<commit_message>
User manual v1.1: Employee App address is https://conceptautobody.app
Phones use conceptautobody.app from anywhere; the office program stays on
shopcontrol.conceptauto.local. Adds home-screen install steps for iPhone and
Android and a troubleshooting row for phones.

Co-Authored-By: Claude Opus 5.5 <noreply@anthropic.com>
</commit_message>
<xml_diff>
--- a/client/manual/ShopControl-User-Manual.docx
+++ b/client/manual/ShopControl-User-Manual.docx
@@ -16,7 +16,7 @@
           <w:noProof/>
         </w:rPr>
         <w:drawing>
-          <wp:inline distT="0" distB="0" distL="0" distR="0" wp14:anchorId="6E08ABD1" wp14:editId="6E08ABD2">
+          <wp:inline distT="0" distB="0" distL="0" distR="0" wp14:anchorId="78E0502B" wp14:editId="78E0502C">
             <wp:extent cx="4000500" cy="1485900"/>
             <wp:effectExtent l="0" t="0" r="0" b="0"/>
             <wp:docPr id="1" name="Picture 1"/>
@@ -93,7 +93,7 @@
         <w:rPr>
           <w:color w:val="5B6776"/>
         </w:rPr>
-        <w:t>Version 1.0  ·  Updated September 28, 2026</w:t>
+        <w:t>Version 1.1  ·  Updated September 28, 2026</w:t>
       </w:r>
     </w:p>
     <w:p>
@@ -122,7 +122,7 @@
     <w:sdt>
       <w:sdtPr>
         <w:alias w:val="Contents"/>
-        <w:id w:val="1380980865"/>
+        <w:id w:val="-309482708"/>
       </w:sdtPr>
       <w:sdtEndPr/>
       <w:sdtContent>
@@ -151,7 +151,7 @@
           <w:r>
             <w:fldChar w:fldCharType="separate"/>
           </w:r>
-          <w:hyperlink w:anchor="_Toc241487758" w:history="1">
+          <w:hyperlink w:anchor="_Toc241488656" w:history="1">
             <w:r>
               <w:rPr>
                 <w:rStyle w:val="Hyperlink"/>
@@ -175,7 +175,7 @@
               <w:rPr>
                 <w:noProof/>
               </w:rPr>
-              <w:instrText xml:space="preserve"> PAGEREF _Toc241487758 \h </w:instrText>
+              <w:instrText xml:space="preserve"> PAGEREF _Toc241488656 \h </w:instrText>
             </w:r>
             <w:r>
               <w:rPr>
@@ -218,7 +218,7 @@
               <w14:ligatures w14:val="standardContextual"/>
             </w:rPr>
           </w:pPr>
-          <w:hyperlink w:anchor="_Toc241487759" w:history="1">
+          <w:hyperlink w:anchor="_Toc241488657" w:history="1">
             <w:r>
               <w:rPr>
                 <w:rStyle w:val="Hyperlink"/>
@@ -242,7 +242,7 @@
               <w:rPr>
                 <w:noProof/>
               </w:rPr>
-              <w:instrText xml:space="preserve"> PAGEREF _Toc241487759 \h </w:instrText>
+              <w:instrText xml:space="preserve"> PAGEREF _Toc241488657 \h </w:instrText>
             </w:r>
             <w:r>
               <w:rPr>
@@ -285,13 +285,13 @@
               <w14:ligatures w14:val="standardContextual"/>
             </w:rPr>
           </w:pPr>
-          <w:hyperlink w:anchor="_Toc241487760" w:history="1">
+          <w:hyperlink w:anchor="_Toc241488658" w:history="1">
             <w:r>
               <w:rPr>
                 <w:rStyle w:val="Hyperlink"/>
                 <w:noProof/>
               </w:rPr>
-              <w:t>Logging in</w:t>
+              <w:t>Put the app on your phone's home screen</w:t>
             </w:r>
             <w:r>
               <w:rPr>
@@ -309,7 +309,7 @@
               <w:rPr>
                 <w:noProof/>
               </w:rPr>
-              <w:instrText xml:space="preserve"> PAGEREF _Toc241487760 \h </w:instrText>
+              <w:instrText xml:space="preserve"> PAGEREF _Toc241488658 \h </w:instrText>
             </w:r>
             <w:r>
               <w:rPr>
@@ -352,13 +352,13 @@
               <w14:ligatures w14:val="standardContextual"/>
             </w:rPr>
           </w:pPr>
-          <w:hyperlink w:anchor="_Toc241487761" w:history="1">
+          <w:hyperlink w:anchor="_Toc241488659" w:history="1">
             <w:r>
               <w:rPr>
                 <w:rStyle w:val="Hyperlink"/>
                 <w:noProof/>
               </w:rPr>
-              <w:t>Staying up to date</w:t>
+              <w:t>Logging in</w:t>
             </w:r>
             <w:r>
               <w:rPr>
@@ -376,7 +376,7 @@
               <w:rPr>
                 <w:noProof/>
               </w:rPr>
-              <w:instrText xml:space="preserve"> PAGEREF _Toc241487761 \h </w:instrText>
+              <w:instrText xml:space="preserve"> PAGEREF _Toc241488659 \h </w:instrText>
             </w:r>
             <w:r>
               <w:rPr>
@@ -419,12 +419,79 @@
               <w14:ligatures w14:val="standardContextual"/>
             </w:rPr>
           </w:pPr>
-          <w:hyperlink w:anchor="_Toc241487762" w:history="1">
+          <w:hyperlink w:anchor="_Toc241488660" w:history="1">
             <w:r>
               <w:rPr>
                 <w:rStyle w:val="Hyperlink"/>
                 <w:noProof/>
               </w:rPr>
+              <w:t>Staying up to date</w:t>
+            </w:r>
+            <w:r>
+              <w:rPr>
+                <w:noProof/>
+              </w:rPr>
+              <w:tab/>
+            </w:r>
+            <w:r>
+              <w:rPr>
+                <w:noProof/>
+              </w:rPr>
+              <w:fldChar w:fldCharType="begin"/>
+            </w:r>
+            <w:r>
+              <w:rPr>
+                <w:noProof/>
+              </w:rPr>
+              <w:instrText xml:space="preserve"> PAGEREF _Toc241488660 \h </w:instrText>
+            </w:r>
+            <w:r>
+              <w:rPr>
+                <w:noProof/>
+              </w:rPr>
+            </w:r>
+            <w:r>
+              <w:rPr>
+                <w:noProof/>
+              </w:rPr>
+              <w:fldChar w:fldCharType="separate"/>
+            </w:r>
+            <w:r>
+              <w:rPr>
+                <w:noProof/>
+              </w:rPr>
+              <w:t>4</w:t>
+            </w:r>
+            <w:r>
+              <w:rPr>
+                <w:noProof/>
+              </w:rPr>
+              <w:fldChar w:fldCharType="end"/>
+            </w:r>
+          </w:hyperlink>
+        </w:p>
+        <w:p>
+          <w:pPr>
+            <w:pStyle w:val="TOC2"/>
+            <w:tabs>
+              <w:tab w:val="right" w:leader="dot" w:pos="9350"/>
+            </w:tabs>
+            <w:rPr>
+              <w:rFonts w:asciiTheme="minorHAnsi" w:eastAsiaTheme="minorEastAsia" w:hAnsiTheme="minorHAnsi" w:cstheme="minorBidi"/>
+              <w:noProof/>
+              <w:color w:val="auto"/>
+              <w:kern w:val="2"/>
+              <w:sz w:val="24"/>
+              <w:szCs w:val="24"/>
+              <w14:ligatures w14:val="standardContextual"/>
+            </w:rPr>
+          </w:pPr>
+          <w:hyperlink w:anchor="_Toc241488661" w:history="1">
+            <w:r>
+              <w:rPr>
+                <w:rStyle w:val="Hyperlink"/>
+                <w:noProof/>
+              </w:rPr>
               <w:t>Who can do what</w:t>
             </w:r>
             <w:r>
@@ -443,7 +510,7 @@
               <w:rPr>
                 <w:noProof/>
               </w:rPr>
-              <w:instrText xml:space="preserve"> PAGEREF _Toc241487762 \h </w:instrText>
+              <w:instrText xml:space="preserve"> PAGEREF _Toc241488661 \h </w:instrText>
             </w:r>
             <w:r>
               <w:rPr>
@@ -486,7 +553,7 @@
               <w14:ligatures w14:val="standardContextual"/>
             </w:rPr>
           </w:pPr>
-          <w:hyperlink w:anchor="_Toc241487763" w:history="1">
+          <w:hyperlink w:anchor="_Toc241488662" w:history="1">
             <w:r>
               <w:rPr>
                 <w:rStyle w:val="Hyperlink"/>
@@ -510,7 +577,7 @@
               <w:rPr>
                 <w:noProof/>
               </w:rPr>
-              <w:instrText xml:space="preserve"> PAGEREF _Toc241487763 \h </w:instrText>
+              <w:instrText xml:space="preserve"> PAGEREF _Toc241488662 \h </w:instrText>
             </w:r>
             <w:r>
               <w:rPr>
@@ -553,7 +620,7 @@
               <w14:ligatures w14:val="standardContextual"/>
             </w:rPr>
           </w:pPr>
-          <w:hyperlink w:anchor="_Toc241487764" w:history="1">
+          <w:hyperlink w:anchor="_Toc241488663" w:history="1">
             <w:r>
               <w:rPr>
                 <w:rStyle w:val="Hyperlink"/>
@@ -577,7 +644,7 @@
               <w:rPr>
                 <w:noProof/>
               </w:rPr>
-              <w:instrText xml:space="preserve"> PAGEREF _Toc241487764 \h </w:instrText>
+              <w:instrText xml:space="preserve"> PAGEREF _Toc241488663 \h </w:instrText>
             </w:r>
             <w:r>
               <w:rPr>
@@ -620,7 +687,7 @@
               <w14:ligatures w14:val="standardContextual"/>
             </w:rPr>
           </w:pPr>
-          <w:hyperlink w:anchor="_Toc241487765" w:history="1">
+          <w:hyperlink w:anchor="_Toc241488664" w:history="1">
             <w:r>
               <w:rPr>
                 <w:rStyle w:val="Hyperlink"/>
@@ -644,7 +711,7 @@
               <w:rPr>
                 <w:noProof/>
               </w:rPr>
-              <w:instrText xml:space="preserve"> PAGEREF _Toc241487765 \h </w:instrText>
+              <w:instrText xml:space="preserve"> PAGEREF _Toc241488664 \h </w:instrText>
             </w:r>
             <w:r>
               <w:rPr>
@@ -687,7 +754,7 @@
               <w14:ligatures w14:val="standardContextual"/>
             </w:rPr>
           </w:pPr>
-          <w:hyperlink w:anchor="_Toc241487766" w:history="1">
+          <w:hyperlink w:anchor="_Toc241488665" w:history="1">
             <w:r>
               <w:rPr>
                 <w:rStyle w:val="Hyperlink"/>
@@ -711,7 +778,7 @@
               <w:rPr>
                 <w:noProof/>
               </w:rPr>
-              <w:instrText xml:space="preserve"> PAGEREF _Toc241487766 \h </w:instrText>
+              <w:instrText xml:space="preserve"> PAGEREF _Toc241488665 \h </w:instrText>
             </w:r>
             <w:r>
               <w:rPr>
@@ -754,7 +821,7 @@
               <w14:ligatures w14:val="standardContextual"/>
             </w:rPr>
           </w:pPr>
-          <w:hyperlink w:anchor="_Toc241487767" w:history="1">
+          <w:hyperlink w:anchor="_Toc241488666" w:history="1">
             <w:r>
               <w:rPr>
                 <w:rStyle w:val="Hyperlink"/>
@@ -778,7 +845,7 @@
               <w:rPr>
                 <w:noProof/>
               </w:rPr>
-              <w:instrText xml:space="preserve"> PAGEREF _Toc241487767 \h </w:instrText>
+              <w:instrText xml:space="preserve"> PAGEREF _Toc241488666 \h </w:instrText>
             </w:r>
             <w:r>
               <w:rPr>
@@ -821,7 +888,7 @@
               <w14:ligatures w14:val="standardContextual"/>
             </w:rPr>
           </w:pPr>
-          <w:hyperlink w:anchor="_Toc241487768" w:history="1">
+          <w:hyperlink w:anchor="_Toc241488667" w:history="1">
             <w:r>
               <w:rPr>
                 <w:rStyle w:val="Hyperlink"/>
@@ -845,7 +912,7 @@
               <w:rPr>
                 <w:noProof/>
               </w:rPr>
-              <w:instrText xml:space="preserve"> PAGEREF _Toc241487768 \h </w:instrText>
+              <w:instrText xml:space="preserve"> PAGEREF _Toc241488667 \h </w:instrText>
             </w:r>
             <w:r>
               <w:rPr>
@@ -888,7 +955,7 @@
               <w14:ligatures w14:val="standardContextual"/>
             </w:rPr>
           </w:pPr>
-          <w:hyperlink w:anchor="_Toc241487769" w:history="1">
+          <w:hyperlink w:anchor="_Toc241488668" w:history="1">
             <w:r>
               <w:rPr>
                 <w:rStyle w:val="Hyperlink"/>
@@ -912,7 +979,7 @@
               <w:rPr>
                 <w:noProof/>
               </w:rPr>
-              <w:instrText xml:space="preserve"> PAGEREF _Toc241487769 \h </w:instrText>
+              <w:instrText xml:space="preserve"> PAGEREF _Toc241488668 \h </w:instrText>
             </w:r>
             <w:r>
               <w:rPr>
@@ -955,7 +1022,7 @@
               <w14:ligatures w14:val="standardContextual"/>
             </w:rPr>
           </w:pPr>
-          <w:hyperlink w:anchor="_Toc241487770" w:history="1">
+          <w:hyperlink w:anchor="_Toc241488669" w:history="1">
             <w:r>
               <w:rPr>
                 <w:rStyle w:val="Hyperlink"/>
@@ -979,7 +1046,7 @@
               <w:rPr>
                 <w:noProof/>
               </w:rPr>
-              <w:instrText xml:space="preserve"> PAGEREF _Toc241487770 \h </w:instrText>
+              <w:instrText xml:space="preserve"> PAGEREF _Toc241488669 \h </w:instrText>
             </w:r>
             <w:r>
               <w:rPr>
@@ -1022,7 +1089,7 @@
               <w14:ligatures w14:val="standardContextual"/>
             </w:rPr>
           </w:pPr>
-          <w:hyperlink w:anchor="_Toc241487771" w:history="1">
+          <w:hyperlink w:anchor="_Toc241488670" w:history="1">
             <w:r>
               <w:rPr>
                 <w:rStyle w:val="Hyperlink"/>
@@ -1046,7 +1113,7 @@
               <w:rPr>
                 <w:noProof/>
               </w:rPr>
-              <w:instrText xml:space="preserve"> PAGEREF _Toc241487771 \h </w:instrText>
+              <w:instrText xml:space="preserve"> PAGEREF _Toc241488670 \h </w:instrText>
             </w:r>
             <w:r>
               <w:rPr>
@@ -1089,7 +1156,7 @@
               <w14:ligatures w14:val="standardContextual"/>
             </w:rPr>
           </w:pPr>
-          <w:hyperlink w:anchor="_Toc241487772" w:history="1">
+          <w:hyperlink w:anchor="_Toc241488671" w:history="1">
             <w:r>
               <w:rPr>
                 <w:rStyle w:val="Hyperlink"/>
@@ -1113,7 +1180,7 @@
               <w:rPr>
                 <w:noProof/>
               </w:rPr>
-              <w:instrText xml:space="preserve"> PAGEREF _Toc241487772 \h </w:instrText>
+              <w:instrText xml:space="preserve"> PAGEREF _Toc241488671 \h </w:instrText>
             </w:r>
             <w:r>
               <w:rPr>
@@ -1156,7 +1223,7 @@
               <w14:ligatures w14:val="standardContextual"/>
             </w:rPr>
           </w:pPr>
-          <w:hyperlink w:anchor="_Toc241487773" w:history="1">
+          <w:hyperlink w:anchor="_Toc241488672" w:history="1">
             <w:r>
               <w:rPr>
                 <w:rStyle w:val="Hyperlink"/>
@@ -1180,7 +1247,7 @@
               <w:rPr>
                 <w:noProof/>
               </w:rPr>
-              <w:instrText xml:space="preserve"> PAGEREF _Toc241487773 \h </w:instrText>
+              <w:instrText xml:space="preserve"> PAGEREF _Toc241488672 \h </w:instrText>
             </w:r>
             <w:r>
               <w:rPr>
@@ -1223,7 +1290,7 @@
               <w14:ligatures w14:val="standardContextual"/>
             </w:rPr>
           </w:pPr>
-          <w:hyperlink w:anchor="_Toc241487774" w:history="1">
+          <w:hyperlink w:anchor="_Toc241488673" w:history="1">
             <w:r>
               <w:rPr>
                 <w:rStyle w:val="Hyperlink"/>
@@ -1247,7 +1314,7 @@
               <w:rPr>
                 <w:noProof/>
               </w:rPr>
-              <w:instrText xml:space="preserve"> PAGEREF _Toc241487774 \h </w:instrText>
+              <w:instrText xml:space="preserve"> PAGEREF _Toc241488673 \h </w:instrText>
             </w:r>
             <w:r>
               <w:rPr>
@@ -1290,7 +1357,7 @@
               <w14:ligatures w14:val="standardContextual"/>
             </w:rPr>
           </w:pPr>
-          <w:hyperlink w:anchor="_Toc241487775" w:history="1">
+          <w:hyperlink w:anchor="_Toc241488674" w:history="1">
             <w:r>
               <w:rPr>
                 <w:rStyle w:val="Hyperlink"/>
@@ -1314,7 +1381,7 @@
               <w:rPr>
                 <w:noProof/>
               </w:rPr>
-              <w:instrText xml:space="preserve"> PAGEREF _Toc241487775 \h </w:instrText>
+              <w:instrText xml:space="preserve"> PAGEREF _Toc241488674 \h </w:instrText>
             </w:r>
             <w:r>
               <w:rPr>
@@ -1357,7 +1424,7 @@
               <w14:ligatures w14:val="standardContextual"/>
             </w:rPr>
           </w:pPr>
-          <w:hyperlink w:anchor="_Toc241487776" w:history="1">
+          <w:hyperlink w:anchor="_Toc241488675" w:history="1">
             <w:r>
               <w:rPr>
                 <w:rStyle w:val="Hyperlink"/>
@@ -1381,7 +1448,7 @@
               <w:rPr>
                 <w:noProof/>
               </w:rPr>
-              <w:instrText xml:space="preserve"> PAGEREF _Toc241487776 \h </w:instrText>
+              <w:instrText xml:space="preserve"> PAGEREF _Toc241488675 \h </w:instrText>
             </w:r>
             <w:r>
               <w:rPr>
@@ -1424,7 +1491,7 @@
               <w14:ligatures w14:val="standardContextual"/>
             </w:rPr>
           </w:pPr>
-          <w:hyperlink w:anchor="_Toc241487777" w:history="1">
+          <w:hyperlink w:anchor="_Toc241488676" w:history="1">
             <w:r>
               <w:rPr>
                 <w:rStyle w:val="Hyperlink"/>
@@ -1448,7 +1515,7 @@
               <w:rPr>
                 <w:noProof/>
               </w:rPr>
-              <w:instrText xml:space="preserve"> PAGEREF _Toc241487777 \h </w:instrText>
+              <w:instrText xml:space="preserve"> PAGEREF _Toc241488676 \h </w:instrText>
             </w:r>
             <w:r>
               <w:rPr>
@@ -1491,7 +1558,7 @@
               <w14:ligatures w14:val="standardContextual"/>
             </w:rPr>
           </w:pPr>
-          <w:hyperlink w:anchor="_Toc241487778" w:history="1">
+          <w:hyperlink w:anchor="_Toc241488677" w:history="1">
             <w:r>
               <w:rPr>
                 <w:rStyle w:val="Hyperlink"/>
@@ -1515,7 +1582,7 @@
               <w:rPr>
                 <w:noProof/>
               </w:rPr>
-              <w:instrText xml:space="preserve"> PAGEREF _Toc241487778 \h </w:instrText>
+              <w:instrText xml:space="preserve"> PAGEREF _Toc241488677 \h </w:instrText>
             </w:r>
             <w:r>
               <w:rPr>
@@ -1558,7 +1625,7 @@
               <w14:ligatures w14:val="standardContextual"/>
             </w:rPr>
           </w:pPr>
-          <w:hyperlink w:anchor="_Toc241487779" w:history="1">
+          <w:hyperlink w:anchor="_Toc241488678" w:history="1">
             <w:r>
               <w:rPr>
                 <w:rStyle w:val="Hyperlink"/>
@@ -1582,7 +1649,7 @@
               <w:rPr>
                 <w:noProof/>
               </w:rPr>
-              <w:instrText xml:space="preserve"> PAGEREF _Toc241487779 \h </w:instrText>
+              <w:instrText xml:space="preserve"> PAGEREF _Toc241488678 \h </w:instrText>
             </w:r>
             <w:r>
               <w:rPr>
@@ -1625,7 +1692,7 @@
               <w14:ligatures w14:val="standardContextual"/>
             </w:rPr>
           </w:pPr>
-          <w:hyperlink w:anchor="_Toc241487780" w:history="1">
+          <w:hyperlink w:anchor="_Toc241488679" w:history="1">
             <w:r>
               <w:rPr>
                 <w:rStyle w:val="Hyperlink"/>
@@ -1649,7 +1716,7 @@
               <w:rPr>
                 <w:noProof/>
               </w:rPr>
-              <w:instrText xml:space="preserve"> PAGEREF _Toc241487780 \h </w:instrText>
+              <w:instrText xml:space="preserve"> PAGEREF _Toc241488679 \h </w:instrText>
             </w:r>
             <w:r>
               <w:rPr>
@@ -1692,7 +1759,7 @@
               <w14:ligatures w14:val="standardContextual"/>
             </w:rPr>
           </w:pPr>
-          <w:hyperlink w:anchor="_Toc241487781" w:history="1">
+          <w:hyperlink w:anchor="_Toc241488680" w:history="1">
             <w:r>
               <w:rPr>
                 <w:rStyle w:val="Hyperlink"/>
@@ -1716,7 +1783,7 @@
               <w:rPr>
                 <w:noProof/>
               </w:rPr>
-              <w:instrText xml:space="preserve"> PAGEREF _Toc241487781 \h </w:instrText>
+              <w:instrText xml:space="preserve"> PAGEREF _Toc241488680 \h </w:instrText>
             </w:r>
             <w:r>
               <w:rPr>
@@ -1759,7 +1826,7 @@
               <w14:ligatures w14:val="standardContextual"/>
             </w:rPr>
           </w:pPr>
-          <w:hyperlink w:anchor="_Toc241487782" w:history="1">
+          <w:hyperlink w:anchor="_Toc241488681" w:history="1">
             <w:r>
               <w:rPr>
                 <w:rStyle w:val="Hyperlink"/>
@@ -1783,7 +1850,7 @@
               <w:rPr>
                 <w:noProof/>
               </w:rPr>
-              <w:instrText xml:space="preserve"> PAGEREF _Toc241487782 \h </w:instrText>
+              <w:instrText xml:space="preserve"> PAGEREF _Toc241488681 \h </w:instrText>
             </w:r>
             <w:r>
               <w:rPr>
@@ -1826,7 +1893,7 @@
               <w14:ligatures w14:val="standardContextual"/>
             </w:rPr>
           </w:pPr>
-          <w:hyperlink w:anchor="_Toc241487783" w:history="1">
+          <w:hyperlink w:anchor="_Toc241488682" w:history="1">
             <w:r>
               <w:rPr>
                 <w:rStyle w:val="Hyperlink"/>
@@ -1850,7 +1917,7 @@
               <w:rPr>
                 <w:noProof/>
               </w:rPr>
-              <w:instrText xml:space="preserve"> PAGEREF _Toc241487783 \h </w:instrText>
+              <w:instrText xml:space="preserve"> PAGEREF _Toc241488682 \h </w:instrText>
             </w:r>
             <w:r>
               <w:rPr>
@@ -1893,7 +1960,7 @@
               <w14:ligatures w14:val="standardContextual"/>
             </w:rPr>
           </w:pPr>
-          <w:hyperlink w:anchor="_Toc241487784" w:history="1">
+          <w:hyperlink w:anchor="_Toc241488683" w:history="1">
             <w:r>
               <w:rPr>
                 <w:rStyle w:val="Hyperlink"/>
@@ -1917,7 +1984,7 @@
               <w:rPr>
                 <w:noProof/>
               </w:rPr>
-              <w:instrText xml:space="preserve"> PAGEREF _Toc241487784 \h </w:instrText>
+              <w:instrText xml:space="preserve"> PAGEREF _Toc241488683 \h </w:instrText>
             </w:r>
             <w:r>
               <w:rPr>
@@ -1960,7 +2027,7 @@
               <w14:ligatures w14:val="standardContextual"/>
             </w:rPr>
           </w:pPr>
-          <w:hyperlink w:anchor="_Toc241487785" w:history="1">
+          <w:hyperlink w:anchor="_Toc241488684" w:history="1">
             <w:r>
               <w:rPr>
                 <w:rStyle w:val="Hyperlink"/>
@@ -1984,7 +2051,7 @@
               <w:rPr>
                 <w:noProof/>
               </w:rPr>
-              <w:instrText xml:space="preserve"> PAGEREF _Toc241487785 \h </w:instrText>
+              <w:instrText xml:space="preserve"> PAGEREF _Toc241488684 \h </w:instrText>
             </w:r>
             <w:r>
               <w:rPr>
@@ -2027,7 +2094,7 @@
               <w14:ligatures w14:val="standardContextual"/>
             </w:rPr>
           </w:pPr>
-          <w:hyperlink w:anchor="_Toc241487786" w:history="1">
+          <w:hyperlink w:anchor="_Toc241488685" w:history="1">
             <w:r>
               <w:rPr>
                 <w:rStyle w:val="Hyperlink"/>
@@ -2051,7 +2118,7 @@
               <w:rPr>
                 <w:noProof/>
               </w:rPr>
-              <w:instrText xml:space="preserve"> PAGEREF _Toc241487786 \h </w:instrText>
+              <w:instrText xml:space="preserve"> PAGEREF _Toc241488685 \h </w:instrText>
             </w:r>
             <w:r>
               <w:rPr>
@@ -2094,7 +2161,7 @@
               <w14:ligatures w14:val="standardContextual"/>
             </w:rPr>
           </w:pPr>
-          <w:hyperlink w:anchor="_Toc241487787" w:history="1">
+          <w:hyperlink w:anchor="_Toc241488686" w:history="1">
             <w:r>
               <w:rPr>
                 <w:rStyle w:val="Hyperlink"/>
@@ -2118,7 +2185,7 @@
               <w:rPr>
                 <w:noProof/>
               </w:rPr>
-              <w:instrText xml:space="preserve"> PAGEREF _Toc241487787 \h </w:instrText>
+              <w:instrText xml:space="preserve"> PAGEREF _Toc241488686 \h </w:instrText>
             </w:r>
             <w:r>
               <w:rPr>
@@ -2161,7 +2228,7 @@
               <w14:ligatures w14:val="standardContextual"/>
             </w:rPr>
           </w:pPr>
-          <w:hyperlink w:anchor="_Toc241487788" w:history="1">
+          <w:hyperlink w:anchor="_Toc241488687" w:history="1">
             <w:r>
               <w:rPr>
                 <w:rStyle w:val="Hyperlink"/>
@@ -2185,7 +2252,7 @@
               <w:rPr>
                 <w:noProof/>
               </w:rPr>
-              <w:instrText xml:space="preserve"> PAGEREF _Toc241487788 \h </w:instrText>
+              <w:instrText xml:space="preserve"> PAGEREF _Toc241488687 \h </w:instrText>
             </w:r>
             <w:r>
               <w:rPr>
@@ -2228,7 +2295,7 @@
               <w14:ligatures w14:val="standardContextual"/>
             </w:rPr>
           </w:pPr>
-          <w:hyperlink w:anchor="_Toc241487789" w:history="1">
+          <w:hyperlink w:anchor="_Toc241488688" w:history="1">
             <w:r>
               <w:rPr>
                 <w:rStyle w:val="Hyperlink"/>
@@ -2252,7 +2319,7 @@
               <w:rPr>
                 <w:noProof/>
               </w:rPr>
-              <w:instrText xml:space="preserve"> PAGEREF _Toc241487789 \h </w:instrText>
+              <w:instrText xml:space="preserve"> PAGEREF _Toc241488688 \h </w:instrText>
             </w:r>
             <w:r>
               <w:rPr>
@@ -2295,7 +2362,7 @@
               <w14:ligatures w14:val="standardContextual"/>
             </w:rPr>
           </w:pPr>
-          <w:hyperlink w:anchor="_Toc241487790" w:history="1">
+          <w:hyperlink w:anchor="_Toc241488689" w:history="1">
             <w:r>
               <w:rPr>
                 <w:rStyle w:val="Hyperlink"/>
@@ -2319,7 +2386,7 @@
               <w:rPr>
                 <w:noProof/>
               </w:rPr>
-              <w:instrText xml:space="preserve"> PAGEREF _Toc241487790 \h </w:instrText>
+              <w:instrText xml:space="preserve"> PAGEREF _Toc241488689 \h </w:instrText>
             </w:r>
             <w:r>
               <w:rPr>
@@ -2362,7 +2429,7 @@
               <w14:ligatures w14:val="standardContextual"/>
             </w:rPr>
           </w:pPr>
-          <w:hyperlink w:anchor="_Toc241487791" w:history="1">
+          <w:hyperlink w:anchor="_Toc241488690" w:history="1">
             <w:r>
               <w:rPr>
                 <w:rStyle w:val="Hyperlink"/>
@@ -2386,7 +2453,7 @@
               <w:rPr>
                 <w:noProof/>
               </w:rPr>
-              <w:instrText xml:space="preserve"> PAGEREF _Toc241487791 \h </w:instrText>
+              <w:instrText xml:space="preserve"> PAGEREF _Toc241488690 \h </w:instrText>
             </w:r>
             <w:r>
               <w:rPr>
@@ -2429,7 +2496,7 @@
               <w14:ligatures w14:val="standardContextual"/>
             </w:rPr>
           </w:pPr>
-          <w:hyperlink w:anchor="_Toc241487792" w:history="1">
+          <w:hyperlink w:anchor="_Toc241488691" w:history="1">
             <w:r>
               <w:rPr>
                 <w:rStyle w:val="Hyperlink"/>
@@ -2453,7 +2520,7 @@
               <w:rPr>
                 <w:noProof/>
               </w:rPr>
-              <w:instrText xml:space="preserve"> PAGEREF _Toc241487792 \h </w:instrText>
+              <w:instrText xml:space="preserve"> PAGEREF _Toc241488691 \h </w:instrText>
             </w:r>
             <w:r>
               <w:rPr>
@@ -2496,7 +2563,7 @@
               <w14:ligatures w14:val="standardContextual"/>
             </w:rPr>
           </w:pPr>
-          <w:hyperlink w:anchor="_Toc241487793" w:history="1">
+          <w:hyperlink w:anchor="_Toc241488692" w:history="1">
             <w:r>
               <w:rPr>
                 <w:rStyle w:val="Hyperlink"/>
@@ -2520,7 +2587,7 @@
               <w:rPr>
                 <w:noProof/>
               </w:rPr>
-              <w:instrText xml:space="preserve"> PAGEREF _Toc241487793 \h </w:instrText>
+              <w:instrText xml:space="preserve"> PAGEREF _Toc241488692 \h </w:instrText>
             </w:r>
             <w:r>
               <w:rPr>
@@ -2563,7 +2630,7 @@
               <w14:ligatures w14:val="standardContextual"/>
             </w:rPr>
           </w:pPr>
-          <w:hyperlink w:anchor="_Toc241487794" w:history="1">
+          <w:hyperlink w:anchor="_Toc241488693" w:history="1">
             <w:r>
               <w:rPr>
                 <w:rStyle w:val="Hyperlink"/>
@@ -2587,7 +2654,7 @@
               <w:rPr>
                 <w:noProof/>
               </w:rPr>
-              <w:instrText xml:space="preserve"> PAGEREF _Toc241487794 \h </w:instrText>
+              <w:instrText xml:space="preserve"> PAGEREF _Toc241488693 \h </w:instrText>
             </w:r>
             <w:r>
               <w:rPr>
@@ -2630,7 +2697,7 @@
               <w14:ligatures w14:val="standardContextual"/>
             </w:rPr>
           </w:pPr>
-          <w:hyperlink w:anchor="_Toc241487795" w:history="1">
+          <w:hyperlink w:anchor="_Toc241488694" w:history="1">
             <w:r>
               <w:rPr>
                 <w:rStyle w:val="Hyperlink"/>
@@ -2654,7 +2721,7 @@
               <w:rPr>
                 <w:noProof/>
               </w:rPr>
-              <w:instrText xml:space="preserve"> PAGEREF _Toc241487795 \h </w:instrText>
+              <w:instrText xml:space="preserve"> PAGEREF _Toc241488694 \h </w:instrText>
             </w:r>
             <w:r>
               <w:rPr>
@@ -2697,7 +2764,7 @@
               <w14:ligatures w14:val="standardContextual"/>
             </w:rPr>
           </w:pPr>
-          <w:hyperlink w:anchor="_Toc241487796" w:history="1">
+          <w:hyperlink w:anchor="_Toc241488695" w:history="1">
             <w:r>
               <w:rPr>
                 <w:rStyle w:val="Hyperlink"/>
@@ -2721,7 +2788,7 @@
               <w:rPr>
                 <w:noProof/>
               </w:rPr>
-              <w:instrText xml:space="preserve"> PAGEREF _Toc241487796 \h </w:instrText>
+              <w:instrText xml:space="preserve"> PAGEREF _Toc241488695 \h </w:instrText>
             </w:r>
             <w:r>
               <w:rPr>
@@ -2764,7 +2831,7 @@
               <w14:ligatures w14:val="standardContextual"/>
             </w:rPr>
           </w:pPr>
-          <w:hyperlink w:anchor="_Toc241487797" w:history="1">
+          <w:hyperlink w:anchor="_Toc241488696" w:history="1">
             <w:r>
               <w:rPr>
                 <w:rStyle w:val="Hyperlink"/>
@@ -2788,7 +2855,7 @@
               <w:rPr>
                 <w:noProof/>
               </w:rPr>
-              <w:instrText xml:space="preserve"> PAGEREF _Toc241487797 \h </w:instrText>
+              <w:instrText xml:space="preserve"> PAGEREF _Toc241488696 \h </w:instrText>
             </w:r>
             <w:r>
               <w:rPr>
@@ -2831,7 +2898,7 @@
               <w14:ligatures w14:val="standardContextual"/>
             </w:rPr>
           </w:pPr>
-          <w:hyperlink w:anchor="_Toc241487798" w:history="1">
+          <w:hyperlink w:anchor="_Toc241488697" w:history="1">
             <w:r>
               <w:rPr>
                 <w:rStyle w:val="Hyperlink"/>
@@ -2855,7 +2922,7 @@
               <w:rPr>
                 <w:noProof/>
               </w:rPr>
-              <w:instrText xml:space="preserve"> PAGEREF _Toc241487798 \h </w:instrText>
+              <w:instrText xml:space="preserve"> PAGEREF _Toc241488697 \h </w:instrText>
             </w:r>
             <w:r>
               <w:rPr>
@@ -2898,7 +2965,7 @@
               <w14:ligatures w14:val="standardContextual"/>
             </w:rPr>
           </w:pPr>
-          <w:hyperlink w:anchor="_Toc241487799" w:history="1">
+          <w:hyperlink w:anchor="_Toc241488698" w:history="1">
             <w:r>
               <w:rPr>
                 <w:rStyle w:val="Hyperlink"/>
@@ -2922,7 +2989,7 @@
               <w:rPr>
                 <w:noProof/>
               </w:rPr>
-              <w:instrText xml:space="preserve"> PAGEREF _Toc241487799 \h </w:instrText>
+              <w:instrText xml:space="preserve"> PAGEREF _Toc241488698 \h </w:instrText>
             </w:r>
             <w:r>
               <w:rPr>
@@ -2965,7 +3032,7 @@
               <w14:ligatures w14:val="standardContextual"/>
             </w:rPr>
           </w:pPr>
-          <w:hyperlink w:anchor="_Toc241487800" w:history="1">
+          <w:hyperlink w:anchor="_Toc241488699" w:history="1">
             <w:r>
               <w:rPr>
                 <w:rStyle w:val="Hyperlink"/>
@@ -2989,7 +3056,7 @@
               <w:rPr>
                 <w:noProof/>
               </w:rPr>
-              <w:instrText xml:space="preserve"> PAGEREF _Toc241487800 \h </w:instrText>
+              <w:instrText xml:space="preserve"> PAGEREF _Toc241488699 \h </w:instrText>
             </w:r>
             <w:r>
               <w:rPr>
@@ -3032,7 +3099,7 @@
               <w14:ligatures w14:val="standardContextual"/>
             </w:rPr>
           </w:pPr>
-          <w:hyperlink w:anchor="_Toc241487801" w:history="1">
+          <w:hyperlink w:anchor="_Toc241488700" w:history="1">
             <w:r>
               <w:rPr>
                 <w:rStyle w:val="Hyperlink"/>
@@ -3056,7 +3123,7 @@
               <w:rPr>
                 <w:noProof/>
               </w:rPr>
-              <w:instrText xml:space="preserve"> PAGEREF _Toc241487801 \h </w:instrText>
+              <w:instrText xml:space="preserve"> PAGEREF _Toc241488700 \h </w:instrText>
             </w:r>
             <w:r>
               <w:rPr>
@@ -3099,7 +3166,7 @@
               <w14:ligatures w14:val="standardContextual"/>
             </w:rPr>
           </w:pPr>
-          <w:hyperlink w:anchor="_Toc241487802" w:history="1">
+          <w:hyperlink w:anchor="_Toc241488701" w:history="1">
             <w:r>
               <w:rPr>
                 <w:rStyle w:val="Hyperlink"/>
@@ -3123,7 +3190,7 @@
               <w:rPr>
                 <w:noProof/>
               </w:rPr>
-              <w:instrText xml:space="preserve"> PAGEREF _Toc241487802 \h </w:instrText>
+              <w:instrText xml:space="preserve"> PAGEREF _Toc241488701 \h </w:instrText>
             </w:r>
             <w:r>
               <w:rPr>
@@ -3166,7 +3233,7 @@
               <w14:ligatures w14:val="standardContextual"/>
             </w:rPr>
           </w:pPr>
-          <w:hyperlink w:anchor="_Toc241487803" w:history="1">
+          <w:hyperlink w:anchor="_Toc241488702" w:history="1">
             <w:r>
               <w:rPr>
                 <w:rStyle w:val="Hyperlink"/>
@@ -3190,7 +3257,7 @@
               <w:rPr>
                 <w:noProof/>
               </w:rPr>
-              <w:instrText xml:space="preserve"> PAGEREF _Toc241487803 \h </w:instrText>
+              <w:instrText xml:space="preserve"> PAGEREF _Toc241488702 \h </w:instrText>
             </w:r>
             <w:r>
               <w:rPr>
@@ -3233,7 +3300,7 @@
               <w14:ligatures w14:val="standardContextual"/>
             </w:rPr>
           </w:pPr>
-          <w:hyperlink w:anchor="_Toc241487804" w:history="1">
+          <w:hyperlink w:anchor="_Toc241488703" w:history="1">
             <w:r>
               <w:rPr>
                 <w:rStyle w:val="Hyperlink"/>
@@ -3257,7 +3324,7 @@
               <w:rPr>
                 <w:noProof/>
               </w:rPr>
-              <w:instrText xml:space="preserve"> PAGEREF _Toc241487804 \h </w:instrText>
+              <w:instrText xml:space="preserve"> PAGEREF _Toc241488703 \h </w:instrText>
             </w:r>
             <w:r>
               <w:rPr>
@@ -3300,7 +3367,7 @@
               <w14:ligatures w14:val="standardContextual"/>
             </w:rPr>
           </w:pPr>
-          <w:hyperlink w:anchor="_Toc241487805" w:history="1">
+          <w:hyperlink w:anchor="_Toc241488704" w:history="1">
             <w:r>
               <w:rPr>
                 <w:rStyle w:val="Hyperlink"/>
@@ -3324,7 +3391,7 @@
               <w:rPr>
                 <w:noProof/>
               </w:rPr>
-              <w:instrText xml:space="preserve"> PAGEREF _Toc241487805 \h </w:instrText>
+              <w:instrText xml:space="preserve"> PAGEREF _Toc241488704 \h </w:instrText>
             </w:r>
             <w:r>
               <w:rPr>
@@ -3367,7 +3434,7 @@
       <w:pPr>
         <w:pStyle w:val="Heading1"/>
       </w:pPr>
-      <w:bookmarkStart w:id="0" w:name="_Toc241487758"/>
+      <w:bookmarkStart w:id="0" w:name="_Toc241488656"/>
       <w:r>
         <w:t>1.  Getting started</w:t>
       </w:r>
@@ -3395,7 +3462,7 @@
       <w:pPr>
         <w:pStyle w:val="Heading2"/>
       </w:pPr>
-      <w:bookmarkStart w:id="1" w:name="_Toc241487759"/>
+      <w:bookmarkStart w:id="1" w:name="_Toc241488657"/>
       <w:r>
         <w:t>Opening ShopControl</w:t>
       </w:r>
@@ -3415,20 +3482,20 @@
           <w:b/>
           <w:bCs/>
         </w:rPr>
-        <w:t>Office computers:</w:t>
-      </w:r>
-      <w:r>
-        <w:t xml:space="preserve"> open </w:t>
-      </w:r>
-      <w:r>
-        <w:rPr>
-          <w:b/>
-          <w:bCs/>
-        </w:rPr>
-        <w:t>https://shopcontrol.conceptauto.local</w:t>
-      </w:r>
-      <w:r>
-        <w:t xml:space="preserve"> in Chrome or Edge.</w:t>
+        <w:t>Employee App (phones):</w:t>
+      </w:r>
+      <w:r>
+        <w:t xml:space="preserve"> go to </w:t>
+      </w:r>
+      <w:r>
+        <w:rPr>
+          <w:b/>
+          <w:bCs/>
+        </w:rPr>
+        <w:t>https://conceptautobody.app</w:t>
+      </w:r>
+      <w:r>
+        <w:t xml:space="preserve"> in Safari or Chrome. It works anywhere you have internet, in the shop or not.</w:t>
       </w:r>
     </w:p>
     <w:p>
@@ -3445,10 +3512,20 @@
           <w:b/>
           <w:bCs/>
         </w:rPr>
-        <w:t>Employee App:</w:t>
-      </w:r>
-      <w:r>
-        <w:t xml:space="preserve"> click </w:t>
+        <w:t>Office computers (full program):</w:t>
+      </w:r>
+      <w:r>
+        <w:t xml:space="preserve"> open </w:t>
+      </w:r>
+      <w:r>
+        <w:rPr>
+          <w:b/>
+          <w:bCs/>
+        </w:rPr>
+        <w:t>https://shopcontrol.conceptauto.local</w:t>
+      </w:r>
+      <w:r>
+        <w:t xml:space="preserve"> in Chrome or Edge. This address only works on the shop network. The Employee App is also under </w:t>
       </w:r>
       <w:r>
         <w:rPr>
@@ -3458,48 +3535,26 @@
         <w:t>Employee app</w:t>
       </w:r>
       <w:r>
-        <w:t xml:space="preserve"> in the left menu of ShopControl, or go to the same address followed by </w:t>
-      </w:r>
-      <w:r>
-        <w:rPr>
-          <w:b/>
-          <w:bCs/>
-        </w:rPr>
-        <w:t>/mobile/</w:t>
-      </w:r>
-      <w:r>
-        <w:t>.</w:t>
-      </w:r>
-    </w:p>
-    <w:p>
-      <w:pPr>
-        <w:pStyle w:val="ListParagraph"/>
-        <w:numPr>
-          <w:ilvl w:val="0"/>
-          <w:numId w:val="2"/>
-        </w:numPr>
-        <w:spacing w:after="60"/>
-      </w:pPr>
-      <w:r>
-        <w:rPr>
-          <w:b/>
-          <w:bCs/>
-        </w:rPr>
-        <w:t>Phones:</w:t>
-      </w:r>
-      <w:r>
-        <w:t xml:space="preserve"> access from phones is being set up. Until then, use the Employee App on a shop computer. When it's ready, the office will send the new address.</w:t>
+        <w:t xml:space="preserve"> in the left menu.</w:t>
       </w:r>
     </w:p>
     <w:p>
       <w:pPr>
         <w:pStyle w:val="Heading2"/>
       </w:pPr>
-      <w:bookmarkStart w:id="2" w:name="_Toc241487760"/>
-      <w:r>
-        <w:t>Logging in</w:t>
+      <w:bookmarkStart w:id="2" w:name="_Toc241488658"/>
+      <w:r>
+        <w:t>Put the app on your phone's home screen</w:t>
       </w:r>
       <w:bookmarkEnd w:id="2"/>
+    </w:p>
+    <w:p>
+      <w:pPr>
+        <w:spacing w:after="120"/>
+      </w:pPr>
+      <w:r>
+        <w:t>Do this once and the app opens like any other app, with the Concept Autobody icon.</w:t>
+      </w:r>
     </w:p>
     <w:p>
       <w:pPr>
@@ -3511,27 +3566,64 @@
         <w:spacing w:after="60"/>
       </w:pPr>
       <w:r>
-        <w:t xml:space="preserve">Enter the </w:t>
-      </w:r>
-      <w:r>
-        <w:rPr>
-          <w:b/>
-          <w:bCs/>
-        </w:rPr>
-        <w:t>username</w:t>
-      </w:r>
-      <w:r>
-        <w:t xml:space="preserve"> and </w:t>
-      </w:r>
-      <w:r>
-        <w:rPr>
-          <w:b/>
-          <w:bCs/>
-        </w:rPr>
-        <w:t>password</w:t>
-      </w:r>
-      <w:r>
-        <w:t xml:space="preserve"> the office gave you.</w:t>
+        <w:rPr>
+          <w:b/>
+          <w:bCs/>
+        </w:rPr>
+        <w:t>iPhone:</w:t>
+      </w:r>
+      <w:r>
+        <w:t xml:space="preserve"> open </w:t>
+      </w:r>
+      <w:r>
+        <w:rPr>
+          <w:b/>
+          <w:bCs/>
+        </w:rPr>
+        <w:t>https://conceptautobody.app</w:t>
+      </w:r>
+      <w:r>
+        <w:t xml:space="preserve"> in </w:t>
+      </w:r>
+      <w:r>
+        <w:rPr>
+          <w:b/>
+          <w:bCs/>
+        </w:rPr>
+        <w:t>Safari</w:t>
+      </w:r>
+      <w:r>
+        <w:t xml:space="preserve">, tap the </w:t>
+      </w:r>
+      <w:r>
+        <w:rPr>
+          <w:b/>
+          <w:bCs/>
+        </w:rPr>
+        <w:t>Share</w:t>
+      </w:r>
+      <w:r>
+        <w:t xml:space="preserve"> button (square with an arrow), then </w:t>
+      </w:r>
+      <w:r>
+        <w:rPr>
+          <w:b/>
+          <w:bCs/>
+        </w:rPr>
+        <w:t>Add to Home Screen</w:t>
+      </w:r>
+      <w:r>
+        <w:t xml:space="preserve">, then </w:t>
+      </w:r>
+      <w:r>
+        <w:rPr>
+          <w:b/>
+          <w:bCs/>
+        </w:rPr>
+        <w:t>Add</w:t>
+      </w:r>
+      <w:r>
+        <w:t>.</w:t>
       </w:r>
     </w:p>
     <w:p>
@@ -3544,39 +3636,162 @@
         <w:spacing w:after="60"/>
       </w:pPr>
       <w:r>
-        <w:t xml:space="preserve">Click </w:t>
-      </w:r>
-      <w:r>
-        <w:rPr>
-          <w:b/>
-          <w:bCs/>
-        </w:rPr>
-        <w:t>Log In</w:t>
-      </w:r>
-      <w:r>
-        <w:t xml:space="preserve"> (desktop) or </w:t>
-      </w:r>
-      <w:r>
-        <w:rPr>
-          <w:b/>
-          <w:bCs/>
-        </w:rPr>
-        <w:t>Sign in</w:t>
-      </w:r>
-      <w:r>
-        <w:t xml:space="preserve"> (Employee App).</w:t>
-      </w:r>
+        <w:rPr>
+          <w:b/>
+          <w:bCs/>
+        </w:rPr>
+        <w:t>Android:</w:t>
+      </w:r>
+      <w:r>
+        <w:t xml:space="preserve"> open </w:t>
+      </w:r>
+      <w:r>
+        <w:rPr>
+          <w:b/>
+          <w:bCs/>
+        </w:rPr>
+        <w:t>https://conceptautobody.app</w:t>
+      </w:r>
+      <w:r>
+        <w:t xml:space="preserve"> in </w:t>
+      </w:r>
+      <w:r>
+        <w:rPr>
+          <w:b/>
+          <w:bCs/>
+        </w:rPr>
+        <w:t>Chrome</w:t>
+      </w:r>
+      <w:r>
+        <w:t xml:space="preserve">, tap the </w:t>
+      </w:r>
+      <w:r>
+        <w:rPr>
+          <w:b/>
+          <w:bCs/>
+        </w:rPr>
+        <w:t>⋮</w:t>
+      </w:r>
+      <w:r>
+        <w:t xml:space="preserve"> menu, then </w:t>
+      </w:r>
+      <w:r>
+        <w:rPr>
+          <w:b/>
+          <w:bCs/>
+        </w:rPr>
+        <w:t>Add to Home screen</w:t>
+      </w:r>
+      <w:r>
+        <w:t xml:space="preserve"> (or </w:t>
+      </w:r>
+      <w:r>
+        <w:rPr>
+          <w:b/>
+          <w:bCs/>
+        </w:rPr>
+        <w:t>Install app</w:t>
+      </w:r>
+      <w:r>
+        <w:t xml:space="preserve">), then </w:t>
+      </w:r>
+      <w:r>
+        <w:rPr>
+          <w:b/>
+          <w:bCs/>
+        </w:rPr>
+        <w:t>Add</w:t>
+      </w:r>
+      <w:r>
+        <w:t>.</w:t>
+      </w:r>
+    </w:p>
+    <w:p>
+      <w:pPr>
+        <w:pStyle w:val="Heading2"/>
+      </w:pPr>
+      <w:bookmarkStart w:id="3" w:name="_Toc241488659"/>
+      <w:r>
+        <w:t>Logging in</w:t>
+      </w:r>
+      <w:bookmarkEnd w:id="3"/>
     </w:p>
     <w:p>
       <w:pPr>
         <w:pStyle w:val="ListParagraph"/>
         <w:numPr>
           <w:ilvl w:val="0"/>
-          <w:numId w:val="3"/>
+          <w:numId w:val="4"/>
         </w:numPr>
         <w:spacing w:after="60"/>
       </w:pPr>
       <w:r>
+        <w:t xml:space="preserve">Enter the </w:t>
+      </w:r>
+      <w:r>
+        <w:rPr>
+          <w:b/>
+          <w:bCs/>
+        </w:rPr>
+        <w:t>username</w:t>
+      </w:r>
+      <w:r>
+        <w:t xml:space="preserve"> and </w:t>
+      </w:r>
+      <w:r>
+        <w:rPr>
+          <w:b/>
+          <w:bCs/>
+        </w:rPr>
+        <w:t>password</w:t>
+      </w:r>
+      <w:r>
+        <w:t xml:space="preserve"> the office gave you.</w:t>
+      </w:r>
+    </w:p>
+    <w:p>
+      <w:pPr>
+        <w:pStyle w:val="ListParagraph"/>
+        <w:numPr>
+          <w:ilvl w:val="0"/>
+          <w:numId w:val="4"/>
+        </w:numPr>
+        <w:spacing w:after="60"/>
+      </w:pPr>
+      <w:r>
+        <w:t xml:space="preserve">Tap </w:t>
+      </w:r>
+      <w:r>
+        <w:rPr>
+          <w:b/>
+          <w:bCs/>
+        </w:rPr>
+        <w:t>Sign in</w:t>
+      </w:r>
+      <w:r>
+        <w:t xml:space="preserve"> (Employee App) or click </w:t>
+      </w:r>
+      <w:r>
+        <w:rPr>
+          <w:b/>
+          <w:bCs/>
+        </w:rPr>
+        <w:t>Log In</w:t>
+      </w:r>
+      <w:r>
+        <w:t xml:space="preserve"> (office computers).</w:t>
+      </w:r>
+    </w:p>
+    <w:p>
+      <w:pPr>
+        <w:pStyle w:val="ListParagraph"/>
+        <w:numPr>
+          <w:ilvl w:val="0"/>
+          <w:numId w:val="4"/>
+        </w:numPr>
+        <w:spacing w:after="60"/>
+      </w:pPr>
+      <w:r>
         <w:t xml:space="preserve">If you forget your password, click </w:t>
       </w:r>
       <w:r>
@@ -3587,7 +3802,7 @@
         <w:t>Forgot password?</w:t>
       </w:r>
       <w:r>
-        <w:t xml:space="preserve"> and enter your username. If your account has an email address, a reset link is emailed to you (it expires in 30 minutes). Otherwise ask an admin to reset it.</w:t>
+        <w:t xml:space="preserve"> on the office login and enter your username. If your account has an email address, a reset link is emailed to you. It works from your phone and expires in 30 minutes. Otherwise ask an admin to reset it.</w:t>
       </w:r>
     </w:p>
     <w:p>
@@ -3635,11 +3850,11 @@
       <w:pPr>
         <w:pStyle w:val="Heading2"/>
       </w:pPr>
-      <w:bookmarkStart w:id="3" w:name="_Toc241487761"/>
+      <w:bookmarkStart w:id="4" w:name="_Toc241488660"/>
       <w:r>
         <w:t>Staying up to date</w:t>
       </w:r>
-      <w:bookmarkEnd w:id="3"/>
+      <w:bookmarkEnd w:id="4"/>
     </w:p>
     <w:p>
       <w:pPr>
@@ -3663,11 +3878,11 @@
       <w:pPr>
         <w:pStyle w:val="Heading2"/>
       </w:pPr>
-      <w:bookmarkStart w:id="4" w:name="_Toc241487762"/>
+      <w:bookmarkStart w:id="5" w:name="_Toc241488661"/>
       <w:r>
         <w:t>Who can do what</w:t>
       </w:r>
-      <w:bookmarkEnd w:id="4"/>
+      <w:bookmarkEnd w:id="5"/>
     </w:p>
     <w:p>
       <w:pPr>
@@ -4276,11 +4491,11 @@
         <w:pStyle w:val="Heading1"/>
         <w:pageBreakBefore/>
       </w:pPr>
-      <w:bookmarkStart w:id="5" w:name="_Toc241487763"/>
+      <w:bookmarkStart w:id="6" w:name="_Toc241488662"/>
       <w:r>
         <w:t>2.  The Employee App (technicians)</w:t>
       </w:r>
-      <w:bookmarkEnd w:id="5"/>
+      <w:bookmarkEnd w:id="6"/>
     </w:p>
     <w:p>
       <w:pPr>
@@ -4294,11 +4509,11 @@
       <w:pPr>
         <w:pStyle w:val="Heading2"/>
       </w:pPr>
-      <w:bookmarkStart w:id="6" w:name="_Toc241487764"/>
+      <w:bookmarkStart w:id="7" w:name="_Toc241488663"/>
       <w:r>
         <w:t>Home screen</w:t>
       </w:r>
-      <w:bookmarkEnd w:id="6"/>
+      <w:bookmarkEnd w:id="7"/>
     </w:p>
     <w:p>
       <w:pPr>
@@ -4434,18 +4649,18 @@
       <w:pPr>
         <w:pStyle w:val="Heading2"/>
       </w:pPr>
-      <w:bookmarkStart w:id="7" w:name="_Toc241487765"/>
+      <w:bookmarkStart w:id="8" w:name="_Toc241488664"/>
       <w:r>
         <w:t>Doing your QC checklist</w:t>
       </w:r>
-      <w:bookmarkEnd w:id="7"/>
+      <w:bookmarkEnd w:id="8"/>
     </w:p>
     <w:p>
       <w:pPr>
         <w:pStyle w:val="ListParagraph"/>
         <w:numPr>
           <w:ilvl w:val="0"/>
-          <w:numId w:val="4"/>
+          <w:numId w:val="5"/>
         </w:numPr>
         <w:spacing w:after="60"/>
       </w:pPr>
@@ -4458,7 +4673,7 @@
         <w:pStyle w:val="ListParagraph"/>
         <w:numPr>
           <w:ilvl w:val="0"/>
-          <w:numId w:val="4"/>
+          <w:numId w:val="5"/>
         </w:numPr>
         <w:spacing w:after="60"/>
       </w:pPr>
@@ -4481,7 +4696,7 @@
         <w:pStyle w:val="ListParagraph"/>
         <w:numPr>
           <w:ilvl w:val="0"/>
-          <w:numId w:val="4"/>
+          <w:numId w:val="5"/>
         </w:numPr>
         <w:spacing w:after="60"/>
       </w:pPr>
@@ -4494,7 +4709,7 @@
         <w:pStyle w:val="ListParagraph"/>
         <w:numPr>
           <w:ilvl w:val="0"/>
-          <w:numId w:val="4"/>
+          <w:numId w:val="5"/>
         </w:numPr>
         <w:spacing w:after="60"/>
       </w:pPr>
@@ -4507,7 +4722,7 @@
         <w:pStyle w:val="ListParagraph"/>
         <w:numPr>
           <w:ilvl w:val="0"/>
-          <w:numId w:val="4"/>
+          <w:numId w:val="5"/>
         </w:numPr>
         <w:spacing w:after="60"/>
       </w:pPr>
@@ -4530,7 +4745,7 @@
         <w:pStyle w:val="ListParagraph"/>
         <w:numPr>
           <w:ilvl w:val="0"/>
-          <w:numId w:val="4"/>
+          <w:numId w:val="5"/>
         </w:numPr>
         <w:spacing w:after="60"/>
       </w:pPr>
@@ -4583,18 +4798,18 @@
       <w:pPr>
         <w:pStyle w:val="Heading2"/>
       </w:pPr>
-      <w:bookmarkStart w:id="8" w:name="_Toc241487766"/>
+      <w:bookmarkStart w:id="9" w:name="_Toc241488665"/>
       <w:r>
         <w:t>Signing and rework</w:t>
       </w:r>
-      <w:bookmarkEnd w:id="8"/>
+      <w:bookmarkEnd w:id="9"/>
     </w:p>
     <w:p>
       <w:pPr>
         <w:pStyle w:val="ListParagraph"/>
         <w:numPr>
           <w:ilvl w:val="0"/>
-          <w:numId w:val="5"/>
+          <w:numId w:val="6"/>
         </w:numPr>
         <w:spacing w:after="60"/>
       </w:pPr>
@@ -4607,7 +4822,7 @@
         <w:pStyle w:val="ListParagraph"/>
         <w:numPr>
           <w:ilvl w:val="0"/>
-          <w:numId w:val="5"/>
+          <w:numId w:val="6"/>
         </w:numPr>
         <w:spacing w:after="60"/>
       </w:pPr>
@@ -4640,7 +4855,7 @@
         <w:pStyle w:val="ListParagraph"/>
         <w:numPr>
           <w:ilvl w:val="0"/>
-          <w:numId w:val="5"/>
+          <w:numId w:val="6"/>
         </w:numPr>
         <w:spacing w:after="60"/>
       </w:pPr>
@@ -4663,7 +4878,7 @@
         <w:pStyle w:val="ListParagraph"/>
         <w:numPr>
           <w:ilvl w:val="0"/>
-          <w:numId w:val="5"/>
+          <w:numId w:val="6"/>
         </w:numPr>
         <w:spacing w:after="60"/>
       </w:pPr>
@@ -4703,11 +4918,11 @@
       <w:pPr>
         <w:pStyle w:val="Heading2"/>
       </w:pPr>
-      <w:bookmarkStart w:id="9" w:name="_Toc241487767"/>
+      <w:bookmarkStart w:id="10" w:name="_Toc241488666"/>
       <w:r>
         <w:t>Other departments' checklists</w:t>
       </w:r>
-      <w:bookmarkEnd w:id="9"/>
+      <w:bookmarkEnd w:id="10"/>
     </w:p>
     <w:p>
       <w:pPr>
@@ -4731,11 +4946,11 @@
       <w:pPr>
         <w:pStyle w:val="Heading2"/>
       </w:pPr>
-      <w:bookmarkStart w:id="10" w:name="_Toc241487768"/>
+      <w:bookmarkStart w:id="11" w:name="_Toc241488667"/>
       <w:r>
         <w:t>Photos and parts</w:t>
       </w:r>
-      <w:bookmarkEnd w:id="10"/>
+      <w:bookmarkEnd w:id="11"/>
     </w:p>
     <w:p>
       <w:pPr>
@@ -4802,11 +5017,11 @@
         <w:pStyle w:val="Heading1"/>
         <w:pageBreakBefore/>
       </w:pPr>
-      <w:bookmarkStart w:id="11" w:name="_Toc241487769"/>
+      <w:bookmarkStart w:id="12" w:name="_Toc241488668"/>
       <w:r>
         <w:t>3.  Staff Hub: time off, mailbox and company info</w:t>
       </w:r>
-      <w:bookmarkEnd w:id="11"/>
+      <w:bookmarkEnd w:id="12"/>
     </w:p>
     <w:p>
       <w:pPr>
@@ -4830,18 +5045,18 @@
       <w:pPr>
         <w:pStyle w:val="Heading2"/>
       </w:pPr>
-      <w:bookmarkStart w:id="12" w:name="_Toc241487770"/>
+      <w:bookmarkStart w:id="13" w:name="_Toc241488669"/>
       <w:r>
         <w:t>Requesting time off</w:t>
       </w:r>
-      <w:bookmarkEnd w:id="12"/>
+      <w:bookmarkEnd w:id="13"/>
     </w:p>
     <w:p>
       <w:pPr>
         <w:pStyle w:val="ListParagraph"/>
         <w:numPr>
           <w:ilvl w:val="0"/>
-          <w:numId w:val="6"/>
+          <w:numId w:val="7"/>
         </w:numPr>
         <w:spacing w:after="60"/>
       </w:pPr>
@@ -4864,7 +5079,7 @@
         <w:pStyle w:val="ListParagraph"/>
         <w:numPr>
           <w:ilvl w:val="0"/>
-          <w:numId w:val="6"/>
+          <w:numId w:val="7"/>
         </w:numPr>
         <w:spacing w:after="60"/>
       </w:pPr>
@@ -4897,7 +5112,7 @@
         <w:pStyle w:val="ListParagraph"/>
         <w:numPr>
           <w:ilvl w:val="0"/>
-          <w:numId w:val="6"/>
+          <w:numId w:val="7"/>
         </w:numPr>
         <w:spacing w:after="60"/>
       </w:pPr>
@@ -4930,7 +5145,7 @@
         <w:pStyle w:val="ListParagraph"/>
         <w:numPr>
           <w:ilvl w:val="0"/>
-          <w:numId w:val="6"/>
+          <w:numId w:val="7"/>
         </w:numPr>
         <w:spacing w:after="60"/>
       </w:pPr>
@@ -4953,7 +5168,7 @@
         <w:pStyle w:val="ListParagraph"/>
         <w:numPr>
           <w:ilvl w:val="0"/>
-          <w:numId w:val="6"/>
+          <w:numId w:val="7"/>
         </w:numPr>
         <w:spacing w:after="60"/>
       </w:pPr>
@@ -4993,11 +5208,11 @@
       <w:pPr>
         <w:pStyle w:val="Heading2"/>
       </w:pPr>
-      <w:bookmarkStart w:id="13" w:name="_Toc241487771"/>
+      <w:bookmarkStart w:id="14" w:name="_Toc241488670"/>
       <w:r>
         <w:t>Checking your requests</w:t>
       </w:r>
-      <w:bookmarkEnd w:id="13"/>
+      <w:bookmarkEnd w:id="14"/>
     </w:p>
     <w:p>
       <w:pPr>
@@ -5048,11 +5263,11 @@
       <w:pPr>
         <w:pStyle w:val="Heading2"/>
       </w:pPr>
-      <w:bookmarkStart w:id="14" w:name="_Toc241487772"/>
+      <w:bookmarkStart w:id="15" w:name="_Toc241488671"/>
       <w:r>
         <w:t>Mailbox</w:t>
       </w:r>
-      <w:bookmarkEnd w:id="14"/>
+      <w:bookmarkEnd w:id="15"/>
     </w:p>
     <w:p>
       <w:pPr>
@@ -5117,11 +5332,11 @@
       <w:pPr>
         <w:pStyle w:val="Heading2"/>
       </w:pPr>
-      <w:bookmarkStart w:id="15" w:name="_Toc241487773"/>
+      <w:bookmarkStart w:id="16" w:name="_Toc241488672"/>
       <w:r>
         <w:t>Company info and this manual</w:t>
       </w:r>
-      <w:bookmarkEnd w:id="15"/>
+      <w:bookmarkEnd w:id="16"/>
     </w:p>
     <w:p>
       <w:pPr>
@@ -5153,11 +5368,11 @@
         <w:pStyle w:val="Heading1"/>
         <w:pageBreakBefore/>
       </w:pPr>
-      <w:bookmarkStart w:id="16" w:name="_Toc241487774"/>
+      <w:bookmarkStart w:id="17" w:name="_Toc241488673"/>
       <w:r>
         <w:t>4.  Dashboard</w:t>
       </w:r>
-      <w:bookmarkEnd w:id="16"/>
+      <w:bookmarkEnd w:id="17"/>
     </w:p>
     <w:p>
       <w:pPr>
@@ -5292,11 +5507,11 @@
         <w:pStyle w:val="Heading1"/>
         <w:pageBreakBefore/>
       </w:pPr>
-      <w:bookmarkStart w:id="17" w:name="_Toc241487775"/>
+      <w:bookmarkStart w:id="18" w:name="_Toc241488674"/>
       <w:r>
         <w:t>5.  Jobs and the Daily GO List</w:t>
       </w:r>
-      <w:bookmarkEnd w:id="17"/>
+      <w:bookmarkEnd w:id="18"/>
     </w:p>
     <w:p>
       <w:pPr>
@@ -5320,11 +5535,11 @@
       <w:pPr>
         <w:pStyle w:val="Heading2"/>
       </w:pPr>
-      <w:bookmarkStart w:id="18" w:name="_Toc241487776"/>
+      <w:bookmarkStart w:id="19" w:name="_Toc241488675"/>
       <w:r>
         <w:t>RO numbers</w:t>
       </w:r>
-      <w:bookmarkEnd w:id="18"/>
+      <w:bookmarkEnd w:id="19"/>
     </w:p>
     <w:p>
       <w:pPr>
@@ -5406,18 +5621,18 @@
       <w:pPr>
         <w:pStyle w:val="Heading2"/>
       </w:pPr>
-      <w:bookmarkStart w:id="19" w:name="_Toc241487777"/>
+      <w:bookmarkStart w:id="20" w:name="_Toc241488676"/>
       <w:r>
         <w:t>Adding or editing a job</w:t>
       </w:r>
-      <w:bookmarkEnd w:id="19"/>
+      <w:bookmarkEnd w:id="20"/>
     </w:p>
     <w:p>
       <w:pPr>
         <w:pStyle w:val="ListParagraph"/>
         <w:numPr>
           <w:ilvl w:val="0"/>
-          <w:numId w:val="7"/>
+          <w:numId w:val="8"/>
         </w:numPr>
         <w:spacing w:after="60"/>
       </w:pPr>
@@ -5460,7 +5675,7 @@
         <w:pStyle w:val="ListParagraph"/>
         <w:numPr>
           <w:ilvl w:val="0"/>
-          <w:numId w:val="7"/>
+          <w:numId w:val="8"/>
         </w:numPr>
         <w:spacing w:after="60"/>
       </w:pPr>
@@ -5473,7 +5688,7 @@
         <w:pStyle w:val="ListParagraph"/>
         <w:numPr>
           <w:ilvl w:val="0"/>
-          <w:numId w:val="7"/>
+          <w:numId w:val="8"/>
         </w:numPr>
         <w:spacing w:after="60"/>
       </w:pPr>
@@ -5496,7 +5711,7 @@
         <w:pStyle w:val="ListParagraph"/>
         <w:numPr>
           <w:ilvl w:val="0"/>
-          <w:numId w:val="7"/>
+          <w:numId w:val="8"/>
         </w:numPr>
         <w:spacing w:after="60"/>
       </w:pPr>
@@ -5526,11 +5741,11 @@
       <w:pPr>
         <w:pStyle w:val="Heading2"/>
       </w:pPr>
-      <w:bookmarkStart w:id="20" w:name="_Toc241487778"/>
+      <w:bookmarkStart w:id="21" w:name="_Toc241488677"/>
       <w:r>
         <w:t>Customer updates</w:t>
       </w:r>
-      <w:bookmarkEnd w:id="20"/>
+      <w:bookmarkEnd w:id="21"/>
     </w:p>
     <w:p>
       <w:pPr>
@@ -5608,7 +5823,7 @@
         <w:pStyle w:val="ListParagraph"/>
         <w:numPr>
           <w:ilvl w:val="0"/>
-          <w:numId w:val="8"/>
+          <w:numId w:val="9"/>
         </w:numPr>
         <w:spacing w:after="60"/>
       </w:pPr>
@@ -5621,7 +5836,7 @@
         <w:pStyle w:val="ListParagraph"/>
         <w:numPr>
           <w:ilvl w:val="0"/>
-          <w:numId w:val="8"/>
+          <w:numId w:val="9"/>
         </w:numPr>
         <w:spacing w:after="60"/>
       </w:pPr>
@@ -5654,7 +5869,7 @@
         <w:pStyle w:val="ListParagraph"/>
         <w:numPr>
           <w:ilvl w:val="0"/>
-          <w:numId w:val="8"/>
+          <w:numId w:val="9"/>
         </w:numPr>
         <w:spacing w:after="60"/>
       </w:pPr>
@@ -5695,21 +5910,21 @@
         <w:pStyle w:val="Heading1"/>
         <w:pageBreakBefore/>
       </w:pPr>
-      <w:bookmarkStart w:id="21" w:name="_Toc241487779"/>
+      <w:bookmarkStart w:id="22" w:name="_Toc241488678"/>
       <w:r>
         <w:t>6.  Production, Delivery and Planning boards</w:t>
       </w:r>
-      <w:bookmarkEnd w:id="21"/>
+      <w:bookmarkEnd w:id="22"/>
     </w:p>
     <w:p>
       <w:pPr>
         <w:pStyle w:val="Heading2"/>
       </w:pPr>
-      <w:bookmarkStart w:id="22" w:name="_Toc241487780"/>
+      <w:bookmarkStart w:id="23" w:name="_Toc241488679"/>
       <w:r>
         <w:t>Production Board</w:t>
       </w:r>
-      <w:bookmarkEnd w:id="22"/>
+      <w:bookmarkEnd w:id="23"/>
     </w:p>
     <w:p>
       <w:pPr>
@@ -5833,11 +6048,11 @@
       <w:pPr>
         <w:pStyle w:val="Heading2"/>
       </w:pPr>
-      <w:bookmarkStart w:id="23" w:name="_Toc241487781"/>
+      <w:bookmarkStart w:id="24" w:name="_Toc241488680"/>
       <w:r>
         <w:t>Vehicle pictures</w:t>
       </w:r>
-      <w:bookmarkEnd w:id="23"/>
+      <w:bookmarkEnd w:id="24"/>
     </w:p>
     <w:p>
       <w:pPr>
@@ -5891,11 +6106,11 @@
       <w:pPr>
         <w:pStyle w:val="Heading2"/>
       </w:pPr>
-      <w:bookmarkStart w:id="24" w:name="_Toc241487782"/>
+      <w:bookmarkStart w:id="25" w:name="_Toc241488681"/>
       <w:r>
         <w:t>Delivery and Planning boards</w:t>
       </w:r>
-      <w:bookmarkEnd w:id="24"/>
+      <w:bookmarkEnd w:id="25"/>
     </w:p>
     <w:p>
       <w:pPr>
@@ -5981,11 +6196,11 @@
       <w:pPr>
         <w:pStyle w:val="Heading2"/>
       </w:pPr>
-      <w:bookmarkStart w:id="25" w:name="_Toc241487783"/>
+      <w:bookmarkStart w:id="26" w:name="_Toc241488682"/>
       <w:r>
         <w:t>TV display</w:t>
       </w:r>
-      <w:bookmarkEnd w:id="25"/>
+      <w:bookmarkEnd w:id="26"/>
     </w:p>
     <w:p>
       <w:pPr>
@@ -6010,11 +6225,11 @@
         <w:pStyle w:val="Heading1"/>
         <w:pageBreakBefore/>
       </w:pPr>
-      <w:bookmarkStart w:id="26" w:name="_Toc241487784"/>
+      <w:bookmarkStart w:id="27" w:name="_Toc241488683"/>
       <w:r>
         <w:t>7.  CCC estimates coming into ShopControl</w:t>
       </w:r>
-      <w:bookmarkEnd w:id="26"/>
+      <w:bookmarkEnd w:id="27"/>
     </w:p>
     <w:p>
       <w:pPr>
@@ -6119,11 +6334,11 @@
         <w:pStyle w:val="Heading1"/>
         <w:pageBreakBefore/>
       </w:pPr>
-      <w:bookmarkStart w:id="27" w:name="_Toc241487785"/>
+      <w:bookmarkStart w:id="28" w:name="_Toc241488684"/>
       <w:r>
         <w:t>8.  Parts</w:t>
       </w:r>
-      <w:bookmarkEnd w:id="27"/>
+      <w:bookmarkEnd w:id="28"/>
     </w:p>
     <w:p>
       <w:pPr>
@@ -6177,11 +6392,11 @@
       <w:pPr>
         <w:pStyle w:val="Heading2"/>
       </w:pPr>
-      <w:bookmarkStart w:id="28" w:name="_Toc241487786"/>
+      <w:bookmarkStart w:id="29" w:name="_Toc241488685"/>
       <w:r>
         <w:t>What counts as a problem</w:t>
       </w:r>
-      <w:bookmarkEnd w:id="28"/>
+      <w:bookmarkEnd w:id="29"/>
     </w:p>
     <w:p>
       <w:pPr>
@@ -6245,116 +6460,9 @@
       <w:pPr>
         <w:pStyle w:val="Heading2"/>
       </w:pPr>
-      <w:bookmarkStart w:id="29" w:name="_Toc241487787"/>
+      <w:bookmarkStart w:id="30" w:name="_Toc241488686"/>
       <w:r>
         <w:t>Ordering parts</w:t>
-      </w:r>
-      <w:bookmarkEnd w:id="29"/>
-    </w:p>
-    <w:p>
-      <w:pPr>
-        <w:pStyle w:val="ListParagraph"/>
-        <w:numPr>
-          <w:ilvl w:val="0"/>
-          <w:numId w:val="9"/>
-        </w:numPr>
-        <w:spacing w:after="60"/>
-      </w:pPr>
-      <w:r>
-        <w:t xml:space="preserve">Click </w:t>
-      </w:r>
-      <w:r>
-        <w:rPr>
-          <w:b/>
-          <w:bCs/>
-        </w:rPr>
-        <w:t>Open Parts</w:t>
-      </w:r>
-      <w:r>
-        <w:t xml:space="preserve"> on a vehicle.</w:t>
-      </w:r>
-    </w:p>
-    <w:p>
-      <w:pPr>
-        <w:pStyle w:val="ListParagraph"/>
-        <w:numPr>
-          <w:ilvl w:val="0"/>
-          <w:numId w:val="9"/>
-        </w:numPr>
-        <w:spacing w:after="60"/>
-      </w:pPr>
-      <w:r>
-        <w:t xml:space="preserve">Select the parts (or </w:t>
-      </w:r>
-      <w:r>
-        <w:rPr>
-          <w:b/>
-          <w:bCs/>
-        </w:rPr>
-        <w:t>Select all parts</w:t>
-      </w:r>
-      <w:r>
-        <w:t>).</w:t>
-      </w:r>
-    </w:p>
-    <w:p>
-      <w:pPr>
-        <w:pStyle w:val="ListParagraph"/>
-        <w:numPr>
-          <w:ilvl w:val="0"/>
-          <w:numId w:val="9"/>
-        </w:numPr>
-        <w:spacing w:after="60"/>
-      </w:pPr>
-      <w:r>
-        <w:t xml:space="preserve">Click </w:t>
-      </w:r>
-      <w:r>
-        <w:rPr>
-          <w:b/>
-          <w:bCs/>
-        </w:rPr>
-        <w:t>Order Selected</w:t>
-      </w:r>
-      <w:r>
-        <w:t xml:space="preserve"> and enter the </w:t>
-      </w:r>
-      <w:r>
-        <w:rPr>
-          <w:b/>
-          <w:bCs/>
-        </w:rPr>
-        <w:t>expected arrival (ETA)</w:t>
-      </w:r>
-      <w:r>
-        <w:t xml:space="preserve"> the vendor gave you.</w:t>
-      </w:r>
-    </w:p>
-    <w:p>
-      <w:pPr>
-        <w:spacing w:after="120"/>
-      </w:pPr>
-      <w:r>
-        <w:t xml:space="preserve">If a part isn't marked received by its ETA, it moves to </w:t>
-      </w:r>
-      <w:r>
-        <w:rPr>
-          <w:b/>
-          <w:bCs/>
-        </w:rPr>
-        <w:t>Parts Not Arrived On Time</w:t>
-      </w:r>
-      <w:r>
-        <w:t>.</w:t>
-      </w:r>
-    </w:p>
-    <w:p>
-      <w:pPr>
-        <w:pStyle w:val="Heading2"/>
-      </w:pPr>
-      <w:bookmarkStart w:id="30" w:name="_Toc241487788"/>
-      <w:r>
-        <w:t>Mirror matching and carts</w:t>
       </w:r>
       <w:bookmarkEnd w:id="30"/>
     </w:p>
@@ -6368,17 +6476,17 @@
         <w:spacing w:after="60"/>
       </w:pPr>
       <w:r>
-        <w:t xml:space="preserve">When parts arrive and are mirror matched, select them and click </w:t>
-      </w:r>
-      <w:r>
-        <w:rPr>
-          <w:b/>
-          <w:bCs/>
-        </w:rPr>
-        <w:t>Mirror Match Selected</w:t>
-      </w:r>
-      <w:r>
-        <w:t>.</w:t>
+        <w:t xml:space="preserve">Click </w:t>
+      </w:r>
+      <w:r>
+        <w:rPr>
+          <w:b/>
+          <w:bCs/>
+        </w:rPr>
+        <w:t>Open Parts</w:t>
+      </w:r>
+      <w:r>
+        <w:t xml:space="preserve"> on a vehicle.</w:t>
       </w:r>
     </w:p>
     <w:p>
@@ -6391,17 +6499,17 @@
         <w:spacing w:after="60"/>
       </w:pPr>
       <w:r>
-        <w:t xml:space="preserve">Choose the </w:t>
-      </w:r>
-      <w:r>
-        <w:rPr>
-          <w:b/>
-          <w:bCs/>
-        </w:rPr>
-        <w:t>cart</w:t>
-      </w:r>
-      <w:r>
-        <w:t xml:space="preserve"> they go on. Carts already holding that RO are listed first, then empty carts. Pick a shelf now or sort it later.</w:t>
+        <w:t xml:space="preserve">Select the parts (or </w:t>
+      </w:r>
+      <w:r>
+        <w:rPr>
+          <w:b/>
+          <w:bCs/>
+        </w:rPr>
+        <w:t>Select all parts</w:t>
+      </w:r>
+      <w:r>
+        <w:t>).</w:t>
       </w:r>
     </w:p>
     <w:p>
@@ -6414,6 +6522,113 @@
         <w:spacing w:after="60"/>
       </w:pPr>
       <w:r>
+        <w:t xml:space="preserve">Click </w:t>
+      </w:r>
+      <w:r>
+        <w:rPr>
+          <w:b/>
+          <w:bCs/>
+        </w:rPr>
+        <w:t>Order Selected</w:t>
+      </w:r>
+      <w:r>
+        <w:t xml:space="preserve"> and enter the </w:t>
+      </w:r>
+      <w:r>
+        <w:rPr>
+          <w:b/>
+          <w:bCs/>
+        </w:rPr>
+        <w:t>expected arrival (ETA)</w:t>
+      </w:r>
+      <w:r>
+        <w:t xml:space="preserve"> the vendor gave you.</w:t>
+      </w:r>
+    </w:p>
+    <w:p>
+      <w:pPr>
+        <w:spacing w:after="120"/>
+      </w:pPr>
+      <w:r>
+        <w:t xml:space="preserve">If a part isn't marked received by its ETA, it moves to </w:t>
+      </w:r>
+      <w:r>
+        <w:rPr>
+          <w:b/>
+          <w:bCs/>
+        </w:rPr>
+        <w:t>Parts Not Arrived On Time</w:t>
+      </w:r>
+      <w:r>
+        <w:t>.</w:t>
+      </w:r>
+    </w:p>
+    <w:p>
+      <w:pPr>
+        <w:pStyle w:val="Heading2"/>
+      </w:pPr>
+      <w:bookmarkStart w:id="31" w:name="_Toc241488687"/>
+      <w:r>
+        <w:t>Mirror matching and carts</w:t>
+      </w:r>
+      <w:bookmarkEnd w:id="31"/>
+    </w:p>
+    <w:p>
+      <w:pPr>
+        <w:pStyle w:val="ListParagraph"/>
+        <w:numPr>
+          <w:ilvl w:val="0"/>
+          <w:numId w:val="11"/>
+        </w:numPr>
+        <w:spacing w:after="60"/>
+      </w:pPr>
+      <w:r>
+        <w:t xml:space="preserve">When parts arrive and are mirror matched, select them and click </w:t>
+      </w:r>
+      <w:r>
+        <w:rPr>
+          <w:b/>
+          <w:bCs/>
+        </w:rPr>
+        <w:t>Mirror Match Selected</w:t>
+      </w:r>
+      <w:r>
+        <w:t>.</w:t>
+      </w:r>
+    </w:p>
+    <w:p>
+      <w:pPr>
+        <w:pStyle w:val="ListParagraph"/>
+        <w:numPr>
+          <w:ilvl w:val="0"/>
+          <w:numId w:val="11"/>
+        </w:numPr>
+        <w:spacing w:after="60"/>
+      </w:pPr>
+      <w:r>
+        <w:t xml:space="preserve">Choose the </w:t>
+      </w:r>
+      <w:r>
+        <w:rPr>
+          <w:b/>
+          <w:bCs/>
+        </w:rPr>
+        <w:t>cart</w:t>
+      </w:r>
+      <w:r>
+        <w:t xml:space="preserve"> they go on. Carts already holding that RO are listed first, then empty carts. Pick a shelf now or sort it later.</w:t>
+      </w:r>
+    </w:p>
+    <w:p>
+      <w:pPr>
+        <w:pStyle w:val="ListParagraph"/>
+        <w:numPr>
+          <w:ilvl w:val="0"/>
+          <w:numId w:val="11"/>
+        </w:numPr>
+        <w:spacing w:after="60"/>
+      </w:pPr>
+      <w:r>
         <w:t xml:space="preserve">In </w:t>
       </w:r>
       <w:r>
@@ -6462,11 +6677,11 @@
       <w:pPr>
         <w:pStyle w:val="Heading2"/>
       </w:pPr>
-      <w:bookmarkStart w:id="31" w:name="_Toc241487789"/>
+      <w:bookmarkStart w:id="32" w:name="_Toc241488688"/>
       <w:r>
         <w:t>Other parts screens</w:t>
       </w:r>
-      <w:bookmarkEnd w:id="31"/>
+      <w:bookmarkEnd w:id="32"/>
     </w:p>
     <w:p>
       <w:pPr>
@@ -6553,11 +6768,11 @@
         <w:pStyle w:val="Heading1"/>
         <w:pageBreakBefore/>
       </w:pPr>
-      <w:bookmarkStart w:id="32" w:name="_Toc241487790"/>
+      <w:bookmarkStart w:id="33" w:name="_Toc241488689"/>
       <w:r>
         <w:t>9.  Vehicle QC (office view)</w:t>
       </w:r>
-      <w:bookmarkEnd w:id="32"/>
+      <w:bookmarkEnd w:id="33"/>
     </w:p>
     <w:p>
       <w:pPr>
@@ -6620,21 +6835,21 @@
         <w:pStyle w:val="Heading1"/>
         <w:pageBreakBefore/>
       </w:pPr>
-      <w:bookmarkStart w:id="33" w:name="_Toc241487791"/>
+      <w:bookmarkStart w:id="34" w:name="_Toc241488690"/>
       <w:r>
         <w:t>10.  Office tools</w:t>
       </w:r>
-      <w:bookmarkEnd w:id="33"/>
+      <w:bookmarkEnd w:id="34"/>
     </w:p>
     <w:p>
       <w:pPr>
         <w:pStyle w:val="Heading2"/>
       </w:pPr>
-      <w:bookmarkStart w:id="34" w:name="_Toc241487792"/>
+      <w:bookmarkStart w:id="35" w:name="_Toc241488691"/>
       <w:r>
         <w:t>Missed Calls / Callback Requests</w:t>
       </w:r>
-      <w:bookmarkEnd w:id="34"/>
+      <w:bookmarkEnd w:id="35"/>
     </w:p>
     <w:p>
       <w:pPr>
@@ -6708,11 +6923,11 @@
       <w:pPr>
         <w:pStyle w:val="Heading2"/>
       </w:pPr>
-      <w:bookmarkStart w:id="35" w:name="_Toc241487793"/>
+      <w:bookmarkStart w:id="36" w:name="_Toc241488692"/>
       <w:r>
         <w:t>Tasks</w:t>
       </w:r>
-      <w:bookmarkEnd w:id="35"/>
+      <w:bookmarkEnd w:id="36"/>
     </w:p>
     <w:p>
       <w:pPr>
@@ -6726,11 +6941,11 @@
       <w:pPr>
         <w:pStyle w:val="Heading2"/>
       </w:pPr>
-      <w:bookmarkStart w:id="36" w:name="_Toc241487794"/>
+      <w:bookmarkStart w:id="37" w:name="_Toc241488693"/>
       <w:r>
         <w:t>Booth Filters and Facility Checklist</w:t>
       </w:r>
-      <w:bookmarkEnd w:id="36"/>
+      <w:bookmarkEnd w:id="37"/>
     </w:p>
     <w:p>
       <w:pPr>
@@ -6764,11 +6979,11 @@
       <w:pPr>
         <w:pStyle w:val="Heading2"/>
       </w:pPr>
-      <w:bookmarkStart w:id="37" w:name="_Toc241487795"/>
+      <w:bookmarkStart w:id="38" w:name="_Toc241488694"/>
       <w:r>
         <w:t>AR Balances and Cycle Time</w:t>
       </w:r>
-      <w:bookmarkEnd w:id="37"/>
+      <w:bookmarkEnd w:id="38"/>
     </w:p>
     <w:p>
       <w:pPr>
@@ -6814,11 +7029,11 @@
       <w:pPr>
         <w:pStyle w:val="Heading2"/>
       </w:pPr>
-      <w:bookmarkStart w:id="38" w:name="_Toc241487796"/>
+      <w:bookmarkStart w:id="39" w:name="_Toc241488695"/>
       <w:r>
         <w:t>Photos and Activity Log</w:t>
       </w:r>
-      <w:bookmarkEnd w:id="38"/>
+      <w:bookmarkEnd w:id="39"/>
     </w:p>
     <w:p>
       <w:pPr>
@@ -6865,21 +7080,21 @@
         <w:pStyle w:val="Heading1"/>
         <w:pageBreakBefore/>
       </w:pPr>
-      <w:bookmarkStart w:id="39" w:name="_Toc241487797"/>
+      <w:bookmarkStart w:id="40" w:name="_Toc241488696"/>
       <w:r>
         <w:t>11.  Time off and messages (office and admins)</w:t>
       </w:r>
-      <w:bookmarkEnd w:id="39"/>
+      <w:bookmarkEnd w:id="40"/>
     </w:p>
     <w:p>
       <w:pPr>
         <w:pStyle w:val="Heading2"/>
       </w:pPr>
-      <w:bookmarkStart w:id="40" w:name="_Toc241487798"/>
+      <w:bookmarkStart w:id="41" w:name="_Toc241488697"/>
       <w:r>
         <w:t>Time Off tab</w:t>
       </w:r>
-      <w:bookmarkEnd w:id="40"/>
+      <w:bookmarkEnd w:id="41"/>
     </w:p>
     <w:p>
       <w:pPr>
@@ -6904,7 +7119,7 @@
         <w:pStyle w:val="ListParagraph"/>
         <w:numPr>
           <w:ilvl w:val="0"/>
-          <w:numId w:val="11"/>
+          <w:numId w:val="12"/>
         </w:numPr>
         <w:spacing w:after="60"/>
       </w:pPr>
@@ -6927,7 +7142,7 @@
         <w:pStyle w:val="ListParagraph"/>
         <w:numPr>
           <w:ilvl w:val="0"/>
-          <w:numId w:val="11"/>
+          <w:numId w:val="12"/>
         </w:numPr>
         <w:spacing w:after="60"/>
       </w:pPr>
@@ -6960,7 +7175,7 @@
         <w:pStyle w:val="ListParagraph"/>
         <w:numPr>
           <w:ilvl w:val="0"/>
-          <w:numId w:val="11"/>
+          <w:numId w:val="12"/>
         </w:numPr>
         <w:spacing w:after="60"/>
       </w:pPr>
@@ -7003,11 +7218,11 @@
       <w:pPr>
         <w:pStyle w:val="Heading2"/>
       </w:pPr>
-      <w:bookmarkStart w:id="41" w:name="_Toc241487799"/>
+      <w:bookmarkStart w:id="42" w:name="_Toc241488698"/>
       <w:r>
         <w:t>Messages &amp; Info tab</w:t>
       </w:r>
-      <w:bookmarkEnd w:id="41"/>
+      <w:bookmarkEnd w:id="42"/>
     </w:p>
     <w:p>
       <w:pPr>
@@ -7094,28 +7309,28 @@
         <w:pStyle w:val="Heading1"/>
         <w:pageBreakBefore/>
       </w:pPr>
-      <w:bookmarkStart w:id="42" w:name="_Toc241487800"/>
+      <w:bookmarkStart w:id="43" w:name="_Toc241488699"/>
       <w:r>
         <w:t>12.  Admin: employees and settings</w:t>
       </w:r>
-      <w:bookmarkEnd w:id="42"/>
+      <w:bookmarkEnd w:id="43"/>
     </w:p>
     <w:p>
       <w:pPr>
         <w:pStyle w:val="Heading2"/>
       </w:pPr>
-      <w:bookmarkStart w:id="43" w:name="_Toc241487801"/>
+      <w:bookmarkStart w:id="44" w:name="_Toc241488700"/>
       <w:r>
         <w:t>Adding an employee</w:t>
       </w:r>
-      <w:bookmarkEnd w:id="43"/>
+      <w:bookmarkEnd w:id="44"/>
     </w:p>
     <w:p>
       <w:pPr>
         <w:pStyle w:val="ListParagraph"/>
         <w:numPr>
           <w:ilvl w:val="0"/>
-          <w:numId w:val="12"/>
+          <w:numId w:val="13"/>
         </w:numPr>
         <w:spacing w:after="60"/>
       </w:pPr>
@@ -7148,7 +7363,7 @@
         <w:pStyle w:val="ListParagraph"/>
         <w:numPr>
           <w:ilvl w:val="0"/>
-          <w:numId w:val="12"/>
+          <w:numId w:val="13"/>
         </w:numPr>
         <w:spacing w:after="60"/>
       </w:pPr>
@@ -7161,7 +7376,7 @@
         <w:pStyle w:val="ListParagraph"/>
         <w:numPr>
           <w:ilvl w:val="0"/>
-          <w:numId w:val="12"/>
+          <w:numId w:val="13"/>
         </w:numPr>
         <w:spacing w:after="60"/>
       </w:pPr>
@@ -7194,7 +7409,7 @@
         <w:pStyle w:val="ListParagraph"/>
         <w:numPr>
           <w:ilvl w:val="0"/>
-          <w:numId w:val="12"/>
+          <w:numId w:val="13"/>
         </w:numPr>
         <w:spacing w:after="60"/>
       </w:pPr>
@@ -7216,11 +7431,11 @@
       <w:pPr>
         <w:pStyle w:val="Heading2"/>
       </w:pPr>
-      <w:bookmarkStart w:id="44" w:name="_Toc241487802"/>
+      <w:bookmarkStart w:id="45" w:name="_Toc241488701"/>
       <w:r>
         <w:t>Changing an employee</w:t>
       </w:r>
-      <w:bookmarkEnd w:id="44"/>
+      <w:bookmarkEnd w:id="45"/>
     </w:p>
     <w:p>
       <w:pPr>
@@ -7306,11 +7521,11 @@
       <w:pPr>
         <w:pStyle w:val="Heading2"/>
       </w:pPr>
-      <w:bookmarkStart w:id="45" w:name="_Toc241487803"/>
+      <w:bookmarkStart w:id="46" w:name="_Toc241488702"/>
       <w:r>
         <w:t>Board Settings</w:t>
       </w:r>
-      <w:bookmarkEnd w:id="45"/>
+      <w:bookmarkEnd w:id="46"/>
     </w:p>
     <w:p>
       <w:pPr>
@@ -7325,11 +7540,11 @@
         <w:pStyle w:val="Heading1"/>
         <w:pageBreakBefore/>
       </w:pPr>
-      <w:bookmarkStart w:id="46" w:name="_Toc241487804"/>
+      <w:bookmarkStart w:id="47" w:name="_Toc241488703"/>
       <w:r>
         <w:t>13.  Quick answers</w:t>
       </w:r>
-      <w:bookmarkEnd w:id="46"/>
+      <w:bookmarkEnd w:id="47"/>
     </w:p>
     <w:tbl>
       <w:tblPr>
@@ -7510,7 +7725,7 @@
                 <w:b/>
                 <w:bCs/>
               </w:rPr>
-              <w:t>I can't log in</w:t>
+              <w:t>The app won't open on my phone</w:t>
             </w:r>
           </w:p>
         </w:tc>
@@ -7532,7 +7747,7 @@
           </w:tcPr>
           <w:p>
             <w:r>
-              <w:t>Check the username. After 10 wrong tries wait 15 minutes. Use Forgot password? or ask an admin.</w:t>
+              <w:t>Check the address is https://conceptautobody.app and that you have internet (Wi-Fi or cell data). The shopcontrol.conceptauto.local address doesn't work on phones.</w:t>
             </w:r>
           </w:p>
         </w:tc>
@@ -7569,7 +7784,7 @@
                 <w:b/>
                 <w:bCs/>
               </w:rPr>
-              <w:t>An estimate from CCC isn't in ShopControl</w:t>
+              <w:t>I can't log in</w:t>
             </w:r>
           </w:p>
         </w:tc>
@@ -7591,7 +7806,7 @@
           </w:tcPr>
           <w:p>
             <w:r>
-              <w:t>Re-save it in CCC and wait a minute. Closed ROs are ignored on purpose.</w:t>
+              <w:t>Check the username. After 10 wrong tries wait 15 minutes. Use Forgot password? or ask an admin.</w:t>
             </w:r>
           </w:p>
         </w:tc>
@@ -7628,7 +7843,7 @@
                 <w:b/>
                 <w:bCs/>
               </w:rPr>
-              <w:t>It says the RO is already on another job</w:t>
+              <w:t>An estimate from CCC isn't in ShopControl</w:t>
             </w:r>
           </w:p>
         </w:tc>
@@ -7650,7 +7865,7 @@
           </w:tcPr>
           <w:p>
             <w:r>
-              <w:t>Look up the RO in CCC. Fix the RO on the wrong job first.</w:t>
+              <w:t>Re-save it in CCC and wait a minute. Closed ROs are ignored on purpose.</w:t>
             </w:r>
           </w:p>
         </w:tc>
@@ -7687,7 +7902,7 @@
                 <w:b/>
                 <w:bCs/>
               </w:rPr>
-              <w:t>A car isn't on the Production Board</w:t>
+              <w:t>It says the RO is already on another job</w:t>
             </w:r>
           </w:p>
         </w:tc>
@@ -7709,7 +7924,7 @@
           </w:tcPr>
           <w:p>
             <w:r>
-              <w:t>It needs a 5-digit RO and Vehicle is physically onsite checked.</w:t>
+              <w:t>Look up the RO in CCC. Fix the RO on the wrong job first.</w:t>
             </w:r>
           </w:p>
         </w:tc>
@@ -7746,7 +7961,7 @@
                 <w:b/>
                 <w:bCs/>
               </w:rPr>
-              <w:t>A card shows the wrong vehicle picture</w:t>
+              <w:t>A car isn't on the Production Board</w:t>
             </w:r>
           </w:p>
         </w:tc>
@@ -7768,7 +7983,7 @@
           </w:tcPr>
           <w:p>
             <w:r>
-              <w:t>Click the card and change Type and color under Vehicle picture.</w:t>
+              <w:t>It needs a 5-digit RO and Vehicle is physically onsite checked.</w:t>
             </w:r>
           </w:p>
         </w:tc>
@@ -7805,7 +8020,7 @@
                 <w:b/>
                 <w:bCs/>
               </w:rPr>
-              <w:t>My checklist didn't save</w:t>
+              <w:t>A card shows the wrong vehicle picture</w:t>
             </w:r>
           </w:p>
         </w:tc>
@@ -7827,7 +8042,7 @@
           </w:tcPr>
           <w:p>
             <w:r>
-              <w:t>Look for Saved at the top. If it says Not saved, check the Wi-Fi; it keeps retrying on its own.</w:t>
+              <w:t>Click the card and change Type and color under Vehicle picture.</w:t>
             </w:r>
           </w:p>
         </w:tc>
@@ -7864,7 +8079,7 @@
                 <w:b/>
                 <w:bCs/>
               </w:rPr>
-              <w:t>I need a different QC checklist</w:t>
+              <w:t>My checklist didn't save</w:t>
             </w:r>
           </w:p>
         </w:tc>
@@ -7886,6 +8101,65 @@
           </w:tcPr>
           <w:p>
             <w:r>
+              <w:t>Look for Saved at the top. If it says Not saved, check your internet connection (Wi-Fi or cell data); it keeps retrying on its own.</w:t>
+            </w:r>
+          </w:p>
+        </w:tc>
+      </w:tr>
+      <w:tr>
+        <w:tblPrEx>
+          <w:tblCellMar>
+            <w:top w:w="0" w:type="dxa"/>
+            <w:bottom w:w="0" w:type="dxa"/>
+          </w:tblCellMar>
+        </w:tblPrEx>
+        <w:trPr>
+          <w:cantSplit/>
+        </w:trPr>
+        <w:tc>
+          <w:tcPr>
+            <w:tcW w:w="2900" w:type="dxa"/>
+            <w:tcBorders>
+              <w:top w:val="single" w:sz="4" w:space="0" w:color="C9CFD6"/>
+              <w:left w:val="single" w:sz="4" w:space="0" w:color="C9CFD6"/>
+              <w:bottom w:val="single" w:sz="4" w:space="0" w:color="C9CFD6"/>
+              <w:right w:val="single" w:sz="4" w:space="0" w:color="C9CFD6"/>
+            </w:tcBorders>
+            <w:tcMar>
+              <w:top w:w="80" w:type="dxa"/>
+              <w:left w:w="120" w:type="dxa"/>
+              <w:bottom w:w="80" w:type="dxa"/>
+              <w:right w:w="120" w:type="dxa"/>
+            </w:tcMar>
+          </w:tcPr>
+          <w:p>
+            <w:r>
+              <w:rPr>
+                <w:b/>
+                <w:bCs/>
+              </w:rPr>
+              <w:t>I need a different QC checklist</w:t>
+            </w:r>
+          </w:p>
+        </w:tc>
+        <w:tc>
+          <w:tcPr>
+            <w:tcW w:w="6460" w:type="dxa"/>
+            <w:tcBorders>
+              <w:top w:val="single" w:sz="4" w:space="0" w:color="C9CFD6"/>
+              <w:left w:val="single" w:sz="4" w:space="0" w:color="C9CFD6"/>
+              <w:bottom w:val="single" w:sz="4" w:space="0" w:color="C9CFD6"/>
+              <w:right w:val="single" w:sz="4" w:space="0" w:color="C9CFD6"/>
+            </w:tcBorders>
+            <w:tcMar>
+              <w:top w:w="80" w:type="dxa"/>
+              <w:left w:w="120" w:type="dxa"/>
+              <w:bottom w:w="80" w:type="dxa"/>
+              <w:right w:w="120" w:type="dxa"/>
+            </w:tcMar>
+          </w:tcPr>
+          <w:p>
+            <w:r>
               <w:t>Ask an admin to set your QC Department, or tap the department on the vehicle screen.</w:t>
             </w:r>
           </w:p>
@@ -7910,11 +8184,11 @@
         <w:pStyle w:val="Heading1"/>
         <w:pageBreakBefore/>
       </w:pPr>
-      <w:bookmarkStart w:id="47" w:name="_Toc241487805"/>
+      <w:bookmarkStart w:id="48" w:name="_Toc241488704"/>
       <w:r>
         <w:t>Manual versions</w:t>
       </w:r>
-      <w:bookmarkEnd w:id="47"/>
+      <w:bookmarkEnd w:id="48"/>
     </w:p>
     <w:tbl>
       <w:tblPr>
@@ -8065,7 +8339,7 @@
                 <w:b/>
                 <w:bCs/>
               </w:rPr>
-              <w:t>1.0</w:t>
+              <w:t>1.1</w:t>
             </w:r>
           </w:p>
         </w:tc>
@@ -8109,6 +8383,97 @@
           </w:tcPr>
           <w:p>
             <w:r>
+              <w:t xml:space="preserve">Employee App address is now </w:t>
+            </w:r>
+            <w:r>
+              <w:rPr>
+                <w:b/>
+                <w:bCs/>
+              </w:rPr>
+              <w:t>https://conceptautobody.app</w:t>
+            </w:r>
+            <w:r>
+              <w:t xml:space="preserve"> and works on phones anywhere. Added how to put it on your phone's home screen.</w:t>
+            </w:r>
+          </w:p>
+        </w:tc>
+      </w:tr>
+      <w:tr>
+        <w:tblPrEx>
+          <w:tblCellMar>
+            <w:top w:w="0" w:type="dxa"/>
+            <w:bottom w:w="0" w:type="dxa"/>
+          </w:tblCellMar>
+        </w:tblPrEx>
+        <w:trPr>
+          <w:cantSplit/>
+        </w:trPr>
+        <w:tc>
+          <w:tcPr>
+            <w:tcW w:w="3120" w:type="dxa"/>
+            <w:tcBorders>
+              <w:top w:val="single" w:sz="4" w:space="0" w:color="C9CFD6"/>
+              <w:left w:val="single" w:sz="4" w:space="0" w:color="C9CFD6"/>
+              <w:bottom w:val="single" w:sz="4" w:space="0" w:color="C9CFD6"/>
+              <w:right w:val="single" w:sz="4" w:space="0" w:color="C9CFD6"/>
+            </w:tcBorders>
+            <w:tcMar>
+              <w:top w:w="80" w:type="dxa"/>
+              <w:left w:w="120" w:type="dxa"/>
+              <w:bottom w:w="80" w:type="dxa"/>
+              <w:right w:w="120" w:type="dxa"/>
+            </w:tcMar>
+          </w:tcPr>
+          <w:p>
+            <w:r>
+              <w:rPr>
+                <w:b/>
+                <w:bCs/>
+              </w:rPr>
+              <w:t>1.0</w:t>
+            </w:r>
+          </w:p>
+        </w:tc>
+        <w:tc>
+          <w:tcPr>
+            <w:tcW w:w="3120" w:type="dxa"/>
+            <w:tcBorders>
+              <w:top w:val="single" w:sz="4" w:space="0" w:color="C9CFD6"/>
+              <w:left w:val="single" w:sz="4" w:space="0" w:color="C9CFD6"/>
+              <w:bottom w:val="single" w:sz="4" w:space="0" w:color="C9CFD6"/>
+              <w:right w:val="single" w:sz="4" w:space="0" w:color="C9CFD6"/>
+            </w:tcBorders>
+            <w:tcMar>
+              <w:top w:w="80" w:type="dxa"/>
+              <w:left w:w="120" w:type="dxa"/>
+              <w:bottom w:w="80" w:type="dxa"/>
+              <w:right w:w="120" w:type="dxa"/>
+            </w:tcMar>
+          </w:tcPr>
+          <w:p>
+            <w:r>
+              <w:t>September 28, 2026</w:t>
+            </w:r>
+          </w:p>
+        </w:tc>
+        <w:tc>
+          <w:tcPr>
+            <w:tcW w:w="3120" w:type="dxa"/>
+            <w:tcBorders>
+              <w:top w:val="single" w:sz="4" w:space="0" w:color="C9CFD6"/>
+              <w:left w:val="single" w:sz="4" w:space="0" w:color="C9CFD6"/>
+              <w:bottom w:val="single" w:sz="4" w:space="0" w:color="C9CFD6"/>
+              <w:right w:val="single" w:sz="4" w:space="0" w:color="C9CFD6"/>
+            </w:tcBorders>
+            <w:tcMar>
+              <w:top w:w="80" w:type="dxa"/>
+              <w:left w:w="120" w:type="dxa"/>
+              <w:bottom w:w="80" w:type="dxa"/>
+              <w:right w:w="120" w:type="dxa"/>
+            </w:tcMar>
+          </w:tcPr>
+          <w:p>
+            <w:r>
               <w:t>First edition.</w:t>
             </w:r>
           </w:p>
@@ -8170,7 +8535,7 @@
         <w:sz w:val="18"/>
         <w:szCs w:val="18"/>
       </w:rPr>
-      <w:t xml:space="preserve">Concept Autobody  ·  Version 1.0  ·  Page </w:t>
+      <w:t xml:space="preserve">Concept Autobody  ·  Version 1.1  ·  Page </w:t>
     </w:r>
     <w:r>
       <w:rPr>
@@ -8263,10 +8628,64 @@
 <file path=word/numbering.xml><?xml version="1.0" encoding="utf-8"?>
 <w:numbering xmlns:wpc="http://schemas.microsoft.com/office/word/2010/wordprocessingCanvas" xmlns:cx="http://schemas.microsoft.com/office/drawing/2014/chartex" xmlns:cx1="http://schemas.microsoft.com/office/drawing/2015/9/8/chartex" xmlns:cx2="http://schemas.microsoft.com/office/drawing/2015/10/21/chartex" xmlns:cx3="http://schemas.microsoft.com/office/drawing/2016/5/9/chartex" xmlns:cx4="http://schemas.microsoft.com/office/drawing/2016/5/10/chartex" xmlns:cx5="http://schemas.microsoft.com/office/drawing/2016/5/11/chartex" xmlns:cx6="http://schemas.microsoft.com/office/drawing/2016/5/12/chartex" xmlns:cx7="http://schemas.microsoft.com/office/drawing/2016/5/13/chartex" xmlns:cx8="http://schemas.microsoft.com/office/drawing/2016/5/14/chartex" xmlns:mc="http://schemas.openxmlformats.org/markup-compatibility/2006" xmlns:aink="http://schemas.microsoft.com/office/drawing/2016/ink" xmlns:am3d="http://schemas.microsoft.com/office/drawing/2017/model3d" xmlns:o="urn:schemas-microsoft-com:office:office" xmlns:oel="http://schemas.microsoft.com/office/2019/extlst" xmlns:r="http://schemas.openxmlformats.org/officeDocument/2006/relationships" xmlns:m="http://schemas.openxmlformats.org/officeDocument/2006/math" xmlns:v="urn:schemas-microsoft-com:vml" xmlns:wp14="http://schemas.microsoft.com/office/word/2010/wordprocessingDrawing" xmlns:wp="http://schemas.openxmlformats.org/drawingml/2006/wordprocessingDrawing" xmlns:w10="urn:schemas-microsoft-com:office:word" xmlns:w="http://schemas.openxmlformats.org/wordprocessingml/2006/main" xmlns:w14="http://schemas.microsoft.com/office/word/2010/wordml" xmlns:w15="http://schemas.microsoft.com/office/word/2012/wordml" xmlns:w16cex="http://schemas.microsoft.com/office/word/2018/wordml/cex" xmlns:w16cid="http://schemas.microsoft.com/office/word/2016/wordml/cid" xmlns:w16="http://schemas.microsoft.com/office/word/2018/wordml" xmlns:w16du="http://schemas.microsoft.com/office/word/2023/wordml/word16du" xmlns:w16sdtdh="http://schemas.microsoft.com/office/word/2020/wordml/sdtdatahash" xmlns:w16sdtfl="http://schemas.microsoft.com/office/word/2024/wordml/sdtformatlock" xmlns:w16se="http://schemas.microsoft.com/office/word/2015/wordml/symex" xmlns:wpg="http://schemas.microsoft.com/office/word/2010/wordprocessingGroup" xmlns:wpi="http://schemas.microsoft.com/office/word/2010/wordprocessingInk" xmlns:wne="http://schemas.microsoft.com/office/word/2006/wordml" xmlns:wps="http://schemas.microsoft.com/office/word/2010/wordprocessingShape" mc:Ignorable="w14 w15 w16se w16cid w16 w16cex w16sdtdh w16sdtfl w16du wp14">
   <w:abstractNum w:abstractNumId="0" w15:restartNumberingAfterBreak="0">
-    <w:nsid w:val="266B0E98"/>
+    <w:nsid w:val="20132E79"/>
     <w:multiLevelType w:val="hybridMultilevel"/>
-    <w:tmpl w:val="0172E606"/>
-    <w:lvl w:ilvl="0" w:tplc="2ACC5D80">
+    <w:tmpl w:val="08CCC716"/>
+    <w:lvl w:ilvl="0" w:tplc="0DB2BDEC">
+      <w:start w:val="1"/>
+      <w:numFmt w:val="bullet"/>
+      <w:lvlText w:val="•"/>
+      <w:lvlJc w:val="left"/>
+      <w:pPr>
+        <w:ind w:left="540" w:hanging="270"/>
+      </w:pPr>
+    </w:lvl>
+    <w:lvl w:ilvl="1" w:tplc="99FA9F34">
+      <w:numFmt w:val="decimal"/>
+      <w:lvlText w:val=""/>
+      <w:lvlJc w:val="left"/>
+    </w:lvl>
+    <w:lvl w:ilvl="2" w:tplc="3CAE6316">
+      <w:numFmt w:val="decimal"/>
+      <w:lvlText w:val=""/>
+      <w:lvlJc w:val="left"/>
+    </w:lvl>
+    <w:lvl w:ilvl="3" w:tplc="B76E875E">
+      <w:numFmt w:val="decimal"/>
+      <w:lvlText w:val=""/>
+      <w:lvlJc w:val="left"/>
+    </w:lvl>
+    <w:lvl w:ilvl="4" w:tplc="8FFEB0C6">
+      <w:numFmt w:val="decimal"/>
+      <w:lvlText w:val=""/>
+      <w:lvlJc w:val="left"/>
+    </w:lvl>
+    <w:lvl w:ilvl="5" w:tplc="5072B268">
+      <w:numFmt w:val="decimal"/>
+      <w:lvlText w:val=""/>
+      <w:lvlJc w:val="left"/>
+    </w:lvl>
+    <w:lvl w:ilvl="6" w:tplc="ABCE9DCA">
+      <w:numFmt w:val="decimal"/>
+      <w:lvlText w:val=""/>
+      <w:lvlJc w:val="left"/>
+    </w:lvl>
+    <w:lvl w:ilvl="7" w:tplc="FA623A20">
+      <w:numFmt w:val="decimal"/>
+      <w:lvlText w:val=""/>
+      <w:lvlJc w:val="left"/>
+    </w:lvl>
+    <w:lvl w:ilvl="8" w:tplc="3E942DA2">
+      <w:numFmt w:val="decimal"/>
+      <w:lvlText w:val=""/>
+      <w:lvlJc w:val="left"/>
+    </w:lvl>
+  </w:abstractNum>
+  <w:abstractNum w:abstractNumId="1" w15:restartNumberingAfterBreak="0">
+    <w:nsid w:val="4D9E669C"/>
+    <w:multiLevelType w:val="hybridMultilevel"/>
+    <w:tmpl w:val="96941CE6"/>
+    <w:lvl w:ilvl="0" w:tplc="060AF66E">
       <w:start w:val="1"/>
       <w:numFmt w:val="decimal"/>
       <w:lvlText w:val="%1."/>
@@ -8280,106 +8699,52 @@
         <w:color w:val="E8620E"/>
       </w:rPr>
     </w:lvl>
-    <w:lvl w:ilvl="1" w:tplc="4D2E3F44">
+    <w:lvl w:ilvl="1" w:tplc="918AFC20">
       <w:numFmt w:val="decimal"/>
       <w:lvlText w:val=""/>
       <w:lvlJc w:val="left"/>
     </w:lvl>
-    <w:lvl w:ilvl="2" w:tplc="5FD834CE">
+    <w:lvl w:ilvl="2" w:tplc="DAAC8034">
       <w:numFmt w:val="decimal"/>
       <w:lvlText w:val=""/>
       <w:lvlJc w:val="left"/>
     </w:lvl>
-    <w:lvl w:ilvl="3" w:tplc="361C3168">
+    <w:lvl w:ilvl="3" w:tplc="E68C4D4E">
       <w:numFmt w:val="decimal"/>
       <w:lvlText w:val=""/>
       <w:lvlJc w:val="left"/>
     </w:lvl>
-    <w:lvl w:ilvl="4" w:tplc="D070D34A">
+    <w:lvl w:ilvl="4" w:tplc="14F44FC6">
       <w:numFmt w:val="decimal"/>
       <w:lvlText w:val=""/>
       <w:lvlJc w:val="left"/>
     </w:lvl>
-    <w:lvl w:ilvl="5" w:tplc="38940BDE">
+    <w:lvl w:ilvl="5" w:tplc="E1203BE2">
       <w:numFmt w:val="decimal"/>
       <w:lvlText w:val=""/>
       <w:lvlJc w:val="left"/>
     </w:lvl>
-    <w:lvl w:ilvl="6" w:tplc="AF6435C0">
+    <w:lvl w:ilvl="6" w:tplc="9E48ADE2">
       <w:numFmt w:val="decimal"/>
       <w:lvlText w:val=""/>
       <w:lvlJc w:val="left"/>
     </w:lvl>
-    <w:lvl w:ilvl="7" w:tplc="5220F20C">
+    <w:lvl w:ilvl="7" w:tplc="49663CD4">
       <w:numFmt w:val="decimal"/>
       <w:lvlText w:val=""/>
       <w:lvlJc w:val="left"/>
     </w:lvl>
-    <w:lvl w:ilvl="8" w:tplc="5ECE770C">
-      <w:numFmt w:val="decimal"/>
-      <w:lvlText w:val=""/>
-      <w:lvlJc w:val="left"/>
-    </w:lvl>
-  </w:abstractNum>
-  <w:abstractNum w:abstractNumId="1" w15:restartNumberingAfterBreak="0">
-    <w:nsid w:val="333A6CAE"/>
-    <w:multiLevelType w:val="hybridMultilevel"/>
-    <w:tmpl w:val="1F3A3CF8"/>
-    <w:lvl w:ilvl="0" w:tplc="46EA1650">
-      <w:start w:val="1"/>
-      <w:numFmt w:val="bullet"/>
-      <w:lvlText w:val="•"/>
-      <w:lvlJc w:val="left"/>
-      <w:pPr>
-        <w:ind w:left="540" w:hanging="270"/>
-      </w:pPr>
-    </w:lvl>
-    <w:lvl w:ilvl="1" w:tplc="3C76C60E">
-      <w:numFmt w:val="decimal"/>
-      <w:lvlText w:val=""/>
-      <w:lvlJc w:val="left"/>
-    </w:lvl>
-    <w:lvl w:ilvl="2" w:tplc="C17435D2">
-      <w:numFmt w:val="decimal"/>
-      <w:lvlText w:val=""/>
-      <w:lvlJc w:val="left"/>
-    </w:lvl>
-    <w:lvl w:ilvl="3" w:tplc="2884DE08">
-      <w:numFmt w:val="decimal"/>
-      <w:lvlText w:val=""/>
-      <w:lvlJc w:val="left"/>
-    </w:lvl>
-    <w:lvl w:ilvl="4" w:tplc="5E1A6042">
-      <w:numFmt w:val="decimal"/>
-      <w:lvlText w:val=""/>
-      <w:lvlJc w:val="left"/>
-    </w:lvl>
-    <w:lvl w:ilvl="5" w:tplc="25E2979A">
-      <w:numFmt w:val="decimal"/>
-      <w:lvlText w:val=""/>
-      <w:lvlJc w:val="left"/>
-    </w:lvl>
-    <w:lvl w:ilvl="6" w:tplc="584E2A72">
-      <w:numFmt w:val="decimal"/>
-      <w:lvlText w:val=""/>
-      <w:lvlJc w:val="left"/>
-    </w:lvl>
-    <w:lvl w:ilvl="7" w:tplc="B59CCB08">
-      <w:numFmt w:val="decimal"/>
-      <w:lvlText w:val=""/>
-      <w:lvlJc w:val="left"/>
-    </w:lvl>
-    <w:lvl w:ilvl="8" w:tplc="6838C6E4">
+    <w:lvl w:ilvl="8" w:tplc="1CD435AC">
       <w:numFmt w:val="decimal"/>
       <w:lvlText w:val=""/>
       <w:lvlJc w:val="left"/>
     </w:lvl>
   </w:abstractNum>
   <w:abstractNum w:abstractNumId="2" w15:restartNumberingAfterBreak="0">
-    <w:nsid w:val="5D8E4EAC"/>
+    <w:nsid w:val="50482E71"/>
     <w:multiLevelType w:val="hybridMultilevel"/>
-    <w:tmpl w:val="F788DC08"/>
-    <w:lvl w:ilvl="0" w:tplc="B3BEF274" w:tentative="1">
+    <w:tmpl w:val="A22C1908"/>
+    <w:lvl w:ilvl="0" w:tplc="CBF403F2" w:tentative="1">
       <w:start w:val="1"/>
       <w:numFmt w:val="bullet"/>
       <w:lvlText w:val="●"/>
@@ -8388,7 +8753,7 @@
         <w:ind w:left="720" w:hanging="360"/>
       </w:pPr>
     </w:lvl>
-    <w:lvl w:ilvl="1" w:tplc="E8CA1D40" w:tentative="1">
+    <w:lvl w:ilvl="1" w:tplc="C262AE40" w:tentative="1">
       <w:start w:val="1"/>
       <w:numFmt w:val="bullet"/>
       <w:lvlText w:val="○"/>
@@ -8397,7 +8762,7 @@
         <w:ind w:left="1440" w:hanging="360"/>
       </w:pPr>
     </w:lvl>
-    <w:lvl w:ilvl="2" w:tplc="9412FC4E" w:tentative="1">
+    <w:lvl w:ilvl="2" w:tplc="5C127ED6" w:tentative="1">
       <w:start w:val="1"/>
       <w:numFmt w:val="bullet"/>
       <w:lvlText w:val="■"/>
@@ -8406,7 +8771,7 @@
         <w:ind w:left="2160" w:hanging="360"/>
       </w:pPr>
     </w:lvl>
-    <w:lvl w:ilvl="3" w:tplc="E242BA2E" w:tentative="1">
+    <w:lvl w:ilvl="3" w:tplc="3508D0CA" w:tentative="1">
       <w:start w:val="1"/>
       <w:numFmt w:val="bullet"/>
       <w:lvlText w:val="●"/>
@@ -8415,7 +8780,7 @@
         <w:ind w:left="2880" w:hanging="360"/>
       </w:pPr>
     </w:lvl>
-    <w:lvl w:ilvl="4" w:tplc="06FE7DF4" w:tentative="1">
+    <w:lvl w:ilvl="4" w:tplc="638C47E0" w:tentative="1">
       <w:start w:val="1"/>
       <w:numFmt w:val="bullet"/>
       <w:lvlText w:val="○"/>
@@ -8424,7 +8789,7 @@
         <w:ind w:left="3600" w:hanging="360"/>
       </w:pPr>
     </w:lvl>
-    <w:lvl w:ilvl="5" w:tplc="7B2E2772" w:tentative="1">
+    <w:lvl w:ilvl="5" w:tplc="F080EF42" w:tentative="1">
       <w:start w:val="1"/>
       <w:numFmt w:val="bullet"/>
       <w:lvlText w:val="■"/>
@@ -8433,7 +8798,7 @@
         <w:ind w:left="4320" w:hanging="360"/>
       </w:pPr>
     </w:lvl>
-    <w:lvl w:ilvl="6" w:tplc="B38EE93E" w:tentative="1">
+    <w:lvl w:ilvl="6" w:tplc="7102F528" w:tentative="1">
       <w:start w:val="1"/>
       <w:numFmt w:val="bullet"/>
       <w:lvlText w:val="●"/>
@@ -8442,7 +8807,7 @@
         <w:ind w:left="5040" w:hanging="360"/>
       </w:pPr>
     </w:lvl>
-    <w:lvl w:ilvl="7" w:tplc="90FA3950" w:tentative="1">
+    <w:lvl w:ilvl="7" w:tplc="A4EC9712" w:tentative="1">
       <w:start w:val="1"/>
       <w:numFmt w:val="bullet"/>
       <w:lvlText w:val="●"/>
@@ -8451,7 +8816,7 @@
         <w:ind w:left="5760" w:hanging="360"/>
       </w:pPr>
     </w:lvl>
-    <w:lvl w:ilvl="8" w:tplc="033EC292" w:tentative="1">
+    <w:lvl w:ilvl="8" w:tplc="3190B78A" w:tentative="1">
       <w:start w:val="1"/>
       <w:numFmt w:val="bullet"/>
       <w:lvlText w:val="●"/>
@@ -8461,74 +8826,80 @@
       </w:pPr>
     </w:lvl>
   </w:abstractNum>
-  <w:num w:numId="1" w16cid:durableId="622733435">
+  <w:num w:numId="1" w16cid:durableId="1707170415">
     <w:abstractNumId w:val="2"/>
     <w:lvlOverride w:ilvl="0">
       <w:startOverride w:val="1"/>
     </w:lvlOverride>
   </w:num>
-  <w:num w:numId="2" w16cid:durableId="330568094">
+  <w:num w:numId="2" w16cid:durableId="1442072322">
+    <w:abstractNumId w:val="0"/>
+    <w:lvlOverride w:ilvl="0">
+      <w:startOverride w:val="1"/>
+    </w:lvlOverride>
+  </w:num>
+  <w:num w:numId="3" w16cid:durableId="566305235">
     <w:abstractNumId w:val="1"/>
     <w:lvlOverride w:ilvl="0">
       <w:startOverride w:val="1"/>
     </w:lvlOverride>
   </w:num>
-  <w:num w:numId="3" w16cid:durableId="1008561888">
-    <w:abstractNumId w:val="0"/>
+  <w:num w:numId="4" w16cid:durableId="332954301">
+    <w:abstractNumId w:val="1"/>
     <w:lvlOverride w:ilvl="0">
       <w:startOverride w:val="1"/>
     </w:lvlOverride>
   </w:num>
-  <w:num w:numId="4" w16cid:durableId="1404523172">
-    <w:abstractNumId w:val="0"/>
+  <w:num w:numId="5" w16cid:durableId="1058088335">
+    <w:abstractNumId w:val="1"/>
     <w:lvlOverride w:ilvl="0">
       <w:startOverride w:val="1"/>
     </w:lvlOverride>
   </w:num>
-  <w:num w:numId="5" w16cid:durableId="17777749">
-    <w:abstractNumId w:val="0"/>
+  <w:num w:numId="6" w16cid:durableId="503519786">
+    <w:abstractNumId w:val="1"/>
     <w:lvlOverride w:ilvl="0">
       <w:startOverride w:val="1"/>
     </w:lvlOverride>
   </w:num>
-  <w:num w:numId="6" w16cid:durableId="930434395">
-    <w:abstractNumId w:val="0"/>
+  <w:num w:numId="7" w16cid:durableId="2086678941">
+    <w:abstractNumId w:val="1"/>
     <w:lvlOverride w:ilvl="0">
       <w:startOverride w:val="1"/>
     </w:lvlOverride>
   </w:num>
-  <w:num w:numId="7" w16cid:durableId="1353875076">
-    <w:abstractNumId w:val="0"/>
+  <w:num w:numId="8" w16cid:durableId="1154101781">
+    <w:abstractNumId w:val="1"/>
     <w:lvlOverride w:ilvl="0">
       <w:startOverride w:val="1"/>
     </w:lvlOverride>
   </w:num>
-  <w:num w:numId="8" w16cid:durableId="1836845809">
-    <w:abstractNumId w:val="0"/>
+  <w:num w:numId="9" w16cid:durableId="404378265">
+    <w:abstractNumId w:val="1"/>
     <w:lvlOverride w:ilvl="0">
       <w:startOverride w:val="1"/>
     </w:lvlOverride>
   </w:num>
-  <w:num w:numId="9" w16cid:durableId="1786657206">
-    <w:abstractNumId w:val="0"/>
+  <w:num w:numId="10" w16cid:durableId="2035879626">
+    <w:abstractNumId w:val="1"/>
     <w:lvlOverride w:ilvl="0">
       <w:startOverride w:val="1"/>
     </w:lvlOverride>
   </w:num>
-  <w:num w:numId="10" w16cid:durableId="480582275">
-    <w:abstractNumId w:val="0"/>
+  <w:num w:numId="11" w16cid:durableId="1691761738">
+    <w:abstractNumId w:val="1"/>
     <w:lvlOverride w:ilvl="0">
       <w:startOverride w:val="1"/>
     </w:lvlOverride>
   </w:num>
-  <w:num w:numId="11" w16cid:durableId="1197044182">
-    <w:abstractNumId w:val="0"/>
+  <w:num w:numId="12" w16cid:durableId="2017876152">
+    <w:abstractNumId w:val="1"/>
     <w:lvlOverride w:ilvl="0">
       <w:startOverride w:val="1"/>
     </w:lvlOverride>
   </w:num>
-  <w:num w:numId="12" w16cid:durableId="2710123">
-    <w:abstractNumId w:val="0"/>
+  <w:num w:numId="13" w16cid:durableId="148062563">
+    <w:abstractNumId w:val="1"/>
     <w:lvlOverride w:ilvl="0">
       <w:startOverride w:val="1"/>
     </w:lvlOverride>
@@ -9180,7 +9551,7 @@
     <w:autoRedefine/>
     <w:uiPriority w:val="39"/>
     <w:unhideWhenUsed/>
-    <w:rsid w:val="000B3345"/>
+    <w:rsid w:val="00B27DCA"/>
     <w:pPr>
       <w:spacing w:after="100"/>
     </w:pPr>
@@ -9192,7 +9563,7 @@
     <w:autoRedefine/>
     <w:uiPriority w:val="39"/>
     <w:unhideWhenUsed/>
-    <w:rsid w:val="000B3345"/>
+    <w:rsid w:val="00B27DCA"/>
     <w:pPr>
       <w:spacing w:after="100"/>
       <w:ind w:left="220"/>

</xml_diff>

<commit_message>
Help tab in the office program; searchable manual (v1.2)
The desktop left menu's Help tab shows the user manual inside ShopControl
(replacing the "User manual" link), with Open in new tab and Download Word copy.
The manual gets a search box that shows only matching sections, highlighted.

Co-Authored-By: Claude Opus 5.5 <noreply@anthropic.com>
</commit_message>
<xml_diff>
--- a/client/manual/ShopControl-User-Manual.docx
+++ b/client/manual/ShopControl-User-Manual.docx
@@ -16,7 +16,7 @@
           <w:noProof/>
         </w:rPr>
         <w:drawing>
-          <wp:inline distT="0" distB="0" distL="0" distR="0" wp14:anchorId="78E0502B" wp14:editId="78E0502C">
+          <wp:inline distT="0" distB="0" distL="0" distR="0" wp14:anchorId="4D6671C3" wp14:editId="4D6671C4">
             <wp:extent cx="4000500" cy="1485900"/>
             <wp:effectExtent l="0" t="0" r="0" b="0"/>
             <wp:docPr id="1" name="Picture 1"/>
@@ -93,7 +93,7 @@
         <w:rPr>
           <w:color w:val="5B6776"/>
         </w:rPr>
-        <w:t>Version 1.1  ·  Updated September 28, 2026</w:t>
+        <w:t>Version 1.2  ·  Updated September 28, 2026</w:t>
       </w:r>
     </w:p>
     <w:p>
@@ -122,7 +122,7 @@
     <w:sdt>
       <w:sdtPr>
         <w:alias w:val="Contents"/>
-        <w:id w:val="-309482708"/>
+        <w:id w:val="-2115046102"/>
       </w:sdtPr>
       <w:sdtEndPr/>
       <w:sdtContent>
@@ -151,7 +151,7 @@
           <w:r>
             <w:fldChar w:fldCharType="separate"/>
           </w:r>
-          <w:hyperlink w:anchor="_Toc241488656" w:history="1">
+          <w:hyperlink w:anchor="_Toc241488889" w:history="1">
             <w:r>
               <w:rPr>
                 <w:rStyle w:val="Hyperlink"/>
@@ -175,7 +175,7 @@
               <w:rPr>
                 <w:noProof/>
               </w:rPr>
-              <w:instrText xml:space="preserve"> PAGEREF _Toc241488656 \h </w:instrText>
+              <w:instrText xml:space="preserve"> PAGEREF _Toc241488889 \h </w:instrText>
             </w:r>
             <w:r>
               <w:rPr>
@@ -218,7 +218,7 @@
               <w14:ligatures w14:val="standardContextual"/>
             </w:rPr>
           </w:pPr>
-          <w:hyperlink w:anchor="_Toc241488657" w:history="1">
+          <w:hyperlink w:anchor="_Toc241488890" w:history="1">
             <w:r>
               <w:rPr>
                 <w:rStyle w:val="Hyperlink"/>
@@ -242,7 +242,7 @@
               <w:rPr>
                 <w:noProof/>
               </w:rPr>
-              <w:instrText xml:space="preserve"> PAGEREF _Toc241488657 \h </w:instrText>
+              <w:instrText xml:space="preserve"> PAGEREF _Toc241488890 \h </w:instrText>
             </w:r>
             <w:r>
               <w:rPr>
@@ -285,13 +285,13 @@
               <w14:ligatures w14:val="standardContextual"/>
             </w:rPr>
           </w:pPr>
-          <w:hyperlink w:anchor="_Toc241488658" w:history="1">
+          <w:hyperlink w:anchor="_Toc241488891" w:history="1">
             <w:r>
               <w:rPr>
                 <w:rStyle w:val="Hyperlink"/>
                 <w:noProof/>
               </w:rPr>
-              <w:t>Put the app on your phone's home screen</w:t>
+              <w:t>Finding help</w:t>
             </w:r>
             <w:r>
               <w:rPr>
@@ -309,7 +309,7 @@
               <w:rPr>
                 <w:noProof/>
               </w:rPr>
-              <w:instrText xml:space="preserve"> PAGEREF _Toc241488658 \h </w:instrText>
+              <w:instrText xml:space="preserve"> PAGEREF _Toc241488891 \h </w:instrText>
             </w:r>
             <w:r>
               <w:rPr>
@@ -352,13 +352,13 @@
               <w14:ligatures w14:val="standardContextual"/>
             </w:rPr>
           </w:pPr>
-          <w:hyperlink w:anchor="_Toc241488659" w:history="1">
+          <w:hyperlink w:anchor="_Toc241488892" w:history="1">
             <w:r>
               <w:rPr>
                 <w:rStyle w:val="Hyperlink"/>
                 <w:noProof/>
               </w:rPr>
-              <w:t>Logging in</w:t>
+              <w:t>Put the app on your phone's home screen</w:t>
             </w:r>
             <w:r>
               <w:rPr>
@@ -376,7 +376,7 @@
               <w:rPr>
                 <w:noProof/>
               </w:rPr>
-              <w:instrText xml:space="preserve"> PAGEREF _Toc241488659 \h </w:instrText>
+              <w:instrText xml:space="preserve"> PAGEREF _Toc241488892 \h </w:instrText>
             </w:r>
             <w:r>
               <w:rPr>
@@ -419,13 +419,13 @@
               <w14:ligatures w14:val="standardContextual"/>
             </w:rPr>
           </w:pPr>
-          <w:hyperlink w:anchor="_Toc241488660" w:history="1">
+          <w:hyperlink w:anchor="_Toc241488893" w:history="1">
             <w:r>
               <w:rPr>
                 <w:rStyle w:val="Hyperlink"/>
                 <w:noProof/>
               </w:rPr>
-              <w:t>Staying up to date</w:t>
+              <w:t>Logging in</w:t>
             </w:r>
             <w:r>
               <w:rPr>
@@ -443,7 +443,7 @@
               <w:rPr>
                 <w:noProof/>
               </w:rPr>
-              <w:instrText xml:space="preserve"> PAGEREF _Toc241488660 \h </w:instrText>
+              <w:instrText xml:space="preserve"> PAGEREF _Toc241488893 \h </w:instrText>
             </w:r>
             <w:r>
               <w:rPr>
@@ -486,12 +486,79 @@
               <w14:ligatures w14:val="standardContextual"/>
             </w:rPr>
           </w:pPr>
-          <w:hyperlink w:anchor="_Toc241488661" w:history="1">
+          <w:hyperlink w:anchor="_Toc241488894" w:history="1">
             <w:r>
               <w:rPr>
                 <w:rStyle w:val="Hyperlink"/>
                 <w:noProof/>
               </w:rPr>
+              <w:t>Staying up to date</w:t>
+            </w:r>
+            <w:r>
+              <w:rPr>
+                <w:noProof/>
+              </w:rPr>
+              <w:tab/>
+            </w:r>
+            <w:r>
+              <w:rPr>
+                <w:noProof/>
+              </w:rPr>
+              <w:fldChar w:fldCharType="begin"/>
+            </w:r>
+            <w:r>
+              <w:rPr>
+                <w:noProof/>
+              </w:rPr>
+              <w:instrText xml:space="preserve"> PAGEREF _Toc241488894 \h </w:instrText>
+            </w:r>
+            <w:r>
+              <w:rPr>
+                <w:noProof/>
+              </w:rPr>
+            </w:r>
+            <w:r>
+              <w:rPr>
+                <w:noProof/>
+              </w:rPr>
+              <w:fldChar w:fldCharType="separate"/>
+            </w:r>
+            <w:r>
+              <w:rPr>
+                <w:noProof/>
+              </w:rPr>
+              <w:t>5</w:t>
+            </w:r>
+            <w:r>
+              <w:rPr>
+                <w:noProof/>
+              </w:rPr>
+              <w:fldChar w:fldCharType="end"/>
+            </w:r>
+          </w:hyperlink>
+        </w:p>
+        <w:p>
+          <w:pPr>
+            <w:pStyle w:val="TOC2"/>
+            <w:tabs>
+              <w:tab w:val="right" w:leader="dot" w:pos="9350"/>
+            </w:tabs>
+            <w:rPr>
+              <w:rFonts w:asciiTheme="minorHAnsi" w:eastAsiaTheme="minorEastAsia" w:hAnsiTheme="minorHAnsi" w:cstheme="minorBidi"/>
+              <w:noProof/>
+              <w:color w:val="auto"/>
+              <w:kern w:val="2"/>
+              <w:sz w:val="24"/>
+              <w:szCs w:val="24"/>
+              <w14:ligatures w14:val="standardContextual"/>
+            </w:rPr>
+          </w:pPr>
+          <w:hyperlink w:anchor="_Toc241488895" w:history="1">
+            <w:r>
+              <w:rPr>
+                <w:rStyle w:val="Hyperlink"/>
+                <w:noProof/>
+              </w:rPr>
               <w:t>Who can do what</w:t>
             </w:r>
             <w:r>
@@ -510,7 +577,7 @@
               <w:rPr>
                 <w:noProof/>
               </w:rPr>
-              <w:instrText xml:space="preserve"> PAGEREF _Toc241488661 \h </w:instrText>
+              <w:instrText xml:space="preserve"> PAGEREF _Toc241488895 \h </w:instrText>
             </w:r>
             <w:r>
               <w:rPr>
@@ -527,7 +594,7 @@
               <w:rPr>
                 <w:noProof/>
               </w:rPr>
-              <w:t>4</w:t>
+              <w:t>5</w:t>
             </w:r>
             <w:r>
               <w:rPr>
@@ -553,7 +620,7 @@
               <w14:ligatures w14:val="standardContextual"/>
             </w:rPr>
           </w:pPr>
-          <w:hyperlink w:anchor="_Toc241488662" w:history="1">
+          <w:hyperlink w:anchor="_Toc241488896" w:history="1">
             <w:r>
               <w:rPr>
                 <w:rStyle w:val="Hyperlink"/>
@@ -577,7 +644,7 @@
               <w:rPr>
                 <w:noProof/>
               </w:rPr>
-              <w:instrText xml:space="preserve"> PAGEREF _Toc241488662 \h </w:instrText>
+              <w:instrText xml:space="preserve"> PAGEREF _Toc241488896 \h </w:instrText>
             </w:r>
             <w:r>
               <w:rPr>
@@ -620,7 +687,7 @@
               <w14:ligatures w14:val="standardContextual"/>
             </w:rPr>
           </w:pPr>
-          <w:hyperlink w:anchor="_Toc241488663" w:history="1">
+          <w:hyperlink w:anchor="_Toc241488897" w:history="1">
             <w:r>
               <w:rPr>
                 <w:rStyle w:val="Hyperlink"/>
@@ -644,7 +711,7 @@
               <w:rPr>
                 <w:noProof/>
               </w:rPr>
-              <w:instrText xml:space="preserve"> PAGEREF _Toc241488663 \h </w:instrText>
+              <w:instrText xml:space="preserve"> PAGEREF _Toc241488897 \h </w:instrText>
             </w:r>
             <w:r>
               <w:rPr>
@@ -687,7 +754,7 @@
               <w14:ligatures w14:val="standardContextual"/>
             </w:rPr>
           </w:pPr>
-          <w:hyperlink w:anchor="_Toc241488664" w:history="1">
+          <w:hyperlink w:anchor="_Toc241488898" w:history="1">
             <w:r>
               <w:rPr>
                 <w:rStyle w:val="Hyperlink"/>
@@ -711,7 +778,7 @@
               <w:rPr>
                 <w:noProof/>
               </w:rPr>
-              <w:instrText xml:space="preserve"> PAGEREF _Toc241488664 \h </w:instrText>
+              <w:instrText xml:space="preserve"> PAGEREF _Toc241488898 \h </w:instrText>
             </w:r>
             <w:r>
               <w:rPr>
@@ -754,7 +821,7 @@
               <w14:ligatures w14:val="standardContextual"/>
             </w:rPr>
           </w:pPr>
-          <w:hyperlink w:anchor="_Toc241488665" w:history="1">
+          <w:hyperlink w:anchor="_Toc241488899" w:history="1">
             <w:r>
               <w:rPr>
                 <w:rStyle w:val="Hyperlink"/>
@@ -778,7 +845,7 @@
               <w:rPr>
                 <w:noProof/>
               </w:rPr>
-              <w:instrText xml:space="preserve"> PAGEREF _Toc241488665 \h </w:instrText>
+              <w:instrText xml:space="preserve"> PAGEREF _Toc241488899 \h </w:instrText>
             </w:r>
             <w:r>
               <w:rPr>
@@ -821,7 +888,7 @@
               <w14:ligatures w14:val="standardContextual"/>
             </w:rPr>
           </w:pPr>
-          <w:hyperlink w:anchor="_Toc241488666" w:history="1">
+          <w:hyperlink w:anchor="_Toc241488900" w:history="1">
             <w:r>
               <w:rPr>
                 <w:rStyle w:val="Hyperlink"/>
@@ -845,7 +912,7 @@
               <w:rPr>
                 <w:noProof/>
               </w:rPr>
-              <w:instrText xml:space="preserve"> PAGEREF _Toc241488666 \h </w:instrText>
+              <w:instrText xml:space="preserve"> PAGEREF _Toc241488900 \h </w:instrText>
             </w:r>
             <w:r>
               <w:rPr>
@@ -888,7 +955,7 @@
               <w14:ligatures w14:val="standardContextual"/>
             </w:rPr>
           </w:pPr>
-          <w:hyperlink w:anchor="_Toc241488667" w:history="1">
+          <w:hyperlink w:anchor="_Toc241488901" w:history="1">
             <w:r>
               <w:rPr>
                 <w:rStyle w:val="Hyperlink"/>
@@ -912,7 +979,7 @@
               <w:rPr>
                 <w:noProof/>
               </w:rPr>
-              <w:instrText xml:space="preserve"> PAGEREF _Toc241488667 \h </w:instrText>
+              <w:instrText xml:space="preserve"> PAGEREF _Toc241488901 \h </w:instrText>
             </w:r>
             <w:r>
               <w:rPr>
@@ -955,7 +1022,7 @@
               <w14:ligatures w14:val="standardContextual"/>
             </w:rPr>
           </w:pPr>
-          <w:hyperlink w:anchor="_Toc241488668" w:history="1">
+          <w:hyperlink w:anchor="_Toc241488902" w:history="1">
             <w:r>
               <w:rPr>
                 <w:rStyle w:val="Hyperlink"/>
@@ -979,7 +1046,7 @@
               <w:rPr>
                 <w:noProof/>
               </w:rPr>
-              <w:instrText xml:space="preserve"> PAGEREF _Toc241488668 \h </w:instrText>
+              <w:instrText xml:space="preserve"> PAGEREF _Toc241488902 \h </w:instrText>
             </w:r>
             <w:r>
               <w:rPr>
@@ -1022,7 +1089,7 @@
               <w14:ligatures w14:val="standardContextual"/>
             </w:rPr>
           </w:pPr>
-          <w:hyperlink w:anchor="_Toc241488669" w:history="1">
+          <w:hyperlink w:anchor="_Toc241488903" w:history="1">
             <w:r>
               <w:rPr>
                 <w:rStyle w:val="Hyperlink"/>
@@ -1046,7 +1113,7 @@
               <w:rPr>
                 <w:noProof/>
               </w:rPr>
-              <w:instrText xml:space="preserve"> PAGEREF _Toc241488669 \h </w:instrText>
+              <w:instrText xml:space="preserve"> PAGEREF _Toc241488903 \h </w:instrText>
             </w:r>
             <w:r>
               <w:rPr>
@@ -1089,7 +1156,7 @@
               <w14:ligatures w14:val="standardContextual"/>
             </w:rPr>
           </w:pPr>
-          <w:hyperlink w:anchor="_Toc241488670" w:history="1">
+          <w:hyperlink w:anchor="_Toc241488904" w:history="1">
             <w:r>
               <w:rPr>
                 <w:rStyle w:val="Hyperlink"/>
@@ -1113,7 +1180,7 @@
               <w:rPr>
                 <w:noProof/>
               </w:rPr>
-              <w:instrText xml:space="preserve"> PAGEREF _Toc241488670 \h </w:instrText>
+              <w:instrText xml:space="preserve"> PAGEREF _Toc241488904 \h </w:instrText>
             </w:r>
             <w:r>
               <w:rPr>
@@ -1156,7 +1223,7 @@
               <w14:ligatures w14:val="standardContextual"/>
             </w:rPr>
           </w:pPr>
-          <w:hyperlink w:anchor="_Toc241488671" w:history="1">
+          <w:hyperlink w:anchor="_Toc241488905" w:history="1">
             <w:r>
               <w:rPr>
                 <w:rStyle w:val="Hyperlink"/>
@@ -1180,7 +1247,7 @@
               <w:rPr>
                 <w:noProof/>
               </w:rPr>
-              <w:instrText xml:space="preserve"> PAGEREF _Toc241488671 \h </w:instrText>
+              <w:instrText xml:space="preserve"> PAGEREF _Toc241488905 \h </w:instrText>
             </w:r>
             <w:r>
               <w:rPr>
@@ -1223,7 +1290,7 @@
               <w14:ligatures w14:val="standardContextual"/>
             </w:rPr>
           </w:pPr>
-          <w:hyperlink w:anchor="_Toc241488672" w:history="1">
+          <w:hyperlink w:anchor="_Toc241488906" w:history="1">
             <w:r>
               <w:rPr>
                 <w:rStyle w:val="Hyperlink"/>
@@ -1247,7 +1314,7 @@
               <w:rPr>
                 <w:noProof/>
               </w:rPr>
-              <w:instrText xml:space="preserve"> PAGEREF _Toc241488672 \h </w:instrText>
+              <w:instrText xml:space="preserve"> PAGEREF _Toc241488906 \h </w:instrText>
             </w:r>
             <w:r>
               <w:rPr>
@@ -1290,7 +1357,7 @@
               <w14:ligatures w14:val="standardContextual"/>
             </w:rPr>
           </w:pPr>
-          <w:hyperlink w:anchor="_Toc241488673" w:history="1">
+          <w:hyperlink w:anchor="_Toc241488907" w:history="1">
             <w:r>
               <w:rPr>
                 <w:rStyle w:val="Hyperlink"/>
@@ -1314,7 +1381,7 @@
               <w:rPr>
                 <w:noProof/>
               </w:rPr>
-              <w:instrText xml:space="preserve"> PAGEREF _Toc241488673 \h </w:instrText>
+              <w:instrText xml:space="preserve"> PAGEREF _Toc241488907 \h </w:instrText>
             </w:r>
             <w:r>
               <w:rPr>
@@ -1357,7 +1424,7 @@
               <w14:ligatures w14:val="standardContextual"/>
             </w:rPr>
           </w:pPr>
-          <w:hyperlink w:anchor="_Toc241488674" w:history="1">
+          <w:hyperlink w:anchor="_Toc241488908" w:history="1">
             <w:r>
               <w:rPr>
                 <w:rStyle w:val="Hyperlink"/>
@@ -1381,7 +1448,7 @@
               <w:rPr>
                 <w:noProof/>
               </w:rPr>
-              <w:instrText xml:space="preserve"> PAGEREF _Toc241488674 \h </w:instrText>
+              <w:instrText xml:space="preserve"> PAGEREF _Toc241488908 \h </w:instrText>
             </w:r>
             <w:r>
               <w:rPr>
@@ -1424,7 +1491,7 @@
               <w14:ligatures w14:val="standardContextual"/>
             </w:rPr>
           </w:pPr>
-          <w:hyperlink w:anchor="_Toc241488675" w:history="1">
+          <w:hyperlink w:anchor="_Toc241488909" w:history="1">
             <w:r>
               <w:rPr>
                 <w:rStyle w:val="Hyperlink"/>
@@ -1448,7 +1515,7 @@
               <w:rPr>
                 <w:noProof/>
               </w:rPr>
-              <w:instrText xml:space="preserve"> PAGEREF _Toc241488675 \h </w:instrText>
+              <w:instrText xml:space="preserve"> PAGEREF _Toc241488909 \h </w:instrText>
             </w:r>
             <w:r>
               <w:rPr>
@@ -1491,7 +1558,7 @@
               <w14:ligatures w14:val="standardContextual"/>
             </w:rPr>
           </w:pPr>
-          <w:hyperlink w:anchor="_Toc241488676" w:history="1">
+          <w:hyperlink w:anchor="_Toc241488910" w:history="1">
             <w:r>
               <w:rPr>
                 <w:rStyle w:val="Hyperlink"/>
@@ -1515,7 +1582,7 @@
               <w:rPr>
                 <w:noProof/>
               </w:rPr>
-              <w:instrText xml:space="preserve"> PAGEREF _Toc241488676 \h </w:instrText>
+              <w:instrText xml:space="preserve"> PAGEREF _Toc241488910 \h </w:instrText>
             </w:r>
             <w:r>
               <w:rPr>
@@ -1558,7 +1625,7 @@
               <w14:ligatures w14:val="standardContextual"/>
             </w:rPr>
           </w:pPr>
-          <w:hyperlink w:anchor="_Toc241488677" w:history="1">
+          <w:hyperlink w:anchor="_Toc241488911" w:history="1">
             <w:r>
               <w:rPr>
                 <w:rStyle w:val="Hyperlink"/>
@@ -1582,7 +1649,7 @@
               <w:rPr>
                 <w:noProof/>
               </w:rPr>
-              <w:instrText xml:space="preserve"> PAGEREF _Toc241488677 \h </w:instrText>
+              <w:instrText xml:space="preserve"> PAGEREF _Toc241488911 \h </w:instrText>
             </w:r>
             <w:r>
               <w:rPr>
@@ -1625,7 +1692,7 @@
               <w14:ligatures w14:val="standardContextual"/>
             </w:rPr>
           </w:pPr>
-          <w:hyperlink w:anchor="_Toc241488678" w:history="1">
+          <w:hyperlink w:anchor="_Toc241488912" w:history="1">
             <w:r>
               <w:rPr>
                 <w:rStyle w:val="Hyperlink"/>
@@ -1649,7 +1716,7 @@
               <w:rPr>
                 <w:noProof/>
               </w:rPr>
-              <w:instrText xml:space="preserve"> PAGEREF _Toc241488678 \h </w:instrText>
+              <w:instrText xml:space="preserve"> PAGEREF _Toc241488912 \h </w:instrText>
             </w:r>
             <w:r>
               <w:rPr>
@@ -1692,7 +1759,7 @@
               <w14:ligatures w14:val="standardContextual"/>
             </w:rPr>
           </w:pPr>
-          <w:hyperlink w:anchor="_Toc241488679" w:history="1">
+          <w:hyperlink w:anchor="_Toc241488913" w:history="1">
             <w:r>
               <w:rPr>
                 <w:rStyle w:val="Hyperlink"/>
@@ -1716,7 +1783,7 @@
               <w:rPr>
                 <w:noProof/>
               </w:rPr>
-              <w:instrText xml:space="preserve"> PAGEREF _Toc241488679 \h </w:instrText>
+              <w:instrText xml:space="preserve"> PAGEREF _Toc241488913 \h </w:instrText>
             </w:r>
             <w:r>
               <w:rPr>
@@ -1759,7 +1826,7 @@
               <w14:ligatures w14:val="standardContextual"/>
             </w:rPr>
           </w:pPr>
-          <w:hyperlink w:anchor="_Toc241488680" w:history="1">
+          <w:hyperlink w:anchor="_Toc241488914" w:history="1">
             <w:r>
               <w:rPr>
                 <w:rStyle w:val="Hyperlink"/>
@@ -1783,7 +1850,7 @@
               <w:rPr>
                 <w:noProof/>
               </w:rPr>
-              <w:instrText xml:space="preserve"> PAGEREF _Toc241488680 \h </w:instrText>
+              <w:instrText xml:space="preserve"> PAGEREF _Toc241488914 \h </w:instrText>
             </w:r>
             <w:r>
               <w:rPr>
@@ -1826,7 +1893,7 @@
               <w14:ligatures w14:val="standardContextual"/>
             </w:rPr>
           </w:pPr>
-          <w:hyperlink w:anchor="_Toc241488681" w:history="1">
+          <w:hyperlink w:anchor="_Toc241488915" w:history="1">
             <w:r>
               <w:rPr>
                 <w:rStyle w:val="Hyperlink"/>
@@ -1850,7 +1917,7 @@
               <w:rPr>
                 <w:noProof/>
               </w:rPr>
-              <w:instrText xml:space="preserve"> PAGEREF _Toc241488681 \h </w:instrText>
+              <w:instrText xml:space="preserve"> PAGEREF _Toc241488915 \h </w:instrText>
             </w:r>
             <w:r>
               <w:rPr>
@@ -1893,7 +1960,7 @@
               <w14:ligatures w14:val="standardContextual"/>
             </w:rPr>
           </w:pPr>
-          <w:hyperlink w:anchor="_Toc241488682" w:history="1">
+          <w:hyperlink w:anchor="_Toc241488916" w:history="1">
             <w:r>
               <w:rPr>
                 <w:rStyle w:val="Hyperlink"/>
@@ -1917,7 +1984,7 @@
               <w:rPr>
                 <w:noProof/>
               </w:rPr>
-              <w:instrText xml:space="preserve"> PAGEREF _Toc241488682 \h </w:instrText>
+              <w:instrText xml:space="preserve"> PAGEREF _Toc241488916 \h </w:instrText>
             </w:r>
             <w:r>
               <w:rPr>
@@ -1960,7 +2027,7 @@
               <w14:ligatures w14:val="standardContextual"/>
             </w:rPr>
           </w:pPr>
-          <w:hyperlink w:anchor="_Toc241488683" w:history="1">
+          <w:hyperlink w:anchor="_Toc241488917" w:history="1">
             <w:r>
               <w:rPr>
                 <w:rStyle w:val="Hyperlink"/>
@@ -1984,7 +2051,7 @@
               <w:rPr>
                 <w:noProof/>
               </w:rPr>
-              <w:instrText xml:space="preserve"> PAGEREF _Toc241488683 \h </w:instrText>
+              <w:instrText xml:space="preserve"> PAGEREF _Toc241488917 \h </w:instrText>
             </w:r>
             <w:r>
               <w:rPr>
@@ -2027,7 +2094,7 @@
               <w14:ligatures w14:val="standardContextual"/>
             </w:rPr>
           </w:pPr>
-          <w:hyperlink w:anchor="_Toc241488684" w:history="1">
+          <w:hyperlink w:anchor="_Toc241488918" w:history="1">
             <w:r>
               <w:rPr>
                 <w:rStyle w:val="Hyperlink"/>
@@ -2051,7 +2118,7 @@
               <w:rPr>
                 <w:noProof/>
               </w:rPr>
-              <w:instrText xml:space="preserve"> PAGEREF _Toc241488684 \h </w:instrText>
+              <w:instrText xml:space="preserve"> PAGEREF _Toc241488918 \h </w:instrText>
             </w:r>
             <w:r>
               <w:rPr>
@@ -2094,7 +2161,7 @@
               <w14:ligatures w14:val="standardContextual"/>
             </w:rPr>
           </w:pPr>
-          <w:hyperlink w:anchor="_Toc241488685" w:history="1">
+          <w:hyperlink w:anchor="_Toc241488919" w:history="1">
             <w:r>
               <w:rPr>
                 <w:rStyle w:val="Hyperlink"/>
@@ -2118,7 +2185,7 @@
               <w:rPr>
                 <w:noProof/>
               </w:rPr>
-              <w:instrText xml:space="preserve"> PAGEREF _Toc241488685 \h </w:instrText>
+              <w:instrText xml:space="preserve"> PAGEREF _Toc241488919 \h </w:instrText>
             </w:r>
             <w:r>
               <w:rPr>
@@ -2161,7 +2228,7 @@
               <w14:ligatures w14:val="standardContextual"/>
             </w:rPr>
           </w:pPr>
-          <w:hyperlink w:anchor="_Toc241488686" w:history="1">
+          <w:hyperlink w:anchor="_Toc241488920" w:history="1">
             <w:r>
               <w:rPr>
                 <w:rStyle w:val="Hyperlink"/>
@@ -2185,7 +2252,7 @@
               <w:rPr>
                 <w:noProof/>
               </w:rPr>
-              <w:instrText xml:space="preserve"> PAGEREF _Toc241488686 \h </w:instrText>
+              <w:instrText xml:space="preserve"> PAGEREF _Toc241488920 \h </w:instrText>
             </w:r>
             <w:r>
               <w:rPr>
@@ -2228,7 +2295,7 @@
               <w14:ligatures w14:val="standardContextual"/>
             </w:rPr>
           </w:pPr>
-          <w:hyperlink w:anchor="_Toc241488687" w:history="1">
+          <w:hyperlink w:anchor="_Toc241488921" w:history="1">
             <w:r>
               <w:rPr>
                 <w:rStyle w:val="Hyperlink"/>
@@ -2252,7 +2319,7 @@
               <w:rPr>
                 <w:noProof/>
               </w:rPr>
-              <w:instrText xml:space="preserve"> PAGEREF _Toc241488687 \h </w:instrText>
+              <w:instrText xml:space="preserve"> PAGEREF _Toc241488921 \h </w:instrText>
             </w:r>
             <w:r>
               <w:rPr>
@@ -2295,7 +2362,7 @@
               <w14:ligatures w14:val="standardContextual"/>
             </w:rPr>
           </w:pPr>
-          <w:hyperlink w:anchor="_Toc241488688" w:history="1">
+          <w:hyperlink w:anchor="_Toc241488922" w:history="1">
             <w:r>
               <w:rPr>
                 <w:rStyle w:val="Hyperlink"/>
@@ -2319,7 +2386,7 @@
               <w:rPr>
                 <w:noProof/>
               </w:rPr>
-              <w:instrText xml:space="preserve"> PAGEREF _Toc241488688 \h </w:instrText>
+              <w:instrText xml:space="preserve"> PAGEREF _Toc241488922 \h </w:instrText>
             </w:r>
             <w:r>
               <w:rPr>
@@ -2362,7 +2429,7 @@
               <w14:ligatures w14:val="standardContextual"/>
             </w:rPr>
           </w:pPr>
-          <w:hyperlink w:anchor="_Toc241488689" w:history="1">
+          <w:hyperlink w:anchor="_Toc241488923" w:history="1">
             <w:r>
               <w:rPr>
                 <w:rStyle w:val="Hyperlink"/>
@@ -2386,7 +2453,7 @@
               <w:rPr>
                 <w:noProof/>
               </w:rPr>
-              <w:instrText xml:space="preserve"> PAGEREF _Toc241488689 \h </w:instrText>
+              <w:instrText xml:space="preserve"> PAGEREF _Toc241488923 \h </w:instrText>
             </w:r>
             <w:r>
               <w:rPr>
@@ -2429,7 +2496,7 @@
               <w14:ligatures w14:val="standardContextual"/>
             </w:rPr>
           </w:pPr>
-          <w:hyperlink w:anchor="_Toc241488690" w:history="1">
+          <w:hyperlink w:anchor="_Toc241488924" w:history="1">
             <w:r>
               <w:rPr>
                 <w:rStyle w:val="Hyperlink"/>
@@ -2453,7 +2520,7 @@
               <w:rPr>
                 <w:noProof/>
               </w:rPr>
-              <w:instrText xml:space="preserve"> PAGEREF _Toc241488690 \h </w:instrText>
+              <w:instrText xml:space="preserve"> PAGEREF _Toc241488924 \h </w:instrText>
             </w:r>
             <w:r>
               <w:rPr>
@@ -2496,7 +2563,7 @@
               <w14:ligatures w14:val="standardContextual"/>
             </w:rPr>
           </w:pPr>
-          <w:hyperlink w:anchor="_Toc241488691" w:history="1">
+          <w:hyperlink w:anchor="_Toc241488925" w:history="1">
             <w:r>
               <w:rPr>
                 <w:rStyle w:val="Hyperlink"/>
@@ -2520,7 +2587,7 @@
               <w:rPr>
                 <w:noProof/>
               </w:rPr>
-              <w:instrText xml:space="preserve"> PAGEREF _Toc241488691 \h </w:instrText>
+              <w:instrText xml:space="preserve"> PAGEREF _Toc241488925 \h </w:instrText>
             </w:r>
             <w:r>
               <w:rPr>
@@ -2563,7 +2630,7 @@
               <w14:ligatures w14:val="standardContextual"/>
             </w:rPr>
           </w:pPr>
-          <w:hyperlink w:anchor="_Toc241488692" w:history="1">
+          <w:hyperlink w:anchor="_Toc241488926" w:history="1">
             <w:r>
               <w:rPr>
                 <w:rStyle w:val="Hyperlink"/>
@@ -2587,7 +2654,7 @@
               <w:rPr>
                 <w:noProof/>
               </w:rPr>
-              <w:instrText xml:space="preserve"> PAGEREF _Toc241488692 \h </w:instrText>
+              <w:instrText xml:space="preserve"> PAGEREF _Toc241488926 \h </w:instrText>
             </w:r>
             <w:r>
               <w:rPr>
@@ -2630,7 +2697,7 @@
               <w14:ligatures w14:val="standardContextual"/>
             </w:rPr>
           </w:pPr>
-          <w:hyperlink w:anchor="_Toc241488693" w:history="1">
+          <w:hyperlink w:anchor="_Toc241488927" w:history="1">
             <w:r>
               <w:rPr>
                 <w:rStyle w:val="Hyperlink"/>
@@ -2654,7 +2721,7 @@
               <w:rPr>
                 <w:noProof/>
               </w:rPr>
-              <w:instrText xml:space="preserve"> PAGEREF _Toc241488693 \h </w:instrText>
+              <w:instrText xml:space="preserve"> PAGEREF _Toc241488927 \h </w:instrText>
             </w:r>
             <w:r>
               <w:rPr>
@@ -2697,7 +2764,7 @@
               <w14:ligatures w14:val="standardContextual"/>
             </w:rPr>
           </w:pPr>
-          <w:hyperlink w:anchor="_Toc241488694" w:history="1">
+          <w:hyperlink w:anchor="_Toc241488928" w:history="1">
             <w:r>
               <w:rPr>
                 <w:rStyle w:val="Hyperlink"/>
@@ -2721,7 +2788,7 @@
               <w:rPr>
                 <w:noProof/>
               </w:rPr>
-              <w:instrText xml:space="preserve"> PAGEREF _Toc241488694 \h </w:instrText>
+              <w:instrText xml:space="preserve"> PAGEREF _Toc241488928 \h </w:instrText>
             </w:r>
             <w:r>
               <w:rPr>
@@ -2764,7 +2831,7 @@
               <w14:ligatures w14:val="standardContextual"/>
             </w:rPr>
           </w:pPr>
-          <w:hyperlink w:anchor="_Toc241488695" w:history="1">
+          <w:hyperlink w:anchor="_Toc241488929" w:history="1">
             <w:r>
               <w:rPr>
                 <w:rStyle w:val="Hyperlink"/>
@@ -2788,7 +2855,7 @@
               <w:rPr>
                 <w:noProof/>
               </w:rPr>
-              <w:instrText xml:space="preserve"> PAGEREF _Toc241488695 \h </w:instrText>
+              <w:instrText xml:space="preserve"> PAGEREF _Toc241488929 \h </w:instrText>
             </w:r>
             <w:r>
               <w:rPr>
@@ -2831,7 +2898,7 @@
               <w14:ligatures w14:val="standardContextual"/>
             </w:rPr>
           </w:pPr>
-          <w:hyperlink w:anchor="_Toc241488696" w:history="1">
+          <w:hyperlink w:anchor="_Toc241488930" w:history="1">
             <w:r>
               <w:rPr>
                 <w:rStyle w:val="Hyperlink"/>
@@ -2855,7 +2922,7 @@
               <w:rPr>
                 <w:noProof/>
               </w:rPr>
-              <w:instrText xml:space="preserve"> PAGEREF _Toc241488696 \h </w:instrText>
+              <w:instrText xml:space="preserve"> PAGEREF _Toc241488930 \h </w:instrText>
             </w:r>
             <w:r>
               <w:rPr>
@@ -2898,7 +2965,7 @@
               <w14:ligatures w14:val="standardContextual"/>
             </w:rPr>
           </w:pPr>
-          <w:hyperlink w:anchor="_Toc241488697" w:history="1">
+          <w:hyperlink w:anchor="_Toc241488931" w:history="1">
             <w:r>
               <w:rPr>
                 <w:rStyle w:val="Hyperlink"/>
@@ -2922,7 +2989,7 @@
               <w:rPr>
                 <w:noProof/>
               </w:rPr>
-              <w:instrText xml:space="preserve"> PAGEREF _Toc241488697 \h </w:instrText>
+              <w:instrText xml:space="preserve"> PAGEREF _Toc241488931 \h </w:instrText>
             </w:r>
             <w:r>
               <w:rPr>
@@ -2965,7 +3032,7 @@
               <w14:ligatures w14:val="standardContextual"/>
             </w:rPr>
           </w:pPr>
-          <w:hyperlink w:anchor="_Toc241488698" w:history="1">
+          <w:hyperlink w:anchor="_Toc241488932" w:history="1">
             <w:r>
               <w:rPr>
                 <w:rStyle w:val="Hyperlink"/>
@@ -2989,7 +3056,7 @@
               <w:rPr>
                 <w:noProof/>
               </w:rPr>
-              <w:instrText xml:space="preserve"> PAGEREF _Toc241488698 \h </w:instrText>
+              <w:instrText xml:space="preserve"> PAGEREF _Toc241488932 \h </w:instrText>
             </w:r>
             <w:r>
               <w:rPr>
@@ -3032,7 +3099,7 @@
               <w14:ligatures w14:val="standardContextual"/>
             </w:rPr>
           </w:pPr>
-          <w:hyperlink w:anchor="_Toc241488699" w:history="1">
+          <w:hyperlink w:anchor="_Toc241488933" w:history="1">
             <w:r>
               <w:rPr>
                 <w:rStyle w:val="Hyperlink"/>
@@ -3056,7 +3123,7 @@
               <w:rPr>
                 <w:noProof/>
               </w:rPr>
-              <w:instrText xml:space="preserve"> PAGEREF _Toc241488699 \h </w:instrText>
+              <w:instrText xml:space="preserve"> PAGEREF _Toc241488933 \h </w:instrText>
             </w:r>
             <w:r>
               <w:rPr>
@@ -3099,7 +3166,7 @@
               <w14:ligatures w14:val="standardContextual"/>
             </w:rPr>
           </w:pPr>
-          <w:hyperlink w:anchor="_Toc241488700" w:history="1">
+          <w:hyperlink w:anchor="_Toc241488934" w:history="1">
             <w:r>
               <w:rPr>
                 <w:rStyle w:val="Hyperlink"/>
@@ -3123,7 +3190,7 @@
               <w:rPr>
                 <w:noProof/>
               </w:rPr>
-              <w:instrText xml:space="preserve"> PAGEREF _Toc241488700 \h </w:instrText>
+              <w:instrText xml:space="preserve"> PAGEREF _Toc241488934 \h </w:instrText>
             </w:r>
             <w:r>
               <w:rPr>
@@ -3166,7 +3233,7 @@
               <w14:ligatures w14:val="standardContextual"/>
             </w:rPr>
           </w:pPr>
-          <w:hyperlink w:anchor="_Toc241488701" w:history="1">
+          <w:hyperlink w:anchor="_Toc241488935" w:history="1">
             <w:r>
               <w:rPr>
                 <w:rStyle w:val="Hyperlink"/>
@@ -3190,7 +3257,7 @@
               <w:rPr>
                 <w:noProof/>
               </w:rPr>
-              <w:instrText xml:space="preserve"> PAGEREF _Toc241488701 \h </w:instrText>
+              <w:instrText xml:space="preserve"> PAGEREF _Toc241488935 \h </w:instrText>
             </w:r>
             <w:r>
               <w:rPr>
@@ -3233,7 +3300,7 @@
               <w14:ligatures w14:val="standardContextual"/>
             </w:rPr>
           </w:pPr>
-          <w:hyperlink w:anchor="_Toc241488702" w:history="1">
+          <w:hyperlink w:anchor="_Toc241488936" w:history="1">
             <w:r>
               <w:rPr>
                 <w:rStyle w:val="Hyperlink"/>
@@ -3257,7 +3324,7 @@
               <w:rPr>
                 <w:noProof/>
               </w:rPr>
-              <w:instrText xml:space="preserve"> PAGEREF _Toc241488702 \h </w:instrText>
+              <w:instrText xml:space="preserve"> PAGEREF _Toc241488936 \h </w:instrText>
             </w:r>
             <w:r>
               <w:rPr>
@@ -3300,7 +3367,7 @@
               <w14:ligatures w14:val="standardContextual"/>
             </w:rPr>
           </w:pPr>
-          <w:hyperlink w:anchor="_Toc241488703" w:history="1">
+          <w:hyperlink w:anchor="_Toc241488937" w:history="1">
             <w:r>
               <w:rPr>
                 <w:rStyle w:val="Hyperlink"/>
@@ -3324,7 +3391,7 @@
               <w:rPr>
                 <w:noProof/>
               </w:rPr>
-              <w:instrText xml:space="preserve"> PAGEREF _Toc241488703 \h </w:instrText>
+              <w:instrText xml:space="preserve"> PAGEREF _Toc241488937 \h </w:instrText>
             </w:r>
             <w:r>
               <w:rPr>
@@ -3367,7 +3434,7 @@
               <w14:ligatures w14:val="standardContextual"/>
             </w:rPr>
           </w:pPr>
-          <w:hyperlink w:anchor="_Toc241488704" w:history="1">
+          <w:hyperlink w:anchor="_Toc241488938" w:history="1">
             <w:r>
               <w:rPr>
                 <w:rStyle w:val="Hyperlink"/>
@@ -3391,7 +3458,7 @@
               <w:rPr>
                 <w:noProof/>
               </w:rPr>
-              <w:instrText xml:space="preserve"> PAGEREF _Toc241488704 \h </w:instrText>
+              <w:instrText xml:space="preserve"> PAGEREF _Toc241488938 \h </w:instrText>
             </w:r>
             <w:r>
               <w:rPr>
@@ -3434,7 +3501,7 @@
       <w:pPr>
         <w:pStyle w:val="Heading1"/>
       </w:pPr>
-      <w:bookmarkStart w:id="0" w:name="_Toc241488656"/>
+      <w:bookmarkStart w:id="0" w:name="_Toc241488889"/>
       <w:r>
         <w:t>1.  Getting started</w:t>
       </w:r>
@@ -3462,7 +3529,7 @@
       <w:pPr>
         <w:pStyle w:val="Heading2"/>
       </w:pPr>
-      <w:bookmarkStart w:id="1" w:name="_Toc241488657"/>
+      <w:bookmarkStart w:id="1" w:name="_Toc241488890"/>
       <w:r>
         <w:t>Opening ShopControl</w:t>
       </w:r>
@@ -3542,11 +3609,114 @@
       <w:pPr>
         <w:pStyle w:val="Heading2"/>
       </w:pPr>
-      <w:bookmarkStart w:id="2" w:name="_Toc241488658"/>
+      <w:bookmarkStart w:id="2" w:name="_Toc241488891"/>
+      <w:r>
+        <w:t>Finding help</w:t>
+      </w:r>
+      <w:bookmarkEnd w:id="2"/>
+    </w:p>
+    <w:p>
+      <w:pPr>
+        <w:pStyle w:val="ListParagraph"/>
+        <w:numPr>
+          <w:ilvl w:val="0"/>
+          <w:numId w:val="2"/>
+        </w:numPr>
+        <w:spacing w:after="60"/>
+      </w:pPr>
+      <w:r>
+        <w:rPr>
+          <w:b/>
+          <w:bCs/>
+        </w:rPr>
+        <w:t>Office computers:</w:t>
+      </w:r>
+      <w:r>
+        <w:t xml:space="preserve"> click </w:t>
+      </w:r>
+      <w:r>
+        <w:rPr>
+          <w:b/>
+          <w:bCs/>
+        </w:rPr>
+        <w:t>Help</w:t>
+      </w:r>
+      <w:r>
+        <w:t xml:space="preserve"> in the left menu to read this manual inside ShopControl. Use </w:t>
+      </w:r>
+      <w:r>
+        <w:rPr>
+          <w:b/>
+          <w:bCs/>
+        </w:rPr>
+        <w:t>Download Word copy</w:t>
+      </w:r>
+      <w:r>
+        <w:t xml:space="preserve"> to print it.</w:t>
+      </w:r>
+    </w:p>
+    <w:p>
+      <w:pPr>
+        <w:pStyle w:val="ListParagraph"/>
+        <w:numPr>
+          <w:ilvl w:val="0"/>
+          <w:numId w:val="2"/>
+        </w:numPr>
+        <w:spacing w:after="60"/>
+      </w:pPr>
+      <w:r>
+        <w:rPr>
+          <w:b/>
+          <w:bCs/>
+        </w:rPr>
+        <w:t>Employee App:</w:t>
+      </w:r>
+      <w:r>
+        <w:t xml:space="preserve"> Staff Hub → </w:t>
+      </w:r>
+      <w:r>
+        <w:rPr>
+          <w:b/>
+          <w:bCs/>
+        </w:rPr>
+        <w:t>User manual</w:t>
+      </w:r>
+      <w:r>
+        <w:t>.</w:t>
+      </w:r>
+    </w:p>
+    <w:p>
+      <w:pPr>
+        <w:pStyle w:val="ListParagraph"/>
+        <w:numPr>
+          <w:ilvl w:val="0"/>
+          <w:numId w:val="2"/>
+        </w:numPr>
+        <w:spacing w:after="60"/>
+      </w:pPr>
+      <w:r>
+        <w:t xml:space="preserve">Type a word or two about what you need in the </w:t>
+      </w:r>
+      <w:r>
+        <w:rPr>
+          <w:b/>
+          <w:bCs/>
+        </w:rPr>
+        <w:t>search box</w:t>
+      </w:r>
+      <w:r>
+        <w:t xml:space="preserve"> at the top of the manual to see just the sections that cover it.</w:t>
+      </w:r>
+    </w:p>
+    <w:p>
+      <w:pPr>
+        <w:pStyle w:val="Heading2"/>
+      </w:pPr>
+      <w:bookmarkStart w:id="3" w:name="_Toc241488892"/>
       <w:r>
         <w:t>Put the app on your phone's home screen</w:t>
       </w:r>
-      <w:bookmarkEnd w:id="2"/>
+      <w:bookmarkEnd w:id="3"/>
     </w:p>
     <w:p>
       <w:pPr>
@@ -3710,11 +3880,11 @@
       <w:pPr>
         <w:pStyle w:val="Heading2"/>
       </w:pPr>
-      <w:bookmarkStart w:id="3" w:name="_Toc241488659"/>
+      <w:bookmarkStart w:id="4" w:name="_Toc241488893"/>
       <w:r>
         <w:t>Logging in</w:t>
       </w:r>
-      <w:bookmarkEnd w:id="3"/>
+      <w:bookmarkEnd w:id="4"/>
     </w:p>
     <w:p>
       <w:pPr>
@@ -3850,11 +4020,11 @@
       <w:pPr>
         <w:pStyle w:val="Heading2"/>
       </w:pPr>
-      <w:bookmarkStart w:id="4" w:name="_Toc241488660"/>
+      <w:bookmarkStart w:id="5" w:name="_Toc241488894"/>
       <w:r>
         <w:t>Staying up to date</w:t>
       </w:r>
-      <w:bookmarkEnd w:id="4"/>
+      <w:bookmarkEnd w:id="5"/>
     </w:p>
     <w:p>
       <w:pPr>
@@ -3878,11 +4048,11 @@
       <w:pPr>
         <w:pStyle w:val="Heading2"/>
       </w:pPr>
-      <w:bookmarkStart w:id="5" w:name="_Toc241488661"/>
+      <w:bookmarkStart w:id="6" w:name="_Toc241488895"/>
       <w:r>
         <w:t>Who can do what</w:t>
       </w:r>
-      <w:bookmarkEnd w:id="5"/>
+      <w:bookmarkEnd w:id="6"/>
     </w:p>
     <w:p>
       <w:pPr>
@@ -4491,11 +4661,11 @@
         <w:pStyle w:val="Heading1"/>
         <w:pageBreakBefore/>
       </w:pPr>
-      <w:bookmarkStart w:id="6" w:name="_Toc241488662"/>
+      <w:bookmarkStart w:id="7" w:name="_Toc241488896"/>
       <w:r>
         <w:t>2.  The Employee App (technicians)</w:t>
       </w:r>
-      <w:bookmarkEnd w:id="6"/>
+      <w:bookmarkEnd w:id="7"/>
     </w:p>
     <w:p>
       <w:pPr>
@@ -4509,11 +4679,11 @@
       <w:pPr>
         <w:pStyle w:val="Heading2"/>
       </w:pPr>
-      <w:bookmarkStart w:id="7" w:name="_Toc241488663"/>
+      <w:bookmarkStart w:id="8" w:name="_Toc241488897"/>
       <w:r>
         <w:t>Home screen</w:t>
       </w:r>
-      <w:bookmarkEnd w:id="7"/>
+      <w:bookmarkEnd w:id="8"/>
     </w:p>
     <w:p>
       <w:pPr>
@@ -4649,11 +4819,11 @@
       <w:pPr>
         <w:pStyle w:val="Heading2"/>
       </w:pPr>
-      <w:bookmarkStart w:id="8" w:name="_Toc241488664"/>
+      <w:bookmarkStart w:id="9" w:name="_Toc241488898"/>
       <w:r>
         <w:t>Doing your QC checklist</w:t>
       </w:r>
-      <w:bookmarkEnd w:id="8"/>
+      <w:bookmarkEnd w:id="9"/>
     </w:p>
     <w:p>
       <w:pPr>
@@ -4798,11 +4968,11 @@
       <w:pPr>
         <w:pStyle w:val="Heading2"/>
       </w:pPr>
-      <w:bookmarkStart w:id="9" w:name="_Toc241488665"/>
+      <w:bookmarkStart w:id="10" w:name="_Toc241488899"/>
       <w:r>
         <w:t>Signing and rework</w:t>
       </w:r>
-      <w:bookmarkEnd w:id="9"/>
+      <w:bookmarkEnd w:id="10"/>
     </w:p>
     <w:p>
       <w:pPr>
@@ -4918,11 +5088,11 @@
       <w:pPr>
         <w:pStyle w:val="Heading2"/>
       </w:pPr>
-      <w:bookmarkStart w:id="10" w:name="_Toc241488666"/>
+      <w:bookmarkStart w:id="11" w:name="_Toc241488900"/>
       <w:r>
         <w:t>Other departments' checklists</w:t>
       </w:r>
-      <w:bookmarkEnd w:id="10"/>
+      <w:bookmarkEnd w:id="11"/>
     </w:p>
     <w:p>
       <w:pPr>
@@ -4946,11 +5116,11 @@
       <w:pPr>
         <w:pStyle w:val="Heading2"/>
       </w:pPr>
-      <w:bookmarkStart w:id="11" w:name="_Toc241488667"/>
+      <w:bookmarkStart w:id="12" w:name="_Toc241488901"/>
       <w:r>
         <w:t>Photos and parts</w:t>
       </w:r>
-      <w:bookmarkEnd w:id="11"/>
+      <w:bookmarkEnd w:id="12"/>
     </w:p>
     <w:p>
       <w:pPr>
@@ -5017,11 +5187,11 @@
         <w:pStyle w:val="Heading1"/>
         <w:pageBreakBefore/>
       </w:pPr>
-      <w:bookmarkStart w:id="12" w:name="_Toc241488668"/>
+      <w:bookmarkStart w:id="13" w:name="_Toc241488902"/>
       <w:r>
         <w:t>3.  Staff Hub: time off, mailbox and company info</w:t>
       </w:r>
-      <w:bookmarkEnd w:id="12"/>
+      <w:bookmarkEnd w:id="13"/>
     </w:p>
     <w:p>
       <w:pPr>
@@ -5045,11 +5215,11 @@
       <w:pPr>
         <w:pStyle w:val="Heading2"/>
       </w:pPr>
-      <w:bookmarkStart w:id="13" w:name="_Toc241488669"/>
+      <w:bookmarkStart w:id="14" w:name="_Toc241488903"/>
       <w:r>
         <w:t>Requesting time off</w:t>
       </w:r>
-      <w:bookmarkEnd w:id="13"/>
+      <w:bookmarkEnd w:id="14"/>
     </w:p>
     <w:p>
       <w:pPr>
@@ -5208,11 +5378,11 @@
       <w:pPr>
         <w:pStyle w:val="Heading2"/>
       </w:pPr>
-      <w:bookmarkStart w:id="14" w:name="_Toc241488670"/>
+      <w:bookmarkStart w:id="15" w:name="_Toc241488904"/>
       <w:r>
         <w:t>Checking your requests</w:t>
       </w:r>
-      <w:bookmarkEnd w:id="14"/>
+      <w:bookmarkEnd w:id="15"/>
     </w:p>
     <w:p>
       <w:pPr>
@@ -5263,11 +5433,11 @@
       <w:pPr>
         <w:pStyle w:val="Heading2"/>
       </w:pPr>
-      <w:bookmarkStart w:id="15" w:name="_Toc241488671"/>
+      <w:bookmarkStart w:id="16" w:name="_Toc241488905"/>
       <w:r>
         <w:t>Mailbox</w:t>
       </w:r>
-      <w:bookmarkEnd w:id="15"/>
+      <w:bookmarkEnd w:id="16"/>
     </w:p>
     <w:p>
       <w:pPr>
@@ -5332,11 +5502,11 @@
       <w:pPr>
         <w:pStyle w:val="Heading2"/>
       </w:pPr>
-      <w:bookmarkStart w:id="16" w:name="_Toc241488672"/>
+      <w:bookmarkStart w:id="17" w:name="_Toc241488906"/>
       <w:r>
         <w:t>Company info and this manual</w:t>
       </w:r>
-      <w:bookmarkEnd w:id="16"/>
+      <w:bookmarkEnd w:id="17"/>
     </w:p>
     <w:p>
       <w:pPr>
@@ -5368,11 +5538,11 @@
         <w:pStyle w:val="Heading1"/>
         <w:pageBreakBefore/>
       </w:pPr>
-      <w:bookmarkStart w:id="17" w:name="_Toc241488673"/>
+      <w:bookmarkStart w:id="18" w:name="_Toc241488907"/>
       <w:r>
         <w:t>4.  Dashboard</w:t>
       </w:r>
-      <w:bookmarkEnd w:id="17"/>
+      <w:bookmarkEnd w:id="18"/>
     </w:p>
     <w:p>
       <w:pPr>
@@ -5507,11 +5677,11 @@
         <w:pStyle w:val="Heading1"/>
         <w:pageBreakBefore/>
       </w:pPr>
-      <w:bookmarkStart w:id="18" w:name="_Toc241488674"/>
+      <w:bookmarkStart w:id="19" w:name="_Toc241488908"/>
       <w:r>
         <w:t>5.  Jobs and the Daily GO List</w:t>
       </w:r>
-      <w:bookmarkEnd w:id="18"/>
+      <w:bookmarkEnd w:id="19"/>
     </w:p>
     <w:p>
       <w:pPr>
@@ -5535,11 +5705,11 @@
       <w:pPr>
         <w:pStyle w:val="Heading2"/>
       </w:pPr>
-      <w:bookmarkStart w:id="19" w:name="_Toc241488675"/>
+      <w:bookmarkStart w:id="20" w:name="_Toc241488909"/>
       <w:r>
         <w:t>RO numbers</w:t>
       </w:r>
-      <w:bookmarkEnd w:id="19"/>
+      <w:bookmarkEnd w:id="20"/>
     </w:p>
     <w:p>
       <w:pPr>
@@ -5621,11 +5791,11 @@
       <w:pPr>
         <w:pStyle w:val="Heading2"/>
       </w:pPr>
-      <w:bookmarkStart w:id="20" w:name="_Toc241488676"/>
+      <w:bookmarkStart w:id="21" w:name="_Toc241488910"/>
       <w:r>
         <w:t>Adding or editing a job</w:t>
       </w:r>
-      <w:bookmarkEnd w:id="20"/>
+      <w:bookmarkEnd w:id="21"/>
     </w:p>
     <w:p>
       <w:pPr>
@@ -5741,11 +5911,11 @@
       <w:pPr>
         <w:pStyle w:val="Heading2"/>
       </w:pPr>
-      <w:bookmarkStart w:id="21" w:name="_Toc241488677"/>
+      <w:bookmarkStart w:id="22" w:name="_Toc241488911"/>
       <w:r>
         <w:t>Customer updates</w:t>
       </w:r>
-      <w:bookmarkEnd w:id="21"/>
+      <w:bookmarkEnd w:id="22"/>
     </w:p>
     <w:p>
       <w:pPr>
@@ -5910,21 +6080,21 @@
         <w:pStyle w:val="Heading1"/>
         <w:pageBreakBefore/>
       </w:pPr>
-      <w:bookmarkStart w:id="22" w:name="_Toc241488678"/>
+      <w:bookmarkStart w:id="23" w:name="_Toc241488912"/>
       <w:r>
         <w:t>6.  Production, Delivery and Planning boards</w:t>
       </w:r>
-      <w:bookmarkEnd w:id="22"/>
+      <w:bookmarkEnd w:id="23"/>
     </w:p>
     <w:p>
       <w:pPr>
         <w:pStyle w:val="Heading2"/>
       </w:pPr>
-      <w:bookmarkStart w:id="23" w:name="_Toc241488679"/>
+      <w:bookmarkStart w:id="24" w:name="_Toc241488913"/>
       <w:r>
         <w:t>Production Board</w:t>
       </w:r>
-      <w:bookmarkEnd w:id="23"/>
+      <w:bookmarkEnd w:id="24"/>
     </w:p>
     <w:p>
       <w:pPr>
@@ -6048,11 +6218,11 @@
       <w:pPr>
         <w:pStyle w:val="Heading2"/>
       </w:pPr>
-      <w:bookmarkStart w:id="24" w:name="_Toc241488680"/>
+      <w:bookmarkStart w:id="25" w:name="_Toc241488914"/>
       <w:r>
         <w:t>Vehicle pictures</w:t>
       </w:r>
-      <w:bookmarkEnd w:id="24"/>
+      <w:bookmarkEnd w:id="25"/>
     </w:p>
     <w:p>
       <w:pPr>
@@ -6106,11 +6276,11 @@
       <w:pPr>
         <w:pStyle w:val="Heading2"/>
       </w:pPr>
-      <w:bookmarkStart w:id="25" w:name="_Toc241488681"/>
+      <w:bookmarkStart w:id="26" w:name="_Toc241488915"/>
       <w:r>
         <w:t>Delivery and Planning boards</w:t>
       </w:r>
-      <w:bookmarkEnd w:id="25"/>
+      <w:bookmarkEnd w:id="26"/>
     </w:p>
     <w:p>
       <w:pPr>
@@ -6196,11 +6366,11 @@
       <w:pPr>
         <w:pStyle w:val="Heading2"/>
       </w:pPr>
-      <w:bookmarkStart w:id="26" w:name="_Toc241488682"/>
+      <w:bookmarkStart w:id="27" w:name="_Toc241488916"/>
       <w:r>
         <w:t>TV display</w:t>
       </w:r>
-      <w:bookmarkEnd w:id="26"/>
+      <w:bookmarkEnd w:id="27"/>
     </w:p>
     <w:p>
       <w:pPr>
@@ -6225,11 +6395,11 @@
         <w:pStyle w:val="Heading1"/>
         <w:pageBreakBefore/>
       </w:pPr>
-      <w:bookmarkStart w:id="27" w:name="_Toc241488683"/>
+      <w:bookmarkStart w:id="28" w:name="_Toc241488917"/>
       <w:r>
         <w:t>7.  CCC estimates coming into ShopControl</w:t>
       </w:r>
-      <w:bookmarkEnd w:id="27"/>
+      <w:bookmarkEnd w:id="28"/>
     </w:p>
     <w:p>
       <w:pPr>
@@ -6334,11 +6504,11 @@
         <w:pStyle w:val="Heading1"/>
         <w:pageBreakBefore/>
       </w:pPr>
-      <w:bookmarkStart w:id="28" w:name="_Toc241488684"/>
+      <w:bookmarkStart w:id="29" w:name="_Toc241488918"/>
       <w:r>
         <w:t>8.  Parts</w:t>
       </w:r>
-      <w:bookmarkEnd w:id="28"/>
+      <w:bookmarkEnd w:id="29"/>
     </w:p>
     <w:p>
       <w:pPr>
@@ -6392,11 +6562,11 @@
       <w:pPr>
         <w:pStyle w:val="Heading2"/>
       </w:pPr>
-      <w:bookmarkStart w:id="29" w:name="_Toc241488685"/>
+      <w:bookmarkStart w:id="30" w:name="_Toc241488919"/>
       <w:r>
         <w:t>What counts as a problem</w:t>
       </w:r>
-      <w:bookmarkEnd w:id="29"/>
+      <w:bookmarkEnd w:id="30"/>
     </w:p>
     <w:p>
       <w:pPr>
@@ -6460,11 +6630,11 @@
       <w:pPr>
         <w:pStyle w:val="Heading2"/>
       </w:pPr>
-      <w:bookmarkStart w:id="30" w:name="_Toc241488686"/>
+      <w:bookmarkStart w:id="31" w:name="_Toc241488920"/>
       <w:r>
         <w:t>Ordering parts</w:t>
       </w:r>
-      <w:bookmarkEnd w:id="30"/>
+      <w:bookmarkEnd w:id="31"/>
     </w:p>
     <w:p>
       <w:pPr>
@@ -6567,11 +6737,11 @@
       <w:pPr>
         <w:pStyle w:val="Heading2"/>
       </w:pPr>
-      <w:bookmarkStart w:id="31" w:name="_Toc241488687"/>
+      <w:bookmarkStart w:id="32" w:name="_Toc241488921"/>
       <w:r>
         <w:t>Mirror matching and carts</w:t>
       </w:r>
-      <w:bookmarkEnd w:id="31"/>
+      <w:bookmarkEnd w:id="32"/>
     </w:p>
     <w:p>
       <w:pPr>
@@ -6677,11 +6847,11 @@
       <w:pPr>
         <w:pStyle w:val="Heading2"/>
       </w:pPr>
-      <w:bookmarkStart w:id="32" w:name="_Toc241488688"/>
+      <w:bookmarkStart w:id="33" w:name="_Toc241488922"/>
       <w:r>
         <w:t>Other parts screens</w:t>
       </w:r>
-      <w:bookmarkEnd w:id="32"/>
+      <w:bookmarkEnd w:id="33"/>
     </w:p>
     <w:p>
       <w:pPr>
@@ -6768,11 +6938,11 @@
         <w:pStyle w:val="Heading1"/>
         <w:pageBreakBefore/>
       </w:pPr>
-      <w:bookmarkStart w:id="33" w:name="_Toc241488689"/>
+      <w:bookmarkStart w:id="34" w:name="_Toc241488923"/>
       <w:r>
         <w:t>9.  Vehicle QC (office view)</w:t>
       </w:r>
-      <w:bookmarkEnd w:id="33"/>
+      <w:bookmarkEnd w:id="34"/>
     </w:p>
     <w:p>
       <w:pPr>
@@ -6835,21 +7005,21 @@
         <w:pStyle w:val="Heading1"/>
         <w:pageBreakBefore/>
       </w:pPr>
-      <w:bookmarkStart w:id="34" w:name="_Toc241488690"/>
+      <w:bookmarkStart w:id="35" w:name="_Toc241488924"/>
       <w:r>
         <w:t>10.  Office tools</w:t>
       </w:r>
-      <w:bookmarkEnd w:id="34"/>
+      <w:bookmarkEnd w:id="35"/>
     </w:p>
     <w:p>
       <w:pPr>
         <w:pStyle w:val="Heading2"/>
       </w:pPr>
-      <w:bookmarkStart w:id="35" w:name="_Toc241488691"/>
+      <w:bookmarkStart w:id="36" w:name="_Toc241488925"/>
       <w:r>
         <w:t>Missed Calls / Callback Requests</w:t>
       </w:r>
-      <w:bookmarkEnd w:id="35"/>
+      <w:bookmarkEnd w:id="36"/>
     </w:p>
     <w:p>
       <w:pPr>
@@ -6923,11 +7093,11 @@
       <w:pPr>
         <w:pStyle w:val="Heading2"/>
       </w:pPr>
-      <w:bookmarkStart w:id="36" w:name="_Toc241488692"/>
+      <w:bookmarkStart w:id="37" w:name="_Toc241488926"/>
       <w:r>
         <w:t>Tasks</w:t>
       </w:r>
-      <w:bookmarkEnd w:id="36"/>
+      <w:bookmarkEnd w:id="37"/>
     </w:p>
     <w:p>
       <w:pPr>
@@ -6941,11 +7111,11 @@
       <w:pPr>
         <w:pStyle w:val="Heading2"/>
       </w:pPr>
-      <w:bookmarkStart w:id="37" w:name="_Toc241488693"/>
+      <w:bookmarkStart w:id="38" w:name="_Toc241488927"/>
       <w:r>
         <w:t>Booth Filters and Facility Checklist</w:t>
       </w:r>
-      <w:bookmarkEnd w:id="37"/>
+      <w:bookmarkEnd w:id="38"/>
     </w:p>
     <w:p>
       <w:pPr>
@@ -6979,11 +7149,11 @@
       <w:pPr>
         <w:pStyle w:val="Heading2"/>
       </w:pPr>
-      <w:bookmarkStart w:id="38" w:name="_Toc241488694"/>
+      <w:bookmarkStart w:id="39" w:name="_Toc241488928"/>
       <w:r>
         <w:t>AR Balances and Cycle Time</w:t>
       </w:r>
-      <w:bookmarkEnd w:id="38"/>
+      <w:bookmarkEnd w:id="39"/>
     </w:p>
     <w:p>
       <w:pPr>
@@ -7029,11 +7199,11 @@
       <w:pPr>
         <w:pStyle w:val="Heading2"/>
       </w:pPr>
-      <w:bookmarkStart w:id="39" w:name="_Toc241488695"/>
+      <w:bookmarkStart w:id="40" w:name="_Toc241488929"/>
       <w:r>
         <w:t>Photos and Activity Log</w:t>
       </w:r>
-      <w:bookmarkEnd w:id="39"/>
+      <w:bookmarkEnd w:id="40"/>
     </w:p>
     <w:p>
       <w:pPr>
@@ -7080,21 +7250,21 @@
         <w:pStyle w:val="Heading1"/>
         <w:pageBreakBefore/>
       </w:pPr>
-      <w:bookmarkStart w:id="40" w:name="_Toc241488696"/>
+      <w:bookmarkStart w:id="41" w:name="_Toc241488930"/>
       <w:r>
         <w:t>11.  Time off and messages (office and admins)</w:t>
       </w:r>
-      <w:bookmarkEnd w:id="40"/>
+      <w:bookmarkEnd w:id="41"/>
     </w:p>
     <w:p>
       <w:pPr>
         <w:pStyle w:val="Heading2"/>
       </w:pPr>
-      <w:bookmarkStart w:id="41" w:name="_Toc241488697"/>
+      <w:bookmarkStart w:id="42" w:name="_Toc241488931"/>
       <w:r>
         <w:t>Time Off tab</w:t>
       </w:r>
-      <w:bookmarkEnd w:id="41"/>
+      <w:bookmarkEnd w:id="42"/>
     </w:p>
     <w:p>
       <w:pPr>
@@ -7218,11 +7388,11 @@
       <w:pPr>
         <w:pStyle w:val="Heading2"/>
       </w:pPr>
-      <w:bookmarkStart w:id="42" w:name="_Toc241488698"/>
+      <w:bookmarkStart w:id="43" w:name="_Toc241488932"/>
       <w:r>
         <w:t>Messages &amp; Info tab</w:t>
       </w:r>
-      <w:bookmarkEnd w:id="42"/>
+      <w:bookmarkEnd w:id="43"/>
     </w:p>
     <w:p>
       <w:pPr>
@@ -7309,21 +7479,21 @@
         <w:pStyle w:val="Heading1"/>
         <w:pageBreakBefore/>
       </w:pPr>
-      <w:bookmarkStart w:id="43" w:name="_Toc241488699"/>
+      <w:bookmarkStart w:id="44" w:name="_Toc241488933"/>
       <w:r>
         <w:t>12.  Admin: employees and settings</w:t>
       </w:r>
-      <w:bookmarkEnd w:id="43"/>
+      <w:bookmarkEnd w:id="44"/>
     </w:p>
     <w:p>
       <w:pPr>
         <w:pStyle w:val="Heading2"/>
       </w:pPr>
-      <w:bookmarkStart w:id="44" w:name="_Toc241488700"/>
+      <w:bookmarkStart w:id="45" w:name="_Toc241488934"/>
       <w:r>
         <w:t>Adding an employee</w:t>
       </w:r>
-      <w:bookmarkEnd w:id="44"/>
+      <w:bookmarkEnd w:id="45"/>
     </w:p>
     <w:p>
       <w:pPr>
@@ -7431,11 +7601,11 @@
       <w:pPr>
         <w:pStyle w:val="Heading2"/>
       </w:pPr>
-      <w:bookmarkStart w:id="45" w:name="_Toc241488701"/>
+      <w:bookmarkStart w:id="46" w:name="_Toc241488935"/>
       <w:r>
         <w:t>Changing an employee</w:t>
       </w:r>
-      <w:bookmarkEnd w:id="45"/>
+      <w:bookmarkEnd w:id="46"/>
     </w:p>
     <w:p>
       <w:pPr>
@@ -7521,11 +7691,11 @@
       <w:pPr>
         <w:pStyle w:val="Heading2"/>
       </w:pPr>
-      <w:bookmarkStart w:id="46" w:name="_Toc241488702"/>
+      <w:bookmarkStart w:id="47" w:name="_Toc241488936"/>
       <w:r>
         <w:t>Board Settings</w:t>
       </w:r>
-      <w:bookmarkEnd w:id="46"/>
+      <w:bookmarkEnd w:id="47"/>
     </w:p>
     <w:p>
       <w:pPr>
@@ -7540,11 +7710,11 @@
         <w:pStyle w:val="Heading1"/>
         <w:pageBreakBefore/>
       </w:pPr>
-      <w:bookmarkStart w:id="47" w:name="_Toc241488703"/>
+      <w:bookmarkStart w:id="48" w:name="_Toc241488937"/>
       <w:r>
         <w:t>13.  Quick answers</w:t>
       </w:r>
-      <w:bookmarkEnd w:id="47"/>
+      <w:bookmarkEnd w:id="48"/>
     </w:p>
     <w:tbl>
       <w:tblPr>
@@ -8184,11 +8354,11 @@
         <w:pStyle w:val="Heading1"/>
         <w:pageBreakBefore/>
       </w:pPr>
-      <w:bookmarkStart w:id="48" w:name="_Toc241488704"/>
+      <w:bookmarkStart w:id="49" w:name="_Toc241488938"/>
       <w:r>
         <w:t>Manual versions</w:t>
       </w:r>
-      <w:bookmarkEnd w:id="48"/>
+      <w:bookmarkEnd w:id="49"/>
     </w:p>
     <w:tbl>
       <w:tblPr>
@@ -8339,7 +8509,7 @@
                 <w:b/>
                 <w:bCs/>
               </w:rPr>
-              <w:t>1.1</w:t>
+              <w:t>1.2</w:t>
             </w:r>
           </w:p>
         </w:tc>
@@ -8383,17 +8553,17 @@
           </w:tcPr>
           <w:p>
             <w:r>
-              <w:t xml:space="preserve">Employee App address is now </w:t>
+              <w:t xml:space="preserve">Added the </w:t>
             </w:r>
             <w:r>
               <w:rPr>
                 <w:b/>
                 <w:bCs/>
               </w:rPr>
-              <w:t>https://conceptautobody.app</w:t>
-            </w:r>
-            <w:r>
-              <w:t xml:space="preserve"> and works on phones anywhere. Added how to put it on your phone's home screen.</w:t>
+              <w:t>Help</w:t>
+            </w:r>
+            <w:r>
+              <w:t xml:space="preserve"> tab in the office program and a search box in the manual.</w:t>
             </w:r>
           </w:p>
         </w:tc>
@@ -8430,7 +8600,7 @@
                 <w:b/>
                 <w:bCs/>
               </w:rPr>
-              <w:t>1.0</w:t>
+              <w:t>1.1</w:t>
             </w:r>
           </w:p>
         </w:tc>
@@ -8474,6 +8644,97 @@
           </w:tcPr>
           <w:p>
             <w:r>
+              <w:t xml:space="preserve">Employee App address is now </w:t>
+            </w:r>
+            <w:r>
+              <w:rPr>
+                <w:b/>
+                <w:bCs/>
+              </w:rPr>
+              <w:t>https://conceptautobody.app</w:t>
+            </w:r>
+            <w:r>
+              <w:t xml:space="preserve"> and works on phones anywhere. Added how to put it on your phone's home screen.</w:t>
+            </w:r>
+          </w:p>
+        </w:tc>
+      </w:tr>
+      <w:tr>
+        <w:tblPrEx>
+          <w:tblCellMar>
+            <w:top w:w="0" w:type="dxa"/>
+            <w:bottom w:w="0" w:type="dxa"/>
+          </w:tblCellMar>
+        </w:tblPrEx>
+        <w:trPr>
+          <w:cantSplit/>
+        </w:trPr>
+        <w:tc>
+          <w:tcPr>
+            <w:tcW w:w="3120" w:type="dxa"/>
+            <w:tcBorders>
+              <w:top w:val="single" w:sz="4" w:space="0" w:color="C9CFD6"/>
+              <w:left w:val="single" w:sz="4" w:space="0" w:color="C9CFD6"/>
+              <w:bottom w:val="single" w:sz="4" w:space="0" w:color="C9CFD6"/>
+              <w:right w:val="single" w:sz="4" w:space="0" w:color="C9CFD6"/>
+            </w:tcBorders>
+            <w:tcMar>
+              <w:top w:w="80" w:type="dxa"/>
+              <w:left w:w="120" w:type="dxa"/>
+              <w:bottom w:w="80" w:type="dxa"/>
+              <w:right w:w="120" w:type="dxa"/>
+            </w:tcMar>
+          </w:tcPr>
+          <w:p>
+            <w:r>
+              <w:rPr>
+                <w:b/>
+                <w:bCs/>
+              </w:rPr>
+              <w:t>1.0</w:t>
+            </w:r>
+          </w:p>
+        </w:tc>
+        <w:tc>
+          <w:tcPr>
+            <w:tcW w:w="3120" w:type="dxa"/>
+            <w:tcBorders>
+              <w:top w:val="single" w:sz="4" w:space="0" w:color="C9CFD6"/>
+              <w:left w:val="single" w:sz="4" w:space="0" w:color="C9CFD6"/>
+              <w:bottom w:val="single" w:sz="4" w:space="0" w:color="C9CFD6"/>
+              <w:right w:val="single" w:sz="4" w:space="0" w:color="C9CFD6"/>
+            </w:tcBorders>
+            <w:tcMar>
+              <w:top w:w="80" w:type="dxa"/>
+              <w:left w:w="120" w:type="dxa"/>
+              <w:bottom w:w="80" w:type="dxa"/>
+              <w:right w:w="120" w:type="dxa"/>
+            </w:tcMar>
+          </w:tcPr>
+          <w:p>
+            <w:r>
+              <w:t>September 28, 2026</w:t>
+            </w:r>
+          </w:p>
+        </w:tc>
+        <w:tc>
+          <w:tcPr>
+            <w:tcW w:w="3120" w:type="dxa"/>
+            <w:tcBorders>
+              <w:top w:val="single" w:sz="4" w:space="0" w:color="C9CFD6"/>
+              <w:left w:val="single" w:sz="4" w:space="0" w:color="C9CFD6"/>
+              <w:bottom w:val="single" w:sz="4" w:space="0" w:color="C9CFD6"/>
+              <w:right w:val="single" w:sz="4" w:space="0" w:color="C9CFD6"/>
+            </w:tcBorders>
+            <w:tcMar>
+              <w:top w:w="80" w:type="dxa"/>
+              <w:left w:w="120" w:type="dxa"/>
+              <w:bottom w:w="80" w:type="dxa"/>
+              <w:right w:w="120" w:type="dxa"/>
+            </w:tcMar>
+          </w:tcPr>
+          <w:p>
+            <w:r>
               <w:t>First edition.</w:t>
             </w:r>
           </w:p>
@@ -8535,7 +8796,7 @@
         <w:sz w:val="18"/>
         <w:szCs w:val="18"/>
       </w:rPr>
-      <w:t xml:space="preserve">Concept Autobody  ·  Version 1.1  ·  Page </w:t>
+      <w:t xml:space="preserve">Concept Autobody  ·  Version 1.2  ·  Page </w:t>
     </w:r>
     <w:r>
       <w:rPr>
@@ -8628,278 +8889,278 @@
 <file path=word/numbering.xml><?xml version="1.0" encoding="utf-8"?>
 <w:numbering xmlns:wpc="http://schemas.microsoft.com/office/word/2010/wordprocessingCanvas" xmlns:cx="http://schemas.microsoft.com/office/drawing/2014/chartex" xmlns:cx1="http://schemas.microsoft.com/office/drawing/2015/9/8/chartex" xmlns:cx2="http://schemas.microsoft.com/office/drawing/2015/10/21/chartex" xmlns:cx3="http://schemas.microsoft.com/office/drawing/2016/5/9/chartex" xmlns:cx4="http://schemas.microsoft.com/office/drawing/2016/5/10/chartex" xmlns:cx5="http://schemas.microsoft.com/office/drawing/2016/5/11/chartex" xmlns:cx6="http://schemas.microsoft.com/office/drawing/2016/5/12/chartex" xmlns:cx7="http://schemas.microsoft.com/office/drawing/2016/5/13/chartex" xmlns:cx8="http://schemas.microsoft.com/office/drawing/2016/5/14/chartex" xmlns:mc="http://schemas.openxmlformats.org/markup-compatibility/2006" xmlns:aink="http://schemas.microsoft.com/office/drawing/2016/ink" xmlns:am3d="http://schemas.microsoft.com/office/drawing/2017/model3d" xmlns:o="urn:schemas-microsoft-com:office:office" xmlns:oel="http://schemas.microsoft.com/office/2019/extlst" xmlns:r="http://schemas.openxmlformats.org/officeDocument/2006/relationships" xmlns:m="http://schemas.openxmlformats.org/officeDocument/2006/math" xmlns:v="urn:schemas-microsoft-com:vml" xmlns:wp14="http://schemas.microsoft.com/office/word/2010/wordprocessingDrawing" xmlns:wp="http://schemas.openxmlformats.org/drawingml/2006/wordprocessingDrawing" xmlns:w10="urn:schemas-microsoft-com:office:word" xmlns:w="http://schemas.openxmlformats.org/wordprocessingml/2006/main" xmlns:w14="http://schemas.microsoft.com/office/word/2010/wordml" xmlns:w15="http://schemas.microsoft.com/office/word/2012/wordml" xmlns:w16cex="http://schemas.microsoft.com/office/word/2018/wordml/cex" xmlns:w16cid="http://schemas.microsoft.com/office/word/2016/wordml/cid" xmlns:w16="http://schemas.microsoft.com/office/word/2018/wordml" xmlns:w16du="http://schemas.microsoft.com/office/word/2023/wordml/word16du" xmlns:w16sdtdh="http://schemas.microsoft.com/office/word/2020/wordml/sdtdatahash" xmlns:w16sdtfl="http://schemas.microsoft.com/office/word/2024/wordml/sdtformatlock" xmlns:w16se="http://schemas.microsoft.com/office/word/2015/wordml/symex" xmlns:wpg="http://schemas.microsoft.com/office/word/2010/wordprocessingGroup" xmlns:wpi="http://schemas.microsoft.com/office/word/2010/wordprocessingInk" xmlns:wne="http://schemas.microsoft.com/office/word/2006/wordml" xmlns:wps="http://schemas.microsoft.com/office/word/2010/wordprocessingShape" mc:Ignorable="w14 w15 w16se w16cid w16 w16cex w16sdtdh w16sdtfl w16du wp14">
   <w:abstractNum w:abstractNumId="0" w15:restartNumberingAfterBreak="0">
-    <w:nsid w:val="20132E79"/>
+    <w:nsid w:val="27B212B5"/>
     <w:multiLevelType w:val="hybridMultilevel"/>
-    <w:tmpl w:val="08CCC716"/>
-    <w:lvl w:ilvl="0" w:tplc="0DB2BDEC">
+    <w:tmpl w:val="A9C6C2BC"/>
+    <w:lvl w:ilvl="0" w:tplc="5B8A2A4E">
       <w:start w:val="1"/>
-      <w:numFmt w:val="bullet"/>
-      <w:lvlText w:val="•"/>
+      <w:numFmt w:val="decimal"/>
+      <w:lvlText w:val="%1."/>
       <w:lvlJc w:val="left"/>
       <w:pPr>
-        <w:ind w:left="540" w:hanging="270"/>
-      </w:pPr>
+        <w:ind w:left="540" w:hanging="360"/>
+      </w:pPr>
+      <w:rPr>
+        <w:b/>
+        <w:bCs/>
+        <w:color w:val="E8620E"/>
+      </w:rPr>
     </w:lvl>
-    <w:lvl w:ilvl="1" w:tplc="99FA9F34">
+    <w:lvl w:ilvl="1" w:tplc="7728DD06">
       <w:numFmt w:val="decimal"/>
       <w:lvlText w:val=""/>
       <w:lvlJc w:val="left"/>
     </w:lvl>
-    <w:lvl w:ilvl="2" w:tplc="3CAE6316">
+    <w:lvl w:ilvl="2" w:tplc="C6F4FA1A">
       <w:numFmt w:val="decimal"/>
       <w:lvlText w:val=""/>
       <w:lvlJc w:val="left"/>
     </w:lvl>
-    <w:lvl w:ilvl="3" w:tplc="B76E875E">
+    <w:lvl w:ilvl="3" w:tplc="6CD812C2">
       <w:numFmt w:val="decimal"/>
       <w:lvlText w:val=""/>
       <w:lvlJc w:val="left"/>
     </w:lvl>
-    <w:lvl w:ilvl="4" w:tplc="8FFEB0C6">
+    <w:lvl w:ilvl="4" w:tplc="163A085E">
       <w:numFmt w:val="decimal"/>
       <w:lvlText w:val=""/>
       <w:lvlJc w:val="left"/>
     </w:lvl>
-    <w:lvl w:ilvl="5" w:tplc="5072B268">
+    <w:lvl w:ilvl="5" w:tplc="384AD7D8">
       <w:numFmt w:val="decimal"/>
       <w:lvlText w:val=""/>
       <w:lvlJc w:val="left"/>
     </w:lvl>
-    <w:lvl w:ilvl="6" w:tplc="ABCE9DCA">
+    <w:lvl w:ilvl="6" w:tplc="22F68386">
       <w:numFmt w:val="decimal"/>
       <w:lvlText w:val=""/>
       <w:lvlJc w:val="left"/>
     </w:lvl>
-    <w:lvl w:ilvl="7" w:tplc="FA623A20">
+    <w:lvl w:ilvl="7" w:tplc="44DADA4A">
       <w:numFmt w:val="decimal"/>
       <w:lvlText w:val=""/>
       <w:lvlJc w:val="left"/>
     </w:lvl>
-    <w:lvl w:ilvl="8" w:tplc="3E942DA2">
+    <w:lvl w:ilvl="8" w:tplc="E5B63654">
       <w:numFmt w:val="decimal"/>
       <w:lvlText w:val=""/>
       <w:lvlJc w:val="left"/>
     </w:lvl>
   </w:abstractNum>
   <w:abstractNum w:abstractNumId="1" w15:restartNumberingAfterBreak="0">
-    <w:nsid w:val="4D9E669C"/>
+    <w:nsid w:val="6DFE6CC7"/>
     <w:multiLevelType w:val="hybridMultilevel"/>
-    <w:tmpl w:val="96941CE6"/>
-    <w:lvl w:ilvl="0" w:tplc="060AF66E">
+    <w:tmpl w:val="9DCC35E0"/>
+    <w:lvl w:ilvl="0" w:tplc="472CF3EA" w:tentative="1">
       <w:start w:val="1"/>
-      <w:numFmt w:val="decimal"/>
-      <w:lvlText w:val="%1."/>
+      <w:numFmt w:val="bullet"/>
+      <w:lvlText w:val="●"/>
       <w:lvlJc w:val="left"/>
       <w:pPr>
-        <w:ind w:left="540" w:hanging="360"/>
-      </w:pPr>
-      <w:rPr>
-        <w:b/>
-        <w:bCs/>
-        <w:color w:val="E8620E"/>
-      </w:rPr>
+        <w:ind w:left="720" w:hanging="360"/>
+      </w:pPr>
     </w:lvl>
-    <w:lvl w:ilvl="1" w:tplc="918AFC20">
+    <w:lvl w:ilvl="1" w:tplc="D7883234" w:tentative="1">
+      <w:start w:val="1"/>
+      <w:numFmt w:val="bullet"/>
+      <w:lvlText w:val="○"/>
+      <w:lvlJc w:val="left"/>
+      <w:pPr>
+        <w:ind w:left="1440" w:hanging="360"/>
+      </w:pPr>
+    </w:lvl>
+    <w:lvl w:ilvl="2" w:tplc="7E58800A" w:tentative="1">
+      <w:start w:val="1"/>
+      <w:numFmt w:val="bullet"/>
+      <w:lvlText w:val="■"/>
+      <w:lvlJc w:val="left"/>
+      <w:pPr>
+        <w:ind w:left="2160" w:hanging="360"/>
+      </w:pPr>
+    </w:lvl>
+    <w:lvl w:ilvl="3" w:tplc="9BC0A68A" w:tentative="1">
+      <w:start w:val="1"/>
+      <w:numFmt w:val="bullet"/>
+      <w:lvlText w:val="●"/>
+      <w:lvlJc w:val="left"/>
+      <w:pPr>
+        <w:ind w:left="2880" w:hanging="360"/>
+      </w:pPr>
+    </w:lvl>
+    <w:lvl w:ilvl="4" w:tplc="A59023EE" w:tentative="1">
+      <w:start w:val="1"/>
+      <w:numFmt w:val="bullet"/>
+      <w:lvlText w:val="○"/>
+      <w:lvlJc w:val="left"/>
+      <w:pPr>
+        <w:ind w:left="3600" w:hanging="360"/>
+      </w:pPr>
+    </w:lvl>
+    <w:lvl w:ilvl="5" w:tplc="DA36D5E0" w:tentative="1">
+      <w:start w:val="1"/>
+      <w:numFmt w:val="bullet"/>
+      <w:lvlText w:val="■"/>
+      <w:lvlJc w:val="left"/>
+      <w:pPr>
+        <w:ind w:left="4320" w:hanging="360"/>
+      </w:pPr>
+    </w:lvl>
+    <w:lvl w:ilvl="6" w:tplc="AB8CC412" w:tentative="1">
+      <w:start w:val="1"/>
+      <w:numFmt w:val="bullet"/>
+      <w:lvlText w:val="●"/>
+      <w:lvlJc w:val="left"/>
+      <w:pPr>
+        <w:ind w:left="5040" w:hanging="360"/>
+      </w:pPr>
+    </w:lvl>
+    <w:lvl w:ilvl="7" w:tplc="67A6B5CE" w:tentative="1">
+      <w:start w:val="1"/>
+      <w:numFmt w:val="bullet"/>
+      <w:lvlText w:val="●"/>
+      <w:lvlJc w:val="left"/>
+      <w:pPr>
+        <w:ind w:left="5760" w:hanging="360"/>
+      </w:pPr>
+    </w:lvl>
+    <w:lvl w:ilvl="8" w:tplc="37FC13D8" w:tentative="1">
+      <w:start w:val="1"/>
+      <w:numFmt w:val="bullet"/>
+      <w:lvlText w:val="●"/>
+      <w:lvlJc w:val="left"/>
+      <w:pPr>
+        <w:ind w:left="6480" w:hanging="360"/>
+      </w:pPr>
+    </w:lvl>
+  </w:abstractNum>
+  <w:abstractNum w:abstractNumId="2" w15:restartNumberingAfterBreak="0">
+    <w:nsid w:val="77583DAB"/>
+    <w:multiLevelType w:val="hybridMultilevel"/>
+    <w:tmpl w:val="275666A2"/>
+    <w:lvl w:ilvl="0" w:tplc="AE94E9E0">
+      <w:start w:val="1"/>
+      <w:numFmt w:val="bullet"/>
+      <w:lvlText w:val="•"/>
+      <w:lvlJc w:val="left"/>
+      <w:pPr>
+        <w:ind w:left="540" w:hanging="270"/>
+      </w:pPr>
+    </w:lvl>
+    <w:lvl w:ilvl="1" w:tplc="BB0EA214">
       <w:numFmt w:val="decimal"/>
       <w:lvlText w:val=""/>
       <w:lvlJc w:val="left"/>
     </w:lvl>
-    <w:lvl w:ilvl="2" w:tplc="DAAC8034">
+    <w:lvl w:ilvl="2" w:tplc="4D22791A">
       <w:numFmt w:val="decimal"/>
       <w:lvlText w:val=""/>
       <w:lvlJc w:val="left"/>
     </w:lvl>
-    <w:lvl w:ilvl="3" w:tplc="E68C4D4E">
+    <w:lvl w:ilvl="3" w:tplc="7C183A32">
       <w:numFmt w:val="decimal"/>
       <w:lvlText w:val=""/>
       <w:lvlJc w:val="left"/>
     </w:lvl>
-    <w:lvl w:ilvl="4" w:tplc="14F44FC6">
+    <w:lvl w:ilvl="4" w:tplc="02EED7BA">
       <w:numFmt w:val="decimal"/>
       <w:lvlText w:val=""/>
       <w:lvlJc w:val="left"/>
     </w:lvl>
-    <w:lvl w:ilvl="5" w:tplc="E1203BE2">
+    <w:lvl w:ilvl="5" w:tplc="7E04F9B4">
       <w:numFmt w:val="decimal"/>
       <w:lvlText w:val=""/>
       <w:lvlJc w:val="left"/>
     </w:lvl>
-    <w:lvl w:ilvl="6" w:tplc="9E48ADE2">
+    <w:lvl w:ilvl="6" w:tplc="3846323A">
       <w:numFmt w:val="decimal"/>
       <w:lvlText w:val=""/>
       <w:lvlJc w:val="left"/>
     </w:lvl>
-    <w:lvl w:ilvl="7" w:tplc="49663CD4">
+    <w:lvl w:ilvl="7" w:tplc="6C7430A6">
       <w:numFmt w:val="decimal"/>
       <w:lvlText w:val=""/>
       <w:lvlJc w:val="left"/>
     </w:lvl>
-    <w:lvl w:ilvl="8" w:tplc="1CD435AC">
+    <w:lvl w:ilvl="8" w:tplc="DD12BED8">
       <w:numFmt w:val="decimal"/>
       <w:lvlText w:val=""/>
       <w:lvlJc w:val="left"/>
     </w:lvl>
   </w:abstractNum>
-  <w:abstractNum w:abstractNumId="2" w15:restartNumberingAfterBreak="0">
-    <w:nsid w:val="50482E71"/>
-    <w:multiLevelType w:val="hybridMultilevel"/>
-    <w:tmpl w:val="A22C1908"/>
-    <w:lvl w:ilvl="0" w:tplc="CBF403F2" w:tentative="1">
-      <w:start w:val="1"/>
-      <w:numFmt w:val="bullet"/>
-      <w:lvlText w:val="●"/>
-      <w:lvlJc w:val="left"/>
-      <w:pPr>
-        <w:ind w:left="720" w:hanging="360"/>
-      </w:pPr>
-    </w:lvl>
-    <w:lvl w:ilvl="1" w:tplc="C262AE40" w:tentative="1">
-      <w:start w:val="1"/>
-      <w:numFmt w:val="bullet"/>
-      <w:lvlText w:val="○"/>
-      <w:lvlJc w:val="left"/>
-      <w:pPr>
-        <w:ind w:left="1440" w:hanging="360"/>
-      </w:pPr>
-    </w:lvl>
-    <w:lvl w:ilvl="2" w:tplc="5C127ED6" w:tentative="1">
-      <w:start w:val="1"/>
-      <w:numFmt w:val="bullet"/>
-      <w:lvlText w:val="■"/>
-      <w:lvlJc w:val="left"/>
-      <w:pPr>
-        <w:ind w:left="2160" w:hanging="360"/>
-      </w:pPr>
-    </w:lvl>
-    <w:lvl w:ilvl="3" w:tplc="3508D0CA" w:tentative="1">
-      <w:start w:val="1"/>
-      <w:numFmt w:val="bullet"/>
-      <w:lvlText w:val="●"/>
-      <w:lvlJc w:val="left"/>
-      <w:pPr>
-        <w:ind w:left="2880" w:hanging="360"/>
-      </w:pPr>
-    </w:lvl>
-    <w:lvl w:ilvl="4" w:tplc="638C47E0" w:tentative="1">
-      <w:start w:val="1"/>
-      <w:numFmt w:val="bullet"/>
-      <w:lvlText w:val="○"/>
-      <w:lvlJc w:val="left"/>
-      <w:pPr>
-        <w:ind w:left="3600" w:hanging="360"/>
-      </w:pPr>
-    </w:lvl>
-    <w:lvl w:ilvl="5" w:tplc="F080EF42" w:tentative="1">
-      <w:start w:val="1"/>
-      <w:numFmt w:val="bullet"/>
-      <w:lvlText w:val="■"/>
-      <w:lvlJc w:val="left"/>
-      <w:pPr>
-        <w:ind w:left="4320" w:hanging="360"/>
-      </w:pPr>
-    </w:lvl>
-    <w:lvl w:ilvl="6" w:tplc="7102F528" w:tentative="1">
-      <w:start w:val="1"/>
-      <w:numFmt w:val="bullet"/>
-      <w:lvlText w:val="●"/>
-      <w:lvlJc w:val="left"/>
-      <w:pPr>
-        <w:ind w:left="5040" w:hanging="360"/>
-      </w:pPr>
-    </w:lvl>
-    <w:lvl w:ilvl="7" w:tplc="A4EC9712" w:tentative="1">
-      <w:start w:val="1"/>
-      <w:numFmt w:val="bullet"/>
-      <w:lvlText w:val="●"/>
-      <w:lvlJc w:val="left"/>
-      <w:pPr>
-        <w:ind w:left="5760" w:hanging="360"/>
-      </w:pPr>
-    </w:lvl>
-    <w:lvl w:ilvl="8" w:tplc="3190B78A" w:tentative="1">
-      <w:start w:val="1"/>
-      <w:numFmt w:val="bullet"/>
-      <w:lvlText w:val="●"/>
-      <w:lvlJc w:val="left"/>
-      <w:pPr>
-        <w:ind w:left="6480" w:hanging="360"/>
-      </w:pPr>
-    </w:lvl>
-  </w:abstractNum>
-  <w:num w:numId="1" w16cid:durableId="1707170415">
+  <w:num w:numId="1" w16cid:durableId="58984982">
+    <w:abstractNumId w:val="1"/>
+    <w:lvlOverride w:ilvl="0">
+      <w:startOverride w:val="1"/>
+    </w:lvlOverride>
+  </w:num>
+  <w:num w:numId="2" w16cid:durableId="1753967356">
     <w:abstractNumId w:val="2"/>
     <w:lvlOverride w:ilvl="0">
       <w:startOverride w:val="1"/>
     </w:lvlOverride>
   </w:num>
-  <w:num w:numId="2" w16cid:durableId="1442072322">
+  <w:num w:numId="3" w16cid:durableId="1959944528">
     <w:abstractNumId w:val="0"/>
     <w:lvlOverride w:ilvl="0">
       <w:startOverride w:val="1"/>
     </w:lvlOverride>
   </w:num>
-  <w:num w:numId="3" w16cid:durableId="566305235">
-    <w:abstractNumId w:val="1"/>
+  <w:num w:numId="4" w16cid:durableId="90395999">
+    <w:abstractNumId w:val="0"/>
     <w:lvlOverride w:ilvl="0">
       <w:startOverride w:val="1"/>
     </w:lvlOverride>
   </w:num>
-  <w:num w:numId="4" w16cid:durableId="332954301">
-    <w:abstractNumId w:val="1"/>
+  <w:num w:numId="5" w16cid:durableId="2057387488">
+    <w:abstractNumId w:val="0"/>
     <w:lvlOverride w:ilvl="0">
       <w:startOverride w:val="1"/>
     </w:lvlOverride>
   </w:num>
-  <w:num w:numId="5" w16cid:durableId="1058088335">
-    <w:abstractNumId w:val="1"/>
+  <w:num w:numId="6" w16cid:durableId="1518499806">
+    <w:abstractNumId w:val="0"/>
     <w:lvlOverride w:ilvl="0">
       <w:startOverride w:val="1"/>
     </w:lvlOverride>
   </w:num>
-  <w:num w:numId="6" w16cid:durableId="503519786">
-    <w:abstractNumId w:val="1"/>
+  <w:num w:numId="7" w16cid:durableId="755975461">
+    <w:abstractNumId w:val="0"/>
     <w:lvlOverride w:ilvl="0">
       <w:startOverride w:val="1"/>
     </w:lvlOverride>
   </w:num>
-  <w:num w:numId="7" w16cid:durableId="2086678941">
-    <w:abstractNumId w:val="1"/>
+  <w:num w:numId="8" w16cid:durableId="1366521496">
+    <w:abstractNumId w:val="0"/>
     <w:lvlOverride w:ilvl="0">
       <w:startOverride w:val="1"/>
     </w:lvlOverride>
   </w:num>
-  <w:num w:numId="8" w16cid:durableId="1154101781">
-    <w:abstractNumId w:val="1"/>
+  <w:num w:numId="9" w16cid:durableId="429543103">
+    <w:abstractNumId w:val="0"/>
     <w:lvlOverride w:ilvl="0">
       <w:startOverride w:val="1"/>
     </w:lvlOverride>
   </w:num>
-  <w:num w:numId="9" w16cid:durableId="404378265">
-    <w:abstractNumId w:val="1"/>
+  <w:num w:numId="10" w16cid:durableId="1204634322">
+    <w:abstractNumId w:val="0"/>
     <w:lvlOverride w:ilvl="0">
       <w:startOverride w:val="1"/>
     </w:lvlOverride>
   </w:num>
-  <w:num w:numId="10" w16cid:durableId="2035879626">
-    <w:abstractNumId w:val="1"/>
+  <w:num w:numId="11" w16cid:durableId="1942030139">
+    <w:abstractNumId w:val="0"/>
     <w:lvlOverride w:ilvl="0">
       <w:startOverride w:val="1"/>
     </w:lvlOverride>
   </w:num>
-  <w:num w:numId="11" w16cid:durableId="1691761738">
-    <w:abstractNumId w:val="1"/>
+  <w:num w:numId="12" w16cid:durableId="1910261094">
+    <w:abstractNumId w:val="0"/>
     <w:lvlOverride w:ilvl="0">
       <w:startOverride w:val="1"/>
     </w:lvlOverride>
   </w:num>
-  <w:num w:numId="12" w16cid:durableId="2017876152">
-    <w:abstractNumId w:val="1"/>
-    <w:lvlOverride w:ilvl="0">
-      <w:startOverride w:val="1"/>
-    </w:lvlOverride>
-  </w:num>
-  <w:num w:numId="13" w16cid:durableId="148062563">
-    <w:abstractNumId w:val="1"/>
+  <w:num w:numId="13" w16cid:durableId="1595547817">
+    <w:abstractNumId w:val="0"/>
     <w:lvlOverride w:ilvl="0">
       <w:startOverride w:val="1"/>
     </w:lvlOverride>
@@ -9551,7 +9812,7 @@
     <w:autoRedefine/>
     <w:uiPriority w:val="39"/>
     <w:unhideWhenUsed/>
-    <w:rsid w:val="00B27DCA"/>
+    <w:rsid w:val="00204C05"/>
     <w:pPr>
       <w:spacing w:after="100"/>
     </w:pPr>
@@ -9563,7 +9824,7 @@
     <w:autoRedefine/>
     <w:uiPriority w:val="39"/>
     <w:unhideWhenUsed/>
-    <w:rsid w:val="00B27DCA"/>
+    <w:rsid w:val="00204C05"/>
     <w:pPr>
       <w:spacing w:after="100"/>
       <w:ind w:left="220"/>

</xml_diff>

<commit_message>
Require a new password at first sign-in after an admin sets one
- Migration 021: users.must_change_password, set when an admin creates an
  account or resets its password; cleared when the user changes it (or uses
  an emailed reset link).
- While set, the API refuses everything except /api/auth/me and the new
  POST /api/auth/change-password (current + new password, 8+ chars, must
  differ). Enforced in requireAuth, not just the screens.
- Office program and Employee App show a "Choose your password" screen after
  signing in with a temporary password; Employees list marks anyone still on
  one with "Needs new password".
- User manual v1.3.

Co-Authored-By: Claude Opus 5.5 <noreply@anthropic.com>
</commit_message>
<xml_diff>
--- a/client/manual/ShopControl-User-Manual.docx
+++ b/client/manual/ShopControl-User-Manual.docx
@@ -16,7 +16,7 @@
           <w:noProof/>
         </w:rPr>
         <w:drawing>
-          <wp:inline distT="0" distB="0" distL="0" distR="0" wp14:anchorId="4D6671C3" wp14:editId="4D6671C4">
+          <wp:inline distT="0" distB="0" distL="0" distR="0" wp14:anchorId="3C5ECB34" wp14:editId="3C5ECB35">
             <wp:extent cx="4000500" cy="1485900"/>
             <wp:effectExtent l="0" t="0" r="0" b="0"/>
             <wp:docPr id="1" name="Picture 1"/>
@@ -93,7 +93,7 @@
         <w:rPr>
           <w:color w:val="5B6776"/>
         </w:rPr>
-        <w:t>Version 1.2  ·  Updated September 28, 2026</w:t>
+        <w:t>Version 1.3  ·  Updated September 28, 2026</w:t>
       </w:r>
     </w:p>
     <w:p>
@@ -122,7 +122,7 @@
     <w:sdt>
       <w:sdtPr>
         <w:alias w:val="Contents"/>
-        <w:id w:val="-2115046102"/>
+        <w:id w:val="-1816944766"/>
       </w:sdtPr>
       <w:sdtEndPr/>
       <w:sdtContent>
@@ -151,7 +151,7 @@
           <w:r>
             <w:fldChar w:fldCharType="separate"/>
           </w:r>
-          <w:hyperlink w:anchor="_Toc241488889" w:history="1">
+          <w:hyperlink w:anchor="_Toc241494507" w:history="1">
             <w:r>
               <w:rPr>
                 <w:rStyle w:val="Hyperlink"/>
@@ -175,7 +175,7 @@
               <w:rPr>
                 <w:noProof/>
               </w:rPr>
-              <w:instrText xml:space="preserve"> PAGEREF _Toc241488889 \h </w:instrText>
+              <w:instrText xml:space="preserve"> PAGEREF _Toc241494507 \h </w:instrText>
             </w:r>
             <w:r>
               <w:rPr>
@@ -218,7 +218,7 @@
               <w14:ligatures w14:val="standardContextual"/>
             </w:rPr>
           </w:pPr>
-          <w:hyperlink w:anchor="_Toc241488890" w:history="1">
+          <w:hyperlink w:anchor="_Toc241494508" w:history="1">
             <w:r>
               <w:rPr>
                 <w:rStyle w:val="Hyperlink"/>
@@ -242,7 +242,7 @@
               <w:rPr>
                 <w:noProof/>
               </w:rPr>
-              <w:instrText xml:space="preserve"> PAGEREF _Toc241488890 \h </w:instrText>
+              <w:instrText xml:space="preserve"> PAGEREF _Toc241494508 \h </w:instrText>
             </w:r>
             <w:r>
               <w:rPr>
@@ -285,7 +285,7 @@
               <w14:ligatures w14:val="standardContextual"/>
             </w:rPr>
           </w:pPr>
-          <w:hyperlink w:anchor="_Toc241488891" w:history="1">
+          <w:hyperlink w:anchor="_Toc241494509" w:history="1">
             <w:r>
               <w:rPr>
                 <w:rStyle w:val="Hyperlink"/>
@@ -309,7 +309,7 @@
               <w:rPr>
                 <w:noProof/>
               </w:rPr>
-              <w:instrText xml:space="preserve"> PAGEREF _Toc241488891 \h </w:instrText>
+              <w:instrText xml:space="preserve"> PAGEREF _Toc241494509 \h </w:instrText>
             </w:r>
             <w:r>
               <w:rPr>
@@ -352,7 +352,7 @@
               <w14:ligatures w14:val="standardContextual"/>
             </w:rPr>
           </w:pPr>
-          <w:hyperlink w:anchor="_Toc241488892" w:history="1">
+          <w:hyperlink w:anchor="_Toc241494510" w:history="1">
             <w:r>
               <w:rPr>
                 <w:rStyle w:val="Hyperlink"/>
@@ -376,7 +376,7 @@
               <w:rPr>
                 <w:noProof/>
               </w:rPr>
-              <w:instrText xml:space="preserve"> PAGEREF _Toc241488892 \h </w:instrText>
+              <w:instrText xml:space="preserve"> PAGEREF _Toc241494510 \h </w:instrText>
             </w:r>
             <w:r>
               <w:rPr>
@@ -419,7 +419,7 @@
               <w14:ligatures w14:val="standardContextual"/>
             </w:rPr>
           </w:pPr>
-          <w:hyperlink w:anchor="_Toc241488893" w:history="1">
+          <w:hyperlink w:anchor="_Toc241494511" w:history="1">
             <w:r>
               <w:rPr>
                 <w:rStyle w:val="Hyperlink"/>
@@ -443,7 +443,7 @@
               <w:rPr>
                 <w:noProof/>
               </w:rPr>
-              <w:instrText xml:space="preserve"> PAGEREF _Toc241488893 \h </w:instrText>
+              <w:instrText xml:space="preserve"> PAGEREF _Toc241494511 \h </w:instrText>
             </w:r>
             <w:r>
               <w:rPr>
@@ -486,7 +486,7 @@
               <w14:ligatures w14:val="standardContextual"/>
             </w:rPr>
           </w:pPr>
-          <w:hyperlink w:anchor="_Toc241488894" w:history="1">
+          <w:hyperlink w:anchor="_Toc241494512" w:history="1">
             <w:r>
               <w:rPr>
                 <w:rStyle w:val="Hyperlink"/>
@@ -510,7 +510,7 @@
               <w:rPr>
                 <w:noProof/>
               </w:rPr>
-              <w:instrText xml:space="preserve"> PAGEREF _Toc241488894 \h </w:instrText>
+              <w:instrText xml:space="preserve"> PAGEREF _Toc241494512 \h </w:instrText>
             </w:r>
             <w:r>
               <w:rPr>
@@ -553,7 +553,7 @@
               <w14:ligatures w14:val="standardContextual"/>
             </w:rPr>
           </w:pPr>
-          <w:hyperlink w:anchor="_Toc241488895" w:history="1">
+          <w:hyperlink w:anchor="_Toc241494513" w:history="1">
             <w:r>
               <w:rPr>
                 <w:rStyle w:val="Hyperlink"/>
@@ -577,7 +577,7 @@
               <w:rPr>
                 <w:noProof/>
               </w:rPr>
-              <w:instrText xml:space="preserve"> PAGEREF _Toc241488895 \h </w:instrText>
+              <w:instrText xml:space="preserve"> PAGEREF _Toc241494513 \h </w:instrText>
             </w:r>
             <w:r>
               <w:rPr>
@@ -620,7 +620,7 @@
               <w14:ligatures w14:val="standardContextual"/>
             </w:rPr>
           </w:pPr>
-          <w:hyperlink w:anchor="_Toc241488896" w:history="1">
+          <w:hyperlink w:anchor="_Toc241494514" w:history="1">
             <w:r>
               <w:rPr>
                 <w:rStyle w:val="Hyperlink"/>
@@ -644,7 +644,7 @@
               <w:rPr>
                 <w:noProof/>
               </w:rPr>
-              <w:instrText xml:space="preserve"> PAGEREF _Toc241488896 \h </w:instrText>
+              <w:instrText xml:space="preserve"> PAGEREF _Toc241494514 \h </w:instrText>
             </w:r>
             <w:r>
               <w:rPr>
@@ -687,7 +687,7 @@
               <w14:ligatures w14:val="standardContextual"/>
             </w:rPr>
           </w:pPr>
-          <w:hyperlink w:anchor="_Toc241488897" w:history="1">
+          <w:hyperlink w:anchor="_Toc241494515" w:history="1">
             <w:r>
               <w:rPr>
                 <w:rStyle w:val="Hyperlink"/>
@@ -711,7 +711,7 @@
               <w:rPr>
                 <w:noProof/>
               </w:rPr>
-              <w:instrText xml:space="preserve"> PAGEREF _Toc241488897 \h </w:instrText>
+              <w:instrText xml:space="preserve"> PAGEREF _Toc241494515 \h </w:instrText>
             </w:r>
             <w:r>
               <w:rPr>
@@ -754,7 +754,7 @@
               <w14:ligatures w14:val="standardContextual"/>
             </w:rPr>
           </w:pPr>
-          <w:hyperlink w:anchor="_Toc241488898" w:history="1">
+          <w:hyperlink w:anchor="_Toc241494516" w:history="1">
             <w:r>
               <w:rPr>
                 <w:rStyle w:val="Hyperlink"/>
@@ -778,7 +778,7 @@
               <w:rPr>
                 <w:noProof/>
               </w:rPr>
-              <w:instrText xml:space="preserve"> PAGEREF _Toc241488898 \h </w:instrText>
+              <w:instrText xml:space="preserve"> PAGEREF _Toc241494516 \h </w:instrText>
             </w:r>
             <w:r>
               <w:rPr>
@@ -821,7 +821,7 @@
               <w14:ligatures w14:val="standardContextual"/>
             </w:rPr>
           </w:pPr>
-          <w:hyperlink w:anchor="_Toc241488899" w:history="1">
+          <w:hyperlink w:anchor="_Toc241494517" w:history="1">
             <w:r>
               <w:rPr>
                 <w:rStyle w:val="Hyperlink"/>
@@ -845,7 +845,7 @@
               <w:rPr>
                 <w:noProof/>
               </w:rPr>
-              <w:instrText xml:space="preserve"> PAGEREF _Toc241488899 \h </w:instrText>
+              <w:instrText xml:space="preserve"> PAGEREF _Toc241494517 \h </w:instrText>
             </w:r>
             <w:r>
               <w:rPr>
@@ -888,7 +888,7 @@
               <w14:ligatures w14:val="standardContextual"/>
             </w:rPr>
           </w:pPr>
-          <w:hyperlink w:anchor="_Toc241488900" w:history="1">
+          <w:hyperlink w:anchor="_Toc241494518" w:history="1">
             <w:r>
               <w:rPr>
                 <w:rStyle w:val="Hyperlink"/>
@@ -912,7 +912,7 @@
               <w:rPr>
                 <w:noProof/>
               </w:rPr>
-              <w:instrText xml:space="preserve"> PAGEREF _Toc241488900 \h </w:instrText>
+              <w:instrText xml:space="preserve"> PAGEREF _Toc241494518 \h </w:instrText>
             </w:r>
             <w:r>
               <w:rPr>
@@ -955,7 +955,7 @@
               <w14:ligatures w14:val="standardContextual"/>
             </w:rPr>
           </w:pPr>
-          <w:hyperlink w:anchor="_Toc241488901" w:history="1">
+          <w:hyperlink w:anchor="_Toc241494519" w:history="1">
             <w:r>
               <w:rPr>
                 <w:rStyle w:val="Hyperlink"/>
@@ -979,7 +979,7 @@
               <w:rPr>
                 <w:noProof/>
               </w:rPr>
-              <w:instrText xml:space="preserve"> PAGEREF _Toc241488901 \h </w:instrText>
+              <w:instrText xml:space="preserve"> PAGEREF _Toc241494519 \h </w:instrText>
             </w:r>
             <w:r>
               <w:rPr>
@@ -1022,7 +1022,7 @@
               <w14:ligatures w14:val="standardContextual"/>
             </w:rPr>
           </w:pPr>
-          <w:hyperlink w:anchor="_Toc241488902" w:history="1">
+          <w:hyperlink w:anchor="_Toc241494520" w:history="1">
             <w:r>
               <w:rPr>
                 <w:rStyle w:val="Hyperlink"/>
@@ -1046,7 +1046,7 @@
               <w:rPr>
                 <w:noProof/>
               </w:rPr>
-              <w:instrText xml:space="preserve"> PAGEREF _Toc241488902 \h </w:instrText>
+              <w:instrText xml:space="preserve"> PAGEREF _Toc241494520 \h </w:instrText>
             </w:r>
             <w:r>
               <w:rPr>
@@ -1089,7 +1089,7 @@
               <w14:ligatures w14:val="standardContextual"/>
             </w:rPr>
           </w:pPr>
-          <w:hyperlink w:anchor="_Toc241488903" w:history="1">
+          <w:hyperlink w:anchor="_Toc241494521" w:history="1">
             <w:r>
               <w:rPr>
                 <w:rStyle w:val="Hyperlink"/>
@@ -1113,7 +1113,7 @@
               <w:rPr>
                 <w:noProof/>
               </w:rPr>
-              <w:instrText xml:space="preserve"> PAGEREF _Toc241488903 \h </w:instrText>
+              <w:instrText xml:space="preserve"> PAGEREF _Toc241494521 \h </w:instrText>
             </w:r>
             <w:r>
               <w:rPr>
@@ -1156,7 +1156,7 @@
               <w14:ligatures w14:val="standardContextual"/>
             </w:rPr>
           </w:pPr>
-          <w:hyperlink w:anchor="_Toc241488904" w:history="1">
+          <w:hyperlink w:anchor="_Toc241494522" w:history="1">
             <w:r>
               <w:rPr>
                 <w:rStyle w:val="Hyperlink"/>
@@ -1180,7 +1180,7 @@
               <w:rPr>
                 <w:noProof/>
               </w:rPr>
-              <w:instrText xml:space="preserve"> PAGEREF _Toc241488904 \h </w:instrText>
+              <w:instrText xml:space="preserve"> PAGEREF _Toc241494522 \h </w:instrText>
             </w:r>
             <w:r>
               <w:rPr>
@@ -1223,7 +1223,7 @@
               <w14:ligatures w14:val="standardContextual"/>
             </w:rPr>
           </w:pPr>
-          <w:hyperlink w:anchor="_Toc241488905" w:history="1">
+          <w:hyperlink w:anchor="_Toc241494523" w:history="1">
             <w:r>
               <w:rPr>
                 <w:rStyle w:val="Hyperlink"/>
@@ -1247,7 +1247,7 @@
               <w:rPr>
                 <w:noProof/>
               </w:rPr>
-              <w:instrText xml:space="preserve"> PAGEREF _Toc241488905 \h </w:instrText>
+              <w:instrText xml:space="preserve"> PAGEREF _Toc241494523 \h </w:instrText>
             </w:r>
             <w:r>
               <w:rPr>
@@ -1290,7 +1290,7 @@
               <w14:ligatures w14:val="standardContextual"/>
             </w:rPr>
           </w:pPr>
-          <w:hyperlink w:anchor="_Toc241488906" w:history="1">
+          <w:hyperlink w:anchor="_Toc241494524" w:history="1">
             <w:r>
               <w:rPr>
                 <w:rStyle w:val="Hyperlink"/>
@@ -1314,7 +1314,7 @@
               <w:rPr>
                 <w:noProof/>
               </w:rPr>
-              <w:instrText xml:space="preserve"> PAGEREF _Toc241488906 \h </w:instrText>
+              <w:instrText xml:space="preserve"> PAGEREF _Toc241494524 \h </w:instrText>
             </w:r>
             <w:r>
               <w:rPr>
@@ -1357,7 +1357,7 @@
               <w14:ligatures w14:val="standardContextual"/>
             </w:rPr>
           </w:pPr>
-          <w:hyperlink w:anchor="_Toc241488907" w:history="1">
+          <w:hyperlink w:anchor="_Toc241494525" w:history="1">
             <w:r>
               <w:rPr>
                 <w:rStyle w:val="Hyperlink"/>
@@ -1381,7 +1381,7 @@
               <w:rPr>
                 <w:noProof/>
               </w:rPr>
-              <w:instrText xml:space="preserve"> PAGEREF _Toc241488907 \h </w:instrText>
+              <w:instrText xml:space="preserve"> PAGEREF _Toc241494525 \h </w:instrText>
             </w:r>
             <w:r>
               <w:rPr>
@@ -1424,7 +1424,7 @@
               <w14:ligatures w14:val="standardContextual"/>
             </w:rPr>
           </w:pPr>
-          <w:hyperlink w:anchor="_Toc241488908" w:history="1">
+          <w:hyperlink w:anchor="_Toc241494526" w:history="1">
             <w:r>
               <w:rPr>
                 <w:rStyle w:val="Hyperlink"/>
@@ -1448,7 +1448,7 @@
               <w:rPr>
                 <w:noProof/>
               </w:rPr>
-              <w:instrText xml:space="preserve"> PAGEREF _Toc241488908 \h </w:instrText>
+              <w:instrText xml:space="preserve"> PAGEREF _Toc241494526 \h </w:instrText>
             </w:r>
             <w:r>
               <w:rPr>
@@ -1491,7 +1491,7 @@
               <w14:ligatures w14:val="standardContextual"/>
             </w:rPr>
           </w:pPr>
-          <w:hyperlink w:anchor="_Toc241488909" w:history="1">
+          <w:hyperlink w:anchor="_Toc241494527" w:history="1">
             <w:r>
               <w:rPr>
                 <w:rStyle w:val="Hyperlink"/>
@@ -1515,7 +1515,7 @@
               <w:rPr>
                 <w:noProof/>
               </w:rPr>
-              <w:instrText xml:space="preserve"> PAGEREF _Toc241488909 \h </w:instrText>
+              <w:instrText xml:space="preserve"> PAGEREF _Toc241494527 \h </w:instrText>
             </w:r>
             <w:r>
               <w:rPr>
@@ -1558,7 +1558,7 @@
               <w14:ligatures w14:val="standardContextual"/>
             </w:rPr>
           </w:pPr>
-          <w:hyperlink w:anchor="_Toc241488910" w:history="1">
+          <w:hyperlink w:anchor="_Toc241494528" w:history="1">
             <w:r>
               <w:rPr>
                 <w:rStyle w:val="Hyperlink"/>
@@ -1582,7 +1582,7 @@
               <w:rPr>
                 <w:noProof/>
               </w:rPr>
-              <w:instrText xml:space="preserve"> PAGEREF _Toc241488910 \h </w:instrText>
+              <w:instrText xml:space="preserve"> PAGEREF _Toc241494528 \h </w:instrText>
             </w:r>
             <w:r>
               <w:rPr>
@@ -1625,7 +1625,7 @@
               <w14:ligatures w14:val="standardContextual"/>
             </w:rPr>
           </w:pPr>
-          <w:hyperlink w:anchor="_Toc241488911" w:history="1">
+          <w:hyperlink w:anchor="_Toc241494529" w:history="1">
             <w:r>
               <w:rPr>
                 <w:rStyle w:val="Hyperlink"/>
@@ -1649,7 +1649,7 @@
               <w:rPr>
                 <w:noProof/>
               </w:rPr>
-              <w:instrText xml:space="preserve"> PAGEREF _Toc241488911 \h </w:instrText>
+              <w:instrText xml:space="preserve"> PAGEREF _Toc241494529 \h </w:instrText>
             </w:r>
             <w:r>
               <w:rPr>
@@ -1692,7 +1692,7 @@
               <w14:ligatures w14:val="standardContextual"/>
             </w:rPr>
           </w:pPr>
-          <w:hyperlink w:anchor="_Toc241488912" w:history="1">
+          <w:hyperlink w:anchor="_Toc241494530" w:history="1">
             <w:r>
               <w:rPr>
                 <w:rStyle w:val="Hyperlink"/>
@@ -1716,7 +1716,7 @@
               <w:rPr>
                 <w:noProof/>
               </w:rPr>
-              <w:instrText xml:space="preserve"> PAGEREF _Toc241488912 \h </w:instrText>
+              <w:instrText xml:space="preserve"> PAGEREF _Toc241494530 \h </w:instrText>
             </w:r>
             <w:r>
               <w:rPr>
@@ -1759,7 +1759,7 @@
               <w14:ligatures w14:val="standardContextual"/>
             </w:rPr>
           </w:pPr>
-          <w:hyperlink w:anchor="_Toc241488913" w:history="1">
+          <w:hyperlink w:anchor="_Toc241494531" w:history="1">
             <w:r>
               <w:rPr>
                 <w:rStyle w:val="Hyperlink"/>
@@ -1783,7 +1783,7 @@
               <w:rPr>
                 <w:noProof/>
               </w:rPr>
-              <w:instrText xml:space="preserve"> PAGEREF _Toc241488913 \h </w:instrText>
+              <w:instrText xml:space="preserve"> PAGEREF _Toc241494531 \h </w:instrText>
             </w:r>
             <w:r>
               <w:rPr>
@@ -1826,7 +1826,7 @@
               <w14:ligatures w14:val="standardContextual"/>
             </w:rPr>
           </w:pPr>
-          <w:hyperlink w:anchor="_Toc241488914" w:history="1">
+          <w:hyperlink w:anchor="_Toc241494532" w:history="1">
             <w:r>
               <w:rPr>
                 <w:rStyle w:val="Hyperlink"/>
@@ -1850,7 +1850,7 @@
               <w:rPr>
                 <w:noProof/>
               </w:rPr>
-              <w:instrText xml:space="preserve"> PAGEREF _Toc241488914 \h </w:instrText>
+              <w:instrText xml:space="preserve"> PAGEREF _Toc241494532 \h </w:instrText>
             </w:r>
             <w:r>
               <w:rPr>
@@ -1893,7 +1893,7 @@
               <w14:ligatures w14:val="standardContextual"/>
             </w:rPr>
           </w:pPr>
-          <w:hyperlink w:anchor="_Toc241488915" w:history="1">
+          <w:hyperlink w:anchor="_Toc241494533" w:history="1">
             <w:r>
               <w:rPr>
                 <w:rStyle w:val="Hyperlink"/>
@@ -1917,7 +1917,7 @@
               <w:rPr>
                 <w:noProof/>
               </w:rPr>
-              <w:instrText xml:space="preserve"> PAGEREF _Toc241488915 \h </w:instrText>
+              <w:instrText xml:space="preserve"> PAGEREF _Toc241494533 \h </w:instrText>
             </w:r>
             <w:r>
               <w:rPr>
@@ -1960,7 +1960,7 @@
               <w14:ligatures w14:val="standardContextual"/>
             </w:rPr>
           </w:pPr>
-          <w:hyperlink w:anchor="_Toc241488916" w:history="1">
+          <w:hyperlink w:anchor="_Toc241494534" w:history="1">
             <w:r>
               <w:rPr>
                 <w:rStyle w:val="Hyperlink"/>
@@ -1984,7 +1984,7 @@
               <w:rPr>
                 <w:noProof/>
               </w:rPr>
-              <w:instrText xml:space="preserve"> PAGEREF _Toc241488916 \h </w:instrText>
+              <w:instrText xml:space="preserve"> PAGEREF _Toc241494534 \h </w:instrText>
             </w:r>
             <w:r>
               <w:rPr>
@@ -2027,7 +2027,7 @@
               <w14:ligatures w14:val="standardContextual"/>
             </w:rPr>
           </w:pPr>
-          <w:hyperlink w:anchor="_Toc241488917" w:history="1">
+          <w:hyperlink w:anchor="_Toc241494535" w:history="1">
             <w:r>
               <w:rPr>
                 <w:rStyle w:val="Hyperlink"/>
@@ -2051,7 +2051,7 @@
               <w:rPr>
                 <w:noProof/>
               </w:rPr>
-              <w:instrText xml:space="preserve"> PAGEREF _Toc241488917 \h </w:instrText>
+              <w:instrText xml:space="preserve"> PAGEREF _Toc241494535 \h </w:instrText>
             </w:r>
             <w:r>
               <w:rPr>
@@ -2094,7 +2094,7 @@
               <w14:ligatures w14:val="standardContextual"/>
             </w:rPr>
           </w:pPr>
-          <w:hyperlink w:anchor="_Toc241488918" w:history="1">
+          <w:hyperlink w:anchor="_Toc241494536" w:history="1">
             <w:r>
               <w:rPr>
                 <w:rStyle w:val="Hyperlink"/>
@@ -2118,7 +2118,7 @@
               <w:rPr>
                 <w:noProof/>
               </w:rPr>
-              <w:instrText xml:space="preserve"> PAGEREF _Toc241488918 \h </w:instrText>
+              <w:instrText xml:space="preserve"> PAGEREF _Toc241494536 \h </w:instrText>
             </w:r>
             <w:r>
               <w:rPr>
@@ -2161,7 +2161,7 @@
               <w14:ligatures w14:val="standardContextual"/>
             </w:rPr>
           </w:pPr>
-          <w:hyperlink w:anchor="_Toc241488919" w:history="1">
+          <w:hyperlink w:anchor="_Toc241494537" w:history="1">
             <w:r>
               <w:rPr>
                 <w:rStyle w:val="Hyperlink"/>
@@ -2185,7 +2185,7 @@
               <w:rPr>
                 <w:noProof/>
               </w:rPr>
-              <w:instrText xml:space="preserve"> PAGEREF _Toc241488919 \h </w:instrText>
+              <w:instrText xml:space="preserve"> PAGEREF _Toc241494537 \h </w:instrText>
             </w:r>
             <w:r>
               <w:rPr>
@@ -2228,7 +2228,7 @@
               <w14:ligatures w14:val="standardContextual"/>
             </w:rPr>
           </w:pPr>
-          <w:hyperlink w:anchor="_Toc241488920" w:history="1">
+          <w:hyperlink w:anchor="_Toc241494538" w:history="1">
             <w:r>
               <w:rPr>
                 <w:rStyle w:val="Hyperlink"/>
@@ -2252,7 +2252,7 @@
               <w:rPr>
                 <w:noProof/>
               </w:rPr>
-              <w:instrText xml:space="preserve"> PAGEREF _Toc241488920 \h </w:instrText>
+              <w:instrText xml:space="preserve"> PAGEREF _Toc241494538 \h </w:instrText>
             </w:r>
             <w:r>
               <w:rPr>
@@ -2295,7 +2295,7 @@
               <w14:ligatures w14:val="standardContextual"/>
             </w:rPr>
           </w:pPr>
-          <w:hyperlink w:anchor="_Toc241488921" w:history="1">
+          <w:hyperlink w:anchor="_Toc241494539" w:history="1">
             <w:r>
               <w:rPr>
                 <w:rStyle w:val="Hyperlink"/>
@@ -2319,7 +2319,7 @@
               <w:rPr>
                 <w:noProof/>
               </w:rPr>
-              <w:instrText xml:space="preserve"> PAGEREF _Toc241488921 \h </w:instrText>
+              <w:instrText xml:space="preserve"> PAGEREF _Toc241494539 \h </w:instrText>
             </w:r>
             <w:r>
               <w:rPr>
@@ -2362,7 +2362,7 @@
               <w14:ligatures w14:val="standardContextual"/>
             </w:rPr>
           </w:pPr>
-          <w:hyperlink w:anchor="_Toc241488922" w:history="1">
+          <w:hyperlink w:anchor="_Toc241494540" w:history="1">
             <w:r>
               <w:rPr>
                 <w:rStyle w:val="Hyperlink"/>
@@ -2386,7 +2386,7 @@
               <w:rPr>
                 <w:noProof/>
               </w:rPr>
-              <w:instrText xml:space="preserve"> PAGEREF _Toc241488922 \h </w:instrText>
+              <w:instrText xml:space="preserve"> PAGEREF _Toc241494540 \h </w:instrText>
             </w:r>
             <w:r>
               <w:rPr>
@@ -2429,7 +2429,7 @@
               <w14:ligatures w14:val="standardContextual"/>
             </w:rPr>
           </w:pPr>
-          <w:hyperlink w:anchor="_Toc241488923" w:history="1">
+          <w:hyperlink w:anchor="_Toc241494541" w:history="1">
             <w:r>
               <w:rPr>
                 <w:rStyle w:val="Hyperlink"/>
@@ -2453,7 +2453,7 @@
               <w:rPr>
                 <w:noProof/>
               </w:rPr>
-              <w:instrText xml:space="preserve"> PAGEREF _Toc241488923 \h </w:instrText>
+              <w:instrText xml:space="preserve"> PAGEREF _Toc241494541 \h </w:instrText>
             </w:r>
             <w:r>
               <w:rPr>
@@ -2496,7 +2496,7 @@
               <w14:ligatures w14:val="standardContextual"/>
             </w:rPr>
           </w:pPr>
-          <w:hyperlink w:anchor="_Toc241488924" w:history="1">
+          <w:hyperlink w:anchor="_Toc241494542" w:history="1">
             <w:r>
               <w:rPr>
                 <w:rStyle w:val="Hyperlink"/>
@@ -2520,7 +2520,7 @@
               <w:rPr>
                 <w:noProof/>
               </w:rPr>
-              <w:instrText xml:space="preserve"> PAGEREF _Toc241488924 \h </w:instrText>
+              <w:instrText xml:space="preserve"> PAGEREF _Toc241494542 \h </w:instrText>
             </w:r>
             <w:r>
               <w:rPr>
@@ -2563,7 +2563,7 @@
               <w14:ligatures w14:val="standardContextual"/>
             </w:rPr>
           </w:pPr>
-          <w:hyperlink w:anchor="_Toc241488925" w:history="1">
+          <w:hyperlink w:anchor="_Toc241494543" w:history="1">
             <w:r>
               <w:rPr>
                 <w:rStyle w:val="Hyperlink"/>
@@ -2587,7 +2587,7 @@
               <w:rPr>
                 <w:noProof/>
               </w:rPr>
-              <w:instrText xml:space="preserve"> PAGEREF _Toc241488925 \h </w:instrText>
+              <w:instrText xml:space="preserve"> PAGEREF _Toc241494543 \h </w:instrText>
             </w:r>
             <w:r>
               <w:rPr>
@@ -2630,7 +2630,7 @@
               <w14:ligatures w14:val="standardContextual"/>
             </w:rPr>
           </w:pPr>
-          <w:hyperlink w:anchor="_Toc241488926" w:history="1">
+          <w:hyperlink w:anchor="_Toc241494544" w:history="1">
             <w:r>
               <w:rPr>
                 <w:rStyle w:val="Hyperlink"/>
@@ -2654,7 +2654,7 @@
               <w:rPr>
                 <w:noProof/>
               </w:rPr>
-              <w:instrText xml:space="preserve"> PAGEREF _Toc241488926 \h </w:instrText>
+              <w:instrText xml:space="preserve"> PAGEREF _Toc241494544 \h </w:instrText>
             </w:r>
             <w:r>
               <w:rPr>
@@ -2697,7 +2697,7 @@
               <w14:ligatures w14:val="standardContextual"/>
             </w:rPr>
           </w:pPr>
-          <w:hyperlink w:anchor="_Toc241488927" w:history="1">
+          <w:hyperlink w:anchor="_Toc241494545" w:history="1">
             <w:r>
               <w:rPr>
                 <w:rStyle w:val="Hyperlink"/>
@@ -2721,7 +2721,7 @@
               <w:rPr>
                 <w:noProof/>
               </w:rPr>
-              <w:instrText xml:space="preserve"> PAGEREF _Toc241488927 \h </w:instrText>
+              <w:instrText xml:space="preserve"> PAGEREF _Toc241494545 \h </w:instrText>
             </w:r>
             <w:r>
               <w:rPr>
@@ -2764,7 +2764,7 @@
               <w14:ligatures w14:val="standardContextual"/>
             </w:rPr>
           </w:pPr>
-          <w:hyperlink w:anchor="_Toc241488928" w:history="1">
+          <w:hyperlink w:anchor="_Toc241494546" w:history="1">
             <w:r>
               <w:rPr>
                 <w:rStyle w:val="Hyperlink"/>
@@ -2788,7 +2788,7 @@
               <w:rPr>
                 <w:noProof/>
               </w:rPr>
-              <w:instrText xml:space="preserve"> PAGEREF _Toc241488928 \h </w:instrText>
+              <w:instrText xml:space="preserve"> PAGEREF _Toc241494546 \h </w:instrText>
             </w:r>
             <w:r>
               <w:rPr>
@@ -2831,7 +2831,7 @@
               <w14:ligatures w14:val="standardContextual"/>
             </w:rPr>
           </w:pPr>
-          <w:hyperlink w:anchor="_Toc241488929" w:history="1">
+          <w:hyperlink w:anchor="_Toc241494547" w:history="1">
             <w:r>
               <w:rPr>
                 <w:rStyle w:val="Hyperlink"/>
@@ -2855,7 +2855,7 @@
               <w:rPr>
                 <w:noProof/>
               </w:rPr>
-              <w:instrText xml:space="preserve"> PAGEREF _Toc241488929 \h </w:instrText>
+              <w:instrText xml:space="preserve"> PAGEREF _Toc241494547 \h </w:instrText>
             </w:r>
             <w:r>
               <w:rPr>
@@ -2898,7 +2898,7 @@
               <w14:ligatures w14:val="standardContextual"/>
             </w:rPr>
           </w:pPr>
-          <w:hyperlink w:anchor="_Toc241488930" w:history="1">
+          <w:hyperlink w:anchor="_Toc241494548" w:history="1">
             <w:r>
               <w:rPr>
                 <w:rStyle w:val="Hyperlink"/>
@@ -2922,7 +2922,7 @@
               <w:rPr>
                 <w:noProof/>
               </w:rPr>
-              <w:instrText xml:space="preserve"> PAGEREF _Toc241488930 \h </w:instrText>
+              <w:instrText xml:space="preserve"> PAGEREF _Toc241494548 \h </w:instrText>
             </w:r>
             <w:r>
               <w:rPr>
@@ -2965,7 +2965,7 @@
               <w14:ligatures w14:val="standardContextual"/>
             </w:rPr>
           </w:pPr>
-          <w:hyperlink w:anchor="_Toc241488931" w:history="1">
+          <w:hyperlink w:anchor="_Toc241494549" w:history="1">
             <w:r>
               <w:rPr>
                 <w:rStyle w:val="Hyperlink"/>
@@ -2989,7 +2989,7 @@
               <w:rPr>
                 <w:noProof/>
               </w:rPr>
-              <w:instrText xml:space="preserve"> PAGEREF _Toc241488931 \h </w:instrText>
+              <w:instrText xml:space="preserve"> PAGEREF _Toc241494549 \h </w:instrText>
             </w:r>
             <w:r>
               <w:rPr>
@@ -3032,7 +3032,7 @@
               <w14:ligatures w14:val="standardContextual"/>
             </w:rPr>
           </w:pPr>
-          <w:hyperlink w:anchor="_Toc241488932" w:history="1">
+          <w:hyperlink w:anchor="_Toc241494550" w:history="1">
             <w:r>
               <w:rPr>
                 <w:rStyle w:val="Hyperlink"/>
@@ -3056,7 +3056,7 @@
               <w:rPr>
                 <w:noProof/>
               </w:rPr>
-              <w:instrText xml:space="preserve"> PAGEREF _Toc241488932 \h </w:instrText>
+              <w:instrText xml:space="preserve"> PAGEREF _Toc241494550 \h </w:instrText>
             </w:r>
             <w:r>
               <w:rPr>
@@ -3099,7 +3099,7 @@
               <w14:ligatures w14:val="standardContextual"/>
             </w:rPr>
           </w:pPr>
-          <w:hyperlink w:anchor="_Toc241488933" w:history="1">
+          <w:hyperlink w:anchor="_Toc241494551" w:history="1">
             <w:r>
               <w:rPr>
                 <w:rStyle w:val="Hyperlink"/>
@@ -3123,7 +3123,7 @@
               <w:rPr>
                 <w:noProof/>
               </w:rPr>
-              <w:instrText xml:space="preserve"> PAGEREF _Toc241488933 \h </w:instrText>
+              <w:instrText xml:space="preserve"> PAGEREF _Toc241494551 \h </w:instrText>
             </w:r>
             <w:r>
               <w:rPr>
@@ -3166,7 +3166,7 @@
               <w14:ligatures w14:val="standardContextual"/>
             </w:rPr>
           </w:pPr>
-          <w:hyperlink w:anchor="_Toc241488934" w:history="1">
+          <w:hyperlink w:anchor="_Toc241494552" w:history="1">
             <w:r>
               <w:rPr>
                 <w:rStyle w:val="Hyperlink"/>
@@ -3190,7 +3190,7 @@
               <w:rPr>
                 <w:noProof/>
               </w:rPr>
-              <w:instrText xml:space="preserve"> PAGEREF _Toc241488934 \h </w:instrText>
+              <w:instrText xml:space="preserve"> PAGEREF _Toc241494552 \h </w:instrText>
             </w:r>
             <w:r>
               <w:rPr>
@@ -3233,7 +3233,7 @@
               <w14:ligatures w14:val="standardContextual"/>
             </w:rPr>
           </w:pPr>
-          <w:hyperlink w:anchor="_Toc241488935" w:history="1">
+          <w:hyperlink w:anchor="_Toc241494553" w:history="1">
             <w:r>
               <w:rPr>
                 <w:rStyle w:val="Hyperlink"/>
@@ -3257,7 +3257,7 @@
               <w:rPr>
                 <w:noProof/>
               </w:rPr>
-              <w:instrText xml:space="preserve"> PAGEREF _Toc241488935 \h </w:instrText>
+              <w:instrText xml:space="preserve"> PAGEREF _Toc241494553 \h </w:instrText>
             </w:r>
             <w:r>
               <w:rPr>
@@ -3300,7 +3300,7 @@
               <w14:ligatures w14:val="standardContextual"/>
             </w:rPr>
           </w:pPr>
-          <w:hyperlink w:anchor="_Toc241488936" w:history="1">
+          <w:hyperlink w:anchor="_Toc241494554" w:history="1">
             <w:r>
               <w:rPr>
                 <w:rStyle w:val="Hyperlink"/>
@@ -3324,7 +3324,7 @@
               <w:rPr>
                 <w:noProof/>
               </w:rPr>
-              <w:instrText xml:space="preserve"> PAGEREF _Toc241488936 \h </w:instrText>
+              <w:instrText xml:space="preserve"> PAGEREF _Toc241494554 \h </w:instrText>
             </w:r>
             <w:r>
               <w:rPr>
@@ -3367,7 +3367,7 @@
               <w14:ligatures w14:val="standardContextual"/>
             </w:rPr>
           </w:pPr>
-          <w:hyperlink w:anchor="_Toc241488937" w:history="1">
+          <w:hyperlink w:anchor="_Toc241494555" w:history="1">
             <w:r>
               <w:rPr>
                 <w:rStyle w:val="Hyperlink"/>
@@ -3391,7 +3391,7 @@
               <w:rPr>
                 <w:noProof/>
               </w:rPr>
-              <w:instrText xml:space="preserve"> PAGEREF _Toc241488937 \h </w:instrText>
+              <w:instrText xml:space="preserve"> PAGEREF _Toc241494555 \h </w:instrText>
             </w:r>
             <w:r>
               <w:rPr>
@@ -3434,7 +3434,7 @@
               <w14:ligatures w14:val="standardContextual"/>
             </w:rPr>
           </w:pPr>
-          <w:hyperlink w:anchor="_Toc241488938" w:history="1">
+          <w:hyperlink w:anchor="_Toc241494556" w:history="1">
             <w:r>
               <w:rPr>
                 <w:rStyle w:val="Hyperlink"/>
@@ -3458,7 +3458,7 @@
               <w:rPr>
                 <w:noProof/>
               </w:rPr>
-              <w:instrText xml:space="preserve"> PAGEREF _Toc241488938 \h </w:instrText>
+              <w:instrText xml:space="preserve"> PAGEREF _Toc241494556 \h </w:instrText>
             </w:r>
             <w:r>
               <w:rPr>
@@ -3501,7 +3501,7 @@
       <w:pPr>
         <w:pStyle w:val="Heading1"/>
       </w:pPr>
-      <w:bookmarkStart w:id="0" w:name="_Toc241488889"/>
+      <w:bookmarkStart w:id="0" w:name="_Toc241494507"/>
       <w:r>
         <w:t>1.  Getting started</w:t>
       </w:r>
@@ -3529,7 +3529,7 @@
       <w:pPr>
         <w:pStyle w:val="Heading2"/>
       </w:pPr>
-      <w:bookmarkStart w:id="1" w:name="_Toc241488890"/>
+      <w:bookmarkStart w:id="1" w:name="_Toc241494508"/>
       <w:r>
         <w:t>Opening ShopControl</w:t>
       </w:r>
@@ -3609,7 +3609,7 @@
       <w:pPr>
         <w:pStyle w:val="Heading2"/>
       </w:pPr>
-      <w:bookmarkStart w:id="2" w:name="_Toc241488891"/>
+      <w:bookmarkStart w:id="2" w:name="_Toc241494509"/>
       <w:r>
         <w:t>Finding help</w:t>
       </w:r>
@@ -3712,7 +3712,7 @@
       <w:pPr>
         <w:pStyle w:val="Heading2"/>
       </w:pPr>
-      <w:bookmarkStart w:id="3" w:name="_Toc241488892"/>
+      <w:bookmarkStart w:id="3" w:name="_Toc241494510"/>
       <w:r>
         <w:t>Put the app on your phone's home screen</w:t>
       </w:r>
@@ -3880,7 +3880,7 @@
       <w:pPr>
         <w:pStyle w:val="Heading2"/>
       </w:pPr>
-      <w:bookmarkStart w:id="4" w:name="_Toc241488893"/>
+      <w:bookmarkStart w:id="4" w:name="_Toc241494511"/>
       <w:r>
         <w:t>Logging in</w:t>
       </w:r>
@@ -3962,6 +3962,36 @@
         <w:spacing w:after="60"/>
       </w:pPr>
       <w:r>
+        <w:rPr>
+          <w:b/>
+          <w:bCs/>
+        </w:rPr>
+        <w:t>First time signing in:</w:t>
+      </w:r>
+      <w:r>
+        <w:t xml:space="preserve"> the password the office gave you is temporary. ShopControl asks you to </w:t>
+      </w:r>
+      <w:r>
+        <w:rPr>
+          <w:b/>
+          <w:bCs/>
+        </w:rPr>
+        <w:t>choose your own password</w:t>
+      </w:r>
+      <w:r>
+        <w:t xml:space="preserve"> (at least 8 characters, typed twice) before you can do anything else. Pick something only you know.</w:t>
+      </w:r>
+    </w:p>
+    <w:p>
+      <w:pPr>
+        <w:pStyle w:val="ListParagraph"/>
+        <w:numPr>
+          <w:ilvl w:val="0"/>
+          <w:numId w:val="4"/>
+        </w:numPr>
+        <w:spacing w:after="60"/>
+      </w:pPr>
+      <w:r>
         <w:t xml:space="preserve">If you forget your password, click </w:t>
       </w:r>
       <w:r>
@@ -4020,7 +4050,7 @@
       <w:pPr>
         <w:pStyle w:val="Heading2"/>
       </w:pPr>
-      <w:bookmarkStart w:id="5" w:name="_Toc241488894"/>
+      <w:bookmarkStart w:id="5" w:name="_Toc241494512"/>
       <w:r>
         <w:t>Staying up to date</w:t>
       </w:r>
@@ -4048,7 +4078,7 @@
       <w:pPr>
         <w:pStyle w:val="Heading2"/>
       </w:pPr>
-      <w:bookmarkStart w:id="6" w:name="_Toc241488895"/>
+      <w:bookmarkStart w:id="6" w:name="_Toc241494513"/>
       <w:r>
         <w:t>Who can do what</w:t>
       </w:r>
@@ -4087,7 +4117,7 @@
           <w:left w:w="10" w:type="dxa"/>
           <w:right w:w="10" w:type="dxa"/>
         </w:tblCellMar>
-        <w:tblLook w:val="0000" w:firstRow="0" w:lastRow="0" w:firstColumn="0" w:lastColumn="0" w:noHBand="0" w:noVBand="0"/>
+        <w:tblLook w:val="04A0" w:firstRow="1" w:lastRow="0" w:firstColumn="1" w:lastColumn="0" w:noHBand="0" w:noVBand="1"/>
       </w:tblPr>
       <w:tblGrid>
         <w:gridCol w:w="2900"/>
@@ -4661,7 +4691,7 @@
         <w:pStyle w:val="Heading1"/>
         <w:pageBreakBefore/>
       </w:pPr>
-      <w:bookmarkStart w:id="7" w:name="_Toc241488896"/>
+      <w:bookmarkStart w:id="7" w:name="_Toc241494514"/>
       <w:r>
         <w:t>2.  The Employee App (technicians)</w:t>
       </w:r>
@@ -4679,7 +4709,7 @@
       <w:pPr>
         <w:pStyle w:val="Heading2"/>
       </w:pPr>
-      <w:bookmarkStart w:id="8" w:name="_Toc241488897"/>
+      <w:bookmarkStart w:id="8" w:name="_Toc241494515"/>
       <w:r>
         <w:t>Home screen</w:t>
       </w:r>
@@ -4819,7 +4849,7 @@
       <w:pPr>
         <w:pStyle w:val="Heading2"/>
       </w:pPr>
-      <w:bookmarkStart w:id="9" w:name="_Toc241488898"/>
+      <w:bookmarkStart w:id="9" w:name="_Toc241494516"/>
       <w:r>
         <w:t>Doing your QC checklist</w:t>
       </w:r>
@@ -4968,7 +4998,7 @@
       <w:pPr>
         <w:pStyle w:val="Heading2"/>
       </w:pPr>
-      <w:bookmarkStart w:id="10" w:name="_Toc241488899"/>
+      <w:bookmarkStart w:id="10" w:name="_Toc241494517"/>
       <w:r>
         <w:t>Signing and rework</w:t>
       </w:r>
@@ -5088,7 +5118,7 @@
       <w:pPr>
         <w:pStyle w:val="Heading2"/>
       </w:pPr>
-      <w:bookmarkStart w:id="11" w:name="_Toc241488900"/>
+      <w:bookmarkStart w:id="11" w:name="_Toc241494518"/>
       <w:r>
         <w:t>Other departments' checklists</w:t>
       </w:r>
@@ -5116,7 +5146,7 @@
       <w:pPr>
         <w:pStyle w:val="Heading2"/>
       </w:pPr>
-      <w:bookmarkStart w:id="12" w:name="_Toc241488901"/>
+      <w:bookmarkStart w:id="12" w:name="_Toc241494519"/>
       <w:r>
         <w:t>Photos and parts</w:t>
       </w:r>
@@ -5187,7 +5217,7 @@
         <w:pStyle w:val="Heading1"/>
         <w:pageBreakBefore/>
       </w:pPr>
-      <w:bookmarkStart w:id="13" w:name="_Toc241488902"/>
+      <w:bookmarkStart w:id="13" w:name="_Toc241494520"/>
       <w:r>
         <w:t>3.  Staff Hub: time off, mailbox and company info</w:t>
       </w:r>
@@ -5215,7 +5245,7 @@
       <w:pPr>
         <w:pStyle w:val="Heading2"/>
       </w:pPr>
-      <w:bookmarkStart w:id="14" w:name="_Toc241488903"/>
+      <w:bookmarkStart w:id="14" w:name="_Toc241494521"/>
       <w:r>
         <w:t>Requesting time off</w:t>
       </w:r>
@@ -5378,7 +5408,7 @@
       <w:pPr>
         <w:pStyle w:val="Heading2"/>
       </w:pPr>
-      <w:bookmarkStart w:id="15" w:name="_Toc241488904"/>
+      <w:bookmarkStart w:id="15" w:name="_Toc241494522"/>
       <w:r>
         <w:t>Checking your requests</w:t>
       </w:r>
@@ -5433,7 +5463,7 @@
       <w:pPr>
         <w:pStyle w:val="Heading2"/>
       </w:pPr>
-      <w:bookmarkStart w:id="16" w:name="_Toc241488905"/>
+      <w:bookmarkStart w:id="16" w:name="_Toc241494523"/>
       <w:r>
         <w:t>Mailbox</w:t>
       </w:r>
@@ -5502,7 +5532,7 @@
       <w:pPr>
         <w:pStyle w:val="Heading2"/>
       </w:pPr>
-      <w:bookmarkStart w:id="17" w:name="_Toc241488906"/>
+      <w:bookmarkStart w:id="17" w:name="_Toc241494524"/>
       <w:r>
         <w:t>Company info and this manual</w:t>
       </w:r>
@@ -5538,7 +5568,7 @@
         <w:pStyle w:val="Heading1"/>
         <w:pageBreakBefore/>
       </w:pPr>
-      <w:bookmarkStart w:id="18" w:name="_Toc241488907"/>
+      <w:bookmarkStart w:id="18" w:name="_Toc241494525"/>
       <w:r>
         <w:t>4.  Dashboard</w:t>
       </w:r>
@@ -5677,7 +5707,7 @@
         <w:pStyle w:val="Heading1"/>
         <w:pageBreakBefore/>
       </w:pPr>
-      <w:bookmarkStart w:id="19" w:name="_Toc241488908"/>
+      <w:bookmarkStart w:id="19" w:name="_Toc241494526"/>
       <w:r>
         <w:t>5.  Jobs and the Daily GO List</w:t>
       </w:r>
@@ -5705,7 +5735,7 @@
       <w:pPr>
         <w:pStyle w:val="Heading2"/>
       </w:pPr>
-      <w:bookmarkStart w:id="20" w:name="_Toc241488909"/>
+      <w:bookmarkStart w:id="20" w:name="_Toc241494527"/>
       <w:r>
         <w:t>RO numbers</w:t>
       </w:r>
@@ -5791,7 +5821,7 @@
       <w:pPr>
         <w:pStyle w:val="Heading2"/>
       </w:pPr>
-      <w:bookmarkStart w:id="21" w:name="_Toc241488910"/>
+      <w:bookmarkStart w:id="21" w:name="_Toc241494528"/>
       <w:r>
         <w:t>Adding or editing a job</w:t>
       </w:r>
@@ -5911,7 +5941,7 @@
       <w:pPr>
         <w:pStyle w:val="Heading2"/>
       </w:pPr>
-      <w:bookmarkStart w:id="22" w:name="_Toc241488911"/>
+      <w:bookmarkStart w:id="22" w:name="_Toc241494529"/>
       <w:r>
         <w:t>Customer updates</w:t>
       </w:r>
@@ -6080,7 +6110,7 @@
         <w:pStyle w:val="Heading1"/>
         <w:pageBreakBefore/>
       </w:pPr>
-      <w:bookmarkStart w:id="23" w:name="_Toc241488912"/>
+      <w:bookmarkStart w:id="23" w:name="_Toc241494530"/>
       <w:r>
         <w:t>6.  Production, Delivery and Planning boards</w:t>
       </w:r>
@@ -6090,7 +6120,7 @@
       <w:pPr>
         <w:pStyle w:val="Heading2"/>
       </w:pPr>
-      <w:bookmarkStart w:id="24" w:name="_Toc241488913"/>
+      <w:bookmarkStart w:id="24" w:name="_Toc241494531"/>
       <w:r>
         <w:t>Production Board</w:t>
       </w:r>
@@ -6218,7 +6248,7 @@
       <w:pPr>
         <w:pStyle w:val="Heading2"/>
       </w:pPr>
-      <w:bookmarkStart w:id="25" w:name="_Toc241488914"/>
+      <w:bookmarkStart w:id="25" w:name="_Toc241494532"/>
       <w:r>
         <w:t>Vehicle pictures</w:t>
       </w:r>
@@ -6276,7 +6306,7 @@
       <w:pPr>
         <w:pStyle w:val="Heading2"/>
       </w:pPr>
-      <w:bookmarkStart w:id="26" w:name="_Toc241488915"/>
+      <w:bookmarkStart w:id="26" w:name="_Toc241494533"/>
       <w:r>
         <w:t>Delivery and Planning boards</w:t>
       </w:r>
@@ -6366,7 +6396,7 @@
       <w:pPr>
         <w:pStyle w:val="Heading2"/>
       </w:pPr>
-      <w:bookmarkStart w:id="27" w:name="_Toc241488916"/>
+      <w:bookmarkStart w:id="27" w:name="_Toc241494534"/>
       <w:r>
         <w:t>TV display</w:t>
       </w:r>
@@ -6395,7 +6425,7 @@
         <w:pStyle w:val="Heading1"/>
         <w:pageBreakBefore/>
       </w:pPr>
-      <w:bookmarkStart w:id="28" w:name="_Toc241488917"/>
+      <w:bookmarkStart w:id="28" w:name="_Toc241494535"/>
       <w:r>
         <w:t>7.  CCC estimates coming into ShopControl</w:t>
       </w:r>
@@ -6504,7 +6534,7 @@
         <w:pStyle w:val="Heading1"/>
         <w:pageBreakBefore/>
       </w:pPr>
-      <w:bookmarkStart w:id="29" w:name="_Toc241488918"/>
+      <w:bookmarkStart w:id="29" w:name="_Toc241494536"/>
       <w:r>
         <w:t>8.  Parts</w:t>
       </w:r>
@@ -6562,7 +6592,7 @@
       <w:pPr>
         <w:pStyle w:val="Heading2"/>
       </w:pPr>
-      <w:bookmarkStart w:id="30" w:name="_Toc241488919"/>
+      <w:bookmarkStart w:id="30" w:name="_Toc241494537"/>
       <w:r>
         <w:t>What counts as a problem</w:t>
       </w:r>
@@ -6630,7 +6660,7 @@
       <w:pPr>
         <w:pStyle w:val="Heading2"/>
       </w:pPr>
-      <w:bookmarkStart w:id="31" w:name="_Toc241488920"/>
+      <w:bookmarkStart w:id="31" w:name="_Toc241494538"/>
       <w:r>
         <w:t>Ordering parts</w:t>
       </w:r>
@@ -6737,7 +6767,7 @@
       <w:pPr>
         <w:pStyle w:val="Heading2"/>
       </w:pPr>
-      <w:bookmarkStart w:id="32" w:name="_Toc241488921"/>
+      <w:bookmarkStart w:id="32" w:name="_Toc241494539"/>
       <w:r>
         <w:t>Mirror matching and carts</w:t>
       </w:r>
@@ -6847,7 +6877,7 @@
       <w:pPr>
         <w:pStyle w:val="Heading2"/>
       </w:pPr>
-      <w:bookmarkStart w:id="33" w:name="_Toc241488922"/>
+      <w:bookmarkStart w:id="33" w:name="_Toc241494540"/>
       <w:r>
         <w:t>Other parts screens</w:t>
       </w:r>
@@ -6938,7 +6968,7 @@
         <w:pStyle w:val="Heading1"/>
         <w:pageBreakBefore/>
       </w:pPr>
-      <w:bookmarkStart w:id="34" w:name="_Toc241488923"/>
+      <w:bookmarkStart w:id="34" w:name="_Toc241494541"/>
       <w:r>
         <w:t>9.  Vehicle QC (office view)</w:t>
       </w:r>
@@ -7005,7 +7035,7 @@
         <w:pStyle w:val="Heading1"/>
         <w:pageBreakBefore/>
       </w:pPr>
-      <w:bookmarkStart w:id="35" w:name="_Toc241488924"/>
+      <w:bookmarkStart w:id="35" w:name="_Toc241494542"/>
       <w:r>
         <w:t>10.  Office tools</w:t>
       </w:r>
@@ -7015,7 +7045,7 @@
       <w:pPr>
         <w:pStyle w:val="Heading2"/>
       </w:pPr>
-      <w:bookmarkStart w:id="36" w:name="_Toc241488925"/>
+      <w:bookmarkStart w:id="36" w:name="_Toc241494543"/>
       <w:r>
         <w:t>Missed Calls / Callback Requests</w:t>
       </w:r>
@@ -7093,7 +7123,7 @@
       <w:pPr>
         <w:pStyle w:val="Heading2"/>
       </w:pPr>
-      <w:bookmarkStart w:id="37" w:name="_Toc241488926"/>
+      <w:bookmarkStart w:id="37" w:name="_Toc241494544"/>
       <w:r>
         <w:t>Tasks</w:t>
       </w:r>
@@ -7111,7 +7141,7 @@
       <w:pPr>
         <w:pStyle w:val="Heading2"/>
       </w:pPr>
-      <w:bookmarkStart w:id="38" w:name="_Toc241488927"/>
+      <w:bookmarkStart w:id="38" w:name="_Toc241494545"/>
       <w:r>
         <w:t>Booth Filters and Facility Checklist</w:t>
       </w:r>
@@ -7149,7 +7179,7 @@
       <w:pPr>
         <w:pStyle w:val="Heading2"/>
       </w:pPr>
-      <w:bookmarkStart w:id="39" w:name="_Toc241488928"/>
+      <w:bookmarkStart w:id="39" w:name="_Toc241494546"/>
       <w:r>
         <w:t>AR Balances and Cycle Time</w:t>
       </w:r>
@@ -7199,7 +7229,7 @@
       <w:pPr>
         <w:pStyle w:val="Heading2"/>
       </w:pPr>
-      <w:bookmarkStart w:id="40" w:name="_Toc241488929"/>
+      <w:bookmarkStart w:id="40" w:name="_Toc241494547"/>
       <w:r>
         <w:t>Photos and Activity Log</w:t>
       </w:r>
@@ -7250,7 +7280,7 @@
         <w:pStyle w:val="Heading1"/>
         <w:pageBreakBefore/>
       </w:pPr>
-      <w:bookmarkStart w:id="41" w:name="_Toc241488930"/>
+      <w:bookmarkStart w:id="41" w:name="_Toc241494548"/>
       <w:r>
         <w:t>11.  Time off and messages (office and admins)</w:t>
       </w:r>
@@ -7260,7 +7290,7 @@
       <w:pPr>
         <w:pStyle w:val="Heading2"/>
       </w:pPr>
-      <w:bookmarkStart w:id="42" w:name="_Toc241488931"/>
+      <w:bookmarkStart w:id="42" w:name="_Toc241494549"/>
       <w:r>
         <w:t>Time Off tab</w:t>
       </w:r>
@@ -7388,7 +7418,7 @@
       <w:pPr>
         <w:pStyle w:val="Heading2"/>
       </w:pPr>
-      <w:bookmarkStart w:id="43" w:name="_Toc241488932"/>
+      <w:bookmarkStart w:id="43" w:name="_Toc241494550"/>
       <w:r>
         <w:t>Messages &amp; Info tab</w:t>
       </w:r>
@@ -7479,7 +7509,7 @@
         <w:pStyle w:val="Heading1"/>
         <w:pageBreakBefore/>
       </w:pPr>
-      <w:bookmarkStart w:id="44" w:name="_Toc241488933"/>
+      <w:bookmarkStart w:id="44" w:name="_Toc241494551"/>
       <w:r>
         <w:t>12.  Admin: employees and settings</w:t>
       </w:r>
@@ -7489,7 +7519,7 @@
       <w:pPr>
         <w:pStyle w:val="Heading2"/>
       </w:pPr>
-      <w:bookmarkStart w:id="45" w:name="_Toc241488934"/>
+      <w:bookmarkStart w:id="45" w:name="_Toc241494552"/>
       <w:r>
         <w:t>Adding an employee</w:t>
       </w:r>
@@ -7538,7 +7568,17 @@
         <w:spacing w:after="60"/>
       </w:pPr>
       <w:r>
-        <w:t>Enter full name, username, email (needed for password resets and emails), job title and a temporary password (8+ characters).</w:t>
+        <w:t xml:space="preserve">Enter full name, username, email (needed for password resets and emails), job title and a </w:t>
+      </w:r>
+      <w:r>
+        <w:rPr>
+          <w:b/>
+          <w:bCs/>
+        </w:rPr>
+        <w:t>temporary password</w:t>
+      </w:r>
+      <w:r>
+        <w:t xml:space="preserve"> (8+ characters). They must choose their own the first time they sign in.</w:t>
       </w:r>
     </w:p>
     <w:p>
@@ -7601,7 +7641,7 @@
       <w:pPr>
         <w:pStyle w:val="Heading2"/>
       </w:pPr>
-      <w:bookmarkStart w:id="46" w:name="_Toc241488935"/>
+      <w:bookmarkStart w:id="46" w:name="_Toc241494553"/>
       <w:r>
         <w:t>Changing an employee</w:t>
       </w:r>
@@ -7664,6 +7704,36 @@
         <w:t>Reset Password</w:t>
       </w:r>
       <w:r>
+        <w:t xml:space="preserve"> sets a new temporary password; the employee must choose their own at next sign-in. Anyone still on a temporary password shows </w:t>
+      </w:r>
+      <w:r>
+        <w:rPr>
+          <w:b/>
+          <w:bCs/>
+        </w:rPr>
+        <w:t>Needs new password</w:t>
+      </w:r>
+      <w:r>
+        <w:t xml:space="preserve"> in the list.</w:t>
+      </w:r>
+    </w:p>
+    <w:p>
+      <w:pPr>
+        <w:pStyle w:val="ListParagraph"/>
+        <w:numPr>
+          <w:ilvl w:val="0"/>
+          <w:numId w:val="2"/>
+        </w:numPr>
+        <w:spacing w:after="60"/>
+      </w:pPr>
+      <w:r>
+        <w:rPr>
+          <w:b/>
+          <w:bCs/>
+        </w:rPr>
+        <w:t>Grant/Revoke Delete</w:t>
+      </w:r>
+      <w:r>
         <w:t xml:space="preserve">, </w:t>
       </w:r>
       <w:r>
@@ -7671,16 +7741,6 @@
           <w:b/>
           <w:bCs/>
         </w:rPr>
-        <w:t>Grant/Revoke Delete</w:t>
-      </w:r>
-      <w:r>
-        <w:t xml:space="preserve">, </w:t>
-      </w:r>
-      <w:r>
-        <w:rPr>
-          <w:b/>
-          <w:bCs/>
-        </w:rPr>
         <w:t>Deactivate / Reactivate</w:t>
       </w:r>
       <w:r>
@@ -7691,7 +7751,7 @@
       <w:pPr>
         <w:pStyle w:val="Heading2"/>
       </w:pPr>
-      <w:bookmarkStart w:id="47" w:name="_Toc241488936"/>
+      <w:bookmarkStart w:id="47" w:name="_Toc241494554"/>
       <w:r>
         <w:t>Board Settings</w:t>
       </w:r>
@@ -7710,7 +7770,7 @@
         <w:pStyle w:val="Heading1"/>
         <w:pageBreakBefore/>
       </w:pPr>
-      <w:bookmarkStart w:id="48" w:name="_Toc241488937"/>
+      <w:bookmarkStart w:id="48" w:name="_Toc241494555"/>
       <w:r>
         <w:t>13.  Quick answers</w:t>
       </w:r>
@@ -7731,7 +7791,7 @@
           <w:left w:w="10" w:type="dxa"/>
           <w:right w:w="10" w:type="dxa"/>
         </w:tblCellMar>
-        <w:tblLook w:val="0000" w:firstRow="0" w:lastRow="0" w:firstColumn="0" w:lastColumn="0" w:noHBand="0" w:noVBand="0"/>
+        <w:tblLook w:val="04A0" w:firstRow="1" w:lastRow="0" w:firstColumn="1" w:lastColumn="0" w:noHBand="0" w:noVBand="1"/>
       </w:tblPr>
       <w:tblGrid>
         <w:gridCol w:w="2900"/>
@@ -8354,7 +8414,7 @@
         <w:pStyle w:val="Heading1"/>
         <w:pageBreakBefore/>
       </w:pPr>
-      <w:bookmarkStart w:id="49" w:name="_Toc241488938"/>
+      <w:bookmarkStart w:id="49" w:name="_Toc241494556"/>
       <w:r>
         <w:t>Manual versions</w:t>
       </w:r>
@@ -8375,7 +8435,7 @@
           <w:left w:w="10" w:type="dxa"/>
           <w:right w:w="10" w:type="dxa"/>
         </w:tblCellMar>
-        <w:tblLook w:val="0000" w:firstRow="0" w:lastRow="0" w:firstColumn="0" w:lastColumn="0" w:noHBand="0" w:noVBand="0"/>
+        <w:tblLook w:val="04A0" w:firstRow="1" w:lastRow="0" w:firstColumn="1" w:lastColumn="0" w:noHBand="0" w:noVBand="1"/>
       </w:tblPr>
       <w:tblGrid>
         <w:gridCol w:w="3120"/>
@@ -8509,7 +8569,7 @@
                 <w:b/>
                 <w:bCs/>
               </w:rPr>
-              <w:t>1.2</w:t>
+              <w:t>1.3</w:t>
             </w:r>
           </w:p>
         </w:tc>
@@ -8553,17 +8613,7 @@
           </w:tcPr>
           <w:p>
             <w:r>
-              <w:t xml:space="preserve">Added the </w:t>
-            </w:r>
-            <w:r>
-              <w:rPr>
-                <w:b/>
-                <w:bCs/>
-              </w:rPr>
-              <w:t>Help</w:t>
-            </w:r>
-            <w:r>
-              <w:t xml:space="preserve"> tab in the office program and a search box in the manual.</w:t>
+              <w:t>New accounts and admin password resets use a temporary password; you choose your own the first time you sign in.</w:t>
             </w:r>
           </w:p>
         </w:tc>
@@ -8600,7 +8650,7 @@
                 <w:b/>
                 <w:bCs/>
               </w:rPr>
-              <w:t>1.1</w:t>
+              <w:t>1.2</w:t>
             </w:r>
           </w:p>
         </w:tc>
@@ -8644,17 +8694,17 @@
           </w:tcPr>
           <w:p>
             <w:r>
-              <w:t xml:space="preserve">Employee App address is now </w:t>
+              <w:t xml:space="preserve">Added the </w:t>
             </w:r>
             <w:r>
               <w:rPr>
                 <w:b/>
                 <w:bCs/>
               </w:rPr>
-              <w:t>https://conceptautobody.app</w:t>
-            </w:r>
-            <w:r>
-              <w:t xml:space="preserve"> and works on phones anywhere. Added how to put it on your phone's home screen.</w:t>
+              <w:t>Help</w:t>
+            </w:r>
+            <w:r>
+              <w:t xml:space="preserve"> tab in the office program and a search box in the manual.</w:t>
             </w:r>
           </w:p>
         </w:tc>
@@ -8691,7 +8741,7 @@
                 <w:b/>
                 <w:bCs/>
               </w:rPr>
-              <w:t>1.0</w:t>
+              <w:t>1.1</w:t>
             </w:r>
           </w:p>
         </w:tc>
@@ -8735,6 +8785,97 @@
           </w:tcPr>
           <w:p>
             <w:r>
+              <w:t xml:space="preserve">Employee App address is now </w:t>
+            </w:r>
+            <w:r>
+              <w:rPr>
+                <w:b/>
+                <w:bCs/>
+              </w:rPr>
+              <w:t>https://conceptautobody.app</w:t>
+            </w:r>
+            <w:r>
+              <w:t xml:space="preserve"> and works on phones anywhere. Added how to put it on your phone's home screen.</w:t>
+            </w:r>
+          </w:p>
+        </w:tc>
+      </w:tr>
+      <w:tr>
+        <w:tblPrEx>
+          <w:tblCellMar>
+            <w:top w:w="0" w:type="dxa"/>
+            <w:bottom w:w="0" w:type="dxa"/>
+          </w:tblCellMar>
+        </w:tblPrEx>
+        <w:trPr>
+          <w:cantSplit/>
+        </w:trPr>
+        <w:tc>
+          <w:tcPr>
+            <w:tcW w:w="3120" w:type="dxa"/>
+            <w:tcBorders>
+              <w:top w:val="single" w:sz="4" w:space="0" w:color="C9CFD6"/>
+              <w:left w:val="single" w:sz="4" w:space="0" w:color="C9CFD6"/>
+              <w:bottom w:val="single" w:sz="4" w:space="0" w:color="C9CFD6"/>
+              <w:right w:val="single" w:sz="4" w:space="0" w:color="C9CFD6"/>
+            </w:tcBorders>
+            <w:tcMar>
+              <w:top w:w="80" w:type="dxa"/>
+              <w:left w:w="120" w:type="dxa"/>
+              <w:bottom w:w="80" w:type="dxa"/>
+              <w:right w:w="120" w:type="dxa"/>
+            </w:tcMar>
+          </w:tcPr>
+          <w:p>
+            <w:r>
+              <w:rPr>
+                <w:b/>
+                <w:bCs/>
+              </w:rPr>
+              <w:t>1.0</w:t>
+            </w:r>
+          </w:p>
+        </w:tc>
+        <w:tc>
+          <w:tcPr>
+            <w:tcW w:w="3120" w:type="dxa"/>
+            <w:tcBorders>
+              <w:top w:val="single" w:sz="4" w:space="0" w:color="C9CFD6"/>
+              <w:left w:val="single" w:sz="4" w:space="0" w:color="C9CFD6"/>
+              <w:bottom w:val="single" w:sz="4" w:space="0" w:color="C9CFD6"/>
+              <w:right w:val="single" w:sz="4" w:space="0" w:color="C9CFD6"/>
+            </w:tcBorders>
+            <w:tcMar>
+              <w:top w:w="80" w:type="dxa"/>
+              <w:left w:w="120" w:type="dxa"/>
+              <w:bottom w:w="80" w:type="dxa"/>
+              <w:right w:w="120" w:type="dxa"/>
+            </w:tcMar>
+          </w:tcPr>
+          <w:p>
+            <w:r>
+              <w:t>September 28, 2026</w:t>
+            </w:r>
+          </w:p>
+        </w:tc>
+        <w:tc>
+          <w:tcPr>
+            <w:tcW w:w="3120" w:type="dxa"/>
+            <w:tcBorders>
+              <w:top w:val="single" w:sz="4" w:space="0" w:color="C9CFD6"/>
+              <w:left w:val="single" w:sz="4" w:space="0" w:color="C9CFD6"/>
+              <w:bottom w:val="single" w:sz="4" w:space="0" w:color="C9CFD6"/>
+              <w:right w:val="single" w:sz="4" w:space="0" w:color="C9CFD6"/>
+            </w:tcBorders>
+            <w:tcMar>
+              <w:top w:w="80" w:type="dxa"/>
+              <w:left w:w="120" w:type="dxa"/>
+              <w:bottom w:w="80" w:type="dxa"/>
+              <w:right w:w="120" w:type="dxa"/>
+            </w:tcMar>
+          </w:tcPr>
+          <w:p>
+            <w:r>
               <w:t>First edition.</w:t>
             </w:r>
           </w:p>
@@ -8796,7 +8937,7 @@
         <w:sz w:val="18"/>
         <w:szCs w:val="18"/>
       </w:rPr>
-      <w:t xml:space="preserve">Concept Autobody  ·  Version 1.2  ·  Page </w:t>
+      <w:t xml:space="preserve">Concept Autobody  ·  Version 1.3  ·  Page </w:t>
     </w:r>
     <w:r>
       <w:rPr>
@@ -8889,10 +9030,150 @@
 <file path=word/numbering.xml><?xml version="1.0" encoding="utf-8"?>
 <w:numbering xmlns:wpc="http://schemas.microsoft.com/office/word/2010/wordprocessingCanvas" xmlns:cx="http://schemas.microsoft.com/office/drawing/2014/chartex" xmlns:cx1="http://schemas.microsoft.com/office/drawing/2015/9/8/chartex" xmlns:cx2="http://schemas.microsoft.com/office/drawing/2015/10/21/chartex" xmlns:cx3="http://schemas.microsoft.com/office/drawing/2016/5/9/chartex" xmlns:cx4="http://schemas.microsoft.com/office/drawing/2016/5/10/chartex" xmlns:cx5="http://schemas.microsoft.com/office/drawing/2016/5/11/chartex" xmlns:cx6="http://schemas.microsoft.com/office/drawing/2016/5/12/chartex" xmlns:cx7="http://schemas.microsoft.com/office/drawing/2016/5/13/chartex" xmlns:cx8="http://schemas.microsoft.com/office/drawing/2016/5/14/chartex" xmlns:mc="http://schemas.openxmlformats.org/markup-compatibility/2006" xmlns:aink="http://schemas.microsoft.com/office/drawing/2016/ink" xmlns:am3d="http://schemas.microsoft.com/office/drawing/2017/model3d" xmlns:o="urn:schemas-microsoft-com:office:office" xmlns:oel="http://schemas.microsoft.com/office/2019/extlst" xmlns:r="http://schemas.openxmlformats.org/officeDocument/2006/relationships" xmlns:m="http://schemas.openxmlformats.org/officeDocument/2006/math" xmlns:v="urn:schemas-microsoft-com:vml" xmlns:wp14="http://schemas.microsoft.com/office/word/2010/wordprocessingDrawing" xmlns:wp="http://schemas.openxmlformats.org/drawingml/2006/wordprocessingDrawing" xmlns:w10="urn:schemas-microsoft-com:office:word" xmlns:w="http://schemas.openxmlformats.org/wordprocessingml/2006/main" xmlns:w14="http://schemas.microsoft.com/office/word/2010/wordml" xmlns:w15="http://schemas.microsoft.com/office/word/2012/wordml" xmlns:w16cex="http://schemas.microsoft.com/office/word/2018/wordml/cex" xmlns:w16cid="http://schemas.microsoft.com/office/word/2016/wordml/cid" xmlns:w16="http://schemas.microsoft.com/office/word/2018/wordml" xmlns:w16du="http://schemas.microsoft.com/office/word/2023/wordml/word16du" xmlns:w16sdtdh="http://schemas.microsoft.com/office/word/2020/wordml/sdtdatahash" xmlns:w16sdtfl="http://schemas.microsoft.com/office/word/2024/wordml/sdtformatlock" xmlns:w16se="http://schemas.microsoft.com/office/word/2015/wordml/symex" xmlns:wpg="http://schemas.microsoft.com/office/word/2010/wordprocessingGroup" xmlns:wpi="http://schemas.microsoft.com/office/word/2010/wordprocessingInk" xmlns:wne="http://schemas.microsoft.com/office/word/2006/wordml" xmlns:wps="http://schemas.microsoft.com/office/word/2010/wordprocessingShape" mc:Ignorable="w14 w15 w16se w16cid w16 w16cex w16sdtdh w16sdtfl w16du wp14">
   <w:abstractNum w:abstractNumId="0" w15:restartNumberingAfterBreak="0">
-    <w:nsid w:val="27B212B5"/>
+    <w:nsid w:val="1B7D31E2"/>
     <w:multiLevelType w:val="hybridMultilevel"/>
-    <w:tmpl w:val="A9C6C2BC"/>
-    <w:lvl w:ilvl="0" w:tplc="5B8A2A4E">
+    <w:tmpl w:val="99167B50"/>
+    <w:lvl w:ilvl="0" w:tplc="19869D1E" w:tentative="1">
+      <w:start w:val="1"/>
+      <w:numFmt w:val="bullet"/>
+      <w:lvlText w:val="●"/>
+      <w:lvlJc w:val="left"/>
+      <w:pPr>
+        <w:ind w:left="720" w:hanging="360"/>
+      </w:pPr>
+    </w:lvl>
+    <w:lvl w:ilvl="1" w:tplc="0748ABDE" w:tentative="1">
+      <w:start w:val="1"/>
+      <w:numFmt w:val="bullet"/>
+      <w:lvlText w:val="○"/>
+      <w:lvlJc w:val="left"/>
+      <w:pPr>
+        <w:ind w:left="1440" w:hanging="360"/>
+      </w:pPr>
+    </w:lvl>
+    <w:lvl w:ilvl="2" w:tplc="E02EFF10" w:tentative="1">
+      <w:start w:val="1"/>
+      <w:numFmt w:val="bullet"/>
+      <w:lvlText w:val="■"/>
+      <w:lvlJc w:val="left"/>
+      <w:pPr>
+        <w:ind w:left="2160" w:hanging="360"/>
+      </w:pPr>
+    </w:lvl>
+    <w:lvl w:ilvl="3" w:tplc="AB766598" w:tentative="1">
+      <w:start w:val="1"/>
+      <w:numFmt w:val="bullet"/>
+      <w:lvlText w:val="●"/>
+      <w:lvlJc w:val="left"/>
+      <w:pPr>
+        <w:ind w:left="2880" w:hanging="360"/>
+      </w:pPr>
+    </w:lvl>
+    <w:lvl w:ilvl="4" w:tplc="E31AE9D8" w:tentative="1">
+      <w:start w:val="1"/>
+      <w:numFmt w:val="bullet"/>
+      <w:lvlText w:val="○"/>
+      <w:lvlJc w:val="left"/>
+      <w:pPr>
+        <w:ind w:left="3600" w:hanging="360"/>
+      </w:pPr>
+    </w:lvl>
+    <w:lvl w:ilvl="5" w:tplc="959AA634" w:tentative="1">
+      <w:start w:val="1"/>
+      <w:numFmt w:val="bullet"/>
+      <w:lvlText w:val="■"/>
+      <w:lvlJc w:val="left"/>
+      <w:pPr>
+        <w:ind w:left="4320" w:hanging="360"/>
+      </w:pPr>
+    </w:lvl>
+    <w:lvl w:ilvl="6" w:tplc="A01E25A8" w:tentative="1">
+      <w:start w:val="1"/>
+      <w:numFmt w:val="bullet"/>
+      <w:lvlText w:val="●"/>
+      <w:lvlJc w:val="left"/>
+      <w:pPr>
+        <w:ind w:left="5040" w:hanging="360"/>
+      </w:pPr>
+    </w:lvl>
+    <w:lvl w:ilvl="7" w:tplc="E28E003A" w:tentative="1">
+      <w:start w:val="1"/>
+      <w:numFmt w:val="bullet"/>
+      <w:lvlText w:val="●"/>
+      <w:lvlJc w:val="left"/>
+      <w:pPr>
+        <w:ind w:left="5760" w:hanging="360"/>
+      </w:pPr>
+    </w:lvl>
+    <w:lvl w:ilvl="8" w:tplc="2FF647A2" w:tentative="1">
+      <w:start w:val="1"/>
+      <w:numFmt w:val="bullet"/>
+      <w:lvlText w:val="●"/>
+      <w:lvlJc w:val="left"/>
+      <w:pPr>
+        <w:ind w:left="6480" w:hanging="360"/>
+      </w:pPr>
+    </w:lvl>
+  </w:abstractNum>
+  <w:abstractNum w:abstractNumId="1" w15:restartNumberingAfterBreak="0">
+    <w:nsid w:val="250A21CB"/>
+    <w:multiLevelType w:val="hybridMultilevel"/>
+    <w:tmpl w:val="431270D8"/>
+    <w:lvl w:ilvl="0" w:tplc="74CC0F76">
+      <w:start w:val="1"/>
+      <w:numFmt w:val="bullet"/>
+      <w:lvlText w:val="•"/>
+      <w:lvlJc w:val="left"/>
+      <w:pPr>
+        <w:ind w:left="540" w:hanging="270"/>
+      </w:pPr>
+    </w:lvl>
+    <w:lvl w:ilvl="1" w:tplc="619E5694">
+      <w:numFmt w:val="decimal"/>
+      <w:lvlText w:val=""/>
+      <w:lvlJc w:val="left"/>
+    </w:lvl>
+    <w:lvl w:ilvl="2" w:tplc="C1DCAF06">
+      <w:numFmt w:val="decimal"/>
+      <w:lvlText w:val=""/>
+      <w:lvlJc w:val="left"/>
+    </w:lvl>
+    <w:lvl w:ilvl="3" w:tplc="EBB042D2">
+      <w:numFmt w:val="decimal"/>
+      <w:lvlText w:val=""/>
+      <w:lvlJc w:val="left"/>
+    </w:lvl>
+    <w:lvl w:ilvl="4" w:tplc="D5D29BE8">
+      <w:numFmt w:val="decimal"/>
+      <w:lvlText w:val=""/>
+      <w:lvlJc w:val="left"/>
+    </w:lvl>
+    <w:lvl w:ilvl="5" w:tplc="BF7227BC">
+      <w:numFmt w:val="decimal"/>
+      <w:lvlText w:val=""/>
+      <w:lvlJc w:val="left"/>
+    </w:lvl>
+    <w:lvl w:ilvl="6" w:tplc="E536DC3C">
+      <w:numFmt w:val="decimal"/>
+      <w:lvlText w:val=""/>
+      <w:lvlJc w:val="left"/>
+    </w:lvl>
+    <w:lvl w:ilvl="7" w:tplc="987AE552">
+      <w:numFmt w:val="decimal"/>
+      <w:lvlText w:val=""/>
+      <w:lvlJc w:val="left"/>
+    </w:lvl>
+    <w:lvl w:ilvl="8" w:tplc="27868C5A">
+      <w:numFmt w:val="decimal"/>
+      <w:lvlText w:val=""/>
+      <w:lvlJc w:val="left"/>
+    </w:lvl>
+  </w:abstractNum>
+  <w:abstractNum w:abstractNumId="2" w15:restartNumberingAfterBreak="0">
+    <w:nsid w:val="32791082"/>
+    <w:multiLevelType w:val="hybridMultilevel"/>
+    <w:tmpl w:val="FC5E4690"/>
+    <w:lvl w:ilvl="0" w:tplc="88303A2C">
       <w:start w:val="1"/>
       <w:numFmt w:val="decimal"/>
       <w:lvlText w:val="%1."/>
@@ -8906,261 +9187,121 @@
         <w:color w:val="E8620E"/>
       </w:rPr>
     </w:lvl>
-    <w:lvl w:ilvl="1" w:tplc="7728DD06">
+    <w:lvl w:ilvl="1" w:tplc="0C44F36E">
       <w:numFmt w:val="decimal"/>
       <w:lvlText w:val=""/>
       <w:lvlJc w:val="left"/>
     </w:lvl>
-    <w:lvl w:ilvl="2" w:tplc="C6F4FA1A">
+    <w:lvl w:ilvl="2" w:tplc="5A248394">
       <w:numFmt w:val="decimal"/>
       <w:lvlText w:val=""/>
       <w:lvlJc w:val="left"/>
     </w:lvl>
-    <w:lvl w:ilvl="3" w:tplc="6CD812C2">
+    <w:lvl w:ilvl="3" w:tplc="54BE7EBC">
       <w:numFmt w:val="decimal"/>
       <w:lvlText w:val=""/>
       <w:lvlJc w:val="left"/>
     </w:lvl>
-    <w:lvl w:ilvl="4" w:tplc="163A085E">
+    <w:lvl w:ilvl="4" w:tplc="83721300">
       <w:numFmt w:val="decimal"/>
       <w:lvlText w:val=""/>
       <w:lvlJc w:val="left"/>
     </w:lvl>
-    <w:lvl w:ilvl="5" w:tplc="384AD7D8">
+    <w:lvl w:ilvl="5" w:tplc="4ECA1BC2">
       <w:numFmt w:val="decimal"/>
       <w:lvlText w:val=""/>
       <w:lvlJc w:val="left"/>
     </w:lvl>
-    <w:lvl w:ilvl="6" w:tplc="22F68386">
+    <w:lvl w:ilvl="6" w:tplc="29BEDA72">
       <w:numFmt w:val="decimal"/>
       <w:lvlText w:val=""/>
       <w:lvlJc w:val="left"/>
     </w:lvl>
-    <w:lvl w:ilvl="7" w:tplc="44DADA4A">
+    <w:lvl w:ilvl="7" w:tplc="EE08709A">
       <w:numFmt w:val="decimal"/>
       <w:lvlText w:val=""/>
       <w:lvlJc w:val="left"/>
     </w:lvl>
-    <w:lvl w:ilvl="8" w:tplc="E5B63654">
+    <w:lvl w:ilvl="8" w:tplc="2E1C5B20">
       <w:numFmt w:val="decimal"/>
       <w:lvlText w:val=""/>
       <w:lvlJc w:val="left"/>
     </w:lvl>
   </w:abstractNum>
-  <w:abstractNum w:abstractNumId="1" w15:restartNumberingAfterBreak="0">
-    <w:nsid w:val="6DFE6CC7"/>
-    <w:multiLevelType w:val="hybridMultilevel"/>
-    <w:tmpl w:val="9DCC35E0"/>
-    <w:lvl w:ilvl="0" w:tplc="472CF3EA" w:tentative="1">
-      <w:start w:val="1"/>
-      <w:numFmt w:val="bullet"/>
-      <w:lvlText w:val="●"/>
-      <w:lvlJc w:val="left"/>
-      <w:pPr>
-        <w:ind w:left="720" w:hanging="360"/>
-      </w:pPr>
-    </w:lvl>
-    <w:lvl w:ilvl="1" w:tplc="D7883234" w:tentative="1">
-      <w:start w:val="1"/>
-      <w:numFmt w:val="bullet"/>
-      <w:lvlText w:val="○"/>
-      <w:lvlJc w:val="left"/>
-      <w:pPr>
-        <w:ind w:left="1440" w:hanging="360"/>
-      </w:pPr>
-    </w:lvl>
-    <w:lvl w:ilvl="2" w:tplc="7E58800A" w:tentative="1">
-      <w:start w:val="1"/>
-      <w:numFmt w:val="bullet"/>
-      <w:lvlText w:val="■"/>
-      <w:lvlJc w:val="left"/>
-      <w:pPr>
-        <w:ind w:left="2160" w:hanging="360"/>
-      </w:pPr>
-    </w:lvl>
-    <w:lvl w:ilvl="3" w:tplc="9BC0A68A" w:tentative="1">
-      <w:start w:val="1"/>
-      <w:numFmt w:val="bullet"/>
-      <w:lvlText w:val="●"/>
-      <w:lvlJc w:val="left"/>
-      <w:pPr>
-        <w:ind w:left="2880" w:hanging="360"/>
-      </w:pPr>
-    </w:lvl>
-    <w:lvl w:ilvl="4" w:tplc="A59023EE" w:tentative="1">
-      <w:start w:val="1"/>
-      <w:numFmt w:val="bullet"/>
-      <w:lvlText w:val="○"/>
-      <w:lvlJc w:val="left"/>
-      <w:pPr>
-        <w:ind w:left="3600" w:hanging="360"/>
-      </w:pPr>
-    </w:lvl>
-    <w:lvl w:ilvl="5" w:tplc="DA36D5E0" w:tentative="1">
-      <w:start w:val="1"/>
-      <w:numFmt w:val="bullet"/>
-      <w:lvlText w:val="■"/>
-      <w:lvlJc w:val="left"/>
-      <w:pPr>
-        <w:ind w:left="4320" w:hanging="360"/>
-      </w:pPr>
-    </w:lvl>
-    <w:lvl w:ilvl="6" w:tplc="AB8CC412" w:tentative="1">
-      <w:start w:val="1"/>
-      <w:numFmt w:val="bullet"/>
-      <w:lvlText w:val="●"/>
-      <w:lvlJc w:val="left"/>
-      <w:pPr>
-        <w:ind w:left="5040" w:hanging="360"/>
-      </w:pPr>
-    </w:lvl>
-    <w:lvl w:ilvl="7" w:tplc="67A6B5CE" w:tentative="1">
-      <w:start w:val="1"/>
-      <w:numFmt w:val="bullet"/>
-      <w:lvlText w:val="●"/>
-      <w:lvlJc w:val="left"/>
-      <w:pPr>
-        <w:ind w:left="5760" w:hanging="360"/>
-      </w:pPr>
-    </w:lvl>
-    <w:lvl w:ilvl="8" w:tplc="37FC13D8" w:tentative="1">
-      <w:start w:val="1"/>
-      <w:numFmt w:val="bullet"/>
-      <w:lvlText w:val="●"/>
-      <w:lvlJc w:val="left"/>
-      <w:pPr>
-        <w:ind w:left="6480" w:hanging="360"/>
-      </w:pPr>
-    </w:lvl>
-  </w:abstractNum>
-  <w:abstractNum w:abstractNumId="2" w15:restartNumberingAfterBreak="0">
-    <w:nsid w:val="77583DAB"/>
-    <w:multiLevelType w:val="hybridMultilevel"/>
-    <w:tmpl w:val="275666A2"/>
-    <w:lvl w:ilvl="0" w:tplc="AE94E9E0">
-      <w:start w:val="1"/>
-      <w:numFmt w:val="bullet"/>
-      <w:lvlText w:val="•"/>
-      <w:lvlJc w:val="left"/>
-      <w:pPr>
-        <w:ind w:left="540" w:hanging="270"/>
-      </w:pPr>
-    </w:lvl>
-    <w:lvl w:ilvl="1" w:tplc="BB0EA214">
-      <w:numFmt w:val="decimal"/>
-      <w:lvlText w:val=""/>
-      <w:lvlJc w:val="left"/>
-    </w:lvl>
-    <w:lvl w:ilvl="2" w:tplc="4D22791A">
-      <w:numFmt w:val="decimal"/>
-      <w:lvlText w:val=""/>
-      <w:lvlJc w:val="left"/>
-    </w:lvl>
-    <w:lvl w:ilvl="3" w:tplc="7C183A32">
-      <w:numFmt w:val="decimal"/>
-      <w:lvlText w:val=""/>
-      <w:lvlJc w:val="left"/>
-    </w:lvl>
-    <w:lvl w:ilvl="4" w:tplc="02EED7BA">
-      <w:numFmt w:val="decimal"/>
-      <w:lvlText w:val=""/>
-      <w:lvlJc w:val="left"/>
-    </w:lvl>
-    <w:lvl w:ilvl="5" w:tplc="7E04F9B4">
-      <w:numFmt w:val="decimal"/>
-      <w:lvlText w:val=""/>
-      <w:lvlJc w:val="left"/>
-    </w:lvl>
-    <w:lvl w:ilvl="6" w:tplc="3846323A">
-      <w:numFmt w:val="decimal"/>
-      <w:lvlText w:val=""/>
-      <w:lvlJc w:val="left"/>
-    </w:lvl>
-    <w:lvl w:ilvl="7" w:tplc="6C7430A6">
-      <w:numFmt w:val="decimal"/>
-      <w:lvlText w:val=""/>
-      <w:lvlJc w:val="left"/>
-    </w:lvl>
-    <w:lvl w:ilvl="8" w:tplc="DD12BED8">
-      <w:numFmt w:val="decimal"/>
-      <w:lvlText w:val=""/>
-      <w:lvlJc w:val="left"/>
-    </w:lvl>
-  </w:abstractNum>
-  <w:num w:numId="1" w16cid:durableId="58984982">
+  <w:num w:numId="1" w16cid:durableId="1019044793">
+    <w:abstractNumId w:val="0"/>
+    <w:lvlOverride w:ilvl="0">
+      <w:startOverride w:val="1"/>
+    </w:lvlOverride>
+  </w:num>
+  <w:num w:numId="2" w16cid:durableId="134572811">
     <w:abstractNumId w:val="1"/>
     <w:lvlOverride w:ilvl="0">
       <w:startOverride w:val="1"/>
     </w:lvlOverride>
   </w:num>
-  <w:num w:numId="2" w16cid:durableId="1753967356">
+  <w:num w:numId="3" w16cid:durableId="62072515">
     <w:abstractNumId w:val="2"/>
     <w:lvlOverride w:ilvl="0">
       <w:startOverride w:val="1"/>
     </w:lvlOverride>
   </w:num>
-  <w:num w:numId="3" w16cid:durableId="1959944528">
-    <w:abstractNumId w:val="0"/>
+  <w:num w:numId="4" w16cid:durableId="1361979285">
+    <w:abstractNumId w:val="2"/>
     <w:lvlOverride w:ilvl="0">
       <w:startOverride w:val="1"/>
     </w:lvlOverride>
   </w:num>
-  <w:num w:numId="4" w16cid:durableId="90395999">
-    <w:abstractNumId w:val="0"/>
+  <w:num w:numId="5" w16cid:durableId="90667035">
+    <w:abstractNumId w:val="2"/>
     <w:lvlOverride w:ilvl="0">
       <w:startOverride w:val="1"/>
     </w:lvlOverride>
   </w:num>
-  <w:num w:numId="5" w16cid:durableId="2057387488">
-    <w:abstractNumId w:val="0"/>
+  <w:num w:numId="6" w16cid:durableId="330376907">
+    <w:abstractNumId w:val="2"/>
     <w:lvlOverride w:ilvl="0">
       <w:startOverride w:val="1"/>
     </w:lvlOverride>
   </w:num>
-  <w:num w:numId="6" w16cid:durableId="1518499806">
-    <w:abstractNumId w:val="0"/>
+  <w:num w:numId="7" w16cid:durableId="894044090">
+    <w:abstractNumId w:val="2"/>
     <w:lvlOverride w:ilvl="0">
       <w:startOverride w:val="1"/>
     </w:lvlOverride>
   </w:num>
-  <w:num w:numId="7" w16cid:durableId="755975461">
-    <w:abstractNumId w:val="0"/>
+  <w:num w:numId="8" w16cid:durableId="774058205">
+    <w:abstractNumId w:val="2"/>
     <w:lvlOverride w:ilvl="0">
       <w:startOverride w:val="1"/>
     </w:lvlOverride>
   </w:num>
-  <w:num w:numId="8" w16cid:durableId="1366521496">
-    <w:abstractNumId w:val="0"/>
+  <w:num w:numId="9" w16cid:durableId="893270649">
+    <w:abstractNumId w:val="2"/>
     <w:lvlOverride w:ilvl="0">
       <w:startOverride w:val="1"/>
     </w:lvlOverride>
   </w:num>
-  <w:num w:numId="9" w16cid:durableId="429543103">
-    <w:abstractNumId w:val="0"/>
+  <w:num w:numId="10" w16cid:durableId="1416198176">
+    <w:abstractNumId w:val="2"/>
     <w:lvlOverride w:ilvl="0">
       <w:startOverride w:val="1"/>
     </w:lvlOverride>
   </w:num>
-  <w:num w:numId="10" w16cid:durableId="1204634322">
-    <w:abstractNumId w:val="0"/>
+  <w:num w:numId="11" w16cid:durableId="1791242058">
+    <w:abstractNumId w:val="2"/>
     <w:lvlOverride w:ilvl="0">
       <w:startOverride w:val="1"/>
     </w:lvlOverride>
   </w:num>
-  <w:num w:numId="11" w16cid:durableId="1942030139">
-    <w:abstractNumId w:val="0"/>
+  <w:num w:numId="12" w16cid:durableId="149711558">
+    <w:abstractNumId w:val="2"/>
     <w:lvlOverride w:ilvl="0">
       <w:startOverride w:val="1"/>
     </w:lvlOverride>
   </w:num>
-  <w:num w:numId="12" w16cid:durableId="1910261094">
-    <w:abstractNumId w:val="0"/>
-    <w:lvlOverride w:ilvl="0">
-      <w:startOverride w:val="1"/>
-    </w:lvlOverride>
-  </w:num>
-  <w:num w:numId="13" w16cid:durableId="1595547817">
-    <w:abstractNumId w:val="0"/>
+  <w:num w:numId="13" w16cid:durableId="627124868">
+    <w:abstractNumId w:val="2"/>
     <w:lvlOverride w:ilvl="0">
       <w:startOverride w:val="1"/>
     </w:lvlOverride>
@@ -9812,7 +9953,7 @@
     <w:autoRedefine/>
     <w:uiPriority w:val="39"/>
     <w:unhideWhenUsed/>
-    <w:rsid w:val="00204C05"/>
+    <w:rsid w:val="00E509E5"/>
     <w:pPr>
       <w:spacing w:after="100"/>
     </w:pPr>
@@ -9824,7 +9965,7 @@
     <w:autoRedefine/>
     <w:uiPriority w:val="39"/>
     <w:unhideWhenUsed/>
-    <w:rsid w:val="00204C05"/>
+    <w:rsid w:val="00E509E5"/>
     <w:pPr>
       <w:spacing w:after="100"/>
       <w:ind w:left="220"/>

</xml_diff>

<commit_message>
Let employees also do other QC checklists (e.g. body techs who reassemble)
- Migration 022: users.extra_departments. Employees -> Edit has "Also does
  these checklists"; the list shows the extras.
- Employee App shows a checklist button for the main department plus each
  extra one on every car; "Other departments" now says tap to view or help out.
- Anyone with a main or extra QC department can fill out QC.
- User manual v1.4.

Co-Authored-By: Claude Opus 5.5 <noreply@anthropic.com>
</commit_message>
<xml_diff>
--- a/client/manual/ShopControl-User-Manual.docx
+++ b/client/manual/ShopControl-User-Manual.docx
@@ -16,7 +16,7 @@
           <w:noProof/>
         </w:rPr>
         <w:drawing>
-          <wp:inline distT="0" distB="0" distL="0" distR="0" wp14:anchorId="3C5ECB34" wp14:editId="3C5ECB35">
+          <wp:inline distT="0" distB="0" distL="0" distR="0" wp14:anchorId="2426B36E" wp14:editId="2426B36F">
             <wp:extent cx="4000500" cy="1485900"/>
             <wp:effectExtent l="0" t="0" r="0" b="0"/>
             <wp:docPr id="1" name="Picture 1"/>
@@ -93,7 +93,7 @@
         <w:rPr>
           <w:color w:val="5B6776"/>
         </w:rPr>
-        <w:t>Version 1.3  ·  Updated September 28, 2026</w:t>
+        <w:t>Version 1.4  ·  Updated September 28, 2026</w:t>
       </w:r>
     </w:p>
     <w:p>
@@ -122,7 +122,7 @@
     <w:sdt>
       <w:sdtPr>
         <w:alias w:val="Contents"/>
-        <w:id w:val="-1816944766"/>
+        <w:id w:val="-861584464"/>
       </w:sdtPr>
       <w:sdtEndPr/>
       <w:sdtContent>
@@ -151,7 +151,7 @@
           <w:r>
             <w:fldChar w:fldCharType="separate"/>
           </w:r>
-          <w:hyperlink w:anchor="_Toc241494507" w:history="1">
+          <w:hyperlink w:anchor="_Toc241508737" w:history="1">
             <w:r>
               <w:rPr>
                 <w:rStyle w:val="Hyperlink"/>
@@ -175,7 +175,7 @@
               <w:rPr>
                 <w:noProof/>
               </w:rPr>
-              <w:instrText xml:space="preserve"> PAGEREF _Toc241494507 \h </w:instrText>
+              <w:instrText xml:space="preserve"> PAGEREF _Toc241508737 \h </w:instrText>
             </w:r>
             <w:r>
               <w:rPr>
@@ -218,7 +218,7 @@
               <w14:ligatures w14:val="standardContextual"/>
             </w:rPr>
           </w:pPr>
-          <w:hyperlink w:anchor="_Toc241494508" w:history="1">
+          <w:hyperlink w:anchor="_Toc241508738" w:history="1">
             <w:r>
               <w:rPr>
                 <w:rStyle w:val="Hyperlink"/>
@@ -242,7 +242,7 @@
               <w:rPr>
                 <w:noProof/>
               </w:rPr>
-              <w:instrText xml:space="preserve"> PAGEREF _Toc241494508 \h </w:instrText>
+              <w:instrText xml:space="preserve"> PAGEREF _Toc241508738 \h </w:instrText>
             </w:r>
             <w:r>
               <w:rPr>
@@ -285,7 +285,7 @@
               <w14:ligatures w14:val="standardContextual"/>
             </w:rPr>
           </w:pPr>
-          <w:hyperlink w:anchor="_Toc241494509" w:history="1">
+          <w:hyperlink w:anchor="_Toc241508739" w:history="1">
             <w:r>
               <w:rPr>
                 <w:rStyle w:val="Hyperlink"/>
@@ -309,7 +309,7 @@
               <w:rPr>
                 <w:noProof/>
               </w:rPr>
-              <w:instrText xml:space="preserve"> PAGEREF _Toc241494509 \h </w:instrText>
+              <w:instrText xml:space="preserve"> PAGEREF _Toc241508739 \h </w:instrText>
             </w:r>
             <w:r>
               <w:rPr>
@@ -352,7 +352,7 @@
               <w14:ligatures w14:val="standardContextual"/>
             </w:rPr>
           </w:pPr>
-          <w:hyperlink w:anchor="_Toc241494510" w:history="1">
+          <w:hyperlink w:anchor="_Toc241508740" w:history="1">
             <w:r>
               <w:rPr>
                 <w:rStyle w:val="Hyperlink"/>
@@ -376,7 +376,7 @@
               <w:rPr>
                 <w:noProof/>
               </w:rPr>
-              <w:instrText xml:space="preserve"> PAGEREF _Toc241494510 \h </w:instrText>
+              <w:instrText xml:space="preserve"> PAGEREF _Toc241508740 \h </w:instrText>
             </w:r>
             <w:r>
               <w:rPr>
@@ -419,7 +419,7 @@
               <w14:ligatures w14:val="standardContextual"/>
             </w:rPr>
           </w:pPr>
-          <w:hyperlink w:anchor="_Toc241494511" w:history="1">
+          <w:hyperlink w:anchor="_Toc241508741" w:history="1">
             <w:r>
               <w:rPr>
                 <w:rStyle w:val="Hyperlink"/>
@@ -443,7 +443,7 @@
               <w:rPr>
                 <w:noProof/>
               </w:rPr>
-              <w:instrText xml:space="preserve"> PAGEREF _Toc241494511 \h </w:instrText>
+              <w:instrText xml:space="preserve"> PAGEREF _Toc241508741 \h </w:instrText>
             </w:r>
             <w:r>
               <w:rPr>
@@ -486,7 +486,7 @@
               <w14:ligatures w14:val="standardContextual"/>
             </w:rPr>
           </w:pPr>
-          <w:hyperlink w:anchor="_Toc241494512" w:history="1">
+          <w:hyperlink w:anchor="_Toc241508742" w:history="1">
             <w:r>
               <w:rPr>
                 <w:rStyle w:val="Hyperlink"/>
@@ -510,7 +510,7 @@
               <w:rPr>
                 <w:noProof/>
               </w:rPr>
-              <w:instrText xml:space="preserve"> PAGEREF _Toc241494512 \h </w:instrText>
+              <w:instrText xml:space="preserve"> PAGEREF _Toc241508742 \h </w:instrText>
             </w:r>
             <w:r>
               <w:rPr>
@@ -553,7 +553,7 @@
               <w14:ligatures w14:val="standardContextual"/>
             </w:rPr>
           </w:pPr>
-          <w:hyperlink w:anchor="_Toc241494513" w:history="1">
+          <w:hyperlink w:anchor="_Toc241508743" w:history="1">
             <w:r>
               <w:rPr>
                 <w:rStyle w:val="Hyperlink"/>
@@ -577,7 +577,7 @@
               <w:rPr>
                 <w:noProof/>
               </w:rPr>
-              <w:instrText xml:space="preserve"> PAGEREF _Toc241494513 \h </w:instrText>
+              <w:instrText xml:space="preserve"> PAGEREF _Toc241508743 \h </w:instrText>
             </w:r>
             <w:r>
               <w:rPr>
@@ -620,7 +620,7 @@
               <w14:ligatures w14:val="standardContextual"/>
             </w:rPr>
           </w:pPr>
-          <w:hyperlink w:anchor="_Toc241494514" w:history="1">
+          <w:hyperlink w:anchor="_Toc241508744" w:history="1">
             <w:r>
               <w:rPr>
                 <w:rStyle w:val="Hyperlink"/>
@@ -644,7 +644,7 @@
               <w:rPr>
                 <w:noProof/>
               </w:rPr>
-              <w:instrText xml:space="preserve"> PAGEREF _Toc241494514 \h </w:instrText>
+              <w:instrText xml:space="preserve"> PAGEREF _Toc241508744 \h </w:instrText>
             </w:r>
             <w:r>
               <w:rPr>
@@ -687,7 +687,7 @@
               <w14:ligatures w14:val="standardContextual"/>
             </w:rPr>
           </w:pPr>
-          <w:hyperlink w:anchor="_Toc241494515" w:history="1">
+          <w:hyperlink w:anchor="_Toc241508745" w:history="1">
             <w:r>
               <w:rPr>
                 <w:rStyle w:val="Hyperlink"/>
@@ -711,7 +711,7 @@
               <w:rPr>
                 <w:noProof/>
               </w:rPr>
-              <w:instrText xml:space="preserve"> PAGEREF _Toc241494515 \h </w:instrText>
+              <w:instrText xml:space="preserve"> PAGEREF _Toc241508745 \h </w:instrText>
             </w:r>
             <w:r>
               <w:rPr>
@@ -754,7 +754,7 @@
               <w14:ligatures w14:val="standardContextual"/>
             </w:rPr>
           </w:pPr>
-          <w:hyperlink w:anchor="_Toc241494516" w:history="1">
+          <w:hyperlink w:anchor="_Toc241508746" w:history="1">
             <w:r>
               <w:rPr>
                 <w:rStyle w:val="Hyperlink"/>
@@ -778,7 +778,7 @@
               <w:rPr>
                 <w:noProof/>
               </w:rPr>
-              <w:instrText xml:space="preserve"> PAGEREF _Toc241494516 \h </w:instrText>
+              <w:instrText xml:space="preserve"> PAGEREF _Toc241508746 \h </w:instrText>
             </w:r>
             <w:r>
               <w:rPr>
@@ -821,7 +821,7 @@
               <w14:ligatures w14:val="standardContextual"/>
             </w:rPr>
           </w:pPr>
-          <w:hyperlink w:anchor="_Toc241494517" w:history="1">
+          <w:hyperlink w:anchor="_Toc241508747" w:history="1">
             <w:r>
               <w:rPr>
                 <w:rStyle w:val="Hyperlink"/>
@@ -845,7 +845,7 @@
               <w:rPr>
                 <w:noProof/>
               </w:rPr>
-              <w:instrText xml:space="preserve"> PAGEREF _Toc241494517 \h </w:instrText>
+              <w:instrText xml:space="preserve"> PAGEREF _Toc241508747 \h </w:instrText>
             </w:r>
             <w:r>
               <w:rPr>
@@ -888,7 +888,7 @@
               <w14:ligatures w14:val="standardContextual"/>
             </w:rPr>
           </w:pPr>
-          <w:hyperlink w:anchor="_Toc241494518" w:history="1">
+          <w:hyperlink w:anchor="_Toc241508748" w:history="1">
             <w:r>
               <w:rPr>
                 <w:rStyle w:val="Hyperlink"/>
@@ -912,7 +912,7 @@
               <w:rPr>
                 <w:noProof/>
               </w:rPr>
-              <w:instrText xml:space="preserve"> PAGEREF _Toc241494518 \h </w:instrText>
+              <w:instrText xml:space="preserve"> PAGEREF _Toc241508748 \h </w:instrText>
             </w:r>
             <w:r>
               <w:rPr>
@@ -929,7 +929,7 @@
               <w:rPr>
                 <w:noProof/>
               </w:rPr>
-              <w:t>6</w:t>
+              <w:t>7</w:t>
             </w:r>
             <w:r>
               <w:rPr>
@@ -955,7 +955,7 @@
               <w14:ligatures w14:val="standardContextual"/>
             </w:rPr>
           </w:pPr>
-          <w:hyperlink w:anchor="_Toc241494519" w:history="1">
+          <w:hyperlink w:anchor="_Toc241508749" w:history="1">
             <w:r>
               <w:rPr>
                 <w:rStyle w:val="Hyperlink"/>
@@ -979,7 +979,7 @@
               <w:rPr>
                 <w:noProof/>
               </w:rPr>
-              <w:instrText xml:space="preserve"> PAGEREF _Toc241494519 \h </w:instrText>
+              <w:instrText xml:space="preserve"> PAGEREF _Toc241508749 \h </w:instrText>
             </w:r>
             <w:r>
               <w:rPr>
@@ -1022,7 +1022,7 @@
               <w14:ligatures w14:val="standardContextual"/>
             </w:rPr>
           </w:pPr>
-          <w:hyperlink w:anchor="_Toc241494520" w:history="1">
+          <w:hyperlink w:anchor="_Toc241508750" w:history="1">
             <w:r>
               <w:rPr>
                 <w:rStyle w:val="Hyperlink"/>
@@ -1046,7 +1046,7 @@
               <w:rPr>
                 <w:noProof/>
               </w:rPr>
-              <w:instrText xml:space="preserve"> PAGEREF _Toc241494520 \h </w:instrText>
+              <w:instrText xml:space="preserve"> PAGEREF _Toc241508750 \h </w:instrText>
             </w:r>
             <w:r>
               <w:rPr>
@@ -1089,7 +1089,7 @@
               <w14:ligatures w14:val="standardContextual"/>
             </w:rPr>
           </w:pPr>
-          <w:hyperlink w:anchor="_Toc241494521" w:history="1">
+          <w:hyperlink w:anchor="_Toc241508751" w:history="1">
             <w:r>
               <w:rPr>
                 <w:rStyle w:val="Hyperlink"/>
@@ -1113,7 +1113,7 @@
               <w:rPr>
                 <w:noProof/>
               </w:rPr>
-              <w:instrText xml:space="preserve"> PAGEREF _Toc241494521 \h </w:instrText>
+              <w:instrText xml:space="preserve"> PAGEREF _Toc241508751 \h </w:instrText>
             </w:r>
             <w:r>
               <w:rPr>
@@ -1156,7 +1156,7 @@
               <w14:ligatures w14:val="standardContextual"/>
             </w:rPr>
           </w:pPr>
-          <w:hyperlink w:anchor="_Toc241494522" w:history="1">
+          <w:hyperlink w:anchor="_Toc241508752" w:history="1">
             <w:r>
               <w:rPr>
                 <w:rStyle w:val="Hyperlink"/>
@@ -1180,7 +1180,7 @@
               <w:rPr>
                 <w:noProof/>
               </w:rPr>
-              <w:instrText xml:space="preserve"> PAGEREF _Toc241494522 \h </w:instrText>
+              <w:instrText xml:space="preserve"> PAGEREF _Toc241508752 \h </w:instrText>
             </w:r>
             <w:r>
               <w:rPr>
@@ -1223,7 +1223,7 @@
               <w14:ligatures w14:val="standardContextual"/>
             </w:rPr>
           </w:pPr>
-          <w:hyperlink w:anchor="_Toc241494523" w:history="1">
+          <w:hyperlink w:anchor="_Toc241508753" w:history="1">
             <w:r>
               <w:rPr>
                 <w:rStyle w:val="Hyperlink"/>
@@ -1247,7 +1247,7 @@
               <w:rPr>
                 <w:noProof/>
               </w:rPr>
-              <w:instrText xml:space="preserve"> PAGEREF _Toc241494523 \h </w:instrText>
+              <w:instrText xml:space="preserve"> PAGEREF _Toc241508753 \h </w:instrText>
             </w:r>
             <w:r>
               <w:rPr>
@@ -1290,7 +1290,7 @@
               <w14:ligatures w14:val="standardContextual"/>
             </w:rPr>
           </w:pPr>
-          <w:hyperlink w:anchor="_Toc241494524" w:history="1">
+          <w:hyperlink w:anchor="_Toc241508754" w:history="1">
             <w:r>
               <w:rPr>
                 <w:rStyle w:val="Hyperlink"/>
@@ -1314,7 +1314,7 @@
               <w:rPr>
                 <w:noProof/>
               </w:rPr>
-              <w:instrText xml:space="preserve"> PAGEREF _Toc241494524 \h </w:instrText>
+              <w:instrText xml:space="preserve"> PAGEREF _Toc241508754 \h </w:instrText>
             </w:r>
             <w:r>
               <w:rPr>
@@ -1357,7 +1357,7 @@
               <w14:ligatures w14:val="standardContextual"/>
             </w:rPr>
           </w:pPr>
-          <w:hyperlink w:anchor="_Toc241494525" w:history="1">
+          <w:hyperlink w:anchor="_Toc241508755" w:history="1">
             <w:r>
               <w:rPr>
                 <w:rStyle w:val="Hyperlink"/>
@@ -1381,7 +1381,7 @@
               <w:rPr>
                 <w:noProof/>
               </w:rPr>
-              <w:instrText xml:space="preserve"> PAGEREF _Toc241494525 \h </w:instrText>
+              <w:instrText xml:space="preserve"> PAGEREF _Toc241508755 \h </w:instrText>
             </w:r>
             <w:r>
               <w:rPr>
@@ -1424,7 +1424,7 @@
               <w14:ligatures w14:val="standardContextual"/>
             </w:rPr>
           </w:pPr>
-          <w:hyperlink w:anchor="_Toc241494526" w:history="1">
+          <w:hyperlink w:anchor="_Toc241508756" w:history="1">
             <w:r>
               <w:rPr>
                 <w:rStyle w:val="Hyperlink"/>
@@ -1448,7 +1448,7 @@
               <w:rPr>
                 <w:noProof/>
               </w:rPr>
-              <w:instrText xml:space="preserve"> PAGEREF _Toc241494526 \h </w:instrText>
+              <w:instrText xml:space="preserve"> PAGEREF _Toc241508756 \h </w:instrText>
             </w:r>
             <w:r>
               <w:rPr>
@@ -1491,7 +1491,7 @@
               <w14:ligatures w14:val="standardContextual"/>
             </w:rPr>
           </w:pPr>
-          <w:hyperlink w:anchor="_Toc241494527" w:history="1">
+          <w:hyperlink w:anchor="_Toc241508757" w:history="1">
             <w:r>
               <w:rPr>
                 <w:rStyle w:val="Hyperlink"/>
@@ -1515,7 +1515,7 @@
               <w:rPr>
                 <w:noProof/>
               </w:rPr>
-              <w:instrText xml:space="preserve"> PAGEREF _Toc241494527 \h </w:instrText>
+              <w:instrText xml:space="preserve"> PAGEREF _Toc241508757 \h </w:instrText>
             </w:r>
             <w:r>
               <w:rPr>
@@ -1558,7 +1558,7 @@
               <w14:ligatures w14:val="standardContextual"/>
             </w:rPr>
           </w:pPr>
-          <w:hyperlink w:anchor="_Toc241494528" w:history="1">
+          <w:hyperlink w:anchor="_Toc241508758" w:history="1">
             <w:r>
               <w:rPr>
                 <w:rStyle w:val="Hyperlink"/>
@@ -1582,7 +1582,7 @@
               <w:rPr>
                 <w:noProof/>
               </w:rPr>
-              <w:instrText xml:space="preserve"> PAGEREF _Toc241494528 \h </w:instrText>
+              <w:instrText xml:space="preserve"> PAGEREF _Toc241508758 \h </w:instrText>
             </w:r>
             <w:r>
               <w:rPr>
@@ -1625,7 +1625,7 @@
               <w14:ligatures w14:val="standardContextual"/>
             </w:rPr>
           </w:pPr>
-          <w:hyperlink w:anchor="_Toc241494529" w:history="1">
+          <w:hyperlink w:anchor="_Toc241508759" w:history="1">
             <w:r>
               <w:rPr>
                 <w:rStyle w:val="Hyperlink"/>
@@ -1649,7 +1649,7 @@
               <w:rPr>
                 <w:noProof/>
               </w:rPr>
-              <w:instrText xml:space="preserve"> PAGEREF _Toc241494529 \h </w:instrText>
+              <w:instrText xml:space="preserve"> PAGEREF _Toc241508759 \h </w:instrText>
             </w:r>
             <w:r>
               <w:rPr>
@@ -1692,7 +1692,7 @@
               <w14:ligatures w14:val="standardContextual"/>
             </w:rPr>
           </w:pPr>
-          <w:hyperlink w:anchor="_Toc241494530" w:history="1">
+          <w:hyperlink w:anchor="_Toc241508760" w:history="1">
             <w:r>
               <w:rPr>
                 <w:rStyle w:val="Hyperlink"/>
@@ -1716,7 +1716,7 @@
               <w:rPr>
                 <w:noProof/>
               </w:rPr>
-              <w:instrText xml:space="preserve"> PAGEREF _Toc241494530 \h </w:instrText>
+              <w:instrText xml:space="preserve"> PAGEREF _Toc241508760 \h </w:instrText>
             </w:r>
             <w:r>
               <w:rPr>
@@ -1759,7 +1759,7 @@
               <w14:ligatures w14:val="standardContextual"/>
             </w:rPr>
           </w:pPr>
-          <w:hyperlink w:anchor="_Toc241494531" w:history="1">
+          <w:hyperlink w:anchor="_Toc241508761" w:history="1">
             <w:r>
               <w:rPr>
                 <w:rStyle w:val="Hyperlink"/>
@@ -1783,7 +1783,7 @@
               <w:rPr>
                 <w:noProof/>
               </w:rPr>
-              <w:instrText xml:space="preserve"> PAGEREF _Toc241494531 \h </w:instrText>
+              <w:instrText xml:space="preserve"> PAGEREF _Toc241508761 \h </w:instrText>
             </w:r>
             <w:r>
               <w:rPr>
@@ -1826,7 +1826,7 @@
               <w14:ligatures w14:val="standardContextual"/>
             </w:rPr>
           </w:pPr>
-          <w:hyperlink w:anchor="_Toc241494532" w:history="1">
+          <w:hyperlink w:anchor="_Toc241508762" w:history="1">
             <w:r>
               <w:rPr>
                 <w:rStyle w:val="Hyperlink"/>
@@ -1850,7 +1850,7 @@
               <w:rPr>
                 <w:noProof/>
               </w:rPr>
-              <w:instrText xml:space="preserve"> PAGEREF _Toc241494532 \h </w:instrText>
+              <w:instrText xml:space="preserve"> PAGEREF _Toc241508762 \h </w:instrText>
             </w:r>
             <w:r>
               <w:rPr>
@@ -1893,7 +1893,7 @@
               <w14:ligatures w14:val="standardContextual"/>
             </w:rPr>
           </w:pPr>
-          <w:hyperlink w:anchor="_Toc241494533" w:history="1">
+          <w:hyperlink w:anchor="_Toc241508763" w:history="1">
             <w:r>
               <w:rPr>
                 <w:rStyle w:val="Hyperlink"/>
@@ -1917,7 +1917,7 @@
               <w:rPr>
                 <w:noProof/>
               </w:rPr>
-              <w:instrText xml:space="preserve"> PAGEREF _Toc241494533 \h </w:instrText>
+              <w:instrText xml:space="preserve"> PAGEREF _Toc241508763 \h </w:instrText>
             </w:r>
             <w:r>
               <w:rPr>
@@ -1960,7 +1960,7 @@
               <w14:ligatures w14:val="standardContextual"/>
             </w:rPr>
           </w:pPr>
-          <w:hyperlink w:anchor="_Toc241494534" w:history="1">
+          <w:hyperlink w:anchor="_Toc241508764" w:history="1">
             <w:r>
               <w:rPr>
                 <w:rStyle w:val="Hyperlink"/>
@@ -1984,7 +1984,7 @@
               <w:rPr>
                 <w:noProof/>
               </w:rPr>
-              <w:instrText xml:space="preserve"> PAGEREF _Toc241494534 \h </w:instrText>
+              <w:instrText xml:space="preserve"> PAGEREF _Toc241508764 \h </w:instrText>
             </w:r>
             <w:r>
               <w:rPr>
@@ -2027,7 +2027,7 @@
               <w14:ligatures w14:val="standardContextual"/>
             </w:rPr>
           </w:pPr>
-          <w:hyperlink w:anchor="_Toc241494535" w:history="1">
+          <w:hyperlink w:anchor="_Toc241508765" w:history="1">
             <w:r>
               <w:rPr>
                 <w:rStyle w:val="Hyperlink"/>
@@ -2051,7 +2051,7 @@
               <w:rPr>
                 <w:noProof/>
               </w:rPr>
-              <w:instrText xml:space="preserve"> PAGEREF _Toc241494535 \h </w:instrText>
+              <w:instrText xml:space="preserve"> PAGEREF _Toc241508765 \h </w:instrText>
             </w:r>
             <w:r>
               <w:rPr>
@@ -2094,7 +2094,7 @@
               <w14:ligatures w14:val="standardContextual"/>
             </w:rPr>
           </w:pPr>
-          <w:hyperlink w:anchor="_Toc241494536" w:history="1">
+          <w:hyperlink w:anchor="_Toc241508766" w:history="1">
             <w:r>
               <w:rPr>
                 <w:rStyle w:val="Hyperlink"/>
@@ -2118,7 +2118,7 @@
               <w:rPr>
                 <w:noProof/>
               </w:rPr>
-              <w:instrText xml:space="preserve"> PAGEREF _Toc241494536 \h </w:instrText>
+              <w:instrText xml:space="preserve"> PAGEREF _Toc241508766 \h </w:instrText>
             </w:r>
             <w:r>
               <w:rPr>
@@ -2161,7 +2161,7 @@
               <w14:ligatures w14:val="standardContextual"/>
             </w:rPr>
           </w:pPr>
-          <w:hyperlink w:anchor="_Toc241494537" w:history="1">
+          <w:hyperlink w:anchor="_Toc241508767" w:history="1">
             <w:r>
               <w:rPr>
                 <w:rStyle w:val="Hyperlink"/>
@@ -2185,7 +2185,7 @@
               <w:rPr>
                 <w:noProof/>
               </w:rPr>
-              <w:instrText xml:space="preserve"> PAGEREF _Toc241494537 \h </w:instrText>
+              <w:instrText xml:space="preserve"> PAGEREF _Toc241508767 \h </w:instrText>
             </w:r>
             <w:r>
               <w:rPr>
@@ -2228,7 +2228,7 @@
               <w14:ligatures w14:val="standardContextual"/>
             </w:rPr>
           </w:pPr>
-          <w:hyperlink w:anchor="_Toc241494538" w:history="1">
+          <w:hyperlink w:anchor="_Toc241508768" w:history="1">
             <w:r>
               <w:rPr>
                 <w:rStyle w:val="Hyperlink"/>
@@ -2252,7 +2252,7 @@
               <w:rPr>
                 <w:noProof/>
               </w:rPr>
-              <w:instrText xml:space="preserve"> PAGEREF _Toc241494538 \h </w:instrText>
+              <w:instrText xml:space="preserve"> PAGEREF _Toc241508768 \h </w:instrText>
             </w:r>
             <w:r>
               <w:rPr>
@@ -2295,7 +2295,7 @@
               <w14:ligatures w14:val="standardContextual"/>
             </w:rPr>
           </w:pPr>
-          <w:hyperlink w:anchor="_Toc241494539" w:history="1">
+          <w:hyperlink w:anchor="_Toc241508769" w:history="1">
             <w:r>
               <w:rPr>
                 <w:rStyle w:val="Hyperlink"/>
@@ -2319,7 +2319,7 @@
               <w:rPr>
                 <w:noProof/>
               </w:rPr>
-              <w:instrText xml:space="preserve"> PAGEREF _Toc241494539 \h </w:instrText>
+              <w:instrText xml:space="preserve"> PAGEREF _Toc241508769 \h </w:instrText>
             </w:r>
             <w:r>
               <w:rPr>
@@ -2362,7 +2362,7 @@
               <w14:ligatures w14:val="standardContextual"/>
             </w:rPr>
           </w:pPr>
-          <w:hyperlink w:anchor="_Toc241494540" w:history="1">
+          <w:hyperlink w:anchor="_Toc241508770" w:history="1">
             <w:r>
               <w:rPr>
                 <w:rStyle w:val="Hyperlink"/>
@@ -2386,7 +2386,7 @@
               <w:rPr>
                 <w:noProof/>
               </w:rPr>
-              <w:instrText xml:space="preserve"> PAGEREF _Toc241494540 \h </w:instrText>
+              <w:instrText xml:space="preserve"> PAGEREF _Toc241508770 \h </w:instrText>
             </w:r>
             <w:r>
               <w:rPr>
@@ -2429,7 +2429,7 @@
               <w14:ligatures w14:val="standardContextual"/>
             </w:rPr>
           </w:pPr>
-          <w:hyperlink w:anchor="_Toc241494541" w:history="1">
+          <w:hyperlink w:anchor="_Toc241508771" w:history="1">
             <w:r>
               <w:rPr>
                 <w:rStyle w:val="Hyperlink"/>
@@ -2453,7 +2453,7 @@
               <w:rPr>
                 <w:noProof/>
               </w:rPr>
-              <w:instrText xml:space="preserve"> PAGEREF _Toc241494541 \h </w:instrText>
+              <w:instrText xml:space="preserve"> PAGEREF _Toc241508771 \h </w:instrText>
             </w:r>
             <w:r>
               <w:rPr>
@@ -2496,7 +2496,7 @@
               <w14:ligatures w14:val="standardContextual"/>
             </w:rPr>
           </w:pPr>
-          <w:hyperlink w:anchor="_Toc241494542" w:history="1">
+          <w:hyperlink w:anchor="_Toc241508772" w:history="1">
             <w:r>
               <w:rPr>
                 <w:rStyle w:val="Hyperlink"/>
@@ -2520,7 +2520,7 @@
               <w:rPr>
                 <w:noProof/>
               </w:rPr>
-              <w:instrText xml:space="preserve"> PAGEREF _Toc241494542 \h </w:instrText>
+              <w:instrText xml:space="preserve"> PAGEREF _Toc241508772 \h </w:instrText>
             </w:r>
             <w:r>
               <w:rPr>
@@ -2563,7 +2563,7 @@
               <w14:ligatures w14:val="standardContextual"/>
             </w:rPr>
           </w:pPr>
-          <w:hyperlink w:anchor="_Toc241494543" w:history="1">
+          <w:hyperlink w:anchor="_Toc241508773" w:history="1">
             <w:r>
               <w:rPr>
                 <w:rStyle w:val="Hyperlink"/>
@@ -2587,7 +2587,7 @@
               <w:rPr>
                 <w:noProof/>
               </w:rPr>
-              <w:instrText xml:space="preserve"> PAGEREF _Toc241494543 \h </w:instrText>
+              <w:instrText xml:space="preserve"> PAGEREF _Toc241508773 \h </w:instrText>
             </w:r>
             <w:r>
               <w:rPr>
@@ -2630,7 +2630,7 @@
               <w14:ligatures w14:val="standardContextual"/>
             </w:rPr>
           </w:pPr>
-          <w:hyperlink w:anchor="_Toc241494544" w:history="1">
+          <w:hyperlink w:anchor="_Toc241508774" w:history="1">
             <w:r>
               <w:rPr>
                 <w:rStyle w:val="Hyperlink"/>
@@ -2654,7 +2654,7 @@
               <w:rPr>
                 <w:noProof/>
               </w:rPr>
-              <w:instrText xml:space="preserve"> PAGEREF _Toc241494544 \h </w:instrText>
+              <w:instrText xml:space="preserve"> PAGEREF _Toc241508774 \h </w:instrText>
             </w:r>
             <w:r>
               <w:rPr>
@@ -2697,7 +2697,7 @@
               <w14:ligatures w14:val="standardContextual"/>
             </w:rPr>
           </w:pPr>
-          <w:hyperlink w:anchor="_Toc241494545" w:history="1">
+          <w:hyperlink w:anchor="_Toc241508775" w:history="1">
             <w:r>
               <w:rPr>
                 <w:rStyle w:val="Hyperlink"/>
@@ -2721,7 +2721,7 @@
               <w:rPr>
                 <w:noProof/>
               </w:rPr>
-              <w:instrText xml:space="preserve"> PAGEREF _Toc241494545 \h </w:instrText>
+              <w:instrText xml:space="preserve"> PAGEREF _Toc241508775 \h </w:instrText>
             </w:r>
             <w:r>
               <w:rPr>
@@ -2764,7 +2764,7 @@
               <w14:ligatures w14:val="standardContextual"/>
             </w:rPr>
           </w:pPr>
-          <w:hyperlink w:anchor="_Toc241494546" w:history="1">
+          <w:hyperlink w:anchor="_Toc241508776" w:history="1">
             <w:r>
               <w:rPr>
                 <w:rStyle w:val="Hyperlink"/>
@@ -2788,7 +2788,7 @@
               <w:rPr>
                 <w:noProof/>
               </w:rPr>
-              <w:instrText xml:space="preserve"> PAGEREF _Toc241494546 \h </w:instrText>
+              <w:instrText xml:space="preserve"> PAGEREF _Toc241508776 \h </w:instrText>
             </w:r>
             <w:r>
               <w:rPr>
@@ -2831,7 +2831,7 @@
               <w14:ligatures w14:val="standardContextual"/>
             </w:rPr>
           </w:pPr>
-          <w:hyperlink w:anchor="_Toc241494547" w:history="1">
+          <w:hyperlink w:anchor="_Toc241508777" w:history="1">
             <w:r>
               <w:rPr>
                 <w:rStyle w:val="Hyperlink"/>
@@ -2855,7 +2855,7 @@
               <w:rPr>
                 <w:noProof/>
               </w:rPr>
-              <w:instrText xml:space="preserve"> PAGEREF _Toc241494547 \h </w:instrText>
+              <w:instrText xml:space="preserve"> PAGEREF _Toc241508777 \h </w:instrText>
             </w:r>
             <w:r>
               <w:rPr>
@@ -2898,7 +2898,7 @@
               <w14:ligatures w14:val="standardContextual"/>
             </w:rPr>
           </w:pPr>
-          <w:hyperlink w:anchor="_Toc241494548" w:history="1">
+          <w:hyperlink w:anchor="_Toc241508778" w:history="1">
             <w:r>
               <w:rPr>
                 <w:rStyle w:val="Hyperlink"/>
@@ -2922,7 +2922,7 @@
               <w:rPr>
                 <w:noProof/>
               </w:rPr>
-              <w:instrText xml:space="preserve"> PAGEREF _Toc241494548 \h </w:instrText>
+              <w:instrText xml:space="preserve"> PAGEREF _Toc241508778 \h </w:instrText>
             </w:r>
             <w:r>
               <w:rPr>
@@ -2965,7 +2965,7 @@
               <w14:ligatures w14:val="standardContextual"/>
             </w:rPr>
           </w:pPr>
-          <w:hyperlink w:anchor="_Toc241494549" w:history="1">
+          <w:hyperlink w:anchor="_Toc241508779" w:history="1">
             <w:r>
               <w:rPr>
                 <w:rStyle w:val="Hyperlink"/>
@@ -2989,7 +2989,7 @@
               <w:rPr>
                 <w:noProof/>
               </w:rPr>
-              <w:instrText xml:space="preserve"> PAGEREF _Toc241494549 \h </w:instrText>
+              <w:instrText xml:space="preserve"> PAGEREF _Toc241508779 \h </w:instrText>
             </w:r>
             <w:r>
               <w:rPr>
@@ -3032,7 +3032,7 @@
               <w14:ligatures w14:val="standardContextual"/>
             </w:rPr>
           </w:pPr>
-          <w:hyperlink w:anchor="_Toc241494550" w:history="1">
+          <w:hyperlink w:anchor="_Toc241508780" w:history="1">
             <w:r>
               <w:rPr>
                 <w:rStyle w:val="Hyperlink"/>
@@ -3056,7 +3056,7 @@
               <w:rPr>
                 <w:noProof/>
               </w:rPr>
-              <w:instrText xml:space="preserve"> PAGEREF _Toc241494550 \h </w:instrText>
+              <w:instrText xml:space="preserve"> PAGEREF _Toc241508780 \h </w:instrText>
             </w:r>
             <w:r>
               <w:rPr>
@@ -3099,7 +3099,7 @@
               <w14:ligatures w14:val="standardContextual"/>
             </w:rPr>
           </w:pPr>
-          <w:hyperlink w:anchor="_Toc241494551" w:history="1">
+          <w:hyperlink w:anchor="_Toc241508781" w:history="1">
             <w:r>
               <w:rPr>
                 <w:rStyle w:val="Hyperlink"/>
@@ -3123,7 +3123,7 @@
               <w:rPr>
                 <w:noProof/>
               </w:rPr>
-              <w:instrText xml:space="preserve"> PAGEREF _Toc241494551 \h </w:instrText>
+              <w:instrText xml:space="preserve"> PAGEREF _Toc241508781 \h </w:instrText>
             </w:r>
             <w:r>
               <w:rPr>
@@ -3166,7 +3166,7 @@
               <w14:ligatures w14:val="standardContextual"/>
             </w:rPr>
           </w:pPr>
-          <w:hyperlink w:anchor="_Toc241494552" w:history="1">
+          <w:hyperlink w:anchor="_Toc241508782" w:history="1">
             <w:r>
               <w:rPr>
                 <w:rStyle w:val="Hyperlink"/>
@@ -3190,7 +3190,7 @@
               <w:rPr>
                 <w:noProof/>
               </w:rPr>
-              <w:instrText xml:space="preserve"> PAGEREF _Toc241494552 \h </w:instrText>
+              <w:instrText xml:space="preserve"> PAGEREF _Toc241508782 \h </w:instrText>
             </w:r>
             <w:r>
               <w:rPr>
@@ -3233,7 +3233,7 @@
               <w14:ligatures w14:val="standardContextual"/>
             </w:rPr>
           </w:pPr>
-          <w:hyperlink w:anchor="_Toc241494553" w:history="1">
+          <w:hyperlink w:anchor="_Toc241508783" w:history="1">
             <w:r>
               <w:rPr>
                 <w:rStyle w:val="Hyperlink"/>
@@ -3257,7 +3257,7 @@
               <w:rPr>
                 <w:noProof/>
               </w:rPr>
-              <w:instrText xml:space="preserve"> PAGEREF _Toc241494553 \h </w:instrText>
+              <w:instrText xml:space="preserve"> PAGEREF _Toc241508783 \h </w:instrText>
             </w:r>
             <w:r>
               <w:rPr>
@@ -3300,7 +3300,7 @@
               <w14:ligatures w14:val="standardContextual"/>
             </w:rPr>
           </w:pPr>
-          <w:hyperlink w:anchor="_Toc241494554" w:history="1">
+          <w:hyperlink w:anchor="_Toc241508784" w:history="1">
             <w:r>
               <w:rPr>
                 <w:rStyle w:val="Hyperlink"/>
@@ -3324,7 +3324,7 @@
               <w:rPr>
                 <w:noProof/>
               </w:rPr>
-              <w:instrText xml:space="preserve"> PAGEREF _Toc241494554 \h </w:instrText>
+              <w:instrText xml:space="preserve"> PAGEREF _Toc241508784 \h </w:instrText>
             </w:r>
             <w:r>
               <w:rPr>
@@ -3367,7 +3367,7 @@
               <w14:ligatures w14:val="standardContextual"/>
             </w:rPr>
           </w:pPr>
-          <w:hyperlink w:anchor="_Toc241494555" w:history="1">
+          <w:hyperlink w:anchor="_Toc241508785" w:history="1">
             <w:r>
               <w:rPr>
                 <w:rStyle w:val="Hyperlink"/>
@@ -3391,7 +3391,7 @@
               <w:rPr>
                 <w:noProof/>
               </w:rPr>
-              <w:instrText xml:space="preserve"> PAGEREF _Toc241494555 \h </w:instrText>
+              <w:instrText xml:space="preserve"> PAGEREF _Toc241508785 \h </w:instrText>
             </w:r>
             <w:r>
               <w:rPr>
@@ -3434,7 +3434,7 @@
               <w14:ligatures w14:val="standardContextual"/>
             </w:rPr>
           </w:pPr>
-          <w:hyperlink w:anchor="_Toc241494556" w:history="1">
+          <w:hyperlink w:anchor="_Toc241508786" w:history="1">
             <w:r>
               <w:rPr>
                 <w:rStyle w:val="Hyperlink"/>
@@ -3458,7 +3458,7 @@
               <w:rPr>
                 <w:noProof/>
               </w:rPr>
-              <w:instrText xml:space="preserve"> PAGEREF _Toc241494556 \h </w:instrText>
+              <w:instrText xml:space="preserve"> PAGEREF _Toc241508786 \h </w:instrText>
             </w:r>
             <w:r>
               <w:rPr>
@@ -3501,7 +3501,7 @@
       <w:pPr>
         <w:pStyle w:val="Heading1"/>
       </w:pPr>
-      <w:bookmarkStart w:id="0" w:name="_Toc241494507"/>
+      <w:bookmarkStart w:id="0" w:name="_Toc241508737"/>
       <w:r>
         <w:t>1.  Getting started</w:t>
       </w:r>
@@ -3529,7 +3529,7 @@
       <w:pPr>
         <w:pStyle w:val="Heading2"/>
       </w:pPr>
-      <w:bookmarkStart w:id="1" w:name="_Toc241494508"/>
+      <w:bookmarkStart w:id="1" w:name="_Toc241508738"/>
       <w:r>
         <w:t>Opening ShopControl</w:t>
       </w:r>
@@ -3609,7 +3609,7 @@
       <w:pPr>
         <w:pStyle w:val="Heading2"/>
       </w:pPr>
-      <w:bookmarkStart w:id="2" w:name="_Toc241494509"/>
+      <w:bookmarkStart w:id="2" w:name="_Toc241508739"/>
       <w:r>
         <w:t>Finding help</w:t>
       </w:r>
@@ -3712,7 +3712,7 @@
       <w:pPr>
         <w:pStyle w:val="Heading2"/>
       </w:pPr>
-      <w:bookmarkStart w:id="3" w:name="_Toc241494510"/>
+      <w:bookmarkStart w:id="3" w:name="_Toc241508740"/>
       <w:r>
         <w:t>Put the app on your phone's home screen</w:t>
       </w:r>
@@ -3880,7 +3880,7 @@
       <w:pPr>
         <w:pStyle w:val="Heading2"/>
       </w:pPr>
-      <w:bookmarkStart w:id="4" w:name="_Toc241494511"/>
+      <w:bookmarkStart w:id="4" w:name="_Toc241508741"/>
       <w:r>
         <w:t>Logging in</w:t>
       </w:r>
@@ -4050,7 +4050,7 @@
       <w:pPr>
         <w:pStyle w:val="Heading2"/>
       </w:pPr>
-      <w:bookmarkStart w:id="5" w:name="_Toc241494512"/>
+      <w:bookmarkStart w:id="5" w:name="_Toc241508742"/>
       <w:r>
         <w:t>Staying up to date</w:t>
       </w:r>
@@ -4078,7 +4078,7 @@
       <w:pPr>
         <w:pStyle w:val="Heading2"/>
       </w:pPr>
-      <w:bookmarkStart w:id="6" w:name="_Toc241494513"/>
+      <w:bookmarkStart w:id="6" w:name="_Toc241508743"/>
       <w:r>
         <w:t>Who can do what</w:t>
       </w:r>
@@ -4691,7 +4691,7 @@
         <w:pStyle w:val="Heading1"/>
         <w:pageBreakBefore/>
       </w:pPr>
-      <w:bookmarkStart w:id="7" w:name="_Toc241494514"/>
+      <w:bookmarkStart w:id="7" w:name="_Toc241508744"/>
       <w:r>
         <w:t>2.  The Employee App (technicians)</w:t>
       </w:r>
@@ -4709,7 +4709,7 @@
       <w:pPr>
         <w:pStyle w:val="Heading2"/>
       </w:pPr>
-      <w:bookmarkStart w:id="8" w:name="_Toc241494515"/>
+      <w:bookmarkStart w:id="8" w:name="_Toc241508745"/>
       <w:r>
         <w:t>Home screen</w:t>
       </w:r>
@@ -4849,7 +4849,7 @@
       <w:pPr>
         <w:pStyle w:val="Heading2"/>
       </w:pPr>
-      <w:bookmarkStart w:id="9" w:name="_Toc241494516"/>
+      <w:bookmarkStart w:id="9" w:name="_Toc241508746"/>
       <w:r>
         <w:t>Doing your QC checklist</w:t>
       </w:r>
@@ -4996,9 +4996,44 @@
     </w:p>
     <w:p>
       <w:pPr>
+        <w:spacing w:after="120"/>
+      </w:pPr>
+      <w:r>
+        <w:rPr>
+          <w:b/>
+          <w:bCs/>
+        </w:rPr>
+        <w:t>Doing more than one department?</w:t>
+      </w:r>
+      <w:r>
+        <w:t xml:space="preserve"> If you also reassemble the cars you work on (or cover another department), the office can add that checklist to your account. It then shows as a second big button under your main one on every car. For example, a body tech sees both </w:t>
+      </w:r>
+      <w:r>
+        <w:rPr>
+          <w:b/>
+          <w:bCs/>
+        </w:rPr>
+        <w:t>Body QC</w:t>
+      </w:r>
+      <w:r>
+        <w:t xml:space="preserve"> and </w:t>
+      </w:r>
+      <w:r>
+        <w:rPr>
+          <w:b/>
+          <w:bCs/>
+        </w:rPr>
+        <w:t>Reassy QC</w:t>
+      </w:r>
+      <w:r>
+        <w:t>.</w:t>
+      </w:r>
+    </w:p>
+    <w:p>
+      <w:pPr>
         <w:pStyle w:val="Heading2"/>
       </w:pPr>
-      <w:bookmarkStart w:id="10" w:name="_Toc241494517"/>
+      <w:bookmarkStart w:id="10" w:name="_Toc241508747"/>
       <w:r>
         <w:t>Signing and rework</w:t>
       </w:r>
@@ -5118,7 +5153,7 @@
       <w:pPr>
         <w:pStyle w:val="Heading2"/>
       </w:pPr>
-      <w:bookmarkStart w:id="11" w:name="_Toc241494518"/>
+      <w:bookmarkStart w:id="11" w:name="_Toc241508748"/>
       <w:r>
         <w:t>Other departments' checklists</w:t>
       </w:r>
@@ -5139,14 +5174,14 @@
         <w:t>Other departments</w:t>
       </w:r>
       <w:r>
-        <w:t xml:space="preserve"> shows each department's progress on that car. Tap one to view or fill it out if you're helping cover that department.</w:t>
+        <w:t xml:space="preserve"> shows each department's progress on that car. Tap one to view it, or to fill it out if you're helping cover that department.</w:t>
       </w:r>
     </w:p>
     <w:p>
       <w:pPr>
         <w:pStyle w:val="Heading2"/>
       </w:pPr>
-      <w:bookmarkStart w:id="12" w:name="_Toc241494519"/>
+      <w:bookmarkStart w:id="12" w:name="_Toc241508749"/>
       <w:r>
         <w:t>Photos and parts</w:t>
       </w:r>
@@ -5217,7 +5252,7 @@
         <w:pStyle w:val="Heading1"/>
         <w:pageBreakBefore/>
       </w:pPr>
-      <w:bookmarkStart w:id="13" w:name="_Toc241494520"/>
+      <w:bookmarkStart w:id="13" w:name="_Toc241508750"/>
       <w:r>
         <w:t>3.  Staff Hub: time off, mailbox and company info</w:t>
       </w:r>
@@ -5245,7 +5280,7 @@
       <w:pPr>
         <w:pStyle w:val="Heading2"/>
       </w:pPr>
-      <w:bookmarkStart w:id="14" w:name="_Toc241494521"/>
+      <w:bookmarkStart w:id="14" w:name="_Toc241508751"/>
       <w:r>
         <w:t>Requesting time off</w:t>
       </w:r>
@@ -5408,7 +5443,7 @@
       <w:pPr>
         <w:pStyle w:val="Heading2"/>
       </w:pPr>
-      <w:bookmarkStart w:id="15" w:name="_Toc241494522"/>
+      <w:bookmarkStart w:id="15" w:name="_Toc241508752"/>
       <w:r>
         <w:t>Checking your requests</w:t>
       </w:r>
@@ -5463,7 +5498,7 @@
       <w:pPr>
         <w:pStyle w:val="Heading2"/>
       </w:pPr>
-      <w:bookmarkStart w:id="16" w:name="_Toc241494523"/>
+      <w:bookmarkStart w:id="16" w:name="_Toc241508753"/>
       <w:r>
         <w:t>Mailbox</w:t>
       </w:r>
@@ -5532,7 +5567,7 @@
       <w:pPr>
         <w:pStyle w:val="Heading2"/>
       </w:pPr>
-      <w:bookmarkStart w:id="17" w:name="_Toc241494524"/>
+      <w:bookmarkStart w:id="17" w:name="_Toc241508754"/>
       <w:r>
         <w:t>Company info and this manual</w:t>
       </w:r>
@@ -5568,7 +5603,7 @@
         <w:pStyle w:val="Heading1"/>
         <w:pageBreakBefore/>
       </w:pPr>
-      <w:bookmarkStart w:id="18" w:name="_Toc241494525"/>
+      <w:bookmarkStart w:id="18" w:name="_Toc241508755"/>
       <w:r>
         <w:t>4.  Dashboard</w:t>
       </w:r>
@@ -5707,7 +5742,7 @@
         <w:pStyle w:val="Heading1"/>
         <w:pageBreakBefore/>
       </w:pPr>
-      <w:bookmarkStart w:id="19" w:name="_Toc241494526"/>
+      <w:bookmarkStart w:id="19" w:name="_Toc241508756"/>
       <w:r>
         <w:t>5.  Jobs and the Daily GO List</w:t>
       </w:r>
@@ -5735,7 +5770,7 @@
       <w:pPr>
         <w:pStyle w:val="Heading2"/>
       </w:pPr>
-      <w:bookmarkStart w:id="20" w:name="_Toc241494527"/>
+      <w:bookmarkStart w:id="20" w:name="_Toc241508757"/>
       <w:r>
         <w:t>RO numbers</w:t>
       </w:r>
@@ -5821,7 +5856,7 @@
       <w:pPr>
         <w:pStyle w:val="Heading2"/>
       </w:pPr>
-      <w:bookmarkStart w:id="21" w:name="_Toc241494528"/>
+      <w:bookmarkStart w:id="21" w:name="_Toc241508758"/>
       <w:r>
         <w:t>Adding or editing a job</w:t>
       </w:r>
@@ -5941,7 +5976,7 @@
       <w:pPr>
         <w:pStyle w:val="Heading2"/>
       </w:pPr>
-      <w:bookmarkStart w:id="22" w:name="_Toc241494529"/>
+      <w:bookmarkStart w:id="22" w:name="_Toc241508759"/>
       <w:r>
         <w:t>Customer updates</w:t>
       </w:r>
@@ -6110,7 +6145,7 @@
         <w:pStyle w:val="Heading1"/>
         <w:pageBreakBefore/>
       </w:pPr>
-      <w:bookmarkStart w:id="23" w:name="_Toc241494530"/>
+      <w:bookmarkStart w:id="23" w:name="_Toc241508760"/>
       <w:r>
         <w:t>6.  Production, Delivery and Planning boards</w:t>
       </w:r>
@@ -6120,7 +6155,7 @@
       <w:pPr>
         <w:pStyle w:val="Heading2"/>
       </w:pPr>
-      <w:bookmarkStart w:id="24" w:name="_Toc241494531"/>
+      <w:bookmarkStart w:id="24" w:name="_Toc241508761"/>
       <w:r>
         <w:t>Production Board</w:t>
       </w:r>
@@ -6248,7 +6283,7 @@
       <w:pPr>
         <w:pStyle w:val="Heading2"/>
       </w:pPr>
-      <w:bookmarkStart w:id="25" w:name="_Toc241494532"/>
+      <w:bookmarkStart w:id="25" w:name="_Toc241508762"/>
       <w:r>
         <w:t>Vehicle pictures</w:t>
       </w:r>
@@ -6306,7 +6341,7 @@
       <w:pPr>
         <w:pStyle w:val="Heading2"/>
       </w:pPr>
-      <w:bookmarkStart w:id="26" w:name="_Toc241494533"/>
+      <w:bookmarkStart w:id="26" w:name="_Toc241508763"/>
       <w:r>
         <w:t>Delivery and Planning boards</w:t>
       </w:r>
@@ -6396,7 +6431,7 @@
       <w:pPr>
         <w:pStyle w:val="Heading2"/>
       </w:pPr>
-      <w:bookmarkStart w:id="27" w:name="_Toc241494534"/>
+      <w:bookmarkStart w:id="27" w:name="_Toc241508764"/>
       <w:r>
         <w:t>TV display</w:t>
       </w:r>
@@ -6425,7 +6460,7 @@
         <w:pStyle w:val="Heading1"/>
         <w:pageBreakBefore/>
       </w:pPr>
-      <w:bookmarkStart w:id="28" w:name="_Toc241494535"/>
+      <w:bookmarkStart w:id="28" w:name="_Toc241508765"/>
       <w:r>
         <w:t>7.  CCC estimates coming into ShopControl</w:t>
       </w:r>
@@ -6534,7 +6569,7 @@
         <w:pStyle w:val="Heading1"/>
         <w:pageBreakBefore/>
       </w:pPr>
-      <w:bookmarkStart w:id="29" w:name="_Toc241494536"/>
+      <w:bookmarkStart w:id="29" w:name="_Toc241508766"/>
       <w:r>
         <w:t>8.  Parts</w:t>
       </w:r>
@@ -6592,7 +6627,7 @@
       <w:pPr>
         <w:pStyle w:val="Heading2"/>
       </w:pPr>
-      <w:bookmarkStart w:id="30" w:name="_Toc241494537"/>
+      <w:bookmarkStart w:id="30" w:name="_Toc241508767"/>
       <w:r>
         <w:t>What counts as a problem</w:t>
       </w:r>
@@ -6660,7 +6695,7 @@
       <w:pPr>
         <w:pStyle w:val="Heading2"/>
       </w:pPr>
-      <w:bookmarkStart w:id="31" w:name="_Toc241494538"/>
+      <w:bookmarkStart w:id="31" w:name="_Toc241508768"/>
       <w:r>
         <w:t>Ordering parts</w:t>
       </w:r>
@@ -6767,7 +6802,7 @@
       <w:pPr>
         <w:pStyle w:val="Heading2"/>
       </w:pPr>
-      <w:bookmarkStart w:id="32" w:name="_Toc241494539"/>
+      <w:bookmarkStart w:id="32" w:name="_Toc241508769"/>
       <w:r>
         <w:t>Mirror matching and carts</w:t>
       </w:r>
@@ -6877,7 +6912,7 @@
       <w:pPr>
         <w:pStyle w:val="Heading2"/>
       </w:pPr>
-      <w:bookmarkStart w:id="33" w:name="_Toc241494540"/>
+      <w:bookmarkStart w:id="33" w:name="_Toc241508770"/>
       <w:r>
         <w:t>Other parts screens</w:t>
       </w:r>
@@ -6968,7 +7003,7 @@
         <w:pStyle w:val="Heading1"/>
         <w:pageBreakBefore/>
       </w:pPr>
-      <w:bookmarkStart w:id="34" w:name="_Toc241494541"/>
+      <w:bookmarkStart w:id="34" w:name="_Toc241508771"/>
       <w:r>
         <w:t>9.  Vehicle QC (office view)</w:t>
       </w:r>
@@ -7035,7 +7070,7 @@
         <w:pStyle w:val="Heading1"/>
         <w:pageBreakBefore/>
       </w:pPr>
-      <w:bookmarkStart w:id="35" w:name="_Toc241494542"/>
+      <w:bookmarkStart w:id="35" w:name="_Toc241508772"/>
       <w:r>
         <w:t>10.  Office tools</w:t>
       </w:r>
@@ -7045,7 +7080,7 @@
       <w:pPr>
         <w:pStyle w:val="Heading2"/>
       </w:pPr>
-      <w:bookmarkStart w:id="36" w:name="_Toc241494543"/>
+      <w:bookmarkStart w:id="36" w:name="_Toc241508773"/>
       <w:r>
         <w:t>Missed Calls / Callback Requests</w:t>
       </w:r>
@@ -7123,7 +7158,7 @@
       <w:pPr>
         <w:pStyle w:val="Heading2"/>
       </w:pPr>
-      <w:bookmarkStart w:id="37" w:name="_Toc241494544"/>
+      <w:bookmarkStart w:id="37" w:name="_Toc241508774"/>
       <w:r>
         <w:t>Tasks</w:t>
       </w:r>
@@ -7141,7 +7176,7 @@
       <w:pPr>
         <w:pStyle w:val="Heading2"/>
       </w:pPr>
-      <w:bookmarkStart w:id="38" w:name="_Toc241494545"/>
+      <w:bookmarkStart w:id="38" w:name="_Toc241508775"/>
       <w:r>
         <w:t>Booth Filters and Facility Checklist</w:t>
       </w:r>
@@ -7179,7 +7214,7 @@
       <w:pPr>
         <w:pStyle w:val="Heading2"/>
       </w:pPr>
-      <w:bookmarkStart w:id="39" w:name="_Toc241494546"/>
+      <w:bookmarkStart w:id="39" w:name="_Toc241508776"/>
       <w:r>
         <w:t>AR Balances and Cycle Time</w:t>
       </w:r>
@@ -7229,7 +7264,7 @@
       <w:pPr>
         <w:pStyle w:val="Heading2"/>
       </w:pPr>
-      <w:bookmarkStart w:id="40" w:name="_Toc241494547"/>
+      <w:bookmarkStart w:id="40" w:name="_Toc241508777"/>
       <w:r>
         <w:t>Photos and Activity Log</w:t>
       </w:r>
@@ -7280,7 +7315,7 @@
         <w:pStyle w:val="Heading1"/>
         <w:pageBreakBefore/>
       </w:pPr>
-      <w:bookmarkStart w:id="41" w:name="_Toc241494548"/>
+      <w:bookmarkStart w:id="41" w:name="_Toc241508778"/>
       <w:r>
         <w:t>11.  Time off and messages (office and admins)</w:t>
       </w:r>
@@ -7290,7 +7325,7 @@
       <w:pPr>
         <w:pStyle w:val="Heading2"/>
       </w:pPr>
-      <w:bookmarkStart w:id="42" w:name="_Toc241494549"/>
+      <w:bookmarkStart w:id="42" w:name="_Toc241508779"/>
       <w:r>
         <w:t>Time Off tab</w:t>
       </w:r>
@@ -7418,7 +7453,7 @@
       <w:pPr>
         <w:pStyle w:val="Heading2"/>
       </w:pPr>
-      <w:bookmarkStart w:id="43" w:name="_Toc241494550"/>
+      <w:bookmarkStart w:id="43" w:name="_Toc241508780"/>
       <w:r>
         <w:t>Messages &amp; Info tab</w:t>
       </w:r>
@@ -7509,7 +7544,7 @@
         <w:pStyle w:val="Heading1"/>
         <w:pageBreakBefore/>
       </w:pPr>
-      <w:bookmarkStart w:id="44" w:name="_Toc241494551"/>
+      <w:bookmarkStart w:id="44" w:name="_Toc241508781"/>
       <w:r>
         <w:t>12.  Admin: employees and settings</w:t>
       </w:r>
@@ -7519,7 +7554,7 @@
       <w:pPr>
         <w:pStyle w:val="Heading2"/>
       </w:pPr>
-      <w:bookmarkStart w:id="45" w:name="_Toc241494552"/>
+      <w:bookmarkStart w:id="45" w:name="_Toc241508782"/>
       <w:r>
         <w:t>Adding an employee</w:t>
       </w:r>
@@ -7641,7 +7676,7 @@
       <w:pPr>
         <w:pStyle w:val="Heading2"/>
       </w:pPr>
-      <w:bookmarkStart w:id="46" w:name="_Toc241494553"/>
+      <w:bookmarkStart w:id="46" w:name="_Toc241508783"/>
       <w:r>
         <w:t>Changing an employee</w:t>
       </w:r>
@@ -7664,7 +7699,37 @@
         <w:t>Edit:</w:t>
       </w:r>
       <w:r>
-        <w:t xml:space="preserve"> change name, email, job title, role and QC department.</w:t>
+        <w:t xml:space="preserve"> change name, email, job title, role and QC department. Use </w:t>
+      </w:r>
+      <w:r>
+        <w:rPr>
+          <w:b/>
+          <w:bCs/>
+        </w:rPr>
+        <w:t>Also does these checklists</w:t>
+      </w:r>
+      <w:r>
+        <w:t xml:space="preserve"> for people who do more than one department (for example a body tech who also reassembles: main department </w:t>
+      </w:r>
+      <w:r>
+        <w:rPr>
+          <w:b/>
+          <w:bCs/>
+        </w:rPr>
+        <w:t>Body</w:t>
+      </w:r>
+      <w:r>
+        <w:t xml:space="preserve">, also does </w:t>
+      </w:r>
+      <w:r>
+        <w:rPr>
+          <w:b/>
+          <w:bCs/>
+        </w:rPr>
+        <w:t>Reassy</w:t>
+      </w:r>
+      <w:r>
+        <w:t>). The list shows the extras under their QC department.</w:t>
       </w:r>
     </w:p>
     <w:p>
@@ -7751,7 +7816,7 @@
       <w:pPr>
         <w:pStyle w:val="Heading2"/>
       </w:pPr>
-      <w:bookmarkStart w:id="47" w:name="_Toc241494554"/>
+      <w:bookmarkStart w:id="47" w:name="_Toc241508784"/>
       <w:r>
         <w:t>Board Settings</w:t>
       </w:r>
@@ -7770,7 +7835,7 @@
         <w:pStyle w:val="Heading1"/>
         <w:pageBreakBefore/>
       </w:pPr>
-      <w:bookmarkStart w:id="48" w:name="_Toc241494555"/>
+      <w:bookmarkStart w:id="48" w:name="_Toc241508785"/>
       <w:r>
         <w:t>13.  Quick answers</w:t>
       </w:r>
@@ -8414,7 +8479,7 @@
         <w:pStyle w:val="Heading1"/>
         <w:pageBreakBefore/>
       </w:pPr>
-      <w:bookmarkStart w:id="49" w:name="_Toc241494556"/>
+      <w:bookmarkStart w:id="49" w:name="_Toc241508786"/>
       <w:r>
         <w:t>Manual versions</w:t>
       </w:r>
@@ -8569,7 +8634,7 @@
                 <w:b/>
                 <w:bCs/>
               </w:rPr>
-              <w:t>1.3</w:t>
+              <w:t>1.4</w:t>
             </w:r>
           </w:p>
         </w:tc>
@@ -8613,7 +8678,17 @@
           </w:tcPr>
           <w:p>
             <w:r>
-              <w:t>New accounts and admin password resets use a temporary password; you choose your own the first time you sign in.</w:t>
+              <w:t xml:space="preserve">Employees can be set to </w:t>
+            </w:r>
+            <w:r>
+              <w:rPr>
+                <w:b/>
+                <w:bCs/>
+              </w:rPr>
+              <w:t>also do</w:t>
+            </w:r>
+            <w:r>
+              <w:t xml:space="preserve"> other checklists (for example a body tech who reassembles also gets the Reassy checklist).</w:t>
             </w:r>
           </w:p>
         </w:tc>
@@ -8650,7 +8725,7 @@
                 <w:b/>
                 <w:bCs/>
               </w:rPr>
-              <w:t>1.2</w:t>
+              <w:t>1.3</w:t>
             </w:r>
           </w:p>
         </w:tc>
@@ -8694,17 +8769,7 @@
           </w:tcPr>
           <w:p>
             <w:r>
-              <w:t xml:space="preserve">Added the </w:t>
-            </w:r>
-            <w:r>
-              <w:rPr>
-                <w:b/>
-                <w:bCs/>
-              </w:rPr>
-              <w:t>Help</w:t>
-            </w:r>
-            <w:r>
-              <w:t xml:space="preserve"> tab in the office program and a search box in the manual.</w:t>
+              <w:t>New accounts and admin password resets use a temporary password; you choose your own the first time you sign in.</w:t>
             </w:r>
           </w:p>
         </w:tc>
@@ -8741,7 +8806,7 @@
                 <w:b/>
                 <w:bCs/>
               </w:rPr>
-              <w:t>1.1</w:t>
+              <w:t>1.2</w:t>
             </w:r>
           </w:p>
         </w:tc>
@@ -8785,17 +8850,17 @@
           </w:tcPr>
           <w:p>
             <w:r>
-              <w:t xml:space="preserve">Employee App address is now </w:t>
+              <w:t xml:space="preserve">Added the </w:t>
             </w:r>
             <w:r>
               <w:rPr>
                 <w:b/>
                 <w:bCs/>
               </w:rPr>
-              <w:t>https://conceptautobody.app</w:t>
-            </w:r>
-            <w:r>
-              <w:t xml:space="preserve"> and works on phones anywhere. Added how to put it on your phone's home screen.</w:t>
+              <w:t>Help</w:t>
+            </w:r>
+            <w:r>
+              <w:t xml:space="preserve"> tab in the office program and a search box in the manual.</w:t>
             </w:r>
           </w:p>
         </w:tc>
@@ -8832,7 +8897,7 @@
                 <w:b/>
                 <w:bCs/>
               </w:rPr>
-              <w:t>1.0</w:t>
+              <w:t>1.1</w:t>
             </w:r>
           </w:p>
         </w:tc>
@@ -8876,6 +8941,97 @@
           </w:tcPr>
           <w:p>
             <w:r>
+              <w:t xml:space="preserve">Employee App address is now </w:t>
+            </w:r>
+            <w:r>
+              <w:rPr>
+                <w:b/>
+                <w:bCs/>
+              </w:rPr>
+              <w:t>https://conceptautobody.app</w:t>
+            </w:r>
+            <w:r>
+              <w:t xml:space="preserve"> and works on phones anywhere. Added how to put it on your phone's home screen.</w:t>
+            </w:r>
+          </w:p>
+        </w:tc>
+      </w:tr>
+      <w:tr>
+        <w:tblPrEx>
+          <w:tblCellMar>
+            <w:top w:w="0" w:type="dxa"/>
+            <w:bottom w:w="0" w:type="dxa"/>
+          </w:tblCellMar>
+        </w:tblPrEx>
+        <w:trPr>
+          <w:cantSplit/>
+        </w:trPr>
+        <w:tc>
+          <w:tcPr>
+            <w:tcW w:w="3120" w:type="dxa"/>
+            <w:tcBorders>
+              <w:top w:val="single" w:sz="4" w:space="0" w:color="C9CFD6"/>
+              <w:left w:val="single" w:sz="4" w:space="0" w:color="C9CFD6"/>
+              <w:bottom w:val="single" w:sz="4" w:space="0" w:color="C9CFD6"/>
+              <w:right w:val="single" w:sz="4" w:space="0" w:color="C9CFD6"/>
+            </w:tcBorders>
+            <w:tcMar>
+              <w:top w:w="80" w:type="dxa"/>
+              <w:left w:w="120" w:type="dxa"/>
+              <w:bottom w:w="80" w:type="dxa"/>
+              <w:right w:w="120" w:type="dxa"/>
+            </w:tcMar>
+          </w:tcPr>
+          <w:p>
+            <w:r>
+              <w:rPr>
+                <w:b/>
+                <w:bCs/>
+              </w:rPr>
+              <w:t>1.0</w:t>
+            </w:r>
+          </w:p>
+        </w:tc>
+        <w:tc>
+          <w:tcPr>
+            <w:tcW w:w="3120" w:type="dxa"/>
+            <w:tcBorders>
+              <w:top w:val="single" w:sz="4" w:space="0" w:color="C9CFD6"/>
+              <w:left w:val="single" w:sz="4" w:space="0" w:color="C9CFD6"/>
+              <w:bottom w:val="single" w:sz="4" w:space="0" w:color="C9CFD6"/>
+              <w:right w:val="single" w:sz="4" w:space="0" w:color="C9CFD6"/>
+            </w:tcBorders>
+            <w:tcMar>
+              <w:top w:w="80" w:type="dxa"/>
+              <w:left w:w="120" w:type="dxa"/>
+              <w:bottom w:w="80" w:type="dxa"/>
+              <w:right w:w="120" w:type="dxa"/>
+            </w:tcMar>
+          </w:tcPr>
+          <w:p>
+            <w:r>
+              <w:t>September 28, 2026</w:t>
+            </w:r>
+          </w:p>
+        </w:tc>
+        <w:tc>
+          <w:tcPr>
+            <w:tcW w:w="3120" w:type="dxa"/>
+            <w:tcBorders>
+              <w:top w:val="single" w:sz="4" w:space="0" w:color="C9CFD6"/>
+              <w:left w:val="single" w:sz="4" w:space="0" w:color="C9CFD6"/>
+              <w:bottom w:val="single" w:sz="4" w:space="0" w:color="C9CFD6"/>
+              <w:right w:val="single" w:sz="4" w:space="0" w:color="C9CFD6"/>
+            </w:tcBorders>
+            <w:tcMar>
+              <w:top w:w="80" w:type="dxa"/>
+              <w:left w:w="120" w:type="dxa"/>
+              <w:bottom w:w="80" w:type="dxa"/>
+              <w:right w:w="120" w:type="dxa"/>
+            </w:tcMar>
+          </w:tcPr>
+          <w:p>
+            <w:r>
               <w:t>First edition.</w:t>
             </w:r>
           </w:p>
@@ -8937,7 +9093,7 @@
         <w:sz w:val="18"/>
         <w:szCs w:val="18"/>
       </w:rPr>
-      <w:t xml:space="preserve">Concept Autobody  ·  Version 1.3  ·  Page </w:t>
+      <w:t xml:space="preserve">Concept Autobody  ·  Version 1.4  ·  Page </w:t>
     </w:r>
     <w:r>
       <w:rPr>
@@ -9030,96 +9186,10 @@
 <file path=word/numbering.xml><?xml version="1.0" encoding="utf-8"?>
 <w:numbering xmlns:wpc="http://schemas.microsoft.com/office/word/2010/wordprocessingCanvas" xmlns:cx="http://schemas.microsoft.com/office/drawing/2014/chartex" xmlns:cx1="http://schemas.microsoft.com/office/drawing/2015/9/8/chartex" xmlns:cx2="http://schemas.microsoft.com/office/drawing/2015/10/21/chartex" xmlns:cx3="http://schemas.microsoft.com/office/drawing/2016/5/9/chartex" xmlns:cx4="http://schemas.microsoft.com/office/drawing/2016/5/10/chartex" xmlns:cx5="http://schemas.microsoft.com/office/drawing/2016/5/11/chartex" xmlns:cx6="http://schemas.microsoft.com/office/drawing/2016/5/12/chartex" xmlns:cx7="http://schemas.microsoft.com/office/drawing/2016/5/13/chartex" xmlns:cx8="http://schemas.microsoft.com/office/drawing/2016/5/14/chartex" xmlns:mc="http://schemas.openxmlformats.org/markup-compatibility/2006" xmlns:aink="http://schemas.microsoft.com/office/drawing/2016/ink" xmlns:am3d="http://schemas.microsoft.com/office/drawing/2017/model3d" xmlns:o="urn:schemas-microsoft-com:office:office" xmlns:oel="http://schemas.microsoft.com/office/2019/extlst" xmlns:r="http://schemas.openxmlformats.org/officeDocument/2006/relationships" xmlns:m="http://schemas.openxmlformats.org/officeDocument/2006/math" xmlns:v="urn:schemas-microsoft-com:vml" xmlns:wp14="http://schemas.microsoft.com/office/word/2010/wordprocessingDrawing" xmlns:wp="http://schemas.openxmlformats.org/drawingml/2006/wordprocessingDrawing" xmlns:w10="urn:schemas-microsoft-com:office:word" xmlns:w="http://schemas.openxmlformats.org/wordprocessingml/2006/main" xmlns:w14="http://schemas.microsoft.com/office/word/2010/wordml" xmlns:w15="http://schemas.microsoft.com/office/word/2012/wordml" xmlns:w16cex="http://schemas.microsoft.com/office/word/2018/wordml/cex" xmlns:w16cid="http://schemas.microsoft.com/office/word/2016/wordml/cid" xmlns:w16="http://schemas.microsoft.com/office/word/2018/wordml" xmlns:w16du="http://schemas.microsoft.com/office/word/2023/wordml/word16du" xmlns:w16sdtdh="http://schemas.microsoft.com/office/word/2020/wordml/sdtdatahash" xmlns:w16sdtfl="http://schemas.microsoft.com/office/word/2024/wordml/sdtformatlock" xmlns:w16se="http://schemas.microsoft.com/office/word/2015/wordml/symex" xmlns:wpg="http://schemas.microsoft.com/office/word/2010/wordprocessingGroup" xmlns:wpi="http://schemas.microsoft.com/office/word/2010/wordprocessingInk" xmlns:wne="http://schemas.microsoft.com/office/word/2006/wordml" xmlns:wps="http://schemas.microsoft.com/office/word/2010/wordprocessingShape" mc:Ignorable="w14 w15 w16se w16cid w16 w16cex w16sdtdh w16sdtfl w16du wp14">
   <w:abstractNum w:abstractNumId="0" w15:restartNumberingAfterBreak="0">
-    <w:nsid w:val="1B7D31E2"/>
+    <w:nsid w:val="1E6138A6"/>
     <w:multiLevelType w:val="hybridMultilevel"/>
-    <w:tmpl w:val="99167B50"/>
-    <w:lvl w:ilvl="0" w:tplc="19869D1E" w:tentative="1">
-      <w:start w:val="1"/>
-      <w:numFmt w:val="bullet"/>
-      <w:lvlText w:val="●"/>
-      <w:lvlJc w:val="left"/>
-      <w:pPr>
-        <w:ind w:left="720" w:hanging="360"/>
-      </w:pPr>
-    </w:lvl>
-    <w:lvl w:ilvl="1" w:tplc="0748ABDE" w:tentative="1">
-      <w:start w:val="1"/>
-      <w:numFmt w:val="bullet"/>
-      <w:lvlText w:val="○"/>
-      <w:lvlJc w:val="left"/>
-      <w:pPr>
-        <w:ind w:left="1440" w:hanging="360"/>
-      </w:pPr>
-    </w:lvl>
-    <w:lvl w:ilvl="2" w:tplc="E02EFF10" w:tentative="1">
-      <w:start w:val="1"/>
-      <w:numFmt w:val="bullet"/>
-      <w:lvlText w:val="■"/>
-      <w:lvlJc w:val="left"/>
-      <w:pPr>
-        <w:ind w:left="2160" w:hanging="360"/>
-      </w:pPr>
-    </w:lvl>
-    <w:lvl w:ilvl="3" w:tplc="AB766598" w:tentative="1">
-      <w:start w:val="1"/>
-      <w:numFmt w:val="bullet"/>
-      <w:lvlText w:val="●"/>
-      <w:lvlJc w:val="left"/>
-      <w:pPr>
-        <w:ind w:left="2880" w:hanging="360"/>
-      </w:pPr>
-    </w:lvl>
-    <w:lvl w:ilvl="4" w:tplc="E31AE9D8" w:tentative="1">
-      <w:start w:val="1"/>
-      <w:numFmt w:val="bullet"/>
-      <w:lvlText w:val="○"/>
-      <w:lvlJc w:val="left"/>
-      <w:pPr>
-        <w:ind w:left="3600" w:hanging="360"/>
-      </w:pPr>
-    </w:lvl>
-    <w:lvl w:ilvl="5" w:tplc="959AA634" w:tentative="1">
-      <w:start w:val="1"/>
-      <w:numFmt w:val="bullet"/>
-      <w:lvlText w:val="■"/>
-      <w:lvlJc w:val="left"/>
-      <w:pPr>
-        <w:ind w:left="4320" w:hanging="360"/>
-      </w:pPr>
-    </w:lvl>
-    <w:lvl w:ilvl="6" w:tplc="A01E25A8" w:tentative="1">
-      <w:start w:val="1"/>
-      <w:numFmt w:val="bullet"/>
-      <w:lvlText w:val="●"/>
-      <w:lvlJc w:val="left"/>
-      <w:pPr>
-        <w:ind w:left="5040" w:hanging="360"/>
-      </w:pPr>
-    </w:lvl>
-    <w:lvl w:ilvl="7" w:tplc="E28E003A" w:tentative="1">
-      <w:start w:val="1"/>
-      <w:numFmt w:val="bullet"/>
-      <w:lvlText w:val="●"/>
-      <w:lvlJc w:val="left"/>
-      <w:pPr>
-        <w:ind w:left="5760" w:hanging="360"/>
-      </w:pPr>
-    </w:lvl>
-    <w:lvl w:ilvl="8" w:tplc="2FF647A2" w:tentative="1">
-      <w:start w:val="1"/>
-      <w:numFmt w:val="bullet"/>
-      <w:lvlText w:val="●"/>
-      <w:lvlJc w:val="left"/>
-      <w:pPr>
-        <w:ind w:left="6480" w:hanging="360"/>
-      </w:pPr>
-    </w:lvl>
-  </w:abstractNum>
-  <w:abstractNum w:abstractNumId="1" w15:restartNumberingAfterBreak="0">
-    <w:nsid w:val="250A21CB"/>
-    <w:multiLevelType w:val="hybridMultilevel"/>
-    <w:tmpl w:val="431270D8"/>
-    <w:lvl w:ilvl="0" w:tplc="74CC0F76">
+    <w:tmpl w:val="F6DE3498"/>
+    <w:lvl w:ilvl="0" w:tplc="2AF427E0">
       <w:start w:val="1"/>
       <w:numFmt w:val="bullet"/>
       <w:lvlText w:val="•"/>
@@ -9128,180 +9198,266 @@
         <w:ind w:left="540" w:hanging="270"/>
       </w:pPr>
     </w:lvl>
-    <w:lvl w:ilvl="1" w:tplc="619E5694">
+    <w:lvl w:ilvl="1" w:tplc="FE7C8DE8">
       <w:numFmt w:val="decimal"/>
       <w:lvlText w:val=""/>
       <w:lvlJc w:val="left"/>
     </w:lvl>
-    <w:lvl w:ilvl="2" w:tplc="C1DCAF06">
+    <w:lvl w:ilvl="2" w:tplc="A2BC7ADE">
       <w:numFmt w:val="decimal"/>
       <w:lvlText w:val=""/>
       <w:lvlJc w:val="left"/>
     </w:lvl>
-    <w:lvl w:ilvl="3" w:tplc="EBB042D2">
+    <w:lvl w:ilvl="3" w:tplc="FA7E421E">
       <w:numFmt w:val="decimal"/>
       <w:lvlText w:val=""/>
       <w:lvlJc w:val="left"/>
     </w:lvl>
-    <w:lvl w:ilvl="4" w:tplc="D5D29BE8">
+    <w:lvl w:ilvl="4" w:tplc="E2CA1856">
       <w:numFmt w:val="decimal"/>
       <w:lvlText w:val=""/>
       <w:lvlJc w:val="left"/>
     </w:lvl>
-    <w:lvl w:ilvl="5" w:tplc="BF7227BC">
+    <w:lvl w:ilvl="5" w:tplc="FB4050C0">
       <w:numFmt w:val="decimal"/>
       <w:lvlText w:val=""/>
       <w:lvlJc w:val="left"/>
     </w:lvl>
-    <w:lvl w:ilvl="6" w:tplc="E536DC3C">
+    <w:lvl w:ilvl="6" w:tplc="30521588">
       <w:numFmt w:val="decimal"/>
       <w:lvlText w:val=""/>
       <w:lvlJc w:val="left"/>
     </w:lvl>
-    <w:lvl w:ilvl="7" w:tplc="987AE552">
+    <w:lvl w:ilvl="7" w:tplc="510ED648">
       <w:numFmt w:val="decimal"/>
       <w:lvlText w:val=""/>
       <w:lvlJc w:val="left"/>
     </w:lvl>
-    <w:lvl w:ilvl="8" w:tplc="27868C5A">
+    <w:lvl w:ilvl="8" w:tplc="1A34A0A4">
+      <w:numFmt w:val="decimal"/>
+      <w:lvlText w:val=""/>
+      <w:lvlJc w:val="left"/>
+    </w:lvl>
+  </w:abstractNum>
+  <w:abstractNum w:abstractNumId="1" w15:restartNumberingAfterBreak="0">
+    <w:nsid w:val="5CA436AA"/>
+    <w:multiLevelType w:val="hybridMultilevel"/>
+    <w:tmpl w:val="86FAC5DC"/>
+    <w:lvl w:ilvl="0" w:tplc="FEDCE750">
+      <w:start w:val="1"/>
+      <w:numFmt w:val="decimal"/>
+      <w:lvlText w:val="%1."/>
+      <w:lvlJc w:val="left"/>
+      <w:pPr>
+        <w:ind w:left="540" w:hanging="360"/>
+      </w:pPr>
+      <w:rPr>
+        <w:b/>
+        <w:bCs/>
+        <w:color w:val="E8620E"/>
+      </w:rPr>
+    </w:lvl>
+    <w:lvl w:ilvl="1" w:tplc="80DC17E4">
+      <w:numFmt w:val="decimal"/>
+      <w:lvlText w:val=""/>
+      <w:lvlJc w:val="left"/>
+    </w:lvl>
+    <w:lvl w:ilvl="2" w:tplc="F4228322">
+      <w:numFmt w:val="decimal"/>
+      <w:lvlText w:val=""/>
+      <w:lvlJc w:val="left"/>
+    </w:lvl>
+    <w:lvl w:ilvl="3" w:tplc="191249F2">
+      <w:numFmt w:val="decimal"/>
+      <w:lvlText w:val=""/>
+      <w:lvlJc w:val="left"/>
+    </w:lvl>
+    <w:lvl w:ilvl="4" w:tplc="4B5EAF9C">
+      <w:numFmt w:val="decimal"/>
+      <w:lvlText w:val=""/>
+      <w:lvlJc w:val="left"/>
+    </w:lvl>
+    <w:lvl w:ilvl="5" w:tplc="816EDA86">
+      <w:numFmt w:val="decimal"/>
+      <w:lvlText w:val=""/>
+      <w:lvlJc w:val="left"/>
+    </w:lvl>
+    <w:lvl w:ilvl="6" w:tplc="EFAE907C">
+      <w:numFmt w:val="decimal"/>
+      <w:lvlText w:val=""/>
+      <w:lvlJc w:val="left"/>
+    </w:lvl>
+    <w:lvl w:ilvl="7" w:tplc="577E0F56">
+      <w:numFmt w:val="decimal"/>
+      <w:lvlText w:val=""/>
+      <w:lvlJc w:val="left"/>
+    </w:lvl>
+    <w:lvl w:ilvl="8" w:tplc="D4D6BB44">
       <w:numFmt w:val="decimal"/>
       <w:lvlText w:val=""/>
       <w:lvlJc w:val="left"/>
     </w:lvl>
   </w:abstractNum>
   <w:abstractNum w:abstractNumId="2" w15:restartNumberingAfterBreak="0">
-    <w:nsid w:val="32791082"/>
+    <w:nsid w:val="7B930AD5"/>
     <w:multiLevelType w:val="hybridMultilevel"/>
-    <w:tmpl w:val="FC5E4690"/>
-    <w:lvl w:ilvl="0" w:tplc="88303A2C">
+    <w:tmpl w:val="FD80DBC8"/>
+    <w:lvl w:ilvl="0" w:tplc="041630FA" w:tentative="1">
       <w:start w:val="1"/>
-      <w:numFmt w:val="decimal"/>
-      <w:lvlText w:val="%1."/>
+      <w:numFmt w:val="bullet"/>
+      <w:lvlText w:val="●"/>
       <w:lvlJc w:val="left"/>
       <w:pPr>
-        <w:ind w:left="540" w:hanging="360"/>
-      </w:pPr>
-      <w:rPr>
-        <w:b/>
-        <w:bCs/>
-        <w:color w:val="E8620E"/>
-      </w:rPr>
+        <w:ind w:left="720" w:hanging="360"/>
+      </w:pPr>
     </w:lvl>
-    <w:lvl w:ilvl="1" w:tplc="0C44F36E">
-      <w:numFmt w:val="decimal"/>
-      <w:lvlText w:val=""/>
+    <w:lvl w:ilvl="1" w:tplc="6054E7AA" w:tentative="1">
+      <w:start w:val="1"/>
+      <w:numFmt w:val="bullet"/>
+      <w:lvlText w:val="○"/>
       <w:lvlJc w:val="left"/>
+      <w:pPr>
+        <w:ind w:left="1440" w:hanging="360"/>
+      </w:pPr>
     </w:lvl>
-    <w:lvl w:ilvl="2" w:tplc="5A248394">
-      <w:numFmt w:val="decimal"/>
-      <w:lvlText w:val=""/>
+    <w:lvl w:ilvl="2" w:tplc="1682DFF0" w:tentative="1">
+      <w:start w:val="1"/>
+      <w:numFmt w:val="bullet"/>
+      <w:lvlText w:val="■"/>
       <w:lvlJc w:val="left"/>
+      <w:pPr>
+        <w:ind w:left="2160" w:hanging="360"/>
+      </w:pPr>
     </w:lvl>
-    <w:lvl w:ilvl="3" w:tplc="54BE7EBC">
-      <w:numFmt w:val="decimal"/>
-      <w:lvlText w:val=""/>
+    <w:lvl w:ilvl="3" w:tplc="8BB6414A" w:tentative="1">
+      <w:start w:val="1"/>
+      <w:numFmt w:val="bullet"/>
+      <w:lvlText w:val="●"/>
       <w:lvlJc w:val="left"/>
+      <w:pPr>
+        <w:ind w:left="2880" w:hanging="360"/>
+      </w:pPr>
     </w:lvl>
-    <w:lvl w:ilvl="4" w:tplc="83721300">
-      <w:numFmt w:val="decimal"/>
-      <w:lvlText w:val=""/>
+    <w:lvl w:ilvl="4" w:tplc="15547BDE" w:tentative="1">
+      <w:start w:val="1"/>
+      <w:numFmt w:val="bullet"/>
+      <w:lvlText w:val="○"/>
       <w:lvlJc w:val="left"/>
+      <w:pPr>
+        <w:ind w:left="3600" w:hanging="360"/>
+      </w:pPr>
     </w:lvl>
-    <w:lvl w:ilvl="5" w:tplc="4ECA1BC2">
-      <w:numFmt w:val="decimal"/>
-      <w:lvlText w:val=""/>
+    <w:lvl w:ilvl="5" w:tplc="7DC45EC4" w:tentative="1">
+      <w:start w:val="1"/>
+      <w:numFmt w:val="bullet"/>
+      <w:lvlText w:val="■"/>
       <w:lvlJc w:val="left"/>
+      <w:pPr>
+        <w:ind w:left="4320" w:hanging="360"/>
+      </w:pPr>
     </w:lvl>
-    <w:lvl w:ilvl="6" w:tplc="29BEDA72">
-      <w:numFmt w:val="decimal"/>
-      <w:lvlText w:val=""/>
+    <w:lvl w:ilvl="6" w:tplc="DEEA5C28" w:tentative="1">
+      <w:start w:val="1"/>
+      <w:numFmt w:val="bullet"/>
+      <w:lvlText w:val="●"/>
       <w:lvlJc w:val="left"/>
+      <w:pPr>
+        <w:ind w:left="5040" w:hanging="360"/>
+      </w:pPr>
     </w:lvl>
-    <w:lvl w:ilvl="7" w:tplc="EE08709A">
-      <w:numFmt w:val="decimal"/>
-      <w:lvlText w:val=""/>
+    <w:lvl w:ilvl="7" w:tplc="F9166FFC" w:tentative="1">
+      <w:start w:val="1"/>
+      <w:numFmt w:val="bullet"/>
+      <w:lvlText w:val="●"/>
       <w:lvlJc w:val="left"/>
+      <w:pPr>
+        <w:ind w:left="5760" w:hanging="360"/>
+      </w:pPr>
     </w:lvl>
-    <w:lvl w:ilvl="8" w:tplc="2E1C5B20">
-      <w:numFmt w:val="decimal"/>
-      <w:lvlText w:val=""/>
+    <w:lvl w:ilvl="8" w:tplc="938E4B94" w:tentative="1">
+      <w:start w:val="1"/>
+      <w:numFmt w:val="bullet"/>
+      <w:lvlText w:val="●"/>
       <w:lvlJc w:val="left"/>
+      <w:pPr>
+        <w:ind w:left="6480" w:hanging="360"/>
+      </w:pPr>
     </w:lvl>
   </w:abstractNum>
-  <w:num w:numId="1" w16cid:durableId="1019044793">
+  <w:num w:numId="1" w16cid:durableId="13456565">
+    <w:abstractNumId w:val="2"/>
+    <w:lvlOverride w:ilvl="0">
+      <w:startOverride w:val="1"/>
+    </w:lvlOverride>
+  </w:num>
+  <w:num w:numId="2" w16cid:durableId="821116427">
     <w:abstractNumId w:val="0"/>
     <w:lvlOverride w:ilvl="0">
       <w:startOverride w:val="1"/>
     </w:lvlOverride>
   </w:num>
-  <w:num w:numId="2" w16cid:durableId="134572811">
+  <w:num w:numId="3" w16cid:durableId="972758376">
     <w:abstractNumId w:val="1"/>
     <w:lvlOverride w:ilvl="0">
       <w:startOverride w:val="1"/>
     </w:lvlOverride>
   </w:num>
-  <w:num w:numId="3" w16cid:durableId="62072515">
-    <w:abstractNumId w:val="2"/>
+  <w:num w:numId="4" w16cid:durableId="284970297">
+    <w:abstractNumId w:val="1"/>
     <w:lvlOverride w:ilvl="0">
       <w:startOverride w:val="1"/>
     </w:lvlOverride>
   </w:num>
-  <w:num w:numId="4" w16cid:durableId="1361979285">
-    <w:abstractNumId w:val="2"/>
+  <w:num w:numId="5" w16cid:durableId="700864090">
+    <w:abstractNumId w:val="1"/>
     <w:lvlOverride w:ilvl="0">
       <w:startOverride w:val="1"/>
     </w:lvlOverride>
   </w:num>
-  <w:num w:numId="5" w16cid:durableId="90667035">
-    <w:abstractNumId w:val="2"/>
+  <w:num w:numId="6" w16cid:durableId="438380939">
+    <w:abstractNumId w:val="1"/>
     <w:lvlOverride w:ilvl="0">
       <w:startOverride w:val="1"/>
     </w:lvlOverride>
   </w:num>
-  <w:num w:numId="6" w16cid:durableId="330376907">
-    <w:abstractNumId w:val="2"/>
+  <w:num w:numId="7" w16cid:durableId="165874254">
+    <w:abstractNumId w:val="1"/>
     <w:lvlOverride w:ilvl="0">
       <w:startOverride w:val="1"/>
     </w:lvlOverride>
   </w:num>
-  <w:num w:numId="7" w16cid:durableId="894044090">
-    <w:abstractNumId w:val="2"/>
+  <w:num w:numId="8" w16cid:durableId="1431469985">
+    <w:abstractNumId w:val="1"/>
     <w:lvlOverride w:ilvl="0">
       <w:startOverride w:val="1"/>
     </w:lvlOverride>
   </w:num>
-  <w:num w:numId="8" w16cid:durableId="774058205">
-    <w:abstractNumId w:val="2"/>
+  <w:num w:numId="9" w16cid:durableId="165363839">
+    <w:abstractNumId w:val="1"/>
     <w:lvlOverride w:ilvl="0">
       <w:startOverride w:val="1"/>
     </w:lvlOverride>
   </w:num>
-  <w:num w:numId="9" w16cid:durableId="893270649">
-    <w:abstractNumId w:val="2"/>
+  <w:num w:numId="10" w16cid:durableId="998997129">
+    <w:abstractNumId w:val="1"/>
     <w:lvlOverride w:ilvl="0">
       <w:startOverride w:val="1"/>
     </w:lvlOverride>
   </w:num>
-  <w:num w:numId="10" w16cid:durableId="1416198176">
-    <w:abstractNumId w:val="2"/>
+  <w:num w:numId="11" w16cid:durableId="2063937474">
+    <w:abstractNumId w:val="1"/>
     <w:lvlOverride w:ilvl="0">
       <w:startOverride w:val="1"/>
     </w:lvlOverride>
   </w:num>
-  <w:num w:numId="11" w16cid:durableId="1791242058">
-    <w:abstractNumId w:val="2"/>
+  <w:num w:numId="12" w16cid:durableId="1778597816">
+    <w:abstractNumId w:val="1"/>
     <w:lvlOverride w:ilvl="0">
       <w:startOverride w:val="1"/>
     </w:lvlOverride>
   </w:num>
-  <w:num w:numId="12" w16cid:durableId="149711558">
-    <w:abstractNumId w:val="2"/>
-    <w:lvlOverride w:ilvl="0">
-      <w:startOverride w:val="1"/>
-    </w:lvlOverride>
-  </w:num>
-  <w:num w:numId="13" w16cid:durableId="627124868">
-    <w:abstractNumId w:val="2"/>
+  <w:num w:numId="13" w16cid:durableId="1986812975">
+    <w:abstractNumId w:val="1"/>
     <w:lvlOverride w:ilvl="0">
       <w:startOverride w:val="1"/>
     </w:lvlOverride>
@@ -9953,7 +10109,7 @@
     <w:autoRedefine/>
     <w:uiPriority w:val="39"/>
     <w:unhideWhenUsed/>
-    <w:rsid w:val="00E509E5"/>
+    <w:rsid w:val="00343307"/>
     <w:pPr>
       <w:spacing w:after="100"/>
     </w:pPr>
@@ -9965,7 +10121,7 @@
     <w:autoRedefine/>
     <w:uiPriority w:val="39"/>
     <w:unhideWhenUsed/>
-    <w:rsid w:val="00E509E5"/>
+    <w:rsid w:val="00343307"/>
     <w:pPr>
       <w:spacing w:after="100"/>
       <w:ind w:left="220"/>

</xml_diff>

<commit_message>
Body techs automatically get the Reassy checklist
Body technicians reassemble the cars they work on, so the Body QC department
now always includes Reassy (qcChecklists.js alsoDoes / departmentsFor). The
Employee App shows both buttons for anyone set to Body; extras set on an
account still add more. User manual v1.5.

Co-Authored-By: Claude Opus 5.5 <noreply@anthropic.com>
</commit_message>
<xml_diff>
--- a/client/manual/ShopControl-User-Manual.docx
+++ b/client/manual/ShopControl-User-Manual.docx
@@ -16,7 +16,7 @@
           <w:noProof/>
         </w:rPr>
         <w:drawing>
-          <wp:inline distT="0" distB="0" distL="0" distR="0" wp14:anchorId="2426B36E" wp14:editId="2426B36F">
+          <wp:inline distT="0" distB="0" distL="0" distR="0" wp14:anchorId="5A0CF00D" wp14:editId="5A0CF00E">
             <wp:extent cx="4000500" cy="1485900"/>
             <wp:effectExtent l="0" t="0" r="0" b="0"/>
             <wp:docPr id="1" name="Picture 1"/>
@@ -93,7 +93,7 @@
         <w:rPr>
           <w:color w:val="5B6776"/>
         </w:rPr>
-        <w:t>Version 1.4  ·  Updated September 28, 2026</w:t>
+        <w:t>Version 1.5  ·  Updated September 28, 2026</w:t>
       </w:r>
     </w:p>
     <w:p>
@@ -122,7 +122,7 @@
     <w:sdt>
       <w:sdtPr>
         <w:alias w:val="Contents"/>
-        <w:id w:val="-861584464"/>
+        <w:id w:val="-801851058"/>
       </w:sdtPr>
       <w:sdtEndPr/>
       <w:sdtContent>
@@ -151,7 +151,7 @@
           <w:r>
             <w:fldChar w:fldCharType="separate"/>
           </w:r>
-          <w:hyperlink w:anchor="_Toc241508737" w:history="1">
+          <w:hyperlink w:anchor="_Toc241508881" w:history="1">
             <w:r>
               <w:rPr>
                 <w:rStyle w:val="Hyperlink"/>
@@ -175,7 +175,7 @@
               <w:rPr>
                 <w:noProof/>
               </w:rPr>
-              <w:instrText xml:space="preserve"> PAGEREF _Toc241508737 \h </w:instrText>
+              <w:instrText xml:space="preserve"> PAGEREF _Toc241508881 \h </w:instrText>
             </w:r>
             <w:r>
               <w:rPr>
@@ -218,7 +218,7 @@
               <w14:ligatures w14:val="standardContextual"/>
             </w:rPr>
           </w:pPr>
-          <w:hyperlink w:anchor="_Toc241508738" w:history="1">
+          <w:hyperlink w:anchor="_Toc241508882" w:history="1">
             <w:r>
               <w:rPr>
                 <w:rStyle w:val="Hyperlink"/>
@@ -242,7 +242,7 @@
               <w:rPr>
                 <w:noProof/>
               </w:rPr>
-              <w:instrText xml:space="preserve"> PAGEREF _Toc241508738 \h </w:instrText>
+              <w:instrText xml:space="preserve"> PAGEREF _Toc241508882 \h </w:instrText>
             </w:r>
             <w:r>
               <w:rPr>
@@ -285,7 +285,7 @@
               <w14:ligatures w14:val="standardContextual"/>
             </w:rPr>
           </w:pPr>
-          <w:hyperlink w:anchor="_Toc241508739" w:history="1">
+          <w:hyperlink w:anchor="_Toc241508883" w:history="1">
             <w:r>
               <w:rPr>
                 <w:rStyle w:val="Hyperlink"/>
@@ -309,7 +309,7 @@
               <w:rPr>
                 <w:noProof/>
               </w:rPr>
-              <w:instrText xml:space="preserve"> PAGEREF _Toc241508739 \h </w:instrText>
+              <w:instrText xml:space="preserve"> PAGEREF _Toc241508883 \h </w:instrText>
             </w:r>
             <w:r>
               <w:rPr>
@@ -352,7 +352,7 @@
               <w14:ligatures w14:val="standardContextual"/>
             </w:rPr>
           </w:pPr>
-          <w:hyperlink w:anchor="_Toc241508740" w:history="1">
+          <w:hyperlink w:anchor="_Toc241508884" w:history="1">
             <w:r>
               <w:rPr>
                 <w:rStyle w:val="Hyperlink"/>
@@ -376,7 +376,7 @@
               <w:rPr>
                 <w:noProof/>
               </w:rPr>
-              <w:instrText xml:space="preserve"> PAGEREF _Toc241508740 \h </w:instrText>
+              <w:instrText xml:space="preserve"> PAGEREF _Toc241508884 \h </w:instrText>
             </w:r>
             <w:r>
               <w:rPr>
@@ -419,7 +419,7 @@
               <w14:ligatures w14:val="standardContextual"/>
             </w:rPr>
           </w:pPr>
-          <w:hyperlink w:anchor="_Toc241508741" w:history="1">
+          <w:hyperlink w:anchor="_Toc241508885" w:history="1">
             <w:r>
               <w:rPr>
                 <w:rStyle w:val="Hyperlink"/>
@@ -443,7 +443,7 @@
               <w:rPr>
                 <w:noProof/>
               </w:rPr>
-              <w:instrText xml:space="preserve"> PAGEREF _Toc241508741 \h </w:instrText>
+              <w:instrText xml:space="preserve"> PAGEREF _Toc241508885 \h </w:instrText>
             </w:r>
             <w:r>
               <w:rPr>
@@ -486,7 +486,7 @@
               <w14:ligatures w14:val="standardContextual"/>
             </w:rPr>
           </w:pPr>
-          <w:hyperlink w:anchor="_Toc241508742" w:history="1">
+          <w:hyperlink w:anchor="_Toc241508886" w:history="1">
             <w:r>
               <w:rPr>
                 <w:rStyle w:val="Hyperlink"/>
@@ -510,7 +510,7 @@
               <w:rPr>
                 <w:noProof/>
               </w:rPr>
-              <w:instrText xml:space="preserve"> PAGEREF _Toc241508742 \h </w:instrText>
+              <w:instrText xml:space="preserve"> PAGEREF _Toc241508886 \h </w:instrText>
             </w:r>
             <w:r>
               <w:rPr>
@@ -553,7 +553,7 @@
               <w14:ligatures w14:val="standardContextual"/>
             </w:rPr>
           </w:pPr>
-          <w:hyperlink w:anchor="_Toc241508743" w:history="1">
+          <w:hyperlink w:anchor="_Toc241508887" w:history="1">
             <w:r>
               <w:rPr>
                 <w:rStyle w:val="Hyperlink"/>
@@ -577,7 +577,7 @@
               <w:rPr>
                 <w:noProof/>
               </w:rPr>
-              <w:instrText xml:space="preserve"> PAGEREF _Toc241508743 \h </w:instrText>
+              <w:instrText xml:space="preserve"> PAGEREF _Toc241508887 \h </w:instrText>
             </w:r>
             <w:r>
               <w:rPr>
@@ -620,7 +620,7 @@
               <w14:ligatures w14:val="standardContextual"/>
             </w:rPr>
           </w:pPr>
-          <w:hyperlink w:anchor="_Toc241508744" w:history="1">
+          <w:hyperlink w:anchor="_Toc241508888" w:history="1">
             <w:r>
               <w:rPr>
                 <w:rStyle w:val="Hyperlink"/>
@@ -644,7 +644,7 @@
               <w:rPr>
                 <w:noProof/>
               </w:rPr>
-              <w:instrText xml:space="preserve"> PAGEREF _Toc241508744 \h </w:instrText>
+              <w:instrText xml:space="preserve"> PAGEREF _Toc241508888 \h </w:instrText>
             </w:r>
             <w:r>
               <w:rPr>
@@ -687,7 +687,7 @@
               <w14:ligatures w14:val="standardContextual"/>
             </w:rPr>
           </w:pPr>
-          <w:hyperlink w:anchor="_Toc241508745" w:history="1">
+          <w:hyperlink w:anchor="_Toc241508889" w:history="1">
             <w:r>
               <w:rPr>
                 <w:rStyle w:val="Hyperlink"/>
@@ -711,7 +711,7 @@
               <w:rPr>
                 <w:noProof/>
               </w:rPr>
-              <w:instrText xml:space="preserve"> PAGEREF _Toc241508745 \h </w:instrText>
+              <w:instrText xml:space="preserve"> PAGEREF _Toc241508889 \h </w:instrText>
             </w:r>
             <w:r>
               <w:rPr>
@@ -754,7 +754,7 @@
               <w14:ligatures w14:val="standardContextual"/>
             </w:rPr>
           </w:pPr>
-          <w:hyperlink w:anchor="_Toc241508746" w:history="1">
+          <w:hyperlink w:anchor="_Toc241508890" w:history="1">
             <w:r>
               <w:rPr>
                 <w:rStyle w:val="Hyperlink"/>
@@ -778,7 +778,7 @@
               <w:rPr>
                 <w:noProof/>
               </w:rPr>
-              <w:instrText xml:space="preserve"> PAGEREF _Toc241508746 \h </w:instrText>
+              <w:instrText xml:space="preserve"> PAGEREF _Toc241508890 \h </w:instrText>
             </w:r>
             <w:r>
               <w:rPr>
@@ -821,7 +821,7 @@
               <w14:ligatures w14:val="standardContextual"/>
             </w:rPr>
           </w:pPr>
-          <w:hyperlink w:anchor="_Toc241508747" w:history="1">
+          <w:hyperlink w:anchor="_Toc241508891" w:history="1">
             <w:r>
               <w:rPr>
                 <w:rStyle w:val="Hyperlink"/>
@@ -845,7 +845,7 @@
               <w:rPr>
                 <w:noProof/>
               </w:rPr>
-              <w:instrText xml:space="preserve"> PAGEREF _Toc241508747 \h </w:instrText>
+              <w:instrText xml:space="preserve"> PAGEREF _Toc241508891 \h </w:instrText>
             </w:r>
             <w:r>
               <w:rPr>
@@ -888,7 +888,7 @@
               <w14:ligatures w14:val="standardContextual"/>
             </w:rPr>
           </w:pPr>
-          <w:hyperlink w:anchor="_Toc241508748" w:history="1">
+          <w:hyperlink w:anchor="_Toc241508892" w:history="1">
             <w:r>
               <w:rPr>
                 <w:rStyle w:val="Hyperlink"/>
@@ -912,7 +912,7 @@
               <w:rPr>
                 <w:noProof/>
               </w:rPr>
-              <w:instrText xml:space="preserve"> PAGEREF _Toc241508748 \h </w:instrText>
+              <w:instrText xml:space="preserve"> PAGEREF _Toc241508892 \h </w:instrText>
             </w:r>
             <w:r>
               <w:rPr>
@@ -955,7 +955,7 @@
               <w14:ligatures w14:val="standardContextual"/>
             </w:rPr>
           </w:pPr>
-          <w:hyperlink w:anchor="_Toc241508749" w:history="1">
+          <w:hyperlink w:anchor="_Toc241508893" w:history="1">
             <w:r>
               <w:rPr>
                 <w:rStyle w:val="Hyperlink"/>
@@ -979,7 +979,7 @@
               <w:rPr>
                 <w:noProof/>
               </w:rPr>
-              <w:instrText xml:space="preserve"> PAGEREF _Toc241508749 \h </w:instrText>
+              <w:instrText xml:space="preserve"> PAGEREF _Toc241508893 \h </w:instrText>
             </w:r>
             <w:r>
               <w:rPr>
@@ -1022,7 +1022,7 @@
               <w14:ligatures w14:val="standardContextual"/>
             </w:rPr>
           </w:pPr>
-          <w:hyperlink w:anchor="_Toc241508750" w:history="1">
+          <w:hyperlink w:anchor="_Toc241508894" w:history="1">
             <w:r>
               <w:rPr>
                 <w:rStyle w:val="Hyperlink"/>
@@ -1046,7 +1046,7 @@
               <w:rPr>
                 <w:noProof/>
               </w:rPr>
-              <w:instrText xml:space="preserve"> PAGEREF _Toc241508750 \h </w:instrText>
+              <w:instrText xml:space="preserve"> PAGEREF _Toc241508894 \h </w:instrText>
             </w:r>
             <w:r>
               <w:rPr>
@@ -1089,7 +1089,7 @@
               <w14:ligatures w14:val="standardContextual"/>
             </w:rPr>
           </w:pPr>
-          <w:hyperlink w:anchor="_Toc241508751" w:history="1">
+          <w:hyperlink w:anchor="_Toc241508895" w:history="1">
             <w:r>
               <w:rPr>
                 <w:rStyle w:val="Hyperlink"/>
@@ -1113,7 +1113,7 @@
               <w:rPr>
                 <w:noProof/>
               </w:rPr>
-              <w:instrText xml:space="preserve"> PAGEREF _Toc241508751 \h </w:instrText>
+              <w:instrText xml:space="preserve"> PAGEREF _Toc241508895 \h </w:instrText>
             </w:r>
             <w:r>
               <w:rPr>
@@ -1156,7 +1156,7 @@
               <w14:ligatures w14:val="standardContextual"/>
             </w:rPr>
           </w:pPr>
-          <w:hyperlink w:anchor="_Toc241508752" w:history="1">
+          <w:hyperlink w:anchor="_Toc241508896" w:history="1">
             <w:r>
               <w:rPr>
                 <w:rStyle w:val="Hyperlink"/>
@@ -1180,7 +1180,7 @@
               <w:rPr>
                 <w:noProof/>
               </w:rPr>
-              <w:instrText xml:space="preserve"> PAGEREF _Toc241508752 \h </w:instrText>
+              <w:instrText xml:space="preserve"> PAGEREF _Toc241508896 \h </w:instrText>
             </w:r>
             <w:r>
               <w:rPr>
@@ -1223,7 +1223,7 @@
               <w14:ligatures w14:val="standardContextual"/>
             </w:rPr>
           </w:pPr>
-          <w:hyperlink w:anchor="_Toc241508753" w:history="1">
+          <w:hyperlink w:anchor="_Toc241508897" w:history="1">
             <w:r>
               <w:rPr>
                 <w:rStyle w:val="Hyperlink"/>
@@ -1247,7 +1247,7 @@
               <w:rPr>
                 <w:noProof/>
               </w:rPr>
-              <w:instrText xml:space="preserve"> PAGEREF _Toc241508753 \h </w:instrText>
+              <w:instrText xml:space="preserve"> PAGEREF _Toc241508897 \h </w:instrText>
             </w:r>
             <w:r>
               <w:rPr>
@@ -1290,7 +1290,7 @@
               <w14:ligatures w14:val="standardContextual"/>
             </w:rPr>
           </w:pPr>
-          <w:hyperlink w:anchor="_Toc241508754" w:history="1">
+          <w:hyperlink w:anchor="_Toc241508898" w:history="1">
             <w:r>
               <w:rPr>
                 <w:rStyle w:val="Hyperlink"/>
@@ -1314,7 +1314,7 @@
               <w:rPr>
                 <w:noProof/>
               </w:rPr>
-              <w:instrText xml:space="preserve"> PAGEREF _Toc241508754 \h </w:instrText>
+              <w:instrText xml:space="preserve"> PAGEREF _Toc241508898 \h </w:instrText>
             </w:r>
             <w:r>
               <w:rPr>
@@ -1357,7 +1357,7 @@
               <w14:ligatures w14:val="standardContextual"/>
             </w:rPr>
           </w:pPr>
-          <w:hyperlink w:anchor="_Toc241508755" w:history="1">
+          <w:hyperlink w:anchor="_Toc241508899" w:history="1">
             <w:r>
               <w:rPr>
                 <w:rStyle w:val="Hyperlink"/>
@@ -1381,7 +1381,7 @@
               <w:rPr>
                 <w:noProof/>
               </w:rPr>
-              <w:instrText xml:space="preserve"> PAGEREF _Toc241508755 \h </w:instrText>
+              <w:instrText xml:space="preserve"> PAGEREF _Toc241508899 \h </w:instrText>
             </w:r>
             <w:r>
               <w:rPr>
@@ -1424,7 +1424,7 @@
               <w14:ligatures w14:val="standardContextual"/>
             </w:rPr>
           </w:pPr>
-          <w:hyperlink w:anchor="_Toc241508756" w:history="1">
+          <w:hyperlink w:anchor="_Toc241508900" w:history="1">
             <w:r>
               <w:rPr>
                 <w:rStyle w:val="Hyperlink"/>
@@ -1448,7 +1448,7 @@
               <w:rPr>
                 <w:noProof/>
               </w:rPr>
-              <w:instrText xml:space="preserve"> PAGEREF _Toc241508756 \h </w:instrText>
+              <w:instrText xml:space="preserve"> PAGEREF _Toc241508900 \h </w:instrText>
             </w:r>
             <w:r>
               <w:rPr>
@@ -1491,7 +1491,7 @@
               <w14:ligatures w14:val="standardContextual"/>
             </w:rPr>
           </w:pPr>
-          <w:hyperlink w:anchor="_Toc241508757" w:history="1">
+          <w:hyperlink w:anchor="_Toc241508901" w:history="1">
             <w:r>
               <w:rPr>
                 <w:rStyle w:val="Hyperlink"/>
@@ -1515,7 +1515,7 @@
               <w:rPr>
                 <w:noProof/>
               </w:rPr>
-              <w:instrText xml:space="preserve"> PAGEREF _Toc241508757 \h </w:instrText>
+              <w:instrText xml:space="preserve"> PAGEREF _Toc241508901 \h </w:instrText>
             </w:r>
             <w:r>
               <w:rPr>
@@ -1558,7 +1558,7 @@
               <w14:ligatures w14:val="standardContextual"/>
             </w:rPr>
           </w:pPr>
-          <w:hyperlink w:anchor="_Toc241508758" w:history="1">
+          <w:hyperlink w:anchor="_Toc241508902" w:history="1">
             <w:r>
               <w:rPr>
                 <w:rStyle w:val="Hyperlink"/>
@@ -1582,7 +1582,7 @@
               <w:rPr>
                 <w:noProof/>
               </w:rPr>
-              <w:instrText xml:space="preserve"> PAGEREF _Toc241508758 \h </w:instrText>
+              <w:instrText xml:space="preserve"> PAGEREF _Toc241508902 \h </w:instrText>
             </w:r>
             <w:r>
               <w:rPr>
@@ -1625,7 +1625,7 @@
               <w14:ligatures w14:val="standardContextual"/>
             </w:rPr>
           </w:pPr>
-          <w:hyperlink w:anchor="_Toc241508759" w:history="1">
+          <w:hyperlink w:anchor="_Toc241508903" w:history="1">
             <w:r>
               <w:rPr>
                 <w:rStyle w:val="Hyperlink"/>
@@ -1649,7 +1649,7 @@
               <w:rPr>
                 <w:noProof/>
               </w:rPr>
-              <w:instrText xml:space="preserve"> PAGEREF _Toc241508759 \h </w:instrText>
+              <w:instrText xml:space="preserve"> PAGEREF _Toc241508903 \h </w:instrText>
             </w:r>
             <w:r>
               <w:rPr>
@@ -1692,7 +1692,7 @@
               <w14:ligatures w14:val="standardContextual"/>
             </w:rPr>
           </w:pPr>
-          <w:hyperlink w:anchor="_Toc241508760" w:history="1">
+          <w:hyperlink w:anchor="_Toc241508904" w:history="1">
             <w:r>
               <w:rPr>
                 <w:rStyle w:val="Hyperlink"/>
@@ -1716,7 +1716,7 @@
               <w:rPr>
                 <w:noProof/>
               </w:rPr>
-              <w:instrText xml:space="preserve"> PAGEREF _Toc241508760 \h </w:instrText>
+              <w:instrText xml:space="preserve"> PAGEREF _Toc241508904 \h </w:instrText>
             </w:r>
             <w:r>
               <w:rPr>
@@ -1759,7 +1759,7 @@
               <w14:ligatures w14:val="standardContextual"/>
             </w:rPr>
           </w:pPr>
-          <w:hyperlink w:anchor="_Toc241508761" w:history="1">
+          <w:hyperlink w:anchor="_Toc241508905" w:history="1">
             <w:r>
               <w:rPr>
                 <w:rStyle w:val="Hyperlink"/>
@@ -1783,7 +1783,7 @@
               <w:rPr>
                 <w:noProof/>
               </w:rPr>
-              <w:instrText xml:space="preserve"> PAGEREF _Toc241508761 \h </w:instrText>
+              <w:instrText xml:space="preserve"> PAGEREF _Toc241508905 \h </w:instrText>
             </w:r>
             <w:r>
               <w:rPr>
@@ -1826,7 +1826,7 @@
               <w14:ligatures w14:val="standardContextual"/>
             </w:rPr>
           </w:pPr>
-          <w:hyperlink w:anchor="_Toc241508762" w:history="1">
+          <w:hyperlink w:anchor="_Toc241508906" w:history="1">
             <w:r>
               <w:rPr>
                 <w:rStyle w:val="Hyperlink"/>
@@ -1850,7 +1850,7 @@
               <w:rPr>
                 <w:noProof/>
               </w:rPr>
-              <w:instrText xml:space="preserve"> PAGEREF _Toc241508762 \h </w:instrText>
+              <w:instrText xml:space="preserve"> PAGEREF _Toc241508906 \h </w:instrText>
             </w:r>
             <w:r>
               <w:rPr>
@@ -1893,7 +1893,7 @@
               <w14:ligatures w14:val="standardContextual"/>
             </w:rPr>
           </w:pPr>
-          <w:hyperlink w:anchor="_Toc241508763" w:history="1">
+          <w:hyperlink w:anchor="_Toc241508907" w:history="1">
             <w:r>
               <w:rPr>
                 <w:rStyle w:val="Hyperlink"/>
@@ -1917,7 +1917,7 @@
               <w:rPr>
                 <w:noProof/>
               </w:rPr>
-              <w:instrText xml:space="preserve"> PAGEREF _Toc241508763 \h </w:instrText>
+              <w:instrText xml:space="preserve"> PAGEREF _Toc241508907 \h </w:instrText>
             </w:r>
             <w:r>
               <w:rPr>
@@ -1960,7 +1960,7 @@
               <w14:ligatures w14:val="standardContextual"/>
             </w:rPr>
           </w:pPr>
-          <w:hyperlink w:anchor="_Toc241508764" w:history="1">
+          <w:hyperlink w:anchor="_Toc241508908" w:history="1">
             <w:r>
               <w:rPr>
                 <w:rStyle w:val="Hyperlink"/>
@@ -1984,7 +1984,7 @@
               <w:rPr>
                 <w:noProof/>
               </w:rPr>
-              <w:instrText xml:space="preserve"> PAGEREF _Toc241508764 \h </w:instrText>
+              <w:instrText xml:space="preserve"> PAGEREF _Toc241508908 \h </w:instrText>
             </w:r>
             <w:r>
               <w:rPr>
@@ -2027,7 +2027,7 @@
               <w14:ligatures w14:val="standardContextual"/>
             </w:rPr>
           </w:pPr>
-          <w:hyperlink w:anchor="_Toc241508765" w:history="1">
+          <w:hyperlink w:anchor="_Toc241508909" w:history="1">
             <w:r>
               <w:rPr>
                 <w:rStyle w:val="Hyperlink"/>
@@ -2051,7 +2051,7 @@
               <w:rPr>
                 <w:noProof/>
               </w:rPr>
-              <w:instrText xml:space="preserve"> PAGEREF _Toc241508765 \h </w:instrText>
+              <w:instrText xml:space="preserve"> PAGEREF _Toc241508909 \h </w:instrText>
             </w:r>
             <w:r>
               <w:rPr>
@@ -2094,7 +2094,7 @@
               <w14:ligatures w14:val="standardContextual"/>
             </w:rPr>
           </w:pPr>
-          <w:hyperlink w:anchor="_Toc241508766" w:history="1">
+          <w:hyperlink w:anchor="_Toc241508910" w:history="1">
             <w:r>
               <w:rPr>
                 <w:rStyle w:val="Hyperlink"/>
@@ -2118,7 +2118,7 @@
               <w:rPr>
                 <w:noProof/>
               </w:rPr>
-              <w:instrText xml:space="preserve"> PAGEREF _Toc241508766 \h </w:instrText>
+              <w:instrText xml:space="preserve"> PAGEREF _Toc241508910 \h </w:instrText>
             </w:r>
             <w:r>
               <w:rPr>
@@ -2161,7 +2161,7 @@
               <w14:ligatures w14:val="standardContextual"/>
             </w:rPr>
           </w:pPr>
-          <w:hyperlink w:anchor="_Toc241508767" w:history="1">
+          <w:hyperlink w:anchor="_Toc241508911" w:history="1">
             <w:r>
               <w:rPr>
                 <w:rStyle w:val="Hyperlink"/>
@@ -2185,7 +2185,7 @@
               <w:rPr>
                 <w:noProof/>
               </w:rPr>
-              <w:instrText xml:space="preserve"> PAGEREF _Toc241508767 \h </w:instrText>
+              <w:instrText xml:space="preserve"> PAGEREF _Toc241508911 \h </w:instrText>
             </w:r>
             <w:r>
               <w:rPr>
@@ -2228,7 +2228,7 @@
               <w14:ligatures w14:val="standardContextual"/>
             </w:rPr>
           </w:pPr>
-          <w:hyperlink w:anchor="_Toc241508768" w:history="1">
+          <w:hyperlink w:anchor="_Toc241508912" w:history="1">
             <w:r>
               <w:rPr>
                 <w:rStyle w:val="Hyperlink"/>
@@ -2252,7 +2252,7 @@
               <w:rPr>
                 <w:noProof/>
               </w:rPr>
-              <w:instrText xml:space="preserve"> PAGEREF _Toc241508768 \h </w:instrText>
+              <w:instrText xml:space="preserve"> PAGEREF _Toc241508912 \h </w:instrText>
             </w:r>
             <w:r>
               <w:rPr>
@@ -2295,7 +2295,7 @@
               <w14:ligatures w14:val="standardContextual"/>
             </w:rPr>
           </w:pPr>
-          <w:hyperlink w:anchor="_Toc241508769" w:history="1">
+          <w:hyperlink w:anchor="_Toc241508913" w:history="1">
             <w:r>
               <w:rPr>
                 <w:rStyle w:val="Hyperlink"/>
@@ -2319,7 +2319,7 @@
               <w:rPr>
                 <w:noProof/>
               </w:rPr>
-              <w:instrText xml:space="preserve"> PAGEREF _Toc241508769 \h </w:instrText>
+              <w:instrText xml:space="preserve"> PAGEREF _Toc241508913 \h </w:instrText>
             </w:r>
             <w:r>
               <w:rPr>
@@ -2362,7 +2362,7 @@
               <w14:ligatures w14:val="standardContextual"/>
             </w:rPr>
           </w:pPr>
-          <w:hyperlink w:anchor="_Toc241508770" w:history="1">
+          <w:hyperlink w:anchor="_Toc241508914" w:history="1">
             <w:r>
               <w:rPr>
                 <w:rStyle w:val="Hyperlink"/>
@@ -2386,7 +2386,7 @@
               <w:rPr>
                 <w:noProof/>
               </w:rPr>
-              <w:instrText xml:space="preserve"> PAGEREF _Toc241508770 \h </w:instrText>
+              <w:instrText xml:space="preserve"> PAGEREF _Toc241508914 \h </w:instrText>
             </w:r>
             <w:r>
               <w:rPr>
@@ -2429,7 +2429,7 @@
               <w14:ligatures w14:val="standardContextual"/>
             </w:rPr>
           </w:pPr>
-          <w:hyperlink w:anchor="_Toc241508771" w:history="1">
+          <w:hyperlink w:anchor="_Toc241508915" w:history="1">
             <w:r>
               <w:rPr>
                 <w:rStyle w:val="Hyperlink"/>
@@ -2453,7 +2453,7 @@
               <w:rPr>
                 <w:noProof/>
               </w:rPr>
-              <w:instrText xml:space="preserve"> PAGEREF _Toc241508771 \h </w:instrText>
+              <w:instrText xml:space="preserve"> PAGEREF _Toc241508915 \h </w:instrText>
             </w:r>
             <w:r>
               <w:rPr>
@@ -2496,7 +2496,7 @@
               <w14:ligatures w14:val="standardContextual"/>
             </w:rPr>
           </w:pPr>
-          <w:hyperlink w:anchor="_Toc241508772" w:history="1">
+          <w:hyperlink w:anchor="_Toc241508916" w:history="1">
             <w:r>
               <w:rPr>
                 <w:rStyle w:val="Hyperlink"/>
@@ -2520,7 +2520,7 @@
               <w:rPr>
                 <w:noProof/>
               </w:rPr>
-              <w:instrText xml:space="preserve"> PAGEREF _Toc241508772 \h </w:instrText>
+              <w:instrText xml:space="preserve"> PAGEREF _Toc241508916 \h </w:instrText>
             </w:r>
             <w:r>
               <w:rPr>
@@ -2563,7 +2563,7 @@
               <w14:ligatures w14:val="standardContextual"/>
             </w:rPr>
           </w:pPr>
-          <w:hyperlink w:anchor="_Toc241508773" w:history="1">
+          <w:hyperlink w:anchor="_Toc241508917" w:history="1">
             <w:r>
               <w:rPr>
                 <w:rStyle w:val="Hyperlink"/>
@@ -2587,7 +2587,7 @@
               <w:rPr>
                 <w:noProof/>
               </w:rPr>
-              <w:instrText xml:space="preserve"> PAGEREF _Toc241508773 \h </w:instrText>
+              <w:instrText xml:space="preserve"> PAGEREF _Toc241508917 \h </w:instrText>
             </w:r>
             <w:r>
               <w:rPr>
@@ -2630,7 +2630,7 @@
               <w14:ligatures w14:val="standardContextual"/>
             </w:rPr>
           </w:pPr>
-          <w:hyperlink w:anchor="_Toc241508774" w:history="1">
+          <w:hyperlink w:anchor="_Toc241508918" w:history="1">
             <w:r>
               <w:rPr>
                 <w:rStyle w:val="Hyperlink"/>
@@ -2654,7 +2654,7 @@
               <w:rPr>
                 <w:noProof/>
               </w:rPr>
-              <w:instrText xml:space="preserve"> PAGEREF _Toc241508774 \h </w:instrText>
+              <w:instrText xml:space="preserve"> PAGEREF _Toc241508918 \h </w:instrText>
             </w:r>
             <w:r>
               <w:rPr>
@@ -2697,7 +2697,7 @@
               <w14:ligatures w14:val="standardContextual"/>
             </w:rPr>
           </w:pPr>
-          <w:hyperlink w:anchor="_Toc241508775" w:history="1">
+          <w:hyperlink w:anchor="_Toc241508919" w:history="1">
             <w:r>
               <w:rPr>
                 <w:rStyle w:val="Hyperlink"/>
@@ -2721,7 +2721,7 @@
               <w:rPr>
                 <w:noProof/>
               </w:rPr>
-              <w:instrText xml:space="preserve"> PAGEREF _Toc241508775 \h </w:instrText>
+              <w:instrText xml:space="preserve"> PAGEREF _Toc241508919 \h </w:instrText>
             </w:r>
             <w:r>
               <w:rPr>
@@ -2764,7 +2764,7 @@
               <w14:ligatures w14:val="standardContextual"/>
             </w:rPr>
           </w:pPr>
-          <w:hyperlink w:anchor="_Toc241508776" w:history="1">
+          <w:hyperlink w:anchor="_Toc241508920" w:history="1">
             <w:r>
               <w:rPr>
                 <w:rStyle w:val="Hyperlink"/>
@@ -2788,7 +2788,7 @@
               <w:rPr>
                 <w:noProof/>
               </w:rPr>
-              <w:instrText xml:space="preserve"> PAGEREF _Toc241508776 \h </w:instrText>
+              <w:instrText xml:space="preserve"> PAGEREF _Toc241508920 \h </w:instrText>
             </w:r>
             <w:r>
               <w:rPr>
@@ -2831,7 +2831,7 @@
               <w14:ligatures w14:val="standardContextual"/>
             </w:rPr>
           </w:pPr>
-          <w:hyperlink w:anchor="_Toc241508777" w:history="1">
+          <w:hyperlink w:anchor="_Toc241508921" w:history="1">
             <w:r>
               <w:rPr>
                 <w:rStyle w:val="Hyperlink"/>
@@ -2855,7 +2855,7 @@
               <w:rPr>
                 <w:noProof/>
               </w:rPr>
-              <w:instrText xml:space="preserve"> PAGEREF _Toc241508777 \h </w:instrText>
+              <w:instrText xml:space="preserve"> PAGEREF _Toc241508921 \h </w:instrText>
             </w:r>
             <w:r>
               <w:rPr>
@@ -2898,7 +2898,7 @@
               <w14:ligatures w14:val="standardContextual"/>
             </w:rPr>
           </w:pPr>
-          <w:hyperlink w:anchor="_Toc241508778" w:history="1">
+          <w:hyperlink w:anchor="_Toc241508922" w:history="1">
             <w:r>
               <w:rPr>
                 <w:rStyle w:val="Hyperlink"/>
@@ -2922,7 +2922,7 @@
               <w:rPr>
                 <w:noProof/>
               </w:rPr>
-              <w:instrText xml:space="preserve"> PAGEREF _Toc241508778 \h </w:instrText>
+              <w:instrText xml:space="preserve"> PAGEREF _Toc241508922 \h </w:instrText>
             </w:r>
             <w:r>
               <w:rPr>
@@ -2965,7 +2965,7 @@
               <w14:ligatures w14:val="standardContextual"/>
             </w:rPr>
           </w:pPr>
-          <w:hyperlink w:anchor="_Toc241508779" w:history="1">
+          <w:hyperlink w:anchor="_Toc241508923" w:history="1">
             <w:r>
               <w:rPr>
                 <w:rStyle w:val="Hyperlink"/>
@@ -2989,7 +2989,7 @@
               <w:rPr>
                 <w:noProof/>
               </w:rPr>
-              <w:instrText xml:space="preserve"> PAGEREF _Toc241508779 \h </w:instrText>
+              <w:instrText xml:space="preserve"> PAGEREF _Toc241508923 \h </w:instrText>
             </w:r>
             <w:r>
               <w:rPr>
@@ -3032,7 +3032,7 @@
               <w14:ligatures w14:val="standardContextual"/>
             </w:rPr>
           </w:pPr>
-          <w:hyperlink w:anchor="_Toc241508780" w:history="1">
+          <w:hyperlink w:anchor="_Toc241508924" w:history="1">
             <w:r>
               <w:rPr>
                 <w:rStyle w:val="Hyperlink"/>
@@ -3056,7 +3056,7 @@
               <w:rPr>
                 <w:noProof/>
               </w:rPr>
-              <w:instrText xml:space="preserve"> PAGEREF _Toc241508780 \h </w:instrText>
+              <w:instrText xml:space="preserve"> PAGEREF _Toc241508924 \h </w:instrText>
             </w:r>
             <w:r>
               <w:rPr>
@@ -3099,7 +3099,7 @@
               <w14:ligatures w14:val="standardContextual"/>
             </w:rPr>
           </w:pPr>
-          <w:hyperlink w:anchor="_Toc241508781" w:history="1">
+          <w:hyperlink w:anchor="_Toc241508925" w:history="1">
             <w:r>
               <w:rPr>
                 <w:rStyle w:val="Hyperlink"/>
@@ -3123,7 +3123,7 @@
               <w:rPr>
                 <w:noProof/>
               </w:rPr>
-              <w:instrText xml:space="preserve"> PAGEREF _Toc241508781 \h </w:instrText>
+              <w:instrText xml:space="preserve"> PAGEREF _Toc241508925 \h </w:instrText>
             </w:r>
             <w:r>
               <w:rPr>
@@ -3166,7 +3166,7 @@
               <w14:ligatures w14:val="standardContextual"/>
             </w:rPr>
           </w:pPr>
-          <w:hyperlink w:anchor="_Toc241508782" w:history="1">
+          <w:hyperlink w:anchor="_Toc241508926" w:history="1">
             <w:r>
               <w:rPr>
                 <w:rStyle w:val="Hyperlink"/>
@@ -3190,7 +3190,7 @@
               <w:rPr>
                 <w:noProof/>
               </w:rPr>
-              <w:instrText xml:space="preserve"> PAGEREF _Toc241508782 \h </w:instrText>
+              <w:instrText xml:space="preserve"> PAGEREF _Toc241508926 \h </w:instrText>
             </w:r>
             <w:r>
               <w:rPr>
@@ -3233,7 +3233,7 @@
               <w14:ligatures w14:val="standardContextual"/>
             </w:rPr>
           </w:pPr>
-          <w:hyperlink w:anchor="_Toc241508783" w:history="1">
+          <w:hyperlink w:anchor="_Toc241508927" w:history="1">
             <w:r>
               <w:rPr>
                 <w:rStyle w:val="Hyperlink"/>
@@ -3257,7 +3257,7 @@
               <w:rPr>
                 <w:noProof/>
               </w:rPr>
-              <w:instrText xml:space="preserve"> PAGEREF _Toc241508783 \h </w:instrText>
+              <w:instrText xml:space="preserve"> PAGEREF _Toc241508927 \h </w:instrText>
             </w:r>
             <w:r>
               <w:rPr>
@@ -3300,7 +3300,7 @@
               <w14:ligatures w14:val="standardContextual"/>
             </w:rPr>
           </w:pPr>
-          <w:hyperlink w:anchor="_Toc241508784" w:history="1">
+          <w:hyperlink w:anchor="_Toc241508928" w:history="1">
             <w:r>
               <w:rPr>
                 <w:rStyle w:val="Hyperlink"/>
@@ -3324,7 +3324,7 @@
               <w:rPr>
                 <w:noProof/>
               </w:rPr>
-              <w:instrText xml:space="preserve"> PAGEREF _Toc241508784 \h </w:instrText>
+              <w:instrText xml:space="preserve"> PAGEREF _Toc241508928 \h </w:instrText>
             </w:r>
             <w:r>
               <w:rPr>
@@ -3367,7 +3367,7 @@
               <w14:ligatures w14:val="standardContextual"/>
             </w:rPr>
           </w:pPr>
-          <w:hyperlink w:anchor="_Toc241508785" w:history="1">
+          <w:hyperlink w:anchor="_Toc241508929" w:history="1">
             <w:r>
               <w:rPr>
                 <w:rStyle w:val="Hyperlink"/>
@@ -3391,7 +3391,7 @@
               <w:rPr>
                 <w:noProof/>
               </w:rPr>
-              <w:instrText xml:space="preserve"> PAGEREF _Toc241508785 \h </w:instrText>
+              <w:instrText xml:space="preserve"> PAGEREF _Toc241508929 \h </w:instrText>
             </w:r>
             <w:r>
               <w:rPr>
@@ -3434,7 +3434,7 @@
               <w14:ligatures w14:val="standardContextual"/>
             </w:rPr>
           </w:pPr>
-          <w:hyperlink w:anchor="_Toc241508786" w:history="1">
+          <w:hyperlink w:anchor="_Toc241508930" w:history="1">
             <w:r>
               <w:rPr>
                 <w:rStyle w:val="Hyperlink"/>
@@ -3458,7 +3458,7 @@
               <w:rPr>
                 <w:noProof/>
               </w:rPr>
-              <w:instrText xml:space="preserve"> PAGEREF _Toc241508786 \h </w:instrText>
+              <w:instrText xml:space="preserve"> PAGEREF _Toc241508930 \h </w:instrText>
             </w:r>
             <w:r>
               <w:rPr>
@@ -3501,7 +3501,7 @@
       <w:pPr>
         <w:pStyle w:val="Heading1"/>
       </w:pPr>
-      <w:bookmarkStart w:id="0" w:name="_Toc241508737"/>
+      <w:bookmarkStart w:id="0" w:name="_Toc241508881"/>
       <w:r>
         <w:t>1.  Getting started</w:t>
       </w:r>
@@ -3529,7 +3529,7 @@
       <w:pPr>
         <w:pStyle w:val="Heading2"/>
       </w:pPr>
-      <w:bookmarkStart w:id="1" w:name="_Toc241508738"/>
+      <w:bookmarkStart w:id="1" w:name="_Toc241508882"/>
       <w:r>
         <w:t>Opening ShopControl</w:t>
       </w:r>
@@ -3609,7 +3609,7 @@
       <w:pPr>
         <w:pStyle w:val="Heading2"/>
       </w:pPr>
-      <w:bookmarkStart w:id="2" w:name="_Toc241508739"/>
+      <w:bookmarkStart w:id="2" w:name="_Toc241508883"/>
       <w:r>
         <w:t>Finding help</w:t>
       </w:r>
@@ -3712,7 +3712,7 @@
       <w:pPr>
         <w:pStyle w:val="Heading2"/>
       </w:pPr>
-      <w:bookmarkStart w:id="3" w:name="_Toc241508740"/>
+      <w:bookmarkStart w:id="3" w:name="_Toc241508884"/>
       <w:r>
         <w:t>Put the app on your phone's home screen</w:t>
       </w:r>
@@ -3880,7 +3880,7 @@
       <w:pPr>
         <w:pStyle w:val="Heading2"/>
       </w:pPr>
-      <w:bookmarkStart w:id="4" w:name="_Toc241508741"/>
+      <w:bookmarkStart w:id="4" w:name="_Toc241508885"/>
       <w:r>
         <w:t>Logging in</w:t>
       </w:r>
@@ -4050,7 +4050,7 @@
       <w:pPr>
         <w:pStyle w:val="Heading2"/>
       </w:pPr>
-      <w:bookmarkStart w:id="5" w:name="_Toc241508742"/>
+      <w:bookmarkStart w:id="5" w:name="_Toc241508886"/>
       <w:r>
         <w:t>Staying up to date</w:t>
       </w:r>
@@ -4078,7 +4078,7 @@
       <w:pPr>
         <w:pStyle w:val="Heading2"/>
       </w:pPr>
-      <w:bookmarkStart w:id="6" w:name="_Toc241508743"/>
+      <w:bookmarkStart w:id="6" w:name="_Toc241508887"/>
       <w:r>
         <w:t>Who can do what</w:t>
       </w:r>
@@ -4691,7 +4691,7 @@
         <w:pStyle w:val="Heading1"/>
         <w:pageBreakBefore/>
       </w:pPr>
-      <w:bookmarkStart w:id="7" w:name="_Toc241508744"/>
+      <w:bookmarkStart w:id="7" w:name="_Toc241508888"/>
       <w:r>
         <w:t>2.  The Employee App (technicians)</w:t>
       </w:r>
@@ -4709,7 +4709,7 @@
       <w:pPr>
         <w:pStyle w:val="Heading2"/>
       </w:pPr>
-      <w:bookmarkStart w:id="8" w:name="_Toc241508745"/>
+      <w:bookmarkStart w:id="8" w:name="_Toc241508889"/>
       <w:r>
         <w:t>Home screen</w:t>
       </w:r>
@@ -4849,7 +4849,7 @@
       <w:pPr>
         <w:pStyle w:val="Heading2"/>
       </w:pPr>
-      <w:bookmarkStart w:id="9" w:name="_Toc241508746"/>
+      <w:bookmarkStart w:id="9" w:name="_Toc241508890"/>
       <w:r>
         <w:t>Doing your QC checklist</w:t>
       </w:r>
@@ -5003,10 +5003,10 @@
           <w:b/>
           <w:bCs/>
         </w:rPr>
-        <w:t>Doing more than one department?</w:t>
-      </w:r>
-      <w:r>
-        <w:t xml:space="preserve"> If you also reassemble the cars you work on (or cover another department), the office can add that checklist to your account. It then shows as a second big button under your main one on every car. For example, a body tech sees both </w:t>
+        <w:t>Body technicians</w:t>
+      </w:r>
+      <w:r>
+        <w:t xml:space="preserve"> reassemble the cars they work on, so every body tech automatically gets two big buttons on every car: </w:t>
       </w:r>
       <w:r>
         <w:rPr>
@@ -5026,14 +5026,14 @@
         <w:t>Reassy QC</w:t>
       </w:r>
       <w:r>
-        <w:t>.</w:t>
+        <w:t>. If you cover another department too, the office can add that checklist to your account and it shows as another button.</w:t>
       </w:r>
     </w:p>
     <w:p>
       <w:pPr>
         <w:pStyle w:val="Heading2"/>
       </w:pPr>
-      <w:bookmarkStart w:id="10" w:name="_Toc241508747"/>
+      <w:bookmarkStart w:id="10" w:name="_Toc241508891"/>
       <w:r>
         <w:t>Signing and rework</w:t>
       </w:r>
@@ -5153,7 +5153,7 @@
       <w:pPr>
         <w:pStyle w:val="Heading2"/>
       </w:pPr>
-      <w:bookmarkStart w:id="11" w:name="_Toc241508748"/>
+      <w:bookmarkStart w:id="11" w:name="_Toc241508892"/>
       <w:r>
         <w:t>Other departments' checklists</w:t>
       </w:r>
@@ -5181,7 +5181,7 @@
       <w:pPr>
         <w:pStyle w:val="Heading2"/>
       </w:pPr>
-      <w:bookmarkStart w:id="12" w:name="_Toc241508749"/>
+      <w:bookmarkStart w:id="12" w:name="_Toc241508893"/>
       <w:r>
         <w:t>Photos and parts</w:t>
       </w:r>
@@ -5252,7 +5252,7 @@
         <w:pStyle w:val="Heading1"/>
         <w:pageBreakBefore/>
       </w:pPr>
-      <w:bookmarkStart w:id="13" w:name="_Toc241508750"/>
+      <w:bookmarkStart w:id="13" w:name="_Toc241508894"/>
       <w:r>
         <w:t>3.  Staff Hub: time off, mailbox and company info</w:t>
       </w:r>
@@ -5280,7 +5280,7 @@
       <w:pPr>
         <w:pStyle w:val="Heading2"/>
       </w:pPr>
-      <w:bookmarkStart w:id="14" w:name="_Toc241508751"/>
+      <w:bookmarkStart w:id="14" w:name="_Toc241508895"/>
       <w:r>
         <w:t>Requesting time off</w:t>
       </w:r>
@@ -5443,7 +5443,7 @@
       <w:pPr>
         <w:pStyle w:val="Heading2"/>
       </w:pPr>
-      <w:bookmarkStart w:id="15" w:name="_Toc241508752"/>
+      <w:bookmarkStart w:id="15" w:name="_Toc241508896"/>
       <w:r>
         <w:t>Checking your requests</w:t>
       </w:r>
@@ -5498,7 +5498,7 @@
       <w:pPr>
         <w:pStyle w:val="Heading2"/>
       </w:pPr>
-      <w:bookmarkStart w:id="16" w:name="_Toc241508753"/>
+      <w:bookmarkStart w:id="16" w:name="_Toc241508897"/>
       <w:r>
         <w:t>Mailbox</w:t>
       </w:r>
@@ -5567,7 +5567,7 @@
       <w:pPr>
         <w:pStyle w:val="Heading2"/>
       </w:pPr>
-      <w:bookmarkStart w:id="17" w:name="_Toc241508754"/>
+      <w:bookmarkStart w:id="17" w:name="_Toc241508898"/>
       <w:r>
         <w:t>Company info and this manual</w:t>
       </w:r>
@@ -5603,7 +5603,7 @@
         <w:pStyle w:val="Heading1"/>
         <w:pageBreakBefore/>
       </w:pPr>
-      <w:bookmarkStart w:id="18" w:name="_Toc241508755"/>
+      <w:bookmarkStart w:id="18" w:name="_Toc241508899"/>
       <w:r>
         <w:t>4.  Dashboard</w:t>
       </w:r>
@@ -5742,7 +5742,7 @@
         <w:pStyle w:val="Heading1"/>
         <w:pageBreakBefore/>
       </w:pPr>
-      <w:bookmarkStart w:id="19" w:name="_Toc241508756"/>
+      <w:bookmarkStart w:id="19" w:name="_Toc241508900"/>
       <w:r>
         <w:t>5.  Jobs and the Daily GO List</w:t>
       </w:r>
@@ -5770,7 +5770,7 @@
       <w:pPr>
         <w:pStyle w:val="Heading2"/>
       </w:pPr>
-      <w:bookmarkStart w:id="20" w:name="_Toc241508757"/>
+      <w:bookmarkStart w:id="20" w:name="_Toc241508901"/>
       <w:r>
         <w:t>RO numbers</w:t>
       </w:r>
@@ -5856,7 +5856,7 @@
       <w:pPr>
         <w:pStyle w:val="Heading2"/>
       </w:pPr>
-      <w:bookmarkStart w:id="21" w:name="_Toc241508758"/>
+      <w:bookmarkStart w:id="21" w:name="_Toc241508902"/>
       <w:r>
         <w:t>Adding or editing a job</w:t>
       </w:r>
@@ -5976,7 +5976,7 @@
       <w:pPr>
         <w:pStyle w:val="Heading2"/>
       </w:pPr>
-      <w:bookmarkStart w:id="22" w:name="_Toc241508759"/>
+      <w:bookmarkStart w:id="22" w:name="_Toc241508903"/>
       <w:r>
         <w:t>Customer updates</w:t>
       </w:r>
@@ -6145,7 +6145,7 @@
         <w:pStyle w:val="Heading1"/>
         <w:pageBreakBefore/>
       </w:pPr>
-      <w:bookmarkStart w:id="23" w:name="_Toc241508760"/>
+      <w:bookmarkStart w:id="23" w:name="_Toc241508904"/>
       <w:r>
         <w:t>6.  Production, Delivery and Planning boards</w:t>
       </w:r>
@@ -6155,7 +6155,7 @@
       <w:pPr>
         <w:pStyle w:val="Heading2"/>
       </w:pPr>
-      <w:bookmarkStart w:id="24" w:name="_Toc241508761"/>
+      <w:bookmarkStart w:id="24" w:name="_Toc241508905"/>
       <w:r>
         <w:t>Production Board</w:t>
       </w:r>
@@ -6283,7 +6283,7 @@
       <w:pPr>
         <w:pStyle w:val="Heading2"/>
       </w:pPr>
-      <w:bookmarkStart w:id="25" w:name="_Toc241508762"/>
+      <w:bookmarkStart w:id="25" w:name="_Toc241508906"/>
       <w:r>
         <w:t>Vehicle pictures</w:t>
       </w:r>
@@ -6341,7 +6341,7 @@
       <w:pPr>
         <w:pStyle w:val="Heading2"/>
       </w:pPr>
-      <w:bookmarkStart w:id="26" w:name="_Toc241508763"/>
+      <w:bookmarkStart w:id="26" w:name="_Toc241508907"/>
       <w:r>
         <w:t>Delivery and Planning boards</w:t>
       </w:r>
@@ -6431,7 +6431,7 @@
       <w:pPr>
         <w:pStyle w:val="Heading2"/>
       </w:pPr>
-      <w:bookmarkStart w:id="27" w:name="_Toc241508764"/>
+      <w:bookmarkStart w:id="27" w:name="_Toc241508908"/>
       <w:r>
         <w:t>TV display</w:t>
       </w:r>
@@ -6460,7 +6460,7 @@
         <w:pStyle w:val="Heading1"/>
         <w:pageBreakBefore/>
       </w:pPr>
-      <w:bookmarkStart w:id="28" w:name="_Toc241508765"/>
+      <w:bookmarkStart w:id="28" w:name="_Toc241508909"/>
       <w:r>
         <w:t>7.  CCC estimates coming into ShopControl</w:t>
       </w:r>
@@ -6569,7 +6569,7 @@
         <w:pStyle w:val="Heading1"/>
         <w:pageBreakBefore/>
       </w:pPr>
-      <w:bookmarkStart w:id="29" w:name="_Toc241508766"/>
+      <w:bookmarkStart w:id="29" w:name="_Toc241508910"/>
       <w:r>
         <w:t>8.  Parts</w:t>
       </w:r>
@@ -6627,7 +6627,7 @@
       <w:pPr>
         <w:pStyle w:val="Heading2"/>
       </w:pPr>
-      <w:bookmarkStart w:id="30" w:name="_Toc241508767"/>
+      <w:bookmarkStart w:id="30" w:name="_Toc241508911"/>
       <w:r>
         <w:t>What counts as a problem</w:t>
       </w:r>
@@ -6695,7 +6695,7 @@
       <w:pPr>
         <w:pStyle w:val="Heading2"/>
       </w:pPr>
-      <w:bookmarkStart w:id="31" w:name="_Toc241508768"/>
+      <w:bookmarkStart w:id="31" w:name="_Toc241508912"/>
       <w:r>
         <w:t>Ordering parts</w:t>
       </w:r>
@@ -6802,7 +6802,7 @@
       <w:pPr>
         <w:pStyle w:val="Heading2"/>
       </w:pPr>
-      <w:bookmarkStart w:id="32" w:name="_Toc241508769"/>
+      <w:bookmarkStart w:id="32" w:name="_Toc241508913"/>
       <w:r>
         <w:t>Mirror matching and carts</w:t>
       </w:r>
@@ -6912,7 +6912,7 @@
       <w:pPr>
         <w:pStyle w:val="Heading2"/>
       </w:pPr>
-      <w:bookmarkStart w:id="33" w:name="_Toc241508770"/>
+      <w:bookmarkStart w:id="33" w:name="_Toc241508914"/>
       <w:r>
         <w:t>Other parts screens</w:t>
       </w:r>
@@ -7003,7 +7003,7 @@
         <w:pStyle w:val="Heading1"/>
         <w:pageBreakBefore/>
       </w:pPr>
-      <w:bookmarkStart w:id="34" w:name="_Toc241508771"/>
+      <w:bookmarkStart w:id="34" w:name="_Toc241508915"/>
       <w:r>
         <w:t>9.  Vehicle QC (office view)</w:t>
       </w:r>
@@ -7070,7 +7070,7 @@
         <w:pStyle w:val="Heading1"/>
         <w:pageBreakBefore/>
       </w:pPr>
-      <w:bookmarkStart w:id="35" w:name="_Toc241508772"/>
+      <w:bookmarkStart w:id="35" w:name="_Toc241508916"/>
       <w:r>
         <w:t>10.  Office tools</w:t>
       </w:r>
@@ -7080,7 +7080,7 @@
       <w:pPr>
         <w:pStyle w:val="Heading2"/>
       </w:pPr>
-      <w:bookmarkStart w:id="36" w:name="_Toc241508773"/>
+      <w:bookmarkStart w:id="36" w:name="_Toc241508917"/>
       <w:r>
         <w:t>Missed Calls / Callback Requests</w:t>
       </w:r>
@@ -7158,7 +7158,7 @@
       <w:pPr>
         <w:pStyle w:val="Heading2"/>
       </w:pPr>
-      <w:bookmarkStart w:id="37" w:name="_Toc241508774"/>
+      <w:bookmarkStart w:id="37" w:name="_Toc241508918"/>
       <w:r>
         <w:t>Tasks</w:t>
       </w:r>
@@ -7176,7 +7176,7 @@
       <w:pPr>
         <w:pStyle w:val="Heading2"/>
       </w:pPr>
-      <w:bookmarkStart w:id="38" w:name="_Toc241508775"/>
+      <w:bookmarkStart w:id="38" w:name="_Toc241508919"/>
       <w:r>
         <w:t>Booth Filters and Facility Checklist</w:t>
       </w:r>
@@ -7214,7 +7214,7 @@
       <w:pPr>
         <w:pStyle w:val="Heading2"/>
       </w:pPr>
-      <w:bookmarkStart w:id="39" w:name="_Toc241508776"/>
+      <w:bookmarkStart w:id="39" w:name="_Toc241508920"/>
       <w:r>
         <w:t>AR Balances and Cycle Time</w:t>
       </w:r>
@@ -7264,7 +7264,7 @@
       <w:pPr>
         <w:pStyle w:val="Heading2"/>
       </w:pPr>
-      <w:bookmarkStart w:id="40" w:name="_Toc241508777"/>
+      <w:bookmarkStart w:id="40" w:name="_Toc241508921"/>
       <w:r>
         <w:t>Photos and Activity Log</w:t>
       </w:r>
@@ -7315,7 +7315,7 @@
         <w:pStyle w:val="Heading1"/>
         <w:pageBreakBefore/>
       </w:pPr>
-      <w:bookmarkStart w:id="41" w:name="_Toc241508778"/>
+      <w:bookmarkStart w:id="41" w:name="_Toc241508922"/>
       <w:r>
         <w:t>11.  Time off and messages (office and admins)</w:t>
       </w:r>
@@ -7325,7 +7325,7 @@
       <w:pPr>
         <w:pStyle w:val="Heading2"/>
       </w:pPr>
-      <w:bookmarkStart w:id="42" w:name="_Toc241508779"/>
+      <w:bookmarkStart w:id="42" w:name="_Toc241508923"/>
       <w:r>
         <w:t>Time Off tab</w:t>
       </w:r>
@@ -7453,7 +7453,7 @@
       <w:pPr>
         <w:pStyle w:val="Heading2"/>
       </w:pPr>
-      <w:bookmarkStart w:id="43" w:name="_Toc241508780"/>
+      <w:bookmarkStart w:id="43" w:name="_Toc241508924"/>
       <w:r>
         <w:t>Messages &amp; Info tab</w:t>
       </w:r>
@@ -7544,7 +7544,7 @@
         <w:pStyle w:val="Heading1"/>
         <w:pageBreakBefore/>
       </w:pPr>
-      <w:bookmarkStart w:id="44" w:name="_Toc241508781"/>
+      <w:bookmarkStart w:id="44" w:name="_Toc241508925"/>
       <w:r>
         <w:t>12.  Admin: employees and settings</w:t>
       </w:r>
@@ -7554,7 +7554,7 @@
       <w:pPr>
         <w:pStyle w:val="Heading2"/>
       </w:pPr>
-      <w:bookmarkStart w:id="45" w:name="_Toc241508782"/>
+      <w:bookmarkStart w:id="45" w:name="_Toc241508926"/>
       <w:r>
         <w:t>Adding an employee</w:t>
       </w:r>
@@ -7676,7 +7676,7 @@
       <w:pPr>
         <w:pStyle w:val="Heading2"/>
       </w:pPr>
-      <w:bookmarkStart w:id="46" w:name="_Toc241508783"/>
+      <w:bookmarkStart w:id="46" w:name="_Toc241508927"/>
       <w:r>
         <w:t>Changing an employee</w:t>
       </w:r>
@@ -7699,7 +7699,27 @@
         <w:t>Edit:</w:t>
       </w:r>
       <w:r>
-        <w:t xml:space="preserve"> change name, email, job title, role and QC department. Use </w:t>
+        <w:t xml:space="preserve"> change name, email, job title, role and QC department. Setting someone's QC department to </w:t>
+      </w:r>
+      <w:r>
+        <w:rPr>
+          <w:b/>
+          <w:bCs/>
+        </w:rPr>
+        <w:t>Body</w:t>
+      </w:r>
+      <w:r>
+        <w:t xml:space="preserve"> automatically gives them the </w:t>
+      </w:r>
+      <w:r>
+        <w:rPr>
+          <w:b/>
+          <w:bCs/>
+        </w:rPr>
+        <w:t>Reassy</w:t>
+      </w:r>
+      <w:r>
+        <w:t xml:space="preserve"> checklist too. Use </w:t>
       </w:r>
       <w:r>
         <w:rPr>
@@ -7709,27 +7729,7 @@
         <w:t>Also does these checklists</w:t>
       </w:r>
       <w:r>
-        <w:t xml:space="preserve"> for people who do more than one department (for example a body tech who also reassembles: main department </w:t>
-      </w:r>
-      <w:r>
-        <w:rPr>
-          <w:b/>
-          <w:bCs/>
-        </w:rPr>
-        <w:t>Body</w:t>
-      </w:r>
-      <w:r>
-        <w:t xml:space="preserve">, also does </w:t>
-      </w:r>
-      <w:r>
-        <w:rPr>
-          <w:b/>
-          <w:bCs/>
-        </w:rPr>
-        <w:t>Reassy</w:t>
-      </w:r>
-      <w:r>
-        <w:t>). The list shows the extras under their QC department.</w:t>
+        <w:t xml:space="preserve"> for anyone else who covers more than one department (for example a painter who also does Final QC). The list shows everything extra under their QC department.</w:t>
       </w:r>
     </w:p>
     <w:p>
@@ -7816,7 +7816,7 @@
       <w:pPr>
         <w:pStyle w:val="Heading2"/>
       </w:pPr>
-      <w:bookmarkStart w:id="47" w:name="_Toc241508784"/>
+      <w:bookmarkStart w:id="47" w:name="_Toc241508928"/>
       <w:r>
         <w:t>Board Settings</w:t>
       </w:r>
@@ -7835,7 +7835,7 @@
         <w:pStyle w:val="Heading1"/>
         <w:pageBreakBefore/>
       </w:pPr>
-      <w:bookmarkStart w:id="48" w:name="_Toc241508785"/>
+      <w:bookmarkStart w:id="48" w:name="_Toc241508929"/>
       <w:r>
         <w:t>13.  Quick answers</w:t>
       </w:r>
@@ -8479,7 +8479,7 @@
         <w:pStyle w:val="Heading1"/>
         <w:pageBreakBefore/>
       </w:pPr>
-      <w:bookmarkStart w:id="49" w:name="_Toc241508786"/>
+      <w:bookmarkStart w:id="49" w:name="_Toc241508930"/>
       <w:r>
         <w:t>Manual versions</w:t>
       </w:r>
@@ -8634,7 +8634,7 @@
                 <w:b/>
                 <w:bCs/>
               </w:rPr>
-              <w:t>1.4</w:t>
+              <w:t>1.5</w:t>
             </w:r>
           </w:p>
         </w:tc>
@@ -8678,17 +8678,17 @@
           </w:tcPr>
           <w:p>
             <w:r>
-              <w:t xml:space="preserve">Employees can be set to </w:t>
+              <w:t xml:space="preserve">Body technicians automatically get the </w:t>
             </w:r>
             <w:r>
               <w:rPr>
                 <w:b/>
                 <w:bCs/>
               </w:rPr>
-              <w:t>also do</w:t>
-            </w:r>
-            <w:r>
-              <w:t xml:space="preserve"> other checklists (for example a body tech who reassembles also gets the Reassy checklist).</w:t>
+              <w:t>Reassy</w:t>
+            </w:r>
+            <w:r>
+              <w:t xml:space="preserve"> checklist too.</w:t>
             </w:r>
           </w:p>
         </w:tc>
@@ -8725,7 +8725,7 @@
                 <w:b/>
                 <w:bCs/>
               </w:rPr>
-              <w:t>1.3</w:t>
+              <w:t>1.4</w:t>
             </w:r>
           </w:p>
         </w:tc>
@@ -8769,7 +8769,17 @@
           </w:tcPr>
           <w:p>
             <w:r>
-              <w:t>New accounts and admin password resets use a temporary password; you choose your own the first time you sign in.</w:t>
+              <w:t xml:space="preserve">Employees can be set to </w:t>
+            </w:r>
+            <w:r>
+              <w:rPr>
+                <w:b/>
+                <w:bCs/>
+              </w:rPr>
+              <w:t>also do</w:t>
+            </w:r>
+            <w:r>
+              <w:t xml:space="preserve"> other checklists (for example a body tech who reassembles also gets the Reassy checklist).</w:t>
             </w:r>
           </w:p>
         </w:tc>
@@ -8806,7 +8816,7 @@
                 <w:b/>
                 <w:bCs/>
               </w:rPr>
-              <w:t>1.2</w:t>
+              <w:t>1.3</w:t>
             </w:r>
           </w:p>
         </w:tc>
@@ -8850,17 +8860,7 @@
           </w:tcPr>
           <w:p>
             <w:r>
-              <w:t xml:space="preserve">Added the </w:t>
-            </w:r>
-            <w:r>
-              <w:rPr>
-                <w:b/>
-                <w:bCs/>
-              </w:rPr>
-              <w:t>Help</w:t>
-            </w:r>
-            <w:r>
-              <w:t xml:space="preserve"> tab in the office program and a search box in the manual.</w:t>
+              <w:t>New accounts and admin password resets use a temporary password; you choose your own the first time you sign in.</w:t>
             </w:r>
           </w:p>
         </w:tc>
@@ -8897,7 +8897,7 @@
                 <w:b/>
                 <w:bCs/>
               </w:rPr>
-              <w:t>1.1</w:t>
+              <w:t>1.2</w:t>
             </w:r>
           </w:p>
         </w:tc>
@@ -8941,17 +8941,17 @@
           </w:tcPr>
           <w:p>
             <w:r>
-              <w:t xml:space="preserve">Employee App address is now </w:t>
+              <w:t xml:space="preserve">Added the </w:t>
             </w:r>
             <w:r>
               <w:rPr>
                 <w:b/>
                 <w:bCs/>
               </w:rPr>
-              <w:t>https://conceptautobody.app</w:t>
-            </w:r>
-            <w:r>
-              <w:t xml:space="preserve"> and works on phones anywhere. Added how to put it on your phone's home screen.</w:t>
+              <w:t>Help</w:t>
+            </w:r>
+            <w:r>
+              <w:t xml:space="preserve"> tab in the office program and a search box in the manual.</w:t>
             </w:r>
           </w:p>
         </w:tc>
@@ -8988,7 +8988,7 @@
                 <w:b/>
                 <w:bCs/>
               </w:rPr>
-              <w:t>1.0</w:t>
+              <w:t>1.1</w:t>
             </w:r>
           </w:p>
         </w:tc>
@@ -9032,6 +9032,97 @@
           </w:tcPr>
           <w:p>
             <w:r>
+              <w:t xml:space="preserve">Employee App address is now </w:t>
+            </w:r>
+            <w:r>
+              <w:rPr>
+                <w:b/>
+                <w:bCs/>
+              </w:rPr>
+              <w:t>https://conceptautobody.app</w:t>
+            </w:r>
+            <w:r>
+              <w:t xml:space="preserve"> and works on phones anywhere. Added how to put it on your phone's home screen.</w:t>
+            </w:r>
+          </w:p>
+        </w:tc>
+      </w:tr>
+      <w:tr>
+        <w:tblPrEx>
+          <w:tblCellMar>
+            <w:top w:w="0" w:type="dxa"/>
+            <w:bottom w:w="0" w:type="dxa"/>
+          </w:tblCellMar>
+        </w:tblPrEx>
+        <w:trPr>
+          <w:cantSplit/>
+        </w:trPr>
+        <w:tc>
+          <w:tcPr>
+            <w:tcW w:w="3120" w:type="dxa"/>
+            <w:tcBorders>
+              <w:top w:val="single" w:sz="4" w:space="0" w:color="C9CFD6"/>
+              <w:left w:val="single" w:sz="4" w:space="0" w:color="C9CFD6"/>
+              <w:bottom w:val="single" w:sz="4" w:space="0" w:color="C9CFD6"/>
+              <w:right w:val="single" w:sz="4" w:space="0" w:color="C9CFD6"/>
+            </w:tcBorders>
+            <w:tcMar>
+              <w:top w:w="80" w:type="dxa"/>
+              <w:left w:w="120" w:type="dxa"/>
+              <w:bottom w:w="80" w:type="dxa"/>
+              <w:right w:w="120" w:type="dxa"/>
+            </w:tcMar>
+          </w:tcPr>
+          <w:p>
+            <w:r>
+              <w:rPr>
+                <w:b/>
+                <w:bCs/>
+              </w:rPr>
+              <w:t>1.0</w:t>
+            </w:r>
+          </w:p>
+        </w:tc>
+        <w:tc>
+          <w:tcPr>
+            <w:tcW w:w="3120" w:type="dxa"/>
+            <w:tcBorders>
+              <w:top w:val="single" w:sz="4" w:space="0" w:color="C9CFD6"/>
+              <w:left w:val="single" w:sz="4" w:space="0" w:color="C9CFD6"/>
+              <w:bottom w:val="single" w:sz="4" w:space="0" w:color="C9CFD6"/>
+              <w:right w:val="single" w:sz="4" w:space="0" w:color="C9CFD6"/>
+            </w:tcBorders>
+            <w:tcMar>
+              <w:top w:w="80" w:type="dxa"/>
+              <w:left w:w="120" w:type="dxa"/>
+              <w:bottom w:w="80" w:type="dxa"/>
+              <w:right w:w="120" w:type="dxa"/>
+            </w:tcMar>
+          </w:tcPr>
+          <w:p>
+            <w:r>
+              <w:t>September 28, 2026</w:t>
+            </w:r>
+          </w:p>
+        </w:tc>
+        <w:tc>
+          <w:tcPr>
+            <w:tcW w:w="3120" w:type="dxa"/>
+            <w:tcBorders>
+              <w:top w:val="single" w:sz="4" w:space="0" w:color="C9CFD6"/>
+              <w:left w:val="single" w:sz="4" w:space="0" w:color="C9CFD6"/>
+              <w:bottom w:val="single" w:sz="4" w:space="0" w:color="C9CFD6"/>
+              <w:right w:val="single" w:sz="4" w:space="0" w:color="C9CFD6"/>
+            </w:tcBorders>
+            <w:tcMar>
+              <w:top w:w="80" w:type="dxa"/>
+              <w:left w:w="120" w:type="dxa"/>
+              <w:bottom w:w="80" w:type="dxa"/>
+              <w:right w:w="120" w:type="dxa"/>
+            </w:tcMar>
+          </w:tcPr>
+          <w:p>
+            <w:r>
               <w:t>First edition.</w:t>
             </w:r>
           </w:p>
@@ -9093,7 +9184,7 @@
         <w:sz w:val="18"/>
         <w:szCs w:val="18"/>
       </w:rPr>
-      <w:t xml:space="preserve">Concept Autobody  ·  Version 1.4  ·  Page </w:t>
+      <w:t xml:space="preserve">Concept Autobody  ·  Version 1.5  ·  Page </w:t>
     </w:r>
     <w:r>
       <w:rPr>
@@ -9186,278 +9277,278 @@
 <file path=word/numbering.xml><?xml version="1.0" encoding="utf-8"?>
 <w:numbering xmlns:wpc="http://schemas.microsoft.com/office/word/2010/wordprocessingCanvas" xmlns:cx="http://schemas.microsoft.com/office/drawing/2014/chartex" xmlns:cx1="http://schemas.microsoft.com/office/drawing/2015/9/8/chartex" xmlns:cx2="http://schemas.microsoft.com/office/drawing/2015/10/21/chartex" xmlns:cx3="http://schemas.microsoft.com/office/drawing/2016/5/9/chartex" xmlns:cx4="http://schemas.microsoft.com/office/drawing/2016/5/10/chartex" xmlns:cx5="http://schemas.microsoft.com/office/drawing/2016/5/11/chartex" xmlns:cx6="http://schemas.microsoft.com/office/drawing/2016/5/12/chartex" xmlns:cx7="http://schemas.microsoft.com/office/drawing/2016/5/13/chartex" xmlns:cx8="http://schemas.microsoft.com/office/drawing/2016/5/14/chartex" xmlns:mc="http://schemas.openxmlformats.org/markup-compatibility/2006" xmlns:aink="http://schemas.microsoft.com/office/drawing/2016/ink" xmlns:am3d="http://schemas.microsoft.com/office/drawing/2017/model3d" xmlns:o="urn:schemas-microsoft-com:office:office" xmlns:oel="http://schemas.microsoft.com/office/2019/extlst" xmlns:r="http://schemas.openxmlformats.org/officeDocument/2006/relationships" xmlns:m="http://schemas.openxmlformats.org/officeDocument/2006/math" xmlns:v="urn:schemas-microsoft-com:vml" xmlns:wp14="http://schemas.microsoft.com/office/word/2010/wordprocessingDrawing" xmlns:wp="http://schemas.openxmlformats.org/drawingml/2006/wordprocessingDrawing" xmlns:w10="urn:schemas-microsoft-com:office:word" xmlns:w="http://schemas.openxmlformats.org/wordprocessingml/2006/main" xmlns:w14="http://schemas.microsoft.com/office/word/2010/wordml" xmlns:w15="http://schemas.microsoft.com/office/word/2012/wordml" xmlns:w16cex="http://schemas.microsoft.com/office/word/2018/wordml/cex" xmlns:w16cid="http://schemas.microsoft.com/office/word/2016/wordml/cid" xmlns:w16="http://schemas.microsoft.com/office/word/2018/wordml" xmlns:w16du="http://schemas.microsoft.com/office/word/2023/wordml/word16du" xmlns:w16sdtdh="http://schemas.microsoft.com/office/word/2020/wordml/sdtdatahash" xmlns:w16sdtfl="http://schemas.microsoft.com/office/word/2024/wordml/sdtformatlock" xmlns:w16se="http://schemas.microsoft.com/office/word/2015/wordml/symex" xmlns:wpg="http://schemas.microsoft.com/office/word/2010/wordprocessingGroup" xmlns:wpi="http://schemas.microsoft.com/office/word/2010/wordprocessingInk" xmlns:wne="http://schemas.microsoft.com/office/word/2006/wordml" xmlns:wps="http://schemas.microsoft.com/office/word/2010/wordprocessingShape" mc:Ignorable="w14 w15 w16se w16cid w16 w16cex w16sdtdh w16sdtfl w16du wp14">
   <w:abstractNum w:abstractNumId="0" w15:restartNumberingAfterBreak="0">
-    <w:nsid w:val="1E6138A6"/>
+    <w:nsid w:val="13F37370"/>
     <w:multiLevelType w:val="hybridMultilevel"/>
-    <w:tmpl w:val="F6DE3498"/>
-    <w:lvl w:ilvl="0" w:tplc="2AF427E0">
+    <w:tmpl w:val="CE0AE8E0"/>
+    <w:lvl w:ilvl="0" w:tplc="92843600">
       <w:start w:val="1"/>
-      <w:numFmt w:val="bullet"/>
-      <w:lvlText w:val="•"/>
+      <w:numFmt w:val="decimal"/>
+      <w:lvlText w:val="%1."/>
       <w:lvlJc w:val="left"/>
       <w:pPr>
-        <w:ind w:left="540" w:hanging="270"/>
-      </w:pPr>
+        <w:ind w:left="540" w:hanging="360"/>
+      </w:pPr>
+      <w:rPr>
+        <w:b/>
+        <w:bCs/>
+        <w:color w:val="E8620E"/>
+      </w:rPr>
     </w:lvl>
-    <w:lvl w:ilvl="1" w:tplc="FE7C8DE8">
+    <w:lvl w:ilvl="1" w:tplc="EDC8B780">
       <w:numFmt w:val="decimal"/>
       <w:lvlText w:val=""/>
       <w:lvlJc w:val="left"/>
     </w:lvl>
-    <w:lvl w:ilvl="2" w:tplc="A2BC7ADE">
+    <w:lvl w:ilvl="2" w:tplc="49468AFE">
       <w:numFmt w:val="decimal"/>
       <w:lvlText w:val=""/>
       <w:lvlJc w:val="left"/>
     </w:lvl>
-    <w:lvl w:ilvl="3" w:tplc="FA7E421E">
+    <w:lvl w:ilvl="3" w:tplc="C40EF9B2">
       <w:numFmt w:val="decimal"/>
       <w:lvlText w:val=""/>
       <w:lvlJc w:val="left"/>
     </w:lvl>
-    <w:lvl w:ilvl="4" w:tplc="E2CA1856">
+    <w:lvl w:ilvl="4" w:tplc="C28ABB48">
       <w:numFmt w:val="decimal"/>
       <w:lvlText w:val=""/>
       <w:lvlJc w:val="left"/>
     </w:lvl>
-    <w:lvl w:ilvl="5" w:tplc="FB4050C0">
+    <w:lvl w:ilvl="5" w:tplc="4308DCB4">
       <w:numFmt w:val="decimal"/>
       <w:lvlText w:val=""/>
       <w:lvlJc w:val="left"/>
     </w:lvl>
-    <w:lvl w:ilvl="6" w:tplc="30521588">
+    <w:lvl w:ilvl="6" w:tplc="67C8FEB2">
       <w:numFmt w:val="decimal"/>
       <w:lvlText w:val=""/>
       <w:lvlJc w:val="left"/>
     </w:lvl>
-    <w:lvl w:ilvl="7" w:tplc="510ED648">
+    <w:lvl w:ilvl="7" w:tplc="A54E46CE">
       <w:numFmt w:val="decimal"/>
       <w:lvlText w:val=""/>
       <w:lvlJc w:val="left"/>
     </w:lvl>
-    <w:lvl w:ilvl="8" w:tplc="1A34A0A4">
+    <w:lvl w:ilvl="8" w:tplc="DA86F5EE">
       <w:numFmt w:val="decimal"/>
       <w:lvlText w:val=""/>
       <w:lvlJc w:val="left"/>
     </w:lvl>
   </w:abstractNum>
   <w:abstractNum w:abstractNumId="1" w15:restartNumberingAfterBreak="0">
-    <w:nsid w:val="5CA436AA"/>
+    <w:nsid w:val="3D371A1A"/>
     <w:multiLevelType w:val="hybridMultilevel"/>
-    <w:tmpl w:val="86FAC5DC"/>
-    <w:lvl w:ilvl="0" w:tplc="FEDCE750">
+    <w:tmpl w:val="1F0C58CC"/>
+    <w:lvl w:ilvl="0" w:tplc="E2FC5FC2" w:tentative="1">
       <w:start w:val="1"/>
-      <w:numFmt w:val="decimal"/>
-      <w:lvlText w:val="%1."/>
+      <w:numFmt w:val="bullet"/>
+      <w:lvlText w:val="●"/>
       <w:lvlJc w:val="left"/>
       <w:pPr>
-        <w:ind w:left="540" w:hanging="360"/>
-      </w:pPr>
-      <w:rPr>
-        <w:b/>
-        <w:bCs/>
-        <w:color w:val="E8620E"/>
-      </w:rPr>
+        <w:ind w:left="720" w:hanging="360"/>
+      </w:pPr>
     </w:lvl>
-    <w:lvl w:ilvl="1" w:tplc="80DC17E4">
+    <w:lvl w:ilvl="1" w:tplc="218A1D4E" w:tentative="1">
+      <w:start w:val="1"/>
+      <w:numFmt w:val="bullet"/>
+      <w:lvlText w:val="○"/>
+      <w:lvlJc w:val="left"/>
+      <w:pPr>
+        <w:ind w:left="1440" w:hanging="360"/>
+      </w:pPr>
+    </w:lvl>
+    <w:lvl w:ilvl="2" w:tplc="8CFABA6C" w:tentative="1">
+      <w:start w:val="1"/>
+      <w:numFmt w:val="bullet"/>
+      <w:lvlText w:val="■"/>
+      <w:lvlJc w:val="left"/>
+      <w:pPr>
+        <w:ind w:left="2160" w:hanging="360"/>
+      </w:pPr>
+    </w:lvl>
+    <w:lvl w:ilvl="3" w:tplc="6B40E3E2" w:tentative="1">
+      <w:start w:val="1"/>
+      <w:numFmt w:val="bullet"/>
+      <w:lvlText w:val="●"/>
+      <w:lvlJc w:val="left"/>
+      <w:pPr>
+        <w:ind w:left="2880" w:hanging="360"/>
+      </w:pPr>
+    </w:lvl>
+    <w:lvl w:ilvl="4" w:tplc="FFE24FBC" w:tentative="1">
+      <w:start w:val="1"/>
+      <w:numFmt w:val="bullet"/>
+      <w:lvlText w:val="○"/>
+      <w:lvlJc w:val="left"/>
+      <w:pPr>
+        <w:ind w:left="3600" w:hanging="360"/>
+      </w:pPr>
+    </w:lvl>
+    <w:lvl w:ilvl="5" w:tplc="5DA611AC" w:tentative="1">
+      <w:start w:val="1"/>
+      <w:numFmt w:val="bullet"/>
+      <w:lvlText w:val="■"/>
+      <w:lvlJc w:val="left"/>
+      <w:pPr>
+        <w:ind w:left="4320" w:hanging="360"/>
+      </w:pPr>
+    </w:lvl>
+    <w:lvl w:ilvl="6" w:tplc="74903AEC" w:tentative="1">
+      <w:start w:val="1"/>
+      <w:numFmt w:val="bullet"/>
+      <w:lvlText w:val="●"/>
+      <w:lvlJc w:val="left"/>
+      <w:pPr>
+        <w:ind w:left="5040" w:hanging="360"/>
+      </w:pPr>
+    </w:lvl>
+    <w:lvl w:ilvl="7" w:tplc="E07EEAA6" w:tentative="1">
+      <w:start w:val="1"/>
+      <w:numFmt w:val="bullet"/>
+      <w:lvlText w:val="●"/>
+      <w:lvlJc w:val="left"/>
+      <w:pPr>
+        <w:ind w:left="5760" w:hanging="360"/>
+      </w:pPr>
+    </w:lvl>
+    <w:lvl w:ilvl="8" w:tplc="78EA4FE6" w:tentative="1">
+      <w:start w:val="1"/>
+      <w:numFmt w:val="bullet"/>
+      <w:lvlText w:val="●"/>
+      <w:lvlJc w:val="left"/>
+      <w:pPr>
+        <w:ind w:left="6480" w:hanging="360"/>
+      </w:pPr>
+    </w:lvl>
+  </w:abstractNum>
+  <w:abstractNum w:abstractNumId="2" w15:restartNumberingAfterBreak="0">
+    <w:nsid w:val="5C8D5C9A"/>
+    <w:multiLevelType w:val="hybridMultilevel"/>
+    <w:tmpl w:val="AAAE5C38"/>
+    <w:lvl w:ilvl="0" w:tplc="291A3462">
+      <w:start w:val="1"/>
+      <w:numFmt w:val="bullet"/>
+      <w:lvlText w:val="•"/>
+      <w:lvlJc w:val="left"/>
+      <w:pPr>
+        <w:ind w:left="540" w:hanging="270"/>
+      </w:pPr>
+    </w:lvl>
+    <w:lvl w:ilvl="1" w:tplc="0794016E">
       <w:numFmt w:val="decimal"/>
       <w:lvlText w:val=""/>
       <w:lvlJc w:val="left"/>
     </w:lvl>
-    <w:lvl w:ilvl="2" w:tplc="F4228322">
+    <w:lvl w:ilvl="2" w:tplc="56F8DA0E">
       <w:numFmt w:val="decimal"/>
       <w:lvlText w:val=""/>
       <w:lvlJc w:val="left"/>
     </w:lvl>
-    <w:lvl w:ilvl="3" w:tplc="191249F2">
+    <w:lvl w:ilvl="3" w:tplc="FA6A78E2">
       <w:numFmt w:val="decimal"/>
       <w:lvlText w:val=""/>
       <w:lvlJc w:val="left"/>
     </w:lvl>
-    <w:lvl w:ilvl="4" w:tplc="4B5EAF9C">
+    <w:lvl w:ilvl="4" w:tplc="D8BE87D2">
       <w:numFmt w:val="decimal"/>
       <w:lvlText w:val=""/>
       <w:lvlJc w:val="left"/>
     </w:lvl>
-    <w:lvl w:ilvl="5" w:tplc="816EDA86">
+    <w:lvl w:ilvl="5" w:tplc="F5DCA0D4">
       <w:numFmt w:val="decimal"/>
       <w:lvlText w:val=""/>
       <w:lvlJc w:val="left"/>
     </w:lvl>
-    <w:lvl w:ilvl="6" w:tplc="EFAE907C">
+    <w:lvl w:ilvl="6" w:tplc="5C3E48A6">
       <w:numFmt w:val="decimal"/>
       <w:lvlText w:val=""/>
       <w:lvlJc w:val="left"/>
     </w:lvl>
-    <w:lvl w:ilvl="7" w:tplc="577E0F56">
+    <w:lvl w:ilvl="7" w:tplc="964C7882">
       <w:numFmt w:val="decimal"/>
       <w:lvlText w:val=""/>
       <w:lvlJc w:val="left"/>
     </w:lvl>
-    <w:lvl w:ilvl="8" w:tplc="D4D6BB44">
+    <w:lvl w:ilvl="8" w:tplc="A84C031A">
       <w:numFmt w:val="decimal"/>
       <w:lvlText w:val=""/>
       <w:lvlJc w:val="left"/>
     </w:lvl>
   </w:abstractNum>
-  <w:abstractNum w:abstractNumId="2" w15:restartNumberingAfterBreak="0">
-    <w:nsid w:val="7B930AD5"/>
-    <w:multiLevelType w:val="hybridMultilevel"/>
-    <w:tmpl w:val="FD80DBC8"/>
-    <w:lvl w:ilvl="0" w:tplc="041630FA" w:tentative="1">
-      <w:start w:val="1"/>
-      <w:numFmt w:val="bullet"/>
-      <w:lvlText w:val="●"/>
-      <w:lvlJc w:val="left"/>
-      <w:pPr>
-        <w:ind w:left="720" w:hanging="360"/>
-      </w:pPr>
-    </w:lvl>
-    <w:lvl w:ilvl="1" w:tplc="6054E7AA" w:tentative="1">
-      <w:start w:val="1"/>
-      <w:numFmt w:val="bullet"/>
-      <w:lvlText w:val="○"/>
-      <w:lvlJc w:val="left"/>
-      <w:pPr>
-        <w:ind w:left="1440" w:hanging="360"/>
-      </w:pPr>
-    </w:lvl>
-    <w:lvl w:ilvl="2" w:tplc="1682DFF0" w:tentative="1">
-      <w:start w:val="1"/>
-      <w:numFmt w:val="bullet"/>
-      <w:lvlText w:val="■"/>
-      <w:lvlJc w:val="left"/>
-      <w:pPr>
-        <w:ind w:left="2160" w:hanging="360"/>
-      </w:pPr>
-    </w:lvl>
-    <w:lvl w:ilvl="3" w:tplc="8BB6414A" w:tentative="1">
-      <w:start w:val="1"/>
-      <w:numFmt w:val="bullet"/>
-      <w:lvlText w:val="●"/>
-      <w:lvlJc w:val="left"/>
-      <w:pPr>
-        <w:ind w:left="2880" w:hanging="360"/>
-      </w:pPr>
-    </w:lvl>
-    <w:lvl w:ilvl="4" w:tplc="15547BDE" w:tentative="1">
-      <w:start w:val="1"/>
-      <w:numFmt w:val="bullet"/>
-      <w:lvlText w:val="○"/>
-      <w:lvlJc w:val="left"/>
-      <w:pPr>
-        <w:ind w:left="3600" w:hanging="360"/>
-      </w:pPr>
-    </w:lvl>
-    <w:lvl w:ilvl="5" w:tplc="7DC45EC4" w:tentative="1">
-      <w:start w:val="1"/>
-      <w:numFmt w:val="bullet"/>
-      <w:lvlText w:val="■"/>
-      <w:lvlJc w:val="left"/>
-      <w:pPr>
-        <w:ind w:left="4320" w:hanging="360"/>
-      </w:pPr>
-    </w:lvl>
-    <w:lvl w:ilvl="6" w:tplc="DEEA5C28" w:tentative="1">
-      <w:start w:val="1"/>
-      <w:numFmt w:val="bullet"/>
-      <w:lvlText w:val="●"/>
-      <w:lvlJc w:val="left"/>
-      <w:pPr>
-        <w:ind w:left="5040" w:hanging="360"/>
-      </w:pPr>
-    </w:lvl>
-    <w:lvl w:ilvl="7" w:tplc="F9166FFC" w:tentative="1">
-      <w:start w:val="1"/>
-      <w:numFmt w:val="bullet"/>
-      <w:lvlText w:val="●"/>
-      <w:lvlJc w:val="left"/>
-      <w:pPr>
-        <w:ind w:left="5760" w:hanging="360"/>
-      </w:pPr>
-    </w:lvl>
-    <w:lvl w:ilvl="8" w:tplc="938E4B94" w:tentative="1">
-      <w:start w:val="1"/>
-      <w:numFmt w:val="bullet"/>
-      <w:lvlText w:val="●"/>
-      <w:lvlJc w:val="left"/>
-      <w:pPr>
-        <w:ind w:left="6480" w:hanging="360"/>
-      </w:pPr>
-    </w:lvl>
-  </w:abstractNum>
-  <w:num w:numId="1" w16cid:durableId="13456565">
+  <w:num w:numId="1" w16cid:durableId="2003654258">
+    <w:abstractNumId w:val="1"/>
+    <w:lvlOverride w:ilvl="0">
+      <w:startOverride w:val="1"/>
+    </w:lvlOverride>
+  </w:num>
+  <w:num w:numId="2" w16cid:durableId="1188134148">
     <w:abstractNumId w:val="2"/>
     <w:lvlOverride w:ilvl="0">
       <w:startOverride w:val="1"/>
     </w:lvlOverride>
   </w:num>
-  <w:num w:numId="2" w16cid:durableId="821116427">
+  <w:num w:numId="3" w16cid:durableId="457997037">
     <w:abstractNumId w:val="0"/>
     <w:lvlOverride w:ilvl="0">
       <w:startOverride w:val="1"/>
     </w:lvlOverride>
   </w:num>
-  <w:num w:numId="3" w16cid:durableId="972758376">
-    <w:abstractNumId w:val="1"/>
+  <w:num w:numId="4" w16cid:durableId="1771775171">
+    <w:abstractNumId w:val="0"/>
     <w:lvlOverride w:ilvl="0">
       <w:startOverride w:val="1"/>
     </w:lvlOverride>
   </w:num>
-  <w:num w:numId="4" w16cid:durableId="284970297">
-    <w:abstractNumId w:val="1"/>
+  <w:num w:numId="5" w16cid:durableId="1265572927">
+    <w:abstractNumId w:val="0"/>
     <w:lvlOverride w:ilvl="0">
       <w:startOverride w:val="1"/>
     </w:lvlOverride>
   </w:num>
-  <w:num w:numId="5" w16cid:durableId="700864090">
-    <w:abstractNumId w:val="1"/>
+  <w:num w:numId="6" w16cid:durableId="525875403">
+    <w:abstractNumId w:val="0"/>
     <w:lvlOverride w:ilvl="0">
       <w:startOverride w:val="1"/>
     </w:lvlOverride>
   </w:num>
-  <w:num w:numId="6" w16cid:durableId="438380939">
-    <w:abstractNumId w:val="1"/>
+  <w:num w:numId="7" w16cid:durableId="1300110374">
+    <w:abstractNumId w:val="0"/>
     <w:lvlOverride w:ilvl="0">
       <w:startOverride w:val="1"/>
     </w:lvlOverride>
   </w:num>
-  <w:num w:numId="7" w16cid:durableId="165874254">
-    <w:abstractNumId w:val="1"/>
+  <w:num w:numId="8" w16cid:durableId="1855611941">
+    <w:abstractNumId w:val="0"/>
     <w:lvlOverride w:ilvl="0">
       <w:startOverride w:val="1"/>
     </w:lvlOverride>
   </w:num>
-  <w:num w:numId="8" w16cid:durableId="1431469985">
-    <w:abstractNumId w:val="1"/>
+  <w:num w:numId="9" w16cid:durableId="424503052">
+    <w:abstractNumId w:val="0"/>
     <w:lvlOverride w:ilvl="0">
       <w:startOverride w:val="1"/>
     </w:lvlOverride>
   </w:num>
-  <w:num w:numId="9" w16cid:durableId="165363839">
-    <w:abstractNumId w:val="1"/>
+  <w:num w:numId="10" w16cid:durableId="1553081193">
+    <w:abstractNumId w:val="0"/>
     <w:lvlOverride w:ilvl="0">
       <w:startOverride w:val="1"/>
     </w:lvlOverride>
   </w:num>
-  <w:num w:numId="10" w16cid:durableId="998997129">
-    <w:abstractNumId w:val="1"/>
+  <w:num w:numId="11" w16cid:durableId="528179538">
+    <w:abstractNumId w:val="0"/>
     <w:lvlOverride w:ilvl="0">
       <w:startOverride w:val="1"/>
     </w:lvlOverride>
   </w:num>
-  <w:num w:numId="11" w16cid:durableId="2063937474">
-    <w:abstractNumId w:val="1"/>
+  <w:num w:numId="12" w16cid:durableId="583413547">
+    <w:abstractNumId w:val="0"/>
     <w:lvlOverride w:ilvl="0">
       <w:startOverride w:val="1"/>
     </w:lvlOverride>
   </w:num>
-  <w:num w:numId="12" w16cid:durableId="1778597816">
-    <w:abstractNumId w:val="1"/>
-    <w:lvlOverride w:ilvl="0">
-      <w:startOverride w:val="1"/>
-    </w:lvlOverride>
-  </w:num>
-  <w:num w:numId="13" w16cid:durableId="1986812975">
-    <w:abstractNumId w:val="1"/>
+  <w:num w:numId="13" w16cid:durableId="730035010">
+    <w:abstractNumId w:val="0"/>
     <w:lvlOverride w:ilvl="0">
       <w:startOverride w:val="1"/>
     </w:lvlOverride>
@@ -10109,7 +10200,7 @@
     <w:autoRedefine/>
     <w:uiPriority w:val="39"/>
     <w:unhideWhenUsed/>
-    <w:rsid w:val="00343307"/>
+    <w:rsid w:val="008B4090"/>
     <w:pPr>
       <w:spacing w:after="100"/>
     </w:pPr>
@@ -10121,7 +10212,7 @@
     <w:autoRedefine/>
     <w:uiPriority w:val="39"/>
     <w:unhideWhenUsed/>
-    <w:rsid w:val="00343307"/>
+    <w:rsid w:val="008B4090"/>
     <w:pPr>
       <w:spacing w:after="100"/>
       <w:ind w:left="220"/>

</xml_diff>

<commit_message>
Check-In includes Final QC; printable per-car QC report; manual v1.6
Co-Authored-By: Claude Opus 5.5 <noreply@anthropic.com>
</commit_message>
<xml_diff>
--- a/client/manual/ShopControl-User-Manual.docx
+++ b/client/manual/ShopControl-User-Manual.docx
@@ -16,7 +16,7 @@
           <w:noProof/>
         </w:rPr>
         <w:drawing>
-          <wp:inline distT="0" distB="0" distL="0" distR="0" wp14:anchorId="5A0CF00D" wp14:editId="5A0CF00E">
+          <wp:inline distT="0" distB="0" distL="0" distR="0" wp14:anchorId="1CAEB953" wp14:editId="1CAEB954">
             <wp:extent cx="4000500" cy="1485900"/>
             <wp:effectExtent l="0" t="0" r="0" b="0"/>
             <wp:docPr id="1" name="Picture 1"/>
@@ -93,7 +93,7 @@
         <w:rPr>
           <w:color w:val="5B6776"/>
         </w:rPr>
-        <w:t>Version 1.5  ·  Updated September 28, 2026</w:t>
+        <w:t>Version 1.6  ·  Updated September 28, 2026</w:t>
       </w:r>
     </w:p>
     <w:p>
@@ -122,7 +122,7 @@
     <w:sdt>
       <w:sdtPr>
         <w:alias w:val="Contents"/>
-        <w:id w:val="-801851058"/>
+        <w:id w:val="1160883584"/>
       </w:sdtPr>
       <w:sdtEndPr/>
       <w:sdtContent>
@@ -151,7 +151,7 @@
           <w:r>
             <w:fldChar w:fldCharType="separate"/>
           </w:r>
-          <w:hyperlink w:anchor="_Toc241508881" w:history="1">
+          <w:hyperlink w:anchor="_Toc241509305" w:history="1">
             <w:r>
               <w:rPr>
                 <w:rStyle w:val="Hyperlink"/>
@@ -175,7 +175,7 @@
               <w:rPr>
                 <w:noProof/>
               </w:rPr>
-              <w:instrText xml:space="preserve"> PAGEREF _Toc241508881 \h </w:instrText>
+              <w:instrText xml:space="preserve"> PAGEREF _Toc241509305 \h </w:instrText>
             </w:r>
             <w:r>
               <w:rPr>
@@ -218,7 +218,7 @@
               <w14:ligatures w14:val="standardContextual"/>
             </w:rPr>
           </w:pPr>
-          <w:hyperlink w:anchor="_Toc241508882" w:history="1">
+          <w:hyperlink w:anchor="_Toc241509306" w:history="1">
             <w:r>
               <w:rPr>
                 <w:rStyle w:val="Hyperlink"/>
@@ -242,7 +242,7 @@
               <w:rPr>
                 <w:noProof/>
               </w:rPr>
-              <w:instrText xml:space="preserve"> PAGEREF _Toc241508882 \h </w:instrText>
+              <w:instrText xml:space="preserve"> PAGEREF _Toc241509306 \h </w:instrText>
             </w:r>
             <w:r>
               <w:rPr>
@@ -285,7 +285,7 @@
               <w14:ligatures w14:val="standardContextual"/>
             </w:rPr>
           </w:pPr>
-          <w:hyperlink w:anchor="_Toc241508883" w:history="1">
+          <w:hyperlink w:anchor="_Toc241509307" w:history="1">
             <w:r>
               <w:rPr>
                 <w:rStyle w:val="Hyperlink"/>
@@ -309,7 +309,7 @@
               <w:rPr>
                 <w:noProof/>
               </w:rPr>
-              <w:instrText xml:space="preserve"> PAGEREF _Toc241508883 \h </w:instrText>
+              <w:instrText xml:space="preserve"> PAGEREF _Toc241509307 \h </w:instrText>
             </w:r>
             <w:r>
               <w:rPr>
@@ -352,7 +352,7 @@
               <w14:ligatures w14:val="standardContextual"/>
             </w:rPr>
           </w:pPr>
-          <w:hyperlink w:anchor="_Toc241508884" w:history="1">
+          <w:hyperlink w:anchor="_Toc241509308" w:history="1">
             <w:r>
               <w:rPr>
                 <w:rStyle w:val="Hyperlink"/>
@@ -376,7 +376,7 @@
               <w:rPr>
                 <w:noProof/>
               </w:rPr>
-              <w:instrText xml:space="preserve"> PAGEREF _Toc241508884 \h </w:instrText>
+              <w:instrText xml:space="preserve"> PAGEREF _Toc241509308 \h </w:instrText>
             </w:r>
             <w:r>
               <w:rPr>
@@ -419,7 +419,7 @@
               <w14:ligatures w14:val="standardContextual"/>
             </w:rPr>
           </w:pPr>
-          <w:hyperlink w:anchor="_Toc241508885" w:history="1">
+          <w:hyperlink w:anchor="_Toc241509309" w:history="1">
             <w:r>
               <w:rPr>
                 <w:rStyle w:val="Hyperlink"/>
@@ -443,7 +443,7 @@
               <w:rPr>
                 <w:noProof/>
               </w:rPr>
-              <w:instrText xml:space="preserve"> PAGEREF _Toc241508885 \h </w:instrText>
+              <w:instrText xml:space="preserve"> PAGEREF _Toc241509309 \h </w:instrText>
             </w:r>
             <w:r>
               <w:rPr>
@@ -486,7 +486,7 @@
               <w14:ligatures w14:val="standardContextual"/>
             </w:rPr>
           </w:pPr>
-          <w:hyperlink w:anchor="_Toc241508886" w:history="1">
+          <w:hyperlink w:anchor="_Toc241509310" w:history="1">
             <w:r>
               <w:rPr>
                 <w:rStyle w:val="Hyperlink"/>
@@ -510,7 +510,7 @@
               <w:rPr>
                 <w:noProof/>
               </w:rPr>
-              <w:instrText xml:space="preserve"> PAGEREF _Toc241508886 \h </w:instrText>
+              <w:instrText xml:space="preserve"> PAGEREF _Toc241509310 \h </w:instrText>
             </w:r>
             <w:r>
               <w:rPr>
@@ -553,7 +553,7 @@
               <w14:ligatures w14:val="standardContextual"/>
             </w:rPr>
           </w:pPr>
-          <w:hyperlink w:anchor="_Toc241508887" w:history="1">
+          <w:hyperlink w:anchor="_Toc241509311" w:history="1">
             <w:r>
               <w:rPr>
                 <w:rStyle w:val="Hyperlink"/>
@@ -577,7 +577,7 @@
               <w:rPr>
                 <w:noProof/>
               </w:rPr>
-              <w:instrText xml:space="preserve"> PAGEREF _Toc241508887 \h </w:instrText>
+              <w:instrText xml:space="preserve"> PAGEREF _Toc241509311 \h </w:instrText>
             </w:r>
             <w:r>
               <w:rPr>
@@ -620,7 +620,7 @@
               <w14:ligatures w14:val="standardContextual"/>
             </w:rPr>
           </w:pPr>
-          <w:hyperlink w:anchor="_Toc241508888" w:history="1">
+          <w:hyperlink w:anchor="_Toc241509312" w:history="1">
             <w:r>
               <w:rPr>
                 <w:rStyle w:val="Hyperlink"/>
@@ -644,7 +644,7 @@
               <w:rPr>
                 <w:noProof/>
               </w:rPr>
-              <w:instrText xml:space="preserve"> PAGEREF _Toc241508888 \h </w:instrText>
+              <w:instrText xml:space="preserve"> PAGEREF _Toc241509312 \h </w:instrText>
             </w:r>
             <w:r>
               <w:rPr>
@@ -687,7 +687,7 @@
               <w14:ligatures w14:val="standardContextual"/>
             </w:rPr>
           </w:pPr>
-          <w:hyperlink w:anchor="_Toc241508889" w:history="1">
+          <w:hyperlink w:anchor="_Toc241509313" w:history="1">
             <w:r>
               <w:rPr>
                 <w:rStyle w:val="Hyperlink"/>
@@ -711,7 +711,7 @@
               <w:rPr>
                 <w:noProof/>
               </w:rPr>
-              <w:instrText xml:space="preserve"> PAGEREF _Toc241508889 \h </w:instrText>
+              <w:instrText xml:space="preserve"> PAGEREF _Toc241509313 \h </w:instrText>
             </w:r>
             <w:r>
               <w:rPr>
@@ -754,7 +754,7 @@
               <w14:ligatures w14:val="standardContextual"/>
             </w:rPr>
           </w:pPr>
-          <w:hyperlink w:anchor="_Toc241508890" w:history="1">
+          <w:hyperlink w:anchor="_Toc241509314" w:history="1">
             <w:r>
               <w:rPr>
                 <w:rStyle w:val="Hyperlink"/>
@@ -778,7 +778,7 @@
               <w:rPr>
                 <w:noProof/>
               </w:rPr>
-              <w:instrText xml:space="preserve"> PAGEREF _Toc241508890 \h </w:instrText>
+              <w:instrText xml:space="preserve"> PAGEREF _Toc241509314 \h </w:instrText>
             </w:r>
             <w:r>
               <w:rPr>
@@ -821,7 +821,7 @@
               <w14:ligatures w14:val="standardContextual"/>
             </w:rPr>
           </w:pPr>
-          <w:hyperlink w:anchor="_Toc241508891" w:history="1">
+          <w:hyperlink w:anchor="_Toc241509315" w:history="1">
             <w:r>
               <w:rPr>
                 <w:rStyle w:val="Hyperlink"/>
@@ -845,7 +845,7 @@
               <w:rPr>
                 <w:noProof/>
               </w:rPr>
-              <w:instrText xml:space="preserve"> PAGEREF _Toc241508891 \h </w:instrText>
+              <w:instrText xml:space="preserve"> PAGEREF _Toc241509315 \h </w:instrText>
             </w:r>
             <w:r>
               <w:rPr>
@@ -888,7 +888,7 @@
               <w14:ligatures w14:val="standardContextual"/>
             </w:rPr>
           </w:pPr>
-          <w:hyperlink w:anchor="_Toc241508892" w:history="1">
+          <w:hyperlink w:anchor="_Toc241509316" w:history="1">
             <w:r>
               <w:rPr>
                 <w:rStyle w:val="Hyperlink"/>
@@ -912,7 +912,7 @@
               <w:rPr>
                 <w:noProof/>
               </w:rPr>
-              <w:instrText xml:space="preserve"> PAGEREF _Toc241508892 \h </w:instrText>
+              <w:instrText xml:space="preserve"> PAGEREF _Toc241509316 \h </w:instrText>
             </w:r>
             <w:r>
               <w:rPr>
@@ -955,7 +955,7 @@
               <w14:ligatures w14:val="standardContextual"/>
             </w:rPr>
           </w:pPr>
-          <w:hyperlink w:anchor="_Toc241508893" w:history="1">
+          <w:hyperlink w:anchor="_Toc241509317" w:history="1">
             <w:r>
               <w:rPr>
                 <w:rStyle w:val="Hyperlink"/>
@@ -979,7 +979,7 @@
               <w:rPr>
                 <w:noProof/>
               </w:rPr>
-              <w:instrText xml:space="preserve"> PAGEREF _Toc241508893 \h </w:instrText>
+              <w:instrText xml:space="preserve"> PAGEREF _Toc241509317 \h </w:instrText>
             </w:r>
             <w:r>
               <w:rPr>
@@ -1022,7 +1022,7 @@
               <w14:ligatures w14:val="standardContextual"/>
             </w:rPr>
           </w:pPr>
-          <w:hyperlink w:anchor="_Toc241508894" w:history="1">
+          <w:hyperlink w:anchor="_Toc241509318" w:history="1">
             <w:r>
               <w:rPr>
                 <w:rStyle w:val="Hyperlink"/>
@@ -1046,7 +1046,7 @@
               <w:rPr>
                 <w:noProof/>
               </w:rPr>
-              <w:instrText xml:space="preserve"> PAGEREF _Toc241508894 \h </w:instrText>
+              <w:instrText xml:space="preserve"> PAGEREF _Toc241509318 \h </w:instrText>
             </w:r>
             <w:r>
               <w:rPr>
@@ -1089,7 +1089,7 @@
               <w14:ligatures w14:val="standardContextual"/>
             </w:rPr>
           </w:pPr>
-          <w:hyperlink w:anchor="_Toc241508895" w:history="1">
+          <w:hyperlink w:anchor="_Toc241509319" w:history="1">
             <w:r>
               <w:rPr>
                 <w:rStyle w:val="Hyperlink"/>
@@ -1113,7 +1113,7 @@
               <w:rPr>
                 <w:noProof/>
               </w:rPr>
-              <w:instrText xml:space="preserve"> PAGEREF _Toc241508895 \h </w:instrText>
+              <w:instrText xml:space="preserve"> PAGEREF _Toc241509319 \h </w:instrText>
             </w:r>
             <w:r>
               <w:rPr>
@@ -1156,7 +1156,7 @@
               <w14:ligatures w14:val="standardContextual"/>
             </w:rPr>
           </w:pPr>
-          <w:hyperlink w:anchor="_Toc241508896" w:history="1">
+          <w:hyperlink w:anchor="_Toc241509320" w:history="1">
             <w:r>
               <w:rPr>
                 <w:rStyle w:val="Hyperlink"/>
@@ -1180,7 +1180,7 @@
               <w:rPr>
                 <w:noProof/>
               </w:rPr>
-              <w:instrText xml:space="preserve"> PAGEREF _Toc241508896 \h </w:instrText>
+              <w:instrText xml:space="preserve"> PAGEREF _Toc241509320 \h </w:instrText>
             </w:r>
             <w:r>
               <w:rPr>
@@ -1223,7 +1223,7 @@
               <w14:ligatures w14:val="standardContextual"/>
             </w:rPr>
           </w:pPr>
-          <w:hyperlink w:anchor="_Toc241508897" w:history="1">
+          <w:hyperlink w:anchor="_Toc241509321" w:history="1">
             <w:r>
               <w:rPr>
                 <w:rStyle w:val="Hyperlink"/>
@@ -1247,7 +1247,7 @@
               <w:rPr>
                 <w:noProof/>
               </w:rPr>
-              <w:instrText xml:space="preserve"> PAGEREF _Toc241508897 \h </w:instrText>
+              <w:instrText xml:space="preserve"> PAGEREF _Toc241509321 \h </w:instrText>
             </w:r>
             <w:r>
               <w:rPr>
@@ -1290,7 +1290,7 @@
               <w14:ligatures w14:val="standardContextual"/>
             </w:rPr>
           </w:pPr>
-          <w:hyperlink w:anchor="_Toc241508898" w:history="1">
+          <w:hyperlink w:anchor="_Toc241509322" w:history="1">
             <w:r>
               <w:rPr>
                 <w:rStyle w:val="Hyperlink"/>
@@ -1314,7 +1314,7 @@
               <w:rPr>
                 <w:noProof/>
               </w:rPr>
-              <w:instrText xml:space="preserve"> PAGEREF _Toc241508898 \h </w:instrText>
+              <w:instrText xml:space="preserve"> PAGEREF _Toc241509322 \h </w:instrText>
             </w:r>
             <w:r>
               <w:rPr>
@@ -1357,7 +1357,7 @@
               <w14:ligatures w14:val="standardContextual"/>
             </w:rPr>
           </w:pPr>
-          <w:hyperlink w:anchor="_Toc241508899" w:history="1">
+          <w:hyperlink w:anchor="_Toc241509323" w:history="1">
             <w:r>
               <w:rPr>
                 <w:rStyle w:val="Hyperlink"/>
@@ -1381,7 +1381,7 @@
               <w:rPr>
                 <w:noProof/>
               </w:rPr>
-              <w:instrText xml:space="preserve"> PAGEREF _Toc241508899 \h </w:instrText>
+              <w:instrText xml:space="preserve"> PAGEREF _Toc241509323 \h </w:instrText>
             </w:r>
             <w:r>
               <w:rPr>
@@ -1424,7 +1424,7 @@
               <w14:ligatures w14:val="standardContextual"/>
             </w:rPr>
           </w:pPr>
-          <w:hyperlink w:anchor="_Toc241508900" w:history="1">
+          <w:hyperlink w:anchor="_Toc241509324" w:history="1">
             <w:r>
               <w:rPr>
                 <w:rStyle w:val="Hyperlink"/>
@@ -1448,7 +1448,7 @@
               <w:rPr>
                 <w:noProof/>
               </w:rPr>
-              <w:instrText xml:space="preserve"> PAGEREF _Toc241508900 \h </w:instrText>
+              <w:instrText xml:space="preserve"> PAGEREF _Toc241509324 \h </w:instrText>
             </w:r>
             <w:r>
               <w:rPr>
@@ -1491,7 +1491,7 @@
               <w14:ligatures w14:val="standardContextual"/>
             </w:rPr>
           </w:pPr>
-          <w:hyperlink w:anchor="_Toc241508901" w:history="1">
+          <w:hyperlink w:anchor="_Toc241509325" w:history="1">
             <w:r>
               <w:rPr>
                 <w:rStyle w:val="Hyperlink"/>
@@ -1515,7 +1515,7 @@
               <w:rPr>
                 <w:noProof/>
               </w:rPr>
-              <w:instrText xml:space="preserve"> PAGEREF _Toc241508901 \h </w:instrText>
+              <w:instrText xml:space="preserve"> PAGEREF _Toc241509325 \h </w:instrText>
             </w:r>
             <w:r>
               <w:rPr>
@@ -1558,7 +1558,7 @@
               <w14:ligatures w14:val="standardContextual"/>
             </w:rPr>
           </w:pPr>
-          <w:hyperlink w:anchor="_Toc241508902" w:history="1">
+          <w:hyperlink w:anchor="_Toc241509326" w:history="1">
             <w:r>
               <w:rPr>
                 <w:rStyle w:val="Hyperlink"/>
@@ -1582,7 +1582,7 @@
               <w:rPr>
                 <w:noProof/>
               </w:rPr>
-              <w:instrText xml:space="preserve"> PAGEREF _Toc241508902 \h </w:instrText>
+              <w:instrText xml:space="preserve"> PAGEREF _Toc241509326 \h </w:instrText>
             </w:r>
             <w:r>
               <w:rPr>
@@ -1625,7 +1625,7 @@
               <w14:ligatures w14:val="standardContextual"/>
             </w:rPr>
           </w:pPr>
-          <w:hyperlink w:anchor="_Toc241508903" w:history="1">
+          <w:hyperlink w:anchor="_Toc241509327" w:history="1">
             <w:r>
               <w:rPr>
                 <w:rStyle w:val="Hyperlink"/>
@@ -1649,7 +1649,7 @@
               <w:rPr>
                 <w:noProof/>
               </w:rPr>
-              <w:instrText xml:space="preserve"> PAGEREF _Toc241508903 \h </w:instrText>
+              <w:instrText xml:space="preserve"> PAGEREF _Toc241509327 \h </w:instrText>
             </w:r>
             <w:r>
               <w:rPr>
@@ -1692,7 +1692,7 @@
               <w14:ligatures w14:val="standardContextual"/>
             </w:rPr>
           </w:pPr>
-          <w:hyperlink w:anchor="_Toc241508904" w:history="1">
+          <w:hyperlink w:anchor="_Toc241509328" w:history="1">
             <w:r>
               <w:rPr>
                 <w:rStyle w:val="Hyperlink"/>
@@ -1716,7 +1716,7 @@
               <w:rPr>
                 <w:noProof/>
               </w:rPr>
-              <w:instrText xml:space="preserve"> PAGEREF _Toc241508904 \h </w:instrText>
+              <w:instrText xml:space="preserve"> PAGEREF _Toc241509328 \h </w:instrText>
             </w:r>
             <w:r>
               <w:rPr>
@@ -1759,7 +1759,7 @@
               <w14:ligatures w14:val="standardContextual"/>
             </w:rPr>
           </w:pPr>
-          <w:hyperlink w:anchor="_Toc241508905" w:history="1">
+          <w:hyperlink w:anchor="_Toc241509329" w:history="1">
             <w:r>
               <w:rPr>
                 <w:rStyle w:val="Hyperlink"/>
@@ -1783,7 +1783,7 @@
               <w:rPr>
                 <w:noProof/>
               </w:rPr>
-              <w:instrText xml:space="preserve"> PAGEREF _Toc241508905 \h </w:instrText>
+              <w:instrText xml:space="preserve"> PAGEREF _Toc241509329 \h </w:instrText>
             </w:r>
             <w:r>
               <w:rPr>
@@ -1826,7 +1826,7 @@
               <w14:ligatures w14:val="standardContextual"/>
             </w:rPr>
           </w:pPr>
-          <w:hyperlink w:anchor="_Toc241508906" w:history="1">
+          <w:hyperlink w:anchor="_Toc241509330" w:history="1">
             <w:r>
               <w:rPr>
                 <w:rStyle w:val="Hyperlink"/>
@@ -1850,7 +1850,7 @@
               <w:rPr>
                 <w:noProof/>
               </w:rPr>
-              <w:instrText xml:space="preserve"> PAGEREF _Toc241508906 \h </w:instrText>
+              <w:instrText xml:space="preserve"> PAGEREF _Toc241509330 \h </w:instrText>
             </w:r>
             <w:r>
               <w:rPr>
@@ -1893,7 +1893,7 @@
               <w14:ligatures w14:val="standardContextual"/>
             </w:rPr>
           </w:pPr>
-          <w:hyperlink w:anchor="_Toc241508907" w:history="1">
+          <w:hyperlink w:anchor="_Toc241509331" w:history="1">
             <w:r>
               <w:rPr>
                 <w:rStyle w:val="Hyperlink"/>
@@ -1917,7 +1917,7 @@
               <w:rPr>
                 <w:noProof/>
               </w:rPr>
-              <w:instrText xml:space="preserve"> PAGEREF _Toc241508907 \h </w:instrText>
+              <w:instrText xml:space="preserve"> PAGEREF _Toc241509331 \h </w:instrText>
             </w:r>
             <w:r>
               <w:rPr>
@@ -1960,7 +1960,7 @@
               <w14:ligatures w14:val="standardContextual"/>
             </w:rPr>
           </w:pPr>
-          <w:hyperlink w:anchor="_Toc241508908" w:history="1">
+          <w:hyperlink w:anchor="_Toc241509332" w:history="1">
             <w:r>
               <w:rPr>
                 <w:rStyle w:val="Hyperlink"/>
@@ -1984,7 +1984,7 @@
               <w:rPr>
                 <w:noProof/>
               </w:rPr>
-              <w:instrText xml:space="preserve"> PAGEREF _Toc241508908 \h </w:instrText>
+              <w:instrText xml:space="preserve"> PAGEREF _Toc241509332 \h </w:instrText>
             </w:r>
             <w:r>
               <w:rPr>
@@ -2027,7 +2027,7 @@
               <w14:ligatures w14:val="standardContextual"/>
             </w:rPr>
           </w:pPr>
-          <w:hyperlink w:anchor="_Toc241508909" w:history="1">
+          <w:hyperlink w:anchor="_Toc241509333" w:history="1">
             <w:r>
               <w:rPr>
                 <w:rStyle w:val="Hyperlink"/>
@@ -2051,7 +2051,7 @@
               <w:rPr>
                 <w:noProof/>
               </w:rPr>
-              <w:instrText xml:space="preserve"> PAGEREF _Toc241508909 \h </w:instrText>
+              <w:instrText xml:space="preserve"> PAGEREF _Toc241509333 \h </w:instrText>
             </w:r>
             <w:r>
               <w:rPr>
@@ -2094,7 +2094,7 @@
               <w14:ligatures w14:val="standardContextual"/>
             </w:rPr>
           </w:pPr>
-          <w:hyperlink w:anchor="_Toc241508910" w:history="1">
+          <w:hyperlink w:anchor="_Toc241509334" w:history="1">
             <w:r>
               <w:rPr>
                 <w:rStyle w:val="Hyperlink"/>
@@ -2118,7 +2118,7 @@
               <w:rPr>
                 <w:noProof/>
               </w:rPr>
-              <w:instrText xml:space="preserve"> PAGEREF _Toc241508910 \h </w:instrText>
+              <w:instrText xml:space="preserve"> PAGEREF _Toc241509334 \h </w:instrText>
             </w:r>
             <w:r>
               <w:rPr>
@@ -2161,7 +2161,7 @@
               <w14:ligatures w14:val="standardContextual"/>
             </w:rPr>
           </w:pPr>
-          <w:hyperlink w:anchor="_Toc241508911" w:history="1">
+          <w:hyperlink w:anchor="_Toc241509335" w:history="1">
             <w:r>
               <w:rPr>
                 <w:rStyle w:val="Hyperlink"/>
@@ -2185,7 +2185,7 @@
               <w:rPr>
                 <w:noProof/>
               </w:rPr>
-              <w:instrText xml:space="preserve"> PAGEREF _Toc241508911 \h </w:instrText>
+              <w:instrText xml:space="preserve"> PAGEREF _Toc241509335 \h </w:instrText>
             </w:r>
             <w:r>
               <w:rPr>
@@ -2228,7 +2228,7 @@
               <w14:ligatures w14:val="standardContextual"/>
             </w:rPr>
           </w:pPr>
-          <w:hyperlink w:anchor="_Toc241508912" w:history="1">
+          <w:hyperlink w:anchor="_Toc241509336" w:history="1">
             <w:r>
               <w:rPr>
                 <w:rStyle w:val="Hyperlink"/>
@@ -2252,7 +2252,7 @@
               <w:rPr>
                 <w:noProof/>
               </w:rPr>
-              <w:instrText xml:space="preserve"> PAGEREF _Toc241508912 \h </w:instrText>
+              <w:instrText xml:space="preserve"> PAGEREF _Toc241509336 \h </w:instrText>
             </w:r>
             <w:r>
               <w:rPr>
@@ -2295,7 +2295,7 @@
               <w14:ligatures w14:val="standardContextual"/>
             </w:rPr>
           </w:pPr>
-          <w:hyperlink w:anchor="_Toc241508913" w:history="1">
+          <w:hyperlink w:anchor="_Toc241509337" w:history="1">
             <w:r>
               <w:rPr>
                 <w:rStyle w:val="Hyperlink"/>
@@ -2319,7 +2319,7 @@
               <w:rPr>
                 <w:noProof/>
               </w:rPr>
-              <w:instrText xml:space="preserve"> PAGEREF _Toc241508913 \h </w:instrText>
+              <w:instrText xml:space="preserve"> PAGEREF _Toc241509337 \h </w:instrText>
             </w:r>
             <w:r>
               <w:rPr>
@@ -2362,7 +2362,7 @@
               <w14:ligatures w14:val="standardContextual"/>
             </w:rPr>
           </w:pPr>
-          <w:hyperlink w:anchor="_Toc241508914" w:history="1">
+          <w:hyperlink w:anchor="_Toc241509338" w:history="1">
             <w:r>
               <w:rPr>
                 <w:rStyle w:val="Hyperlink"/>
@@ -2386,7 +2386,7 @@
               <w:rPr>
                 <w:noProof/>
               </w:rPr>
-              <w:instrText xml:space="preserve"> PAGEREF _Toc241508914 \h </w:instrText>
+              <w:instrText xml:space="preserve"> PAGEREF _Toc241509338 \h </w:instrText>
             </w:r>
             <w:r>
               <w:rPr>
@@ -2429,7 +2429,7 @@
               <w14:ligatures w14:val="standardContextual"/>
             </w:rPr>
           </w:pPr>
-          <w:hyperlink w:anchor="_Toc241508915" w:history="1">
+          <w:hyperlink w:anchor="_Toc241509339" w:history="1">
             <w:r>
               <w:rPr>
                 <w:rStyle w:val="Hyperlink"/>
@@ -2453,7 +2453,74 @@
               <w:rPr>
                 <w:noProof/>
               </w:rPr>
-              <w:instrText xml:space="preserve"> PAGEREF _Toc241508915 \h </w:instrText>
+              <w:instrText xml:space="preserve"> PAGEREF _Toc241509339 \h </w:instrText>
+            </w:r>
+            <w:r>
+              <w:rPr>
+                <w:noProof/>
+              </w:rPr>
+            </w:r>
+            <w:r>
+              <w:rPr>
+                <w:noProof/>
+              </w:rPr>
+              <w:fldChar w:fldCharType="separate"/>
+            </w:r>
+            <w:r>
+              <w:rPr>
+                <w:noProof/>
+              </w:rPr>
+              <w:t>14</w:t>
+            </w:r>
+            <w:r>
+              <w:rPr>
+                <w:noProof/>
+              </w:rPr>
+              <w:fldChar w:fldCharType="end"/>
+            </w:r>
+          </w:hyperlink>
+        </w:p>
+        <w:p>
+          <w:pPr>
+            <w:pStyle w:val="TOC2"/>
+            <w:tabs>
+              <w:tab w:val="right" w:leader="dot" w:pos="9350"/>
+            </w:tabs>
+            <w:rPr>
+              <w:rFonts w:asciiTheme="minorHAnsi" w:eastAsiaTheme="minorEastAsia" w:hAnsiTheme="minorHAnsi" w:cstheme="minorBidi"/>
+              <w:noProof/>
+              <w:color w:val="auto"/>
+              <w:kern w:val="2"/>
+              <w:sz w:val="24"/>
+              <w:szCs w:val="24"/>
+              <w14:ligatures w14:val="standardContextual"/>
+            </w:rPr>
+          </w:pPr>
+          <w:hyperlink w:anchor="_Toc241509340" w:history="1">
+            <w:r>
+              <w:rPr>
+                <w:rStyle w:val="Hyperlink"/>
+                <w:noProof/>
+              </w:rPr>
+              <w:t>Pulling up a car's QC report</w:t>
+            </w:r>
+            <w:r>
+              <w:rPr>
+                <w:noProof/>
+              </w:rPr>
+              <w:tab/>
+            </w:r>
+            <w:r>
+              <w:rPr>
+                <w:noProof/>
+              </w:rPr>
+              <w:fldChar w:fldCharType="begin"/>
+            </w:r>
+            <w:r>
+              <w:rPr>
+                <w:noProof/>
+              </w:rPr>
+              <w:instrText xml:space="preserve"> PAGEREF _Toc241509340 \h </w:instrText>
             </w:r>
             <w:r>
               <w:rPr>
@@ -2496,7 +2563,7 @@
               <w14:ligatures w14:val="standardContextual"/>
             </w:rPr>
           </w:pPr>
-          <w:hyperlink w:anchor="_Toc241508916" w:history="1">
+          <w:hyperlink w:anchor="_Toc241509341" w:history="1">
             <w:r>
               <w:rPr>
                 <w:rStyle w:val="Hyperlink"/>
@@ -2520,7 +2587,7 @@
               <w:rPr>
                 <w:noProof/>
               </w:rPr>
-              <w:instrText xml:space="preserve"> PAGEREF _Toc241508916 \h </w:instrText>
+              <w:instrText xml:space="preserve"> PAGEREF _Toc241509341 \h </w:instrText>
             </w:r>
             <w:r>
               <w:rPr>
@@ -2563,7 +2630,7 @@
               <w14:ligatures w14:val="standardContextual"/>
             </w:rPr>
           </w:pPr>
-          <w:hyperlink w:anchor="_Toc241508917" w:history="1">
+          <w:hyperlink w:anchor="_Toc241509342" w:history="1">
             <w:r>
               <w:rPr>
                 <w:rStyle w:val="Hyperlink"/>
@@ -2587,7 +2654,7 @@
               <w:rPr>
                 <w:noProof/>
               </w:rPr>
-              <w:instrText xml:space="preserve"> PAGEREF _Toc241508917 \h </w:instrText>
+              <w:instrText xml:space="preserve"> PAGEREF _Toc241509342 \h </w:instrText>
             </w:r>
             <w:r>
               <w:rPr>
@@ -2630,7 +2697,7 @@
               <w14:ligatures w14:val="standardContextual"/>
             </w:rPr>
           </w:pPr>
-          <w:hyperlink w:anchor="_Toc241508918" w:history="1">
+          <w:hyperlink w:anchor="_Toc241509343" w:history="1">
             <w:r>
               <w:rPr>
                 <w:rStyle w:val="Hyperlink"/>
@@ -2654,7 +2721,7 @@
               <w:rPr>
                 <w:noProof/>
               </w:rPr>
-              <w:instrText xml:space="preserve"> PAGEREF _Toc241508918 \h </w:instrText>
+              <w:instrText xml:space="preserve"> PAGEREF _Toc241509343 \h </w:instrText>
             </w:r>
             <w:r>
               <w:rPr>
@@ -2697,7 +2764,7 @@
               <w14:ligatures w14:val="standardContextual"/>
             </w:rPr>
           </w:pPr>
-          <w:hyperlink w:anchor="_Toc241508919" w:history="1">
+          <w:hyperlink w:anchor="_Toc241509344" w:history="1">
             <w:r>
               <w:rPr>
                 <w:rStyle w:val="Hyperlink"/>
@@ -2721,7 +2788,7 @@
               <w:rPr>
                 <w:noProof/>
               </w:rPr>
-              <w:instrText xml:space="preserve"> PAGEREF _Toc241508919 \h </w:instrText>
+              <w:instrText xml:space="preserve"> PAGEREF _Toc241509344 \h </w:instrText>
             </w:r>
             <w:r>
               <w:rPr>
@@ -2764,7 +2831,7 @@
               <w14:ligatures w14:val="standardContextual"/>
             </w:rPr>
           </w:pPr>
-          <w:hyperlink w:anchor="_Toc241508920" w:history="1">
+          <w:hyperlink w:anchor="_Toc241509345" w:history="1">
             <w:r>
               <w:rPr>
                 <w:rStyle w:val="Hyperlink"/>
@@ -2788,7 +2855,7 @@
               <w:rPr>
                 <w:noProof/>
               </w:rPr>
-              <w:instrText xml:space="preserve"> PAGEREF _Toc241508920 \h </w:instrText>
+              <w:instrText xml:space="preserve"> PAGEREF _Toc241509345 \h </w:instrText>
             </w:r>
             <w:r>
               <w:rPr>
@@ -2831,7 +2898,7 @@
               <w14:ligatures w14:val="standardContextual"/>
             </w:rPr>
           </w:pPr>
-          <w:hyperlink w:anchor="_Toc241508921" w:history="1">
+          <w:hyperlink w:anchor="_Toc241509346" w:history="1">
             <w:r>
               <w:rPr>
                 <w:rStyle w:val="Hyperlink"/>
@@ -2855,7 +2922,7 @@
               <w:rPr>
                 <w:noProof/>
               </w:rPr>
-              <w:instrText xml:space="preserve"> PAGEREF _Toc241508921 \h </w:instrText>
+              <w:instrText xml:space="preserve"> PAGEREF _Toc241509346 \h </w:instrText>
             </w:r>
             <w:r>
               <w:rPr>
@@ -2898,7 +2965,7 @@
               <w14:ligatures w14:val="standardContextual"/>
             </w:rPr>
           </w:pPr>
-          <w:hyperlink w:anchor="_Toc241508922" w:history="1">
+          <w:hyperlink w:anchor="_Toc241509347" w:history="1">
             <w:r>
               <w:rPr>
                 <w:rStyle w:val="Hyperlink"/>
@@ -2922,7 +2989,7 @@
               <w:rPr>
                 <w:noProof/>
               </w:rPr>
-              <w:instrText xml:space="preserve"> PAGEREF _Toc241508922 \h </w:instrText>
+              <w:instrText xml:space="preserve"> PAGEREF _Toc241509347 \h </w:instrText>
             </w:r>
             <w:r>
               <w:rPr>
@@ -2965,7 +3032,7 @@
               <w14:ligatures w14:val="standardContextual"/>
             </w:rPr>
           </w:pPr>
-          <w:hyperlink w:anchor="_Toc241508923" w:history="1">
+          <w:hyperlink w:anchor="_Toc241509348" w:history="1">
             <w:r>
               <w:rPr>
                 <w:rStyle w:val="Hyperlink"/>
@@ -2989,7 +3056,7 @@
               <w:rPr>
                 <w:noProof/>
               </w:rPr>
-              <w:instrText xml:space="preserve"> PAGEREF _Toc241508923 \h </w:instrText>
+              <w:instrText xml:space="preserve"> PAGEREF _Toc241509348 \h </w:instrText>
             </w:r>
             <w:r>
               <w:rPr>
@@ -3032,7 +3099,7 @@
               <w14:ligatures w14:val="standardContextual"/>
             </w:rPr>
           </w:pPr>
-          <w:hyperlink w:anchor="_Toc241508924" w:history="1">
+          <w:hyperlink w:anchor="_Toc241509349" w:history="1">
             <w:r>
               <w:rPr>
                 <w:rStyle w:val="Hyperlink"/>
@@ -3056,7 +3123,7 @@
               <w:rPr>
                 <w:noProof/>
               </w:rPr>
-              <w:instrText xml:space="preserve"> PAGEREF _Toc241508924 \h </w:instrText>
+              <w:instrText xml:space="preserve"> PAGEREF _Toc241509349 \h </w:instrText>
             </w:r>
             <w:r>
               <w:rPr>
@@ -3099,7 +3166,7 @@
               <w14:ligatures w14:val="standardContextual"/>
             </w:rPr>
           </w:pPr>
-          <w:hyperlink w:anchor="_Toc241508925" w:history="1">
+          <w:hyperlink w:anchor="_Toc241509350" w:history="1">
             <w:r>
               <w:rPr>
                 <w:rStyle w:val="Hyperlink"/>
@@ -3123,7 +3190,7 @@
               <w:rPr>
                 <w:noProof/>
               </w:rPr>
-              <w:instrText xml:space="preserve"> PAGEREF _Toc241508925 \h </w:instrText>
+              <w:instrText xml:space="preserve"> PAGEREF _Toc241509350 \h </w:instrText>
             </w:r>
             <w:r>
               <w:rPr>
@@ -3166,7 +3233,7 @@
               <w14:ligatures w14:val="standardContextual"/>
             </w:rPr>
           </w:pPr>
-          <w:hyperlink w:anchor="_Toc241508926" w:history="1">
+          <w:hyperlink w:anchor="_Toc241509351" w:history="1">
             <w:r>
               <w:rPr>
                 <w:rStyle w:val="Hyperlink"/>
@@ -3190,7 +3257,7 @@
               <w:rPr>
                 <w:noProof/>
               </w:rPr>
-              <w:instrText xml:space="preserve"> PAGEREF _Toc241508926 \h </w:instrText>
+              <w:instrText xml:space="preserve"> PAGEREF _Toc241509351 \h </w:instrText>
             </w:r>
             <w:r>
               <w:rPr>
@@ -3233,7 +3300,7 @@
               <w14:ligatures w14:val="standardContextual"/>
             </w:rPr>
           </w:pPr>
-          <w:hyperlink w:anchor="_Toc241508927" w:history="1">
+          <w:hyperlink w:anchor="_Toc241509352" w:history="1">
             <w:r>
               <w:rPr>
                 <w:rStyle w:val="Hyperlink"/>
@@ -3257,7 +3324,7 @@
               <w:rPr>
                 <w:noProof/>
               </w:rPr>
-              <w:instrText xml:space="preserve"> PAGEREF _Toc241508927 \h </w:instrText>
+              <w:instrText xml:space="preserve"> PAGEREF _Toc241509352 \h </w:instrText>
             </w:r>
             <w:r>
               <w:rPr>
@@ -3300,7 +3367,7 @@
               <w14:ligatures w14:val="standardContextual"/>
             </w:rPr>
           </w:pPr>
-          <w:hyperlink w:anchor="_Toc241508928" w:history="1">
+          <w:hyperlink w:anchor="_Toc241509353" w:history="1">
             <w:r>
               <w:rPr>
                 <w:rStyle w:val="Hyperlink"/>
@@ -3324,7 +3391,7 @@
               <w:rPr>
                 <w:noProof/>
               </w:rPr>
-              <w:instrText xml:space="preserve"> PAGEREF _Toc241508928 \h </w:instrText>
+              <w:instrText xml:space="preserve"> PAGEREF _Toc241509353 \h </w:instrText>
             </w:r>
             <w:r>
               <w:rPr>
@@ -3367,7 +3434,7 @@
               <w14:ligatures w14:val="standardContextual"/>
             </w:rPr>
           </w:pPr>
-          <w:hyperlink w:anchor="_Toc241508929" w:history="1">
+          <w:hyperlink w:anchor="_Toc241509354" w:history="1">
             <w:r>
               <w:rPr>
                 <w:rStyle w:val="Hyperlink"/>
@@ -3391,7 +3458,7 @@
               <w:rPr>
                 <w:noProof/>
               </w:rPr>
-              <w:instrText xml:space="preserve"> PAGEREF _Toc241508929 \h </w:instrText>
+              <w:instrText xml:space="preserve"> PAGEREF _Toc241509354 \h </w:instrText>
             </w:r>
             <w:r>
               <w:rPr>
@@ -3434,7 +3501,7 @@
               <w14:ligatures w14:val="standardContextual"/>
             </w:rPr>
           </w:pPr>
-          <w:hyperlink w:anchor="_Toc241508930" w:history="1">
+          <w:hyperlink w:anchor="_Toc241509355" w:history="1">
             <w:r>
               <w:rPr>
                 <w:rStyle w:val="Hyperlink"/>
@@ -3458,7 +3525,7 @@
               <w:rPr>
                 <w:noProof/>
               </w:rPr>
-              <w:instrText xml:space="preserve"> PAGEREF _Toc241508930 \h </w:instrText>
+              <w:instrText xml:space="preserve"> PAGEREF _Toc241509355 \h </w:instrText>
             </w:r>
             <w:r>
               <w:rPr>
@@ -3501,7 +3568,7 @@
       <w:pPr>
         <w:pStyle w:val="Heading1"/>
       </w:pPr>
-      <w:bookmarkStart w:id="0" w:name="_Toc241508881"/>
+      <w:bookmarkStart w:id="0" w:name="_Toc241509305"/>
       <w:r>
         <w:t>1.  Getting started</w:t>
       </w:r>
@@ -3529,7 +3596,7 @@
       <w:pPr>
         <w:pStyle w:val="Heading2"/>
       </w:pPr>
-      <w:bookmarkStart w:id="1" w:name="_Toc241508882"/>
+      <w:bookmarkStart w:id="1" w:name="_Toc241509306"/>
       <w:r>
         <w:t>Opening ShopControl</w:t>
       </w:r>
@@ -3609,7 +3676,7 @@
       <w:pPr>
         <w:pStyle w:val="Heading2"/>
       </w:pPr>
-      <w:bookmarkStart w:id="2" w:name="_Toc241508883"/>
+      <w:bookmarkStart w:id="2" w:name="_Toc241509307"/>
       <w:r>
         <w:t>Finding help</w:t>
       </w:r>
@@ -3712,7 +3779,7 @@
       <w:pPr>
         <w:pStyle w:val="Heading2"/>
       </w:pPr>
-      <w:bookmarkStart w:id="3" w:name="_Toc241508884"/>
+      <w:bookmarkStart w:id="3" w:name="_Toc241509308"/>
       <w:r>
         <w:t>Put the app on your phone's home screen</w:t>
       </w:r>
@@ -3880,7 +3947,7 @@
       <w:pPr>
         <w:pStyle w:val="Heading2"/>
       </w:pPr>
-      <w:bookmarkStart w:id="4" w:name="_Toc241508885"/>
+      <w:bookmarkStart w:id="4" w:name="_Toc241509309"/>
       <w:r>
         <w:t>Logging in</w:t>
       </w:r>
@@ -4050,7 +4117,7 @@
       <w:pPr>
         <w:pStyle w:val="Heading2"/>
       </w:pPr>
-      <w:bookmarkStart w:id="5" w:name="_Toc241508886"/>
+      <w:bookmarkStart w:id="5" w:name="_Toc241509310"/>
       <w:r>
         <w:t>Staying up to date</w:t>
       </w:r>
@@ -4078,7 +4145,7 @@
       <w:pPr>
         <w:pStyle w:val="Heading2"/>
       </w:pPr>
-      <w:bookmarkStart w:id="6" w:name="_Toc241508887"/>
+      <w:bookmarkStart w:id="6" w:name="_Toc241509311"/>
       <w:r>
         <w:t>Who can do what</w:t>
       </w:r>
@@ -4691,7 +4758,7 @@
         <w:pStyle w:val="Heading1"/>
         <w:pageBreakBefore/>
       </w:pPr>
-      <w:bookmarkStart w:id="7" w:name="_Toc241508888"/>
+      <w:bookmarkStart w:id="7" w:name="_Toc241509312"/>
       <w:r>
         <w:t>2.  The Employee App (technicians)</w:t>
       </w:r>
@@ -4709,7 +4776,7 @@
       <w:pPr>
         <w:pStyle w:val="Heading2"/>
       </w:pPr>
-      <w:bookmarkStart w:id="8" w:name="_Toc241508889"/>
+      <w:bookmarkStart w:id="8" w:name="_Toc241509313"/>
       <w:r>
         <w:t>Home screen</w:t>
       </w:r>
@@ -4849,7 +4916,7 @@
       <w:pPr>
         <w:pStyle w:val="Heading2"/>
       </w:pPr>
-      <w:bookmarkStart w:id="9" w:name="_Toc241508890"/>
+      <w:bookmarkStart w:id="9" w:name="_Toc241509314"/>
       <w:r>
         <w:t>Doing your QC checklist</w:t>
       </w:r>
@@ -5026,6 +5093,36 @@
         <w:t>Reassy QC</w:t>
       </w:r>
       <w:r>
+        <w:t xml:space="preserve">. The same goes for </w:t>
+      </w:r>
+      <w:r>
+        <w:rPr>
+          <w:b/>
+          <w:bCs/>
+        </w:rPr>
+        <w:t>Check-In</w:t>
+      </w:r>
+      <w:r>
+        <w:t xml:space="preserve">: whoever checks cars in often does the final QC too, so they get </w:t>
+      </w:r>
+      <w:r>
+        <w:rPr>
+          <w:b/>
+          <w:bCs/>
+        </w:rPr>
+        <w:t>Check-In QC</w:t>
+      </w:r>
+      <w:r>
+        <w:t xml:space="preserve"> and </w:t>
+      </w:r>
+      <w:r>
+        <w:rPr>
+          <w:b/>
+          <w:bCs/>
+        </w:rPr>
+        <w:t>Final QC</w:t>
+      </w:r>
+      <w:r>
         <w:t>. If you cover another department too, the office can add that checklist to your account and it shows as another button.</w:t>
       </w:r>
     </w:p>
@@ -5033,7 +5130,7 @@
       <w:pPr>
         <w:pStyle w:val="Heading2"/>
       </w:pPr>
-      <w:bookmarkStart w:id="10" w:name="_Toc241508891"/>
+      <w:bookmarkStart w:id="10" w:name="_Toc241509315"/>
       <w:r>
         <w:t>Signing and rework</w:t>
       </w:r>
@@ -5153,7 +5250,7 @@
       <w:pPr>
         <w:pStyle w:val="Heading2"/>
       </w:pPr>
-      <w:bookmarkStart w:id="11" w:name="_Toc241508892"/>
+      <w:bookmarkStart w:id="11" w:name="_Toc241509316"/>
       <w:r>
         <w:t>Other departments' checklists</w:t>
       </w:r>
@@ -5181,7 +5278,7 @@
       <w:pPr>
         <w:pStyle w:val="Heading2"/>
       </w:pPr>
-      <w:bookmarkStart w:id="12" w:name="_Toc241508893"/>
+      <w:bookmarkStart w:id="12" w:name="_Toc241509317"/>
       <w:r>
         <w:t>Photos and parts</w:t>
       </w:r>
@@ -5252,7 +5349,7 @@
         <w:pStyle w:val="Heading1"/>
         <w:pageBreakBefore/>
       </w:pPr>
-      <w:bookmarkStart w:id="13" w:name="_Toc241508894"/>
+      <w:bookmarkStart w:id="13" w:name="_Toc241509318"/>
       <w:r>
         <w:t>3.  Staff Hub: time off, mailbox and company info</w:t>
       </w:r>
@@ -5280,7 +5377,7 @@
       <w:pPr>
         <w:pStyle w:val="Heading2"/>
       </w:pPr>
-      <w:bookmarkStart w:id="14" w:name="_Toc241508895"/>
+      <w:bookmarkStart w:id="14" w:name="_Toc241509319"/>
       <w:r>
         <w:t>Requesting time off</w:t>
       </w:r>
@@ -5443,7 +5540,7 @@
       <w:pPr>
         <w:pStyle w:val="Heading2"/>
       </w:pPr>
-      <w:bookmarkStart w:id="15" w:name="_Toc241508896"/>
+      <w:bookmarkStart w:id="15" w:name="_Toc241509320"/>
       <w:r>
         <w:t>Checking your requests</w:t>
       </w:r>
@@ -5498,7 +5595,7 @@
       <w:pPr>
         <w:pStyle w:val="Heading2"/>
       </w:pPr>
-      <w:bookmarkStart w:id="16" w:name="_Toc241508897"/>
+      <w:bookmarkStart w:id="16" w:name="_Toc241509321"/>
       <w:r>
         <w:t>Mailbox</w:t>
       </w:r>
@@ -5567,7 +5664,7 @@
       <w:pPr>
         <w:pStyle w:val="Heading2"/>
       </w:pPr>
-      <w:bookmarkStart w:id="17" w:name="_Toc241508898"/>
+      <w:bookmarkStart w:id="17" w:name="_Toc241509322"/>
       <w:r>
         <w:t>Company info and this manual</w:t>
       </w:r>
@@ -5603,7 +5700,7 @@
         <w:pStyle w:val="Heading1"/>
         <w:pageBreakBefore/>
       </w:pPr>
-      <w:bookmarkStart w:id="18" w:name="_Toc241508899"/>
+      <w:bookmarkStart w:id="18" w:name="_Toc241509323"/>
       <w:r>
         <w:t>4.  Dashboard</w:t>
       </w:r>
@@ -5742,7 +5839,7 @@
         <w:pStyle w:val="Heading1"/>
         <w:pageBreakBefore/>
       </w:pPr>
-      <w:bookmarkStart w:id="19" w:name="_Toc241508900"/>
+      <w:bookmarkStart w:id="19" w:name="_Toc241509324"/>
       <w:r>
         <w:t>5.  Jobs and the Daily GO List</w:t>
       </w:r>
@@ -5770,7 +5867,7 @@
       <w:pPr>
         <w:pStyle w:val="Heading2"/>
       </w:pPr>
-      <w:bookmarkStart w:id="20" w:name="_Toc241508901"/>
+      <w:bookmarkStart w:id="20" w:name="_Toc241509325"/>
       <w:r>
         <w:t>RO numbers</w:t>
       </w:r>
@@ -5856,7 +5953,7 @@
       <w:pPr>
         <w:pStyle w:val="Heading2"/>
       </w:pPr>
-      <w:bookmarkStart w:id="21" w:name="_Toc241508902"/>
+      <w:bookmarkStart w:id="21" w:name="_Toc241509326"/>
       <w:r>
         <w:t>Adding or editing a job</w:t>
       </w:r>
@@ -5976,7 +6073,7 @@
       <w:pPr>
         <w:pStyle w:val="Heading2"/>
       </w:pPr>
-      <w:bookmarkStart w:id="22" w:name="_Toc241508903"/>
+      <w:bookmarkStart w:id="22" w:name="_Toc241509327"/>
       <w:r>
         <w:t>Customer updates</w:t>
       </w:r>
@@ -6145,7 +6242,7 @@
         <w:pStyle w:val="Heading1"/>
         <w:pageBreakBefore/>
       </w:pPr>
-      <w:bookmarkStart w:id="23" w:name="_Toc241508904"/>
+      <w:bookmarkStart w:id="23" w:name="_Toc241509328"/>
       <w:r>
         <w:t>6.  Production, Delivery and Planning boards</w:t>
       </w:r>
@@ -6155,7 +6252,7 @@
       <w:pPr>
         <w:pStyle w:val="Heading2"/>
       </w:pPr>
-      <w:bookmarkStart w:id="24" w:name="_Toc241508905"/>
+      <w:bookmarkStart w:id="24" w:name="_Toc241509329"/>
       <w:r>
         <w:t>Production Board</w:t>
       </w:r>
@@ -6283,7 +6380,7 @@
       <w:pPr>
         <w:pStyle w:val="Heading2"/>
       </w:pPr>
-      <w:bookmarkStart w:id="25" w:name="_Toc241508906"/>
+      <w:bookmarkStart w:id="25" w:name="_Toc241509330"/>
       <w:r>
         <w:t>Vehicle pictures</w:t>
       </w:r>
@@ -6341,7 +6438,7 @@
       <w:pPr>
         <w:pStyle w:val="Heading2"/>
       </w:pPr>
-      <w:bookmarkStart w:id="26" w:name="_Toc241508907"/>
+      <w:bookmarkStart w:id="26" w:name="_Toc241509331"/>
       <w:r>
         <w:t>Delivery and Planning boards</w:t>
       </w:r>
@@ -6431,7 +6528,7 @@
       <w:pPr>
         <w:pStyle w:val="Heading2"/>
       </w:pPr>
-      <w:bookmarkStart w:id="27" w:name="_Toc241508908"/>
+      <w:bookmarkStart w:id="27" w:name="_Toc241509332"/>
       <w:r>
         <w:t>TV display</w:t>
       </w:r>
@@ -6460,7 +6557,7 @@
         <w:pStyle w:val="Heading1"/>
         <w:pageBreakBefore/>
       </w:pPr>
-      <w:bookmarkStart w:id="28" w:name="_Toc241508909"/>
+      <w:bookmarkStart w:id="28" w:name="_Toc241509333"/>
       <w:r>
         <w:t>7.  CCC estimates coming into ShopControl</w:t>
       </w:r>
@@ -6569,7 +6666,7 @@
         <w:pStyle w:val="Heading1"/>
         <w:pageBreakBefore/>
       </w:pPr>
-      <w:bookmarkStart w:id="29" w:name="_Toc241508910"/>
+      <w:bookmarkStart w:id="29" w:name="_Toc241509334"/>
       <w:r>
         <w:t>8.  Parts</w:t>
       </w:r>
@@ -6627,7 +6724,7 @@
       <w:pPr>
         <w:pStyle w:val="Heading2"/>
       </w:pPr>
-      <w:bookmarkStart w:id="30" w:name="_Toc241508911"/>
+      <w:bookmarkStart w:id="30" w:name="_Toc241509335"/>
       <w:r>
         <w:t>What counts as a problem</w:t>
       </w:r>
@@ -6695,7 +6792,7 @@
       <w:pPr>
         <w:pStyle w:val="Heading2"/>
       </w:pPr>
-      <w:bookmarkStart w:id="31" w:name="_Toc241508912"/>
+      <w:bookmarkStart w:id="31" w:name="_Toc241509336"/>
       <w:r>
         <w:t>Ordering parts</w:t>
       </w:r>
@@ -6802,7 +6899,7 @@
       <w:pPr>
         <w:pStyle w:val="Heading2"/>
       </w:pPr>
-      <w:bookmarkStart w:id="32" w:name="_Toc241508913"/>
+      <w:bookmarkStart w:id="32" w:name="_Toc241509337"/>
       <w:r>
         <w:t>Mirror matching and carts</w:t>
       </w:r>
@@ -6912,7 +7009,7 @@
       <w:pPr>
         <w:pStyle w:val="Heading2"/>
       </w:pPr>
-      <w:bookmarkStart w:id="33" w:name="_Toc241508914"/>
+      <w:bookmarkStart w:id="33" w:name="_Toc241509338"/>
       <w:r>
         <w:t>Other parts screens</w:t>
       </w:r>
@@ -7003,7 +7100,7 @@
         <w:pStyle w:val="Heading1"/>
         <w:pageBreakBefore/>
       </w:pPr>
-      <w:bookmarkStart w:id="34" w:name="_Toc241508915"/>
+      <w:bookmarkStart w:id="34" w:name="_Toc241509339"/>
       <w:r>
         <w:t>9.  Vehicle QC (office view)</w:t>
       </w:r>
@@ -7035,6 +7132,92 @@
       </w:r>
       <w:r>
         <w:t xml:space="preserve"> to see each item, the notes and the signature.</w:t>
+      </w:r>
+    </w:p>
+    <w:p>
+      <w:pPr>
+        <w:pStyle w:val="Heading2"/>
+      </w:pPr>
+      <w:bookmarkStart w:id="35" w:name="_Toc241509340"/>
+      <w:r>
+        <w:t>Pulling up a car's QC report</w:t>
+      </w:r>
+      <w:bookmarkEnd w:id="35"/>
+    </w:p>
+    <w:p>
+      <w:pPr>
+        <w:spacing w:after="120"/>
+      </w:pPr>
+      <w:r>
+        <w:t xml:space="preserve">Every checklist is saved in ShopControl under the car's RO number, so nothing is lost when the car is delivered. To see everything for one car on a single page, click </w:t>
+      </w:r>
+      <w:r>
+        <w:rPr>
+          <w:b/>
+          <w:bCs/>
+        </w:rPr>
+        <w:t>Car report</w:t>
+      </w:r>
+      <w:r>
+        <w:t xml:space="preserve"> on any of its rows in the </w:t>
+      </w:r>
+      <w:r>
+        <w:rPr>
+          <w:b/>
+          <w:bCs/>
+        </w:rPr>
+        <w:t>Vehicle QC</w:t>
+      </w:r>
+      <w:r>
+        <w:t xml:space="preserve"> tab, or open the car on the </w:t>
+      </w:r>
+      <w:r>
+        <w:rPr>
+          <w:b/>
+          <w:bCs/>
+        </w:rPr>
+        <w:t>Production Board</w:t>
+      </w:r>
+      <w:r>
+        <w:t xml:space="preserve"> and click </w:t>
+      </w:r>
+      <w:r>
+        <w:rPr>
+          <w:b/>
+          <w:bCs/>
+        </w:rPr>
+        <w:t>QC report</w:t>
+      </w:r>
+      <w:r>
+        <w:t>.</w:t>
+      </w:r>
+    </w:p>
+    <w:p>
+      <w:pPr>
+        <w:spacing w:after="120"/>
+      </w:pPr>
+      <w:r>
+        <w:t xml:space="preserve">The report opens in a new tab and shows all five checklists in shop order: every item, values like the A/C vent temperature, notes, rework, who did it and when, and their signature. Departments nobody has started say </w:t>
+      </w:r>
+      <w:r>
+        <w:rPr>
+          <w:b/>
+          <w:bCs/>
+        </w:rPr>
+        <w:t>Not started</w:t>
+      </w:r>
+      <w:r>
+        <w:t xml:space="preserve">. Click </w:t>
+      </w:r>
+      <w:r>
+        <w:rPr>
+          <w:b/>
+          <w:bCs/>
+        </w:rPr>
+        <w:t>Print / Save as PDF</w:t>
+      </w:r>
+      <w:r>
+        <w:t xml:space="preserve"> to print it or keep a PDF copy for the file.</w:t>
       </w:r>
     </w:p>
     <w:p>
@@ -7070,21 +7253,21 @@
         <w:pStyle w:val="Heading1"/>
         <w:pageBreakBefore/>
       </w:pPr>
-      <w:bookmarkStart w:id="35" w:name="_Toc241508916"/>
+      <w:bookmarkStart w:id="36" w:name="_Toc241509341"/>
       <w:r>
         <w:t>10.  Office tools</w:t>
       </w:r>
-      <w:bookmarkEnd w:id="35"/>
+      <w:bookmarkEnd w:id="36"/>
     </w:p>
     <w:p>
       <w:pPr>
         <w:pStyle w:val="Heading2"/>
       </w:pPr>
-      <w:bookmarkStart w:id="36" w:name="_Toc241508917"/>
+      <w:bookmarkStart w:id="37" w:name="_Toc241509342"/>
       <w:r>
         <w:t>Missed Calls / Callback Requests</w:t>
       </w:r>
-      <w:bookmarkEnd w:id="36"/>
+      <w:bookmarkEnd w:id="37"/>
     </w:p>
     <w:p>
       <w:pPr>
@@ -7158,11 +7341,11 @@
       <w:pPr>
         <w:pStyle w:val="Heading2"/>
       </w:pPr>
-      <w:bookmarkStart w:id="37" w:name="_Toc241508918"/>
+      <w:bookmarkStart w:id="38" w:name="_Toc241509343"/>
       <w:r>
         <w:t>Tasks</w:t>
       </w:r>
-      <w:bookmarkEnd w:id="37"/>
+      <w:bookmarkEnd w:id="38"/>
     </w:p>
     <w:p>
       <w:pPr>
@@ -7176,11 +7359,11 @@
       <w:pPr>
         <w:pStyle w:val="Heading2"/>
       </w:pPr>
-      <w:bookmarkStart w:id="38" w:name="_Toc241508919"/>
+      <w:bookmarkStart w:id="39" w:name="_Toc241509344"/>
       <w:r>
         <w:t>Booth Filters and Facility Checklist</w:t>
       </w:r>
-      <w:bookmarkEnd w:id="38"/>
+      <w:bookmarkEnd w:id="39"/>
     </w:p>
     <w:p>
       <w:pPr>
@@ -7214,11 +7397,11 @@
       <w:pPr>
         <w:pStyle w:val="Heading2"/>
       </w:pPr>
-      <w:bookmarkStart w:id="39" w:name="_Toc241508920"/>
+      <w:bookmarkStart w:id="40" w:name="_Toc241509345"/>
       <w:r>
         <w:t>AR Balances and Cycle Time</w:t>
       </w:r>
-      <w:bookmarkEnd w:id="39"/>
+      <w:bookmarkEnd w:id="40"/>
     </w:p>
     <w:p>
       <w:pPr>
@@ -7264,11 +7447,11 @@
       <w:pPr>
         <w:pStyle w:val="Heading2"/>
       </w:pPr>
-      <w:bookmarkStart w:id="40" w:name="_Toc241508921"/>
+      <w:bookmarkStart w:id="41" w:name="_Toc241509346"/>
       <w:r>
         <w:t>Photos and Activity Log</w:t>
       </w:r>
-      <w:bookmarkEnd w:id="40"/>
+      <w:bookmarkEnd w:id="41"/>
     </w:p>
     <w:p>
       <w:pPr>
@@ -7315,21 +7498,21 @@
         <w:pStyle w:val="Heading1"/>
         <w:pageBreakBefore/>
       </w:pPr>
-      <w:bookmarkStart w:id="41" w:name="_Toc241508922"/>
+      <w:bookmarkStart w:id="42" w:name="_Toc241509347"/>
       <w:r>
         <w:t>11.  Time off and messages (office and admins)</w:t>
       </w:r>
-      <w:bookmarkEnd w:id="41"/>
+      <w:bookmarkEnd w:id="42"/>
     </w:p>
     <w:p>
       <w:pPr>
         <w:pStyle w:val="Heading2"/>
       </w:pPr>
-      <w:bookmarkStart w:id="42" w:name="_Toc241508923"/>
+      <w:bookmarkStart w:id="43" w:name="_Toc241509348"/>
       <w:r>
         <w:t>Time Off tab</w:t>
       </w:r>
-      <w:bookmarkEnd w:id="42"/>
+      <w:bookmarkEnd w:id="43"/>
     </w:p>
     <w:p>
       <w:pPr>
@@ -7453,11 +7636,11 @@
       <w:pPr>
         <w:pStyle w:val="Heading2"/>
       </w:pPr>
-      <w:bookmarkStart w:id="43" w:name="_Toc241508924"/>
+      <w:bookmarkStart w:id="44" w:name="_Toc241509349"/>
       <w:r>
         <w:t>Messages &amp; Info tab</w:t>
       </w:r>
-      <w:bookmarkEnd w:id="43"/>
+      <w:bookmarkEnd w:id="44"/>
     </w:p>
     <w:p>
       <w:pPr>
@@ -7544,21 +7727,21 @@
         <w:pStyle w:val="Heading1"/>
         <w:pageBreakBefore/>
       </w:pPr>
-      <w:bookmarkStart w:id="44" w:name="_Toc241508925"/>
+      <w:bookmarkStart w:id="45" w:name="_Toc241509350"/>
       <w:r>
         <w:t>12.  Admin: employees and settings</w:t>
       </w:r>
-      <w:bookmarkEnd w:id="44"/>
+      <w:bookmarkEnd w:id="45"/>
     </w:p>
     <w:p>
       <w:pPr>
         <w:pStyle w:val="Heading2"/>
       </w:pPr>
-      <w:bookmarkStart w:id="45" w:name="_Toc241508926"/>
+      <w:bookmarkStart w:id="46" w:name="_Toc241509351"/>
       <w:r>
         <w:t>Adding an employee</w:t>
       </w:r>
-      <w:bookmarkEnd w:id="45"/>
+      <w:bookmarkEnd w:id="46"/>
     </w:p>
     <w:p>
       <w:pPr>
@@ -7676,11 +7859,11 @@
       <w:pPr>
         <w:pStyle w:val="Heading2"/>
       </w:pPr>
-      <w:bookmarkStart w:id="46" w:name="_Toc241508927"/>
+      <w:bookmarkStart w:id="47" w:name="_Toc241509352"/>
       <w:r>
         <w:t>Changing an employee</w:t>
       </w:r>
-      <w:bookmarkEnd w:id="46"/>
+      <w:bookmarkEnd w:id="47"/>
     </w:p>
     <w:p>
       <w:pPr>
@@ -7719,7 +7902,27 @@
         <w:t>Reassy</w:t>
       </w:r>
       <w:r>
-        <w:t xml:space="preserve"> checklist too. Use </w:t>
+        <w:t xml:space="preserve"> checklist too, and </w:t>
+      </w:r>
+      <w:r>
+        <w:rPr>
+          <w:b/>
+          <w:bCs/>
+        </w:rPr>
+        <w:t>Check-In</w:t>
+      </w:r>
+      <w:r>
+        <w:t xml:space="preserve"> automatically gives them </w:t>
+      </w:r>
+      <w:r>
+        <w:rPr>
+          <w:b/>
+          <w:bCs/>
+        </w:rPr>
+        <w:t>Final QC</w:t>
+      </w:r>
+      <w:r>
+        <w:t xml:space="preserve">. Use </w:t>
       </w:r>
       <w:r>
         <w:rPr>
@@ -7816,11 +8019,11 @@
       <w:pPr>
         <w:pStyle w:val="Heading2"/>
       </w:pPr>
-      <w:bookmarkStart w:id="47" w:name="_Toc241508928"/>
+      <w:bookmarkStart w:id="48" w:name="_Toc241509353"/>
       <w:r>
         <w:t>Board Settings</w:t>
       </w:r>
-      <w:bookmarkEnd w:id="47"/>
+      <w:bookmarkEnd w:id="48"/>
     </w:p>
     <w:p>
       <w:pPr>
@@ -7835,11 +8038,11 @@
         <w:pStyle w:val="Heading1"/>
         <w:pageBreakBefore/>
       </w:pPr>
-      <w:bookmarkStart w:id="48" w:name="_Toc241508929"/>
+      <w:bookmarkStart w:id="49" w:name="_Toc241509354"/>
       <w:r>
         <w:t>13.  Quick answers</w:t>
       </w:r>
-      <w:bookmarkEnd w:id="48"/>
+      <w:bookmarkEnd w:id="49"/>
     </w:p>
     <w:tbl>
       <w:tblPr>
@@ -8479,11 +8682,11 @@
         <w:pStyle w:val="Heading1"/>
         <w:pageBreakBefore/>
       </w:pPr>
-      <w:bookmarkStart w:id="49" w:name="_Toc241508930"/>
+      <w:bookmarkStart w:id="50" w:name="_Toc241509355"/>
       <w:r>
         <w:t>Manual versions</w:t>
       </w:r>
-      <w:bookmarkEnd w:id="49"/>
+      <w:bookmarkEnd w:id="50"/>
     </w:p>
     <w:tbl>
       <w:tblPr>
@@ -8634,7 +8837,7 @@
                 <w:b/>
                 <w:bCs/>
               </w:rPr>
-              <w:t>1.5</w:t>
+              <w:t>1.6</w:t>
             </w:r>
           </w:p>
         </w:tc>
@@ -8678,17 +8881,37 @@
           </w:tcPr>
           <w:p>
             <w:r>
-              <w:t xml:space="preserve">Body technicians automatically get the </w:t>
+              <w:t xml:space="preserve">Whoever does </w:t>
             </w:r>
             <w:r>
               <w:rPr>
                 <w:b/>
                 <w:bCs/>
               </w:rPr>
-              <w:t>Reassy</w:t>
-            </w:r>
-            <w:r>
-              <w:t xml:space="preserve"> checklist too.</w:t>
+              <w:t>Check-In</w:t>
+            </w:r>
+            <w:r>
+              <w:t xml:space="preserve"> automatically gets the </w:t>
+            </w:r>
+            <w:r>
+              <w:rPr>
+                <w:b/>
+                <w:bCs/>
+              </w:rPr>
+              <w:t>Final QC</w:t>
+            </w:r>
+            <w:r>
+              <w:t xml:space="preserve"> checklist too. New </w:t>
+            </w:r>
+            <w:r>
+              <w:rPr>
+                <w:b/>
+                <w:bCs/>
+              </w:rPr>
+              <w:t>QC report</w:t>
+            </w:r>
+            <w:r>
+              <w:t xml:space="preserve"> for each car: all five checklists with signatures on one printable page.</w:t>
             </w:r>
           </w:p>
         </w:tc>
@@ -8725,7 +8948,7 @@
                 <w:b/>
                 <w:bCs/>
               </w:rPr>
-              <w:t>1.4</w:t>
+              <w:t>1.5</w:t>
             </w:r>
           </w:p>
         </w:tc>
@@ -8769,17 +8992,17 @@
           </w:tcPr>
           <w:p>
             <w:r>
-              <w:t xml:space="preserve">Employees can be set to </w:t>
+              <w:t xml:space="preserve">Body technicians automatically get the </w:t>
             </w:r>
             <w:r>
               <w:rPr>
                 <w:b/>
                 <w:bCs/>
               </w:rPr>
-              <w:t>also do</w:t>
-            </w:r>
-            <w:r>
-              <w:t xml:space="preserve"> other checklists (for example a body tech who reassembles also gets the Reassy checklist).</w:t>
+              <w:t>Reassy</w:t>
+            </w:r>
+            <w:r>
+              <w:t xml:space="preserve"> checklist too.</w:t>
             </w:r>
           </w:p>
         </w:tc>
@@ -8816,7 +9039,7 @@
                 <w:b/>
                 <w:bCs/>
               </w:rPr>
-              <w:t>1.3</w:t>
+              <w:t>1.4</w:t>
             </w:r>
           </w:p>
         </w:tc>
@@ -8860,7 +9083,17 @@
           </w:tcPr>
           <w:p>
             <w:r>
-              <w:t>New accounts and admin password resets use a temporary password; you choose your own the first time you sign in.</w:t>
+              <w:t xml:space="preserve">Employees can be set to </w:t>
+            </w:r>
+            <w:r>
+              <w:rPr>
+                <w:b/>
+                <w:bCs/>
+              </w:rPr>
+              <w:t>also do</w:t>
+            </w:r>
+            <w:r>
+              <w:t xml:space="preserve"> other checklists (for example a body tech who reassembles also gets the Reassy checklist).</w:t>
             </w:r>
           </w:p>
         </w:tc>
@@ -8897,7 +9130,7 @@
                 <w:b/>
                 <w:bCs/>
               </w:rPr>
-              <w:t>1.2</w:t>
+              <w:t>1.3</w:t>
             </w:r>
           </w:p>
         </w:tc>
@@ -8941,17 +9174,7 @@
           </w:tcPr>
           <w:p>
             <w:r>
-              <w:t xml:space="preserve">Added the </w:t>
-            </w:r>
-            <w:r>
-              <w:rPr>
-                <w:b/>
-                <w:bCs/>
-              </w:rPr>
-              <w:t>Help</w:t>
-            </w:r>
-            <w:r>
-              <w:t xml:space="preserve"> tab in the office program and a search box in the manual.</w:t>
+              <w:t>New accounts and admin password resets use a temporary password; you choose your own the first time you sign in.</w:t>
             </w:r>
           </w:p>
         </w:tc>
@@ -8988,7 +9211,7 @@
                 <w:b/>
                 <w:bCs/>
               </w:rPr>
-              <w:t>1.1</w:t>
+              <w:t>1.2</w:t>
             </w:r>
           </w:p>
         </w:tc>
@@ -9032,17 +9255,17 @@
           </w:tcPr>
           <w:p>
             <w:r>
-              <w:t xml:space="preserve">Employee App address is now </w:t>
+              <w:t xml:space="preserve">Added the </w:t>
             </w:r>
             <w:r>
               <w:rPr>
                 <w:b/>
                 <w:bCs/>
               </w:rPr>
-              <w:t>https://conceptautobody.app</w:t>
-            </w:r>
-            <w:r>
-              <w:t xml:space="preserve"> and works on phones anywhere. Added how to put it on your phone's home screen.</w:t>
+              <w:t>Help</w:t>
+            </w:r>
+            <w:r>
+              <w:t xml:space="preserve"> tab in the office program and a search box in the manual.</w:t>
             </w:r>
           </w:p>
         </w:tc>
@@ -9079,7 +9302,7 @@
                 <w:b/>
                 <w:bCs/>
               </w:rPr>
-              <w:t>1.0</w:t>
+              <w:t>1.1</w:t>
             </w:r>
           </w:p>
         </w:tc>
@@ -9123,6 +9346,97 @@
           </w:tcPr>
           <w:p>
             <w:r>
+              <w:t xml:space="preserve">Employee App address is now </w:t>
+            </w:r>
+            <w:r>
+              <w:rPr>
+                <w:b/>
+                <w:bCs/>
+              </w:rPr>
+              <w:t>https://conceptautobody.app</w:t>
+            </w:r>
+            <w:r>
+              <w:t xml:space="preserve"> and works on phones anywhere. Added how to put it on your phone's home screen.</w:t>
+            </w:r>
+          </w:p>
+        </w:tc>
+      </w:tr>
+      <w:tr>
+        <w:tblPrEx>
+          <w:tblCellMar>
+            <w:top w:w="0" w:type="dxa"/>
+            <w:bottom w:w="0" w:type="dxa"/>
+          </w:tblCellMar>
+        </w:tblPrEx>
+        <w:trPr>
+          <w:cantSplit/>
+        </w:trPr>
+        <w:tc>
+          <w:tcPr>
+            <w:tcW w:w="3120" w:type="dxa"/>
+            <w:tcBorders>
+              <w:top w:val="single" w:sz="4" w:space="0" w:color="C9CFD6"/>
+              <w:left w:val="single" w:sz="4" w:space="0" w:color="C9CFD6"/>
+              <w:bottom w:val="single" w:sz="4" w:space="0" w:color="C9CFD6"/>
+              <w:right w:val="single" w:sz="4" w:space="0" w:color="C9CFD6"/>
+            </w:tcBorders>
+            <w:tcMar>
+              <w:top w:w="80" w:type="dxa"/>
+              <w:left w:w="120" w:type="dxa"/>
+              <w:bottom w:w="80" w:type="dxa"/>
+              <w:right w:w="120" w:type="dxa"/>
+            </w:tcMar>
+          </w:tcPr>
+          <w:p>
+            <w:r>
+              <w:rPr>
+                <w:b/>
+                <w:bCs/>
+              </w:rPr>
+              <w:t>1.0</w:t>
+            </w:r>
+          </w:p>
+        </w:tc>
+        <w:tc>
+          <w:tcPr>
+            <w:tcW w:w="3120" w:type="dxa"/>
+            <w:tcBorders>
+              <w:top w:val="single" w:sz="4" w:space="0" w:color="C9CFD6"/>
+              <w:left w:val="single" w:sz="4" w:space="0" w:color="C9CFD6"/>
+              <w:bottom w:val="single" w:sz="4" w:space="0" w:color="C9CFD6"/>
+              <w:right w:val="single" w:sz="4" w:space="0" w:color="C9CFD6"/>
+            </w:tcBorders>
+            <w:tcMar>
+              <w:top w:w="80" w:type="dxa"/>
+              <w:left w:w="120" w:type="dxa"/>
+              <w:bottom w:w="80" w:type="dxa"/>
+              <w:right w:w="120" w:type="dxa"/>
+            </w:tcMar>
+          </w:tcPr>
+          <w:p>
+            <w:r>
+              <w:t>September 28, 2026</w:t>
+            </w:r>
+          </w:p>
+        </w:tc>
+        <w:tc>
+          <w:tcPr>
+            <w:tcW w:w="3120" w:type="dxa"/>
+            <w:tcBorders>
+              <w:top w:val="single" w:sz="4" w:space="0" w:color="C9CFD6"/>
+              <w:left w:val="single" w:sz="4" w:space="0" w:color="C9CFD6"/>
+              <w:bottom w:val="single" w:sz="4" w:space="0" w:color="C9CFD6"/>
+              <w:right w:val="single" w:sz="4" w:space="0" w:color="C9CFD6"/>
+            </w:tcBorders>
+            <w:tcMar>
+              <w:top w:w="80" w:type="dxa"/>
+              <w:left w:w="120" w:type="dxa"/>
+              <w:bottom w:w="80" w:type="dxa"/>
+              <w:right w:w="120" w:type="dxa"/>
+            </w:tcMar>
+          </w:tcPr>
+          <w:p>
+            <w:r>
               <w:t>First edition.</w:t>
             </w:r>
           </w:p>
@@ -9184,7 +9498,7 @@
         <w:sz w:val="18"/>
         <w:szCs w:val="18"/>
       </w:rPr>
-      <w:t xml:space="preserve">Concept Autobody  ·  Version 1.5  ·  Page </w:t>
+      <w:t xml:space="preserve">Concept Autobody  ·  Version 1.6  ·  Page </w:t>
     </w:r>
     <w:r>
       <w:rPr>
@@ -9277,10 +9591,64 @@
 <file path=word/numbering.xml><?xml version="1.0" encoding="utf-8"?>
 <w:numbering xmlns:wpc="http://schemas.microsoft.com/office/word/2010/wordprocessingCanvas" xmlns:cx="http://schemas.microsoft.com/office/drawing/2014/chartex" xmlns:cx1="http://schemas.microsoft.com/office/drawing/2015/9/8/chartex" xmlns:cx2="http://schemas.microsoft.com/office/drawing/2015/10/21/chartex" xmlns:cx3="http://schemas.microsoft.com/office/drawing/2016/5/9/chartex" xmlns:cx4="http://schemas.microsoft.com/office/drawing/2016/5/10/chartex" xmlns:cx5="http://schemas.microsoft.com/office/drawing/2016/5/11/chartex" xmlns:cx6="http://schemas.microsoft.com/office/drawing/2016/5/12/chartex" xmlns:cx7="http://schemas.microsoft.com/office/drawing/2016/5/13/chartex" xmlns:cx8="http://schemas.microsoft.com/office/drawing/2016/5/14/chartex" xmlns:mc="http://schemas.openxmlformats.org/markup-compatibility/2006" xmlns:aink="http://schemas.microsoft.com/office/drawing/2016/ink" xmlns:am3d="http://schemas.microsoft.com/office/drawing/2017/model3d" xmlns:o="urn:schemas-microsoft-com:office:office" xmlns:oel="http://schemas.microsoft.com/office/2019/extlst" xmlns:r="http://schemas.openxmlformats.org/officeDocument/2006/relationships" xmlns:m="http://schemas.openxmlformats.org/officeDocument/2006/math" xmlns:v="urn:schemas-microsoft-com:vml" xmlns:wp14="http://schemas.microsoft.com/office/word/2010/wordprocessingDrawing" xmlns:wp="http://schemas.openxmlformats.org/drawingml/2006/wordprocessingDrawing" xmlns:w10="urn:schemas-microsoft-com:office:word" xmlns:w="http://schemas.openxmlformats.org/wordprocessingml/2006/main" xmlns:w14="http://schemas.microsoft.com/office/word/2010/wordml" xmlns:w15="http://schemas.microsoft.com/office/word/2012/wordml" xmlns:w16cex="http://schemas.microsoft.com/office/word/2018/wordml/cex" xmlns:w16cid="http://schemas.microsoft.com/office/word/2016/wordml/cid" xmlns:w16="http://schemas.microsoft.com/office/word/2018/wordml" xmlns:w16du="http://schemas.microsoft.com/office/word/2023/wordml/word16du" xmlns:w16sdtdh="http://schemas.microsoft.com/office/word/2020/wordml/sdtdatahash" xmlns:w16sdtfl="http://schemas.microsoft.com/office/word/2024/wordml/sdtformatlock" xmlns:w16se="http://schemas.microsoft.com/office/word/2015/wordml/symex" xmlns:wpg="http://schemas.microsoft.com/office/word/2010/wordprocessingGroup" xmlns:wpi="http://schemas.microsoft.com/office/word/2010/wordprocessingInk" xmlns:wne="http://schemas.microsoft.com/office/word/2006/wordml" xmlns:wps="http://schemas.microsoft.com/office/word/2010/wordprocessingShape" mc:Ignorable="w14 w15 w16se w16cid w16 w16cex w16sdtdh w16sdtfl w16du wp14">
   <w:abstractNum w:abstractNumId="0" w15:restartNumberingAfterBreak="0">
-    <w:nsid w:val="13F37370"/>
+    <w:nsid w:val="1373442F"/>
     <w:multiLevelType w:val="hybridMultilevel"/>
-    <w:tmpl w:val="CE0AE8E0"/>
-    <w:lvl w:ilvl="0" w:tplc="92843600">
+    <w:tmpl w:val="DE40012A"/>
+    <w:lvl w:ilvl="0" w:tplc="28EA0C0C">
+      <w:start w:val="1"/>
+      <w:numFmt w:val="bullet"/>
+      <w:lvlText w:val="•"/>
+      <w:lvlJc w:val="left"/>
+      <w:pPr>
+        <w:ind w:left="540" w:hanging="270"/>
+      </w:pPr>
+    </w:lvl>
+    <w:lvl w:ilvl="1" w:tplc="63BC7822">
+      <w:numFmt w:val="decimal"/>
+      <w:lvlText w:val=""/>
+      <w:lvlJc w:val="left"/>
+    </w:lvl>
+    <w:lvl w:ilvl="2" w:tplc="2E583844">
+      <w:numFmt w:val="decimal"/>
+      <w:lvlText w:val=""/>
+      <w:lvlJc w:val="left"/>
+    </w:lvl>
+    <w:lvl w:ilvl="3" w:tplc="F32450E8">
+      <w:numFmt w:val="decimal"/>
+      <w:lvlText w:val=""/>
+      <w:lvlJc w:val="left"/>
+    </w:lvl>
+    <w:lvl w:ilvl="4" w:tplc="51AED156">
+      <w:numFmt w:val="decimal"/>
+      <w:lvlText w:val=""/>
+      <w:lvlJc w:val="left"/>
+    </w:lvl>
+    <w:lvl w:ilvl="5" w:tplc="7EE824B8">
+      <w:numFmt w:val="decimal"/>
+      <w:lvlText w:val=""/>
+      <w:lvlJc w:val="left"/>
+    </w:lvl>
+    <w:lvl w:ilvl="6" w:tplc="06D67C90">
+      <w:numFmt w:val="decimal"/>
+      <w:lvlText w:val=""/>
+      <w:lvlJc w:val="left"/>
+    </w:lvl>
+    <w:lvl w:ilvl="7" w:tplc="308A6F6C">
+      <w:numFmt w:val="decimal"/>
+      <w:lvlText w:val=""/>
+      <w:lvlJc w:val="left"/>
+    </w:lvl>
+    <w:lvl w:ilvl="8" w:tplc="12084036">
+      <w:numFmt w:val="decimal"/>
+      <w:lvlText w:val=""/>
+      <w:lvlJc w:val="left"/>
+    </w:lvl>
+  </w:abstractNum>
+  <w:abstractNum w:abstractNumId="1" w15:restartNumberingAfterBreak="0">
+    <w:nsid w:val="597F180B"/>
+    <w:multiLevelType w:val="hybridMultilevel"/>
+    <w:tmpl w:val="48BA5478"/>
+    <w:lvl w:ilvl="0" w:tplc="F222B8DC">
       <w:start w:val="1"/>
       <w:numFmt w:val="decimal"/>
       <w:lvlText w:val="%1."/>
@@ -9294,52 +9662,52 @@
         <w:color w:val="E8620E"/>
       </w:rPr>
     </w:lvl>
-    <w:lvl w:ilvl="1" w:tplc="EDC8B780">
+    <w:lvl w:ilvl="1" w:tplc="734CC610">
       <w:numFmt w:val="decimal"/>
       <w:lvlText w:val=""/>
       <w:lvlJc w:val="left"/>
     </w:lvl>
-    <w:lvl w:ilvl="2" w:tplc="49468AFE">
+    <w:lvl w:ilvl="2" w:tplc="F06E3606">
       <w:numFmt w:val="decimal"/>
       <w:lvlText w:val=""/>
       <w:lvlJc w:val="left"/>
     </w:lvl>
-    <w:lvl w:ilvl="3" w:tplc="C40EF9B2">
+    <w:lvl w:ilvl="3" w:tplc="DDD6FD7E">
       <w:numFmt w:val="decimal"/>
       <w:lvlText w:val=""/>
       <w:lvlJc w:val="left"/>
     </w:lvl>
-    <w:lvl w:ilvl="4" w:tplc="C28ABB48">
+    <w:lvl w:ilvl="4" w:tplc="5A2CBE6E">
       <w:numFmt w:val="decimal"/>
       <w:lvlText w:val=""/>
       <w:lvlJc w:val="left"/>
     </w:lvl>
-    <w:lvl w:ilvl="5" w:tplc="4308DCB4">
+    <w:lvl w:ilvl="5" w:tplc="3198EBC8">
       <w:numFmt w:val="decimal"/>
       <w:lvlText w:val=""/>
       <w:lvlJc w:val="left"/>
     </w:lvl>
-    <w:lvl w:ilvl="6" w:tplc="67C8FEB2">
+    <w:lvl w:ilvl="6" w:tplc="1FAA242A">
       <w:numFmt w:val="decimal"/>
       <w:lvlText w:val=""/>
       <w:lvlJc w:val="left"/>
     </w:lvl>
-    <w:lvl w:ilvl="7" w:tplc="A54E46CE">
+    <w:lvl w:ilvl="7" w:tplc="A3F2FFE4">
       <w:numFmt w:val="decimal"/>
       <w:lvlText w:val=""/>
       <w:lvlJc w:val="left"/>
     </w:lvl>
-    <w:lvl w:ilvl="8" w:tplc="DA86F5EE">
+    <w:lvl w:ilvl="8" w:tplc="7952A0E0">
       <w:numFmt w:val="decimal"/>
       <w:lvlText w:val=""/>
       <w:lvlJc w:val="left"/>
     </w:lvl>
   </w:abstractNum>
-  <w:abstractNum w:abstractNumId="1" w15:restartNumberingAfterBreak="0">
-    <w:nsid w:val="3D371A1A"/>
+  <w:abstractNum w:abstractNumId="2" w15:restartNumberingAfterBreak="0">
+    <w:nsid w:val="75DC3AE9"/>
     <w:multiLevelType w:val="hybridMultilevel"/>
-    <w:tmpl w:val="1F0C58CC"/>
-    <w:lvl w:ilvl="0" w:tplc="E2FC5FC2" w:tentative="1">
+    <w:tmpl w:val="F3AEE800"/>
+    <w:lvl w:ilvl="0" w:tplc="DD4654CE" w:tentative="1">
       <w:start w:val="1"/>
       <w:numFmt w:val="bullet"/>
       <w:lvlText w:val="●"/>
@@ -9348,7 +9716,7 @@
         <w:ind w:left="720" w:hanging="360"/>
       </w:pPr>
     </w:lvl>
-    <w:lvl w:ilvl="1" w:tplc="218A1D4E" w:tentative="1">
+    <w:lvl w:ilvl="1" w:tplc="FCD89AE4" w:tentative="1">
       <w:start w:val="1"/>
       <w:numFmt w:val="bullet"/>
       <w:lvlText w:val="○"/>
@@ -9357,7 +9725,7 @@
         <w:ind w:left="1440" w:hanging="360"/>
       </w:pPr>
     </w:lvl>
-    <w:lvl w:ilvl="2" w:tplc="8CFABA6C" w:tentative="1">
+    <w:lvl w:ilvl="2" w:tplc="CC5ECF9C" w:tentative="1">
       <w:start w:val="1"/>
       <w:numFmt w:val="bullet"/>
       <w:lvlText w:val="■"/>
@@ -9366,7 +9734,7 @@
         <w:ind w:left="2160" w:hanging="360"/>
       </w:pPr>
     </w:lvl>
-    <w:lvl w:ilvl="3" w:tplc="6B40E3E2" w:tentative="1">
+    <w:lvl w:ilvl="3" w:tplc="1016645C" w:tentative="1">
       <w:start w:val="1"/>
       <w:numFmt w:val="bullet"/>
       <w:lvlText w:val="●"/>
@@ -9375,7 +9743,7 @@
         <w:ind w:left="2880" w:hanging="360"/>
       </w:pPr>
     </w:lvl>
-    <w:lvl w:ilvl="4" w:tplc="FFE24FBC" w:tentative="1">
+    <w:lvl w:ilvl="4" w:tplc="796CBADA" w:tentative="1">
       <w:start w:val="1"/>
       <w:numFmt w:val="bullet"/>
       <w:lvlText w:val="○"/>
@@ -9384,7 +9752,7 @@
         <w:ind w:left="3600" w:hanging="360"/>
       </w:pPr>
     </w:lvl>
-    <w:lvl w:ilvl="5" w:tplc="5DA611AC" w:tentative="1">
+    <w:lvl w:ilvl="5" w:tplc="F0FA4D44" w:tentative="1">
       <w:start w:val="1"/>
       <w:numFmt w:val="bullet"/>
       <w:lvlText w:val="■"/>
@@ -9393,7 +9761,7 @@
         <w:ind w:left="4320" w:hanging="360"/>
       </w:pPr>
     </w:lvl>
-    <w:lvl w:ilvl="6" w:tplc="74903AEC" w:tentative="1">
+    <w:lvl w:ilvl="6" w:tplc="9942F2CA" w:tentative="1">
       <w:start w:val="1"/>
       <w:numFmt w:val="bullet"/>
       <w:lvlText w:val="●"/>
@@ -9402,7 +9770,7 @@
         <w:ind w:left="5040" w:hanging="360"/>
       </w:pPr>
     </w:lvl>
-    <w:lvl w:ilvl="7" w:tplc="E07EEAA6" w:tentative="1">
+    <w:lvl w:ilvl="7" w:tplc="E1C28B1E" w:tentative="1">
       <w:start w:val="1"/>
       <w:numFmt w:val="bullet"/>
       <w:lvlText w:val="●"/>
@@ -9411,7 +9779,7 @@
         <w:ind w:left="5760" w:hanging="360"/>
       </w:pPr>
     </w:lvl>
-    <w:lvl w:ilvl="8" w:tplc="78EA4FE6" w:tentative="1">
+    <w:lvl w:ilvl="8" w:tplc="A35A56C0" w:tentative="1">
       <w:start w:val="1"/>
       <w:numFmt w:val="bullet"/>
       <w:lvlText w:val="●"/>
@@ -9421,134 +9789,80 @@
       </w:pPr>
     </w:lvl>
   </w:abstractNum>
-  <w:abstractNum w:abstractNumId="2" w15:restartNumberingAfterBreak="0">
-    <w:nsid w:val="5C8D5C9A"/>
-    <w:multiLevelType w:val="hybridMultilevel"/>
-    <w:tmpl w:val="AAAE5C38"/>
-    <w:lvl w:ilvl="0" w:tplc="291A3462">
-      <w:start w:val="1"/>
-      <w:numFmt w:val="bullet"/>
-      <w:lvlText w:val="•"/>
-      <w:lvlJc w:val="left"/>
-      <w:pPr>
-        <w:ind w:left="540" w:hanging="270"/>
-      </w:pPr>
-    </w:lvl>
-    <w:lvl w:ilvl="1" w:tplc="0794016E">
-      <w:numFmt w:val="decimal"/>
-      <w:lvlText w:val=""/>
-      <w:lvlJc w:val="left"/>
-    </w:lvl>
-    <w:lvl w:ilvl="2" w:tplc="56F8DA0E">
-      <w:numFmt w:val="decimal"/>
-      <w:lvlText w:val=""/>
-      <w:lvlJc w:val="left"/>
-    </w:lvl>
-    <w:lvl w:ilvl="3" w:tplc="FA6A78E2">
-      <w:numFmt w:val="decimal"/>
-      <w:lvlText w:val=""/>
-      <w:lvlJc w:val="left"/>
-    </w:lvl>
-    <w:lvl w:ilvl="4" w:tplc="D8BE87D2">
-      <w:numFmt w:val="decimal"/>
-      <w:lvlText w:val=""/>
-      <w:lvlJc w:val="left"/>
-    </w:lvl>
-    <w:lvl w:ilvl="5" w:tplc="F5DCA0D4">
-      <w:numFmt w:val="decimal"/>
-      <w:lvlText w:val=""/>
-      <w:lvlJc w:val="left"/>
-    </w:lvl>
-    <w:lvl w:ilvl="6" w:tplc="5C3E48A6">
-      <w:numFmt w:val="decimal"/>
-      <w:lvlText w:val=""/>
-      <w:lvlJc w:val="left"/>
-    </w:lvl>
-    <w:lvl w:ilvl="7" w:tplc="964C7882">
-      <w:numFmt w:val="decimal"/>
-      <w:lvlText w:val=""/>
-      <w:lvlJc w:val="left"/>
-    </w:lvl>
-    <w:lvl w:ilvl="8" w:tplc="A84C031A">
-      <w:numFmt w:val="decimal"/>
-      <w:lvlText w:val=""/>
-      <w:lvlJc w:val="left"/>
-    </w:lvl>
-  </w:abstractNum>
-  <w:num w:numId="1" w16cid:durableId="2003654258">
+  <w:num w:numId="1" w16cid:durableId="1503396522">
+    <w:abstractNumId w:val="2"/>
+    <w:lvlOverride w:ilvl="0">
+      <w:startOverride w:val="1"/>
+    </w:lvlOverride>
+  </w:num>
+  <w:num w:numId="2" w16cid:durableId="2054650532">
+    <w:abstractNumId w:val="0"/>
+    <w:lvlOverride w:ilvl="0">
+      <w:startOverride w:val="1"/>
+    </w:lvlOverride>
+  </w:num>
+  <w:num w:numId="3" w16cid:durableId="966280475">
     <w:abstractNumId w:val="1"/>
     <w:lvlOverride w:ilvl="0">
       <w:startOverride w:val="1"/>
     </w:lvlOverride>
   </w:num>
-  <w:num w:numId="2" w16cid:durableId="1188134148">
-    <w:abstractNumId w:val="2"/>
+  <w:num w:numId="4" w16cid:durableId="771897447">
+    <w:abstractNumId w:val="1"/>
     <w:lvlOverride w:ilvl="0">
       <w:startOverride w:val="1"/>
     </w:lvlOverride>
   </w:num>
-  <w:num w:numId="3" w16cid:durableId="457997037">
-    <w:abstractNumId w:val="0"/>
+  <w:num w:numId="5" w16cid:durableId="813446076">
+    <w:abstractNumId w:val="1"/>
     <w:lvlOverride w:ilvl="0">
       <w:startOverride w:val="1"/>
     </w:lvlOverride>
   </w:num>
-  <w:num w:numId="4" w16cid:durableId="1771775171">
-    <w:abstractNumId w:val="0"/>
+  <w:num w:numId="6" w16cid:durableId="188178791">
+    <w:abstractNumId w:val="1"/>
     <w:lvlOverride w:ilvl="0">
       <w:startOverride w:val="1"/>
     </w:lvlOverride>
   </w:num>
-  <w:num w:numId="5" w16cid:durableId="1265572927">
-    <w:abstractNumId w:val="0"/>
+  <w:num w:numId="7" w16cid:durableId="1495144388">
+    <w:abstractNumId w:val="1"/>
     <w:lvlOverride w:ilvl="0">
       <w:startOverride w:val="1"/>
     </w:lvlOverride>
   </w:num>
-  <w:num w:numId="6" w16cid:durableId="525875403">
-    <w:abstractNumId w:val="0"/>
+  <w:num w:numId="8" w16cid:durableId="1771271310">
+    <w:abstractNumId w:val="1"/>
     <w:lvlOverride w:ilvl="0">
       <w:startOverride w:val="1"/>
     </w:lvlOverride>
   </w:num>
-  <w:num w:numId="7" w16cid:durableId="1300110374">
-    <w:abstractNumId w:val="0"/>
+  <w:num w:numId="9" w16cid:durableId="1555698099">
+    <w:abstractNumId w:val="1"/>
     <w:lvlOverride w:ilvl="0">
       <w:startOverride w:val="1"/>
     </w:lvlOverride>
   </w:num>
-  <w:num w:numId="8" w16cid:durableId="1855611941">
-    <w:abstractNumId w:val="0"/>
+  <w:num w:numId="10" w16cid:durableId="1464155434">
+    <w:abstractNumId w:val="1"/>
     <w:lvlOverride w:ilvl="0">
       <w:startOverride w:val="1"/>
     </w:lvlOverride>
   </w:num>
-  <w:num w:numId="9" w16cid:durableId="424503052">
-    <w:abstractNumId w:val="0"/>
+  <w:num w:numId="11" w16cid:durableId="5838151">
+    <w:abstractNumId w:val="1"/>
     <w:lvlOverride w:ilvl="0">
       <w:startOverride w:val="1"/>
     </w:lvlOverride>
   </w:num>
-  <w:num w:numId="10" w16cid:durableId="1553081193">
-    <w:abstractNumId w:val="0"/>
+  <w:num w:numId="12" w16cid:durableId="622426347">
+    <w:abstractNumId w:val="1"/>
     <w:lvlOverride w:ilvl="0">
       <w:startOverride w:val="1"/>
     </w:lvlOverride>
   </w:num>
-  <w:num w:numId="11" w16cid:durableId="528179538">
-    <w:abstractNumId w:val="0"/>
-    <w:lvlOverride w:ilvl="0">
-      <w:startOverride w:val="1"/>
-    </w:lvlOverride>
-  </w:num>
-  <w:num w:numId="12" w16cid:durableId="583413547">
-    <w:abstractNumId w:val="0"/>
-    <w:lvlOverride w:ilvl="0">
-      <w:startOverride w:val="1"/>
-    </w:lvlOverride>
-  </w:num>
-  <w:num w:numId="13" w16cid:durableId="730035010">
-    <w:abstractNumId w:val="0"/>
+  <w:num w:numId="13" w16cid:durableId="2100129508">
+    <w:abstractNumId w:val="1"/>
     <w:lvlOverride w:ilvl="0">
       <w:startOverride w:val="1"/>
     </w:lvlOverride>
@@ -10200,7 +10514,7 @@
     <w:autoRedefine/>
     <w:uiPriority w:val="39"/>
     <w:unhideWhenUsed/>
-    <w:rsid w:val="008B4090"/>
+    <w:rsid w:val="00C951A7"/>
     <w:pPr>
       <w:spacing w:after="100"/>
     </w:pPr>
@@ -10212,7 +10526,7 @@
     <w:autoRedefine/>
     <w:uiPriority w:val="39"/>
     <w:unhideWhenUsed/>
-    <w:rsid w:val="008B4090"/>
+    <w:rsid w:val="00C951A7"/>
     <w:pPr>
       <w:spacing w:after="100"/>
       <w:ind w:left="220"/>

</xml_diff>

<commit_message>
Employee app shows where each part is (cart/shelf or storage spot); manual v1.7
Co-Authored-By: Claude Opus 5.5 <noreply@anthropic.com>
</commit_message>
<xml_diff>
--- a/client/manual/ShopControl-User-Manual.docx
+++ b/client/manual/ShopControl-User-Manual.docx
@@ -16,7 +16,7 @@
           <w:noProof/>
         </w:rPr>
         <w:drawing>
-          <wp:inline distT="0" distB="0" distL="0" distR="0" wp14:anchorId="1CAEB953" wp14:editId="1CAEB954">
+          <wp:inline distT="0" distB="0" distL="0" distR="0" wp14:anchorId="773D5AA4" wp14:editId="773D5AA5">
             <wp:extent cx="4000500" cy="1485900"/>
             <wp:effectExtent l="0" t="0" r="0" b="0"/>
             <wp:docPr id="1" name="Picture 1"/>
@@ -93,7 +93,7 @@
         <w:rPr>
           <w:color w:val="5B6776"/>
         </w:rPr>
-        <w:t>Version 1.6  ·  Updated September 28, 2026</w:t>
+        <w:t>Version 1.7  ·  Updated September 28, 2026</w:t>
       </w:r>
     </w:p>
     <w:p>
@@ -122,7 +122,7 @@
     <w:sdt>
       <w:sdtPr>
         <w:alias w:val="Contents"/>
-        <w:id w:val="1160883584"/>
+        <w:id w:val="-373614861"/>
       </w:sdtPr>
       <w:sdtEndPr/>
       <w:sdtContent>
@@ -151,7 +151,7 @@
           <w:r>
             <w:fldChar w:fldCharType="separate"/>
           </w:r>
-          <w:hyperlink w:anchor="_Toc241509305" w:history="1">
+          <w:hyperlink w:anchor="_Toc241510399" w:history="1">
             <w:r>
               <w:rPr>
                 <w:rStyle w:val="Hyperlink"/>
@@ -175,7 +175,7 @@
               <w:rPr>
                 <w:noProof/>
               </w:rPr>
-              <w:instrText xml:space="preserve"> PAGEREF _Toc241509305 \h </w:instrText>
+              <w:instrText xml:space="preserve"> PAGEREF _Toc241510399 \h </w:instrText>
             </w:r>
             <w:r>
               <w:rPr>
@@ -218,7 +218,7 @@
               <w14:ligatures w14:val="standardContextual"/>
             </w:rPr>
           </w:pPr>
-          <w:hyperlink w:anchor="_Toc241509306" w:history="1">
+          <w:hyperlink w:anchor="_Toc241510400" w:history="1">
             <w:r>
               <w:rPr>
                 <w:rStyle w:val="Hyperlink"/>
@@ -242,7 +242,7 @@
               <w:rPr>
                 <w:noProof/>
               </w:rPr>
-              <w:instrText xml:space="preserve"> PAGEREF _Toc241509306 \h </w:instrText>
+              <w:instrText xml:space="preserve"> PAGEREF _Toc241510400 \h </w:instrText>
             </w:r>
             <w:r>
               <w:rPr>
@@ -285,7 +285,7 @@
               <w14:ligatures w14:val="standardContextual"/>
             </w:rPr>
           </w:pPr>
-          <w:hyperlink w:anchor="_Toc241509307" w:history="1">
+          <w:hyperlink w:anchor="_Toc241510401" w:history="1">
             <w:r>
               <w:rPr>
                 <w:rStyle w:val="Hyperlink"/>
@@ -309,7 +309,7 @@
               <w:rPr>
                 <w:noProof/>
               </w:rPr>
-              <w:instrText xml:space="preserve"> PAGEREF _Toc241509307 \h </w:instrText>
+              <w:instrText xml:space="preserve"> PAGEREF _Toc241510401 \h </w:instrText>
             </w:r>
             <w:r>
               <w:rPr>
@@ -352,7 +352,7 @@
               <w14:ligatures w14:val="standardContextual"/>
             </w:rPr>
           </w:pPr>
-          <w:hyperlink w:anchor="_Toc241509308" w:history="1">
+          <w:hyperlink w:anchor="_Toc241510402" w:history="1">
             <w:r>
               <w:rPr>
                 <w:rStyle w:val="Hyperlink"/>
@@ -376,7 +376,7 @@
               <w:rPr>
                 <w:noProof/>
               </w:rPr>
-              <w:instrText xml:space="preserve"> PAGEREF _Toc241509308 \h </w:instrText>
+              <w:instrText xml:space="preserve"> PAGEREF _Toc241510402 \h </w:instrText>
             </w:r>
             <w:r>
               <w:rPr>
@@ -419,7 +419,7 @@
               <w14:ligatures w14:val="standardContextual"/>
             </w:rPr>
           </w:pPr>
-          <w:hyperlink w:anchor="_Toc241509309" w:history="1">
+          <w:hyperlink w:anchor="_Toc241510403" w:history="1">
             <w:r>
               <w:rPr>
                 <w:rStyle w:val="Hyperlink"/>
@@ -443,7 +443,7 @@
               <w:rPr>
                 <w:noProof/>
               </w:rPr>
-              <w:instrText xml:space="preserve"> PAGEREF _Toc241509309 \h </w:instrText>
+              <w:instrText xml:space="preserve"> PAGEREF _Toc241510403 \h </w:instrText>
             </w:r>
             <w:r>
               <w:rPr>
@@ -486,7 +486,7 @@
               <w14:ligatures w14:val="standardContextual"/>
             </w:rPr>
           </w:pPr>
-          <w:hyperlink w:anchor="_Toc241509310" w:history="1">
+          <w:hyperlink w:anchor="_Toc241510404" w:history="1">
             <w:r>
               <w:rPr>
                 <w:rStyle w:val="Hyperlink"/>
@@ -510,7 +510,7 @@
               <w:rPr>
                 <w:noProof/>
               </w:rPr>
-              <w:instrText xml:space="preserve"> PAGEREF _Toc241509310 \h </w:instrText>
+              <w:instrText xml:space="preserve"> PAGEREF _Toc241510404 \h </w:instrText>
             </w:r>
             <w:r>
               <w:rPr>
@@ -553,7 +553,7 @@
               <w14:ligatures w14:val="standardContextual"/>
             </w:rPr>
           </w:pPr>
-          <w:hyperlink w:anchor="_Toc241509311" w:history="1">
+          <w:hyperlink w:anchor="_Toc241510405" w:history="1">
             <w:r>
               <w:rPr>
                 <w:rStyle w:val="Hyperlink"/>
@@ -577,7 +577,7 @@
               <w:rPr>
                 <w:noProof/>
               </w:rPr>
-              <w:instrText xml:space="preserve"> PAGEREF _Toc241509311 \h </w:instrText>
+              <w:instrText xml:space="preserve"> PAGEREF _Toc241510405 \h </w:instrText>
             </w:r>
             <w:r>
               <w:rPr>
@@ -620,7 +620,7 @@
               <w14:ligatures w14:val="standardContextual"/>
             </w:rPr>
           </w:pPr>
-          <w:hyperlink w:anchor="_Toc241509312" w:history="1">
+          <w:hyperlink w:anchor="_Toc241510406" w:history="1">
             <w:r>
               <w:rPr>
                 <w:rStyle w:val="Hyperlink"/>
@@ -644,7 +644,7 @@
               <w:rPr>
                 <w:noProof/>
               </w:rPr>
-              <w:instrText xml:space="preserve"> PAGEREF _Toc241509312 \h </w:instrText>
+              <w:instrText xml:space="preserve"> PAGEREF _Toc241510406 \h </w:instrText>
             </w:r>
             <w:r>
               <w:rPr>
@@ -687,7 +687,7 @@
               <w14:ligatures w14:val="standardContextual"/>
             </w:rPr>
           </w:pPr>
-          <w:hyperlink w:anchor="_Toc241509313" w:history="1">
+          <w:hyperlink w:anchor="_Toc241510407" w:history="1">
             <w:r>
               <w:rPr>
                 <w:rStyle w:val="Hyperlink"/>
@@ -711,7 +711,7 @@
               <w:rPr>
                 <w:noProof/>
               </w:rPr>
-              <w:instrText xml:space="preserve"> PAGEREF _Toc241509313 \h </w:instrText>
+              <w:instrText xml:space="preserve"> PAGEREF _Toc241510407 \h </w:instrText>
             </w:r>
             <w:r>
               <w:rPr>
@@ -754,7 +754,7 @@
               <w14:ligatures w14:val="standardContextual"/>
             </w:rPr>
           </w:pPr>
-          <w:hyperlink w:anchor="_Toc241509314" w:history="1">
+          <w:hyperlink w:anchor="_Toc241510408" w:history="1">
             <w:r>
               <w:rPr>
                 <w:rStyle w:val="Hyperlink"/>
@@ -778,7 +778,7 @@
               <w:rPr>
                 <w:noProof/>
               </w:rPr>
-              <w:instrText xml:space="preserve"> PAGEREF _Toc241509314 \h </w:instrText>
+              <w:instrText xml:space="preserve"> PAGEREF _Toc241510408 \h </w:instrText>
             </w:r>
             <w:r>
               <w:rPr>
@@ -821,7 +821,7 @@
               <w14:ligatures w14:val="standardContextual"/>
             </w:rPr>
           </w:pPr>
-          <w:hyperlink w:anchor="_Toc241509315" w:history="1">
+          <w:hyperlink w:anchor="_Toc241510409" w:history="1">
             <w:r>
               <w:rPr>
                 <w:rStyle w:val="Hyperlink"/>
@@ -845,7 +845,7 @@
               <w:rPr>
                 <w:noProof/>
               </w:rPr>
-              <w:instrText xml:space="preserve"> PAGEREF _Toc241509315 \h </w:instrText>
+              <w:instrText xml:space="preserve"> PAGEREF _Toc241510409 \h </w:instrText>
             </w:r>
             <w:r>
               <w:rPr>
@@ -888,7 +888,7 @@
               <w14:ligatures w14:val="standardContextual"/>
             </w:rPr>
           </w:pPr>
-          <w:hyperlink w:anchor="_Toc241509316" w:history="1">
+          <w:hyperlink w:anchor="_Toc241510410" w:history="1">
             <w:r>
               <w:rPr>
                 <w:rStyle w:val="Hyperlink"/>
@@ -912,7 +912,7 @@
               <w:rPr>
                 <w:noProof/>
               </w:rPr>
-              <w:instrText xml:space="preserve"> PAGEREF _Toc241509316 \h </w:instrText>
+              <w:instrText xml:space="preserve"> PAGEREF _Toc241510410 \h </w:instrText>
             </w:r>
             <w:r>
               <w:rPr>
@@ -955,7 +955,7 @@
               <w14:ligatures w14:val="standardContextual"/>
             </w:rPr>
           </w:pPr>
-          <w:hyperlink w:anchor="_Toc241509317" w:history="1">
+          <w:hyperlink w:anchor="_Toc241510411" w:history="1">
             <w:r>
               <w:rPr>
                 <w:rStyle w:val="Hyperlink"/>
@@ -979,7 +979,7 @@
               <w:rPr>
                 <w:noProof/>
               </w:rPr>
-              <w:instrText xml:space="preserve"> PAGEREF _Toc241509317 \h </w:instrText>
+              <w:instrText xml:space="preserve"> PAGEREF _Toc241510411 \h </w:instrText>
             </w:r>
             <w:r>
               <w:rPr>
@@ -1022,7 +1022,7 @@
               <w14:ligatures w14:val="standardContextual"/>
             </w:rPr>
           </w:pPr>
-          <w:hyperlink w:anchor="_Toc241509318" w:history="1">
+          <w:hyperlink w:anchor="_Toc241510412" w:history="1">
             <w:r>
               <w:rPr>
                 <w:rStyle w:val="Hyperlink"/>
@@ -1046,7 +1046,7 @@
               <w:rPr>
                 <w:noProof/>
               </w:rPr>
-              <w:instrText xml:space="preserve"> PAGEREF _Toc241509318 \h </w:instrText>
+              <w:instrText xml:space="preserve"> PAGEREF _Toc241510412 \h </w:instrText>
             </w:r>
             <w:r>
               <w:rPr>
@@ -1089,7 +1089,7 @@
               <w14:ligatures w14:val="standardContextual"/>
             </w:rPr>
           </w:pPr>
-          <w:hyperlink w:anchor="_Toc241509319" w:history="1">
+          <w:hyperlink w:anchor="_Toc241510413" w:history="1">
             <w:r>
               <w:rPr>
                 <w:rStyle w:val="Hyperlink"/>
@@ -1113,7 +1113,7 @@
               <w:rPr>
                 <w:noProof/>
               </w:rPr>
-              <w:instrText xml:space="preserve"> PAGEREF _Toc241509319 \h </w:instrText>
+              <w:instrText xml:space="preserve"> PAGEREF _Toc241510413 \h </w:instrText>
             </w:r>
             <w:r>
               <w:rPr>
@@ -1156,7 +1156,7 @@
               <w14:ligatures w14:val="standardContextual"/>
             </w:rPr>
           </w:pPr>
-          <w:hyperlink w:anchor="_Toc241509320" w:history="1">
+          <w:hyperlink w:anchor="_Toc241510414" w:history="1">
             <w:r>
               <w:rPr>
                 <w:rStyle w:val="Hyperlink"/>
@@ -1180,7 +1180,7 @@
               <w:rPr>
                 <w:noProof/>
               </w:rPr>
-              <w:instrText xml:space="preserve"> PAGEREF _Toc241509320 \h </w:instrText>
+              <w:instrText xml:space="preserve"> PAGEREF _Toc241510414 \h </w:instrText>
             </w:r>
             <w:r>
               <w:rPr>
@@ -1223,7 +1223,7 @@
               <w14:ligatures w14:val="standardContextual"/>
             </w:rPr>
           </w:pPr>
-          <w:hyperlink w:anchor="_Toc241509321" w:history="1">
+          <w:hyperlink w:anchor="_Toc241510415" w:history="1">
             <w:r>
               <w:rPr>
                 <w:rStyle w:val="Hyperlink"/>
@@ -1247,7 +1247,7 @@
               <w:rPr>
                 <w:noProof/>
               </w:rPr>
-              <w:instrText xml:space="preserve"> PAGEREF _Toc241509321 \h </w:instrText>
+              <w:instrText xml:space="preserve"> PAGEREF _Toc241510415 \h </w:instrText>
             </w:r>
             <w:r>
               <w:rPr>
@@ -1290,7 +1290,7 @@
               <w14:ligatures w14:val="standardContextual"/>
             </w:rPr>
           </w:pPr>
-          <w:hyperlink w:anchor="_Toc241509322" w:history="1">
+          <w:hyperlink w:anchor="_Toc241510416" w:history="1">
             <w:r>
               <w:rPr>
                 <w:rStyle w:val="Hyperlink"/>
@@ -1314,7 +1314,7 @@
               <w:rPr>
                 <w:noProof/>
               </w:rPr>
-              <w:instrText xml:space="preserve"> PAGEREF _Toc241509322 \h </w:instrText>
+              <w:instrText xml:space="preserve"> PAGEREF _Toc241510416 \h </w:instrText>
             </w:r>
             <w:r>
               <w:rPr>
@@ -1357,7 +1357,7 @@
               <w14:ligatures w14:val="standardContextual"/>
             </w:rPr>
           </w:pPr>
-          <w:hyperlink w:anchor="_Toc241509323" w:history="1">
+          <w:hyperlink w:anchor="_Toc241510417" w:history="1">
             <w:r>
               <w:rPr>
                 <w:rStyle w:val="Hyperlink"/>
@@ -1381,7 +1381,7 @@
               <w:rPr>
                 <w:noProof/>
               </w:rPr>
-              <w:instrText xml:space="preserve"> PAGEREF _Toc241509323 \h </w:instrText>
+              <w:instrText xml:space="preserve"> PAGEREF _Toc241510417 \h </w:instrText>
             </w:r>
             <w:r>
               <w:rPr>
@@ -1424,7 +1424,7 @@
               <w14:ligatures w14:val="standardContextual"/>
             </w:rPr>
           </w:pPr>
-          <w:hyperlink w:anchor="_Toc241509324" w:history="1">
+          <w:hyperlink w:anchor="_Toc241510418" w:history="1">
             <w:r>
               <w:rPr>
                 <w:rStyle w:val="Hyperlink"/>
@@ -1448,7 +1448,7 @@
               <w:rPr>
                 <w:noProof/>
               </w:rPr>
-              <w:instrText xml:space="preserve"> PAGEREF _Toc241509324 \h </w:instrText>
+              <w:instrText xml:space="preserve"> PAGEREF _Toc241510418 \h </w:instrText>
             </w:r>
             <w:r>
               <w:rPr>
@@ -1491,7 +1491,7 @@
               <w14:ligatures w14:val="standardContextual"/>
             </w:rPr>
           </w:pPr>
-          <w:hyperlink w:anchor="_Toc241509325" w:history="1">
+          <w:hyperlink w:anchor="_Toc241510419" w:history="1">
             <w:r>
               <w:rPr>
                 <w:rStyle w:val="Hyperlink"/>
@@ -1515,7 +1515,7 @@
               <w:rPr>
                 <w:noProof/>
               </w:rPr>
-              <w:instrText xml:space="preserve"> PAGEREF _Toc241509325 \h </w:instrText>
+              <w:instrText xml:space="preserve"> PAGEREF _Toc241510419 \h </w:instrText>
             </w:r>
             <w:r>
               <w:rPr>
@@ -1558,7 +1558,7 @@
               <w14:ligatures w14:val="standardContextual"/>
             </w:rPr>
           </w:pPr>
-          <w:hyperlink w:anchor="_Toc241509326" w:history="1">
+          <w:hyperlink w:anchor="_Toc241510420" w:history="1">
             <w:r>
               <w:rPr>
                 <w:rStyle w:val="Hyperlink"/>
@@ -1582,7 +1582,7 @@
               <w:rPr>
                 <w:noProof/>
               </w:rPr>
-              <w:instrText xml:space="preserve"> PAGEREF _Toc241509326 \h </w:instrText>
+              <w:instrText xml:space="preserve"> PAGEREF _Toc241510420 \h </w:instrText>
             </w:r>
             <w:r>
               <w:rPr>
@@ -1625,7 +1625,7 @@
               <w14:ligatures w14:val="standardContextual"/>
             </w:rPr>
           </w:pPr>
-          <w:hyperlink w:anchor="_Toc241509327" w:history="1">
+          <w:hyperlink w:anchor="_Toc241510421" w:history="1">
             <w:r>
               <w:rPr>
                 <w:rStyle w:val="Hyperlink"/>
@@ -1649,7 +1649,7 @@
               <w:rPr>
                 <w:noProof/>
               </w:rPr>
-              <w:instrText xml:space="preserve"> PAGEREF _Toc241509327 \h </w:instrText>
+              <w:instrText xml:space="preserve"> PAGEREF _Toc241510421 \h </w:instrText>
             </w:r>
             <w:r>
               <w:rPr>
@@ -1692,7 +1692,7 @@
               <w14:ligatures w14:val="standardContextual"/>
             </w:rPr>
           </w:pPr>
-          <w:hyperlink w:anchor="_Toc241509328" w:history="1">
+          <w:hyperlink w:anchor="_Toc241510422" w:history="1">
             <w:r>
               <w:rPr>
                 <w:rStyle w:val="Hyperlink"/>
@@ -1716,7 +1716,7 @@
               <w:rPr>
                 <w:noProof/>
               </w:rPr>
-              <w:instrText xml:space="preserve"> PAGEREF _Toc241509328 \h </w:instrText>
+              <w:instrText xml:space="preserve"> PAGEREF _Toc241510422 \h </w:instrText>
             </w:r>
             <w:r>
               <w:rPr>
@@ -1759,7 +1759,7 @@
               <w14:ligatures w14:val="standardContextual"/>
             </w:rPr>
           </w:pPr>
-          <w:hyperlink w:anchor="_Toc241509329" w:history="1">
+          <w:hyperlink w:anchor="_Toc241510423" w:history="1">
             <w:r>
               <w:rPr>
                 <w:rStyle w:val="Hyperlink"/>
@@ -1783,7 +1783,7 @@
               <w:rPr>
                 <w:noProof/>
               </w:rPr>
-              <w:instrText xml:space="preserve"> PAGEREF _Toc241509329 \h </w:instrText>
+              <w:instrText xml:space="preserve"> PAGEREF _Toc241510423 \h </w:instrText>
             </w:r>
             <w:r>
               <w:rPr>
@@ -1826,7 +1826,7 @@
               <w14:ligatures w14:val="standardContextual"/>
             </w:rPr>
           </w:pPr>
-          <w:hyperlink w:anchor="_Toc241509330" w:history="1">
+          <w:hyperlink w:anchor="_Toc241510424" w:history="1">
             <w:r>
               <w:rPr>
                 <w:rStyle w:val="Hyperlink"/>
@@ -1850,7 +1850,7 @@
               <w:rPr>
                 <w:noProof/>
               </w:rPr>
-              <w:instrText xml:space="preserve"> PAGEREF _Toc241509330 \h </w:instrText>
+              <w:instrText xml:space="preserve"> PAGEREF _Toc241510424 \h </w:instrText>
             </w:r>
             <w:r>
               <w:rPr>
@@ -1893,7 +1893,7 @@
               <w14:ligatures w14:val="standardContextual"/>
             </w:rPr>
           </w:pPr>
-          <w:hyperlink w:anchor="_Toc241509331" w:history="1">
+          <w:hyperlink w:anchor="_Toc241510425" w:history="1">
             <w:r>
               <w:rPr>
                 <w:rStyle w:val="Hyperlink"/>
@@ -1917,7 +1917,7 @@
               <w:rPr>
                 <w:noProof/>
               </w:rPr>
-              <w:instrText xml:space="preserve"> PAGEREF _Toc241509331 \h </w:instrText>
+              <w:instrText xml:space="preserve"> PAGEREF _Toc241510425 \h </w:instrText>
             </w:r>
             <w:r>
               <w:rPr>
@@ -1960,7 +1960,7 @@
               <w14:ligatures w14:val="standardContextual"/>
             </w:rPr>
           </w:pPr>
-          <w:hyperlink w:anchor="_Toc241509332" w:history="1">
+          <w:hyperlink w:anchor="_Toc241510426" w:history="1">
             <w:r>
               <w:rPr>
                 <w:rStyle w:val="Hyperlink"/>
@@ -1984,7 +1984,7 @@
               <w:rPr>
                 <w:noProof/>
               </w:rPr>
-              <w:instrText xml:space="preserve"> PAGEREF _Toc241509332 \h </w:instrText>
+              <w:instrText xml:space="preserve"> PAGEREF _Toc241510426 \h </w:instrText>
             </w:r>
             <w:r>
               <w:rPr>
@@ -2027,7 +2027,7 @@
               <w14:ligatures w14:val="standardContextual"/>
             </w:rPr>
           </w:pPr>
-          <w:hyperlink w:anchor="_Toc241509333" w:history="1">
+          <w:hyperlink w:anchor="_Toc241510427" w:history="1">
             <w:r>
               <w:rPr>
                 <w:rStyle w:val="Hyperlink"/>
@@ -2051,7 +2051,7 @@
               <w:rPr>
                 <w:noProof/>
               </w:rPr>
-              <w:instrText xml:space="preserve"> PAGEREF _Toc241509333 \h </w:instrText>
+              <w:instrText xml:space="preserve"> PAGEREF _Toc241510427 \h </w:instrText>
             </w:r>
             <w:r>
               <w:rPr>
@@ -2094,7 +2094,7 @@
               <w14:ligatures w14:val="standardContextual"/>
             </w:rPr>
           </w:pPr>
-          <w:hyperlink w:anchor="_Toc241509334" w:history="1">
+          <w:hyperlink w:anchor="_Toc241510428" w:history="1">
             <w:r>
               <w:rPr>
                 <w:rStyle w:val="Hyperlink"/>
@@ -2118,7 +2118,7 @@
               <w:rPr>
                 <w:noProof/>
               </w:rPr>
-              <w:instrText xml:space="preserve"> PAGEREF _Toc241509334 \h </w:instrText>
+              <w:instrText xml:space="preserve"> PAGEREF _Toc241510428 \h </w:instrText>
             </w:r>
             <w:r>
               <w:rPr>
@@ -2161,7 +2161,7 @@
               <w14:ligatures w14:val="standardContextual"/>
             </w:rPr>
           </w:pPr>
-          <w:hyperlink w:anchor="_Toc241509335" w:history="1">
+          <w:hyperlink w:anchor="_Toc241510429" w:history="1">
             <w:r>
               <w:rPr>
                 <w:rStyle w:val="Hyperlink"/>
@@ -2185,7 +2185,7 @@
               <w:rPr>
                 <w:noProof/>
               </w:rPr>
-              <w:instrText xml:space="preserve"> PAGEREF _Toc241509335 \h </w:instrText>
+              <w:instrText xml:space="preserve"> PAGEREF _Toc241510429 \h </w:instrText>
             </w:r>
             <w:r>
               <w:rPr>
@@ -2228,7 +2228,7 @@
               <w14:ligatures w14:val="standardContextual"/>
             </w:rPr>
           </w:pPr>
-          <w:hyperlink w:anchor="_Toc241509336" w:history="1">
+          <w:hyperlink w:anchor="_Toc241510430" w:history="1">
             <w:r>
               <w:rPr>
                 <w:rStyle w:val="Hyperlink"/>
@@ -2252,7 +2252,7 @@
               <w:rPr>
                 <w:noProof/>
               </w:rPr>
-              <w:instrText xml:space="preserve"> PAGEREF _Toc241509336 \h </w:instrText>
+              <w:instrText xml:space="preserve"> PAGEREF _Toc241510430 \h </w:instrText>
             </w:r>
             <w:r>
               <w:rPr>
@@ -2295,7 +2295,7 @@
               <w14:ligatures w14:val="standardContextual"/>
             </w:rPr>
           </w:pPr>
-          <w:hyperlink w:anchor="_Toc241509337" w:history="1">
+          <w:hyperlink w:anchor="_Toc241510431" w:history="1">
             <w:r>
               <w:rPr>
                 <w:rStyle w:val="Hyperlink"/>
@@ -2319,7 +2319,7 @@
               <w:rPr>
                 <w:noProof/>
               </w:rPr>
-              <w:instrText xml:space="preserve"> PAGEREF _Toc241509337 \h </w:instrText>
+              <w:instrText xml:space="preserve"> PAGEREF _Toc241510431 \h </w:instrText>
             </w:r>
             <w:r>
               <w:rPr>
@@ -2362,7 +2362,7 @@
               <w14:ligatures w14:val="standardContextual"/>
             </w:rPr>
           </w:pPr>
-          <w:hyperlink w:anchor="_Toc241509338" w:history="1">
+          <w:hyperlink w:anchor="_Toc241510432" w:history="1">
             <w:r>
               <w:rPr>
                 <w:rStyle w:val="Hyperlink"/>
@@ -2386,7 +2386,7 @@
               <w:rPr>
                 <w:noProof/>
               </w:rPr>
-              <w:instrText xml:space="preserve"> PAGEREF _Toc241509338 \h </w:instrText>
+              <w:instrText xml:space="preserve"> PAGEREF _Toc241510432 \h </w:instrText>
             </w:r>
             <w:r>
               <w:rPr>
@@ -2429,7 +2429,7 @@
               <w14:ligatures w14:val="standardContextual"/>
             </w:rPr>
           </w:pPr>
-          <w:hyperlink w:anchor="_Toc241509339" w:history="1">
+          <w:hyperlink w:anchor="_Toc241510433" w:history="1">
             <w:r>
               <w:rPr>
                 <w:rStyle w:val="Hyperlink"/>
@@ -2453,7 +2453,7 @@
               <w:rPr>
                 <w:noProof/>
               </w:rPr>
-              <w:instrText xml:space="preserve"> PAGEREF _Toc241509339 \h </w:instrText>
+              <w:instrText xml:space="preserve"> PAGEREF _Toc241510433 \h </w:instrText>
             </w:r>
             <w:r>
               <w:rPr>
@@ -2470,7 +2470,7 @@
               <w:rPr>
                 <w:noProof/>
               </w:rPr>
-              <w:t>14</w:t>
+              <w:t>15</w:t>
             </w:r>
             <w:r>
               <w:rPr>
@@ -2496,7 +2496,7 @@
               <w14:ligatures w14:val="standardContextual"/>
             </w:rPr>
           </w:pPr>
-          <w:hyperlink w:anchor="_Toc241509340" w:history="1">
+          <w:hyperlink w:anchor="_Toc241510434" w:history="1">
             <w:r>
               <w:rPr>
                 <w:rStyle w:val="Hyperlink"/>
@@ -2520,7 +2520,7 @@
               <w:rPr>
                 <w:noProof/>
               </w:rPr>
-              <w:instrText xml:space="preserve"> PAGEREF _Toc241509340 \h </w:instrText>
+              <w:instrText xml:space="preserve"> PAGEREF _Toc241510434 \h </w:instrText>
             </w:r>
             <w:r>
               <w:rPr>
@@ -2537,7 +2537,7 @@
               <w:rPr>
                 <w:noProof/>
               </w:rPr>
-              <w:t>14</w:t>
+              <w:t>15</w:t>
             </w:r>
             <w:r>
               <w:rPr>
@@ -2563,7 +2563,7 @@
               <w14:ligatures w14:val="standardContextual"/>
             </w:rPr>
           </w:pPr>
-          <w:hyperlink w:anchor="_Toc241509341" w:history="1">
+          <w:hyperlink w:anchor="_Toc241510435" w:history="1">
             <w:r>
               <w:rPr>
                 <w:rStyle w:val="Hyperlink"/>
@@ -2587,7 +2587,7 @@
               <w:rPr>
                 <w:noProof/>
               </w:rPr>
-              <w:instrText xml:space="preserve"> PAGEREF _Toc241509341 \h </w:instrText>
+              <w:instrText xml:space="preserve"> PAGEREF _Toc241510435 \h </w:instrText>
             </w:r>
             <w:r>
               <w:rPr>
@@ -2604,7 +2604,7 @@
               <w:rPr>
                 <w:noProof/>
               </w:rPr>
-              <w:t>15</w:t>
+              <w:t>16</w:t>
             </w:r>
             <w:r>
               <w:rPr>
@@ -2630,7 +2630,7 @@
               <w14:ligatures w14:val="standardContextual"/>
             </w:rPr>
           </w:pPr>
-          <w:hyperlink w:anchor="_Toc241509342" w:history="1">
+          <w:hyperlink w:anchor="_Toc241510436" w:history="1">
             <w:r>
               <w:rPr>
                 <w:rStyle w:val="Hyperlink"/>
@@ -2654,7 +2654,7 @@
               <w:rPr>
                 <w:noProof/>
               </w:rPr>
-              <w:instrText xml:space="preserve"> PAGEREF _Toc241509342 \h </w:instrText>
+              <w:instrText xml:space="preserve"> PAGEREF _Toc241510436 \h </w:instrText>
             </w:r>
             <w:r>
               <w:rPr>
@@ -2671,7 +2671,7 @@
               <w:rPr>
                 <w:noProof/>
               </w:rPr>
-              <w:t>15</w:t>
+              <w:t>16</w:t>
             </w:r>
             <w:r>
               <w:rPr>
@@ -2697,7 +2697,7 @@
               <w14:ligatures w14:val="standardContextual"/>
             </w:rPr>
           </w:pPr>
-          <w:hyperlink w:anchor="_Toc241509343" w:history="1">
+          <w:hyperlink w:anchor="_Toc241510437" w:history="1">
             <w:r>
               <w:rPr>
                 <w:rStyle w:val="Hyperlink"/>
@@ -2721,7 +2721,7 @@
               <w:rPr>
                 <w:noProof/>
               </w:rPr>
-              <w:instrText xml:space="preserve"> PAGEREF _Toc241509343 \h </w:instrText>
+              <w:instrText xml:space="preserve"> PAGEREF _Toc241510437 \h </w:instrText>
             </w:r>
             <w:r>
               <w:rPr>
@@ -2738,7 +2738,7 @@
               <w:rPr>
                 <w:noProof/>
               </w:rPr>
-              <w:t>15</w:t>
+              <w:t>16</w:t>
             </w:r>
             <w:r>
               <w:rPr>
@@ -2764,7 +2764,7 @@
               <w14:ligatures w14:val="standardContextual"/>
             </w:rPr>
           </w:pPr>
-          <w:hyperlink w:anchor="_Toc241509344" w:history="1">
+          <w:hyperlink w:anchor="_Toc241510438" w:history="1">
             <w:r>
               <w:rPr>
                 <w:rStyle w:val="Hyperlink"/>
@@ -2788,7 +2788,7 @@
               <w:rPr>
                 <w:noProof/>
               </w:rPr>
-              <w:instrText xml:space="preserve"> PAGEREF _Toc241509344 \h </w:instrText>
+              <w:instrText xml:space="preserve"> PAGEREF _Toc241510438 \h </w:instrText>
             </w:r>
             <w:r>
               <w:rPr>
@@ -2805,7 +2805,7 @@
               <w:rPr>
                 <w:noProof/>
               </w:rPr>
-              <w:t>15</w:t>
+              <w:t>16</w:t>
             </w:r>
             <w:r>
               <w:rPr>
@@ -2831,7 +2831,7 @@
               <w14:ligatures w14:val="standardContextual"/>
             </w:rPr>
           </w:pPr>
-          <w:hyperlink w:anchor="_Toc241509345" w:history="1">
+          <w:hyperlink w:anchor="_Toc241510439" w:history="1">
             <w:r>
               <w:rPr>
                 <w:rStyle w:val="Hyperlink"/>
@@ -2855,7 +2855,7 @@
               <w:rPr>
                 <w:noProof/>
               </w:rPr>
-              <w:instrText xml:space="preserve"> PAGEREF _Toc241509345 \h </w:instrText>
+              <w:instrText xml:space="preserve"> PAGEREF _Toc241510439 \h </w:instrText>
             </w:r>
             <w:r>
               <w:rPr>
@@ -2872,7 +2872,7 @@
               <w:rPr>
                 <w:noProof/>
               </w:rPr>
-              <w:t>15</w:t>
+              <w:t>16</w:t>
             </w:r>
             <w:r>
               <w:rPr>
@@ -2898,7 +2898,7 @@
               <w14:ligatures w14:val="standardContextual"/>
             </w:rPr>
           </w:pPr>
-          <w:hyperlink w:anchor="_Toc241509346" w:history="1">
+          <w:hyperlink w:anchor="_Toc241510440" w:history="1">
             <w:r>
               <w:rPr>
                 <w:rStyle w:val="Hyperlink"/>
@@ -2922,7 +2922,7 @@
               <w:rPr>
                 <w:noProof/>
               </w:rPr>
-              <w:instrText xml:space="preserve"> PAGEREF _Toc241509346 \h </w:instrText>
+              <w:instrText xml:space="preserve"> PAGEREF _Toc241510440 \h </w:instrText>
             </w:r>
             <w:r>
               <w:rPr>
@@ -2939,7 +2939,7 @@
               <w:rPr>
                 <w:noProof/>
               </w:rPr>
-              <w:t>15</w:t>
+              <w:t>16</w:t>
             </w:r>
             <w:r>
               <w:rPr>
@@ -2965,7 +2965,7 @@
               <w14:ligatures w14:val="standardContextual"/>
             </w:rPr>
           </w:pPr>
-          <w:hyperlink w:anchor="_Toc241509347" w:history="1">
+          <w:hyperlink w:anchor="_Toc241510441" w:history="1">
             <w:r>
               <w:rPr>
                 <w:rStyle w:val="Hyperlink"/>
@@ -2989,7 +2989,7 @@
               <w:rPr>
                 <w:noProof/>
               </w:rPr>
-              <w:instrText xml:space="preserve"> PAGEREF _Toc241509347 \h </w:instrText>
+              <w:instrText xml:space="preserve"> PAGEREF _Toc241510441 \h </w:instrText>
             </w:r>
             <w:r>
               <w:rPr>
@@ -3006,7 +3006,7 @@
               <w:rPr>
                 <w:noProof/>
               </w:rPr>
-              <w:t>16</w:t>
+              <w:t>17</w:t>
             </w:r>
             <w:r>
               <w:rPr>
@@ -3032,7 +3032,7 @@
               <w14:ligatures w14:val="standardContextual"/>
             </w:rPr>
           </w:pPr>
-          <w:hyperlink w:anchor="_Toc241509348" w:history="1">
+          <w:hyperlink w:anchor="_Toc241510442" w:history="1">
             <w:r>
               <w:rPr>
                 <w:rStyle w:val="Hyperlink"/>
@@ -3056,7 +3056,7 @@
               <w:rPr>
                 <w:noProof/>
               </w:rPr>
-              <w:instrText xml:space="preserve"> PAGEREF _Toc241509348 \h </w:instrText>
+              <w:instrText xml:space="preserve"> PAGEREF _Toc241510442 \h </w:instrText>
             </w:r>
             <w:r>
               <w:rPr>
@@ -3073,7 +3073,7 @@
               <w:rPr>
                 <w:noProof/>
               </w:rPr>
-              <w:t>16</w:t>
+              <w:t>17</w:t>
             </w:r>
             <w:r>
               <w:rPr>
@@ -3099,7 +3099,7 @@
               <w14:ligatures w14:val="standardContextual"/>
             </w:rPr>
           </w:pPr>
-          <w:hyperlink w:anchor="_Toc241509349" w:history="1">
+          <w:hyperlink w:anchor="_Toc241510443" w:history="1">
             <w:r>
               <w:rPr>
                 <w:rStyle w:val="Hyperlink"/>
@@ -3123,7 +3123,7 @@
               <w:rPr>
                 <w:noProof/>
               </w:rPr>
-              <w:instrText xml:space="preserve"> PAGEREF _Toc241509349 \h </w:instrText>
+              <w:instrText xml:space="preserve"> PAGEREF _Toc241510443 \h </w:instrText>
             </w:r>
             <w:r>
               <w:rPr>
@@ -3140,7 +3140,7 @@
               <w:rPr>
                 <w:noProof/>
               </w:rPr>
-              <w:t>16</w:t>
+              <w:t>17</w:t>
             </w:r>
             <w:r>
               <w:rPr>
@@ -3166,7 +3166,7 @@
               <w14:ligatures w14:val="standardContextual"/>
             </w:rPr>
           </w:pPr>
-          <w:hyperlink w:anchor="_Toc241509350" w:history="1">
+          <w:hyperlink w:anchor="_Toc241510444" w:history="1">
             <w:r>
               <w:rPr>
                 <w:rStyle w:val="Hyperlink"/>
@@ -3190,7 +3190,7 @@
               <w:rPr>
                 <w:noProof/>
               </w:rPr>
-              <w:instrText xml:space="preserve"> PAGEREF _Toc241509350 \h </w:instrText>
+              <w:instrText xml:space="preserve"> PAGEREF _Toc241510444 \h </w:instrText>
             </w:r>
             <w:r>
               <w:rPr>
@@ -3207,7 +3207,7 @@
               <w:rPr>
                 <w:noProof/>
               </w:rPr>
-              <w:t>17</w:t>
+              <w:t>18</w:t>
             </w:r>
             <w:r>
               <w:rPr>
@@ -3233,7 +3233,7 @@
               <w14:ligatures w14:val="standardContextual"/>
             </w:rPr>
           </w:pPr>
-          <w:hyperlink w:anchor="_Toc241509351" w:history="1">
+          <w:hyperlink w:anchor="_Toc241510445" w:history="1">
             <w:r>
               <w:rPr>
                 <w:rStyle w:val="Hyperlink"/>
@@ -3257,7 +3257,7 @@
               <w:rPr>
                 <w:noProof/>
               </w:rPr>
-              <w:instrText xml:space="preserve"> PAGEREF _Toc241509351 \h </w:instrText>
+              <w:instrText xml:space="preserve"> PAGEREF _Toc241510445 \h </w:instrText>
             </w:r>
             <w:r>
               <w:rPr>
@@ -3274,7 +3274,7 @@
               <w:rPr>
                 <w:noProof/>
               </w:rPr>
-              <w:t>17</w:t>
+              <w:t>18</w:t>
             </w:r>
             <w:r>
               <w:rPr>
@@ -3300,7 +3300,7 @@
               <w14:ligatures w14:val="standardContextual"/>
             </w:rPr>
           </w:pPr>
-          <w:hyperlink w:anchor="_Toc241509352" w:history="1">
+          <w:hyperlink w:anchor="_Toc241510446" w:history="1">
             <w:r>
               <w:rPr>
                 <w:rStyle w:val="Hyperlink"/>
@@ -3324,7 +3324,7 @@
               <w:rPr>
                 <w:noProof/>
               </w:rPr>
-              <w:instrText xml:space="preserve"> PAGEREF _Toc241509352 \h </w:instrText>
+              <w:instrText xml:space="preserve"> PAGEREF _Toc241510446 \h </w:instrText>
             </w:r>
             <w:r>
               <w:rPr>
@@ -3341,7 +3341,7 @@
               <w:rPr>
                 <w:noProof/>
               </w:rPr>
-              <w:t>17</w:t>
+              <w:t>18</w:t>
             </w:r>
             <w:r>
               <w:rPr>
@@ -3367,7 +3367,7 @@
               <w14:ligatures w14:val="standardContextual"/>
             </w:rPr>
           </w:pPr>
-          <w:hyperlink w:anchor="_Toc241509353" w:history="1">
+          <w:hyperlink w:anchor="_Toc241510447" w:history="1">
             <w:r>
               <w:rPr>
                 <w:rStyle w:val="Hyperlink"/>
@@ -3391,7 +3391,7 @@
               <w:rPr>
                 <w:noProof/>
               </w:rPr>
-              <w:instrText xml:space="preserve"> PAGEREF _Toc241509353 \h </w:instrText>
+              <w:instrText xml:space="preserve"> PAGEREF _Toc241510447 \h </w:instrText>
             </w:r>
             <w:r>
               <w:rPr>
@@ -3408,7 +3408,7 @@
               <w:rPr>
                 <w:noProof/>
               </w:rPr>
-              <w:t>17</w:t>
+              <w:t>18</w:t>
             </w:r>
             <w:r>
               <w:rPr>
@@ -3434,7 +3434,7 @@
               <w14:ligatures w14:val="standardContextual"/>
             </w:rPr>
           </w:pPr>
-          <w:hyperlink w:anchor="_Toc241509354" w:history="1">
+          <w:hyperlink w:anchor="_Toc241510448" w:history="1">
             <w:r>
               <w:rPr>
                 <w:rStyle w:val="Hyperlink"/>
@@ -3458,7 +3458,7 @@
               <w:rPr>
                 <w:noProof/>
               </w:rPr>
-              <w:instrText xml:space="preserve"> PAGEREF _Toc241509354 \h </w:instrText>
+              <w:instrText xml:space="preserve"> PAGEREF _Toc241510448 \h </w:instrText>
             </w:r>
             <w:r>
               <w:rPr>
@@ -3475,7 +3475,7 @@
               <w:rPr>
                 <w:noProof/>
               </w:rPr>
-              <w:t>18</w:t>
+              <w:t>19</w:t>
             </w:r>
             <w:r>
               <w:rPr>
@@ -3501,7 +3501,7 @@
               <w14:ligatures w14:val="standardContextual"/>
             </w:rPr>
           </w:pPr>
-          <w:hyperlink w:anchor="_Toc241509355" w:history="1">
+          <w:hyperlink w:anchor="_Toc241510449" w:history="1">
             <w:r>
               <w:rPr>
                 <w:rStyle w:val="Hyperlink"/>
@@ -3525,7 +3525,7 @@
               <w:rPr>
                 <w:noProof/>
               </w:rPr>
-              <w:instrText xml:space="preserve"> PAGEREF _Toc241509355 \h </w:instrText>
+              <w:instrText xml:space="preserve"> PAGEREF _Toc241510449 \h </w:instrText>
             </w:r>
             <w:r>
               <w:rPr>
@@ -3542,7 +3542,7 @@
               <w:rPr>
                 <w:noProof/>
               </w:rPr>
-              <w:t>19</w:t>
+              <w:t>20</w:t>
             </w:r>
             <w:r>
               <w:rPr>
@@ -3568,7 +3568,7 @@
       <w:pPr>
         <w:pStyle w:val="Heading1"/>
       </w:pPr>
-      <w:bookmarkStart w:id="0" w:name="_Toc241509305"/>
+      <w:bookmarkStart w:id="0" w:name="_Toc241510399"/>
       <w:r>
         <w:t>1.  Getting started</w:t>
       </w:r>
@@ -3596,7 +3596,7 @@
       <w:pPr>
         <w:pStyle w:val="Heading2"/>
       </w:pPr>
-      <w:bookmarkStart w:id="1" w:name="_Toc241509306"/>
+      <w:bookmarkStart w:id="1" w:name="_Toc241510400"/>
       <w:r>
         <w:t>Opening ShopControl</w:t>
       </w:r>
@@ -3676,7 +3676,7 @@
       <w:pPr>
         <w:pStyle w:val="Heading2"/>
       </w:pPr>
-      <w:bookmarkStart w:id="2" w:name="_Toc241509307"/>
+      <w:bookmarkStart w:id="2" w:name="_Toc241510401"/>
       <w:r>
         <w:t>Finding help</w:t>
       </w:r>
@@ -3779,7 +3779,7 @@
       <w:pPr>
         <w:pStyle w:val="Heading2"/>
       </w:pPr>
-      <w:bookmarkStart w:id="3" w:name="_Toc241509308"/>
+      <w:bookmarkStart w:id="3" w:name="_Toc241510402"/>
       <w:r>
         <w:t>Put the app on your phone's home screen</w:t>
       </w:r>
@@ -3947,7 +3947,7 @@
       <w:pPr>
         <w:pStyle w:val="Heading2"/>
       </w:pPr>
-      <w:bookmarkStart w:id="4" w:name="_Toc241509309"/>
+      <w:bookmarkStart w:id="4" w:name="_Toc241510403"/>
       <w:r>
         <w:t>Logging in</w:t>
       </w:r>
@@ -4117,7 +4117,7 @@
       <w:pPr>
         <w:pStyle w:val="Heading2"/>
       </w:pPr>
-      <w:bookmarkStart w:id="5" w:name="_Toc241509310"/>
+      <w:bookmarkStart w:id="5" w:name="_Toc241510404"/>
       <w:r>
         <w:t>Staying up to date</w:t>
       </w:r>
@@ -4145,7 +4145,7 @@
       <w:pPr>
         <w:pStyle w:val="Heading2"/>
       </w:pPr>
-      <w:bookmarkStart w:id="6" w:name="_Toc241509311"/>
+      <w:bookmarkStart w:id="6" w:name="_Toc241510405"/>
       <w:r>
         <w:t>Who can do what</w:t>
       </w:r>
@@ -4758,7 +4758,7 @@
         <w:pStyle w:val="Heading1"/>
         <w:pageBreakBefore/>
       </w:pPr>
-      <w:bookmarkStart w:id="7" w:name="_Toc241509312"/>
+      <w:bookmarkStart w:id="7" w:name="_Toc241510406"/>
       <w:r>
         <w:t>2.  The Employee App (technicians)</w:t>
       </w:r>
@@ -4776,7 +4776,7 @@
       <w:pPr>
         <w:pStyle w:val="Heading2"/>
       </w:pPr>
-      <w:bookmarkStart w:id="8" w:name="_Toc241509313"/>
+      <w:bookmarkStart w:id="8" w:name="_Toc241510407"/>
       <w:r>
         <w:t>Home screen</w:t>
       </w:r>
@@ -4916,7 +4916,7 @@
       <w:pPr>
         <w:pStyle w:val="Heading2"/>
       </w:pPr>
-      <w:bookmarkStart w:id="9" w:name="_Toc241509314"/>
+      <w:bookmarkStart w:id="9" w:name="_Toc241510408"/>
       <w:r>
         <w:t>Doing your QC checklist</w:t>
       </w:r>
@@ -5130,7 +5130,7 @@
       <w:pPr>
         <w:pStyle w:val="Heading2"/>
       </w:pPr>
-      <w:bookmarkStart w:id="10" w:name="_Toc241509315"/>
+      <w:bookmarkStart w:id="10" w:name="_Toc241510409"/>
       <w:r>
         <w:t>Signing and rework</w:t>
       </w:r>
@@ -5250,7 +5250,7 @@
       <w:pPr>
         <w:pStyle w:val="Heading2"/>
       </w:pPr>
-      <w:bookmarkStart w:id="11" w:name="_Toc241509316"/>
+      <w:bookmarkStart w:id="11" w:name="_Toc241510410"/>
       <w:r>
         <w:t>Other departments' checklists</w:t>
       </w:r>
@@ -5278,7 +5278,7 @@
       <w:pPr>
         <w:pStyle w:val="Heading2"/>
       </w:pPr>
-      <w:bookmarkStart w:id="12" w:name="_Toc241509317"/>
+      <w:bookmarkStart w:id="12" w:name="_Toc241510411"/>
       <w:r>
         <w:t>Photos and parts</w:t>
       </w:r>
@@ -5341,7 +5341,73 @@
         <w:t>Parts:</w:t>
       </w:r>
       <w:r>
-        <w:t xml:space="preserve"> every part on the RO with its status. Parts that need attention (late, backordered, wrong part, return needed) are marked in red.</w:t>
+        <w:t xml:space="preserve"> every part on the RO with its status and </w:t>
+      </w:r>
+      <w:r>
+        <w:rPr>
+          <w:b/>
+          <w:bCs/>
+        </w:rPr>
+        <w:t>where it is</w:t>
+      </w:r>
+      <w:r>
+        <w:t xml:space="preserve">. The car's parts cart shows at the top (and on the Parts button, for example </w:t>
+      </w:r>
+      <w:r>
+        <w:rPr>
+          <w:b/>
+          <w:bCs/>
+        </w:rPr>
+        <w:t>Cart #13 · 4/5 here</w:t>
+      </w:r>
+      <w:r>
+        <w:t xml:space="preserve">). Each part shows its spot with a </w:t>
+      </w:r>
+      <w:r>
+        <w:t>📍</w:t>
+      </w:r>
+      <w:r>
+        <w:t xml:space="preserve">, like </w:t>
+      </w:r>
+      <w:r>
+        <w:rPr>
+          <w:b/>
+          <w:bCs/>
+        </w:rPr>
+        <w:t>Cart #13 · Shelf 2</w:t>
+      </w:r>
+      <w:r>
+        <w:t xml:space="preserve">, </w:t>
+      </w:r>
+      <w:r>
+        <w:rPr>
+          <w:b/>
+          <w:bCs/>
+        </w:rPr>
+        <w:t>#3 A · Black Shelves Wall</w:t>
+      </w:r>
+      <w:r>
+        <w:t xml:space="preserve"> or </w:t>
+      </w:r>
+      <w:r>
+        <w:rPr>
+          <w:b/>
+          <w:bCs/>
+        </w:rPr>
+        <w:t>Receiving Bumpers · Bumper Racks</w:t>
+      </w:r>
+      <w:r>
+        <w:t xml:space="preserve">. A part that has arrived but hasn't been put away yet says </w:t>
+      </w:r>
+      <w:r>
+        <w:rPr>
+          <w:b/>
+          <w:bCs/>
+        </w:rPr>
+        <w:t>Here, not put away yet · ask parts</w:t>
+      </w:r>
+      <w:r>
+        <w:t>. Parts that need attention (late, backordered, wrong part, return needed) are marked in red.</w:t>
       </w:r>
     </w:p>
     <w:p>
@@ -5349,7 +5415,7 @@
         <w:pStyle w:val="Heading1"/>
         <w:pageBreakBefore/>
       </w:pPr>
-      <w:bookmarkStart w:id="13" w:name="_Toc241509318"/>
+      <w:bookmarkStart w:id="13" w:name="_Toc241510412"/>
       <w:r>
         <w:t>3.  Staff Hub: time off, mailbox and company info</w:t>
       </w:r>
@@ -5377,7 +5443,7 @@
       <w:pPr>
         <w:pStyle w:val="Heading2"/>
       </w:pPr>
-      <w:bookmarkStart w:id="14" w:name="_Toc241509319"/>
+      <w:bookmarkStart w:id="14" w:name="_Toc241510413"/>
       <w:r>
         <w:t>Requesting time off</w:t>
       </w:r>
@@ -5540,7 +5606,7 @@
       <w:pPr>
         <w:pStyle w:val="Heading2"/>
       </w:pPr>
-      <w:bookmarkStart w:id="15" w:name="_Toc241509320"/>
+      <w:bookmarkStart w:id="15" w:name="_Toc241510414"/>
       <w:r>
         <w:t>Checking your requests</w:t>
       </w:r>
@@ -5595,7 +5661,7 @@
       <w:pPr>
         <w:pStyle w:val="Heading2"/>
       </w:pPr>
-      <w:bookmarkStart w:id="16" w:name="_Toc241509321"/>
+      <w:bookmarkStart w:id="16" w:name="_Toc241510415"/>
       <w:r>
         <w:t>Mailbox</w:t>
       </w:r>
@@ -5664,7 +5730,7 @@
       <w:pPr>
         <w:pStyle w:val="Heading2"/>
       </w:pPr>
-      <w:bookmarkStart w:id="17" w:name="_Toc241509322"/>
+      <w:bookmarkStart w:id="17" w:name="_Toc241510416"/>
       <w:r>
         <w:t>Company info and this manual</w:t>
       </w:r>
@@ -5700,7 +5766,7 @@
         <w:pStyle w:val="Heading1"/>
         <w:pageBreakBefore/>
       </w:pPr>
-      <w:bookmarkStart w:id="18" w:name="_Toc241509323"/>
+      <w:bookmarkStart w:id="18" w:name="_Toc241510417"/>
       <w:r>
         <w:t>4.  Dashboard</w:t>
       </w:r>
@@ -5839,7 +5905,7 @@
         <w:pStyle w:val="Heading1"/>
         <w:pageBreakBefore/>
       </w:pPr>
-      <w:bookmarkStart w:id="19" w:name="_Toc241509324"/>
+      <w:bookmarkStart w:id="19" w:name="_Toc241510418"/>
       <w:r>
         <w:t>5.  Jobs and the Daily GO List</w:t>
       </w:r>
@@ -5867,7 +5933,7 @@
       <w:pPr>
         <w:pStyle w:val="Heading2"/>
       </w:pPr>
-      <w:bookmarkStart w:id="20" w:name="_Toc241509325"/>
+      <w:bookmarkStart w:id="20" w:name="_Toc241510419"/>
       <w:r>
         <w:t>RO numbers</w:t>
       </w:r>
@@ -5953,7 +6019,7 @@
       <w:pPr>
         <w:pStyle w:val="Heading2"/>
       </w:pPr>
-      <w:bookmarkStart w:id="21" w:name="_Toc241509326"/>
+      <w:bookmarkStart w:id="21" w:name="_Toc241510420"/>
       <w:r>
         <w:t>Adding or editing a job</w:t>
       </w:r>
@@ -6073,7 +6139,7 @@
       <w:pPr>
         <w:pStyle w:val="Heading2"/>
       </w:pPr>
-      <w:bookmarkStart w:id="22" w:name="_Toc241509327"/>
+      <w:bookmarkStart w:id="22" w:name="_Toc241510421"/>
       <w:r>
         <w:t>Customer updates</w:t>
       </w:r>
@@ -6242,7 +6308,7 @@
         <w:pStyle w:val="Heading1"/>
         <w:pageBreakBefore/>
       </w:pPr>
-      <w:bookmarkStart w:id="23" w:name="_Toc241509328"/>
+      <w:bookmarkStart w:id="23" w:name="_Toc241510422"/>
       <w:r>
         <w:t>6.  Production, Delivery and Planning boards</w:t>
       </w:r>
@@ -6252,7 +6318,7 @@
       <w:pPr>
         <w:pStyle w:val="Heading2"/>
       </w:pPr>
-      <w:bookmarkStart w:id="24" w:name="_Toc241509329"/>
+      <w:bookmarkStart w:id="24" w:name="_Toc241510423"/>
       <w:r>
         <w:t>Production Board</w:t>
       </w:r>
@@ -6380,7 +6446,7 @@
       <w:pPr>
         <w:pStyle w:val="Heading2"/>
       </w:pPr>
-      <w:bookmarkStart w:id="25" w:name="_Toc241509330"/>
+      <w:bookmarkStart w:id="25" w:name="_Toc241510424"/>
       <w:r>
         <w:t>Vehicle pictures</w:t>
       </w:r>
@@ -6438,7 +6504,7 @@
       <w:pPr>
         <w:pStyle w:val="Heading2"/>
       </w:pPr>
-      <w:bookmarkStart w:id="26" w:name="_Toc241509331"/>
+      <w:bookmarkStart w:id="26" w:name="_Toc241510425"/>
       <w:r>
         <w:t>Delivery and Planning boards</w:t>
       </w:r>
@@ -6528,7 +6594,7 @@
       <w:pPr>
         <w:pStyle w:val="Heading2"/>
       </w:pPr>
-      <w:bookmarkStart w:id="27" w:name="_Toc241509332"/>
+      <w:bookmarkStart w:id="27" w:name="_Toc241510426"/>
       <w:r>
         <w:t>TV display</w:t>
       </w:r>
@@ -6557,7 +6623,7 @@
         <w:pStyle w:val="Heading1"/>
         <w:pageBreakBefore/>
       </w:pPr>
-      <w:bookmarkStart w:id="28" w:name="_Toc241509333"/>
+      <w:bookmarkStart w:id="28" w:name="_Toc241510427"/>
       <w:r>
         <w:t>7.  CCC estimates coming into ShopControl</w:t>
       </w:r>
@@ -6666,7 +6732,7 @@
         <w:pStyle w:val="Heading1"/>
         <w:pageBreakBefore/>
       </w:pPr>
-      <w:bookmarkStart w:id="29" w:name="_Toc241509334"/>
+      <w:bookmarkStart w:id="29" w:name="_Toc241510428"/>
       <w:r>
         <w:t>8.  Parts</w:t>
       </w:r>
@@ -6724,7 +6790,7 @@
       <w:pPr>
         <w:pStyle w:val="Heading2"/>
       </w:pPr>
-      <w:bookmarkStart w:id="30" w:name="_Toc241509335"/>
+      <w:bookmarkStart w:id="30" w:name="_Toc241510429"/>
       <w:r>
         <w:t>What counts as a problem</w:t>
       </w:r>
@@ -6792,7 +6858,7 @@
       <w:pPr>
         <w:pStyle w:val="Heading2"/>
       </w:pPr>
-      <w:bookmarkStart w:id="31" w:name="_Toc241509336"/>
+      <w:bookmarkStart w:id="31" w:name="_Toc241510430"/>
       <w:r>
         <w:t>Ordering parts</w:t>
       </w:r>
@@ -6899,7 +6965,7 @@
       <w:pPr>
         <w:pStyle w:val="Heading2"/>
       </w:pPr>
-      <w:bookmarkStart w:id="32" w:name="_Toc241509337"/>
+      <w:bookmarkStart w:id="32" w:name="_Toc241510431"/>
       <w:r>
         <w:t>Mirror matching and carts</w:t>
       </w:r>
@@ -7007,9 +7073,37 @@
     </w:p>
     <w:p>
       <w:pPr>
+        <w:spacing w:after="120"/>
+      </w:pPr>
+      <w:r>
+        <w:t xml:space="preserve">Technicians see these spots in the Employee App under </w:t>
+      </w:r>
+      <w:r>
+        <w:rPr>
+          <w:b/>
+          <w:bCs/>
+        </w:rPr>
+        <w:t>Parts</w:t>
+      </w:r>
+      <w:r>
+        <w:t xml:space="preserve">, so always record where a part was put (cart and shelf, or storage spot). A part that is received but not placed shows as </w:t>
+      </w:r>
+      <w:r>
+        <w:rPr>
+          <w:b/>
+          <w:bCs/>
+        </w:rPr>
+        <w:t>not put away yet</w:t>
+      </w:r>
+      <w:r>
+        <w:t>.</w:t>
+      </w:r>
+    </w:p>
+    <w:p>
+      <w:pPr>
         <w:pStyle w:val="Heading2"/>
       </w:pPr>
-      <w:bookmarkStart w:id="33" w:name="_Toc241509338"/>
+      <w:bookmarkStart w:id="33" w:name="_Toc241510432"/>
       <w:r>
         <w:t>Other parts screens</w:t>
       </w:r>
@@ -7100,7 +7194,7 @@
         <w:pStyle w:val="Heading1"/>
         <w:pageBreakBefore/>
       </w:pPr>
-      <w:bookmarkStart w:id="34" w:name="_Toc241509339"/>
+      <w:bookmarkStart w:id="34" w:name="_Toc241510433"/>
       <w:r>
         <w:t>9.  Vehicle QC (office view)</w:t>
       </w:r>
@@ -7138,7 +7232,7 @@
       <w:pPr>
         <w:pStyle w:val="Heading2"/>
       </w:pPr>
-      <w:bookmarkStart w:id="35" w:name="_Toc241509340"/>
+      <w:bookmarkStart w:id="35" w:name="_Toc241510434"/>
       <w:r>
         <w:t>Pulling up a car's QC report</w:t>
       </w:r>
@@ -7253,7 +7347,7 @@
         <w:pStyle w:val="Heading1"/>
         <w:pageBreakBefore/>
       </w:pPr>
-      <w:bookmarkStart w:id="36" w:name="_Toc241509341"/>
+      <w:bookmarkStart w:id="36" w:name="_Toc241510435"/>
       <w:r>
         <w:t>10.  Office tools</w:t>
       </w:r>
@@ -7263,7 +7357,7 @@
       <w:pPr>
         <w:pStyle w:val="Heading2"/>
       </w:pPr>
-      <w:bookmarkStart w:id="37" w:name="_Toc241509342"/>
+      <w:bookmarkStart w:id="37" w:name="_Toc241510436"/>
       <w:r>
         <w:t>Missed Calls / Callback Requests</w:t>
       </w:r>
@@ -7341,7 +7435,7 @@
       <w:pPr>
         <w:pStyle w:val="Heading2"/>
       </w:pPr>
-      <w:bookmarkStart w:id="38" w:name="_Toc241509343"/>
+      <w:bookmarkStart w:id="38" w:name="_Toc241510437"/>
       <w:r>
         <w:t>Tasks</w:t>
       </w:r>
@@ -7359,7 +7453,7 @@
       <w:pPr>
         <w:pStyle w:val="Heading2"/>
       </w:pPr>
-      <w:bookmarkStart w:id="39" w:name="_Toc241509344"/>
+      <w:bookmarkStart w:id="39" w:name="_Toc241510438"/>
       <w:r>
         <w:t>Booth Filters and Facility Checklist</w:t>
       </w:r>
@@ -7397,7 +7491,7 @@
       <w:pPr>
         <w:pStyle w:val="Heading2"/>
       </w:pPr>
-      <w:bookmarkStart w:id="40" w:name="_Toc241509345"/>
+      <w:bookmarkStart w:id="40" w:name="_Toc241510439"/>
       <w:r>
         <w:t>AR Balances and Cycle Time</w:t>
       </w:r>
@@ -7447,7 +7541,7 @@
       <w:pPr>
         <w:pStyle w:val="Heading2"/>
       </w:pPr>
-      <w:bookmarkStart w:id="41" w:name="_Toc241509346"/>
+      <w:bookmarkStart w:id="41" w:name="_Toc241510440"/>
       <w:r>
         <w:t>Photos and Activity Log</w:t>
       </w:r>
@@ -7498,7 +7592,7 @@
         <w:pStyle w:val="Heading1"/>
         <w:pageBreakBefore/>
       </w:pPr>
-      <w:bookmarkStart w:id="42" w:name="_Toc241509347"/>
+      <w:bookmarkStart w:id="42" w:name="_Toc241510441"/>
       <w:r>
         <w:t>11.  Time off and messages (office and admins)</w:t>
       </w:r>
@@ -7508,7 +7602,7 @@
       <w:pPr>
         <w:pStyle w:val="Heading2"/>
       </w:pPr>
-      <w:bookmarkStart w:id="43" w:name="_Toc241509348"/>
+      <w:bookmarkStart w:id="43" w:name="_Toc241510442"/>
       <w:r>
         <w:t>Time Off tab</w:t>
       </w:r>
@@ -7636,7 +7730,7 @@
       <w:pPr>
         <w:pStyle w:val="Heading2"/>
       </w:pPr>
-      <w:bookmarkStart w:id="44" w:name="_Toc241509349"/>
+      <w:bookmarkStart w:id="44" w:name="_Toc241510443"/>
       <w:r>
         <w:t>Messages &amp; Info tab</w:t>
       </w:r>
@@ -7727,7 +7821,7 @@
         <w:pStyle w:val="Heading1"/>
         <w:pageBreakBefore/>
       </w:pPr>
-      <w:bookmarkStart w:id="45" w:name="_Toc241509350"/>
+      <w:bookmarkStart w:id="45" w:name="_Toc241510444"/>
       <w:r>
         <w:t>12.  Admin: employees and settings</w:t>
       </w:r>
@@ -7737,7 +7831,7 @@
       <w:pPr>
         <w:pStyle w:val="Heading2"/>
       </w:pPr>
-      <w:bookmarkStart w:id="46" w:name="_Toc241509351"/>
+      <w:bookmarkStart w:id="46" w:name="_Toc241510445"/>
       <w:r>
         <w:t>Adding an employee</w:t>
       </w:r>
@@ -7859,7 +7953,7 @@
       <w:pPr>
         <w:pStyle w:val="Heading2"/>
       </w:pPr>
-      <w:bookmarkStart w:id="47" w:name="_Toc241509352"/>
+      <w:bookmarkStart w:id="47" w:name="_Toc241510446"/>
       <w:r>
         <w:t>Changing an employee</w:t>
       </w:r>
@@ -8019,7 +8113,7 @@
       <w:pPr>
         <w:pStyle w:val="Heading2"/>
       </w:pPr>
-      <w:bookmarkStart w:id="48" w:name="_Toc241509353"/>
+      <w:bookmarkStart w:id="48" w:name="_Toc241510447"/>
       <w:r>
         <w:t>Board Settings</w:t>
       </w:r>
@@ -8038,7 +8132,7 @@
         <w:pStyle w:val="Heading1"/>
         <w:pageBreakBefore/>
       </w:pPr>
-      <w:bookmarkStart w:id="49" w:name="_Toc241509354"/>
+      <w:bookmarkStart w:id="49" w:name="_Toc241510448"/>
       <w:r>
         <w:t>13.  Quick answers</w:t>
       </w:r>
@@ -8682,7 +8776,7 @@
         <w:pStyle w:val="Heading1"/>
         <w:pageBreakBefore/>
       </w:pPr>
-      <w:bookmarkStart w:id="50" w:name="_Toc241509355"/>
+      <w:bookmarkStart w:id="50" w:name="_Toc241510449"/>
       <w:r>
         <w:t>Manual versions</w:t>
       </w:r>
@@ -8837,7 +8931,7 @@
                 <w:b/>
                 <w:bCs/>
               </w:rPr>
-              <w:t>1.6</w:t>
+              <w:t>1.7</w:t>
             </w:r>
           </w:p>
         </w:tc>
@@ -8881,37 +8975,17 @@
           </w:tcPr>
           <w:p>
             <w:r>
-              <w:t xml:space="preserve">Whoever does </w:t>
+              <w:t xml:space="preserve">The Employee App now shows </w:t>
             </w:r>
             <w:r>
               <w:rPr>
                 <w:b/>
                 <w:bCs/>
               </w:rPr>
-              <w:t>Check-In</w:t>
-            </w:r>
-            <w:r>
-              <w:t xml:space="preserve"> automatically gets the </w:t>
-            </w:r>
-            <w:r>
-              <w:rPr>
-                <w:b/>
-                <w:bCs/>
-              </w:rPr>
-              <w:t>Final QC</w:t>
-            </w:r>
-            <w:r>
-              <w:t xml:space="preserve"> checklist too. New </w:t>
-            </w:r>
-            <w:r>
-              <w:rPr>
-                <w:b/>
-                <w:bCs/>
-              </w:rPr>
-              <w:t>QC report</w:t>
-            </w:r>
-            <w:r>
-              <w:t xml:space="preserve"> for each car: all five checklists with signatures on one printable page.</w:t>
+              <w:t>where each part is</w:t>
+            </w:r>
+            <w:r>
+              <w:t>: the car's parts cart, and the cart shelf or storage spot for every part.</w:t>
             </w:r>
           </w:p>
         </w:tc>
@@ -8948,7 +9022,7 @@
                 <w:b/>
                 <w:bCs/>
               </w:rPr>
-              <w:t>1.5</w:t>
+              <w:t>1.6</w:t>
             </w:r>
           </w:p>
         </w:tc>
@@ -8992,17 +9066,37 @@
           </w:tcPr>
           <w:p>
             <w:r>
-              <w:t xml:space="preserve">Body technicians automatically get the </w:t>
+              <w:t xml:space="preserve">Whoever does </w:t>
             </w:r>
             <w:r>
               <w:rPr>
                 <w:b/>
                 <w:bCs/>
               </w:rPr>
-              <w:t>Reassy</w:t>
-            </w:r>
-            <w:r>
-              <w:t xml:space="preserve"> checklist too.</w:t>
+              <w:t>Check-In</w:t>
+            </w:r>
+            <w:r>
+              <w:t xml:space="preserve"> automatically gets the </w:t>
+            </w:r>
+            <w:r>
+              <w:rPr>
+                <w:b/>
+                <w:bCs/>
+              </w:rPr>
+              <w:t>Final QC</w:t>
+            </w:r>
+            <w:r>
+              <w:t xml:space="preserve"> checklist too. New </w:t>
+            </w:r>
+            <w:r>
+              <w:rPr>
+                <w:b/>
+                <w:bCs/>
+              </w:rPr>
+              <w:t>QC report</w:t>
+            </w:r>
+            <w:r>
+              <w:t xml:space="preserve"> for each car: all five checklists with signatures on one printable page.</w:t>
             </w:r>
           </w:p>
         </w:tc>
@@ -9039,7 +9133,7 @@
                 <w:b/>
                 <w:bCs/>
               </w:rPr>
-              <w:t>1.4</w:t>
+              <w:t>1.5</w:t>
             </w:r>
           </w:p>
         </w:tc>
@@ -9083,17 +9177,17 @@
           </w:tcPr>
           <w:p>
             <w:r>
-              <w:t xml:space="preserve">Employees can be set to </w:t>
+              <w:t xml:space="preserve">Body technicians automatically get the </w:t>
             </w:r>
             <w:r>
               <w:rPr>
                 <w:b/>
                 <w:bCs/>
               </w:rPr>
-              <w:t>also do</w:t>
-            </w:r>
-            <w:r>
-              <w:t xml:space="preserve"> other checklists (for example a body tech who reassembles also gets the Reassy checklist).</w:t>
+              <w:t>Reassy</w:t>
+            </w:r>
+            <w:r>
+              <w:t xml:space="preserve"> checklist too.</w:t>
             </w:r>
           </w:p>
         </w:tc>
@@ -9130,7 +9224,7 @@
                 <w:b/>
                 <w:bCs/>
               </w:rPr>
-              <w:t>1.3</w:t>
+              <w:t>1.4</w:t>
             </w:r>
           </w:p>
         </w:tc>
@@ -9174,7 +9268,17 @@
           </w:tcPr>
           <w:p>
             <w:r>
-              <w:t>New accounts and admin password resets use a temporary password; you choose your own the first time you sign in.</w:t>
+              <w:t xml:space="preserve">Employees can be set to </w:t>
+            </w:r>
+            <w:r>
+              <w:rPr>
+                <w:b/>
+                <w:bCs/>
+              </w:rPr>
+              <w:t>also do</w:t>
+            </w:r>
+            <w:r>
+              <w:t xml:space="preserve"> other checklists (for example a body tech who reassembles also gets the Reassy checklist).</w:t>
             </w:r>
           </w:p>
         </w:tc>
@@ -9211,7 +9315,7 @@
                 <w:b/>
                 <w:bCs/>
               </w:rPr>
-              <w:t>1.2</w:t>
+              <w:t>1.3</w:t>
             </w:r>
           </w:p>
         </w:tc>
@@ -9255,17 +9359,7 @@
           </w:tcPr>
           <w:p>
             <w:r>
-              <w:t xml:space="preserve">Added the </w:t>
-            </w:r>
-            <w:r>
-              <w:rPr>
-                <w:b/>
-                <w:bCs/>
-              </w:rPr>
-              <w:t>Help</w:t>
-            </w:r>
-            <w:r>
-              <w:t xml:space="preserve"> tab in the office program and a search box in the manual.</w:t>
+              <w:t>New accounts and admin password resets use a temporary password; you choose your own the first time you sign in.</w:t>
             </w:r>
           </w:p>
         </w:tc>
@@ -9302,7 +9396,7 @@
                 <w:b/>
                 <w:bCs/>
               </w:rPr>
-              <w:t>1.1</w:t>
+              <w:t>1.2</w:t>
             </w:r>
           </w:p>
         </w:tc>
@@ -9346,17 +9440,17 @@
           </w:tcPr>
           <w:p>
             <w:r>
-              <w:t xml:space="preserve">Employee App address is now </w:t>
+              <w:t xml:space="preserve">Added the </w:t>
             </w:r>
             <w:r>
               <w:rPr>
                 <w:b/>
                 <w:bCs/>
               </w:rPr>
-              <w:t>https://conceptautobody.app</w:t>
-            </w:r>
-            <w:r>
-              <w:t xml:space="preserve"> and works on phones anywhere. Added how to put it on your phone's home screen.</w:t>
+              <w:t>Help</w:t>
+            </w:r>
+            <w:r>
+              <w:t xml:space="preserve"> tab in the office program and a search box in the manual.</w:t>
             </w:r>
           </w:p>
         </w:tc>
@@ -9393,7 +9487,7 @@
                 <w:b/>
                 <w:bCs/>
               </w:rPr>
-              <w:t>1.0</w:t>
+              <w:t>1.1</w:t>
             </w:r>
           </w:p>
         </w:tc>
@@ -9437,6 +9531,97 @@
           </w:tcPr>
           <w:p>
             <w:r>
+              <w:t xml:space="preserve">Employee App address is now </w:t>
+            </w:r>
+            <w:r>
+              <w:rPr>
+                <w:b/>
+                <w:bCs/>
+              </w:rPr>
+              <w:t>https://conceptautobody.app</w:t>
+            </w:r>
+            <w:r>
+              <w:t xml:space="preserve"> and works on phones anywhere. Added how to put it on your phone's home screen.</w:t>
+            </w:r>
+          </w:p>
+        </w:tc>
+      </w:tr>
+      <w:tr>
+        <w:tblPrEx>
+          <w:tblCellMar>
+            <w:top w:w="0" w:type="dxa"/>
+            <w:bottom w:w="0" w:type="dxa"/>
+          </w:tblCellMar>
+        </w:tblPrEx>
+        <w:trPr>
+          <w:cantSplit/>
+        </w:trPr>
+        <w:tc>
+          <w:tcPr>
+            <w:tcW w:w="3120" w:type="dxa"/>
+            <w:tcBorders>
+              <w:top w:val="single" w:sz="4" w:space="0" w:color="C9CFD6"/>
+              <w:left w:val="single" w:sz="4" w:space="0" w:color="C9CFD6"/>
+              <w:bottom w:val="single" w:sz="4" w:space="0" w:color="C9CFD6"/>
+              <w:right w:val="single" w:sz="4" w:space="0" w:color="C9CFD6"/>
+            </w:tcBorders>
+            <w:tcMar>
+              <w:top w:w="80" w:type="dxa"/>
+              <w:left w:w="120" w:type="dxa"/>
+              <w:bottom w:w="80" w:type="dxa"/>
+              <w:right w:w="120" w:type="dxa"/>
+            </w:tcMar>
+          </w:tcPr>
+          <w:p>
+            <w:r>
+              <w:rPr>
+                <w:b/>
+                <w:bCs/>
+              </w:rPr>
+              <w:t>1.0</w:t>
+            </w:r>
+          </w:p>
+        </w:tc>
+        <w:tc>
+          <w:tcPr>
+            <w:tcW w:w="3120" w:type="dxa"/>
+            <w:tcBorders>
+              <w:top w:val="single" w:sz="4" w:space="0" w:color="C9CFD6"/>
+              <w:left w:val="single" w:sz="4" w:space="0" w:color="C9CFD6"/>
+              <w:bottom w:val="single" w:sz="4" w:space="0" w:color="C9CFD6"/>
+              <w:right w:val="single" w:sz="4" w:space="0" w:color="C9CFD6"/>
+            </w:tcBorders>
+            <w:tcMar>
+              <w:top w:w="80" w:type="dxa"/>
+              <w:left w:w="120" w:type="dxa"/>
+              <w:bottom w:w="80" w:type="dxa"/>
+              <w:right w:w="120" w:type="dxa"/>
+            </w:tcMar>
+          </w:tcPr>
+          <w:p>
+            <w:r>
+              <w:t>September 28, 2026</w:t>
+            </w:r>
+          </w:p>
+        </w:tc>
+        <w:tc>
+          <w:tcPr>
+            <w:tcW w:w="3120" w:type="dxa"/>
+            <w:tcBorders>
+              <w:top w:val="single" w:sz="4" w:space="0" w:color="C9CFD6"/>
+              <w:left w:val="single" w:sz="4" w:space="0" w:color="C9CFD6"/>
+              <w:bottom w:val="single" w:sz="4" w:space="0" w:color="C9CFD6"/>
+              <w:right w:val="single" w:sz="4" w:space="0" w:color="C9CFD6"/>
+            </w:tcBorders>
+            <w:tcMar>
+              <w:top w:w="80" w:type="dxa"/>
+              <w:left w:w="120" w:type="dxa"/>
+              <w:bottom w:w="80" w:type="dxa"/>
+              <w:right w:w="120" w:type="dxa"/>
+            </w:tcMar>
+          </w:tcPr>
+          <w:p>
+            <w:r>
               <w:t>First edition.</w:t>
             </w:r>
           </w:p>
@@ -9498,7 +9683,7 @@
         <w:sz w:val="18"/>
         <w:szCs w:val="18"/>
       </w:rPr>
-      <w:t xml:space="preserve">Concept Autobody  ·  Version 1.6  ·  Page </w:t>
+      <w:t xml:space="preserve">Concept Autobody  ·  Version 1.7  ·  Page </w:t>
     </w:r>
     <w:r>
       <w:rPr>
@@ -9591,10 +9776,96 @@
 <file path=word/numbering.xml><?xml version="1.0" encoding="utf-8"?>
 <w:numbering xmlns:wpc="http://schemas.microsoft.com/office/word/2010/wordprocessingCanvas" xmlns:cx="http://schemas.microsoft.com/office/drawing/2014/chartex" xmlns:cx1="http://schemas.microsoft.com/office/drawing/2015/9/8/chartex" xmlns:cx2="http://schemas.microsoft.com/office/drawing/2015/10/21/chartex" xmlns:cx3="http://schemas.microsoft.com/office/drawing/2016/5/9/chartex" xmlns:cx4="http://schemas.microsoft.com/office/drawing/2016/5/10/chartex" xmlns:cx5="http://schemas.microsoft.com/office/drawing/2016/5/11/chartex" xmlns:cx6="http://schemas.microsoft.com/office/drawing/2016/5/12/chartex" xmlns:cx7="http://schemas.microsoft.com/office/drawing/2016/5/13/chartex" xmlns:cx8="http://schemas.microsoft.com/office/drawing/2016/5/14/chartex" xmlns:mc="http://schemas.openxmlformats.org/markup-compatibility/2006" xmlns:aink="http://schemas.microsoft.com/office/drawing/2016/ink" xmlns:am3d="http://schemas.microsoft.com/office/drawing/2017/model3d" xmlns:o="urn:schemas-microsoft-com:office:office" xmlns:oel="http://schemas.microsoft.com/office/2019/extlst" xmlns:r="http://schemas.openxmlformats.org/officeDocument/2006/relationships" xmlns:m="http://schemas.openxmlformats.org/officeDocument/2006/math" xmlns:v="urn:schemas-microsoft-com:vml" xmlns:wp14="http://schemas.microsoft.com/office/word/2010/wordprocessingDrawing" xmlns:wp="http://schemas.openxmlformats.org/drawingml/2006/wordprocessingDrawing" xmlns:w10="urn:schemas-microsoft-com:office:word" xmlns:w="http://schemas.openxmlformats.org/wordprocessingml/2006/main" xmlns:w14="http://schemas.microsoft.com/office/word/2010/wordml" xmlns:w15="http://schemas.microsoft.com/office/word/2012/wordml" xmlns:w16cex="http://schemas.microsoft.com/office/word/2018/wordml/cex" xmlns:w16cid="http://schemas.microsoft.com/office/word/2016/wordml/cid" xmlns:w16="http://schemas.microsoft.com/office/word/2018/wordml" xmlns:w16du="http://schemas.microsoft.com/office/word/2023/wordml/word16du" xmlns:w16sdtdh="http://schemas.microsoft.com/office/word/2020/wordml/sdtdatahash" xmlns:w16sdtfl="http://schemas.microsoft.com/office/word/2024/wordml/sdtformatlock" xmlns:w16se="http://schemas.microsoft.com/office/word/2015/wordml/symex" xmlns:wpg="http://schemas.microsoft.com/office/word/2010/wordprocessingGroup" xmlns:wpi="http://schemas.microsoft.com/office/word/2010/wordprocessingInk" xmlns:wne="http://schemas.microsoft.com/office/word/2006/wordml" xmlns:wps="http://schemas.microsoft.com/office/word/2010/wordprocessingShape" mc:Ignorable="w14 w15 w16se w16cid w16 w16cex w16sdtdh w16sdtfl w16du wp14">
   <w:abstractNum w:abstractNumId="0" w15:restartNumberingAfterBreak="0">
-    <w:nsid w:val="1373442F"/>
+    <w:nsid w:val="079E7B38"/>
     <w:multiLevelType w:val="hybridMultilevel"/>
-    <w:tmpl w:val="DE40012A"/>
-    <w:lvl w:ilvl="0" w:tplc="28EA0C0C">
+    <w:tmpl w:val="1946D078"/>
+    <w:lvl w:ilvl="0" w:tplc="2992258E" w:tentative="1">
+      <w:start w:val="1"/>
+      <w:numFmt w:val="bullet"/>
+      <w:lvlText w:val="●"/>
+      <w:lvlJc w:val="left"/>
+      <w:pPr>
+        <w:ind w:left="720" w:hanging="360"/>
+      </w:pPr>
+    </w:lvl>
+    <w:lvl w:ilvl="1" w:tplc="2FB45784" w:tentative="1">
+      <w:start w:val="1"/>
+      <w:numFmt w:val="bullet"/>
+      <w:lvlText w:val="○"/>
+      <w:lvlJc w:val="left"/>
+      <w:pPr>
+        <w:ind w:left="1440" w:hanging="360"/>
+      </w:pPr>
+    </w:lvl>
+    <w:lvl w:ilvl="2" w:tplc="F1CCBBDC" w:tentative="1">
+      <w:start w:val="1"/>
+      <w:numFmt w:val="bullet"/>
+      <w:lvlText w:val="■"/>
+      <w:lvlJc w:val="left"/>
+      <w:pPr>
+        <w:ind w:left="2160" w:hanging="360"/>
+      </w:pPr>
+    </w:lvl>
+    <w:lvl w:ilvl="3" w:tplc="7AD6D556" w:tentative="1">
+      <w:start w:val="1"/>
+      <w:numFmt w:val="bullet"/>
+      <w:lvlText w:val="●"/>
+      <w:lvlJc w:val="left"/>
+      <w:pPr>
+        <w:ind w:left="2880" w:hanging="360"/>
+      </w:pPr>
+    </w:lvl>
+    <w:lvl w:ilvl="4" w:tplc="EF28604A" w:tentative="1">
+      <w:start w:val="1"/>
+      <w:numFmt w:val="bullet"/>
+      <w:lvlText w:val="○"/>
+      <w:lvlJc w:val="left"/>
+      <w:pPr>
+        <w:ind w:left="3600" w:hanging="360"/>
+      </w:pPr>
+    </w:lvl>
+    <w:lvl w:ilvl="5" w:tplc="8FAC4992" w:tentative="1">
+      <w:start w:val="1"/>
+      <w:numFmt w:val="bullet"/>
+      <w:lvlText w:val="■"/>
+      <w:lvlJc w:val="left"/>
+      <w:pPr>
+        <w:ind w:left="4320" w:hanging="360"/>
+      </w:pPr>
+    </w:lvl>
+    <w:lvl w:ilvl="6" w:tplc="B45CBDF6" w:tentative="1">
+      <w:start w:val="1"/>
+      <w:numFmt w:val="bullet"/>
+      <w:lvlText w:val="●"/>
+      <w:lvlJc w:val="left"/>
+      <w:pPr>
+        <w:ind w:left="5040" w:hanging="360"/>
+      </w:pPr>
+    </w:lvl>
+    <w:lvl w:ilvl="7" w:tplc="1BD28E58" w:tentative="1">
+      <w:start w:val="1"/>
+      <w:numFmt w:val="bullet"/>
+      <w:lvlText w:val="●"/>
+      <w:lvlJc w:val="left"/>
+      <w:pPr>
+        <w:ind w:left="5760" w:hanging="360"/>
+      </w:pPr>
+    </w:lvl>
+    <w:lvl w:ilvl="8" w:tplc="6BF6570A" w:tentative="1">
+      <w:start w:val="1"/>
+      <w:numFmt w:val="bullet"/>
+      <w:lvlText w:val="●"/>
+      <w:lvlJc w:val="left"/>
+      <w:pPr>
+        <w:ind w:left="6480" w:hanging="360"/>
+      </w:pPr>
+    </w:lvl>
+  </w:abstractNum>
+  <w:abstractNum w:abstractNumId="1" w15:restartNumberingAfterBreak="0">
+    <w:nsid w:val="0ECB21D7"/>
+    <w:multiLevelType w:val="hybridMultilevel"/>
+    <w:tmpl w:val="DD20D966"/>
+    <w:lvl w:ilvl="0" w:tplc="B47EC45A">
       <w:start w:val="1"/>
       <w:numFmt w:val="bullet"/>
       <w:lvlText w:val="•"/>
@@ -9603,52 +9874,52 @@
         <w:ind w:left="540" w:hanging="270"/>
       </w:pPr>
     </w:lvl>
-    <w:lvl w:ilvl="1" w:tplc="63BC7822">
+    <w:lvl w:ilvl="1" w:tplc="4580961E">
       <w:numFmt w:val="decimal"/>
       <w:lvlText w:val=""/>
       <w:lvlJc w:val="left"/>
     </w:lvl>
-    <w:lvl w:ilvl="2" w:tplc="2E583844">
+    <w:lvl w:ilvl="2" w:tplc="7F08DD50">
       <w:numFmt w:val="decimal"/>
       <w:lvlText w:val=""/>
       <w:lvlJc w:val="left"/>
     </w:lvl>
-    <w:lvl w:ilvl="3" w:tplc="F32450E8">
+    <w:lvl w:ilvl="3" w:tplc="0422F214">
       <w:numFmt w:val="decimal"/>
       <w:lvlText w:val=""/>
       <w:lvlJc w:val="left"/>
     </w:lvl>
-    <w:lvl w:ilvl="4" w:tplc="51AED156">
+    <w:lvl w:ilvl="4" w:tplc="8E2E2040">
       <w:numFmt w:val="decimal"/>
       <w:lvlText w:val=""/>
       <w:lvlJc w:val="left"/>
     </w:lvl>
-    <w:lvl w:ilvl="5" w:tplc="7EE824B8">
+    <w:lvl w:ilvl="5" w:tplc="84A4F694">
       <w:numFmt w:val="decimal"/>
       <w:lvlText w:val=""/>
       <w:lvlJc w:val="left"/>
     </w:lvl>
-    <w:lvl w:ilvl="6" w:tplc="06D67C90">
+    <w:lvl w:ilvl="6" w:tplc="0FCC5CA6">
       <w:numFmt w:val="decimal"/>
       <w:lvlText w:val=""/>
       <w:lvlJc w:val="left"/>
     </w:lvl>
-    <w:lvl w:ilvl="7" w:tplc="308A6F6C">
+    <w:lvl w:ilvl="7" w:tplc="B6CA19F0">
       <w:numFmt w:val="decimal"/>
       <w:lvlText w:val=""/>
       <w:lvlJc w:val="left"/>
     </w:lvl>
-    <w:lvl w:ilvl="8" w:tplc="12084036">
+    <w:lvl w:ilvl="8" w:tplc="92CE7DCC">
       <w:numFmt w:val="decimal"/>
       <w:lvlText w:val=""/>
       <w:lvlJc w:val="left"/>
     </w:lvl>
   </w:abstractNum>
-  <w:abstractNum w:abstractNumId="1" w15:restartNumberingAfterBreak="0">
-    <w:nsid w:val="597F180B"/>
+  <w:abstractNum w:abstractNumId="2" w15:restartNumberingAfterBreak="0">
+    <w:nsid w:val="110F21AD"/>
     <w:multiLevelType w:val="hybridMultilevel"/>
-    <w:tmpl w:val="48BA5478"/>
-    <w:lvl w:ilvl="0" w:tplc="F222B8DC">
+    <w:tmpl w:val="2F28649C"/>
+    <w:lvl w:ilvl="0" w:tplc="545CBEAA">
       <w:start w:val="1"/>
       <w:numFmt w:val="decimal"/>
       <w:lvlText w:val="%1."/>
@@ -9662,207 +9933,121 @@
         <w:color w:val="E8620E"/>
       </w:rPr>
     </w:lvl>
-    <w:lvl w:ilvl="1" w:tplc="734CC610">
+    <w:lvl w:ilvl="1" w:tplc="1BF271D0">
       <w:numFmt w:val="decimal"/>
       <w:lvlText w:val=""/>
       <w:lvlJc w:val="left"/>
     </w:lvl>
-    <w:lvl w:ilvl="2" w:tplc="F06E3606">
+    <w:lvl w:ilvl="2" w:tplc="A7608C0C">
       <w:numFmt w:val="decimal"/>
       <w:lvlText w:val=""/>
       <w:lvlJc w:val="left"/>
     </w:lvl>
-    <w:lvl w:ilvl="3" w:tplc="DDD6FD7E">
+    <w:lvl w:ilvl="3" w:tplc="474C870E">
       <w:numFmt w:val="decimal"/>
       <w:lvlText w:val=""/>
       <w:lvlJc w:val="left"/>
     </w:lvl>
-    <w:lvl w:ilvl="4" w:tplc="5A2CBE6E">
+    <w:lvl w:ilvl="4" w:tplc="9A2C08D0">
       <w:numFmt w:val="decimal"/>
       <w:lvlText w:val=""/>
       <w:lvlJc w:val="left"/>
     </w:lvl>
-    <w:lvl w:ilvl="5" w:tplc="3198EBC8">
+    <w:lvl w:ilvl="5" w:tplc="928EBC0E">
       <w:numFmt w:val="decimal"/>
       <w:lvlText w:val=""/>
       <w:lvlJc w:val="left"/>
     </w:lvl>
-    <w:lvl w:ilvl="6" w:tplc="1FAA242A">
+    <w:lvl w:ilvl="6" w:tplc="1010899A">
       <w:numFmt w:val="decimal"/>
       <w:lvlText w:val=""/>
       <w:lvlJc w:val="left"/>
     </w:lvl>
-    <w:lvl w:ilvl="7" w:tplc="A3F2FFE4">
+    <w:lvl w:ilvl="7" w:tplc="7CC04A0A">
       <w:numFmt w:val="decimal"/>
       <w:lvlText w:val=""/>
       <w:lvlJc w:val="left"/>
     </w:lvl>
-    <w:lvl w:ilvl="8" w:tplc="7952A0E0">
+    <w:lvl w:ilvl="8" w:tplc="D6D690C4">
       <w:numFmt w:val="decimal"/>
       <w:lvlText w:val=""/>
       <w:lvlJc w:val="left"/>
     </w:lvl>
   </w:abstractNum>
-  <w:abstractNum w:abstractNumId="2" w15:restartNumberingAfterBreak="0">
-    <w:nsid w:val="75DC3AE9"/>
-    <w:multiLevelType w:val="hybridMultilevel"/>
-    <w:tmpl w:val="F3AEE800"/>
-    <w:lvl w:ilvl="0" w:tplc="DD4654CE" w:tentative="1">
-      <w:start w:val="1"/>
-      <w:numFmt w:val="bullet"/>
-      <w:lvlText w:val="●"/>
-      <w:lvlJc w:val="left"/>
-      <w:pPr>
-        <w:ind w:left="720" w:hanging="360"/>
-      </w:pPr>
-    </w:lvl>
-    <w:lvl w:ilvl="1" w:tplc="FCD89AE4" w:tentative="1">
-      <w:start w:val="1"/>
-      <w:numFmt w:val="bullet"/>
-      <w:lvlText w:val="○"/>
-      <w:lvlJc w:val="left"/>
-      <w:pPr>
-        <w:ind w:left="1440" w:hanging="360"/>
-      </w:pPr>
-    </w:lvl>
-    <w:lvl w:ilvl="2" w:tplc="CC5ECF9C" w:tentative="1">
-      <w:start w:val="1"/>
-      <w:numFmt w:val="bullet"/>
-      <w:lvlText w:val="■"/>
-      <w:lvlJc w:val="left"/>
-      <w:pPr>
-        <w:ind w:left="2160" w:hanging="360"/>
-      </w:pPr>
-    </w:lvl>
-    <w:lvl w:ilvl="3" w:tplc="1016645C" w:tentative="1">
-      <w:start w:val="1"/>
-      <w:numFmt w:val="bullet"/>
-      <w:lvlText w:val="●"/>
-      <w:lvlJc w:val="left"/>
-      <w:pPr>
-        <w:ind w:left="2880" w:hanging="360"/>
-      </w:pPr>
-    </w:lvl>
-    <w:lvl w:ilvl="4" w:tplc="796CBADA" w:tentative="1">
-      <w:start w:val="1"/>
-      <w:numFmt w:val="bullet"/>
-      <w:lvlText w:val="○"/>
-      <w:lvlJc w:val="left"/>
-      <w:pPr>
-        <w:ind w:left="3600" w:hanging="360"/>
-      </w:pPr>
-    </w:lvl>
-    <w:lvl w:ilvl="5" w:tplc="F0FA4D44" w:tentative="1">
-      <w:start w:val="1"/>
-      <w:numFmt w:val="bullet"/>
-      <w:lvlText w:val="■"/>
-      <w:lvlJc w:val="left"/>
-      <w:pPr>
-        <w:ind w:left="4320" w:hanging="360"/>
-      </w:pPr>
-    </w:lvl>
-    <w:lvl w:ilvl="6" w:tplc="9942F2CA" w:tentative="1">
-      <w:start w:val="1"/>
-      <w:numFmt w:val="bullet"/>
-      <w:lvlText w:val="●"/>
-      <w:lvlJc w:val="left"/>
-      <w:pPr>
-        <w:ind w:left="5040" w:hanging="360"/>
-      </w:pPr>
-    </w:lvl>
-    <w:lvl w:ilvl="7" w:tplc="E1C28B1E" w:tentative="1">
-      <w:start w:val="1"/>
-      <w:numFmt w:val="bullet"/>
-      <w:lvlText w:val="●"/>
-      <w:lvlJc w:val="left"/>
-      <w:pPr>
-        <w:ind w:left="5760" w:hanging="360"/>
-      </w:pPr>
-    </w:lvl>
-    <w:lvl w:ilvl="8" w:tplc="A35A56C0" w:tentative="1">
-      <w:start w:val="1"/>
-      <w:numFmt w:val="bullet"/>
-      <w:lvlText w:val="●"/>
-      <w:lvlJc w:val="left"/>
-      <w:pPr>
-        <w:ind w:left="6480" w:hanging="360"/>
-      </w:pPr>
-    </w:lvl>
-  </w:abstractNum>
-  <w:num w:numId="1" w16cid:durableId="1503396522">
+  <w:num w:numId="1" w16cid:durableId="1709447604">
+    <w:abstractNumId w:val="0"/>
+    <w:lvlOverride w:ilvl="0">
+      <w:startOverride w:val="1"/>
+    </w:lvlOverride>
+  </w:num>
+  <w:num w:numId="2" w16cid:durableId="2063363255">
+    <w:abstractNumId w:val="1"/>
+    <w:lvlOverride w:ilvl="0">
+      <w:startOverride w:val="1"/>
+    </w:lvlOverride>
+  </w:num>
+  <w:num w:numId="3" w16cid:durableId="1532574104">
     <w:abstractNumId w:val="2"/>
     <w:lvlOverride w:ilvl="0">
       <w:startOverride w:val="1"/>
     </w:lvlOverride>
   </w:num>
-  <w:num w:numId="2" w16cid:durableId="2054650532">
-    <w:abstractNumId w:val="0"/>
+  <w:num w:numId="4" w16cid:durableId="1973124768">
+    <w:abstractNumId w:val="2"/>
     <w:lvlOverride w:ilvl="0">
       <w:startOverride w:val="1"/>
     </w:lvlOverride>
   </w:num>
-  <w:num w:numId="3" w16cid:durableId="966280475">
-    <w:abstractNumId w:val="1"/>
+  <w:num w:numId="5" w16cid:durableId="1806584889">
+    <w:abstractNumId w:val="2"/>
     <w:lvlOverride w:ilvl="0">
       <w:startOverride w:val="1"/>
     </w:lvlOverride>
   </w:num>
-  <w:num w:numId="4" w16cid:durableId="771897447">
-    <w:abstractNumId w:val="1"/>
+  <w:num w:numId="6" w16cid:durableId="494417919">
+    <w:abstractNumId w:val="2"/>
     <w:lvlOverride w:ilvl="0">
       <w:startOverride w:val="1"/>
     </w:lvlOverride>
   </w:num>
-  <w:num w:numId="5" w16cid:durableId="813446076">
-    <w:abstractNumId w:val="1"/>
+  <w:num w:numId="7" w16cid:durableId="1299339350">
+    <w:abstractNumId w:val="2"/>
     <w:lvlOverride w:ilvl="0">
       <w:startOverride w:val="1"/>
     </w:lvlOverride>
   </w:num>
-  <w:num w:numId="6" w16cid:durableId="188178791">
-    <w:abstractNumId w:val="1"/>
+  <w:num w:numId="8" w16cid:durableId="946354575">
+    <w:abstractNumId w:val="2"/>
     <w:lvlOverride w:ilvl="0">
       <w:startOverride w:val="1"/>
     </w:lvlOverride>
   </w:num>
-  <w:num w:numId="7" w16cid:durableId="1495144388">
-    <w:abstractNumId w:val="1"/>
+  <w:num w:numId="9" w16cid:durableId="891622928">
+    <w:abstractNumId w:val="2"/>
     <w:lvlOverride w:ilvl="0">
       <w:startOverride w:val="1"/>
     </w:lvlOverride>
   </w:num>
-  <w:num w:numId="8" w16cid:durableId="1771271310">
-    <w:abstractNumId w:val="1"/>
+  <w:num w:numId="10" w16cid:durableId="675575932">
+    <w:abstractNumId w:val="2"/>
     <w:lvlOverride w:ilvl="0">
       <w:startOverride w:val="1"/>
     </w:lvlOverride>
   </w:num>
-  <w:num w:numId="9" w16cid:durableId="1555698099">
-    <w:abstractNumId w:val="1"/>
+  <w:num w:numId="11" w16cid:durableId="136993908">
+    <w:abstractNumId w:val="2"/>
     <w:lvlOverride w:ilvl="0">
       <w:startOverride w:val="1"/>
     </w:lvlOverride>
   </w:num>
-  <w:num w:numId="10" w16cid:durableId="1464155434">
-    <w:abstractNumId w:val="1"/>
+  <w:num w:numId="12" w16cid:durableId="686832799">
+    <w:abstractNumId w:val="2"/>
     <w:lvlOverride w:ilvl="0">
       <w:startOverride w:val="1"/>
     </w:lvlOverride>
   </w:num>
-  <w:num w:numId="11" w16cid:durableId="5838151">
-    <w:abstractNumId w:val="1"/>
-    <w:lvlOverride w:ilvl="0">
-      <w:startOverride w:val="1"/>
-    </w:lvlOverride>
-  </w:num>
-  <w:num w:numId="12" w16cid:durableId="622426347">
-    <w:abstractNumId w:val="1"/>
-    <w:lvlOverride w:ilvl="0">
-      <w:startOverride w:val="1"/>
-    </w:lvlOverride>
-  </w:num>
-  <w:num w:numId="13" w16cid:durableId="2100129508">
-    <w:abstractNumId w:val="1"/>
+  <w:num w:numId="13" w16cid:durableId="299261858">
+    <w:abstractNumId w:val="2"/>
     <w:lvlOverride w:ilvl="0">
       <w:startOverride w:val="1"/>
     </w:lvlOverride>
@@ -10514,7 +10699,7 @@
     <w:autoRedefine/>
     <w:uiPriority w:val="39"/>
     <w:unhideWhenUsed/>
-    <w:rsid w:val="00C951A7"/>
+    <w:rsid w:val="00DF5676"/>
     <w:pPr>
       <w:spacing w:after="100"/>
     </w:pPr>
@@ -10526,7 +10711,7 @@
     <w:autoRedefine/>
     <w:uiPriority w:val="39"/>
     <w:unhideWhenUsed/>
-    <w:rsid w:val="00C951A7"/>
+    <w:rsid w:val="00DF5676"/>
     <w:pPr>
       <w:spacing w:after="100"/>
       <w:ind w:left="220"/>

</xml_diff>

<commit_message>
Completed Jobs tab with full job history; protect completed jobs from deletion; manual v1.8
Co-Authored-By: Claude Opus 5.5 <noreply@anthropic.com>
</commit_message>
<xml_diff>
--- a/client/manual/ShopControl-User-Manual.docx
+++ b/client/manual/ShopControl-User-Manual.docx
@@ -16,7 +16,7 @@
           <w:noProof/>
         </w:rPr>
         <w:drawing>
-          <wp:inline distT="0" distB="0" distL="0" distR="0" wp14:anchorId="773D5AA4" wp14:editId="773D5AA5">
+          <wp:inline distT="0" distB="0" distL="0" distR="0" wp14:anchorId="082A2B82" wp14:editId="082A2B83">
             <wp:extent cx="4000500" cy="1485900"/>
             <wp:effectExtent l="0" t="0" r="0" b="0"/>
             <wp:docPr id="1" name="Picture 1"/>
@@ -93,7 +93,7 @@
         <w:rPr>
           <w:color w:val="5B6776"/>
         </w:rPr>
-        <w:t>Version 1.7  ·  Updated September 28, 2026</w:t>
+        <w:t>Version 1.8  ·  Updated September 28, 2026</w:t>
       </w:r>
     </w:p>
     <w:p>
@@ -122,7 +122,7 @@
     <w:sdt>
       <w:sdtPr>
         <w:alias w:val="Contents"/>
-        <w:id w:val="-373614861"/>
+        <w:id w:val="-1808000580"/>
       </w:sdtPr>
       <w:sdtEndPr/>
       <w:sdtContent>
@@ -151,7 +151,7 @@
           <w:r>
             <w:fldChar w:fldCharType="separate"/>
           </w:r>
-          <w:hyperlink w:anchor="_Toc241510399" w:history="1">
+          <w:hyperlink w:anchor="_Toc241511950" w:history="1">
             <w:r>
               <w:rPr>
                 <w:rStyle w:val="Hyperlink"/>
@@ -175,7 +175,7 @@
               <w:rPr>
                 <w:noProof/>
               </w:rPr>
-              <w:instrText xml:space="preserve"> PAGEREF _Toc241510399 \h </w:instrText>
+              <w:instrText xml:space="preserve"> PAGEREF _Toc241511950 \h </w:instrText>
             </w:r>
             <w:r>
               <w:rPr>
@@ -218,7 +218,7 @@
               <w14:ligatures w14:val="standardContextual"/>
             </w:rPr>
           </w:pPr>
-          <w:hyperlink w:anchor="_Toc241510400" w:history="1">
+          <w:hyperlink w:anchor="_Toc241511951" w:history="1">
             <w:r>
               <w:rPr>
                 <w:rStyle w:val="Hyperlink"/>
@@ -242,7 +242,7 @@
               <w:rPr>
                 <w:noProof/>
               </w:rPr>
-              <w:instrText xml:space="preserve"> PAGEREF _Toc241510400 \h </w:instrText>
+              <w:instrText xml:space="preserve"> PAGEREF _Toc241511951 \h </w:instrText>
             </w:r>
             <w:r>
               <w:rPr>
@@ -285,7 +285,7 @@
               <w14:ligatures w14:val="standardContextual"/>
             </w:rPr>
           </w:pPr>
-          <w:hyperlink w:anchor="_Toc241510401" w:history="1">
+          <w:hyperlink w:anchor="_Toc241511952" w:history="1">
             <w:r>
               <w:rPr>
                 <w:rStyle w:val="Hyperlink"/>
@@ -309,7 +309,7 @@
               <w:rPr>
                 <w:noProof/>
               </w:rPr>
-              <w:instrText xml:space="preserve"> PAGEREF _Toc241510401 \h </w:instrText>
+              <w:instrText xml:space="preserve"> PAGEREF _Toc241511952 \h </w:instrText>
             </w:r>
             <w:r>
               <w:rPr>
@@ -352,7 +352,7 @@
               <w14:ligatures w14:val="standardContextual"/>
             </w:rPr>
           </w:pPr>
-          <w:hyperlink w:anchor="_Toc241510402" w:history="1">
+          <w:hyperlink w:anchor="_Toc241511953" w:history="1">
             <w:r>
               <w:rPr>
                 <w:rStyle w:val="Hyperlink"/>
@@ -376,7 +376,7 @@
               <w:rPr>
                 <w:noProof/>
               </w:rPr>
-              <w:instrText xml:space="preserve"> PAGEREF _Toc241510402 \h </w:instrText>
+              <w:instrText xml:space="preserve"> PAGEREF _Toc241511953 \h </w:instrText>
             </w:r>
             <w:r>
               <w:rPr>
@@ -419,7 +419,7 @@
               <w14:ligatures w14:val="standardContextual"/>
             </w:rPr>
           </w:pPr>
-          <w:hyperlink w:anchor="_Toc241510403" w:history="1">
+          <w:hyperlink w:anchor="_Toc241511954" w:history="1">
             <w:r>
               <w:rPr>
                 <w:rStyle w:val="Hyperlink"/>
@@ -443,7 +443,7 @@
               <w:rPr>
                 <w:noProof/>
               </w:rPr>
-              <w:instrText xml:space="preserve"> PAGEREF _Toc241510403 \h </w:instrText>
+              <w:instrText xml:space="preserve"> PAGEREF _Toc241511954 \h </w:instrText>
             </w:r>
             <w:r>
               <w:rPr>
@@ -486,7 +486,7 @@
               <w14:ligatures w14:val="standardContextual"/>
             </w:rPr>
           </w:pPr>
-          <w:hyperlink w:anchor="_Toc241510404" w:history="1">
+          <w:hyperlink w:anchor="_Toc241511955" w:history="1">
             <w:r>
               <w:rPr>
                 <w:rStyle w:val="Hyperlink"/>
@@ -510,7 +510,7 @@
               <w:rPr>
                 <w:noProof/>
               </w:rPr>
-              <w:instrText xml:space="preserve"> PAGEREF _Toc241510404 \h </w:instrText>
+              <w:instrText xml:space="preserve"> PAGEREF _Toc241511955 \h </w:instrText>
             </w:r>
             <w:r>
               <w:rPr>
@@ -553,7 +553,7 @@
               <w14:ligatures w14:val="standardContextual"/>
             </w:rPr>
           </w:pPr>
-          <w:hyperlink w:anchor="_Toc241510405" w:history="1">
+          <w:hyperlink w:anchor="_Toc241511956" w:history="1">
             <w:r>
               <w:rPr>
                 <w:rStyle w:val="Hyperlink"/>
@@ -577,7 +577,7 @@
               <w:rPr>
                 <w:noProof/>
               </w:rPr>
-              <w:instrText xml:space="preserve"> PAGEREF _Toc241510405 \h </w:instrText>
+              <w:instrText xml:space="preserve"> PAGEREF _Toc241511956 \h </w:instrText>
             </w:r>
             <w:r>
               <w:rPr>
@@ -620,7 +620,7 @@
               <w14:ligatures w14:val="standardContextual"/>
             </w:rPr>
           </w:pPr>
-          <w:hyperlink w:anchor="_Toc241510406" w:history="1">
+          <w:hyperlink w:anchor="_Toc241511957" w:history="1">
             <w:r>
               <w:rPr>
                 <w:rStyle w:val="Hyperlink"/>
@@ -644,7 +644,7 @@
               <w:rPr>
                 <w:noProof/>
               </w:rPr>
-              <w:instrText xml:space="preserve"> PAGEREF _Toc241510406 \h </w:instrText>
+              <w:instrText xml:space="preserve"> PAGEREF _Toc241511957 \h </w:instrText>
             </w:r>
             <w:r>
               <w:rPr>
@@ -687,7 +687,7 @@
               <w14:ligatures w14:val="standardContextual"/>
             </w:rPr>
           </w:pPr>
-          <w:hyperlink w:anchor="_Toc241510407" w:history="1">
+          <w:hyperlink w:anchor="_Toc241511958" w:history="1">
             <w:r>
               <w:rPr>
                 <w:rStyle w:val="Hyperlink"/>
@@ -711,7 +711,7 @@
               <w:rPr>
                 <w:noProof/>
               </w:rPr>
-              <w:instrText xml:space="preserve"> PAGEREF _Toc241510407 \h </w:instrText>
+              <w:instrText xml:space="preserve"> PAGEREF _Toc241511958 \h </w:instrText>
             </w:r>
             <w:r>
               <w:rPr>
@@ -754,7 +754,7 @@
               <w14:ligatures w14:val="standardContextual"/>
             </w:rPr>
           </w:pPr>
-          <w:hyperlink w:anchor="_Toc241510408" w:history="1">
+          <w:hyperlink w:anchor="_Toc241511959" w:history="1">
             <w:r>
               <w:rPr>
                 <w:rStyle w:val="Hyperlink"/>
@@ -778,7 +778,7 @@
               <w:rPr>
                 <w:noProof/>
               </w:rPr>
-              <w:instrText xml:space="preserve"> PAGEREF _Toc241510408 \h </w:instrText>
+              <w:instrText xml:space="preserve"> PAGEREF _Toc241511959 \h </w:instrText>
             </w:r>
             <w:r>
               <w:rPr>
@@ -821,7 +821,7 @@
               <w14:ligatures w14:val="standardContextual"/>
             </w:rPr>
           </w:pPr>
-          <w:hyperlink w:anchor="_Toc241510409" w:history="1">
+          <w:hyperlink w:anchor="_Toc241511960" w:history="1">
             <w:r>
               <w:rPr>
                 <w:rStyle w:val="Hyperlink"/>
@@ -845,7 +845,7 @@
               <w:rPr>
                 <w:noProof/>
               </w:rPr>
-              <w:instrText xml:space="preserve"> PAGEREF _Toc241510409 \h </w:instrText>
+              <w:instrText xml:space="preserve"> PAGEREF _Toc241511960 \h </w:instrText>
             </w:r>
             <w:r>
               <w:rPr>
@@ -888,7 +888,7 @@
               <w14:ligatures w14:val="standardContextual"/>
             </w:rPr>
           </w:pPr>
-          <w:hyperlink w:anchor="_Toc241510410" w:history="1">
+          <w:hyperlink w:anchor="_Toc241511961" w:history="1">
             <w:r>
               <w:rPr>
                 <w:rStyle w:val="Hyperlink"/>
@@ -912,7 +912,7 @@
               <w:rPr>
                 <w:noProof/>
               </w:rPr>
-              <w:instrText xml:space="preserve"> PAGEREF _Toc241510410 \h </w:instrText>
+              <w:instrText xml:space="preserve"> PAGEREF _Toc241511961 \h </w:instrText>
             </w:r>
             <w:r>
               <w:rPr>
@@ -955,7 +955,7 @@
               <w14:ligatures w14:val="standardContextual"/>
             </w:rPr>
           </w:pPr>
-          <w:hyperlink w:anchor="_Toc241510411" w:history="1">
+          <w:hyperlink w:anchor="_Toc241511962" w:history="1">
             <w:r>
               <w:rPr>
                 <w:rStyle w:val="Hyperlink"/>
@@ -979,7 +979,7 @@
               <w:rPr>
                 <w:noProof/>
               </w:rPr>
-              <w:instrText xml:space="preserve"> PAGEREF _Toc241510411 \h </w:instrText>
+              <w:instrText xml:space="preserve"> PAGEREF _Toc241511962 \h </w:instrText>
             </w:r>
             <w:r>
               <w:rPr>
@@ -1022,7 +1022,7 @@
               <w14:ligatures w14:val="standardContextual"/>
             </w:rPr>
           </w:pPr>
-          <w:hyperlink w:anchor="_Toc241510412" w:history="1">
+          <w:hyperlink w:anchor="_Toc241511963" w:history="1">
             <w:r>
               <w:rPr>
                 <w:rStyle w:val="Hyperlink"/>
@@ -1046,7 +1046,7 @@
               <w:rPr>
                 <w:noProof/>
               </w:rPr>
-              <w:instrText xml:space="preserve"> PAGEREF _Toc241510412 \h </w:instrText>
+              <w:instrText xml:space="preserve"> PAGEREF _Toc241511963 \h </w:instrText>
             </w:r>
             <w:r>
               <w:rPr>
@@ -1089,7 +1089,7 @@
               <w14:ligatures w14:val="standardContextual"/>
             </w:rPr>
           </w:pPr>
-          <w:hyperlink w:anchor="_Toc241510413" w:history="1">
+          <w:hyperlink w:anchor="_Toc241511964" w:history="1">
             <w:r>
               <w:rPr>
                 <w:rStyle w:val="Hyperlink"/>
@@ -1113,7 +1113,7 @@
               <w:rPr>
                 <w:noProof/>
               </w:rPr>
-              <w:instrText xml:space="preserve"> PAGEREF _Toc241510413 \h </w:instrText>
+              <w:instrText xml:space="preserve"> PAGEREF _Toc241511964 \h </w:instrText>
             </w:r>
             <w:r>
               <w:rPr>
@@ -1156,7 +1156,7 @@
               <w14:ligatures w14:val="standardContextual"/>
             </w:rPr>
           </w:pPr>
-          <w:hyperlink w:anchor="_Toc241510414" w:history="1">
+          <w:hyperlink w:anchor="_Toc241511965" w:history="1">
             <w:r>
               <w:rPr>
                 <w:rStyle w:val="Hyperlink"/>
@@ -1180,7 +1180,7 @@
               <w:rPr>
                 <w:noProof/>
               </w:rPr>
-              <w:instrText xml:space="preserve"> PAGEREF _Toc241510414 \h </w:instrText>
+              <w:instrText xml:space="preserve"> PAGEREF _Toc241511965 \h </w:instrText>
             </w:r>
             <w:r>
               <w:rPr>
@@ -1223,7 +1223,7 @@
               <w14:ligatures w14:val="standardContextual"/>
             </w:rPr>
           </w:pPr>
-          <w:hyperlink w:anchor="_Toc241510415" w:history="1">
+          <w:hyperlink w:anchor="_Toc241511966" w:history="1">
             <w:r>
               <w:rPr>
                 <w:rStyle w:val="Hyperlink"/>
@@ -1247,7 +1247,7 @@
               <w:rPr>
                 <w:noProof/>
               </w:rPr>
-              <w:instrText xml:space="preserve"> PAGEREF _Toc241510415 \h </w:instrText>
+              <w:instrText xml:space="preserve"> PAGEREF _Toc241511966 \h </w:instrText>
             </w:r>
             <w:r>
               <w:rPr>
@@ -1290,7 +1290,7 @@
               <w14:ligatures w14:val="standardContextual"/>
             </w:rPr>
           </w:pPr>
-          <w:hyperlink w:anchor="_Toc241510416" w:history="1">
+          <w:hyperlink w:anchor="_Toc241511967" w:history="1">
             <w:r>
               <w:rPr>
                 <w:rStyle w:val="Hyperlink"/>
@@ -1314,7 +1314,7 @@
               <w:rPr>
                 <w:noProof/>
               </w:rPr>
-              <w:instrText xml:space="preserve"> PAGEREF _Toc241510416 \h </w:instrText>
+              <w:instrText xml:space="preserve"> PAGEREF _Toc241511967 \h </w:instrText>
             </w:r>
             <w:r>
               <w:rPr>
@@ -1357,7 +1357,7 @@
               <w14:ligatures w14:val="standardContextual"/>
             </w:rPr>
           </w:pPr>
-          <w:hyperlink w:anchor="_Toc241510417" w:history="1">
+          <w:hyperlink w:anchor="_Toc241511968" w:history="1">
             <w:r>
               <w:rPr>
                 <w:rStyle w:val="Hyperlink"/>
@@ -1381,7 +1381,7 @@
               <w:rPr>
                 <w:noProof/>
               </w:rPr>
-              <w:instrText xml:space="preserve"> PAGEREF _Toc241510417 \h </w:instrText>
+              <w:instrText xml:space="preserve"> PAGEREF _Toc241511968 \h </w:instrText>
             </w:r>
             <w:r>
               <w:rPr>
@@ -1424,7 +1424,7 @@
               <w14:ligatures w14:val="standardContextual"/>
             </w:rPr>
           </w:pPr>
-          <w:hyperlink w:anchor="_Toc241510418" w:history="1">
+          <w:hyperlink w:anchor="_Toc241511969" w:history="1">
             <w:r>
               <w:rPr>
                 <w:rStyle w:val="Hyperlink"/>
@@ -1448,7 +1448,7 @@
               <w:rPr>
                 <w:noProof/>
               </w:rPr>
-              <w:instrText xml:space="preserve"> PAGEREF _Toc241510418 \h </w:instrText>
+              <w:instrText xml:space="preserve"> PAGEREF _Toc241511969 \h </w:instrText>
             </w:r>
             <w:r>
               <w:rPr>
@@ -1491,7 +1491,7 @@
               <w14:ligatures w14:val="standardContextual"/>
             </w:rPr>
           </w:pPr>
-          <w:hyperlink w:anchor="_Toc241510419" w:history="1">
+          <w:hyperlink w:anchor="_Toc241511970" w:history="1">
             <w:r>
               <w:rPr>
                 <w:rStyle w:val="Hyperlink"/>
@@ -1515,7 +1515,7 @@
               <w:rPr>
                 <w:noProof/>
               </w:rPr>
-              <w:instrText xml:space="preserve"> PAGEREF _Toc241510419 \h </w:instrText>
+              <w:instrText xml:space="preserve"> PAGEREF _Toc241511970 \h </w:instrText>
             </w:r>
             <w:r>
               <w:rPr>
@@ -1558,7 +1558,7 @@
               <w14:ligatures w14:val="standardContextual"/>
             </w:rPr>
           </w:pPr>
-          <w:hyperlink w:anchor="_Toc241510420" w:history="1">
+          <w:hyperlink w:anchor="_Toc241511971" w:history="1">
             <w:r>
               <w:rPr>
                 <w:rStyle w:val="Hyperlink"/>
@@ -1582,7 +1582,7 @@
               <w:rPr>
                 <w:noProof/>
               </w:rPr>
-              <w:instrText xml:space="preserve"> PAGEREF _Toc241510420 \h </w:instrText>
+              <w:instrText xml:space="preserve"> PAGEREF _Toc241511971 \h </w:instrText>
             </w:r>
             <w:r>
               <w:rPr>
@@ -1625,7 +1625,7 @@
               <w14:ligatures w14:val="standardContextual"/>
             </w:rPr>
           </w:pPr>
-          <w:hyperlink w:anchor="_Toc241510421" w:history="1">
+          <w:hyperlink w:anchor="_Toc241511972" w:history="1">
             <w:r>
               <w:rPr>
                 <w:rStyle w:val="Hyperlink"/>
@@ -1649,7 +1649,7 @@
               <w:rPr>
                 <w:noProof/>
               </w:rPr>
-              <w:instrText xml:space="preserve"> PAGEREF _Toc241510421 \h </w:instrText>
+              <w:instrText xml:space="preserve"> PAGEREF _Toc241511972 \h </w:instrText>
             </w:r>
             <w:r>
               <w:rPr>
@@ -1692,7 +1692,7 @@
               <w14:ligatures w14:val="standardContextual"/>
             </w:rPr>
           </w:pPr>
-          <w:hyperlink w:anchor="_Toc241510422" w:history="1">
+          <w:hyperlink w:anchor="_Toc241511973" w:history="1">
             <w:r>
               <w:rPr>
                 <w:rStyle w:val="Hyperlink"/>
@@ -1716,7 +1716,7 @@
               <w:rPr>
                 <w:noProof/>
               </w:rPr>
-              <w:instrText xml:space="preserve"> PAGEREF _Toc241510422 \h </w:instrText>
+              <w:instrText xml:space="preserve"> PAGEREF _Toc241511973 \h </w:instrText>
             </w:r>
             <w:r>
               <w:rPr>
@@ -1759,7 +1759,7 @@
               <w14:ligatures w14:val="standardContextual"/>
             </w:rPr>
           </w:pPr>
-          <w:hyperlink w:anchor="_Toc241510423" w:history="1">
+          <w:hyperlink w:anchor="_Toc241511974" w:history="1">
             <w:r>
               <w:rPr>
                 <w:rStyle w:val="Hyperlink"/>
@@ -1783,7 +1783,7 @@
               <w:rPr>
                 <w:noProof/>
               </w:rPr>
-              <w:instrText xml:space="preserve"> PAGEREF _Toc241510423 \h </w:instrText>
+              <w:instrText xml:space="preserve"> PAGEREF _Toc241511974 \h </w:instrText>
             </w:r>
             <w:r>
               <w:rPr>
@@ -1826,7 +1826,7 @@
               <w14:ligatures w14:val="standardContextual"/>
             </w:rPr>
           </w:pPr>
-          <w:hyperlink w:anchor="_Toc241510424" w:history="1">
+          <w:hyperlink w:anchor="_Toc241511975" w:history="1">
             <w:r>
               <w:rPr>
                 <w:rStyle w:val="Hyperlink"/>
@@ -1850,7 +1850,7 @@
               <w:rPr>
                 <w:noProof/>
               </w:rPr>
-              <w:instrText xml:space="preserve"> PAGEREF _Toc241510424 \h </w:instrText>
+              <w:instrText xml:space="preserve"> PAGEREF _Toc241511975 \h </w:instrText>
             </w:r>
             <w:r>
               <w:rPr>
@@ -1893,7 +1893,7 @@
               <w14:ligatures w14:val="standardContextual"/>
             </w:rPr>
           </w:pPr>
-          <w:hyperlink w:anchor="_Toc241510425" w:history="1">
+          <w:hyperlink w:anchor="_Toc241511976" w:history="1">
             <w:r>
               <w:rPr>
                 <w:rStyle w:val="Hyperlink"/>
@@ -1917,7 +1917,7 @@
               <w:rPr>
                 <w:noProof/>
               </w:rPr>
-              <w:instrText xml:space="preserve"> PAGEREF _Toc241510425 \h </w:instrText>
+              <w:instrText xml:space="preserve"> PAGEREF _Toc241511976 \h </w:instrText>
             </w:r>
             <w:r>
               <w:rPr>
@@ -1960,7 +1960,7 @@
               <w14:ligatures w14:val="standardContextual"/>
             </w:rPr>
           </w:pPr>
-          <w:hyperlink w:anchor="_Toc241510426" w:history="1">
+          <w:hyperlink w:anchor="_Toc241511977" w:history="1">
             <w:r>
               <w:rPr>
                 <w:rStyle w:val="Hyperlink"/>
@@ -1984,7 +1984,7 @@
               <w:rPr>
                 <w:noProof/>
               </w:rPr>
-              <w:instrText xml:space="preserve"> PAGEREF _Toc241510426 \h </w:instrText>
+              <w:instrText xml:space="preserve"> PAGEREF _Toc241511977 \h </w:instrText>
             </w:r>
             <w:r>
               <w:rPr>
@@ -2027,7 +2027,7 @@
               <w14:ligatures w14:val="standardContextual"/>
             </w:rPr>
           </w:pPr>
-          <w:hyperlink w:anchor="_Toc241510427" w:history="1">
+          <w:hyperlink w:anchor="_Toc241511978" w:history="1">
             <w:r>
               <w:rPr>
                 <w:rStyle w:val="Hyperlink"/>
@@ -2051,7 +2051,7 @@
               <w:rPr>
                 <w:noProof/>
               </w:rPr>
-              <w:instrText xml:space="preserve"> PAGEREF _Toc241510427 \h </w:instrText>
+              <w:instrText xml:space="preserve"> PAGEREF _Toc241511978 \h </w:instrText>
             </w:r>
             <w:r>
               <w:rPr>
@@ -2094,7 +2094,7 @@
               <w14:ligatures w14:val="standardContextual"/>
             </w:rPr>
           </w:pPr>
-          <w:hyperlink w:anchor="_Toc241510428" w:history="1">
+          <w:hyperlink w:anchor="_Toc241511979" w:history="1">
             <w:r>
               <w:rPr>
                 <w:rStyle w:val="Hyperlink"/>
@@ -2118,7 +2118,7 @@
               <w:rPr>
                 <w:noProof/>
               </w:rPr>
-              <w:instrText xml:space="preserve"> PAGEREF _Toc241510428 \h </w:instrText>
+              <w:instrText xml:space="preserve"> PAGEREF _Toc241511979 \h </w:instrText>
             </w:r>
             <w:r>
               <w:rPr>
@@ -2161,7 +2161,7 @@
               <w14:ligatures w14:val="standardContextual"/>
             </w:rPr>
           </w:pPr>
-          <w:hyperlink w:anchor="_Toc241510429" w:history="1">
+          <w:hyperlink w:anchor="_Toc241511980" w:history="1">
             <w:r>
               <w:rPr>
                 <w:rStyle w:val="Hyperlink"/>
@@ -2185,7 +2185,7 @@
               <w:rPr>
                 <w:noProof/>
               </w:rPr>
-              <w:instrText xml:space="preserve"> PAGEREF _Toc241510429 \h </w:instrText>
+              <w:instrText xml:space="preserve"> PAGEREF _Toc241511980 \h </w:instrText>
             </w:r>
             <w:r>
               <w:rPr>
@@ -2228,7 +2228,7 @@
               <w14:ligatures w14:val="standardContextual"/>
             </w:rPr>
           </w:pPr>
-          <w:hyperlink w:anchor="_Toc241510430" w:history="1">
+          <w:hyperlink w:anchor="_Toc241511981" w:history="1">
             <w:r>
               <w:rPr>
                 <w:rStyle w:val="Hyperlink"/>
@@ -2252,7 +2252,7 @@
               <w:rPr>
                 <w:noProof/>
               </w:rPr>
-              <w:instrText xml:space="preserve"> PAGEREF _Toc241510430 \h </w:instrText>
+              <w:instrText xml:space="preserve"> PAGEREF _Toc241511981 \h </w:instrText>
             </w:r>
             <w:r>
               <w:rPr>
@@ -2295,7 +2295,7 @@
               <w14:ligatures w14:val="standardContextual"/>
             </w:rPr>
           </w:pPr>
-          <w:hyperlink w:anchor="_Toc241510431" w:history="1">
+          <w:hyperlink w:anchor="_Toc241511982" w:history="1">
             <w:r>
               <w:rPr>
                 <w:rStyle w:val="Hyperlink"/>
@@ -2319,7 +2319,7 @@
               <w:rPr>
                 <w:noProof/>
               </w:rPr>
-              <w:instrText xml:space="preserve"> PAGEREF _Toc241510431 \h </w:instrText>
+              <w:instrText xml:space="preserve"> PAGEREF _Toc241511982 \h </w:instrText>
             </w:r>
             <w:r>
               <w:rPr>
@@ -2362,7 +2362,7 @@
               <w14:ligatures w14:val="standardContextual"/>
             </w:rPr>
           </w:pPr>
-          <w:hyperlink w:anchor="_Toc241510432" w:history="1">
+          <w:hyperlink w:anchor="_Toc241511983" w:history="1">
             <w:r>
               <w:rPr>
                 <w:rStyle w:val="Hyperlink"/>
@@ -2386,7 +2386,7 @@
               <w:rPr>
                 <w:noProof/>
               </w:rPr>
-              <w:instrText xml:space="preserve"> PAGEREF _Toc241510432 \h </w:instrText>
+              <w:instrText xml:space="preserve"> PAGEREF _Toc241511983 \h </w:instrText>
             </w:r>
             <w:r>
               <w:rPr>
@@ -2429,7 +2429,7 @@
               <w14:ligatures w14:val="standardContextual"/>
             </w:rPr>
           </w:pPr>
-          <w:hyperlink w:anchor="_Toc241510433" w:history="1">
+          <w:hyperlink w:anchor="_Toc241511984" w:history="1">
             <w:r>
               <w:rPr>
                 <w:rStyle w:val="Hyperlink"/>
@@ -2453,7 +2453,7 @@
               <w:rPr>
                 <w:noProof/>
               </w:rPr>
-              <w:instrText xml:space="preserve"> PAGEREF _Toc241510433 \h </w:instrText>
+              <w:instrText xml:space="preserve"> PAGEREF _Toc241511984 \h </w:instrText>
             </w:r>
             <w:r>
               <w:rPr>
@@ -2496,7 +2496,7 @@
               <w14:ligatures w14:val="standardContextual"/>
             </w:rPr>
           </w:pPr>
-          <w:hyperlink w:anchor="_Toc241510434" w:history="1">
+          <w:hyperlink w:anchor="_Toc241511985" w:history="1">
             <w:r>
               <w:rPr>
                 <w:rStyle w:val="Hyperlink"/>
@@ -2520,7 +2520,7 @@
               <w:rPr>
                 <w:noProof/>
               </w:rPr>
-              <w:instrText xml:space="preserve"> PAGEREF _Toc241510434 \h </w:instrText>
+              <w:instrText xml:space="preserve"> PAGEREF _Toc241511985 \h </w:instrText>
             </w:r>
             <w:r>
               <w:rPr>
@@ -2563,13 +2563,13 @@
               <w14:ligatures w14:val="standardContextual"/>
             </w:rPr>
           </w:pPr>
-          <w:hyperlink w:anchor="_Toc241510435" w:history="1">
+          <w:hyperlink w:anchor="_Toc241511986" w:history="1">
             <w:r>
               <w:rPr>
                 <w:rStyle w:val="Hyperlink"/>
                 <w:noProof/>
               </w:rPr>
-              <w:t>10.  Office tools</w:t>
+              <w:t>10.  Completed Jobs (job records)</w:t>
             </w:r>
             <w:r>
               <w:rPr>
@@ -2587,7 +2587,7 @@
               <w:rPr>
                 <w:noProof/>
               </w:rPr>
-              <w:instrText xml:space="preserve"> PAGEREF _Toc241510435 \h </w:instrText>
+              <w:instrText xml:space="preserve"> PAGEREF _Toc241511986 \h </w:instrText>
             </w:r>
             <w:r>
               <w:rPr>
@@ -2630,13 +2630,13 @@
               <w14:ligatures w14:val="standardContextual"/>
             </w:rPr>
           </w:pPr>
-          <w:hyperlink w:anchor="_Toc241510436" w:history="1">
+          <w:hyperlink w:anchor="_Toc241511987" w:history="1">
             <w:r>
               <w:rPr>
                 <w:rStyle w:val="Hyperlink"/>
                 <w:noProof/>
               </w:rPr>
-              <w:t>Missed Calls / Callback Requests</w:t>
+              <w:t>Deleted jobs</w:t>
             </w:r>
             <w:r>
               <w:rPr>
@@ -2654,7 +2654,7 @@
               <w:rPr>
                 <w:noProof/>
               </w:rPr>
-              <w:instrText xml:space="preserve"> PAGEREF _Toc241510436 \h </w:instrText>
+              <w:instrText xml:space="preserve"> PAGEREF _Toc241511987 \h </w:instrText>
             </w:r>
             <w:r>
               <w:rPr>
@@ -2672,6 +2672,73 @@
                 <w:noProof/>
               </w:rPr>
               <w:t>16</w:t>
+            </w:r>
+            <w:r>
+              <w:rPr>
+                <w:noProof/>
+              </w:rPr>
+              <w:fldChar w:fldCharType="end"/>
+            </w:r>
+          </w:hyperlink>
+        </w:p>
+        <w:p>
+          <w:pPr>
+            <w:pStyle w:val="TOC1"/>
+            <w:tabs>
+              <w:tab w:val="right" w:leader="dot" w:pos="9350"/>
+            </w:tabs>
+            <w:rPr>
+              <w:rFonts w:asciiTheme="minorHAnsi" w:eastAsiaTheme="minorEastAsia" w:hAnsiTheme="minorHAnsi" w:cstheme="minorBidi"/>
+              <w:noProof/>
+              <w:color w:val="auto"/>
+              <w:kern w:val="2"/>
+              <w:sz w:val="24"/>
+              <w:szCs w:val="24"/>
+              <w14:ligatures w14:val="standardContextual"/>
+            </w:rPr>
+          </w:pPr>
+          <w:hyperlink w:anchor="_Toc241511988" w:history="1">
+            <w:r>
+              <w:rPr>
+                <w:rStyle w:val="Hyperlink"/>
+                <w:noProof/>
+              </w:rPr>
+              <w:t>11.  Office tools</w:t>
+            </w:r>
+            <w:r>
+              <w:rPr>
+                <w:noProof/>
+              </w:rPr>
+              <w:tab/>
+            </w:r>
+            <w:r>
+              <w:rPr>
+                <w:noProof/>
+              </w:rPr>
+              <w:fldChar w:fldCharType="begin"/>
+            </w:r>
+            <w:r>
+              <w:rPr>
+                <w:noProof/>
+              </w:rPr>
+              <w:instrText xml:space="preserve"> PAGEREF _Toc241511988 \h </w:instrText>
+            </w:r>
+            <w:r>
+              <w:rPr>
+                <w:noProof/>
+              </w:rPr>
+            </w:r>
+            <w:r>
+              <w:rPr>
+                <w:noProof/>
+              </w:rPr>
+              <w:fldChar w:fldCharType="separate"/>
+            </w:r>
+            <w:r>
+              <w:rPr>
+                <w:noProof/>
+              </w:rPr>
+              <w:t>17</w:t>
             </w:r>
             <w:r>
               <w:rPr>
@@ -2697,13 +2764,13 @@
               <w14:ligatures w14:val="standardContextual"/>
             </w:rPr>
           </w:pPr>
-          <w:hyperlink w:anchor="_Toc241510437" w:history="1">
+          <w:hyperlink w:anchor="_Toc241511989" w:history="1">
             <w:r>
               <w:rPr>
                 <w:rStyle w:val="Hyperlink"/>
                 <w:noProof/>
               </w:rPr>
-              <w:t>Tasks</w:t>
+              <w:t>Missed Calls / Callback Requests</w:t>
             </w:r>
             <w:r>
               <w:rPr>
@@ -2721,7 +2788,7 @@
               <w:rPr>
                 <w:noProof/>
               </w:rPr>
-              <w:instrText xml:space="preserve"> PAGEREF _Toc241510437 \h </w:instrText>
+              <w:instrText xml:space="preserve"> PAGEREF _Toc241511989 \h </w:instrText>
             </w:r>
             <w:r>
               <w:rPr>
@@ -2738,7 +2805,7 @@
               <w:rPr>
                 <w:noProof/>
               </w:rPr>
-              <w:t>16</w:t>
+              <w:t>17</w:t>
             </w:r>
             <w:r>
               <w:rPr>
@@ -2764,13 +2831,13 @@
               <w14:ligatures w14:val="standardContextual"/>
             </w:rPr>
           </w:pPr>
-          <w:hyperlink w:anchor="_Toc241510438" w:history="1">
+          <w:hyperlink w:anchor="_Toc241511990" w:history="1">
             <w:r>
               <w:rPr>
                 <w:rStyle w:val="Hyperlink"/>
                 <w:noProof/>
               </w:rPr>
-              <w:t>Booth Filters and Facility Checklist</w:t>
+              <w:t>Tasks</w:t>
             </w:r>
             <w:r>
               <w:rPr>
@@ -2788,7 +2855,7 @@
               <w:rPr>
                 <w:noProof/>
               </w:rPr>
-              <w:instrText xml:space="preserve"> PAGEREF _Toc241510438 \h </w:instrText>
+              <w:instrText xml:space="preserve"> PAGEREF _Toc241511990 \h </w:instrText>
             </w:r>
             <w:r>
               <w:rPr>
@@ -2805,7 +2872,7 @@
               <w:rPr>
                 <w:noProof/>
               </w:rPr>
-              <w:t>16</w:t>
+              <w:t>17</w:t>
             </w:r>
             <w:r>
               <w:rPr>
@@ -2831,13 +2898,13 @@
               <w14:ligatures w14:val="standardContextual"/>
             </w:rPr>
           </w:pPr>
-          <w:hyperlink w:anchor="_Toc241510439" w:history="1">
+          <w:hyperlink w:anchor="_Toc241511991" w:history="1">
             <w:r>
               <w:rPr>
                 <w:rStyle w:val="Hyperlink"/>
                 <w:noProof/>
               </w:rPr>
-              <w:t>AR Balances and Cycle Time</w:t>
+              <w:t>Booth Filters and Facility Checklist</w:t>
             </w:r>
             <w:r>
               <w:rPr>
@@ -2855,7 +2922,7 @@
               <w:rPr>
                 <w:noProof/>
               </w:rPr>
-              <w:instrText xml:space="preserve"> PAGEREF _Toc241510439 \h </w:instrText>
+              <w:instrText xml:space="preserve"> PAGEREF _Toc241511991 \h </w:instrText>
             </w:r>
             <w:r>
               <w:rPr>
@@ -2872,7 +2939,7 @@
               <w:rPr>
                 <w:noProof/>
               </w:rPr>
-              <w:t>16</w:t>
+              <w:t>17</w:t>
             </w:r>
             <w:r>
               <w:rPr>
@@ -2898,12 +2965,79 @@
               <w14:ligatures w14:val="standardContextual"/>
             </w:rPr>
           </w:pPr>
-          <w:hyperlink w:anchor="_Toc241510440" w:history="1">
+          <w:hyperlink w:anchor="_Toc241511992" w:history="1">
             <w:r>
               <w:rPr>
                 <w:rStyle w:val="Hyperlink"/>
                 <w:noProof/>
               </w:rPr>
+              <w:t>AR Balances and Cycle Time</w:t>
+            </w:r>
+            <w:r>
+              <w:rPr>
+                <w:noProof/>
+              </w:rPr>
+              <w:tab/>
+            </w:r>
+            <w:r>
+              <w:rPr>
+                <w:noProof/>
+              </w:rPr>
+              <w:fldChar w:fldCharType="begin"/>
+            </w:r>
+            <w:r>
+              <w:rPr>
+                <w:noProof/>
+              </w:rPr>
+              <w:instrText xml:space="preserve"> PAGEREF _Toc241511992 \h </w:instrText>
+            </w:r>
+            <w:r>
+              <w:rPr>
+                <w:noProof/>
+              </w:rPr>
+            </w:r>
+            <w:r>
+              <w:rPr>
+                <w:noProof/>
+              </w:rPr>
+              <w:fldChar w:fldCharType="separate"/>
+            </w:r>
+            <w:r>
+              <w:rPr>
+                <w:noProof/>
+              </w:rPr>
+              <w:t>17</w:t>
+            </w:r>
+            <w:r>
+              <w:rPr>
+                <w:noProof/>
+              </w:rPr>
+              <w:fldChar w:fldCharType="end"/>
+            </w:r>
+          </w:hyperlink>
+        </w:p>
+        <w:p>
+          <w:pPr>
+            <w:pStyle w:val="TOC2"/>
+            <w:tabs>
+              <w:tab w:val="right" w:leader="dot" w:pos="9350"/>
+            </w:tabs>
+            <w:rPr>
+              <w:rFonts w:asciiTheme="minorHAnsi" w:eastAsiaTheme="minorEastAsia" w:hAnsiTheme="minorHAnsi" w:cstheme="minorBidi"/>
+              <w:noProof/>
+              <w:color w:val="auto"/>
+              <w:kern w:val="2"/>
+              <w:sz w:val="24"/>
+              <w:szCs w:val="24"/>
+              <w14:ligatures w14:val="standardContextual"/>
+            </w:rPr>
+          </w:pPr>
+          <w:hyperlink w:anchor="_Toc241511993" w:history="1">
+            <w:r>
+              <w:rPr>
+                <w:rStyle w:val="Hyperlink"/>
+                <w:noProof/>
+              </w:rPr>
               <w:t>Photos and Activity Log</w:t>
             </w:r>
             <w:r>
@@ -2922,7 +3056,7 @@
               <w:rPr>
                 <w:noProof/>
               </w:rPr>
-              <w:instrText xml:space="preserve"> PAGEREF _Toc241510440 \h </w:instrText>
+              <w:instrText xml:space="preserve"> PAGEREF _Toc241511993 \h </w:instrText>
             </w:r>
             <w:r>
               <w:rPr>
@@ -2939,7 +3073,7 @@
               <w:rPr>
                 <w:noProof/>
               </w:rPr>
-              <w:t>16</w:t>
+              <w:t>17</w:t>
             </w:r>
             <w:r>
               <w:rPr>
@@ -2965,13 +3099,13 @@
               <w14:ligatures w14:val="standardContextual"/>
             </w:rPr>
           </w:pPr>
-          <w:hyperlink w:anchor="_Toc241510441" w:history="1">
+          <w:hyperlink w:anchor="_Toc241511994" w:history="1">
             <w:r>
               <w:rPr>
                 <w:rStyle w:val="Hyperlink"/>
                 <w:noProof/>
               </w:rPr>
-              <w:t>11.  Time off and messages (office and admins)</w:t>
+              <w:t>12.  Time off and messages (office and admins)</w:t>
             </w:r>
             <w:r>
               <w:rPr>
@@ -2989,7 +3123,7 @@
               <w:rPr>
                 <w:noProof/>
               </w:rPr>
-              <w:instrText xml:space="preserve"> PAGEREF _Toc241510441 \h </w:instrText>
+              <w:instrText xml:space="preserve"> PAGEREF _Toc241511994 \h </w:instrText>
             </w:r>
             <w:r>
               <w:rPr>
@@ -3006,7 +3140,7 @@
               <w:rPr>
                 <w:noProof/>
               </w:rPr>
-              <w:t>17</w:t>
+              <w:t>18</w:t>
             </w:r>
             <w:r>
               <w:rPr>
@@ -3032,7 +3166,7 @@
               <w14:ligatures w14:val="standardContextual"/>
             </w:rPr>
           </w:pPr>
-          <w:hyperlink w:anchor="_Toc241510442" w:history="1">
+          <w:hyperlink w:anchor="_Toc241511995" w:history="1">
             <w:r>
               <w:rPr>
                 <w:rStyle w:val="Hyperlink"/>
@@ -3056,7 +3190,7 @@
               <w:rPr>
                 <w:noProof/>
               </w:rPr>
-              <w:instrText xml:space="preserve"> PAGEREF _Toc241510442 \h </w:instrText>
+              <w:instrText xml:space="preserve"> PAGEREF _Toc241511995 \h </w:instrText>
             </w:r>
             <w:r>
               <w:rPr>
@@ -3073,7 +3207,7 @@
               <w:rPr>
                 <w:noProof/>
               </w:rPr>
-              <w:t>17</w:t>
+              <w:t>18</w:t>
             </w:r>
             <w:r>
               <w:rPr>
@@ -3099,7 +3233,7 @@
               <w14:ligatures w14:val="standardContextual"/>
             </w:rPr>
           </w:pPr>
-          <w:hyperlink w:anchor="_Toc241510443" w:history="1">
+          <w:hyperlink w:anchor="_Toc241511996" w:history="1">
             <w:r>
               <w:rPr>
                 <w:rStyle w:val="Hyperlink"/>
@@ -3123,7 +3257,7 @@
               <w:rPr>
                 <w:noProof/>
               </w:rPr>
-              <w:instrText xml:space="preserve"> PAGEREF _Toc241510443 \h </w:instrText>
+              <w:instrText xml:space="preserve"> PAGEREF _Toc241511996 \h </w:instrText>
             </w:r>
             <w:r>
               <w:rPr>
@@ -3140,7 +3274,7 @@
               <w:rPr>
                 <w:noProof/>
               </w:rPr>
-              <w:t>17</w:t>
+              <w:t>18</w:t>
             </w:r>
             <w:r>
               <w:rPr>
@@ -3166,13 +3300,13 @@
               <w14:ligatures w14:val="standardContextual"/>
             </w:rPr>
           </w:pPr>
-          <w:hyperlink w:anchor="_Toc241510444" w:history="1">
+          <w:hyperlink w:anchor="_Toc241511997" w:history="1">
             <w:r>
               <w:rPr>
                 <w:rStyle w:val="Hyperlink"/>
                 <w:noProof/>
               </w:rPr>
-              <w:t>12.  Admin: employees and settings</w:t>
+              <w:t>13.  Admin: employees and settings</w:t>
             </w:r>
             <w:r>
               <w:rPr>
@@ -3190,7 +3324,7 @@
               <w:rPr>
                 <w:noProof/>
               </w:rPr>
-              <w:instrText xml:space="preserve"> PAGEREF _Toc241510444 \h </w:instrText>
+              <w:instrText xml:space="preserve"> PAGEREF _Toc241511997 \h </w:instrText>
             </w:r>
             <w:r>
               <w:rPr>
@@ -3207,7 +3341,7 @@
               <w:rPr>
                 <w:noProof/>
               </w:rPr>
-              <w:t>18</w:t>
+              <w:t>19</w:t>
             </w:r>
             <w:r>
               <w:rPr>
@@ -3233,7 +3367,7 @@
               <w14:ligatures w14:val="standardContextual"/>
             </w:rPr>
           </w:pPr>
-          <w:hyperlink w:anchor="_Toc241510445" w:history="1">
+          <w:hyperlink w:anchor="_Toc241511998" w:history="1">
             <w:r>
               <w:rPr>
                 <w:rStyle w:val="Hyperlink"/>
@@ -3257,7 +3391,7 @@
               <w:rPr>
                 <w:noProof/>
               </w:rPr>
-              <w:instrText xml:space="preserve"> PAGEREF _Toc241510445 \h </w:instrText>
+              <w:instrText xml:space="preserve"> PAGEREF _Toc241511998 \h </w:instrText>
             </w:r>
             <w:r>
               <w:rPr>
@@ -3274,7 +3408,7 @@
               <w:rPr>
                 <w:noProof/>
               </w:rPr>
-              <w:t>18</w:t>
+              <w:t>19</w:t>
             </w:r>
             <w:r>
               <w:rPr>
@@ -3300,7 +3434,7 @@
               <w14:ligatures w14:val="standardContextual"/>
             </w:rPr>
           </w:pPr>
-          <w:hyperlink w:anchor="_Toc241510446" w:history="1">
+          <w:hyperlink w:anchor="_Toc241511999" w:history="1">
             <w:r>
               <w:rPr>
                 <w:rStyle w:val="Hyperlink"/>
@@ -3324,7 +3458,7 @@
               <w:rPr>
                 <w:noProof/>
               </w:rPr>
-              <w:instrText xml:space="preserve"> PAGEREF _Toc241510446 \h </w:instrText>
+              <w:instrText xml:space="preserve"> PAGEREF _Toc241511999 \h </w:instrText>
             </w:r>
             <w:r>
               <w:rPr>
@@ -3341,7 +3475,7 @@
               <w:rPr>
                 <w:noProof/>
               </w:rPr>
-              <w:t>18</w:t>
+              <w:t>19</w:t>
             </w:r>
             <w:r>
               <w:rPr>
@@ -3367,7 +3501,7 @@
               <w14:ligatures w14:val="standardContextual"/>
             </w:rPr>
           </w:pPr>
-          <w:hyperlink w:anchor="_Toc241510447" w:history="1">
+          <w:hyperlink w:anchor="_Toc241512000" w:history="1">
             <w:r>
               <w:rPr>
                 <w:rStyle w:val="Hyperlink"/>
@@ -3391,7 +3525,7 @@
               <w:rPr>
                 <w:noProof/>
               </w:rPr>
-              <w:instrText xml:space="preserve"> PAGEREF _Toc241510447 \h </w:instrText>
+              <w:instrText xml:space="preserve"> PAGEREF _Toc241512000 \h </w:instrText>
             </w:r>
             <w:r>
               <w:rPr>
@@ -3408,7 +3542,7 @@
               <w:rPr>
                 <w:noProof/>
               </w:rPr>
-              <w:t>18</w:t>
+              <w:t>19</w:t>
             </w:r>
             <w:r>
               <w:rPr>
@@ -3434,13 +3568,13 @@
               <w14:ligatures w14:val="standardContextual"/>
             </w:rPr>
           </w:pPr>
-          <w:hyperlink w:anchor="_Toc241510448" w:history="1">
+          <w:hyperlink w:anchor="_Toc241512001" w:history="1">
             <w:r>
               <w:rPr>
                 <w:rStyle w:val="Hyperlink"/>
                 <w:noProof/>
               </w:rPr>
-              <w:t>13.  Quick answers</w:t>
+              <w:t>14.  Quick answers</w:t>
             </w:r>
             <w:r>
               <w:rPr>
@@ -3458,7 +3592,7 @@
               <w:rPr>
                 <w:noProof/>
               </w:rPr>
-              <w:instrText xml:space="preserve"> PAGEREF _Toc241510448 \h </w:instrText>
+              <w:instrText xml:space="preserve"> PAGEREF _Toc241512001 \h </w:instrText>
             </w:r>
             <w:r>
               <w:rPr>
@@ -3475,7 +3609,7 @@
               <w:rPr>
                 <w:noProof/>
               </w:rPr>
-              <w:t>19</w:t>
+              <w:t>20</w:t>
             </w:r>
             <w:r>
               <w:rPr>
@@ -3501,7 +3635,7 @@
               <w14:ligatures w14:val="standardContextual"/>
             </w:rPr>
           </w:pPr>
-          <w:hyperlink w:anchor="_Toc241510449" w:history="1">
+          <w:hyperlink w:anchor="_Toc241512002" w:history="1">
             <w:r>
               <w:rPr>
                 <w:rStyle w:val="Hyperlink"/>
@@ -3525,7 +3659,7 @@
               <w:rPr>
                 <w:noProof/>
               </w:rPr>
-              <w:instrText xml:space="preserve"> PAGEREF _Toc241510449 \h </w:instrText>
+              <w:instrText xml:space="preserve"> PAGEREF _Toc241512002 \h </w:instrText>
             </w:r>
             <w:r>
               <w:rPr>
@@ -3542,7 +3676,7 @@
               <w:rPr>
                 <w:noProof/>
               </w:rPr>
-              <w:t>20</w:t>
+              <w:t>21</w:t>
             </w:r>
             <w:r>
               <w:rPr>
@@ -3568,7 +3702,7 @@
       <w:pPr>
         <w:pStyle w:val="Heading1"/>
       </w:pPr>
-      <w:bookmarkStart w:id="0" w:name="_Toc241510399"/>
+      <w:bookmarkStart w:id="0" w:name="_Toc241511950"/>
       <w:r>
         <w:t>1.  Getting started</w:t>
       </w:r>
@@ -3596,7 +3730,7 @@
       <w:pPr>
         <w:pStyle w:val="Heading2"/>
       </w:pPr>
-      <w:bookmarkStart w:id="1" w:name="_Toc241510400"/>
+      <w:bookmarkStart w:id="1" w:name="_Toc241511951"/>
       <w:r>
         <w:t>Opening ShopControl</w:t>
       </w:r>
@@ -3676,7 +3810,7 @@
       <w:pPr>
         <w:pStyle w:val="Heading2"/>
       </w:pPr>
-      <w:bookmarkStart w:id="2" w:name="_Toc241510401"/>
+      <w:bookmarkStart w:id="2" w:name="_Toc241511952"/>
       <w:r>
         <w:t>Finding help</w:t>
       </w:r>
@@ -3779,7 +3913,7 @@
       <w:pPr>
         <w:pStyle w:val="Heading2"/>
       </w:pPr>
-      <w:bookmarkStart w:id="3" w:name="_Toc241510402"/>
+      <w:bookmarkStart w:id="3" w:name="_Toc241511953"/>
       <w:r>
         <w:t>Put the app on your phone's home screen</w:t>
       </w:r>
@@ -3947,7 +4081,7 @@
       <w:pPr>
         <w:pStyle w:val="Heading2"/>
       </w:pPr>
-      <w:bookmarkStart w:id="4" w:name="_Toc241510403"/>
+      <w:bookmarkStart w:id="4" w:name="_Toc241511954"/>
       <w:r>
         <w:t>Logging in</w:t>
       </w:r>
@@ -4117,7 +4251,7 @@
       <w:pPr>
         <w:pStyle w:val="Heading2"/>
       </w:pPr>
-      <w:bookmarkStart w:id="5" w:name="_Toc241510404"/>
+      <w:bookmarkStart w:id="5" w:name="_Toc241511955"/>
       <w:r>
         <w:t>Staying up to date</w:t>
       </w:r>
@@ -4145,7 +4279,7 @@
       <w:pPr>
         <w:pStyle w:val="Heading2"/>
       </w:pPr>
-      <w:bookmarkStart w:id="6" w:name="_Toc241510405"/>
+      <w:bookmarkStart w:id="6" w:name="_Toc241511956"/>
       <w:r>
         <w:t>Who can do what</w:t>
       </w:r>
@@ -4184,7 +4318,7 @@
           <w:left w:w="10" w:type="dxa"/>
           <w:right w:w="10" w:type="dxa"/>
         </w:tblCellMar>
-        <w:tblLook w:val="04A0" w:firstRow="1" w:lastRow="0" w:firstColumn="1" w:lastColumn="0" w:noHBand="0" w:noVBand="1"/>
+        <w:tblLook w:val="0000" w:firstRow="0" w:lastRow="0" w:firstColumn="0" w:lastColumn="0" w:noHBand="0" w:noVBand="0"/>
       </w:tblPr>
       <w:tblGrid>
         <w:gridCol w:w="2900"/>
@@ -4758,7 +4892,7 @@
         <w:pStyle w:val="Heading1"/>
         <w:pageBreakBefore/>
       </w:pPr>
-      <w:bookmarkStart w:id="7" w:name="_Toc241510406"/>
+      <w:bookmarkStart w:id="7" w:name="_Toc241511957"/>
       <w:r>
         <w:t>2.  The Employee App (technicians)</w:t>
       </w:r>
@@ -4776,7 +4910,7 @@
       <w:pPr>
         <w:pStyle w:val="Heading2"/>
       </w:pPr>
-      <w:bookmarkStart w:id="8" w:name="_Toc241510407"/>
+      <w:bookmarkStart w:id="8" w:name="_Toc241511958"/>
       <w:r>
         <w:t>Home screen</w:t>
       </w:r>
@@ -4916,7 +5050,7 @@
       <w:pPr>
         <w:pStyle w:val="Heading2"/>
       </w:pPr>
-      <w:bookmarkStart w:id="9" w:name="_Toc241510408"/>
+      <w:bookmarkStart w:id="9" w:name="_Toc241511959"/>
       <w:r>
         <w:t>Doing your QC checklist</w:t>
       </w:r>
@@ -5130,7 +5264,7 @@
       <w:pPr>
         <w:pStyle w:val="Heading2"/>
       </w:pPr>
-      <w:bookmarkStart w:id="10" w:name="_Toc241510409"/>
+      <w:bookmarkStart w:id="10" w:name="_Toc241511960"/>
       <w:r>
         <w:t>Signing and rework</w:t>
       </w:r>
@@ -5250,7 +5384,7 @@
       <w:pPr>
         <w:pStyle w:val="Heading2"/>
       </w:pPr>
-      <w:bookmarkStart w:id="11" w:name="_Toc241510410"/>
+      <w:bookmarkStart w:id="11" w:name="_Toc241511961"/>
       <w:r>
         <w:t>Other departments' checklists</w:t>
       </w:r>
@@ -5278,7 +5412,7 @@
       <w:pPr>
         <w:pStyle w:val="Heading2"/>
       </w:pPr>
-      <w:bookmarkStart w:id="12" w:name="_Toc241510411"/>
+      <w:bookmarkStart w:id="12" w:name="_Toc241511962"/>
       <w:r>
         <w:t>Photos and parts</w:t>
       </w:r>
@@ -5415,7 +5549,7 @@
         <w:pStyle w:val="Heading1"/>
         <w:pageBreakBefore/>
       </w:pPr>
-      <w:bookmarkStart w:id="13" w:name="_Toc241510412"/>
+      <w:bookmarkStart w:id="13" w:name="_Toc241511963"/>
       <w:r>
         <w:t>3.  Staff Hub: time off, mailbox and company info</w:t>
       </w:r>
@@ -5443,7 +5577,7 @@
       <w:pPr>
         <w:pStyle w:val="Heading2"/>
       </w:pPr>
-      <w:bookmarkStart w:id="14" w:name="_Toc241510413"/>
+      <w:bookmarkStart w:id="14" w:name="_Toc241511964"/>
       <w:r>
         <w:t>Requesting time off</w:t>
       </w:r>
@@ -5606,7 +5740,7 @@
       <w:pPr>
         <w:pStyle w:val="Heading2"/>
       </w:pPr>
-      <w:bookmarkStart w:id="15" w:name="_Toc241510414"/>
+      <w:bookmarkStart w:id="15" w:name="_Toc241511965"/>
       <w:r>
         <w:t>Checking your requests</w:t>
       </w:r>
@@ -5661,7 +5795,7 @@
       <w:pPr>
         <w:pStyle w:val="Heading2"/>
       </w:pPr>
-      <w:bookmarkStart w:id="16" w:name="_Toc241510415"/>
+      <w:bookmarkStart w:id="16" w:name="_Toc241511966"/>
       <w:r>
         <w:t>Mailbox</w:t>
       </w:r>
@@ -5730,7 +5864,7 @@
       <w:pPr>
         <w:pStyle w:val="Heading2"/>
       </w:pPr>
-      <w:bookmarkStart w:id="17" w:name="_Toc241510416"/>
+      <w:bookmarkStart w:id="17" w:name="_Toc241511967"/>
       <w:r>
         <w:t>Company info and this manual</w:t>
       </w:r>
@@ -5766,7 +5900,7 @@
         <w:pStyle w:val="Heading1"/>
         <w:pageBreakBefore/>
       </w:pPr>
-      <w:bookmarkStart w:id="18" w:name="_Toc241510417"/>
+      <w:bookmarkStart w:id="18" w:name="_Toc241511968"/>
       <w:r>
         <w:t>4.  Dashboard</w:t>
       </w:r>
@@ -5905,7 +6039,7 @@
         <w:pStyle w:val="Heading1"/>
         <w:pageBreakBefore/>
       </w:pPr>
-      <w:bookmarkStart w:id="19" w:name="_Toc241510418"/>
+      <w:bookmarkStart w:id="19" w:name="_Toc241511969"/>
       <w:r>
         <w:t>5.  Jobs and the Daily GO List</w:t>
       </w:r>
@@ -5933,7 +6067,7 @@
       <w:pPr>
         <w:pStyle w:val="Heading2"/>
       </w:pPr>
-      <w:bookmarkStart w:id="20" w:name="_Toc241510419"/>
+      <w:bookmarkStart w:id="20" w:name="_Toc241511970"/>
       <w:r>
         <w:t>RO numbers</w:t>
       </w:r>
@@ -6019,7 +6153,7 @@
       <w:pPr>
         <w:pStyle w:val="Heading2"/>
       </w:pPr>
-      <w:bookmarkStart w:id="21" w:name="_Toc241510420"/>
+      <w:bookmarkStart w:id="21" w:name="_Toc241511971"/>
       <w:r>
         <w:t>Adding or editing a job</w:t>
       </w:r>
@@ -6139,7 +6273,7 @@
       <w:pPr>
         <w:pStyle w:val="Heading2"/>
       </w:pPr>
-      <w:bookmarkStart w:id="22" w:name="_Toc241510421"/>
+      <w:bookmarkStart w:id="22" w:name="_Toc241511972"/>
       <w:r>
         <w:t>Customer updates</w:t>
       </w:r>
@@ -6308,7 +6442,7 @@
         <w:pStyle w:val="Heading1"/>
         <w:pageBreakBefore/>
       </w:pPr>
-      <w:bookmarkStart w:id="23" w:name="_Toc241510422"/>
+      <w:bookmarkStart w:id="23" w:name="_Toc241511973"/>
       <w:r>
         <w:t>6.  Production, Delivery and Planning boards</w:t>
       </w:r>
@@ -6318,7 +6452,7 @@
       <w:pPr>
         <w:pStyle w:val="Heading2"/>
       </w:pPr>
-      <w:bookmarkStart w:id="24" w:name="_Toc241510423"/>
+      <w:bookmarkStart w:id="24" w:name="_Toc241511974"/>
       <w:r>
         <w:t>Production Board</w:t>
       </w:r>
@@ -6446,7 +6580,7 @@
       <w:pPr>
         <w:pStyle w:val="Heading2"/>
       </w:pPr>
-      <w:bookmarkStart w:id="25" w:name="_Toc241510424"/>
+      <w:bookmarkStart w:id="25" w:name="_Toc241511975"/>
       <w:r>
         <w:t>Vehicle pictures</w:t>
       </w:r>
@@ -6504,7 +6638,7 @@
       <w:pPr>
         <w:pStyle w:val="Heading2"/>
       </w:pPr>
-      <w:bookmarkStart w:id="26" w:name="_Toc241510425"/>
+      <w:bookmarkStart w:id="26" w:name="_Toc241511976"/>
       <w:r>
         <w:t>Delivery and Planning boards</w:t>
       </w:r>
@@ -6594,7 +6728,7 @@
       <w:pPr>
         <w:pStyle w:val="Heading2"/>
       </w:pPr>
-      <w:bookmarkStart w:id="27" w:name="_Toc241510426"/>
+      <w:bookmarkStart w:id="27" w:name="_Toc241511977"/>
       <w:r>
         <w:t>TV display</w:t>
       </w:r>
@@ -6623,7 +6757,7 @@
         <w:pStyle w:val="Heading1"/>
         <w:pageBreakBefore/>
       </w:pPr>
-      <w:bookmarkStart w:id="28" w:name="_Toc241510427"/>
+      <w:bookmarkStart w:id="28" w:name="_Toc241511978"/>
       <w:r>
         <w:t>7.  CCC estimates coming into ShopControl</w:t>
       </w:r>
@@ -6732,7 +6866,7 @@
         <w:pStyle w:val="Heading1"/>
         <w:pageBreakBefore/>
       </w:pPr>
-      <w:bookmarkStart w:id="29" w:name="_Toc241510428"/>
+      <w:bookmarkStart w:id="29" w:name="_Toc241511979"/>
       <w:r>
         <w:t>8.  Parts</w:t>
       </w:r>
@@ -6790,7 +6924,7 @@
       <w:pPr>
         <w:pStyle w:val="Heading2"/>
       </w:pPr>
-      <w:bookmarkStart w:id="30" w:name="_Toc241510429"/>
+      <w:bookmarkStart w:id="30" w:name="_Toc241511980"/>
       <w:r>
         <w:t>What counts as a problem</w:t>
       </w:r>
@@ -6858,7 +6992,7 @@
       <w:pPr>
         <w:pStyle w:val="Heading2"/>
       </w:pPr>
-      <w:bookmarkStart w:id="31" w:name="_Toc241510430"/>
+      <w:bookmarkStart w:id="31" w:name="_Toc241511981"/>
       <w:r>
         <w:t>Ordering parts</w:t>
       </w:r>
@@ -6965,7 +7099,7 @@
       <w:pPr>
         <w:pStyle w:val="Heading2"/>
       </w:pPr>
-      <w:bookmarkStart w:id="32" w:name="_Toc241510431"/>
+      <w:bookmarkStart w:id="32" w:name="_Toc241511982"/>
       <w:r>
         <w:t>Mirror matching and carts</w:t>
       </w:r>
@@ -7103,7 +7237,7 @@
       <w:pPr>
         <w:pStyle w:val="Heading2"/>
       </w:pPr>
-      <w:bookmarkStart w:id="33" w:name="_Toc241510432"/>
+      <w:bookmarkStart w:id="33" w:name="_Toc241511983"/>
       <w:r>
         <w:t>Other parts screens</w:t>
       </w:r>
@@ -7194,7 +7328,7 @@
         <w:pStyle w:val="Heading1"/>
         <w:pageBreakBefore/>
       </w:pPr>
-      <w:bookmarkStart w:id="34" w:name="_Toc241510433"/>
+      <w:bookmarkStart w:id="34" w:name="_Toc241511984"/>
       <w:r>
         <w:t>9.  Vehicle QC (office view)</w:t>
       </w:r>
@@ -7232,7 +7366,7 @@
       <w:pPr>
         <w:pStyle w:val="Heading2"/>
       </w:pPr>
-      <w:bookmarkStart w:id="35" w:name="_Toc241510434"/>
+      <w:bookmarkStart w:id="35" w:name="_Toc241511985"/>
       <w:r>
         <w:t>Pulling up a car's QC report</w:t>
       </w:r>
@@ -7347,155 +7481,47 @@
         <w:pStyle w:val="Heading1"/>
         <w:pageBreakBefore/>
       </w:pPr>
-      <w:bookmarkStart w:id="36" w:name="_Toc241510435"/>
-      <w:r>
-        <w:t>10.  Office tools</w:t>
+      <w:bookmarkStart w:id="36" w:name="_Toc241511986"/>
+      <w:r>
+        <w:t>10.  Completed Jobs (job records)</w:t>
       </w:r>
       <w:bookmarkEnd w:id="36"/>
     </w:p>
     <w:p>
       <w:pPr>
-        <w:pStyle w:val="Heading2"/>
-      </w:pPr>
-      <w:bookmarkStart w:id="37" w:name="_Toc241510436"/>
-      <w:r>
-        <w:t>Missed Calls / Callback Requests</w:t>
-      </w:r>
-      <w:bookmarkEnd w:id="37"/>
-    </w:p>
-    <w:p>
-      <w:pPr>
         <w:spacing w:after="120"/>
       </w:pPr>
       <w:r>
-        <w:t xml:space="preserve">Log every missed call with the caller, number, reason and who owns the callback. Log each callback attempt. A call still </w:t>
-      </w:r>
-      <w:r>
-        <w:rPr>
-          <w:b/>
-          <w:bCs/>
-        </w:rPr>
-        <w:t>New</w:t>
-      </w:r>
-      <w:r>
-        <w:t xml:space="preserve"> or </w:t>
-      </w:r>
-      <w:r>
-        <w:rPr>
-          <w:b/>
-          <w:bCs/>
-        </w:rPr>
-        <w:t>In progress</w:t>
-      </w:r>
-      <w:r>
-        <w:t xml:space="preserve"> after </w:t>
-      </w:r>
-      <w:r>
-        <w:rPr>
-          <w:b/>
-          <w:bCs/>
-        </w:rPr>
-        <w:t>1 business hour</w:t>
-      </w:r>
-      <w:r>
-        <w:t xml:space="preserve"> shows as overdue on the dashboard (</w:t>
-      </w:r>
-      <w:r>
-        <w:rPr>
-          <w:b/>
-          <w:bCs/>
-        </w:rPr>
-        <w:t>Missed Calls Overdue</w:t>
-      </w:r>
-      <w:r>
-        <w:t xml:space="preserve">). Mark it </w:t>
-      </w:r>
-      <w:r>
-        <w:rPr>
-          <w:b/>
-          <w:bCs/>
-        </w:rPr>
-        <w:t>Returned / resolved</w:t>
-      </w:r>
-      <w:r>
-        <w:t xml:space="preserve"> when done, or </w:t>
-      </w:r>
-      <w:r>
-        <w:rPr>
-          <w:b/>
-          <w:bCs/>
-        </w:rPr>
-        <w:t>Closed — no callback needed</w:t>
-      </w:r>
-      <w:r>
-        <w:t xml:space="preserve"> with a reason.</w:t>
-      </w:r>
-    </w:p>
-    <w:p>
-      <w:pPr>
-        <w:pStyle w:val="Heading2"/>
-      </w:pPr>
-      <w:bookmarkStart w:id="38" w:name="_Toc241510437"/>
-      <w:r>
-        <w:t>Tasks</w:t>
-      </w:r>
-      <w:bookmarkEnd w:id="38"/>
+        <w:t xml:space="preserve">When a car is delivered (or marked Total Loss) it leaves the boards, but nothing about it is lost. The </w:t>
+      </w:r>
+      <w:r>
+        <w:rPr>
+          <w:b/>
+          <w:bCs/>
+        </w:rPr>
+        <w:t>Completed Jobs</w:t>
+      </w:r>
+      <w:r>
+        <w:t xml:space="preserve"> tab (left menu, under Delivery Board) lists every finished job with when it came in, when it was delivered, days in the shop, repair value, how many parts it had and how many QC checklists were done. Search by RO, customer, vehicle or insurance, or filter by delivered date.</w:t>
+      </w:r>
     </w:p>
     <w:p>
       <w:pPr>
         <w:spacing w:after="120"/>
       </w:pPr>
       <w:r>
-        <w:t>Assign tasks with a due date. The person is emailed when the task is assigned and reminded by email if it's still open after 1 hour and again after 3 hours. Anything that can't be done today should be flagged to management before the end of the day.</w:t>
-      </w:r>
-    </w:p>
-    <w:p>
-      <w:pPr>
-        <w:pStyle w:val="Heading2"/>
-      </w:pPr>
-      <w:bookmarkStart w:id="39" w:name="_Toc241510438"/>
-      <w:r>
-        <w:t>Booth Filters and Facility Checklist</w:t>
-      </w:r>
-      <w:bookmarkEnd w:id="39"/>
-    </w:p>
-    <w:p>
-      <w:pPr>
-        <w:spacing w:after="120"/>
-      </w:pPr>
-      <w:r>
-        <w:t xml:space="preserve">Log each paint booth filter change (with a picture) to reset the 30-day countdown. The weekly </w:t>
-      </w:r>
-      <w:r>
-        <w:rPr>
-          <w:b/>
-          <w:bCs/>
-        </w:rPr>
-        <w:t>Facility Checklist</w:t>
-      </w:r>
-      <w:r>
-        <w:t xml:space="preserve"> covers the booth, compressor and shop equipment; mark anything </w:t>
-      </w:r>
-      <w:r>
-        <w:rPr>
-          <w:b/>
-          <w:bCs/>
-        </w:rPr>
-        <w:t>Needs Attention</w:t>
-      </w:r>
-      <w:r>
-        <w:t xml:space="preserve"> and create a task if needed.</w:t>
-      </w:r>
-    </w:p>
-    <w:p>
-      <w:pPr>
-        <w:pStyle w:val="Heading2"/>
-      </w:pPr>
-      <w:bookmarkStart w:id="40" w:name="_Toc241510439"/>
-      <w:r>
-        <w:t>AR Balances and Cycle Time</w:t>
-      </w:r>
-      <w:bookmarkEnd w:id="40"/>
+        <w:t xml:space="preserve">Click a job to open its </w:t>
+      </w:r>
+      <w:r>
+        <w:rPr>
+          <w:b/>
+          <w:bCs/>
+        </w:rPr>
+        <w:t>job file</w:t>
+      </w:r>
+      <w:r>
+        <w:t>:</w:t>
+      </w:r>
     </w:p>
     <w:p>
       <w:pPr>
@@ -7511,10 +7537,10 @@
           <w:b/>
           <w:bCs/>
         </w:rPr>
-        <w:t>AR Balances:</w:t>
-      </w:r>
-      <w:r>
-        <w:t xml:space="preserve"> open balances by RO, who owes it and when it's due.</w:t>
+        <w:t>Job details:</w:t>
+      </w:r>
+      <w:r>
+        <w:t xml:space="preserve"> customer, vehicle, value, insurance, estimator, the techs and painters on it, in / on-site / delivered dates, days in shop and hours.</w:t>
       </w:r>
     </w:p>
     <w:p>
@@ -7531,21 +7557,11 @@
           <w:b/>
           <w:bCs/>
         </w:rPr>
-        <w:t>Cycle time tabs:</w:t>
-      </w:r>
-      <w:r>
-        <w:t xml:space="preserve"> active jobs by dollar range with target days in the shop: under $2,000 = 2 days, $2,000–4,000 = 4 days, $4,000–10,000 = 8 days, $10,000+ = 15 days.</w:t>
-      </w:r>
-    </w:p>
-    <w:p>
-      <w:pPr>
-        <w:pStyle w:val="Heading2"/>
-      </w:pPr>
-      <w:bookmarkStart w:id="41" w:name="_Toc241510440"/>
-      <w:r>
-        <w:t>Photos and Activity Log</w:t>
-      </w:r>
-      <w:bookmarkEnd w:id="41"/>
+        <w:t>Production timeline:</w:t>
+      </w:r>
+      <w:r>
+        <w:t xml:space="preserve"> every stage move with the date, time and who moved it, and how long the car sat in each stage.</w:t>
+      </w:r>
     </w:p>
     <w:p>
       <w:pPr>
@@ -7561,10 +7577,10 @@
           <w:b/>
           <w:bCs/>
         </w:rPr>
-        <w:t>Photos:</w:t>
-      </w:r>
-      <w:r>
-        <w:t xml:space="preserve"> upload photos and PDFs tied to a job or record.</w:t>
+        <w:t>Parts:</w:t>
+      </w:r>
+      <w:r>
+        <w:t xml:space="preserve"> every part with vendor, estimated cost, status, ordered / ETA / received dates and where it was stored. Parts removed from the job along the way are listed separately with who removed them and when.</w:t>
       </w:r>
     </w:p>
     <w:p>
@@ -7581,10 +7597,134 @@
           <w:b/>
           <w:bCs/>
         </w:rPr>
-        <w:t>Activity Log:</w:t>
-      </w:r>
-      <w:r>
-        <w:t xml:space="preserve"> who added, changed, deleted or uploaded what, and when.</w:t>
+        <w:t>Quality control:</w:t>
+      </w:r>
+      <w:r>
+        <w:t xml:space="preserve"> all five checklists with who did them and when they were signed. Click </w:t>
+      </w:r>
+      <w:r>
+        <w:rPr>
+          <w:b/>
+          <w:bCs/>
+        </w:rPr>
+        <w:t>Open full QC report with signatures</w:t>
+      </w:r>
+      <w:r>
+        <w:t xml:space="preserve"> for the complete checklists.</w:t>
+      </w:r>
+    </w:p>
+    <w:p>
+      <w:pPr>
+        <w:pStyle w:val="ListParagraph"/>
+        <w:numPr>
+          <w:ilvl w:val="0"/>
+          <w:numId w:val="2"/>
+        </w:numPr>
+        <w:spacing w:after="60"/>
+      </w:pPr>
+      <w:r>
+        <w:rPr>
+          <w:b/>
+          <w:bCs/>
+        </w:rPr>
+        <w:t>Photos and files, appointments, core returns and notes.</w:t>
+      </w:r>
+    </w:p>
+    <w:p>
+      <w:pPr>
+        <w:pStyle w:val="ListParagraph"/>
+        <w:numPr>
+          <w:ilvl w:val="0"/>
+          <w:numId w:val="2"/>
+        </w:numPr>
+        <w:spacing w:after="60"/>
+      </w:pPr>
+      <w:r>
+        <w:rPr>
+          <w:b/>
+          <w:bCs/>
+        </w:rPr>
+        <w:t>Every change:</w:t>
+      </w:r>
+      <w:r>
+        <w:t xml:space="preserve"> each edit to the job (supplement amounts, estimator, techs, dates and so on), who made it and when, including updates from CCC.</w:t>
+      </w:r>
+    </w:p>
+    <w:p>
+      <w:pPr>
+        <w:spacing w:after="120"/>
+      </w:pPr>
+      <w:r>
+        <w:t xml:space="preserve">Click </w:t>
+      </w:r>
+      <w:r>
+        <w:rPr>
+          <w:b/>
+          <w:bCs/>
+        </w:rPr>
+        <w:t>Print / Save as PDF</w:t>
+      </w:r>
+      <w:r>
+        <w:t xml:space="preserve"> to print the job file or keep a PDF copy, for example for an insurance question or a comeback.</w:t>
+      </w:r>
+    </w:p>
+    <w:p>
+      <w:pPr>
+        <w:pStyle w:val="Heading2"/>
+      </w:pPr>
+      <w:bookmarkStart w:id="37" w:name="_Toc241511987"/>
+      <w:r>
+        <w:t>Deleted jobs</w:t>
+      </w:r>
+      <w:bookmarkEnd w:id="37"/>
+    </w:p>
+    <w:p>
+      <w:pPr>
+        <w:spacing w:after="120"/>
+      </w:pPr>
+      <w:r>
+        <w:t xml:space="preserve">Tick </w:t>
+      </w:r>
+      <w:r>
+        <w:rPr>
+          <w:b/>
+          <w:bCs/>
+        </w:rPr>
+        <w:t>Show deleted jobs</w:t>
+      </w:r>
+      <w:r>
+        <w:t xml:space="preserve"> to see jobs someone deleted. ShopControl keeps a copy of every deleted job, so its file can still be opened (it shows who deleted it and when).</w:t>
+      </w:r>
+    </w:p>
+    <w:p>
+      <w:pPr>
+        <w:pBdr>
+          <w:left w:val="single" w:sz="24" w:space="8" w:color="C99A06"/>
+        </w:pBdr>
+        <w:shd w:val="clear" w:color="auto" w:fill="FFF8DD"/>
+        <w:spacing w:before="120" w:after="160"/>
+        <w:ind w:left="160" w:right="160"/>
+      </w:pPr>
+      <w:r>
+        <w:rPr>
+          <w:b/>
+          <w:bCs/>
+          <w:color w:val="C99A06"/>
+        </w:rPr>
+        <w:t xml:space="preserve">Note:  </w:t>
+      </w:r>
+      <w:r>
+        <w:t xml:space="preserve">Delivered and total-loss jobs are the shop's record of the repair. Only an </w:t>
+      </w:r>
+      <w:r>
+        <w:rPr>
+          <w:b/>
+          <w:bCs/>
+        </w:rPr>
+        <w:t>admin or owner</w:t>
+      </w:r>
+      <w:r>
+        <w:t xml:space="preserve"> can delete them or the parts on them; anyone else gets a message instead.</w:t>
       </w:r>
     </w:p>
     <w:p>
@@ -7592,21 +7732,266 @@
         <w:pStyle w:val="Heading1"/>
         <w:pageBreakBefore/>
       </w:pPr>
-      <w:bookmarkStart w:id="42" w:name="_Toc241510441"/>
-      <w:r>
-        <w:t>11.  Time off and messages (office and admins)</w:t>
+      <w:bookmarkStart w:id="38" w:name="_Toc241511988"/>
+      <w:r>
+        <w:t>11.  Office tools</w:t>
+      </w:r>
+      <w:bookmarkEnd w:id="38"/>
+    </w:p>
+    <w:p>
+      <w:pPr>
+        <w:pStyle w:val="Heading2"/>
+      </w:pPr>
+      <w:bookmarkStart w:id="39" w:name="_Toc241511989"/>
+      <w:r>
+        <w:t>Missed Calls / Callback Requests</w:t>
+      </w:r>
+      <w:bookmarkEnd w:id="39"/>
+    </w:p>
+    <w:p>
+      <w:pPr>
+        <w:spacing w:after="120"/>
+      </w:pPr>
+      <w:r>
+        <w:t xml:space="preserve">Log every missed call with the caller, number, reason and who owns the callback. Log each callback attempt. A call still </w:t>
+      </w:r>
+      <w:r>
+        <w:rPr>
+          <w:b/>
+          <w:bCs/>
+        </w:rPr>
+        <w:t>New</w:t>
+      </w:r>
+      <w:r>
+        <w:t xml:space="preserve"> or </w:t>
+      </w:r>
+      <w:r>
+        <w:rPr>
+          <w:b/>
+          <w:bCs/>
+        </w:rPr>
+        <w:t>In progress</w:t>
+      </w:r>
+      <w:r>
+        <w:t xml:space="preserve"> after </w:t>
+      </w:r>
+      <w:r>
+        <w:rPr>
+          <w:b/>
+          <w:bCs/>
+        </w:rPr>
+        <w:t>1 business hour</w:t>
+      </w:r>
+      <w:r>
+        <w:t xml:space="preserve"> shows as overdue on the dashboard (</w:t>
+      </w:r>
+      <w:r>
+        <w:rPr>
+          <w:b/>
+          <w:bCs/>
+        </w:rPr>
+        <w:t>Missed Calls Overdue</w:t>
+      </w:r>
+      <w:r>
+        <w:t xml:space="preserve">). Mark it </w:t>
+      </w:r>
+      <w:r>
+        <w:rPr>
+          <w:b/>
+          <w:bCs/>
+        </w:rPr>
+        <w:t>Returned / resolved</w:t>
+      </w:r>
+      <w:r>
+        <w:t xml:space="preserve"> when done, or </w:t>
+      </w:r>
+      <w:r>
+        <w:rPr>
+          <w:b/>
+          <w:bCs/>
+        </w:rPr>
+        <w:t>Closed — no callback needed</w:t>
+      </w:r>
+      <w:r>
+        <w:t xml:space="preserve"> with a reason.</w:t>
+      </w:r>
+    </w:p>
+    <w:p>
+      <w:pPr>
+        <w:pStyle w:val="Heading2"/>
+      </w:pPr>
+      <w:bookmarkStart w:id="40" w:name="_Toc241511990"/>
+      <w:r>
+        <w:t>Tasks</w:t>
+      </w:r>
+      <w:bookmarkEnd w:id="40"/>
+    </w:p>
+    <w:p>
+      <w:pPr>
+        <w:spacing w:after="120"/>
+      </w:pPr>
+      <w:r>
+        <w:t>Assign tasks with a due date. The person is emailed when the task is assigned and reminded by email if it's still open after 1 hour and again after 3 hours. Anything that can't be done today should be flagged to management before the end of the day.</w:t>
+      </w:r>
+    </w:p>
+    <w:p>
+      <w:pPr>
+        <w:pStyle w:val="Heading2"/>
+      </w:pPr>
+      <w:bookmarkStart w:id="41" w:name="_Toc241511991"/>
+      <w:r>
+        <w:t>Booth Filters and Facility Checklist</w:t>
+      </w:r>
+      <w:bookmarkEnd w:id="41"/>
+    </w:p>
+    <w:p>
+      <w:pPr>
+        <w:spacing w:after="120"/>
+      </w:pPr>
+      <w:r>
+        <w:t xml:space="preserve">Log each paint booth filter change (with a picture) to reset the 30-day countdown. The weekly </w:t>
+      </w:r>
+      <w:r>
+        <w:rPr>
+          <w:b/>
+          <w:bCs/>
+        </w:rPr>
+        <w:t>Facility Checklist</w:t>
+      </w:r>
+      <w:r>
+        <w:t xml:space="preserve"> covers the booth, compressor and shop equipment; mark anything </w:t>
+      </w:r>
+      <w:r>
+        <w:rPr>
+          <w:b/>
+          <w:bCs/>
+        </w:rPr>
+        <w:t>Needs Attention</w:t>
+      </w:r>
+      <w:r>
+        <w:t xml:space="preserve"> and create a task if needed.</w:t>
+      </w:r>
+    </w:p>
+    <w:p>
+      <w:pPr>
+        <w:pStyle w:val="Heading2"/>
+      </w:pPr>
+      <w:bookmarkStart w:id="42" w:name="_Toc241511992"/>
+      <w:r>
+        <w:t>AR Balances and Cycle Time</w:t>
       </w:r>
       <w:bookmarkEnd w:id="42"/>
     </w:p>
     <w:p>
       <w:pPr>
+        <w:pStyle w:val="ListParagraph"/>
+        <w:numPr>
+          <w:ilvl w:val="0"/>
+          <w:numId w:val="2"/>
+        </w:numPr>
+        <w:spacing w:after="60"/>
+      </w:pPr>
+      <w:r>
+        <w:rPr>
+          <w:b/>
+          <w:bCs/>
+        </w:rPr>
+        <w:t>AR Balances:</w:t>
+      </w:r>
+      <w:r>
+        <w:t xml:space="preserve"> open balances by RO, who owes it and when it's due.</w:t>
+      </w:r>
+    </w:p>
+    <w:p>
+      <w:pPr>
+        <w:pStyle w:val="ListParagraph"/>
+        <w:numPr>
+          <w:ilvl w:val="0"/>
+          <w:numId w:val="2"/>
+        </w:numPr>
+        <w:spacing w:after="60"/>
+      </w:pPr>
+      <w:r>
+        <w:rPr>
+          <w:b/>
+          <w:bCs/>
+        </w:rPr>
+        <w:t>Cycle time tabs:</w:t>
+      </w:r>
+      <w:r>
+        <w:t xml:space="preserve"> active jobs by dollar range with target days in the shop: under $2,000 = 2 days, $2,000–4,000 = 4 days, $4,000–10,000 = 8 days, $10,000+ = 15 days.</w:t>
+      </w:r>
+    </w:p>
+    <w:p>
+      <w:pPr>
         <w:pStyle w:val="Heading2"/>
       </w:pPr>
-      <w:bookmarkStart w:id="43" w:name="_Toc241510442"/>
+      <w:bookmarkStart w:id="43" w:name="_Toc241511993"/>
+      <w:r>
+        <w:t>Photos and Activity Log</w:t>
+      </w:r>
+      <w:bookmarkEnd w:id="43"/>
+    </w:p>
+    <w:p>
+      <w:pPr>
+        <w:pStyle w:val="ListParagraph"/>
+        <w:numPr>
+          <w:ilvl w:val="0"/>
+          <w:numId w:val="2"/>
+        </w:numPr>
+        <w:spacing w:after="60"/>
+      </w:pPr>
+      <w:r>
+        <w:rPr>
+          <w:b/>
+          <w:bCs/>
+        </w:rPr>
+        <w:t>Photos:</w:t>
+      </w:r>
+      <w:r>
+        <w:t xml:space="preserve"> upload photos and PDFs tied to a job or record.</w:t>
+      </w:r>
+    </w:p>
+    <w:p>
+      <w:pPr>
+        <w:pStyle w:val="ListParagraph"/>
+        <w:numPr>
+          <w:ilvl w:val="0"/>
+          <w:numId w:val="2"/>
+        </w:numPr>
+        <w:spacing w:after="60"/>
+      </w:pPr>
+      <w:r>
+        <w:rPr>
+          <w:b/>
+          <w:bCs/>
+        </w:rPr>
+        <w:t>Activity Log:</w:t>
+      </w:r>
+      <w:r>
+        <w:t xml:space="preserve"> who added, changed, deleted or uploaded what, and when.</w:t>
+      </w:r>
+    </w:p>
+    <w:p>
+      <w:pPr>
+        <w:pStyle w:val="Heading1"/>
+        <w:pageBreakBefore/>
+      </w:pPr>
+      <w:bookmarkStart w:id="44" w:name="_Toc241511994"/>
+      <w:r>
+        <w:t>12.  Time off and messages (office and admins)</w:t>
+      </w:r>
+      <w:bookmarkEnd w:id="44"/>
+    </w:p>
+    <w:p>
+      <w:pPr>
+        <w:pStyle w:val="Heading2"/>
+      </w:pPr>
+      <w:bookmarkStart w:id="45" w:name="_Toc241511995"/>
       <w:r>
         <w:t>Time Off tab</w:t>
       </w:r>
-      <w:bookmarkEnd w:id="43"/>
+      <w:bookmarkEnd w:id="45"/>
     </w:p>
     <w:p>
       <w:pPr>
@@ -7730,11 +8115,11 @@
       <w:pPr>
         <w:pStyle w:val="Heading2"/>
       </w:pPr>
-      <w:bookmarkStart w:id="44" w:name="_Toc241510443"/>
+      <w:bookmarkStart w:id="46" w:name="_Toc241511996"/>
       <w:r>
         <w:t>Messages &amp; Info tab</w:t>
       </w:r>
-      <w:bookmarkEnd w:id="44"/>
+      <w:bookmarkEnd w:id="46"/>
     </w:p>
     <w:p>
       <w:pPr>
@@ -7821,21 +8206,21 @@
         <w:pStyle w:val="Heading1"/>
         <w:pageBreakBefore/>
       </w:pPr>
-      <w:bookmarkStart w:id="45" w:name="_Toc241510444"/>
-      <w:r>
-        <w:t>12.  Admin: employees and settings</w:t>
-      </w:r>
-      <w:bookmarkEnd w:id="45"/>
+      <w:bookmarkStart w:id="47" w:name="_Toc241511997"/>
+      <w:r>
+        <w:t>13.  Admin: employees and settings</w:t>
+      </w:r>
+      <w:bookmarkEnd w:id="47"/>
     </w:p>
     <w:p>
       <w:pPr>
         <w:pStyle w:val="Heading2"/>
       </w:pPr>
-      <w:bookmarkStart w:id="46" w:name="_Toc241510445"/>
+      <w:bookmarkStart w:id="48" w:name="_Toc241511998"/>
       <w:r>
         <w:t>Adding an employee</w:t>
       </w:r>
-      <w:bookmarkEnd w:id="46"/>
+      <w:bookmarkEnd w:id="48"/>
     </w:p>
     <w:p>
       <w:pPr>
@@ -7953,11 +8338,11 @@
       <w:pPr>
         <w:pStyle w:val="Heading2"/>
       </w:pPr>
-      <w:bookmarkStart w:id="47" w:name="_Toc241510446"/>
+      <w:bookmarkStart w:id="49" w:name="_Toc241511999"/>
       <w:r>
         <w:t>Changing an employee</w:t>
       </w:r>
-      <w:bookmarkEnd w:id="47"/>
+      <w:bookmarkEnd w:id="49"/>
     </w:p>
     <w:p>
       <w:pPr>
@@ -8113,11 +8498,11 @@
       <w:pPr>
         <w:pStyle w:val="Heading2"/>
       </w:pPr>
-      <w:bookmarkStart w:id="48" w:name="_Toc241510447"/>
+      <w:bookmarkStart w:id="50" w:name="_Toc241512000"/>
       <w:r>
         <w:t>Board Settings</w:t>
       </w:r>
-      <w:bookmarkEnd w:id="48"/>
+      <w:bookmarkEnd w:id="50"/>
     </w:p>
     <w:p>
       <w:pPr>
@@ -8132,11 +8517,11 @@
         <w:pStyle w:val="Heading1"/>
         <w:pageBreakBefore/>
       </w:pPr>
-      <w:bookmarkStart w:id="49" w:name="_Toc241510448"/>
-      <w:r>
-        <w:t>13.  Quick answers</w:t>
-      </w:r>
-      <w:bookmarkEnd w:id="49"/>
+      <w:bookmarkStart w:id="51" w:name="_Toc241512001"/>
+      <w:r>
+        <w:t>14.  Quick answers</w:t>
+      </w:r>
+      <w:bookmarkEnd w:id="51"/>
     </w:p>
     <w:tbl>
       <w:tblPr>
@@ -8153,7 +8538,7 @@
           <w:left w:w="10" w:type="dxa"/>
           <w:right w:w="10" w:type="dxa"/>
         </w:tblCellMar>
-        <w:tblLook w:val="04A0" w:firstRow="1" w:lastRow="0" w:firstColumn="1" w:lastColumn="0" w:noHBand="0" w:noVBand="1"/>
+        <w:tblLook w:val="0000" w:firstRow="0" w:lastRow="0" w:firstColumn="0" w:lastColumn="0" w:noHBand="0" w:noVBand="0"/>
       </w:tblPr>
       <w:tblGrid>
         <w:gridCol w:w="2900"/>
@@ -8776,11 +9161,11 @@
         <w:pStyle w:val="Heading1"/>
         <w:pageBreakBefore/>
       </w:pPr>
-      <w:bookmarkStart w:id="50" w:name="_Toc241510449"/>
+      <w:bookmarkStart w:id="52" w:name="_Toc241512002"/>
       <w:r>
         <w:t>Manual versions</w:t>
       </w:r>
-      <w:bookmarkEnd w:id="50"/>
+      <w:bookmarkEnd w:id="52"/>
     </w:p>
     <w:tbl>
       <w:tblPr>
@@ -8797,7 +9182,7 @@
           <w:left w:w="10" w:type="dxa"/>
           <w:right w:w="10" w:type="dxa"/>
         </w:tblCellMar>
-        <w:tblLook w:val="04A0" w:firstRow="1" w:lastRow="0" w:firstColumn="1" w:lastColumn="0" w:noHBand="0" w:noVBand="1"/>
+        <w:tblLook w:val="0000" w:firstRow="0" w:lastRow="0" w:firstColumn="0" w:lastColumn="0" w:noHBand="0" w:noVBand="0"/>
       </w:tblPr>
       <w:tblGrid>
         <w:gridCol w:w="3120"/>
@@ -8931,7 +9316,7 @@
                 <w:b/>
                 <w:bCs/>
               </w:rPr>
-              <w:t>1.7</w:t>
+              <w:t>1.8</w:t>
             </w:r>
           </w:p>
         </w:tc>
@@ -8975,17 +9360,17 @@
           </w:tcPr>
           <w:p>
             <w:r>
-              <w:t xml:space="preserve">The Employee App now shows </w:t>
+              <w:t xml:space="preserve">New </w:t>
             </w:r>
             <w:r>
               <w:rPr>
                 <w:b/>
                 <w:bCs/>
               </w:rPr>
-              <w:t>where each part is</w:t>
-            </w:r>
-            <w:r>
-              <w:t>: the car's parts cart, and the cart shelf or storage spot for every part.</w:t>
+              <w:t>Completed Jobs</w:t>
+            </w:r>
+            <w:r>
+              <w:t xml:space="preserve"> tab with each finished job's full file (production timeline, parts, QC, photos, every change). Only an admin can delete a delivered job or its parts.</w:t>
             </w:r>
           </w:p>
         </w:tc>
@@ -9022,7 +9407,7 @@
                 <w:b/>
                 <w:bCs/>
               </w:rPr>
-              <w:t>1.6</w:t>
+              <w:t>1.7</w:t>
             </w:r>
           </w:p>
         </w:tc>
@@ -9066,37 +9451,17 @@
           </w:tcPr>
           <w:p>
             <w:r>
-              <w:t xml:space="preserve">Whoever does </w:t>
+              <w:t xml:space="preserve">The Employee App now shows </w:t>
             </w:r>
             <w:r>
               <w:rPr>
                 <w:b/>
                 <w:bCs/>
               </w:rPr>
-              <w:t>Check-In</w:t>
-            </w:r>
-            <w:r>
-              <w:t xml:space="preserve"> automatically gets the </w:t>
-            </w:r>
-            <w:r>
-              <w:rPr>
-                <w:b/>
-                <w:bCs/>
-              </w:rPr>
-              <w:t>Final QC</w:t>
-            </w:r>
-            <w:r>
-              <w:t xml:space="preserve"> checklist too. New </w:t>
-            </w:r>
-            <w:r>
-              <w:rPr>
-                <w:b/>
-                <w:bCs/>
-              </w:rPr>
-              <w:t>QC report</w:t>
-            </w:r>
-            <w:r>
-              <w:t xml:space="preserve"> for each car: all five checklists with signatures on one printable page.</w:t>
+              <w:t>where each part is</w:t>
+            </w:r>
+            <w:r>
+              <w:t>: the car's parts cart, and the cart shelf or storage spot for every part.</w:t>
             </w:r>
           </w:p>
         </w:tc>
@@ -9133,7 +9498,7 @@
                 <w:b/>
                 <w:bCs/>
               </w:rPr>
-              <w:t>1.5</w:t>
+              <w:t>1.6</w:t>
             </w:r>
           </w:p>
         </w:tc>
@@ -9177,17 +9542,37 @@
           </w:tcPr>
           <w:p>
             <w:r>
-              <w:t xml:space="preserve">Body technicians automatically get the </w:t>
+              <w:t xml:space="preserve">Whoever does </w:t>
             </w:r>
             <w:r>
               <w:rPr>
                 <w:b/>
                 <w:bCs/>
               </w:rPr>
-              <w:t>Reassy</w:t>
-            </w:r>
-            <w:r>
-              <w:t xml:space="preserve"> checklist too.</w:t>
+              <w:t>Check-In</w:t>
+            </w:r>
+            <w:r>
+              <w:t xml:space="preserve"> automatically gets the </w:t>
+            </w:r>
+            <w:r>
+              <w:rPr>
+                <w:b/>
+                <w:bCs/>
+              </w:rPr>
+              <w:t>Final QC</w:t>
+            </w:r>
+            <w:r>
+              <w:t xml:space="preserve"> checklist too. New </w:t>
+            </w:r>
+            <w:r>
+              <w:rPr>
+                <w:b/>
+                <w:bCs/>
+              </w:rPr>
+              <w:t>QC report</w:t>
+            </w:r>
+            <w:r>
+              <w:t xml:space="preserve"> for each car: all five checklists with signatures on one printable page.</w:t>
             </w:r>
           </w:p>
         </w:tc>
@@ -9224,7 +9609,7 @@
                 <w:b/>
                 <w:bCs/>
               </w:rPr>
-              <w:t>1.4</w:t>
+              <w:t>1.5</w:t>
             </w:r>
           </w:p>
         </w:tc>
@@ -9268,17 +9653,17 @@
           </w:tcPr>
           <w:p>
             <w:r>
-              <w:t xml:space="preserve">Employees can be set to </w:t>
+              <w:t xml:space="preserve">Body technicians automatically get the </w:t>
             </w:r>
             <w:r>
               <w:rPr>
                 <w:b/>
                 <w:bCs/>
               </w:rPr>
-              <w:t>also do</w:t>
-            </w:r>
-            <w:r>
-              <w:t xml:space="preserve"> other checklists (for example a body tech who reassembles also gets the Reassy checklist).</w:t>
+              <w:t>Reassy</w:t>
+            </w:r>
+            <w:r>
+              <w:t xml:space="preserve"> checklist too.</w:t>
             </w:r>
           </w:p>
         </w:tc>
@@ -9315,7 +9700,7 @@
                 <w:b/>
                 <w:bCs/>
               </w:rPr>
-              <w:t>1.3</w:t>
+              <w:t>1.4</w:t>
             </w:r>
           </w:p>
         </w:tc>
@@ -9359,7 +9744,17 @@
           </w:tcPr>
           <w:p>
             <w:r>
-              <w:t>New accounts and admin password resets use a temporary password; you choose your own the first time you sign in.</w:t>
+              <w:t xml:space="preserve">Employees can be set to </w:t>
+            </w:r>
+            <w:r>
+              <w:rPr>
+                <w:b/>
+                <w:bCs/>
+              </w:rPr>
+              <w:t>also do</w:t>
+            </w:r>
+            <w:r>
+              <w:t xml:space="preserve"> other checklists (for example a body tech who reassembles also gets the Reassy checklist).</w:t>
             </w:r>
           </w:p>
         </w:tc>
@@ -9396,7 +9791,7 @@
                 <w:b/>
                 <w:bCs/>
               </w:rPr>
-              <w:t>1.2</w:t>
+              <w:t>1.3</w:t>
             </w:r>
           </w:p>
         </w:tc>
@@ -9440,17 +9835,7 @@
           </w:tcPr>
           <w:p>
             <w:r>
-              <w:t xml:space="preserve">Added the </w:t>
-            </w:r>
-            <w:r>
-              <w:rPr>
-                <w:b/>
-                <w:bCs/>
-              </w:rPr>
-              <w:t>Help</w:t>
-            </w:r>
-            <w:r>
-              <w:t xml:space="preserve"> tab in the office program and a search box in the manual.</w:t>
+              <w:t>New accounts and admin password resets use a temporary password; you choose your own the first time you sign in.</w:t>
             </w:r>
           </w:p>
         </w:tc>
@@ -9487,7 +9872,7 @@
                 <w:b/>
                 <w:bCs/>
               </w:rPr>
-              <w:t>1.1</w:t>
+              <w:t>1.2</w:t>
             </w:r>
           </w:p>
         </w:tc>
@@ -9531,17 +9916,17 @@
           </w:tcPr>
           <w:p>
             <w:r>
-              <w:t xml:space="preserve">Employee App address is now </w:t>
+              <w:t xml:space="preserve">Added the </w:t>
             </w:r>
             <w:r>
               <w:rPr>
                 <w:b/>
                 <w:bCs/>
               </w:rPr>
-              <w:t>https://conceptautobody.app</w:t>
-            </w:r>
-            <w:r>
-              <w:t xml:space="preserve"> and works on phones anywhere. Added how to put it on your phone's home screen.</w:t>
+              <w:t>Help</w:t>
+            </w:r>
+            <w:r>
+              <w:t xml:space="preserve"> tab in the office program and a search box in the manual.</w:t>
             </w:r>
           </w:p>
         </w:tc>
@@ -9578,7 +9963,7 @@
                 <w:b/>
                 <w:bCs/>
               </w:rPr>
-              <w:t>1.0</w:t>
+              <w:t>1.1</w:t>
             </w:r>
           </w:p>
         </w:tc>
@@ -9622,6 +10007,97 @@
           </w:tcPr>
           <w:p>
             <w:r>
+              <w:t xml:space="preserve">Employee App address is now </w:t>
+            </w:r>
+            <w:r>
+              <w:rPr>
+                <w:b/>
+                <w:bCs/>
+              </w:rPr>
+              <w:t>https://conceptautobody.app</w:t>
+            </w:r>
+            <w:r>
+              <w:t xml:space="preserve"> and works on phones anywhere. Added how to put it on your phone's home screen.</w:t>
+            </w:r>
+          </w:p>
+        </w:tc>
+      </w:tr>
+      <w:tr>
+        <w:tblPrEx>
+          <w:tblCellMar>
+            <w:top w:w="0" w:type="dxa"/>
+            <w:bottom w:w="0" w:type="dxa"/>
+          </w:tblCellMar>
+        </w:tblPrEx>
+        <w:trPr>
+          <w:cantSplit/>
+        </w:trPr>
+        <w:tc>
+          <w:tcPr>
+            <w:tcW w:w="3120" w:type="dxa"/>
+            <w:tcBorders>
+              <w:top w:val="single" w:sz="4" w:space="0" w:color="C9CFD6"/>
+              <w:left w:val="single" w:sz="4" w:space="0" w:color="C9CFD6"/>
+              <w:bottom w:val="single" w:sz="4" w:space="0" w:color="C9CFD6"/>
+              <w:right w:val="single" w:sz="4" w:space="0" w:color="C9CFD6"/>
+            </w:tcBorders>
+            <w:tcMar>
+              <w:top w:w="80" w:type="dxa"/>
+              <w:left w:w="120" w:type="dxa"/>
+              <w:bottom w:w="80" w:type="dxa"/>
+              <w:right w:w="120" w:type="dxa"/>
+            </w:tcMar>
+          </w:tcPr>
+          <w:p>
+            <w:r>
+              <w:rPr>
+                <w:b/>
+                <w:bCs/>
+              </w:rPr>
+              <w:t>1.0</w:t>
+            </w:r>
+          </w:p>
+        </w:tc>
+        <w:tc>
+          <w:tcPr>
+            <w:tcW w:w="3120" w:type="dxa"/>
+            <w:tcBorders>
+              <w:top w:val="single" w:sz="4" w:space="0" w:color="C9CFD6"/>
+              <w:left w:val="single" w:sz="4" w:space="0" w:color="C9CFD6"/>
+              <w:bottom w:val="single" w:sz="4" w:space="0" w:color="C9CFD6"/>
+              <w:right w:val="single" w:sz="4" w:space="0" w:color="C9CFD6"/>
+            </w:tcBorders>
+            <w:tcMar>
+              <w:top w:w="80" w:type="dxa"/>
+              <w:left w:w="120" w:type="dxa"/>
+              <w:bottom w:w="80" w:type="dxa"/>
+              <w:right w:w="120" w:type="dxa"/>
+            </w:tcMar>
+          </w:tcPr>
+          <w:p>
+            <w:r>
+              <w:t>September 28, 2026</w:t>
+            </w:r>
+          </w:p>
+        </w:tc>
+        <w:tc>
+          <w:tcPr>
+            <w:tcW w:w="3120" w:type="dxa"/>
+            <w:tcBorders>
+              <w:top w:val="single" w:sz="4" w:space="0" w:color="C9CFD6"/>
+              <w:left w:val="single" w:sz="4" w:space="0" w:color="C9CFD6"/>
+              <w:bottom w:val="single" w:sz="4" w:space="0" w:color="C9CFD6"/>
+              <w:right w:val="single" w:sz="4" w:space="0" w:color="C9CFD6"/>
+            </w:tcBorders>
+            <w:tcMar>
+              <w:top w:w="80" w:type="dxa"/>
+              <w:left w:w="120" w:type="dxa"/>
+              <w:bottom w:w="80" w:type="dxa"/>
+              <w:right w:w="120" w:type="dxa"/>
+            </w:tcMar>
+          </w:tcPr>
+          <w:p>
+            <w:r>
               <w:t>First edition.</w:t>
             </w:r>
           </w:p>
@@ -9683,7 +10159,7 @@
         <w:sz w:val="18"/>
         <w:szCs w:val="18"/>
       </w:rPr>
-      <w:t xml:space="preserve">Concept Autobody  ·  Version 1.7  ·  Page </w:t>
+      <w:t xml:space="preserve">Concept Autobody  ·  Version 1.8  ·  Page </w:t>
     </w:r>
     <w:r>
       <w:rPr>
@@ -9776,96 +10252,69 @@
 <file path=word/numbering.xml><?xml version="1.0" encoding="utf-8"?>
 <w:numbering xmlns:wpc="http://schemas.microsoft.com/office/word/2010/wordprocessingCanvas" xmlns:cx="http://schemas.microsoft.com/office/drawing/2014/chartex" xmlns:cx1="http://schemas.microsoft.com/office/drawing/2015/9/8/chartex" xmlns:cx2="http://schemas.microsoft.com/office/drawing/2015/10/21/chartex" xmlns:cx3="http://schemas.microsoft.com/office/drawing/2016/5/9/chartex" xmlns:cx4="http://schemas.microsoft.com/office/drawing/2016/5/10/chartex" xmlns:cx5="http://schemas.microsoft.com/office/drawing/2016/5/11/chartex" xmlns:cx6="http://schemas.microsoft.com/office/drawing/2016/5/12/chartex" xmlns:cx7="http://schemas.microsoft.com/office/drawing/2016/5/13/chartex" xmlns:cx8="http://schemas.microsoft.com/office/drawing/2016/5/14/chartex" xmlns:mc="http://schemas.openxmlformats.org/markup-compatibility/2006" xmlns:aink="http://schemas.microsoft.com/office/drawing/2016/ink" xmlns:am3d="http://schemas.microsoft.com/office/drawing/2017/model3d" xmlns:o="urn:schemas-microsoft-com:office:office" xmlns:oel="http://schemas.microsoft.com/office/2019/extlst" xmlns:r="http://schemas.openxmlformats.org/officeDocument/2006/relationships" xmlns:m="http://schemas.openxmlformats.org/officeDocument/2006/math" xmlns:v="urn:schemas-microsoft-com:vml" xmlns:wp14="http://schemas.microsoft.com/office/word/2010/wordprocessingDrawing" xmlns:wp="http://schemas.openxmlformats.org/drawingml/2006/wordprocessingDrawing" xmlns:w10="urn:schemas-microsoft-com:office:word" xmlns:w="http://schemas.openxmlformats.org/wordprocessingml/2006/main" xmlns:w14="http://schemas.microsoft.com/office/word/2010/wordml" xmlns:w15="http://schemas.microsoft.com/office/word/2012/wordml" xmlns:w16cex="http://schemas.microsoft.com/office/word/2018/wordml/cex" xmlns:w16cid="http://schemas.microsoft.com/office/word/2016/wordml/cid" xmlns:w16="http://schemas.microsoft.com/office/word/2018/wordml" xmlns:w16du="http://schemas.microsoft.com/office/word/2023/wordml/word16du" xmlns:w16sdtdh="http://schemas.microsoft.com/office/word/2020/wordml/sdtdatahash" xmlns:w16sdtfl="http://schemas.microsoft.com/office/word/2024/wordml/sdtformatlock" xmlns:w16se="http://schemas.microsoft.com/office/word/2015/wordml/symex" xmlns:wpg="http://schemas.microsoft.com/office/word/2010/wordprocessingGroup" xmlns:wpi="http://schemas.microsoft.com/office/word/2010/wordprocessingInk" xmlns:wne="http://schemas.microsoft.com/office/word/2006/wordml" xmlns:wps="http://schemas.microsoft.com/office/word/2010/wordprocessingShape" mc:Ignorable="w14 w15 w16se w16cid w16 w16cex w16sdtdh w16sdtfl w16du wp14">
   <w:abstractNum w:abstractNumId="0" w15:restartNumberingAfterBreak="0">
-    <w:nsid w:val="079E7B38"/>
+    <w:nsid w:val="39007136"/>
     <w:multiLevelType w:val="hybridMultilevel"/>
-    <w:tmpl w:val="1946D078"/>
-    <w:lvl w:ilvl="0" w:tplc="2992258E" w:tentative="1">
+    <w:tmpl w:val="DBCA654C"/>
+    <w:lvl w:ilvl="0" w:tplc="8F1CC336">
       <w:start w:val="1"/>
-      <w:numFmt w:val="bullet"/>
-      <w:lvlText w:val="●"/>
+      <w:numFmt w:val="decimal"/>
+      <w:lvlText w:val="%1."/>
       <w:lvlJc w:val="left"/>
       <w:pPr>
-        <w:ind w:left="720" w:hanging="360"/>
-      </w:pPr>
+        <w:ind w:left="540" w:hanging="360"/>
+      </w:pPr>
+      <w:rPr>
+        <w:b/>
+        <w:bCs/>
+        <w:color w:val="E8620E"/>
+      </w:rPr>
     </w:lvl>
-    <w:lvl w:ilvl="1" w:tplc="2FB45784" w:tentative="1">
-      <w:start w:val="1"/>
-      <w:numFmt w:val="bullet"/>
-      <w:lvlText w:val="○"/>
+    <w:lvl w:ilvl="1" w:tplc="6C80D8B4">
+      <w:numFmt w:val="decimal"/>
+      <w:lvlText w:val=""/>
       <w:lvlJc w:val="left"/>
-      <w:pPr>
-        <w:ind w:left="1440" w:hanging="360"/>
-      </w:pPr>
     </w:lvl>
-    <w:lvl w:ilvl="2" w:tplc="F1CCBBDC" w:tentative="1">
-      <w:start w:val="1"/>
-      <w:numFmt w:val="bullet"/>
-      <w:lvlText w:val="■"/>
+    <w:lvl w:ilvl="2" w:tplc="1356486A">
+      <w:numFmt w:val="decimal"/>
+      <w:lvlText w:val=""/>
       <w:lvlJc w:val="left"/>
-      <w:pPr>
-        <w:ind w:left="2160" w:hanging="360"/>
-      </w:pPr>
     </w:lvl>
-    <w:lvl w:ilvl="3" w:tplc="7AD6D556" w:tentative="1">
-      <w:start w:val="1"/>
-      <w:numFmt w:val="bullet"/>
-      <w:lvlText w:val="●"/>
+    <w:lvl w:ilvl="3" w:tplc="6ED43F14">
+      <w:numFmt w:val="decimal"/>
+      <w:lvlText w:val=""/>
       <w:lvlJc w:val="left"/>
-      <w:pPr>
-        <w:ind w:left="2880" w:hanging="360"/>
-      </w:pPr>
     </w:lvl>
-    <w:lvl w:ilvl="4" w:tplc="EF28604A" w:tentative="1">
-      <w:start w:val="1"/>
-      <w:numFmt w:val="bullet"/>
-      <w:lvlText w:val="○"/>
+    <w:lvl w:ilvl="4" w:tplc="77EE7BE6">
+      <w:numFmt w:val="decimal"/>
+      <w:lvlText w:val=""/>
       <w:lvlJc w:val="left"/>
-      <w:pPr>
-        <w:ind w:left="3600" w:hanging="360"/>
-      </w:pPr>
     </w:lvl>
-    <w:lvl w:ilvl="5" w:tplc="8FAC4992" w:tentative="1">
-      <w:start w:val="1"/>
-      <w:numFmt w:val="bullet"/>
-      <w:lvlText w:val="■"/>
+    <w:lvl w:ilvl="5" w:tplc="B866CE1E">
+      <w:numFmt w:val="decimal"/>
+      <w:lvlText w:val=""/>
       <w:lvlJc w:val="left"/>
-      <w:pPr>
-        <w:ind w:left="4320" w:hanging="360"/>
-      </w:pPr>
     </w:lvl>
-    <w:lvl w:ilvl="6" w:tplc="B45CBDF6" w:tentative="1">
-      <w:start w:val="1"/>
-      <w:numFmt w:val="bullet"/>
-      <w:lvlText w:val="●"/>
+    <w:lvl w:ilvl="6" w:tplc="FA228A7C">
+      <w:numFmt w:val="decimal"/>
+      <w:lvlText w:val=""/>
       <w:lvlJc w:val="left"/>
-      <w:pPr>
-        <w:ind w:left="5040" w:hanging="360"/>
-      </w:pPr>
     </w:lvl>
-    <w:lvl w:ilvl="7" w:tplc="1BD28E58" w:tentative="1">
-      <w:start w:val="1"/>
-      <w:numFmt w:val="bullet"/>
-      <w:lvlText w:val="●"/>
+    <w:lvl w:ilvl="7" w:tplc="18D2739A">
+      <w:numFmt w:val="decimal"/>
+      <w:lvlText w:val=""/>
       <w:lvlJc w:val="left"/>
-      <w:pPr>
-        <w:ind w:left="5760" w:hanging="360"/>
-      </w:pPr>
     </w:lvl>
-    <w:lvl w:ilvl="8" w:tplc="6BF6570A" w:tentative="1">
-      <w:start w:val="1"/>
-      <w:numFmt w:val="bullet"/>
-      <w:lvlText w:val="●"/>
+    <w:lvl w:ilvl="8" w:tplc="711475BA">
+      <w:numFmt w:val="decimal"/>
+      <w:lvlText w:val=""/>
       <w:lvlJc w:val="left"/>
-      <w:pPr>
-        <w:ind w:left="6480" w:hanging="360"/>
-      </w:pPr>
     </w:lvl>
   </w:abstractNum>
   <w:abstractNum w:abstractNumId="1" w15:restartNumberingAfterBreak="0">
-    <w:nsid w:val="0ECB21D7"/>
+    <w:nsid w:val="3C461B1A"/>
     <w:multiLevelType w:val="hybridMultilevel"/>
-    <w:tmpl w:val="DD20D966"/>
-    <w:lvl w:ilvl="0" w:tplc="B47EC45A">
+    <w:tmpl w:val="AF54DE68"/>
+    <w:lvl w:ilvl="0" w:tplc="D7DEDA12">
       <w:start w:val="1"/>
       <w:numFmt w:val="bullet"/>
       <w:lvlText w:val="•"/>
@@ -9874,180 +10323,207 @@
         <w:ind w:left="540" w:hanging="270"/>
       </w:pPr>
     </w:lvl>
-    <w:lvl w:ilvl="1" w:tplc="4580961E">
+    <w:lvl w:ilvl="1" w:tplc="7EFC0E6C">
       <w:numFmt w:val="decimal"/>
       <w:lvlText w:val=""/>
       <w:lvlJc w:val="left"/>
     </w:lvl>
-    <w:lvl w:ilvl="2" w:tplc="7F08DD50">
+    <w:lvl w:ilvl="2" w:tplc="8766BA88">
       <w:numFmt w:val="decimal"/>
       <w:lvlText w:val=""/>
       <w:lvlJc w:val="left"/>
     </w:lvl>
-    <w:lvl w:ilvl="3" w:tplc="0422F214">
+    <w:lvl w:ilvl="3" w:tplc="ACE6A01C">
       <w:numFmt w:val="decimal"/>
       <w:lvlText w:val=""/>
       <w:lvlJc w:val="left"/>
     </w:lvl>
-    <w:lvl w:ilvl="4" w:tplc="8E2E2040">
+    <w:lvl w:ilvl="4" w:tplc="D7962E60">
       <w:numFmt w:val="decimal"/>
       <w:lvlText w:val=""/>
       <w:lvlJc w:val="left"/>
     </w:lvl>
-    <w:lvl w:ilvl="5" w:tplc="84A4F694">
+    <w:lvl w:ilvl="5" w:tplc="858A672A">
       <w:numFmt w:val="decimal"/>
       <w:lvlText w:val=""/>
       <w:lvlJc w:val="left"/>
     </w:lvl>
-    <w:lvl w:ilvl="6" w:tplc="0FCC5CA6">
+    <w:lvl w:ilvl="6" w:tplc="56DCCC5E">
       <w:numFmt w:val="decimal"/>
       <w:lvlText w:val=""/>
       <w:lvlJc w:val="left"/>
     </w:lvl>
-    <w:lvl w:ilvl="7" w:tplc="B6CA19F0">
+    <w:lvl w:ilvl="7" w:tplc="E8EC44DC">
       <w:numFmt w:val="decimal"/>
       <w:lvlText w:val=""/>
       <w:lvlJc w:val="left"/>
     </w:lvl>
-    <w:lvl w:ilvl="8" w:tplc="92CE7DCC">
+    <w:lvl w:ilvl="8" w:tplc="23CCC854">
       <w:numFmt w:val="decimal"/>
       <w:lvlText w:val=""/>
       <w:lvlJc w:val="left"/>
     </w:lvl>
   </w:abstractNum>
   <w:abstractNum w:abstractNumId="2" w15:restartNumberingAfterBreak="0">
-    <w:nsid w:val="110F21AD"/>
+    <w:nsid w:val="54A458E5"/>
     <w:multiLevelType w:val="hybridMultilevel"/>
-    <w:tmpl w:val="2F28649C"/>
-    <w:lvl w:ilvl="0" w:tplc="545CBEAA">
+    <w:tmpl w:val="3182D562"/>
+    <w:lvl w:ilvl="0" w:tplc="D1D69BCE" w:tentative="1">
       <w:start w:val="1"/>
-      <w:numFmt w:val="decimal"/>
-      <w:lvlText w:val="%1."/>
+      <w:numFmt w:val="bullet"/>
+      <w:lvlText w:val="●"/>
       <w:lvlJc w:val="left"/>
       <w:pPr>
-        <w:ind w:left="540" w:hanging="360"/>
-      </w:pPr>
-      <w:rPr>
-        <w:b/>
-        <w:bCs/>
-        <w:color w:val="E8620E"/>
-      </w:rPr>
+        <w:ind w:left="720" w:hanging="360"/>
+      </w:pPr>
     </w:lvl>
-    <w:lvl w:ilvl="1" w:tplc="1BF271D0">
-      <w:numFmt w:val="decimal"/>
-      <w:lvlText w:val=""/>
+    <w:lvl w:ilvl="1" w:tplc="A1023732" w:tentative="1">
+      <w:start w:val="1"/>
+      <w:numFmt w:val="bullet"/>
+      <w:lvlText w:val="○"/>
       <w:lvlJc w:val="left"/>
+      <w:pPr>
+        <w:ind w:left="1440" w:hanging="360"/>
+      </w:pPr>
     </w:lvl>
-    <w:lvl w:ilvl="2" w:tplc="A7608C0C">
-      <w:numFmt w:val="decimal"/>
-      <w:lvlText w:val=""/>
+    <w:lvl w:ilvl="2" w:tplc="E9B68480" w:tentative="1">
+      <w:start w:val="1"/>
+      <w:numFmt w:val="bullet"/>
+      <w:lvlText w:val="■"/>
       <w:lvlJc w:val="left"/>
+      <w:pPr>
+        <w:ind w:left="2160" w:hanging="360"/>
+      </w:pPr>
     </w:lvl>
-    <w:lvl w:ilvl="3" w:tplc="474C870E">
-      <w:numFmt w:val="decimal"/>
-      <w:lvlText w:val=""/>
+    <w:lvl w:ilvl="3" w:tplc="C87CC196" w:tentative="1">
+      <w:start w:val="1"/>
+      <w:numFmt w:val="bullet"/>
+      <w:lvlText w:val="●"/>
       <w:lvlJc w:val="left"/>
+      <w:pPr>
+        <w:ind w:left="2880" w:hanging="360"/>
+      </w:pPr>
     </w:lvl>
-    <w:lvl w:ilvl="4" w:tplc="9A2C08D0">
-      <w:numFmt w:val="decimal"/>
-      <w:lvlText w:val=""/>
+    <w:lvl w:ilvl="4" w:tplc="104A5618" w:tentative="1">
+      <w:start w:val="1"/>
+      <w:numFmt w:val="bullet"/>
+      <w:lvlText w:val="○"/>
       <w:lvlJc w:val="left"/>
+      <w:pPr>
+        <w:ind w:left="3600" w:hanging="360"/>
+      </w:pPr>
     </w:lvl>
-    <w:lvl w:ilvl="5" w:tplc="928EBC0E">
-      <w:numFmt w:val="decimal"/>
-      <w:lvlText w:val=""/>
+    <w:lvl w:ilvl="5" w:tplc="6D2EF0C0" w:tentative="1">
+      <w:start w:val="1"/>
+      <w:numFmt w:val="bullet"/>
+      <w:lvlText w:val="■"/>
       <w:lvlJc w:val="left"/>
+      <w:pPr>
+        <w:ind w:left="4320" w:hanging="360"/>
+      </w:pPr>
     </w:lvl>
-    <w:lvl w:ilvl="6" w:tplc="1010899A">
-      <w:numFmt w:val="decimal"/>
-      <w:lvlText w:val=""/>
+    <w:lvl w:ilvl="6" w:tplc="90CA0178" w:tentative="1">
+      <w:start w:val="1"/>
+      <w:numFmt w:val="bullet"/>
+      <w:lvlText w:val="●"/>
       <w:lvlJc w:val="left"/>
+      <w:pPr>
+        <w:ind w:left="5040" w:hanging="360"/>
+      </w:pPr>
     </w:lvl>
-    <w:lvl w:ilvl="7" w:tplc="7CC04A0A">
-      <w:numFmt w:val="decimal"/>
-      <w:lvlText w:val=""/>
+    <w:lvl w:ilvl="7" w:tplc="CB3C5C40" w:tentative="1">
+      <w:start w:val="1"/>
+      <w:numFmt w:val="bullet"/>
+      <w:lvlText w:val="●"/>
       <w:lvlJc w:val="left"/>
+      <w:pPr>
+        <w:ind w:left="5760" w:hanging="360"/>
+      </w:pPr>
     </w:lvl>
-    <w:lvl w:ilvl="8" w:tplc="D6D690C4">
-      <w:numFmt w:val="decimal"/>
-      <w:lvlText w:val=""/>
+    <w:lvl w:ilvl="8" w:tplc="7CE000E0" w:tentative="1">
+      <w:start w:val="1"/>
+      <w:numFmt w:val="bullet"/>
+      <w:lvlText w:val="●"/>
       <w:lvlJc w:val="left"/>
+      <w:pPr>
+        <w:ind w:left="6480" w:hanging="360"/>
+      </w:pPr>
     </w:lvl>
   </w:abstractNum>
-  <w:num w:numId="1" w16cid:durableId="1709447604">
+  <w:num w:numId="1" w16cid:durableId="1489980683">
+    <w:abstractNumId w:val="2"/>
+    <w:lvlOverride w:ilvl="0">
+      <w:startOverride w:val="1"/>
+    </w:lvlOverride>
+  </w:num>
+  <w:num w:numId="2" w16cid:durableId="1051418419">
+    <w:abstractNumId w:val="1"/>
+    <w:lvlOverride w:ilvl="0">
+      <w:startOverride w:val="1"/>
+    </w:lvlOverride>
+  </w:num>
+  <w:num w:numId="3" w16cid:durableId="1438676148">
     <w:abstractNumId w:val="0"/>
     <w:lvlOverride w:ilvl="0">
       <w:startOverride w:val="1"/>
     </w:lvlOverride>
   </w:num>
-  <w:num w:numId="2" w16cid:durableId="2063363255">
-    <w:abstractNumId w:val="1"/>
+  <w:num w:numId="4" w16cid:durableId="120998083">
+    <w:abstractNumId w:val="0"/>
     <w:lvlOverride w:ilvl="0">
       <w:startOverride w:val="1"/>
     </w:lvlOverride>
   </w:num>
-  <w:num w:numId="3" w16cid:durableId="1532574104">
-    <w:abstractNumId w:val="2"/>
+  <w:num w:numId="5" w16cid:durableId="2144351762">
+    <w:abstractNumId w:val="0"/>
     <w:lvlOverride w:ilvl="0">
       <w:startOverride w:val="1"/>
     </w:lvlOverride>
   </w:num>
-  <w:num w:numId="4" w16cid:durableId="1973124768">
-    <w:abstractNumId w:val="2"/>
+  <w:num w:numId="6" w16cid:durableId="954098888">
+    <w:abstractNumId w:val="0"/>
     <w:lvlOverride w:ilvl="0">
       <w:startOverride w:val="1"/>
     </w:lvlOverride>
   </w:num>
-  <w:num w:numId="5" w16cid:durableId="1806584889">
-    <w:abstractNumId w:val="2"/>
+  <w:num w:numId="7" w16cid:durableId="852458187">
+    <w:abstractNumId w:val="0"/>
     <w:lvlOverride w:ilvl="0">
       <w:startOverride w:val="1"/>
     </w:lvlOverride>
   </w:num>
-  <w:num w:numId="6" w16cid:durableId="494417919">
-    <w:abstractNumId w:val="2"/>
+  <w:num w:numId="8" w16cid:durableId="1817841570">
+    <w:abstractNumId w:val="0"/>
     <w:lvlOverride w:ilvl="0">
       <w:startOverride w:val="1"/>
     </w:lvlOverride>
   </w:num>
-  <w:num w:numId="7" w16cid:durableId="1299339350">
-    <w:abstractNumId w:val="2"/>
+  <w:num w:numId="9" w16cid:durableId="809712867">
+    <w:abstractNumId w:val="0"/>
     <w:lvlOverride w:ilvl="0">
       <w:startOverride w:val="1"/>
     </w:lvlOverride>
   </w:num>
-  <w:num w:numId="8" w16cid:durableId="946354575">
-    <w:abstractNumId w:val="2"/>
+  <w:num w:numId="10" w16cid:durableId="1397781054">
+    <w:abstractNumId w:val="0"/>
     <w:lvlOverride w:ilvl="0">
       <w:startOverride w:val="1"/>
     </w:lvlOverride>
   </w:num>
-  <w:num w:numId="9" w16cid:durableId="891622928">
-    <w:abstractNumId w:val="2"/>
+  <w:num w:numId="11" w16cid:durableId="1267736752">
+    <w:abstractNumId w:val="0"/>
     <w:lvlOverride w:ilvl="0">
       <w:startOverride w:val="1"/>
     </w:lvlOverride>
   </w:num>
-  <w:num w:numId="10" w16cid:durableId="675575932">
-    <w:abstractNumId w:val="2"/>
+  <w:num w:numId="12" w16cid:durableId="227344877">
+    <w:abstractNumId w:val="0"/>
     <w:lvlOverride w:ilvl="0">
       <w:startOverride w:val="1"/>
     </w:lvlOverride>
   </w:num>
-  <w:num w:numId="11" w16cid:durableId="136993908">
-    <w:abstractNumId w:val="2"/>
-    <w:lvlOverride w:ilvl="0">
-      <w:startOverride w:val="1"/>
-    </w:lvlOverride>
-  </w:num>
-  <w:num w:numId="12" w16cid:durableId="686832799">
-    <w:abstractNumId w:val="2"/>
-    <w:lvlOverride w:ilvl="0">
-      <w:startOverride w:val="1"/>
-    </w:lvlOverride>
-  </w:num>
-  <w:num w:numId="13" w16cid:durableId="299261858">
-    <w:abstractNumId w:val="2"/>
+  <w:num w:numId="13" w16cid:durableId="1983457438">
+    <w:abstractNumId w:val="0"/>
     <w:lvlOverride w:ilvl="0">
       <w:startOverride w:val="1"/>
     </w:lvlOverride>
@@ -10699,7 +11175,7 @@
     <w:autoRedefine/>
     <w:uiPriority w:val="39"/>
     <w:unhideWhenUsed/>
-    <w:rsid w:val="00DF5676"/>
+    <w:rsid w:val="00043BCC"/>
     <w:pPr>
       <w:spacing w:after="100"/>
     </w:pPr>
@@ -10711,7 +11187,7 @@
     <w:autoRedefine/>
     <w:uiPriority w:val="39"/>
     <w:unhideWhenUsed/>
-    <w:rsid w:val="00DF5676"/>
+    <w:rsid w:val="00043BCC"/>
     <w:pPr>
       <w:spacing w:after="100"/>
       <w:ind w:left="220"/>

</xml_diff>

<commit_message>
Find a vehicle search in the office header (any stage, finished jobs too); manual v1.9
Co-Authored-By: Claude Opus 5.5 <noreply@anthropic.com>
</commit_message>
<xml_diff>
--- a/client/manual/ShopControl-User-Manual.docx
+++ b/client/manual/ShopControl-User-Manual.docx
@@ -16,7 +16,7 @@
           <w:noProof/>
         </w:rPr>
         <w:drawing>
-          <wp:inline distT="0" distB="0" distL="0" distR="0" wp14:anchorId="082A2B82" wp14:editId="082A2B83">
+          <wp:inline distT="0" distB="0" distL="0" distR="0" wp14:anchorId="246F0BD3" wp14:editId="246F0BD4">
             <wp:extent cx="4000500" cy="1485900"/>
             <wp:effectExtent l="0" t="0" r="0" b="0"/>
             <wp:docPr id="1" name="Picture 1"/>
@@ -93,7 +93,7 @@
         <w:rPr>
           <w:color w:val="5B6776"/>
         </w:rPr>
-        <w:t>Version 1.8  ·  Updated September 28, 2026</w:t>
+        <w:t>Version 1.9  ·  Updated September 28, 2026</w:t>
       </w:r>
     </w:p>
     <w:p>
@@ -122,7 +122,7 @@
     <w:sdt>
       <w:sdtPr>
         <w:alias w:val="Contents"/>
-        <w:id w:val="-1808000580"/>
+        <w:id w:val="-226385353"/>
       </w:sdtPr>
       <w:sdtEndPr/>
       <w:sdtContent>
@@ -151,7 +151,7 @@
           <w:r>
             <w:fldChar w:fldCharType="separate"/>
           </w:r>
-          <w:hyperlink w:anchor="_Toc241511950" w:history="1">
+          <w:hyperlink w:anchor="_Toc241512311" w:history="1">
             <w:r>
               <w:rPr>
                 <w:rStyle w:val="Hyperlink"/>
@@ -175,7 +175,7 @@
               <w:rPr>
                 <w:noProof/>
               </w:rPr>
-              <w:instrText xml:space="preserve"> PAGEREF _Toc241511950 \h </w:instrText>
+              <w:instrText xml:space="preserve"> PAGEREF _Toc241512311 \h </w:instrText>
             </w:r>
             <w:r>
               <w:rPr>
@@ -218,7 +218,7 @@
               <w14:ligatures w14:val="standardContextual"/>
             </w:rPr>
           </w:pPr>
-          <w:hyperlink w:anchor="_Toc241511951" w:history="1">
+          <w:hyperlink w:anchor="_Toc241512312" w:history="1">
             <w:r>
               <w:rPr>
                 <w:rStyle w:val="Hyperlink"/>
@@ -242,7 +242,7 @@
               <w:rPr>
                 <w:noProof/>
               </w:rPr>
-              <w:instrText xml:space="preserve"> PAGEREF _Toc241511951 \h </w:instrText>
+              <w:instrText xml:space="preserve"> PAGEREF _Toc241512312 \h </w:instrText>
             </w:r>
             <w:r>
               <w:rPr>
@@ -285,7 +285,7 @@
               <w14:ligatures w14:val="standardContextual"/>
             </w:rPr>
           </w:pPr>
-          <w:hyperlink w:anchor="_Toc241511952" w:history="1">
+          <w:hyperlink w:anchor="_Toc241512313" w:history="1">
             <w:r>
               <w:rPr>
                 <w:rStyle w:val="Hyperlink"/>
@@ -309,7 +309,7 @@
               <w:rPr>
                 <w:noProof/>
               </w:rPr>
-              <w:instrText xml:space="preserve"> PAGEREF _Toc241511952 \h </w:instrText>
+              <w:instrText xml:space="preserve"> PAGEREF _Toc241512313 \h </w:instrText>
             </w:r>
             <w:r>
               <w:rPr>
@@ -352,7 +352,7 @@
               <w14:ligatures w14:val="standardContextual"/>
             </w:rPr>
           </w:pPr>
-          <w:hyperlink w:anchor="_Toc241511953" w:history="1">
+          <w:hyperlink w:anchor="_Toc241512314" w:history="1">
             <w:r>
               <w:rPr>
                 <w:rStyle w:val="Hyperlink"/>
@@ -376,7 +376,7 @@
               <w:rPr>
                 <w:noProof/>
               </w:rPr>
-              <w:instrText xml:space="preserve"> PAGEREF _Toc241511953 \h </w:instrText>
+              <w:instrText xml:space="preserve"> PAGEREF _Toc241512314 \h </w:instrText>
             </w:r>
             <w:r>
               <w:rPr>
@@ -419,7 +419,7 @@
               <w14:ligatures w14:val="standardContextual"/>
             </w:rPr>
           </w:pPr>
-          <w:hyperlink w:anchor="_Toc241511954" w:history="1">
+          <w:hyperlink w:anchor="_Toc241512315" w:history="1">
             <w:r>
               <w:rPr>
                 <w:rStyle w:val="Hyperlink"/>
@@ -443,7 +443,7 @@
               <w:rPr>
                 <w:noProof/>
               </w:rPr>
-              <w:instrText xml:space="preserve"> PAGEREF _Toc241511954 \h </w:instrText>
+              <w:instrText xml:space="preserve"> PAGEREF _Toc241512315 \h </w:instrText>
             </w:r>
             <w:r>
               <w:rPr>
@@ -486,7 +486,7 @@
               <w14:ligatures w14:val="standardContextual"/>
             </w:rPr>
           </w:pPr>
-          <w:hyperlink w:anchor="_Toc241511955" w:history="1">
+          <w:hyperlink w:anchor="_Toc241512316" w:history="1">
             <w:r>
               <w:rPr>
                 <w:rStyle w:val="Hyperlink"/>
@@ -510,7 +510,7 @@
               <w:rPr>
                 <w:noProof/>
               </w:rPr>
-              <w:instrText xml:space="preserve"> PAGEREF _Toc241511955 \h </w:instrText>
+              <w:instrText xml:space="preserve"> PAGEREF _Toc241512316 \h </w:instrText>
             </w:r>
             <w:r>
               <w:rPr>
@@ -553,7 +553,7 @@
               <w14:ligatures w14:val="standardContextual"/>
             </w:rPr>
           </w:pPr>
-          <w:hyperlink w:anchor="_Toc241511956" w:history="1">
+          <w:hyperlink w:anchor="_Toc241512317" w:history="1">
             <w:r>
               <w:rPr>
                 <w:rStyle w:val="Hyperlink"/>
@@ -577,7 +577,7 @@
               <w:rPr>
                 <w:noProof/>
               </w:rPr>
-              <w:instrText xml:space="preserve"> PAGEREF _Toc241511956 \h </w:instrText>
+              <w:instrText xml:space="preserve"> PAGEREF _Toc241512317 \h </w:instrText>
             </w:r>
             <w:r>
               <w:rPr>
@@ -620,7 +620,7 @@
               <w14:ligatures w14:val="standardContextual"/>
             </w:rPr>
           </w:pPr>
-          <w:hyperlink w:anchor="_Toc241511957" w:history="1">
+          <w:hyperlink w:anchor="_Toc241512318" w:history="1">
             <w:r>
               <w:rPr>
                 <w:rStyle w:val="Hyperlink"/>
@@ -644,7 +644,7 @@
               <w:rPr>
                 <w:noProof/>
               </w:rPr>
-              <w:instrText xml:space="preserve"> PAGEREF _Toc241511957 \h </w:instrText>
+              <w:instrText xml:space="preserve"> PAGEREF _Toc241512318 \h </w:instrText>
             </w:r>
             <w:r>
               <w:rPr>
@@ -687,7 +687,7 @@
               <w14:ligatures w14:val="standardContextual"/>
             </w:rPr>
           </w:pPr>
-          <w:hyperlink w:anchor="_Toc241511958" w:history="1">
+          <w:hyperlink w:anchor="_Toc241512319" w:history="1">
             <w:r>
               <w:rPr>
                 <w:rStyle w:val="Hyperlink"/>
@@ -711,7 +711,7 @@
               <w:rPr>
                 <w:noProof/>
               </w:rPr>
-              <w:instrText xml:space="preserve"> PAGEREF _Toc241511958 \h </w:instrText>
+              <w:instrText xml:space="preserve"> PAGEREF _Toc241512319 \h </w:instrText>
             </w:r>
             <w:r>
               <w:rPr>
@@ -754,7 +754,7 @@
               <w14:ligatures w14:val="standardContextual"/>
             </w:rPr>
           </w:pPr>
-          <w:hyperlink w:anchor="_Toc241511959" w:history="1">
+          <w:hyperlink w:anchor="_Toc241512320" w:history="1">
             <w:r>
               <w:rPr>
                 <w:rStyle w:val="Hyperlink"/>
@@ -778,7 +778,7 @@
               <w:rPr>
                 <w:noProof/>
               </w:rPr>
-              <w:instrText xml:space="preserve"> PAGEREF _Toc241511959 \h </w:instrText>
+              <w:instrText xml:space="preserve"> PAGEREF _Toc241512320 \h </w:instrText>
             </w:r>
             <w:r>
               <w:rPr>
@@ -821,7 +821,7 @@
               <w14:ligatures w14:val="standardContextual"/>
             </w:rPr>
           </w:pPr>
-          <w:hyperlink w:anchor="_Toc241511960" w:history="1">
+          <w:hyperlink w:anchor="_Toc241512321" w:history="1">
             <w:r>
               <w:rPr>
                 <w:rStyle w:val="Hyperlink"/>
@@ -845,7 +845,7 @@
               <w:rPr>
                 <w:noProof/>
               </w:rPr>
-              <w:instrText xml:space="preserve"> PAGEREF _Toc241511960 \h </w:instrText>
+              <w:instrText xml:space="preserve"> PAGEREF _Toc241512321 \h </w:instrText>
             </w:r>
             <w:r>
               <w:rPr>
@@ -888,7 +888,7 @@
               <w14:ligatures w14:val="standardContextual"/>
             </w:rPr>
           </w:pPr>
-          <w:hyperlink w:anchor="_Toc241511961" w:history="1">
+          <w:hyperlink w:anchor="_Toc241512322" w:history="1">
             <w:r>
               <w:rPr>
                 <w:rStyle w:val="Hyperlink"/>
@@ -912,7 +912,7 @@
               <w:rPr>
                 <w:noProof/>
               </w:rPr>
-              <w:instrText xml:space="preserve"> PAGEREF _Toc241511961 \h </w:instrText>
+              <w:instrText xml:space="preserve"> PAGEREF _Toc241512322 \h </w:instrText>
             </w:r>
             <w:r>
               <w:rPr>
@@ -955,7 +955,7 @@
               <w14:ligatures w14:val="standardContextual"/>
             </w:rPr>
           </w:pPr>
-          <w:hyperlink w:anchor="_Toc241511962" w:history="1">
+          <w:hyperlink w:anchor="_Toc241512323" w:history="1">
             <w:r>
               <w:rPr>
                 <w:rStyle w:val="Hyperlink"/>
@@ -979,7 +979,7 @@
               <w:rPr>
                 <w:noProof/>
               </w:rPr>
-              <w:instrText xml:space="preserve"> PAGEREF _Toc241511962 \h </w:instrText>
+              <w:instrText xml:space="preserve"> PAGEREF _Toc241512323 \h </w:instrText>
             </w:r>
             <w:r>
               <w:rPr>
@@ -1022,7 +1022,7 @@
               <w14:ligatures w14:val="standardContextual"/>
             </w:rPr>
           </w:pPr>
-          <w:hyperlink w:anchor="_Toc241511963" w:history="1">
+          <w:hyperlink w:anchor="_Toc241512324" w:history="1">
             <w:r>
               <w:rPr>
                 <w:rStyle w:val="Hyperlink"/>
@@ -1046,7 +1046,7 @@
               <w:rPr>
                 <w:noProof/>
               </w:rPr>
-              <w:instrText xml:space="preserve"> PAGEREF _Toc241511963 \h </w:instrText>
+              <w:instrText xml:space="preserve"> PAGEREF _Toc241512324 \h </w:instrText>
             </w:r>
             <w:r>
               <w:rPr>
@@ -1089,7 +1089,7 @@
               <w14:ligatures w14:val="standardContextual"/>
             </w:rPr>
           </w:pPr>
-          <w:hyperlink w:anchor="_Toc241511964" w:history="1">
+          <w:hyperlink w:anchor="_Toc241512325" w:history="1">
             <w:r>
               <w:rPr>
                 <w:rStyle w:val="Hyperlink"/>
@@ -1113,7 +1113,7 @@
               <w:rPr>
                 <w:noProof/>
               </w:rPr>
-              <w:instrText xml:space="preserve"> PAGEREF _Toc241511964 \h </w:instrText>
+              <w:instrText xml:space="preserve"> PAGEREF _Toc241512325 \h </w:instrText>
             </w:r>
             <w:r>
               <w:rPr>
@@ -1156,7 +1156,7 @@
               <w14:ligatures w14:val="standardContextual"/>
             </w:rPr>
           </w:pPr>
-          <w:hyperlink w:anchor="_Toc241511965" w:history="1">
+          <w:hyperlink w:anchor="_Toc241512326" w:history="1">
             <w:r>
               <w:rPr>
                 <w:rStyle w:val="Hyperlink"/>
@@ -1180,7 +1180,7 @@
               <w:rPr>
                 <w:noProof/>
               </w:rPr>
-              <w:instrText xml:space="preserve"> PAGEREF _Toc241511965 \h </w:instrText>
+              <w:instrText xml:space="preserve"> PAGEREF _Toc241512326 \h </w:instrText>
             </w:r>
             <w:r>
               <w:rPr>
@@ -1223,7 +1223,7 @@
               <w14:ligatures w14:val="standardContextual"/>
             </w:rPr>
           </w:pPr>
-          <w:hyperlink w:anchor="_Toc241511966" w:history="1">
+          <w:hyperlink w:anchor="_Toc241512327" w:history="1">
             <w:r>
               <w:rPr>
                 <w:rStyle w:val="Hyperlink"/>
@@ -1247,7 +1247,7 @@
               <w:rPr>
                 <w:noProof/>
               </w:rPr>
-              <w:instrText xml:space="preserve"> PAGEREF _Toc241511966 \h </w:instrText>
+              <w:instrText xml:space="preserve"> PAGEREF _Toc241512327 \h </w:instrText>
             </w:r>
             <w:r>
               <w:rPr>
@@ -1290,7 +1290,7 @@
               <w14:ligatures w14:val="standardContextual"/>
             </w:rPr>
           </w:pPr>
-          <w:hyperlink w:anchor="_Toc241511967" w:history="1">
+          <w:hyperlink w:anchor="_Toc241512328" w:history="1">
             <w:r>
               <w:rPr>
                 <w:rStyle w:val="Hyperlink"/>
@@ -1314,7 +1314,7 @@
               <w:rPr>
                 <w:noProof/>
               </w:rPr>
-              <w:instrText xml:space="preserve"> PAGEREF _Toc241511967 \h </w:instrText>
+              <w:instrText xml:space="preserve"> PAGEREF _Toc241512328 \h </w:instrText>
             </w:r>
             <w:r>
               <w:rPr>
@@ -1357,13 +1357,13 @@
               <w14:ligatures w14:val="standardContextual"/>
             </w:rPr>
           </w:pPr>
-          <w:hyperlink w:anchor="_Toc241511968" w:history="1">
+          <w:hyperlink w:anchor="_Toc241512329" w:history="1">
             <w:r>
               <w:rPr>
                 <w:rStyle w:val="Hyperlink"/>
                 <w:noProof/>
               </w:rPr>
-              <w:t>4.  Dashboard</w:t>
+              <w:t>4.  Finding a vehicle</w:t>
             </w:r>
             <w:r>
               <w:rPr>
@@ -1381,7 +1381,7 @@
               <w:rPr>
                 <w:noProof/>
               </w:rPr>
-              <w:instrText xml:space="preserve"> PAGEREF _Toc241511968 \h </w:instrText>
+              <w:instrText xml:space="preserve"> PAGEREF _Toc241512329 \h </w:instrText>
             </w:r>
             <w:r>
               <w:rPr>
@@ -1424,13 +1424,13 @@
               <w14:ligatures w14:val="standardContextual"/>
             </w:rPr>
           </w:pPr>
-          <w:hyperlink w:anchor="_Toc241511969" w:history="1">
+          <w:hyperlink w:anchor="_Toc241512330" w:history="1">
             <w:r>
               <w:rPr>
                 <w:rStyle w:val="Hyperlink"/>
                 <w:noProof/>
               </w:rPr>
-              <w:t>5.  Jobs and the Daily GO List</w:t>
+              <w:t>5.  Dashboard</w:t>
             </w:r>
             <w:r>
               <w:rPr>
@@ -1448,7 +1448,7 @@
               <w:rPr>
                 <w:noProof/>
               </w:rPr>
-              <w:instrText xml:space="preserve"> PAGEREF _Toc241511969 \h </w:instrText>
+              <w:instrText xml:space="preserve"> PAGEREF _Toc241512330 \h </w:instrText>
             </w:r>
             <w:r>
               <w:rPr>
@@ -1466,6 +1466,73 @@
                 <w:noProof/>
               </w:rPr>
               <w:t>10</w:t>
+            </w:r>
+            <w:r>
+              <w:rPr>
+                <w:noProof/>
+              </w:rPr>
+              <w:fldChar w:fldCharType="end"/>
+            </w:r>
+          </w:hyperlink>
+        </w:p>
+        <w:p>
+          <w:pPr>
+            <w:pStyle w:val="TOC1"/>
+            <w:tabs>
+              <w:tab w:val="right" w:leader="dot" w:pos="9350"/>
+            </w:tabs>
+            <w:rPr>
+              <w:rFonts w:asciiTheme="minorHAnsi" w:eastAsiaTheme="minorEastAsia" w:hAnsiTheme="minorHAnsi" w:cstheme="minorBidi"/>
+              <w:noProof/>
+              <w:color w:val="auto"/>
+              <w:kern w:val="2"/>
+              <w:sz w:val="24"/>
+              <w:szCs w:val="24"/>
+              <w14:ligatures w14:val="standardContextual"/>
+            </w:rPr>
+          </w:pPr>
+          <w:hyperlink w:anchor="_Toc241512331" w:history="1">
+            <w:r>
+              <w:rPr>
+                <w:rStyle w:val="Hyperlink"/>
+                <w:noProof/>
+              </w:rPr>
+              <w:t>6.  Jobs and the Daily GO List</w:t>
+            </w:r>
+            <w:r>
+              <w:rPr>
+                <w:noProof/>
+              </w:rPr>
+              <w:tab/>
+            </w:r>
+            <w:r>
+              <w:rPr>
+                <w:noProof/>
+              </w:rPr>
+              <w:fldChar w:fldCharType="begin"/>
+            </w:r>
+            <w:r>
+              <w:rPr>
+                <w:noProof/>
+              </w:rPr>
+              <w:instrText xml:space="preserve"> PAGEREF _Toc241512331 \h </w:instrText>
+            </w:r>
+            <w:r>
+              <w:rPr>
+                <w:noProof/>
+              </w:rPr>
+            </w:r>
+            <w:r>
+              <w:rPr>
+                <w:noProof/>
+              </w:rPr>
+              <w:fldChar w:fldCharType="separate"/>
+            </w:r>
+            <w:r>
+              <w:rPr>
+                <w:noProof/>
+              </w:rPr>
+              <w:t>11</w:t>
             </w:r>
             <w:r>
               <w:rPr>
@@ -1491,7 +1558,7 @@
               <w14:ligatures w14:val="standardContextual"/>
             </w:rPr>
           </w:pPr>
-          <w:hyperlink w:anchor="_Toc241511970" w:history="1">
+          <w:hyperlink w:anchor="_Toc241512332" w:history="1">
             <w:r>
               <w:rPr>
                 <w:rStyle w:val="Hyperlink"/>
@@ -1515,7 +1582,7 @@
               <w:rPr>
                 <w:noProof/>
               </w:rPr>
-              <w:instrText xml:space="preserve"> PAGEREF _Toc241511970 \h </w:instrText>
+              <w:instrText xml:space="preserve"> PAGEREF _Toc241512332 \h </w:instrText>
             </w:r>
             <w:r>
               <w:rPr>
@@ -1532,7 +1599,7 @@
               <w:rPr>
                 <w:noProof/>
               </w:rPr>
-              <w:t>10</w:t>
+              <w:t>11</w:t>
             </w:r>
             <w:r>
               <w:rPr>
@@ -1558,7 +1625,7 @@
               <w14:ligatures w14:val="standardContextual"/>
             </w:rPr>
           </w:pPr>
-          <w:hyperlink w:anchor="_Toc241511971" w:history="1">
+          <w:hyperlink w:anchor="_Toc241512333" w:history="1">
             <w:r>
               <w:rPr>
                 <w:rStyle w:val="Hyperlink"/>
@@ -1582,7 +1649,7 @@
               <w:rPr>
                 <w:noProof/>
               </w:rPr>
-              <w:instrText xml:space="preserve"> PAGEREF _Toc241511971 \h </w:instrText>
+              <w:instrText xml:space="preserve"> PAGEREF _Toc241512333 \h </w:instrText>
             </w:r>
             <w:r>
               <w:rPr>
@@ -1599,7 +1666,7 @@
               <w:rPr>
                 <w:noProof/>
               </w:rPr>
-              <w:t>10</w:t>
+              <w:t>11</w:t>
             </w:r>
             <w:r>
               <w:rPr>
@@ -1625,7 +1692,7 @@
               <w14:ligatures w14:val="standardContextual"/>
             </w:rPr>
           </w:pPr>
-          <w:hyperlink w:anchor="_Toc241511972" w:history="1">
+          <w:hyperlink w:anchor="_Toc241512334" w:history="1">
             <w:r>
               <w:rPr>
                 <w:rStyle w:val="Hyperlink"/>
@@ -1649,7 +1716,7 @@
               <w:rPr>
                 <w:noProof/>
               </w:rPr>
-              <w:instrText xml:space="preserve"> PAGEREF _Toc241511972 \h </w:instrText>
+              <w:instrText xml:space="preserve"> PAGEREF _Toc241512334 \h </w:instrText>
             </w:r>
             <w:r>
               <w:rPr>
@@ -1666,7 +1733,7 @@
               <w:rPr>
                 <w:noProof/>
               </w:rPr>
-              <w:t>10</w:t>
+              <w:t>11</w:t>
             </w:r>
             <w:r>
               <w:rPr>
@@ -1692,13 +1759,13 @@
               <w14:ligatures w14:val="standardContextual"/>
             </w:rPr>
           </w:pPr>
-          <w:hyperlink w:anchor="_Toc241511973" w:history="1">
+          <w:hyperlink w:anchor="_Toc241512335" w:history="1">
             <w:r>
               <w:rPr>
                 <w:rStyle w:val="Hyperlink"/>
                 <w:noProof/>
               </w:rPr>
-              <w:t>6.  Production, Delivery and Planning boards</w:t>
+              <w:t>7.  Production, Delivery and Planning boards</w:t>
             </w:r>
             <w:r>
               <w:rPr>
@@ -1716,7 +1783,7 @@
               <w:rPr>
                 <w:noProof/>
               </w:rPr>
-              <w:instrText xml:space="preserve"> PAGEREF _Toc241511973 \h </w:instrText>
+              <w:instrText xml:space="preserve"> PAGEREF _Toc241512335 \h </w:instrText>
             </w:r>
             <w:r>
               <w:rPr>
@@ -1733,7 +1800,7 @@
               <w:rPr>
                 <w:noProof/>
               </w:rPr>
-              <w:t>11</w:t>
+              <w:t>12</w:t>
             </w:r>
             <w:r>
               <w:rPr>
@@ -1759,7 +1826,7 @@
               <w14:ligatures w14:val="standardContextual"/>
             </w:rPr>
           </w:pPr>
-          <w:hyperlink w:anchor="_Toc241511974" w:history="1">
+          <w:hyperlink w:anchor="_Toc241512336" w:history="1">
             <w:r>
               <w:rPr>
                 <w:rStyle w:val="Hyperlink"/>
@@ -1783,7 +1850,7 @@
               <w:rPr>
                 <w:noProof/>
               </w:rPr>
-              <w:instrText xml:space="preserve"> PAGEREF _Toc241511974 \h </w:instrText>
+              <w:instrText xml:space="preserve"> PAGEREF _Toc241512336 \h </w:instrText>
             </w:r>
             <w:r>
               <w:rPr>
@@ -1800,7 +1867,7 @@
               <w:rPr>
                 <w:noProof/>
               </w:rPr>
-              <w:t>11</w:t>
+              <w:t>12</w:t>
             </w:r>
             <w:r>
               <w:rPr>
@@ -1826,7 +1893,7 @@
               <w14:ligatures w14:val="standardContextual"/>
             </w:rPr>
           </w:pPr>
-          <w:hyperlink w:anchor="_Toc241511975" w:history="1">
+          <w:hyperlink w:anchor="_Toc241512337" w:history="1">
             <w:r>
               <w:rPr>
                 <w:rStyle w:val="Hyperlink"/>
@@ -1850,7 +1917,7 @@
               <w:rPr>
                 <w:noProof/>
               </w:rPr>
-              <w:instrText xml:space="preserve"> PAGEREF _Toc241511975 \h </w:instrText>
+              <w:instrText xml:space="preserve"> PAGEREF _Toc241512337 \h </w:instrText>
             </w:r>
             <w:r>
               <w:rPr>
@@ -1867,7 +1934,7 @@
               <w:rPr>
                 <w:noProof/>
               </w:rPr>
-              <w:t>11</w:t>
+              <w:t>12</w:t>
             </w:r>
             <w:r>
               <w:rPr>
@@ -1893,7 +1960,7 @@
               <w14:ligatures w14:val="standardContextual"/>
             </w:rPr>
           </w:pPr>
-          <w:hyperlink w:anchor="_Toc241511976" w:history="1">
+          <w:hyperlink w:anchor="_Toc241512338" w:history="1">
             <w:r>
               <w:rPr>
                 <w:rStyle w:val="Hyperlink"/>
@@ -1917,7 +1984,7 @@
               <w:rPr>
                 <w:noProof/>
               </w:rPr>
-              <w:instrText xml:space="preserve"> PAGEREF _Toc241511976 \h </w:instrText>
+              <w:instrText xml:space="preserve"> PAGEREF _Toc241512338 \h </w:instrText>
             </w:r>
             <w:r>
               <w:rPr>
@@ -1934,7 +2001,7 @@
               <w:rPr>
                 <w:noProof/>
               </w:rPr>
-              <w:t>11</w:t>
+              <w:t>12</w:t>
             </w:r>
             <w:r>
               <w:rPr>
@@ -1960,7 +2027,7 @@
               <w14:ligatures w14:val="standardContextual"/>
             </w:rPr>
           </w:pPr>
-          <w:hyperlink w:anchor="_Toc241511977" w:history="1">
+          <w:hyperlink w:anchor="_Toc241512339" w:history="1">
             <w:r>
               <w:rPr>
                 <w:rStyle w:val="Hyperlink"/>
@@ -1984,7 +2051,7 @@
               <w:rPr>
                 <w:noProof/>
               </w:rPr>
-              <w:instrText xml:space="preserve"> PAGEREF _Toc241511977 \h </w:instrText>
+              <w:instrText xml:space="preserve"> PAGEREF _Toc241512339 \h </w:instrText>
             </w:r>
             <w:r>
               <w:rPr>
@@ -2001,7 +2068,7 @@
               <w:rPr>
                 <w:noProof/>
               </w:rPr>
-              <w:t>11</w:t>
+              <w:t>12</w:t>
             </w:r>
             <w:r>
               <w:rPr>
@@ -2027,13 +2094,13 @@
               <w14:ligatures w14:val="standardContextual"/>
             </w:rPr>
           </w:pPr>
-          <w:hyperlink w:anchor="_Toc241511978" w:history="1">
+          <w:hyperlink w:anchor="_Toc241512340" w:history="1">
             <w:r>
               <w:rPr>
                 <w:rStyle w:val="Hyperlink"/>
                 <w:noProof/>
               </w:rPr>
-              <w:t>7.  CCC estimates coming into ShopControl</w:t>
+              <w:t>8.  CCC estimates coming into ShopControl</w:t>
             </w:r>
             <w:r>
               <w:rPr>
@@ -2051,7 +2118,7 @@
               <w:rPr>
                 <w:noProof/>
               </w:rPr>
-              <w:instrText xml:space="preserve"> PAGEREF _Toc241511978 \h </w:instrText>
+              <w:instrText xml:space="preserve"> PAGEREF _Toc241512340 \h </w:instrText>
             </w:r>
             <w:r>
               <w:rPr>
@@ -2068,7 +2135,7 @@
               <w:rPr>
                 <w:noProof/>
               </w:rPr>
-              <w:t>12</w:t>
+              <w:t>13</w:t>
             </w:r>
             <w:r>
               <w:rPr>
@@ -2094,13 +2161,13 @@
               <w14:ligatures w14:val="standardContextual"/>
             </w:rPr>
           </w:pPr>
-          <w:hyperlink w:anchor="_Toc241511979" w:history="1">
+          <w:hyperlink w:anchor="_Toc241512341" w:history="1">
             <w:r>
               <w:rPr>
                 <w:rStyle w:val="Hyperlink"/>
                 <w:noProof/>
               </w:rPr>
-              <w:t>8.  Parts</w:t>
+              <w:t>9.  Parts</w:t>
             </w:r>
             <w:r>
               <w:rPr>
@@ -2118,7 +2185,7 @@
               <w:rPr>
                 <w:noProof/>
               </w:rPr>
-              <w:instrText xml:space="preserve"> PAGEREF _Toc241511979 \h </w:instrText>
+              <w:instrText xml:space="preserve"> PAGEREF _Toc241512341 \h </w:instrText>
             </w:r>
             <w:r>
               <w:rPr>
@@ -2135,7 +2202,7 @@
               <w:rPr>
                 <w:noProof/>
               </w:rPr>
-              <w:t>13</w:t>
+              <w:t>14</w:t>
             </w:r>
             <w:r>
               <w:rPr>
@@ -2161,7 +2228,7 @@
               <w14:ligatures w14:val="standardContextual"/>
             </w:rPr>
           </w:pPr>
-          <w:hyperlink w:anchor="_Toc241511980" w:history="1">
+          <w:hyperlink w:anchor="_Toc241512342" w:history="1">
             <w:r>
               <w:rPr>
                 <w:rStyle w:val="Hyperlink"/>
@@ -2185,7 +2252,7 @@
               <w:rPr>
                 <w:noProof/>
               </w:rPr>
-              <w:instrText xml:space="preserve"> PAGEREF _Toc241511980 \h </w:instrText>
+              <w:instrText xml:space="preserve"> PAGEREF _Toc241512342 \h </w:instrText>
             </w:r>
             <w:r>
               <w:rPr>
@@ -2202,7 +2269,7 @@
               <w:rPr>
                 <w:noProof/>
               </w:rPr>
-              <w:t>13</w:t>
+              <w:t>14</w:t>
             </w:r>
             <w:r>
               <w:rPr>
@@ -2228,7 +2295,7 @@
               <w14:ligatures w14:val="standardContextual"/>
             </w:rPr>
           </w:pPr>
-          <w:hyperlink w:anchor="_Toc241511981" w:history="1">
+          <w:hyperlink w:anchor="_Toc241512343" w:history="1">
             <w:r>
               <w:rPr>
                 <w:rStyle w:val="Hyperlink"/>
@@ -2252,7 +2319,7 @@
               <w:rPr>
                 <w:noProof/>
               </w:rPr>
-              <w:instrText xml:space="preserve"> PAGEREF _Toc241511981 \h </w:instrText>
+              <w:instrText xml:space="preserve"> PAGEREF _Toc241512343 \h </w:instrText>
             </w:r>
             <w:r>
               <w:rPr>
@@ -2269,7 +2336,7 @@
               <w:rPr>
                 <w:noProof/>
               </w:rPr>
-              <w:t>13</w:t>
+              <w:t>14</w:t>
             </w:r>
             <w:r>
               <w:rPr>
@@ -2295,7 +2362,7 @@
               <w14:ligatures w14:val="standardContextual"/>
             </w:rPr>
           </w:pPr>
-          <w:hyperlink w:anchor="_Toc241511982" w:history="1">
+          <w:hyperlink w:anchor="_Toc241512344" w:history="1">
             <w:r>
               <w:rPr>
                 <w:rStyle w:val="Hyperlink"/>
@@ -2319,7 +2386,7 @@
               <w:rPr>
                 <w:noProof/>
               </w:rPr>
-              <w:instrText xml:space="preserve"> PAGEREF _Toc241511982 \h </w:instrText>
+              <w:instrText xml:space="preserve"> PAGEREF _Toc241512344 \h </w:instrText>
             </w:r>
             <w:r>
               <w:rPr>
@@ -2336,7 +2403,7 @@
               <w:rPr>
                 <w:noProof/>
               </w:rPr>
-              <w:t>13</w:t>
+              <w:t>14</w:t>
             </w:r>
             <w:r>
               <w:rPr>
@@ -2362,7 +2429,7 @@
               <w14:ligatures w14:val="standardContextual"/>
             </w:rPr>
           </w:pPr>
-          <w:hyperlink w:anchor="_Toc241511983" w:history="1">
+          <w:hyperlink w:anchor="_Toc241512345" w:history="1">
             <w:r>
               <w:rPr>
                 <w:rStyle w:val="Hyperlink"/>
@@ -2386,7 +2453,7 @@
               <w:rPr>
                 <w:noProof/>
               </w:rPr>
-              <w:instrText xml:space="preserve"> PAGEREF _Toc241511983 \h </w:instrText>
+              <w:instrText xml:space="preserve"> PAGEREF _Toc241512345 \h </w:instrText>
             </w:r>
             <w:r>
               <w:rPr>
@@ -2403,7 +2470,7 @@
               <w:rPr>
                 <w:noProof/>
               </w:rPr>
-              <w:t>13</w:t>
+              <w:t>14</w:t>
             </w:r>
             <w:r>
               <w:rPr>
@@ -2429,13 +2496,13 @@
               <w14:ligatures w14:val="standardContextual"/>
             </w:rPr>
           </w:pPr>
-          <w:hyperlink w:anchor="_Toc241511984" w:history="1">
+          <w:hyperlink w:anchor="_Toc241512346" w:history="1">
             <w:r>
               <w:rPr>
                 <w:rStyle w:val="Hyperlink"/>
                 <w:noProof/>
               </w:rPr>
-              <w:t>9.  Vehicle QC (office view)</w:t>
+              <w:t>10.  Vehicle QC (office view)</w:t>
             </w:r>
             <w:r>
               <w:rPr>
@@ -2453,7 +2520,7 @@
               <w:rPr>
                 <w:noProof/>
               </w:rPr>
-              <w:instrText xml:space="preserve"> PAGEREF _Toc241511984 \h </w:instrText>
+              <w:instrText xml:space="preserve"> PAGEREF _Toc241512346 \h </w:instrText>
             </w:r>
             <w:r>
               <w:rPr>
@@ -2470,7 +2537,7 @@
               <w:rPr>
                 <w:noProof/>
               </w:rPr>
-              <w:t>15</w:t>
+              <w:t>16</w:t>
             </w:r>
             <w:r>
               <w:rPr>
@@ -2496,7 +2563,7 @@
               <w14:ligatures w14:val="standardContextual"/>
             </w:rPr>
           </w:pPr>
-          <w:hyperlink w:anchor="_Toc241511985" w:history="1">
+          <w:hyperlink w:anchor="_Toc241512347" w:history="1">
             <w:r>
               <w:rPr>
                 <w:rStyle w:val="Hyperlink"/>
@@ -2520,7 +2587,7 @@
               <w:rPr>
                 <w:noProof/>
               </w:rPr>
-              <w:instrText xml:space="preserve"> PAGEREF _Toc241511985 \h </w:instrText>
+              <w:instrText xml:space="preserve"> PAGEREF _Toc241512347 \h </w:instrText>
             </w:r>
             <w:r>
               <w:rPr>
@@ -2537,7 +2604,7 @@
               <w:rPr>
                 <w:noProof/>
               </w:rPr>
-              <w:t>15</w:t>
+              <w:t>16</w:t>
             </w:r>
             <w:r>
               <w:rPr>
@@ -2563,13 +2630,13 @@
               <w14:ligatures w14:val="standardContextual"/>
             </w:rPr>
           </w:pPr>
-          <w:hyperlink w:anchor="_Toc241511986" w:history="1">
+          <w:hyperlink w:anchor="_Toc241512348" w:history="1">
             <w:r>
               <w:rPr>
                 <w:rStyle w:val="Hyperlink"/>
                 <w:noProof/>
               </w:rPr>
-              <w:t>10.  Completed Jobs (job records)</w:t>
+              <w:t>11.  Completed Jobs (job records)</w:t>
             </w:r>
             <w:r>
               <w:rPr>
@@ -2587,7 +2654,7 @@
               <w:rPr>
                 <w:noProof/>
               </w:rPr>
-              <w:instrText xml:space="preserve"> PAGEREF _Toc241511986 \h </w:instrText>
+              <w:instrText xml:space="preserve"> PAGEREF _Toc241512348 \h </w:instrText>
             </w:r>
             <w:r>
               <w:rPr>
@@ -2604,7 +2671,7 @@
               <w:rPr>
                 <w:noProof/>
               </w:rPr>
-              <w:t>16</w:t>
+              <w:t>17</w:t>
             </w:r>
             <w:r>
               <w:rPr>
@@ -2630,7 +2697,7 @@
               <w14:ligatures w14:val="standardContextual"/>
             </w:rPr>
           </w:pPr>
-          <w:hyperlink w:anchor="_Toc241511987" w:history="1">
+          <w:hyperlink w:anchor="_Toc241512349" w:history="1">
             <w:r>
               <w:rPr>
                 <w:rStyle w:val="Hyperlink"/>
@@ -2654,7 +2721,7 @@
               <w:rPr>
                 <w:noProof/>
               </w:rPr>
-              <w:instrText xml:space="preserve"> PAGEREF _Toc241511987 \h </w:instrText>
+              <w:instrText xml:space="preserve"> PAGEREF _Toc241512349 \h </w:instrText>
             </w:r>
             <w:r>
               <w:rPr>
@@ -2671,7 +2738,7 @@
               <w:rPr>
                 <w:noProof/>
               </w:rPr>
-              <w:t>16</w:t>
+              <w:t>17</w:t>
             </w:r>
             <w:r>
               <w:rPr>
@@ -2697,13 +2764,13 @@
               <w14:ligatures w14:val="standardContextual"/>
             </w:rPr>
           </w:pPr>
-          <w:hyperlink w:anchor="_Toc241511988" w:history="1">
+          <w:hyperlink w:anchor="_Toc241512350" w:history="1">
             <w:r>
               <w:rPr>
                 <w:rStyle w:val="Hyperlink"/>
                 <w:noProof/>
               </w:rPr>
-              <w:t>11.  Office tools</w:t>
+              <w:t>12.  Office tools</w:t>
             </w:r>
             <w:r>
               <w:rPr>
@@ -2721,7 +2788,7 @@
               <w:rPr>
                 <w:noProof/>
               </w:rPr>
-              <w:instrText xml:space="preserve"> PAGEREF _Toc241511988 \h </w:instrText>
+              <w:instrText xml:space="preserve"> PAGEREF _Toc241512350 \h </w:instrText>
             </w:r>
             <w:r>
               <w:rPr>
@@ -2738,7 +2805,7 @@
               <w:rPr>
                 <w:noProof/>
               </w:rPr>
-              <w:t>17</w:t>
+              <w:t>18</w:t>
             </w:r>
             <w:r>
               <w:rPr>
@@ -2764,7 +2831,7 @@
               <w14:ligatures w14:val="standardContextual"/>
             </w:rPr>
           </w:pPr>
-          <w:hyperlink w:anchor="_Toc241511989" w:history="1">
+          <w:hyperlink w:anchor="_Toc241512351" w:history="1">
             <w:r>
               <w:rPr>
                 <w:rStyle w:val="Hyperlink"/>
@@ -2788,7 +2855,7 @@
               <w:rPr>
                 <w:noProof/>
               </w:rPr>
-              <w:instrText xml:space="preserve"> PAGEREF _Toc241511989 \h </w:instrText>
+              <w:instrText xml:space="preserve"> PAGEREF _Toc241512351 \h </w:instrText>
             </w:r>
             <w:r>
               <w:rPr>
@@ -2805,7 +2872,7 @@
               <w:rPr>
                 <w:noProof/>
               </w:rPr>
-              <w:t>17</w:t>
+              <w:t>18</w:t>
             </w:r>
             <w:r>
               <w:rPr>
@@ -2831,7 +2898,7 @@
               <w14:ligatures w14:val="standardContextual"/>
             </w:rPr>
           </w:pPr>
-          <w:hyperlink w:anchor="_Toc241511990" w:history="1">
+          <w:hyperlink w:anchor="_Toc241512352" w:history="1">
             <w:r>
               <w:rPr>
                 <w:rStyle w:val="Hyperlink"/>
@@ -2855,7 +2922,7 @@
               <w:rPr>
                 <w:noProof/>
               </w:rPr>
-              <w:instrText xml:space="preserve"> PAGEREF _Toc241511990 \h </w:instrText>
+              <w:instrText xml:space="preserve"> PAGEREF _Toc241512352 \h </w:instrText>
             </w:r>
             <w:r>
               <w:rPr>
@@ -2872,7 +2939,7 @@
               <w:rPr>
                 <w:noProof/>
               </w:rPr>
-              <w:t>17</w:t>
+              <w:t>18</w:t>
             </w:r>
             <w:r>
               <w:rPr>
@@ -2898,7 +2965,7 @@
               <w14:ligatures w14:val="standardContextual"/>
             </w:rPr>
           </w:pPr>
-          <w:hyperlink w:anchor="_Toc241511991" w:history="1">
+          <w:hyperlink w:anchor="_Toc241512353" w:history="1">
             <w:r>
               <w:rPr>
                 <w:rStyle w:val="Hyperlink"/>
@@ -2922,7 +2989,7 @@
               <w:rPr>
                 <w:noProof/>
               </w:rPr>
-              <w:instrText xml:space="preserve"> PAGEREF _Toc241511991 \h </w:instrText>
+              <w:instrText xml:space="preserve"> PAGEREF _Toc241512353 \h </w:instrText>
             </w:r>
             <w:r>
               <w:rPr>
@@ -2939,7 +3006,7 @@
               <w:rPr>
                 <w:noProof/>
               </w:rPr>
-              <w:t>17</w:t>
+              <w:t>18</w:t>
             </w:r>
             <w:r>
               <w:rPr>
@@ -2965,7 +3032,7 @@
               <w14:ligatures w14:val="standardContextual"/>
             </w:rPr>
           </w:pPr>
-          <w:hyperlink w:anchor="_Toc241511992" w:history="1">
+          <w:hyperlink w:anchor="_Toc241512354" w:history="1">
             <w:r>
               <w:rPr>
                 <w:rStyle w:val="Hyperlink"/>
@@ -2989,7 +3056,7 @@
               <w:rPr>
                 <w:noProof/>
               </w:rPr>
-              <w:instrText xml:space="preserve"> PAGEREF _Toc241511992 \h </w:instrText>
+              <w:instrText xml:space="preserve"> PAGEREF _Toc241512354 \h </w:instrText>
             </w:r>
             <w:r>
               <w:rPr>
@@ -3006,7 +3073,7 @@
               <w:rPr>
                 <w:noProof/>
               </w:rPr>
-              <w:t>17</w:t>
+              <w:t>18</w:t>
             </w:r>
             <w:r>
               <w:rPr>
@@ -3032,7 +3099,7 @@
               <w14:ligatures w14:val="standardContextual"/>
             </w:rPr>
           </w:pPr>
-          <w:hyperlink w:anchor="_Toc241511993" w:history="1">
+          <w:hyperlink w:anchor="_Toc241512355" w:history="1">
             <w:r>
               <w:rPr>
                 <w:rStyle w:val="Hyperlink"/>
@@ -3056,7 +3123,7 @@
               <w:rPr>
                 <w:noProof/>
               </w:rPr>
-              <w:instrText xml:space="preserve"> PAGEREF _Toc241511993 \h </w:instrText>
+              <w:instrText xml:space="preserve"> PAGEREF _Toc241512355 \h </w:instrText>
             </w:r>
             <w:r>
               <w:rPr>
@@ -3073,7 +3140,7 @@
               <w:rPr>
                 <w:noProof/>
               </w:rPr>
-              <w:t>17</w:t>
+              <w:t>18</w:t>
             </w:r>
             <w:r>
               <w:rPr>
@@ -3099,13 +3166,13 @@
               <w14:ligatures w14:val="standardContextual"/>
             </w:rPr>
           </w:pPr>
-          <w:hyperlink w:anchor="_Toc241511994" w:history="1">
+          <w:hyperlink w:anchor="_Toc241512356" w:history="1">
             <w:r>
               <w:rPr>
                 <w:rStyle w:val="Hyperlink"/>
                 <w:noProof/>
               </w:rPr>
-              <w:t>12.  Time off and messages (office and admins)</w:t>
+              <w:t>13.  Time off and messages (office and admins)</w:t>
             </w:r>
             <w:r>
               <w:rPr>
@@ -3123,7 +3190,7 @@
               <w:rPr>
                 <w:noProof/>
               </w:rPr>
-              <w:instrText xml:space="preserve"> PAGEREF _Toc241511994 \h </w:instrText>
+              <w:instrText xml:space="preserve"> PAGEREF _Toc241512356 \h </w:instrText>
             </w:r>
             <w:r>
               <w:rPr>
@@ -3140,7 +3207,7 @@
               <w:rPr>
                 <w:noProof/>
               </w:rPr>
-              <w:t>18</w:t>
+              <w:t>19</w:t>
             </w:r>
             <w:r>
               <w:rPr>
@@ -3166,7 +3233,7 @@
               <w14:ligatures w14:val="standardContextual"/>
             </w:rPr>
           </w:pPr>
-          <w:hyperlink w:anchor="_Toc241511995" w:history="1">
+          <w:hyperlink w:anchor="_Toc241512357" w:history="1">
             <w:r>
               <w:rPr>
                 <w:rStyle w:val="Hyperlink"/>
@@ -3190,7 +3257,7 @@
               <w:rPr>
                 <w:noProof/>
               </w:rPr>
-              <w:instrText xml:space="preserve"> PAGEREF _Toc241511995 \h </w:instrText>
+              <w:instrText xml:space="preserve"> PAGEREF _Toc241512357 \h </w:instrText>
             </w:r>
             <w:r>
               <w:rPr>
@@ -3207,7 +3274,7 @@
               <w:rPr>
                 <w:noProof/>
               </w:rPr>
-              <w:t>18</w:t>
+              <w:t>19</w:t>
             </w:r>
             <w:r>
               <w:rPr>
@@ -3233,7 +3300,7 @@
               <w14:ligatures w14:val="standardContextual"/>
             </w:rPr>
           </w:pPr>
-          <w:hyperlink w:anchor="_Toc241511996" w:history="1">
+          <w:hyperlink w:anchor="_Toc241512358" w:history="1">
             <w:r>
               <w:rPr>
                 <w:rStyle w:val="Hyperlink"/>
@@ -3257,7 +3324,7 @@
               <w:rPr>
                 <w:noProof/>
               </w:rPr>
-              <w:instrText xml:space="preserve"> PAGEREF _Toc241511996 \h </w:instrText>
+              <w:instrText xml:space="preserve"> PAGEREF _Toc241512358 \h </w:instrText>
             </w:r>
             <w:r>
               <w:rPr>
@@ -3274,7 +3341,7 @@
               <w:rPr>
                 <w:noProof/>
               </w:rPr>
-              <w:t>18</w:t>
+              <w:t>19</w:t>
             </w:r>
             <w:r>
               <w:rPr>
@@ -3300,13 +3367,13 @@
               <w14:ligatures w14:val="standardContextual"/>
             </w:rPr>
           </w:pPr>
-          <w:hyperlink w:anchor="_Toc241511997" w:history="1">
+          <w:hyperlink w:anchor="_Toc241512359" w:history="1">
             <w:r>
               <w:rPr>
                 <w:rStyle w:val="Hyperlink"/>
                 <w:noProof/>
               </w:rPr>
-              <w:t>13.  Admin: employees and settings</w:t>
+              <w:t>14.  Admin: employees and settings</w:t>
             </w:r>
             <w:r>
               <w:rPr>
@@ -3324,7 +3391,7 @@
               <w:rPr>
                 <w:noProof/>
               </w:rPr>
-              <w:instrText xml:space="preserve"> PAGEREF _Toc241511997 \h </w:instrText>
+              <w:instrText xml:space="preserve"> PAGEREF _Toc241512359 \h </w:instrText>
             </w:r>
             <w:r>
               <w:rPr>
@@ -3341,7 +3408,7 @@
               <w:rPr>
                 <w:noProof/>
               </w:rPr>
-              <w:t>19</w:t>
+              <w:t>20</w:t>
             </w:r>
             <w:r>
               <w:rPr>
@@ -3367,7 +3434,7 @@
               <w14:ligatures w14:val="standardContextual"/>
             </w:rPr>
           </w:pPr>
-          <w:hyperlink w:anchor="_Toc241511998" w:history="1">
+          <w:hyperlink w:anchor="_Toc241512360" w:history="1">
             <w:r>
               <w:rPr>
                 <w:rStyle w:val="Hyperlink"/>
@@ -3391,7 +3458,7 @@
               <w:rPr>
                 <w:noProof/>
               </w:rPr>
-              <w:instrText xml:space="preserve"> PAGEREF _Toc241511998 \h </w:instrText>
+              <w:instrText xml:space="preserve"> PAGEREF _Toc241512360 \h </w:instrText>
             </w:r>
             <w:r>
               <w:rPr>
@@ -3408,7 +3475,7 @@
               <w:rPr>
                 <w:noProof/>
               </w:rPr>
-              <w:t>19</w:t>
+              <w:t>20</w:t>
             </w:r>
             <w:r>
               <w:rPr>
@@ -3434,7 +3501,7 @@
               <w14:ligatures w14:val="standardContextual"/>
             </w:rPr>
           </w:pPr>
-          <w:hyperlink w:anchor="_Toc241511999" w:history="1">
+          <w:hyperlink w:anchor="_Toc241512361" w:history="1">
             <w:r>
               <w:rPr>
                 <w:rStyle w:val="Hyperlink"/>
@@ -3458,7 +3525,7 @@
               <w:rPr>
                 <w:noProof/>
               </w:rPr>
-              <w:instrText xml:space="preserve"> PAGEREF _Toc241511999 \h </w:instrText>
+              <w:instrText xml:space="preserve"> PAGEREF _Toc241512361 \h </w:instrText>
             </w:r>
             <w:r>
               <w:rPr>
@@ -3475,7 +3542,7 @@
               <w:rPr>
                 <w:noProof/>
               </w:rPr>
-              <w:t>19</w:t>
+              <w:t>20</w:t>
             </w:r>
             <w:r>
               <w:rPr>
@@ -3501,7 +3568,7 @@
               <w14:ligatures w14:val="standardContextual"/>
             </w:rPr>
           </w:pPr>
-          <w:hyperlink w:anchor="_Toc241512000" w:history="1">
+          <w:hyperlink w:anchor="_Toc241512362" w:history="1">
             <w:r>
               <w:rPr>
                 <w:rStyle w:val="Hyperlink"/>
@@ -3525,7 +3592,7 @@
               <w:rPr>
                 <w:noProof/>
               </w:rPr>
-              <w:instrText xml:space="preserve"> PAGEREF _Toc241512000 \h </w:instrText>
+              <w:instrText xml:space="preserve"> PAGEREF _Toc241512362 \h </w:instrText>
             </w:r>
             <w:r>
               <w:rPr>
@@ -3542,7 +3609,7 @@
               <w:rPr>
                 <w:noProof/>
               </w:rPr>
-              <w:t>19</w:t>
+              <w:t>20</w:t>
             </w:r>
             <w:r>
               <w:rPr>
@@ -3568,13 +3635,13 @@
               <w14:ligatures w14:val="standardContextual"/>
             </w:rPr>
           </w:pPr>
-          <w:hyperlink w:anchor="_Toc241512001" w:history="1">
+          <w:hyperlink w:anchor="_Toc241512363" w:history="1">
             <w:r>
               <w:rPr>
                 <w:rStyle w:val="Hyperlink"/>
                 <w:noProof/>
               </w:rPr>
-              <w:t>14.  Quick answers</w:t>
+              <w:t>15.  Quick answers</w:t>
             </w:r>
             <w:r>
               <w:rPr>
@@ -3592,7 +3659,7 @@
               <w:rPr>
                 <w:noProof/>
               </w:rPr>
-              <w:instrText xml:space="preserve"> PAGEREF _Toc241512001 \h </w:instrText>
+              <w:instrText xml:space="preserve"> PAGEREF _Toc241512363 \h </w:instrText>
             </w:r>
             <w:r>
               <w:rPr>
@@ -3609,7 +3676,7 @@
               <w:rPr>
                 <w:noProof/>
               </w:rPr>
-              <w:t>20</w:t>
+              <w:t>21</w:t>
             </w:r>
             <w:r>
               <w:rPr>
@@ -3635,7 +3702,7 @@
               <w14:ligatures w14:val="standardContextual"/>
             </w:rPr>
           </w:pPr>
-          <w:hyperlink w:anchor="_Toc241512002" w:history="1">
+          <w:hyperlink w:anchor="_Toc241512364" w:history="1">
             <w:r>
               <w:rPr>
                 <w:rStyle w:val="Hyperlink"/>
@@ -3659,7 +3726,7 @@
               <w:rPr>
                 <w:noProof/>
               </w:rPr>
-              <w:instrText xml:space="preserve"> PAGEREF _Toc241512002 \h </w:instrText>
+              <w:instrText xml:space="preserve"> PAGEREF _Toc241512364 \h </w:instrText>
             </w:r>
             <w:r>
               <w:rPr>
@@ -3676,7 +3743,7 @@
               <w:rPr>
                 <w:noProof/>
               </w:rPr>
-              <w:t>21</w:t>
+              <w:t>22</w:t>
             </w:r>
             <w:r>
               <w:rPr>
@@ -3702,7 +3769,7 @@
       <w:pPr>
         <w:pStyle w:val="Heading1"/>
       </w:pPr>
-      <w:bookmarkStart w:id="0" w:name="_Toc241511950"/>
+      <w:bookmarkStart w:id="0" w:name="_Toc241512311"/>
       <w:r>
         <w:t>1.  Getting started</w:t>
       </w:r>
@@ -3730,7 +3797,7 @@
       <w:pPr>
         <w:pStyle w:val="Heading2"/>
       </w:pPr>
-      <w:bookmarkStart w:id="1" w:name="_Toc241511951"/>
+      <w:bookmarkStart w:id="1" w:name="_Toc241512312"/>
       <w:r>
         <w:t>Opening ShopControl</w:t>
       </w:r>
@@ -3810,7 +3877,7 @@
       <w:pPr>
         <w:pStyle w:val="Heading2"/>
       </w:pPr>
-      <w:bookmarkStart w:id="2" w:name="_Toc241511952"/>
+      <w:bookmarkStart w:id="2" w:name="_Toc241512313"/>
       <w:r>
         <w:t>Finding help</w:t>
       </w:r>
@@ -3913,7 +3980,7 @@
       <w:pPr>
         <w:pStyle w:val="Heading2"/>
       </w:pPr>
-      <w:bookmarkStart w:id="3" w:name="_Toc241511953"/>
+      <w:bookmarkStart w:id="3" w:name="_Toc241512314"/>
       <w:r>
         <w:t>Put the app on your phone's home screen</w:t>
       </w:r>
@@ -4081,7 +4148,7 @@
       <w:pPr>
         <w:pStyle w:val="Heading2"/>
       </w:pPr>
-      <w:bookmarkStart w:id="4" w:name="_Toc241511954"/>
+      <w:bookmarkStart w:id="4" w:name="_Toc241512315"/>
       <w:r>
         <w:t>Logging in</w:t>
       </w:r>
@@ -4251,7 +4318,7 @@
       <w:pPr>
         <w:pStyle w:val="Heading2"/>
       </w:pPr>
-      <w:bookmarkStart w:id="5" w:name="_Toc241511955"/>
+      <w:bookmarkStart w:id="5" w:name="_Toc241512316"/>
       <w:r>
         <w:t>Staying up to date</w:t>
       </w:r>
@@ -4279,7 +4346,7 @@
       <w:pPr>
         <w:pStyle w:val="Heading2"/>
       </w:pPr>
-      <w:bookmarkStart w:id="6" w:name="_Toc241511956"/>
+      <w:bookmarkStart w:id="6" w:name="_Toc241512317"/>
       <w:r>
         <w:t>Who can do what</w:t>
       </w:r>
@@ -4318,7 +4385,7 @@
           <w:left w:w="10" w:type="dxa"/>
           <w:right w:w="10" w:type="dxa"/>
         </w:tblCellMar>
-        <w:tblLook w:val="0000" w:firstRow="0" w:lastRow="0" w:firstColumn="0" w:lastColumn="0" w:noHBand="0" w:noVBand="0"/>
+        <w:tblLook w:val="04A0" w:firstRow="1" w:lastRow="0" w:firstColumn="1" w:lastColumn="0" w:noHBand="0" w:noVBand="1"/>
       </w:tblPr>
       <w:tblGrid>
         <w:gridCol w:w="2900"/>
@@ -4892,7 +4959,7 @@
         <w:pStyle w:val="Heading1"/>
         <w:pageBreakBefore/>
       </w:pPr>
-      <w:bookmarkStart w:id="7" w:name="_Toc241511957"/>
+      <w:bookmarkStart w:id="7" w:name="_Toc241512318"/>
       <w:r>
         <w:t>2.  The Employee App (technicians)</w:t>
       </w:r>
@@ -4910,7 +4977,7 @@
       <w:pPr>
         <w:pStyle w:val="Heading2"/>
       </w:pPr>
-      <w:bookmarkStart w:id="8" w:name="_Toc241511958"/>
+      <w:bookmarkStart w:id="8" w:name="_Toc241512319"/>
       <w:r>
         <w:t>Home screen</w:t>
       </w:r>
@@ -5050,7 +5117,7 @@
       <w:pPr>
         <w:pStyle w:val="Heading2"/>
       </w:pPr>
-      <w:bookmarkStart w:id="9" w:name="_Toc241511959"/>
+      <w:bookmarkStart w:id="9" w:name="_Toc241512320"/>
       <w:r>
         <w:t>Doing your QC checklist</w:t>
       </w:r>
@@ -5264,7 +5331,7 @@
       <w:pPr>
         <w:pStyle w:val="Heading2"/>
       </w:pPr>
-      <w:bookmarkStart w:id="10" w:name="_Toc241511960"/>
+      <w:bookmarkStart w:id="10" w:name="_Toc241512321"/>
       <w:r>
         <w:t>Signing and rework</w:t>
       </w:r>
@@ -5384,7 +5451,7 @@
       <w:pPr>
         <w:pStyle w:val="Heading2"/>
       </w:pPr>
-      <w:bookmarkStart w:id="11" w:name="_Toc241511961"/>
+      <w:bookmarkStart w:id="11" w:name="_Toc241512322"/>
       <w:r>
         <w:t>Other departments' checklists</w:t>
       </w:r>
@@ -5412,7 +5479,7 @@
       <w:pPr>
         <w:pStyle w:val="Heading2"/>
       </w:pPr>
-      <w:bookmarkStart w:id="12" w:name="_Toc241511962"/>
+      <w:bookmarkStart w:id="12" w:name="_Toc241512323"/>
       <w:r>
         <w:t>Photos and parts</w:t>
       </w:r>
@@ -5549,7 +5616,7 @@
         <w:pStyle w:val="Heading1"/>
         <w:pageBreakBefore/>
       </w:pPr>
-      <w:bookmarkStart w:id="13" w:name="_Toc241511963"/>
+      <w:bookmarkStart w:id="13" w:name="_Toc241512324"/>
       <w:r>
         <w:t>3.  Staff Hub: time off, mailbox and company info</w:t>
       </w:r>
@@ -5577,7 +5644,7 @@
       <w:pPr>
         <w:pStyle w:val="Heading2"/>
       </w:pPr>
-      <w:bookmarkStart w:id="14" w:name="_Toc241511964"/>
+      <w:bookmarkStart w:id="14" w:name="_Toc241512325"/>
       <w:r>
         <w:t>Requesting time off</w:t>
       </w:r>
@@ -5740,7 +5807,7 @@
       <w:pPr>
         <w:pStyle w:val="Heading2"/>
       </w:pPr>
-      <w:bookmarkStart w:id="15" w:name="_Toc241511965"/>
+      <w:bookmarkStart w:id="15" w:name="_Toc241512326"/>
       <w:r>
         <w:t>Checking your requests</w:t>
       </w:r>
@@ -5795,7 +5862,7 @@
       <w:pPr>
         <w:pStyle w:val="Heading2"/>
       </w:pPr>
-      <w:bookmarkStart w:id="16" w:name="_Toc241511966"/>
+      <w:bookmarkStart w:id="16" w:name="_Toc241512327"/>
       <w:r>
         <w:t>Mailbox</w:t>
       </w:r>
@@ -5864,7 +5931,7 @@
       <w:pPr>
         <w:pStyle w:val="Heading2"/>
       </w:pPr>
-      <w:bookmarkStart w:id="17" w:name="_Toc241511967"/>
+      <w:bookmarkStart w:id="17" w:name="_Toc241512328"/>
       <w:r>
         <w:t>Company info and this manual</w:t>
       </w:r>
@@ -5900,9 +5967,9 @@
         <w:pStyle w:val="Heading1"/>
         <w:pageBreakBefore/>
       </w:pPr>
-      <w:bookmarkStart w:id="18" w:name="_Toc241511968"/>
-      <w:r>
-        <w:t>4.  Dashboard</w:t>
+      <w:bookmarkStart w:id="18" w:name="_Toc241512329"/>
+      <w:r>
+        <w:t>4.  Finding a vehicle</w:t>
       </w:r>
       <w:bookmarkEnd w:id="18"/>
     </w:p>
@@ -5911,17 +5978,37 @@
         <w:spacing w:after="120"/>
       </w:pPr>
       <w:r>
-        <w:t xml:space="preserve">The first screen in ShopControl. Every number is a shortcut: </w:t>
-      </w:r>
-      <w:r>
-        <w:rPr>
-          <w:b/>
-          <w:bCs/>
-        </w:rPr>
-        <w:t>click a tile to jump to that list</w:t>
-      </w:r>
-      <w:r>
-        <w:t>.</w:t>
+        <w:t xml:space="preserve">The </w:t>
+      </w:r>
+      <w:r>
+        <w:rPr>
+          <w:b/>
+          <w:bCs/>
+        </w:rPr>
+        <w:t>Find a vehicle</w:t>
+      </w:r>
+      <w:r>
+        <w:t xml:space="preserve"> box at the top of every office screen finds any car ShopControl has ever had: opportunities, cars in production, and delivered or total-loss jobs. Click it (or press </w:t>
+      </w:r>
+      <w:r>
+        <w:rPr>
+          <w:b/>
+          <w:bCs/>
+        </w:rPr>
+        <w:t>/</w:t>
+      </w:r>
+      <w:r>
+        <w:t xml:space="preserve"> or </w:t>
+      </w:r>
+      <w:r>
+        <w:rPr>
+          <w:b/>
+          <w:bCs/>
+        </w:rPr>
+        <w:t>Ctrl+K</w:t>
+      </w:r>
+      <w:r>
+        <w:t xml:space="preserve"> from anywhere) and start typing.</w:t>
       </w:r>
     </w:p>
     <w:p>
@@ -5934,24 +6021,17 @@
         <w:spacing w:after="60"/>
       </w:pPr>
       <w:r>
-        <w:rPr>
-          <w:b/>
-          <w:bCs/>
-        </w:rPr>
-        <w:t>Booth Filter Countdown</w:t>
-      </w:r>
-      <w:r>
-        <w:t xml:space="preserve"> at the top: days left before the paint booth filters are due (30-day cycle). Green is fine, yellow is due soon, red is overdue or not recorded. Use </w:t>
-      </w:r>
-      <w:r>
-        <w:rPr>
-          <w:b/>
-          <w:bCs/>
-        </w:rPr>
-        <w:t>Reset Filter Countdown</w:t>
-      </w:r>
-      <w:r>
-        <w:t xml:space="preserve"> after changing filters.</w:t>
+        <w:t xml:space="preserve">Search by </w:t>
+      </w:r>
+      <w:r>
+        <w:rPr>
+          <w:b/>
+          <w:bCs/>
+        </w:rPr>
+        <w:t>RO or estimate number, customer name, year / make / model, color, VIN (even just the last 6), license plate, claim number, insurance company or estimator</w:t>
+      </w:r>
+      <w:r>
+        <w:t>.</w:t>
       </w:r>
     </w:p>
     <w:p>
@@ -5964,14 +6044,27 @@
         <w:spacing w:after="60"/>
       </w:pPr>
       <w:r>
-        <w:rPr>
-          <w:b/>
-          <w:bCs/>
-        </w:rPr>
-        <w:t>Arrivals and jobs:</w:t>
-      </w:r>
-      <w:r>
-        <w:t xml:space="preserve"> scheduled arrivals, cars on the road, open opportunities, active jobs, must-move and delivery-today counts.</w:t>
+        <w:t xml:space="preserve">Type more than one word to narrow it down, for example </w:t>
+      </w:r>
+      <w:r>
+        <w:rPr>
+          <w:b/>
+          <w:bCs/>
+        </w:rPr>
+        <w:t>camry silver</w:t>
+      </w:r>
+      <w:r>
+        <w:t xml:space="preserve"> or </w:t>
+      </w:r>
+      <w:r>
+        <w:rPr>
+          <w:b/>
+          <w:bCs/>
+        </w:rPr>
+        <w:t>toyota lopez</w:t>
+      </w:r>
+      <w:r>
+        <w:t>.</w:t>
       </w:r>
     </w:p>
     <w:p>
@@ -5984,14 +6077,37 @@
         <w:spacing w:after="60"/>
       </w:pPr>
       <w:r>
-        <w:rPr>
-          <w:b/>
-          <w:bCs/>
-        </w:rPr>
-        <w:t>Needs attention:</w:t>
-      </w:r>
-      <w:r>
-        <w:t xml:space="preserve"> estimates and supplements needed, management help, customer updates needed, cars sitting too long, overdue tasks, QC failures.</w:t>
+        <w:t xml:space="preserve">Cars still in the shop are listed first, each with its stage (for example </w:t>
+      </w:r>
+      <w:r>
+        <w:rPr>
+          <w:b/>
+          <w:bCs/>
+        </w:rPr>
+        <w:t>Paint · on site</w:t>
+      </w:r>
+      <w:r>
+        <w:t xml:space="preserve">). Opportunities are marked </w:t>
+      </w:r>
+      <w:r>
+        <w:rPr>
+          <w:b/>
+          <w:bCs/>
+        </w:rPr>
+        <w:t>Opportunity</w:t>
+      </w:r>
+      <w:r>
+        <w:t xml:space="preserve">. Finished cars show </w:t>
+      </w:r>
+      <w:r>
+        <w:rPr>
+          <w:b/>
+          <w:bCs/>
+        </w:rPr>
+        <w:t>Delivered</w:t>
+      </w:r>
+      <w:r>
+        <w:t xml:space="preserve"> with the date.</w:t>
       </w:r>
     </w:p>
     <w:p>
@@ -6004,14 +6120,47 @@
         <w:spacing w:after="60"/>
       </w:pPr>
       <w:r>
-        <w:rPr>
-          <w:b/>
-          <w:bCs/>
-        </w:rPr>
-        <w:t>Parts:</w:t>
-      </w:r>
-      <w:r>
-        <w:t xml:space="preserve"> Parts Problems (counted by vehicle), Parts Not Arrived On Time, Parts No RO Yet, parts needing return or mirror match, parts value on site and parts 25+ days on site.</w:t>
+        <w:t xml:space="preserve">Click a result, or use the arrow keys and press </w:t>
+      </w:r>
+      <w:r>
+        <w:rPr>
+          <w:b/>
+          <w:bCs/>
+        </w:rPr>
+        <w:t>Enter</w:t>
+      </w:r>
+      <w:r>
+        <w:t xml:space="preserve">. A car in the shop opens its job window (with </w:t>
+      </w:r>
+      <w:r>
+        <w:rPr>
+          <w:b/>
+          <w:bCs/>
+        </w:rPr>
+        <w:t>Open full Shop Control job</w:t>
+      </w:r>
+      <w:r>
+        <w:t xml:space="preserve"> and </w:t>
+      </w:r>
+      <w:r>
+        <w:rPr>
+          <w:b/>
+          <w:bCs/>
+        </w:rPr>
+        <w:t>QC report</w:t>
+      </w:r>
+      <w:r>
+        <w:t xml:space="preserve">). A finished car opens its file in </w:t>
+      </w:r>
+      <w:r>
+        <w:rPr>
+          <w:b/>
+          <w:bCs/>
+        </w:rPr>
+        <w:t>Completed Jobs</w:t>
+      </w:r>
+      <w:r>
+        <w:t>.</w:t>
       </w:r>
     </w:p>
     <w:p>
@@ -6024,14 +6173,48 @@
         <w:spacing w:after="60"/>
       </w:pPr>
       <w:r>
-        <w:rPr>
-          <w:b/>
-          <w:bCs/>
-        </w:rPr>
-        <w:t>Time-Off Requests Pending</w:t>
-      </w:r>
-      <w:r>
-        <w:t xml:space="preserve"> (office and admins only).</w:t>
+        <w:t xml:space="preserve">Press </w:t>
+      </w:r>
+      <w:r>
+        <w:rPr>
+          <w:b/>
+          <w:bCs/>
+        </w:rPr>
+        <w:t>Esc</w:t>
+      </w:r>
+      <w:r>
+        <w:t xml:space="preserve"> to clear the search.</w:t>
+      </w:r>
+    </w:p>
+    <w:p>
+      <w:pPr>
+        <w:pBdr>
+          <w:left w:val="single" w:sz="24" w:space="8" w:color="C99A06"/>
+        </w:pBdr>
+        <w:shd w:val="clear" w:color="auto" w:fill="FFF8DD"/>
+        <w:spacing w:before="120" w:after="160"/>
+        <w:ind w:left="160" w:right="160"/>
+      </w:pPr>
+      <w:r>
+        <w:rPr>
+          <w:b/>
+          <w:bCs/>
+          <w:color w:val="C99A06"/>
+        </w:rPr>
+        <w:t xml:space="preserve">Note:  </w:t>
+      </w:r>
+      <w:r>
+        <w:t xml:space="preserve">Jobs someone deleted don't show here. Find them under </w:t>
+      </w:r>
+      <w:r>
+        <w:rPr>
+          <w:b/>
+          <w:bCs/>
+        </w:rPr>
+        <w:t>Completed Jobs → Show deleted jobs</w:t>
+      </w:r>
+      <w:r>
+        <w:t>.</w:t>
       </w:r>
     </w:p>
     <w:p>
@@ -6039,9 +6222,9 @@
         <w:pStyle w:val="Heading1"/>
         <w:pageBreakBefore/>
       </w:pPr>
-      <w:bookmarkStart w:id="19" w:name="_Toc241511969"/>
-      <w:r>
-        <w:t>5.  Jobs and the Daily GO List</w:t>
+      <w:bookmarkStart w:id="19" w:name="_Toc241512330"/>
+      <w:r>
+        <w:t>5.  Dashboard</w:t>
       </w:r>
       <w:bookmarkEnd w:id="19"/>
     </w:p>
@@ -6050,28 +6233,18 @@
         <w:spacing w:after="120"/>
       </w:pPr>
       <w:r>
-        <w:t xml:space="preserve">Every vehicle is a </w:t>
-      </w:r>
-      <w:r>
-        <w:rPr>
-          <w:b/>
-          <w:bCs/>
-        </w:rPr>
-        <w:t>job</w:t>
-      </w:r>
-      <w:r>
-        <w:t>. The Daily GO List is the full list; the boards are visual views of the same jobs. Change a job anywhere and it changes everywhere.</w:t>
-      </w:r>
-    </w:p>
-    <w:p>
-      <w:pPr>
-        <w:pStyle w:val="Heading2"/>
-      </w:pPr>
-      <w:bookmarkStart w:id="20" w:name="_Toc241511970"/>
-      <w:r>
-        <w:t>RO numbers</w:t>
-      </w:r>
-      <w:bookmarkEnd w:id="20"/>
+        <w:t xml:space="preserve">The first screen in ShopControl. Every number is a shortcut: </w:t>
+      </w:r>
+      <w:r>
+        <w:rPr>
+          <w:b/>
+          <w:bCs/>
+        </w:rPr>
+        <w:t>click a tile to jump to that list</w:t>
+      </w:r>
+      <w:r>
+        <w:t>.</w:t>
+      </w:r>
     </w:p>
     <w:p>
       <w:pPr>
@@ -6083,27 +6256,24 @@
         <w:spacing w:after="60"/>
       </w:pPr>
       <w:r>
-        <w:t xml:space="preserve">A real RO number is </w:t>
-      </w:r>
-      <w:r>
-        <w:rPr>
-          <w:b/>
-          <w:bCs/>
-        </w:rPr>
-        <w:t>all digits</w:t>
-      </w:r>
-      <w:r>
-        <w:t xml:space="preserve"> (normally 5, like 17944). A job with a 5-digit RO is an </w:t>
-      </w:r>
-      <w:r>
-        <w:rPr>
-          <w:b/>
-          <w:bCs/>
-        </w:rPr>
-        <w:t>active job</w:t>
-      </w:r>
-      <w:r>
-        <w:t>.</w:t>
+        <w:rPr>
+          <w:b/>
+          <w:bCs/>
+        </w:rPr>
+        <w:t>Booth Filter Countdown</w:t>
+      </w:r>
+      <w:r>
+        <w:t xml:space="preserve"> at the top: days left before the paint booth filters are due (30-day cycle). Green is fine, yellow is due soon, red is overdue or not recorded. Use </w:t>
+      </w:r>
+      <w:r>
+        <w:rPr>
+          <w:b/>
+          <w:bCs/>
+        </w:rPr>
+        <w:t>Reset Filter Countdown</w:t>
+      </w:r>
+      <w:r>
+        <w:t xml:space="preserve"> after changing filters.</w:t>
       </w:r>
     </w:p>
     <w:p>
@@ -6116,17 +6286,14 @@
         <w:spacing w:after="60"/>
       </w:pPr>
       <w:r>
-        <w:t xml:space="preserve">Estimates that don't have an RO yet show CCC's file number instead (letters and numbers, like 0a7fce43). Those are </w:t>
-      </w:r>
-      <w:r>
-        <w:rPr>
-          <w:b/>
-          <w:bCs/>
-        </w:rPr>
-        <w:t>opportunities</w:t>
-      </w:r>
-      <w:r>
-        <w:t>: they can't be marked onsite or scheduled until they get a 5-digit RO.</w:t>
+        <w:rPr>
+          <w:b/>
+          <w:bCs/>
+        </w:rPr>
+        <w:t>Arrivals and jobs:</w:t>
+      </w:r>
+      <w:r>
+        <w:t xml:space="preserve"> scheduled arrivals, cars on the road, open opportunities, active jobs, must-move and delivery-today counts.</w:t>
       </w:r>
     </w:p>
     <w:p>
@@ -6143,6 +6310,161 @@
           <w:b/>
           <w:bCs/>
         </w:rPr>
+        <w:t>Needs attention:</w:t>
+      </w:r>
+      <w:r>
+        <w:t xml:space="preserve"> estimates and supplements needed, management help, customer updates needed, cars sitting too long, overdue tasks, QC failures.</w:t>
+      </w:r>
+    </w:p>
+    <w:p>
+      <w:pPr>
+        <w:pStyle w:val="ListParagraph"/>
+        <w:numPr>
+          <w:ilvl w:val="0"/>
+          <w:numId w:val="2"/>
+        </w:numPr>
+        <w:spacing w:after="60"/>
+      </w:pPr>
+      <w:r>
+        <w:rPr>
+          <w:b/>
+          <w:bCs/>
+        </w:rPr>
+        <w:t>Parts:</w:t>
+      </w:r>
+      <w:r>
+        <w:t xml:space="preserve"> Parts Problems (counted by vehicle), Parts Not Arrived On Time, Parts No RO Yet, parts needing return or mirror match, parts value on site and parts 25+ days on site.</w:t>
+      </w:r>
+    </w:p>
+    <w:p>
+      <w:pPr>
+        <w:pStyle w:val="ListParagraph"/>
+        <w:numPr>
+          <w:ilvl w:val="0"/>
+          <w:numId w:val="2"/>
+        </w:numPr>
+        <w:spacing w:after="60"/>
+      </w:pPr>
+      <w:r>
+        <w:rPr>
+          <w:b/>
+          <w:bCs/>
+        </w:rPr>
+        <w:t>Time-Off Requests Pending</w:t>
+      </w:r>
+      <w:r>
+        <w:t xml:space="preserve"> (office and admins only).</w:t>
+      </w:r>
+    </w:p>
+    <w:p>
+      <w:pPr>
+        <w:pStyle w:val="Heading1"/>
+        <w:pageBreakBefore/>
+      </w:pPr>
+      <w:bookmarkStart w:id="20" w:name="_Toc241512331"/>
+      <w:r>
+        <w:t>6.  Jobs and the Daily GO List</w:t>
+      </w:r>
+      <w:bookmarkEnd w:id="20"/>
+    </w:p>
+    <w:p>
+      <w:pPr>
+        <w:spacing w:after="120"/>
+      </w:pPr>
+      <w:r>
+        <w:t xml:space="preserve">Every vehicle is a </w:t>
+      </w:r>
+      <w:r>
+        <w:rPr>
+          <w:b/>
+          <w:bCs/>
+        </w:rPr>
+        <w:t>job</w:t>
+      </w:r>
+      <w:r>
+        <w:t>. The Daily GO List is the full list; the boards are visual views of the same jobs. Change a job anywhere and it changes everywhere.</w:t>
+      </w:r>
+    </w:p>
+    <w:p>
+      <w:pPr>
+        <w:pStyle w:val="Heading2"/>
+      </w:pPr>
+      <w:bookmarkStart w:id="21" w:name="_Toc241512332"/>
+      <w:r>
+        <w:t>RO numbers</w:t>
+      </w:r>
+      <w:bookmarkEnd w:id="21"/>
+    </w:p>
+    <w:p>
+      <w:pPr>
+        <w:pStyle w:val="ListParagraph"/>
+        <w:numPr>
+          <w:ilvl w:val="0"/>
+          <w:numId w:val="2"/>
+        </w:numPr>
+        <w:spacing w:after="60"/>
+      </w:pPr>
+      <w:r>
+        <w:t xml:space="preserve">A real RO number is </w:t>
+      </w:r>
+      <w:r>
+        <w:rPr>
+          <w:b/>
+          <w:bCs/>
+        </w:rPr>
+        <w:t>all digits</w:t>
+      </w:r>
+      <w:r>
+        <w:t xml:space="preserve"> (normally 5, like 17944). A job with a 5-digit RO is an </w:t>
+      </w:r>
+      <w:r>
+        <w:rPr>
+          <w:b/>
+          <w:bCs/>
+        </w:rPr>
+        <w:t>active job</w:t>
+      </w:r>
+      <w:r>
+        <w:t>.</w:t>
+      </w:r>
+    </w:p>
+    <w:p>
+      <w:pPr>
+        <w:pStyle w:val="ListParagraph"/>
+        <w:numPr>
+          <w:ilvl w:val="0"/>
+          <w:numId w:val="2"/>
+        </w:numPr>
+        <w:spacing w:after="60"/>
+      </w:pPr>
+      <w:r>
+        <w:t xml:space="preserve">Estimates that don't have an RO yet show CCC's file number instead (letters and numbers, like 0a7fce43). Those are </w:t>
+      </w:r>
+      <w:r>
+        <w:rPr>
+          <w:b/>
+          <w:bCs/>
+        </w:rPr>
+        <w:t>opportunities</w:t>
+      </w:r>
+      <w:r>
+        <w:t>: they can't be marked onsite or scheduled until they get a 5-digit RO.</w:t>
+      </w:r>
+    </w:p>
+    <w:p>
+      <w:pPr>
+        <w:pStyle w:val="ListParagraph"/>
+        <w:numPr>
+          <w:ilvl w:val="0"/>
+          <w:numId w:val="2"/>
+        </w:numPr>
+        <w:spacing w:after="60"/>
+      </w:pPr>
+      <w:r>
+        <w:rPr>
+          <w:b/>
+          <w:bCs/>
+        </w:rPr>
         <w:t>An RO number can only be on one job.</w:t>
       </w:r>
       <w:r>
@@ -6153,11 +6475,11 @@
       <w:pPr>
         <w:pStyle w:val="Heading2"/>
       </w:pPr>
-      <w:bookmarkStart w:id="21" w:name="_Toc241511971"/>
+      <w:bookmarkStart w:id="22" w:name="_Toc241512333"/>
       <w:r>
         <w:t>Adding or editing a job</w:t>
       </w:r>
-      <w:bookmarkEnd w:id="21"/>
+      <w:bookmarkEnd w:id="22"/>
     </w:p>
     <w:p>
       <w:pPr>
@@ -6273,11 +6595,11 @@
       <w:pPr>
         <w:pStyle w:val="Heading2"/>
       </w:pPr>
-      <w:bookmarkStart w:id="22" w:name="_Toc241511972"/>
+      <w:bookmarkStart w:id="23" w:name="_Toc241512334"/>
       <w:r>
         <w:t>Customer updates</w:t>
       </w:r>
-      <w:bookmarkEnd w:id="22"/>
+      <w:bookmarkEnd w:id="23"/>
     </w:p>
     <w:p>
       <w:pPr>
@@ -6442,21 +6764,21 @@
         <w:pStyle w:val="Heading1"/>
         <w:pageBreakBefore/>
       </w:pPr>
-      <w:bookmarkStart w:id="23" w:name="_Toc241511973"/>
-      <w:r>
-        <w:t>6.  Production, Delivery and Planning boards</w:t>
-      </w:r>
-      <w:bookmarkEnd w:id="23"/>
+      <w:bookmarkStart w:id="24" w:name="_Toc241512335"/>
+      <w:r>
+        <w:t>7.  Production, Delivery and Planning boards</w:t>
+      </w:r>
+      <w:bookmarkEnd w:id="24"/>
     </w:p>
     <w:p>
       <w:pPr>
         <w:pStyle w:val="Heading2"/>
       </w:pPr>
-      <w:bookmarkStart w:id="24" w:name="_Toc241511974"/>
+      <w:bookmarkStart w:id="25" w:name="_Toc241512336"/>
       <w:r>
         <w:t>Production Board</w:t>
       </w:r>
-      <w:bookmarkEnd w:id="24"/>
+      <w:bookmarkEnd w:id="25"/>
     </w:p>
     <w:p>
       <w:pPr>
@@ -6580,11 +6902,11 @@
       <w:pPr>
         <w:pStyle w:val="Heading2"/>
       </w:pPr>
-      <w:bookmarkStart w:id="25" w:name="_Toc241511975"/>
+      <w:bookmarkStart w:id="26" w:name="_Toc241512337"/>
       <w:r>
         <w:t>Vehicle pictures</w:t>
       </w:r>
-      <w:bookmarkEnd w:id="25"/>
+      <w:bookmarkEnd w:id="26"/>
     </w:p>
     <w:p>
       <w:pPr>
@@ -6638,11 +6960,11 @@
       <w:pPr>
         <w:pStyle w:val="Heading2"/>
       </w:pPr>
-      <w:bookmarkStart w:id="26" w:name="_Toc241511976"/>
+      <w:bookmarkStart w:id="27" w:name="_Toc241512338"/>
       <w:r>
         <w:t>Delivery and Planning boards</w:t>
       </w:r>
-      <w:bookmarkEnd w:id="26"/>
+      <w:bookmarkEnd w:id="27"/>
     </w:p>
     <w:p>
       <w:pPr>
@@ -6728,11 +7050,11 @@
       <w:pPr>
         <w:pStyle w:val="Heading2"/>
       </w:pPr>
-      <w:bookmarkStart w:id="27" w:name="_Toc241511977"/>
+      <w:bookmarkStart w:id="28" w:name="_Toc241512339"/>
       <w:r>
         <w:t>TV display</w:t>
       </w:r>
-      <w:bookmarkEnd w:id="27"/>
+      <w:bookmarkEnd w:id="28"/>
     </w:p>
     <w:p>
       <w:pPr>
@@ -6757,11 +7079,11 @@
         <w:pStyle w:val="Heading1"/>
         <w:pageBreakBefore/>
       </w:pPr>
-      <w:bookmarkStart w:id="28" w:name="_Toc241511978"/>
-      <w:r>
-        <w:t>7.  CCC estimates coming into ShopControl</w:t>
-      </w:r>
-      <w:bookmarkEnd w:id="28"/>
+      <w:bookmarkStart w:id="29" w:name="_Toc241512340"/>
+      <w:r>
+        <w:t>8.  CCC estimates coming into ShopControl</w:t>
+      </w:r>
+      <w:bookmarkEnd w:id="29"/>
     </w:p>
     <w:p>
       <w:pPr>
@@ -6866,11 +7188,11 @@
         <w:pStyle w:val="Heading1"/>
         <w:pageBreakBefore/>
       </w:pPr>
-      <w:bookmarkStart w:id="29" w:name="_Toc241511979"/>
-      <w:r>
-        <w:t>8.  Parts</w:t>
-      </w:r>
-      <w:bookmarkEnd w:id="29"/>
+      <w:bookmarkStart w:id="30" w:name="_Toc241512341"/>
+      <w:r>
+        <w:t>9.  Parts</w:t>
+      </w:r>
+      <w:bookmarkEnd w:id="30"/>
     </w:p>
     <w:p>
       <w:pPr>
@@ -6924,11 +7246,11 @@
       <w:pPr>
         <w:pStyle w:val="Heading2"/>
       </w:pPr>
-      <w:bookmarkStart w:id="30" w:name="_Toc241511980"/>
+      <w:bookmarkStart w:id="31" w:name="_Toc241512342"/>
       <w:r>
         <w:t>What counts as a problem</w:t>
       </w:r>
-      <w:bookmarkEnd w:id="30"/>
+      <w:bookmarkEnd w:id="31"/>
     </w:p>
     <w:p>
       <w:pPr>
@@ -6992,11 +7314,11 @@
       <w:pPr>
         <w:pStyle w:val="Heading2"/>
       </w:pPr>
-      <w:bookmarkStart w:id="31" w:name="_Toc241511981"/>
+      <w:bookmarkStart w:id="32" w:name="_Toc241512343"/>
       <w:r>
         <w:t>Ordering parts</w:t>
       </w:r>
-      <w:bookmarkEnd w:id="31"/>
+      <w:bookmarkEnd w:id="32"/>
     </w:p>
     <w:p>
       <w:pPr>
@@ -7099,11 +7421,11 @@
       <w:pPr>
         <w:pStyle w:val="Heading2"/>
       </w:pPr>
-      <w:bookmarkStart w:id="32" w:name="_Toc241511982"/>
+      <w:bookmarkStart w:id="33" w:name="_Toc241512344"/>
       <w:r>
         <w:t>Mirror matching and carts</w:t>
       </w:r>
-      <w:bookmarkEnd w:id="32"/>
+      <w:bookmarkEnd w:id="33"/>
     </w:p>
     <w:p>
       <w:pPr>
@@ -7237,11 +7559,11 @@
       <w:pPr>
         <w:pStyle w:val="Heading2"/>
       </w:pPr>
-      <w:bookmarkStart w:id="33" w:name="_Toc241511983"/>
+      <w:bookmarkStart w:id="34" w:name="_Toc241512345"/>
       <w:r>
         <w:t>Other parts screens</w:t>
       </w:r>
-      <w:bookmarkEnd w:id="33"/>
+      <w:bookmarkEnd w:id="34"/>
     </w:p>
     <w:p>
       <w:pPr>
@@ -7328,11 +7650,11 @@
         <w:pStyle w:val="Heading1"/>
         <w:pageBreakBefore/>
       </w:pPr>
-      <w:bookmarkStart w:id="34" w:name="_Toc241511984"/>
-      <w:r>
-        <w:t>9.  Vehicle QC (office view)</w:t>
-      </w:r>
-      <w:bookmarkEnd w:id="34"/>
+      <w:bookmarkStart w:id="35" w:name="_Toc241512346"/>
+      <w:r>
+        <w:t>10.  Vehicle QC (office view)</w:t>
+      </w:r>
+      <w:bookmarkEnd w:id="35"/>
     </w:p>
     <w:p>
       <w:pPr>
@@ -7366,11 +7688,11 @@
       <w:pPr>
         <w:pStyle w:val="Heading2"/>
       </w:pPr>
-      <w:bookmarkStart w:id="35" w:name="_Toc241511985"/>
+      <w:bookmarkStart w:id="36" w:name="_Toc241512347"/>
       <w:r>
         <w:t>Pulling up a car's QC report</w:t>
       </w:r>
-      <w:bookmarkEnd w:id="35"/>
+      <w:bookmarkEnd w:id="36"/>
     </w:p>
     <w:p>
       <w:pPr>
@@ -7481,11 +7803,11 @@
         <w:pStyle w:val="Heading1"/>
         <w:pageBreakBefore/>
       </w:pPr>
-      <w:bookmarkStart w:id="36" w:name="_Toc241511986"/>
-      <w:r>
-        <w:t>10.  Completed Jobs (job records)</w:t>
-      </w:r>
-      <w:bookmarkEnd w:id="36"/>
+      <w:bookmarkStart w:id="37" w:name="_Toc241512348"/>
+      <w:r>
+        <w:t>11.  Completed Jobs (job records)</w:t>
+      </w:r>
+      <w:bookmarkEnd w:id="37"/>
     </w:p>
     <w:p>
       <w:pPr>
@@ -7672,11 +7994,11 @@
       <w:pPr>
         <w:pStyle w:val="Heading2"/>
       </w:pPr>
-      <w:bookmarkStart w:id="37" w:name="_Toc241511987"/>
+      <w:bookmarkStart w:id="38" w:name="_Toc241512349"/>
       <w:r>
         <w:t>Deleted jobs</w:t>
       </w:r>
-      <w:bookmarkEnd w:id="37"/>
+      <w:bookmarkEnd w:id="38"/>
     </w:p>
     <w:p>
       <w:pPr>
@@ -7732,21 +8054,21 @@
         <w:pStyle w:val="Heading1"/>
         <w:pageBreakBefore/>
       </w:pPr>
-      <w:bookmarkStart w:id="38" w:name="_Toc241511988"/>
-      <w:r>
-        <w:t>11.  Office tools</w:t>
-      </w:r>
-      <w:bookmarkEnd w:id="38"/>
+      <w:bookmarkStart w:id="39" w:name="_Toc241512350"/>
+      <w:r>
+        <w:t>12.  Office tools</w:t>
+      </w:r>
+      <w:bookmarkEnd w:id="39"/>
     </w:p>
     <w:p>
       <w:pPr>
         <w:pStyle w:val="Heading2"/>
       </w:pPr>
-      <w:bookmarkStart w:id="39" w:name="_Toc241511989"/>
+      <w:bookmarkStart w:id="40" w:name="_Toc241512351"/>
       <w:r>
         <w:t>Missed Calls / Callback Requests</w:t>
       </w:r>
-      <w:bookmarkEnd w:id="39"/>
+      <w:bookmarkEnd w:id="40"/>
     </w:p>
     <w:p>
       <w:pPr>
@@ -7820,11 +8142,11 @@
       <w:pPr>
         <w:pStyle w:val="Heading2"/>
       </w:pPr>
-      <w:bookmarkStart w:id="40" w:name="_Toc241511990"/>
+      <w:bookmarkStart w:id="41" w:name="_Toc241512352"/>
       <w:r>
         <w:t>Tasks</w:t>
       </w:r>
-      <w:bookmarkEnd w:id="40"/>
+      <w:bookmarkEnd w:id="41"/>
     </w:p>
     <w:p>
       <w:pPr>
@@ -7838,11 +8160,11 @@
       <w:pPr>
         <w:pStyle w:val="Heading2"/>
       </w:pPr>
-      <w:bookmarkStart w:id="41" w:name="_Toc241511991"/>
+      <w:bookmarkStart w:id="42" w:name="_Toc241512353"/>
       <w:r>
         <w:t>Booth Filters and Facility Checklist</w:t>
       </w:r>
-      <w:bookmarkEnd w:id="41"/>
+      <w:bookmarkEnd w:id="42"/>
     </w:p>
     <w:p>
       <w:pPr>
@@ -7876,11 +8198,11 @@
       <w:pPr>
         <w:pStyle w:val="Heading2"/>
       </w:pPr>
-      <w:bookmarkStart w:id="42" w:name="_Toc241511992"/>
+      <w:bookmarkStart w:id="43" w:name="_Toc241512354"/>
       <w:r>
         <w:t>AR Balances and Cycle Time</w:t>
       </w:r>
-      <w:bookmarkEnd w:id="42"/>
+      <w:bookmarkEnd w:id="43"/>
     </w:p>
     <w:p>
       <w:pPr>
@@ -7926,11 +8248,11 @@
       <w:pPr>
         <w:pStyle w:val="Heading2"/>
       </w:pPr>
-      <w:bookmarkStart w:id="43" w:name="_Toc241511993"/>
+      <w:bookmarkStart w:id="44" w:name="_Toc241512355"/>
       <w:r>
         <w:t>Photos and Activity Log</w:t>
       </w:r>
-      <w:bookmarkEnd w:id="43"/>
+      <w:bookmarkEnd w:id="44"/>
     </w:p>
     <w:p>
       <w:pPr>
@@ -7977,21 +8299,21 @@
         <w:pStyle w:val="Heading1"/>
         <w:pageBreakBefore/>
       </w:pPr>
-      <w:bookmarkStart w:id="44" w:name="_Toc241511994"/>
-      <w:r>
-        <w:t>12.  Time off and messages (office and admins)</w:t>
-      </w:r>
-      <w:bookmarkEnd w:id="44"/>
+      <w:bookmarkStart w:id="45" w:name="_Toc241512356"/>
+      <w:r>
+        <w:t>13.  Time off and messages (office and admins)</w:t>
+      </w:r>
+      <w:bookmarkEnd w:id="45"/>
     </w:p>
     <w:p>
       <w:pPr>
         <w:pStyle w:val="Heading2"/>
       </w:pPr>
-      <w:bookmarkStart w:id="45" w:name="_Toc241511995"/>
+      <w:bookmarkStart w:id="46" w:name="_Toc241512357"/>
       <w:r>
         <w:t>Time Off tab</w:t>
       </w:r>
-      <w:bookmarkEnd w:id="45"/>
+      <w:bookmarkEnd w:id="46"/>
     </w:p>
     <w:p>
       <w:pPr>
@@ -8115,11 +8437,11 @@
       <w:pPr>
         <w:pStyle w:val="Heading2"/>
       </w:pPr>
-      <w:bookmarkStart w:id="46" w:name="_Toc241511996"/>
+      <w:bookmarkStart w:id="47" w:name="_Toc241512358"/>
       <w:r>
         <w:t>Messages &amp; Info tab</w:t>
       </w:r>
-      <w:bookmarkEnd w:id="46"/>
+      <w:bookmarkEnd w:id="47"/>
     </w:p>
     <w:p>
       <w:pPr>
@@ -8206,21 +8528,21 @@
         <w:pStyle w:val="Heading1"/>
         <w:pageBreakBefore/>
       </w:pPr>
-      <w:bookmarkStart w:id="47" w:name="_Toc241511997"/>
-      <w:r>
-        <w:t>13.  Admin: employees and settings</w:t>
-      </w:r>
-      <w:bookmarkEnd w:id="47"/>
+      <w:bookmarkStart w:id="48" w:name="_Toc241512359"/>
+      <w:r>
+        <w:t>14.  Admin: employees and settings</w:t>
+      </w:r>
+      <w:bookmarkEnd w:id="48"/>
     </w:p>
     <w:p>
       <w:pPr>
         <w:pStyle w:val="Heading2"/>
       </w:pPr>
-      <w:bookmarkStart w:id="48" w:name="_Toc241511998"/>
+      <w:bookmarkStart w:id="49" w:name="_Toc241512360"/>
       <w:r>
         <w:t>Adding an employee</w:t>
       </w:r>
-      <w:bookmarkEnd w:id="48"/>
+      <w:bookmarkEnd w:id="49"/>
     </w:p>
     <w:p>
       <w:pPr>
@@ -8338,11 +8660,11 @@
       <w:pPr>
         <w:pStyle w:val="Heading2"/>
       </w:pPr>
-      <w:bookmarkStart w:id="49" w:name="_Toc241511999"/>
+      <w:bookmarkStart w:id="50" w:name="_Toc241512361"/>
       <w:r>
         <w:t>Changing an employee</w:t>
       </w:r>
-      <w:bookmarkEnd w:id="49"/>
+      <w:bookmarkEnd w:id="50"/>
     </w:p>
     <w:p>
       <w:pPr>
@@ -8498,11 +8820,11 @@
       <w:pPr>
         <w:pStyle w:val="Heading2"/>
       </w:pPr>
-      <w:bookmarkStart w:id="50" w:name="_Toc241512000"/>
+      <w:bookmarkStart w:id="51" w:name="_Toc241512362"/>
       <w:r>
         <w:t>Board Settings</w:t>
       </w:r>
-      <w:bookmarkEnd w:id="50"/>
+      <w:bookmarkEnd w:id="51"/>
     </w:p>
     <w:p>
       <w:pPr>
@@ -8517,11 +8839,11 @@
         <w:pStyle w:val="Heading1"/>
         <w:pageBreakBefore/>
       </w:pPr>
-      <w:bookmarkStart w:id="51" w:name="_Toc241512001"/>
-      <w:r>
-        <w:t>14.  Quick answers</w:t>
-      </w:r>
-      <w:bookmarkEnd w:id="51"/>
+      <w:bookmarkStart w:id="52" w:name="_Toc241512363"/>
+      <w:r>
+        <w:t>15.  Quick answers</w:t>
+      </w:r>
+      <w:bookmarkEnd w:id="52"/>
     </w:p>
     <w:tbl>
       <w:tblPr>
@@ -8538,7 +8860,7 @@
           <w:left w:w="10" w:type="dxa"/>
           <w:right w:w="10" w:type="dxa"/>
         </w:tblCellMar>
-        <w:tblLook w:val="0000" w:firstRow="0" w:lastRow="0" w:firstColumn="0" w:lastColumn="0" w:noHBand="0" w:noVBand="0"/>
+        <w:tblLook w:val="04A0" w:firstRow="1" w:lastRow="0" w:firstColumn="1" w:lastColumn="0" w:noHBand="0" w:noVBand="1"/>
       </w:tblPr>
       <w:tblGrid>
         <w:gridCol w:w="2900"/>
@@ -9161,11 +9483,11 @@
         <w:pStyle w:val="Heading1"/>
         <w:pageBreakBefore/>
       </w:pPr>
-      <w:bookmarkStart w:id="52" w:name="_Toc241512002"/>
+      <w:bookmarkStart w:id="53" w:name="_Toc241512364"/>
       <w:r>
         <w:t>Manual versions</w:t>
       </w:r>
-      <w:bookmarkEnd w:id="52"/>
+      <w:bookmarkEnd w:id="53"/>
     </w:p>
     <w:tbl>
       <w:tblPr>
@@ -9182,7 +9504,7 @@
           <w:left w:w="10" w:type="dxa"/>
           <w:right w:w="10" w:type="dxa"/>
         </w:tblCellMar>
-        <w:tblLook w:val="0000" w:firstRow="0" w:lastRow="0" w:firstColumn="0" w:lastColumn="0" w:noHBand="0" w:noVBand="0"/>
+        <w:tblLook w:val="04A0" w:firstRow="1" w:lastRow="0" w:firstColumn="1" w:lastColumn="0" w:noHBand="0" w:noVBand="1"/>
       </w:tblPr>
       <w:tblGrid>
         <w:gridCol w:w="3120"/>
@@ -9316,7 +9638,7 @@
                 <w:b/>
                 <w:bCs/>
               </w:rPr>
-              <w:t>1.8</w:t>
+              <w:t>1.9</w:t>
             </w:r>
           </w:p>
         </w:tc>
@@ -9367,10 +9689,10 @@
                 <w:b/>
                 <w:bCs/>
               </w:rPr>
-              <w:t>Completed Jobs</w:t>
-            </w:r>
-            <w:r>
-              <w:t xml:space="preserve"> tab with each finished job's full file (production timeline, parts, QC, photos, every change). Only an admin can delete a delivered job or its parts.</w:t>
+              <w:t>Find a vehicle</w:t>
+            </w:r>
+            <w:r>
+              <w:t xml:space="preserve"> search at the top of the office program. It finds any car, at any stage or finished, by RO, customer, vehicle, VIN, plate or claim number.</w:t>
             </w:r>
           </w:p>
         </w:tc>
@@ -9407,7 +9729,7 @@
                 <w:b/>
                 <w:bCs/>
               </w:rPr>
-              <w:t>1.7</w:t>
+              <w:t>1.8</w:t>
             </w:r>
           </w:p>
         </w:tc>
@@ -9451,17 +9773,17 @@
           </w:tcPr>
           <w:p>
             <w:r>
-              <w:t xml:space="preserve">The Employee App now shows </w:t>
+              <w:t xml:space="preserve">New </w:t>
             </w:r>
             <w:r>
               <w:rPr>
                 <w:b/>
                 <w:bCs/>
               </w:rPr>
-              <w:t>where each part is</w:t>
-            </w:r>
-            <w:r>
-              <w:t>: the car's parts cart, and the cart shelf or storage spot for every part.</w:t>
+              <w:t>Completed Jobs</w:t>
+            </w:r>
+            <w:r>
+              <w:t xml:space="preserve"> tab with each finished job's full file (production timeline, parts, QC, photos, every change). Only an admin can delete a delivered job or its parts.</w:t>
             </w:r>
           </w:p>
         </w:tc>
@@ -9498,7 +9820,7 @@
                 <w:b/>
                 <w:bCs/>
               </w:rPr>
-              <w:t>1.6</w:t>
+              <w:t>1.7</w:t>
             </w:r>
           </w:p>
         </w:tc>
@@ -9542,37 +9864,17 @@
           </w:tcPr>
           <w:p>
             <w:r>
-              <w:t xml:space="preserve">Whoever does </w:t>
+              <w:t xml:space="preserve">The Employee App now shows </w:t>
             </w:r>
             <w:r>
               <w:rPr>
                 <w:b/>
                 <w:bCs/>
               </w:rPr>
-              <w:t>Check-In</w:t>
-            </w:r>
-            <w:r>
-              <w:t xml:space="preserve"> automatically gets the </w:t>
-            </w:r>
-            <w:r>
-              <w:rPr>
-                <w:b/>
-                <w:bCs/>
-              </w:rPr>
-              <w:t>Final QC</w:t>
-            </w:r>
-            <w:r>
-              <w:t xml:space="preserve"> checklist too. New </w:t>
-            </w:r>
-            <w:r>
-              <w:rPr>
-                <w:b/>
-                <w:bCs/>
-              </w:rPr>
-              <w:t>QC report</w:t>
-            </w:r>
-            <w:r>
-              <w:t xml:space="preserve"> for each car: all five checklists with signatures on one printable page.</w:t>
+              <w:t>where each part is</w:t>
+            </w:r>
+            <w:r>
+              <w:t>: the car's parts cart, and the cart shelf or storage spot for every part.</w:t>
             </w:r>
           </w:p>
         </w:tc>
@@ -9609,7 +9911,7 @@
                 <w:b/>
                 <w:bCs/>
               </w:rPr>
-              <w:t>1.5</w:t>
+              <w:t>1.6</w:t>
             </w:r>
           </w:p>
         </w:tc>
@@ -9653,17 +9955,37 @@
           </w:tcPr>
           <w:p>
             <w:r>
-              <w:t xml:space="preserve">Body technicians automatically get the </w:t>
+              <w:t xml:space="preserve">Whoever does </w:t>
             </w:r>
             <w:r>
               <w:rPr>
                 <w:b/>
                 <w:bCs/>
               </w:rPr>
-              <w:t>Reassy</w:t>
-            </w:r>
-            <w:r>
-              <w:t xml:space="preserve"> checklist too.</w:t>
+              <w:t>Check-In</w:t>
+            </w:r>
+            <w:r>
+              <w:t xml:space="preserve"> automatically gets the </w:t>
+            </w:r>
+            <w:r>
+              <w:rPr>
+                <w:b/>
+                <w:bCs/>
+              </w:rPr>
+              <w:t>Final QC</w:t>
+            </w:r>
+            <w:r>
+              <w:t xml:space="preserve"> checklist too. New </w:t>
+            </w:r>
+            <w:r>
+              <w:rPr>
+                <w:b/>
+                <w:bCs/>
+              </w:rPr>
+              <w:t>QC report</w:t>
+            </w:r>
+            <w:r>
+              <w:t xml:space="preserve"> for each car: all five checklists with signatures on one printable page.</w:t>
             </w:r>
           </w:p>
         </w:tc>
@@ -9700,7 +10022,7 @@
                 <w:b/>
                 <w:bCs/>
               </w:rPr>
-              <w:t>1.4</w:t>
+              <w:t>1.5</w:t>
             </w:r>
           </w:p>
         </w:tc>
@@ -9744,17 +10066,17 @@
           </w:tcPr>
           <w:p>
             <w:r>
-              <w:t xml:space="preserve">Employees can be set to </w:t>
+              <w:t xml:space="preserve">Body technicians automatically get the </w:t>
             </w:r>
             <w:r>
               <w:rPr>
                 <w:b/>
                 <w:bCs/>
               </w:rPr>
-              <w:t>also do</w:t>
-            </w:r>
-            <w:r>
-              <w:t xml:space="preserve"> other checklists (for example a body tech who reassembles also gets the Reassy checklist).</w:t>
+              <w:t>Reassy</w:t>
+            </w:r>
+            <w:r>
+              <w:t xml:space="preserve"> checklist too.</w:t>
             </w:r>
           </w:p>
         </w:tc>
@@ -9791,7 +10113,7 @@
                 <w:b/>
                 <w:bCs/>
               </w:rPr>
-              <w:t>1.3</w:t>
+              <w:t>1.4</w:t>
             </w:r>
           </w:p>
         </w:tc>
@@ -9835,7 +10157,17 @@
           </w:tcPr>
           <w:p>
             <w:r>
-              <w:t>New accounts and admin password resets use a temporary password; you choose your own the first time you sign in.</w:t>
+              <w:t xml:space="preserve">Employees can be set to </w:t>
+            </w:r>
+            <w:r>
+              <w:rPr>
+                <w:b/>
+                <w:bCs/>
+              </w:rPr>
+              <w:t>also do</w:t>
+            </w:r>
+            <w:r>
+              <w:t xml:space="preserve"> other checklists (for example a body tech who reassembles also gets the Reassy checklist).</w:t>
             </w:r>
           </w:p>
         </w:tc>
@@ -9872,7 +10204,7 @@
                 <w:b/>
                 <w:bCs/>
               </w:rPr>
-              <w:t>1.2</w:t>
+              <w:t>1.3</w:t>
             </w:r>
           </w:p>
         </w:tc>
@@ -9916,17 +10248,7 @@
           </w:tcPr>
           <w:p>
             <w:r>
-              <w:t xml:space="preserve">Added the </w:t>
-            </w:r>
-            <w:r>
-              <w:rPr>
-                <w:b/>
-                <w:bCs/>
-              </w:rPr>
-              <w:t>Help</w:t>
-            </w:r>
-            <w:r>
-              <w:t xml:space="preserve"> tab in the office program and a search box in the manual.</w:t>
+              <w:t>New accounts and admin password resets use a temporary password; you choose your own the first time you sign in.</w:t>
             </w:r>
           </w:p>
         </w:tc>
@@ -9963,7 +10285,7 @@
                 <w:b/>
                 <w:bCs/>
               </w:rPr>
-              <w:t>1.1</w:t>
+              <w:t>1.2</w:t>
             </w:r>
           </w:p>
         </w:tc>
@@ -10007,17 +10329,17 @@
           </w:tcPr>
           <w:p>
             <w:r>
-              <w:t xml:space="preserve">Employee App address is now </w:t>
+              <w:t xml:space="preserve">Added the </w:t>
             </w:r>
             <w:r>
               <w:rPr>
                 <w:b/>
                 <w:bCs/>
               </w:rPr>
-              <w:t>https://conceptautobody.app</w:t>
-            </w:r>
-            <w:r>
-              <w:t xml:space="preserve"> and works on phones anywhere. Added how to put it on your phone's home screen.</w:t>
+              <w:t>Help</w:t>
+            </w:r>
+            <w:r>
+              <w:t xml:space="preserve"> tab in the office program and a search box in the manual.</w:t>
             </w:r>
           </w:p>
         </w:tc>
@@ -10054,7 +10376,7 @@
                 <w:b/>
                 <w:bCs/>
               </w:rPr>
-              <w:t>1.0</w:t>
+              <w:t>1.1</w:t>
             </w:r>
           </w:p>
         </w:tc>
@@ -10098,6 +10420,97 @@
           </w:tcPr>
           <w:p>
             <w:r>
+              <w:t xml:space="preserve">Employee App address is now </w:t>
+            </w:r>
+            <w:r>
+              <w:rPr>
+                <w:b/>
+                <w:bCs/>
+              </w:rPr>
+              <w:t>https://conceptautobody.app</w:t>
+            </w:r>
+            <w:r>
+              <w:t xml:space="preserve"> and works on phones anywhere. Added how to put it on your phone's home screen.</w:t>
+            </w:r>
+          </w:p>
+        </w:tc>
+      </w:tr>
+      <w:tr>
+        <w:tblPrEx>
+          <w:tblCellMar>
+            <w:top w:w="0" w:type="dxa"/>
+            <w:bottom w:w="0" w:type="dxa"/>
+          </w:tblCellMar>
+        </w:tblPrEx>
+        <w:trPr>
+          <w:cantSplit/>
+        </w:trPr>
+        <w:tc>
+          <w:tcPr>
+            <w:tcW w:w="3120" w:type="dxa"/>
+            <w:tcBorders>
+              <w:top w:val="single" w:sz="4" w:space="0" w:color="C9CFD6"/>
+              <w:left w:val="single" w:sz="4" w:space="0" w:color="C9CFD6"/>
+              <w:bottom w:val="single" w:sz="4" w:space="0" w:color="C9CFD6"/>
+              <w:right w:val="single" w:sz="4" w:space="0" w:color="C9CFD6"/>
+            </w:tcBorders>
+            <w:tcMar>
+              <w:top w:w="80" w:type="dxa"/>
+              <w:left w:w="120" w:type="dxa"/>
+              <w:bottom w:w="80" w:type="dxa"/>
+              <w:right w:w="120" w:type="dxa"/>
+            </w:tcMar>
+          </w:tcPr>
+          <w:p>
+            <w:r>
+              <w:rPr>
+                <w:b/>
+                <w:bCs/>
+              </w:rPr>
+              <w:t>1.0</w:t>
+            </w:r>
+          </w:p>
+        </w:tc>
+        <w:tc>
+          <w:tcPr>
+            <w:tcW w:w="3120" w:type="dxa"/>
+            <w:tcBorders>
+              <w:top w:val="single" w:sz="4" w:space="0" w:color="C9CFD6"/>
+              <w:left w:val="single" w:sz="4" w:space="0" w:color="C9CFD6"/>
+              <w:bottom w:val="single" w:sz="4" w:space="0" w:color="C9CFD6"/>
+              <w:right w:val="single" w:sz="4" w:space="0" w:color="C9CFD6"/>
+            </w:tcBorders>
+            <w:tcMar>
+              <w:top w:w="80" w:type="dxa"/>
+              <w:left w:w="120" w:type="dxa"/>
+              <w:bottom w:w="80" w:type="dxa"/>
+              <w:right w:w="120" w:type="dxa"/>
+            </w:tcMar>
+          </w:tcPr>
+          <w:p>
+            <w:r>
+              <w:t>September 28, 2026</w:t>
+            </w:r>
+          </w:p>
+        </w:tc>
+        <w:tc>
+          <w:tcPr>
+            <w:tcW w:w="3120" w:type="dxa"/>
+            <w:tcBorders>
+              <w:top w:val="single" w:sz="4" w:space="0" w:color="C9CFD6"/>
+              <w:left w:val="single" w:sz="4" w:space="0" w:color="C9CFD6"/>
+              <w:bottom w:val="single" w:sz="4" w:space="0" w:color="C9CFD6"/>
+              <w:right w:val="single" w:sz="4" w:space="0" w:color="C9CFD6"/>
+            </w:tcBorders>
+            <w:tcMar>
+              <w:top w:w="80" w:type="dxa"/>
+              <w:left w:w="120" w:type="dxa"/>
+              <w:bottom w:w="80" w:type="dxa"/>
+              <w:right w:w="120" w:type="dxa"/>
+            </w:tcMar>
+          </w:tcPr>
+          <w:p>
+            <w:r>
               <w:t>First edition.</w:t>
             </w:r>
           </w:p>
@@ -10159,7 +10572,7 @@
         <w:sz w:val="18"/>
         <w:szCs w:val="18"/>
       </w:rPr>
-      <w:t xml:space="preserve">Concept Autobody  ·  Version 1.8  ·  Page </w:t>
+      <w:t xml:space="preserve">Concept Autobody  ·  Version 1.9  ·  Page </w:t>
     </w:r>
     <w:r>
       <w:rPr>
@@ -10252,10 +10665,150 @@
 <file path=word/numbering.xml><?xml version="1.0" encoding="utf-8"?>
 <w:numbering xmlns:wpc="http://schemas.microsoft.com/office/word/2010/wordprocessingCanvas" xmlns:cx="http://schemas.microsoft.com/office/drawing/2014/chartex" xmlns:cx1="http://schemas.microsoft.com/office/drawing/2015/9/8/chartex" xmlns:cx2="http://schemas.microsoft.com/office/drawing/2015/10/21/chartex" xmlns:cx3="http://schemas.microsoft.com/office/drawing/2016/5/9/chartex" xmlns:cx4="http://schemas.microsoft.com/office/drawing/2016/5/10/chartex" xmlns:cx5="http://schemas.microsoft.com/office/drawing/2016/5/11/chartex" xmlns:cx6="http://schemas.microsoft.com/office/drawing/2016/5/12/chartex" xmlns:cx7="http://schemas.microsoft.com/office/drawing/2016/5/13/chartex" xmlns:cx8="http://schemas.microsoft.com/office/drawing/2016/5/14/chartex" xmlns:mc="http://schemas.openxmlformats.org/markup-compatibility/2006" xmlns:aink="http://schemas.microsoft.com/office/drawing/2016/ink" xmlns:am3d="http://schemas.microsoft.com/office/drawing/2017/model3d" xmlns:o="urn:schemas-microsoft-com:office:office" xmlns:oel="http://schemas.microsoft.com/office/2019/extlst" xmlns:r="http://schemas.openxmlformats.org/officeDocument/2006/relationships" xmlns:m="http://schemas.openxmlformats.org/officeDocument/2006/math" xmlns:v="urn:schemas-microsoft-com:vml" xmlns:wp14="http://schemas.microsoft.com/office/word/2010/wordprocessingDrawing" xmlns:wp="http://schemas.openxmlformats.org/drawingml/2006/wordprocessingDrawing" xmlns:w10="urn:schemas-microsoft-com:office:word" xmlns:w="http://schemas.openxmlformats.org/wordprocessingml/2006/main" xmlns:w14="http://schemas.microsoft.com/office/word/2010/wordml" xmlns:w15="http://schemas.microsoft.com/office/word/2012/wordml" xmlns:w16cex="http://schemas.microsoft.com/office/word/2018/wordml/cex" xmlns:w16cid="http://schemas.microsoft.com/office/word/2016/wordml/cid" xmlns:w16="http://schemas.microsoft.com/office/word/2018/wordml" xmlns:w16du="http://schemas.microsoft.com/office/word/2023/wordml/word16du" xmlns:w16sdtdh="http://schemas.microsoft.com/office/word/2020/wordml/sdtdatahash" xmlns:w16sdtfl="http://schemas.microsoft.com/office/word/2024/wordml/sdtformatlock" xmlns:w16se="http://schemas.microsoft.com/office/word/2015/wordml/symex" xmlns:wpg="http://schemas.microsoft.com/office/word/2010/wordprocessingGroup" xmlns:wpi="http://schemas.microsoft.com/office/word/2010/wordprocessingInk" xmlns:wne="http://schemas.microsoft.com/office/word/2006/wordml" xmlns:wps="http://schemas.microsoft.com/office/word/2010/wordprocessingShape" mc:Ignorable="w14 w15 w16se w16cid w16 w16cex w16sdtdh w16sdtfl w16du wp14">
   <w:abstractNum w:abstractNumId="0" w15:restartNumberingAfterBreak="0">
-    <w:nsid w:val="39007136"/>
+    <w:nsid w:val="073C2646"/>
     <w:multiLevelType w:val="hybridMultilevel"/>
-    <w:tmpl w:val="DBCA654C"/>
-    <w:lvl w:ilvl="0" w:tplc="8F1CC336">
+    <w:tmpl w:val="E408B022"/>
+    <w:lvl w:ilvl="0" w:tplc="8DC4F968">
+      <w:start w:val="1"/>
+      <w:numFmt w:val="bullet"/>
+      <w:lvlText w:val="•"/>
+      <w:lvlJc w:val="left"/>
+      <w:pPr>
+        <w:ind w:left="540" w:hanging="270"/>
+      </w:pPr>
+    </w:lvl>
+    <w:lvl w:ilvl="1" w:tplc="CDF00612">
+      <w:numFmt w:val="decimal"/>
+      <w:lvlText w:val=""/>
+      <w:lvlJc w:val="left"/>
+    </w:lvl>
+    <w:lvl w:ilvl="2" w:tplc="58D8E664">
+      <w:numFmt w:val="decimal"/>
+      <w:lvlText w:val=""/>
+      <w:lvlJc w:val="left"/>
+    </w:lvl>
+    <w:lvl w:ilvl="3" w:tplc="50E03266">
+      <w:numFmt w:val="decimal"/>
+      <w:lvlText w:val=""/>
+      <w:lvlJc w:val="left"/>
+    </w:lvl>
+    <w:lvl w:ilvl="4" w:tplc="C71AB788">
+      <w:numFmt w:val="decimal"/>
+      <w:lvlText w:val=""/>
+      <w:lvlJc w:val="left"/>
+    </w:lvl>
+    <w:lvl w:ilvl="5" w:tplc="598AA09A">
+      <w:numFmt w:val="decimal"/>
+      <w:lvlText w:val=""/>
+      <w:lvlJc w:val="left"/>
+    </w:lvl>
+    <w:lvl w:ilvl="6" w:tplc="C344C11E">
+      <w:numFmt w:val="decimal"/>
+      <w:lvlText w:val=""/>
+      <w:lvlJc w:val="left"/>
+    </w:lvl>
+    <w:lvl w:ilvl="7" w:tplc="2B8E4856">
+      <w:numFmt w:val="decimal"/>
+      <w:lvlText w:val=""/>
+      <w:lvlJc w:val="left"/>
+    </w:lvl>
+    <w:lvl w:ilvl="8" w:tplc="74DECA50">
+      <w:numFmt w:val="decimal"/>
+      <w:lvlText w:val=""/>
+      <w:lvlJc w:val="left"/>
+    </w:lvl>
+  </w:abstractNum>
+  <w:abstractNum w:abstractNumId="1" w15:restartNumberingAfterBreak="0">
+    <w:nsid w:val="52F415B7"/>
+    <w:multiLevelType w:val="hybridMultilevel"/>
+    <w:tmpl w:val="AFD4D0F6"/>
+    <w:lvl w:ilvl="0" w:tplc="2E284118" w:tentative="1">
+      <w:start w:val="1"/>
+      <w:numFmt w:val="bullet"/>
+      <w:lvlText w:val="●"/>
+      <w:lvlJc w:val="left"/>
+      <w:pPr>
+        <w:ind w:left="720" w:hanging="360"/>
+      </w:pPr>
+    </w:lvl>
+    <w:lvl w:ilvl="1" w:tplc="9F864FB8" w:tentative="1">
+      <w:start w:val="1"/>
+      <w:numFmt w:val="bullet"/>
+      <w:lvlText w:val="○"/>
+      <w:lvlJc w:val="left"/>
+      <w:pPr>
+        <w:ind w:left="1440" w:hanging="360"/>
+      </w:pPr>
+    </w:lvl>
+    <w:lvl w:ilvl="2" w:tplc="D1AC38E6" w:tentative="1">
+      <w:start w:val="1"/>
+      <w:numFmt w:val="bullet"/>
+      <w:lvlText w:val="■"/>
+      <w:lvlJc w:val="left"/>
+      <w:pPr>
+        <w:ind w:left="2160" w:hanging="360"/>
+      </w:pPr>
+    </w:lvl>
+    <w:lvl w:ilvl="3" w:tplc="4768B024" w:tentative="1">
+      <w:start w:val="1"/>
+      <w:numFmt w:val="bullet"/>
+      <w:lvlText w:val="●"/>
+      <w:lvlJc w:val="left"/>
+      <w:pPr>
+        <w:ind w:left="2880" w:hanging="360"/>
+      </w:pPr>
+    </w:lvl>
+    <w:lvl w:ilvl="4" w:tplc="E6B2F034" w:tentative="1">
+      <w:start w:val="1"/>
+      <w:numFmt w:val="bullet"/>
+      <w:lvlText w:val="○"/>
+      <w:lvlJc w:val="left"/>
+      <w:pPr>
+        <w:ind w:left="3600" w:hanging="360"/>
+      </w:pPr>
+    </w:lvl>
+    <w:lvl w:ilvl="5" w:tplc="95A2E408" w:tentative="1">
+      <w:start w:val="1"/>
+      <w:numFmt w:val="bullet"/>
+      <w:lvlText w:val="■"/>
+      <w:lvlJc w:val="left"/>
+      <w:pPr>
+        <w:ind w:left="4320" w:hanging="360"/>
+      </w:pPr>
+    </w:lvl>
+    <w:lvl w:ilvl="6" w:tplc="9E0CC87E" w:tentative="1">
+      <w:start w:val="1"/>
+      <w:numFmt w:val="bullet"/>
+      <w:lvlText w:val="●"/>
+      <w:lvlJc w:val="left"/>
+      <w:pPr>
+        <w:ind w:left="5040" w:hanging="360"/>
+      </w:pPr>
+    </w:lvl>
+    <w:lvl w:ilvl="7" w:tplc="32345986" w:tentative="1">
+      <w:start w:val="1"/>
+      <w:numFmt w:val="bullet"/>
+      <w:lvlText w:val="●"/>
+      <w:lvlJc w:val="left"/>
+      <w:pPr>
+        <w:ind w:left="5760" w:hanging="360"/>
+      </w:pPr>
+    </w:lvl>
+    <w:lvl w:ilvl="8" w:tplc="C444E896" w:tentative="1">
+      <w:start w:val="1"/>
+      <w:numFmt w:val="bullet"/>
+      <w:lvlText w:val="●"/>
+      <w:lvlJc w:val="left"/>
+      <w:pPr>
+        <w:ind w:left="6480" w:hanging="360"/>
+      </w:pPr>
+    </w:lvl>
+  </w:abstractNum>
+  <w:abstractNum w:abstractNumId="2" w15:restartNumberingAfterBreak="0">
+    <w:nsid w:val="5822667F"/>
+    <w:multiLevelType w:val="hybridMultilevel"/>
+    <w:tmpl w:val="C01200B4"/>
+    <w:lvl w:ilvl="0" w:tplc="742650E2">
       <w:start w:val="1"/>
       <w:numFmt w:val="decimal"/>
       <w:lvlText w:val="%1."/>
@@ -10269,261 +10822,121 @@
         <w:color w:val="E8620E"/>
       </w:rPr>
     </w:lvl>
-    <w:lvl w:ilvl="1" w:tplc="6C80D8B4">
+    <w:lvl w:ilvl="1" w:tplc="686C92BA">
       <w:numFmt w:val="decimal"/>
       <w:lvlText w:val=""/>
       <w:lvlJc w:val="left"/>
     </w:lvl>
-    <w:lvl w:ilvl="2" w:tplc="1356486A">
+    <w:lvl w:ilvl="2" w:tplc="97CCD866">
       <w:numFmt w:val="decimal"/>
       <w:lvlText w:val=""/>
       <w:lvlJc w:val="left"/>
     </w:lvl>
-    <w:lvl w:ilvl="3" w:tplc="6ED43F14">
+    <w:lvl w:ilvl="3" w:tplc="3B3AA34C">
       <w:numFmt w:val="decimal"/>
       <w:lvlText w:val=""/>
       <w:lvlJc w:val="left"/>
     </w:lvl>
-    <w:lvl w:ilvl="4" w:tplc="77EE7BE6">
+    <w:lvl w:ilvl="4" w:tplc="3C96D59A">
       <w:numFmt w:val="decimal"/>
       <w:lvlText w:val=""/>
       <w:lvlJc w:val="left"/>
     </w:lvl>
-    <w:lvl w:ilvl="5" w:tplc="B866CE1E">
+    <w:lvl w:ilvl="5" w:tplc="2CDE8464">
       <w:numFmt w:val="decimal"/>
       <w:lvlText w:val=""/>
       <w:lvlJc w:val="left"/>
     </w:lvl>
-    <w:lvl w:ilvl="6" w:tplc="FA228A7C">
+    <w:lvl w:ilvl="6" w:tplc="651688AA">
       <w:numFmt w:val="decimal"/>
       <w:lvlText w:val=""/>
       <w:lvlJc w:val="left"/>
     </w:lvl>
-    <w:lvl w:ilvl="7" w:tplc="18D2739A">
+    <w:lvl w:ilvl="7" w:tplc="7DEC359E">
       <w:numFmt w:val="decimal"/>
       <w:lvlText w:val=""/>
       <w:lvlJc w:val="left"/>
     </w:lvl>
-    <w:lvl w:ilvl="8" w:tplc="711475BA">
+    <w:lvl w:ilvl="8" w:tplc="6276B384">
       <w:numFmt w:val="decimal"/>
       <w:lvlText w:val=""/>
       <w:lvlJc w:val="left"/>
     </w:lvl>
   </w:abstractNum>
-  <w:abstractNum w:abstractNumId="1" w15:restartNumberingAfterBreak="0">
-    <w:nsid w:val="3C461B1A"/>
-    <w:multiLevelType w:val="hybridMultilevel"/>
-    <w:tmpl w:val="AF54DE68"/>
-    <w:lvl w:ilvl="0" w:tplc="D7DEDA12">
-      <w:start w:val="1"/>
-      <w:numFmt w:val="bullet"/>
-      <w:lvlText w:val="•"/>
-      <w:lvlJc w:val="left"/>
-      <w:pPr>
-        <w:ind w:left="540" w:hanging="270"/>
-      </w:pPr>
-    </w:lvl>
-    <w:lvl w:ilvl="1" w:tplc="7EFC0E6C">
-      <w:numFmt w:val="decimal"/>
-      <w:lvlText w:val=""/>
-      <w:lvlJc w:val="left"/>
-    </w:lvl>
-    <w:lvl w:ilvl="2" w:tplc="8766BA88">
-      <w:numFmt w:val="decimal"/>
-      <w:lvlText w:val=""/>
-      <w:lvlJc w:val="left"/>
-    </w:lvl>
-    <w:lvl w:ilvl="3" w:tplc="ACE6A01C">
-      <w:numFmt w:val="decimal"/>
-      <w:lvlText w:val=""/>
-      <w:lvlJc w:val="left"/>
-    </w:lvl>
-    <w:lvl w:ilvl="4" w:tplc="D7962E60">
-      <w:numFmt w:val="decimal"/>
-      <w:lvlText w:val=""/>
-      <w:lvlJc w:val="left"/>
-    </w:lvl>
-    <w:lvl w:ilvl="5" w:tplc="858A672A">
-      <w:numFmt w:val="decimal"/>
-      <w:lvlText w:val=""/>
-      <w:lvlJc w:val="left"/>
-    </w:lvl>
-    <w:lvl w:ilvl="6" w:tplc="56DCCC5E">
-      <w:numFmt w:val="decimal"/>
-      <w:lvlText w:val=""/>
-      <w:lvlJc w:val="left"/>
-    </w:lvl>
-    <w:lvl w:ilvl="7" w:tplc="E8EC44DC">
-      <w:numFmt w:val="decimal"/>
-      <w:lvlText w:val=""/>
-      <w:lvlJc w:val="left"/>
-    </w:lvl>
-    <w:lvl w:ilvl="8" w:tplc="23CCC854">
-      <w:numFmt w:val="decimal"/>
-      <w:lvlText w:val=""/>
-      <w:lvlJc w:val="left"/>
-    </w:lvl>
-  </w:abstractNum>
-  <w:abstractNum w:abstractNumId="2" w15:restartNumberingAfterBreak="0">
-    <w:nsid w:val="54A458E5"/>
-    <w:multiLevelType w:val="hybridMultilevel"/>
-    <w:tmpl w:val="3182D562"/>
-    <w:lvl w:ilvl="0" w:tplc="D1D69BCE" w:tentative="1">
-      <w:start w:val="1"/>
-      <w:numFmt w:val="bullet"/>
-      <w:lvlText w:val="●"/>
-      <w:lvlJc w:val="left"/>
-      <w:pPr>
-        <w:ind w:left="720" w:hanging="360"/>
-      </w:pPr>
-    </w:lvl>
-    <w:lvl w:ilvl="1" w:tplc="A1023732" w:tentative="1">
-      <w:start w:val="1"/>
-      <w:numFmt w:val="bullet"/>
-      <w:lvlText w:val="○"/>
-      <w:lvlJc w:val="left"/>
-      <w:pPr>
-        <w:ind w:left="1440" w:hanging="360"/>
-      </w:pPr>
-    </w:lvl>
-    <w:lvl w:ilvl="2" w:tplc="E9B68480" w:tentative="1">
-      <w:start w:val="1"/>
-      <w:numFmt w:val="bullet"/>
-      <w:lvlText w:val="■"/>
-      <w:lvlJc w:val="left"/>
-      <w:pPr>
-        <w:ind w:left="2160" w:hanging="360"/>
-      </w:pPr>
-    </w:lvl>
-    <w:lvl w:ilvl="3" w:tplc="C87CC196" w:tentative="1">
-      <w:start w:val="1"/>
-      <w:numFmt w:val="bullet"/>
-      <w:lvlText w:val="●"/>
-      <w:lvlJc w:val="left"/>
-      <w:pPr>
-        <w:ind w:left="2880" w:hanging="360"/>
-      </w:pPr>
-    </w:lvl>
-    <w:lvl w:ilvl="4" w:tplc="104A5618" w:tentative="1">
-      <w:start w:val="1"/>
-      <w:numFmt w:val="bullet"/>
-      <w:lvlText w:val="○"/>
-      <w:lvlJc w:val="left"/>
-      <w:pPr>
-        <w:ind w:left="3600" w:hanging="360"/>
-      </w:pPr>
-    </w:lvl>
-    <w:lvl w:ilvl="5" w:tplc="6D2EF0C0" w:tentative="1">
-      <w:start w:val="1"/>
-      <w:numFmt w:val="bullet"/>
-      <w:lvlText w:val="■"/>
-      <w:lvlJc w:val="left"/>
-      <w:pPr>
-        <w:ind w:left="4320" w:hanging="360"/>
-      </w:pPr>
-    </w:lvl>
-    <w:lvl w:ilvl="6" w:tplc="90CA0178" w:tentative="1">
-      <w:start w:val="1"/>
-      <w:numFmt w:val="bullet"/>
-      <w:lvlText w:val="●"/>
-      <w:lvlJc w:val="left"/>
-      <w:pPr>
-        <w:ind w:left="5040" w:hanging="360"/>
-      </w:pPr>
-    </w:lvl>
-    <w:lvl w:ilvl="7" w:tplc="CB3C5C40" w:tentative="1">
-      <w:start w:val="1"/>
-      <w:numFmt w:val="bullet"/>
-      <w:lvlText w:val="●"/>
-      <w:lvlJc w:val="left"/>
-      <w:pPr>
-        <w:ind w:left="5760" w:hanging="360"/>
-      </w:pPr>
-    </w:lvl>
-    <w:lvl w:ilvl="8" w:tplc="7CE000E0" w:tentative="1">
-      <w:start w:val="1"/>
-      <w:numFmt w:val="bullet"/>
-      <w:lvlText w:val="●"/>
-      <w:lvlJc w:val="left"/>
-      <w:pPr>
-        <w:ind w:left="6480" w:hanging="360"/>
-      </w:pPr>
-    </w:lvl>
-  </w:abstractNum>
-  <w:num w:numId="1" w16cid:durableId="1489980683">
+  <w:num w:numId="1" w16cid:durableId="1526098783">
+    <w:abstractNumId w:val="1"/>
+    <w:lvlOverride w:ilvl="0">
+      <w:startOverride w:val="1"/>
+    </w:lvlOverride>
+  </w:num>
+  <w:num w:numId="2" w16cid:durableId="435053229">
+    <w:abstractNumId w:val="0"/>
+    <w:lvlOverride w:ilvl="0">
+      <w:startOverride w:val="1"/>
+    </w:lvlOverride>
+  </w:num>
+  <w:num w:numId="3" w16cid:durableId="2088381983">
     <w:abstractNumId w:val="2"/>
     <w:lvlOverride w:ilvl="0">
       <w:startOverride w:val="1"/>
     </w:lvlOverride>
   </w:num>
-  <w:num w:numId="2" w16cid:durableId="1051418419">
-    <w:abstractNumId w:val="1"/>
+  <w:num w:numId="4" w16cid:durableId="914516550">
+    <w:abstractNumId w:val="2"/>
     <w:lvlOverride w:ilvl="0">
       <w:startOverride w:val="1"/>
     </w:lvlOverride>
   </w:num>
-  <w:num w:numId="3" w16cid:durableId="1438676148">
-    <w:abstractNumId w:val="0"/>
+  <w:num w:numId="5" w16cid:durableId="1346400830">
+    <w:abstractNumId w:val="2"/>
     <w:lvlOverride w:ilvl="0">
       <w:startOverride w:val="1"/>
     </w:lvlOverride>
   </w:num>
-  <w:num w:numId="4" w16cid:durableId="120998083">
-    <w:abstractNumId w:val="0"/>
+  <w:num w:numId="6" w16cid:durableId="715465893">
+    <w:abstractNumId w:val="2"/>
     <w:lvlOverride w:ilvl="0">
       <w:startOverride w:val="1"/>
     </w:lvlOverride>
   </w:num>
-  <w:num w:numId="5" w16cid:durableId="2144351762">
-    <w:abstractNumId w:val="0"/>
+  <w:num w:numId="7" w16cid:durableId="546526641">
+    <w:abstractNumId w:val="2"/>
     <w:lvlOverride w:ilvl="0">
       <w:startOverride w:val="1"/>
     </w:lvlOverride>
   </w:num>
-  <w:num w:numId="6" w16cid:durableId="954098888">
-    <w:abstractNumId w:val="0"/>
+  <w:num w:numId="8" w16cid:durableId="228078913">
+    <w:abstractNumId w:val="2"/>
     <w:lvlOverride w:ilvl="0">
       <w:startOverride w:val="1"/>
     </w:lvlOverride>
   </w:num>
-  <w:num w:numId="7" w16cid:durableId="852458187">
-    <w:abstractNumId w:val="0"/>
+  <w:num w:numId="9" w16cid:durableId="1093088787">
+    <w:abstractNumId w:val="2"/>
     <w:lvlOverride w:ilvl="0">
       <w:startOverride w:val="1"/>
     </w:lvlOverride>
   </w:num>
-  <w:num w:numId="8" w16cid:durableId="1817841570">
-    <w:abstractNumId w:val="0"/>
+  <w:num w:numId="10" w16cid:durableId="1719890075">
+    <w:abstractNumId w:val="2"/>
     <w:lvlOverride w:ilvl="0">
       <w:startOverride w:val="1"/>
     </w:lvlOverride>
   </w:num>
-  <w:num w:numId="9" w16cid:durableId="809712867">
-    <w:abstractNumId w:val="0"/>
+  <w:num w:numId="11" w16cid:durableId="1509059329">
+    <w:abstractNumId w:val="2"/>
     <w:lvlOverride w:ilvl="0">
       <w:startOverride w:val="1"/>
     </w:lvlOverride>
   </w:num>
-  <w:num w:numId="10" w16cid:durableId="1397781054">
-    <w:abstractNumId w:val="0"/>
+  <w:num w:numId="12" w16cid:durableId="1266422376">
+    <w:abstractNumId w:val="2"/>
     <w:lvlOverride w:ilvl="0">
       <w:startOverride w:val="1"/>
     </w:lvlOverride>
   </w:num>
-  <w:num w:numId="11" w16cid:durableId="1267736752">
-    <w:abstractNumId w:val="0"/>
-    <w:lvlOverride w:ilvl="0">
-      <w:startOverride w:val="1"/>
-    </w:lvlOverride>
-  </w:num>
-  <w:num w:numId="12" w16cid:durableId="227344877">
-    <w:abstractNumId w:val="0"/>
-    <w:lvlOverride w:ilvl="0">
-      <w:startOverride w:val="1"/>
-    </w:lvlOverride>
-  </w:num>
-  <w:num w:numId="13" w16cid:durableId="1983457438">
-    <w:abstractNumId w:val="0"/>
+  <w:num w:numId="13" w16cid:durableId="1987666681">
+    <w:abstractNumId w:val="2"/>
     <w:lvlOverride w:ilvl="0">
       <w:startOverride w:val="1"/>
     </w:lvlOverride>
@@ -11175,7 +11588,7 @@
     <w:autoRedefine/>
     <w:uiPriority w:val="39"/>
     <w:unhideWhenUsed/>
-    <w:rsid w:val="00043BCC"/>
+    <w:rsid w:val="00190394"/>
     <w:pPr>
       <w:spacing w:after="100"/>
     </w:pPr>
@@ -11187,7 +11600,7 @@
     <w:autoRedefine/>
     <w:uiPriority w:val="39"/>
     <w:unhideWhenUsed/>
-    <w:rsid w:val="00043BCC"/>
+    <w:rsid w:val="00190394"/>
     <w:pPr>
       <w:spacing w:after="100"/>
       <w:ind w:left="220"/>

</xml_diff>

<commit_message>
Employee app: Español button translates the whole app; saved data and reports stay English; manual v2.0
Co-Authored-By: Claude Opus 5.5 <noreply@anthropic.com>
</commit_message>
<xml_diff>
--- a/client/manual/ShopControl-User-Manual.docx
+++ b/client/manual/ShopControl-User-Manual.docx
@@ -16,7 +16,7 @@
           <w:noProof/>
         </w:rPr>
         <w:drawing>
-          <wp:inline distT="0" distB="0" distL="0" distR="0" wp14:anchorId="246F0BD3" wp14:editId="246F0BD4">
+          <wp:inline distT="0" distB="0" distL="0" distR="0" wp14:anchorId="59A3690B" wp14:editId="59A3690C">
             <wp:extent cx="4000500" cy="1485900"/>
             <wp:effectExtent l="0" t="0" r="0" b="0"/>
             <wp:docPr id="1" name="Picture 1"/>
@@ -93,7 +93,7 @@
         <w:rPr>
           <w:color w:val="5B6776"/>
         </w:rPr>
-        <w:t>Version 1.9  ·  Updated September 28, 2026</w:t>
+        <w:t>Version 2.0  ·  Updated September 28, 2026</w:t>
       </w:r>
     </w:p>
     <w:p>
@@ -122,7 +122,7 @@
     <w:sdt>
       <w:sdtPr>
         <w:alias w:val="Contents"/>
-        <w:id w:val="-226385353"/>
+        <w:id w:val="199446628"/>
       </w:sdtPr>
       <w:sdtEndPr/>
       <w:sdtContent>
@@ -151,7 +151,7 @@
           <w:r>
             <w:fldChar w:fldCharType="separate"/>
           </w:r>
-          <w:hyperlink w:anchor="_Toc241512311" w:history="1">
+          <w:hyperlink w:anchor="_Toc241660837" w:history="1">
             <w:r>
               <w:rPr>
                 <w:rStyle w:val="Hyperlink"/>
@@ -175,7 +175,7 @@
               <w:rPr>
                 <w:noProof/>
               </w:rPr>
-              <w:instrText xml:space="preserve"> PAGEREF _Toc241512311 \h </w:instrText>
+              <w:instrText xml:space="preserve"> PAGEREF _Toc241660837 \h </w:instrText>
             </w:r>
             <w:r>
               <w:rPr>
@@ -218,7 +218,7 @@
               <w14:ligatures w14:val="standardContextual"/>
             </w:rPr>
           </w:pPr>
-          <w:hyperlink w:anchor="_Toc241512312" w:history="1">
+          <w:hyperlink w:anchor="_Toc241660838" w:history="1">
             <w:r>
               <w:rPr>
                 <w:rStyle w:val="Hyperlink"/>
@@ -242,7 +242,7 @@
               <w:rPr>
                 <w:noProof/>
               </w:rPr>
-              <w:instrText xml:space="preserve"> PAGEREF _Toc241512312 \h </w:instrText>
+              <w:instrText xml:space="preserve"> PAGEREF _Toc241660838 \h </w:instrText>
             </w:r>
             <w:r>
               <w:rPr>
@@ -285,7 +285,7 @@
               <w14:ligatures w14:val="standardContextual"/>
             </w:rPr>
           </w:pPr>
-          <w:hyperlink w:anchor="_Toc241512313" w:history="1">
+          <w:hyperlink w:anchor="_Toc241660839" w:history="1">
             <w:r>
               <w:rPr>
                 <w:rStyle w:val="Hyperlink"/>
@@ -309,7 +309,7 @@
               <w:rPr>
                 <w:noProof/>
               </w:rPr>
-              <w:instrText xml:space="preserve"> PAGEREF _Toc241512313 \h </w:instrText>
+              <w:instrText xml:space="preserve"> PAGEREF _Toc241660839 \h </w:instrText>
             </w:r>
             <w:r>
               <w:rPr>
@@ -352,7 +352,7 @@
               <w14:ligatures w14:val="standardContextual"/>
             </w:rPr>
           </w:pPr>
-          <w:hyperlink w:anchor="_Toc241512314" w:history="1">
+          <w:hyperlink w:anchor="_Toc241660840" w:history="1">
             <w:r>
               <w:rPr>
                 <w:rStyle w:val="Hyperlink"/>
@@ -376,7 +376,7 @@
               <w:rPr>
                 <w:noProof/>
               </w:rPr>
-              <w:instrText xml:space="preserve"> PAGEREF _Toc241512314 \h </w:instrText>
+              <w:instrText xml:space="preserve"> PAGEREF _Toc241660840 \h </w:instrText>
             </w:r>
             <w:r>
               <w:rPr>
@@ -419,7 +419,7 @@
               <w14:ligatures w14:val="standardContextual"/>
             </w:rPr>
           </w:pPr>
-          <w:hyperlink w:anchor="_Toc241512315" w:history="1">
+          <w:hyperlink w:anchor="_Toc241660841" w:history="1">
             <w:r>
               <w:rPr>
                 <w:rStyle w:val="Hyperlink"/>
@@ -443,7 +443,7 @@
               <w:rPr>
                 <w:noProof/>
               </w:rPr>
-              <w:instrText xml:space="preserve"> PAGEREF _Toc241512315 \h </w:instrText>
+              <w:instrText xml:space="preserve"> PAGEREF _Toc241660841 \h </w:instrText>
             </w:r>
             <w:r>
               <w:rPr>
@@ -486,7 +486,7 @@
               <w14:ligatures w14:val="standardContextual"/>
             </w:rPr>
           </w:pPr>
-          <w:hyperlink w:anchor="_Toc241512316" w:history="1">
+          <w:hyperlink w:anchor="_Toc241660842" w:history="1">
             <w:r>
               <w:rPr>
                 <w:rStyle w:val="Hyperlink"/>
@@ -510,7 +510,7 @@
               <w:rPr>
                 <w:noProof/>
               </w:rPr>
-              <w:instrText xml:space="preserve"> PAGEREF _Toc241512316 \h </w:instrText>
+              <w:instrText xml:space="preserve"> PAGEREF _Toc241660842 \h </w:instrText>
             </w:r>
             <w:r>
               <w:rPr>
@@ -553,7 +553,7 @@
               <w14:ligatures w14:val="standardContextual"/>
             </w:rPr>
           </w:pPr>
-          <w:hyperlink w:anchor="_Toc241512317" w:history="1">
+          <w:hyperlink w:anchor="_Toc241660843" w:history="1">
             <w:r>
               <w:rPr>
                 <w:rStyle w:val="Hyperlink"/>
@@ -577,7 +577,7 @@
               <w:rPr>
                 <w:noProof/>
               </w:rPr>
-              <w:instrText xml:space="preserve"> PAGEREF _Toc241512317 \h </w:instrText>
+              <w:instrText xml:space="preserve"> PAGEREF _Toc241660843 \h </w:instrText>
             </w:r>
             <w:r>
               <w:rPr>
@@ -620,7 +620,7 @@
               <w14:ligatures w14:val="standardContextual"/>
             </w:rPr>
           </w:pPr>
-          <w:hyperlink w:anchor="_Toc241512318" w:history="1">
+          <w:hyperlink w:anchor="_Toc241660844" w:history="1">
             <w:r>
               <w:rPr>
                 <w:rStyle w:val="Hyperlink"/>
@@ -644,7 +644,7 @@
               <w:rPr>
                 <w:noProof/>
               </w:rPr>
-              <w:instrText xml:space="preserve"> PAGEREF _Toc241512318 \h </w:instrText>
+              <w:instrText xml:space="preserve"> PAGEREF _Toc241660844 \h </w:instrText>
             </w:r>
             <w:r>
               <w:rPr>
@@ -687,7 +687,7 @@
               <w14:ligatures w14:val="standardContextual"/>
             </w:rPr>
           </w:pPr>
-          <w:hyperlink w:anchor="_Toc241512319" w:history="1">
+          <w:hyperlink w:anchor="_Toc241660845" w:history="1">
             <w:r>
               <w:rPr>
                 <w:rStyle w:val="Hyperlink"/>
@@ -711,7 +711,7 @@
               <w:rPr>
                 <w:noProof/>
               </w:rPr>
-              <w:instrText xml:space="preserve"> PAGEREF _Toc241512319 \h </w:instrText>
+              <w:instrText xml:space="preserve"> PAGEREF _Toc241660845 \h </w:instrText>
             </w:r>
             <w:r>
               <w:rPr>
@@ -754,13 +754,13 @@
               <w14:ligatures w14:val="standardContextual"/>
             </w:rPr>
           </w:pPr>
-          <w:hyperlink w:anchor="_Toc241512320" w:history="1">
+          <w:hyperlink w:anchor="_Toc241660846" w:history="1">
             <w:r>
               <w:rPr>
                 <w:rStyle w:val="Hyperlink"/>
                 <w:noProof/>
               </w:rPr>
-              <w:t>Doing your QC checklist</w:t>
+              <w:t>Spanish (Español)</w:t>
             </w:r>
             <w:r>
               <w:rPr>
@@ -778,7 +778,7 @@
               <w:rPr>
                 <w:noProof/>
               </w:rPr>
-              <w:instrText xml:space="preserve"> PAGEREF _Toc241512320 \h </w:instrText>
+              <w:instrText xml:space="preserve"> PAGEREF _Toc241660846 \h </w:instrText>
             </w:r>
             <w:r>
               <w:rPr>
@@ -821,13 +821,13 @@
               <w14:ligatures w14:val="standardContextual"/>
             </w:rPr>
           </w:pPr>
-          <w:hyperlink w:anchor="_Toc241512321" w:history="1">
+          <w:hyperlink w:anchor="_Toc241660847" w:history="1">
             <w:r>
               <w:rPr>
                 <w:rStyle w:val="Hyperlink"/>
                 <w:noProof/>
               </w:rPr>
-              <w:t>Signing and rework</w:t>
+              <w:t>Doing your QC checklist</w:t>
             </w:r>
             <w:r>
               <w:rPr>
@@ -845,7 +845,7 @@
               <w:rPr>
                 <w:noProof/>
               </w:rPr>
-              <w:instrText xml:space="preserve"> PAGEREF _Toc241512321 \h </w:instrText>
+              <w:instrText xml:space="preserve"> PAGEREF _Toc241660847 \h </w:instrText>
             </w:r>
             <w:r>
               <w:rPr>
@@ -888,13 +888,13 @@
               <w14:ligatures w14:val="standardContextual"/>
             </w:rPr>
           </w:pPr>
-          <w:hyperlink w:anchor="_Toc241512322" w:history="1">
+          <w:hyperlink w:anchor="_Toc241660848" w:history="1">
             <w:r>
               <w:rPr>
                 <w:rStyle w:val="Hyperlink"/>
                 <w:noProof/>
               </w:rPr>
-              <w:t>Other departments' checklists</w:t>
+              <w:t>Signing and rework</w:t>
             </w:r>
             <w:r>
               <w:rPr>
@@ -912,7 +912,7 @@
               <w:rPr>
                 <w:noProof/>
               </w:rPr>
-              <w:instrText xml:space="preserve"> PAGEREF _Toc241512322 \h </w:instrText>
+              <w:instrText xml:space="preserve"> PAGEREF _Toc241660848 \h </w:instrText>
             </w:r>
             <w:r>
               <w:rPr>
@@ -955,12 +955,79 @@
               <w14:ligatures w14:val="standardContextual"/>
             </w:rPr>
           </w:pPr>
-          <w:hyperlink w:anchor="_Toc241512323" w:history="1">
+          <w:hyperlink w:anchor="_Toc241660849" w:history="1">
             <w:r>
               <w:rPr>
                 <w:rStyle w:val="Hyperlink"/>
                 <w:noProof/>
               </w:rPr>
+              <w:t>Other departments' checklists</w:t>
+            </w:r>
+            <w:r>
+              <w:rPr>
+                <w:noProof/>
+              </w:rPr>
+              <w:tab/>
+            </w:r>
+            <w:r>
+              <w:rPr>
+                <w:noProof/>
+              </w:rPr>
+              <w:fldChar w:fldCharType="begin"/>
+            </w:r>
+            <w:r>
+              <w:rPr>
+                <w:noProof/>
+              </w:rPr>
+              <w:instrText xml:space="preserve"> PAGEREF _Toc241660849 \h </w:instrText>
+            </w:r>
+            <w:r>
+              <w:rPr>
+                <w:noProof/>
+              </w:rPr>
+            </w:r>
+            <w:r>
+              <w:rPr>
+                <w:noProof/>
+              </w:rPr>
+              <w:fldChar w:fldCharType="separate"/>
+            </w:r>
+            <w:r>
+              <w:rPr>
+                <w:noProof/>
+              </w:rPr>
+              <w:t>7</w:t>
+            </w:r>
+            <w:r>
+              <w:rPr>
+                <w:noProof/>
+              </w:rPr>
+              <w:fldChar w:fldCharType="end"/>
+            </w:r>
+          </w:hyperlink>
+        </w:p>
+        <w:p>
+          <w:pPr>
+            <w:pStyle w:val="TOC2"/>
+            <w:tabs>
+              <w:tab w:val="right" w:leader="dot" w:pos="9350"/>
+            </w:tabs>
+            <w:rPr>
+              <w:rFonts w:asciiTheme="minorHAnsi" w:eastAsiaTheme="minorEastAsia" w:hAnsiTheme="minorHAnsi" w:cstheme="minorBidi"/>
+              <w:noProof/>
+              <w:color w:val="auto"/>
+              <w:kern w:val="2"/>
+              <w:sz w:val="24"/>
+              <w:szCs w:val="24"/>
+              <w14:ligatures w14:val="standardContextual"/>
+            </w:rPr>
+          </w:pPr>
+          <w:hyperlink w:anchor="_Toc241660850" w:history="1">
+            <w:r>
+              <w:rPr>
+                <w:rStyle w:val="Hyperlink"/>
+                <w:noProof/>
+              </w:rPr>
               <w:t>Photos and parts</w:t>
             </w:r>
             <w:r>
@@ -979,7 +1046,7 @@
               <w:rPr>
                 <w:noProof/>
               </w:rPr>
-              <w:instrText xml:space="preserve"> PAGEREF _Toc241512323 \h </w:instrText>
+              <w:instrText xml:space="preserve"> PAGEREF _Toc241660850 \h </w:instrText>
             </w:r>
             <w:r>
               <w:rPr>
@@ -1022,7 +1089,7 @@
               <w14:ligatures w14:val="standardContextual"/>
             </w:rPr>
           </w:pPr>
-          <w:hyperlink w:anchor="_Toc241512324" w:history="1">
+          <w:hyperlink w:anchor="_Toc241660851" w:history="1">
             <w:r>
               <w:rPr>
                 <w:rStyle w:val="Hyperlink"/>
@@ -1046,7 +1113,7 @@
               <w:rPr>
                 <w:noProof/>
               </w:rPr>
-              <w:instrText xml:space="preserve"> PAGEREF _Toc241512324 \h </w:instrText>
+              <w:instrText xml:space="preserve"> PAGEREF _Toc241660851 \h </w:instrText>
             </w:r>
             <w:r>
               <w:rPr>
@@ -1089,7 +1156,7 @@
               <w14:ligatures w14:val="standardContextual"/>
             </w:rPr>
           </w:pPr>
-          <w:hyperlink w:anchor="_Toc241512325" w:history="1">
+          <w:hyperlink w:anchor="_Toc241660852" w:history="1">
             <w:r>
               <w:rPr>
                 <w:rStyle w:val="Hyperlink"/>
@@ -1113,7 +1180,7 @@
               <w:rPr>
                 <w:noProof/>
               </w:rPr>
-              <w:instrText xml:space="preserve"> PAGEREF _Toc241512325 \h </w:instrText>
+              <w:instrText xml:space="preserve"> PAGEREF _Toc241660852 \h </w:instrText>
             </w:r>
             <w:r>
               <w:rPr>
@@ -1156,7 +1223,7 @@
               <w14:ligatures w14:val="standardContextual"/>
             </w:rPr>
           </w:pPr>
-          <w:hyperlink w:anchor="_Toc241512326" w:history="1">
+          <w:hyperlink w:anchor="_Toc241660853" w:history="1">
             <w:r>
               <w:rPr>
                 <w:rStyle w:val="Hyperlink"/>
@@ -1180,7 +1247,7 @@
               <w:rPr>
                 <w:noProof/>
               </w:rPr>
-              <w:instrText xml:space="preserve"> PAGEREF _Toc241512326 \h </w:instrText>
+              <w:instrText xml:space="preserve"> PAGEREF _Toc241660853 \h </w:instrText>
             </w:r>
             <w:r>
               <w:rPr>
@@ -1223,7 +1290,7 @@
               <w14:ligatures w14:val="standardContextual"/>
             </w:rPr>
           </w:pPr>
-          <w:hyperlink w:anchor="_Toc241512327" w:history="1">
+          <w:hyperlink w:anchor="_Toc241660854" w:history="1">
             <w:r>
               <w:rPr>
                 <w:rStyle w:val="Hyperlink"/>
@@ -1247,7 +1314,7 @@
               <w:rPr>
                 <w:noProof/>
               </w:rPr>
-              <w:instrText xml:space="preserve"> PAGEREF _Toc241512327 \h </w:instrText>
+              <w:instrText xml:space="preserve"> PAGEREF _Toc241660854 \h </w:instrText>
             </w:r>
             <w:r>
               <w:rPr>
@@ -1290,7 +1357,7 @@
               <w14:ligatures w14:val="standardContextual"/>
             </w:rPr>
           </w:pPr>
-          <w:hyperlink w:anchor="_Toc241512328" w:history="1">
+          <w:hyperlink w:anchor="_Toc241660855" w:history="1">
             <w:r>
               <w:rPr>
                 <w:rStyle w:val="Hyperlink"/>
@@ -1314,7 +1381,7 @@
               <w:rPr>
                 <w:noProof/>
               </w:rPr>
-              <w:instrText xml:space="preserve"> PAGEREF _Toc241512328 \h </w:instrText>
+              <w:instrText xml:space="preserve"> PAGEREF _Toc241660855 \h </w:instrText>
             </w:r>
             <w:r>
               <w:rPr>
@@ -1357,7 +1424,7 @@
               <w14:ligatures w14:val="standardContextual"/>
             </w:rPr>
           </w:pPr>
-          <w:hyperlink w:anchor="_Toc241512329" w:history="1">
+          <w:hyperlink w:anchor="_Toc241660856" w:history="1">
             <w:r>
               <w:rPr>
                 <w:rStyle w:val="Hyperlink"/>
@@ -1381,7 +1448,7 @@
               <w:rPr>
                 <w:noProof/>
               </w:rPr>
-              <w:instrText xml:space="preserve"> PAGEREF _Toc241512329 \h </w:instrText>
+              <w:instrText xml:space="preserve"> PAGEREF _Toc241660856 \h </w:instrText>
             </w:r>
             <w:r>
               <w:rPr>
@@ -1424,7 +1491,7 @@
               <w14:ligatures w14:val="standardContextual"/>
             </w:rPr>
           </w:pPr>
-          <w:hyperlink w:anchor="_Toc241512330" w:history="1">
+          <w:hyperlink w:anchor="_Toc241660857" w:history="1">
             <w:r>
               <w:rPr>
                 <w:rStyle w:val="Hyperlink"/>
@@ -1448,7 +1515,7 @@
               <w:rPr>
                 <w:noProof/>
               </w:rPr>
-              <w:instrText xml:space="preserve"> PAGEREF _Toc241512330 \h </w:instrText>
+              <w:instrText xml:space="preserve"> PAGEREF _Toc241660857 \h </w:instrText>
             </w:r>
             <w:r>
               <w:rPr>
@@ -1491,7 +1558,7 @@
               <w14:ligatures w14:val="standardContextual"/>
             </w:rPr>
           </w:pPr>
-          <w:hyperlink w:anchor="_Toc241512331" w:history="1">
+          <w:hyperlink w:anchor="_Toc241660858" w:history="1">
             <w:r>
               <w:rPr>
                 <w:rStyle w:val="Hyperlink"/>
@@ -1515,7 +1582,7 @@
               <w:rPr>
                 <w:noProof/>
               </w:rPr>
-              <w:instrText xml:space="preserve"> PAGEREF _Toc241512331 \h </w:instrText>
+              <w:instrText xml:space="preserve"> PAGEREF _Toc241660858 \h </w:instrText>
             </w:r>
             <w:r>
               <w:rPr>
@@ -1558,7 +1625,7 @@
               <w14:ligatures w14:val="standardContextual"/>
             </w:rPr>
           </w:pPr>
-          <w:hyperlink w:anchor="_Toc241512332" w:history="1">
+          <w:hyperlink w:anchor="_Toc241660859" w:history="1">
             <w:r>
               <w:rPr>
                 <w:rStyle w:val="Hyperlink"/>
@@ -1582,7 +1649,7 @@
               <w:rPr>
                 <w:noProof/>
               </w:rPr>
-              <w:instrText xml:space="preserve"> PAGEREF _Toc241512332 \h </w:instrText>
+              <w:instrText xml:space="preserve"> PAGEREF _Toc241660859 \h </w:instrText>
             </w:r>
             <w:r>
               <w:rPr>
@@ -1625,7 +1692,7 @@
               <w14:ligatures w14:val="standardContextual"/>
             </w:rPr>
           </w:pPr>
-          <w:hyperlink w:anchor="_Toc241512333" w:history="1">
+          <w:hyperlink w:anchor="_Toc241660860" w:history="1">
             <w:r>
               <w:rPr>
                 <w:rStyle w:val="Hyperlink"/>
@@ -1649,7 +1716,7 @@
               <w:rPr>
                 <w:noProof/>
               </w:rPr>
-              <w:instrText xml:space="preserve"> PAGEREF _Toc241512333 \h </w:instrText>
+              <w:instrText xml:space="preserve"> PAGEREF _Toc241660860 \h </w:instrText>
             </w:r>
             <w:r>
               <w:rPr>
@@ -1692,7 +1759,7 @@
               <w14:ligatures w14:val="standardContextual"/>
             </w:rPr>
           </w:pPr>
-          <w:hyperlink w:anchor="_Toc241512334" w:history="1">
+          <w:hyperlink w:anchor="_Toc241660861" w:history="1">
             <w:r>
               <w:rPr>
                 <w:rStyle w:val="Hyperlink"/>
@@ -1716,7 +1783,7 @@
               <w:rPr>
                 <w:noProof/>
               </w:rPr>
-              <w:instrText xml:space="preserve"> PAGEREF _Toc241512334 \h </w:instrText>
+              <w:instrText xml:space="preserve"> PAGEREF _Toc241660861 \h </w:instrText>
             </w:r>
             <w:r>
               <w:rPr>
@@ -1759,7 +1826,7 @@
               <w14:ligatures w14:val="standardContextual"/>
             </w:rPr>
           </w:pPr>
-          <w:hyperlink w:anchor="_Toc241512335" w:history="1">
+          <w:hyperlink w:anchor="_Toc241660862" w:history="1">
             <w:r>
               <w:rPr>
                 <w:rStyle w:val="Hyperlink"/>
@@ -1783,7 +1850,7 @@
               <w:rPr>
                 <w:noProof/>
               </w:rPr>
-              <w:instrText xml:space="preserve"> PAGEREF _Toc241512335 \h </w:instrText>
+              <w:instrText xml:space="preserve"> PAGEREF _Toc241660862 \h </w:instrText>
             </w:r>
             <w:r>
               <w:rPr>
@@ -1826,7 +1893,7 @@
               <w14:ligatures w14:val="standardContextual"/>
             </w:rPr>
           </w:pPr>
-          <w:hyperlink w:anchor="_Toc241512336" w:history="1">
+          <w:hyperlink w:anchor="_Toc241660863" w:history="1">
             <w:r>
               <w:rPr>
                 <w:rStyle w:val="Hyperlink"/>
@@ -1850,7 +1917,7 @@
               <w:rPr>
                 <w:noProof/>
               </w:rPr>
-              <w:instrText xml:space="preserve"> PAGEREF _Toc241512336 \h </w:instrText>
+              <w:instrText xml:space="preserve"> PAGEREF _Toc241660863 \h </w:instrText>
             </w:r>
             <w:r>
               <w:rPr>
@@ -1893,7 +1960,7 @@
               <w14:ligatures w14:val="standardContextual"/>
             </w:rPr>
           </w:pPr>
-          <w:hyperlink w:anchor="_Toc241512337" w:history="1">
+          <w:hyperlink w:anchor="_Toc241660864" w:history="1">
             <w:r>
               <w:rPr>
                 <w:rStyle w:val="Hyperlink"/>
@@ -1917,7 +1984,7 @@
               <w:rPr>
                 <w:noProof/>
               </w:rPr>
-              <w:instrText xml:space="preserve"> PAGEREF _Toc241512337 \h </w:instrText>
+              <w:instrText xml:space="preserve"> PAGEREF _Toc241660864 \h </w:instrText>
             </w:r>
             <w:r>
               <w:rPr>
@@ -1960,7 +2027,7 @@
               <w14:ligatures w14:val="standardContextual"/>
             </w:rPr>
           </w:pPr>
-          <w:hyperlink w:anchor="_Toc241512338" w:history="1">
+          <w:hyperlink w:anchor="_Toc241660865" w:history="1">
             <w:r>
               <w:rPr>
                 <w:rStyle w:val="Hyperlink"/>
@@ -1984,7 +2051,7 @@
               <w:rPr>
                 <w:noProof/>
               </w:rPr>
-              <w:instrText xml:space="preserve"> PAGEREF _Toc241512338 \h </w:instrText>
+              <w:instrText xml:space="preserve"> PAGEREF _Toc241660865 \h </w:instrText>
             </w:r>
             <w:r>
               <w:rPr>
@@ -2027,7 +2094,7 @@
               <w14:ligatures w14:val="standardContextual"/>
             </w:rPr>
           </w:pPr>
-          <w:hyperlink w:anchor="_Toc241512339" w:history="1">
+          <w:hyperlink w:anchor="_Toc241660866" w:history="1">
             <w:r>
               <w:rPr>
                 <w:rStyle w:val="Hyperlink"/>
@@ -2051,7 +2118,7 @@
               <w:rPr>
                 <w:noProof/>
               </w:rPr>
-              <w:instrText xml:space="preserve"> PAGEREF _Toc241512339 \h </w:instrText>
+              <w:instrText xml:space="preserve"> PAGEREF _Toc241660866 \h </w:instrText>
             </w:r>
             <w:r>
               <w:rPr>
@@ -2094,7 +2161,7 @@
               <w14:ligatures w14:val="standardContextual"/>
             </w:rPr>
           </w:pPr>
-          <w:hyperlink w:anchor="_Toc241512340" w:history="1">
+          <w:hyperlink w:anchor="_Toc241660867" w:history="1">
             <w:r>
               <w:rPr>
                 <w:rStyle w:val="Hyperlink"/>
@@ -2118,7 +2185,7 @@
               <w:rPr>
                 <w:noProof/>
               </w:rPr>
-              <w:instrText xml:space="preserve"> PAGEREF _Toc241512340 \h </w:instrText>
+              <w:instrText xml:space="preserve"> PAGEREF _Toc241660867 \h </w:instrText>
             </w:r>
             <w:r>
               <w:rPr>
@@ -2161,7 +2228,7 @@
               <w14:ligatures w14:val="standardContextual"/>
             </w:rPr>
           </w:pPr>
-          <w:hyperlink w:anchor="_Toc241512341" w:history="1">
+          <w:hyperlink w:anchor="_Toc241660868" w:history="1">
             <w:r>
               <w:rPr>
                 <w:rStyle w:val="Hyperlink"/>
@@ -2185,7 +2252,7 @@
               <w:rPr>
                 <w:noProof/>
               </w:rPr>
-              <w:instrText xml:space="preserve"> PAGEREF _Toc241512341 \h </w:instrText>
+              <w:instrText xml:space="preserve"> PAGEREF _Toc241660868 \h </w:instrText>
             </w:r>
             <w:r>
               <w:rPr>
@@ -2228,7 +2295,7 @@
               <w14:ligatures w14:val="standardContextual"/>
             </w:rPr>
           </w:pPr>
-          <w:hyperlink w:anchor="_Toc241512342" w:history="1">
+          <w:hyperlink w:anchor="_Toc241660869" w:history="1">
             <w:r>
               <w:rPr>
                 <w:rStyle w:val="Hyperlink"/>
@@ -2252,7 +2319,7 @@
               <w:rPr>
                 <w:noProof/>
               </w:rPr>
-              <w:instrText xml:space="preserve"> PAGEREF _Toc241512342 \h </w:instrText>
+              <w:instrText xml:space="preserve"> PAGEREF _Toc241660869 \h </w:instrText>
             </w:r>
             <w:r>
               <w:rPr>
@@ -2295,7 +2362,7 @@
               <w14:ligatures w14:val="standardContextual"/>
             </w:rPr>
           </w:pPr>
-          <w:hyperlink w:anchor="_Toc241512343" w:history="1">
+          <w:hyperlink w:anchor="_Toc241660870" w:history="1">
             <w:r>
               <w:rPr>
                 <w:rStyle w:val="Hyperlink"/>
@@ -2319,7 +2386,7 @@
               <w:rPr>
                 <w:noProof/>
               </w:rPr>
-              <w:instrText xml:space="preserve"> PAGEREF _Toc241512343 \h </w:instrText>
+              <w:instrText xml:space="preserve"> PAGEREF _Toc241660870 \h </w:instrText>
             </w:r>
             <w:r>
               <w:rPr>
@@ -2362,7 +2429,7 @@
               <w14:ligatures w14:val="standardContextual"/>
             </w:rPr>
           </w:pPr>
-          <w:hyperlink w:anchor="_Toc241512344" w:history="1">
+          <w:hyperlink w:anchor="_Toc241660871" w:history="1">
             <w:r>
               <w:rPr>
                 <w:rStyle w:val="Hyperlink"/>
@@ -2386,7 +2453,7 @@
               <w:rPr>
                 <w:noProof/>
               </w:rPr>
-              <w:instrText xml:space="preserve"> PAGEREF _Toc241512344 \h </w:instrText>
+              <w:instrText xml:space="preserve"> PAGEREF _Toc241660871 \h </w:instrText>
             </w:r>
             <w:r>
               <w:rPr>
@@ -2429,7 +2496,7 @@
               <w14:ligatures w14:val="standardContextual"/>
             </w:rPr>
           </w:pPr>
-          <w:hyperlink w:anchor="_Toc241512345" w:history="1">
+          <w:hyperlink w:anchor="_Toc241660872" w:history="1">
             <w:r>
               <w:rPr>
                 <w:rStyle w:val="Hyperlink"/>
@@ -2453,7 +2520,7 @@
               <w:rPr>
                 <w:noProof/>
               </w:rPr>
-              <w:instrText xml:space="preserve"> PAGEREF _Toc241512345 \h </w:instrText>
+              <w:instrText xml:space="preserve"> PAGEREF _Toc241660872 \h </w:instrText>
             </w:r>
             <w:r>
               <w:rPr>
@@ -2496,7 +2563,7 @@
               <w14:ligatures w14:val="standardContextual"/>
             </w:rPr>
           </w:pPr>
-          <w:hyperlink w:anchor="_Toc241512346" w:history="1">
+          <w:hyperlink w:anchor="_Toc241660873" w:history="1">
             <w:r>
               <w:rPr>
                 <w:rStyle w:val="Hyperlink"/>
@@ -2520,7 +2587,7 @@
               <w:rPr>
                 <w:noProof/>
               </w:rPr>
-              <w:instrText xml:space="preserve"> PAGEREF _Toc241512346 \h </w:instrText>
+              <w:instrText xml:space="preserve"> PAGEREF _Toc241660873 \h </w:instrText>
             </w:r>
             <w:r>
               <w:rPr>
@@ -2563,7 +2630,7 @@
               <w14:ligatures w14:val="standardContextual"/>
             </w:rPr>
           </w:pPr>
-          <w:hyperlink w:anchor="_Toc241512347" w:history="1">
+          <w:hyperlink w:anchor="_Toc241660874" w:history="1">
             <w:r>
               <w:rPr>
                 <w:rStyle w:val="Hyperlink"/>
@@ -2587,7 +2654,7 @@
               <w:rPr>
                 <w:noProof/>
               </w:rPr>
-              <w:instrText xml:space="preserve"> PAGEREF _Toc241512347 \h </w:instrText>
+              <w:instrText xml:space="preserve"> PAGEREF _Toc241660874 \h </w:instrText>
             </w:r>
             <w:r>
               <w:rPr>
@@ -2630,7 +2697,7 @@
               <w14:ligatures w14:val="standardContextual"/>
             </w:rPr>
           </w:pPr>
-          <w:hyperlink w:anchor="_Toc241512348" w:history="1">
+          <w:hyperlink w:anchor="_Toc241660875" w:history="1">
             <w:r>
               <w:rPr>
                 <w:rStyle w:val="Hyperlink"/>
@@ -2654,7 +2721,7 @@
               <w:rPr>
                 <w:noProof/>
               </w:rPr>
-              <w:instrText xml:space="preserve"> PAGEREF _Toc241512348 \h </w:instrText>
+              <w:instrText xml:space="preserve"> PAGEREF _Toc241660875 \h </w:instrText>
             </w:r>
             <w:r>
               <w:rPr>
@@ -2697,7 +2764,7 @@
               <w14:ligatures w14:val="standardContextual"/>
             </w:rPr>
           </w:pPr>
-          <w:hyperlink w:anchor="_Toc241512349" w:history="1">
+          <w:hyperlink w:anchor="_Toc241660876" w:history="1">
             <w:r>
               <w:rPr>
                 <w:rStyle w:val="Hyperlink"/>
@@ -2721,7 +2788,7 @@
               <w:rPr>
                 <w:noProof/>
               </w:rPr>
-              <w:instrText xml:space="preserve"> PAGEREF _Toc241512349 \h </w:instrText>
+              <w:instrText xml:space="preserve"> PAGEREF _Toc241660876 \h </w:instrText>
             </w:r>
             <w:r>
               <w:rPr>
@@ -2764,7 +2831,7 @@
               <w14:ligatures w14:val="standardContextual"/>
             </w:rPr>
           </w:pPr>
-          <w:hyperlink w:anchor="_Toc241512350" w:history="1">
+          <w:hyperlink w:anchor="_Toc241660877" w:history="1">
             <w:r>
               <w:rPr>
                 <w:rStyle w:val="Hyperlink"/>
@@ -2788,7 +2855,7 @@
               <w:rPr>
                 <w:noProof/>
               </w:rPr>
-              <w:instrText xml:space="preserve"> PAGEREF _Toc241512350 \h </w:instrText>
+              <w:instrText xml:space="preserve"> PAGEREF _Toc241660877 \h </w:instrText>
             </w:r>
             <w:r>
               <w:rPr>
@@ -2831,7 +2898,7 @@
               <w14:ligatures w14:val="standardContextual"/>
             </w:rPr>
           </w:pPr>
-          <w:hyperlink w:anchor="_Toc241512351" w:history="1">
+          <w:hyperlink w:anchor="_Toc241660878" w:history="1">
             <w:r>
               <w:rPr>
                 <w:rStyle w:val="Hyperlink"/>
@@ -2855,7 +2922,7 @@
               <w:rPr>
                 <w:noProof/>
               </w:rPr>
-              <w:instrText xml:space="preserve"> PAGEREF _Toc241512351 \h </w:instrText>
+              <w:instrText xml:space="preserve"> PAGEREF _Toc241660878 \h </w:instrText>
             </w:r>
             <w:r>
               <w:rPr>
@@ -2898,7 +2965,7 @@
               <w14:ligatures w14:val="standardContextual"/>
             </w:rPr>
           </w:pPr>
-          <w:hyperlink w:anchor="_Toc241512352" w:history="1">
+          <w:hyperlink w:anchor="_Toc241660879" w:history="1">
             <w:r>
               <w:rPr>
                 <w:rStyle w:val="Hyperlink"/>
@@ -2922,7 +2989,7 @@
               <w:rPr>
                 <w:noProof/>
               </w:rPr>
-              <w:instrText xml:space="preserve"> PAGEREF _Toc241512352 \h </w:instrText>
+              <w:instrText xml:space="preserve"> PAGEREF _Toc241660879 \h </w:instrText>
             </w:r>
             <w:r>
               <w:rPr>
@@ -2965,7 +3032,7 @@
               <w14:ligatures w14:val="standardContextual"/>
             </w:rPr>
           </w:pPr>
-          <w:hyperlink w:anchor="_Toc241512353" w:history="1">
+          <w:hyperlink w:anchor="_Toc241660880" w:history="1">
             <w:r>
               <w:rPr>
                 <w:rStyle w:val="Hyperlink"/>
@@ -2989,7 +3056,7 @@
               <w:rPr>
                 <w:noProof/>
               </w:rPr>
-              <w:instrText xml:space="preserve"> PAGEREF _Toc241512353 \h </w:instrText>
+              <w:instrText xml:space="preserve"> PAGEREF _Toc241660880 \h </w:instrText>
             </w:r>
             <w:r>
               <w:rPr>
@@ -3032,7 +3099,7 @@
               <w14:ligatures w14:val="standardContextual"/>
             </w:rPr>
           </w:pPr>
-          <w:hyperlink w:anchor="_Toc241512354" w:history="1">
+          <w:hyperlink w:anchor="_Toc241660881" w:history="1">
             <w:r>
               <w:rPr>
                 <w:rStyle w:val="Hyperlink"/>
@@ -3056,7 +3123,7 @@
               <w:rPr>
                 <w:noProof/>
               </w:rPr>
-              <w:instrText xml:space="preserve"> PAGEREF _Toc241512354 \h </w:instrText>
+              <w:instrText xml:space="preserve"> PAGEREF _Toc241660881 \h </w:instrText>
             </w:r>
             <w:r>
               <w:rPr>
@@ -3099,7 +3166,7 @@
               <w14:ligatures w14:val="standardContextual"/>
             </w:rPr>
           </w:pPr>
-          <w:hyperlink w:anchor="_Toc241512355" w:history="1">
+          <w:hyperlink w:anchor="_Toc241660882" w:history="1">
             <w:r>
               <w:rPr>
                 <w:rStyle w:val="Hyperlink"/>
@@ -3123,7 +3190,7 @@
               <w:rPr>
                 <w:noProof/>
               </w:rPr>
-              <w:instrText xml:space="preserve"> PAGEREF _Toc241512355 \h </w:instrText>
+              <w:instrText xml:space="preserve"> PAGEREF _Toc241660882 \h </w:instrText>
             </w:r>
             <w:r>
               <w:rPr>
@@ -3166,7 +3233,7 @@
               <w14:ligatures w14:val="standardContextual"/>
             </w:rPr>
           </w:pPr>
-          <w:hyperlink w:anchor="_Toc241512356" w:history="1">
+          <w:hyperlink w:anchor="_Toc241660883" w:history="1">
             <w:r>
               <w:rPr>
                 <w:rStyle w:val="Hyperlink"/>
@@ -3190,7 +3257,7 @@
               <w:rPr>
                 <w:noProof/>
               </w:rPr>
-              <w:instrText xml:space="preserve"> PAGEREF _Toc241512356 \h </w:instrText>
+              <w:instrText xml:space="preserve"> PAGEREF _Toc241660883 \h </w:instrText>
             </w:r>
             <w:r>
               <w:rPr>
@@ -3233,7 +3300,7 @@
               <w14:ligatures w14:val="standardContextual"/>
             </w:rPr>
           </w:pPr>
-          <w:hyperlink w:anchor="_Toc241512357" w:history="1">
+          <w:hyperlink w:anchor="_Toc241660884" w:history="1">
             <w:r>
               <w:rPr>
                 <w:rStyle w:val="Hyperlink"/>
@@ -3257,7 +3324,7 @@
               <w:rPr>
                 <w:noProof/>
               </w:rPr>
-              <w:instrText xml:space="preserve"> PAGEREF _Toc241512357 \h </w:instrText>
+              <w:instrText xml:space="preserve"> PAGEREF _Toc241660884 \h </w:instrText>
             </w:r>
             <w:r>
               <w:rPr>
@@ -3300,7 +3367,7 @@
               <w14:ligatures w14:val="standardContextual"/>
             </w:rPr>
           </w:pPr>
-          <w:hyperlink w:anchor="_Toc241512358" w:history="1">
+          <w:hyperlink w:anchor="_Toc241660885" w:history="1">
             <w:r>
               <w:rPr>
                 <w:rStyle w:val="Hyperlink"/>
@@ -3324,7 +3391,7 @@
               <w:rPr>
                 <w:noProof/>
               </w:rPr>
-              <w:instrText xml:space="preserve"> PAGEREF _Toc241512358 \h </w:instrText>
+              <w:instrText xml:space="preserve"> PAGEREF _Toc241660885 \h </w:instrText>
             </w:r>
             <w:r>
               <w:rPr>
@@ -3367,7 +3434,7 @@
               <w14:ligatures w14:val="standardContextual"/>
             </w:rPr>
           </w:pPr>
-          <w:hyperlink w:anchor="_Toc241512359" w:history="1">
+          <w:hyperlink w:anchor="_Toc241660886" w:history="1">
             <w:r>
               <w:rPr>
                 <w:rStyle w:val="Hyperlink"/>
@@ -3391,7 +3458,7 @@
               <w:rPr>
                 <w:noProof/>
               </w:rPr>
-              <w:instrText xml:space="preserve"> PAGEREF _Toc241512359 \h </w:instrText>
+              <w:instrText xml:space="preserve"> PAGEREF _Toc241660886 \h </w:instrText>
             </w:r>
             <w:r>
               <w:rPr>
@@ -3434,7 +3501,7 @@
               <w14:ligatures w14:val="standardContextual"/>
             </w:rPr>
           </w:pPr>
-          <w:hyperlink w:anchor="_Toc241512360" w:history="1">
+          <w:hyperlink w:anchor="_Toc241660887" w:history="1">
             <w:r>
               <w:rPr>
                 <w:rStyle w:val="Hyperlink"/>
@@ -3458,7 +3525,7 @@
               <w:rPr>
                 <w:noProof/>
               </w:rPr>
-              <w:instrText xml:space="preserve"> PAGEREF _Toc241512360 \h </w:instrText>
+              <w:instrText xml:space="preserve"> PAGEREF _Toc241660887 \h </w:instrText>
             </w:r>
             <w:r>
               <w:rPr>
@@ -3501,7 +3568,7 @@
               <w14:ligatures w14:val="standardContextual"/>
             </w:rPr>
           </w:pPr>
-          <w:hyperlink w:anchor="_Toc241512361" w:history="1">
+          <w:hyperlink w:anchor="_Toc241660888" w:history="1">
             <w:r>
               <w:rPr>
                 <w:rStyle w:val="Hyperlink"/>
@@ -3525,7 +3592,7 @@
               <w:rPr>
                 <w:noProof/>
               </w:rPr>
-              <w:instrText xml:space="preserve"> PAGEREF _Toc241512361 \h </w:instrText>
+              <w:instrText xml:space="preserve"> PAGEREF _Toc241660888 \h </w:instrText>
             </w:r>
             <w:r>
               <w:rPr>
@@ -3568,7 +3635,7 @@
               <w14:ligatures w14:val="standardContextual"/>
             </w:rPr>
           </w:pPr>
-          <w:hyperlink w:anchor="_Toc241512362" w:history="1">
+          <w:hyperlink w:anchor="_Toc241660889" w:history="1">
             <w:r>
               <w:rPr>
                 <w:rStyle w:val="Hyperlink"/>
@@ -3592,7 +3659,7 @@
               <w:rPr>
                 <w:noProof/>
               </w:rPr>
-              <w:instrText xml:space="preserve"> PAGEREF _Toc241512362 \h </w:instrText>
+              <w:instrText xml:space="preserve"> PAGEREF _Toc241660889 \h </w:instrText>
             </w:r>
             <w:r>
               <w:rPr>
@@ -3635,7 +3702,7 @@
               <w14:ligatures w14:val="standardContextual"/>
             </w:rPr>
           </w:pPr>
-          <w:hyperlink w:anchor="_Toc241512363" w:history="1">
+          <w:hyperlink w:anchor="_Toc241660890" w:history="1">
             <w:r>
               <w:rPr>
                 <w:rStyle w:val="Hyperlink"/>
@@ -3659,7 +3726,7 @@
               <w:rPr>
                 <w:noProof/>
               </w:rPr>
-              <w:instrText xml:space="preserve"> PAGEREF _Toc241512363 \h </w:instrText>
+              <w:instrText xml:space="preserve"> PAGEREF _Toc241660890 \h </w:instrText>
             </w:r>
             <w:r>
               <w:rPr>
@@ -3702,7 +3769,7 @@
               <w14:ligatures w14:val="standardContextual"/>
             </w:rPr>
           </w:pPr>
-          <w:hyperlink w:anchor="_Toc241512364" w:history="1">
+          <w:hyperlink w:anchor="_Toc241660891" w:history="1">
             <w:r>
               <w:rPr>
                 <w:rStyle w:val="Hyperlink"/>
@@ -3726,7 +3793,7 @@
               <w:rPr>
                 <w:noProof/>
               </w:rPr>
-              <w:instrText xml:space="preserve"> PAGEREF _Toc241512364 \h </w:instrText>
+              <w:instrText xml:space="preserve"> PAGEREF _Toc241660891 \h </w:instrText>
             </w:r>
             <w:r>
               <w:rPr>
@@ -3769,7 +3836,7 @@
       <w:pPr>
         <w:pStyle w:val="Heading1"/>
       </w:pPr>
-      <w:bookmarkStart w:id="0" w:name="_Toc241512311"/>
+      <w:bookmarkStart w:id="0" w:name="_Toc241660837"/>
       <w:r>
         <w:t>1.  Getting started</w:t>
       </w:r>
@@ -3797,7 +3864,7 @@
       <w:pPr>
         <w:pStyle w:val="Heading2"/>
       </w:pPr>
-      <w:bookmarkStart w:id="1" w:name="_Toc241512312"/>
+      <w:bookmarkStart w:id="1" w:name="_Toc241660838"/>
       <w:r>
         <w:t>Opening ShopControl</w:t>
       </w:r>
@@ -3877,7 +3944,7 @@
       <w:pPr>
         <w:pStyle w:val="Heading2"/>
       </w:pPr>
-      <w:bookmarkStart w:id="2" w:name="_Toc241512313"/>
+      <w:bookmarkStart w:id="2" w:name="_Toc241660839"/>
       <w:r>
         <w:t>Finding help</w:t>
       </w:r>
@@ -3980,7 +4047,7 @@
       <w:pPr>
         <w:pStyle w:val="Heading2"/>
       </w:pPr>
-      <w:bookmarkStart w:id="3" w:name="_Toc241512314"/>
+      <w:bookmarkStart w:id="3" w:name="_Toc241660840"/>
       <w:r>
         <w:t>Put the app on your phone's home screen</w:t>
       </w:r>
@@ -4148,7 +4215,7 @@
       <w:pPr>
         <w:pStyle w:val="Heading2"/>
       </w:pPr>
-      <w:bookmarkStart w:id="4" w:name="_Toc241512315"/>
+      <w:bookmarkStart w:id="4" w:name="_Toc241660841"/>
       <w:r>
         <w:t>Logging in</w:t>
       </w:r>
@@ -4318,7 +4385,7 @@
       <w:pPr>
         <w:pStyle w:val="Heading2"/>
       </w:pPr>
-      <w:bookmarkStart w:id="5" w:name="_Toc241512316"/>
+      <w:bookmarkStart w:id="5" w:name="_Toc241660842"/>
       <w:r>
         <w:t>Staying up to date</w:t>
       </w:r>
@@ -4346,7 +4413,7 @@
       <w:pPr>
         <w:pStyle w:val="Heading2"/>
       </w:pPr>
-      <w:bookmarkStart w:id="6" w:name="_Toc241512317"/>
+      <w:bookmarkStart w:id="6" w:name="_Toc241660843"/>
       <w:r>
         <w:t>Who can do what</w:t>
       </w:r>
@@ -4959,7 +5026,7 @@
         <w:pStyle w:val="Heading1"/>
         <w:pageBreakBefore/>
       </w:pPr>
-      <w:bookmarkStart w:id="7" w:name="_Toc241512318"/>
+      <w:bookmarkStart w:id="7" w:name="_Toc241660844"/>
       <w:r>
         <w:t>2.  The Employee App (technicians)</w:t>
       </w:r>
@@ -4977,7 +5044,7 @@
       <w:pPr>
         <w:pStyle w:val="Heading2"/>
       </w:pPr>
-      <w:bookmarkStart w:id="8" w:name="_Toc241512319"/>
+      <w:bookmarkStart w:id="8" w:name="_Toc241660845"/>
       <w:r>
         <w:t>Home screen</w:t>
       </w:r>
@@ -5115,13 +5182,120 @@
     </w:p>
     <w:p>
       <w:pPr>
+        <w:pStyle w:val="ListParagraph"/>
+        <w:numPr>
+          <w:ilvl w:val="0"/>
+          <w:numId w:val="2"/>
+        </w:numPr>
+        <w:spacing w:after="60"/>
+      </w:pPr>
+      <w:r>
+        <w:rPr>
+          <w:b/>
+          <w:bCs/>
+        </w:rPr>
+        <w:t>Español / English</w:t>
+      </w:r>
+      <w:r>
+        <w:t xml:space="preserve"> button (top of the screen): switches the app between English and Spanish.</w:t>
+      </w:r>
+    </w:p>
+    <w:p>
+      <w:pPr>
         <w:pStyle w:val="Heading2"/>
       </w:pPr>
-      <w:bookmarkStart w:id="9" w:name="_Toc241512320"/>
+      <w:bookmarkStart w:id="9" w:name="_Toc241660846"/>
+      <w:r>
+        <w:t>Spanish (Español)</w:t>
+      </w:r>
+      <w:bookmarkEnd w:id="9"/>
+    </w:p>
+    <w:p>
+      <w:pPr>
+        <w:spacing w:after="120"/>
+      </w:pPr>
+      <w:r>
+        <w:t xml:space="preserve">Tap </w:t>
+      </w:r>
+      <w:r>
+        <w:rPr>
+          <w:b/>
+          <w:bCs/>
+        </w:rPr>
+        <w:t>Español</w:t>
+      </w:r>
+      <w:r>
+        <w:t xml:space="preserve"> at the top of the sign-in screen, the home screen or the Staff Hub to switch the whole app to Spanish: menus, buttons, messages, every QC checklist item, part statuses, production stages and the time-off form. Tap </w:t>
+      </w:r>
+      <w:r>
+        <w:rPr>
+          <w:b/>
+          <w:bCs/>
+        </w:rPr>
+        <w:t>English</w:t>
+      </w:r>
+      <w:r>
+        <w:t xml:space="preserve"> to switch back. Each phone remembers its choice.</w:t>
+      </w:r>
+    </w:p>
+    <w:p>
+      <w:pPr>
+        <w:spacing w:after="120"/>
+      </w:pPr>
+      <w:r>
+        <w:t xml:space="preserve">Everything is still </w:t>
+      </w:r>
+      <w:r>
+        <w:rPr>
+          <w:b/>
+          <w:bCs/>
+        </w:rPr>
+        <w:t>saved in English</w:t>
+      </w:r>
+      <w:r>
+        <w:t>. Checklists save which items were checked, not the words on screen, so the office program, the QC report and Completed Jobs always show the English checklist, whichever language the tech used. Time-off types, rework choices and stages also save in English.</w:t>
+      </w:r>
+    </w:p>
+    <w:p>
+      <w:pPr>
+        <w:pBdr>
+          <w:left w:val="single" w:sz="24" w:space="8" w:color="C99A06"/>
+        </w:pBdr>
+        <w:shd w:val="clear" w:color="auto" w:fill="FFF8DD"/>
+        <w:spacing w:before="120" w:after="160"/>
+        <w:ind w:left="160" w:right="160"/>
+      </w:pPr>
+      <w:r>
+        <w:rPr>
+          <w:b/>
+          <w:bCs/>
+          <w:color w:val="C99A06"/>
+        </w:rPr>
+        <w:t xml:space="preserve">Note:  </w:t>
+      </w:r>
+      <w:r>
+        <w:t xml:space="preserve">What someone </w:t>
+      </w:r>
+      <w:r>
+        <w:rPr>
+          <w:b/>
+          <w:bCs/>
+        </w:rPr>
+        <w:t>types</w:t>
+      </w:r>
+      <w:r>
+        <w:t xml:space="preserve"> is saved exactly as typed. If a tech writes notes or a rework description in Spanish, that note shows in Spanish in the office program and on reports. Messages and company info from the office are not translated either. The user manual is in English.</w:t>
+      </w:r>
+    </w:p>
+    <w:p>
+      <w:pPr>
+        <w:pStyle w:val="Heading2"/>
+      </w:pPr>
+      <w:bookmarkStart w:id="10" w:name="_Toc241660847"/>
       <w:r>
         <w:t>Doing your QC checklist</w:t>
       </w:r>
-      <w:bookmarkEnd w:id="9"/>
+      <w:bookmarkEnd w:id="10"/>
     </w:p>
     <w:p>
       <w:pPr>
@@ -5331,11 +5505,11 @@
       <w:pPr>
         <w:pStyle w:val="Heading2"/>
       </w:pPr>
-      <w:bookmarkStart w:id="10" w:name="_Toc241512321"/>
+      <w:bookmarkStart w:id="11" w:name="_Toc241660848"/>
       <w:r>
         <w:t>Signing and rework</w:t>
       </w:r>
-      <w:bookmarkEnd w:id="10"/>
+      <w:bookmarkEnd w:id="11"/>
     </w:p>
     <w:p>
       <w:pPr>
@@ -5451,11 +5625,11 @@
       <w:pPr>
         <w:pStyle w:val="Heading2"/>
       </w:pPr>
-      <w:bookmarkStart w:id="11" w:name="_Toc241512322"/>
+      <w:bookmarkStart w:id="12" w:name="_Toc241660849"/>
       <w:r>
         <w:t>Other departments' checklists</w:t>
       </w:r>
-      <w:bookmarkEnd w:id="11"/>
+      <w:bookmarkEnd w:id="12"/>
     </w:p>
     <w:p>
       <w:pPr>
@@ -5479,11 +5653,11 @@
       <w:pPr>
         <w:pStyle w:val="Heading2"/>
       </w:pPr>
-      <w:bookmarkStart w:id="12" w:name="_Toc241512323"/>
+      <w:bookmarkStart w:id="13" w:name="_Toc241660850"/>
       <w:r>
         <w:t>Photos and parts</w:t>
       </w:r>
-      <w:bookmarkEnd w:id="12"/>
+      <w:bookmarkEnd w:id="13"/>
     </w:p>
     <w:p>
       <w:pPr>
@@ -5616,11 +5790,11 @@
         <w:pStyle w:val="Heading1"/>
         <w:pageBreakBefore/>
       </w:pPr>
-      <w:bookmarkStart w:id="13" w:name="_Toc241512324"/>
+      <w:bookmarkStart w:id="14" w:name="_Toc241660851"/>
       <w:r>
         <w:t>3.  Staff Hub: time off, mailbox and company info</w:t>
       </w:r>
-      <w:bookmarkEnd w:id="13"/>
+      <w:bookmarkEnd w:id="14"/>
     </w:p>
     <w:p>
       <w:pPr>
@@ -5644,11 +5818,11 @@
       <w:pPr>
         <w:pStyle w:val="Heading2"/>
       </w:pPr>
-      <w:bookmarkStart w:id="14" w:name="_Toc241512325"/>
+      <w:bookmarkStart w:id="15" w:name="_Toc241660852"/>
       <w:r>
         <w:t>Requesting time off</w:t>
       </w:r>
-      <w:bookmarkEnd w:id="14"/>
+      <w:bookmarkEnd w:id="15"/>
     </w:p>
     <w:p>
       <w:pPr>
@@ -5807,11 +5981,11 @@
       <w:pPr>
         <w:pStyle w:val="Heading2"/>
       </w:pPr>
-      <w:bookmarkStart w:id="15" w:name="_Toc241512326"/>
+      <w:bookmarkStart w:id="16" w:name="_Toc241660853"/>
       <w:r>
         <w:t>Checking your requests</w:t>
       </w:r>
-      <w:bookmarkEnd w:id="15"/>
+      <w:bookmarkEnd w:id="16"/>
     </w:p>
     <w:p>
       <w:pPr>
@@ -5862,11 +6036,11 @@
       <w:pPr>
         <w:pStyle w:val="Heading2"/>
       </w:pPr>
-      <w:bookmarkStart w:id="16" w:name="_Toc241512327"/>
+      <w:bookmarkStart w:id="17" w:name="_Toc241660854"/>
       <w:r>
         <w:t>Mailbox</w:t>
       </w:r>
-      <w:bookmarkEnd w:id="16"/>
+      <w:bookmarkEnd w:id="17"/>
     </w:p>
     <w:p>
       <w:pPr>
@@ -5931,11 +6105,11 @@
       <w:pPr>
         <w:pStyle w:val="Heading2"/>
       </w:pPr>
-      <w:bookmarkStart w:id="17" w:name="_Toc241512328"/>
+      <w:bookmarkStart w:id="18" w:name="_Toc241660855"/>
       <w:r>
         <w:t>Company info and this manual</w:t>
       </w:r>
-      <w:bookmarkEnd w:id="17"/>
+      <w:bookmarkEnd w:id="18"/>
     </w:p>
     <w:p>
       <w:pPr>
@@ -5967,11 +6141,11 @@
         <w:pStyle w:val="Heading1"/>
         <w:pageBreakBefore/>
       </w:pPr>
-      <w:bookmarkStart w:id="18" w:name="_Toc241512329"/>
+      <w:bookmarkStart w:id="19" w:name="_Toc241660856"/>
       <w:r>
         <w:t>4.  Finding a vehicle</w:t>
       </w:r>
-      <w:bookmarkEnd w:id="18"/>
+      <w:bookmarkEnd w:id="19"/>
     </w:p>
     <w:p>
       <w:pPr>
@@ -6222,11 +6396,11 @@
         <w:pStyle w:val="Heading1"/>
         <w:pageBreakBefore/>
       </w:pPr>
-      <w:bookmarkStart w:id="19" w:name="_Toc241512330"/>
+      <w:bookmarkStart w:id="20" w:name="_Toc241660857"/>
       <w:r>
         <w:t>5.  Dashboard</w:t>
       </w:r>
-      <w:bookmarkEnd w:id="19"/>
+      <w:bookmarkEnd w:id="20"/>
     </w:p>
     <w:p>
       <w:pPr>
@@ -6361,11 +6535,11 @@
         <w:pStyle w:val="Heading1"/>
         <w:pageBreakBefore/>
       </w:pPr>
-      <w:bookmarkStart w:id="20" w:name="_Toc241512331"/>
+      <w:bookmarkStart w:id="21" w:name="_Toc241660858"/>
       <w:r>
         <w:t>6.  Jobs and the Daily GO List</w:t>
       </w:r>
-      <w:bookmarkEnd w:id="20"/>
+      <w:bookmarkEnd w:id="21"/>
     </w:p>
     <w:p>
       <w:pPr>
@@ -6389,11 +6563,11 @@
       <w:pPr>
         <w:pStyle w:val="Heading2"/>
       </w:pPr>
-      <w:bookmarkStart w:id="21" w:name="_Toc241512332"/>
+      <w:bookmarkStart w:id="22" w:name="_Toc241660859"/>
       <w:r>
         <w:t>RO numbers</w:t>
       </w:r>
-      <w:bookmarkEnd w:id="21"/>
+      <w:bookmarkEnd w:id="22"/>
     </w:p>
     <w:p>
       <w:pPr>
@@ -6475,11 +6649,11 @@
       <w:pPr>
         <w:pStyle w:val="Heading2"/>
       </w:pPr>
-      <w:bookmarkStart w:id="22" w:name="_Toc241512333"/>
+      <w:bookmarkStart w:id="23" w:name="_Toc241660860"/>
       <w:r>
         <w:t>Adding or editing a job</w:t>
       </w:r>
-      <w:bookmarkEnd w:id="22"/>
+      <w:bookmarkEnd w:id="23"/>
     </w:p>
     <w:p>
       <w:pPr>
@@ -6595,11 +6769,11 @@
       <w:pPr>
         <w:pStyle w:val="Heading2"/>
       </w:pPr>
-      <w:bookmarkStart w:id="23" w:name="_Toc241512334"/>
+      <w:bookmarkStart w:id="24" w:name="_Toc241660861"/>
       <w:r>
         <w:t>Customer updates</w:t>
       </w:r>
-      <w:bookmarkEnd w:id="23"/>
+      <w:bookmarkEnd w:id="24"/>
     </w:p>
     <w:p>
       <w:pPr>
@@ -6764,21 +6938,21 @@
         <w:pStyle w:val="Heading1"/>
         <w:pageBreakBefore/>
       </w:pPr>
-      <w:bookmarkStart w:id="24" w:name="_Toc241512335"/>
+      <w:bookmarkStart w:id="25" w:name="_Toc241660862"/>
       <w:r>
         <w:t>7.  Production, Delivery and Planning boards</w:t>
       </w:r>
-      <w:bookmarkEnd w:id="24"/>
+      <w:bookmarkEnd w:id="25"/>
     </w:p>
     <w:p>
       <w:pPr>
         <w:pStyle w:val="Heading2"/>
       </w:pPr>
-      <w:bookmarkStart w:id="25" w:name="_Toc241512336"/>
+      <w:bookmarkStart w:id="26" w:name="_Toc241660863"/>
       <w:r>
         <w:t>Production Board</w:t>
       </w:r>
-      <w:bookmarkEnd w:id="25"/>
+      <w:bookmarkEnd w:id="26"/>
     </w:p>
     <w:p>
       <w:pPr>
@@ -6902,11 +7076,11 @@
       <w:pPr>
         <w:pStyle w:val="Heading2"/>
       </w:pPr>
-      <w:bookmarkStart w:id="26" w:name="_Toc241512337"/>
+      <w:bookmarkStart w:id="27" w:name="_Toc241660864"/>
       <w:r>
         <w:t>Vehicle pictures</w:t>
       </w:r>
-      <w:bookmarkEnd w:id="26"/>
+      <w:bookmarkEnd w:id="27"/>
     </w:p>
     <w:p>
       <w:pPr>
@@ -6960,11 +7134,11 @@
       <w:pPr>
         <w:pStyle w:val="Heading2"/>
       </w:pPr>
-      <w:bookmarkStart w:id="27" w:name="_Toc241512338"/>
+      <w:bookmarkStart w:id="28" w:name="_Toc241660865"/>
       <w:r>
         <w:t>Delivery and Planning boards</w:t>
       </w:r>
-      <w:bookmarkEnd w:id="27"/>
+      <w:bookmarkEnd w:id="28"/>
     </w:p>
     <w:p>
       <w:pPr>
@@ -7050,11 +7224,11 @@
       <w:pPr>
         <w:pStyle w:val="Heading2"/>
       </w:pPr>
-      <w:bookmarkStart w:id="28" w:name="_Toc241512339"/>
+      <w:bookmarkStart w:id="29" w:name="_Toc241660866"/>
       <w:r>
         <w:t>TV display</w:t>
       </w:r>
-      <w:bookmarkEnd w:id="28"/>
+      <w:bookmarkEnd w:id="29"/>
     </w:p>
     <w:p>
       <w:pPr>
@@ -7079,11 +7253,11 @@
         <w:pStyle w:val="Heading1"/>
         <w:pageBreakBefore/>
       </w:pPr>
-      <w:bookmarkStart w:id="29" w:name="_Toc241512340"/>
+      <w:bookmarkStart w:id="30" w:name="_Toc241660867"/>
       <w:r>
         <w:t>8.  CCC estimates coming into ShopControl</w:t>
       </w:r>
-      <w:bookmarkEnd w:id="29"/>
+      <w:bookmarkEnd w:id="30"/>
     </w:p>
     <w:p>
       <w:pPr>
@@ -7188,11 +7362,11 @@
         <w:pStyle w:val="Heading1"/>
         <w:pageBreakBefore/>
       </w:pPr>
-      <w:bookmarkStart w:id="30" w:name="_Toc241512341"/>
+      <w:bookmarkStart w:id="31" w:name="_Toc241660868"/>
       <w:r>
         <w:t>9.  Parts</w:t>
       </w:r>
-      <w:bookmarkEnd w:id="30"/>
+      <w:bookmarkEnd w:id="31"/>
     </w:p>
     <w:p>
       <w:pPr>
@@ -7246,11 +7420,11 @@
       <w:pPr>
         <w:pStyle w:val="Heading2"/>
       </w:pPr>
-      <w:bookmarkStart w:id="31" w:name="_Toc241512342"/>
+      <w:bookmarkStart w:id="32" w:name="_Toc241660869"/>
       <w:r>
         <w:t>What counts as a problem</w:t>
       </w:r>
-      <w:bookmarkEnd w:id="31"/>
+      <w:bookmarkEnd w:id="32"/>
     </w:p>
     <w:p>
       <w:pPr>
@@ -7314,11 +7488,11 @@
       <w:pPr>
         <w:pStyle w:val="Heading2"/>
       </w:pPr>
-      <w:bookmarkStart w:id="32" w:name="_Toc241512343"/>
+      <w:bookmarkStart w:id="33" w:name="_Toc241660870"/>
       <w:r>
         <w:t>Ordering parts</w:t>
       </w:r>
-      <w:bookmarkEnd w:id="32"/>
+      <w:bookmarkEnd w:id="33"/>
     </w:p>
     <w:p>
       <w:pPr>
@@ -7421,11 +7595,11 @@
       <w:pPr>
         <w:pStyle w:val="Heading2"/>
       </w:pPr>
-      <w:bookmarkStart w:id="33" w:name="_Toc241512344"/>
+      <w:bookmarkStart w:id="34" w:name="_Toc241660871"/>
       <w:r>
         <w:t>Mirror matching and carts</w:t>
       </w:r>
-      <w:bookmarkEnd w:id="33"/>
+      <w:bookmarkEnd w:id="34"/>
     </w:p>
     <w:p>
       <w:pPr>
@@ -7559,11 +7733,11 @@
       <w:pPr>
         <w:pStyle w:val="Heading2"/>
       </w:pPr>
-      <w:bookmarkStart w:id="34" w:name="_Toc241512345"/>
+      <w:bookmarkStart w:id="35" w:name="_Toc241660872"/>
       <w:r>
         <w:t>Other parts screens</w:t>
       </w:r>
-      <w:bookmarkEnd w:id="34"/>
+      <w:bookmarkEnd w:id="35"/>
     </w:p>
     <w:p>
       <w:pPr>
@@ -7650,11 +7824,11 @@
         <w:pStyle w:val="Heading1"/>
         <w:pageBreakBefore/>
       </w:pPr>
-      <w:bookmarkStart w:id="35" w:name="_Toc241512346"/>
+      <w:bookmarkStart w:id="36" w:name="_Toc241660873"/>
       <w:r>
         <w:t>10.  Vehicle QC (office view)</w:t>
       </w:r>
-      <w:bookmarkEnd w:id="35"/>
+      <w:bookmarkEnd w:id="36"/>
     </w:p>
     <w:p>
       <w:pPr>
@@ -7688,11 +7862,11 @@
       <w:pPr>
         <w:pStyle w:val="Heading2"/>
       </w:pPr>
-      <w:bookmarkStart w:id="36" w:name="_Toc241512347"/>
+      <w:bookmarkStart w:id="37" w:name="_Toc241660874"/>
       <w:r>
         <w:t>Pulling up a car's QC report</w:t>
       </w:r>
-      <w:bookmarkEnd w:id="36"/>
+      <w:bookmarkEnd w:id="37"/>
     </w:p>
     <w:p>
       <w:pPr>
@@ -7803,11 +7977,11 @@
         <w:pStyle w:val="Heading1"/>
         <w:pageBreakBefore/>
       </w:pPr>
-      <w:bookmarkStart w:id="37" w:name="_Toc241512348"/>
+      <w:bookmarkStart w:id="38" w:name="_Toc241660875"/>
       <w:r>
         <w:t>11.  Completed Jobs (job records)</w:t>
       </w:r>
-      <w:bookmarkEnd w:id="37"/>
+      <w:bookmarkEnd w:id="38"/>
     </w:p>
     <w:p>
       <w:pPr>
@@ -7994,11 +8168,11 @@
       <w:pPr>
         <w:pStyle w:val="Heading2"/>
       </w:pPr>
-      <w:bookmarkStart w:id="38" w:name="_Toc241512349"/>
+      <w:bookmarkStart w:id="39" w:name="_Toc241660876"/>
       <w:r>
         <w:t>Deleted jobs</w:t>
       </w:r>
-      <w:bookmarkEnd w:id="38"/>
+      <w:bookmarkEnd w:id="39"/>
     </w:p>
     <w:p>
       <w:pPr>
@@ -8054,21 +8228,21 @@
         <w:pStyle w:val="Heading1"/>
         <w:pageBreakBefore/>
       </w:pPr>
-      <w:bookmarkStart w:id="39" w:name="_Toc241512350"/>
+      <w:bookmarkStart w:id="40" w:name="_Toc241660877"/>
       <w:r>
         <w:t>12.  Office tools</w:t>
       </w:r>
-      <w:bookmarkEnd w:id="39"/>
+      <w:bookmarkEnd w:id="40"/>
     </w:p>
     <w:p>
       <w:pPr>
         <w:pStyle w:val="Heading2"/>
       </w:pPr>
-      <w:bookmarkStart w:id="40" w:name="_Toc241512351"/>
+      <w:bookmarkStart w:id="41" w:name="_Toc241660878"/>
       <w:r>
         <w:t>Missed Calls / Callback Requests</w:t>
       </w:r>
-      <w:bookmarkEnd w:id="40"/>
+      <w:bookmarkEnd w:id="41"/>
     </w:p>
     <w:p>
       <w:pPr>
@@ -8142,11 +8316,11 @@
       <w:pPr>
         <w:pStyle w:val="Heading2"/>
       </w:pPr>
-      <w:bookmarkStart w:id="41" w:name="_Toc241512352"/>
+      <w:bookmarkStart w:id="42" w:name="_Toc241660879"/>
       <w:r>
         <w:t>Tasks</w:t>
       </w:r>
-      <w:bookmarkEnd w:id="41"/>
+      <w:bookmarkEnd w:id="42"/>
     </w:p>
     <w:p>
       <w:pPr>
@@ -8160,11 +8334,11 @@
       <w:pPr>
         <w:pStyle w:val="Heading2"/>
       </w:pPr>
-      <w:bookmarkStart w:id="42" w:name="_Toc241512353"/>
+      <w:bookmarkStart w:id="43" w:name="_Toc241660880"/>
       <w:r>
         <w:t>Booth Filters and Facility Checklist</w:t>
       </w:r>
-      <w:bookmarkEnd w:id="42"/>
+      <w:bookmarkEnd w:id="43"/>
     </w:p>
     <w:p>
       <w:pPr>
@@ -8198,11 +8372,11 @@
       <w:pPr>
         <w:pStyle w:val="Heading2"/>
       </w:pPr>
-      <w:bookmarkStart w:id="43" w:name="_Toc241512354"/>
+      <w:bookmarkStart w:id="44" w:name="_Toc241660881"/>
       <w:r>
         <w:t>AR Balances and Cycle Time</w:t>
       </w:r>
-      <w:bookmarkEnd w:id="43"/>
+      <w:bookmarkEnd w:id="44"/>
     </w:p>
     <w:p>
       <w:pPr>
@@ -8248,11 +8422,11 @@
       <w:pPr>
         <w:pStyle w:val="Heading2"/>
       </w:pPr>
-      <w:bookmarkStart w:id="44" w:name="_Toc241512355"/>
+      <w:bookmarkStart w:id="45" w:name="_Toc241660882"/>
       <w:r>
         <w:t>Photos and Activity Log</w:t>
       </w:r>
-      <w:bookmarkEnd w:id="44"/>
+      <w:bookmarkEnd w:id="45"/>
     </w:p>
     <w:p>
       <w:pPr>
@@ -8299,21 +8473,21 @@
         <w:pStyle w:val="Heading1"/>
         <w:pageBreakBefore/>
       </w:pPr>
-      <w:bookmarkStart w:id="45" w:name="_Toc241512356"/>
+      <w:bookmarkStart w:id="46" w:name="_Toc241660883"/>
       <w:r>
         <w:t>13.  Time off and messages (office and admins)</w:t>
       </w:r>
-      <w:bookmarkEnd w:id="45"/>
+      <w:bookmarkEnd w:id="46"/>
     </w:p>
     <w:p>
       <w:pPr>
         <w:pStyle w:val="Heading2"/>
       </w:pPr>
-      <w:bookmarkStart w:id="46" w:name="_Toc241512357"/>
+      <w:bookmarkStart w:id="47" w:name="_Toc241660884"/>
       <w:r>
         <w:t>Time Off tab</w:t>
       </w:r>
-      <w:bookmarkEnd w:id="46"/>
+      <w:bookmarkEnd w:id="47"/>
     </w:p>
     <w:p>
       <w:pPr>
@@ -8437,11 +8611,11 @@
       <w:pPr>
         <w:pStyle w:val="Heading2"/>
       </w:pPr>
-      <w:bookmarkStart w:id="47" w:name="_Toc241512358"/>
+      <w:bookmarkStart w:id="48" w:name="_Toc241660885"/>
       <w:r>
         <w:t>Messages &amp; Info tab</w:t>
       </w:r>
-      <w:bookmarkEnd w:id="47"/>
+      <w:bookmarkEnd w:id="48"/>
     </w:p>
     <w:p>
       <w:pPr>
@@ -8528,21 +8702,21 @@
         <w:pStyle w:val="Heading1"/>
         <w:pageBreakBefore/>
       </w:pPr>
-      <w:bookmarkStart w:id="48" w:name="_Toc241512359"/>
+      <w:bookmarkStart w:id="49" w:name="_Toc241660886"/>
       <w:r>
         <w:t>14.  Admin: employees and settings</w:t>
       </w:r>
-      <w:bookmarkEnd w:id="48"/>
+      <w:bookmarkEnd w:id="49"/>
     </w:p>
     <w:p>
       <w:pPr>
         <w:pStyle w:val="Heading2"/>
       </w:pPr>
-      <w:bookmarkStart w:id="49" w:name="_Toc241512360"/>
+      <w:bookmarkStart w:id="50" w:name="_Toc241660887"/>
       <w:r>
         <w:t>Adding an employee</w:t>
       </w:r>
-      <w:bookmarkEnd w:id="49"/>
+      <w:bookmarkEnd w:id="50"/>
     </w:p>
     <w:p>
       <w:pPr>
@@ -8660,11 +8834,11 @@
       <w:pPr>
         <w:pStyle w:val="Heading2"/>
       </w:pPr>
-      <w:bookmarkStart w:id="50" w:name="_Toc241512361"/>
+      <w:bookmarkStart w:id="51" w:name="_Toc241660888"/>
       <w:r>
         <w:t>Changing an employee</w:t>
       </w:r>
-      <w:bookmarkEnd w:id="50"/>
+      <w:bookmarkEnd w:id="51"/>
     </w:p>
     <w:p>
       <w:pPr>
@@ -8820,11 +8994,11 @@
       <w:pPr>
         <w:pStyle w:val="Heading2"/>
       </w:pPr>
-      <w:bookmarkStart w:id="51" w:name="_Toc241512362"/>
+      <w:bookmarkStart w:id="52" w:name="_Toc241660889"/>
       <w:r>
         <w:t>Board Settings</w:t>
       </w:r>
-      <w:bookmarkEnd w:id="51"/>
+      <w:bookmarkEnd w:id="52"/>
     </w:p>
     <w:p>
       <w:pPr>
@@ -8839,11 +9013,11 @@
         <w:pStyle w:val="Heading1"/>
         <w:pageBreakBefore/>
       </w:pPr>
-      <w:bookmarkStart w:id="52" w:name="_Toc241512363"/>
+      <w:bookmarkStart w:id="53" w:name="_Toc241660890"/>
       <w:r>
         <w:t>15.  Quick answers</w:t>
       </w:r>
-      <w:bookmarkEnd w:id="52"/>
+      <w:bookmarkEnd w:id="53"/>
     </w:p>
     <w:tbl>
       <w:tblPr>
@@ -9483,11 +9657,11 @@
         <w:pStyle w:val="Heading1"/>
         <w:pageBreakBefore/>
       </w:pPr>
-      <w:bookmarkStart w:id="53" w:name="_Toc241512364"/>
+      <w:bookmarkStart w:id="54" w:name="_Toc241660891"/>
       <w:r>
         <w:t>Manual versions</w:t>
       </w:r>
-      <w:bookmarkEnd w:id="53"/>
+      <w:bookmarkEnd w:id="54"/>
     </w:p>
     <w:tbl>
       <w:tblPr>
@@ -9638,7 +9812,7 @@
                 <w:b/>
                 <w:bCs/>
               </w:rPr>
-              <w:t>1.9</w:t>
+              <w:t>2.0</w:t>
             </w:r>
           </w:p>
         </w:tc>
@@ -9660,7 +9834,7 @@
           </w:tcPr>
           <w:p>
             <w:r>
-              <w:t>September 28, 2026</w:t>
+              <w:t>September 30, 2026</w:t>
             </w:r>
           </w:p>
         </w:tc>
@@ -9682,17 +9856,27 @@
           </w:tcPr>
           <w:p>
             <w:r>
-              <w:t xml:space="preserve">New </w:t>
+              <w:t xml:space="preserve">The Employee App can be switched to </w:t>
             </w:r>
             <w:r>
               <w:rPr>
                 <w:b/>
                 <w:bCs/>
               </w:rPr>
-              <w:t>Find a vehicle</w:t>
-            </w:r>
-            <w:r>
-              <w:t xml:space="preserve"> search at the top of the office program. It finds any car, at any stage or finished, by RO, customer, vehicle, VIN, plate or claim number.</w:t>
+              <w:t>Spanish</w:t>
+            </w:r>
+            <w:r>
+              <w:t xml:space="preserve"> with the </w:t>
+            </w:r>
+            <w:r>
+              <w:rPr>
+                <w:b/>
+                <w:bCs/>
+              </w:rPr>
+              <w:t>Español</w:t>
+            </w:r>
+            <w:r>
+              <w:t xml:space="preserve"> button. Reports and the office program stay in English.</w:t>
             </w:r>
           </w:p>
         </w:tc>
@@ -9729,7 +9913,7 @@
                 <w:b/>
                 <w:bCs/>
               </w:rPr>
-              <w:t>1.8</w:t>
+              <w:t>1.9</w:t>
             </w:r>
           </w:p>
         </w:tc>
@@ -9780,10 +9964,10 @@
                 <w:b/>
                 <w:bCs/>
               </w:rPr>
-              <w:t>Completed Jobs</w:t>
-            </w:r>
-            <w:r>
-              <w:t xml:space="preserve"> tab with each finished job's full file (production timeline, parts, QC, photos, every change). Only an admin can delete a delivered job or its parts.</w:t>
+              <w:t>Find a vehicle</w:t>
+            </w:r>
+            <w:r>
+              <w:t xml:space="preserve"> search at the top of the office program. It finds any car, at any stage or finished, by RO, customer, vehicle, VIN, plate or claim number.</w:t>
             </w:r>
           </w:p>
         </w:tc>
@@ -9820,7 +10004,7 @@
                 <w:b/>
                 <w:bCs/>
               </w:rPr>
-              <w:t>1.7</w:t>
+              <w:t>1.8</w:t>
             </w:r>
           </w:p>
         </w:tc>
@@ -9864,17 +10048,17 @@
           </w:tcPr>
           <w:p>
             <w:r>
-              <w:t xml:space="preserve">The Employee App now shows </w:t>
+              <w:t xml:space="preserve">New </w:t>
             </w:r>
             <w:r>
               <w:rPr>
                 <w:b/>
                 <w:bCs/>
               </w:rPr>
-              <w:t>where each part is</w:t>
-            </w:r>
-            <w:r>
-              <w:t>: the car's parts cart, and the cart shelf or storage spot for every part.</w:t>
+              <w:t>Completed Jobs</w:t>
+            </w:r>
+            <w:r>
+              <w:t xml:space="preserve"> tab with each finished job's full file (production timeline, parts, QC, photos, every change). Only an admin can delete a delivered job or its parts.</w:t>
             </w:r>
           </w:p>
         </w:tc>
@@ -9911,7 +10095,7 @@
                 <w:b/>
                 <w:bCs/>
               </w:rPr>
-              <w:t>1.6</w:t>
+              <w:t>1.7</w:t>
             </w:r>
           </w:p>
         </w:tc>
@@ -9955,37 +10139,17 @@
           </w:tcPr>
           <w:p>
             <w:r>
-              <w:t xml:space="preserve">Whoever does </w:t>
+              <w:t xml:space="preserve">The Employee App now shows </w:t>
             </w:r>
             <w:r>
               <w:rPr>
                 <w:b/>
                 <w:bCs/>
               </w:rPr>
-              <w:t>Check-In</w:t>
-            </w:r>
-            <w:r>
-              <w:t xml:space="preserve"> automatically gets the </w:t>
-            </w:r>
-            <w:r>
-              <w:rPr>
-                <w:b/>
-                <w:bCs/>
-              </w:rPr>
-              <w:t>Final QC</w:t>
-            </w:r>
-            <w:r>
-              <w:t xml:space="preserve"> checklist too. New </w:t>
-            </w:r>
-            <w:r>
-              <w:rPr>
-                <w:b/>
-                <w:bCs/>
-              </w:rPr>
-              <w:t>QC report</w:t>
-            </w:r>
-            <w:r>
-              <w:t xml:space="preserve"> for each car: all five checklists with signatures on one printable page.</w:t>
+              <w:t>where each part is</w:t>
+            </w:r>
+            <w:r>
+              <w:t>: the car's parts cart, and the cart shelf or storage spot for every part.</w:t>
             </w:r>
           </w:p>
         </w:tc>
@@ -10022,7 +10186,7 @@
                 <w:b/>
                 <w:bCs/>
               </w:rPr>
-              <w:t>1.5</w:t>
+              <w:t>1.6</w:t>
             </w:r>
           </w:p>
         </w:tc>
@@ -10066,17 +10230,37 @@
           </w:tcPr>
           <w:p>
             <w:r>
-              <w:t xml:space="preserve">Body technicians automatically get the </w:t>
+              <w:t xml:space="preserve">Whoever does </w:t>
             </w:r>
             <w:r>
               <w:rPr>
                 <w:b/>
                 <w:bCs/>
               </w:rPr>
-              <w:t>Reassy</w:t>
-            </w:r>
-            <w:r>
-              <w:t xml:space="preserve"> checklist too.</w:t>
+              <w:t>Check-In</w:t>
+            </w:r>
+            <w:r>
+              <w:t xml:space="preserve"> automatically gets the </w:t>
+            </w:r>
+            <w:r>
+              <w:rPr>
+                <w:b/>
+                <w:bCs/>
+              </w:rPr>
+              <w:t>Final QC</w:t>
+            </w:r>
+            <w:r>
+              <w:t xml:space="preserve"> checklist too. New </w:t>
+            </w:r>
+            <w:r>
+              <w:rPr>
+                <w:b/>
+                <w:bCs/>
+              </w:rPr>
+              <w:t>QC report</w:t>
+            </w:r>
+            <w:r>
+              <w:t xml:space="preserve"> for each car: all five checklists with signatures on one printable page.</w:t>
             </w:r>
           </w:p>
         </w:tc>
@@ -10113,7 +10297,7 @@
                 <w:b/>
                 <w:bCs/>
               </w:rPr>
-              <w:t>1.4</w:t>
+              <w:t>1.5</w:t>
             </w:r>
           </w:p>
         </w:tc>
@@ -10157,17 +10341,17 @@
           </w:tcPr>
           <w:p>
             <w:r>
-              <w:t xml:space="preserve">Employees can be set to </w:t>
+              <w:t xml:space="preserve">Body technicians automatically get the </w:t>
             </w:r>
             <w:r>
               <w:rPr>
                 <w:b/>
                 <w:bCs/>
               </w:rPr>
-              <w:t>also do</w:t>
-            </w:r>
-            <w:r>
-              <w:t xml:space="preserve"> other checklists (for example a body tech who reassembles also gets the Reassy checklist).</w:t>
+              <w:t>Reassy</w:t>
+            </w:r>
+            <w:r>
+              <w:t xml:space="preserve"> checklist too.</w:t>
             </w:r>
           </w:p>
         </w:tc>
@@ -10204,7 +10388,7 @@
                 <w:b/>
                 <w:bCs/>
               </w:rPr>
-              <w:t>1.3</w:t>
+              <w:t>1.4</w:t>
             </w:r>
           </w:p>
         </w:tc>
@@ -10248,7 +10432,17 @@
           </w:tcPr>
           <w:p>
             <w:r>
-              <w:t>New accounts and admin password resets use a temporary password; you choose your own the first time you sign in.</w:t>
+              <w:t xml:space="preserve">Employees can be set to </w:t>
+            </w:r>
+            <w:r>
+              <w:rPr>
+                <w:b/>
+                <w:bCs/>
+              </w:rPr>
+              <w:t>also do</w:t>
+            </w:r>
+            <w:r>
+              <w:t xml:space="preserve"> other checklists (for example a body tech who reassembles also gets the Reassy checklist).</w:t>
             </w:r>
           </w:p>
         </w:tc>
@@ -10285,7 +10479,7 @@
                 <w:b/>
                 <w:bCs/>
               </w:rPr>
-              <w:t>1.2</w:t>
+              <w:t>1.3</w:t>
             </w:r>
           </w:p>
         </w:tc>
@@ -10329,17 +10523,7 @@
           </w:tcPr>
           <w:p>
             <w:r>
-              <w:t xml:space="preserve">Added the </w:t>
-            </w:r>
-            <w:r>
-              <w:rPr>
-                <w:b/>
-                <w:bCs/>
-              </w:rPr>
-              <w:t>Help</w:t>
-            </w:r>
-            <w:r>
-              <w:t xml:space="preserve"> tab in the office program and a search box in the manual.</w:t>
+              <w:t>New accounts and admin password resets use a temporary password; you choose your own the first time you sign in.</w:t>
             </w:r>
           </w:p>
         </w:tc>
@@ -10376,7 +10560,7 @@
                 <w:b/>
                 <w:bCs/>
               </w:rPr>
-              <w:t>1.1</w:t>
+              <w:t>1.2</w:t>
             </w:r>
           </w:p>
         </w:tc>
@@ -10420,17 +10604,17 @@
           </w:tcPr>
           <w:p>
             <w:r>
-              <w:t xml:space="preserve">Employee App address is now </w:t>
+              <w:t xml:space="preserve">Added the </w:t>
             </w:r>
             <w:r>
               <w:rPr>
                 <w:b/>
                 <w:bCs/>
               </w:rPr>
-              <w:t>https://conceptautobody.app</w:t>
-            </w:r>
-            <w:r>
-              <w:t xml:space="preserve"> and works on phones anywhere. Added how to put it on your phone's home screen.</w:t>
+              <w:t>Help</w:t>
+            </w:r>
+            <w:r>
+              <w:t xml:space="preserve"> tab in the office program and a search box in the manual.</w:t>
             </w:r>
           </w:p>
         </w:tc>
@@ -10467,7 +10651,7 @@
                 <w:b/>
                 <w:bCs/>
               </w:rPr>
-              <w:t>1.0</w:t>
+              <w:t>1.1</w:t>
             </w:r>
           </w:p>
         </w:tc>
@@ -10511,6 +10695,97 @@
           </w:tcPr>
           <w:p>
             <w:r>
+              <w:t xml:space="preserve">Employee App address is now </w:t>
+            </w:r>
+            <w:r>
+              <w:rPr>
+                <w:b/>
+                <w:bCs/>
+              </w:rPr>
+              <w:t>https://conceptautobody.app</w:t>
+            </w:r>
+            <w:r>
+              <w:t xml:space="preserve"> and works on phones anywhere. Added how to put it on your phone's home screen.</w:t>
+            </w:r>
+          </w:p>
+        </w:tc>
+      </w:tr>
+      <w:tr>
+        <w:tblPrEx>
+          <w:tblCellMar>
+            <w:top w:w="0" w:type="dxa"/>
+            <w:bottom w:w="0" w:type="dxa"/>
+          </w:tblCellMar>
+        </w:tblPrEx>
+        <w:trPr>
+          <w:cantSplit/>
+        </w:trPr>
+        <w:tc>
+          <w:tcPr>
+            <w:tcW w:w="3120" w:type="dxa"/>
+            <w:tcBorders>
+              <w:top w:val="single" w:sz="4" w:space="0" w:color="C9CFD6"/>
+              <w:left w:val="single" w:sz="4" w:space="0" w:color="C9CFD6"/>
+              <w:bottom w:val="single" w:sz="4" w:space="0" w:color="C9CFD6"/>
+              <w:right w:val="single" w:sz="4" w:space="0" w:color="C9CFD6"/>
+            </w:tcBorders>
+            <w:tcMar>
+              <w:top w:w="80" w:type="dxa"/>
+              <w:left w:w="120" w:type="dxa"/>
+              <w:bottom w:w="80" w:type="dxa"/>
+              <w:right w:w="120" w:type="dxa"/>
+            </w:tcMar>
+          </w:tcPr>
+          <w:p>
+            <w:r>
+              <w:rPr>
+                <w:b/>
+                <w:bCs/>
+              </w:rPr>
+              <w:t>1.0</w:t>
+            </w:r>
+          </w:p>
+        </w:tc>
+        <w:tc>
+          <w:tcPr>
+            <w:tcW w:w="3120" w:type="dxa"/>
+            <w:tcBorders>
+              <w:top w:val="single" w:sz="4" w:space="0" w:color="C9CFD6"/>
+              <w:left w:val="single" w:sz="4" w:space="0" w:color="C9CFD6"/>
+              <w:bottom w:val="single" w:sz="4" w:space="0" w:color="C9CFD6"/>
+              <w:right w:val="single" w:sz="4" w:space="0" w:color="C9CFD6"/>
+            </w:tcBorders>
+            <w:tcMar>
+              <w:top w:w="80" w:type="dxa"/>
+              <w:left w:w="120" w:type="dxa"/>
+              <w:bottom w:w="80" w:type="dxa"/>
+              <w:right w:w="120" w:type="dxa"/>
+            </w:tcMar>
+          </w:tcPr>
+          <w:p>
+            <w:r>
+              <w:t>September 28, 2026</w:t>
+            </w:r>
+          </w:p>
+        </w:tc>
+        <w:tc>
+          <w:tcPr>
+            <w:tcW w:w="3120" w:type="dxa"/>
+            <w:tcBorders>
+              <w:top w:val="single" w:sz="4" w:space="0" w:color="C9CFD6"/>
+              <w:left w:val="single" w:sz="4" w:space="0" w:color="C9CFD6"/>
+              <w:bottom w:val="single" w:sz="4" w:space="0" w:color="C9CFD6"/>
+              <w:right w:val="single" w:sz="4" w:space="0" w:color="C9CFD6"/>
+            </w:tcBorders>
+            <w:tcMar>
+              <w:top w:w="80" w:type="dxa"/>
+              <w:left w:w="120" w:type="dxa"/>
+              <w:bottom w:w="80" w:type="dxa"/>
+              <w:right w:w="120" w:type="dxa"/>
+            </w:tcMar>
+          </w:tcPr>
+          <w:p>
+            <w:r>
               <w:t>First edition.</w:t>
             </w:r>
           </w:p>
@@ -10572,7 +10847,7 @@
         <w:sz w:val="18"/>
         <w:szCs w:val="18"/>
       </w:rPr>
-      <w:t xml:space="preserve">Concept Autobody  ·  Version 1.9  ·  Page </w:t>
+      <w:t xml:space="preserve">Concept Autobody  ·  Version 2.0  ·  Page </w:t>
     </w:r>
     <w:r>
       <w:rPr>
@@ -10665,278 +10940,278 @@
 <file path=word/numbering.xml><?xml version="1.0" encoding="utf-8"?>
 <w:numbering xmlns:wpc="http://schemas.microsoft.com/office/word/2010/wordprocessingCanvas" xmlns:cx="http://schemas.microsoft.com/office/drawing/2014/chartex" xmlns:cx1="http://schemas.microsoft.com/office/drawing/2015/9/8/chartex" xmlns:cx2="http://schemas.microsoft.com/office/drawing/2015/10/21/chartex" xmlns:cx3="http://schemas.microsoft.com/office/drawing/2016/5/9/chartex" xmlns:cx4="http://schemas.microsoft.com/office/drawing/2016/5/10/chartex" xmlns:cx5="http://schemas.microsoft.com/office/drawing/2016/5/11/chartex" xmlns:cx6="http://schemas.microsoft.com/office/drawing/2016/5/12/chartex" xmlns:cx7="http://schemas.microsoft.com/office/drawing/2016/5/13/chartex" xmlns:cx8="http://schemas.microsoft.com/office/drawing/2016/5/14/chartex" xmlns:mc="http://schemas.openxmlformats.org/markup-compatibility/2006" xmlns:aink="http://schemas.microsoft.com/office/drawing/2016/ink" xmlns:am3d="http://schemas.microsoft.com/office/drawing/2017/model3d" xmlns:o="urn:schemas-microsoft-com:office:office" xmlns:oel="http://schemas.microsoft.com/office/2019/extlst" xmlns:r="http://schemas.openxmlformats.org/officeDocument/2006/relationships" xmlns:m="http://schemas.openxmlformats.org/officeDocument/2006/math" xmlns:v="urn:schemas-microsoft-com:vml" xmlns:wp14="http://schemas.microsoft.com/office/word/2010/wordprocessingDrawing" xmlns:wp="http://schemas.openxmlformats.org/drawingml/2006/wordprocessingDrawing" xmlns:w10="urn:schemas-microsoft-com:office:word" xmlns:w="http://schemas.openxmlformats.org/wordprocessingml/2006/main" xmlns:w14="http://schemas.microsoft.com/office/word/2010/wordml" xmlns:w15="http://schemas.microsoft.com/office/word/2012/wordml" xmlns:w16cex="http://schemas.microsoft.com/office/word/2018/wordml/cex" xmlns:w16cid="http://schemas.microsoft.com/office/word/2016/wordml/cid" xmlns:w16="http://schemas.microsoft.com/office/word/2018/wordml" xmlns:w16du="http://schemas.microsoft.com/office/word/2023/wordml/word16du" xmlns:w16sdtdh="http://schemas.microsoft.com/office/word/2020/wordml/sdtdatahash" xmlns:w16sdtfl="http://schemas.microsoft.com/office/word/2024/wordml/sdtformatlock" xmlns:w16se="http://schemas.microsoft.com/office/word/2015/wordml/symex" xmlns:wpg="http://schemas.microsoft.com/office/word/2010/wordprocessingGroup" xmlns:wpi="http://schemas.microsoft.com/office/word/2010/wordprocessingInk" xmlns:wne="http://schemas.microsoft.com/office/word/2006/wordml" xmlns:wps="http://schemas.microsoft.com/office/word/2010/wordprocessingShape" mc:Ignorable="w14 w15 w16se w16cid w16 w16cex w16sdtdh w16sdtfl w16du wp14">
   <w:abstractNum w:abstractNumId="0" w15:restartNumberingAfterBreak="0">
-    <w:nsid w:val="073C2646"/>
+    <w:nsid w:val="097919B6"/>
     <w:multiLevelType w:val="hybridMultilevel"/>
-    <w:tmpl w:val="E408B022"/>
-    <w:lvl w:ilvl="0" w:tplc="8DC4F968">
+    <w:tmpl w:val="1FDED014"/>
+    <w:lvl w:ilvl="0" w:tplc="4E548058">
       <w:start w:val="1"/>
-      <w:numFmt w:val="bullet"/>
-      <w:lvlText w:val="•"/>
+      <w:numFmt w:val="decimal"/>
+      <w:lvlText w:val="%1."/>
       <w:lvlJc w:val="left"/>
       <w:pPr>
-        <w:ind w:left="540" w:hanging="270"/>
-      </w:pPr>
+        <w:ind w:left="540" w:hanging="360"/>
+      </w:pPr>
+      <w:rPr>
+        <w:b/>
+        <w:bCs/>
+        <w:color w:val="E8620E"/>
+      </w:rPr>
     </w:lvl>
-    <w:lvl w:ilvl="1" w:tplc="CDF00612">
+    <w:lvl w:ilvl="1" w:tplc="38F69A0E">
       <w:numFmt w:val="decimal"/>
       <w:lvlText w:val=""/>
       <w:lvlJc w:val="left"/>
     </w:lvl>
-    <w:lvl w:ilvl="2" w:tplc="58D8E664">
+    <w:lvl w:ilvl="2" w:tplc="B49A105A">
       <w:numFmt w:val="decimal"/>
       <w:lvlText w:val=""/>
       <w:lvlJc w:val="left"/>
     </w:lvl>
-    <w:lvl w:ilvl="3" w:tplc="50E03266">
+    <w:lvl w:ilvl="3" w:tplc="BE10FE64">
       <w:numFmt w:val="decimal"/>
       <w:lvlText w:val=""/>
       <w:lvlJc w:val="left"/>
     </w:lvl>
-    <w:lvl w:ilvl="4" w:tplc="C71AB788">
+    <w:lvl w:ilvl="4" w:tplc="E272D84E">
       <w:numFmt w:val="decimal"/>
       <w:lvlText w:val=""/>
       <w:lvlJc w:val="left"/>
     </w:lvl>
-    <w:lvl w:ilvl="5" w:tplc="598AA09A">
+    <w:lvl w:ilvl="5" w:tplc="C0340354">
       <w:numFmt w:val="decimal"/>
       <w:lvlText w:val=""/>
       <w:lvlJc w:val="left"/>
     </w:lvl>
-    <w:lvl w:ilvl="6" w:tplc="C344C11E">
+    <w:lvl w:ilvl="6" w:tplc="E4CC1B90">
       <w:numFmt w:val="decimal"/>
       <w:lvlText w:val=""/>
       <w:lvlJc w:val="left"/>
     </w:lvl>
-    <w:lvl w:ilvl="7" w:tplc="2B8E4856">
+    <w:lvl w:ilvl="7" w:tplc="AC6AE3B4">
       <w:numFmt w:val="decimal"/>
       <w:lvlText w:val=""/>
       <w:lvlJc w:val="left"/>
     </w:lvl>
-    <w:lvl w:ilvl="8" w:tplc="74DECA50">
+    <w:lvl w:ilvl="8" w:tplc="29E6D06C">
       <w:numFmt w:val="decimal"/>
       <w:lvlText w:val=""/>
       <w:lvlJc w:val="left"/>
     </w:lvl>
   </w:abstractNum>
   <w:abstractNum w:abstractNumId="1" w15:restartNumberingAfterBreak="0">
-    <w:nsid w:val="52F415B7"/>
+    <w:nsid w:val="459058D3"/>
     <w:multiLevelType w:val="hybridMultilevel"/>
-    <w:tmpl w:val="AFD4D0F6"/>
-    <w:lvl w:ilvl="0" w:tplc="2E284118" w:tentative="1">
+    <w:tmpl w:val="AA6A2416"/>
+    <w:lvl w:ilvl="0" w:tplc="C7129F0C">
       <w:start w:val="1"/>
       <w:numFmt w:val="bullet"/>
-      <w:lvlText w:val="●"/>
+      <w:lvlText w:val="•"/>
       <w:lvlJc w:val="left"/>
       <w:pPr>
-        <w:ind w:left="720" w:hanging="360"/>
+        <w:ind w:left="540" w:hanging="270"/>
       </w:pPr>
     </w:lvl>
-    <w:lvl w:ilvl="1" w:tplc="9F864FB8" w:tentative="1">
-      <w:start w:val="1"/>
-      <w:numFmt w:val="bullet"/>
-      <w:lvlText w:val="○"/>
-      <w:lvlJc w:val="left"/>
-      <w:pPr>
-        <w:ind w:left="1440" w:hanging="360"/>
-      </w:pPr>
-    </w:lvl>
-    <w:lvl w:ilvl="2" w:tplc="D1AC38E6" w:tentative="1">
-      <w:start w:val="1"/>
-      <w:numFmt w:val="bullet"/>
-      <w:lvlText w:val="■"/>
-      <w:lvlJc w:val="left"/>
-      <w:pPr>
-        <w:ind w:left="2160" w:hanging="360"/>
-      </w:pPr>
-    </w:lvl>
-    <w:lvl w:ilvl="3" w:tplc="4768B024" w:tentative="1">
-      <w:start w:val="1"/>
-      <w:numFmt w:val="bullet"/>
-      <w:lvlText w:val="●"/>
-      <w:lvlJc w:val="left"/>
-      <w:pPr>
-        <w:ind w:left="2880" w:hanging="360"/>
-      </w:pPr>
-    </w:lvl>
-    <w:lvl w:ilvl="4" w:tplc="E6B2F034" w:tentative="1">
-      <w:start w:val="1"/>
-      <w:numFmt w:val="bullet"/>
-      <w:lvlText w:val="○"/>
-      <w:lvlJc w:val="left"/>
-      <w:pPr>
-        <w:ind w:left="3600" w:hanging="360"/>
-      </w:pPr>
-    </w:lvl>
-    <w:lvl w:ilvl="5" w:tplc="95A2E408" w:tentative="1">
-      <w:start w:val="1"/>
-      <w:numFmt w:val="bullet"/>
-      <w:lvlText w:val="■"/>
-      <w:lvlJc w:val="left"/>
-      <w:pPr>
-        <w:ind w:left="4320" w:hanging="360"/>
-      </w:pPr>
-    </w:lvl>
-    <w:lvl w:ilvl="6" w:tplc="9E0CC87E" w:tentative="1">
-      <w:start w:val="1"/>
-      <w:numFmt w:val="bullet"/>
-      <w:lvlText w:val="●"/>
-      <w:lvlJc w:val="left"/>
-      <w:pPr>
-        <w:ind w:left="5040" w:hanging="360"/>
-      </w:pPr>
-    </w:lvl>
-    <w:lvl w:ilvl="7" w:tplc="32345986" w:tentative="1">
-      <w:start w:val="1"/>
-      <w:numFmt w:val="bullet"/>
-      <w:lvlText w:val="●"/>
-      <w:lvlJc w:val="left"/>
-      <w:pPr>
-        <w:ind w:left="5760" w:hanging="360"/>
-      </w:pPr>
-    </w:lvl>
-    <w:lvl w:ilvl="8" w:tplc="C444E896" w:tentative="1">
-      <w:start w:val="1"/>
-      <w:numFmt w:val="bullet"/>
-      <w:lvlText w:val="●"/>
-      <w:lvlJc w:val="left"/>
-      <w:pPr>
-        <w:ind w:left="6480" w:hanging="360"/>
-      </w:pPr>
-    </w:lvl>
-  </w:abstractNum>
-  <w:abstractNum w:abstractNumId="2" w15:restartNumberingAfterBreak="0">
-    <w:nsid w:val="5822667F"/>
-    <w:multiLevelType w:val="hybridMultilevel"/>
-    <w:tmpl w:val="C01200B4"/>
-    <w:lvl w:ilvl="0" w:tplc="742650E2">
-      <w:start w:val="1"/>
-      <w:numFmt w:val="decimal"/>
-      <w:lvlText w:val="%1."/>
-      <w:lvlJc w:val="left"/>
-      <w:pPr>
-        <w:ind w:left="540" w:hanging="360"/>
-      </w:pPr>
-      <w:rPr>
-        <w:b/>
-        <w:bCs/>
-        <w:color w:val="E8620E"/>
-      </w:rPr>
-    </w:lvl>
-    <w:lvl w:ilvl="1" w:tplc="686C92BA">
+    <w:lvl w:ilvl="1" w:tplc="0CF6A102">
       <w:numFmt w:val="decimal"/>
       <w:lvlText w:val=""/>
       <w:lvlJc w:val="left"/>
     </w:lvl>
-    <w:lvl w:ilvl="2" w:tplc="97CCD866">
+    <w:lvl w:ilvl="2" w:tplc="47E21EEC">
       <w:numFmt w:val="decimal"/>
       <w:lvlText w:val=""/>
       <w:lvlJc w:val="left"/>
     </w:lvl>
-    <w:lvl w:ilvl="3" w:tplc="3B3AA34C">
+    <w:lvl w:ilvl="3" w:tplc="B91857FA">
       <w:numFmt w:val="decimal"/>
       <w:lvlText w:val=""/>
       <w:lvlJc w:val="left"/>
     </w:lvl>
-    <w:lvl w:ilvl="4" w:tplc="3C96D59A">
+    <w:lvl w:ilvl="4" w:tplc="74D80990">
       <w:numFmt w:val="decimal"/>
       <w:lvlText w:val=""/>
       <w:lvlJc w:val="left"/>
     </w:lvl>
-    <w:lvl w:ilvl="5" w:tplc="2CDE8464">
+    <w:lvl w:ilvl="5" w:tplc="27CC09E8">
       <w:numFmt w:val="decimal"/>
       <w:lvlText w:val=""/>
       <w:lvlJc w:val="left"/>
     </w:lvl>
-    <w:lvl w:ilvl="6" w:tplc="651688AA">
+    <w:lvl w:ilvl="6" w:tplc="8DB27892">
       <w:numFmt w:val="decimal"/>
       <w:lvlText w:val=""/>
       <w:lvlJc w:val="left"/>
     </w:lvl>
-    <w:lvl w:ilvl="7" w:tplc="7DEC359E">
+    <w:lvl w:ilvl="7" w:tplc="E0DAB5FE">
       <w:numFmt w:val="decimal"/>
       <w:lvlText w:val=""/>
       <w:lvlJc w:val="left"/>
     </w:lvl>
-    <w:lvl w:ilvl="8" w:tplc="6276B384">
+    <w:lvl w:ilvl="8" w:tplc="3F564BE4">
       <w:numFmt w:val="decimal"/>
       <w:lvlText w:val=""/>
       <w:lvlJc w:val="left"/>
     </w:lvl>
   </w:abstractNum>
-  <w:num w:numId="1" w16cid:durableId="1526098783">
+  <w:abstractNum w:abstractNumId="2" w15:restartNumberingAfterBreak="0">
+    <w:nsid w:val="6CCE7A5E"/>
+    <w:multiLevelType w:val="hybridMultilevel"/>
+    <w:tmpl w:val="06646A70"/>
+    <w:lvl w:ilvl="0" w:tplc="B6882134" w:tentative="1">
+      <w:start w:val="1"/>
+      <w:numFmt w:val="bullet"/>
+      <w:lvlText w:val="●"/>
+      <w:lvlJc w:val="left"/>
+      <w:pPr>
+        <w:ind w:left="720" w:hanging="360"/>
+      </w:pPr>
+    </w:lvl>
+    <w:lvl w:ilvl="1" w:tplc="3A148406" w:tentative="1">
+      <w:start w:val="1"/>
+      <w:numFmt w:val="bullet"/>
+      <w:lvlText w:val="○"/>
+      <w:lvlJc w:val="left"/>
+      <w:pPr>
+        <w:ind w:left="1440" w:hanging="360"/>
+      </w:pPr>
+    </w:lvl>
+    <w:lvl w:ilvl="2" w:tplc="66125130" w:tentative="1">
+      <w:start w:val="1"/>
+      <w:numFmt w:val="bullet"/>
+      <w:lvlText w:val="■"/>
+      <w:lvlJc w:val="left"/>
+      <w:pPr>
+        <w:ind w:left="2160" w:hanging="360"/>
+      </w:pPr>
+    </w:lvl>
+    <w:lvl w:ilvl="3" w:tplc="080CEDCA" w:tentative="1">
+      <w:start w:val="1"/>
+      <w:numFmt w:val="bullet"/>
+      <w:lvlText w:val="●"/>
+      <w:lvlJc w:val="left"/>
+      <w:pPr>
+        <w:ind w:left="2880" w:hanging="360"/>
+      </w:pPr>
+    </w:lvl>
+    <w:lvl w:ilvl="4" w:tplc="E5185814" w:tentative="1">
+      <w:start w:val="1"/>
+      <w:numFmt w:val="bullet"/>
+      <w:lvlText w:val="○"/>
+      <w:lvlJc w:val="left"/>
+      <w:pPr>
+        <w:ind w:left="3600" w:hanging="360"/>
+      </w:pPr>
+    </w:lvl>
+    <w:lvl w:ilvl="5" w:tplc="582C2C34" w:tentative="1">
+      <w:start w:val="1"/>
+      <w:numFmt w:val="bullet"/>
+      <w:lvlText w:val="■"/>
+      <w:lvlJc w:val="left"/>
+      <w:pPr>
+        <w:ind w:left="4320" w:hanging="360"/>
+      </w:pPr>
+    </w:lvl>
+    <w:lvl w:ilvl="6" w:tplc="16DEBF66" w:tentative="1">
+      <w:start w:val="1"/>
+      <w:numFmt w:val="bullet"/>
+      <w:lvlText w:val="●"/>
+      <w:lvlJc w:val="left"/>
+      <w:pPr>
+        <w:ind w:left="5040" w:hanging="360"/>
+      </w:pPr>
+    </w:lvl>
+    <w:lvl w:ilvl="7" w:tplc="30F2269A" w:tentative="1">
+      <w:start w:val="1"/>
+      <w:numFmt w:val="bullet"/>
+      <w:lvlText w:val="●"/>
+      <w:lvlJc w:val="left"/>
+      <w:pPr>
+        <w:ind w:left="5760" w:hanging="360"/>
+      </w:pPr>
+    </w:lvl>
+    <w:lvl w:ilvl="8" w:tplc="5844A7A4" w:tentative="1">
+      <w:start w:val="1"/>
+      <w:numFmt w:val="bullet"/>
+      <w:lvlText w:val="●"/>
+      <w:lvlJc w:val="left"/>
+      <w:pPr>
+        <w:ind w:left="6480" w:hanging="360"/>
+      </w:pPr>
+    </w:lvl>
+  </w:abstractNum>
+  <w:num w:numId="1" w16cid:durableId="238566942">
+    <w:abstractNumId w:val="2"/>
+    <w:lvlOverride w:ilvl="0">
+      <w:startOverride w:val="1"/>
+    </w:lvlOverride>
+  </w:num>
+  <w:num w:numId="2" w16cid:durableId="1774934163">
     <w:abstractNumId w:val="1"/>
     <w:lvlOverride w:ilvl="0">
       <w:startOverride w:val="1"/>
     </w:lvlOverride>
   </w:num>
-  <w:num w:numId="2" w16cid:durableId="435053229">
+  <w:num w:numId="3" w16cid:durableId="764158105">
     <w:abstractNumId w:val="0"/>
     <w:lvlOverride w:ilvl="0">
       <w:startOverride w:val="1"/>
     </w:lvlOverride>
   </w:num>
-  <w:num w:numId="3" w16cid:durableId="2088381983">
-    <w:abstractNumId w:val="2"/>
+  <w:num w:numId="4" w16cid:durableId="814644756">
+    <w:abstractNumId w:val="0"/>
     <w:lvlOverride w:ilvl="0">
       <w:startOverride w:val="1"/>
     </w:lvlOverride>
   </w:num>
-  <w:num w:numId="4" w16cid:durableId="914516550">
-    <w:abstractNumId w:val="2"/>
+  <w:num w:numId="5" w16cid:durableId="722875417">
+    <w:abstractNumId w:val="0"/>
     <w:lvlOverride w:ilvl="0">
       <w:startOverride w:val="1"/>
     </w:lvlOverride>
   </w:num>
-  <w:num w:numId="5" w16cid:durableId="1346400830">
-    <w:abstractNumId w:val="2"/>
+  <w:num w:numId="6" w16cid:durableId="668871021">
+    <w:abstractNumId w:val="0"/>
     <w:lvlOverride w:ilvl="0">
       <w:startOverride w:val="1"/>
     </w:lvlOverride>
   </w:num>
-  <w:num w:numId="6" w16cid:durableId="715465893">
-    <w:abstractNumId w:val="2"/>
+  <w:num w:numId="7" w16cid:durableId="1645623227">
+    <w:abstractNumId w:val="0"/>
     <w:lvlOverride w:ilvl="0">
       <w:startOverride w:val="1"/>
     </w:lvlOverride>
   </w:num>
-  <w:num w:numId="7" w16cid:durableId="546526641">
-    <w:abstractNumId w:val="2"/>
+  <w:num w:numId="8" w16cid:durableId="1688872946">
+    <w:abstractNumId w:val="0"/>
     <w:lvlOverride w:ilvl="0">
       <w:startOverride w:val="1"/>
     </w:lvlOverride>
   </w:num>
-  <w:num w:numId="8" w16cid:durableId="228078913">
-    <w:abstractNumId w:val="2"/>
+  <w:num w:numId="9" w16cid:durableId="820079038">
+    <w:abstractNumId w:val="0"/>
     <w:lvlOverride w:ilvl="0">
       <w:startOverride w:val="1"/>
     </w:lvlOverride>
   </w:num>
-  <w:num w:numId="9" w16cid:durableId="1093088787">
-    <w:abstractNumId w:val="2"/>
+  <w:num w:numId="10" w16cid:durableId="1983071553">
+    <w:abstractNumId w:val="0"/>
     <w:lvlOverride w:ilvl="0">
       <w:startOverride w:val="1"/>
     </w:lvlOverride>
   </w:num>
-  <w:num w:numId="10" w16cid:durableId="1719890075">
-    <w:abstractNumId w:val="2"/>
+  <w:num w:numId="11" w16cid:durableId="566380236">
+    <w:abstractNumId w:val="0"/>
     <w:lvlOverride w:ilvl="0">
       <w:startOverride w:val="1"/>
     </w:lvlOverride>
   </w:num>
-  <w:num w:numId="11" w16cid:durableId="1509059329">
-    <w:abstractNumId w:val="2"/>
+  <w:num w:numId="12" w16cid:durableId="1904027427">
+    <w:abstractNumId w:val="0"/>
     <w:lvlOverride w:ilvl="0">
       <w:startOverride w:val="1"/>
     </w:lvlOverride>
   </w:num>
-  <w:num w:numId="12" w16cid:durableId="1266422376">
-    <w:abstractNumId w:val="2"/>
-    <w:lvlOverride w:ilvl="0">
-      <w:startOverride w:val="1"/>
-    </w:lvlOverride>
-  </w:num>
-  <w:num w:numId="13" w16cid:durableId="1987666681">
-    <w:abstractNumId w:val="2"/>
+  <w:num w:numId="13" w16cid:durableId="871110368">
+    <w:abstractNumId w:val="0"/>
     <w:lvlOverride w:ilvl="0">
       <w:startOverride w:val="1"/>
     </w:lvlOverride>
@@ -11588,7 +11863,7 @@
     <w:autoRedefine/>
     <w:uiPriority w:val="39"/>
     <w:unhideWhenUsed/>
-    <w:rsid w:val="00190394"/>
+    <w:rsid w:val="003D0965"/>
     <w:pPr>
       <w:spacing w:after="100"/>
     </w:pPr>
@@ -11600,7 +11875,7 @@
     <w:autoRedefine/>
     <w:uiPriority w:val="39"/>
     <w:unhideWhenUsed/>
-    <w:rsid w:val="00190394"/>
+    <w:rsid w:val="003D0965"/>
     <w:pPr>
       <w:spacing w:after="100"/>
       <w:ind w:left="220"/>

</xml_diff>

<commit_message>
Shop touch board: techs tap a car, the stage and their name to move it; shopboard role can only move stages; manual v2.1
Co-Authored-By: Claude Opus 5.5 <noreply@anthropic.com>
</commit_message>
<xml_diff>
--- a/client/manual/ShopControl-User-Manual.docx
+++ b/client/manual/ShopControl-User-Manual.docx
@@ -16,7 +16,7 @@
           <w:noProof/>
         </w:rPr>
         <w:drawing>
-          <wp:inline distT="0" distB="0" distL="0" distR="0" wp14:anchorId="59A3690B" wp14:editId="59A3690C">
+          <wp:inline distT="0" distB="0" distL="0" distR="0" wp14:anchorId="696B6FF5" wp14:editId="696B6FF6">
             <wp:extent cx="4000500" cy="1485900"/>
             <wp:effectExtent l="0" t="0" r="0" b="0"/>
             <wp:docPr id="1" name="Picture 1"/>
@@ -93,7 +93,7 @@
         <w:rPr>
           <w:color w:val="5B6776"/>
         </w:rPr>
-        <w:t>Version 2.0  ·  Updated September 28, 2026</w:t>
+        <w:t>Version 2.1  ·  Updated September 28, 2026</w:t>
       </w:r>
     </w:p>
     <w:p>
@@ -122,7 +122,7 @@
     <w:sdt>
       <w:sdtPr>
         <w:alias w:val="Contents"/>
-        <w:id w:val="199446628"/>
+        <w:id w:val="-43140319"/>
       </w:sdtPr>
       <w:sdtEndPr/>
       <w:sdtContent>
@@ -151,7 +151,7 @@
           <w:r>
             <w:fldChar w:fldCharType="separate"/>
           </w:r>
-          <w:hyperlink w:anchor="_Toc241660837" w:history="1">
+          <w:hyperlink w:anchor="_Toc241663414" w:history="1">
             <w:r>
               <w:rPr>
                 <w:rStyle w:val="Hyperlink"/>
@@ -175,7 +175,7 @@
               <w:rPr>
                 <w:noProof/>
               </w:rPr>
-              <w:instrText xml:space="preserve"> PAGEREF _Toc241660837 \h </w:instrText>
+              <w:instrText xml:space="preserve"> PAGEREF _Toc241663414 \h </w:instrText>
             </w:r>
             <w:r>
               <w:rPr>
@@ -218,7 +218,7 @@
               <w14:ligatures w14:val="standardContextual"/>
             </w:rPr>
           </w:pPr>
-          <w:hyperlink w:anchor="_Toc241660838" w:history="1">
+          <w:hyperlink w:anchor="_Toc241663415" w:history="1">
             <w:r>
               <w:rPr>
                 <w:rStyle w:val="Hyperlink"/>
@@ -242,7 +242,7 @@
               <w:rPr>
                 <w:noProof/>
               </w:rPr>
-              <w:instrText xml:space="preserve"> PAGEREF _Toc241660838 \h </w:instrText>
+              <w:instrText xml:space="preserve"> PAGEREF _Toc241663415 \h </w:instrText>
             </w:r>
             <w:r>
               <w:rPr>
@@ -285,7 +285,7 @@
               <w14:ligatures w14:val="standardContextual"/>
             </w:rPr>
           </w:pPr>
-          <w:hyperlink w:anchor="_Toc241660839" w:history="1">
+          <w:hyperlink w:anchor="_Toc241663416" w:history="1">
             <w:r>
               <w:rPr>
                 <w:rStyle w:val="Hyperlink"/>
@@ -309,7 +309,7 @@
               <w:rPr>
                 <w:noProof/>
               </w:rPr>
-              <w:instrText xml:space="preserve"> PAGEREF _Toc241660839 \h </w:instrText>
+              <w:instrText xml:space="preserve"> PAGEREF _Toc241663416 \h </w:instrText>
             </w:r>
             <w:r>
               <w:rPr>
@@ -352,7 +352,7 @@
               <w14:ligatures w14:val="standardContextual"/>
             </w:rPr>
           </w:pPr>
-          <w:hyperlink w:anchor="_Toc241660840" w:history="1">
+          <w:hyperlink w:anchor="_Toc241663417" w:history="1">
             <w:r>
               <w:rPr>
                 <w:rStyle w:val="Hyperlink"/>
@@ -376,7 +376,7 @@
               <w:rPr>
                 <w:noProof/>
               </w:rPr>
-              <w:instrText xml:space="preserve"> PAGEREF _Toc241660840 \h </w:instrText>
+              <w:instrText xml:space="preserve"> PAGEREF _Toc241663417 \h </w:instrText>
             </w:r>
             <w:r>
               <w:rPr>
@@ -419,7 +419,7 @@
               <w14:ligatures w14:val="standardContextual"/>
             </w:rPr>
           </w:pPr>
-          <w:hyperlink w:anchor="_Toc241660841" w:history="1">
+          <w:hyperlink w:anchor="_Toc241663418" w:history="1">
             <w:r>
               <w:rPr>
                 <w:rStyle w:val="Hyperlink"/>
@@ -443,7 +443,7 @@
               <w:rPr>
                 <w:noProof/>
               </w:rPr>
-              <w:instrText xml:space="preserve"> PAGEREF _Toc241660841 \h </w:instrText>
+              <w:instrText xml:space="preserve"> PAGEREF _Toc241663418 \h </w:instrText>
             </w:r>
             <w:r>
               <w:rPr>
@@ -486,7 +486,7 @@
               <w14:ligatures w14:val="standardContextual"/>
             </w:rPr>
           </w:pPr>
-          <w:hyperlink w:anchor="_Toc241660842" w:history="1">
+          <w:hyperlink w:anchor="_Toc241663419" w:history="1">
             <w:r>
               <w:rPr>
                 <w:rStyle w:val="Hyperlink"/>
@@ -510,7 +510,7 @@
               <w:rPr>
                 <w:noProof/>
               </w:rPr>
-              <w:instrText xml:space="preserve"> PAGEREF _Toc241660842 \h </w:instrText>
+              <w:instrText xml:space="preserve"> PAGEREF _Toc241663419 \h </w:instrText>
             </w:r>
             <w:r>
               <w:rPr>
@@ -553,7 +553,7 @@
               <w14:ligatures w14:val="standardContextual"/>
             </w:rPr>
           </w:pPr>
-          <w:hyperlink w:anchor="_Toc241660843" w:history="1">
+          <w:hyperlink w:anchor="_Toc241663420" w:history="1">
             <w:r>
               <w:rPr>
                 <w:rStyle w:val="Hyperlink"/>
@@ -577,7 +577,7 @@
               <w:rPr>
                 <w:noProof/>
               </w:rPr>
-              <w:instrText xml:space="preserve"> PAGEREF _Toc241660843 \h </w:instrText>
+              <w:instrText xml:space="preserve"> PAGEREF _Toc241663420 \h </w:instrText>
             </w:r>
             <w:r>
               <w:rPr>
@@ -620,7 +620,7 @@
               <w14:ligatures w14:val="standardContextual"/>
             </w:rPr>
           </w:pPr>
-          <w:hyperlink w:anchor="_Toc241660844" w:history="1">
+          <w:hyperlink w:anchor="_Toc241663421" w:history="1">
             <w:r>
               <w:rPr>
                 <w:rStyle w:val="Hyperlink"/>
@@ -644,7 +644,7 @@
               <w:rPr>
                 <w:noProof/>
               </w:rPr>
-              <w:instrText xml:space="preserve"> PAGEREF _Toc241660844 \h </w:instrText>
+              <w:instrText xml:space="preserve"> PAGEREF _Toc241663421 \h </w:instrText>
             </w:r>
             <w:r>
               <w:rPr>
@@ -687,7 +687,7 @@
               <w14:ligatures w14:val="standardContextual"/>
             </w:rPr>
           </w:pPr>
-          <w:hyperlink w:anchor="_Toc241660845" w:history="1">
+          <w:hyperlink w:anchor="_Toc241663422" w:history="1">
             <w:r>
               <w:rPr>
                 <w:rStyle w:val="Hyperlink"/>
@@ -711,7 +711,7 @@
               <w:rPr>
                 <w:noProof/>
               </w:rPr>
-              <w:instrText xml:space="preserve"> PAGEREF _Toc241660845 \h </w:instrText>
+              <w:instrText xml:space="preserve"> PAGEREF _Toc241663422 \h </w:instrText>
             </w:r>
             <w:r>
               <w:rPr>
@@ -754,7 +754,7 @@
               <w14:ligatures w14:val="standardContextual"/>
             </w:rPr>
           </w:pPr>
-          <w:hyperlink w:anchor="_Toc241660846" w:history="1">
+          <w:hyperlink w:anchor="_Toc241663423" w:history="1">
             <w:r>
               <w:rPr>
                 <w:rStyle w:val="Hyperlink"/>
@@ -778,7 +778,7 @@
               <w:rPr>
                 <w:noProof/>
               </w:rPr>
-              <w:instrText xml:space="preserve"> PAGEREF _Toc241660846 \h </w:instrText>
+              <w:instrText xml:space="preserve"> PAGEREF _Toc241663423 \h </w:instrText>
             </w:r>
             <w:r>
               <w:rPr>
@@ -821,7 +821,7 @@
               <w14:ligatures w14:val="standardContextual"/>
             </w:rPr>
           </w:pPr>
-          <w:hyperlink w:anchor="_Toc241660847" w:history="1">
+          <w:hyperlink w:anchor="_Toc241663424" w:history="1">
             <w:r>
               <w:rPr>
                 <w:rStyle w:val="Hyperlink"/>
@@ -845,7 +845,7 @@
               <w:rPr>
                 <w:noProof/>
               </w:rPr>
-              <w:instrText xml:space="preserve"> PAGEREF _Toc241660847 \h </w:instrText>
+              <w:instrText xml:space="preserve"> PAGEREF _Toc241663424 \h </w:instrText>
             </w:r>
             <w:r>
               <w:rPr>
@@ -888,7 +888,7 @@
               <w14:ligatures w14:val="standardContextual"/>
             </w:rPr>
           </w:pPr>
-          <w:hyperlink w:anchor="_Toc241660848" w:history="1">
+          <w:hyperlink w:anchor="_Toc241663425" w:history="1">
             <w:r>
               <w:rPr>
                 <w:rStyle w:val="Hyperlink"/>
@@ -912,7 +912,7 @@
               <w:rPr>
                 <w:noProof/>
               </w:rPr>
-              <w:instrText xml:space="preserve"> PAGEREF _Toc241660848 \h </w:instrText>
+              <w:instrText xml:space="preserve"> PAGEREF _Toc241663425 \h </w:instrText>
             </w:r>
             <w:r>
               <w:rPr>
@@ -955,7 +955,7 @@
               <w14:ligatures w14:val="standardContextual"/>
             </w:rPr>
           </w:pPr>
-          <w:hyperlink w:anchor="_Toc241660849" w:history="1">
+          <w:hyperlink w:anchor="_Toc241663426" w:history="1">
             <w:r>
               <w:rPr>
                 <w:rStyle w:val="Hyperlink"/>
@@ -979,7 +979,7 @@
               <w:rPr>
                 <w:noProof/>
               </w:rPr>
-              <w:instrText xml:space="preserve"> PAGEREF _Toc241660849 \h </w:instrText>
+              <w:instrText xml:space="preserve"> PAGEREF _Toc241663426 \h </w:instrText>
             </w:r>
             <w:r>
               <w:rPr>
@@ -1022,7 +1022,7 @@
               <w14:ligatures w14:val="standardContextual"/>
             </w:rPr>
           </w:pPr>
-          <w:hyperlink w:anchor="_Toc241660850" w:history="1">
+          <w:hyperlink w:anchor="_Toc241663427" w:history="1">
             <w:r>
               <w:rPr>
                 <w:rStyle w:val="Hyperlink"/>
@@ -1046,7 +1046,7 @@
               <w:rPr>
                 <w:noProof/>
               </w:rPr>
-              <w:instrText xml:space="preserve"> PAGEREF _Toc241660850 \h </w:instrText>
+              <w:instrText xml:space="preserve"> PAGEREF _Toc241663427 \h </w:instrText>
             </w:r>
             <w:r>
               <w:rPr>
@@ -1089,7 +1089,7 @@
               <w14:ligatures w14:val="standardContextual"/>
             </w:rPr>
           </w:pPr>
-          <w:hyperlink w:anchor="_Toc241660851" w:history="1">
+          <w:hyperlink w:anchor="_Toc241663428" w:history="1">
             <w:r>
               <w:rPr>
                 <w:rStyle w:val="Hyperlink"/>
@@ -1113,7 +1113,7 @@
               <w:rPr>
                 <w:noProof/>
               </w:rPr>
-              <w:instrText xml:space="preserve"> PAGEREF _Toc241660851 \h </w:instrText>
+              <w:instrText xml:space="preserve"> PAGEREF _Toc241663428 \h </w:instrText>
             </w:r>
             <w:r>
               <w:rPr>
@@ -1156,7 +1156,7 @@
               <w14:ligatures w14:val="standardContextual"/>
             </w:rPr>
           </w:pPr>
-          <w:hyperlink w:anchor="_Toc241660852" w:history="1">
+          <w:hyperlink w:anchor="_Toc241663429" w:history="1">
             <w:r>
               <w:rPr>
                 <w:rStyle w:val="Hyperlink"/>
@@ -1180,7 +1180,7 @@
               <w:rPr>
                 <w:noProof/>
               </w:rPr>
-              <w:instrText xml:space="preserve"> PAGEREF _Toc241660852 \h </w:instrText>
+              <w:instrText xml:space="preserve"> PAGEREF _Toc241663429 \h </w:instrText>
             </w:r>
             <w:r>
               <w:rPr>
@@ -1223,7 +1223,7 @@
               <w14:ligatures w14:val="standardContextual"/>
             </w:rPr>
           </w:pPr>
-          <w:hyperlink w:anchor="_Toc241660853" w:history="1">
+          <w:hyperlink w:anchor="_Toc241663430" w:history="1">
             <w:r>
               <w:rPr>
                 <w:rStyle w:val="Hyperlink"/>
@@ -1247,7 +1247,7 @@
               <w:rPr>
                 <w:noProof/>
               </w:rPr>
-              <w:instrText xml:space="preserve"> PAGEREF _Toc241660853 \h </w:instrText>
+              <w:instrText xml:space="preserve"> PAGEREF _Toc241663430 \h </w:instrText>
             </w:r>
             <w:r>
               <w:rPr>
@@ -1290,7 +1290,7 @@
               <w14:ligatures w14:val="standardContextual"/>
             </w:rPr>
           </w:pPr>
-          <w:hyperlink w:anchor="_Toc241660854" w:history="1">
+          <w:hyperlink w:anchor="_Toc241663431" w:history="1">
             <w:r>
               <w:rPr>
                 <w:rStyle w:val="Hyperlink"/>
@@ -1314,7 +1314,7 @@
               <w:rPr>
                 <w:noProof/>
               </w:rPr>
-              <w:instrText xml:space="preserve"> PAGEREF _Toc241660854 \h </w:instrText>
+              <w:instrText xml:space="preserve"> PAGEREF _Toc241663431 \h </w:instrText>
             </w:r>
             <w:r>
               <w:rPr>
@@ -1357,7 +1357,7 @@
               <w14:ligatures w14:val="standardContextual"/>
             </w:rPr>
           </w:pPr>
-          <w:hyperlink w:anchor="_Toc241660855" w:history="1">
+          <w:hyperlink w:anchor="_Toc241663432" w:history="1">
             <w:r>
               <w:rPr>
                 <w:rStyle w:val="Hyperlink"/>
@@ -1381,7 +1381,7 @@
               <w:rPr>
                 <w:noProof/>
               </w:rPr>
-              <w:instrText xml:space="preserve"> PAGEREF _Toc241660855 \h </w:instrText>
+              <w:instrText xml:space="preserve"> PAGEREF _Toc241663432 \h </w:instrText>
             </w:r>
             <w:r>
               <w:rPr>
@@ -1424,7 +1424,7 @@
               <w14:ligatures w14:val="standardContextual"/>
             </w:rPr>
           </w:pPr>
-          <w:hyperlink w:anchor="_Toc241660856" w:history="1">
+          <w:hyperlink w:anchor="_Toc241663433" w:history="1">
             <w:r>
               <w:rPr>
                 <w:rStyle w:val="Hyperlink"/>
@@ -1448,7 +1448,7 @@
               <w:rPr>
                 <w:noProof/>
               </w:rPr>
-              <w:instrText xml:space="preserve"> PAGEREF _Toc241660856 \h </w:instrText>
+              <w:instrText xml:space="preserve"> PAGEREF _Toc241663433 \h </w:instrText>
             </w:r>
             <w:r>
               <w:rPr>
@@ -1491,7 +1491,7 @@
               <w14:ligatures w14:val="standardContextual"/>
             </w:rPr>
           </w:pPr>
-          <w:hyperlink w:anchor="_Toc241660857" w:history="1">
+          <w:hyperlink w:anchor="_Toc241663434" w:history="1">
             <w:r>
               <w:rPr>
                 <w:rStyle w:val="Hyperlink"/>
@@ -1515,7 +1515,7 @@
               <w:rPr>
                 <w:noProof/>
               </w:rPr>
-              <w:instrText xml:space="preserve"> PAGEREF _Toc241660857 \h </w:instrText>
+              <w:instrText xml:space="preserve"> PAGEREF _Toc241663434 \h </w:instrText>
             </w:r>
             <w:r>
               <w:rPr>
@@ -1558,7 +1558,7 @@
               <w14:ligatures w14:val="standardContextual"/>
             </w:rPr>
           </w:pPr>
-          <w:hyperlink w:anchor="_Toc241660858" w:history="1">
+          <w:hyperlink w:anchor="_Toc241663435" w:history="1">
             <w:r>
               <w:rPr>
                 <w:rStyle w:val="Hyperlink"/>
@@ -1582,7 +1582,7 @@
               <w:rPr>
                 <w:noProof/>
               </w:rPr>
-              <w:instrText xml:space="preserve"> PAGEREF _Toc241660858 \h </w:instrText>
+              <w:instrText xml:space="preserve"> PAGEREF _Toc241663435 \h </w:instrText>
             </w:r>
             <w:r>
               <w:rPr>
@@ -1625,7 +1625,7 @@
               <w14:ligatures w14:val="standardContextual"/>
             </w:rPr>
           </w:pPr>
-          <w:hyperlink w:anchor="_Toc241660859" w:history="1">
+          <w:hyperlink w:anchor="_Toc241663436" w:history="1">
             <w:r>
               <w:rPr>
                 <w:rStyle w:val="Hyperlink"/>
@@ -1649,7 +1649,7 @@
               <w:rPr>
                 <w:noProof/>
               </w:rPr>
-              <w:instrText xml:space="preserve"> PAGEREF _Toc241660859 \h </w:instrText>
+              <w:instrText xml:space="preserve"> PAGEREF _Toc241663436 \h </w:instrText>
             </w:r>
             <w:r>
               <w:rPr>
@@ -1692,7 +1692,7 @@
               <w14:ligatures w14:val="standardContextual"/>
             </w:rPr>
           </w:pPr>
-          <w:hyperlink w:anchor="_Toc241660860" w:history="1">
+          <w:hyperlink w:anchor="_Toc241663437" w:history="1">
             <w:r>
               <w:rPr>
                 <w:rStyle w:val="Hyperlink"/>
@@ -1716,7 +1716,7 @@
               <w:rPr>
                 <w:noProof/>
               </w:rPr>
-              <w:instrText xml:space="preserve"> PAGEREF _Toc241660860 \h </w:instrText>
+              <w:instrText xml:space="preserve"> PAGEREF _Toc241663437 \h </w:instrText>
             </w:r>
             <w:r>
               <w:rPr>
@@ -1759,7 +1759,7 @@
               <w14:ligatures w14:val="standardContextual"/>
             </w:rPr>
           </w:pPr>
-          <w:hyperlink w:anchor="_Toc241660861" w:history="1">
+          <w:hyperlink w:anchor="_Toc241663438" w:history="1">
             <w:r>
               <w:rPr>
                 <w:rStyle w:val="Hyperlink"/>
@@ -1783,7 +1783,7 @@
               <w:rPr>
                 <w:noProof/>
               </w:rPr>
-              <w:instrText xml:space="preserve"> PAGEREF _Toc241660861 \h </w:instrText>
+              <w:instrText xml:space="preserve"> PAGEREF _Toc241663438 \h </w:instrText>
             </w:r>
             <w:r>
               <w:rPr>
@@ -1826,7 +1826,7 @@
               <w14:ligatures w14:val="standardContextual"/>
             </w:rPr>
           </w:pPr>
-          <w:hyperlink w:anchor="_Toc241660862" w:history="1">
+          <w:hyperlink w:anchor="_Toc241663439" w:history="1">
             <w:r>
               <w:rPr>
                 <w:rStyle w:val="Hyperlink"/>
@@ -1850,7 +1850,7 @@
               <w:rPr>
                 <w:noProof/>
               </w:rPr>
-              <w:instrText xml:space="preserve"> PAGEREF _Toc241660862 \h </w:instrText>
+              <w:instrText xml:space="preserve"> PAGEREF _Toc241663439 \h </w:instrText>
             </w:r>
             <w:r>
               <w:rPr>
@@ -1893,7 +1893,7 @@
               <w14:ligatures w14:val="standardContextual"/>
             </w:rPr>
           </w:pPr>
-          <w:hyperlink w:anchor="_Toc241660863" w:history="1">
+          <w:hyperlink w:anchor="_Toc241663440" w:history="1">
             <w:r>
               <w:rPr>
                 <w:rStyle w:val="Hyperlink"/>
@@ -1917,7 +1917,7 @@
               <w:rPr>
                 <w:noProof/>
               </w:rPr>
-              <w:instrText xml:space="preserve"> PAGEREF _Toc241660863 \h </w:instrText>
+              <w:instrText xml:space="preserve"> PAGEREF _Toc241663440 \h </w:instrText>
             </w:r>
             <w:r>
               <w:rPr>
@@ -1960,7 +1960,7 @@
               <w14:ligatures w14:val="standardContextual"/>
             </w:rPr>
           </w:pPr>
-          <w:hyperlink w:anchor="_Toc241660864" w:history="1">
+          <w:hyperlink w:anchor="_Toc241663441" w:history="1">
             <w:r>
               <w:rPr>
                 <w:rStyle w:val="Hyperlink"/>
@@ -1984,7 +1984,7 @@
               <w:rPr>
                 <w:noProof/>
               </w:rPr>
-              <w:instrText xml:space="preserve"> PAGEREF _Toc241660864 \h </w:instrText>
+              <w:instrText xml:space="preserve"> PAGEREF _Toc241663441 \h </w:instrText>
             </w:r>
             <w:r>
               <w:rPr>
@@ -2027,7 +2027,7 @@
               <w14:ligatures w14:val="standardContextual"/>
             </w:rPr>
           </w:pPr>
-          <w:hyperlink w:anchor="_Toc241660865" w:history="1">
+          <w:hyperlink w:anchor="_Toc241663442" w:history="1">
             <w:r>
               <w:rPr>
                 <w:rStyle w:val="Hyperlink"/>
@@ -2051,7 +2051,7 @@
               <w:rPr>
                 <w:noProof/>
               </w:rPr>
-              <w:instrText xml:space="preserve"> PAGEREF _Toc241660865 \h </w:instrText>
+              <w:instrText xml:space="preserve"> PAGEREF _Toc241663442 \h </w:instrText>
             </w:r>
             <w:r>
               <w:rPr>
@@ -2094,7 +2094,7 @@
               <w14:ligatures w14:val="standardContextual"/>
             </w:rPr>
           </w:pPr>
-          <w:hyperlink w:anchor="_Toc241660866" w:history="1">
+          <w:hyperlink w:anchor="_Toc241663443" w:history="1">
             <w:r>
               <w:rPr>
                 <w:rStyle w:val="Hyperlink"/>
@@ -2118,7 +2118,7 @@
               <w:rPr>
                 <w:noProof/>
               </w:rPr>
-              <w:instrText xml:space="preserve"> PAGEREF _Toc241660866 \h </w:instrText>
+              <w:instrText xml:space="preserve"> PAGEREF _Toc241663443 \h </w:instrText>
             </w:r>
             <w:r>
               <w:rPr>
@@ -2136,6 +2136,140 @@
                 <w:noProof/>
               </w:rPr>
               <w:t>12</w:t>
+            </w:r>
+            <w:r>
+              <w:rPr>
+                <w:noProof/>
+              </w:rPr>
+              <w:fldChar w:fldCharType="end"/>
+            </w:r>
+          </w:hyperlink>
+        </w:p>
+        <w:p>
+          <w:pPr>
+            <w:pStyle w:val="TOC2"/>
+            <w:tabs>
+              <w:tab w:val="right" w:leader="dot" w:pos="9350"/>
+            </w:tabs>
+            <w:rPr>
+              <w:rFonts w:asciiTheme="minorHAnsi" w:eastAsiaTheme="minorEastAsia" w:hAnsiTheme="minorHAnsi" w:cstheme="minorBidi"/>
+              <w:noProof/>
+              <w:color w:val="auto"/>
+              <w:kern w:val="2"/>
+              <w:sz w:val="24"/>
+              <w:szCs w:val="24"/>
+              <w14:ligatures w14:val="standardContextual"/>
+            </w:rPr>
+          </w:pPr>
+          <w:hyperlink w:anchor="_Toc241663444" w:history="1">
+            <w:r>
+              <w:rPr>
+                <w:rStyle w:val="Hyperlink"/>
+                <w:noProof/>
+              </w:rPr>
+              <w:t>Shop touch board</w:t>
+            </w:r>
+            <w:r>
+              <w:rPr>
+                <w:noProof/>
+              </w:rPr>
+              <w:tab/>
+            </w:r>
+            <w:r>
+              <w:rPr>
+                <w:noProof/>
+              </w:rPr>
+              <w:fldChar w:fldCharType="begin"/>
+            </w:r>
+            <w:r>
+              <w:rPr>
+                <w:noProof/>
+              </w:rPr>
+              <w:instrText xml:space="preserve"> PAGEREF _Toc241663444 \h </w:instrText>
+            </w:r>
+            <w:r>
+              <w:rPr>
+                <w:noProof/>
+              </w:rPr>
+            </w:r>
+            <w:r>
+              <w:rPr>
+                <w:noProof/>
+              </w:rPr>
+              <w:fldChar w:fldCharType="separate"/>
+            </w:r>
+            <w:r>
+              <w:rPr>
+                <w:noProof/>
+              </w:rPr>
+              <w:t>12</w:t>
+            </w:r>
+            <w:r>
+              <w:rPr>
+                <w:noProof/>
+              </w:rPr>
+              <w:fldChar w:fldCharType="end"/>
+            </w:r>
+          </w:hyperlink>
+        </w:p>
+        <w:p>
+          <w:pPr>
+            <w:pStyle w:val="TOC2"/>
+            <w:tabs>
+              <w:tab w:val="right" w:leader="dot" w:pos="9350"/>
+            </w:tabs>
+            <w:rPr>
+              <w:rFonts w:asciiTheme="minorHAnsi" w:eastAsiaTheme="minorEastAsia" w:hAnsiTheme="minorHAnsi" w:cstheme="minorBidi"/>
+              <w:noProof/>
+              <w:color w:val="auto"/>
+              <w:kern w:val="2"/>
+              <w:sz w:val="24"/>
+              <w:szCs w:val="24"/>
+              <w14:ligatures w14:val="standardContextual"/>
+            </w:rPr>
+          </w:pPr>
+          <w:hyperlink w:anchor="_Toc241663445" w:history="1">
+            <w:r>
+              <w:rPr>
+                <w:rStyle w:val="Hyperlink"/>
+                <w:noProof/>
+              </w:rPr>
+              <w:t>Setting up the shop touch board (admins)</w:t>
+            </w:r>
+            <w:r>
+              <w:rPr>
+                <w:noProof/>
+              </w:rPr>
+              <w:tab/>
+            </w:r>
+            <w:r>
+              <w:rPr>
+                <w:noProof/>
+              </w:rPr>
+              <w:fldChar w:fldCharType="begin"/>
+            </w:r>
+            <w:r>
+              <w:rPr>
+                <w:noProof/>
+              </w:rPr>
+              <w:instrText xml:space="preserve"> PAGEREF _Toc241663445 \h </w:instrText>
+            </w:r>
+            <w:r>
+              <w:rPr>
+                <w:noProof/>
+              </w:rPr>
+            </w:r>
+            <w:r>
+              <w:rPr>
+                <w:noProof/>
+              </w:rPr>
+              <w:fldChar w:fldCharType="separate"/>
+            </w:r>
+            <w:r>
+              <w:rPr>
+                <w:noProof/>
+              </w:rPr>
+              <w:t>13</w:t>
             </w:r>
             <w:r>
               <w:rPr>
@@ -2161,7 +2295,7 @@
               <w14:ligatures w14:val="standardContextual"/>
             </w:rPr>
           </w:pPr>
-          <w:hyperlink w:anchor="_Toc241660867" w:history="1">
+          <w:hyperlink w:anchor="_Toc241663446" w:history="1">
             <w:r>
               <w:rPr>
                 <w:rStyle w:val="Hyperlink"/>
@@ -2185,7 +2319,7 @@
               <w:rPr>
                 <w:noProof/>
               </w:rPr>
-              <w:instrText xml:space="preserve"> PAGEREF _Toc241660867 \h </w:instrText>
+              <w:instrText xml:space="preserve"> PAGEREF _Toc241663446 \h </w:instrText>
             </w:r>
             <w:r>
               <w:rPr>
@@ -2202,7 +2336,7 @@
               <w:rPr>
                 <w:noProof/>
               </w:rPr>
-              <w:t>13</w:t>
+              <w:t>14</w:t>
             </w:r>
             <w:r>
               <w:rPr>
@@ -2228,7 +2362,7 @@
               <w14:ligatures w14:val="standardContextual"/>
             </w:rPr>
           </w:pPr>
-          <w:hyperlink w:anchor="_Toc241660868" w:history="1">
+          <w:hyperlink w:anchor="_Toc241663447" w:history="1">
             <w:r>
               <w:rPr>
                 <w:rStyle w:val="Hyperlink"/>
@@ -2252,7 +2386,7 @@
               <w:rPr>
                 <w:noProof/>
               </w:rPr>
-              <w:instrText xml:space="preserve"> PAGEREF _Toc241660868 \h </w:instrText>
+              <w:instrText xml:space="preserve"> PAGEREF _Toc241663447 \h </w:instrText>
             </w:r>
             <w:r>
               <w:rPr>
@@ -2269,7 +2403,7 @@
               <w:rPr>
                 <w:noProof/>
               </w:rPr>
-              <w:t>14</w:t>
+              <w:t>15</w:t>
             </w:r>
             <w:r>
               <w:rPr>
@@ -2295,7 +2429,7 @@
               <w14:ligatures w14:val="standardContextual"/>
             </w:rPr>
           </w:pPr>
-          <w:hyperlink w:anchor="_Toc241660869" w:history="1">
+          <w:hyperlink w:anchor="_Toc241663448" w:history="1">
             <w:r>
               <w:rPr>
                 <w:rStyle w:val="Hyperlink"/>
@@ -2319,7 +2453,7 @@
               <w:rPr>
                 <w:noProof/>
               </w:rPr>
-              <w:instrText xml:space="preserve"> PAGEREF _Toc241660869 \h </w:instrText>
+              <w:instrText xml:space="preserve"> PAGEREF _Toc241663448 \h </w:instrText>
             </w:r>
             <w:r>
               <w:rPr>
@@ -2336,7 +2470,7 @@
               <w:rPr>
                 <w:noProof/>
               </w:rPr>
-              <w:t>14</w:t>
+              <w:t>15</w:t>
             </w:r>
             <w:r>
               <w:rPr>
@@ -2362,7 +2496,7 @@
               <w14:ligatures w14:val="standardContextual"/>
             </w:rPr>
           </w:pPr>
-          <w:hyperlink w:anchor="_Toc241660870" w:history="1">
+          <w:hyperlink w:anchor="_Toc241663449" w:history="1">
             <w:r>
               <w:rPr>
                 <w:rStyle w:val="Hyperlink"/>
@@ -2386,7 +2520,7 @@
               <w:rPr>
                 <w:noProof/>
               </w:rPr>
-              <w:instrText xml:space="preserve"> PAGEREF _Toc241660870 \h </w:instrText>
+              <w:instrText xml:space="preserve"> PAGEREF _Toc241663449 \h </w:instrText>
             </w:r>
             <w:r>
               <w:rPr>
@@ -2403,7 +2537,7 @@
               <w:rPr>
                 <w:noProof/>
               </w:rPr>
-              <w:t>14</w:t>
+              <w:t>15</w:t>
             </w:r>
             <w:r>
               <w:rPr>
@@ -2429,7 +2563,7 @@
               <w14:ligatures w14:val="standardContextual"/>
             </w:rPr>
           </w:pPr>
-          <w:hyperlink w:anchor="_Toc241660871" w:history="1">
+          <w:hyperlink w:anchor="_Toc241663450" w:history="1">
             <w:r>
               <w:rPr>
                 <w:rStyle w:val="Hyperlink"/>
@@ -2453,7 +2587,7 @@
               <w:rPr>
                 <w:noProof/>
               </w:rPr>
-              <w:instrText xml:space="preserve"> PAGEREF _Toc241660871 \h </w:instrText>
+              <w:instrText xml:space="preserve"> PAGEREF _Toc241663450 \h </w:instrText>
             </w:r>
             <w:r>
               <w:rPr>
@@ -2470,7 +2604,7 @@
               <w:rPr>
                 <w:noProof/>
               </w:rPr>
-              <w:t>14</w:t>
+              <w:t>15</w:t>
             </w:r>
             <w:r>
               <w:rPr>
@@ -2496,7 +2630,7 @@
               <w14:ligatures w14:val="standardContextual"/>
             </w:rPr>
           </w:pPr>
-          <w:hyperlink w:anchor="_Toc241660872" w:history="1">
+          <w:hyperlink w:anchor="_Toc241663451" w:history="1">
             <w:r>
               <w:rPr>
                 <w:rStyle w:val="Hyperlink"/>
@@ -2520,7 +2654,7 @@
               <w:rPr>
                 <w:noProof/>
               </w:rPr>
-              <w:instrText xml:space="preserve"> PAGEREF _Toc241660872 \h </w:instrText>
+              <w:instrText xml:space="preserve"> PAGEREF _Toc241663451 \h </w:instrText>
             </w:r>
             <w:r>
               <w:rPr>
@@ -2537,7 +2671,7 @@
               <w:rPr>
                 <w:noProof/>
               </w:rPr>
-              <w:t>14</w:t>
+              <w:t>15</w:t>
             </w:r>
             <w:r>
               <w:rPr>
@@ -2563,7 +2697,7 @@
               <w14:ligatures w14:val="standardContextual"/>
             </w:rPr>
           </w:pPr>
-          <w:hyperlink w:anchor="_Toc241660873" w:history="1">
+          <w:hyperlink w:anchor="_Toc241663452" w:history="1">
             <w:r>
               <w:rPr>
                 <w:rStyle w:val="Hyperlink"/>
@@ -2587,7 +2721,7 @@
               <w:rPr>
                 <w:noProof/>
               </w:rPr>
-              <w:instrText xml:space="preserve"> PAGEREF _Toc241660873 \h </w:instrText>
+              <w:instrText xml:space="preserve"> PAGEREF _Toc241663452 \h </w:instrText>
             </w:r>
             <w:r>
               <w:rPr>
@@ -2604,7 +2738,7 @@
               <w:rPr>
                 <w:noProof/>
               </w:rPr>
-              <w:t>16</w:t>
+              <w:t>17</w:t>
             </w:r>
             <w:r>
               <w:rPr>
@@ -2630,7 +2764,7 @@
               <w14:ligatures w14:val="standardContextual"/>
             </w:rPr>
           </w:pPr>
-          <w:hyperlink w:anchor="_Toc241660874" w:history="1">
+          <w:hyperlink w:anchor="_Toc241663453" w:history="1">
             <w:r>
               <w:rPr>
                 <w:rStyle w:val="Hyperlink"/>
@@ -2654,7 +2788,7 @@
               <w:rPr>
                 <w:noProof/>
               </w:rPr>
-              <w:instrText xml:space="preserve"> PAGEREF _Toc241660874 \h </w:instrText>
+              <w:instrText xml:space="preserve"> PAGEREF _Toc241663453 \h </w:instrText>
             </w:r>
             <w:r>
               <w:rPr>
@@ -2671,7 +2805,7 @@
               <w:rPr>
                 <w:noProof/>
               </w:rPr>
-              <w:t>16</w:t>
+              <w:t>17</w:t>
             </w:r>
             <w:r>
               <w:rPr>
@@ -2697,7 +2831,7 @@
               <w14:ligatures w14:val="standardContextual"/>
             </w:rPr>
           </w:pPr>
-          <w:hyperlink w:anchor="_Toc241660875" w:history="1">
+          <w:hyperlink w:anchor="_Toc241663454" w:history="1">
             <w:r>
               <w:rPr>
                 <w:rStyle w:val="Hyperlink"/>
@@ -2721,7 +2855,7 @@
               <w:rPr>
                 <w:noProof/>
               </w:rPr>
-              <w:instrText xml:space="preserve"> PAGEREF _Toc241660875 \h </w:instrText>
+              <w:instrText xml:space="preserve"> PAGEREF _Toc241663454 \h </w:instrText>
             </w:r>
             <w:r>
               <w:rPr>
@@ -2738,7 +2872,7 @@
               <w:rPr>
                 <w:noProof/>
               </w:rPr>
-              <w:t>17</w:t>
+              <w:t>18</w:t>
             </w:r>
             <w:r>
               <w:rPr>
@@ -2764,7 +2898,7 @@
               <w14:ligatures w14:val="standardContextual"/>
             </w:rPr>
           </w:pPr>
-          <w:hyperlink w:anchor="_Toc241660876" w:history="1">
+          <w:hyperlink w:anchor="_Toc241663455" w:history="1">
             <w:r>
               <w:rPr>
                 <w:rStyle w:val="Hyperlink"/>
@@ -2788,7 +2922,7 @@
               <w:rPr>
                 <w:noProof/>
               </w:rPr>
-              <w:instrText xml:space="preserve"> PAGEREF _Toc241660876 \h </w:instrText>
+              <w:instrText xml:space="preserve"> PAGEREF _Toc241663455 \h </w:instrText>
             </w:r>
             <w:r>
               <w:rPr>
@@ -2805,7 +2939,7 @@
               <w:rPr>
                 <w:noProof/>
               </w:rPr>
-              <w:t>17</w:t>
+              <w:t>18</w:t>
             </w:r>
             <w:r>
               <w:rPr>
@@ -2831,7 +2965,7 @@
               <w14:ligatures w14:val="standardContextual"/>
             </w:rPr>
           </w:pPr>
-          <w:hyperlink w:anchor="_Toc241660877" w:history="1">
+          <w:hyperlink w:anchor="_Toc241663456" w:history="1">
             <w:r>
               <w:rPr>
                 <w:rStyle w:val="Hyperlink"/>
@@ -2855,7 +2989,7 @@
               <w:rPr>
                 <w:noProof/>
               </w:rPr>
-              <w:instrText xml:space="preserve"> PAGEREF _Toc241660877 \h </w:instrText>
+              <w:instrText xml:space="preserve"> PAGEREF _Toc241663456 \h </w:instrText>
             </w:r>
             <w:r>
               <w:rPr>
@@ -2872,7 +3006,7 @@
               <w:rPr>
                 <w:noProof/>
               </w:rPr>
-              <w:t>18</w:t>
+              <w:t>19</w:t>
             </w:r>
             <w:r>
               <w:rPr>
@@ -2898,7 +3032,7 @@
               <w14:ligatures w14:val="standardContextual"/>
             </w:rPr>
           </w:pPr>
-          <w:hyperlink w:anchor="_Toc241660878" w:history="1">
+          <w:hyperlink w:anchor="_Toc241663457" w:history="1">
             <w:r>
               <w:rPr>
                 <w:rStyle w:val="Hyperlink"/>
@@ -2922,7 +3056,7 @@
               <w:rPr>
                 <w:noProof/>
               </w:rPr>
-              <w:instrText xml:space="preserve"> PAGEREF _Toc241660878 \h </w:instrText>
+              <w:instrText xml:space="preserve"> PAGEREF _Toc241663457 \h </w:instrText>
             </w:r>
             <w:r>
               <w:rPr>
@@ -2939,7 +3073,7 @@
               <w:rPr>
                 <w:noProof/>
               </w:rPr>
-              <w:t>18</w:t>
+              <w:t>19</w:t>
             </w:r>
             <w:r>
               <w:rPr>
@@ -2965,7 +3099,7 @@
               <w14:ligatures w14:val="standardContextual"/>
             </w:rPr>
           </w:pPr>
-          <w:hyperlink w:anchor="_Toc241660879" w:history="1">
+          <w:hyperlink w:anchor="_Toc241663458" w:history="1">
             <w:r>
               <w:rPr>
                 <w:rStyle w:val="Hyperlink"/>
@@ -2989,7 +3123,7 @@
               <w:rPr>
                 <w:noProof/>
               </w:rPr>
-              <w:instrText xml:space="preserve"> PAGEREF _Toc241660879 \h </w:instrText>
+              <w:instrText xml:space="preserve"> PAGEREF _Toc241663458 \h </w:instrText>
             </w:r>
             <w:r>
               <w:rPr>
@@ -3006,7 +3140,7 @@
               <w:rPr>
                 <w:noProof/>
               </w:rPr>
-              <w:t>18</w:t>
+              <w:t>19</w:t>
             </w:r>
             <w:r>
               <w:rPr>
@@ -3032,7 +3166,7 @@
               <w14:ligatures w14:val="standardContextual"/>
             </w:rPr>
           </w:pPr>
-          <w:hyperlink w:anchor="_Toc241660880" w:history="1">
+          <w:hyperlink w:anchor="_Toc241663459" w:history="1">
             <w:r>
               <w:rPr>
                 <w:rStyle w:val="Hyperlink"/>
@@ -3056,7 +3190,7 @@
               <w:rPr>
                 <w:noProof/>
               </w:rPr>
-              <w:instrText xml:space="preserve"> PAGEREF _Toc241660880 \h </w:instrText>
+              <w:instrText xml:space="preserve"> PAGEREF _Toc241663459 \h </w:instrText>
             </w:r>
             <w:r>
               <w:rPr>
@@ -3073,7 +3207,7 @@
               <w:rPr>
                 <w:noProof/>
               </w:rPr>
-              <w:t>18</w:t>
+              <w:t>19</w:t>
             </w:r>
             <w:r>
               <w:rPr>
@@ -3099,7 +3233,7 @@
               <w14:ligatures w14:val="standardContextual"/>
             </w:rPr>
           </w:pPr>
-          <w:hyperlink w:anchor="_Toc241660881" w:history="1">
+          <w:hyperlink w:anchor="_Toc241663460" w:history="1">
             <w:r>
               <w:rPr>
                 <w:rStyle w:val="Hyperlink"/>
@@ -3123,7 +3257,7 @@
               <w:rPr>
                 <w:noProof/>
               </w:rPr>
-              <w:instrText xml:space="preserve"> PAGEREF _Toc241660881 \h </w:instrText>
+              <w:instrText xml:space="preserve"> PAGEREF _Toc241663460 \h </w:instrText>
             </w:r>
             <w:r>
               <w:rPr>
@@ -3140,7 +3274,7 @@
               <w:rPr>
                 <w:noProof/>
               </w:rPr>
-              <w:t>18</w:t>
+              <w:t>19</w:t>
             </w:r>
             <w:r>
               <w:rPr>
@@ -3166,7 +3300,7 @@
               <w14:ligatures w14:val="standardContextual"/>
             </w:rPr>
           </w:pPr>
-          <w:hyperlink w:anchor="_Toc241660882" w:history="1">
+          <w:hyperlink w:anchor="_Toc241663461" w:history="1">
             <w:r>
               <w:rPr>
                 <w:rStyle w:val="Hyperlink"/>
@@ -3190,7 +3324,7 @@
               <w:rPr>
                 <w:noProof/>
               </w:rPr>
-              <w:instrText xml:space="preserve"> PAGEREF _Toc241660882 \h </w:instrText>
+              <w:instrText xml:space="preserve"> PAGEREF _Toc241663461 \h </w:instrText>
             </w:r>
             <w:r>
               <w:rPr>
@@ -3207,7 +3341,7 @@
               <w:rPr>
                 <w:noProof/>
               </w:rPr>
-              <w:t>18</w:t>
+              <w:t>19</w:t>
             </w:r>
             <w:r>
               <w:rPr>
@@ -3233,7 +3367,7 @@
               <w14:ligatures w14:val="standardContextual"/>
             </w:rPr>
           </w:pPr>
-          <w:hyperlink w:anchor="_Toc241660883" w:history="1">
+          <w:hyperlink w:anchor="_Toc241663462" w:history="1">
             <w:r>
               <w:rPr>
                 <w:rStyle w:val="Hyperlink"/>
@@ -3257,7 +3391,7 @@
               <w:rPr>
                 <w:noProof/>
               </w:rPr>
-              <w:instrText xml:space="preserve"> PAGEREF _Toc241660883 \h </w:instrText>
+              <w:instrText xml:space="preserve"> PAGEREF _Toc241663462 \h </w:instrText>
             </w:r>
             <w:r>
               <w:rPr>
@@ -3274,7 +3408,7 @@
               <w:rPr>
                 <w:noProof/>
               </w:rPr>
-              <w:t>19</w:t>
+              <w:t>20</w:t>
             </w:r>
             <w:r>
               <w:rPr>
@@ -3300,7 +3434,7 @@
               <w14:ligatures w14:val="standardContextual"/>
             </w:rPr>
           </w:pPr>
-          <w:hyperlink w:anchor="_Toc241660884" w:history="1">
+          <w:hyperlink w:anchor="_Toc241663463" w:history="1">
             <w:r>
               <w:rPr>
                 <w:rStyle w:val="Hyperlink"/>
@@ -3324,7 +3458,7 @@
               <w:rPr>
                 <w:noProof/>
               </w:rPr>
-              <w:instrText xml:space="preserve"> PAGEREF _Toc241660884 \h </w:instrText>
+              <w:instrText xml:space="preserve"> PAGEREF _Toc241663463 \h </w:instrText>
             </w:r>
             <w:r>
               <w:rPr>
@@ -3341,7 +3475,7 @@
               <w:rPr>
                 <w:noProof/>
               </w:rPr>
-              <w:t>19</w:t>
+              <w:t>20</w:t>
             </w:r>
             <w:r>
               <w:rPr>
@@ -3367,7 +3501,7 @@
               <w14:ligatures w14:val="standardContextual"/>
             </w:rPr>
           </w:pPr>
-          <w:hyperlink w:anchor="_Toc241660885" w:history="1">
+          <w:hyperlink w:anchor="_Toc241663464" w:history="1">
             <w:r>
               <w:rPr>
                 <w:rStyle w:val="Hyperlink"/>
@@ -3391,7 +3525,7 @@
               <w:rPr>
                 <w:noProof/>
               </w:rPr>
-              <w:instrText xml:space="preserve"> PAGEREF _Toc241660885 \h </w:instrText>
+              <w:instrText xml:space="preserve"> PAGEREF _Toc241663464 \h </w:instrText>
             </w:r>
             <w:r>
               <w:rPr>
@@ -3408,7 +3542,7 @@
               <w:rPr>
                 <w:noProof/>
               </w:rPr>
-              <w:t>19</w:t>
+              <w:t>20</w:t>
             </w:r>
             <w:r>
               <w:rPr>
@@ -3434,7 +3568,7 @@
               <w14:ligatures w14:val="standardContextual"/>
             </w:rPr>
           </w:pPr>
-          <w:hyperlink w:anchor="_Toc241660886" w:history="1">
+          <w:hyperlink w:anchor="_Toc241663465" w:history="1">
             <w:r>
               <w:rPr>
                 <w:rStyle w:val="Hyperlink"/>
@@ -3458,7 +3592,7 @@
               <w:rPr>
                 <w:noProof/>
               </w:rPr>
-              <w:instrText xml:space="preserve"> PAGEREF _Toc241660886 \h </w:instrText>
+              <w:instrText xml:space="preserve"> PAGEREF _Toc241663465 \h </w:instrText>
             </w:r>
             <w:r>
               <w:rPr>
@@ -3475,7 +3609,7 @@
               <w:rPr>
                 <w:noProof/>
               </w:rPr>
-              <w:t>20</w:t>
+              <w:t>21</w:t>
             </w:r>
             <w:r>
               <w:rPr>
@@ -3501,7 +3635,7 @@
               <w14:ligatures w14:val="standardContextual"/>
             </w:rPr>
           </w:pPr>
-          <w:hyperlink w:anchor="_Toc241660887" w:history="1">
+          <w:hyperlink w:anchor="_Toc241663466" w:history="1">
             <w:r>
               <w:rPr>
                 <w:rStyle w:val="Hyperlink"/>
@@ -3525,7 +3659,7 @@
               <w:rPr>
                 <w:noProof/>
               </w:rPr>
-              <w:instrText xml:space="preserve"> PAGEREF _Toc241660887 \h </w:instrText>
+              <w:instrText xml:space="preserve"> PAGEREF _Toc241663466 \h </w:instrText>
             </w:r>
             <w:r>
               <w:rPr>
@@ -3542,7 +3676,7 @@
               <w:rPr>
                 <w:noProof/>
               </w:rPr>
-              <w:t>20</w:t>
+              <w:t>21</w:t>
             </w:r>
             <w:r>
               <w:rPr>
@@ -3568,7 +3702,7 @@
               <w14:ligatures w14:val="standardContextual"/>
             </w:rPr>
           </w:pPr>
-          <w:hyperlink w:anchor="_Toc241660888" w:history="1">
+          <w:hyperlink w:anchor="_Toc241663467" w:history="1">
             <w:r>
               <w:rPr>
                 <w:rStyle w:val="Hyperlink"/>
@@ -3592,7 +3726,7 @@
               <w:rPr>
                 <w:noProof/>
               </w:rPr>
-              <w:instrText xml:space="preserve"> PAGEREF _Toc241660888 \h </w:instrText>
+              <w:instrText xml:space="preserve"> PAGEREF _Toc241663467 \h </w:instrText>
             </w:r>
             <w:r>
               <w:rPr>
@@ -3609,7 +3743,7 @@
               <w:rPr>
                 <w:noProof/>
               </w:rPr>
-              <w:t>20</w:t>
+              <w:t>21</w:t>
             </w:r>
             <w:r>
               <w:rPr>
@@ -3635,7 +3769,7 @@
               <w14:ligatures w14:val="standardContextual"/>
             </w:rPr>
           </w:pPr>
-          <w:hyperlink w:anchor="_Toc241660889" w:history="1">
+          <w:hyperlink w:anchor="_Toc241663468" w:history="1">
             <w:r>
               <w:rPr>
                 <w:rStyle w:val="Hyperlink"/>
@@ -3659,7 +3793,7 @@
               <w:rPr>
                 <w:noProof/>
               </w:rPr>
-              <w:instrText xml:space="preserve"> PAGEREF _Toc241660889 \h </w:instrText>
+              <w:instrText xml:space="preserve"> PAGEREF _Toc241663468 \h </w:instrText>
             </w:r>
             <w:r>
               <w:rPr>
@@ -3676,7 +3810,7 @@
               <w:rPr>
                 <w:noProof/>
               </w:rPr>
-              <w:t>20</w:t>
+              <w:t>21</w:t>
             </w:r>
             <w:r>
               <w:rPr>
@@ -3702,7 +3836,7 @@
               <w14:ligatures w14:val="standardContextual"/>
             </w:rPr>
           </w:pPr>
-          <w:hyperlink w:anchor="_Toc241660890" w:history="1">
+          <w:hyperlink w:anchor="_Toc241663469" w:history="1">
             <w:r>
               <w:rPr>
                 <w:rStyle w:val="Hyperlink"/>
@@ -3726,7 +3860,7 @@
               <w:rPr>
                 <w:noProof/>
               </w:rPr>
-              <w:instrText xml:space="preserve"> PAGEREF _Toc241660890 \h </w:instrText>
+              <w:instrText xml:space="preserve"> PAGEREF _Toc241663469 \h </w:instrText>
             </w:r>
             <w:r>
               <w:rPr>
@@ -3743,7 +3877,7 @@
               <w:rPr>
                 <w:noProof/>
               </w:rPr>
-              <w:t>21</w:t>
+              <w:t>22</w:t>
             </w:r>
             <w:r>
               <w:rPr>
@@ -3769,7 +3903,7 @@
               <w14:ligatures w14:val="standardContextual"/>
             </w:rPr>
           </w:pPr>
-          <w:hyperlink w:anchor="_Toc241660891" w:history="1">
+          <w:hyperlink w:anchor="_Toc241663470" w:history="1">
             <w:r>
               <w:rPr>
                 <w:rStyle w:val="Hyperlink"/>
@@ -3793,7 +3927,7 @@
               <w:rPr>
                 <w:noProof/>
               </w:rPr>
-              <w:instrText xml:space="preserve"> PAGEREF _Toc241660891 \h </w:instrText>
+              <w:instrText xml:space="preserve"> PAGEREF _Toc241663470 \h </w:instrText>
             </w:r>
             <w:r>
               <w:rPr>
@@ -3810,7 +3944,7 @@
               <w:rPr>
                 <w:noProof/>
               </w:rPr>
-              <w:t>22</w:t>
+              <w:t>23</w:t>
             </w:r>
             <w:r>
               <w:rPr>
@@ -3836,7 +3970,7 @@
       <w:pPr>
         <w:pStyle w:val="Heading1"/>
       </w:pPr>
-      <w:bookmarkStart w:id="0" w:name="_Toc241660837"/>
+      <w:bookmarkStart w:id="0" w:name="_Toc241663414"/>
       <w:r>
         <w:t>1.  Getting started</w:t>
       </w:r>
@@ -3864,7 +3998,7 @@
       <w:pPr>
         <w:pStyle w:val="Heading2"/>
       </w:pPr>
-      <w:bookmarkStart w:id="1" w:name="_Toc241660838"/>
+      <w:bookmarkStart w:id="1" w:name="_Toc241663415"/>
       <w:r>
         <w:t>Opening ShopControl</w:t>
       </w:r>
@@ -3944,7 +4078,7 @@
       <w:pPr>
         <w:pStyle w:val="Heading2"/>
       </w:pPr>
-      <w:bookmarkStart w:id="2" w:name="_Toc241660839"/>
+      <w:bookmarkStart w:id="2" w:name="_Toc241663416"/>
       <w:r>
         <w:t>Finding help</w:t>
       </w:r>
@@ -4047,7 +4181,7 @@
       <w:pPr>
         <w:pStyle w:val="Heading2"/>
       </w:pPr>
-      <w:bookmarkStart w:id="3" w:name="_Toc241660840"/>
+      <w:bookmarkStart w:id="3" w:name="_Toc241663417"/>
       <w:r>
         <w:t>Put the app on your phone's home screen</w:t>
       </w:r>
@@ -4215,7 +4349,7 @@
       <w:pPr>
         <w:pStyle w:val="Heading2"/>
       </w:pPr>
-      <w:bookmarkStart w:id="4" w:name="_Toc241660841"/>
+      <w:bookmarkStart w:id="4" w:name="_Toc241663418"/>
       <w:r>
         <w:t>Logging in</w:t>
       </w:r>
@@ -4385,7 +4519,7 @@
       <w:pPr>
         <w:pStyle w:val="Heading2"/>
       </w:pPr>
-      <w:bookmarkStart w:id="5" w:name="_Toc241660842"/>
+      <w:bookmarkStart w:id="5" w:name="_Toc241663419"/>
       <w:r>
         <w:t>Staying up to date</w:t>
       </w:r>
@@ -4413,7 +4547,7 @@
       <w:pPr>
         <w:pStyle w:val="Heading2"/>
       </w:pPr>
-      <w:bookmarkStart w:id="6" w:name="_Toc241660843"/>
+      <w:bookmarkStart w:id="6" w:name="_Toc241663420"/>
       <w:r>
         <w:t>Who can do what</w:t>
       </w:r>
@@ -4997,6 +5131,65 @@
           </w:p>
         </w:tc>
       </w:tr>
+      <w:tr>
+        <w:tblPrEx>
+          <w:tblCellMar>
+            <w:top w:w="0" w:type="dxa"/>
+            <w:bottom w:w="0" w:type="dxa"/>
+          </w:tblCellMar>
+        </w:tblPrEx>
+        <w:trPr>
+          <w:cantSplit/>
+        </w:trPr>
+        <w:tc>
+          <w:tcPr>
+            <w:tcW w:w="2900" w:type="dxa"/>
+            <w:tcBorders>
+              <w:top w:val="single" w:sz="4" w:space="0" w:color="C9CFD6"/>
+              <w:left w:val="single" w:sz="4" w:space="0" w:color="C9CFD6"/>
+              <w:bottom w:val="single" w:sz="4" w:space="0" w:color="C9CFD6"/>
+              <w:right w:val="single" w:sz="4" w:space="0" w:color="C9CFD6"/>
+            </w:tcBorders>
+            <w:tcMar>
+              <w:top w:w="80" w:type="dxa"/>
+              <w:left w:w="120" w:type="dxa"/>
+              <w:bottom w:w="80" w:type="dxa"/>
+              <w:right w:w="120" w:type="dxa"/>
+            </w:tcMar>
+          </w:tcPr>
+          <w:p>
+            <w:r>
+              <w:rPr>
+                <w:b/>
+                <w:bCs/>
+              </w:rPr>
+              <w:t>Shop board</w:t>
+            </w:r>
+          </w:p>
+        </w:tc>
+        <w:tc>
+          <w:tcPr>
+            <w:tcW w:w="6460" w:type="dxa"/>
+            <w:tcBorders>
+              <w:top w:val="single" w:sz="4" w:space="0" w:color="C9CFD6"/>
+              <w:left w:val="single" w:sz="4" w:space="0" w:color="C9CFD6"/>
+              <w:bottom w:val="single" w:sz="4" w:space="0" w:color="C9CFD6"/>
+              <w:right w:val="single" w:sz="4" w:space="0" w:color="C9CFD6"/>
+            </w:tcBorders>
+            <w:tcMar>
+              <w:top w:w="80" w:type="dxa"/>
+              <w:left w:w="120" w:type="dxa"/>
+              <w:bottom w:w="80" w:type="dxa"/>
+              <w:right w:w="120" w:type="dxa"/>
+            </w:tcMar>
+          </w:tcPr>
+          <w:p>
+            <w:r>
+              <w:t>The touch screen in the shop. Sees the Production Board and can only move cars between production stages.</w:t>
+            </w:r>
+          </w:p>
+        </w:tc>
+      </w:tr>
     </w:tbl>
     <w:p>
       <w:pPr>
@@ -5026,7 +5219,7 @@
         <w:pStyle w:val="Heading1"/>
         <w:pageBreakBefore/>
       </w:pPr>
-      <w:bookmarkStart w:id="7" w:name="_Toc241660844"/>
+      <w:bookmarkStart w:id="7" w:name="_Toc241663421"/>
       <w:r>
         <w:t>2.  The Employee App (technicians)</w:t>
       </w:r>
@@ -5044,7 +5237,7 @@
       <w:pPr>
         <w:pStyle w:val="Heading2"/>
       </w:pPr>
-      <w:bookmarkStart w:id="8" w:name="_Toc241660845"/>
+      <w:bookmarkStart w:id="8" w:name="_Toc241663422"/>
       <w:r>
         <w:t>Home screen</w:t>
       </w:r>
@@ -5204,7 +5397,7 @@
       <w:pPr>
         <w:pStyle w:val="Heading2"/>
       </w:pPr>
-      <w:bookmarkStart w:id="9" w:name="_Toc241660846"/>
+      <w:bookmarkStart w:id="9" w:name="_Toc241663423"/>
       <w:r>
         <w:t>Spanish (Español)</w:t>
       </w:r>
@@ -5291,7 +5484,7 @@
       <w:pPr>
         <w:pStyle w:val="Heading2"/>
       </w:pPr>
-      <w:bookmarkStart w:id="10" w:name="_Toc241660847"/>
+      <w:bookmarkStart w:id="10" w:name="_Toc241663424"/>
       <w:r>
         <w:t>Doing your QC checklist</w:t>
       </w:r>
@@ -5505,7 +5698,7 @@
       <w:pPr>
         <w:pStyle w:val="Heading2"/>
       </w:pPr>
-      <w:bookmarkStart w:id="11" w:name="_Toc241660848"/>
+      <w:bookmarkStart w:id="11" w:name="_Toc241663425"/>
       <w:r>
         <w:t>Signing and rework</w:t>
       </w:r>
@@ -5625,7 +5818,7 @@
       <w:pPr>
         <w:pStyle w:val="Heading2"/>
       </w:pPr>
-      <w:bookmarkStart w:id="12" w:name="_Toc241660849"/>
+      <w:bookmarkStart w:id="12" w:name="_Toc241663426"/>
       <w:r>
         <w:t>Other departments' checklists</w:t>
       </w:r>
@@ -5653,7 +5846,7 @@
       <w:pPr>
         <w:pStyle w:val="Heading2"/>
       </w:pPr>
-      <w:bookmarkStart w:id="13" w:name="_Toc241660850"/>
+      <w:bookmarkStart w:id="13" w:name="_Toc241663427"/>
       <w:r>
         <w:t>Photos and parts</w:t>
       </w:r>
@@ -5790,7 +5983,7 @@
         <w:pStyle w:val="Heading1"/>
         <w:pageBreakBefore/>
       </w:pPr>
-      <w:bookmarkStart w:id="14" w:name="_Toc241660851"/>
+      <w:bookmarkStart w:id="14" w:name="_Toc241663428"/>
       <w:r>
         <w:t>3.  Staff Hub: time off, mailbox and company info</w:t>
       </w:r>
@@ -5818,7 +6011,7 @@
       <w:pPr>
         <w:pStyle w:val="Heading2"/>
       </w:pPr>
-      <w:bookmarkStart w:id="15" w:name="_Toc241660852"/>
+      <w:bookmarkStart w:id="15" w:name="_Toc241663429"/>
       <w:r>
         <w:t>Requesting time off</w:t>
       </w:r>
@@ -5981,7 +6174,7 @@
       <w:pPr>
         <w:pStyle w:val="Heading2"/>
       </w:pPr>
-      <w:bookmarkStart w:id="16" w:name="_Toc241660853"/>
+      <w:bookmarkStart w:id="16" w:name="_Toc241663430"/>
       <w:r>
         <w:t>Checking your requests</w:t>
       </w:r>
@@ -6036,7 +6229,7 @@
       <w:pPr>
         <w:pStyle w:val="Heading2"/>
       </w:pPr>
-      <w:bookmarkStart w:id="17" w:name="_Toc241660854"/>
+      <w:bookmarkStart w:id="17" w:name="_Toc241663431"/>
       <w:r>
         <w:t>Mailbox</w:t>
       </w:r>
@@ -6105,7 +6298,7 @@
       <w:pPr>
         <w:pStyle w:val="Heading2"/>
       </w:pPr>
-      <w:bookmarkStart w:id="18" w:name="_Toc241660855"/>
+      <w:bookmarkStart w:id="18" w:name="_Toc241663432"/>
       <w:r>
         <w:t>Company info and this manual</w:t>
       </w:r>
@@ -6141,7 +6334,7 @@
         <w:pStyle w:val="Heading1"/>
         <w:pageBreakBefore/>
       </w:pPr>
-      <w:bookmarkStart w:id="19" w:name="_Toc241660856"/>
+      <w:bookmarkStart w:id="19" w:name="_Toc241663433"/>
       <w:r>
         <w:t>4.  Finding a vehicle</w:t>
       </w:r>
@@ -6396,7 +6589,7 @@
         <w:pStyle w:val="Heading1"/>
         <w:pageBreakBefore/>
       </w:pPr>
-      <w:bookmarkStart w:id="20" w:name="_Toc241660857"/>
+      <w:bookmarkStart w:id="20" w:name="_Toc241663434"/>
       <w:r>
         <w:t>5.  Dashboard</w:t>
       </w:r>
@@ -6535,7 +6728,7 @@
         <w:pStyle w:val="Heading1"/>
         <w:pageBreakBefore/>
       </w:pPr>
-      <w:bookmarkStart w:id="21" w:name="_Toc241660858"/>
+      <w:bookmarkStart w:id="21" w:name="_Toc241663435"/>
       <w:r>
         <w:t>6.  Jobs and the Daily GO List</w:t>
       </w:r>
@@ -6563,7 +6756,7 @@
       <w:pPr>
         <w:pStyle w:val="Heading2"/>
       </w:pPr>
-      <w:bookmarkStart w:id="22" w:name="_Toc241660859"/>
+      <w:bookmarkStart w:id="22" w:name="_Toc241663436"/>
       <w:r>
         <w:t>RO numbers</w:t>
       </w:r>
@@ -6649,7 +6842,7 @@
       <w:pPr>
         <w:pStyle w:val="Heading2"/>
       </w:pPr>
-      <w:bookmarkStart w:id="23" w:name="_Toc241660860"/>
+      <w:bookmarkStart w:id="23" w:name="_Toc241663437"/>
       <w:r>
         <w:t>Adding or editing a job</w:t>
       </w:r>
@@ -6769,7 +6962,7 @@
       <w:pPr>
         <w:pStyle w:val="Heading2"/>
       </w:pPr>
-      <w:bookmarkStart w:id="24" w:name="_Toc241660861"/>
+      <w:bookmarkStart w:id="24" w:name="_Toc241663438"/>
       <w:r>
         <w:t>Customer updates</w:t>
       </w:r>
@@ -6938,7 +7131,7 @@
         <w:pStyle w:val="Heading1"/>
         <w:pageBreakBefore/>
       </w:pPr>
-      <w:bookmarkStart w:id="25" w:name="_Toc241660862"/>
+      <w:bookmarkStart w:id="25" w:name="_Toc241663439"/>
       <w:r>
         <w:t>7.  Production, Delivery and Planning boards</w:t>
       </w:r>
@@ -6948,7 +7141,7 @@
       <w:pPr>
         <w:pStyle w:val="Heading2"/>
       </w:pPr>
-      <w:bookmarkStart w:id="26" w:name="_Toc241660863"/>
+      <w:bookmarkStart w:id="26" w:name="_Toc241663440"/>
       <w:r>
         <w:t>Production Board</w:t>
       </w:r>
@@ -7076,7 +7269,7 @@
       <w:pPr>
         <w:pStyle w:val="Heading2"/>
       </w:pPr>
-      <w:bookmarkStart w:id="27" w:name="_Toc241660864"/>
+      <w:bookmarkStart w:id="27" w:name="_Toc241663441"/>
       <w:r>
         <w:t>Vehicle pictures</w:t>
       </w:r>
@@ -7134,7 +7327,7 @@
       <w:pPr>
         <w:pStyle w:val="Heading2"/>
       </w:pPr>
-      <w:bookmarkStart w:id="28" w:name="_Toc241660865"/>
+      <w:bookmarkStart w:id="28" w:name="_Toc241663442"/>
       <w:r>
         <w:t>Delivery and Planning boards</w:t>
       </w:r>
@@ -7224,7 +7417,7 @@
       <w:pPr>
         <w:pStyle w:val="Heading2"/>
       </w:pPr>
-      <w:bookmarkStart w:id="29" w:name="_Toc241660866"/>
+      <w:bookmarkStart w:id="29" w:name="_Toc241663443"/>
       <w:r>
         <w:t>TV display</w:t>
       </w:r>
@@ -7246,6 +7439,265 @@
       </w:r>
       <w:r>
         <w:t xml:space="preserve"> in the left menu.</w:t>
+      </w:r>
+    </w:p>
+    <w:p>
+      <w:pPr>
+        <w:pStyle w:val="Heading2"/>
+      </w:pPr>
+      <w:bookmarkStart w:id="30" w:name="_Toc241663444"/>
+      <w:r>
+        <w:t>Shop touch board</w:t>
+      </w:r>
+      <w:bookmarkEnd w:id="30"/>
+    </w:p>
+    <w:p>
+      <w:pPr>
+        <w:spacing w:after="120"/>
+      </w:pPr>
+      <w:r>
+        <w:t>The touch screen in the shop shows the same Production Board as the TV, and technicians use it to move cars to their next stage:</w:t>
+      </w:r>
+    </w:p>
+    <w:p>
+      <w:pPr>
+        <w:pStyle w:val="ListParagraph"/>
+        <w:numPr>
+          <w:ilvl w:val="0"/>
+          <w:numId w:val="10"/>
+        </w:numPr>
+        <w:spacing w:after="60"/>
+      </w:pPr>
+      <w:r>
+        <w:t>Tap the car.</w:t>
+      </w:r>
+    </w:p>
+    <w:p>
+      <w:pPr>
+        <w:pStyle w:val="ListParagraph"/>
+        <w:numPr>
+          <w:ilvl w:val="0"/>
+          <w:numId w:val="10"/>
+        </w:numPr>
+        <w:spacing w:after="60"/>
+      </w:pPr>
+      <w:r>
+        <w:t xml:space="preserve">Tap the big orange button to move it to its usual next stage (for example </w:t>
+      </w:r>
+      <w:r>
+        <w:rPr>
+          <w:b/>
+          <w:bCs/>
+        </w:rPr>
+        <w:t>Move to Paint</w:t>
+      </w:r>
+      <w:r>
+        <w:t>), or tap any other stage.</w:t>
+      </w:r>
+    </w:p>
+    <w:p>
+      <w:pPr>
+        <w:pStyle w:val="ListParagraph"/>
+        <w:numPr>
+          <w:ilvl w:val="0"/>
+          <w:numId w:val="10"/>
+        </w:numPr>
+        <w:spacing w:after="60"/>
+      </w:pPr>
+      <w:r>
+        <w:t>Tap your name. Names of the techs assigned to the car are at the top.</w:t>
+      </w:r>
+    </w:p>
+    <w:p>
+      <w:pPr>
+        <w:pStyle w:val="ListParagraph"/>
+        <w:numPr>
+          <w:ilvl w:val="0"/>
+          <w:numId w:val="10"/>
+        </w:numPr>
+        <w:spacing w:after="60"/>
+      </w:pPr>
+      <w:r>
+        <w:t xml:space="preserve">The car moves and a green banner confirms it. Tapped the wrong thing? Tap </w:t>
+      </w:r>
+      <w:r>
+        <w:rPr>
+          <w:b/>
+          <w:bCs/>
+        </w:rPr>
+        <w:t>Undo</w:t>
+      </w:r>
+      <w:r>
+        <w:t xml:space="preserve"> on the banner within 15 seconds.</w:t>
+      </w:r>
+    </w:p>
+    <w:p>
+      <w:pPr>
+        <w:spacing w:after="120"/>
+      </w:pPr>
+      <w:r>
+        <w:t xml:space="preserve">Every move is saved under the name that was tapped, for example </w:t>
+      </w:r>
+      <w:r>
+        <w:rPr>
+          <w:b/>
+          <w:bCs/>
+        </w:rPr>
+        <w:t>Luis S (shop board)</w:t>
+      </w:r>
+      <w:r>
+        <w:t xml:space="preserve">, and shows in the car's production timeline in </w:t>
+      </w:r>
+      <w:r>
+        <w:rPr>
+          <w:b/>
+          <w:bCs/>
+        </w:rPr>
+        <w:t>Completed Jobs</w:t>
+      </w:r>
+      <w:r>
+        <w:t>. The board holds still for 90 seconds after anyone touches it, then goes back to paging through the columns. If nobody finishes a move, the move screen closes by itself after a minute.</w:t>
+      </w:r>
+    </w:p>
+    <w:p>
+      <w:pPr>
+        <w:pBdr>
+          <w:left w:val="single" w:sz="24" w:space="8" w:color="C99A06"/>
+        </w:pBdr>
+        <w:shd w:val="clear" w:color="auto" w:fill="FFF8DD"/>
+        <w:spacing w:before="120" w:after="160"/>
+        <w:ind w:left="160" w:right="160"/>
+      </w:pPr>
+      <w:r>
+        <w:rPr>
+          <w:b/>
+          <w:bCs/>
+          <w:color w:val="C99A06"/>
+        </w:rPr>
+        <w:t xml:space="preserve">Note:  </w:t>
+      </w:r>
+      <w:r>
+        <w:t>The shop board can only move cars between production stages. It can't mark a car Delivered, edit a job, or delete anything. Only tap your own name: the move is recorded as yours.</w:t>
+      </w:r>
+    </w:p>
+    <w:p>
+      <w:pPr>
+        <w:pStyle w:val="Heading2"/>
+      </w:pPr>
+      <w:bookmarkStart w:id="31" w:name="_Toc241663445"/>
+      <w:r>
+        <w:t>Setting up the shop touch board (admins)</w:t>
+      </w:r>
+      <w:bookmarkEnd w:id="31"/>
+    </w:p>
+    <w:p>
+      <w:pPr>
+        <w:pStyle w:val="ListParagraph"/>
+        <w:numPr>
+          <w:ilvl w:val="0"/>
+          <w:numId w:val="11"/>
+        </w:numPr>
+        <w:spacing w:after="60"/>
+      </w:pPr>
+      <w:r>
+        <w:t xml:space="preserve">In </w:t>
+      </w:r>
+      <w:r>
+        <w:rPr>
+          <w:b/>
+          <w:bCs/>
+        </w:rPr>
+        <w:t>Employees</w:t>
+      </w:r>
+      <w:r>
+        <w:t xml:space="preserve">, add an account (for example username </w:t>
+      </w:r>
+      <w:r>
+        <w:rPr>
+          <w:b/>
+          <w:bCs/>
+        </w:rPr>
+        <w:t>shopboard</w:t>
+      </w:r>
+      <w:r>
+        <w:t xml:space="preserve">, name </w:t>
+      </w:r>
+      <w:r>
+        <w:rPr>
+          <w:b/>
+          <w:bCs/>
+        </w:rPr>
+        <w:t>Shop Board</w:t>
+      </w:r>
+      <w:r>
+        <w:t xml:space="preserve">) with the role </w:t>
+      </w:r>
+      <w:r>
+        <w:rPr>
+          <w:b/>
+          <w:bCs/>
+        </w:rPr>
+        <w:t>Shop board (touch screen: moves cars only)</w:t>
+      </w:r>
+      <w:r>
+        <w:t>.</w:t>
+      </w:r>
+    </w:p>
+    <w:p>
+      <w:pPr>
+        <w:pStyle w:val="ListParagraph"/>
+        <w:numPr>
+          <w:ilvl w:val="0"/>
+          <w:numId w:val="11"/>
+        </w:numPr>
+        <w:spacing w:after="60"/>
+      </w:pPr>
+      <w:r>
+        <w:t>On the touch screen, open ShopControl (https://shopcontrol.conceptauto.local on the shop network, or https://conceptautobody.app/index.html) and sign in with that account. It opens straight to the Production Board, full screen.</w:t>
+      </w:r>
+    </w:p>
+    <w:p>
+      <w:pPr>
+        <w:pStyle w:val="ListParagraph"/>
+        <w:numPr>
+          <w:ilvl w:val="0"/>
+          <w:numId w:val="11"/>
+        </w:numPr>
+        <w:spacing w:after="60"/>
+      </w:pPr>
+      <w:r>
+        <w:t>It stays signed in, refreshes every 20 seconds and reloads every 3 hours, just like the TV.</w:t>
+      </w:r>
+    </w:p>
+    <w:p>
+      <w:pPr>
+        <w:pBdr>
+          <w:left w:val="single" w:sz="24" w:space="8" w:color="2F9E5B"/>
+        </w:pBdr>
+        <w:shd w:val="clear" w:color="auto" w:fill="EAF7EF"/>
+        <w:spacing w:before="120" w:after="160"/>
+        <w:ind w:left="160" w:right="160"/>
+      </w:pPr>
+      <w:r>
+        <w:rPr>
+          <w:b/>
+          <w:bCs/>
+          <w:color w:val="2F9E5B"/>
+        </w:rPr>
+        <w:t xml:space="preserve">Tip:  </w:t>
+      </w:r>
+      <w:r>
+        <w:t xml:space="preserve">To try it from an office computer, click </w:t>
+      </w:r>
+      <w:r>
+        <w:rPr>
+          <w:b/>
+          <w:bCs/>
+        </w:rPr>
+        <w:t>Shop touch board</w:t>
+      </w:r>
+      <w:r>
+        <w:t xml:space="preserve"> in the left menu. Moves you make there are recorded under the name you tap.</w:t>
       </w:r>
     </w:p>
     <w:p>
@@ -7253,11 +7705,11 @@
         <w:pStyle w:val="Heading1"/>
         <w:pageBreakBefore/>
       </w:pPr>
-      <w:bookmarkStart w:id="30" w:name="_Toc241660867"/>
+      <w:bookmarkStart w:id="32" w:name="_Toc241663446"/>
       <w:r>
         <w:t>8.  CCC estimates coming into ShopControl</w:t>
       </w:r>
-      <w:bookmarkEnd w:id="30"/>
+      <w:bookmarkEnd w:id="32"/>
     </w:p>
     <w:p>
       <w:pPr>
@@ -7362,11 +7814,11 @@
         <w:pStyle w:val="Heading1"/>
         <w:pageBreakBefore/>
       </w:pPr>
-      <w:bookmarkStart w:id="31" w:name="_Toc241660868"/>
+      <w:bookmarkStart w:id="33" w:name="_Toc241663447"/>
       <w:r>
         <w:t>9.  Parts</w:t>
       </w:r>
-      <w:bookmarkEnd w:id="31"/>
+      <w:bookmarkEnd w:id="33"/>
     </w:p>
     <w:p>
       <w:pPr>
@@ -7420,11 +7872,11 @@
       <w:pPr>
         <w:pStyle w:val="Heading2"/>
       </w:pPr>
-      <w:bookmarkStart w:id="32" w:name="_Toc241660869"/>
+      <w:bookmarkStart w:id="34" w:name="_Toc241663448"/>
       <w:r>
         <w:t>What counts as a problem</w:t>
       </w:r>
-      <w:bookmarkEnd w:id="32"/>
+      <w:bookmarkEnd w:id="34"/>
     </w:p>
     <w:p>
       <w:pPr>
@@ -7488,18 +7940,18 @@
       <w:pPr>
         <w:pStyle w:val="Heading2"/>
       </w:pPr>
-      <w:bookmarkStart w:id="33" w:name="_Toc241660870"/>
+      <w:bookmarkStart w:id="35" w:name="_Toc241663449"/>
       <w:r>
         <w:t>Ordering parts</w:t>
       </w:r>
-      <w:bookmarkEnd w:id="33"/>
+      <w:bookmarkEnd w:id="35"/>
     </w:p>
     <w:p>
       <w:pPr>
         <w:pStyle w:val="ListParagraph"/>
         <w:numPr>
           <w:ilvl w:val="0"/>
-          <w:numId w:val="10"/>
+          <w:numId w:val="12"/>
         </w:numPr>
         <w:spacing w:after="60"/>
       </w:pPr>
@@ -7522,7 +7974,7 @@
         <w:pStyle w:val="ListParagraph"/>
         <w:numPr>
           <w:ilvl w:val="0"/>
-          <w:numId w:val="10"/>
+          <w:numId w:val="12"/>
         </w:numPr>
         <w:spacing w:after="60"/>
       </w:pPr>
@@ -7545,7 +7997,7 @@
         <w:pStyle w:val="ListParagraph"/>
         <w:numPr>
           <w:ilvl w:val="0"/>
-          <w:numId w:val="10"/>
+          <w:numId w:val="12"/>
         </w:numPr>
         <w:spacing w:after="60"/>
       </w:pPr>
@@ -7595,18 +8047,18 @@
       <w:pPr>
         <w:pStyle w:val="Heading2"/>
       </w:pPr>
-      <w:bookmarkStart w:id="34" w:name="_Toc241660871"/>
+      <w:bookmarkStart w:id="36" w:name="_Toc241663450"/>
       <w:r>
         <w:t>Mirror matching and carts</w:t>
       </w:r>
-      <w:bookmarkEnd w:id="34"/>
+      <w:bookmarkEnd w:id="36"/>
     </w:p>
     <w:p>
       <w:pPr>
         <w:pStyle w:val="ListParagraph"/>
         <w:numPr>
           <w:ilvl w:val="0"/>
-          <w:numId w:val="11"/>
+          <w:numId w:val="13"/>
         </w:numPr>
         <w:spacing w:after="60"/>
       </w:pPr>
@@ -7629,7 +8081,7 @@
         <w:pStyle w:val="ListParagraph"/>
         <w:numPr>
           <w:ilvl w:val="0"/>
-          <w:numId w:val="11"/>
+          <w:numId w:val="13"/>
         </w:numPr>
         <w:spacing w:after="60"/>
       </w:pPr>
@@ -7652,7 +8104,7 @@
         <w:pStyle w:val="ListParagraph"/>
         <w:numPr>
           <w:ilvl w:val="0"/>
-          <w:numId w:val="11"/>
+          <w:numId w:val="13"/>
         </w:numPr>
         <w:spacing w:after="60"/>
       </w:pPr>
@@ -7733,11 +8185,11 @@
       <w:pPr>
         <w:pStyle w:val="Heading2"/>
       </w:pPr>
-      <w:bookmarkStart w:id="35" w:name="_Toc241660872"/>
+      <w:bookmarkStart w:id="37" w:name="_Toc241663451"/>
       <w:r>
         <w:t>Other parts screens</w:t>
       </w:r>
-      <w:bookmarkEnd w:id="35"/>
+      <w:bookmarkEnd w:id="37"/>
     </w:p>
     <w:p>
       <w:pPr>
@@ -7824,11 +8276,11 @@
         <w:pStyle w:val="Heading1"/>
         <w:pageBreakBefore/>
       </w:pPr>
-      <w:bookmarkStart w:id="36" w:name="_Toc241660873"/>
+      <w:bookmarkStart w:id="38" w:name="_Toc241663452"/>
       <w:r>
         <w:t>10.  Vehicle QC (office view)</w:t>
       </w:r>
-      <w:bookmarkEnd w:id="36"/>
+      <w:bookmarkEnd w:id="38"/>
     </w:p>
     <w:p>
       <w:pPr>
@@ -7862,11 +8314,11 @@
       <w:pPr>
         <w:pStyle w:val="Heading2"/>
       </w:pPr>
-      <w:bookmarkStart w:id="37" w:name="_Toc241660874"/>
+      <w:bookmarkStart w:id="39" w:name="_Toc241663453"/>
       <w:r>
         <w:t>Pulling up a car's QC report</w:t>
       </w:r>
-      <w:bookmarkEnd w:id="37"/>
+      <w:bookmarkEnd w:id="39"/>
     </w:p>
     <w:p>
       <w:pPr>
@@ -7977,11 +8429,11 @@
         <w:pStyle w:val="Heading1"/>
         <w:pageBreakBefore/>
       </w:pPr>
-      <w:bookmarkStart w:id="38" w:name="_Toc241660875"/>
+      <w:bookmarkStart w:id="40" w:name="_Toc241663454"/>
       <w:r>
         <w:t>11.  Completed Jobs (job records)</w:t>
       </w:r>
-      <w:bookmarkEnd w:id="38"/>
+      <w:bookmarkEnd w:id="40"/>
     </w:p>
     <w:p>
       <w:pPr>
@@ -8168,11 +8620,11 @@
       <w:pPr>
         <w:pStyle w:val="Heading2"/>
       </w:pPr>
-      <w:bookmarkStart w:id="39" w:name="_Toc241660876"/>
+      <w:bookmarkStart w:id="41" w:name="_Toc241663455"/>
       <w:r>
         <w:t>Deleted jobs</w:t>
       </w:r>
-      <w:bookmarkEnd w:id="39"/>
+      <w:bookmarkEnd w:id="41"/>
     </w:p>
     <w:p>
       <w:pPr>
@@ -8228,21 +8680,21 @@
         <w:pStyle w:val="Heading1"/>
         <w:pageBreakBefore/>
       </w:pPr>
-      <w:bookmarkStart w:id="40" w:name="_Toc241660877"/>
+      <w:bookmarkStart w:id="42" w:name="_Toc241663456"/>
       <w:r>
         <w:t>12.  Office tools</w:t>
       </w:r>
-      <w:bookmarkEnd w:id="40"/>
+      <w:bookmarkEnd w:id="42"/>
     </w:p>
     <w:p>
       <w:pPr>
         <w:pStyle w:val="Heading2"/>
       </w:pPr>
-      <w:bookmarkStart w:id="41" w:name="_Toc241660878"/>
+      <w:bookmarkStart w:id="43" w:name="_Toc241663457"/>
       <w:r>
         <w:t>Missed Calls / Callback Requests</w:t>
       </w:r>
-      <w:bookmarkEnd w:id="41"/>
+      <w:bookmarkEnd w:id="43"/>
     </w:p>
     <w:p>
       <w:pPr>
@@ -8316,11 +8768,11 @@
       <w:pPr>
         <w:pStyle w:val="Heading2"/>
       </w:pPr>
-      <w:bookmarkStart w:id="42" w:name="_Toc241660879"/>
+      <w:bookmarkStart w:id="44" w:name="_Toc241663458"/>
       <w:r>
         <w:t>Tasks</w:t>
       </w:r>
-      <w:bookmarkEnd w:id="42"/>
+      <w:bookmarkEnd w:id="44"/>
     </w:p>
     <w:p>
       <w:pPr>
@@ -8334,11 +8786,11 @@
       <w:pPr>
         <w:pStyle w:val="Heading2"/>
       </w:pPr>
-      <w:bookmarkStart w:id="43" w:name="_Toc241660880"/>
+      <w:bookmarkStart w:id="45" w:name="_Toc241663459"/>
       <w:r>
         <w:t>Booth Filters and Facility Checklist</w:t>
       </w:r>
-      <w:bookmarkEnd w:id="43"/>
+      <w:bookmarkEnd w:id="45"/>
     </w:p>
     <w:p>
       <w:pPr>
@@ -8372,11 +8824,11 @@
       <w:pPr>
         <w:pStyle w:val="Heading2"/>
       </w:pPr>
-      <w:bookmarkStart w:id="44" w:name="_Toc241660881"/>
+      <w:bookmarkStart w:id="46" w:name="_Toc241663460"/>
       <w:r>
         <w:t>AR Balances and Cycle Time</w:t>
       </w:r>
-      <w:bookmarkEnd w:id="44"/>
+      <w:bookmarkEnd w:id="46"/>
     </w:p>
     <w:p>
       <w:pPr>
@@ -8422,11 +8874,11 @@
       <w:pPr>
         <w:pStyle w:val="Heading2"/>
       </w:pPr>
-      <w:bookmarkStart w:id="45" w:name="_Toc241660882"/>
+      <w:bookmarkStart w:id="47" w:name="_Toc241663461"/>
       <w:r>
         <w:t>Photos and Activity Log</w:t>
       </w:r>
-      <w:bookmarkEnd w:id="45"/>
+      <w:bookmarkEnd w:id="47"/>
     </w:p>
     <w:p>
       <w:pPr>
@@ -8473,21 +8925,21 @@
         <w:pStyle w:val="Heading1"/>
         <w:pageBreakBefore/>
       </w:pPr>
-      <w:bookmarkStart w:id="46" w:name="_Toc241660883"/>
+      <w:bookmarkStart w:id="48" w:name="_Toc241663462"/>
       <w:r>
         <w:t>13.  Time off and messages (office and admins)</w:t>
       </w:r>
-      <w:bookmarkEnd w:id="46"/>
+      <w:bookmarkEnd w:id="48"/>
     </w:p>
     <w:p>
       <w:pPr>
         <w:pStyle w:val="Heading2"/>
       </w:pPr>
-      <w:bookmarkStart w:id="47" w:name="_Toc241660884"/>
+      <w:bookmarkStart w:id="49" w:name="_Toc241663463"/>
       <w:r>
         <w:t>Time Off tab</w:t>
       </w:r>
-      <w:bookmarkEnd w:id="47"/>
+      <w:bookmarkEnd w:id="49"/>
     </w:p>
     <w:p>
       <w:pPr>
@@ -8512,7 +8964,7 @@
         <w:pStyle w:val="ListParagraph"/>
         <w:numPr>
           <w:ilvl w:val="0"/>
-          <w:numId w:val="12"/>
+          <w:numId w:val="14"/>
         </w:numPr>
         <w:spacing w:after="60"/>
       </w:pPr>
@@ -8535,7 +8987,7 @@
         <w:pStyle w:val="ListParagraph"/>
         <w:numPr>
           <w:ilvl w:val="0"/>
-          <w:numId w:val="12"/>
+          <w:numId w:val="14"/>
         </w:numPr>
         <w:spacing w:after="60"/>
       </w:pPr>
@@ -8568,7 +9020,7 @@
         <w:pStyle w:val="ListParagraph"/>
         <w:numPr>
           <w:ilvl w:val="0"/>
-          <w:numId w:val="12"/>
+          <w:numId w:val="14"/>
         </w:numPr>
         <w:spacing w:after="60"/>
       </w:pPr>
@@ -8611,11 +9063,11 @@
       <w:pPr>
         <w:pStyle w:val="Heading2"/>
       </w:pPr>
-      <w:bookmarkStart w:id="48" w:name="_Toc241660885"/>
+      <w:bookmarkStart w:id="50" w:name="_Toc241663464"/>
       <w:r>
         <w:t>Messages &amp; Info tab</w:t>
       </w:r>
-      <w:bookmarkEnd w:id="48"/>
+      <w:bookmarkEnd w:id="50"/>
     </w:p>
     <w:p>
       <w:pPr>
@@ -8702,28 +9154,28 @@
         <w:pStyle w:val="Heading1"/>
         <w:pageBreakBefore/>
       </w:pPr>
-      <w:bookmarkStart w:id="49" w:name="_Toc241660886"/>
+      <w:bookmarkStart w:id="51" w:name="_Toc241663465"/>
       <w:r>
         <w:t>14.  Admin: employees and settings</w:t>
       </w:r>
-      <w:bookmarkEnd w:id="49"/>
+      <w:bookmarkEnd w:id="51"/>
     </w:p>
     <w:p>
       <w:pPr>
         <w:pStyle w:val="Heading2"/>
       </w:pPr>
-      <w:bookmarkStart w:id="50" w:name="_Toc241660887"/>
+      <w:bookmarkStart w:id="52" w:name="_Toc241663466"/>
       <w:r>
         <w:t>Adding an employee</w:t>
       </w:r>
-      <w:bookmarkEnd w:id="50"/>
+      <w:bookmarkEnd w:id="52"/>
     </w:p>
     <w:p>
       <w:pPr>
         <w:pStyle w:val="ListParagraph"/>
         <w:numPr>
           <w:ilvl w:val="0"/>
-          <w:numId w:val="13"/>
+          <w:numId w:val="15"/>
         </w:numPr>
         <w:spacing w:after="60"/>
       </w:pPr>
@@ -8756,7 +9208,7 @@
         <w:pStyle w:val="ListParagraph"/>
         <w:numPr>
           <w:ilvl w:val="0"/>
-          <w:numId w:val="13"/>
+          <w:numId w:val="15"/>
         </w:numPr>
         <w:spacing w:after="60"/>
       </w:pPr>
@@ -8779,7 +9231,7 @@
         <w:pStyle w:val="ListParagraph"/>
         <w:numPr>
           <w:ilvl w:val="0"/>
-          <w:numId w:val="13"/>
+          <w:numId w:val="15"/>
         </w:numPr>
         <w:spacing w:after="60"/>
       </w:pPr>
@@ -8812,7 +9264,7 @@
         <w:pStyle w:val="ListParagraph"/>
         <w:numPr>
           <w:ilvl w:val="0"/>
-          <w:numId w:val="13"/>
+          <w:numId w:val="15"/>
         </w:numPr>
         <w:spacing w:after="60"/>
       </w:pPr>
@@ -8834,11 +9286,11 @@
       <w:pPr>
         <w:pStyle w:val="Heading2"/>
       </w:pPr>
-      <w:bookmarkStart w:id="51" w:name="_Toc241660888"/>
+      <w:bookmarkStart w:id="53" w:name="_Toc241663467"/>
       <w:r>
         <w:t>Changing an employee</w:t>
       </w:r>
-      <w:bookmarkEnd w:id="51"/>
+      <w:bookmarkEnd w:id="53"/>
     </w:p>
     <w:p>
       <w:pPr>
@@ -8994,11 +9446,11 @@
       <w:pPr>
         <w:pStyle w:val="Heading2"/>
       </w:pPr>
-      <w:bookmarkStart w:id="52" w:name="_Toc241660889"/>
+      <w:bookmarkStart w:id="54" w:name="_Toc241663468"/>
       <w:r>
         <w:t>Board Settings</w:t>
       </w:r>
-      <w:bookmarkEnd w:id="52"/>
+      <w:bookmarkEnd w:id="54"/>
     </w:p>
     <w:p>
       <w:pPr>
@@ -9013,11 +9465,11 @@
         <w:pStyle w:val="Heading1"/>
         <w:pageBreakBefore/>
       </w:pPr>
-      <w:bookmarkStart w:id="53" w:name="_Toc241660890"/>
+      <w:bookmarkStart w:id="55" w:name="_Toc241663469"/>
       <w:r>
         <w:t>15.  Quick answers</w:t>
       </w:r>
-      <w:bookmarkEnd w:id="53"/>
+      <w:bookmarkEnd w:id="55"/>
     </w:p>
     <w:tbl>
       <w:tblPr>
@@ -9657,11 +10109,11 @@
         <w:pStyle w:val="Heading1"/>
         <w:pageBreakBefore/>
       </w:pPr>
-      <w:bookmarkStart w:id="54" w:name="_Toc241660891"/>
+      <w:bookmarkStart w:id="56" w:name="_Toc241663470"/>
       <w:r>
         <w:t>Manual versions</w:t>
       </w:r>
-      <w:bookmarkEnd w:id="54"/>
+      <w:bookmarkEnd w:id="56"/>
     </w:p>
     <w:tbl>
       <w:tblPr>
@@ -9812,7 +10264,7 @@
                 <w:b/>
                 <w:bCs/>
               </w:rPr>
-              <w:t>2.0</w:t>
+              <w:t>2.1</w:t>
             </w:r>
           </w:p>
         </w:tc>
@@ -9856,27 +10308,17 @@
           </w:tcPr>
           <w:p>
             <w:r>
-              <w:t xml:space="preserve">The Employee App can be switched to </w:t>
+              <w:t xml:space="preserve">New </w:t>
             </w:r>
             <w:r>
               <w:rPr>
                 <w:b/>
                 <w:bCs/>
               </w:rPr>
-              <w:t>Spanish</w:t>
-            </w:r>
-            <w:r>
-              <w:t xml:space="preserve"> with the </w:t>
-            </w:r>
-            <w:r>
-              <w:rPr>
-                <w:b/>
-                <w:bCs/>
-              </w:rPr>
-              <w:t>Español</w:t>
-            </w:r>
-            <w:r>
-              <w:t xml:space="preserve"> button. Reports and the office program stay in English.</w:t>
+              <w:t>shop touch board</w:t>
+            </w:r>
+            <w:r>
+              <w:t>: technicians move cars to their next stage by tapping the car, the stage and their name.</w:t>
             </w:r>
           </w:p>
         </w:tc>
@@ -9913,7 +10355,7 @@
                 <w:b/>
                 <w:bCs/>
               </w:rPr>
-              <w:t>1.9</w:t>
+              <w:t>2.0</w:t>
             </w:r>
           </w:p>
         </w:tc>
@@ -9935,7 +10377,7 @@
           </w:tcPr>
           <w:p>
             <w:r>
-              <w:t>September 28, 2026</w:t>
+              <w:t>September 30, 2026</w:t>
             </w:r>
           </w:p>
         </w:tc>
@@ -9957,17 +10399,27 @@
           </w:tcPr>
           <w:p>
             <w:r>
-              <w:t xml:space="preserve">New </w:t>
+              <w:t xml:space="preserve">The Employee App can be switched to </w:t>
             </w:r>
             <w:r>
               <w:rPr>
                 <w:b/>
                 <w:bCs/>
               </w:rPr>
-              <w:t>Find a vehicle</w:t>
-            </w:r>
-            <w:r>
-              <w:t xml:space="preserve"> search at the top of the office program. It finds any car, at any stage or finished, by RO, customer, vehicle, VIN, plate or claim number.</w:t>
+              <w:t>Spanish</w:t>
+            </w:r>
+            <w:r>
+              <w:t xml:space="preserve"> with the </w:t>
+            </w:r>
+            <w:r>
+              <w:rPr>
+                <w:b/>
+                <w:bCs/>
+              </w:rPr>
+              <w:t>Español</w:t>
+            </w:r>
+            <w:r>
+              <w:t xml:space="preserve"> button. Reports and the office program stay in English.</w:t>
             </w:r>
           </w:p>
         </w:tc>
@@ -10004,7 +10456,7 @@
                 <w:b/>
                 <w:bCs/>
               </w:rPr>
-              <w:t>1.8</w:t>
+              <w:t>1.9</w:t>
             </w:r>
           </w:p>
         </w:tc>
@@ -10055,10 +10507,10 @@
                 <w:b/>
                 <w:bCs/>
               </w:rPr>
-              <w:t>Completed Jobs</w:t>
-            </w:r>
-            <w:r>
-              <w:t xml:space="preserve"> tab with each finished job's full file (production timeline, parts, QC, photos, every change). Only an admin can delete a delivered job or its parts.</w:t>
+              <w:t>Find a vehicle</w:t>
+            </w:r>
+            <w:r>
+              <w:t xml:space="preserve"> search at the top of the office program. It finds any car, at any stage or finished, by RO, customer, vehicle, VIN, plate or claim number.</w:t>
             </w:r>
           </w:p>
         </w:tc>
@@ -10095,7 +10547,7 @@
                 <w:b/>
                 <w:bCs/>
               </w:rPr>
-              <w:t>1.7</w:t>
+              <w:t>1.8</w:t>
             </w:r>
           </w:p>
         </w:tc>
@@ -10139,17 +10591,17 @@
           </w:tcPr>
           <w:p>
             <w:r>
-              <w:t xml:space="preserve">The Employee App now shows </w:t>
+              <w:t xml:space="preserve">New </w:t>
             </w:r>
             <w:r>
               <w:rPr>
                 <w:b/>
                 <w:bCs/>
               </w:rPr>
-              <w:t>where each part is</w:t>
-            </w:r>
-            <w:r>
-              <w:t>: the car's parts cart, and the cart shelf or storage spot for every part.</w:t>
+              <w:t>Completed Jobs</w:t>
+            </w:r>
+            <w:r>
+              <w:t xml:space="preserve"> tab with each finished job's full file (production timeline, parts, QC, photos, every change). Only an admin can delete a delivered job or its parts.</w:t>
             </w:r>
           </w:p>
         </w:tc>
@@ -10186,7 +10638,7 @@
                 <w:b/>
                 <w:bCs/>
               </w:rPr>
-              <w:t>1.6</w:t>
+              <w:t>1.7</w:t>
             </w:r>
           </w:p>
         </w:tc>
@@ -10230,37 +10682,17 @@
           </w:tcPr>
           <w:p>
             <w:r>
-              <w:t xml:space="preserve">Whoever does </w:t>
+              <w:t xml:space="preserve">The Employee App now shows </w:t>
             </w:r>
             <w:r>
               <w:rPr>
                 <w:b/>
                 <w:bCs/>
               </w:rPr>
-              <w:t>Check-In</w:t>
-            </w:r>
-            <w:r>
-              <w:t xml:space="preserve"> automatically gets the </w:t>
-            </w:r>
-            <w:r>
-              <w:rPr>
-                <w:b/>
-                <w:bCs/>
-              </w:rPr>
-              <w:t>Final QC</w:t>
-            </w:r>
-            <w:r>
-              <w:t xml:space="preserve"> checklist too. New </w:t>
-            </w:r>
-            <w:r>
-              <w:rPr>
-                <w:b/>
-                <w:bCs/>
-              </w:rPr>
-              <w:t>QC report</w:t>
-            </w:r>
-            <w:r>
-              <w:t xml:space="preserve"> for each car: all five checklists with signatures on one printable page.</w:t>
+              <w:t>where each part is</w:t>
+            </w:r>
+            <w:r>
+              <w:t>: the car's parts cart, and the cart shelf or storage spot for every part.</w:t>
             </w:r>
           </w:p>
         </w:tc>
@@ -10297,7 +10729,7 @@
                 <w:b/>
                 <w:bCs/>
               </w:rPr>
-              <w:t>1.5</w:t>
+              <w:t>1.6</w:t>
             </w:r>
           </w:p>
         </w:tc>
@@ -10341,17 +10773,37 @@
           </w:tcPr>
           <w:p>
             <w:r>
-              <w:t xml:space="preserve">Body technicians automatically get the </w:t>
+              <w:t xml:space="preserve">Whoever does </w:t>
             </w:r>
             <w:r>
               <w:rPr>
                 <w:b/>
                 <w:bCs/>
               </w:rPr>
-              <w:t>Reassy</w:t>
-            </w:r>
-            <w:r>
-              <w:t xml:space="preserve"> checklist too.</w:t>
+              <w:t>Check-In</w:t>
+            </w:r>
+            <w:r>
+              <w:t xml:space="preserve"> automatically gets the </w:t>
+            </w:r>
+            <w:r>
+              <w:rPr>
+                <w:b/>
+                <w:bCs/>
+              </w:rPr>
+              <w:t>Final QC</w:t>
+            </w:r>
+            <w:r>
+              <w:t xml:space="preserve"> checklist too. New </w:t>
+            </w:r>
+            <w:r>
+              <w:rPr>
+                <w:b/>
+                <w:bCs/>
+              </w:rPr>
+              <w:t>QC report</w:t>
+            </w:r>
+            <w:r>
+              <w:t xml:space="preserve"> for each car: all five checklists with signatures on one printable page.</w:t>
             </w:r>
           </w:p>
         </w:tc>
@@ -10388,7 +10840,7 @@
                 <w:b/>
                 <w:bCs/>
               </w:rPr>
-              <w:t>1.4</w:t>
+              <w:t>1.5</w:t>
             </w:r>
           </w:p>
         </w:tc>
@@ -10432,17 +10884,17 @@
           </w:tcPr>
           <w:p>
             <w:r>
-              <w:t xml:space="preserve">Employees can be set to </w:t>
+              <w:t xml:space="preserve">Body technicians automatically get the </w:t>
             </w:r>
             <w:r>
               <w:rPr>
                 <w:b/>
                 <w:bCs/>
               </w:rPr>
-              <w:t>also do</w:t>
-            </w:r>
-            <w:r>
-              <w:t xml:space="preserve"> other checklists (for example a body tech who reassembles also gets the Reassy checklist).</w:t>
+              <w:t>Reassy</w:t>
+            </w:r>
+            <w:r>
+              <w:t xml:space="preserve"> checklist too.</w:t>
             </w:r>
           </w:p>
         </w:tc>
@@ -10479,7 +10931,7 @@
                 <w:b/>
                 <w:bCs/>
               </w:rPr>
-              <w:t>1.3</w:t>
+              <w:t>1.4</w:t>
             </w:r>
           </w:p>
         </w:tc>
@@ -10523,7 +10975,17 @@
           </w:tcPr>
           <w:p>
             <w:r>
-              <w:t>New accounts and admin password resets use a temporary password; you choose your own the first time you sign in.</w:t>
+              <w:t xml:space="preserve">Employees can be set to </w:t>
+            </w:r>
+            <w:r>
+              <w:rPr>
+                <w:b/>
+                <w:bCs/>
+              </w:rPr>
+              <w:t>also do</w:t>
+            </w:r>
+            <w:r>
+              <w:t xml:space="preserve"> other checklists (for example a body tech who reassembles also gets the Reassy checklist).</w:t>
             </w:r>
           </w:p>
         </w:tc>
@@ -10560,7 +11022,7 @@
                 <w:b/>
                 <w:bCs/>
               </w:rPr>
-              <w:t>1.2</w:t>
+              <w:t>1.3</w:t>
             </w:r>
           </w:p>
         </w:tc>
@@ -10604,17 +11066,7 @@
           </w:tcPr>
           <w:p>
             <w:r>
-              <w:t xml:space="preserve">Added the </w:t>
-            </w:r>
-            <w:r>
-              <w:rPr>
-                <w:b/>
-                <w:bCs/>
-              </w:rPr>
-              <w:t>Help</w:t>
-            </w:r>
-            <w:r>
-              <w:t xml:space="preserve"> tab in the office program and a search box in the manual.</w:t>
+              <w:t>New accounts and admin password resets use a temporary password; you choose your own the first time you sign in.</w:t>
             </w:r>
           </w:p>
         </w:tc>
@@ -10651,7 +11103,7 @@
                 <w:b/>
                 <w:bCs/>
               </w:rPr>
-              <w:t>1.1</w:t>
+              <w:t>1.2</w:t>
             </w:r>
           </w:p>
         </w:tc>
@@ -10695,17 +11147,17 @@
           </w:tcPr>
           <w:p>
             <w:r>
-              <w:t xml:space="preserve">Employee App address is now </w:t>
+              <w:t xml:space="preserve">Added the </w:t>
             </w:r>
             <w:r>
               <w:rPr>
                 <w:b/>
                 <w:bCs/>
               </w:rPr>
-              <w:t>https://conceptautobody.app</w:t>
-            </w:r>
-            <w:r>
-              <w:t xml:space="preserve"> and works on phones anywhere. Added how to put it on your phone's home screen.</w:t>
+              <w:t>Help</w:t>
+            </w:r>
+            <w:r>
+              <w:t xml:space="preserve"> tab in the office program and a search box in the manual.</w:t>
             </w:r>
           </w:p>
         </w:tc>
@@ -10742,7 +11194,7 @@
                 <w:b/>
                 <w:bCs/>
               </w:rPr>
-              <w:t>1.0</w:t>
+              <w:t>1.1</w:t>
             </w:r>
           </w:p>
         </w:tc>
@@ -10786,6 +11238,97 @@
           </w:tcPr>
           <w:p>
             <w:r>
+              <w:t xml:space="preserve">Employee App address is now </w:t>
+            </w:r>
+            <w:r>
+              <w:rPr>
+                <w:b/>
+                <w:bCs/>
+              </w:rPr>
+              <w:t>https://conceptautobody.app</w:t>
+            </w:r>
+            <w:r>
+              <w:t xml:space="preserve"> and works on phones anywhere. Added how to put it on your phone's home screen.</w:t>
+            </w:r>
+          </w:p>
+        </w:tc>
+      </w:tr>
+      <w:tr>
+        <w:tblPrEx>
+          <w:tblCellMar>
+            <w:top w:w="0" w:type="dxa"/>
+            <w:bottom w:w="0" w:type="dxa"/>
+          </w:tblCellMar>
+        </w:tblPrEx>
+        <w:trPr>
+          <w:cantSplit/>
+        </w:trPr>
+        <w:tc>
+          <w:tcPr>
+            <w:tcW w:w="3120" w:type="dxa"/>
+            <w:tcBorders>
+              <w:top w:val="single" w:sz="4" w:space="0" w:color="C9CFD6"/>
+              <w:left w:val="single" w:sz="4" w:space="0" w:color="C9CFD6"/>
+              <w:bottom w:val="single" w:sz="4" w:space="0" w:color="C9CFD6"/>
+              <w:right w:val="single" w:sz="4" w:space="0" w:color="C9CFD6"/>
+            </w:tcBorders>
+            <w:tcMar>
+              <w:top w:w="80" w:type="dxa"/>
+              <w:left w:w="120" w:type="dxa"/>
+              <w:bottom w:w="80" w:type="dxa"/>
+              <w:right w:w="120" w:type="dxa"/>
+            </w:tcMar>
+          </w:tcPr>
+          <w:p>
+            <w:r>
+              <w:rPr>
+                <w:b/>
+                <w:bCs/>
+              </w:rPr>
+              <w:t>1.0</w:t>
+            </w:r>
+          </w:p>
+        </w:tc>
+        <w:tc>
+          <w:tcPr>
+            <w:tcW w:w="3120" w:type="dxa"/>
+            <w:tcBorders>
+              <w:top w:val="single" w:sz="4" w:space="0" w:color="C9CFD6"/>
+              <w:left w:val="single" w:sz="4" w:space="0" w:color="C9CFD6"/>
+              <w:bottom w:val="single" w:sz="4" w:space="0" w:color="C9CFD6"/>
+              <w:right w:val="single" w:sz="4" w:space="0" w:color="C9CFD6"/>
+            </w:tcBorders>
+            <w:tcMar>
+              <w:top w:w="80" w:type="dxa"/>
+              <w:left w:w="120" w:type="dxa"/>
+              <w:bottom w:w="80" w:type="dxa"/>
+              <w:right w:w="120" w:type="dxa"/>
+            </w:tcMar>
+          </w:tcPr>
+          <w:p>
+            <w:r>
+              <w:t>September 28, 2026</w:t>
+            </w:r>
+          </w:p>
+        </w:tc>
+        <w:tc>
+          <w:tcPr>
+            <w:tcW w:w="3120" w:type="dxa"/>
+            <w:tcBorders>
+              <w:top w:val="single" w:sz="4" w:space="0" w:color="C9CFD6"/>
+              <w:left w:val="single" w:sz="4" w:space="0" w:color="C9CFD6"/>
+              <w:bottom w:val="single" w:sz="4" w:space="0" w:color="C9CFD6"/>
+              <w:right w:val="single" w:sz="4" w:space="0" w:color="C9CFD6"/>
+            </w:tcBorders>
+            <w:tcMar>
+              <w:top w:w="80" w:type="dxa"/>
+              <w:left w:w="120" w:type="dxa"/>
+              <w:bottom w:w="80" w:type="dxa"/>
+              <w:right w:w="120" w:type="dxa"/>
+            </w:tcMar>
+          </w:tcPr>
+          <w:p>
+            <w:r>
               <w:t>First edition.</w:t>
             </w:r>
           </w:p>
@@ -10847,7 +11390,7 @@
         <w:sz w:val="18"/>
         <w:szCs w:val="18"/>
       </w:rPr>
-      <w:t xml:space="preserve">Concept Autobody  ·  Version 2.0  ·  Page </w:t>
+      <w:t xml:space="preserve">Concept Autobody  ·  Version 2.1  ·  Page </w:t>
     </w:r>
     <w:r>
       <w:rPr>
@@ -10940,10 +11483,64 @@
 <file path=word/numbering.xml><?xml version="1.0" encoding="utf-8"?>
 <w:numbering xmlns:wpc="http://schemas.microsoft.com/office/word/2010/wordprocessingCanvas" xmlns:cx="http://schemas.microsoft.com/office/drawing/2014/chartex" xmlns:cx1="http://schemas.microsoft.com/office/drawing/2015/9/8/chartex" xmlns:cx2="http://schemas.microsoft.com/office/drawing/2015/10/21/chartex" xmlns:cx3="http://schemas.microsoft.com/office/drawing/2016/5/9/chartex" xmlns:cx4="http://schemas.microsoft.com/office/drawing/2016/5/10/chartex" xmlns:cx5="http://schemas.microsoft.com/office/drawing/2016/5/11/chartex" xmlns:cx6="http://schemas.microsoft.com/office/drawing/2016/5/12/chartex" xmlns:cx7="http://schemas.microsoft.com/office/drawing/2016/5/13/chartex" xmlns:cx8="http://schemas.microsoft.com/office/drawing/2016/5/14/chartex" xmlns:mc="http://schemas.openxmlformats.org/markup-compatibility/2006" xmlns:aink="http://schemas.microsoft.com/office/drawing/2016/ink" xmlns:am3d="http://schemas.microsoft.com/office/drawing/2017/model3d" xmlns:o="urn:schemas-microsoft-com:office:office" xmlns:oel="http://schemas.microsoft.com/office/2019/extlst" xmlns:r="http://schemas.openxmlformats.org/officeDocument/2006/relationships" xmlns:m="http://schemas.openxmlformats.org/officeDocument/2006/math" xmlns:v="urn:schemas-microsoft-com:vml" xmlns:wp14="http://schemas.microsoft.com/office/word/2010/wordprocessingDrawing" xmlns:wp="http://schemas.openxmlformats.org/drawingml/2006/wordprocessingDrawing" xmlns:w10="urn:schemas-microsoft-com:office:word" xmlns:w="http://schemas.openxmlformats.org/wordprocessingml/2006/main" xmlns:w14="http://schemas.microsoft.com/office/word/2010/wordml" xmlns:w15="http://schemas.microsoft.com/office/word/2012/wordml" xmlns:w16cex="http://schemas.microsoft.com/office/word/2018/wordml/cex" xmlns:w16cid="http://schemas.microsoft.com/office/word/2016/wordml/cid" xmlns:w16="http://schemas.microsoft.com/office/word/2018/wordml" xmlns:w16du="http://schemas.microsoft.com/office/word/2023/wordml/word16du" xmlns:w16sdtdh="http://schemas.microsoft.com/office/word/2020/wordml/sdtdatahash" xmlns:w16sdtfl="http://schemas.microsoft.com/office/word/2024/wordml/sdtformatlock" xmlns:w16se="http://schemas.microsoft.com/office/word/2015/wordml/symex" xmlns:wpg="http://schemas.microsoft.com/office/word/2010/wordprocessingGroup" xmlns:wpi="http://schemas.microsoft.com/office/word/2010/wordprocessingInk" xmlns:wne="http://schemas.microsoft.com/office/word/2006/wordml" xmlns:wps="http://schemas.microsoft.com/office/word/2010/wordprocessingShape" mc:Ignorable="w14 w15 w16se w16cid w16 w16cex w16sdtdh w16sdtfl w16du wp14">
   <w:abstractNum w:abstractNumId="0" w15:restartNumberingAfterBreak="0">
-    <w:nsid w:val="097919B6"/>
+    <w:nsid w:val="1F1B035C"/>
     <w:multiLevelType w:val="hybridMultilevel"/>
-    <w:tmpl w:val="1FDED014"/>
-    <w:lvl w:ilvl="0" w:tplc="4E548058">
+    <w:tmpl w:val="313A0138"/>
+    <w:lvl w:ilvl="0" w:tplc="23E8DF2A">
+      <w:start w:val="1"/>
+      <w:numFmt w:val="bullet"/>
+      <w:lvlText w:val="•"/>
+      <w:lvlJc w:val="left"/>
+      <w:pPr>
+        <w:ind w:left="540" w:hanging="270"/>
+      </w:pPr>
+    </w:lvl>
+    <w:lvl w:ilvl="1" w:tplc="E982CD38">
+      <w:numFmt w:val="decimal"/>
+      <w:lvlText w:val=""/>
+      <w:lvlJc w:val="left"/>
+    </w:lvl>
+    <w:lvl w:ilvl="2" w:tplc="599C18E2">
+      <w:numFmt w:val="decimal"/>
+      <w:lvlText w:val=""/>
+      <w:lvlJc w:val="left"/>
+    </w:lvl>
+    <w:lvl w:ilvl="3" w:tplc="00B0B580">
+      <w:numFmt w:val="decimal"/>
+      <w:lvlText w:val=""/>
+      <w:lvlJc w:val="left"/>
+    </w:lvl>
+    <w:lvl w:ilvl="4" w:tplc="A59A7684">
+      <w:numFmt w:val="decimal"/>
+      <w:lvlText w:val=""/>
+      <w:lvlJc w:val="left"/>
+    </w:lvl>
+    <w:lvl w:ilvl="5" w:tplc="45761014">
+      <w:numFmt w:val="decimal"/>
+      <w:lvlText w:val=""/>
+      <w:lvlJc w:val="left"/>
+    </w:lvl>
+    <w:lvl w:ilvl="6" w:tplc="23CCBAD0">
+      <w:numFmt w:val="decimal"/>
+      <w:lvlText w:val=""/>
+      <w:lvlJc w:val="left"/>
+    </w:lvl>
+    <w:lvl w:ilvl="7" w:tplc="2EC22806">
+      <w:numFmt w:val="decimal"/>
+      <w:lvlText w:val=""/>
+      <w:lvlJc w:val="left"/>
+    </w:lvl>
+    <w:lvl w:ilvl="8" w:tplc="B79A304C">
+      <w:numFmt w:val="decimal"/>
+      <w:lvlText w:val=""/>
+      <w:lvlJc w:val="left"/>
+    </w:lvl>
+  </w:abstractNum>
+  <w:abstractNum w:abstractNumId="1" w15:restartNumberingAfterBreak="0">
+    <w:nsid w:val="24C307F9"/>
+    <w:multiLevelType w:val="hybridMultilevel"/>
+    <w:tmpl w:val="29C2559C"/>
+    <w:lvl w:ilvl="0" w:tplc="CC0ED220">
       <w:start w:val="1"/>
       <w:numFmt w:val="decimal"/>
       <w:lvlText w:val="%1."/>
@@ -10957,106 +11554,52 @@
         <w:color w:val="E8620E"/>
       </w:rPr>
     </w:lvl>
-    <w:lvl w:ilvl="1" w:tplc="38F69A0E">
+    <w:lvl w:ilvl="1" w:tplc="992E2546">
       <w:numFmt w:val="decimal"/>
       <w:lvlText w:val=""/>
       <w:lvlJc w:val="left"/>
     </w:lvl>
-    <w:lvl w:ilvl="2" w:tplc="B49A105A">
+    <w:lvl w:ilvl="2" w:tplc="6DA24FC8">
       <w:numFmt w:val="decimal"/>
       <w:lvlText w:val=""/>
       <w:lvlJc w:val="left"/>
     </w:lvl>
-    <w:lvl w:ilvl="3" w:tplc="BE10FE64">
+    <w:lvl w:ilvl="3" w:tplc="024468DA">
       <w:numFmt w:val="decimal"/>
       <w:lvlText w:val=""/>
       <w:lvlJc w:val="left"/>
     </w:lvl>
-    <w:lvl w:ilvl="4" w:tplc="E272D84E">
+    <w:lvl w:ilvl="4" w:tplc="FFA4C62C">
       <w:numFmt w:val="decimal"/>
       <w:lvlText w:val=""/>
       <w:lvlJc w:val="left"/>
     </w:lvl>
-    <w:lvl w:ilvl="5" w:tplc="C0340354">
+    <w:lvl w:ilvl="5" w:tplc="3E107650">
       <w:numFmt w:val="decimal"/>
       <w:lvlText w:val=""/>
       <w:lvlJc w:val="left"/>
     </w:lvl>
-    <w:lvl w:ilvl="6" w:tplc="E4CC1B90">
+    <w:lvl w:ilvl="6" w:tplc="773489DA">
       <w:numFmt w:val="decimal"/>
       <w:lvlText w:val=""/>
       <w:lvlJc w:val="left"/>
     </w:lvl>
-    <w:lvl w:ilvl="7" w:tplc="AC6AE3B4">
+    <w:lvl w:ilvl="7" w:tplc="10AA98D8">
       <w:numFmt w:val="decimal"/>
       <w:lvlText w:val=""/>
       <w:lvlJc w:val="left"/>
     </w:lvl>
-    <w:lvl w:ilvl="8" w:tplc="29E6D06C">
-      <w:numFmt w:val="decimal"/>
-      <w:lvlText w:val=""/>
-      <w:lvlJc w:val="left"/>
-    </w:lvl>
-  </w:abstractNum>
-  <w:abstractNum w:abstractNumId="1" w15:restartNumberingAfterBreak="0">
-    <w:nsid w:val="459058D3"/>
-    <w:multiLevelType w:val="hybridMultilevel"/>
-    <w:tmpl w:val="AA6A2416"/>
-    <w:lvl w:ilvl="0" w:tplc="C7129F0C">
-      <w:start w:val="1"/>
-      <w:numFmt w:val="bullet"/>
-      <w:lvlText w:val="•"/>
-      <w:lvlJc w:val="left"/>
-      <w:pPr>
-        <w:ind w:left="540" w:hanging="270"/>
-      </w:pPr>
-    </w:lvl>
-    <w:lvl w:ilvl="1" w:tplc="0CF6A102">
-      <w:numFmt w:val="decimal"/>
-      <w:lvlText w:val=""/>
-      <w:lvlJc w:val="left"/>
-    </w:lvl>
-    <w:lvl w:ilvl="2" w:tplc="47E21EEC">
-      <w:numFmt w:val="decimal"/>
-      <w:lvlText w:val=""/>
-      <w:lvlJc w:val="left"/>
-    </w:lvl>
-    <w:lvl w:ilvl="3" w:tplc="B91857FA">
-      <w:numFmt w:val="decimal"/>
-      <w:lvlText w:val=""/>
-      <w:lvlJc w:val="left"/>
-    </w:lvl>
-    <w:lvl w:ilvl="4" w:tplc="74D80990">
-      <w:numFmt w:val="decimal"/>
-      <w:lvlText w:val=""/>
-      <w:lvlJc w:val="left"/>
-    </w:lvl>
-    <w:lvl w:ilvl="5" w:tplc="27CC09E8">
-      <w:numFmt w:val="decimal"/>
-      <w:lvlText w:val=""/>
-      <w:lvlJc w:val="left"/>
-    </w:lvl>
-    <w:lvl w:ilvl="6" w:tplc="8DB27892">
-      <w:numFmt w:val="decimal"/>
-      <w:lvlText w:val=""/>
-      <w:lvlJc w:val="left"/>
-    </w:lvl>
-    <w:lvl w:ilvl="7" w:tplc="E0DAB5FE">
-      <w:numFmt w:val="decimal"/>
-      <w:lvlText w:val=""/>
-      <w:lvlJc w:val="left"/>
-    </w:lvl>
-    <w:lvl w:ilvl="8" w:tplc="3F564BE4">
+    <w:lvl w:ilvl="8" w:tplc="22D6F37A">
       <w:numFmt w:val="decimal"/>
       <w:lvlText w:val=""/>
       <w:lvlJc w:val="left"/>
     </w:lvl>
   </w:abstractNum>
   <w:abstractNum w:abstractNumId="2" w15:restartNumberingAfterBreak="0">
-    <w:nsid w:val="6CCE7A5E"/>
+    <w:nsid w:val="597D5447"/>
     <w:multiLevelType w:val="hybridMultilevel"/>
-    <w:tmpl w:val="06646A70"/>
-    <w:lvl w:ilvl="0" w:tplc="B6882134" w:tentative="1">
+    <w:tmpl w:val="50A89D66"/>
+    <w:lvl w:ilvl="0" w:tplc="BBBA569C" w:tentative="1">
       <w:start w:val="1"/>
       <w:numFmt w:val="bullet"/>
       <w:lvlText w:val="●"/>
@@ -11065,7 +11608,7 @@
         <w:ind w:left="720" w:hanging="360"/>
       </w:pPr>
     </w:lvl>
-    <w:lvl w:ilvl="1" w:tplc="3A148406" w:tentative="1">
+    <w:lvl w:ilvl="1" w:tplc="EF94BEB8" w:tentative="1">
       <w:start w:val="1"/>
       <w:numFmt w:val="bullet"/>
       <w:lvlText w:val="○"/>
@@ -11074,7 +11617,7 @@
         <w:ind w:left="1440" w:hanging="360"/>
       </w:pPr>
     </w:lvl>
-    <w:lvl w:ilvl="2" w:tplc="66125130" w:tentative="1">
+    <w:lvl w:ilvl="2" w:tplc="320C69EC" w:tentative="1">
       <w:start w:val="1"/>
       <w:numFmt w:val="bullet"/>
       <w:lvlText w:val="■"/>
@@ -11083,7 +11626,7 @@
         <w:ind w:left="2160" w:hanging="360"/>
       </w:pPr>
     </w:lvl>
-    <w:lvl w:ilvl="3" w:tplc="080CEDCA" w:tentative="1">
+    <w:lvl w:ilvl="3" w:tplc="172A2610" w:tentative="1">
       <w:start w:val="1"/>
       <w:numFmt w:val="bullet"/>
       <w:lvlText w:val="●"/>
@@ -11092,7 +11635,7 @@
         <w:ind w:left="2880" w:hanging="360"/>
       </w:pPr>
     </w:lvl>
-    <w:lvl w:ilvl="4" w:tplc="E5185814" w:tentative="1">
+    <w:lvl w:ilvl="4" w:tplc="7FF66C52" w:tentative="1">
       <w:start w:val="1"/>
       <w:numFmt w:val="bullet"/>
       <w:lvlText w:val="○"/>
@@ -11101,7 +11644,7 @@
         <w:ind w:left="3600" w:hanging="360"/>
       </w:pPr>
     </w:lvl>
-    <w:lvl w:ilvl="5" w:tplc="582C2C34" w:tentative="1">
+    <w:lvl w:ilvl="5" w:tplc="26BAFA96" w:tentative="1">
       <w:start w:val="1"/>
       <w:numFmt w:val="bullet"/>
       <w:lvlText w:val="■"/>
@@ -11110,7 +11653,7 @@
         <w:ind w:left="4320" w:hanging="360"/>
       </w:pPr>
     </w:lvl>
-    <w:lvl w:ilvl="6" w:tplc="16DEBF66" w:tentative="1">
+    <w:lvl w:ilvl="6" w:tplc="FE34C2B8" w:tentative="1">
       <w:start w:val="1"/>
       <w:numFmt w:val="bullet"/>
       <w:lvlText w:val="●"/>
@@ -11119,7 +11662,7 @@
         <w:ind w:left="5040" w:hanging="360"/>
       </w:pPr>
     </w:lvl>
-    <w:lvl w:ilvl="7" w:tplc="30F2269A" w:tentative="1">
+    <w:lvl w:ilvl="7" w:tplc="ACF4AD6A" w:tentative="1">
       <w:start w:val="1"/>
       <w:numFmt w:val="bullet"/>
       <w:lvlText w:val="●"/>
@@ -11128,7 +11671,7 @@
         <w:ind w:left="5760" w:hanging="360"/>
       </w:pPr>
     </w:lvl>
-    <w:lvl w:ilvl="8" w:tplc="5844A7A4" w:tentative="1">
+    <w:lvl w:ilvl="8" w:tplc="5F84E2E4" w:tentative="1">
       <w:start w:val="1"/>
       <w:numFmt w:val="bullet"/>
       <w:lvlText w:val="●"/>
@@ -11138,80 +11681,92 @@
       </w:pPr>
     </w:lvl>
   </w:abstractNum>
-  <w:num w:numId="1" w16cid:durableId="238566942">
+  <w:num w:numId="1" w16cid:durableId="391971919">
     <w:abstractNumId w:val="2"/>
     <w:lvlOverride w:ilvl="0">
       <w:startOverride w:val="1"/>
     </w:lvlOverride>
   </w:num>
-  <w:num w:numId="2" w16cid:durableId="1774934163">
+  <w:num w:numId="2" w16cid:durableId="749541668">
+    <w:abstractNumId w:val="0"/>
+    <w:lvlOverride w:ilvl="0">
+      <w:startOverride w:val="1"/>
+    </w:lvlOverride>
+  </w:num>
+  <w:num w:numId="3" w16cid:durableId="1437480542">
     <w:abstractNumId w:val="1"/>
     <w:lvlOverride w:ilvl="0">
       <w:startOverride w:val="1"/>
     </w:lvlOverride>
   </w:num>
-  <w:num w:numId="3" w16cid:durableId="764158105">
-    <w:abstractNumId w:val="0"/>
+  <w:num w:numId="4" w16cid:durableId="1600677636">
+    <w:abstractNumId w:val="1"/>
     <w:lvlOverride w:ilvl="0">
       <w:startOverride w:val="1"/>
     </w:lvlOverride>
   </w:num>
-  <w:num w:numId="4" w16cid:durableId="814644756">
-    <w:abstractNumId w:val="0"/>
+  <w:num w:numId="5" w16cid:durableId="1702976223">
+    <w:abstractNumId w:val="1"/>
     <w:lvlOverride w:ilvl="0">
       <w:startOverride w:val="1"/>
     </w:lvlOverride>
   </w:num>
-  <w:num w:numId="5" w16cid:durableId="722875417">
-    <w:abstractNumId w:val="0"/>
+  <w:num w:numId="6" w16cid:durableId="1277835395">
+    <w:abstractNumId w:val="1"/>
     <w:lvlOverride w:ilvl="0">
       <w:startOverride w:val="1"/>
     </w:lvlOverride>
   </w:num>
-  <w:num w:numId="6" w16cid:durableId="668871021">
-    <w:abstractNumId w:val="0"/>
+  <w:num w:numId="7" w16cid:durableId="1751149166">
+    <w:abstractNumId w:val="1"/>
     <w:lvlOverride w:ilvl="0">
       <w:startOverride w:val="1"/>
     </w:lvlOverride>
   </w:num>
-  <w:num w:numId="7" w16cid:durableId="1645623227">
-    <w:abstractNumId w:val="0"/>
+  <w:num w:numId="8" w16cid:durableId="1213421822">
+    <w:abstractNumId w:val="1"/>
     <w:lvlOverride w:ilvl="0">
       <w:startOverride w:val="1"/>
     </w:lvlOverride>
   </w:num>
-  <w:num w:numId="8" w16cid:durableId="1688872946">
-    <w:abstractNumId w:val="0"/>
+  <w:num w:numId="9" w16cid:durableId="971330162">
+    <w:abstractNumId w:val="1"/>
     <w:lvlOverride w:ilvl="0">
       <w:startOverride w:val="1"/>
     </w:lvlOverride>
   </w:num>
-  <w:num w:numId="9" w16cid:durableId="820079038">
-    <w:abstractNumId w:val="0"/>
+  <w:num w:numId="10" w16cid:durableId="719552117">
+    <w:abstractNumId w:val="1"/>
     <w:lvlOverride w:ilvl="0">
       <w:startOverride w:val="1"/>
     </w:lvlOverride>
   </w:num>
-  <w:num w:numId="10" w16cid:durableId="1983071553">
-    <w:abstractNumId w:val="0"/>
+  <w:num w:numId="11" w16cid:durableId="1607081732">
+    <w:abstractNumId w:val="1"/>
     <w:lvlOverride w:ilvl="0">
       <w:startOverride w:val="1"/>
     </w:lvlOverride>
   </w:num>
-  <w:num w:numId="11" w16cid:durableId="566380236">
-    <w:abstractNumId w:val="0"/>
+  <w:num w:numId="12" w16cid:durableId="1968314427">
+    <w:abstractNumId w:val="1"/>
     <w:lvlOverride w:ilvl="0">
       <w:startOverride w:val="1"/>
     </w:lvlOverride>
   </w:num>
-  <w:num w:numId="12" w16cid:durableId="1904027427">
-    <w:abstractNumId w:val="0"/>
+  <w:num w:numId="13" w16cid:durableId="1715499374">
+    <w:abstractNumId w:val="1"/>
     <w:lvlOverride w:ilvl="0">
       <w:startOverride w:val="1"/>
     </w:lvlOverride>
   </w:num>
-  <w:num w:numId="13" w16cid:durableId="871110368">
-    <w:abstractNumId w:val="0"/>
+  <w:num w:numId="14" w16cid:durableId="1373726809">
+    <w:abstractNumId w:val="1"/>
+    <w:lvlOverride w:ilvl="0">
+      <w:startOverride w:val="1"/>
+    </w:lvlOverride>
+  </w:num>
+  <w:num w:numId="15" w16cid:durableId="483622657">
+    <w:abstractNumId w:val="1"/>
     <w:lvlOverride w:ilvl="0">
       <w:startOverride w:val="1"/>
     </w:lvlOverride>
@@ -11863,7 +12418,7 @@
     <w:autoRedefine/>
     <w:uiPriority w:val="39"/>
     <w:unhideWhenUsed/>
-    <w:rsid w:val="003D0965"/>
+    <w:rsid w:val="0083545F"/>
     <w:pPr>
       <w:spacing w:after="100"/>
     </w:pPr>
@@ -11875,7 +12430,7 @@
     <w:autoRedefine/>
     <w:uiPriority w:val="39"/>
     <w:unhideWhenUsed/>
-    <w:rsid w:val="003D0965"/>
+    <w:rsid w:val="0083545F"/>
     <w:pPr>
       <w:spacing w:after="100"/>
       <w:ind w:left="220"/>

</xml_diff>

<commit_message>
Shop touch board: press-and-hold drag onto a stage column (finger or mouse), edge scrolling; manual v2.2
Co-Authored-By: Claude Opus 5.5 <noreply@anthropic.com>
</commit_message>
<xml_diff>
--- a/client/manual/ShopControl-User-Manual.docx
+++ b/client/manual/ShopControl-User-Manual.docx
@@ -16,7 +16,7 @@
           <w:noProof/>
         </w:rPr>
         <w:drawing>
-          <wp:inline distT="0" distB="0" distL="0" distR="0" wp14:anchorId="696B6FF5" wp14:editId="696B6FF6">
+          <wp:inline distT="0" distB="0" distL="0" distR="0" wp14:anchorId="4A6FA19F" wp14:editId="4A6FA1A0">
             <wp:extent cx="4000500" cy="1485900"/>
             <wp:effectExtent l="0" t="0" r="0" b="0"/>
             <wp:docPr id="1" name="Picture 1"/>
@@ -93,7 +93,7 @@
         <w:rPr>
           <w:color w:val="5B6776"/>
         </w:rPr>
-        <w:t>Version 2.1  ·  Updated September 28, 2026</w:t>
+        <w:t>Version 2.2  ·  Updated September 28, 2026</w:t>
       </w:r>
     </w:p>
     <w:p>
@@ -122,7 +122,7 @@
     <w:sdt>
       <w:sdtPr>
         <w:alias w:val="Contents"/>
-        <w:id w:val="-43140319"/>
+        <w:id w:val="126753679"/>
       </w:sdtPr>
       <w:sdtEndPr/>
       <w:sdtContent>
@@ -151,7 +151,7 @@
           <w:r>
             <w:fldChar w:fldCharType="separate"/>
           </w:r>
-          <w:hyperlink w:anchor="_Toc241663414" w:history="1">
+          <w:hyperlink w:anchor="_Toc241663918" w:history="1">
             <w:r>
               <w:rPr>
                 <w:rStyle w:val="Hyperlink"/>
@@ -175,7 +175,7 @@
               <w:rPr>
                 <w:noProof/>
               </w:rPr>
-              <w:instrText xml:space="preserve"> PAGEREF _Toc241663414 \h </w:instrText>
+              <w:instrText xml:space="preserve"> PAGEREF _Toc241663918 \h </w:instrText>
             </w:r>
             <w:r>
               <w:rPr>
@@ -218,7 +218,7 @@
               <w14:ligatures w14:val="standardContextual"/>
             </w:rPr>
           </w:pPr>
-          <w:hyperlink w:anchor="_Toc241663415" w:history="1">
+          <w:hyperlink w:anchor="_Toc241663919" w:history="1">
             <w:r>
               <w:rPr>
                 <w:rStyle w:val="Hyperlink"/>
@@ -242,7 +242,7 @@
               <w:rPr>
                 <w:noProof/>
               </w:rPr>
-              <w:instrText xml:space="preserve"> PAGEREF _Toc241663415 \h </w:instrText>
+              <w:instrText xml:space="preserve"> PAGEREF _Toc241663919 \h </w:instrText>
             </w:r>
             <w:r>
               <w:rPr>
@@ -285,7 +285,7 @@
               <w14:ligatures w14:val="standardContextual"/>
             </w:rPr>
           </w:pPr>
-          <w:hyperlink w:anchor="_Toc241663416" w:history="1">
+          <w:hyperlink w:anchor="_Toc241663920" w:history="1">
             <w:r>
               <w:rPr>
                 <w:rStyle w:val="Hyperlink"/>
@@ -309,7 +309,7 @@
               <w:rPr>
                 <w:noProof/>
               </w:rPr>
-              <w:instrText xml:space="preserve"> PAGEREF _Toc241663416 \h </w:instrText>
+              <w:instrText xml:space="preserve"> PAGEREF _Toc241663920 \h </w:instrText>
             </w:r>
             <w:r>
               <w:rPr>
@@ -352,7 +352,7 @@
               <w14:ligatures w14:val="standardContextual"/>
             </w:rPr>
           </w:pPr>
-          <w:hyperlink w:anchor="_Toc241663417" w:history="1">
+          <w:hyperlink w:anchor="_Toc241663921" w:history="1">
             <w:r>
               <w:rPr>
                 <w:rStyle w:val="Hyperlink"/>
@@ -376,7 +376,7 @@
               <w:rPr>
                 <w:noProof/>
               </w:rPr>
-              <w:instrText xml:space="preserve"> PAGEREF _Toc241663417 \h </w:instrText>
+              <w:instrText xml:space="preserve"> PAGEREF _Toc241663921 \h </w:instrText>
             </w:r>
             <w:r>
               <w:rPr>
@@ -419,7 +419,7 @@
               <w14:ligatures w14:val="standardContextual"/>
             </w:rPr>
           </w:pPr>
-          <w:hyperlink w:anchor="_Toc241663418" w:history="1">
+          <w:hyperlink w:anchor="_Toc241663922" w:history="1">
             <w:r>
               <w:rPr>
                 <w:rStyle w:val="Hyperlink"/>
@@ -443,7 +443,7 @@
               <w:rPr>
                 <w:noProof/>
               </w:rPr>
-              <w:instrText xml:space="preserve"> PAGEREF _Toc241663418 \h </w:instrText>
+              <w:instrText xml:space="preserve"> PAGEREF _Toc241663922 \h </w:instrText>
             </w:r>
             <w:r>
               <w:rPr>
@@ -486,7 +486,7 @@
               <w14:ligatures w14:val="standardContextual"/>
             </w:rPr>
           </w:pPr>
-          <w:hyperlink w:anchor="_Toc241663419" w:history="1">
+          <w:hyperlink w:anchor="_Toc241663923" w:history="1">
             <w:r>
               <w:rPr>
                 <w:rStyle w:val="Hyperlink"/>
@@ -510,7 +510,7 @@
               <w:rPr>
                 <w:noProof/>
               </w:rPr>
-              <w:instrText xml:space="preserve"> PAGEREF _Toc241663419 \h </w:instrText>
+              <w:instrText xml:space="preserve"> PAGEREF _Toc241663923 \h </w:instrText>
             </w:r>
             <w:r>
               <w:rPr>
@@ -553,7 +553,7 @@
               <w14:ligatures w14:val="standardContextual"/>
             </w:rPr>
           </w:pPr>
-          <w:hyperlink w:anchor="_Toc241663420" w:history="1">
+          <w:hyperlink w:anchor="_Toc241663924" w:history="1">
             <w:r>
               <w:rPr>
                 <w:rStyle w:val="Hyperlink"/>
@@ -577,7 +577,7 @@
               <w:rPr>
                 <w:noProof/>
               </w:rPr>
-              <w:instrText xml:space="preserve"> PAGEREF _Toc241663420 \h </w:instrText>
+              <w:instrText xml:space="preserve"> PAGEREF _Toc241663924 \h </w:instrText>
             </w:r>
             <w:r>
               <w:rPr>
@@ -620,7 +620,7 @@
               <w14:ligatures w14:val="standardContextual"/>
             </w:rPr>
           </w:pPr>
-          <w:hyperlink w:anchor="_Toc241663421" w:history="1">
+          <w:hyperlink w:anchor="_Toc241663925" w:history="1">
             <w:r>
               <w:rPr>
                 <w:rStyle w:val="Hyperlink"/>
@@ -644,7 +644,7 @@
               <w:rPr>
                 <w:noProof/>
               </w:rPr>
-              <w:instrText xml:space="preserve"> PAGEREF _Toc241663421 \h </w:instrText>
+              <w:instrText xml:space="preserve"> PAGEREF _Toc241663925 \h </w:instrText>
             </w:r>
             <w:r>
               <w:rPr>
@@ -687,7 +687,7 @@
               <w14:ligatures w14:val="standardContextual"/>
             </w:rPr>
           </w:pPr>
-          <w:hyperlink w:anchor="_Toc241663422" w:history="1">
+          <w:hyperlink w:anchor="_Toc241663926" w:history="1">
             <w:r>
               <w:rPr>
                 <w:rStyle w:val="Hyperlink"/>
@@ -711,7 +711,7 @@
               <w:rPr>
                 <w:noProof/>
               </w:rPr>
-              <w:instrText xml:space="preserve"> PAGEREF _Toc241663422 \h </w:instrText>
+              <w:instrText xml:space="preserve"> PAGEREF _Toc241663926 \h </w:instrText>
             </w:r>
             <w:r>
               <w:rPr>
@@ -754,7 +754,7 @@
               <w14:ligatures w14:val="standardContextual"/>
             </w:rPr>
           </w:pPr>
-          <w:hyperlink w:anchor="_Toc241663423" w:history="1">
+          <w:hyperlink w:anchor="_Toc241663927" w:history="1">
             <w:r>
               <w:rPr>
                 <w:rStyle w:val="Hyperlink"/>
@@ -778,7 +778,7 @@
               <w:rPr>
                 <w:noProof/>
               </w:rPr>
-              <w:instrText xml:space="preserve"> PAGEREF _Toc241663423 \h </w:instrText>
+              <w:instrText xml:space="preserve"> PAGEREF _Toc241663927 \h </w:instrText>
             </w:r>
             <w:r>
               <w:rPr>
@@ -821,7 +821,7 @@
               <w14:ligatures w14:val="standardContextual"/>
             </w:rPr>
           </w:pPr>
-          <w:hyperlink w:anchor="_Toc241663424" w:history="1">
+          <w:hyperlink w:anchor="_Toc241663928" w:history="1">
             <w:r>
               <w:rPr>
                 <w:rStyle w:val="Hyperlink"/>
@@ -845,7 +845,7 @@
               <w:rPr>
                 <w:noProof/>
               </w:rPr>
-              <w:instrText xml:space="preserve"> PAGEREF _Toc241663424 \h </w:instrText>
+              <w:instrText xml:space="preserve"> PAGEREF _Toc241663928 \h </w:instrText>
             </w:r>
             <w:r>
               <w:rPr>
@@ -888,7 +888,7 @@
               <w14:ligatures w14:val="standardContextual"/>
             </w:rPr>
           </w:pPr>
-          <w:hyperlink w:anchor="_Toc241663425" w:history="1">
+          <w:hyperlink w:anchor="_Toc241663929" w:history="1">
             <w:r>
               <w:rPr>
                 <w:rStyle w:val="Hyperlink"/>
@@ -912,7 +912,7 @@
               <w:rPr>
                 <w:noProof/>
               </w:rPr>
-              <w:instrText xml:space="preserve"> PAGEREF _Toc241663425 \h </w:instrText>
+              <w:instrText xml:space="preserve"> PAGEREF _Toc241663929 \h </w:instrText>
             </w:r>
             <w:r>
               <w:rPr>
@@ -955,7 +955,7 @@
               <w14:ligatures w14:val="standardContextual"/>
             </w:rPr>
           </w:pPr>
-          <w:hyperlink w:anchor="_Toc241663426" w:history="1">
+          <w:hyperlink w:anchor="_Toc241663930" w:history="1">
             <w:r>
               <w:rPr>
                 <w:rStyle w:val="Hyperlink"/>
@@ -979,7 +979,7 @@
               <w:rPr>
                 <w:noProof/>
               </w:rPr>
-              <w:instrText xml:space="preserve"> PAGEREF _Toc241663426 \h </w:instrText>
+              <w:instrText xml:space="preserve"> PAGEREF _Toc241663930 \h </w:instrText>
             </w:r>
             <w:r>
               <w:rPr>
@@ -1022,7 +1022,7 @@
               <w14:ligatures w14:val="standardContextual"/>
             </w:rPr>
           </w:pPr>
-          <w:hyperlink w:anchor="_Toc241663427" w:history="1">
+          <w:hyperlink w:anchor="_Toc241663931" w:history="1">
             <w:r>
               <w:rPr>
                 <w:rStyle w:val="Hyperlink"/>
@@ -1046,7 +1046,7 @@
               <w:rPr>
                 <w:noProof/>
               </w:rPr>
-              <w:instrText xml:space="preserve"> PAGEREF _Toc241663427 \h </w:instrText>
+              <w:instrText xml:space="preserve"> PAGEREF _Toc241663931 \h </w:instrText>
             </w:r>
             <w:r>
               <w:rPr>
@@ -1089,7 +1089,7 @@
               <w14:ligatures w14:val="standardContextual"/>
             </w:rPr>
           </w:pPr>
-          <w:hyperlink w:anchor="_Toc241663428" w:history="1">
+          <w:hyperlink w:anchor="_Toc241663932" w:history="1">
             <w:r>
               <w:rPr>
                 <w:rStyle w:val="Hyperlink"/>
@@ -1113,7 +1113,7 @@
               <w:rPr>
                 <w:noProof/>
               </w:rPr>
-              <w:instrText xml:space="preserve"> PAGEREF _Toc241663428 \h </w:instrText>
+              <w:instrText xml:space="preserve"> PAGEREF _Toc241663932 \h </w:instrText>
             </w:r>
             <w:r>
               <w:rPr>
@@ -1156,7 +1156,7 @@
               <w14:ligatures w14:val="standardContextual"/>
             </w:rPr>
           </w:pPr>
-          <w:hyperlink w:anchor="_Toc241663429" w:history="1">
+          <w:hyperlink w:anchor="_Toc241663933" w:history="1">
             <w:r>
               <w:rPr>
                 <w:rStyle w:val="Hyperlink"/>
@@ -1180,7 +1180,7 @@
               <w:rPr>
                 <w:noProof/>
               </w:rPr>
-              <w:instrText xml:space="preserve"> PAGEREF _Toc241663429 \h </w:instrText>
+              <w:instrText xml:space="preserve"> PAGEREF _Toc241663933 \h </w:instrText>
             </w:r>
             <w:r>
               <w:rPr>
@@ -1223,7 +1223,7 @@
               <w14:ligatures w14:val="standardContextual"/>
             </w:rPr>
           </w:pPr>
-          <w:hyperlink w:anchor="_Toc241663430" w:history="1">
+          <w:hyperlink w:anchor="_Toc241663934" w:history="1">
             <w:r>
               <w:rPr>
                 <w:rStyle w:val="Hyperlink"/>
@@ -1247,7 +1247,7 @@
               <w:rPr>
                 <w:noProof/>
               </w:rPr>
-              <w:instrText xml:space="preserve"> PAGEREF _Toc241663430 \h </w:instrText>
+              <w:instrText xml:space="preserve"> PAGEREF _Toc241663934 \h </w:instrText>
             </w:r>
             <w:r>
               <w:rPr>
@@ -1290,7 +1290,7 @@
               <w14:ligatures w14:val="standardContextual"/>
             </w:rPr>
           </w:pPr>
-          <w:hyperlink w:anchor="_Toc241663431" w:history="1">
+          <w:hyperlink w:anchor="_Toc241663935" w:history="1">
             <w:r>
               <w:rPr>
                 <w:rStyle w:val="Hyperlink"/>
@@ -1314,7 +1314,7 @@
               <w:rPr>
                 <w:noProof/>
               </w:rPr>
-              <w:instrText xml:space="preserve"> PAGEREF _Toc241663431 \h </w:instrText>
+              <w:instrText xml:space="preserve"> PAGEREF _Toc241663935 \h </w:instrText>
             </w:r>
             <w:r>
               <w:rPr>
@@ -1357,7 +1357,7 @@
               <w14:ligatures w14:val="standardContextual"/>
             </w:rPr>
           </w:pPr>
-          <w:hyperlink w:anchor="_Toc241663432" w:history="1">
+          <w:hyperlink w:anchor="_Toc241663936" w:history="1">
             <w:r>
               <w:rPr>
                 <w:rStyle w:val="Hyperlink"/>
@@ -1381,7 +1381,7 @@
               <w:rPr>
                 <w:noProof/>
               </w:rPr>
-              <w:instrText xml:space="preserve"> PAGEREF _Toc241663432 \h </w:instrText>
+              <w:instrText xml:space="preserve"> PAGEREF _Toc241663936 \h </w:instrText>
             </w:r>
             <w:r>
               <w:rPr>
@@ -1424,7 +1424,7 @@
               <w14:ligatures w14:val="standardContextual"/>
             </w:rPr>
           </w:pPr>
-          <w:hyperlink w:anchor="_Toc241663433" w:history="1">
+          <w:hyperlink w:anchor="_Toc241663937" w:history="1">
             <w:r>
               <w:rPr>
                 <w:rStyle w:val="Hyperlink"/>
@@ -1448,7 +1448,7 @@
               <w:rPr>
                 <w:noProof/>
               </w:rPr>
-              <w:instrText xml:space="preserve"> PAGEREF _Toc241663433 \h </w:instrText>
+              <w:instrText xml:space="preserve"> PAGEREF _Toc241663937 \h </w:instrText>
             </w:r>
             <w:r>
               <w:rPr>
@@ -1491,7 +1491,7 @@
               <w14:ligatures w14:val="standardContextual"/>
             </w:rPr>
           </w:pPr>
-          <w:hyperlink w:anchor="_Toc241663434" w:history="1">
+          <w:hyperlink w:anchor="_Toc241663938" w:history="1">
             <w:r>
               <w:rPr>
                 <w:rStyle w:val="Hyperlink"/>
@@ -1515,7 +1515,7 @@
               <w:rPr>
                 <w:noProof/>
               </w:rPr>
-              <w:instrText xml:space="preserve"> PAGEREF _Toc241663434 \h </w:instrText>
+              <w:instrText xml:space="preserve"> PAGEREF _Toc241663938 \h </w:instrText>
             </w:r>
             <w:r>
               <w:rPr>
@@ -1558,7 +1558,7 @@
               <w14:ligatures w14:val="standardContextual"/>
             </w:rPr>
           </w:pPr>
-          <w:hyperlink w:anchor="_Toc241663435" w:history="1">
+          <w:hyperlink w:anchor="_Toc241663939" w:history="1">
             <w:r>
               <w:rPr>
                 <w:rStyle w:val="Hyperlink"/>
@@ -1582,7 +1582,7 @@
               <w:rPr>
                 <w:noProof/>
               </w:rPr>
-              <w:instrText xml:space="preserve"> PAGEREF _Toc241663435 \h </w:instrText>
+              <w:instrText xml:space="preserve"> PAGEREF _Toc241663939 \h </w:instrText>
             </w:r>
             <w:r>
               <w:rPr>
@@ -1625,7 +1625,7 @@
               <w14:ligatures w14:val="standardContextual"/>
             </w:rPr>
           </w:pPr>
-          <w:hyperlink w:anchor="_Toc241663436" w:history="1">
+          <w:hyperlink w:anchor="_Toc241663940" w:history="1">
             <w:r>
               <w:rPr>
                 <w:rStyle w:val="Hyperlink"/>
@@ -1649,7 +1649,7 @@
               <w:rPr>
                 <w:noProof/>
               </w:rPr>
-              <w:instrText xml:space="preserve"> PAGEREF _Toc241663436 \h </w:instrText>
+              <w:instrText xml:space="preserve"> PAGEREF _Toc241663940 \h </w:instrText>
             </w:r>
             <w:r>
               <w:rPr>
@@ -1692,7 +1692,7 @@
               <w14:ligatures w14:val="standardContextual"/>
             </w:rPr>
           </w:pPr>
-          <w:hyperlink w:anchor="_Toc241663437" w:history="1">
+          <w:hyperlink w:anchor="_Toc241663941" w:history="1">
             <w:r>
               <w:rPr>
                 <w:rStyle w:val="Hyperlink"/>
@@ -1716,7 +1716,7 @@
               <w:rPr>
                 <w:noProof/>
               </w:rPr>
-              <w:instrText xml:space="preserve"> PAGEREF _Toc241663437 \h </w:instrText>
+              <w:instrText xml:space="preserve"> PAGEREF _Toc241663941 \h </w:instrText>
             </w:r>
             <w:r>
               <w:rPr>
@@ -1759,7 +1759,7 @@
               <w14:ligatures w14:val="standardContextual"/>
             </w:rPr>
           </w:pPr>
-          <w:hyperlink w:anchor="_Toc241663438" w:history="1">
+          <w:hyperlink w:anchor="_Toc241663942" w:history="1">
             <w:r>
               <w:rPr>
                 <w:rStyle w:val="Hyperlink"/>
@@ -1783,7 +1783,7 @@
               <w:rPr>
                 <w:noProof/>
               </w:rPr>
-              <w:instrText xml:space="preserve"> PAGEREF _Toc241663438 \h </w:instrText>
+              <w:instrText xml:space="preserve"> PAGEREF _Toc241663942 \h </w:instrText>
             </w:r>
             <w:r>
               <w:rPr>
@@ -1826,7 +1826,7 @@
               <w14:ligatures w14:val="standardContextual"/>
             </w:rPr>
           </w:pPr>
-          <w:hyperlink w:anchor="_Toc241663439" w:history="1">
+          <w:hyperlink w:anchor="_Toc241663943" w:history="1">
             <w:r>
               <w:rPr>
                 <w:rStyle w:val="Hyperlink"/>
@@ -1850,7 +1850,7 @@
               <w:rPr>
                 <w:noProof/>
               </w:rPr>
-              <w:instrText xml:space="preserve"> PAGEREF _Toc241663439 \h </w:instrText>
+              <w:instrText xml:space="preserve"> PAGEREF _Toc241663943 \h </w:instrText>
             </w:r>
             <w:r>
               <w:rPr>
@@ -1893,7 +1893,7 @@
               <w14:ligatures w14:val="standardContextual"/>
             </w:rPr>
           </w:pPr>
-          <w:hyperlink w:anchor="_Toc241663440" w:history="1">
+          <w:hyperlink w:anchor="_Toc241663944" w:history="1">
             <w:r>
               <w:rPr>
                 <w:rStyle w:val="Hyperlink"/>
@@ -1917,7 +1917,7 @@
               <w:rPr>
                 <w:noProof/>
               </w:rPr>
-              <w:instrText xml:space="preserve"> PAGEREF _Toc241663440 \h </w:instrText>
+              <w:instrText xml:space="preserve"> PAGEREF _Toc241663944 \h </w:instrText>
             </w:r>
             <w:r>
               <w:rPr>
@@ -1960,7 +1960,7 @@
               <w14:ligatures w14:val="standardContextual"/>
             </w:rPr>
           </w:pPr>
-          <w:hyperlink w:anchor="_Toc241663441" w:history="1">
+          <w:hyperlink w:anchor="_Toc241663945" w:history="1">
             <w:r>
               <w:rPr>
                 <w:rStyle w:val="Hyperlink"/>
@@ -1984,7 +1984,7 @@
               <w:rPr>
                 <w:noProof/>
               </w:rPr>
-              <w:instrText xml:space="preserve"> PAGEREF _Toc241663441 \h </w:instrText>
+              <w:instrText xml:space="preserve"> PAGEREF _Toc241663945 \h </w:instrText>
             </w:r>
             <w:r>
               <w:rPr>
@@ -2027,7 +2027,7 @@
               <w14:ligatures w14:val="standardContextual"/>
             </w:rPr>
           </w:pPr>
-          <w:hyperlink w:anchor="_Toc241663442" w:history="1">
+          <w:hyperlink w:anchor="_Toc241663946" w:history="1">
             <w:r>
               <w:rPr>
                 <w:rStyle w:val="Hyperlink"/>
@@ -2051,7 +2051,7 @@
               <w:rPr>
                 <w:noProof/>
               </w:rPr>
-              <w:instrText xml:space="preserve"> PAGEREF _Toc241663442 \h </w:instrText>
+              <w:instrText xml:space="preserve"> PAGEREF _Toc241663946 \h </w:instrText>
             </w:r>
             <w:r>
               <w:rPr>
@@ -2094,7 +2094,7 @@
               <w14:ligatures w14:val="standardContextual"/>
             </w:rPr>
           </w:pPr>
-          <w:hyperlink w:anchor="_Toc241663443" w:history="1">
+          <w:hyperlink w:anchor="_Toc241663947" w:history="1">
             <w:r>
               <w:rPr>
                 <w:rStyle w:val="Hyperlink"/>
@@ -2118,7 +2118,7 @@
               <w:rPr>
                 <w:noProof/>
               </w:rPr>
-              <w:instrText xml:space="preserve"> PAGEREF _Toc241663443 \h </w:instrText>
+              <w:instrText xml:space="preserve"> PAGEREF _Toc241663947 \h </w:instrText>
             </w:r>
             <w:r>
               <w:rPr>
@@ -2161,7 +2161,7 @@
               <w14:ligatures w14:val="standardContextual"/>
             </w:rPr>
           </w:pPr>
-          <w:hyperlink w:anchor="_Toc241663444" w:history="1">
+          <w:hyperlink w:anchor="_Toc241663948" w:history="1">
             <w:r>
               <w:rPr>
                 <w:rStyle w:val="Hyperlink"/>
@@ -2185,7 +2185,7 @@
               <w:rPr>
                 <w:noProof/>
               </w:rPr>
-              <w:instrText xml:space="preserve"> PAGEREF _Toc241663444 \h </w:instrText>
+              <w:instrText xml:space="preserve"> PAGEREF _Toc241663948 \h </w:instrText>
             </w:r>
             <w:r>
               <w:rPr>
@@ -2228,12 +2228,146 @@
               <w14:ligatures w14:val="standardContextual"/>
             </w:rPr>
           </w:pPr>
-          <w:hyperlink w:anchor="_Toc241663445" w:history="1">
+          <w:hyperlink w:anchor="_Toc241663949" w:history="1">
             <w:r>
               <w:rPr>
                 <w:rStyle w:val="Hyperlink"/>
                 <w:noProof/>
               </w:rPr>
+              <w:t>Drag it</w:t>
+            </w:r>
+            <w:r>
+              <w:rPr>
+                <w:noProof/>
+              </w:rPr>
+              <w:tab/>
+            </w:r>
+            <w:r>
+              <w:rPr>
+                <w:noProof/>
+              </w:rPr>
+              <w:fldChar w:fldCharType="begin"/>
+            </w:r>
+            <w:r>
+              <w:rPr>
+                <w:noProof/>
+              </w:rPr>
+              <w:instrText xml:space="preserve"> PAGEREF _Toc241663949 \h </w:instrText>
+            </w:r>
+            <w:r>
+              <w:rPr>
+                <w:noProof/>
+              </w:rPr>
+            </w:r>
+            <w:r>
+              <w:rPr>
+                <w:noProof/>
+              </w:rPr>
+              <w:fldChar w:fldCharType="separate"/>
+            </w:r>
+            <w:r>
+              <w:rPr>
+                <w:noProof/>
+              </w:rPr>
+              <w:t>12</w:t>
+            </w:r>
+            <w:r>
+              <w:rPr>
+                <w:noProof/>
+              </w:rPr>
+              <w:fldChar w:fldCharType="end"/>
+            </w:r>
+          </w:hyperlink>
+        </w:p>
+        <w:p>
+          <w:pPr>
+            <w:pStyle w:val="TOC2"/>
+            <w:tabs>
+              <w:tab w:val="right" w:leader="dot" w:pos="9350"/>
+            </w:tabs>
+            <w:rPr>
+              <w:rFonts w:asciiTheme="minorHAnsi" w:eastAsiaTheme="minorEastAsia" w:hAnsiTheme="minorHAnsi" w:cstheme="minorBidi"/>
+              <w:noProof/>
+              <w:color w:val="auto"/>
+              <w:kern w:val="2"/>
+              <w:sz w:val="24"/>
+              <w:szCs w:val="24"/>
+              <w14:ligatures w14:val="standardContextual"/>
+            </w:rPr>
+          </w:pPr>
+          <w:hyperlink w:anchor="_Toc241663950" w:history="1">
+            <w:r>
+              <w:rPr>
+                <w:rStyle w:val="Hyperlink"/>
+                <w:noProof/>
+              </w:rPr>
+              <w:t>Or tap it</w:t>
+            </w:r>
+            <w:r>
+              <w:rPr>
+                <w:noProof/>
+              </w:rPr>
+              <w:tab/>
+            </w:r>
+            <w:r>
+              <w:rPr>
+                <w:noProof/>
+              </w:rPr>
+              <w:fldChar w:fldCharType="begin"/>
+            </w:r>
+            <w:r>
+              <w:rPr>
+                <w:noProof/>
+              </w:rPr>
+              <w:instrText xml:space="preserve"> PAGEREF _Toc241663950 \h </w:instrText>
+            </w:r>
+            <w:r>
+              <w:rPr>
+                <w:noProof/>
+              </w:rPr>
+            </w:r>
+            <w:r>
+              <w:rPr>
+                <w:noProof/>
+              </w:rPr>
+              <w:fldChar w:fldCharType="separate"/>
+            </w:r>
+            <w:r>
+              <w:rPr>
+                <w:noProof/>
+              </w:rPr>
+              <w:t>13</w:t>
+            </w:r>
+            <w:r>
+              <w:rPr>
+                <w:noProof/>
+              </w:rPr>
+              <w:fldChar w:fldCharType="end"/>
+            </w:r>
+          </w:hyperlink>
+        </w:p>
+        <w:p>
+          <w:pPr>
+            <w:pStyle w:val="TOC2"/>
+            <w:tabs>
+              <w:tab w:val="right" w:leader="dot" w:pos="9350"/>
+            </w:tabs>
+            <w:rPr>
+              <w:rFonts w:asciiTheme="minorHAnsi" w:eastAsiaTheme="minorEastAsia" w:hAnsiTheme="minorHAnsi" w:cstheme="minorBidi"/>
+              <w:noProof/>
+              <w:color w:val="auto"/>
+              <w:kern w:val="2"/>
+              <w:sz w:val="24"/>
+              <w:szCs w:val="24"/>
+              <w14:ligatures w14:val="standardContextual"/>
+            </w:rPr>
+          </w:pPr>
+          <w:hyperlink w:anchor="_Toc241663951" w:history="1">
+            <w:r>
+              <w:rPr>
+                <w:rStyle w:val="Hyperlink"/>
+                <w:noProof/>
+              </w:rPr>
               <w:t>Setting up the shop touch board (admins)</w:t>
             </w:r>
             <w:r>
@@ -2252,7 +2386,7 @@
               <w:rPr>
                 <w:noProof/>
               </w:rPr>
-              <w:instrText xml:space="preserve"> PAGEREF _Toc241663445 \h </w:instrText>
+              <w:instrText xml:space="preserve"> PAGEREF _Toc241663951 \h </w:instrText>
             </w:r>
             <w:r>
               <w:rPr>
@@ -2295,7 +2429,7 @@
               <w14:ligatures w14:val="standardContextual"/>
             </w:rPr>
           </w:pPr>
-          <w:hyperlink w:anchor="_Toc241663446" w:history="1">
+          <w:hyperlink w:anchor="_Toc241663952" w:history="1">
             <w:r>
               <w:rPr>
                 <w:rStyle w:val="Hyperlink"/>
@@ -2319,7 +2453,7 @@
               <w:rPr>
                 <w:noProof/>
               </w:rPr>
-              <w:instrText xml:space="preserve"> PAGEREF _Toc241663446 \h </w:instrText>
+              <w:instrText xml:space="preserve"> PAGEREF _Toc241663952 \h </w:instrText>
             </w:r>
             <w:r>
               <w:rPr>
@@ -2362,7 +2496,7 @@
               <w14:ligatures w14:val="standardContextual"/>
             </w:rPr>
           </w:pPr>
-          <w:hyperlink w:anchor="_Toc241663447" w:history="1">
+          <w:hyperlink w:anchor="_Toc241663953" w:history="1">
             <w:r>
               <w:rPr>
                 <w:rStyle w:val="Hyperlink"/>
@@ -2386,7 +2520,7 @@
               <w:rPr>
                 <w:noProof/>
               </w:rPr>
-              <w:instrText xml:space="preserve"> PAGEREF _Toc241663447 \h </w:instrText>
+              <w:instrText xml:space="preserve"> PAGEREF _Toc241663953 \h </w:instrText>
             </w:r>
             <w:r>
               <w:rPr>
@@ -2429,7 +2563,7 @@
               <w14:ligatures w14:val="standardContextual"/>
             </w:rPr>
           </w:pPr>
-          <w:hyperlink w:anchor="_Toc241663448" w:history="1">
+          <w:hyperlink w:anchor="_Toc241663954" w:history="1">
             <w:r>
               <w:rPr>
                 <w:rStyle w:val="Hyperlink"/>
@@ -2453,7 +2587,7 @@
               <w:rPr>
                 <w:noProof/>
               </w:rPr>
-              <w:instrText xml:space="preserve"> PAGEREF _Toc241663448 \h </w:instrText>
+              <w:instrText xml:space="preserve"> PAGEREF _Toc241663954 \h </w:instrText>
             </w:r>
             <w:r>
               <w:rPr>
@@ -2496,7 +2630,7 @@
               <w14:ligatures w14:val="standardContextual"/>
             </w:rPr>
           </w:pPr>
-          <w:hyperlink w:anchor="_Toc241663449" w:history="1">
+          <w:hyperlink w:anchor="_Toc241663955" w:history="1">
             <w:r>
               <w:rPr>
                 <w:rStyle w:val="Hyperlink"/>
@@ -2520,7 +2654,7 @@
               <w:rPr>
                 <w:noProof/>
               </w:rPr>
-              <w:instrText xml:space="preserve"> PAGEREF _Toc241663449 \h </w:instrText>
+              <w:instrText xml:space="preserve"> PAGEREF _Toc241663955 \h </w:instrText>
             </w:r>
             <w:r>
               <w:rPr>
@@ -2563,7 +2697,7 @@
               <w14:ligatures w14:val="standardContextual"/>
             </w:rPr>
           </w:pPr>
-          <w:hyperlink w:anchor="_Toc241663450" w:history="1">
+          <w:hyperlink w:anchor="_Toc241663956" w:history="1">
             <w:r>
               <w:rPr>
                 <w:rStyle w:val="Hyperlink"/>
@@ -2587,7 +2721,7 @@
               <w:rPr>
                 <w:noProof/>
               </w:rPr>
-              <w:instrText xml:space="preserve"> PAGEREF _Toc241663450 \h </w:instrText>
+              <w:instrText xml:space="preserve"> PAGEREF _Toc241663956 \h </w:instrText>
             </w:r>
             <w:r>
               <w:rPr>
@@ -2630,7 +2764,7 @@
               <w14:ligatures w14:val="standardContextual"/>
             </w:rPr>
           </w:pPr>
-          <w:hyperlink w:anchor="_Toc241663451" w:history="1">
+          <w:hyperlink w:anchor="_Toc241663957" w:history="1">
             <w:r>
               <w:rPr>
                 <w:rStyle w:val="Hyperlink"/>
@@ -2654,7 +2788,7 @@
               <w:rPr>
                 <w:noProof/>
               </w:rPr>
-              <w:instrText xml:space="preserve"> PAGEREF _Toc241663451 \h </w:instrText>
+              <w:instrText xml:space="preserve"> PAGEREF _Toc241663957 \h </w:instrText>
             </w:r>
             <w:r>
               <w:rPr>
@@ -2697,7 +2831,7 @@
               <w14:ligatures w14:val="standardContextual"/>
             </w:rPr>
           </w:pPr>
-          <w:hyperlink w:anchor="_Toc241663452" w:history="1">
+          <w:hyperlink w:anchor="_Toc241663958" w:history="1">
             <w:r>
               <w:rPr>
                 <w:rStyle w:val="Hyperlink"/>
@@ -2721,7 +2855,7 @@
               <w:rPr>
                 <w:noProof/>
               </w:rPr>
-              <w:instrText xml:space="preserve"> PAGEREF _Toc241663452 \h </w:instrText>
+              <w:instrText xml:space="preserve"> PAGEREF _Toc241663958 \h </w:instrText>
             </w:r>
             <w:r>
               <w:rPr>
@@ -2764,7 +2898,7 @@
               <w14:ligatures w14:val="standardContextual"/>
             </w:rPr>
           </w:pPr>
-          <w:hyperlink w:anchor="_Toc241663453" w:history="1">
+          <w:hyperlink w:anchor="_Toc241663959" w:history="1">
             <w:r>
               <w:rPr>
                 <w:rStyle w:val="Hyperlink"/>
@@ -2788,7 +2922,7 @@
               <w:rPr>
                 <w:noProof/>
               </w:rPr>
-              <w:instrText xml:space="preserve"> PAGEREF _Toc241663453 \h </w:instrText>
+              <w:instrText xml:space="preserve"> PAGEREF _Toc241663959 \h </w:instrText>
             </w:r>
             <w:r>
               <w:rPr>
@@ -2831,7 +2965,7 @@
               <w14:ligatures w14:val="standardContextual"/>
             </w:rPr>
           </w:pPr>
-          <w:hyperlink w:anchor="_Toc241663454" w:history="1">
+          <w:hyperlink w:anchor="_Toc241663960" w:history="1">
             <w:r>
               <w:rPr>
                 <w:rStyle w:val="Hyperlink"/>
@@ -2855,7 +2989,7 @@
               <w:rPr>
                 <w:noProof/>
               </w:rPr>
-              <w:instrText xml:space="preserve"> PAGEREF _Toc241663454 \h </w:instrText>
+              <w:instrText xml:space="preserve"> PAGEREF _Toc241663960 \h </w:instrText>
             </w:r>
             <w:r>
               <w:rPr>
@@ -2898,7 +3032,7 @@
               <w14:ligatures w14:val="standardContextual"/>
             </w:rPr>
           </w:pPr>
-          <w:hyperlink w:anchor="_Toc241663455" w:history="1">
+          <w:hyperlink w:anchor="_Toc241663961" w:history="1">
             <w:r>
               <w:rPr>
                 <w:rStyle w:val="Hyperlink"/>
@@ -2922,7 +3056,7 @@
               <w:rPr>
                 <w:noProof/>
               </w:rPr>
-              <w:instrText xml:space="preserve"> PAGEREF _Toc241663455 \h </w:instrText>
+              <w:instrText xml:space="preserve"> PAGEREF _Toc241663961 \h </w:instrText>
             </w:r>
             <w:r>
               <w:rPr>
@@ -2965,7 +3099,7 @@
               <w14:ligatures w14:val="standardContextual"/>
             </w:rPr>
           </w:pPr>
-          <w:hyperlink w:anchor="_Toc241663456" w:history="1">
+          <w:hyperlink w:anchor="_Toc241663962" w:history="1">
             <w:r>
               <w:rPr>
                 <w:rStyle w:val="Hyperlink"/>
@@ -2989,7 +3123,7 @@
               <w:rPr>
                 <w:noProof/>
               </w:rPr>
-              <w:instrText xml:space="preserve"> PAGEREF _Toc241663456 \h </w:instrText>
+              <w:instrText xml:space="preserve"> PAGEREF _Toc241663962 \h </w:instrText>
             </w:r>
             <w:r>
               <w:rPr>
@@ -3032,7 +3166,7 @@
               <w14:ligatures w14:val="standardContextual"/>
             </w:rPr>
           </w:pPr>
-          <w:hyperlink w:anchor="_Toc241663457" w:history="1">
+          <w:hyperlink w:anchor="_Toc241663963" w:history="1">
             <w:r>
               <w:rPr>
                 <w:rStyle w:val="Hyperlink"/>
@@ -3056,7 +3190,7 @@
               <w:rPr>
                 <w:noProof/>
               </w:rPr>
-              <w:instrText xml:space="preserve"> PAGEREF _Toc241663457 \h </w:instrText>
+              <w:instrText xml:space="preserve"> PAGEREF _Toc241663963 \h </w:instrText>
             </w:r>
             <w:r>
               <w:rPr>
@@ -3099,7 +3233,7 @@
               <w14:ligatures w14:val="standardContextual"/>
             </w:rPr>
           </w:pPr>
-          <w:hyperlink w:anchor="_Toc241663458" w:history="1">
+          <w:hyperlink w:anchor="_Toc241663964" w:history="1">
             <w:r>
               <w:rPr>
                 <w:rStyle w:val="Hyperlink"/>
@@ -3123,7 +3257,7 @@
               <w:rPr>
                 <w:noProof/>
               </w:rPr>
-              <w:instrText xml:space="preserve"> PAGEREF _Toc241663458 \h </w:instrText>
+              <w:instrText xml:space="preserve"> PAGEREF _Toc241663964 \h </w:instrText>
             </w:r>
             <w:r>
               <w:rPr>
@@ -3166,7 +3300,7 @@
               <w14:ligatures w14:val="standardContextual"/>
             </w:rPr>
           </w:pPr>
-          <w:hyperlink w:anchor="_Toc241663459" w:history="1">
+          <w:hyperlink w:anchor="_Toc241663965" w:history="1">
             <w:r>
               <w:rPr>
                 <w:rStyle w:val="Hyperlink"/>
@@ -3190,7 +3324,7 @@
               <w:rPr>
                 <w:noProof/>
               </w:rPr>
-              <w:instrText xml:space="preserve"> PAGEREF _Toc241663459 \h </w:instrText>
+              <w:instrText xml:space="preserve"> PAGEREF _Toc241663965 \h </w:instrText>
             </w:r>
             <w:r>
               <w:rPr>
@@ -3233,7 +3367,7 @@
               <w14:ligatures w14:val="standardContextual"/>
             </w:rPr>
           </w:pPr>
-          <w:hyperlink w:anchor="_Toc241663460" w:history="1">
+          <w:hyperlink w:anchor="_Toc241663966" w:history="1">
             <w:r>
               <w:rPr>
                 <w:rStyle w:val="Hyperlink"/>
@@ -3257,7 +3391,7 @@
               <w:rPr>
                 <w:noProof/>
               </w:rPr>
-              <w:instrText xml:space="preserve"> PAGEREF _Toc241663460 \h </w:instrText>
+              <w:instrText xml:space="preserve"> PAGEREF _Toc241663966 \h </w:instrText>
             </w:r>
             <w:r>
               <w:rPr>
@@ -3300,7 +3434,7 @@
               <w14:ligatures w14:val="standardContextual"/>
             </w:rPr>
           </w:pPr>
-          <w:hyperlink w:anchor="_Toc241663461" w:history="1">
+          <w:hyperlink w:anchor="_Toc241663967" w:history="1">
             <w:r>
               <w:rPr>
                 <w:rStyle w:val="Hyperlink"/>
@@ -3324,7 +3458,7 @@
               <w:rPr>
                 <w:noProof/>
               </w:rPr>
-              <w:instrText xml:space="preserve"> PAGEREF _Toc241663461 \h </w:instrText>
+              <w:instrText xml:space="preserve"> PAGEREF _Toc241663967 \h </w:instrText>
             </w:r>
             <w:r>
               <w:rPr>
@@ -3367,7 +3501,7 @@
               <w14:ligatures w14:val="standardContextual"/>
             </w:rPr>
           </w:pPr>
-          <w:hyperlink w:anchor="_Toc241663462" w:history="1">
+          <w:hyperlink w:anchor="_Toc241663968" w:history="1">
             <w:r>
               <w:rPr>
                 <w:rStyle w:val="Hyperlink"/>
@@ -3391,7 +3525,7 @@
               <w:rPr>
                 <w:noProof/>
               </w:rPr>
-              <w:instrText xml:space="preserve"> PAGEREF _Toc241663462 \h </w:instrText>
+              <w:instrText xml:space="preserve"> PAGEREF _Toc241663968 \h </w:instrText>
             </w:r>
             <w:r>
               <w:rPr>
@@ -3434,7 +3568,7 @@
               <w14:ligatures w14:val="standardContextual"/>
             </w:rPr>
           </w:pPr>
-          <w:hyperlink w:anchor="_Toc241663463" w:history="1">
+          <w:hyperlink w:anchor="_Toc241663969" w:history="1">
             <w:r>
               <w:rPr>
                 <w:rStyle w:val="Hyperlink"/>
@@ -3458,7 +3592,7 @@
               <w:rPr>
                 <w:noProof/>
               </w:rPr>
-              <w:instrText xml:space="preserve"> PAGEREF _Toc241663463 \h </w:instrText>
+              <w:instrText xml:space="preserve"> PAGEREF _Toc241663969 \h </w:instrText>
             </w:r>
             <w:r>
               <w:rPr>
@@ -3501,7 +3635,7 @@
               <w14:ligatures w14:val="standardContextual"/>
             </w:rPr>
           </w:pPr>
-          <w:hyperlink w:anchor="_Toc241663464" w:history="1">
+          <w:hyperlink w:anchor="_Toc241663970" w:history="1">
             <w:r>
               <w:rPr>
                 <w:rStyle w:val="Hyperlink"/>
@@ -3525,7 +3659,7 @@
               <w:rPr>
                 <w:noProof/>
               </w:rPr>
-              <w:instrText xml:space="preserve"> PAGEREF _Toc241663464 \h </w:instrText>
+              <w:instrText xml:space="preserve"> PAGEREF _Toc241663970 \h </w:instrText>
             </w:r>
             <w:r>
               <w:rPr>
@@ -3568,7 +3702,7 @@
               <w14:ligatures w14:val="standardContextual"/>
             </w:rPr>
           </w:pPr>
-          <w:hyperlink w:anchor="_Toc241663465" w:history="1">
+          <w:hyperlink w:anchor="_Toc241663971" w:history="1">
             <w:r>
               <w:rPr>
                 <w:rStyle w:val="Hyperlink"/>
@@ -3592,7 +3726,7 @@
               <w:rPr>
                 <w:noProof/>
               </w:rPr>
-              <w:instrText xml:space="preserve"> PAGEREF _Toc241663465 \h </w:instrText>
+              <w:instrText xml:space="preserve"> PAGEREF _Toc241663971 \h </w:instrText>
             </w:r>
             <w:r>
               <w:rPr>
@@ -3635,7 +3769,7 @@
               <w14:ligatures w14:val="standardContextual"/>
             </w:rPr>
           </w:pPr>
-          <w:hyperlink w:anchor="_Toc241663466" w:history="1">
+          <w:hyperlink w:anchor="_Toc241663972" w:history="1">
             <w:r>
               <w:rPr>
                 <w:rStyle w:val="Hyperlink"/>
@@ -3659,7 +3793,7 @@
               <w:rPr>
                 <w:noProof/>
               </w:rPr>
-              <w:instrText xml:space="preserve"> PAGEREF _Toc241663466 \h </w:instrText>
+              <w:instrText xml:space="preserve"> PAGEREF _Toc241663972 \h </w:instrText>
             </w:r>
             <w:r>
               <w:rPr>
@@ -3702,7 +3836,7 @@
               <w14:ligatures w14:val="standardContextual"/>
             </w:rPr>
           </w:pPr>
-          <w:hyperlink w:anchor="_Toc241663467" w:history="1">
+          <w:hyperlink w:anchor="_Toc241663973" w:history="1">
             <w:r>
               <w:rPr>
                 <w:rStyle w:val="Hyperlink"/>
@@ -3726,7 +3860,7 @@
               <w:rPr>
                 <w:noProof/>
               </w:rPr>
-              <w:instrText xml:space="preserve"> PAGEREF _Toc241663467 \h </w:instrText>
+              <w:instrText xml:space="preserve"> PAGEREF _Toc241663973 \h </w:instrText>
             </w:r>
             <w:r>
               <w:rPr>
@@ -3769,7 +3903,7 @@
               <w14:ligatures w14:val="standardContextual"/>
             </w:rPr>
           </w:pPr>
-          <w:hyperlink w:anchor="_Toc241663468" w:history="1">
+          <w:hyperlink w:anchor="_Toc241663974" w:history="1">
             <w:r>
               <w:rPr>
                 <w:rStyle w:val="Hyperlink"/>
@@ -3793,7 +3927,7 @@
               <w:rPr>
                 <w:noProof/>
               </w:rPr>
-              <w:instrText xml:space="preserve"> PAGEREF _Toc241663468 \h </w:instrText>
+              <w:instrText xml:space="preserve"> PAGEREF _Toc241663974 \h </w:instrText>
             </w:r>
             <w:r>
               <w:rPr>
@@ -3836,7 +3970,7 @@
               <w14:ligatures w14:val="standardContextual"/>
             </w:rPr>
           </w:pPr>
-          <w:hyperlink w:anchor="_Toc241663469" w:history="1">
+          <w:hyperlink w:anchor="_Toc241663975" w:history="1">
             <w:r>
               <w:rPr>
                 <w:rStyle w:val="Hyperlink"/>
@@ -3860,7 +3994,7 @@
               <w:rPr>
                 <w:noProof/>
               </w:rPr>
-              <w:instrText xml:space="preserve"> PAGEREF _Toc241663469 \h </w:instrText>
+              <w:instrText xml:space="preserve"> PAGEREF _Toc241663975 \h </w:instrText>
             </w:r>
             <w:r>
               <w:rPr>
@@ -3903,7 +4037,7 @@
               <w14:ligatures w14:val="standardContextual"/>
             </w:rPr>
           </w:pPr>
-          <w:hyperlink w:anchor="_Toc241663470" w:history="1">
+          <w:hyperlink w:anchor="_Toc241663976" w:history="1">
             <w:r>
               <w:rPr>
                 <w:rStyle w:val="Hyperlink"/>
@@ -3927,7 +4061,7 @@
               <w:rPr>
                 <w:noProof/>
               </w:rPr>
-              <w:instrText xml:space="preserve"> PAGEREF _Toc241663470 \h </w:instrText>
+              <w:instrText xml:space="preserve"> PAGEREF _Toc241663976 \h </w:instrText>
             </w:r>
             <w:r>
               <w:rPr>
@@ -3970,7 +4104,7 @@
       <w:pPr>
         <w:pStyle w:val="Heading1"/>
       </w:pPr>
-      <w:bookmarkStart w:id="0" w:name="_Toc241663414"/>
+      <w:bookmarkStart w:id="0" w:name="_Toc241663918"/>
       <w:r>
         <w:t>1.  Getting started</w:t>
       </w:r>
@@ -3998,7 +4132,7 @@
       <w:pPr>
         <w:pStyle w:val="Heading2"/>
       </w:pPr>
-      <w:bookmarkStart w:id="1" w:name="_Toc241663415"/>
+      <w:bookmarkStart w:id="1" w:name="_Toc241663919"/>
       <w:r>
         <w:t>Opening ShopControl</w:t>
       </w:r>
@@ -4078,7 +4212,7 @@
       <w:pPr>
         <w:pStyle w:val="Heading2"/>
       </w:pPr>
-      <w:bookmarkStart w:id="2" w:name="_Toc241663416"/>
+      <w:bookmarkStart w:id="2" w:name="_Toc241663920"/>
       <w:r>
         <w:t>Finding help</w:t>
       </w:r>
@@ -4181,7 +4315,7 @@
       <w:pPr>
         <w:pStyle w:val="Heading2"/>
       </w:pPr>
-      <w:bookmarkStart w:id="3" w:name="_Toc241663417"/>
+      <w:bookmarkStart w:id="3" w:name="_Toc241663921"/>
       <w:r>
         <w:t>Put the app on your phone's home screen</w:t>
       </w:r>
@@ -4349,7 +4483,7 @@
       <w:pPr>
         <w:pStyle w:val="Heading2"/>
       </w:pPr>
-      <w:bookmarkStart w:id="4" w:name="_Toc241663418"/>
+      <w:bookmarkStart w:id="4" w:name="_Toc241663922"/>
       <w:r>
         <w:t>Logging in</w:t>
       </w:r>
@@ -4519,7 +4653,7 @@
       <w:pPr>
         <w:pStyle w:val="Heading2"/>
       </w:pPr>
-      <w:bookmarkStart w:id="5" w:name="_Toc241663419"/>
+      <w:bookmarkStart w:id="5" w:name="_Toc241663923"/>
       <w:r>
         <w:t>Staying up to date</w:t>
       </w:r>
@@ -4547,7 +4681,7 @@
       <w:pPr>
         <w:pStyle w:val="Heading2"/>
       </w:pPr>
-      <w:bookmarkStart w:id="6" w:name="_Toc241663420"/>
+      <w:bookmarkStart w:id="6" w:name="_Toc241663924"/>
       <w:r>
         <w:t>Who can do what</w:t>
       </w:r>
@@ -5219,7 +5353,7 @@
         <w:pStyle w:val="Heading1"/>
         <w:pageBreakBefore/>
       </w:pPr>
-      <w:bookmarkStart w:id="7" w:name="_Toc241663421"/>
+      <w:bookmarkStart w:id="7" w:name="_Toc241663925"/>
       <w:r>
         <w:t>2.  The Employee App (technicians)</w:t>
       </w:r>
@@ -5237,7 +5371,7 @@
       <w:pPr>
         <w:pStyle w:val="Heading2"/>
       </w:pPr>
-      <w:bookmarkStart w:id="8" w:name="_Toc241663422"/>
+      <w:bookmarkStart w:id="8" w:name="_Toc241663926"/>
       <w:r>
         <w:t>Home screen</w:t>
       </w:r>
@@ -5397,7 +5531,7 @@
       <w:pPr>
         <w:pStyle w:val="Heading2"/>
       </w:pPr>
-      <w:bookmarkStart w:id="9" w:name="_Toc241663423"/>
+      <w:bookmarkStart w:id="9" w:name="_Toc241663927"/>
       <w:r>
         <w:t>Spanish (Español)</w:t>
       </w:r>
@@ -5484,7 +5618,7 @@
       <w:pPr>
         <w:pStyle w:val="Heading2"/>
       </w:pPr>
-      <w:bookmarkStart w:id="10" w:name="_Toc241663424"/>
+      <w:bookmarkStart w:id="10" w:name="_Toc241663928"/>
       <w:r>
         <w:t>Doing your QC checklist</w:t>
       </w:r>
@@ -5698,7 +5832,7 @@
       <w:pPr>
         <w:pStyle w:val="Heading2"/>
       </w:pPr>
-      <w:bookmarkStart w:id="11" w:name="_Toc241663425"/>
+      <w:bookmarkStart w:id="11" w:name="_Toc241663929"/>
       <w:r>
         <w:t>Signing and rework</w:t>
       </w:r>
@@ -5818,7 +5952,7 @@
       <w:pPr>
         <w:pStyle w:val="Heading2"/>
       </w:pPr>
-      <w:bookmarkStart w:id="12" w:name="_Toc241663426"/>
+      <w:bookmarkStart w:id="12" w:name="_Toc241663930"/>
       <w:r>
         <w:t>Other departments' checklists</w:t>
       </w:r>
@@ -5846,7 +5980,7 @@
       <w:pPr>
         <w:pStyle w:val="Heading2"/>
       </w:pPr>
-      <w:bookmarkStart w:id="13" w:name="_Toc241663427"/>
+      <w:bookmarkStart w:id="13" w:name="_Toc241663931"/>
       <w:r>
         <w:t>Photos and parts</w:t>
       </w:r>
@@ -5983,7 +6117,7 @@
         <w:pStyle w:val="Heading1"/>
         <w:pageBreakBefore/>
       </w:pPr>
-      <w:bookmarkStart w:id="14" w:name="_Toc241663428"/>
+      <w:bookmarkStart w:id="14" w:name="_Toc241663932"/>
       <w:r>
         <w:t>3.  Staff Hub: time off, mailbox and company info</w:t>
       </w:r>
@@ -6011,7 +6145,7 @@
       <w:pPr>
         <w:pStyle w:val="Heading2"/>
       </w:pPr>
-      <w:bookmarkStart w:id="15" w:name="_Toc241663429"/>
+      <w:bookmarkStart w:id="15" w:name="_Toc241663933"/>
       <w:r>
         <w:t>Requesting time off</w:t>
       </w:r>
@@ -6174,7 +6308,7 @@
       <w:pPr>
         <w:pStyle w:val="Heading2"/>
       </w:pPr>
-      <w:bookmarkStart w:id="16" w:name="_Toc241663430"/>
+      <w:bookmarkStart w:id="16" w:name="_Toc241663934"/>
       <w:r>
         <w:t>Checking your requests</w:t>
       </w:r>
@@ -6229,7 +6363,7 @@
       <w:pPr>
         <w:pStyle w:val="Heading2"/>
       </w:pPr>
-      <w:bookmarkStart w:id="17" w:name="_Toc241663431"/>
+      <w:bookmarkStart w:id="17" w:name="_Toc241663935"/>
       <w:r>
         <w:t>Mailbox</w:t>
       </w:r>
@@ -6298,7 +6432,7 @@
       <w:pPr>
         <w:pStyle w:val="Heading2"/>
       </w:pPr>
-      <w:bookmarkStart w:id="18" w:name="_Toc241663432"/>
+      <w:bookmarkStart w:id="18" w:name="_Toc241663936"/>
       <w:r>
         <w:t>Company info and this manual</w:t>
       </w:r>
@@ -6334,7 +6468,7 @@
         <w:pStyle w:val="Heading1"/>
         <w:pageBreakBefore/>
       </w:pPr>
-      <w:bookmarkStart w:id="19" w:name="_Toc241663433"/>
+      <w:bookmarkStart w:id="19" w:name="_Toc241663937"/>
       <w:r>
         <w:t>4.  Finding a vehicle</w:t>
       </w:r>
@@ -6589,7 +6723,7 @@
         <w:pStyle w:val="Heading1"/>
         <w:pageBreakBefore/>
       </w:pPr>
-      <w:bookmarkStart w:id="20" w:name="_Toc241663434"/>
+      <w:bookmarkStart w:id="20" w:name="_Toc241663938"/>
       <w:r>
         <w:t>5.  Dashboard</w:t>
       </w:r>
@@ -6728,7 +6862,7 @@
         <w:pStyle w:val="Heading1"/>
         <w:pageBreakBefore/>
       </w:pPr>
-      <w:bookmarkStart w:id="21" w:name="_Toc241663435"/>
+      <w:bookmarkStart w:id="21" w:name="_Toc241663939"/>
       <w:r>
         <w:t>6.  Jobs and the Daily GO List</w:t>
       </w:r>
@@ -6756,7 +6890,7 @@
       <w:pPr>
         <w:pStyle w:val="Heading2"/>
       </w:pPr>
-      <w:bookmarkStart w:id="22" w:name="_Toc241663436"/>
+      <w:bookmarkStart w:id="22" w:name="_Toc241663940"/>
       <w:r>
         <w:t>RO numbers</w:t>
       </w:r>
@@ -6842,7 +6976,7 @@
       <w:pPr>
         <w:pStyle w:val="Heading2"/>
       </w:pPr>
-      <w:bookmarkStart w:id="23" w:name="_Toc241663437"/>
+      <w:bookmarkStart w:id="23" w:name="_Toc241663941"/>
       <w:r>
         <w:t>Adding or editing a job</w:t>
       </w:r>
@@ -6962,7 +7096,7 @@
       <w:pPr>
         <w:pStyle w:val="Heading2"/>
       </w:pPr>
-      <w:bookmarkStart w:id="24" w:name="_Toc241663438"/>
+      <w:bookmarkStart w:id="24" w:name="_Toc241663942"/>
       <w:r>
         <w:t>Customer updates</w:t>
       </w:r>
@@ -7131,7 +7265,7 @@
         <w:pStyle w:val="Heading1"/>
         <w:pageBreakBefore/>
       </w:pPr>
-      <w:bookmarkStart w:id="25" w:name="_Toc241663439"/>
+      <w:bookmarkStart w:id="25" w:name="_Toc241663943"/>
       <w:r>
         <w:t>7.  Production, Delivery and Planning boards</w:t>
       </w:r>
@@ -7141,7 +7275,7 @@
       <w:pPr>
         <w:pStyle w:val="Heading2"/>
       </w:pPr>
-      <w:bookmarkStart w:id="26" w:name="_Toc241663440"/>
+      <w:bookmarkStart w:id="26" w:name="_Toc241663944"/>
       <w:r>
         <w:t>Production Board</w:t>
       </w:r>
@@ -7269,7 +7403,7 @@
       <w:pPr>
         <w:pStyle w:val="Heading2"/>
       </w:pPr>
-      <w:bookmarkStart w:id="27" w:name="_Toc241663441"/>
+      <w:bookmarkStart w:id="27" w:name="_Toc241663945"/>
       <w:r>
         <w:t>Vehicle pictures</w:t>
       </w:r>
@@ -7327,7 +7461,7 @@
       <w:pPr>
         <w:pStyle w:val="Heading2"/>
       </w:pPr>
-      <w:bookmarkStart w:id="28" w:name="_Toc241663442"/>
+      <w:bookmarkStart w:id="28" w:name="_Toc241663946"/>
       <w:r>
         <w:t>Delivery and Planning boards</w:t>
       </w:r>
@@ -7417,7 +7551,7 @@
       <w:pPr>
         <w:pStyle w:val="Heading2"/>
       </w:pPr>
-      <w:bookmarkStart w:id="29" w:name="_Toc241663443"/>
+      <w:bookmarkStart w:id="29" w:name="_Toc241663947"/>
       <w:r>
         <w:t>TV display</w:t>
       </w:r>
@@ -7445,7 +7579,7 @@
       <w:pPr>
         <w:pStyle w:val="Heading2"/>
       </w:pPr>
-      <w:bookmarkStart w:id="30" w:name="_Toc241663444"/>
+      <w:bookmarkStart w:id="30" w:name="_Toc241663948"/>
       <w:r>
         <w:t>Shop touch board</w:t>
       </w:r>
@@ -7456,8 +7590,18 @@
         <w:spacing w:after="120"/>
       </w:pPr>
       <w:r>
-        <w:t>The touch screen in the shop shows the same Production Board as the TV, and technicians use it to move cars to their next stage:</w:t>
-      </w:r>
+        <w:t>The touch screen in the shop shows the same Production Board as the TV, and technicians use it to move cars to their next stage. There are two ways:</w:t>
+      </w:r>
+    </w:p>
+    <w:p>
+      <w:pPr>
+        <w:pStyle w:val="Heading2"/>
+      </w:pPr>
+      <w:bookmarkStart w:id="31" w:name="_Toc241663949"/>
+      <w:r>
+        <w:t>Drag it</w:t>
+      </w:r>
+      <w:bookmarkEnd w:id="31"/>
     </w:p>
     <w:p>
       <w:pPr>
@@ -7469,7 +7613,7 @@
         <w:spacing w:after="60"/>
       </w:pPr>
       <w:r>
-        <w:t>Tap the car.</w:t>
+        <w:t>Press and hold the car for a moment until it lifts off the board.</w:t>
       </w:r>
     </w:p>
     <w:p>
@@ -7482,17 +7626,7 @@
         <w:spacing w:after="60"/>
       </w:pPr>
       <w:r>
-        <w:t xml:space="preserve">Tap the big orange button to move it to its usual next stage (for example </w:t>
-      </w:r>
-      <w:r>
-        <w:rPr>
-          <w:b/>
-          <w:bCs/>
-        </w:rPr>
-        <w:t>Move to Paint</w:t>
-      </w:r>
-      <w:r>
-        <w:t>), or tap any other stage.</w:t>
+        <w:t>Drag it onto the stage column it's moving to (the column lights up orange) and let go. To reach a column that's off screen, hold the car near the left or right edge and the board slides over.</w:t>
       </w:r>
     </w:p>
     <w:p>
@@ -7518,6 +7652,99 @@
         <w:spacing w:after="60"/>
       </w:pPr>
       <w:r>
+        <w:t>The car moves and a green banner confirms it.</w:t>
+      </w:r>
+    </w:p>
+    <w:p>
+      <w:pPr>
+        <w:pBdr>
+          <w:left w:val="single" w:sz="24" w:space="8" w:color="2F9E5B"/>
+        </w:pBdr>
+        <w:shd w:val="clear" w:color="auto" w:fill="EAF7EF"/>
+        <w:spacing w:before="120" w:after="160"/>
+        <w:ind w:left="160" w:right="160"/>
+      </w:pPr>
+      <w:r>
+        <w:rPr>
+          <w:b/>
+          <w:bCs/>
+          <w:color w:val="2F9E5B"/>
+        </w:rPr>
+        <w:t xml:space="preserve">Tip:  </w:t>
+      </w:r>
+      <w:r>
+        <w:t>A quick swipe (without holding first) just scrolls the board, so you won't move a car by accident.</w:t>
+      </w:r>
+    </w:p>
+    <w:p>
+      <w:pPr>
+        <w:pStyle w:val="Heading2"/>
+      </w:pPr>
+      <w:bookmarkStart w:id="32" w:name="_Toc241663950"/>
+      <w:r>
+        <w:t>Or tap it</w:t>
+      </w:r>
+      <w:bookmarkEnd w:id="32"/>
+    </w:p>
+    <w:p>
+      <w:pPr>
+        <w:pStyle w:val="ListParagraph"/>
+        <w:numPr>
+          <w:ilvl w:val="0"/>
+          <w:numId w:val="11"/>
+        </w:numPr>
+        <w:spacing w:after="60"/>
+      </w:pPr>
+      <w:r>
+        <w:t>Tap the car.</w:t>
+      </w:r>
+    </w:p>
+    <w:p>
+      <w:pPr>
+        <w:pStyle w:val="ListParagraph"/>
+        <w:numPr>
+          <w:ilvl w:val="0"/>
+          <w:numId w:val="11"/>
+        </w:numPr>
+        <w:spacing w:after="60"/>
+      </w:pPr>
+      <w:r>
+        <w:t xml:space="preserve">Tap the big orange button to move it to its usual next stage (for example </w:t>
+      </w:r>
+      <w:r>
+        <w:rPr>
+          <w:b/>
+          <w:bCs/>
+        </w:rPr>
+        <w:t>Move to Paint</w:t>
+      </w:r>
+      <w:r>
+        <w:t>), or tap any other stage.</w:t>
+      </w:r>
+    </w:p>
+    <w:p>
+      <w:pPr>
+        <w:pStyle w:val="ListParagraph"/>
+        <w:numPr>
+          <w:ilvl w:val="0"/>
+          <w:numId w:val="11"/>
+        </w:numPr>
+        <w:spacing w:after="60"/>
+      </w:pPr>
+      <w:r>
+        <w:t>Tap your name. Names of the techs assigned to the car are at the top.</w:t>
+      </w:r>
+    </w:p>
+    <w:p>
+      <w:pPr>
+        <w:pStyle w:val="ListParagraph"/>
+        <w:numPr>
+          <w:ilvl w:val="0"/>
+          <w:numId w:val="11"/>
+        </w:numPr>
+        <w:spacing w:after="60"/>
+      </w:pPr>
+      <w:r>
         <w:t xml:space="preserve">The car moves and a green banner confirms it. Tapped the wrong thing? Tap </w:t>
       </w:r>
       <w:r>
@@ -7584,18 +7811,18 @@
       <w:pPr>
         <w:pStyle w:val="Heading2"/>
       </w:pPr>
-      <w:bookmarkStart w:id="31" w:name="_Toc241663445"/>
+      <w:bookmarkStart w:id="33" w:name="_Toc241663951"/>
       <w:r>
         <w:t>Setting up the shop touch board (admins)</w:t>
       </w:r>
-      <w:bookmarkEnd w:id="31"/>
+      <w:bookmarkEnd w:id="33"/>
     </w:p>
     <w:p>
       <w:pPr>
         <w:pStyle w:val="ListParagraph"/>
         <w:numPr>
           <w:ilvl w:val="0"/>
-          <w:numId w:val="11"/>
+          <w:numId w:val="12"/>
         </w:numPr>
         <w:spacing w:after="60"/>
       </w:pPr>
@@ -7648,7 +7875,7 @@
         <w:pStyle w:val="ListParagraph"/>
         <w:numPr>
           <w:ilvl w:val="0"/>
-          <w:numId w:val="11"/>
+          <w:numId w:val="12"/>
         </w:numPr>
         <w:spacing w:after="60"/>
       </w:pPr>
@@ -7661,7 +7888,7 @@
         <w:pStyle w:val="ListParagraph"/>
         <w:numPr>
           <w:ilvl w:val="0"/>
-          <w:numId w:val="11"/>
+          <w:numId w:val="12"/>
         </w:numPr>
         <w:spacing w:after="60"/>
       </w:pPr>
@@ -7705,11 +7932,11 @@
         <w:pStyle w:val="Heading1"/>
         <w:pageBreakBefore/>
       </w:pPr>
-      <w:bookmarkStart w:id="32" w:name="_Toc241663446"/>
+      <w:bookmarkStart w:id="34" w:name="_Toc241663952"/>
       <w:r>
         <w:t>8.  CCC estimates coming into ShopControl</w:t>
       </w:r>
-      <w:bookmarkEnd w:id="32"/>
+      <w:bookmarkEnd w:id="34"/>
     </w:p>
     <w:p>
       <w:pPr>
@@ -7814,11 +8041,11 @@
         <w:pStyle w:val="Heading1"/>
         <w:pageBreakBefore/>
       </w:pPr>
-      <w:bookmarkStart w:id="33" w:name="_Toc241663447"/>
+      <w:bookmarkStart w:id="35" w:name="_Toc241663953"/>
       <w:r>
         <w:t>9.  Parts</w:t>
       </w:r>
-      <w:bookmarkEnd w:id="33"/>
+      <w:bookmarkEnd w:id="35"/>
     </w:p>
     <w:p>
       <w:pPr>
@@ -7872,11 +8099,11 @@
       <w:pPr>
         <w:pStyle w:val="Heading2"/>
       </w:pPr>
-      <w:bookmarkStart w:id="34" w:name="_Toc241663448"/>
+      <w:bookmarkStart w:id="36" w:name="_Toc241663954"/>
       <w:r>
         <w:t>What counts as a problem</w:t>
       </w:r>
-      <w:bookmarkEnd w:id="34"/>
+      <w:bookmarkEnd w:id="36"/>
     </w:p>
     <w:p>
       <w:pPr>
@@ -7940,118 +8167,11 @@
       <w:pPr>
         <w:pStyle w:val="Heading2"/>
       </w:pPr>
-      <w:bookmarkStart w:id="35" w:name="_Toc241663449"/>
+      <w:bookmarkStart w:id="37" w:name="_Toc241663955"/>
       <w:r>
         <w:t>Ordering parts</w:t>
       </w:r>
-      <w:bookmarkEnd w:id="35"/>
-    </w:p>
-    <w:p>
-      <w:pPr>
-        <w:pStyle w:val="ListParagraph"/>
-        <w:numPr>
-          <w:ilvl w:val="0"/>
-          <w:numId w:val="12"/>
-        </w:numPr>
-        <w:spacing w:after="60"/>
-      </w:pPr>
-      <w:r>
-        <w:t xml:space="preserve">Click </w:t>
-      </w:r>
-      <w:r>
-        <w:rPr>
-          <w:b/>
-          <w:bCs/>
-        </w:rPr>
-        <w:t>Open Parts</w:t>
-      </w:r>
-      <w:r>
-        <w:t xml:space="preserve"> on a vehicle.</w:t>
-      </w:r>
-    </w:p>
-    <w:p>
-      <w:pPr>
-        <w:pStyle w:val="ListParagraph"/>
-        <w:numPr>
-          <w:ilvl w:val="0"/>
-          <w:numId w:val="12"/>
-        </w:numPr>
-        <w:spacing w:after="60"/>
-      </w:pPr>
-      <w:r>
-        <w:t xml:space="preserve">Select the parts (or </w:t>
-      </w:r>
-      <w:r>
-        <w:rPr>
-          <w:b/>
-          <w:bCs/>
-        </w:rPr>
-        <w:t>Select all parts</w:t>
-      </w:r>
-      <w:r>
-        <w:t>).</w:t>
-      </w:r>
-    </w:p>
-    <w:p>
-      <w:pPr>
-        <w:pStyle w:val="ListParagraph"/>
-        <w:numPr>
-          <w:ilvl w:val="0"/>
-          <w:numId w:val="12"/>
-        </w:numPr>
-        <w:spacing w:after="60"/>
-      </w:pPr>
-      <w:r>
-        <w:t xml:space="preserve">Click </w:t>
-      </w:r>
-      <w:r>
-        <w:rPr>
-          <w:b/>
-          <w:bCs/>
-        </w:rPr>
-        <w:t>Order Selected</w:t>
-      </w:r>
-      <w:r>
-        <w:t xml:space="preserve"> and enter the </w:t>
-      </w:r>
-      <w:r>
-        <w:rPr>
-          <w:b/>
-          <w:bCs/>
-        </w:rPr>
-        <w:t>expected arrival (ETA)</w:t>
-      </w:r>
-      <w:r>
-        <w:t xml:space="preserve"> the vendor gave you.</w:t>
-      </w:r>
-    </w:p>
-    <w:p>
-      <w:pPr>
-        <w:spacing w:after="120"/>
-      </w:pPr>
-      <w:r>
-        <w:t xml:space="preserve">If a part isn't marked received by its ETA, it moves to </w:t>
-      </w:r>
-      <w:r>
-        <w:rPr>
-          <w:b/>
-          <w:bCs/>
-        </w:rPr>
-        <w:t>Parts Not Arrived On Time</w:t>
-      </w:r>
-      <w:r>
-        <w:t>.</w:t>
-      </w:r>
-    </w:p>
-    <w:p>
-      <w:pPr>
-        <w:pStyle w:val="Heading2"/>
-      </w:pPr>
-      <w:bookmarkStart w:id="36" w:name="_Toc241663450"/>
-      <w:r>
-        <w:t>Mirror matching and carts</w:t>
-      </w:r>
-      <w:bookmarkEnd w:id="36"/>
+      <w:bookmarkEnd w:id="37"/>
     </w:p>
     <w:p>
       <w:pPr>
@@ -8063,17 +8183,17 @@
         <w:spacing w:after="60"/>
       </w:pPr>
       <w:r>
-        <w:t xml:space="preserve">When parts arrive and are mirror matched, select them and click </w:t>
-      </w:r>
-      <w:r>
-        <w:rPr>
-          <w:b/>
-          <w:bCs/>
-        </w:rPr>
-        <w:t>Mirror Match Selected</w:t>
-      </w:r>
-      <w:r>
-        <w:t>.</w:t>
+        <w:t xml:space="preserve">Click </w:t>
+      </w:r>
+      <w:r>
+        <w:rPr>
+          <w:b/>
+          <w:bCs/>
+        </w:rPr>
+        <w:t>Open Parts</w:t>
+      </w:r>
+      <w:r>
+        <w:t xml:space="preserve"> on a vehicle.</w:t>
       </w:r>
     </w:p>
     <w:p>
@@ -8086,17 +8206,17 @@
         <w:spacing w:after="60"/>
       </w:pPr>
       <w:r>
-        <w:t xml:space="preserve">Choose the </w:t>
-      </w:r>
-      <w:r>
-        <w:rPr>
-          <w:b/>
-          <w:bCs/>
-        </w:rPr>
-        <w:t>cart</w:t>
-      </w:r>
-      <w:r>
-        <w:t xml:space="preserve"> they go on. Carts already holding that RO are listed first, then empty carts. Pick a shelf now or sort it later.</w:t>
+        <w:t xml:space="preserve">Select the parts (or </w:t>
+      </w:r>
+      <w:r>
+        <w:rPr>
+          <w:b/>
+          <w:bCs/>
+        </w:rPr>
+        <w:t>Select all parts</w:t>
+      </w:r>
+      <w:r>
+        <w:t>).</w:t>
       </w:r>
     </w:p>
     <w:p>
@@ -8109,6 +8229,113 @@
         <w:spacing w:after="60"/>
       </w:pPr>
       <w:r>
+        <w:t xml:space="preserve">Click </w:t>
+      </w:r>
+      <w:r>
+        <w:rPr>
+          <w:b/>
+          <w:bCs/>
+        </w:rPr>
+        <w:t>Order Selected</w:t>
+      </w:r>
+      <w:r>
+        <w:t xml:space="preserve"> and enter the </w:t>
+      </w:r>
+      <w:r>
+        <w:rPr>
+          <w:b/>
+          <w:bCs/>
+        </w:rPr>
+        <w:t>expected arrival (ETA)</w:t>
+      </w:r>
+      <w:r>
+        <w:t xml:space="preserve"> the vendor gave you.</w:t>
+      </w:r>
+    </w:p>
+    <w:p>
+      <w:pPr>
+        <w:spacing w:after="120"/>
+      </w:pPr>
+      <w:r>
+        <w:t xml:space="preserve">If a part isn't marked received by its ETA, it moves to </w:t>
+      </w:r>
+      <w:r>
+        <w:rPr>
+          <w:b/>
+          <w:bCs/>
+        </w:rPr>
+        <w:t>Parts Not Arrived On Time</w:t>
+      </w:r>
+      <w:r>
+        <w:t>.</w:t>
+      </w:r>
+    </w:p>
+    <w:p>
+      <w:pPr>
+        <w:pStyle w:val="Heading2"/>
+      </w:pPr>
+      <w:bookmarkStart w:id="38" w:name="_Toc241663956"/>
+      <w:r>
+        <w:t>Mirror matching and carts</w:t>
+      </w:r>
+      <w:bookmarkEnd w:id="38"/>
+    </w:p>
+    <w:p>
+      <w:pPr>
+        <w:pStyle w:val="ListParagraph"/>
+        <w:numPr>
+          <w:ilvl w:val="0"/>
+          <w:numId w:val="14"/>
+        </w:numPr>
+        <w:spacing w:after="60"/>
+      </w:pPr>
+      <w:r>
+        <w:t xml:space="preserve">When parts arrive and are mirror matched, select them and click </w:t>
+      </w:r>
+      <w:r>
+        <w:rPr>
+          <w:b/>
+          <w:bCs/>
+        </w:rPr>
+        <w:t>Mirror Match Selected</w:t>
+      </w:r>
+      <w:r>
+        <w:t>.</w:t>
+      </w:r>
+    </w:p>
+    <w:p>
+      <w:pPr>
+        <w:pStyle w:val="ListParagraph"/>
+        <w:numPr>
+          <w:ilvl w:val="0"/>
+          <w:numId w:val="14"/>
+        </w:numPr>
+        <w:spacing w:after="60"/>
+      </w:pPr>
+      <w:r>
+        <w:t xml:space="preserve">Choose the </w:t>
+      </w:r>
+      <w:r>
+        <w:rPr>
+          <w:b/>
+          <w:bCs/>
+        </w:rPr>
+        <w:t>cart</w:t>
+      </w:r>
+      <w:r>
+        <w:t xml:space="preserve"> they go on. Carts already holding that RO are listed first, then empty carts. Pick a shelf now or sort it later.</w:t>
+      </w:r>
+    </w:p>
+    <w:p>
+      <w:pPr>
+        <w:pStyle w:val="ListParagraph"/>
+        <w:numPr>
+          <w:ilvl w:val="0"/>
+          <w:numId w:val="14"/>
+        </w:numPr>
+        <w:spacing w:after="60"/>
+      </w:pPr>
+      <w:r>
         <w:t xml:space="preserve">In </w:t>
       </w:r>
       <w:r>
@@ -8185,11 +8412,11 @@
       <w:pPr>
         <w:pStyle w:val="Heading2"/>
       </w:pPr>
-      <w:bookmarkStart w:id="37" w:name="_Toc241663451"/>
+      <w:bookmarkStart w:id="39" w:name="_Toc241663957"/>
       <w:r>
         <w:t>Other parts screens</w:t>
       </w:r>
-      <w:bookmarkEnd w:id="37"/>
+      <w:bookmarkEnd w:id="39"/>
     </w:p>
     <w:p>
       <w:pPr>
@@ -8276,11 +8503,11 @@
         <w:pStyle w:val="Heading1"/>
         <w:pageBreakBefore/>
       </w:pPr>
-      <w:bookmarkStart w:id="38" w:name="_Toc241663452"/>
+      <w:bookmarkStart w:id="40" w:name="_Toc241663958"/>
       <w:r>
         <w:t>10.  Vehicle QC (office view)</w:t>
       </w:r>
-      <w:bookmarkEnd w:id="38"/>
+      <w:bookmarkEnd w:id="40"/>
     </w:p>
     <w:p>
       <w:pPr>
@@ -8314,11 +8541,11 @@
       <w:pPr>
         <w:pStyle w:val="Heading2"/>
       </w:pPr>
-      <w:bookmarkStart w:id="39" w:name="_Toc241663453"/>
+      <w:bookmarkStart w:id="41" w:name="_Toc241663959"/>
       <w:r>
         <w:t>Pulling up a car's QC report</w:t>
       </w:r>
-      <w:bookmarkEnd w:id="39"/>
+      <w:bookmarkEnd w:id="41"/>
     </w:p>
     <w:p>
       <w:pPr>
@@ -8429,11 +8656,11 @@
         <w:pStyle w:val="Heading1"/>
         <w:pageBreakBefore/>
       </w:pPr>
-      <w:bookmarkStart w:id="40" w:name="_Toc241663454"/>
+      <w:bookmarkStart w:id="42" w:name="_Toc241663960"/>
       <w:r>
         <w:t>11.  Completed Jobs (job records)</w:t>
       </w:r>
-      <w:bookmarkEnd w:id="40"/>
+      <w:bookmarkEnd w:id="42"/>
     </w:p>
     <w:p>
       <w:pPr>
@@ -8620,11 +8847,11 @@
       <w:pPr>
         <w:pStyle w:val="Heading2"/>
       </w:pPr>
-      <w:bookmarkStart w:id="41" w:name="_Toc241663455"/>
+      <w:bookmarkStart w:id="43" w:name="_Toc241663961"/>
       <w:r>
         <w:t>Deleted jobs</w:t>
       </w:r>
-      <w:bookmarkEnd w:id="41"/>
+      <w:bookmarkEnd w:id="43"/>
     </w:p>
     <w:p>
       <w:pPr>
@@ -8680,21 +8907,21 @@
         <w:pStyle w:val="Heading1"/>
         <w:pageBreakBefore/>
       </w:pPr>
-      <w:bookmarkStart w:id="42" w:name="_Toc241663456"/>
+      <w:bookmarkStart w:id="44" w:name="_Toc241663962"/>
       <w:r>
         <w:t>12.  Office tools</w:t>
       </w:r>
-      <w:bookmarkEnd w:id="42"/>
+      <w:bookmarkEnd w:id="44"/>
     </w:p>
     <w:p>
       <w:pPr>
         <w:pStyle w:val="Heading2"/>
       </w:pPr>
-      <w:bookmarkStart w:id="43" w:name="_Toc241663457"/>
+      <w:bookmarkStart w:id="45" w:name="_Toc241663963"/>
       <w:r>
         <w:t>Missed Calls / Callback Requests</w:t>
       </w:r>
-      <w:bookmarkEnd w:id="43"/>
+      <w:bookmarkEnd w:id="45"/>
     </w:p>
     <w:p>
       <w:pPr>
@@ -8768,11 +8995,11 @@
       <w:pPr>
         <w:pStyle w:val="Heading2"/>
       </w:pPr>
-      <w:bookmarkStart w:id="44" w:name="_Toc241663458"/>
+      <w:bookmarkStart w:id="46" w:name="_Toc241663964"/>
       <w:r>
         <w:t>Tasks</w:t>
       </w:r>
-      <w:bookmarkEnd w:id="44"/>
+      <w:bookmarkEnd w:id="46"/>
     </w:p>
     <w:p>
       <w:pPr>
@@ -8786,11 +9013,11 @@
       <w:pPr>
         <w:pStyle w:val="Heading2"/>
       </w:pPr>
-      <w:bookmarkStart w:id="45" w:name="_Toc241663459"/>
+      <w:bookmarkStart w:id="47" w:name="_Toc241663965"/>
       <w:r>
         <w:t>Booth Filters and Facility Checklist</w:t>
       </w:r>
-      <w:bookmarkEnd w:id="45"/>
+      <w:bookmarkEnd w:id="47"/>
     </w:p>
     <w:p>
       <w:pPr>
@@ -8824,11 +9051,11 @@
       <w:pPr>
         <w:pStyle w:val="Heading2"/>
       </w:pPr>
-      <w:bookmarkStart w:id="46" w:name="_Toc241663460"/>
+      <w:bookmarkStart w:id="48" w:name="_Toc241663966"/>
       <w:r>
         <w:t>AR Balances and Cycle Time</w:t>
       </w:r>
-      <w:bookmarkEnd w:id="46"/>
+      <w:bookmarkEnd w:id="48"/>
     </w:p>
     <w:p>
       <w:pPr>
@@ -8874,11 +9101,11 @@
       <w:pPr>
         <w:pStyle w:val="Heading2"/>
       </w:pPr>
-      <w:bookmarkStart w:id="47" w:name="_Toc241663461"/>
+      <w:bookmarkStart w:id="49" w:name="_Toc241663967"/>
       <w:r>
         <w:t>Photos and Activity Log</w:t>
       </w:r>
-      <w:bookmarkEnd w:id="47"/>
+      <w:bookmarkEnd w:id="49"/>
     </w:p>
     <w:p>
       <w:pPr>
@@ -8925,21 +9152,21 @@
         <w:pStyle w:val="Heading1"/>
         <w:pageBreakBefore/>
       </w:pPr>
-      <w:bookmarkStart w:id="48" w:name="_Toc241663462"/>
+      <w:bookmarkStart w:id="50" w:name="_Toc241663968"/>
       <w:r>
         <w:t>13.  Time off and messages (office and admins)</w:t>
       </w:r>
-      <w:bookmarkEnd w:id="48"/>
+      <w:bookmarkEnd w:id="50"/>
     </w:p>
     <w:p>
       <w:pPr>
         <w:pStyle w:val="Heading2"/>
       </w:pPr>
-      <w:bookmarkStart w:id="49" w:name="_Toc241663463"/>
+      <w:bookmarkStart w:id="51" w:name="_Toc241663969"/>
       <w:r>
         <w:t>Time Off tab</w:t>
       </w:r>
-      <w:bookmarkEnd w:id="49"/>
+      <w:bookmarkEnd w:id="51"/>
     </w:p>
     <w:p>
       <w:pPr>
@@ -8964,7 +9191,7 @@
         <w:pStyle w:val="ListParagraph"/>
         <w:numPr>
           <w:ilvl w:val="0"/>
-          <w:numId w:val="14"/>
+          <w:numId w:val="15"/>
         </w:numPr>
         <w:spacing w:after="60"/>
       </w:pPr>
@@ -8987,7 +9214,7 @@
         <w:pStyle w:val="ListParagraph"/>
         <w:numPr>
           <w:ilvl w:val="0"/>
-          <w:numId w:val="14"/>
+          <w:numId w:val="15"/>
         </w:numPr>
         <w:spacing w:after="60"/>
       </w:pPr>
@@ -9020,7 +9247,7 @@
         <w:pStyle w:val="ListParagraph"/>
         <w:numPr>
           <w:ilvl w:val="0"/>
-          <w:numId w:val="14"/>
+          <w:numId w:val="15"/>
         </w:numPr>
         <w:spacing w:after="60"/>
       </w:pPr>
@@ -9063,11 +9290,11 @@
       <w:pPr>
         <w:pStyle w:val="Heading2"/>
       </w:pPr>
-      <w:bookmarkStart w:id="50" w:name="_Toc241663464"/>
+      <w:bookmarkStart w:id="52" w:name="_Toc241663970"/>
       <w:r>
         <w:t>Messages &amp; Info tab</w:t>
       </w:r>
-      <w:bookmarkEnd w:id="50"/>
+      <w:bookmarkEnd w:id="52"/>
     </w:p>
     <w:p>
       <w:pPr>
@@ -9154,28 +9381,28 @@
         <w:pStyle w:val="Heading1"/>
         <w:pageBreakBefore/>
       </w:pPr>
-      <w:bookmarkStart w:id="51" w:name="_Toc241663465"/>
+      <w:bookmarkStart w:id="53" w:name="_Toc241663971"/>
       <w:r>
         <w:t>14.  Admin: employees and settings</w:t>
       </w:r>
-      <w:bookmarkEnd w:id="51"/>
+      <w:bookmarkEnd w:id="53"/>
     </w:p>
     <w:p>
       <w:pPr>
         <w:pStyle w:val="Heading2"/>
       </w:pPr>
-      <w:bookmarkStart w:id="52" w:name="_Toc241663466"/>
+      <w:bookmarkStart w:id="54" w:name="_Toc241663972"/>
       <w:r>
         <w:t>Adding an employee</w:t>
       </w:r>
-      <w:bookmarkEnd w:id="52"/>
+      <w:bookmarkEnd w:id="54"/>
     </w:p>
     <w:p>
       <w:pPr>
         <w:pStyle w:val="ListParagraph"/>
         <w:numPr>
           <w:ilvl w:val="0"/>
-          <w:numId w:val="15"/>
+          <w:numId w:val="16"/>
         </w:numPr>
         <w:spacing w:after="60"/>
       </w:pPr>
@@ -9208,7 +9435,7 @@
         <w:pStyle w:val="ListParagraph"/>
         <w:numPr>
           <w:ilvl w:val="0"/>
-          <w:numId w:val="15"/>
+          <w:numId w:val="16"/>
         </w:numPr>
         <w:spacing w:after="60"/>
       </w:pPr>
@@ -9231,7 +9458,7 @@
         <w:pStyle w:val="ListParagraph"/>
         <w:numPr>
           <w:ilvl w:val="0"/>
-          <w:numId w:val="15"/>
+          <w:numId w:val="16"/>
         </w:numPr>
         <w:spacing w:after="60"/>
       </w:pPr>
@@ -9264,7 +9491,7 @@
         <w:pStyle w:val="ListParagraph"/>
         <w:numPr>
           <w:ilvl w:val="0"/>
-          <w:numId w:val="15"/>
+          <w:numId w:val="16"/>
         </w:numPr>
         <w:spacing w:after="60"/>
       </w:pPr>
@@ -9286,11 +9513,11 @@
       <w:pPr>
         <w:pStyle w:val="Heading2"/>
       </w:pPr>
-      <w:bookmarkStart w:id="53" w:name="_Toc241663467"/>
+      <w:bookmarkStart w:id="55" w:name="_Toc241663973"/>
       <w:r>
         <w:t>Changing an employee</w:t>
       </w:r>
-      <w:bookmarkEnd w:id="53"/>
+      <w:bookmarkEnd w:id="55"/>
     </w:p>
     <w:p>
       <w:pPr>
@@ -9446,11 +9673,11 @@
       <w:pPr>
         <w:pStyle w:val="Heading2"/>
       </w:pPr>
-      <w:bookmarkStart w:id="54" w:name="_Toc241663468"/>
+      <w:bookmarkStart w:id="56" w:name="_Toc241663974"/>
       <w:r>
         <w:t>Board Settings</w:t>
       </w:r>
-      <w:bookmarkEnd w:id="54"/>
+      <w:bookmarkEnd w:id="56"/>
     </w:p>
     <w:p>
       <w:pPr>
@@ -9465,11 +9692,11 @@
         <w:pStyle w:val="Heading1"/>
         <w:pageBreakBefore/>
       </w:pPr>
-      <w:bookmarkStart w:id="55" w:name="_Toc241663469"/>
+      <w:bookmarkStart w:id="57" w:name="_Toc241663975"/>
       <w:r>
         <w:t>15.  Quick answers</w:t>
       </w:r>
-      <w:bookmarkEnd w:id="55"/>
+      <w:bookmarkEnd w:id="57"/>
     </w:p>
     <w:tbl>
       <w:tblPr>
@@ -10109,11 +10336,11 @@
         <w:pStyle w:val="Heading1"/>
         <w:pageBreakBefore/>
       </w:pPr>
-      <w:bookmarkStart w:id="56" w:name="_Toc241663470"/>
+      <w:bookmarkStart w:id="58" w:name="_Toc241663976"/>
       <w:r>
         <w:t>Manual versions</w:t>
       </w:r>
-      <w:bookmarkEnd w:id="56"/>
+      <w:bookmarkEnd w:id="58"/>
     </w:p>
     <w:tbl>
       <w:tblPr>
@@ -10264,7 +10491,7 @@
                 <w:b/>
                 <w:bCs/>
               </w:rPr>
-              <w:t>2.1</w:t>
+              <w:t>2.2</w:t>
             </w:r>
           </w:p>
         </w:tc>
@@ -10308,17 +10535,17 @@
           </w:tcPr>
           <w:p>
             <w:r>
-              <w:t xml:space="preserve">New </w:t>
+              <w:t xml:space="preserve">On the shop touch board, technicians can </w:t>
             </w:r>
             <w:r>
               <w:rPr>
                 <w:b/>
                 <w:bCs/>
               </w:rPr>
-              <w:t>shop touch board</w:t>
-            </w:r>
-            <w:r>
-              <w:t>: technicians move cars to their next stage by tapping the car, the stage and their name.</w:t>
+              <w:t>drag</w:t>
+            </w:r>
+            <w:r>
+              <w:t xml:space="preserve"> a car to its next stage with a finger (tapping still works).</w:t>
             </w:r>
           </w:p>
         </w:tc>
@@ -10355,7 +10582,7 @@
                 <w:b/>
                 <w:bCs/>
               </w:rPr>
-              <w:t>2.0</w:t>
+              <w:t>2.1</w:t>
             </w:r>
           </w:p>
         </w:tc>
@@ -10399,27 +10626,17 @@
           </w:tcPr>
           <w:p>
             <w:r>
-              <w:t xml:space="preserve">The Employee App can be switched to </w:t>
+              <w:t xml:space="preserve">New </w:t>
             </w:r>
             <w:r>
               <w:rPr>
                 <w:b/>
                 <w:bCs/>
               </w:rPr>
-              <w:t>Spanish</w:t>
-            </w:r>
-            <w:r>
-              <w:t xml:space="preserve"> with the </w:t>
-            </w:r>
-            <w:r>
-              <w:rPr>
-                <w:b/>
-                <w:bCs/>
-              </w:rPr>
-              <w:t>Español</w:t>
-            </w:r>
-            <w:r>
-              <w:t xml:space="preserve"> button. Reports and the office program stay in English.</w:t>
+              <w:t>shop touch board</w:t>
+            </w:r>
+            <w:r>
+              <w:t>: technicians move cars to their next stage by tapping the car, the stage and their name.</w:t>
             </w:r>
           </w:p>
         </w:tc>
@@ -10456,7 +10673,7 @@
                 <w:b/>
                 <w:bCs/>
               </w:rPr>
-              <w:t>1.9</w:t>
+              <w:t>2.0</w:t>
             </w:r>
           </w:p>
         </w:tc>
@@ -10478,7 +10695,7 @@
           </w:tcPr>
           <w:p>
             <w:r>
-              <w:t>September 28, 2026</w:t>
+              <w:t>September 30, 2026</w:t>
             </w:r>
           </w:p>
         </w:tc>
@@ -10500,17 +10717,27 @@
           </w:tcPr>
           <w:p>
             <w:r>
-              <w:t xml:space="preserve">New </w:t>
+              <w:t xml:space="preserve">The Employee App can be switched to </w:t>
             </w:r>
             <w:r>
               <w:rPr>
                 <w:b/>
                 <w:bCs/>
               </w:rPr>
-              <w:t>Find a vehicle</w:t>
-            </w:r>
-            <w:r>
-              <w:t xml:space="preserve"> search at the top of the office program. It finds any car, at any stage or finished, by RO, customer, vehicle, VIN, plate or claim number.</w:t>
+              <w:t>Spanish</w:t>
+            </w:r>
+            <w:r>
+              <w:t xml:space="preserve"> with the </w:t>
+            </w:r>
+            <w:r>
+              <w:rPr>
+                <w:b/>
+                <w:bCs/>
+              </w:rPr>
+              <w:t>Español</w:t>
+            </w:r>
+            <w:r>
+              <w:t xml:space="preserve"> button. Reports and the office program stay in English.</w:t>
             </w:r>
           </w:p>
         </w:tc>
@@ -10547,7 +10774,7 @@
                 <w:b/>
                 <w:bCs/>
               </w:rPr>
-              <w:t>1.8</w:t>
+              <w:t>1.9</w:t>
             </w:r>
           </w:p>
         </w:tc>
@@ -10598,10 +10825,10 @@
                 <w:b/>
                 <w:bCs/>
               </w:rPr>
-              <w:t>Completed Jobs</w:t>
-            </w:r>
-            <w:r>
-              <w:t xml:space="preserve"> tab with each finished job's full file (production timeline, parts, QC, photos, every change). Only an admin can delete a delivered job or its parts.</w:t>
+              <w:t>Find a vehicle</w:t>
+            </w:r>
+            <w:r>
+              <w:t xml:space="preserve"> search at the top of the office program. It finds any car, at any stage or finished, by RO, customer, vehicle, VIN, plate or claim number.</w:t>
             </w:r>
           </w:p>
         </w:tc>
@@ -10638,7 +10865,7 @@
                 <w:b/>
                 <w:bCs/>
               </w:rPr>
-              <w:t>1.7</w:t>
+              <w:t>1.8</w:t>
             </w:r>
           </w:p>
         </w:tc>
@@ -10682,17 +10909,17 @@
           </w:tcPr>
           <w:p>
             <w:r>
-              <w:t xml:space="preserve">The Employee App now shows </w:t>
+              <w:t xml:space="preserve">New </w:t>
             </w:r>
             <w:r>
               <w:rPr>
                 <w:b/>
                 <w:bCs/>
               </w:rPr>
-              <w:t>where each part is</w:t>
-            </w:r>
-            <w:r>
-              <w:t>: the car's parts cart, and the cart shelf or storage spot for every part.</w:t>
+              <w:t>Completed Jobs</w:t>
+            </w:r>
+            <w:r>
+              <w:t xml:space="preserve"> tab with each finished job's full file (production timeline, parts, QC, photos, every change). Only an admin can delete a delivered job or its parts.</w:t>
             </w:r>
           </w:p>
         </w:tc>
@@ -10729,7 +10956,7 @@
                 <w:b/>
                 <w:bCs/>
               </w:rPr>
-              <w:t>1.6</w:t>
+              <w:t>1.7</w:t>
             </w:r>
           </w:p>
         </w:tc>
@@ -10773,37 +11000,17 @@
           </w:tcPr>
           <w:p>
             <w:r>
-              <w:t xml:space="preserve">Whoever does </w:t>
+              <w:t xml:space="preserve">The Employee App now shows </w:t>
             </w:r>
             <w:r>
               <w:rPr>
                 <w:b/>
                 <w:bCs/>
               </w:rPr>
-              <w:t>Check-In</w:t>
-            </w:r>
-            <w:r>
-              <w:t xml:space="preserve"> automatically gets the </w:t>
-            </w:r>
-            <w:r>
-              <w:rPr>
-                <w:b/>
-                <w:bCs/>
-              </w:rPr>
-              <w:t>Final QC</w:t>
-            </w:r>
-            <w:r>
-              <w:t xml:space="preserve"> checklist too. New </w:t>
-            </w:r>
-            <w:r>
-              <w:rPr>
-                <w:b/>
-                <w:bCs/>
-              </w:rPr>
-              <w:t>QC report</w:t>
-            </w:r>
-            <w:r>
-              <w:t xml:space="preserve"> for each car: all five checklists with signatures on one printable page.</w:t>
+              <w:t>where each part is</w:t>
+            </w:r>
+            <w:r>
+              <w:t>: the car's parts cart, and the cart shelf or storage spot for every part.</w:t>
             </w:r>
           </w:p>
         </w:tc>
@@ -10840,7 +11047,7 @@
                 <w:b/>
                 <w:bCs/>
               </w:rPr>
-              <w:t>1.5</w:t>
+              <w:t>1.6</w:t>
             </w:r>
           </w:p>
         </w:tc>
@@ -10884,17 +11091,37 @@
           </w:tcPr>
           <w:p>
             <w:r>
-              <w:t xml:space="preserve">Body technicians automatically get the </w:t>
+              <w:t xml:space="preserve">Whoever does </w:t>
             </w:r>
             <w:r>
               <w:rPr>
                 <w:b/>
                 <w:bCs/>
               </w:rPr>
-              <w:t>Reassy</w:t>
-            </w:r>
-            <w:r>
-              <w:t xml:space="preserve"> checklist too.</w:t>
+              <w:t>Check-In</w:t>
+            </w:r>
+            <w:r>
+              <w:t xml:space="preserve"> automatically gets the </w:t>
+            </w:r>
+            <w:r>
+              <w:rPr>
+                <w:b/>
+                <w:bCs/>
+              </w:rPr>
+              <w:t>Final QC</w:t>
+            </w:r>
+            <w:r>
+              <w:t xml:space="preserve"> checklist too. New </w:t>
+            </w:r>
+            <w:r>
+              <w:rPr>
+                <w:b/>
+                <w:bCs/>
+              </w:rPr>
+              <w:t>QC report</w:t>
+            </w:r>
+            <w:r>
+              <w:t xml:space="preserve"> for each car: all five checklists with signatures on one printable page.</w:t>
             </w:r>
           </w:p>
         </w:tc>
@@ -10931,7 +11158,7 @@
                 <w:b/>
                 <w:bCs/>
               </w:rPr>
-              <w:t>1.4</w:t>
+              <w:t>1.5</w:t>
             </w:r>
           </w:p>
         </w:tc>
@@ -10975,17 +11202,17 @@
           </w:tcPr>
           <w:p>
             <w:r>
-              <w:t xml:space="preserve">Employees can be set to </w:t>
+              <w:t xml:space="preserve">Body technicians automatically get the </w:t>
             </w:r>
             <w:r>
               <w:rPr>
                 <w:b/>
                 <w:bCs/>
               </w:rPr>
-              <w:t>also do</w:t>
-            </w:r>
-            <w:r>
-              <w:t xml:space="preserve"> other checklists (for example a body tech who reassembles also gets the Reassy checklist).</w:t>
+              <w:t>Reassy</w:t>
+            </w:r>
+            <w:r>
+              <w:t xml:space="preserve"> checklist too.</w:t>
             </w:r>
           </w:p>
         </w:tc>
@@ -11022,7 +11249,7 @@
                 <w:b/>
                 <w:bCs/>
               </w:rPr>
-              <w:t>1.3</w:t>
+              <w:t>1.4</w:t>
             </w:r>
           </w:p>
         </w:tc>
@@ -11066,7 +11293,17 @@
           </w:tcPr>
           <w:p>
             <w:r>
-              <w:t>New accounts and admin password resets use a temporary password; you choose your own the first time you sign in.</w:t>
+              <w:t xml:space="preserve">Employees can be set to </w:t>
+            </w:r>
+            <w:r>
+              <w:rPr>
+                <w:b/>
+                <w:bCs/>
+              </w:rPr>
+              <w:t>also do</w:t>
+            </w:r>
+            <w:r>
+              <w:t xml:space="preserve"> other checklists (for example a body tech who reassembles also gets the Reassy checklist).</w:t>
             </w:r>
           </w:p>
         </w:tc>
@@ -11103,7 +11340,7 @@
                 <w:b/>
                 <w:bCs/>
               </w:rPr>
-              <w:t>1.2</w:t>
+              <w:t>1.3</w:t>
             </w:r>
           </w:p>
         </w:tc>
@@ -11147,17 +11384,7 @@
           </w:tcPr>
           <w:p>
             <w:r>
-              <w:t xml:space="preserve">Added the </w:t>
-            </w:r>
-            <w:r>
-              <w:rPr>
-                <w:b/>
-                <w:bCs/>
-              </w:rPr>
-              <w:t>Help</w:t>
-            </w:r>
-            <w:r>
-              <w:t xml:space="preserve"> tab in the office program and a search box in the manual.</w:t>
+              <w:t>New accounts and admin password resets use a temporary password; you choose your own the first time you sign in.</w:t>
             </w:r>
           </w:p>
         </w:tc>
@@ -11194,7 +11421,7 @@
                 <w:b/>
                 <w:bCs/>
               </w:rPr>
-              <w:t>1.1</w:t>
+              <w:t>1.2</w:t>
             </w:r>
           </w:p>
         </w:tc>
@@ -11238,17 +11465,17 @@
           </w:tcPr>
           <w:p>
             <w:r>
-              <w:t xml:space="preserve">Employee App address is now </w:t>
+              <w:t xml:space="preserve">Added the </w:t>
             </w:r>
             <w:r>
               <w:rPr>
                 <w:b/>
                 <w:bCs/>
               </w:rPr>
-              <w:t>https://conceptautobody.app</w:t>
-            </w:r>
-            <w:r>
-              <w:t xml:space="preserve"> and works on phones anywhere. Added how to put it on your phone's home screen.</w:t>
+              <w:t>Help</w:t>
+            </w:r>
+            <w:r>
+              <w:t xml:space="preserve"> tab in the office program and a search box in the manual.</w:t>
             </w:r>
           </w:p>
         </w:tc>
@@ -11285,7 +11512,7 @@
                 <w:b/>
                 <w:bCs/>
               </w:rPr>
-              <w:t>1.0</w:t>
+              <w:t>1.1</w:t>
             </w:r>
           </w:p>
         </w:tc>
@@ -11329,6 +11556,97 @@
           </w:tcPr>
           <w:p>
             <w:r>
+              <w:t xml:space="preserve">Employee App address is now </w:t>
+            </w:r>
+            <w:r>
+              <w:rPr>
+                <w:b/>
+                <w:bCs/>
+              </w:rPr>
+              <w:t>https://conceptautobody.app</w:t>
+            </w:r>
+            <w:r>
+              <w:t xml:space="preserve"> and works on phones anywhere. Added how to put it on your phone's home screen.</w:t>
+            </w:r>
+          </w:p>
+        </w:tc>
+      </w:tr>
+      <w:tr>
+        <w:tblPrEx>
+          <w:tblCellMar>
+            <w:top w:w="0" w:type="dxa"/>
+            <w:bottom w:w="0" w:type="dxa"/>
+          </w:tblCellMar>
+        </w:tblPrEx>
+        <w:trPr>
+          <w:cantSplit/>
+        </w:trPr>
+        <w:tc>
+          <w:tcPr>
+            <w:tcW w:w="3120" w:type="dxa"/>
+            <w:tcBorders>
+              <w:top w:val="single" w:sz="4" w:space="0" w:color="C9CFD6"/>
+              <w:left w:val="single" w:sz="4" w:space="0" w:color="C9CFD6"/>
+              <w:bottom w:val="single" w:sz="4" w:space="0" w:color="C9CFD6"/>
+              <w:right w:val="single" w:sz="4" w:space="0" w:color="C9CFD6"/>
+            </w:tcBorders>
+            <w:tcMar>
+              <w:top w:w="80" w:type="dxa"/>
+              <w:left w:w="120" w:type="dxa"/>
+              <w:bottom w:w="80" w:type="dxa"/>
+              <w:right w:w="120" w:type="dxa"/>
+            </w:tcMar>
+          </w:tcPr>
+          <w:p>
+            <w:r>
+              <w:rPr>
+                <w:b/>
+                <w:bCs/>
+              </w:rPr>
+              <w:t>1.0</w:t>
+            </w:r>
+          </w:p>
+        </w:tc>
+        <w:tc>
+          <w:tcPr>
+            <w:tcW w:w="3120" w:type="dxa"/>
+            <w:tcBorders>
+              <w:top w:val="single" w:sz="4" w:space="0" w:color="C9CFD6"/>
+              <w:left w:val="single" w:sz="4" w:space="0" w:color="C9CFD6"/>
+              <w:bottom w:val="single" w:sz="4" w:space="0" w:color="C9CFD6"/>
+              <w:right w:val="single" w:sz="4" w:space="0" w:color="C9CFD6"/>
+            </w:tcBorders>
+            <w:tcMar>
+              <w:top w:w="80" w:type="dxa"/>
+              <w:left w:w="120" w:type="dxa"/>
+              <w:bottom w:w="80" w:type="dxa"/>
+              <w:right w:w="120" w:type="dxa"/>
+            </w:tcMar>
+          </w:tcPr>
+          <w:p>
+            <w:r>
+              <w:t>September 28, 2026</w:t>
+            </w:r>
+          </w:p>
+        </w:tc>
+        <w:tc>
+          <w:tcPr>
+            <w:tcW w:w="3120" w:type="dxa"/>
+            <w:tcBorders>
+              <w:top w:val="single" w:sz="4" w:space="0" w:color="C9CFD6"/>
+              <w:left w:val="single" w:sz="4" w:space="0" w:color="C9CFD6"/>
+              <w:bottom w:val="single" w:sz="4" w:space="0" w:color="C9CFD6"/>
+              <w:right w:val="single" w:sz="4" w:space="0" w:color="C9CFD6"/>
+            </w:tcBorders>
+            <w:tcMar>
+              <w:top w:w="80" w:type="dxa"/>
+              <w:left w:w="120" w:type="dxa"/>
+              <w:bottom w:w="80" w:type="dxa"/>
+              <w:right w:w="120" w:type="dxa"/>
+            </w:tcMar>
+          </w:tcPr>
+          <w:p>
+            <w:r>
               <w:t>First edition.</w:t>
             </w:r>
           </w:p>
@@ -11390,7 +11708,7 @@
         <w:sz w:val="18"/>
         <w:szCs w:val="18"/>
       </w:rPr>
-      <w:t xml:space="preserve">Concept Autobody  ·  Version 2.1  ·  Page </w:t>
+      <w:t xml:space="preserve">Concept Autobody  ·  Version 2.2  ·  Page </w:t>
     </w:r>
     <w:r>
       <w:rPr>
@@ -11483,290 +11801,296 @@
 <file path=word/numbering.xml><?xml version="1.0" encoding="utf-8"?>
 <w:numbering xmlns:wpc="http://schemas.microsoft.com/office/word/2010/wordprocessingCanvas" xmlns:cx="http://schemas.microsoft.com/office/drawing/2014/chartex" xmlns:cx1="http://schemas.microsoft.com/office/drawing/2015/9/8/chartex" xmlns:cx2="http://schemas.microsoft.com/office/drawing/2015/10/21/chartex" xmlns:cx3="http://schemas.microsoft.com/office/drawing/2016/5/9/chartex" xmlns:cx4="http://schemas.microsoft.com/office/drawing/2016/5/10/chartex" xmlns:cx5="http://schemas.microsoft.com/office/drawing/2016/5/11/chartex" xmlns:cx6="http://schemas.microsoft.com/office/drawing/2016/5/12/chartex" xmlns:cx7="http://schemas.microsoft.com/office/drawing/2016/5/13/chartex" xmlns:cx8="http://schemas.microsoft.com/office/drawing/2016/5/14/chartex" xmlns:mc="http://schemas.openxmlformats.org/markup-compatibility/2006" xmlns:aink="http://schemas.microsoft.com/office/drawing/2016/ink" xmlns:am3d="http://schemas.microsoft.com/office/drawing/2017/model3d" xmlns:o="urn:schemas-microsoft-com:office:office" xmlns:oel="http://schemas.microsoft.com/office/2019/extlst" xmlns:r="http://schemas.openxmlformats.org/officeDocument/2006/relationships" xmlns:m="http://schemas.openxmlformats.org/officeDocument/2006/math" xmlns:v="urn:schemas-microsoft-com:vml" xmlns:wp14="http://schemas.microsoft.com/office/word/2010/wordprocessingDrawing" xmlns:wp="http://schemas.openxmlformats.org/drawingml/2006/wordprocessingDrawing" xmlns:w10="urn:schemas-microsoft-com:office:word" xmlns:w="http://schemas.openxmlformats.org/wordprocessingml/2006/main" xmlns:w14="http://schemas.microsoft.com/office/word/2010/wordml" xmlns:w15="http://schemas.microsoft.com/office/word/2012/wordml" xmlns:w16cex="http://schemas.microsoft.com/office/word/2018/wordml/cex" xmlns:w16cid="http://schemas.microsoft.com/office/word/2016/wordml/cid" xmlns:w16="http://schemas.microsoft.com/office/word/2018/wordml" xmlns:w16du="http://schemas.microsoft.com/office/word/2023/wordml/word16du" xmlns:w16sdtdh="http://schemas.microsoft.com/office/word/2020/wordml/sdtdatahash" xmlns:w16sdtfl="http://schemas.microsoft.com/office/word/2024/wordml/sdtformatlock" xmlns:w16se="http://schemas.microsoft.com/office/word/2015/wordml/symex" xmlns:wpg="http://schemas.microsoft.com/office/word/2010/wordprocessingGroup" xmlns:wpi="http://schemas.microsoft.com/office/word/2010/wordprocessingInk" xmlns:wne="http://schemas.microsoft.com/office/word/2006/wordml" xmlns:wps="http://schemas.microsoft.com/office/word/2010/wordprocessingShape" mc:Ignorable="w14 w15 w16se w16cid w16 w16cex w16sdtdh w16sdtfl w16du wp14">
   <w:abstractNum w:abstractNumId="0" w15:restartNumberingAfterBreak="0">
-    <w:nsid w:val="1F1B035C"/>
+    <w:nsid w:val="07DE08B3"/>
     <w:multiLevelType w:val="hybridMultilevel"/>
-    <w:tmpl w:val="313A0138"/>
-    <w:lvl w:ilvl="0" w:tplc="23E8DF2A">
+    <w:tmpl w:val="CBDA26FE"/>
+    <w:lvl w:ilvl="0" w:tplc="2ED4CE74">
       <w:start w:val="1"/>
-      <w:numFmt w:val="bullet"/>
-      <w:lvlText w:val="•"/>
+      <w:numFmt w:val="decimal"/>
+      <w:lvlText w:val="%1."/>
       <w:lvlJc w:val="left"/>
       <w:pPr>
-        <w:ind w:left="540" w:hanging="270"/>
-      </w:pPr>
+        <w:ind w:left="540" w:hanging="360"/>
+      </w:pPr>
+      <w:rPr>
+        <w:b/>
+        <w:bCs/>
+        <w:color w:val="E8620E"/>
+      </w:rPr>
     </w:lvl>
-    <w:lvl w:ilvl="1" w:tplc="E982CD38">
+    <w:lvl w:ilvl="1" w:tplc="E992408E">
       <w:numFmt w:val="decimal"/>
       <w:lvlText w:val=""/>
       <w:lvlJc w:val="left"/>
     </w:lvl>
-    <w:lvl w:ilvl="2" w:tplc="599C18E2">
+    <w:lvl w:ilvl="2" w:tplc="F328DCBA">
       <w:numFmt w:val="decimal"/>
       <w:lvlText w:val=""/>
       <w:lvlJc w:val="left"/>
     </w:lvl>
-    <w:lvl w:ilvl="3" w:tplc="00B0B580">
+    <w:lvl w:ilvl="3" w:tplc="4BD49252">
       <w:numFmt w:val="decimal"/>
       <w:lvlText w:val=""/>
       <w:lvlJc w:val="left"/>
     </w:lvl>
-    <w:lvl w:ilvl="4" w:tplc="A59A7684">
+    <w:lvl w:ilvl="4" w:tplc="FB88188A">
       <w:numFmt w:val="decimal"/>
       <w:lvlText w:val=""/>
       <w:lvlJc w:val="left"/>
     </w:lvl>
-    <w:lvl w:ilvl="5" w:tplc="45761014">
+    <w:lvl w:ilvl="5" w:tplc="C78CC3EA">
       <w:numFmt w:val="decimal"/>
       <w:lvlText w:val=""/>
       <w:lvlJc w:val="left"/>
     </w:lvl>
-    <w:lvl w:ilvl="6" w:tplc="23CCBAD0">
+    <w:lvl w:ilvl="6" w:tplc="5D7CEC00">
       <w:numFmt w:val="decimal"/>
       <w:lvlText w:val=""/>
       <w:lvlJc w:val="left"/>
     </w:lvl>
-    <w:lvl w:ilvl="7" w:tplc="2EC22806">
+    <w:lvl w:ilvl="7" w:tplc="80FCAFD4">
       <w:numFmt w:val="decimal"/>
       <w:lvlText w:val=""/>
       <w:lvlJc w:val="left"/>
     </w:lvl>
-    <w:lvl w:ilvl="8" w:tplc="B79A304C">
+    <w:lvl w:ilvl="8" w:tplc="D46236C6">
       <w:numFmt w:val="decimal"/>
       <w:lvlText w:val=""/>
       <w:lvlJc w:val="left"/>
     </w:lvl>
   </w:abstractNum>
   <w:abstractNum w:abstractNumId="1" w15:restartNumberingAfterBreak="0">
-    <w:nsid w:val="24C307F9"/>
+    <w:nsid w:val="37613613"/>
     <w:multiLevelType w:val="hybridMultilevel"/>
-    <w:tmpl w:val="29C2559C"/>
-    <w:lvl w:ilvl="0" w:tplc="CC0ED220">
+    <w:tmpl w:val="621C4158"/>
+    <w:lvl w:ilvl="0" w:tplc="2482DA74" w:tentative="1">
       <w:start w:val="1"/>
-      <w:numFmt w:val="decimal"/>
-      <w:lvlText w:val="%1."/>
+      <w:numFmt w:val="bullet"/>
+      <w:lvlText w:val="●"/>
       <w:lvlJc w:val="left"/>
       <w:pPr>
-        <w:ind w:left="540" w:hanging="360"/>
-      </w:pPr>
-      <w:rPr>
-        <w:b/>
-        <w:bCs/>
-        <w:color w:val="E8620E"/>
-      </w:rPr>
+        <w:ind w:left="720" w:hanging="360"/>
+      </w:pPr>
     </w:lvl>
-    <w:lvl w:ilvl="1" w:tplc="992E2546">
+    <w:lvl w:ilvl="1" w:tplc="33EE7C32" w:tentative="1">
+      <w:start w:val="1"/>
+      <w:numFmt w:val="bullet"/>
+      <w:lvlText w:val="○"/>
+      <w:lvlJc w:val="left"/>
+      <w:pPr>
+        <w:ind w:left="1440" w:hanging="360"/>
+      </w:pPr>
+    </w:lvl>
+    <w:lvl w:ilvl="2" w:tplc="1748ABF0" w:tentative="1">
+      <w:start w:val="1"/>
+      <w:numFmt w:val="bullet"/>
+      <w:lvlText w:val="■"/>
+      <w:lvlJc w:val="left"/>
+      <w:pPr>
+        <w:ind w:left="2160" w:hanging="360"/>
+      </w:pPr>
+    </w:lvl>
+    <w:lvl w:ilvl="3" w:tplc="9BD82DF4" w:tentative="1">
+      <w:start w:val="1"/>
+      <w:numFmt w:val="bullet"/>
+      <w:lvlText w:val="●"/>
+      <w:lvlJc w:val="left"/>
+      <w:pPr>
+        <w:ind w:left="2880" w:hanging="360"/>
+      </w:pPr>
+    </w:lvl>
+    <w:lvl w:ilvl="4" w:tplc="3340656C" w:tentative="1">
+      <w:start w:val="1"/>
+      <w:numFmt w:val="bullet"/>
+      <w:lvlText w:val="○"/>
+      <w:lvlJc w:val="left"/>
+      <w:pPr>
+        <w:ind w:left="3600" w:hanging="360"/>
+      </w:pPr>
+    </w:lvl>
+    <w:lvl w:ilvl="5" w:tplc="79901256" w:tentative="1">
+      <w:start w:val="1"/>
+      <w:numFmt w:val="bullet"/>
+      <w:lvlText w:val="■"/>
+      <w:lvlJc w:val="left"/>
+      <w:pPr>
+        <w:ind w:left="4320" w:hanging="360"/>
+      </w:pPr>
+    </w:lvl>
+    <w:lvl w:ilvl="6" w:tplc="CA26D21E" w:tentative="1">
+      <w:start w:val="1"/>
+      <w:numFmt w:val="bullet"/>
+      <w:lvlText w:val="●"/>
+      <w:lvlJc w:val="left"/>
+      <w:pPr>
+        <w:ind w:left="5040" w:hanging="360"/>
+      </w:pPr>
+    </w:lvl>
+    <w:lvl w:ilvl="7" w:tplc="446C5874" w:tentative="1">
+      <w:start w:val="1"/>
+      <w:numFmt w:val="bullet"/>
+      <w:lvlText w:val="●"/>
+      <w:lvlJc w:val="left"/>
+      <w:pPr>
+        <w:ind w:left="5760" w:hanging="360"/>
+      </w:pPr>
+    </w:lvl>
+    <w:lvl w:ilvl="8" w:tplc="E66EBB66" w:tentative="1">
+      <w:start w:val="1"/>
+      <w:numFmt w:val="bullet"/>
+      <w:lvlText w:val="●"/>
+      <w:lvlJc w:val="left"/>
+      <w:pPr>
+        <w:ind w:left="6480" w:hanging="360"/>
+      </w:pPr>
+    </w:lvl>
+  </w:abstractNum>
+  <w:abstractNum w:abstractNumId="2" w15:restartNumberingAfterBreak="0">
+    <w:nsid w:val="7609025F"/>
+    <w:multiLevelType w:val="hybridMultilevel"/>
+    <w:tmpl w:val="34249346"/>
+    <w:lvl w:ilvl="0" w:tplc="62E08340">
+      <w:start w:val="1"/>
+      <w:numFmt w:val="bullet"/>
+      <w:lvlText w:val="•"/>
+      <w:lvlJc w:val="left"/>
+      <w:pPr>
+        <w:ind w:left="540" w:hanging="270"/>
+      </w:pPr>
+    </w:lvl>
+    <w:lvl w:ilvl="1" w:tplc="D84C607C">
       <w:numFmt w:val="decimal"/>
       <w:lvlText w:val=""/>
       <w:lvlJc w:val="left"/>
     </w:lvl>
-    <w:lvl w:ilvl="2" w:tplc="6DA24FC8">
+    <w:lvl w:ilvl="2" w:tplc="CF265B8A">
       <w:numFmt w:val="decimal"/>
       <w:lvlText w:val=""/>
       <w:lvlJc w:val="left"/>
     </w:lvl>
-    <w:lvl w:ilvl="3" w:tplc="024468DA">
+    <w:lvl w:ilvl="3" w:tplc="1B504946">
       <w:numFmt w:val="decimal"/>
       <w:lvlText w:val=""/>
       <w:lvlJc w:val="left"/>
     </w:lvl>
-    <w:lvl w:ilvl="4" w:tplc="FFA4C62C">
+    <w:lvl w:ilvl="4" w:tplc="914ECB8C">
       <w:numFmt w:val="decimal"/>
       <w:lvlText w:val=""/>
       <w:lvlJc w:val="left"/>
     </w:lvl>
-    <w:lvl w:ilvl="5" w:tplc="3E107650">
+    <w:lvl w:ilvl="5" w:tplc="4590FEFE">
       <w:numFmt w:val="decimal"/>
       <w:lvlText w:val=""/>
       <w:lvlJc w:val="left"/>
     </w:lvl>
-    <w:lvl w:ilvl="6" w:tplc="773489DA">
+    <w:lvl w:ilvl="6" w:tplc="DF5C5DB0">
       <w:numFmt w:val="decimal"/>
       <w:lvlText w:val=""/>
       <w:lvlJc w:val="left"/>
     </w:lvl>
-    <w:lvl w:ilvl="7" w:tplc="10AA98D8">
+    <w:lvl w:ilvl="7" w:tplc="9BA6A766">
       <w:numFmt w:val="decimal"/>
       <w:lvlText w:val=""/>
       <w:lvlJc w:val="left"/>
     </w:lvl>
-    <w:lvl w:ilvl="8" w:tplc="22D6F37A">
+    <w:lvl w:ilvl="8" w:tplc="A568F518">
       <w:numFmt w:val="decimal"/>
       <w:lvlText w:val=""/>
       <w:lvlJc w:val="left"/>
     </w:lvl>
   </w:abstractNum>
-  <w:abstractNum w:abstractNumId="2" w15:restartNumberingAfterBreak="0">
-    <w:nsid w:val="597D5447"/>
-    <w:multiLevelType w:val="hybridMultilevel"/>
-    <w:tmpl w:val="50A89D66"/>
-    <w:lvl w:ilvl="0" w:tplc="BBBA569C" w:tentative="1">
-      <w:start w:val="1"/>
-      <w:numFmt w:val="bullet"/>
-      <w:lvlText w:val="●"/>
-      <w:lvlJc w:val="left"/>
-      <w:pPr>
-        <w:ind w:left="720" w:hanging="360"/>
-      </w:pPr>
-    </w:lvl>
-    <w:lvl w:ilvl="1" w:tplc="EF94BEB8" w:tentative="1">
-      <w:start w:val="1"/>
-      <w:numFmt w:val="bullet"/>
-      <w:lvlText w:val="○"/>
-      <w:lvlJc w:val="left"/>
-      <w:pPr>
-        <w:ind w:left="1440" w:hanging="360"/>
-      </w:pPr>
-    </w:lvl>
-    <w:lvl w:ilvl="2" w:tplc="320C69EC" w:tentative="1">
-      <w:start w:val="1"/>
-      <w:numFmt w:val="bullet"/>
-      <w:lvlText w:val="■"/>
-      <w:lvlJc w:val="left"/>
-      <w:pPr>
-        <w:ind w:left="2160" w:hanging="360"/>
-      </w:pPr>
-    </w:lvl>
-    <w:lvl w:ilvl="3" w:tplc="172A2610" w:tentative="1">
-      <w:start w:val="1"/>
-      <w:numFmt w:val="bullet"/>
-      <w:lvlText w:val="●"/>
-      <w:lvlJc w:val="left"/>
-      <w:pPr>
-        <w:ind w:left="2880" w:hanging="360"/>
-      </w:pPr>
-    </w:lvl>
-    <w:lvl w:ilvl="4" w:tplc="7FF66C52" w:tentative="1">
-      <w:start w:val="1"/>
-      <w:numFmt w:val="bullet"/>
-      <w:lvlText w:val="○"/>
-      <w:lvlJc w:val="left"/>
-      <w:pPr>
-        <w:ind w:left="3600" w:hanging="360"/>
-      </w:pPr>
-    </w:lvl>
-    <w:lvl w:ilvl="5" w:tplc="26BAFA96" w:tentative="1">
-      <w:start w:val="1"/>
-      <w:numFmt w:val="bullet"/>
-      <w:lvlText w:val="■"/>
-      <w:lvlJc w:val="left"/>
-      <w:pPr>
-        <w:ind w:left="4320" w:hanging="360"/>
-      </w:pPr>
-    </w:lvl>
-    <w:lvl w:ilvl="6" w:tplc="FE34C2B8" w:tentative="1">
-      <w:start w:val="1"/>
-      <w:numFmt w:val="bullet"/>
-      <w:lvlText w:val="●"/>
-      <w:lvlJc w:val="left"/>
-      <w:pPr>
-        <w:ind w:left="5040" w:hanging="360"/>
-      </w:pPr>
-    </w:lvl>
-    <w:lvl w:ilvl="7" w:tplc="ACF4AD6A" w:tentative="1">
-      <w:start w:val="1"/>
-      <w:numFmt w:val="bullet"/>
-      <w:lvlText w:val="●"/>
-      <w:lvlJc w:val="left"/>
-      <w:pPr>
-        <w:ind w:left="5760" w:hanging="360"/>
-      </w:pPr>
-    </w:lvl>
-    <w:lvl w:ilvl="8" w:tplc="5F84E2E4" w:tentative="1">
-      <w:start w:val="1"/>
-      <w:numFmt w:val="bullet"/>
-      <w:lvlText w:val="●"/>
-      <w:lvlJc w:val="left"/>
-      <w:pPr>
-        <w:ind w:left="6480" w:hanging="360"/>
-      </w:pPr>
-    </w:lvl>
-  </w:abstractNum>
-  <w:num w:numId="1" w16cid:durableId="391971919">
+  <w:num w:numId="1" w16cid:durableId="1510369958">
+    <w:abstractNumId w:val="1"/>
+    <w:lvlOverride w:ilvl="0">
+      <w:startOverride w:val="1"/>
+    </w:lvlOverride>
+  </w:num>
+  <w:num w:numId="2" w16cid:durableId="501166494">
     <w:abstractNumId w:val="2"/>
     <w:lvlOverride w:ilvl="0">
       <w:startOverride w:val="1"/>
     </w:lvlOverride>
   </w:num>
-  <w:num w:numId="2" w16cid:durableId="749541668">
+  <w:num w:numId="3" w16cid:durableId="77094417">
     <w:abstractNumId w:val="0"/>
     <w:lvlOverride w:ilvl="0">
       <w:startOverride w:val="1"/>
     </w:lvlOverride>
   </w:num>
-  <w:num w:numId="3" w16cid:durableId="1437480542">
-    <w:abstractNumId w:val="1"/>
+  <w:num w:numId="4" w16cid:durableId="1838424141">
+    <w:abstractNumId w:val="0"/>
     <w:lvlOverride w:ilvl="0">
       <w:startOverride w:val="1"/>
     </w:lvlOverride>
   </w:num>
-  <w:num w:numId="4" w16cid:durableId="1600677636">
-    <w:abstractNumId w:val="1"/>
+  <w:num w:numId="5" w16cid:durableId="1071998778">
+    <w:abstractNumId w:val="0"/>
     <w:lvlOverride w:ilvl="0">
       <w:startOverride w:val="1"/>
     </w:lvlOverride>
   </w:num>
-  <w:num w:numId="5" w16cid:durableId="1702976223">
-    <w:abstractNumId w:val="1"/>
+  <w:num w:numId="6" w16cid:durableId="122815172">
+    <w:abstractNumId w:val="0"/>
     <w:lvlOverride w:ilvl="0">
       <w:startOverride w:val="1"/>
     </w:lvlOverride>
   </w:num>
-  <w:num w:numId="6" w16cid:durableId="1277835395">
-    <w:abstractNumId w:val="1"/>
+  <w:num w:numId="7" w16cid:durableId="1967540662">
+    <w:abstractNumId w:val="0"/>
     <w:lvlOverride w:ilvl="0">
       <w:startOverride w:val="1"/>
     </w:lvlOverride>
   </w:num>
-  <w:num w:numId="7" w16cid:durableId="1751149166">
-    <w:abstractNumId w:val="1"/>
+  <w:num w:numId="8" w16cid:durableId="1734084347">
+    <w:abstractNumId w:val="0"/>
     <w:lvlOverride w:ilvl="0">
       <w:startOverride w:val="1"/>
     </w:lvlOverride>
   </w:num>
-  <w:num w:numId="8" w16cid:durableId="1213421822">
-    <w:abstractNumId w:val="1"/>
+  <w:num w:numId="9" w16cid:durableId="1134831953">
+    <w:abstractNumId w:val="0"/>
     <w:lvlOverride w:ilvl="0">
       <w:startOverride w:val="1"/>
     </w:lvlOverride>
   </w:num>
-  <w:num w:numId="9" w16cid:durableId="971330162">
-    <w:abstractNumId w:val="1"/>
+  <w:num w:numId="10" w16cid:durableId="267011362">
+    <w:abstractNumId w:val="0"/>
     <w:lvlOverride w:ilvl="0">
       <w:startOverride w:val="1"/>
     </w:lvlOverride>
   </w:num>
-  <w:num w:numId="10" w16cid:durableId="719552117">
-    <w:abstractNumId w:val="1"/>
+  <w:num w:numId="11" w16cid:durableId="205265926">
+    <w:abstractNumId w:val="0"/>
     <w:lvlOverride w:ilvl="0">
       <w:startOverride w:val="1"/>
     </w:lvlOverride>
   </w:num>
-  <w:num w:numId="11" w16cid:durableId="1607081732">
-    <w:abstractNumId w:val="1"/>
+  <w:num w:numId="12" w16cid:durableId="1521777325">
+    <w:abstractNumId w:val="0"/>
     <w:lvlOverride w:ilvl="0">
       <w:startOverride w:val="1"/>
     </w:lvlOverride>
   </w:num>
-  <w:num w:numId="12" w16cid:durableId="1968314427">
-    <w:abstractNumId w:val="1"/>
+  <w:num w:numId="13" w16cid:durableId="346366415">
+    <w:abstractNumId w:val="0"/>
     <w:lvlOverride w:ilvl="0">
       <w:startOverride w:val="1"/>
     </w:lvlOverride>
   </w:num>
-  <w:num w:numId="13" w16cid:durableId="1715499374">
-    <w:abstractNumId w:val="1"/>
+  <w:num w:numId="14" w16cid:durableId="1288775262">
+    <w:abstractNumId w:val="0"/>
     <w:lvlOverride w:ilvl="0">
       <w:startOverride w:val="1"/>
     </w:lvlOverride>
   </w:num>
-  <w:num w:numId="14" w16cid:durableId="1373726809">
-    <w:abstractNumId w:val="1"/>
+  <w:num w:numId="15" w16cid:durableId="23752722">
+    <w:abstractNumId w:val="0"/>
     <w:lvlOverride w:ilvl="0">
       <w:startOverride w:val="1"/>
     </w:lvlOverride>
   </w:num>
-  <w:num w:numId="15" w16cid:durableId="483622657">
-    <w:abstractNumId w:val="1"/>
+  <w:num w:numId="16" w16cid:durableId="484317274">
+    <w:abstractNumId w:val="0"/>
     <w:lvlOverride w:ilvl="0">
       <w:startOverride w:val="1"/>
     </w:lvlOverride>
@@ -12418,7 +12742,7 @@
     <w:autoRedefine/>
     <w:uiPriority w:val="39"/>
     <w:unhideWhenUsed/>
-    <w:rsid w:val="0083545F"/>
+    <w:rsid w:val="00F4209D"/>
     <w:pPr>
       <w:spacing w:after="100"/>
     </w:pPr>
@@ -12430,7 +12754,7 @@
     <w:autoRedefine/>
     <w:uiPriority w:val="39"/>
     <w:unhideWhenUsed/>
-    <w:rsid w:val="0083545F"/>
+    <w:rsid w:val="00F4209D"/>
     <w:pPr>
       <w:spacing w:after="100"/>
       <w:ind w:left="220"/>

</xml_diff>

<commit_message>
Time off: email office staff on approve/deny with APPROVED/DENIED in the subject
The employee's decision message and email subject also show the decision in capitals.

Co-Authored-By: Claude Opus 5.5 <noreply@anthropic.com>
</commit_message>
<xml_diff>
--- a/client/manual/ShopControl-User-Manual.docx
+++ b/client/manual/ShopControl-User-Manual.docx
@@ -2240,7 +2240,27 @@
         <w:t xml:space="preserve">Only an admin can approve or deny</w:t>
       </w:r>
       <w:r>
-        <w:t xml:space="preserve"> a request. You'll get a message in your mailbox (and an email if your account has one) when it's decided.</w:t>
+        <w:t xml:space="preserve"> a request. You'll get a message in your mailbox (and an email if your account has one) when it's decided. The subject says </w:t>
+      </w:r>
+      <w:r>
+        <w:rPr>
+          <w:b/>
+          <w:bCs/>
+        </w:rPr>
+        <w:t xml:space="preserve">APPROVED</w:t>
+      </w:r>
+      <w:r>
+        <w:t xml:space="preserve"> or </w:t>
+      </w:r>
+      <w:r>
+        <w:rPr>
+          <w:b/>
+          <w:bCs/>
+        </w:rPr>
+        <w:t xml:space="preserve">DENIED</w:t>
+      </w:r>
+      <w:r>
+        <w:t xml:space="preserve">.</w:t>
       </w:r>
     </w:p>
     <w:p>
@@ -5300,7 +5320,27 @@
         <w:spacing w:after="60"/>
       </w:pPr>
       <w:r>
-        <w:t xml:space="preserve">The employee gets a mailbox message and an email with the decision.</w:t>
+        <w:t xml:space="preserve">The employee gets a mailbox message and an email with the decision. The office and admins also get an email, with </w:t>
+      </w:r>
+      <w:r>
+        <w:rPr>
+          <w:b/>
+          <w:bCs/>
+        </w:rPr>
+        <w:t xml:space="preserve">APPROVED</w:t>
+      </w:r>
+      <w:r>
+        <w:t xml:space="preserve"> or </w:t>
+      </w:r>
+      <w:r>
+        <w:rPr>
+          <w:b/>
+          <w:bCs/>
+        </w:rPr>
+        <w:t xml:space="preserve">DENIED</w:t>
+      </w:r>
+      <w:r>
+        <w:t xml:space="preserve"> and the employee's name in the subject (for example "Time-off request APPROVED · Jane Doe").</w:t>
       </w:r>
     </w:p>
     <w:p>

</xml_diff>

<commit_message>
Shop board refresh watchdog and Updated stamp; approve/deny time off in the employee app; manual v2.4
Chrome on the shop computers can stall the board's 20s poll, leaving stale data. A Web Worker tick (plus touch, focus, wake and reconnect) now reloads the data whenever it's overdue, and the corner shows when it last updated (red if over 90s).

Admins and owners get an Approve time off screen in Staff Hub with a waiting count.

Co-Authored-By: Claude Opus 5.5 <noreply@anthropic.com>
</commit_message>
<xml_diff>
--- a/client/manual/ShopControl-User-Manual.docx
+++ b/client/manual/ShopControl-User-Manual.docx
@@ -92,7 +92,7 @@
           <w:sz w:val="22"/>
           <w:szCs w:val="22"/>
         </w:rPr>
-        <w:t xml:space="preserve">Version 2.3  ·  Updated September 28, 2026</w:t>
+        <w:t xml:space="preserve">Version 2.4  ·  Updated October 6, 2026</w:t>
       </w:r>
     </w:p>
     <w:p>
@@ -2268,6 +2268,123 @@
         <w:pStyle w:val="Heading2"/>
       </w:pPr>
       <w:r>
+        <w:t xml:space="preserve">Approving time off on your phone (admins and owners)</w:t>
+      </w:r>
+    </w:p>
+    <w:p>
+      <w:pPr>
+        <w:pStyle w:val="ListParagraph"/>
+        <w:numPr>
+          <w:ilvl w:val="0"/>
+          <w:numId w:val="8"/>
+        </w:numPr>
+        <w:spacing w:after="60"/>
+      </w:pPr>
+      <w:r>
+        <w:t xml:space="preserve">Open </w:t>
+      </w:r>
+      <w:r>
+        <w:rPr>
+          <w:b/>
+          <w:bCs/>
+        </w:rPr>
+        <w:t xml:space="preserve">Staff Hub</w:t>
+      </w:r>
+      <w:r>
+        <w:t xml:space="preserve"> → </w:t>
+      </w:r>
+      <w:r>
+        <w:rPr>
+          <w:b/>
+          <w:bCs/>
+        </w:rPr>
+        <w:t xml:space="preserve">Approve time off</w:t>
+      </w:r>
+      <w:r>
+        <w:t xml:space="preserve">. The tile, and the Staff Hub button, show how many requests are waiting.</w:t>
+      </w:r>
+    </w:p>
+    <w:p>
+      <w:pPr>
+        <w:pStyle w:val="ListParagraph"/>
+        <w:numPr>
+          <w:ilvl w:val="0"/>
+          <w:numId w:val="8"/>
+        </w:numPr>
+        <w:spacing w:after="60"/>
+      </w:pPr>
+      <w:r>
+        <w:t xml:space="preserve">Tap </w:t>
+      </w:r>
+      <w:r>
+        <w:rPr>
+          <w:b/>
+          <w:bCs/>
+        </w:rPr>
+        <w:t xml:space="preserve">Approve</w:t>
+      </w:r>
+      <w:r>
+        <w:t xml:space="preserve"> or </w:t>
+      </w:r>
+      <w:r>
+        <w:rPr>
+          <w:b/>
+          <w:bCs/>
+        </w:rPr>
+        <w:t xml:space="preserve">Deny</w:t>
+      </w:r>
+      <w:r>
+        <w:t xml:space="preserve"> on a request, add an optional note to the employee, and confirm.</w:t>
+      </w:r>
+    </w:p>
+    <w:p>
+      <w:pPr>
+        <w:pStyle w:val="ListParagraph"/>
+        <w:numPr>
+          <w:ilvl w:val="0"/>
+          <w:numId w:val="8"/>
+        </w:numPr>
+        <w:spacing w:after="60"/>
+      </w:pPr>
+      <w:r>
+        <w:t xml:space="preserve">The employee gets a mailbox message and an email, and the office gets an email with </w:t>
+      </w:r>
+      <w:r>
+        <w:rPr>
+          <w:b/>
+          <w:bCs/>
+        </w:rPr>
+        <w:t xml:space="preserve">APPROVED</w:t>
+      </w:r>
+      <w:r>
+        <w:t xml:space="preserve"> or </w:t>
+      </w:r>
+      <w:r>
+        <w:rPr>
+          <w:b/>
+          <w:bCs/>
+        </w:rPr>
+        <w:t xml:space="preserve">DENIED</w:t>
+      </w:r>
+      <w:r>
+        <w:t xml:space="preserve"> in the subject. </w:t>
+      </w:r>
+      <w:r>
+        <w:rPr>
+          <w:b/>
+          <w:bCs/>
+        </w:rPr>
+        <w:t xml:space="preserve">Recently decided</w:t>
+      </w:r>
+      <w:r>
+        <w:t xml:space="preserve"> below shows the last decisions.</w:t>
+      </w:r>
+    </w:p>
+    <w:p>
+      <w:pPr>
+        <w:pStyle w:val="Heading2"/>
+      </w:pPr>
+      <w:r>
         <w:t xml:space="preserve">Checking your requests</w:t>
       </w:r>
     </w:p>
@@ -2930,7 +3047,7 @@
         <w:pStyle w:val="ListParagraph"/>
         <w:numPr>
           <w:ilvl w:val="0"/>
-          <w:numId w:val="8"/>
+          <w:numId w:val="9"/>
         </w:numPr>
         <w:spacing w:after="60"/>
       </w:pPr>
@@ -2973,7 +3090,7 @@
         <w:pStyle w:val="ListParagraph"/>
         <w:numPr>
           <w:ilvl w:val="0"/>
-          <w:numId w:val="8"/>
+          <w:numId w:val="9"/>
         </w:numPr>
         <w:spacing w:after="60"/>
       </w:pPr>
@@ -2986,7 +3103,7 @@
         <w:pStyle w:val="ListParagraph"/>
         <w:numPr>
           <w:ilvl w:val="0"/>
-          <w:numId w:val="8"/>
+          <w:numId w:val="9"/>
         </w:numPr>
         <w:spacing w:after="60"/>
       </w:pPr>
@@ -3009,7 +3126,7 @@
         <w:pStyle w:val="ListParagraph"/>
         <w:numPr>
           <w:ilvl w:val="0"/>
-          <w:numId w:val="8"/>
+          <w:numId w:val="9"/>
         </w:numPr>
         <w:spacing w:after="60"/>
       </w:pPr>
@@ -3119,7 +3236,7 @@
         <w:pStyle w:val="ListParagraph"/>
         <w:numPr>
           <w:ilvl w:val="0"/>
-          <w:numId w:val="9"/>
+          <w:numId w:val="10"/>
         </w:numPr>
         <w:spacing w:after="60"/>
       </w:pPr>
@@ -3132,7 +3249,7 @@
         <w:pStyle w:val="ListParagraph"/>
         <w:numPr>
           <w:ilvl w:val="0"/>
-          <w:numId w:val="9"/>
+          <w:numId w:val="10"/>
         </w:numPr>
         <w:spacing w:after="60"/>
       </w:pPr>
@@ -3165,7 +3282,7 @@
         <w:pStyle w:val="ListParagraph"/>
         <w:numPr>
           <w:ilvl w:val="0"/>
-          <w:numId w:val="9"/>
+          <w:numId w:val="10"/>
         </w:numPr>
         <w:spacing w:after="60"/>
       </w:pPr>
@@ -3661,7 +3778,27 @@
         <w:spacing w:after="120"/>
       </w:pPr>
       <w:r>
-        <w:t xml:space="preserve">The shop TV shows the Production Board full screen and scrolls through the columns by itself. It reloads every 3 hours to pick up updates. To open it on a computer, click </w:t>
+        <w:t xml:space="preserve">The shop TV shows the Production Board full screen and scrolls through the columns by itself. It reloads every 3 hours to pick up updates. </w:t>
+      </w:r>
+      <w:r>
+        <w:rPr>
+          <w:b/>
+          <w:bCs/>
+        </w:rPr>
+        <w:t xml:space="preserve">Updated 2:41 PM</w:t>
+      </w:r>
+      <w:r>
+        <w:t xml:space="preserve"> in the bottom-right corner shows when the board last got fresh data (it refreshes every 20 seconds). If it can't reach the server, the corner turns red and says </w:t>
+      </w:r>
+      <w:r>
+        <w:rPr>
+          <w:b/>
+          <w:bCs/>
+        </w:rPr>
+        <w:t xml:space="preserve">reconnecting</w:t>
+      </w:r>
+      <w:r>
+        <w:t xml:space="preserve">; it catches up on its own once the connection is back. To open it on a computer, click </w:t>
       </w:r>
       <w:r>
         <w:rPr>
@@ -3703,7 +3840,7 @@
         <w:pStyle w:val="ListParagraph"/>
         <w:numPr>
           <w:ilvl w:val="0"/>
-          <w:numId w:val="10"/>
+          <w:numId w:val="11"/>
         </w:numPr>
         <w:spacing w:after="60"/>
       </w:pPr>
@@ -3716,7 +3853,7 @@
         <w:pStyle w:val="ListParagraph"/>
         <w:numPr>
           <w:ilvl w:val="0"/>
-          <w:numId w:val="10"/>
+          <w:numId w:val="11"/>
         </w:numPr>
         <w:spacing w:after="60"/>
       </w:pPr>
@@ -3729,7 +3866,7 @@
         <w:pStyle w:val="ListParagraph"/>
         <w:numPr>
           <w:ilvl w:val="0"/>
-          <w:numId w:val="10"/>
+          <w:numId w:val="11"/>
         </w:numPr>
         <w:spacing w:after="60"/>
       </w:pPr>
@@ -3742,7 +3879,7 @@
         <w:pStyle w:val="ListParagraph"/>
         <w:numPr>
           <w:ilvl w:val="0"/>
-          <w:numId w:val="10"/>
+          <w:numId w:val="11"/>
         </w:numPr>
         <w:spacing w:after="60"/>
       </w:pPr>
@@ -3784,7 +3921,7 @@
         <w:pStyle w:val="ListParagraph"/>
         <w:numPr>
           <w:ilvl w:val="0"/>
-          <w:numId w:val="11"/>
+          <w:numId w:val="12"/>
         </w:numPr>
         <w:spacing w:after="60"/>
       </w:pPr>
@@ -3797,7 +3934,7 @@
         <w:pStyle w:val="ListParagraph"/>
         <w:numPr>
           <w:ilvl w:val="0"/>
-          <w:numId w:val="11"/>
+          <w:numId w:val="12"/>
         </w:numPr>
         <w:spacing w:after="60"/>
       </w:pPr>
@@ -3820,7 +3957,7 @@
         <w:pStyle w:val="ListParagraph"/>
         <w:numPr>
           <w:ilvl w:val="0"/>
-          <w:numId w:val="11"/>
+          <w:numId w:val="12"/>
         </w:numPr>
         <w:spacing w:after="60"/>
       </w:pPr>
@@ -3833,7 +3970,7 @@
         <w:pStyle w:val="ListParagraph"/>
         <w:numPr>
           <w:ilvl w:val="0"/>
-          <w:numId w:val="11"/>
+          <w:numId w:val="12"/>
         </w:numPr>
         <w:spacing w:after="60"/>
       </w:pPr>
@@ -3913,7 +4050,7 @@
         <w:pStyle w:val="ListParagraph"/>
         <w:numPr>
           <w:ilvl w:val="0"/>
-          <w:numId w:val="12"/>
+          <w:numId w:val="13"/>
         </w:numPr>
         <w:spacing w:after="60"/>
       </w:pPr>
@@ -3966,7 +4103,7 @@
         <w:pStyle w:val="ListParagraph"/>
         <w:numPr>
           <w:ilvl w:val="0"/>
-          <w:numId w:val="12"/>
+          <w:numId w:val="13"/>
         </w:numPr>
         <w:spacing w:after="60"/>
       </w:pPr>
@@ -3979,7 +4116,7 @@
         <w:pStyle w:val="ListParagraph"/>
         <w:numPr>
           <w:ilvl w:val="0"/>
-          <w:numId w:val="12"/>
+          <w:numId w:val="13"/>
         </w:numPr>
         <w:spacing w:after="60"/>
       </w:pPr>
@@ -4261,7 +4398,7 @@
         <w:pStyle w:val="ListParagraph"/>
         <w:numPr>
           <w:ilvl w:val="0"/>
-          <w:numId w:val="13"/>
+          <w:numId w:val="14"/>
         </w:numPr>
         <w:spacing w:after="60"/>
       </w:pPr>
@@ -4284,7 +4421,7 @@
         <w:pStyle w:val="ListParagraph"/>
         <w:numPr>
           <w:ilvl w:val="0"/>
-          <w:numId w:val="13"/>
+          <w:numId w:val="14"/>
         </w:numPr>
         <w:spacing w:after="60"/>
       </w:pPr>
@@ -4307,7 +4444,7 @@
         <w:pStyle w:val="ListParagraph"/>
         <w:numPr>
           <w:ilvl w:val="0"/>
-          <w:numId w:val="13"/>
+          <w:numId w:val="14"/>
         </w:numPr>
         <w:spacing w:after="60"/>
       </w:pPr>
@@ -4366,7 +4503,7 @@
         <w:pStyle w:val="ListParagraph"/>
         <w:numPr>
           <w:ilvl w:val="0"/>
-          <w:numId w:val="14"/>
+          <w:numId w:val="15"/>
         </w:numPr>
         <w:spacing w:after="60"/>
       </w:pPr>
@@ -4389,7 +4526,7 @@
         <w:pStyle w:val="ListParagraph"/>
         <w:numPr>
           <w:ilvl w:val="0"/>
-          <w:numId w:val="14"/>
+          <w:numId w:val="15"/>
         </w:numPr>
         <w:spacing w:after="60"/>
       </w:pPr>
@@ -4412,7 +4549,7 @@
         <w:pStyle w:val="ListParagraph"/>
         <w:numPr>
           <w:ilvl w:val="0"/>
-          <w:numId w:val="14"/>
+          <w:numId w:val="15"/>
         </w:numPr>
         <w:spacing w:after="60"/>
       </w:pPr>
@@ -5259,7 +5396,7 @@
         <w:pStyle w:val="ListParagraph"/>
         <w:numPr>
           <w:ilvl w:val="0"/>
-          <w:numId w:val="15"/>
+          <w:numId w:val="16"/>
         </w:numPr>
         <w:spacing w:after="60"/>
       </w:pPr>
@@ -5282,7 +5419,7 @@
         <w:pStyle w:val="ListParagraph"/>
         <w:numPr>
           <w:ilvl w:val="0"/>
-          <w:numId w:val="15"/>
+          <w:numId w:val="16"/>
         </w:numPr>
         <w:spacing w:after="60"/>
       </w:pPr>
@@ -5315,7 +5452,7 @@
         <w:pStyle w:val="ListParagraph"/>
         <w:numPr>
           <w:ilvl w:val="0"/>
-          <w:numId w:val="15"/>
+          <w:numId w:val="16"/>
         </w:numPr>
         <w:spacing w:after="60"/>
       </w:pPr>
@@ -5371,7 +5508,17 @@
         <w:t xml:space="preserve">admins and owners</w:t>
       </w:r>
       <w:r>
-        <w:t xml:space="preserve"> can approve or deny. Managers and office staff can see requests but not decide them.</w:t>
+        <w:t xml:space="preserve"> can approve or deny, here or in the Employee App (Staff Hub → </w:t>
+      </w:r>
+      <w:r>
+        <w:rPr>
+          <w:b/>
+          <w:bCs/>
+        </w:rPr>
+        <w:t xml:space="preserve">Approve time off</w:t>
+      </w:r>
+      <w:r>
+        <w:t xml:space="preserve">). Managers and office staff can see requests but not decide them.</w:t>
       </w:r>
     </w:p>
     <w:p>
@@ -5484,7 +5631,7 @@
         <w:pStyle w:val="ListParagraph"/>
         <w:numPr>
           <w:ilvl w:val="0"/>
-          <w:numId w:val="16"/>
+          <w:numId w:val="17"/>
         </w:numPr>
         <w:spacing w:after="60"/>
       </w:pPr>
@@ -5517,7 +5664,7 @@
         <w:pStyle w:val="ListParagraph"/>
         <w:numPr>
           <w:ilvl w:val="0"/>
-          <w:numId w:val="16"/>
+          <w:numId w:val="17"/>
         </w:numPr>
         <w:spacing w:after="60"/>
       </w:pPr>
@@ -5540,7 +5687,7 @@
         <w:pStyle w:val="ListParagraph"/>
         <w:numPr>
           <w:ilvl w:val="0"/>
-          <w:numId w:val="16"/>
+          <w:numId w:val="17"/>
         </w:numPr>
         <w:spacing w:after="60"/>
       </w:pPr>
@@ -5573,7 +5720,7 @@
         <w:pStyle w:val="ListParagraph"/>
         <w:numPr>
           <w:ilvl w:val="0"/>
-          <w:numId w:val="16"/>
+          <w:numId w:val="17"/>
         </w:numPr>
         <w:spacing w:after="60"/>
       </w:pPr>
@@ -6483,7 +6630,7 @@
                 <w:b/>
                 <w:bCs/>
               </w:rPr>
-              <w:t xml:space="preserve">2.3</w:t>
+              <w:t xml:space="preserve">2.4</w:t>
             </w:r>
           </w:p>
         </w:tc>
@@ -6505,7 +6652,7 @@
           </w:tcPr>
           <w:p>
             <w:r>
-              <w:t xml:space="preserve">October 5, 2026</w:t>
+              <w:t xml:space="preserve">October 6, 2026</w:t>
             </w:r>
           </w:p>
         </w:tc>
@@ -6527,37 +6674,17 @@
           </w:tcPr>
           <w:p>
             <w:r>
-              <w:t xml:space="preserve">Estimates without an RO are now </w:t>
+              <w:t xml:space="preserve">Admins can </w:t>
             </w:r>
             <w:r>
               <w:rPr>
                 <w:b/>
                 <w:bCs/>
               </w:rPr>
-              <w:t xml:space="preserve">capture opportunities</w:t>
-            </w:r>
-            <w:r>
-              <w:t xml:space="preserve">: instead of cycle time emails, the office gets up to 3 reminders to call the customer. Log each call with </w:t>
-            </w:r>
-            <w:r>
-              <w:rPr>
-                <w:b/>
-                <w:bCs/>
-              </w:rPr>
-              <w:t xml:space="preserve">Log call</w:t>
-            </w:r>
-            <w:r>
-              <w:t xml:space="preserve"> under </w:t>
-            </w:r>
-            <w:r>
-              <w:rPr>
-                <w:b/>
-                <w:bCs/>
-              </w:rPr>
-              <w:t xml:space="preserve">Opportunities</w:t>
-            </w:r>
-            <w:r>
-              <w:t xml:space="preserve">.</w:t>
+              <w:t xml:space="preserve">approve or deny time off in the Employee App</w:t>
+            </w:r>
+            <w:r>
+              <w:t xml:space="preserve"> (Staff Hub → Approve time off), and the office is emailed every decision. The TV and shop touch board show when they last updated and catch up by themselves if they fall behind.</w:t>
             </w:r>
           </w:p>
         </w:tc>
@@ -6588,7 +6715,7 @@
                 <w:b/>
                 <w:bCs/>
               </w:rPr>
-              <w:t xml:space="preserve">2.2</w:t>
+              <w:t xml:space="preserve">2.3</w:t>
             </w:r>
           </w:p>
         </w:tc>
@@ -6610,7 +6737,7 @@
           </w:tcPr>
           <w:p>
             <w:r>
-              <w:t xml:space="preserve">September 30, 2026</w:t>
+              <w:t xml:space="preserve">October 5, 2026</w:t>
             </w:r>
           </w:p>
         </w:tc>
@@ -6632,17 +6759,37 @@
           </w:tcPr>
           <w:p>
             <w:r>
-              <w:t xml:space="preserve">On the shop touch board, technicians can </w:t>
+              <w:t xml:space="preserve">Estimates without an RO are now </w:t>
             </w:r>
             <w:r>
               <w:rPr>
                 <w:b/>
                 <w:bCs/>
               </w:rPr>
-              <w:t xml:space="preserve">drag</w:t>
-            </w:r>
-            <w:r>
-              <w:t xml:space="preserve"> a car to its next stage with a finger (tapping still works).</w:t>
+              <w:t xml:space="preserve">capture opportunities</w:t>
+            </w:r>
+            <w:r>
+              <w:t xml:space="preserve">: instead of cycle time emails, the office gets up to 3 reminders to call the customer. Log each call with </w:t>
+            </w:r>
+            <w:r>
+              <w:rPr>
+                <w:b/>
+                <w:bCs/>
+              </w:rPr>
+              <w:t xml:space="preserve">Log call</w:t>
+            </w:r>
+            <w:r>
+              <w:t xml:space="preserve"> under </w:t>
+            </w:r>
+            <w:r>
+              <w:rPr>
+                <w:b/>
+                <w:bCs/>
+              </w:rPr>
+              <w:t xml:space="preserve">Opportunities</w:t>
+            </w:r>
+            <w:r>
+              <w:t xml:space="preserve">.</w:t>
             </w:r>
           </w:p>
         </w:tc>
@@ -6673,7 +6820,7 @@
                 <w:b/>
                 <w:bCs/>
               </w:rPr>
-              <w:t xml:space="preserve">2.1</w:t>
+              <w:t xml:space="preserve">2.2</w:t>
             </w:r>
           </w:p>
         </w:tc>
@@ -6717,17 +6864,17 @@
           </w:tcPr>
           <w:p>
             <w:r>
-              <w:t xml:space="preserve">New </w:t>
+              <w:t xml:space="preserve">On the shop touch board, technicians can </w:t>
             </w:r>
             <w:r>
               <w:rPr>
                 <w:b/>
                 <w:bCs/>
               </w:rPr>
-              <w:t xml:space="preserve">shop touch board</w:t>
-            </w:r>
-            <w:r>
-              <w:t xml:space="preserve">: technicians move cars to their next stage by tapping the car, the stage and their name.</w:t>
+              <w:t xml:space="preserve">drag</w:t>
+            </w:r>
+            <w:r>
+              <w:t xml:space="preserve"> a car to its next stage with a finger (tapping still works).</w:t>
             </w:r>
           </w:p>
         </w:tc>
@@ -6758,7 +6905,7 @@
                 <w:b/>
                 <w:bCs/>
               </w:rPr>
-              <w:t xml:space="preserve">2.0</w:t>
+              <w:t xml:space="preserve">2.1</w:t>
             </w:r>
           </w:p>
         </w:tc>
@@ -6802,27 +6949,17 @@
           </w:tcPr>
           <w:p>
             <w:r>
-              <w:t xml:space="preserve">The Employee App can be switched to </w:t>
+              <w:t xml:space="preserve">New </w:t>
             </w:r>
             <w:r>
               <w:rPr>
                 <w:b/>
                 <w:bCs/>
               </w:rPr>
-              <w:t xml:space="preserve">Spanish</w:t>
-            </w:r>
-            <w:r>
-              <w:t xml:space="preserve"> with the </w:t>
-            </w:r>
-            <w:r>
-              <w:rPr>
-                <w:b/>
-                <w:bCs/>
-              </w:rPr>
-              <w:t xml:space="preserve">Español</w:t>
-            </w:r>
-            <w:r>
-              <w:t xml:space="preserve"> button. Reports and the office program stay in English.</w:t>
+              <w:t xml:space="preserve">shop touch board</w:t>
+            </w:r>
+            <w:r>
+              <w:t xml:space="preserve">: technicians move cars to their next stage by tapping the car, the stage and their name.</w:t>
             </w:r>
           </w:p>
         </w:tc>
@@ -6853,7 +6990,7 @@
                 <w:b/>
                 <w:bCs/>
               </w:rPr>
-              <w:t xml:space="preserve">1.9</w:t>
+              <w:t xml:space="preserve">2.0</w:t>
             </w:r>
           </w:p>
         </w:tc>
@@ -6875,7 +7012,7 @@
           </w:tcPr>
           <w:p>
             <w:r>
-              <w:t xml:space="preserve">September 28, 2026</w:t>
+              <w:t xml:space="preserve">September 30, 2026</w:t>
             </w:r>
           </w:p>
         </w:tc>
@@ -6897,17 +7034,27 @@
           </w:tcPr>
           <w:p>
             <w:r>
-              <w:t xml:space="preserve">New </w:t>
+              <w:t xml:space="preserve">The Employee App can be switched to </w:t>
             </w:r>
             <w:r>
               <w:rPr>
                 <w:b/>
                 <w:bCs/>
               </w:rPr>
-              <w:t xml:space="preserve">Find a vehicle</w:t>
-            </w:r>
-            <w:r>
-              <w:t xml:space="preserve"> search at the top of the office program. It finds any car, at any stage or finished, by RO, customer, vehicle, VIN, plate or claim number.</w:t>
+              <w:t xml:space="preserve">Spanish</w:t>
+            </w:r>
+            <w:r>
+              <w:t xml:space="preserve"> with the </w:t>
+            </w:r>
+            <w:r>
+              <w:rPr>
+                <w:b/>
+                <w:bCs/>
+              </w:rPr>
+              <w:t xml:space="preserve">Español</w:t>
+            </w:r>
+            <w:r>
+              <w:t xml:space="preserve"> button. Reports and the office program stay in English.</w:t>
             </w:r>
           </w:p>
         </w:tc>
@@ -6938,7 +7085,7 @@
                 <w:b/>
                 <w:bCs/>
               </w:rPr>
-              <w:t xml:space="preserve">1.8</w:t>
+              <w:t xml:space="preserve">1.9</w:t>
             </w:r>
           </w:p>
         </w:tc>
@@ -6989,10 +7136,10 @@
                 <w:b/>
                 <w:bCs/>
               </w:rPr>
-              <w:t xml:space="preserve">Completed Jobs</w:t>
-            </w:r>
-            <w:r>
-              <w:t xml:space="preserve"> tab with each finished job's full file (production timeline, parts, QC, photos, every change). Only an admin can delete a delivered job or its parts.</w:t>
+              <w:t xml:space="preserve">Find a vehicle</w:t>
+            </w:r>
+            <w:r>
+              <w:t xml:space="preserve"> search at the top of the office program. It finds any car, at any stage or finished, by RO, customer, vehicle, VIN, plate or claim number.</w:t>
             </w:r>
           </w:p>
         </w:tc>
@@ -7023,7 +7170,7 @@
                 <w:b/>
                 <w:bCs/>
               </w:rPr>
-              <w:t xml:space="preserve">1.7</w:t>
+              <w:t xml:space="preserve">1.8</w:t>
             </w:r>
           </w:p>
         </w:tc>
@@ -7067,17 +7214,17 @@
           </w:tcPr>
           <w:p>
             <w:r>
-              <w:t xml:space="preserve">The Employee App now shows </w:t>
+              <w:t xml:space="preserve">New </w:t>
             </w:r>
             <w:r>
               <w:rPr>
                 <w:b/>
                 <w:bCs/>
               </w:rPr>
-              <w:t xml:space="preserve">where each part is</w:t>
-            </w:r>
-            <w:r>
-              <w:t xml:space="preserve">: the car's parts cart, and the cart shelf or storage spot for every part.</w:t>
+              <w:t xml:space="preserve">Completed Jobs</w:t>
+            </w:r>
+            <w:r>
+              <w:t xml:space="preserve"> tab with each finished job's full file (production timeline, parts, QC, photos, every change). Only an admin can delete a delivered job or its parts.</w:t>
             </w:r>
           </w:p>
         </w:tc>
@@ -7108,7 +7255,7 @@
                 <w:b/>
                 <w:bCs/>
               </w:rPr>
-              <w:t xml:space="preserve">1.6</w:t>
+              <w:t xml:space="preserve">1.7</w:t>
             </w:r>
           </w:p>
         </w:tc>
@@ -7152,37 +7299,17 @@
           </w:tcPr>
           <w:p>
             <w:r>
-              <w:t xml:space="preserve">Whoever does </w:t>
+              <w:t xml:space="preserve">The Employee App now shows </w:t>
             </w:r>
             <w:r>
               <w:rPr>
                 <w:b/>
                 <w:bCs/>
               </w:rPr>
-              <w:t xml:space="preserve">Check-In</w:t>
-            </w:r>
-            <w:r>
-              <w:t xml:space="preserve"> automatically gets the </w:t>
-            </w:r>
-            <w:r>
-              <w:rPr>
-                <w:b/>
-                <w:bCs/>
-              </w:rPr>
-              <w:t xml:space="preserve">Final QC</w:t>
-            </w:r>
-            <w:r>
-              <w:t xml:space="preserve"> checklist too. New </w:t>
-            </w:r>
-            <w:r>
-              <w:rPr>
-                <w:b/>
-                <w:bCs/>
-              </w:rPr>
-              <w:t xml:space="preserve">QC report</w:t>
-            </w:r>
-            <w:r>
-              <w:t xml:space="preserve"> for each car: all five checklists with signatures on one printable page.</w:t>
+              <w:t xml:space="preserve">where each part is</w:t>
+            </w:r>
+            <w:r>
+              <w:t xml:space="preserve">: the car's parts cart, and the cart shelf or storage spot for every part.</w:t>
             </w:r>
           </w:p>
         </w:tc>
@@ -7213,7 +7340,7 @@
                 <w:b/>
                 <w:bCs/>
               </w:rPr>
-              <w:t xml:space="preserve">1.5</w:t>
+              <w:t xml:space="preserve">1.6</w:t>
             </w:r>
           </w:p>
         </w:tc>
@@ -7257,17 +7384,37 @@
           </w:tcPr>
           <w:p>
             <w:r>
-              <w:t xml:space="preserve">Body technicians automatically get the </w:t>
+              <w:t xml:space="preserve">Whoever does </w:t>
             </w:r>
             <w:r>
               <w:rPr>
                 <w:b/>
                 <w:bCs/>
               </w:rPr>
-              <w:t xml:space="preserve">Reassy</w:t>
-            </w:r>
-            <w:r>
-              <w:t xml:space="preserve"> checklist too.</w:t>
+              <w:t xml:space="preserve">Check-In</w:t>
+            </w:r>
+            <w:r>
+              <w:t xml:space="preserve"> automatically gets the </w:t>
+            </w:r>
+            <w:r>
+              <w:rPr>
+                <w:b/>
+                <w:bCs/>
+              </w:rPr>
+              <w:t xml:space="preserve">Final QC</w:t>
+            </w:r>
+            <w:r>
+              <w:t xml:space="preserve"> checklist too. New </w:t>
+            </w:r>
+            <w:r>
+              <w:rPr>
+                <w:b/>
+                <w:bCs/>
+              </w:rPr>
+              <w:t xml:space="preserve">QC report</w:t>
+            </w:r>
+            <w:r>
+              <w:t xml:space="preserve"> for each car: all five checklists with signatures on one printable page.</w:t>
             </w:r>
           </w:p>
         </w:tc>
@@ -7298,7 +7445,7 @@
                 <w:b/>
                 <w:bCs/>
               </w:rPr>
-              <w:t xml:space="preserve">1.4</w:t>
+              <w:t xml:space="preserve">1.5</w:t>
             </w:r>
           </w:p>
         </w:tc>
@@ -7342,17 +7489,17 @@
           </w:tcPr>
           <w:p>
             <w:r>
-              <w:t xml:space="preserve">Employees can be set to </w:t>
+              <w:t xml:space="preserve">Body technicians automatically get the </w:t>
             </w:r>
             <w:r>
               <w:rPr>
                 <w:b/>
                 <w:bCs/>
               </w:rPr>
-              <w:t xml:space="preserve">also do</w:t>
-            </w:r>
-            <w:r>
-              <w:t xml:space="preserve"> other checklists (for example a body tech who reassembles also gets the Reassy checklist).</w:t>
+              <w:t xml:space="preserve">Reassy</w:t>
+            </w:r>
+            <w:r>
+              <w:t xml:space="preserve"> checklist too.</w:t>
             </w:r>
           </w:p>
         </w:tc>
@@ -7383,7 +7530,7 @@
                 <w:b/>
                 <w:bCs/>
               </w:rPr>
-              <w:t xml:space="preserve">1.3</w:t>
+              <w:t xml:space="preserve">1.4</w:t>
             </w:r>
           </w:p>
         </w:tc>
@@ -7427,7 +7574,17 @@
           </w:tcPr>
           <w:p>
             <w:r>
-              <w:t xml:space="preserve">New accounts and admin password resets use a temporary password; you choose your own the first time you sign in.</w:t>
+              <w:t xml:space="preserve">Employees can be set to </w:t>
+            </w:r>
+            <w:r>
+              <w:rPr>
+                <w:b/>
+                <w:bCs/>
+              </w:rPr>
+              <w:t xml:space="preserve">also do</w:t>
+            </w:r>
+            <w:r>
+              <w:t xml:space="preserve"> other checklists (for example a body tech who reassembles also gets the Reassy checklist).</w:t>
             </w:r>
           </w:p>
         </w:tc>
@@ -7458,7 +7615,7 @@
                 <w:b/>
                 <w:bCs/>
               </w:rPr>
-              <w:t xml:space="preserve">1.2</w:t>
+              <w:t xml:space="preserve">1.3</w:t>
             </w:r>
           </w:p>
         </w:tc>
@@ -7502,17 +7659,7 @@
           </w:tcPr>
           <w:p>
             <w:r>
-              <w:t xml:space="preserve">Added the </w:t>
-            </w:r>
-            <w:r>
-              <w:rPr>
-                <w:b/>
-                <w:bCs/>
-              </w:rPr>
-              <w:t xml:space="preserve">Help</w:t>
-            </w:r>
-            <w:r>
-              <w:t xml:space="preserve"> tab in the office program and a search box in the manual.</w:t>
+              <w:t xml:space="preserve">New accounts and admin password resets use a temporary password; you choose your own the first time you sign in.</w:t>
             </w:r>
           </w:p>
         </w:tc>
@@ -7543,7 +7690,7 @@
                 <w:b/>
                 <w:bCs/>
               </w:rPr>
-              <w:t xml:space="preserve">1.1</w:t>
+              <w:t xml:space="preserve">1.2</w:t>
             </w:r>
           </w:p>
         </w:tc>
@@ -7587,17 +7734,17 @@
           </w:tcPr>
           <w:p>
             <w:r>
-              <w:t xml:space="preserve">Employee App address is now </w:t>
+              <w:t xml:space="preserve">Added the </w:t>
             </w:r>
             <w:r>
               <w:rPr>
                 <w:b/>
                 <w:bCs/>
               </w:rPr>
-              <w:t xml:space="preserve">https://conceptautobody.app</w:t>
-            </w:r>
-            <w:r>
-              <w:t xml:space="preserve"> and works on phones anywhere. Added how to put it on your phone's home screen.</w:t>
+              <w:t xml:space="preserve">Help</w:t>
+            </w:r>
+            <w:r>
+              <w:t xml:space="preserve"> tab in the office program and a search box in the manual.</w:t>
             </w:r>
           </w:p>
         </w:tc>
@@ -7628,7 +7775,7 @@
                 <w:b/>
                 <w:bCs/>
               </w:rPr>
-              <w:t xml:space="preserve">1.0</w:t>
+              <w:t xml:space="preserve">1.1</w:t>
             </w:r>
           </w:p>
         </w:tc>
@@ -7672,6 +7819,91 @@
           </w:tcPr>
           <w:p>
             <w:r>
+              <w:t xml:space="preserve">Employee App address is now </w:t>
+            </w:r>
+            <w:r>
+              <w:rPr>
+                <w:b/>
+                <w:bCs/>
+              </w:rPr>
+              <w:t xml:space="preserve">https://conceptautobody.app</w:t>
+            </w:r>
+            <w:r>
+              <w:t xml:space="preserve"> and works on phones anywhere. Added how to put it on your phone's home screen.</w:t>
+            </w:r>
+          </w:p>
+        </w:tc>
+      </w:tr>
+      <w:tr>
+        <w:trPr>
+          <w:cantSplit/>
+        </w:trPr>
+        <w:tc>
+          <w:tcPr>
+            <w:tcW w:type="dxa" w:w="3120"/>
+            <w:tcBorders>
+              <w:top w:val="single" w:color="C9CFD6" w:sz="4"/>
+              <w:left w:val="single" w:color="C9CFD6" w:sz="4"/>
+              <w:bottom w:val="single" w:color="C9CFD6" w:sz="4"/>
+              <w:right w:val="single" w:color="C9CFD6" w:sz="4"/>
+            </w:tcBorders>
+            <w:tcMar>
+              <w:top w:type="dxa" w:w="80"/>
+              <w:left w:type="dxa" w:w="120"/>
+              <w:bottom w:type="dxa" w:w="80"/>
+              <w:right w:type="dxa" w:w="120"/>
+            </w:tcMar>
+          </w:tcPr>
+          <w:p>
+            <w:r>
+              <w:rPr>
+                <w:b/>
+                <w:bCs/>
+              </w:rPr>
+              <w:t xml:space="preserve">1.0</w:t>
+            </w:r>
+          </w:p>
+        </w:tc>
+        <w:tc>
+          <w:tcPr>
+            <w:tcW w:type="dxa" w:w="3120"/>
+            <w:tcBorders>
+              <w:top w:val="single" w:color="C9CFD6" w:sz="4"/>
+              <w:left w:val="single" w:color="C9CFD6" w:sz="4"/>
+              <w:bottom w:val="single" w:color="C9CFD6" w:sz="4"/>
+              <w:right w:val="single" w:color="C9CFD6" w:sz="4"/>
+            </w:tcBorders>
+            <w:tcMar>
+              <w:top w:type="dxa" w:w="80"/>
+              <w:left w:type="dxa" w:w="120"/>
+              <w:bottom w:type="dxa" w:w="80"/>
+              <w:right w:type="dxa" w:w="120"/>
+            </w:tcMar>
+          </w:tcPr>
+          <w:p>
+            <w:r>
+              <w:t xml:space="preserve">September 28, 2026</w:t>
+            </w:r>
+          </w:p>
+        </w:tc>
+        <w:tc>
+          <w:tcPr>
+            <w:tcW w:type="dxa" w:w="3120"/>
+            <w:tcBorders>
+              <w:top w:val="single" w:color="C9CFD6" w:sz="4"/>
+              <w:left w:val="single" w:color="C9CFD6" w:sz="4"/>
+              <w:bottom w:val="single" w:color="C9CFD6" w:sz="4"/>
+              <w:right w:val="single" w:color="C9CFD6" w:sz="4"/>
+            </w:tcBorders>
+            <w:tcMar>
+              <w:top w:type="dxa" w:w="80"/>
+              <w:left w:type="dxa" w:w="120"/>
+              <w:bottom w:type="dxa" w:w="80"/>
+              <w:right w:type="dxa" w:w="120"/>
+            </w:tcMar>
+          </w:tcPr>
+          <w:p>
+            <w:r>
               <w:t xml:space="preserve">First edition.</w:t>
             </w:r>
           </w:p>
@@ -7745,7 +7977,7 @@
         <w:sz w:val="18"/>
         <w:szCs w:val="18"/>
       </w:rPr>
-      <w:t xml:space="preserve">Concept Autobody  ·  Version 2.3  ·  Page </w:t>
+      <w:t xml:space="preserve">Concept Autobody  ·  Version 2.4  ·  Page </w:t>
     </w:r>
     <w:r>
       <w:rPr>
@@ -8023,6 +8255,12 @@
     </w:lvlOverride>
   </w:num>
   <w:num w:numId="16">
+    <w:abstractNumId w:val="3"/>
+    <w:lvlOverride w:ilvl="0">
+      <w:startOverride w:val="1"/>
+    </w:lvlOverride>
+  </w:num>
+  <w:num w:numId="17">
     <w:abstractNumId w:val="3"/>
     <w:lvlOverride w:ilvl="0">
       <w:startOverride w:val="1"/>

</xml_diff>

<commit_message>
Employee app: Parts desk for office and parts staff; manual v2.5
Office, manager, admin, owner and parts accounts get a Parts desk in the
employee app with the office Parts tabs' features: filtered list by vehicle,
add/edit parts, bulk order (ETA), receive, mirror match onto a cart/shelf,
bulk edit and delete, carts & shelves (tap to move shelf), returns & alerts
with cores due, and storage locations. A car's Parts screen gets a Manage
parts shortcut. Floor plan and CSV export stay in the office program.

Co-Authored-By: Claude Opus 5.5 <noreply@anthropic.com>
</commit_message>
<xml_diff>
--- a/client/manual/ShopControl-User-Manual.docx
+++ b/client/manual/ShopControl-User-Manual.docx
@@ -92,7 +92,7 @@
           <w:sz w:val="22"/>
           <w:szCs w:val="22"/>
         </w:rPr>
-        <w:t xml:space="preserve">Version 2.4  ·  Updated October 6, 2026</w:t>
+        <w:t xml:space="preserve">Version 2.5  ·  Updated October 8, 2026</w:t>
       </w:r>
     </w:p>
     <w:p>
@@ -4631,7 +4631,187 @@
         <w:pStyle w:val="Heading2"/>
       </w:pPr>
       <w:r>
-        <w:t xml:space="preserve">Other parts screens</w:t>
+        <w:t xml:space="preserve">Parts desk on your phone (office and parts staff)</w:t>
+      </w:r>
+    </w:p>
+    <w:p>
+      <w:pPr>
+        <w:spacing w:after="120"/>
+      </w:pPr>
+      <w:r>
+        <w:t xml:space="preserve">Office, manager, admin, owner and parts accounts get a </w:t>
+      </w:r>
+      <w:r>
+        <w:rPr>
+          <w:b/>
+          <w:bCs/>
+        </w:rPr>
+        <w:t xml:space="preserve">Parts desk</w:t>
+      </w:r>
+      <w:r>
+        <w:t xml:space="preserve"> button on the Employee App home screen. It does what the Parts, Carts &amp; Shelves, Returns &amp; Alerts and Manage Locations tabs do. Technicians don't see it; they keep the read-only </w:t>
+      </w:r>
+      <w:r>
+        <w:rPr>
+          <w:b/>
+          <w:bCs/>
+        </w:rPr>
+        <w:t xml:space="preserve">Parts</w:t>
+      </w:r>
+      <w:r>
+        <w:t xml:space="preserve"> list on each car.</w:t>
+      </w:r>
+    </w:p>
+    <w:p>
+      <w:pPr>
+        <w:pStyle w:val="ListParagraph"/>
+        <w:numPr>
+          <w:ilvl w:val="0"/>
+          <w:numId w:val="16"/>
+        </w:numPr>
+        <w:spacing w:after="60"/>
+      </w:pPr>
+      <w:r>
+        <w:t xml:space="preserve">Tap </w:t>
+      </w:r>
+      <w:r>
+        <w:rPr>
+          <w:b/>
+          <w:bCs/>
+        </w:rPr>
+        <w:t xml:space="preserve">Parts desk</w:t>
+      </w:r>
+      <w:r>
+        <w:t xml:space="preserve">. Vehicles with parts are listed; use the search box or the filters (All open, Problems, Not arrived on time, Need to order and so on).</w:t>
+      </w:r>
+    </w:p>
+    <w:p>
+      <w:pPr>
+        <w:pStyle w:val="ListParagraph"/>
+        <w:numPr>
+          <w:ilvl w:val="0"/>
+          <w:numId w:val="16"/>
+        </w:numPr>
+        <w:spacing w:after="60"/>
+      </w:pPr>
+      <w:r>
+        <w:t xml:space="preserve">Tap a vehicle to see its parts. Tap the boxes to pick parts, or use </w:t>
+      </w:r>
+      <w:r>
+        <w:rPr>
+          <w:b/>
+          <w:bCs/>
+        </w:rPr>
+        <w:t xml:space="preserve">Select all</w:t>
+      </w:r>
+      <w:r>
+        <w:t xml:space="preserve">, </w:t>
+      </w:r>
+      <w:r>
+        <w:rPr>
+          <w:b/>
+          <w:bCs/>
+        </w:rPr>
+        <w:t xml:space="preserve">Already ordered</w:t>
+      </w:r>
+      <w:r>
+        <w:t xml:space="preserve"> or </w:t>
+      </w:r>
+      <w:r>
+        <w:rPr>
+          <w:b/>
+          <w:bCs/>
+        </w:rPr>
+        <w:t xml:space="preserve">Already mirror matched</w:t>
+      </w:r>
+      <w:r>
+        <w:t xml:space="preserve">.</w:t>
+      </w:r>
+    </w:p>
+    <w:p>
+      <w:pPr>
+        <w:pStyle w:val="ListParagraph"/>
+        <w:numPr>
+          <w:ilvl w:val="0"/>
+          <w:numId w:val="16"/>
+        </w:numPr>
+        <w:spacing w:after="60"/>
+      </w:pPr>
+      <w:r>
+        <w:t xml:space="preserve">With parts picked, tap </w:t>
+      </w:r>
+      <w:r>
+        <w:rPr>
+          <w:b/>
+          <w:bCs/>
+        </w:rPr>
+        <w:t xml:space="preserve">Order</w:t>
+      </w:r>
+      <w:r>
+        <w:t xml:space="preserve"> (asks for the ETA), </w:t>
+      </w:r>
+      <w:r>
+        <w:rPr>
+          <w:b/>
+          <w:bCs/>
+        </w:rPr>
+        <w:t xml:space="preserve">Receive</w:t>
+      </w:r>
+      <w:r>
+        <w:t xml:space="preserve"> (sets Received with today's date), </w:t>
+      </w:r>
+      <w:r>
+        <w:rPr>
+          <w:b/>
+          <w:bCs/>
+        </w:rPr>
+        <w:t xml:space="preserve">Mirror match</w:t>
+      </w:r>
+      <w:r>
+        <w:t xml:space="preserve"> (asks which cart and shelf), </w:t>
+      </w:r>
+      <w:r>
+        <w:rPr>
+          <w:b/>
+          <w:bCs/>
+        </w:rPr>
+        <w:t xml:space="preserve">Edit</w:t>
+      </w:r>
+      <w:r>
+        <w:t xml:space="preserve"> (change only the fields you tick) or </w:t>
+      </w:r>
+      <w:r>
+        <w:rPr>
+          <w:b/>
+          <w:bCs/>
+        </w:rPr>
+        <w:t xml:space="preserve">Delete</w:t>
+      </w:r>
+      <w:r>
+        <w:t xml:space="preserve"> (accounts allowed to delete only).</w:t>
+      </w:r>
+    </w:p>
+    <w:p>
+      <w:pPr>
+        <w:pStyle w:val="ListParagraph"/>
+        <w:numPr>
+          <w:ilvl w:val="0"/>
+          <w:numId w:val="16"/>
+        </w:numPr>
+        <w:spacing w:after="60"/>
+      </w:pPr>
+      <w:r>
+        <w:t xml:space="preserve">Tap a part's name to open and edit everything about it. </w:t>
+      </w:r>
+      <w:r>
+        <w:rPr>
+          <w:b/>
+          <w:bCs/>
+        </w:rPr>
+        <w:t xml:space="preserve">+ Add a part</w:t>
+      </w:r>
+      <w:r>
+        <w:t xml:space="preserve"> adds one; from a vehicle it fills in the RO, customer and vehicle for you.</w:t>
       </w:r>
     </w:p>
     <w:p>
@@ -4648,10 +4828,10 @@
           <w:b/>
           <w:bCs/>
         </w:rPr>
-        <w:t xml:space="preserve">Shop Floor Plan:</w:t>
-      </w:r>
-      <w:r>
-        <w:t xml:space="preserve"> carts and storage locations by zone.</w:t>
+        <w:t xml:space="preserve">Carts &amp; shelves:</w:t>
+      </w:r>
+      <w:r>
+        <w:t xml:space="preserve"> tap a cart to see each shelf. Tap a part to move it to another shelf (there's no dragging on a phone).</w:t>
       </w:r>
     </w:p>
     <w:p>
@@ -4668,10 +4848,10 @@
           <w:b/>
           <w:bCs/>
         </w:rPr>
-        <w:t xml:space="preserve">Returns &amp; Alerts:</w:t>
-      </w:r>
-      <w:r>
-        <w:t xml:space="preserve"> parts waiting to be returned, credits outstanding and parts on site 25+ days (check vendor return terms).</w:t>
+        <w:t xml:space="preserve">Returns &amp; alerts:</w:t>
+      </w:r>
+      <w:r>
+        <w:t xml:space="preserve"> on-site value, parts 25+ days on site, cores waiting to go back, and returns and credits.</w:t>
       </w:r>
     </w:p>
     <w:p>
@@ -4688,10 +4868,10 @@
           <w:b/>
           <w:bCs/>
         </w:rPr>
-        <w:t xml:space="preserve">Manage Locations:</w:t>
-      </w:r>
-      <w:r>
-        <w:t xml:space="preserve"> add carts and storage locations, set shelves and zones.</w:t>
+        <w:t xml:space="preserve">Locations:</w:t>
+      </w:r>
+      <w:r>
+        <w:t xml:space="preserve"> add or change carts and storage spots (+ in the top corner).</w:t>
       </w:r>
     </w:p>
     <w:p>
@@ -4704,379 +4884,27 @@
         <w:spacing w:after="60"/>
       </w:pPr>
       <w:r>
-        <w:rPr>
-          <w:b/>
-          <w:bCs/>
-        </w:rPr>
-        <w:t xml:space="preserve">Cores:</w:t>
-      </w:r>
-      <w:r>
-        <w:t xml:space="preserve"> mark a part as having a core; the parts team gets an alert until the core is marked returned.</w:t>
-      </w:r>
-    </w:p>
-    <w:p>
-      <w:pPr>
-        <w:pStyle w:val="Heading1"/>
-        <w:pageBreakBefore/>
-      </w:pPr>
-      <w:r>
-        <w:t xml:space="preserve">10.  Vehicle QC (office view)</w:t>
-      </w:r>
-    </w:p>
-    <w:p>
-      <w:pPr>
-        <w:spacing w:after="120"/>
-      </w:pPr>
-      <w:r>
-        <w:t xml:space="preserve">Technicians fill out QC checklists in the Employee App. The </w:t>
-      </w:r>
-      <w:r>
-        <w:rPr>
-          <w:b/>
-          <w:bCs/>
-        </w:rPr>
-        <w:t xml:space="preserve">Vehicle QC</w:t>
-      </w:r>
-      <w:r>
-        <w:t xml:space="preserve"> tab shows every checklist with its department and progress (for example 8/10 checked). Click </w:t>
-      </w:r>
-      <w:r>
-        <w:rPr>
-          <w:b/>
-          <w:bCs/>
-        </w:rPr>
-        <w:t xml:space="preserve">Checklist</w:t>
-      </w:r>
-      <w:r>
-        <w:t xml:space="preserve"> to see each item, the notes and the signature.</w:t>
-      </w:r>
-    </w:p>
-    <w:p>
-      <w:pPr>
-        <w:pStyle w:val="Heading2"/>
-      </w:pPr>
-      <w:r>
-        <w:t xml:space="preserve">Pulling up a car's QC report</w:t>
-      </w:r>
-    </w:p>
-    <w:p>
-      <w:pPr>
-        <w:spacing w:after="120"/>
-      </w:pPr>
-      <w:r>
-        <w:t xml:space="preserve">Every checklist is saved in ShopControl under the car's RO number, so nothing is lost when the car is delivered. To see everything for one car on a single page, click </w:t>
-      </w:r>
-      <w:r>
-        <w:rPr>
-          <w:b/>
-          <w:bCs/>
-        </w:rPr>
-        <w:t xml:space="preserve">Car report</w:t>
-      </w:r>
-      <w:r>
-        <w:t xml:space="preserve"> on any of its rows in the </w:t>
-      </w:r>
-      <w:r>
-        <w:rPr>
-          <w:b/>
-          <w:bCs/>
-        </w:rPr>
-        <w:t xml:space="preserve">Vehicle QC</w:t>
-      </w:r>
-      <w:r>
-        <w:t xml:space="preserve"> tab, or open the car on the </w:t>
-      </w:r>
-      <w:r>
-        <w:rPr>
-          <w:b/>
-          <w:bCs/>
-        </w:rPr>
-        <w:t xml:space="preserve">Production Board</w:t>
-      </w:r>
-      <w:r>
-        <w:t xml:space="preserve"> and click </w:t>
-      </w:r>
-      <w:r>
-        <w:rPr>
-          <w:b/>
-          <w:bCs/>
-        </w:rPr>
-        <w:t xml:space="preserve">QC report</w:t>
-      </w:r>
-      <w:r>
-        <w:t xml:space="preserve">.</w:t>
-      </w:r>
-    </w:p>
-    <w:p>
-      <w:pPr>
-        <w:spacing w:after="120"/>
-      </w:pPr>
-      <w:r>
-        <w:t xml:space="preserve">The report opens in a new tab and shows all five checklists in shop order: every item, values like the A/C vent temperature, notes, rework, who did it and when, and their signature. Departments nobody has started say </w:t>
-      </w:r>
-      <w:r>
-        <w:rPr>
-          <w:b/>
-          <w:bCs/>
-        </w:rPr>
-        <w:t xml:space="preserve">Not started</w:t>
-      </w:r>
-      <w:r>
-        <w:t xml:space="preserve">. Click </w:t>
-      </w:r>
-      <w:r>
-        <w:rPr>
-          <w:b/>
-          <w:bCs/>
-        </w:rPr>
-        <w:t xml:space="preserve">Print / Save as PDF</w:t>
-      </w:r>
-      <w:r>
-        <w:t xml:space="preserve"> to print it or keep a PDF copy for the file.</w:t>
-      </w:r>
-    </w:p>
-    <w:p>
-      <w:pPr>
-        <w:spacing w:after="120"/>
-      </w:pPr>
-      <w:r>
-        <w:t xml:space="preserve">The five checklists are </w:t>
-      </w:r>
-      <w:r>
-        <w:rPr>
-          <w:b/>
-          <w:bCs/>
-        </w:rPr>
-        <w:t xml:space="preserve">Check-In, Body, Paint, Reassy</w:t>
-      </w:r>
-      <w:r>
-        <w:t xml:space="preserve"> and </w:t>
-      </w:r>
-      <w:r>
-        <w:rPr>
-          <w:b/>
-          <w:bCs/>
-        </w:rPr>
-        <w:t xml:space="preserve">Final QC</w:t>
-      </w:r>
-      <w:r>
-        <w:t xml:space="preserve">, taken from the shop's QC sheet. No vehicle should be delivered until Final QC is complete and signed.</w:t>
-      </w:r>
-    </w:p>
-    <w:p>
-      <w:pPr>
-        <w:pStyle w:val="Heading1"/>
-        <w:pageBreakBefore/>
-      </w:pPr>
-      <w:r>
-        <w:t xml:space="preserve">11.  Completed Jobs (job records)</w:t>
-      </w:r>
-    </w:p>
-    <w:p>
-      <w:pPr>
-        <w:spacing w:after="120"/>
-      </w:pPr>
-      <w:r>
-        <w:t xml:space="preserve">When a car is delivered (or marked Total Loss) it leaves the boards, but nothing about it is lost. The </w:t>
-      </w:r>
-      <w:r>
-        <w:rPr>
-          <w:b/>
-          <w:bCs/>
-        </w:rPr>
-        <w:t xml:space="preserve">Completed Jobs</w:t>
-      </w:r>
-      <w:r>
-        <w:t xml:space="preserve"> tab (left menu, under Delivery Board) lists every finished job with when it came in, when it was delivered, days in the shop, repair value, how many parts it had and how many QC checklists were done. Search by RO, customer, vehicle or insurance, or filter by delivered date.</w:t>
-      </w:r>
-    </w:p>
-    <w:p>
-      <w:pPr>
-        <w:spacing w:after="120"/>
-      </w:pPr>
-      <w:r>
-        <w:t xml:space="preserve">Click a job to open its </w:t>
-      </w:r>
-      <w:r>
-        <w:rPr>
-          <w:b/>
-          <w:bCs/>
-        </w:rPr>
-        <w:t xml:space="preserve">job file</w:t>
-      </w:r>
-      <w:r>
-        <w:t xml:space="preserve">:</w:t>
-      </w:r>
-    </w:p>
-    <w:p>
-      <w:pPr>
-        <w:pStyle w:val="ListParagraph"/>
-        <w:numPr>
-          <w:ilvl w:val="0"/>
-          <w:numId w:val="2"/>
-        </w:numPr>
-        <w:spacing w:after="60"/>
-      </w:pPr>
-      <w:r>
-        <w:rPr>
-          <w:b/>
-          <w:bCs/>
-        </w:rPr>
-        <w:t xml:space="preserve">Job details:</w:t>
-      </w:r>
-      <w:r>
-        <w:t xml:space="preserve"> customer, vehicle, value, insurance, estimator, the techs and painters on it, in / on-site / delivered dates, days in shop and hours.</w:t>
-      </w:r>
-    </w:p>
-    <w:p>
-      <w:pPr>
-        <w:pStyle w:val="ListParagraph"/>
-        <w:numPr>
-          <w:ilvl w:val="0"/>
-          <w:numId w:val="2"/>
-        </w:numPr>
-        <w:spacing w:after="60"/>
-      </w:pPr>
-      <w:r>
-        <w:rPr>
-          <w:b/>
-          <w:bCs/>
-        </w:rPr>
-        <w:t xml:space="preserve">Production timeline:</w:t>
-      </w:r>
-      <w:r>
-        <w:t xml:space="preserve"> every stage move with the date, time and who moved it, and how long the car sat in each stage.</w:t>
-      </w:r>
-    </w:p>
-    <w:p>
-      <w:pPr>
-        <w:pStyle w:val="ListParagraph"/>
-        <w:numPr>
-          <w:ilvl w:val="0"/>
-          <w:numId w:val="2"/>
-        </w:numPr>
-        <w:spacing w:after="60"/>
-      </w:pPr>
-      <w:r>
-        <w:rPr>
-          <w:b/>
-          <w:bCs/>
-        </w:rPr>
-        <w:t xml:space="preserve">Parts:</w:t>
-      </w:r>
-      <w:r>
-        <w:t xml:space="preserve"> every part with vendor, estimated cost, status, ordered / ETA / received dates and where it was stored. Parts removed from the job along the way are listed separately with who removed them and when.</w:t>
-      </w:r>
-    </w:p>
-    <w:p>
-      <w:pPr>
-        <w:pStyle w:val="ListParagraph"/>
-        <w:numPr>
-          <w:ilvl w:val="0"/>
-          <w:numId w:val="2"/>
-        </w:numPr>
-        <w:spacing w:after="60"/>
-      </w:pPr>
-      <w:r>
-        <w:rPr>
-          <w:b/>
-          <w:bCs/>
-        </w:rPr>
-        <w:t xml:space="preserve">Quality control:</w:t>
-      </w:r>
-      <w:r>
-        <w:t xml:space="preserve"> all five checklists with who did them and when they were signed. Click </w:t>
-      </w:r>
-      <w:r>
-        <w:rPr>
-          <w:b/>
-          <w:bCs/>
-        </w:rPr>
-        <w:t xml:space="preserve">Open full QC report with signatures</w:t>
-      </w:r>
-      <w:r>
-        <w:t xml:space="preserve"> for the complete checklists.</w:t>
-      </w:r>
-    </w:p>
-    <w:p>
-      <w:pPr>
-        <w:pStyle w:val="ListParagraph"/>
-        <w:numPr>
-          <w:ilvl w:val="0"/>
-          <w:numId w:val="2"/>
-        </w:numPr>
-        <w:spacing w:after="60"/>
-      </w:pPr>
-      <w:r>
-        <w:rPr>
-          <w:b/>
-          <w:bCs/>
-        </w:rPr>
-        <w:t xml:space="preserve">Photos and files, appointments, core returns and notes.</w:t>
-      </w:r>
-    </w:p>
-    <w:p>
-      <w:pPr>
-        <w:pStyle w:val="ListParagraph"/>
-        <w:numPr>
-          <w:ilvl w:val="0"/>
-          <w:numId w:val="2"/>
-        </w:numPr>
-        <w:spacing w:after="60"/>
-      </w:pPr>
-      <w:r>
-        <w:rPr>
-          <w:b/>
-          <w:bCs/>
-        </w:rPr>
-        <w:t xml:space="preserve">Every change:</w:t>
-      </w:r>
-      <w:r>
-        <w:t xml:space="preserve"> each edit to the job (supplement amounts, estimator, techs, dates and so on), who made it and when, including updates from CCC.</w:t>
-      </w:r>
-    </w:p>
-    <w:p>
-      <w:pPr>
-        <w:spacing w:after="120"/>
-      </w:pPr>
-      <w:r>
-        <w:t xml:space="preserve">Click </w:t>
-      </w:r>
-      <w:r>
-        <w:rPr>
-          <w:b/>
-          <w:bCs/>
-        </w:rPr>
-        <w:t xml:space="preserve">Print / Save as PDF</w:t>
-      </w:r>
-      <w:r>
-        <w:t xml:space="preserve"> to print the job file or keep a PDF copy, for example for an insurance question or a comeback.</w:t>
-      </w:r>
-    </w:p>
-    <w:p>
-      <w:pPr>
-        <w:pStyle w:val="Heading2"/>
-      </w:pPr>
-      <w:r>
-        <w:t xml:space="preserve">Deleted jobs</w:t>
-      </w:r>
-    </w:p>
-    <w:p>
-      <w:pPr>
-        <w:spacing w:after="120"/>
-      </w:pPr>
-      <w:r>
-        <w:t xml:space="preserve">Tick </w:t>
-      </w:r>
-      <w:r>
-        <w:rPr>
-          <w:b/>
-          <w:bCs/>
-        </w:rPr>
-        <w:t xml:space="preserve">Show deleted jobs</w:t>
-      </w:r>
-      <w:r>
-        <w:t xml:space="preserve"> to see jobs someone deleted. ShopControl keeps a copy of every deleted job, so its file can still be opened (it shows who deleted it and when).</w:t>
+        <w:t xml:space="preserve">From a car's </w:t>
+      </w:r>
+      <w:r>
+        <w:rPr>
+          <w:b/>
+          <w:bCs/>
+        </w:rPr>
+        <w:t xml:space="preserve">Parts</w:t>
+      </w:r>
+      <w:r>
+        <w:t xml:space="preserve"> screen, </w:t>
+      </w:r>
+      <w:r>
+        <w:rPr>
+          <w:b/>
+          <w:bCs/>
+        </w:rPr>
+        <w:t xml:space="preserve">Manage parts</w:t>
+      </w:r>
+      <w:r>
+        <w:t xml:space="preserve"> jumps straight to that RO in the Parts desk.</w:t>
       </w:r>
     </w:p>
     <w:p>
@@ -5097,17 +4925,95 @@
         <w:t xml:space="preserve">Note:  </w:t>
       </w:r>
       <w:r>
-        <w:t xml:space="preserve">Delivered and total-loss jobs are the shop's record of the repair. Only an </w:t>
-      </w:r>
-      <w:r>
-        <w:rPr>
-          <w:b/>
-          <w:bCs/>
-        </w:rPr>
-        <w:t xml:space="preserve">admin or owner</w:t>
-      </w:r>
-      <w:r>
-        <w:t xml:space="preserve"> can delete them or the parts on them; anyone else gets a message instead.</w:t>
+        <w:t xml:space="preserve">The Shop Floor Plan and Export Parts CSV are only in the office program.</w:t>
+      </w:r>
+    </w:p>
+    <w:p>
+      <w:pPr>
+        <w:pStyle w:val="Heading2"/>
+      </w:pPr>
+      <w:r>
+        <w:t xml:space="preserve">Other parts screens</w:t>
+      </w:r>
+    </w:p>
+    <w:p>
+      <w:pPr>
+        <w:pStyle w:val="ListParagraph"/>
+        <w:numPr>
+          <w:ilvl w:val="0"/>
+          <w:numId w:val="2"/>
+        </w:numPr>
+        <w:spacing w:after="60"/>
+      </w:pPr>
+      <w:r>
+        <w:rPr>
+          <w:b/>
+          <w:bCs/>
+        </w:rPr>
+        <w:t xml:space="preserve">Shop Floor Plan:</w:t>
+      </w:r>
+      <w:r>
+        <w:t xml:space="preserve"> carts and storage locations by zone.</w:t>
+      </w:r>
+    </w:p>
+    <w:p>
+      <w:pPr>
+        <w:pStyle w:val="ListParagraph"/>
+        <w:numPr>
+          <w:ilvl w:val="0"/>
+          <w:numId w:val="2"/>
+        </w:numPr>
+        <w:spacing w:after="60"/>
+      </w:pPr>
+      <w:r>
+        <w:rPr>
+          <w:b/>
+          <w:bCs/>
+        </w:rPr>
+        <w:t xml:space="preserve">Returns &amp; Alerts:</w:t>
+      </w:r>
+      <w:r>
+        <w:t xml:space="preserve"> parts waiting to be returned, credits outstanding and parts on site 25+ days (check vendor return terms).</w:t>
+      </w:r>
+    </w:p>
+    <w:p>
+      <w:pPr>
+        <w:pStyle w:val="ListParagraph"/>
+        <w:numPr>
+          <w:ilvl w:val="0"/>
+          <w:numId w:val="2"/>
+        </w:numPr>
+        <w:spacing w:after="60"/>
+      </w:pPr>
+      <w:r>
+        <w:rPr>
+          <w:b/>
+          <w:bCs/>
+        </w:rPr>
+        <w:t xml:space="preserve">Manage Locations:</w:t>
+      </w:r>
+      <w:r>
+        <w:t xml:space="preserve"> add carts and storage locations, set shelves and zones.</w:t>
+      </w:r>
+    </w:p>
+    <w:p>
+      <w:pPr>
+        <w:pStyle w:val="ListParagraph"/>
+        <w:numPr>
+          <w:ilvl w:val="0"/>
+          <w:numId w:val="2"/>
+        </w:numPr>
+        <w:spacing w:after="60"/>
+      </w:pPr>
+      <w:r>
+        <w:rPr>
+          <w:b/>
+          <w:bCs/>
+        </w:rPr>
+        <w:t xml:space="preserve">Cores:</w:t>
+      </w:r>
+      <w:r>
+        <w:t xml:space="preserve"> mark a part as having a core; the parts team gets an alert until the core is marked returned.</w:t>
       </w:r>
     </w:p>
     <w:p>
@@ -5116,7 +5022,35 @@
         <w:pageBreakBefore/>
       </w:pPr>
       <w:r>
-        <w:t xml:space="preserve">12.  Office tools</w:t>
+        <w:t xml:space="preserve">10.  Vehicle QC (office view)</w:t>
+      </w:r>
+    </w:p>
+    <w:p>
+      <w:pPr>
+        <w:spacing w:after="120"/>
+      </w:pPr>
+      <w:r>
+        <w:t xml:space="preserve">Technicians fill out QC checklists in the Employee App. The </w:t>
+      </w:r>
+      <w:r>
+        <w:rPr>
+          <w:b/>
+          <w:bCs/>
+        </w:rPr>
+        <w:t xml:space="preserve">Vehicle QC</w:t>
+      </w:r>
+      <w:r>
+        <w:t xml:space="preserve"> tab shows every checklist with its department and progress (for example 8/10 checked). Click </w:t>
+      </w:r>
+      <w:r>
+        <w:rPr>
+          <w:b/>
+          <w:bCs/>
+        </w:rPr>
+        <w:t xml:space="preserve">Checklist</w:t>
+      </w:r>
+      <w:r>
+        <w:t xml:space="preserve"> to see each item, the notes and the signature.</w:t>
       </w:r>
     </w:p>
     <w:p>
@@ -5124,7 +5058,7 @@
         <w:pStyle w:val="Heading2"/>
       </w:pPr>
       <w:r>
-        <w:t xml:space="preserve">Missed Calls / Callback Requests</w:t>
+        <w:t xml:space="preserve">Pulling up a car's QC report</w:t>
       </w:r>
     </w:p>
     <w:p>
@@ -5132,75 +5066,47 @@
         <w:spacing w:after="120"/>
       </w:pPr>
       <w:r>
-        <w:t xml:space="preserve">Log every missed call with the caller, number, reason and who owns the callback. Log each callback attempt. A call still </w:t>
-      </w:r>
-      <w:r>
-        <w:rPr>
-          <w:b/>
-          <w:bCs/>
-        </w:rPr>
-        <w:t xml:space="preserve">New</w:t>
-      </w:r>
-      <w:r>
-        <w:t xml:space="preserve"> or </w:t>
-      </w:r>
-      <w:r>
-        <w:rPr>
-          <w:b/>
-          <w:bCs/>
-        </w:rPr>
-        <w:t xml:space="preserve">In progress</w:t>
-      </w:r>
-      <w:r>
-        <w:t xml:space="preserve"> after </w:t>
-      </w:r>
-      <w:r>
-        <w:rPr>
-          <w:b/>
-          <w:bCs/>
-        </w:rPr>
-        <w:t xml:space="preserve">1 business hour</w:t>
-      </w:r>
-      <w:r>
-        <w:t xml:space="preserve"> shows as overdue on the dashboard (</w:t>
-      </w:r>
-      <w:r>
-        <w:rPr>
-          <w:b/>
-          <w:bCs/>
-        </w:rPr>
-        <w:t xml:space="preserve">Missed Calls Overdue</w:t>
-      </w:r>
-      <w:r>
-        <w:t xml:space="preserve">). Mark it </w:t>
-      </w:r>
-      <w:r>
-        <w:rPr>
-          <w:b/>
-          <w:bCs/>
-        </w:rPr>
-        <w:t xml:space="preserve">Returned / resolved</w:t>
-      </w:r>
-      <w:r>
-        <w:t xml:space="preserve"> when done, or </w:t>
-      </w:r>
-      <w:r>
-        <w:rPr>
-          <w:b/>
-          <w:bCs/>
-        </w:rPr>
-        <w:t xml:space="preserve">Closed — no callback needed</w:t>
-      </w:r>
-      <w:r>
-        <w:t xml:space="preserve"> with a reason.</w:t>
-      </w:r>
-    </w:p>
-    <w:p>
-      <w:pPr>
-        <w:pStyle w:val="Heading2"/>
-      </w:pPr>
-      <w:r>
-        <w:t xml:space="preserve">Tasks</w:t>
+        <w:t xml:space="preserve">Every checklist is saved in ShopControl under the car's RO number, so nothing is lost when the car is delivered. To see everything for one car on a single page, click </w:t>
+      </w:r>
+      <w:r>
+        <w:rPr>
+          <w:b/>
+          <w:bCs/>
+        </w:rPr>
+        <w:t xml:space="preserve">Car report</w:t>
+      </w:r>
+      <w:r>
+        <w:t xml:space="preserve"> on any of its rows in the </w:t>
+      </w:r>
+      <w:r>
+        <w:rPr>
+          <w:b/>
+          <w:bCs/>
+        </w:rPr>
+        <w:t xml:space="preserve">Vehicle QC</w:t>
+      </w:r>
+      <w:r>
+        <w:t xml:space="preserve"> tab, or open the car on the </w:t>
+      </w:r>
+      <w:r>
+        <w:rPr>
+          <w:b/>
+          <w:bCs/>
+        </w:rPr>
+        <w:t xml:space="preserve">Production Board</w:t>
+      </w:r>
+      <w:r>
+        <w:t xml:space="preserve"> and click </w:t>
+      </w:r>
+      <w:r>
+        <w:rPr>
+          <w:b/>
+          <w:bCs/>
+        </w:rPr>
+        <w:t xml:space="preserve">QC report</w:t>
+      </w:r>
+      <w:r>
+        <w:t xml:space="preserve">.</w:t>
       </w:r>
     </w:p>
     <w:p>
@@ -5208,15 +5114,27 @@
         <w:spacing w:after="120"/>
       </w:pPr>
       <w:r>
-        <w:t xml:space="preserve">Assign tasks with a due date. The person is emailed when the task is assigned and reminded by email if it's still open after 1 hour and again after 3 hours. Anything that can't be done today should be flagged to management before the end of the day.</w:t>
-      </w:r>
-    </w:p>
-    <w:p>
-      <w:pPr>
-        <w:pStyle w:val="Heading2"/>
-      </w:pPr>
-      <w:r>
-        <w:t xml:space="preserve">Booth Filters and Facility Checklist</w:t>
+        <w:t xml:space="preserve">The report opens in a new tab and shows all five checklists in shop order: every item, values like the A/C vent temperature, notes, rework, who did it and when, and their signature. Departments nobody has started say </w:t>
+      </w:r>
+      <w:r>
+        <w:rPr>
+          <w:b/>
+          <w:bCs/>
+        </w:rPr>
+        <w:t xml:space="preserve">Not started</w:t>
+      </w:r>
+      <w:r>
+        <w:t xml:space="preserve">. Click </w:t>
+      </w:r>
+      <w:r>
+        <w:rPr>
+          <w:b/>
+          <w:bCs/>
+        </w:rPr>
+        <w:t xml:space="preserve">Print / Save as PDF</w:t>
+      </w:r>
+      <w:r>
+        <w:t xml:space="preserve"> to print it or keep a PDF copy for the file.</w:t>
       </w:r>
     </w:p>
     <w:p>
@@ -5224,136 +5142,27 @@
         <w:spacing w:after="120"/>
       </w:pPr>
       <w:r>
-        <w:t xml:space="preserve">Log each paint booth filter change (with a picture) to reset the 30-day countdown. The weekly </w:t>
-      </w:r>
-      <w:r>
-        <w:rPr>
-          <w:b/>
-          <w:bCs/>
-        </w:rPr>
-        <w:t xml:space="preserve">Facility Checklist</w:t>
-      </w:r>
-      <w:r>
-        <w:t xml:space="preserve"> covers the booth, compressor and shop equipment; mark anything </w:t>
-      </w:r>
-      <w:r>
-        <w:rPr>
-          <w:b/>
-          <w:bCs/>
-        </w:rPr>
-        <w:t xml:space="preserve">Needs Attention</w:t>
-      </w:r>
-      <w:r>
-        <w:t xml:space="preserve"> and create a task if needed.</w:t>
-      </w:r>
-    </w:p>
-    <w:p>
-      <w:pPr>
-        <w:pStyle w:val="Heading2"/>
-      </w:pPr>
-      <w:r>
-        <w:t xml:space="preserve">AR Balances and Cycle Time</w:t>
-      </w:r>
-    </w:p>
-    <w:p>
-      <w:pPr>
-        <w:pStyle w:val="ListParagraph"/>
-        <w:numPr>
-          <w:ilvl w:val="0"/>
-          <w:numId w:val="2"/>
-        </w:numPr>
-        <w:spacing w:after="60"/>
-      </w:pPr>
-      <w:r>
-        <w:rPr>
-          <w:b/>
-          <w:bCs/>
-        </w:rPr>
-        <w:t xml:space="preserve">AR Balances:</w:t>
-      </w:r>
-      <w:r>
-        <w:t xml:space="preserve"> open balances by RO, who owes it and when it's due.</w:t>
-      </w:r>
-    </w:p>
-    <w:p>
-      <w:pPr>
-        <w:pStyle w:val="ListParagraph"/>
-        <w:numPr>
-          <w:ilvl w:val="0"/>
-          <w:numId w:val="2"/>
-        </w:numPr>
-        <w:spacing w:after="60"/>
-      </w:pPr>
-      <w:r>
-        <w:rPr>
-          <w:b/>
-          <w:bCs/>
-        </w:rPr>
-        <w:t xml:space="preserve">Cycle time tabs:</w:t>
-      </w:r>
-      <w:r>
-        <w:t xml:space="preserve"> active jobs by dollar range with target days in the shop: under $2,000 = 2 days, $2,000–4,000 = 4 days, $4,000–10,000 = 8 days, $10,000+ = 15 days.</w:t>
-      </w:r>
-    </w:p>
-    <w:p>
-      <w:pPr>
-        <w:pStyle w:val="ListParagraph"/>
-        <w:numPr>
-          <w:ilvl w:val="0"/>
-          <w:numId w:val="2"/>
-        </w:numPr>
-        <w:spacing w:after="60"/>
-      </w:pPr>
-      <w:r>
-        <w:t xml:space="preserve">Cycle time emails (due tomorrow, past due) are only sent for jobs with an RO. Estimates without one get capture opportunity reminders instead.</w:t>
-      </w:r>
-    </w:p>
-    <w:p>
-      <w:pPr>
-        <w:pStyle w:val="Heading2"/>
-      </w:pPr>
-      <w:r>
-        <w:t xml:space="preserve">Photos and Activity Log</w:t>
-      </w:r>
-    </w:p>
-    <w:p>
-      <w:pPr>
-        <w:pStyle w:val="ListParagraph"/>
-        <w:numPr>
-          <w:ilvl w:val="0"/>
-          <w:numId w:val="2"/>
-        </w:numPr>
-        <w:spacing w:after="60"/>
-      </w:pPr>
-      <w:r>
-        <w:rPr>
-          <w:b/>
-          <w:bCs/>
-        </w:rPr>
-        <w:t xml:space="preserve">Photos:</w:t>
-      </w:r>
-      <w:r>
-        <w:t xml:space="preserve"> upload photos and PDFs tied to a job or record.</w:t>
-      </w:r>
-    </w:p>
-    <w:p>
-      <w:pPr>
-        <w:pStyle w:val="ListParagraph"/>
-        <w:numPr>
-          <w:ilvl w:val="0"/>
-          <w:numId w:val="2"/>
-        </w:numPr>
-        <w:spacing w:after="60"/>
-      </w:pPr>
-      <w:r>
-        <w:rPr>
-          <w:b/>
-          <w:bCs/>
-        </w:rPr>
-        <w:t xml:space="preserve">Activity Log:</w:t>
-      </w:r>
-      <w:r>
-        <w:t xml:space="preserve"> who added, changed, deleted or uploaded what, and when.</w:t>
+        <w:t xml:space="preserve">The five checklists are </w:t>
+      </w:r>
+      <w:r>
+        <w:rPr>
+          <w:b/>
+          <w:bCs/>
+        </w:rPr>
+        <w:t xml:space="preserve">Check-In, Body, Paint, Reassy</w:t>
+      </w:r>
+      <w:r>
+        <w:t xml:space="preserve"> and </w:t>
+      </w:r>
+      <w:r>
+        <w:rPr>
+          <w:b/>
+          <w:bCs/>
+        </w:rPr>
+        <w:t xml:space="preserve">Final QC</w:t>
+      </w:r>
+      <w:r>
+        <w:t xml:space="preserve">, taken from the shop's QC sheet. No vehicle should be delivered until Final QC is complete and signed.</w:t>
       </w:r>
     </w:p>
     <w:p>
@@ -5362,7 +5171,188 @@
         <w:pageBreakBefore/>
       </w:pPr>
       <w:r>
-        <w:t xml:space="preserve">13.  Time off and messages (office and admins)</w:t>
+        <w:t xml:space="preserve">11.  Completed Jobs (job records)</w:t>
+      </w:r>
+    </w:p>
+    <w:p>
+      <w:pPr>
+        <w:spacing w:after="120"/>
+      </w:pPr>
+      <w:r>
+        <w:t xml:space="preserve">When a car is delivered (or marked Total Loss) it leaves the boards, but nothing about it is lost. The </w:t>
+      </w:r>
+      <w:r>
+        <w:rPr>
+          <w:b/>
+          <w:bCs/>
+        </w:rPr>
+        <w:t xml:space="preserve">Completed Jobs</w:t>
+      </w:r>
+      <w:r>
+        <w:t xml:space="preserve"> tab (left menu, under Delivery Board) lists every finished job with when it came in, when it was delivered, days in the shop, repair value, how many parts it had and how many QC checklists were done. Search by RO, customer, vehicle or insurance, or filter by delivered date.</w:t>
+      </w:r>
+    </w:p>
+    <w:p>
+      <w:pPr>
+        <w:spacing w:after="120"/>
+      </w:pPr>
+      <w:r>
+        <w:t xml:space="preserve">Click a job to open its </w:t>
+      </w:r>
+      <w:r>
+        <w:rPr>
+          <w:b/>
+          <w:bCs/>
+        </w:rPr>
+        <w:t xml:space="preserve">job file</w:t>
+      </w:r>
+      <w:r>
+        <w:t xml:space="preserve">:</w:t>
+      </w:r>
+    </w:p>
+    <w:p>
+      <w:pPr>
+        <w:pStyle w:val="ListParagraph"/>
+        <w:numPr>
+          <w:ilvl w:val="0"/>
+          <w:numId w:val="2"/>
+        </w:numPr>
+        <w:spacing w:after="60"/>
+      </w:pPr>
+      <w:r>
+        <w:rPr>
+          <w:b/>
+          <w:bCs/>
+        </w:rPr>
+        <w:t xml:space="preserve">Job details:</w:t>
+      </w:r>
+      <w:r>
+        <w:t xml:space="preserve"> customer, vehicle, value, insurance, estimator, the techs and painters on it, in / on-site / delivered dates, days in shop and hours.</w:t>
+      </w:r>
+    </w:p>
+    <w:p>
+      <w:pPr>
+        <w:pStyle w:val="ListParagraph"/>
+        <w:numPr>
+          <w:ilvl w:val="0"/>
+          <w:numId w:val="2"/>
+        </w:numPr>
+        <w:spacing w:after="60"/>
+      </w:pPr>
+      <w:r>
+        <w:rPr>
+          <w:b/>
+          <w:bCs/>
+        </w:rPr>
+        <w:t xml:space="preserve">Production timeline:</w:t>
+      </w:r>
+      <w:r>
+        <w:t xml:space="preserve"> every stage move with the date, time and who moved it, and how long the car sat in each stage.</w:t>
+      </w:r>
+    </w:p>
+    <w:p>
+      <w:pPr>
+        <w:pStyle w:val="ListParagraph"/>
+        <w:numPr>
+          <w:ilvl w:val="0"/>
+          <w:numId w:val="2"/>
+        </w:numPr>
+        <w:spacing w:after="60"/>
+      </w:pPr>
+      <w:r>
+        <w:rPr>
+          <w:b/>
+          <w:bCs/>
+        </w:rPr>
+        <w:t xml:space="preserve">Parts:</w:t>
+      </w:r>
+      <w:r>
+        <w:t xml:space="preserve"> every part with vendor, estimated cost, status, ordered / ETA / received dates and where it was stored. Parts removed from the job along the way are listed separately with who removed them and when.</w:t>
+      </w:r>
+    </w:p>
+    <w:p>
+      <w:pPr>
+        <w:pStyle w:val="ListParagraph"/>
+        <w:numPr>
+          <w:ilvl w:val="0"/>
+          <w:numId w:val="2"/>
+        </w:numPr>
+        <w:spacing w:after="60"/>
+      </w:pPr>
+      <w:r>
+        <w:rPr>
+          <w:b/>
+          <w:bCs/>
+        </w:rPr>
+        <w:t xml:space="preserve">Quality control:</w:t>
+      </w:r>
+      <w:r>
+        <w:t xml:space="preserve"> all five checklists with who did them and when they were signed. Click </w:t>
+      </w:r>
+      <w:r>
+        <w:rPr>
+          <w:b/>
+          <w:bCs/>
+        </w:rPr>
+        <w:t xml:space="preserve">Open full QC report with signatures</w:t>
+      </w:r>
+      <w:r>
+        <w:t xml:space="preserve"> for the complete checklists.</w:t>
+      </w:r>
+    </w:p>
+    <w:p>
+      <w:pPr>
+        <w:pStyle w:val="ListParagraph"/>
+        <w:numPr>
+          <w:ilvl w:val="0"/>
+          <w:numId w:val="2"/>
+        </w:numPr>
+        <w:spacing w:after="60"/>
+      </w:pPr>
+      <w:r>
+        <w:rPr>
+          <w:b/>
+          <w:bCs/>
+        </w:rPr>
+        <w:t xml:space="preserve">Photos and files, appointments, core returns and notes.</w:t>
+      </w:r>
+    </w:p>
+    <w:p>
+      <w:pPr>
+        <w:pStyle w:val="ListParagraph"/>
+        <w:numPr>
+          <w:ilvl w:val="0"/>
+          <w:numId w:val="2"/>
+        </w:numPr>
+        <w:spacing w:after="60"/>
+      </w:pPr>
+      <w:r>
+        <w:rPr>
+          <w:b/>
+          <w:bCs/>
+        </w:rPr>
+        <w:t xml:space="preserve">Every change:</w:t>
+      </w:r>
+      <w:r>
+        <w:t xml:space="preserve"> each edit to the job (supplement amounts, estimator, techs, dates and so on), who made it and when, including updates from CCC.</w:t>
+      </w:r>
+    </w:p>
+    <w:p>
+      <w:pPr>
+        <w:spacing w:after="120"/>
+      </w:pPr>
+      <w:r>
+        <w:t xml:space="preserve">Click </w:t>
+      </w:r>
+      <w:r>
+        <w:rPr>
+          <w:b/>
+          <w:bCs/>
+        </w:rPr>
+        <w:t xml:space="preserve">Print / Save as PDF</w:t>
+      </w:r>
+      <w:r>
+        <w:t xml:space="preserve"> to print the job file or keep a PDF copy, for example for an insurance question or a comeback.</w:t>
       </w:r>
     </w:p>
     <w:p>
@@ -5370,7 +5360,7 @@
         <w:pStyle w:val="Heading2"/>
       </w:pPr>
       <w:r>
-        <w:t xml:space="preserve">Time Off tab</w:t>
+        <w:t xml:space="preserve">Deleted jobs</w:t>
       </w:r>
     </w:p>
     <w:p>
@@ -5378,106 +5368,17 @@
         <w:spacing w:after="120"/>
       </w:pPr>
       <w:r>
-        <w:t xml:space="preserve">Shows every request with who's out today. New requests also email the office and admins and appear under </w:t>
-      </w:r>
-      <w:r>
-        <w:rPr>
-          <w:b/>
-          <w:bCs/>
-        </w:rPr>
-        <w:t xml:space="preserve">Notifications</w:t>
-      </w:r>
-      <w:r>
-        <w:t xml:space="preserve">.</w:t>
-      </w:r>
-    </w:p>
-    <w:p>
-      <w:pPr>
-        <w:pStyle w:val="ListParagraph"/>
-        <w:numPr>
-          <w:ilvl w:val="0"/>
-          <w:numId w:val="16"/>
-        </w:numPr>
-        <w:spacing w:after="60"/>
-      </w:pPr>
-      <w:r>
-        <w:t xml:space="preserve">Open </w:t>
-      </w:r>
-      <w:r>
-        <w:rPr>
-          <w:b/>
-          <w:bCs/>
-        </w:rPr>
-        <w:t xml:space="preserve">Time Off</w:t>
-      </w:r>
-      <w:r>
-        <w:t xml:space="preserve"> (the tab shows a red number when requests are waiting).</w:t>
-      </w:r>
-    </w:p>
-    <w:p>
-      <w:pPr>
-        <w:pStyle w:val="ListParagraph"/>
-        <w:numPr>
-          <w:ilvl w:val="0"/>
-          <w:numId w:val="16"/>
-        </w:numPr>
-        <w:spacing w:after="60"/>
-      </w:pPr>
-      <w:r>
-        <w:t xml:space="preserve">Admins: click </w:t>
-      </w:r>
-      <w:r>
-        <w:rPr>
-          <w:b/>
-          <w:bCs/>
-        </w:rPr>
-        <w:t xml:space="preserve">Approve</w:t>
-      </w:r>
-      <w:r>
-        <w:t xml:space="preserve"> or </w:t>
-      </w:r>
-      <w:r>
-        <w:rPr>
-          <w:b/>
-          <w:bCs/>
-        </w:rPr>
-        <w:t xml:space="preserve">Deny</w:t>
-      </w:r>
-      <w:r>
-        <w:t xml:space="preserve">, add an optional note, and confirm.</w:t>
-      </w:r>
-    </w:p>
-    <w:p>
-      <w:pPr>
-        <w:pStyle w:val="ListParagraph"/>
-        <w:numPr>
-          <w:ilvl w:val="0"/>
-          <w:numId w:val="16"/>
-        </w:numPr>
-        <w:spacing w:after="60"/>
-      </w:pPr>
-      <w:r>
-        <w:t xml:space="preserve">The employee gets a mailbox message and an email with the decision. The office and admins also get an email, with </w:t>
-      </w:r>
-      <w:r>
-        <w:rPr>
-          <w:b/>
-          <w:bCs/>
-        </w:rPr>
-        <w:t xml:space="preserve">APPROVED</w:t>
-      </w:r>
-      <w:r>
-        <w:t xml:space="preserve"> or </w:t>
-      </w:r>
-      <w:r>
-        <w:rPr>
-          <w:b/>
-          <w:bCs/>
-        </w:rPr>
-        <w:t xml:space="preserve">DENIED</w:t>
-      </w:r>
-      <w:r>
-        <w:t xml:space="preserve"> and the employee's name in the subject (for example "Time-off request APPROVED · Jane Doe").</w:t>
+        <w:t xml:space="preserve">Tick </w:t>
+      </w:r>
+      <w:r>
+        <w:rPr>
+          <w:b/>
+          <w:bCs/>
+        </w:rPr>
+        <w:t xml:space="preserve">Show deleted jobs</w:t>
+      </w:r>
+      <w:r>
+        <w:t xml:space="preserve"> to see jobs someone deleted. ShopControl keeps a copy of every deleted job, so its file can still be opened (it shows who deleted it and when).</w:t>
       </w:r>
     </w:p>
     <w:p>
@@ -5498,115 +5399,17 @@
         <w:t xml:space="preserve">Note:  </w:t>
       </w:r>
       <w:r>
-        <w:t xml:space="preserve">Only </w:t>
-      </w:r>
-      <w:r>
-        <w:rPr>
-          <w:b/>
-          <w:bCs/>
-        </w:rPr>
-        <w:t xml:space="preserve">admins and owners</w:t>
-      </w:r>
-      <w:r>
-        <w:t xml:space="preserve"> can approve or deny, here or in the Employee App (Staff Hub → </w:t>
-      </w:r>
-      <w:r>
-        <w:rPr>
-          <w:b/>
-          <w:bCs/>
-        </w:rPr>
-        <w:t xml:space="preserve">Approve time off</w:t>
-      </w:r>
-      <w:r>
-        <w:t xml:space="preserve">). Managers and office staff can see requests but not decide them.</w:t>
-      </w:r>
-    </w:p>
-    <w:p>
-      <w:pPr>
-        <w:pStyle w:val="Heading2"/>
-      </w:pPr>
-      <w:r>
-        <w:t xml:space="preserve">Messages &amp; Info tab</w:t>
-      </w:r>
-    </w:p>
-    <w:p>
-      <w:pPr>
-        <w:pStyle w:val="ListParagraph"/>
-        <w:numPr>
-          <w:ilvl w:val="0"/>
-          <w:numId w:val="2"/>
-        </w:numPr>
-        <w:spacing w:after="60"/>
-      </w:pPr>
-      <w:r>
-        <w:rPr>
-          <w:b/>
-          <w:bCs/>
-        </w:rPr>
-        <w:t xml:space="preserve">Inbox:</w:t>
-      </w:r>
-      <w:r>
-        <w:t xml:space="preserve"> your messages. Click one to read it and </w:t>
-      </w:r>
-      <w:r>
-        <w:rPr>
-          <w:b/>
-          <w:bCs/>
-        </w:rPr>
-        <w:t xml:space="preserve">Reply</w:t>
-      </w:r>
-      <w:r>
-        <w:t xml:space="preserve">.</w:t>
-      </w:r>
-    </w:p>
-    <w:p>
-      <w:pPr>
-        <w:pStyle w:val="ListParagraph"/>
-        <w:numPr>
-          <w:ilvl w:val="0"/>
-          <w:numId w:val="2"/>
-        </w:numPr>
-        <w:spacing w:after="60"/>
-      </w:pPr>
-      <w:r>
-        <w:rPr>
-          <w:b/>
-          <w:bCs/>
-        </w:rPr>
-        <w:t xml:space="preserve">New message:</w:t>
-      </w:r>
-      <w:r>
-        <w:t xml:space="preserve"> send to one person, a department (for example all of Paint), the office, or everyone. It appears in their Employee App mailbox.</w:t>
-      </w:r>
-    </w:p>
-    <w:p>
-      <w:pPr>
-        <w:pStyle w:val="ListParagraph"/>
-        <w:numPr>
-          <w:ilvl w:val="0"/>
-          <w:numId w:val="2"/>
-        </w:numPr>
-        <w:spacing w:after="60"/>
-      </w:pPr>
-      <w:r>
-        <w:rPr>
-          <w:b/>
-          <w:bCs/>
-        </w:rPr>
-        <w:t xml:space="preserve">Company info</w:t>
-      </w:r>
-      <w:r>
-        <w:t xml:space="preserve"> (admins): </w:t>
-      </w:r>
-      <w:r>
-        <w:rPr>
-          <w:b/>
-          <w:bCs/>
-        </w:rPr>
-        <w:t xml:space="preserve">Add section</w:t>
-      </w:r>
-      <w:r>
-        <w:t xml:space="preserve"> for things like shop hours, holiday schedule or who to call. Staff see it under Staff Hub → Company info.</w:t>
+        <w:t xml:space="preserve">Delivered and total-loss jobs are the shop's record of the repair. Only an </w:t>
+      </w:r>
+      <w:r>
+        <w:rPr>
+          <w:b/>
+          <w:bCs/>
+        </w:rPr>
+        <w:t xml:space="preserve">admin or owner</w:t>
+      </w:r>
+      <w:r>
+        <w:t xml:space="preserve"> can delete them or the parts on them; anyone else gets a message instead.</w:t>
       </w:r>
     </w:p>
     <w:p>
@@ -5615,6 +5418,505 @@
         <w:pageBreakBefore/>
       </w:pPr>
       <w:r>
+        <w:t xml:space="preserve">12.  Office tools</w:t>
+      </w:r>
+    </w:p>
+    <w:p>
+      <w:pPr>
+        <w:pStyle w:val="Heading2"/>
+      </w:pPr>
+      <w:r>
+        <w:t xml:space="preserve">Missed Calls / Callback Requests</w:t>
+      </w:r>
+    </w:p>
+    <w:p>
+      <w:pPr>
+        <w:spacing w:after="120"/>
+      </w:pPr>
+      <w:r>
+        <w:t xml:space="preserve">Log every missed call with the caller, number, reason and who owns the callback. Log each callback attempt. A call still </w:t>
+      </w:r>
+      <w:r>
+        <w:rPr>
+          <w:b/>
+          <w:bCs/>
+        </w:rPr>
+        <w:t xml:space="preserve">New</w:t>
+      </w:r>
+      <w:r>
+        <w:t xml:space="preserve"> or </w:t>
+      </w:r>
+      <w:r>
+        <w:rPr>
+          <w:b/>
+          <w:bCs/>
+        </w:rPr>
+        <w:t xml:space="preserve">In progress</w:t>
+      </w:r>
+      <w:r>
+        <w:t xml:space="preserve"> after </w:t>
+      </w:r>
+      <w:r>
+        <w:rPr>
+          <w:b/>
+          <w:bCs/>
+        </w:rPr>
+        <w:t xml:space="preserve">1 business hour</w:t>
+      </w:r>
+      <w:r>
+        <w:t xml:space="preserve"> shows as overdue on the dashboard (</w:t>
+      </w:r>
+      <w:r>
+        <w:rPr>
+          <w:b/>
+          <w:bCs/>
+        </w:rPr>
+        <w:t xml:space="preserve">Missed Calls Overdue</w:t>
+      </w:r>
+      <w:r>
+        <w:t xml:space="preserve">). Mark it </w:t>
+      </w:r>
+      <w:r>
+        <w:rPr>
+          <w:b/>
+          <w:bCs/>
+        </w:rPr>
+        <w:t xml:space="preserve">Returned / resolved</w:t>
+      </w:r>
+      <w:r>
+        <w:t xml:space="preserve"> when done, or </w:t>
+      </w:r>
+      <w:r>
+        <w:rPr>
+          <w:b/>
+          <w:bCs/>
+        </w:rPr>
+        <w:t xml:space="preserve">Closed — no callback needed</w:t>
+      </w:r>
+      <w:r>
+        <w:t xml:space="preserve"> with a reason.</w:t>
+      </w:r>
+    </w:p>
+    <w:p>
+      <w:pPr>
+        <w:pStyle w:val="Heading2"/>
+      </w:pPr>
+      <w:r>
+        <w:t xml:space="preserve">Tasks</w:t>
+      </w:r>
+    </w:p>
+    <w:p>
+      <w:pPr>
+        <w:spacing w:after="120"/>
+      </w:pPr>
+      <w:r>
+        <w:t xml:space="preserve">Assign tasks with a due date. The person is emailed when the task is assigned and reminded by email if it's still open after 1 hour and again after 3 hours. Anything that can't be done today should be flagged to management before the end of the day.</w:t>
+      </w:r>
+    </w:p>
+    <w:p>
+      <w:pPr>
+        <w:pStyle w:val="Heading2"/>
+      </w:pPr>
+      <w:r>
+        <w:t xml:space="preserve">Booth Filters and Facility Checklist</w:t>
+      </w:r>
+    </w:p>
+    <w:p>
+      <w:pPr>
+        <w:spacing w:after="120"/>
+      </w:pPr>
+      <w:r>
+        <w:t xml:space="preserve">Log each paint booth filter change (with a picture) to reset the 30-day countdown. The weekly </w:t>
+      </w:r>
+      <w:r>
+        <w:rPr>
+          <w:b/>
+          <w:bCs/>
+        </w:rPr>
+        <w:t xml:space="preserve">Facility Checklist</w:t>
+      </w:r>
+      <w:r>
+        <w:t xml:space="preserve"> covers the booth, compressor and shop equipment; mark anything </w:t>
+      </w:r>
+      <w:r>
+        <w:rPr>
+          <w:b/>
+          <w:bCs/>
+        </w:rPr>
+        <w:t xml:space="preserve">Needs Attention</w:t>
+      </w:r>
+      <w:r>
+        <w:t xml:space="preserve"> and create a task if needed.</w:t>
+      </w:r>
+    </w:p>
+    <w:p>
+      <w:pPr>
+        <w:pStyle w:val="Heading2"/>
+      </w:pPr>
+      <w:r>
+        <w:t xml:space="preserve">AR Balances and Cycle Time</w:t>
+      </w:r>
+    </w:p>
+    <w:p>
+      <w:pPr>
+        <w:pStyle w:val="ListParagraph"/>
+        <w:numPr>
+          <w:ilvl w:val="0"/>
+          <w:numId w:val="2"/>
+        </w:numPr>
+        <w:spacing w:after="60"/>
+      </w:pPr>
+      <w:r>
+        <w:rPr>
+          <w:b/>
+          <w:bCs/>
+        </w:rPr>
+        <w:t xml:space="preserve">AR Balances:</w:t>
+      </w:r>
+      <w:r>
+        <w:t xml:space="preserve"> open balances by RO, who owes it and when it's due.</w:t>
+      </w:r>
+    </w:p>
+    <w:p>
+      <w:pPr>
+        <w:pStyle w:val="ListParagraph"/>
+        <w:numPr>
+          <w:ilvl w:val="0"/>
+          <w:numId w:val="2"/>
+        </w:numPr>
+        <w:spacing w:after="60"/>
+      </w:pPr>
+      <w:r>
+        <w:rPr>
+          <w:b/>
+          <w:bCs/>
+        </w:rPr>
+        <w:t xml:space="preserve">Cycle time tabs:</w:t>
+      </w:r>
+      <w:r>
+        <w:t xml:space="preserve"> active jobs by dollar range with target days in the shop: under $2,000 = 2 days, $2,000–4,000 = 4 days, $4,000–10,000 = 8 days, $10,000+ = 15 days.</w:t>
+      </w:r>
+    </w:p>
+    <w:p>
+      <w:pPr>
+        <w:pStyle w:val="ListParagraph"/>
+        <w:numPr>
+          <w:ilvl w:val="0"/>
+          <w:numId w:val="2"/>
+        </w:numPr>
+        <w:spacing w:after="60"/>
+      </w:pPr>
+      <w:r>
+        <w:t xml:space="preserve">Cycle time emails (due tomorrow, past due) are only sent for jobs with an RO. Estimates without one get capture opportunity reminders instead.</w:t>
+      </w:r>
+    </w:p>
+    <w:p>
+      <w:pPr>
+        <w:pStyle w:val="Heading2"/>
+      </w:pPr>
+      <w:r>
+        <w:t xml:space="preserve">Photos and Activity Log</w:t>
+      </w:r>
+    </w:p>
+    <w:p>
+      <w:pPr>
+        <w:pStyle w:val="ListParagraph"/>
+        <w:numPr>
+          <w:ilvl w:val="0"/>
+          <w:numId w:val="2"/>
+        </w:numPr>
+        <w:spacing w:after="60"/>
+      </w:pPr>
+      <w:r>
+        <w:rPr>
+          <w:b/>
+          <w:bCs/>
+        </w:rPr>
+        <w:t xml:space="preserve">Photos:</w:t>
+      </w:r>
+      <w:r>
+        <w:t xml:space="preserve"> upload photos and PDFs tied to a job or record.</w:t>
+      </w:r>
+    </w:p>
+    <w:p>
+      <w:pPr>
+        <w:pStyle w:val="ListParagraph"/>
+        <w:numPr>
+          <w:ilvl w:val="0"/>
+          <w:numId w:val="2"/>
+        </w:numPr>
+        <w:spacing w:after="60"/>
+      </w:pPr>
+      <w:r>
+        <w:rPr>
+          <w:b/>
+          <w:bCs/>
+        </w:rPr>
+        <w:t xml:space="preserve">Activity Log:</w:t>
+      </w:r>
+      <w:r>
+        <w:t xml:space="preserve"> who added, changed, deleted or uploaded what, and when.</w:t>
+      </w:r>
+    </w:p>
+    <w:p>
+      <w:pPr>
+        <w:pStyle w:val="Heading1"/>
+        <w:pageBreakBefore/>
+      </w:pPr>
+      <w:r>
+        <w:t xml:space="preserve">13.  Time off and messages (office and admins)</w:t>
+      </w:r>
+    </w:p>
+    <w:p>
+      <w:pPr>
+        <w:pStyle w:val="Heading2"/>
+      </w:pPr>
+      <w:r>
+        <w:t xml:space="preserve">Time Off tab</w:t>
+      </w:r>
+    </w:p>
+    <w:p>
+      <w:pPr>
+        <w:spacing w:after="120"/>
+      </w:pPr>
+      <w:r>
+        <w:t xml:space="preserve">Shows every request with who's out today. New requests also email the office and admins and appear under </w:t>
+      </w:r>
+      <w:r>
+        <w:rPr>
+          <w:b/>
+          <w:bCs/>
+        </w:rPr>
+        <w:t xml:space="preserve">Notifications</w:t>
+      </w:r>
+      <w:r>
+        <w:t xml:space="preserve">.</w:t>
+      </w:r>
+    </w:p>
+    <w:p>
+      <w:pPr>
+        <w:pStyle w:val="ListParagraph"/>
+        <w:numPr>
+          <w:ilvl w:val="0"/>
+          <w:numId w:val="17"/>
+        </w:numPr>
+        <w:spacing w:after="60"/>
+      </w:pPr>
+      <w:r>
+        <w:t xml:space="preserve">Open </w:t>
+      </w:r>
+      <w:r>
+        <w:rPr>
+          <w:b/>
+          <w:bCs/>
+        </w:rPr>
+        <w:t xml:space="preserve">Time Off</w:t>
+      </w:r>
+      <w:r>
+        <w:t xml:space="preserve"> (the tab shows a red number when requests are waiting).</w:t>
+      </w:r>
+    </w:p>
+    <w:p>
+      <w:pPr>
+        <w:pStyle w:val="ListParagraph"/>
+        <w:numPr>
+          <w:ilvl w:val="0"/>
+          <w:numId w:val="17"/>
+        </w:numPr>
+        <w:spacing w:after="60"/>
+      </w:pPr>
+      <w:r>
+        <w:t xml:space="preserve">Admins: click </w:t>
+      </w:r>
+      <w:r>
+        <w:rPr>
+          <w:b/>
+          <w:bCs/>
+        </w:rPr>
+        <w:t xml:space="preserve">Approve</w:t>
+      </w:r>
+      <w:r>
+        <w:t xml:space="preserve"> or </w:t>
+      </w:r>
+      <w:r>
+        <w:rPr>
+          <w:b/>
+          <w:bCs/>
+        </w:rPr>
+        <w:t xml:space="preserve">Deny</w:t>
+      </w:r>
+      <w:r>
+        <w:t xml:space="preserve">, add an optional note, and confirm.</w:t>
+      </w:r>
+    </w:p>
+    <w:p>
+      <w:pPr>
+        <w:pStyle w:val="ListParagraph"/>
+        <w:numPr>
+          <w:ilvl w:val="0"/>
+          <w:numId w:val="17"/>
+        </w:numPr>
+        <w:spacing w:after="60"/>
+      </w:pPr>
+      <w:r>
+        <w:t xml:space="preserve">The employee gets a mailbox message and an email with the decision. The office and admins also get an email, with </w:t>
+      </w:r>
+      <w:r>
+        <w:rPr>
+          <w:b/>
+          <w:bCs/>
+        </w:rPr>
+        <w:t xml:space="preserve">APPROVED</w:t>
+      </w:r>
+      <w:r>
+        <w:t xml:space="preserve"> or </w:t>
+      </w:r>
+      <w:r>
+        <w:rPr>
+          <w:b/>
+          <w:bCs/>
+        </w:rPr>
+        <w:t xml:space="preserve">DENIED</w:t>
+      </w:r>
+      <w:r>
+        <w:t xml:space="preserve"> and the employee's name in the subject (for example "Time-off request APPROVED · Jane Doe").</w:t>
+      </w:r>
+    </w:p>
+    <w:p>
+      <w:pPr>
+        <w:pBdr>
+          <w:left w:val="single" w:color="C99A06" w:sz="24" w:space="8"/>
+        </w:pBdr>
+        <w:shd w:fill="FFF8DD" w:color="auto" w:val="clear"/>
+        <w:spacing w:after="160" w:before="120"/>
+        <w:ind w:left="160" w:right="160"/>
+      </w:pPr>
+      <w:r>
+        <w:rPr>
+          <w:b/>
+          <w:bCs/>
+          <w:color w:val="C99A06"/>
+        </w:rPr>
+        <w:t xml:space="preserve">Note:  </w:t>
+      </w:r>
+      <w:r>
+        <w:t xml:space="preserve">Only </w:t>
+      </w:r>
+      <w:r>
+        <w:rPr>
+          <w:b/>
+          <w:bCs/>
+        </w:rPr>
+        <w:t xml:space="preserve">admins and owners</w:t>
+      </w:r>
+      <w:r>
+        <w:t xml:space="preserve"> can approve or deny, here or in the Employee App (Staff Hub → </w:t>
+      </w:r>
+      <w:r>
+        <w:rPr>
+          <w:b/>
+          <w:bCs/>
+        </w:rPr>
+        <w:t xml:space="preserve">Approve time off</w:t>
+      </w:r>
+      <w:r>
+        <w:t xml:space="preserve">). Managers and office staff can see requests but not decide them.</w:t>
+      </w:r>
+    </w:p>
+    <w:p>
+      <w:pPr>
+        <w:pStyle w:val="Heading2"/>
+      </w:pPr>
+      <w:r>
+        <w:t xml:space="preserve">Messages &amp; Info tab</w:t>
+      </w:r>
+    </w:p>
+    <w:p>
+      <w:pPr>
+        <w:pStyle w:val="ListParagraph"/>
+        <w:numPr>
+          <w:ilvl w:val="0"/>
+          <w:numId w:val="2"/>
+        </w:numPr>
+        <w:spacing w:after="60"/>
+      </w:pPr>
+      <w:r>
+        <w:rPr>
+          <w:b/>
+          <w:bCs/>
+        </w:rPr>
+        <w:t xml:space="preserve">Inbox:</w:t>
+      </w:r>
+      <w:r>
+        <w:t xml:space="preserve"> your messages. Click one to read it and </w:t>
+      </w:r>
+      <w:r>
+        <w:rPr>
+          <w:b/>
+          <w:bCs/>
+        </w:rPr>
+        <w:t xml:space="preserve">Reply</w:t>
+      </w:r>
+      <w:r>
+        <w:t xml:space="preserve">.</w:t>
+      </w:r>
+    </w:p>
+    <w:p>
+      <w:pPr>
+        <w:pStyle w:val="ListParagraph"/>
+        <w:numPr>
+          <w:ilvl w:val="0"/>
+          <w:numId w:val="2"/>
+        </w:numPr>
+        <w:spacing w:after="60"/>
+      </w:pPr>
+      <w:r>
+        <w:rPr>
+          <w:b/>
+          <w:bCs/>
+        </w:rPr>
+        <w:t xml:space="preserve">New message:</w:t>
+      </w:r>
+      <w:r>
+        <w:t xml:space="preserve"> send to one person, a department (for example all of Paint), the office, or everyone. It appears in their Employee App mailbox.</w:t>
+      </w:r>
+    </w:p>
+    <w:p>
+      <w:pPr>
+        <w:pStyle w:val="ListParagraph"/>
+        <w:numPr>
+          <w:ilvl w:val="0"/>
+          <w:numId w:val="2"/>
+        </w:numPr>
+        <w:spacing w:after="60"/>
+      </w:pPr>
+      <w:r>
+        <w:rPr>
+          <w:b/>
+          <w:bCs/>
+        </w:rPr>
+        <w:t xml:space="preserve">Company info</w:t>
+      </w:r>
+      <w:r>
+        <w:t xml:space="preserve"> (admins): </w:t>
+      </w:r>
+      <w:r>
+        <w:rPr>
+          <w:b/>
+          <w:bCs/>
+        </w:rPr>
+        <w:t xml:space="preserve">Add section</w:t>
+      </w:r>
+      <w:r>
+        <w:t xml:space="preserve"> for things like shop hours, holiday schedule or who to call. Staff see it under Staff Hub → Company info.</w:t>
+      </w:r>
+    </w:p>
+    <w:p>
+      <w:pPr>
+        <w:pStyle w:val="Heading1"/>
+        <w:pageBreakBefore/>
+      </w:pPr>
+      <w:r>
         <w:t xml:space="preserve">14.  Admin: employees and settings</w:t>
       </w:r>
     </w:p>
@@ -5631,7 +5933,7 @@
         <w:pStyle w:val="ListParagraph"/>
         <w:numPr>
           <w:ilvl w:val="0"/>
-          <w:numId w:val="17"/>
+          <w:numId w:val="18"/>
         </w:numPr>
         <w:spacing w:after="60"/>
       </w:pPr>
@@ -5664,7 +5966,7 @@
         <w:pStyle w:val="ListParagraph"/>
         <w:numPr>
           <w:ilvl w:val="0"/>
-          <w:numId w:val="17"/>
+          <w:numId w:val="18"/>
         </w:numPr>
         <w:spacing w:after="60"/>
       </w:pPr>
@@ -5687,7 +5989,7 @@
         <w:pStyle w:val="ListParagraph"/>
         <w:numPr>
           <w:ilvl w:val="0"/>
-          <w:numId w:val="17"/>
+          <w:numId w:val="18"/>
         </w:numPr>
         <w:spacing w:after="60"/>
       </w:pPr>
@@ -5720,7 +6022,7 @@
         <w:pStyle w:val="ListParagraph"/>
         <w:numPr>
           <w:ilvl w:val="0"/>
-          <w:numId w:val="17"/>
+          <w:numId w:val="18"/>
         </w:numPr>
         <w:spacing w:after="60"/>
       </w:pPr>
@@ -6630,7 +6932,7 @@
                 <w:b/>
                 <w:bCs/>
               </w:rPr>
-              <w:t xml:space="preserve">2.4</w:t>
+              <w:t xml:space="preserve">2.5</w:t>
             </w:r>
           </w:p>
         </w:tc>
@@ -6652,7 +6954,7 @@
           </w:tcPr>
           <w:p>
             <w:r>
-              <w:t xml:space="preserve">October 6, 2026</w:t>
+              <w:t xml:space="preserve">October 8, 2026</w:t>
             </w:r>
           </w:p>
         </w:tc>
@@ -6674,17 +6976,27 @@
           </w:tcPr>
           <w:p>
             <w:r>
-              <w:t xml:space="preserve">Admins can </w:t>
+              <w:t xml:space="preserve">Office staff and the parts department can </w:t>
             </w:r>
             <w:r>
               <w:rPr>
                 <w:b/>
                 <w:bCs/>
               </w:rPr>
-              <w:t xml:space="preserve">approve or deny time off in the Employee App</w:t>
-            </w:r>
-            <w:r>
-              <w:t xml:space="preserve"> (Staff Hub → Approve time off), and the office is emailed every decision. The TV and shop touch board show when they last updated and catch up by themselves if they fall behind.</w:t>
+              <w:t xml:space="preserve">run parts from their phone</w:t>
+            </w:r>
+            <w:r>
+              <w:t xml:space="preserve">: the new </w:t>
+            </w:r>
+            <w:r>
+              <w:rPr>
+                <w:b/>
+                <w:bCs/>
+              </w:rPr>
+              <w:t xml:space="preserve">Parts desk</w:t>
+            </w:r>
+            <w:r>
+              <w:t xml:space="preserve"> in the Employee App orders, receives and mirror matches parts, moves them between shelves, and covers Returns &amp; Alerts and storage locations.</w:t>
             </w:r>
           </w:p>
         </w:tc>
@@ -6715,7 +7027,7 @@
                 <w:b/>
                 <w:bCs/>
               </w:rPr>
-              <w:t xml:space="preserve">2.3</w:t>
+              <w:t xml:space="preserve">2.4</w:t>
             </w:r>
           </w:p>
         </w:tc>
@@ -6737,7 +7049,7 @@
           </w:tcPr>
           <w:p>
             <w:r>
-              <w:t xml:space="preserve">October 5, 2026</w:t>
+              <w:t xml:space="preserve">October 6, 2026</w:t>
             </w:r>
           </w:p>
         </w:tc>
@@ -6759,37 +7071,17 @@
           </w:tcPr>
           <w:p>
             <w:r>
-              <w:t xml:space="preserve">Estimates without an RO are now </w:t>
+              <w:t xml:space="preserve">Admins can </w:t>
             </w:r>
             <w:r>
               <w:rPr>
                 <w:b/>
                 <w:bCs/>
               </w:rPr>
-              <w:t xml:space="preserve">capture opportunities</w:t>
-            </w:r>
-            <w:r>
-              <w:t xml:space="preserve">: instead of cycle time emails, the office gets up to 3 reminders to call the customer. Log each call with </w:t>
-            </w:r>
-            <w:r>
-              <w:rPr>
-                <w:b/>
-                <w:bCs/>
-              </w:rPr>
-              <w:t xml:space="preserve">Log call</w:t>
-            </w:r>
-            <w:r>
-              <w:t xml:space="preserve"> under </w:t>
-            </w:r>
-            <w:r>
-              <w:rPr>
-                <w:b/>
-                <w:bCs/>
-              </w:rPr>
-              <w:t xml:space="preserve">Opportunities</w:t>
-            </w:r>
-            <w:r>
-              <w:t xml:space="preserve">.</w:t>
+              <w:t xml:space="preserve">approve or deny time off in the Employee App</w:t>
+            </w:r>
+            <w:r>
+              <w:t xml:space="preserve"> (Staff Hub → Approve time off), and the office is emailed every decision. The TV and shop touch board show when they last updated and catch up by themselves if they fall behind.</w:t>
             </w:r>
           </w:p>
         </w:tc>
@@ -6820,7 +7112,7 @@
                 <w:b/>
                 <w:bCs/>
               </w:rPr>
-              <w:t xml:space="preserve">2.2</w:t>
+              <w:t xml:space="preserve">2.3</w:t>
             </w:r>
           </w:p>
         </w:tc>
@@ -6842,7 +7134,7 @@
           </w:tcPr>
           <w:p>
             <w:r>
-              <w:t xml:space="preserve">September 30, 2026</w:t>
+              <w:t xml:space="preserve">October 5, 2026</w:t>
             </w:r>
           </w:p>
         </w:tc>
@@ -6864,17 +7156,37 @@
           </w:tcPr>
           <w:p>
             <w:r>
-              <w:t xml:space="preserve">On the shop touch board, technicians can </w:t>
+              <w:t xml:space="preserve">Estimates without an RO are now </w:t>
             </w:r>
             <w:r>
               <w:rPr>
                 <w:b/>
                 <w:bCs/>
               </w:rPr>
-              <w:t xml:space="preserve">drag</w:t>
-            </w:r>
-            <w:r>
-              <w:t xml:space="preserve"> a car to its next stage with a finger (tapping still works).</w:t>
+              <w:t xml:space="preserve">capture opportunities</w:t>
+            </w:r>
+            <w:r>
+              <w:t xml:space="preserve">: instead of cycle time emails, the office gets up to 3 reminders to call the customer. Log each call with </w:t>
+            </w:r>
+            <w:r>
+              <w:rPr>
+                <w:b/>
+                <w:bCs/>
+              </w:rPr>
+              <w:t xml:space="preserve">Log call</w:t>
+            </w:r>
+            <w:r>
+              <w:t xml:space="preserve"> under </w:t>
+            </w:r>
+            <w:r>
+              <w:rPr>
+                <w:b/>
+                <w:bCs/>
+              </w:rPr>
+              <w:t xml:space="preserve">Opportunities</w:t>
+            </w:r>
+            <w:r>
+              <w:t xml:space="preserve">.</w:t>
             </w:r>
           </w:p>
         </w:tc>
@@ -6905,7 +7217,7 @@
                 <w:b/>
                 <w:bCs/>
               </w:rPr>
-              <w:t xml:space="preserve">2.1</w:t>
+              <w:t xml:space="preserve">2.2</w:t>
             </w:r>
           </w:p>
         </w:tc>
@@ -6949,17 +7261,17 @@
           </w:tcPr>
           <w:p>
             <w:r>
-              <w:t xml:space="preserve">New </w:t>
+              <w:t xml:space="preserve">On the shop touch board, technicians can </w:t>
             </w:r>
             <w:r>
               <w:rPr>
                 <w:b/>
                 <w:bCs/>
               </w:rPr>
-              <w:t xml:space="preserve">shop touch board</w:t>
-            </w:r>
-            <w:r>
-              <w:t xml:space="preserve">: technicians move cars to their next stage by tapping the car, the stage and their name.</w:t>
+              <w:t xml:space="preserve">drag</w:t>
+            </w:r>
+            <w:r>
+              <w:t xml:space="preserve"> a car to its next stage with a finger (tapping still works).</w:t>
             </w:r>
           </w:p>
         </w:tc>
@@ -6990,7 +7302,7 @@
                 <w:b/>
                 <w:bCs/>
               </w:rPr>
-              <w:t xml:space="preserve">2.0</w:t>
+              <w:t xml:space="preserve">2.1</w:t>
             </w:r>
           </w:p>
         </w:tc>
@@ -7034,27 +7346,17 @@
           </w:tcPr>
           <w:p>
             <w:r>
-              <w:t xml:space="preserve">The Employee App can be switched to </w:t>
+              <w:t xml:space="preserve">New </w:t>
             </w:r>
             <w:r>
               <w:rPr>
                 <w:b/>
                 <w:bCs/>
               </w:rPr>
-              <w:t xml:space="preserve">Spanish</w:t>
-            </w:r>
-            <w:r>
-              <w:t xml:space="preserve"> with the </w:t>
-            </w:r>
-            <w:r>
-              <w:rPr>
-                <w:b/>
-                <w:bCs/>
-              </w:rPr>
-              <w:t xml:space="preserve">Español</w:t>
-            </w:r>
-            <w:r>
-              <w:t xml:space="preserve"> button. Reports and the office program stay in English.</w:t>
+              <w:t xml:space="preserve">shop touch board</w:t>
+            </w:r>
+            <w:r>
+              <w:t xml:space="preserve">: technicians move cars to their next stage by tapping the car, the stage and their name.</w:t>
             </w:r>
           </w:p>
         </w:tc>
@@ -7085,7 +7387,7 @@
                 <w:b/>
                 <w:bCs/>
               </w:rPr>
-              <w:t xml:space="preserve">1.9</w:t>
+              <w:t xml:space="preserve">2.0</w:t>
             </w:r>
           </w:p>
         </w:tc>
@@ -7107,7 +7409,7 @@
           </w:tcPr>
           <w:p>
             <w:r>
-              <w:t xml:space="preserve">September 28, 2026</w:t>
+              <w:t xml:space="preserve">September 30, 2026</w:t>
             </w:r>
           </w:p>
         </w:tc>
@@ -7129,17 +7431,27 @@
           </w:tcPr>
           <w:p>
             <w:r>
-              <w:t xml:space="preserve">New </w:t>
+              <w:t xml:space="preserve">The Employee App can be switched to </w:t>
             </w:r>
             <w:r>
               <w:rPr>
                 <w:b/>
                 <w:bCs/>
               </w:rPr>
-              <w:t xml:space="preserve">Find a vehicle</w:t>
-            </w:r>
-            <w:r>
-              <w:t xml:space="preserve"> search at the top of the office program. It finds any car, at any stage or finished, by RO, customer, vehicle, VIN, plate or claim number.</w:t>
+              <w:t xml:space="preserve">Spanish</w:t>
+            </w:r>
+            <w:r>
+              <w:t xml:space="preserve"> with the </w:t>
+            </w:r>
+            <w:r>
+              <w:rPr>
+                <w:b/>
+                <w:bCs/>
+              </w:rPr>
+              <w:t xml:space="preserve">Español</w:t>
+            </w:r>
+            <w:r>
+              <w:t xml:space="preserve"> button. Reports and the office program stay in English.</w:t>
             </w:r>
           </w:p>
         </w:tc>
@@ -7170,7 +7482,7 @@
                 <w:b/>
                 <w:bCs/>
               </w:rPr>
-              <w:t xml:space="preserve">1.8</w:t>
+              <w:t xml:space="preserve">1.9</w:t>
             </w:r>
           </w:p>
         </w:tc>
@@ -7221,10 +7533,10 @@
                 <w:b/>
                 <w:bCs/>
               </w:rPr>
-              <w:t xml:space="preserve">Completed Jobs</w:t>
-            </w:r>
-            <w:r>
-              <w:t xml:space="preserve"> tab with each finished job's full file (production timeline, parts, QC, photos, every change). Only an admin can delete a delivered job or its parts.</w:t>
+              <w:t xml:space="preserve">Find a vehicle</w:t>
+            </w:r>
+            <w:r>
+              <w:t xml:space="preserve"> search at the top of the office program. It finds any car, at any stage or finished, by RO, customer, vehicle, VIN, plate or claim number.</w:t>
             </w:r>
           </w:p>
         </w:tc>
@@ -7255,7 +7567,7 @@
                 <w:b/>
                 <w:bCs/>
               </w:rPr>
-              <w:t xml:space="preserve">1.7</w:t>
+              <w:t xml:space="preserve">1.8</w:t>
             </w:r>
           </w:p>
         </w:tc>
@@ -7299,17 +7611,17 @@
           </w:tcPr>
           <w:p>
             <w:r>
-              <w:t xml:space="preserve">The Employee App now shows </w:t>
+              <w:t xml:space="preserve">New </w:t>
             </w:r>
             <w:r>
               <w:rPr>
                 <w:b/>
                 <w:bCs/>
               </w:rPr>
-              <w:t xml:space="preserve">where each part is</w:t>
-            </w:r>
-            <w:r>
-              <w:t xml:space="preserve">: the car's parts cart, and the cart shelf or storage spot for every part.</w:t>
+              <w:t xml:space="preserve">Completed Jobs</w:t>
+            </w:r>
+            <w:r>
+              <w:t xml:space="preserve"> tab with each finished job's full file (production timeline, parts, QC, photos, every change). Only an admin can delete a delivered job or its parts.</w:t>
             </w:r>
           </w:p>
         </w:tc>
@@ -7340,7 +7652,7 @@
                 <w:b/>
                 <w:bCs/>
               </w:rPr>
-              <w:t xml:space="preserve">1.6</w:t>
+              <w:t xml:space="preserve">1.7</w:t>
             </w:r>
           </w:p>
         </w:tc>
@@ -7384,37 +7696,17 @@
           </w:tcPr>
           <w:p>
             <w:r>
-              <w:t xml:space="preserve">Whoever does </w:t>
+              <w:t xml:space="preserve">The Employee App now shows </w:t>
             </w:r>
             <w:r>
               <w:rPr>
                 <w:b/>
                 <w:bCs/>
               </w:rPr>
-              <w:t xml:space="preserve">Check-In</w:t>
-            </w:r>
-            <w:r>
-              <w:t xml:space="preserve"> automatically gets the </w:t>
-            </w:r>
-            <w:r>
-              <w:rPr>
-                <w:b/>
-                <w:bCs/>
-              </w:rPr>
-              <w:t xml:space="preserve">Final QC</w:t>
-            </w:r>
-            <w:r>
-              <w:t xml:space="preserve"> checklist too. New </w:t>
-            </w:r>
-            <w:r>
-              <w:rPr>
-                <w:b/>
-                <w:bCs/>
-              </w:rPr>
-              <w:t xml:space="preserve">QC report</w:t>
-            </w:r>
-            <w:r>
-              <w:t xml:space="preserve"> for each car: all five checklists with signatures on one printable page.</w:t>
+              <w:t xml:space="preserve">where each part is</w:t>
+            </w:r>
+            <w:r>
+              <w:t xml:space="preserve">: the car's parts cart, and the cart shelf or storage spot for every part.</w:t>
             </w:r>
           </w:p>
         </w:tc>
@@ -7445,7 +7737,7 @@
                 <w:b/>
                 <w:bCs/>
               </w:rPr>
-              <w:t xml:space="preserve">1.5</w:t>
+              <w:t xml:space="preserve">1.6</w:t>
             </w:r>
           </w:p>
         </w:tc>
@@ -7489,17 +7781,37 @@
           </w:tcPr>
           <w:p>
             <w:r>
-              <w:t xml:space="preserve">Body technicians automatically get the </w:t>
+              <w:t xml:space="preserve">Whoever does </w:t>
             </w:r>
             <w:r>
               <w:rPr>
                 <w:b/>
                 <w:bCs/>
               </w:rPr>
-              <w:t xml:space="preserve">Reassy</w:t>
-            </w:r>
-            <w:r>
-              <w:t xml:space="preserve"> checklist too.</w:t>
+              <w:t xml:space="preserve">Check-In</w:t>
+            </w:r>
+            <w:r>
+              <w:t xml:space="preserve"> automatically gets the </w:t>
+            </w:r>
+            <w:r>
+              <w:rPr>
+                <w:b/>
+                <w:bCs/>
+              </w:rPr>
+              <w:t xml:space="preserve">Final QC</w:t>
+            </w:r>
+            <w:r>
+              <w:t xml:space="preserve"> checklist too. New </w:t>
+            </w:r>
+            <w:r>
+              <w:rPr>
+                <w:b/>
+                <w:bCs/>
+              </w:rPr>
+              <w:t xml:space="preserve">QC report</w:t>
+            </w:r>
+            <w:r>
+              <w:t xml:space="preserve"> for each car: all five checklists with signatures on one printable page.</w:t>
             </w:r>
           </w:p>
         </w:tc>
@@ -7530,7 +7842,7 @@
                 <w:b/>
                 <w:bCs/>
               </w:rPr>
-              <w:t xml:space="preserve">1.4</w:t>
+              <w:t xml:space="preserve">1.5</w:t>
             </w:r>
           </w:p>
         </w:tc>
@@ -7574,17 +7886,17 @@
           </w:tcPr>
           <w:p>
             <w:r>
-              <w:t xml:space="preserve">Employees can be set to </w:t>
+              <w:t xml:space="preserve">Body technicians automatically get the </w:t>
             </w:r>
             <w:r>
               <w:rPr>
                 <w:b/>
                 <w:bCs/>
               </w:rPr>
-              <w:t xml:space="preserve">also do</w:t>
-            </w:r>
-            <w:r>
-              <w:t xml:space="preserve"> other checklists (for example a body tech who reassembles also gets the Reassy checklist).</w:t>
+              <w:t xml:space="preserve">Reassy</w:t>
+            </w:r>
+            <w:r>
+              <w:t xml:space="preserve"> checklist too.</w:t>
             </w:r>
           </w:p>
         </w:tc>
@@ -7615,7 +7927,7 @@
                 <w:b/>
                 <w:bCs/>
               </w:rPr>
-              <w:t xml:space="preserve">1.3</w:t>
+              <w:t xml:space="preserve">1.4</w:t>
             </w:r>
           </w:p>
         </w:tc>
@@ -7659,7 +7971,17 @@
           </w:tcPr>
           <w:p>
             <w:r>
-              <w:t xml:space="preserve">New accounts and admin password resets use a temporary password; you choose your own the first time you sign in.</w:t>
+              <w:t xml:space="preserve">Employees can be set to </w:t>
+            </w:r>
+            <w:r>
+              <w:rPr>
+                <w:b/>
+                <w:bCs/>
+              </w:rPr>
+              <w:t xml:space="preserve">also do</w:t>
+            </w:r>
+            <w:r>
+              <w:t xml:space="preserve"> other checklists (for example a body tech who reassembles also gets the Reassy checklist).</w:t>
             </w:r>
           </w:p>
         </w:tc>
@@ -7690,7 +8012,7 @@
                 <w:b/>
                 <w:bCs/>
               </w:rPr>
-              <w:t xml:space="preserve">1.2</w:t>
+              <w:t xml:space="preserve">1.3</w:t>
             </w:r>
           </w:p>
         </w:tc>
@@ -7734,17 +8056,7 @@
           </w:tcPr>
           <w:p>
             <w:r>
-              <w:t xml:space="preserve">Added the </w:t>
-            </w:r>
-            <w:r>
-              <w:rPr>
-                <w:b/>
-                <w:bCs/>
-              </w:rPr>
-              <w:t xml:space="preserve">Help</w:t>
-            </w:r>
-            <w:r>
-              <w:t xml:space="preserve"> tab in the office program and a search box in the manual.</w:t>
+              <w:t xml:space="preserve">New accounts and admin password resets use a temporary password; you choose your own the first time you sign in.</w:t>
             </w:r>
           </w:p>
         </w:tc>
@@ -7775,7 +8087,7 @@
                 <w:b/>
                 <w:bCs/>
               </w:rPr>
-              <w:t xml:space="preserve">1.1</w:t>
+              <w:t xml:space="preserve">1.2</w:t>
             </w:r>
           </w:p>
         </w:tc>
@@ -7819,17 +8131,17 @@
           </w:tcPr>
           <w:p>
             <w:r>
-              <w:t xml:space="preserve">Employee App address is now </w:t>
+              <w:t xml:space="preserve">Added the </w:t>
             </w:r>
             <w:r>
               <w:rPr>
                 <w:b/>
                 <w:bCs/>
               </w:rPr>
-              <w:t xml:space="preserve">https://conceptautobody.app</w:t>
-            </w:r>
-            <w:r>
-              <w:t xml:space="preserve"> and works on phones anywhere. Added how to put it on your phone's home screen.</w:t>
+              <w:t xml:space="preserve">Help</w:t>
+            </w:r>
+            <w:r>
+              <w:t xml:space="preserve"> tab in the office program and a search box in the manual.</w:t>
             </w:r>
           </w:p>
         </w:tc>
@@ -7860,7 +8172,7 @@
                 <w:b/>
                 <w:bCs/>
               </w:rPr>
-              <w:t xml:space="preserve">1.0</w:t>
+              <w:t xml:space="preserve">1.1</w:t>
             </w:r>
           </w:p>
         </w:tc>
@@ -7904,6 +8216,91 @@
           </w:tcPr>
           <w:p>
             <w:r>
+              <w:t xml:space="preserve">Employee App address is now </w:t>
+            </w:r>
+            <w:r>
+              <w:rPr>
+                <w:b/>
+                <w:bCs/>
+              </w:rPr>
+              <w:t xml:space="preserve">https://conceptautobody.app</w:t>
+            </w:r>
+            <w:r>
+              <w:t xml:space="preserve"> and works on phones anywhere. Added how to put it on your phone's home screen.</w:t>
+            </w:r>
+          </w:p>
+        </w:tc>
+      </w:tr>
+      <w:tr>
+        <w:trPr>
+          <w:cantSplit/>
+        </w:trPr>
+        <w:tc>
+          <w:tcPr>
+            <w:tcW w:type="dxa" w:w="3120"/>
+            <w:tcBorders>
+              <w:top w:val="single" w:color="C9CFD6" w:sz="4"/>
+              <w:left w:val="single" w:color="C9CFD6" w:sz="4"/>
+              <w:bottom w:val="single" w:color="C9CFD6" w:sz="4"/>
+              <w:right w:val="single" w:color="C9CFD6" w:sz="4"/>
+            </w:tcBorders>
+            <w:tcMar>
+              <w:top w:type="dxa" w:w="80"/>
+              <w:left w:type="dxa" w:w="120"/>
+              <w:bottom w:type="dxa" w:w="80"/>
+              <w:right w:type="dxa" w:w="120"/>
+            </w:tcMar>
+          </w:tcPr>
+          <w:p>
+            <w:r>
+              <w:rPr>
+                <w:b/>
+                <w:bCs/>
+              </w:rPr>
+              <w:t xml:space="preserve">1.0</w:t>
+            </w:r>
+          </w:p>
+        </w:tc>
+        <w:tc>
+          <w:tcPr>
+            <w:tcW w:type="dxa" w:w="3120"/>
+            <w:tcBorders>
+              <w:top w:val="single" w:color="C9CFD6" w:sz="4"/>
+              <w:left w:val="single" w:color="C9CFD6" w:sz="4"/>
+              <w:bottom w:val="single" w:color="C9CFD6" w:sz="4"/>
+              <w:right w:val="single" w:color="C9CFD6" w:sz="4"/>
+            </w:tcBorders>
+            <w:tcMar>
+              <w:top w:type="dxa" w:w="80"/>
+              <w:left w:type="dxa" w:w="120"/>
+              <w:bottom w:type="dxa" w:w="80"/>
+              <w:right w:type="dxa" w:w="120"/>
+            </w:tcMar>
+          </w:tcPr>
+          <w:p>
+            <w:r>
+              <w:t xml:space="preserve">September 28, 2026</w:t>
+            </w:r>
+          </w:p>
+        </w:tc>
+        <w:tc>
+          <w:tcPr>
+            <w:tcW w:type="dxa" w:w="3120"/>
+            <w:tcBorders>
+              <w:top w:val="single" w:color="C9CFD6" w:sz="4"/>
+              <w:left w:val="single" w:color="C9CFD6" w:sz="4"/>
+              <w:bottom w:val="single" w:color="C9CFD6" w:sz="4"/>
+              <w:right w:val="single" w:color="C9CFD6" w:sz="4"/>
+            </w:tcBorders>
+            <w:tcMar>
+              <w:top w:type="dxa" w:w="80"/>
+              <w:left w:type="dxa" w:w="120"/>
+              <w:bottom w:type="dxa" w:w="80"/>
+              <w:right w:type="dxa" w:w="120"/>
+            </w:tcMar>
+          </w:tcPr>
+          <w:p>
+            <w:r>
               <w:t xml:space="preserve">First edition.</w:t>
             </w:r>
           </w:p>
@@ -7977,7 +8374,7 @@
         <w:sz w:val="18"/>
         <w:szCs w:val="18"/>
       </w:rPr>
-      <w:t xml:space="preserve">Concept Autobody  ·  Version 2.4  ·  Page </w:t>
+      <w:t xml:space="preserve">Concept Autobody  ·  Version 2.5  ·  Page </w:t>
     </w:r>
     <w:r>
       <w:rPr>
@@ -8261,6 +8658,12 @@
     </w:lvlOverride>
   </w:num>
   <w:num w:numId="17">
+    <w:abstractNumId w:val="3"/>
+    <w:lvlOverride w:ilvl="0">
+      <w:startOverride w:val="1"/>
+    </w:lvlOverride>
+  </w:num>
+  <w:num w:numId="18">
     <w:abstractNumId w:val="3"/>
     <w:lvlOverride w:ilvl="0">
       <w:startOverride w:val="1"/>

</xml_diff>

<commit_message>
Employee app: missed punch slips in Staff Hub, approved with time off; manual v2.6
Digital version of the paper Missed Punch form: date, time in, lunch out/in,
time out and initials, with the Thursday-Wednesday payroll week shown.
Admins approve or deny in Staff Hub (Approve requests) or the desktop Time
Off tab; the employee and office are notified. Migration 024.

Co-Authored-By: Claude Opus 5.5 <noreply@anthropic.com>
</commit_message>
<xml_diff>
--- a/client/manual/ShopControl-User-Manual.docx
+++ b/client/manual/ShopControl-User-Manual.docx
@@ -92,7 +92,7 @@
           <w:sz w:val="22"/>
           <w:szCs w:val="22"/>
         </w:rPr>
-        <w:t xml:space="preserve">Version 2.5  ·  Updated October 8, 2026</w:t>
+        <w:t xml:space="preserve">Version 2.6  ·  Updated October 8, 2026</w:t>
       </w:r>
     </w:p>
     <w:p>
@@ -1403,7 +1403,7 @@
         <w:t xml:space="preserve">Staff Hub</w:t>
       </w:r>
       <w:r>
-        <w:t xml:space="preserve"> button: time off, mailbox, company info and this manual.</w:t>
+        <w:t xml:space="preserve"> button: time off, missed punches, mailbox, company info and this manual.</w:t>
       </w:r>
     </w:p>
     <w:p>
@@ -2061,7 +2061,7 @@
         <w:pageBreakBefore/>
       </w:pPr>
       <w:r>
-        <w:t xml:space="preserve">3.  Staff Hub: time off, mailbox and company info</w:t>
+        <w:t xml:space="preserve">3.  Staff Hub: time off, missed punches, mailbox and company info</w:t>
       </w:r>
     </w:p>
     <w:p>
@@ -2268,7 +2268,35 @@
         <w:pStyle w:val="Heading2"/>
       </w:pPr>
       <w:r>
-        <w:t xml:space="preserve">Approving time off on your phone (admins and owners)</w:t>
+        <w:t xml:space="preserve">Missed punch</w:t>
+      </w:r>
+    </w:p>
+    <w:p>
+      <w:pPr>
+        <w:spacing w:after="120"/>
+      </w:pPr>
+      <w:r>
+        <w:t xml:space="preserve">Use this instead of the paper missed punch slip when you forgot to clock in or out. Missed punches are paid on the </w:t>
+      </w:r>
+      <w:r>
+        <w:rPr>
+          <w:b/>
+          <w:bCs/>
+        </w:rPr>
+        <w:t xml:space="preserve">following payroll</w:t>
+      </w:r>
+      <w:r>
+        <w:t xml:space="preserve">, and payroll runs </w:t>
+      </w:r>
+      <w:r>
+        <w:rPr>
+          <w:b/>
+          <w:bCs/>
+        </w:rPr>
+        <w:t xml:space="preserve">Thursday to Wednesday</w:t>
+      </w:r>
+      <w:r>
+        <w:t xml:space="preserve">, so send your slip before the next payroll to get paid.</w:t>
       </w:r>
     </w:p>
     <w:p>
@@ -2281,6 +2309,194 @@
         <w:spacing w:after="60"/>
       </w:pPr>
       <w:r>
+        <w:t xml:space="preserve">Tap </w:t>
+      </w:r>
+      <w:r>
+        <w:rPr>
+          <w:b/>
+          <w:bCs/>
+        </w:rPr>
+        <w:t xml:space="preserve">Missed punch</w:t>
+      </w:r>
+      <w:r>
+        <w:t xml:space="preserve">. Your name fills in automatically.</w:t>
+      </w:r>
+    </w:p>
+    <w:p>
+      <w:pPr>
+        <w:pStyle w:val="ListParagraph"/>
+        <w:numPr>
+          <w:ilvl w:val="0"/>
+          <w:numId w:val="8"/>
+        </w:numPr>
+        <w:spacing w:after="60"/>
+      </w:pPr>
+      <w:r>
+        <w:t xml:space="preserve">Pick the </w:t>
+      </w:r>
+      <w:r>
+        <w:rPr>
+          <w:b/>
+          <w:bCs/>
+        </w:rPr>
+        <w:t xml:space="preserve">date</w:t>
+      </w:r>
+      <w:r>
+        <w:t xml:space="preserve">. The app shows which payroll week (Thursday to Wednesday) it falls in.</w:t>
+      </w:r>
+    </w:p>
+    <w:p>
+      <w:pPr>
+        <w:pStyle w:val="ListParagraph"/>
+        <w:numPr>
+          <w:ilvl w:val="0"/>
+          <w:numId w:val="8"/>
+        </w:numPr>
+        <w:spacing w:after="60"/>
+      </w:pPr>
+      <w:r>
+        <w:t xml:space="preserve">Enter the whole day as accurately as you can: </w:t>
+      </w:r>
+      <w:r>
+        <w:rPr>
+          <w:b/>
+          <w:bCs/>
+        </w:rPr>
+        <w:t xml:space="preserve">Time in</w:t>
+      </w:r>
+      <w:r>
+        <w:t xml:space="preserve">, </w:t>
+      </w:r>
+      <w:r>
+        <w:rPr>
+          <w:b/>
+          <w:bCs/>
+        </w:rPr>
+        <w:t xml:space="preserve">Time out (lunch)</w:t>
+      </w:r>
+      <w:r>
+        <w:t xml:space="preserve">, </w:t>
+      </w:r>
+      <w:r>
+        <w:rPr>
+          <w:b/>
+          <w:bCs/>
+        </w:rPr>
+        <w:t xml:space="preserve">Time in (lunch)</w:t>
+      </w:r>
+      <w:r>
+        <w:t xml:space="preserve"> and </w:t>
+      </w:r>
+      <w:r>
+        <w:rPr>
+          <w:b/>
+          <w:bCs/>
+        </w:rPr>
+        <w:t xml:space="preserve">Time out</w:t>
+      </w:r>
+      <w:r>
+        <w:t xml:space="preserve">. If you didn't take a lunch, check </w:t>
+      </w:r>
+      <w:r>
+        <w:rPr>
+          <w:b/>
+          <w:bCs/>
+        </w:rPr>
+        <w:t xml:space="preserve">I didn't take a lunch</w:t>
+      </w:r>
+      <w:r>
+        <w:t xml:space="preserve">.</w:t>
+      </w:r>
+    </w:p>
+    <w:p>
+      <w:pPr>
+        <w:pStyle w:val="ListParagraph"/>
+        <w:numPr>
+          <w:ilvl w:val="0"/>
+          <w:numId w:val="8"/>
+        </w:numPr>
+        <w:spacing w:after="60"/>
+      </w:pPr>
+      <w:r>
+        <w:t xml:space="preserve">Add a note if it helps (for example "Forgot to clock out for lunch"), type your </w:t>
+      </w:r>
+      <w:r>
+        <w:rPr>
+          <w:b/>
+          <w:bCs/>
+        </w:rPr>
+        <w:t xml:space="preserve">initials</w:t>
+      </w:r>
+      <w:r>
+        <w:t xml:space="preserve"> to confirm the times, and tap </w:t>
+      </w:r>
+      <w:r>
+        <w:rPr>
+          <w:b/>
+          <w:bCs/>
+        </w:rPr>
+        <w:t xml:space="preserve">Submit missed punch</w:t>
+      </w:r>
+      <w:r>
+        <w:t xml:space="preserve">.</w:t>
+      </w:r>
+    </w:p>
+    <w:p>
+      <w:pPr>
+        <w:spacing w:after="120"/>
+      </w:pPr>
+      <w:r>
+        <w:t xml:space="preserve">The office and admins are emailed right away. Only an admin can approve or deny it, and you'll get a mailbox message (and an email) with </w:t>
+      </w:r>
+      <w:r>
+        <w:rPr>
+          <w:b/>
+          <w:bCs/>
+        </w:rPr>
+        <w:t xml:space="preserve">APPROVED</w:t>
+      </w:r>
+      <w:r>
+        <w:t xml:space="preserve"> or </w:t>
+      </w:r>
+      <w:r>
+        <w:rPr>
+          <w:b/>
+          <w:bCs/>
+        </w:rPr>
+        <w:t xml:space="preserve">DENIED</w:t>
+      </w:r>
+      <w:r>
+        <w:t xml:space="preserve">. You can send one slip per day; to fix a mistake, cancel it under </w:t>
+      </w:r>
+      <w:r>
+        <w:rPr>
+          <w:b/>
+          <w:bCs/>
+        </w:rPr>
+        <w:t xml:space="preserve">My requests</w:t>
+      </w:r>
+      <w:r>
+        <w:t xml:space="preserve"> and send a new one.</w:t>
+      </w:r>
+    </w:p>
+    <w:p>
+      <w:pPr>
+        <w:pStyle w:val="Heading2"/>
+      </w:pPr>
+      <w:r>
+        <w:t xml:space="preserve">Approving time off and missed punches on your phone (admins and owners)</w:t>
+      </w:r>
+    </w:p>
+    <w:p>
+      <w:pPr>
+        <w:pStyle w:val="ListParagraph"/>
+        <w:numPr>
+          <w:ilvl w:val="0"/>
+          <w:numId w:val="9"/>
+        </w:numPr>
+        <w:spacing w:after="60"/>
+      </w:pPr>
+      <w:r>
         <w:t xml:space="preserve">Open </w:t>
       </w:r>
       <w:r>
@@ -2298,7 +2514,7 @@
           <w:b/>
           <w:bCs/>
         </w:rPr>
-        <w:t xml:space="preserve">Approve time off</w:t>
+        <w:t xml:space="preserve">Approve requests</w:t>
       </w:r>
       <w:r>
         <w:t xml:space="preserve">. The tile, and the Staff Hub button, show how many requests are waiting.</w:t>
@@ -2309,7 +2525,7 @@
         <w:pStyle w:val="ListParagraph"/>
         <w:numPr>
           <w:ilvl w:val="0"/>
-          <w:numId w:val="8"/>
+          <w:numId w:val="9"/>
         </w:numPr>
         <w:spacing w:after="60"/>
       </w:pPr>
@@ -2342,7 +2558,20 @@
         <w:pStyle w:val="ListParagraph"/>
         <w:numPr>
           <w:ilvl w:val="0"/>
-          <w:numId w:val="8"/>
+          <w:numId w:val="9"/>
+        </w:numPr>
+        <w:spacing w:after="60"/>
+      </w:pPr>
+      <w:r>
+        <w:t xml:space="preserve">Missed punch slips show the date, every time, the payroll week and the employee's initials.</w:t>
+      </w:r>
+    </w:p>
+    <w:p>
+      <w:pPr>
+        <w:pStyle w:val="ListParagraph"/>
+        <w:numPr>
+          <w:ilvl w:val="0"/>
+          <w:numId w:val="9"/>
         </w:numPr>
         <w:spacing w:after="60"/>
       </w:pPr>
@@ -2400,7 +2629,7 @@
         <w:t xml:space="preserve">My requests</w:t>
       </w:r>
       <w:r>
-        <w:t xml:space="preserve"> shows each request as </w:t>
+        <w:t xml:space="preserve"> shows each time-off request and missed punch slip as </w:t>
       </w:r>
       <w:r>
         <w:rPr>
@@ -2917,7 +3146,7 @@
           <w:b/>
           <w:bCs/>
         </w:rPr>
-        <w:t xml:space="preserve">Time-Off Requests Pending</w:t>
+        <w:t xml:space="preserve">Time Off &amp; Missed Punches Pending</w:t>
       </w:r>
       <w:r>
         <w:t xml:space="preserve"> (office and admins only).</w:t>
@@ -3047,7 +3276,7 @@
         <w:pStyle w:val="ListParagraph"/>
         <w:numPr>
           <w:ilvl w:val="0"/>
-          <w:numId w:val="9"/>
+          <w:numId w:val="10"/>
         </w:numPr>
         <w:spacing w:after="60"/>
       </w:pPr>
@@ -3090,7 +3319,7 @@
         <w:pStyle w:val="ListParagraph"/>
         <w:numPr>
           <w:ilvl w:val="0"/>
-          <w:numId w:val="9"/>
+          <w:numId w:val="10"/>
         </w:numPr>
         <w:spacing w:after="60"/>
       </w:pPr>
@@ -3103,7 +3332,7 @@
         <w:pStyle w:val="ListParagraph"/>
         <w:numPr>
           <w:ilvl w:val="0"/>
-          <w:numId w:val="9"/>
+          <w:numId w:val="10"/>
         </w:numPr>
         <w:spacing w:after="60"/>
       </w:pPr>
@@ -3126,7 +3355,7 @@
         <w:pStyle w:val="ListParagraph"/>
         <w:numPr>
           <w:ilvl w:val="0"/>
-          <w:numId w:val="9"/>
+          <w:numId w:val="10"/>
         </w:numPr>
         <w:spacing w:after="60"/>
       </w:pPr>
@@ -3236,7 +3465,7 @@
         <w:pStyle w:val="ListParagraph"/>
         <w:numPr>
           <w:ilvl w:val="0"/>
-          <w:numId w:val="10"/>
+          <w:numId w:val="11"/>
         </w:numPr>
         <w:spacing w:after="60"/>
       </w:pPr>
@@ -3249,7 +3478,7 @@
         <w:pStyle w:val="ListParagraph"/>
         <w:numPr>
           <w:ilvl w:val="0"/>
-          <w:numId w:val="10"/>
+          <w:numId w:val="11"/>
         </w:numPr>
         <w:spacing w:after="60"/>
       </w:pPr>
@@ -3282,7 +3511,7 @@
         <w:pStyle w:val="ListParagraph"/>
         <w:numPr>
           <w:ilvl w:val="0"/>
-          <w:numId w:val="10"/>
+          <w:numId w:val="11"/>
         </w:numPr>
         <w:spacing w:after="60"/>
       </w:pPr>
@@ -3840,7 +4069,7 @@
         <w:pStyle w:val="ListParagraph"/>
         <w:numPr>
           <w:ilvl w:val="0"/>
-          <w:numId w:val="11"/>
+          <w:numId w:val="12"/>
         </w:numPr>
         <w:spacing w:after="60"/>
       </w:pPr>
@@ -3853,7 +4082,7 @@
         <w:pStyle w:val="ListParagraph"/>
         <w:numPr>
           <w:ilvl w:val="0"/>
-          <w:numId w:val="11"/>
+          <w:numId w:val="12"/>
         </w:numPr>
         <w:spacing w:after="60"/>
       </w:pPr>
@@ -3866,7 +4095,7 @@
         <w:pStyle w:val="ListParagraph"/>
         <w:numPr>
           <w:ilvl w:val="0"/>
-          <w:numId w:val="11"/>
+          <w:numId w:val="12"/>
         </w:numPr>
         <w:spacing w:after="60"/>
       </w:pPr>
@@ -3879,7 +4108,7 @@
         <w:pStyle w:val="ListParagraph"/>
         <w:numPr>
           <w:ilvl w:val="0"/>
-          <w:numId w:val="11"/>
+          <w:numId w:val="12"/>
         </w:numPr>
         <w:spacing w:after="60"/>
       </w:pPr>
@@ -3921,7 +4150,7 @@
         <w:pStyle w:val="ListParagraph"/>
         <w:numPr>
           <w:ilvl w:val="0"/>
-          <w:numId w:val="12"/>
+          <w:numId w:val="13"/>
         </w:numPr>
         <w:spacing w:after="60"/>
       </w:pPr>
@@ -3934,7 +4163,7 @@
         <w:pStyle w:val="ListParagraph"/>
         <w:numPr>
           <w:ilvl w:val="0"/>
-          <w:numId w:val="12"/>
+          <w:numId w:val="13"/>
         </w:numPr>
         <w:spacing w:after="60"/>
       </w:pPr>
@@ -3957,7 +4186,7 @@
         <w:pStyle w:val="ListParagraph"/>
         <w:numPr>
           <w:ilvl w:val="0"/>
-          <w:numId w:val="12"/>
+          <w:numId w:val="13"/>
         </w:numPr>
         <w:spacing w:after="60"/>
       </w:pPr>
@@ -3970,7 +4199,7 @@
         <w:pStyle w:val="ListParagraph"/>
         <w:numPr>
           <w:ilvl w:val="0"/>
-          <w:numId w:val="12"/>
+          <w:numId w:val="13"/>
         </w:numPr>
         <w:spacing w:after="60"/>
       </w:pPr>
@@ -4050,7 +4279,7 @@
         <w:pStyle w:val="ListParagraph"/>
         <w:numPr>
           <w:ilvl w:val="0"/>
-          <w:numId w:val="13"/>
+          <w:numId w:val="14"/>
         </w:numPr>
         <w:spacing w:after="60"/>
       </w:pPr>
@@ -4103,7 +4332,7 @@
         <w:pStyle w:val="ListParagraph"/>
         <w:numPr>
           <w:ilvl w:val="0"/>
-          <w:numId w:val="13"/>
+          <w:numId w:val="14"/>
         </w:numPr>
         <w:spacing w:after="60"/>
       </w:pPr>
@@ -4116,7 +4345,7 @@
         <w:pStyle w:val="ListParagraph"/>
         <w:numPr>
           <w:ilvl w:val="0"/>
-          <w:numId w:val="13"/>
+          <w:numId w:val="14"/>
         </w:numPr>
         <w:spacing w:after="60"/>
       </w:pPr>
@@ -4398,7 +4627,7 @@
         <w:pStyle w:val="ListParagraph"/>
         <w:numPr>
           <w:ilvl w:val="0"/>
-          <w:numId w:val="14"/>
+          <w:numId w:val="15"/>
         </w:numPr>
         <w:spacing w:after="60"/>
       </w:pPr>
@@ -4421,7 +4650,7 @@
         <w:pStyle w:val="ListParagraph"/>
         <w:numPr>
           <w:ilvl w:val="0"/>
-          <w:numId w:val="14"/>
+          <w:numId w:val="15"/>
         </w:numPr>
         <w:spacing w:after="60"/>
       </w:pPr>
@@ -4444,7 +4673,7 @@
         <w:pStyle w:val="ListParagraph"/>
         <w:numPr>
           <w:ilvl w:val="0"/>
-          <w:numId w:val="14"/>
+          <w:numId w:val="15"/>
         </w:numPr>
         <w:spacing w:after="60"/>
       </w:pPr>
@@ -4503,7 +4732,7 @@
         <w:pStyle w:val="ListParagraph"/>
         <w:numPr>
           <w:ilvl w:val="0"/>
-          <w:numId w:val="15"/>
+          <w:numId w:val="16"/>
         </w:numPr>
         <w:spacing w:after="60"/>
       </w:pPr>
@@ -4526,7 +4755,7 @@
         <w:pStyle w:val="ListParagraph"/>
         <w:numPr>
           <w:ilvl w:val="0"/>
-          <w:numId w:val="15"/>
+          <w:numId w:val="16"/>
         </w:numPr>
         <w:spacing w:after="60"/>
       </w:pPr>
@@ -4549,7 +4778,7 @@
         <w:pStyle w:val="ListParagraph"/>
         <w:numPr>
           <w:ilvl w:val="0"/>
-          <w:numId w:val="15"/>
+          <w:numId w:val="16"/>
         </w:numPr>
         <w:spacing w:after="60"/>
       </w:pPr>
@@ -4667,7 +4896,7 @@
         <w:pStyle w:val="ListParagraph"/>
         <w:numPr>
           <w:ilvl w:val="0"/>
-          <w:numId w:val="16"/>
+          <w:numId w:val="17"/>
         </w:numPr>
         <w:spacing w:after="60"/>
       </w:pPr>
@@ -4690,7 +4919,7 @@
         <w:pStyle w:val="ListParagraph"/>
         <w:numPr>
           <w:ilvl w:val="0"/>
-          <w:numId w:val="16"/>
+          <w:numId w:val="17"/>
         </w:numPr>
         <w:spacing w:after="60"/>
       </w:pPr>
@@ -4733,7 +4962,7 @@
         <w:pStyle w:val="ListParagraph"/>
         <w:numPr>
           <w:ilvl w:val="0"/>
-          <w:numId w:val="16"/>
+          <w:numId w:val="17"/>
         </w:numPr>
         <w:spacing w:after="60"/>
       </w:pPr>
@@ -4796,7 +5025,7 @@
         <w:pStyle w:val="ListParagraph"/>
         <w:numPr>
           <w:ilvl w:val="0"/>
-          <w:numId w:val="16"/>
+          <w:numId w:val="17"/>
         </w:numPr>
         <w:spacing w:after="60"/>
       </w:pPr>
@@ -5698,7 +5927,7 @@
         <w:pStyle w:val="ListParagraph"/>
         <w:numPr>
           <w:ilvl w:val="0"/>
-          <w:numId w:val="17"/>
+          <w:numId w:val="18"/>
         </w:numPr>
         <w:spacing w:after="60"/>
       </w:pPr>
@@ -5721,7 +5950,7 @@
         <w:pStyle w:val="ListParagraph"/>
         <w:numPr>
           <w:ilvl w:val="0"/>
-          <w:numId w:val="17"/>
+          <w:numId w:val="18"/>
         </w:numPr>
         <w:spacing w:after="60"/>
       </w:pPr>
@@ -5754,7 +5983,7 @@
         <w:pStyle w:val="ListParagraph"/>
         <w:numPr>
           <w:ilvl w:val="0"/>
-          <w:numId w:val="17"/>
+          <w:numId w:val="18"/>
         </w:numPr>
         <w:spacing w:after="60"/>
       </w:pPr>
@@ -5780,6 +6009,21 @@
       </w:r>
       <w:r>
         <w:t xml:space="preserve"> and the employee's name in the subject (for example "Time-off request APPROVED · Jane Doe").</w:t>
+      </w:r>
+    </w:p>
+    <w:p>
+      <w:pPr>
+        <w:spacing w:after="120"/>
+      </w:pPr>
+      <w:r>
+        <w:rPr>
+          <w:b/>
+          <w:bCs/>
+        </w:rPr>
+        <w:t xml:space="preserve">Missed punches</w:t>
+      </w:r>
+      <w:r>
+        <w:t xml:space="preserve"> are listed below the time-off requests, with the date, times, payroll week (Thursday to Wednesday) and the employee's initials. Approve or deny them the same way; the emails say "Missed punch APPROVED · Jane Doe". Use the approved slips to correct the time clock for payroll.</w:t>
       </w:r>
     </w:p>
     <w:p>
@@ -5817,7 +6061,7 @@
           <w:b/>
           <w:bCs/>
         </w:rPr>
-        <w:t xml:space="preserve">Approve time off</w:t>
+        <w:t xml:space="preserve">Approve requests</w:t>
       </w:r>
       <w:r>
         <w:t xml:space="preserve">). Managers and office staff can see requests but not decide them.</w:t>
@@ -5933,7 +6177,7 @@
         <w:pStyle w:val="ListParagraph"/>
         <w:numPr>
           <w:ilvl w:val="0"/>
-          <w:numId w:val="18"/>
+          <w:numId w:val="19"/>
         </w:numPr>
         <w:spacing w:after="60"/>
       </w:pPr>
@@ -5966,7 +6210,7 @@
         <w:pStyle w:val="ListParagraph"/>
         <w:numPr>
           <w:ilvl w:val="0"/>
-          <w:numId w:val="18"/>
+          <w:numId w:val="19"/>
         </w:numPr>
         <w:spacing w:after="60"/>
       </w:pPr>
@@ -5989,7 +6233,7 @@
         <w:pStyle w:val="ListParagraph"/>
         <w:numPr>
           <w:ilvl w:val="0"/>
-          <w:numId w:val="18"/>
+          <w:numId w:val="19"/>
         </w:numPr>
         <w:spacing w:after="60"/>
       </w:pPr>
@@ -6022,7 +6266,7 @@
         <w:pStyle w:val="ListParagraph"/>
         <w:numPr>
           <w:ilvl w:val="0"/>
-          <w:numId w:val="18"/>
+          <w:numId w:val="19"/>
         </w:numPr>
         <w:spacing w:after="60"/>
       </w:pPr>
@@ -6932,7 +7176,7 @@
                 <w:b/>
                 <w:bCs/>
               </w:rPr>
-              <w:t xml:space="preserve">2.5</w:t>
+              <w:t xml:space="preserve">2.6</w:t>
             </w:r>
           </w:p>
         </w:tc>
@@ -6976,27 +7220,37 @@
           </w:tcPr>
           <w:p>
             <w:r>
-              <w:t xml:space="preserve">Office staff and the parts department can </w:t>
+              <w:t xml:space="preserve">The paper missed punch slip is now in the Employee App: </w:t>
             </w:r>
             <w:r>
               <w:rPr>
                 <w:b/>
                 <w:bCs/>
               </w:rPr>
-              <w:t xml:space="preserve">run parts from their phone</w:t>
-            </w:r>
-            <w:r>
-              <w:t xml:space="preserve">: the new </w:t>
+              <w:t xml:space="preserve">Staff Hub → Missed punch</w:t>
+            </w:r>
+            <w:r>
+              <w:t xml:space="preserve">. Admins approve or deny slips with time off (Staff Hub → </w:t>
             </w:r>
             <w:r>
               <w:rPr>
                 <w:b/>
                 <w:bCs/>
               </w:rPr>
-              <w:t xml:space="preserve">Parts desk</w:t>
-            </w:r>
-            <w:r>
-              <w:t xml:space="preserve"> in the Employee App orders, receives and mirror matches parts, moves them between shelves, and covers Returns &amp; Alerts and storage locations.</w:t>
+              <w:t xml:space="preserve">Approve requests</w:t>
+            </w:r>
+            <w:r>
+              <w:t xml:space="preserve">, or the </w:t>
+            </w:r>
+            <w:r>
+              <w:rPr>
+                <w:b/>
+                <w:bCs/>
+              </w:rPr>
+              <w:t xml:space="preserve">Time Off</w:t>
+            </w:r>
+            <w:r>
+              <w:t xml:space="preserve"> tab), and the employee and office are notified.</w:t>
             </w:r>
           </w:p>
         </w:tc>
@@ -7027,7 +7281,7 @@
                 <w:b/>
                 <w:bCs/>
               </w:rPr>
-              <w:t xml:space="preserve">2.4</w:t>
+              <w:t xml:space="preserve">2.5</w:t>
             </w:r>
           </w:p>
         </w:tc>
@@ -7049,7 +7303,7 @@
           </w:tcPr>
           <w:p>
             <w:r>
-              <w:t xml:space="preserve">October 6, 2026</w:t>
+              <w:t xml:space="preserve">October 8, 2026</w:t>
             </w:r>
           </w:p>
         </w:tc>
@@ -7071,17 +7325,27 @@
           </w:tcPr>
           <w:p>
             <w:r>
-              <w:t xml:space="preserve">Admins can </w:t>
+              <w:t xml:space="preserve">Office staff and the parts department can </w:t>
             </w:r>
             <w:r>
               <w:rPr>
                 <w:b/>
                 <w:bCs/>
               </w:rPr>
-              <w:t xml:space="preserve">approve or deny time off in the Employee App</w:t>
-            </w:r>
-            <w:r>
-              <w:t xml:space="preserve"> (Staff Hub → Approve time off), and the office is emailed every decision. The TV and shop touch board show when they last updated and catch up by themselves if they fall behind.</w:t>
+              <w:t xml:space="preserve">run parts from their phone</w:t>
+            </w:r>
+            <w:r>
+              <w:t xml:space="preserve">: the new </w:t>
+            </w:r>
+            <w:r>
+              <w:rPr>
+                <w:b/>
+                <w:bCs/>
+              </w:rPr>
+              <w:t xml:space="preserve">Parts desk</w:t>
+            </w:r>
+            <w:r>
+              <w:t xml:space="preserve"> in the Employee App orders, receives and mirror matches parts, moves them between shelves, and covers Returns &amp; Alerts and storage locations.</w:t>
             </w:r>
           </w:p>
         </w:tc>
@@ -7112,7 +7376,7 @@
                 <w:b/>
                 <w:bCs/>
               </w:rPr>
-              <w:t xml:space="preserve">2.3</w:t>
+              <w:t xml:space="preserve">2.4</w:t>
             </w:r>
           </w:p>
         </w:tc>
@@ -7134,7 +7398,7 @@
           </w:tcPr>
           <w:p>
             <w:r>
-              <w:t xml:space="preserve">October 5, 2026</w:t>
+              <w:t xml:space="preserve">October 6, 2026</w:t>
             </w:r>
           </w:p>
         </w:tc>
@@ -7156,37 +7420,17 @@
           </w:tcPr>
           <w:p>
             <w:r>
-              <w:t xml:space="preserve">Estimates without an RO are now </w:t>
+              <w:t xml:space="preserve">Admins can </w:t>
             </w:r>
             <w:r>
               <w:rPr>
                 <w:b/>
                 <w:bCs/>
               </w:rPr>
-              <w:t xml:space="preserve">capture opportunities</w:t>
-            </w:r>
-            <w:r>
-              <w:t xml:space="preserve">: instead of cycle time emails, the office gets up to 3 reminders to call the customer. Log each call with </w:t>
-            </w:r>
-            <w:r>
-              <w:rPr>
-                <w:b/>
-                <w:bCs/>
-              </w:rPr>
-              <w:t xml:space="preserve">Log call</w:t>
-            </w:r>
-            <w:r>
-              <w:t xml:space="preserve"> under </w:t>
-            </w:r>
-            <w:r>
-              <w:rPr>
-                <w:b/>
-                <w:bCs/>
-              </w:rPr>
-              <w:t xml:space="preserve">Opportunities</w:t>
-            </w:r>
-            <w:r>
-              <w:t xml:space="preserve">.</w:t>
+              <w:t xml:space="preserve">approve or deny time off in the Employee App</w:t>
+            </w:r>
+            <w:r>
+              <w:t xml:space="preserve"> (Staff Hub → Approve time off), and the office is emailed every decision. The TV and shop touch board show when they last updated and catch up by themselves if they fall behind.</w:t>
             </w:r>
           </w:p>
         </w:tc>
@@ -7217,7 +7461,7 @@
                 <w:b/>
                 <w:bCs/>
               </w:rPr>
-              <w:t xml:space="preserve">2.2</w:t>
+              <w:t xml:space="preserve">2.3</w:t>
             </w:r>
           </w:p>
         </w:tc>
@@ -7239,7 +7483,7 @@
           </w:tcPr>
           <w:p>
             <w:r>
-              <w:t xml:space="preserve">September 30, 2026</w:t>
+              <w:t xml:space="preserve">October 5, 2026</w:t>
             </w:r>
           </w:p>
         </w:tc>
@@ -7261,17 +7505,37 @@
           </w:tcPr>
           <w:p>
             <w:r>
-              <w:t xml:space="preserve">On the shop touch board, technicians can </w:t>
+              <w:t xml:space="preserve">Estimates without an RO are now </w:t>
             </w:r>
             <w:r>
               <w:rPr>
                 <w:b/>
                 <w:bCs/>
               </w:rPr>
-              <w:t xml:space="preserve">drag</w:t>
-            </w:r>
-            <w:r>
-              <w:t xml:space="preserve"> a car to its next stage with a finger (tapping still works).</w:t>
+              <w:t xml:space="preserve">capture opportunities</w:t>
+            </w:r>
+            <w:r>
+              <w:t xml:space="preserve">: instead of cycle time emails, the office gets up to 3 reminders to call the customer. Log each call with </w:t>
+            </w:r>
+            <w:r>
+              <w:rPr>
+                <w:b/>
+                <w:bCs/>
+              </w:rPr>
+              <w:t xml:space="preserve">Log call</w:t>
+            </w:r>
+            <w:r>
+              <w:t xml:space="preserve"> under </w:t>
+            </w:r>
+            <w:r>
+              <w:rPr>
+                <w:b/>
+                <w:bCs/>
+              </w:rPr>
+              <w:t xml:space="preserve">Opportunities</w:t>
+            </w:r>
+            <w:r>
+              <w:t xml:space="preserve">.</w:t>
             </w:r>
           </w:p>
         </w:tc>
@@ -7302,7 +7566,7 @@
                 <w:b/>
                 <w:bCs/>
               </w:rPr>
-              <w:t xml:space="preserve">2.1</w:t>
+              <w:t xml:space="preserve">2.2</w:t>
             </w:r>
           </w:p>
         </w:tc>
@@ -7346,17 +7610,17 @@
           </w:tcPr>
           <w:p>
             <w:r>
-              <w:t xml:space="preserve">New </w:t>
+              <w:t xml:space="preserve">On the shop touch board, technicians can </w:t>
             </w:r>
             <w:r>
               <w:rPr>
                 <w:b/>
                 <w:bCs/>
               </w:rPr>
-              <w:t xml:space="preserve">shop touch board</w:t>
-            </w:r>
-            <w:r>
-              <w:t xml:space="preserve">: technicians move cars to their next stage by tapping the car, the stage and their name.</w:t>
+              <w:t xml:space="preserve">drag</w:t>
+            </w:r>
+            <w:r>
+              <w:t xml:space="preserve"> a car to its next stage with a finger (tapping still works).</w:t>
             </w:r>
           </w:p>
         </w:tc>
@@ -7387,7 +7651,7 @@
                 <w:b/>
                 <w:bCs/>
               </w:rPr>
-              <w:t xml:space="preserve">2.0</w:t>
+              <w:t xml:space="preserve">2.1</w:t>
             </w:r>
           </w:p>
         </w:tc>
@@ -7431,27 +7695,17 @@
           </w:tcPr>
           <w:p>
             <w:r>
-              <w:t xml:space="preserve">The Employee App can be switched to </w:t>
+              <w:t xml:space="preserve">New </w:t>
             </w:r>
             <w:r>
               <w:rPr>
                 <w:b/>
                 <w:bCs/>
               </w:rPr>
-              <w:t xml:space="preserve">Spanish</w:t>
-            </w:r>
-            <w:r>
-              <w:t xml:space="preserve"> with the </w:t>
-            </w:r>
-            <w:r>
-              <w:rPr>
-                <w:b/>
-                <w:bCs/>
-              </w:rPr>
-              <w:t xml:space="preserve">Español</w:t>
-            </w:r>
-            <w:r>
-              <w:t xml:space="preserve"> button. Reports and the office program stay in English.</w:t>
+              <w:t xml:space="preserve">shop touch board</w:t>
+            </w:r>
+            <w:r>
+              <w:t xml:space="preserve">: technicians move cars to their next stage by tapping the car, the stage and their name.</w:t>
             </w:r>
           </w:p>
         </w:tc>
@@ -7482,7 +7736,7 @@
                 <w:b/>
                 <w:bCs/>
               </w:rPr>
-              <w:t xml:space="preserve">1.9</w:t>
+              <w:t xml:space="preserve">2.0</w:t>
             </w:r>
           </w:p>
         </w:tc>
@@ -7504,7 +7758,7 @@
           </w:tcPr>
           <w:p>
             <w:r>
-              <w:t xml:space="preserve">September 28, 2026</w:t>
+              <w:t xml:space="preserve">September 30, 2026</w:t>
             </w:r>
           </w:p>
         </w:tc>
@@ -7526,17 +7780,27 @@
           </w:tcPr>
           <w:p>
             <w:r>
-              <w:t xml:space="preserve">New </w:t>
+              <w:t xml:space="preserve">The Employee App can be switched to </w:t>
             </w:r>
             <w:r>
               <w:rPr>
                 <w:b/>
                 <w:bCs/>
               </w:rPr>
-              <w:t xml:space="preserve">Find a vehicle</w:t>
-            </w:r>
-            <w:r>
-              <w:t xml:space="preserve"> search at the top of the office program. It finds any car, at any stage or finished, by RO, customer, vehicle, VIN, plate or claim number.</w:t>
+              <w:t xml:space="preserve">Spanish</w:t>
+            </w:r>
+            <w:r>
+              <w:t xml:space="preserve"> with the </w:t>
+            </w:r>
+            <w:r>
+              <w:rPr>
+                <w:b/>
+                <w:bCs/>
+              </w:rPr>
+              <w:t xml:space="preserve">Español</w:t>
+            </w:r>
+            <w:r>
+              <w:t xml:space="preserve"> button. Reports and the office program stay in English.</w:t>
             </w:r>
           </w:p>
         </w:tc>
@@ -7567,7 +7831,7 @@
                 <w:b/>
                 <w:bCs/>
               </w:rPr>
-              <w:t xml:space="preserve">1.8</w:t>
+              <w:t xml:space="preserve">1.9</w:t>
             </w:r>
           </w:p>
         </w:tc>
@@ -7618,10 +7882,10 @@
                 <w:b/>
                 <w:bCs/>
               </w:rPr>
-              <w:t xml:space="preserve">Completed Jobs</w:t>
-            </w:r>
-            <w:r>
-              <w:t xml:space="preserve"> tab with each finished job's full file (production timeline, parts, QC, photos, every change). Only an admin can delete a delivered job or its parts.</w:t>
+              <w:t xml:space="preserve">Find a vehicle</w:t>
+            </w:r>
+            <w:r>
+              <w:t xml:space="preserve"> search at the top of the office program. It finds any car, at any stage or finished, by RO, customer, vehicle, VIN, plate or claim number.</w:t>
             </w:r>
           </w:p>
         </w:tc>
@@ -7652,7 +7916,7 @@
                 <w:b/>
                 <w:bCs/>
               </w:rPr>
-              <w:t xml:space="preserve">1.7</w:t>
+              <w:t xml:space="preserve">1.8</w:t>
             </w:r>
           </w:p>
         </w:tc>
@@ -7696,17 +7960,17 @@
           </w:tcPr>
           <w:p>
             <w:r>
-              <w:t xml:space="preserve">The Employee App now shows </w:t>
+              <w:t xml:space="preserve">New </w:t>
             </w:r>
             <w:r>
               <w:rPr>
                 <w:b/>
                 <w:bCs/>
               </w:rPr>
-              <w:t xml:space="preserve">where each part is</w:t>
-            </w:r>
-            <w:r>
-              <w:t xml:space="preserve">: the car's parts cart, and the cart shelf or storage spot for every part.</w:t>
+              <w:t xml:space="preserve">Completed Jobs</w:t>
+            </w:r>
+            <w:r>
+              <w:t xml:space="preserve"> tab with each finished job's full file (production timeline, parts, QC, photos, every change). Only an admin can delete a delivered job or its parts.</w:t>
             </w:r>
           </w:p>
         </w:tc>
@@ -7737,7 +8001,7 @@
                 <w:b/>
                 <w:bCs/>
               </w:rPr>
-              <w:t xml:space="preserve">1.6</w:t>
+              <w:t xml:space="preserve">1.7</w:t>
             </w:r>
           </w:p>
         </w:tc>
@@ -7781,37 +8045,17 @@
           </w:tcPr>
           <w:p>
             <w:r>
-              <w:t xml:space="preserve">Whoever does </w:t>
+              <w:t xml:space="preserve">The Employee App now shows </w:t>
             </w:r>
             <w:r>
               <w:rPr>
                 <w:b/>
                 <w:bCs/>
               </w:rPr>
-              <w:t xml:space="preserve">Check-In</w:t>
-            </w:r>
-            <w:r>
-              <w:t xml:space="preserve"> automatically gets the </w:t>
-            </w:r>
-            <w:r>
-              <w:rPr>
-                <w:b/>
-                <w:bCs/>
-              </w:rPr>
-              <w:t xml:space="preserve">Final QC</w:t>
-            </w:r>
-            <w:r>
-              <w:t xml:space="preserve"> checklist too. New </w:t>
-            </w:r>
-            <w:r>
-              <w:rPr>
-                <w:b/>
-                <w:bCs/>
-              </w:rPr>
-              <w:t xml:space="preserve">QC report</w:t>
-            </w:r>
-            <w:r>
-              <w:t xml:space="preserve"> for each car: all five checklists with signatures on one printable page.</w:t>
+              <w:t xml:space="preserve">where each part is</w:t>
+            </w:r>
+            <w:r>
+              <w:t xml:space="preserve">: the car's parts cart, and the cart shelf or storage spot for every part.</w:t>
             </w:r>
           </w:p>
         </w:tc>
@@ -7842,7 +8086,7 @@
                 <w:b/>
                 <w:bCs/>
               </w:rPr>
-              <w:t xml:space="preserve">1.5</w:t>
+              <w:t xml:space="preserve">1.6</w:t>
             </w:r>
           </w:p>
         </w:tc>
@@ -7886,17 +8130,37 @@
           </w:tcPr>
           <w:p>
             <w:r>
-              <w:t xml:space="preserve">Body technicians automatically get the </w:t>
+              <w:t xml:space="preserve">Whoever does </w:t>
             </w:r>
             <w:r>
               <w:rPr>
                 <w:b/>
                 <w:bCs/>
               </w:rPr>
-              <w:t xml:space="preserve">Reassy</w:t>
-            </w:r>
-            <w:r>
-              <w:t xml:space="preserve"> checklist too.</w:t>
+              <w:t xml:space="preserve">Check-In</w:t>
+            </w:r>
+            <w:r>
+              <w:t xml:space="preserve"> automatically gets the </w:t>
+            </w:r>
+            <w:r>
+              <w:rPr>
+                <w:b/>
+                <w:bCs/>
+              </w:rPr>
+              <w:t xml:space="preserve">Final QC</w:t>
+            </w:r>
+            <w:r>
+              <w:t xml:space="preserve"> checklist too. New </w:t>
+            </w:r>
+            <w:r>
+              <w:rPr>
+                <w:b/>
+                <w:bCs/>
+              </w:rPr>
+              <w:t xml:space="preserve">QC report</w:t>
+            </w:r>
+            <w:r>
+              <w:t xml:space="preserve"> for each car: all five checklists with signatures on one printable page.</w:t>
             </w:r>
           </w:p>
         </w:tc>
@@ -7927,7 +8191,7 @@
                 <w:b/>
                 <w:bCs/>
               </w:rPr>
-              <w:t xml:space="preserve">1.4</w:t>
+              <w:t xml:space="preserve">1.5</w:t>
             </w:r>
           </w:p>
         </w:tc>
@@ -7971,17 +8235,17 @@
           </w:tcPr>
           <w:p>
             <w:r>
-              <w:t xml:space="preserve">Employees can be set to </w:t>
+              <w:t xml:space="preserve">Body technicians automatically get the </w:t>
             </w:r>
             <w:r>
               <w:rPr>
                 <w:b/>
                 <w:bCs/>
               </w:rPr>
-              <w:t xml:space="preserve">also do</w:t>
-            </w:r>
-            <w:r>
-              <w:t xml:space="preserve"> other checklists (for example a body tech who reassembles also gets the Reassy checklist).</w:t>
+              <w:t xml:space="preserve">Reassy</w:t>
+            </w:r>
+            <w:r>
+              <w:t xml:space="preserve"> checklist too.</w:t>
             </w:r>
           </w:p>
         </w:tc>
@@ -8012,7 +8276,7 @@
                 <w:b/>
                 <w:bCs/>
               </w:rPr>
-              <w:t xml:space="preserve">1.3</w:t>
+              <w:t xml:space="preserve">1.4</w:t>
             </w:r>
           </w:p>
         </w:tc>
@@ -8056,7 +8320,17 @@
           </w:tcPr>
           <w:p>
             <w:r>
-              <w:t xml:space="preserve">New accounts and admin password resets use a temporary password; you choose your own the first time you sign in.</w:t>
+              <w:t xml:space="preserve">Employees can be set to </w:t>
+            </w:r>
+            <w:r>
+              <w:rPr>
+                <w:b/>
+                <w:bCs/>
+              </w:rPr>
+              <w:t xml:space="preserve">also do</w:t>
+            </w:r>
+            <w:r>
+              <w:t xml:space="preserve"> other checklists (for example a body tech who reassembles also gets the Reassy checklist).</w:t>
             </w:r>
           </w:p>
         </w:tc>
@@ -8087,7 +8361,7 @@
                 <w:b/>
                 <w:bCs/>
               </w:rPr>
-              <w:t xml:space="preserve">1.2</w:t>
+              <w:t xml:space="preserve">1.3</w:t>
             </w:r>
           </w:p>
         </w:tc>
@@ -8131,17 +8405,7 @@
           </w:tcPr>
           <w:p>
             <w:r>
-              <w:t xml:space="preserve">Added the </w:t>
-            </w:r>
-            <w:r>
-              <w:rPr>
-                <w:b/>
-                <w:bCs/>
-              </w:rPr>
-              <w:t xml:space="preserve">Help</w:t>
-            </w:r>
-            <w:r>
-              <w:t xml:space="preserve"> tab in the office program and a search box in the manual.</w:t>
+              <w:t xml:space="preserve">New accounts and admin password resets use a temporary password; you choose your own the first time you sign in.</w:t>
             </w:r>
           </w:p>
         </w:tc>
@@ -8172,7 +8436,7 @@
                 <w:b/>
                 <w:bCs/>
               </w:rPr>
-              <w:t xml:space="preserve">1.1</w:t>
+              <w:t xml:space="preserve">1.2</w:t>
             </w:r>
           </w:p>
         </w:tc>
@@ -8216,17 +8480,17 @@
           </w:tcPr>
           <w:p>
             <w:r>
-              <w:t xml:space="preserve">Employee App address is now </w:t>
+              <w:t xml:space="preserve">Added the </w:t>
             </w:r>
             <w:r>
               <w:rPr>
                 <w:b/>
                 <w:bCs/>
               </w:rPr>
-              <w:t xml:space="preserve">https://conceptautobody.app</w:t>
-            </w:r>
-            <w:r>
-              <w:t xml:space="preserve"> and works on phones anywhere. Added how to put it on your phone's home screen.</w:t>
+              <w:t xml:space="preserve">Help</w:t>
+            </w:r>
+            <w:r>
+              <w:t xml:space="preserve"> tab in the office program and a search box in the manual.</w:t>
             </w:r>
           </w:p>
         </w:tc>
@@ -8257,7 +8521,7 @@
                 <w:b/>
                 <w:bCs/>
               </w:rPr>
-              <w:t xml:space="preserve">1.0</w:t>
+              <w:t xml:space="preserve">1.1</w:t>
             </w:r>
           </w:p>
         </w:tc>
@@ -8301,6 +8565,91 @@
           </w:tcPr>
           <w:p>
             <w:r>
+              <w:t xml:space="preserve">Employee App address is now </w:t>
+            </w:r>
+            <w:r>
+              <w:rPr>
+                <w:b/>
+                <w:bCs/>
+              </w:rPr>
+              <w:t xml:space="preserve">https://conceptautobody.app</w:t>
+            </w:r>
+            <w:r>
+              <w:t xml:space="preserve"> and works on phones anywhere. Added how to put it on your phone's home screen.</w:t>
+            </w:r>
+          </w:p>
+        </w:tc>
+      </w:tr>
+      <w:tr>
+        <w:trPr>
+          <w:cantSplit/>
+        </w:trPr>
+        <w:tc>
+          <w:tcPr>
+            <w:tcW w:type="dxa" w:w="3120"/>
+            <w:tcBorders>
+              <w:top w:val="single" w:color="C9CFD6" w:sz="4"/>
+              <w:left w:val="single" w:color="C9CFD6" w:sz="4"/>
+              <w:bottom w:val="single" w:color="C9CFD6" w:sz="4"/>
+              <w:right w:val="single" w:color="C9CFD6" w:sz="4"/>
+            </w:tcBorders>
+            <w:tcMar>
+              <w:top w:type="dxa" w:w="80"/>
+              <w:left w:type="dxa" w:w="120"/>
+              <w:bottom w:type="dxa" w:w="80"/>
+              <w:right w:type="dxa" w:w="120"/>
+            </w:tcMar>
+          </w:tcPr>
+          <w:p>
+            <w:r>
+              <w:rPr>
+                <w:b/>
+                <w:bCs/>
+              </w:rPr>
+              <w:t xml:space="preserve">1.0</w:t>
+            </w:r>
+          </w:p>
+        </w:tc>
+        <w:tc>
+          <w:tcPr>
+            <w:tcW w:type="dxa" w:w="3120"/>
+            <w:tcBorders>
+              <w:top w:val="single" w:color="C9CFD6" w:sz="4"/>
+              <w:left w:val="single" w:color="C9CFD6" w:sz="4"/>
+              <w:bottom w:val="single" w:color="C9CFD6" w:sz="4"/>
+              <w:right w:val="single" w:color="C9CFD6" w:sz="4"/>
+            </w:tcBorders>
+            <w:tcMar>
+              <w:top w:type="dxa" w:w="80"/>
+              <w:left w:type="dxa" w:w="120"/>
+              <w:bottom w:type="dxa" w:w="80"/>
+              <w:right w:type="dxa" w:w="120"/>
+            </w:tcMar>
+          </w:tcPr>
+          <w:p>
+            <w:r>
+              <w:t xml:space="preserve">September 28, 2026</w:t>
+            </w:r>
+          </w:p>
+        </w:tc>
+        <w:tc>
+          <w:tcPr>
+            <w:tcW w:type="dxa" w:w="3120"/>
+            <w:tcBorders>
+              <w:top w:val="single" w:color="C9CFD6" w:sz="4"/>
+              <w:left w:val="single" w:color="C9CFD6" w:sz="4"/>
+              <w:bottom w:val="single" w:color="C9CFD6" w:sz="4"/>
+              <w:right w:val="single" w:color="C9CFD6" w:sz="4"/>
+            </w:tcBorders>
+            <w:tcMar>
+              <w:top w:type="dxa" w:w="80"/>
+              <w:left w:type="dxa" w:w="120"/>
+              <w:bottom w:type="dxa" w:w="80"/>
+              <w:right w:type="dxa" w:w="120"/>
+            </w:tcMar>
+          </w:tcPr>
+          <w:p>
+            <w:r>
               <w:t xml:space="preserve">First edition.</w:t>
             </w:r>
           </w:p>
@@ -8374,7 +8723,7 @@
         <w:sz w:val="18"/>
         <w:szCs w:val="18"/>
       </w:rPr>
-      <w:t xml:space="preserve">Concept Autobody  ·  Version 2.5  ·  Page </w:t>
+      <w:t xml:space="preserve">Concept Autobody  ·  Version 2.6  ·  Page </w:t>
     </w:r>
     <w:r>
       <w:rPr>
@@ -8664,6 +9013,12 @@
     </w:lvlOverride>
   </w:num>
   <w:num w:numId="18">
+    <w:abstractNumId w:val="3"/>
+    <w:lvlOverride w:ilvl="0">
+      <w:startOverride w:val="1"/>
+    </w:lvlOverride>
+  </w:num>
+  <w:num w:numId="19">
     <w:abstractNumId w:val="3"/>
     <w:lvlOverride w:ilvl="0">
       <w:startOverride w:val="1"/>

</xml_diff>

<commit_message>
Missed punch: lunch times are required (everyone takes a lunch)
Drops the "I didn't take a lunch" option; all four times are required in the
app, the API and the table. The form now follows the paper slip's order.

Co-Authored-By: Claude Opus 5.5 <noreply@anthropic.com>
</commit_message>
<xml_diff>
--- a/client/manual/ShopControl-User-Manual.docx
+++ b/client/manual/ShopControl-User-Manual.docx
@@ -2395,17 +2395,7 @@
         <w:t xml:space="preserve">Time out</w:t>
       </w:r>
       <w:r>
-        <w:t xml:space="preserve">. If you didn't take a lunch, check </w:t>
-      </w:r>
-      <w:r>
-        <w:rPr>
-          <w:b/>
-          <w:bCs/>
-        </w:rPr>
-        <w:t xml:space="preserve">I didn't take a lunch</w:t>
-      </w:r>
-      <w:r>
-        <w:t xml:space="preserve">.</w:t>
+        <w:t xml:space="preserve">. All four are required, since everyone takes a lunch.</w:t>
       </w:r>
     </w:p>
     <w:p>

</xml_diff>

<commit_message>
Employee app reloads itself after a deploy
/api/version reports a version built from the employee app's file sizes and
modified times. The app checks it when reopened and every 5 minutes, and
reloads when that loses nothing; on a form it shows a tap-to-update bar and
reloads once the person is back on a safe screen. Manual note added.

Co-Authored-By: Claude Opus 5.5 <noreply@anthropic.com>
</commit_message>
<xml_diff>
--- a/client/manual/ShopControl-User-Manual.docx
+++ b/client/manual/ShopControl-User-Manual.docx
@@ -1484,6 +1484,47 @@
       </w:r>
       <w:r>
         <w:t xml:space="preserve"> button (top of the screen): switches the app between English and Spanish.</w:t>
+      </w:r>
+    </w:p>
+    <w:p>
+      <w:pPr>
+        <w:pBdr>
+          <w:left w:val="single" w:color="2F9E5B" w:sz="24" w:space="8"/>
+        </w:pBdr>
+        <w:shd w:fill="EAF7EF" w:color="auto" w:val="clear"/>
+        <w:spacing w:after="160" w:before="120"/>
+        <w:ind w:left="160" w:right="160"/>
+      </w:pPr>
+      <w:r>
+        <w:rPr>
+          <w:b/>
+          <w:bCs/>
+          <w:color w:val="2F9E5B"/>
+        </w:rPr>
+        <w:t xml:space="preserve">Tip:  </w:t>
+      </w:r>
+      <w:r>
+        <w:t xml:space="preserve">The app </w:t>
+      </w:r>
+      <w:r>
+        <w:rPr>
+          <w:b/>
+          <w:bCs/>
+        </w:rPr>
+        <w:t xml:space="preserve">updates itself</w:t>
+      </w:r>
+      <w:r>
+        <w:t xml:space="preserve">. When a new version is put on the server it reloads the next time you open it. If you're in the middle of a form, an orange </w:t>
+      </w:r>
+      <w:r>
+        <w:rPr>
+          <w:b/>
+          <w:bCs/>
+        </w:rPr>
+        <w:t xml:space="preserve">A new version is ready. Tap to update</w:t>
+      </w:r>
+      <w:r>
+        <w:t xml:space="preserve"> bar shows instead: finish what you're doing, then tap it (or just go back, and it updates on its own).</w:t>
       </w:r>
     </w:p>
     <w:p>
@@ -7240,7 +7281,17 @@
               <w:t xml:space="preserve">Time Off</w:t>
             </w:r>
             <w:r>
-              <w:t xml:space="preserve"> tab), and the employee and office are notified.</w:t>
+              <w:t xml:space="preserve"> tab), and the employee and office are notified. The Employee App now </w:t>
+            </w:r>
+            <w:r>
+              <w:rPr>
+                <w:b/>
+                <w:bCs/>
+              </w:rPr>
+              <w:t xml:space="preserve">updates itself</w:t>
+            </w:r>
+            <w:r>
+              <w:t xml:space="preserve"> when a new version is put on the server.</w:t>
             </w:r>
           </w:p>
         </w:tc>

</xml_diff>

<commit_message>
Employee app: payroll correction form in Staff Hub, approved with time off; manual v2.7
Page 1 of the paper Payroll Correction Form: employee #, phone, up to 5
dates with hours actually worked and total hours (filled in from the times),
reason, how to pay it, and a typed signature. Admin approval stands in for
the supervisor's signature; the employee and office are notified. Desktop
Time Off tab lists them and shows times as AM/PM. Migration 025.

Co-Authored-By: Claude Opus 5.5 <noreply@anthropic.com>
</commit_message>
<xml_diff>
--- a/client/manual/ShopControl-User-Manual.docx
+++ b/client/manual/ShopControl-User-Manual.docx
@@ -92,7 +92,7 @@
           <w:sz w:val="22"/>
           <w:szCs w:val="22"/>
         </w:rPr>
-        <w:t xml:space="preserve">Version 2.6  ·  Updated October 8, 2026</w:t>
+        <w:t xml:space="preserve">Version 2.7  ·  Updated October 8, 2026</w:t>
       </w:r>
     </w:p>
     <w:p>
@@ -1403,7 +1403,7 @@
         <w:t xml:space="preserve">Staff Hub</w:t>
       </w:r>
       <w:r>
-        <w:t xml:space="preserve"> button: time off, missed punches, mailbox, company info and this manual.</w:t>
+        <w:t xml:space="preserve"> button: time off, missed punches, payroll corrections, mailbox, company info and this manual.</w:t>
       </w:r>
     </w:p>
     <w:p>
@@ -2102,7 +2102,7 @@
         <w:pageBreakBefore/>
       </w:pPr>
       <w:r>
-        <w:t xml:space="preserve">3.  Staff Hub: time off, missed punches, mailbox and company info</w:t>
+        <w:t xml:space="preserve">3.  Staff Hub: time off, missed punches, payroll corrections, mailbox and company info</w:t>
       </w:r>
     </w:p>
     <w:p>
@@ -2515,7 +2515,25 @@
         <w:pStyle w:val="Heading2"/>
       </w:pPr>
       <w:r>
-        <w:t xml:space="preserve">Approving time off and missed punches on your phone (admins and owners)</w:t>
+        <w:t xml:space="preserve">Payroll correction</w:t>
+      </w:r>
+    </w:p>
+    <w:p>
+      <w:pPr>
+        <w:spacing w:after="120"/>
+      </w:pPr>
+      <w:r>
+        <w:t xml:space="preserve">If you think there's an error on your payroll check, send a payroll correction as soon as possible. </w:t>
+      </w:r>
+      <w:r>
+        <w:rPr>
+          <w:b/>
+          <w:bCs/>
+        </w:rPr>
+        <w:t xml:space="preserve">Verbal inquiries are not accepted.</w:t>
+      </w:r>
+      <w:r>
+        <w:t xml:space="preserve"> An admin's approval takes the place of your supervisor's signature. Corrections should be done within three working days; if it will take longer, you'll be told how long.</w:t>
       </w:r>
     </w:p>
     <w:p>
@@ -2528,6 +2546,303 @@
         <w:spacing w:after="60"/>
       </w:pPr>
       <w:r>
+        <w:t xml:space="preserve">Tap </w:t>
+      </w:r>
+      <w:r>
+        <w:rPr>
+          <w:b/>
+          <w:bCs/>
+        </w:rPr>
+        <w:t xml:space="preserve">Payroll correction</w:t>
+      </w:r>
+      <w:r>
+        <w:t xml:space="preserve">. Your name fills in automatically.</w:t>
+      </w:r>
+    </w:p>
+    <w:p>
+      <w:pPr>
+        <w:pStyle w:val="ListParagraph"/>
+        <w:numPr>
+          <w:ilvl w:val="0"/>
+          <w:numId w:val="9"/>
+        </w:numPr>
+        <w:spacing w:after="60"/>
+      </w:pPr>
+      <w:r>
+        <w:t xml:space="preserve">Enter your </w:t>
+      </w:r>
+      <w:r>
+        <w:rPr>
+          <w:b/>
+          <w:bCs/>
+        </w:rPr>
+        <w:t xml:space="preserve">phone number</w:t>
+      </w:r>
+      <w:r>
+        <w:t xml:space="preserve"> (and your </w:t>
+      </w:r>
+      <w:r>
+        <w:rPr>
+          <w:b/>
+          <w:bCs/>
+        </w:rPr>
+        <w:t xml:space="preserve">employee #</w:t>
+      </w:r>
+      <w:r>
+        <w:t xml:space="preserve"> if you know it). Your phone remembers them for next time.</w:t>
+      </w:r>
+    </w:p>
+    <w:p>
+      <w:pPr>
+        <w:pStyle w:val="ListParagraph"/>
+        <w:numPr>
+          <w:ilvl w:val="0"/>
+          <w:numId w:val="9"/>
+        </w:numPr>
+        <w:spacing w:after="60"/>
+      </w:pPr>
+      <w:r>
+        <w:t xml:space="preserve">Under </w:t>
+      </w:r>
+      <w:r>
+        <w:rPr>
+          <w:b/>
+          <w:bCs/>
+        </w:rPr>
+        <w:t xml:space="preserve">Dates in question</w:t>
+      </w:r>
+      <w:r>
+        <w:t xml:space="preserve">, enter each day: the </w:t>
+      </w:r>
+      <w:r>
+        <w:rPr>
+          <w:b/>
+          <w:bCs/>
+        </w:rPr>
+        <w:t xml:space="preserve">date</w:t>
+      </w:r>
+      <w:r>
+        <w:t xml:space="preserve">, the hours you actually worked (</w:t>
+      </w:r>
+      <w:r>
+        <w:rPr>
+          <w:b/>
+          <w:bCs/>
+        </w:rPr>
+        <w:t xml:space="preserve">from</w:t>
+      </w:r>
+      <w:r>
+        <w:t xml:space="preserve"> and </w:t>
+      </w:r>
+      <w:r>
+        <w:rPr>
+          <w:b/>
+          <w:bCs/>
+        </w:rPr>
+        <w:t xml:space="preserve">to</w:t>
+      </w:r>
+      <w:r>
+        <w:t xml:space="preserve">), and the </w:t>
+      </w:r>
+      <w:r>
+        <w:rPr>
+          <w:b/>
+          <w:bCs/>
+        </w:rPr>
+        <w:t xml:space="preserve">total hours</w:t>
+      </w:r>
+      <w:r>
+        <w:t xml:space="preserve">. Total hours fills in from your times; change it if it's different (for example after lunch). Tap </w:t>
+      </w:r>
+      <w:r>
+        <w:rPr>
+          <w:b/>
+          <w:bCs/>
+        </w:rPr>
+        <w:t xml:space="preserve">Add another day</w:t>
+      </w:r>
+      <w:r>
+        <w:t xml:space="preserve"> for more, up to 5.</w:t>
+      </w:r>
+    </w:p>
+    <w:p>
+      <w:pPr>
+        <w:pStyle w:val="ListParagraph"/>
+        <w:numPr>
+          <w:ilvl w:val="0"/>
+          <w:numId w:val="9"/>
+        </w:numPr>
+        <w:spacing w:after="60"/>
+      </w:pPr>
+      <w:r>
+        <w:t xml:space="preserve">The </w:t>
+      </w:r>
+      <w:r>
+        <w:rPr>
+          <w:b/>
+          <w:bCs/>
+        </w:rPr>
+        <w:t xml:space="preserve">Hours in question</w:t>
+      </w:r>
+      <w:r>
+        <w:t xml:space="preserve"> total adds up by itself. Fill in </w:t>
+      </w:r>
+      <w:r>
+        <w:rPr>
+          <w:b/>
+          <w:bCs/>
+        </w:rPr>
+        <w:t xml:space="preserve">Program(s)</w:t>
+      </w:r>
+      <w:r>
+        <w:t xml:space="preserve"> if it applies.</w:t>
+      </w:r>
+    </w:p>
+    <w:p>
+      <w:pPr>
+        <w:pStyle w:val="ListParagraph"/>
+        <w:numPr>
+          <w:ilvl w:val="0"/>
+          <w:numId w:val="9"/>
+        </w:numPr>
+        <w:spacing w:after="60"/>
+      </w:pPr>
+      <w:r>
+        <w:t xml:space="preserve">Explain </w:t>
+      </w:r>
+      <w:r>
+        <w:rPr>
+          <w:b/>
+          <w:bCs/>
+        </w:rPr>
+        <w:t xml:space="preserve">why you feel the error was made</w:t>
+      </w:r>
+      <w:r>
+        <w:t xml:space="preserve"> (for example "I forgot to clock in/out and forgot to tell my supervisor").</w:t>
+      </w:r>
+    </w:p>
+    <w:p>
+      <w:pPr>
+        <w:pStyle w:val="ListParagraph"/>
+        <w:numPr>
+          <w:ilvl w:val="0"/>
+          <w:numId w:val="9"/>
+        </w:numPr>
+        <w:spacing w:after="60"/>
+      </w:pPr>
+      <w:r>
+        <w:t xml:space="preserve">Choose </w:t>
+      </w:r>
+      <w:r>
+        <w:rPr>
+          <w:b/>
+          <w:bCs/>
+        </w:rPr>
+        <w:t xml:space="preserve">Adjust my next payroll check</w:t>
+      </w:r>
+      <w:r>
+        <w:t xml:space="preserve"> or </w:t>
+      </w:r>
+      <w:r>
+        <w:rPr>
+          <w:b/>
+          <w:bCs/>
+        </w:rPr>
+        <w:t xml:space="preserve">Issue me a separate check (if applicable)</w:t>
+      </w:r>
+      <w:r>
+        <w:t xml:space="preserve">.</w:t>
+      </w:r>
+    </w:p>
+    <w:p>
+      <w:pPr>
+        <w:pStyle w:val="ListParagraph"/>
+        <w:numPr>
+          <w:ilvl w:val="0"/>
+          <w:numId w:val="9"/>
+        </w:numPr>
+        <w:spacing w:after="60"/>
+      </w:pPr>
+      <w:r>
+        <w:t xml:space="preserve">Type your </w:t>
+      </w:r>
+      <w:r>
+        <w:rPr>
+          <w:b/>
+          <w:bCs/>
+        </w:rPr>
+        <w:t xml:space="preserve">full name</w:t>
+      </w:r>
+      <w:r>
+        <w:t xml:space="preserve"> to sign, then tap </w:t>
+      </w:r>
+      <w:r>
+        <w:rPr>
+          <w:b/>
+          <w:bCs/>
+        </w:rPr>
+        <w:t xml:space="preserve">Submit payroll correction</w:t>
+      </w:r>
+      <w:r>
+        <w:t xml:space="preserve">.</w:t>
+      </w:r>
+    </w:p>
+    <w:p>
+      <w:pPr>
+        <w:spacing w:after="120"/>
+      </w:pPr>
+      <w:r>
+        <w:t xml:space="preserve">The office and admins are emailed right away. You'll get a mailbox message (and an email) with </w:t>
+      </w:r>
+      <w:r>
+        <w:rPr>
+          <w:b/>
+          <w:bCs/>
+        </w:rPr>
+        <w:t xml:space="preserve">APPROVED</w:t>
+      </w:r>
+      <w:r>
+        <w:t xml:space="preserve"> or </w:t>
+      </w:r>
+      <w:r>
+        <w:rPr>
+          <w:b/>
+          <w:bCs/>
+        </w:rPr>
+        <w:t xml:space="preserve">DENIED</w:t>
+      </w:r>
+      <w:r>
+        <w:t xml:space="preserve">. You can cancel it under </w:t>
+      </w:r>
+      <w:r>
+        <w:rPr>
+          <w:b/>
+          <w:bCs/>
+        </w:rPr>
+        <w:t xml:space="preserve">My requests</w:t>
+      </w:r>
+      <w:r>
+        <w:t xml:space="preserve"> while it's still waiting.</w:t>
+      </w:r>
+    </w:p>
+    <w:p>
+      <w:pPr>
+        <w:pStyle w:val="Heading2"/>
+      </w:pPr>
+      <w:r>
+        <w:t xml:space="preserve">Approving time off, missed punches and payroll corrections on your phone (admins and owners)</w:t>
+      </w:r>
+    </w:p>
+    <w:p>
+      <w:pPr>
+        <w:pStyle w:val="ListParagraph"/>
+        <w:numPr>
+          <w:ilvl w:val="0"/>
+          <w:numId w:val="10"/>
+        </w:numPr>
+        <w:spacing w:after="60"/>
+      </w:pPr>
+      <w:r>
         <w:t xml:space="preserve">Open </w:t>
       </w:r>
       <w:r>
@@ -2556,7 +2871,7 @@
         <w:pStyle w:val="ListParagraph"/>
         <w:numPr>
           <w:ilvl w:val="0"/>
-          <w:numId w:val="9"/>
+          <w:numId w:val="10"/>
         </w:numPr>
         <w:spacing w:after="60"/>
       </w:pPr>
@@ -2589,20 +2904,20 @@
         <w:pStyle w:val="ListParagraph"/>
         <w:numPr>
           <w:ilvl w:val="0"/>
-          <w:numId w:val="9"/>
-        </w:numPr>
-        <w:spacing w:after="60"/>
-      </w:pPr>
-      <w:r>
-        <w:t xml:space="preserve">Missed punch slips show the date, every time, the payroll week and the employee's initials.</w:t>
-      </w:r>
-    </w:p>
-    <w:p>
-      <w:pPr>
-        <w:pStyle w:val="ListParagraph"/>
-        <w:numPr>
-          <w:ilvl w:val="0"/>
-          <w:numId w:val="9"/>
+          <w:numId w:val="10"/>
+        </w:numPr>
+        <w:spacing w:after="60"/>
+      </w:pPr>
+      <w:r>
+        <w:t xml:space="preserve">Missed punch slips show the date, every time, the payroll week and the employee's initials. Payroll corrections show each day and its hours, the reason, how it should be paid, and the employee's phone.</w:t>
+      </w:r>
+    </w:p>
+    <w:p>
+      <w:pPr>
+        <w:pStyle w:val="ListParagraph"/>
+        <w:numPr>
+          <w:ilvl w:val="0"/>
+          <w:numId w:val="10"/>
         </w:numPr>
         <w:spacing w:after="60"/>
       </w:pPr>
@@ -2660,7 +2975,7 @@
         <w:t xml:space="preserve">My requests</w:t>
       </w:r>
       <w:r>
-        <w:t xml:space="preserve"> shows each time-off request and missed punch slip as </w:t>
+        <w:t xml:space="preserve"> shows each time-off request, missed punch slip and payroll correction as </w:t>
       </w:r>
       <w:r>
         <w:rPr>
@@ -3177,7 +3492,7 @@
           <w:b/>
           <w:bCs/>
         </w:rPr>
-        <w:t xml:space="preserve">Time Off &amp; Missed Punches Pending</w:t>
+        <w:t xml:space="preserve">Time Off, Punches &amp; Payroll Pending</w:t>
       </w:r>
       <w:r>
         <w:t xml:space="preserve"> (office and admins only).</w:t>
@@ -3307,7 +3622,7 @@
         <w:pStyle w:val="ListParagraph"/>
         <w:numPr>
           <w:ilvl w:val="0"/>
-          <w:numId w:val="10"/>
+          <w:numId w:val="11"/>
         </w:numPr>
         <w:spacing w:after="60"/>
       </w:pPr>
@@ -3350,7 +3665,7 @@
         <w:pStyle w:val="ListParagraph"/>
         <w:numPr>
           <w:ilvl w:val="0"/>
-          <w:numId w:val="10"/>
+          <w:numId w:val="11"/>
         </w:numPr>
         <w:spacing w:after="60"/>
       </w:pPr>
@@ -3363,7 +3678,7 @@
         <w:pStyle w:val="ListParagraph"/>
         <w:numPr>
           <w:ilvl w:val="0"/>
-          <w:numId w:val="10"/>
+          <w:numId w:val="11"/>
         </w:numPr>
         <w:spacing w:after="60"/>
       </w:pPr>
@@ -3386,7 +3701,7 @@
         <w:pStyle w:val="ListParagraph"/>
         <w:numPr>
           <w:ilvl w:val="0"/>
-          <w:numId w:val="10"/>
+          <w:numId w:val="11"/>
         </w:numPr>
         <w:spacing w:after="60"/>
       </w:pPr>
@@ -3496,7 +3811,7 @@
         <w:pStyle w:val="ListParagraph"/>
         <w:numPr>
           <w:ilvl w:val="0"/>
-          <w:numId w:val="11"/>
+          <w:numId w:val="12"/>
         </w:numPr>
         <w:spacing w:after="60"/>
       </w:pPr>
@@ -3509,7 +3824,7 @@
         <w:pStyle w:val="ListParagraph"/>
         <w:numPr>
           <w:ilvl w:val="0"/>
-          <w:numId w:val="11"/>
+          <w:numId w:val="12"/>
         </w:numPr>
         <w:spacing w:after="60"/>
       </w:pPr>
@@ -3542,7 +3857,7 @@
         <w:pStyle w:val="ListParagraph"/>
         <w:numPr>
           <w:ilvl w:val="0"/>
-          <w:numId w:val="11"/>
+          <w:numId w:val="12"/>
         </w:numPr>
         <w:spacing w:after="60"/>
       </w:pPr>
@@ -4100,7 +4415,7 @@
         <w:pStyle w:val="ListParagraph"/>
         <w:numPr>
           <w:ilvl w:val="0"/>
-          <w:numId w:val="12"/>
+          <w:numId w:val="13"/>
         </w:numPr>
         <w:spacing w:after="60"/>
       </w:pPr>
@@ -4113,7 +4428,7 @@
         <w:pStyle w:val="ListParagraph"/>
         <w:numPr>
           <w:ilvl w:val="0"/>
-          <w:numId w:val="12"/>
+          <w:numId w:val="13"/>
         </w:numPr>
         <w:spacing w:after="60"/>
       </w:pPr>
@@ -4126,7 +4441,7 @@
         <w:pStyle w:val="ListParagraph"/>
         <w:numPr>
           <w:ilvl w:val="0"/>
-          <w:numId w:val="12"/>
+          <w:numId w:val="13"/>
         </w:numPr>
         <w:spacing w:after="60"/>
       </w:pPr>
@@ -4139,7 +4454,7 @@
         <w:pStyle w:val="ListParagraph"/>
         <w:numPr>
           <w:ilvl w:val="0"/>
-          <w:numId w:val="12"/>
+          <w:numId w:val="13"/>
         </w:numPr>
         <w:spacing w:after="60"/>
       </w:pPr>
@@ -4181,7 +4496,7 @@
         <w:pStyle w:val="ListParagraph"/>
         <w:numPr>
           <w:ilvl w:val="0"/>
-          <w:numId w:val="13"/>
+          <w:numId w:val="14"/>
         </w:numPr>
         <w:spacing w:after="60"/>
       </w:pPr>
@@ -4194,7 +4509,7 @@
         <w:pStyle w:val="ListParagraph"/>
         <w:numPr>
           <w:ilvl w:val="0"/>
-          <w:numId w:val="13"/>
+          <w:numId w:val="14"/>
         </w:numPr>
         <w:spacing w:after="60"/>
       </w:pPr>
@@ -4217,7 +4532,7 @@
         <w:pStyle w:val="ListParagraph"/>
         <w:numPr>
           <w:ilvl w:val="0"/>
-          <w:numId w:val="13"/>
+          <w:numId w:val="14"/>
         </w:numPr>
         <w:spacing w:after="60"/>
       </w:pPr>
@@ -4230,7 +4545,7 @@
         <w:pStyle w:val="ListParagraph"/>
         <w:numPr>
           <w:ilvl w:val="0"/>
-          <w:numId w:val="13"/>
+          <w:numId w:val="14"/>
         </w:numPr>
         <w:spacing w:after="60"/>
       </w:pPr>
@@ -4310,7 +4625,7 @@
         <w:pStyle w:val="ListParagraph"/>
         <w:numPr>
           <w:ilvl w:val="0"/>
-          <w:numId w:val="14"/>
+          <w:numId w:val="15"/>
         </w:numPr>
         <w:spacing w:after="60"/>
       </w:pPr>
@@ -4363,7 +4678,7 @@
         <w:pStyle w:val="ListParagraph"/>
         <w:numPr>
           <w:ilvl w:val="0"/>
-          <w:numId w:val="14"/>
+          <w:numId w:val="15"/>
         </w:numPr>
         <w:spacing w:after="60"/>
       </w:pPr>
@@ -4376,7 +4691,7 @@
         <w:pStyle w:val="ListParagraph"/>
         <w:numPr>
           <w:ilvl w:val="0"/>
-          <w:numId w:val="14"/>
+          <w:numId w:val="15"/>
         </w:numPr>
         <w:spacing w:after="60"/>
       </w:pPr>
@@ -4658,7 +4973,7 @@
         <w:pStyle w:val="ListParagraph"/>
         <w:numPr>
           <w:ilvl w:val="0"/>
-          <w:numId w:val="15"/>
+          <w:numId w:val="16"/>
         </w:numPr>
         <w:spacing w:after="60"/>
       </w:pPr>
@@ -4681,7 +4996,7 @@
         <w:pStyle w:val="ListParagraph"/>
         <w:numPr>
           <w:ilvl w:val="0"/>
-          <w:numId w:val="15"/>
+          <w:numId w:val="16"/>
         </w:numPr>
         <w:spacing w:after="60"/>
       </w:pPr>
@@ -4704,7 +5019,7 @@
         <w:pStyle w:val="ListParagraph"/>
         <w:numPr>
           <w:ilvl w:val="0"/>
-          <w:numId w:val="15"/>
+          <w:numId w:val="16"/>
         </w:numPr>
         <w:spacing w:after="60"/>
       </w:pPr>
@@ -4763,7 +5078,7 @@
         <w:pStyle w:val="ListParagraph"/>
         <w:numPr>
           <w:ilvl w:val="0"/>
-          <w:numId w:val="16"/>
+          <w:numId w:val="17"/>
         </w:numPr>
         <w:spacing w:after="60"/>
       </w:pPr>
@@ -4786,7 +5101,7 @@
         <w:pStyle w:val="ListParagraph"/>
         <w:numPr>
           <w:ilvl w:val="0"/>
-          <w:numId w:val="16"/>
+          <w:numId w:val="17"/>
         </w:numPr>
         <w:spacing w:after="60"/>
       </w:pPr>
@@ -4809,7 +5124,7 @@
         <w:pStyle w:val="ListParagraph"/>
         <w:numPr>
           <w:ilvl w:val="0"/>
-          <w:numId w:val="16"/>
+          <w:numId w:val="17"/>
         </w:numPr>
         <w:spacing w:after="60"/>
       </w:pPr>
@@ -4927,7 +5242,7 @@
         <w:pStyle w:val="ListParagraph"/>
         <w:numPr>
           <w:ilvl w:val="0"/>
-          <w:numId w:val="17"/>
+          <w:numId w:val="18"/>
         </w:numPr>
         <w:spacing w:after="60"/>
       </w:pPr>
@@ -4950,7 +5265,7 @@
         <w:pStyle w:val="ListParagraph"/>
         <w:numPr>
           <w:ilvl w:val="0"/>
-          <w:numId w:val="17"/>
+          <w:numId w:val="18"/>
         </w:numPr>
         <w:spacing w:after="60"/>
       </w:pPr>
@@ -4993,7 +5308,7 @@
         <w:pStyle w:val="ListParagraph"/>
         <w:numPr>
           <w:ilvl w:val="0"/>
-          <w:numId w:val="17"/>
+          <w:numId w:val="18"/>
         </w:numPr>
         <w:spacing w:after="60"/>
       </w:pPr>
@@ -5056,7 +5371,7 @@
         <w:pStyle w:val="ListParagraph"/>
         <w:numPr>
           <w:ilvl w:val="0"/>
-          <w:numId w:val="17"/>
+          <w:numId w:val="18"/>
         </w:numPr>
         <w:spacing w:after="60"/>
       </w:pPr>
@@ -5958,7 +6273,7 @@
         <w:pStyle w:val="ListParagraph"/>
         <w:numPr>
           <w:ilvl w:val="0"/>
-          <w:numId w:val="18"/>
+          <w:numId w:val="19"/>
         </w:numPr>
         <w:spacing w:after="60"/>
       </w:pPr>
@@ -5981,7 +6296,7 @@
         <w:pStyle w:val="ListParagraph"/>
         <w:numPr>
           <w:ilvl w:val="0"/>
-          <w:numId w:val="18"/>
+          <w:numId w:val="19"/>
         </w:numPr>
         <w:spacing w:after="60"/>
       </w:pPr>
@@ -6014,7 +6329,7 @@
         <w:pStyle w:val="ListParagraph"/>
         <w:numPr>
           <w:ilvl w:val="0"/>
-          <w:numId w:val="18"/>
+          <w:numId w:val="19"/>
         </w:numPr>
         <w:spacing w:after="60"/>
       </w:pPr>
@@ -6055,6 +6370,21 @@
       </w:r>
       <w:r>
         <w:t xml:space="preserve"> are listed below the time-off requests, with the date, times, payroll week (Thursday to Wednesday) and the employee's initials. Approve or deny them the same way; the emails say "Missed punch APPROVED · Jane Doe". Use the approved slips to correct the time clock for payroll.</w:t>
+      </w:r>
+    </w:p>
+    <w:p>
+      <w:pPr>
+        <w:spacing w:after="120"/>
+      </w:pPr>
+      <w:r>
+        <w:rPr>
+          <w:b/>
+          <w:bCs/>
+        </w:rPr>
+        <w:t xml:space="preserve">Payroll corrections</w:t>
+      </w:r>
+      <w:r>
+        <w:t xml:space="preserve"> are listed last, with the employee's phone and employee #, each day in question with its hours, the total, the reason, whether to adjust the next check or issue a separate check, and their typed signature. Approving takes the place of the supervisor's signature on the paper form.</w:t>
       </w:r>
     </w:p>
     <w:p>
@@ -6208,7 +6538,7 @@
         <w:pStyle w:val="ListParagraph"/>
         <w:numPr>
           <w:ilvl w:val="0"/>
-          <w:numId w:val="19"/>
+          <w:numId w:val="20"/>
         </w:numPr>
         <w:spacing w:after="60"/>
       </w:pPr>
@@ -6241,7 +6571,7 @@
         <w:pStyle w:val="ListParagraph"/>
         <w:numPr>
           <w:ilvl w:val="0"/>
-          <w:numId w:val="19"/>
+          <w:numId w:val="20"/>
         </w:numPr>
         <w:spacing w:after="60"/>
       </w:pPr>
@@ -6264,7 +6594,7 @@
         <w:pStyle w:val="ListParagraph"/>
         <w:numPr>
           <w:ilvl w:val="0"/>
-          <w:numId w:val="19"/>
+          <w:numId w:val="20"/>
         </w:numPr>
         <w:spacing w:after="60"/>
       </w:pPr>
@@ -6297,7 +6627,7 @@
         <w:pStyle w:val="ListParagraph"/>
         <w:numPr>
           <w:ilvl w:val="0"/>
-          <w:numId w:val="19"/>
+          <w:numId w:val="20"/>
         </w:numPr>
         <w:spacing w:after="60"/>
       </w:pPr>
@@ -7207,7 +7537,7 @@
                 <w:b/>
                 <w:bCs/>
               </w:rPr>
-              <w:t xml:space="preserve">2.6</w:t>
+              <w:t xml:space="preserve">2.7</w:t>
             </w:r>
           </w:p>
         </w:tc>
@@ -7251,47 +7581,27 @@
           </w:tcPr>
           <w:p>
             <w:r>
-              <w:t xml:space="preserve">The paper missed punch slip is now in the Employee App: </w:t>
+              <w:t xml:space="preserve">The paper </w:t>
             </w:r>
             <w:r>
               <w:rPr>
                 <w:b/>
                 <w:bCs/>
               </w:rPr>
-              <w:t xml:space="preserve">Staff Hub → Missed punch</w:t>
-            </w:r>
-            <w:r>
-              <w:t xml:space="preserve">. Admins approve or deny slips with time off (Staff Hub → </w:t>
+              <w:t xml:space="preserve">payroll correction form</w:t>
+            </w:r>
+            <w:r>
+              <w:t xml:space="preserve"> is now in the Employee App: </w:t>
             </w:r>
             <w:r>
               <w:rPr>
                 <w:b/>
                 <w:bCs/>
               </w:rPr>
-              <w:t xml:space="preserve">Approve requests</w:t>
-            </w:r>
-            <w:r>
-              <w:t xml:space="preserve">, or the </w:t>
-            </w:r>
-            <w:r>
-              <w:rPr>
-                <w:b/>
-                <w:bCs/>
-              </w:rPr>
-              <w:t xml:space="preserve">Time Off</w:t>
-            </w:r>
-            <w:r>
-              <w:t xml:space="preserve"> tab), and the employee and office are notified. The Employee App now </w:t>
-            </w:r>
-            <w:r>
-              <w:rPr>
-                <w:b/>
-                <w:bCs/>
-              </w:rPr>
-              <w:t xml:space="preserve">updates itself</w:t>
-            </w:r>
-            <w:r>
-              <w:t xml:space="preserve"> when a new version is put on the server.</w:t>
+              <w:t xml:space="preserve">Staff Hub → Payroll correction</w:t>
+            </w:r>
+            <w:r>
+              <w:t xml:space="preserve">. Admins approve or deny it with time off and missed punches, and the employee and office are notified.</w:t>
             </w:r>
           </w:p>
         </w:tc>
@@ -7322,7 +7632,7 @@
                 <w:b/>
                 <w:bCs/>
               </w:rPr>
-              <w:t xml:space="preserve">2.5</w:t>
+              <w:t xml:space="preserve">2.6</w:t>
             </w:r>
           </w:p>
         </w:tc>
@@ -7366,27 +7676,47 @@
           </w:tcPr>
           <w:p>
             <w:r>
-              <w:t xml:space="preserve">Office staff and the parts department can </w:t>
+              <w:t xml:space="preserve">The paper missed punch slip is now in the Employee App: </w:t>
             </w:r>
             <w:r>
               <w:rPr>
                 <w:b/>
                 <w:bCs/>
               </w:rPr>
-              <w:t xml:space="preserve">run parts from their phone</w:t>
-            </w:r>
-            <w:r>
-              <w:t xml:space="preserve">: the new </w:t>
+              <w:t xml:space="preserve">Staff Hub → Missed punch</w:t>
+            </w:r>
+            <w:r>
+              <w:t xml:space="preserve">. Admins approve or deny slips with time off (Staff Hub → </w:t>
             </w:r>
             <w:r>
               <w:rPr>
                 <w:b/>
                 <w:bCs/>
               </w:rPr>
-              <w:t xml:space="preserve">Parts desk</w:t>
-            </w:r>
-            <w:r>
-              <w:t xml:space="preserve"> in the Employee App orders, receives and mirror matches parts, moves them between shelves, and covers Returns &amp; Alerts and storage locations.</w:t>
+              <w:t xml:space="preserve">Approve requests</w:t>
+            </w:r>
+            <w:r>
+              <w:t xml:space="preserve">, or the </w:t>
+            </w:r>
+            <w:r>
+              <w:rPr>
+                <w:b/>
+                <w:bCs/>
+              </w:rPr>
+              <w:t xml:space="preserve">Time Off</w:t>
+            </w:r>
+            <w:r>
+              <w:t xml:space="preserve"> tab), and the employee and office are notified. The Employee App now </w:t>
+            </w:r>
+            <w:r>
+              <w:rPr>
+                <w:b/>
+                <w:bCs/>
+              </w:rPr>
+              <w:t xml:space="preserve">updates itself</w:t>
+            </w:r>
+            <w:r>
+              <w:t xml:space="preserve"> when a new version is put on the server.</w:t>
             </w:r>
           </w:p>
         </w:tc>
@@ -7417,7 +7747,7 @@
                 <w:b/>
                 <w:bCs/>
               </w:rPr>
-              <w:t xml:space="preserve">2.4</w:t>
+              <w:t xml:space="preserve">2.5</w:t>
             </w:r>
           </w:p>
         </w:tc>
@@ -7439,7 +7769,7 @@
           </w:tcPr>
           <w:p>
             <w:r>
-              <w:t xml:space="preserve">October 6, 2026</w:t>
+              <w:t xml:space="preserve">October 8, 2026</w:t>
             </w:r>
           </w:p>
         </w:tc>
@@ -7461,17 +7791,27 @@
           </w:tcPr>
           <w:p>
             <w:r>
-              <w:t xml:space="preserve">Admins can </w:t>
+              <w:t xml:space="preserve">Office staff and the parts department can </w:t>
             </w:r>
             <w:r>
               <w:rPr>
                 <w:b/>
                 <w:bCs/>
               </w:rPr>
-              <w:t xml:space="preserve">approve or deny time off in the Employee App</w:t>
-            </w:r>
-            <w:r>
-              <w:t xml:space="preserve"> (Staff Hub → Approve time off), and the office is emailed every decision. The TV and shop touch board show when they last updated and catch up by themselves if they fall behind.</w:t>
+              <w:t xml:space="preserve">run parts from their phone</w:t>
+            </w:r>
+            <w:r>
+              <w:t xml:space="preserve">: the new </w:t>
+            </w:r>
+            <w:r>
+              <w:rPr>
+                <w:b/>
+                <w:bCs/>
+              </w:rPr>
+              <w:t xml:space="preserve">Parts desk</w:t>
+            </w:r>
+            <w:r>
+              <w:t xml:space="preserve"> in the Employee App orders, receives and mirror matches parts, moves them between shelves, and covers Returns &amp; Alerts and storage locations.</w:t>
             </w:r>
           </w:p>
         </w:tc>
@@ -7502,7 +7842,7 @@
                 <w:b/>
                 <w:bCs/>
               </w:rPr>
-              <w:t xml:space="preserve">2.3</w:t>
+              <w:t xml:space="preserve">2.4</w:t>
             </w:r>
           </w:p>
         </w:tc>
@@ -7524,7 +7864,7 @@
           </w:tcPr>
           <w:p>
             <w:r>
-              <w:t xml:space="preserve">October 5, 2026</w:t>
+              <w:t xml:space="preserve">October 6, 2026</w:t>
             </w:r>
           </w:p>
         </w:tc>
@@ -7546,37 +7886,17 @@
           </w:tcPr>
           <w:p>
             <w:r>
-              <w:t xml:space="preserve">Estimates without an RO are now </w:t>
+              <w:t xml:space="preserve">Admins can </w:t>
             </w:r>
             <w:r>
               <w:rPr>
                 <w:b/>
                 <w:bCs/>
               </w:rPr>
-              <w:t xml:space="preserve">capture opportunities</w:t>
-            </w:r>
-            <w:r>
-              <w:t xml:space="preserve">: instead of cycle time emails, the office gets up to 3 reminders to call the customer. Log each call with </w:t>
-            </w:r>
-            <w:r>
-              <w:rPr>
-                <w:b/>
-                <w:bCs/>
-              </w:rPr>
-              <w:t xml:space="preserve">Log call</w:t>
-            </w:r>
-            <w:r>
-              <w:t xml:space="preserve"> under </w:t>
-            </w:r>
-            <w:r>
-              <w:rPr>
-                <w:b/>
-                <w:bCs/>
-              </w:rPr>
-              <w:t xml:space="preserve">Opportunities</w:t>
-            </w:r>
-            <w:r>
-              <w:t xml:space="preserve">.</w:t>
+              <w:t xml:space="preserve">approve or deny time off in the Employee App</w:t>
+            </w:r>
+            <w:r>
+              <w:t xml:space="preserve"> (Staff Hub → Approve time off), and the office is emailed every decision. The TV and shop touch board show when they last updated and catch up by themselves if they fall behind.</w:t>
             </w:r>
           </w:p>
         </w:tc>
@@ -7607,7 +7927,7 @@
                 <w:b/>
                 <w:bCs/>
               </w:rPr>
-              <w:t xml:space="preserve">2.2</w:t>
+              <w:t xml:space="preserve">2.3</w:t>
             </w:r>
           </w:p>
         </w:tc>
@@ -7629,7 +7949,7 @@
           </w:tcPr>
           <w:p>
             <w:r>
-              <w:t xml:space="preserve">September 30, 2026</w:t>
+              <w:t xml:space="preserve">October 5, 2026</w:t>
             </w:r>
           </w:p>
         </w:tc>
@@ -7651,17 +7971,37 @@
           </w:tcPr>
           <w:p>
             <w:r>
-              <w:t xml:space="preserve">On the shop touch board, technicians can </w:t>
+              <w:t xml:space="preserve">Estimates without an RO are now </w:t>
             </w:r>
             <w:r>
               <w:rPr>
                 <w:b/>
                 <w:bCs/>
               </w:rPr>
-              <w:t xml:space="preserve">drag</w:t>
-            </w:r>
-            <w:r>
-              <w:t xml:space="preserve"> a car to its next stage with a finger (tapping still works).</w:t>
+              <w:t xml:space="preserve">capture opportunities</w:t>
+            </w:r>
+            <w:r>
+              <w:t xml:space="preserve">: instead of cycle time emails, the office gets up to 3 reminders to call the customer. Log each call with </w:t>
+            </w:r>
+            <w:r>
+              <w:rPr>
+                <w:b/>
+                <w:bCs/>
+              </w:rPr>
+              <w:t xml:space="preserve">Log call</w:t>
+            </w:r>
+            <w:r>
+              <w:t xml:space="preserve"> under </w:t>
+            </w:r>
+            <w:r>
+              <w:rPr>
+                <w:b/>
+                <w:bCs/>
+              </w:rPr>
+              <w:t xml:space="preserve">Opportunities</w:t>
+            </w:r>
+            <w:r>
+              <w:t xml:space="preserve">.</w:t>
             </w:r>
           </w:p>
         </w:tc>
@@ -7692,7 +8032,7 @@
                 <w:b/>
                 <w:bCs/>
               </w:rPr>
-              <w:t xml:space="preserve">2.1</w:t>
+              <w:t xml:space="preserve">2.2</w:t>
             </w:r>
           </w:p>
         </w:tc>
@@ -7736,17 +8076,17 @@
           </w:tcPr>
           <w:p>
             <w:r>
-              <w:t xml:space="preserve">New </w:t>
+              <w:t xml:space="preserve">On the shop touch board, technicians can </w:t>
             </w:r>
             <w:r>
               <w:rPr>
                 <w:b/>
                 <w:bCs/>
               </w:rPr>
-              <w:t xml:space="preserve">shop touch board</w:t>
-            </w:r>
-            <w:r>
-              <w:t xml:space="preserve">: technicians move cars to their next stage by tapping the car, the stage and their name.</w:t>
+              <w:t xml:space="preserve">drag</w:t>
+            </w:r>
+            <w:r>
+              <w:t xml:space="preserve"> a car to its next stage with a finger (tapping still works).</w:t>
             </w:r>
           </w:p>
         </w:tc>
@@ -7777,7 +8117,7 @@
                 <w:b/>
                 <w:bCs/>
               </w:rPr>
-              <w:t xml:space="preserve">2.0</w:t>
+              <w:t xml:space="preserve">2.1</w:t>
             </w:r>
           </w:p>
         </w:tc>
@@ -7821,27 +8161,17 @@
           </w:tcPr>
           <w:p>
             <w:r>
-              <w:t xml:space="preserve">The Employee App can be switched to </w:t>
+              <w:t xml:space="preserve">New </w:t>
             </w:r>
             <w:r>
               <w:rPr>
                 <w:b/>
                 <w:bCs/>
               </w:rPr>
-              <w:t xml:space="preserve">Spanish</w:t>
-            </w:r>
-            <w:r>
-              <w:t xml:space="preserve"> with the </w:t>
-            </w:r>
-            <w:r>
-              <w:rPr>
-                <w:b/>
-                <w:bCs/>
-              </w:rPr>
-              <w:t xml:space="preserve">Español</w:t>
-            </w:r>
-            <w:r>
-              <w:t xml:space="preserve"> button. Reports and the office program stay in English.</w:t>
+              <w:t xml:space="preserve">shop touch board</w:t>
+            </w:r>
+            <w:r>
+              <w:t xml:space="preserve">: technicians move cars to their next stage by tapping the car, the stage and their name.</w:t>
             </w:r>
           </w:p>
         </w:tc>
@@ -7872,7 +8202,7 @@
                 <w:b/>
                 <w:bCs/>
               </w:rPr>
-              <w:t xml:space="preserve">1.9</w:t>
+              <w:t xml:space="preserve">2.0</w:t>
             </w:r>
           </w:p>
         </w:tc>
@@ -7894,7 +8224,7 @@
           </w:tcPr>
           <w:p>
             <w:r>
-              <w:t xml:space="preserve">September 28, 2026</w:t>
+              <w:t xml:space="preserve">September 30, 2026</w:t>
             </w:r>
           </w:p>
         </w:tc>
@@ -7916,17 +8246,27 @@
           </w:tcPr>
           <w:p>
             <w:r>
-              <w:t xml:space="preserve">New </w:t>
+              <w:t xml:space="preserve">The Employee App can be switched to </w:t>
             </w:r>
             <w:r>
               <w:rPr>
                 <w:b/>
                 <w:bCs/>
               </w:rPr>
-              <w:t xml:space="preserve">Find a vehicle</w:t>
-            </w:r>
-            <w:r>
-              <w:t xml:space="preserve"> search at the top of the office program. It finds any car, at any stage or finished, by RO, customer, vehicle, VIN, plate or claim number.</w:t>
+              <w:t xml:space="preserve">Spanish</w:t>
+            </w:r>
+            <w:r>
+              <w:t xml:space="preserve"> with the </w:t>
+            </w:r>
+            <w:r>
+              <w:rPr>
+                <w:b/>
+                <w:bCs/>
+              </w:rPr>
+              <w:t xml:space="preserve">Español</w:t>
+            </w:r>
+            <w:r>
+              <w:t xml:space="preserve"> button. Reports and the office program stay in English.</w:t>
             </w:r>
           </w:p>
         </w:tc>
@@ -7957,7 +8297,7 @@
                 <w:b/>
                 <w:bCs/>
               </w:rPr>
-              <w:t xml:space="preserve">1.8</w:t>
+              <w:t xml:space="preserve">1.9</w:t>
             </w:r>
           </w:p>
         </w:tc>
@@ -8008,10 +8348,10 @@
                 <w:b/>
                 <w:bCs/>
               </w:rPr>
-              <w:t xml:space="preserve">Completed Jobs</w:t>
-            </w:r>
-            <w:r>
-              <w:t xml:space="preserve"> tab with each finished job's full file (production timeline, parts, QC, photos, every change). Only an admin can delete a delivered job or its parts.</w:t>
+              <w:t xml:space="preserve">Find a vehicle</w:t>
+            </w:r>
+            <w:r>
+              <w:t xml:space="preserve"> search at the top of the office program. It finds any car, at any stage or finished, by RO, customer, vehicle, VIN, plate or claim number.</w:t>
             </w:r>
           </w:p>
         </w:tc>
@@ -8042,7 +8382,7 @@
                 <w:b/>
                 <w:bCs/>
               </w:rPr>
-              <w:t xml:space="preserve">1.7</w:t>
+              <w:t xml:space="preserve">1.8</w:t>
             </w:r>
           </w:p>
         </w:tc>
@@ -8086,17 +8426,17 @@
           </w:tcPr>
           <w:p>
             <w:r>
-              <w:t xml:space="preserve">The Employee App now shows </w:t>
+              <w:t xml:space="preserve">New </w:t>
             </w:r>
             <w:r>
               <w:rPr>
                 <w:b/>
                 <w:bCs/>
               </w:rPr>
-              <w:t xml:space="preserve">where each part is</w:t>
-            </w:r>
-            <w:r>
-              <w:t xml:space="preserve">: the car's parts cart, and the cart shelf or storage spot for every part.</w:t>
+              <w:t xml:space="preserve">Completed Jobs</w:t>
+            </w:r>
+            <w:r>
+              <w:t xml:space="preserve"> tab with each finished job's full file (production timeline, parts, QC, photos, every change). Only an admin can delete a delivered job or its parts.</w:t>
             </w:r>
           </w:p>
         </w:tc>
@@ -8127,7 +8467,7 @@
                 <w:b/>
                 <w:bCs/>
               </w:rPr>
-              <w:t xml:space="preserve">1.6</w:t>
+              <w:t xml:space="preserve">1.7</w:t>
             </w:r>
           </w:p>
         </w:tc>
@@ -8171,37 +8511,17 @@
           </w:tcPr>
           <w:p>
             <w:r>
-              <w:t xml:space="preserve">Whoever does </w:t>
+              <w:t xml:space="preserve">The Employee App now shows </w:t>
             </w:r>
             <w:r>
               <w:rPr>
                 <w:b/>
                 <w:bCs/>
               </w:rPr>
-              <w:t xml:space="preserve">Check-In</w:t>
-            </w:r>
-            <w:r>
-              <w:t xml:space="preserve"> automatically gets the </w:t>
-            </w:r>
-            <w:r>
-              <w:rPr>
-                <w:b/>
-                <w:bCs/>
-              </w:rPr>
-              <w:t xml:space="preserve">Final QC</w:t>
-            </w:r>
-            <w:r>
-              <w:t xml:space="preserve"> checklist too. New </w:t>
-            </w:r>
-            <w:r>
-              <w:rPr>
-                <w:b/>
-                <w:bCs/>
-              </w:rPr>
-              <w:t xml:space="preserve">QC report</w:t>
-            </w:r>
-            <w:r>
-              <w:t xml:space="preserve"> for each car: all five checklists with signatures on one printable page.</w:t>
+              <w:t xml:space="preserve">where each part is</w:t>
+            </w:r>
+            <w:r>
+              <w:t xml:space="preserve">: the car's parts cart, and the cart shelf or storage spot for every part.</w:t>
             </w:r>
           </w:p>
         </w:tc>
@@ -8232,7 +8552,7 @@
                 <w:b/>
                 <w:bCs/>
               </w:rPr>
-              <w:t xml:space="preserve">1.5</w:t>
+              <w:t xml:space="preserve">1.6</w:t>
             </w:r>
           </w:p>
         </w:tc>
@@ -8276,17 +8596,37 @@
           </w:tcPr>
           <w:p>
             <w:r>
-              <w:t xml:space="preserve">Body technicians automatically get the </w:t>
+              <w:t xml:space="preserve">Whoever does </w:t>
             </w:r>
             <w:r>
               <w:rPr>
                 <w:b/>
                 <w:bCs/>
               </w:rPr>
-              <w:t xml:space="preserve">Reassy</w:t>
-            </w:r>
-            <w:r>
-              <w:t xml:space="preserve"> checklist too.</w:t>
+              <w:t xml:space="preserve">Check-In</w:t>
+            </w:r>
+            <w:r>
+              <w:t xml:space="preserve"> automatically gets the </w:t>
+            </w:r>
+            <w:r>
+              <w:rPr>
+                <w:b/>
+                <w:bCs/>
+              </w:rPr>
+              <w:t xml:space="preserve">Final QC</w:t>
+            </w:r>
+            <w:r>
+              <w:t xml:space="preserve"> checklist too. New </w:t>
+            </w:r>
+            <w:r>
+              <w:rPr>
+                <w:b/>
+                <w:bCs/>
+              </w:rPr>
+              <w:t xml:space="preserve">QC report</w:t>
+            </w:r>
+            <w:r>
+              <w:t xml:space="preserve"> for each car: all five checklists with signatures on one printable page.</w:t>
             </w:r>
           </w:p>
         </w:tc>
@@ -8317,7 +8657,7 @@
                 <w:b/>
                 <w:bCs/>
               </w:rPr>
-              <w:t xml:space="preserve">1.4</w:t>
+              <w:t xml:space="preserve">1.5</w:t>
             </w:r>
           </w:p>
         </w:tc>
@@ -8361,17 +8701,17 @@
           </w:tcPr>
           <w:p>
             <w:r>
-              <w:t xml:space="preserve">Employees can be set to </w:t>
+              <w:t xml:space="preserve">Body technicians automatically get the </w:t>
             </w:r>
             <w:r>
               <w:rPr>
                 <w:b/>
                 <w:bCs/>
               </w:rPr>
-              <w:t xml:space="preserve">also do</w:t>
-            </w:r>
-            <w:r>
-              <w:t xml:space="preserve"> other checklists (for example a body tech who reassembles also gets the Reassy checklist).</w:t>
+              <w:t xml:space="preserve">Reassy</w:t>
+            </w:r>
+            <w:r>
+              <w:t xml:space="preserve"> checklist too.</w:t>
             </w:r>
           </w:p>
         </w:tc>
@@ -8402,7 +8742,7 @@
                 <w:b/>
                 <w:bCs/>
               </w:rPr>
-              <w:t xml:space="preserve">1.3</w:t>
+              <w:t xml:space="preserve">1.4</w:t>
             </w:r>
           </w:p>
         </w:tc>
@@ -8446,7 +8786,17 @@
           </w:tcPr>
           <w:p>
             <w:r>
-              <w:t xml:space="preserve">New accounts and admin password resets use a temporary password; you choose your own the first time you sign in.</w:t>
+              <w:t xml:space="preserve">Employees can be set to </w:t>
+            </w:r>
+            <w:r>
+              <w:rPr>
+                <w:b/>
+                <w:bCs/>
+              </w:rPr>
+              <w:t xml:space="preserve">also do</w:t>
+            </w:r>
+            <w:r>
+              <w:t xml:space="preserve"> other checklists (for example a body tech who reassembles also gets the Reassy checklist).</w:t>
             </w:r>
           </w:p>
         </w:tc>
@@ -8477,7 +8827,7 @@
                 <w:b/>
                 <w:bCs/>
               </w:rPr>
-              <w:t xml:space="preserve">1.2</w:t>
+              <w:t xml:space="preserve">1.3</w:t>
             </w:r>
           </w:p>
         </w:tc>
@@ -8521,17 +8871,7 @@
           </w:tcPr>
           <w:p>
             <w:r>
-              <w:t xml:space="preserve">Added the </w:t>
-            </w:r>
-            <w:r>
-              <w:rPr>
-                <w:b/>
-                <w:bCs/>
-              </w:rPr>
-              <w:t xml:space="preserve">Help</w:t>
-            </w:r>
-            <w:r>
-              <w:t xml:space="preserve"> tab in the office program and a search box in the manual.</w:t>
+              <w:t xml:space="preserve">New accounts and admin password resets use a temporary password; you choose your own the first time you sign in.</w:t>
             </w:r>
           </w:p>
         </w:tc>
@@ -8562,7 +8902,7 @@
                 <w:b/>
                 <w:bCs/>
               </w:rPr>
-              <w:t xml:space="preserve">1.1</w:t>
+              <w:t xml:space="preserve">1.2</w:t>
             </w:r>
           </w:p>
         </w:tc>
@@ -8606,17 +8946,17 @@
           </w:tcPr>
           <w:p>
             <w:r>
-              <w:t xml:space="preserve">Employee App address is now </w:t>
+              <w:t xml:space="preserve">Added the </w:t>
             </w:r>
             <w:r>
               <w:rPr>
                 <w:b/>
                 <w:bCs/>
               </w:rPr>
-              <w:t xml:space="preserve">https://conceptautobody.app</w:t>
-            </w:r>
-            <w:r>
-              <w:t xml:space="preserve"> and works on phones anywhere. Added how to put it on your phone's home screen.</w:t>
+              <w:t xml:space="preserve">Help</w:t>
+            </w:r>
+            <w:r>
+              <w:t xml:space="preserve"> tab in the office program and a search box in the manual.</w:t>
             </w:r>
           </w:p>
         </w:tc>
@@ -8647,7 +8987,7 @@
                 <w:b/>
                 <w:bCs/>
               </w:rPr>
-              <w:t xml:space="preserve">1.0</w:t>
+              <w:t xml:space="preserve">1.1</w:t>
             </w:r>
           </w:p>
         </w:tc>
@@ -8691,6 +9031,91 @@
           </w:tcPr>
           <w:p>
             <w:r>
+              <w:t xml:space="preserve">Employee App address is now </w:t>
+            </w:r>
+            <w:r>
+              <w:rPr>
+                <w:b/>
+                <w:bCs/>
+              </w:rPr>
+              <w:t xml:space="preserve">https://conceptautobody.app</w:t>
+            </w:r>
+            <w:r>
+              <w:t xml:space="preserve"> and works on phones anywhere. Added how to put it on your phone's home screen.</w:t>
+            </w:r>
+          </w:p>
+        </w:tc>
+      </w:tr>
+      <w:tr>
+        <w:trPr>
+          <w:cantSplit/>
+        </w:trPr>
+        <w:tc>
+          <w:tcPr>
+            <w:tcW w:type="dxa" w:w="3120"/>
+            <w:tcBorders>
+              <w:top w:val="single" w:color="C9CFD6" w:sz="4"/>
+              <w:left w:val="single" w:color="C9CFD6" w:sz="4"/>
+              <w:bottom w:val="single" w:color="C9CFD6" w:sz="4"/>
+              <w:right w:val="single" w:color="C9CFD6" w:sz="4"/>
+            </w:tcBorders>
+            <w:tcMar>
+              <w:top w:type="dxa" w:w="80"/>
+              <w:left w:type="dxa" w:w="120"/>
+              <w:bottom w:type="dxa" w:w="80"/>
+              <w:right w:type="dxa" w:w="120"/>
+            </w:tcMar>
+          </w:tcPr>
+          <w:p>
+            <w:r>
+              <w:rPr>
+                <w:b/>
+                <w:bCs/>
+              </w:rPr>
+              <w:t xml:space="preserve">1.0</w:t>
+            </w:r>
+          </w:p>
+        </w:tc>
+        <w:tc>
+          <w:tcPr>
+            <w:tcW w:type="dxa" w:w="3120"/>
+            <w:tcBorders>
+              <w:top w:val="single" w:color="C9CFD6" w:sz="4"/>
+              <w:left w:val="single" w:color="C9CFD6" w:sz="4"/>
+              <w:bottom w:val="single" w:color="C9CFD6" w:sz="4"/>
+              <w:right w:val="single" w:color="C9CFD6" w:sz="4"/>
+            </w:tcBorders>
+            <w:tcMar>
+              <w:top w:type="dxa" w:w="80"/>
+              <w:left w:type="dxa" w:w="120"/>
+              <w:bottom w:type="dxa" w:w="80"/>
+              <w:right w:type="dxa" w:w="120"/>
+            </w:tcMar>
+          </w:tcPr>
+          <w:p>
+            <w:r>
+              <w:t xml:space="preserve">September 28, 2026</w:t>
+            </w:r>
+          </w:p>
+        </w:tc>
+        <w:tc>
+          <w:tcPr>
+            <w:tcW w:type="dxa" w:w="3120"/>
+            <w:tcBorders>
+              <w:top w:val="single" w:color="C9CFD6" w:sz="4"/>
+              <w:left w:val="single" w:color="C9CFD6" w:sz="4"/>
+              <w:bottom w:val="single" w:color="C9CFD6" w:sz="4"/>
+              <w:right w:val="single" w:color="C9CFD6" w:sz="4"/>
+            </w:tcBorders>
+            <w:tcMar>
+              <w:top w:type="dxa" w:w="80"/>
+              <w:left w:type="dxa" w:w="120"/>
+              <w:bottom w:type="dxa" w:w="80"/>
+              <w:right w:type="dxa" w:w="120"/>
+            </w:tcMar>
+          </w:tcPr>
+          <w:p>
+            <w:r>
               <w:t xml:space="preserve">First edition.</w:t>
             </w:r>
           </w:p>
@@ -8764,7 +9189,7 @@
         <w:sz w:val="18"/>
         <w:szCs w:val="18"/>
       </w:rPr>
-      <w:t xml:space="preserve">Concept Autobody  ·  Version 2.6  ·  Page </w:t>
+      <w:t xml:space="preserve">Concept Autobody  ·  Version 2.7  ·  Page </w:t>
     </w:r>
     <w:r>
       <w:rPr>
@@ -9060,6 +9485,12 @@
     </w:lvlOverride>
   </w:num>
   <w:num w:numId="19">
+    <w:abstractNumId w:val="3"/>
+    <w:lvlOverride w:ilvl="0">
+      <w:startOverride w:val="1"/>
+    </w:lvlOverride>
+  </w:num>
+  <w:num w:numId="20">
     <w:abstractNumId w:val="3"/>
     <w:lvlOverride w:ilvl="0">
       <w:startOverride w:val="1"/>

</xml_diff>

<commit_message>
Customer status page at /update; manual v2.8
Customers see their vehicle, a simplified progress bar, the updates the
office posts and Call/Text buttons, from a private link (/update/<token>) or
by looking up RO number + last name (rate limited per visitor and per RO).
No prices, notes, hold-ups or staff names are ever sent. On Hold keeps
showing the last step reached (migration 026 tracks it). Office staff create
and copy links and post updates from the job editor; posting sets Customer
Updated to Yes and hands the editor the new version. Admins set the shop's
phone, text number, hours and address under Settings.

Co-Authored-By: Claude Opus 5.5 <noreply@anthropic.com>
</commit_message>
<xml_diff>
--- a/client/manual/ShopControl-User-Manual.docx
+++ b/client/manual/ShopControl-User-Manual.docx
@@ -92,7 +92,7 @@
           <w:sz w:val="22"/>
           <w:szCs w:val="22"/>
         </w:rPr>
-        <w:t xml:space="preserve">Version 2.7  ·  Updated October 8, 2026</w:t>
+        <w:t xml:space="preserve">Version 2.8  ·  Updated October 8, 2026</w:t>
       </w:r>
     </w:p>
     <w:p>
@@ -6433,6 +6433,243 @@
         <w:pStyle w:val="Heading2"/>
       </w:pPr>
       <w:r>
+        <w:t xml:space="preserve">Customer status page</w:t>
+      </w:r>
+    </w:p>
+    <w:p>
+      <w:pPr>
+        <w:spacing w:after="120"/>
+      </w:pPr>
+      <w:r>
+        <w:t xml:space="preserve">Customers can check on their car at </w:t>
+      </w:r>
+      <w:r>
+        <w:rPr>
+          <w:b/>
+          <w:bCs/>
+        </w:rPr>
+        <w:t xml:space="preserve">conceptautobody.app/update</w:t>
+      </w:r>
+      <w:r>
+        <w:t xml:space="preserve">. They see the vehicle, a progress bar (Checked in, Repair plan, Parts, Body, Paint, Reassembly, Final check, Ready), the updates you post, and Call and Text buttons. They </w:t>
+      </w:r>
+      <w:r>
+        <w:rPr>
+          <w:b/>
+          <w:bCs/>
+        </w:rPr>
+        <w:t xml:space="preserve">never</w:t>
+      </w:r>
+      <w:r>
+        <w:t xml:space="preserve"> see prices, notes, hold-up reasons, supplements or staff names. A car on hold keeps showing the last step it reached.</w:t>
+      </w:r>
+    </w:p>
+    <w:p>
+      <w:pPr>
+        <w:pStyle w:val="ListParagraph"/>
+        <w:numPr>
+          <w:ilvl w:val="0"/>
+          <w:numId w:val="20"/>
+        </w:numPr>
+        <w:spacing w:after="60"/>
+      </w:pPr>
+      <w:r>
+        <w:t xml:space="preserve">Open the job in </w:t>
+      </w:r>
+      <w:r>
+        <w:rPr>
+          <w:b/>
+          <w:bCs/>
+        </w:rPr>
+        <w:t xml:space="preserve">Shop Control</w:t>
+      </w:r>
+      <w:r>
+        <w:t xml:space="preserve"> (Edit). The </w:t>
+      </w:r>
+      <w:r>
+        <w:rPr>
+          <w:b/>
+          <w:bCs/>
+        </w:rPr>
+        <w:t xml:space="preserve">Customer status page</w:t>
+      </w:r>
+      <w:r>
+        <w:t xml:space="preserve"> panel is under the timestamps (office staff, estimators, managers and admins).</w:t>
+      </w:r>
+    </w:p>
+    <w:p>
+      <w:pPr>
+        <w:pStyle w:val="ListParagraph"/>
+        <w:numPr>
+          <w:ilvl w:val="0"/>
+          <w:numId w:val="20"/>
+        </w:numPr>
+        <w:spacing w:after="60"/>
+      </w:pPr>
+      <w:r>
+        <w:t xml:space="preserve">Click </w:t>
+      </w:r>
+      <w:r>
+        <w:rPr>
+          <w:b/>
+          <w:bCs/>
+        </w:rPr>
+        <w:t xml:space="preserve">Create customer link</w:t>
+      </w:r>
+      <w:r>
+        <w:t xml:space="preserve">. It's copied for you; paste it into a text or email to the customer. </w:t>
+      </w:r>
+      <w:r>
+        <w:rPr>
+          <w:b/>
+          <w:bCs/>
+        </w:rPr>
+        <w:t xml:space="preserve">Copy customer link</w:t>
+      </w:r>
+      <w:r>
+        <w:t xml:space="preserve"> copies it again later.</w:t>
+      </w:r>
+    </w:p>
+    <w:p>
+      <w:pPr>
+        <w:pStyle w:val="ListParagraph"/>
+        <w:numPr>
+          <w:ilvl w:val="0"/>
+          <w:numId w:val="20"/>
+        </w:numPr>
+        <w:spacing w:after="60"/>
+      </w:pPr>
+      <w:r>
+        <w:t xml:space="preserve">To update the customer, type a short message under </w:t>
+      </w:r>
+      <w:r>
+        <w:rPr>
+          <w:b/>
+          <w:bCs/>
+        </w:rPr>
+        <w:t xml:space="preserve">Post an update for the customer</w:t>
+      </w:r>
+      <w:r>
+        <w:t xml:space="preserve"> and click </w:t>
+      </w:r>
+      <w:r>
+        <w:rPr>
+          <w:b/>
+          <w:bCs/>
+        </w:rPr>
+        <w:t xml:space="preserve">Post update</w:t>
+      </w:r>
+      <w:r>
+        <w:t xml:space="preserve">. It shows on their page right away and sets </w:t>
+      </w:r>
+      <w:r>
+        <w:rPr>
+          <w:b/>
+          <w:bCs/>
+        </w:rPr>
+        <w:t xml:space="preserve">Customer Updated</w:t>
+      </w:r>
+      <w:r>
+        <w:t xml:space="preserve"> to Yes.</w:t>
+      </w:r>
+    </w:p>
+    <w:p>
+      <w:pPr>
+        <w:pStyle w:val="ListParagraph"/>
+        <w:numPr>
+          <w:ilvl w:val="0"/>
+          <w:numId w:val="20"/>
+        </w:numPr>
+        <w:spacing w:after="60"/>
+      </w:pPr>
+      <w:r>
+        <w:t xml:space="preserve">Made a mistake? Click </w:t>
+      </w:r>
+      <w:r>
+        <w:rPr>
+          <w:b/>
+          <w:bCs/>
+        </w:rPr>
+        <w:t xml:space="preserve">Remove</w:t>
+      </w:r>
+      <w:r>
+        <w:t xml:space="preserve"> next to the update, then click again to confirm.</w:t>
+      </w:r>
+    </w:p>
+    <w:p>
+      <w:pPr>
+        <w:spacing w:after="120"/>
+      </w:pPr>
+      <w:r>
+        <w:t xml:space="preserve">Customers who lost the link can go to conceptautobody.app/update and enter their </w:t>
+      </w:r>
+      <w:r>
+        <w:rPr>
+          <w:b/>
+          <w:bCs/>
+        </w:rPr>
+        <w:t xml:space="preserve">5-digit RO number</w:t>
+      </w:r>
+      <w:r>
+        <w:t xml:space="preserve"> and the </w:t>
+      </w:r>
+      <w:r>
+        <w:rPr>
+          <w:b/>
+          <w:bCs/>
+        </w:rPr>
+        <w:t xml:space="preserve">last name</w:t>
+      </w:r>
+      <w:r>
+        <w:t xml:space="preserve"> on the repair order. After a few wrong tries the page makes them wait, so nobody can guess their way into another customer's car. Links keep working for 30 days after pickup. Estimates without an RO don't have a status page.</w:t>
+      </w:r>
+    </w:p>
+    <w:p>
+      <w:pPr>
+        <w:pBdr>
+          <w:left w:val="single" w:color="C99A06" w:sz="24" w:space="8"/>
+        </w:pBdr>
+        <w:shd w:fill="FFF8DD" w:color="auto" w:val="clear"/>
+        <w:spacing w:after="160" w:before="120"/>
+        <w:ind w:left="160" w:right="160"/>
+      </w:pPr>
+      <w:r>
+        <w:rPr>
+          <w:b/>
+          <w:bCs/>
+          <w:color w:val="C99A06"/>
+        </w:rPr>
+        <w:t xml:space="preserve">Note:  </w:t>
+      </w:r>
+      <w:r>
+        <w:t xml:space="preserve">Admins set the shop phone, the number customers can text, hours and address under </w:t>
+      </w:r>
+      <w:r>
+        <w:rPr>
+          <w:b/>
+          <w:bCs/>
+        </w:rPr>
+        <w:t xml:space="preserve">Settings</w:t>
+      </w:r>
+      <w:r>
+        <w:t xml:space="preserve"> → </w:t>
+      </w:r>
+      <w:r>
+        <w:rPr>
+          <w:b/>
+          <w:bCs/>
+        </w:rPr>
+        <w:t xml:space="preserve">Customer status page</w:t>
+      </w:r>
+      <w:r>
+        <w:t xml:space="preserve">. Leave the text number blank if you don't take texts.</w:t>
+      </w:r>
+    </w:p>
+    <w:p>
+      <w:pPr>
+        <w:pStyle w:val="Heading2"/>
+      </w:pPr>
+      <w:r>
         <w:t xml:space="preserve">Messages &amp; Info tab</w:t>
       </w:r>
     </w:p>
@@ -6538,7 +6775,7 @@
         <w:pStyle w:val="ListParagraph"/>
         <w:numPr>
           <w:ilvl w:val="0"/>
-          <w:numId w:val="20"/>
+          <w:numId w:val="21"/>
         </w:numPr>
         <w:spacing w:after="60"/>
       </w:pPr>
@@ -6571,7 +6808,7 @@
         <w:pStyle w:val="ListParagraph"/>
         <w:numPr>
           <w:ilvl w:val="0"/>
-          <w:numId w:val="20"/>
+          <w:numId w:val="21"/>
         </w:numPr>
         <w:spacing w:after="60"/>
       </w:pPr>
@@ -6594,7 +6831,7 @@
         <w:pStyle w:val="ListParagraph"/>
         <w:numPr>
           <w:ilvl w:val="0"/>
-          <w:numId w:val="20"/>
+          <w:numId w:val="21"/>
         </w:numPr>
         <w:spacing w:after="60"/>
       </w:pPr>
@@ -6627,7 +6864,7 @@
         <w:pStyle w:val="ListParagraph"/>
         <w:numPr>
           <w:ilvl w:val="0"/>
-          <w:numId w:val="20"/>
+          <w:numId w:val="21"/>
         </w:numPr>
         <w:spacing w:after="60"/>
       </w:pPr>
@@ -7537,7 +7774,7 @@
                 <w:b/>
                 <w:bCs/>
               </w:rPr>
-              <w:t xml:space="preserve">2.7</w:t>
+              <w:t xml:space="preserve">2.8</w:t>
             </w:r>
           </w:p>
         </w:tc>
@@ -7581,27 +7818,27 @@
           </w:tcPr>
           <w:p>
             <w:r>
-              <w:t xml:space="preserve">The paper </w:t>
+              <w:t xml:space="preserve">New </w:t>
             </w:r>
             <w:r>
               <w:rPr>
                 <w:b/>
                 <w:bCs/>
               </w:rPr>
-              <w:t xml:space="preserve">payroll correction form</w:t>
-            </w:r>
-            <w:r>
-              <w:t xml:space="preserve"> is now in the Employee App: </w:t>
+              <w:t xml:space="preserve">customer status page</w:t>
+            </w:r>
+            <w:r>
+              <w:t xml:space="preserve"> at conceptautobody.app/update: customers see where their car is in the repair and the updates you post, from a private link or by looking up their RO number and last name. Set it up from the job editor (</w:t>
             </w:r>
             <w:r>
               <w:rPr>
                 <w:b/>
                 <w:bCs/>
               </w:rPr>
-              <w:t xml:space="preserve">Staff Hub → Payroll correction</w:t>
-            </w:r>
-            <w:r>
-              <w:t xml:space="preserve">. Admins approve or deny it with time off and missed punches, and the employee and office are notified.</w:t>
+              <w:t xml:space="preserve">Customer status page</w:t>
+            </w:r>
+            <w:r>
+              <w:t xml:space="preserve">) and Settings.</w:t>
             </w:r>
           </w:p>
         </w:tc>
@@ -7632,7 +7869,7 @@
                 <w:b/>
                 <w:bCs/>
               </w:rPr>
-              <w:t xml:space="preserve">2.6</w:t>
+              <w:t xml:space="preserve">2.7</w:t>
             </w:r>
           </w:p>
         </w:tc>
@@ -7676,47 +7913,27 @@
           </w:tcPr>
           <w:p>
             <w:r>
-              <w:t xml:space="preserve">The paper missed punch slip is now in the Employee App: </w:t>
+              <w:t xml:space="preserve">The paper </w:t>
             </w:r>
             <w:r>
               <w:rPr>
                 <w:b/>
                 <w:bCs/>
               </w:rPr>
-              <w:t xml:space="preserve">Staff Hub → Missed punch</w:t>
-            </w:r>
-            <w:r>
-              <w:t xml:space="preserve">. Admins approve or deny slips with time off (Staff Hub → </w:t>
+              <w:t xml:space="preserve">payroll correction form</w:t>
+            </w:r>
+            <w:r>
+              <w:t xml:space="preserve"> is now in the Employee App: </w:t>
             </w:r>
             <w:r>
               <w:rPr>
                 <w:b/>
                 <w:bCs/>
               </w:rPr>
-              <w:t xml:space="preserve">Approve requests</w:t>
-            </w:r>
-            <w:r>
-              <w:t xml:space="preserve">, or the </w:t>
-            </w:r>
-            <w:r>
-              <w:rPr>
-                <w:b/>
-                <w:bCs/>
-              </w:rPr>
-              <w:t xml:space="preserve">Time Off</w:t>
-            </w:r>
-            <w:r>
-              <w:t xml:space="preserve"> tab), and the employee and office are notified. The Employee App now </w:t>
-            </w:r>
-            <w:r>
-              <w:rPr>
-                <w:b/>
-                <w:bCs/>
-              </w:rPr>
-              <w:t xml:space="preserve">updates itself</w:t>
-            </w:r>
-            <w:r>
-              <w:t xml:space="preserve"> when a new version is put on the server.</w:t>
+              <w:t xml:space="preserve">Staff Hub → Payroll correction</w:t>
+            </w:r>
+            <w:r>
+              <w:t xml:space="preserve">. Admins approve or deny it with time off and missed punches, and the employee and office are notified.</w:t>
             </w:r>
           </w:p>
         </w:tc>
@@ -7747,7 +7964,7 @@
                 <w:b/>
                 <w:bCs/>
               </w:rPr>
-              <w:t xml:space="preserve">2.5</w:t>
+              <w:t xml:space="preserve">2.6</w:t>
             </w:r>
           </w:p>
         </w:tc>
@@ -7791,27 +8008,47 @@
           </w:tcPr>
           <w:p>
             <w:r>
-              <w:t xml:space="preserve">Office staff and the parts department can </w:t>
+              <w:t xml:space="preserve">The paper missed punch slip is now in the Employee App: </w:t>
             </w:r>
             <w:r>
               <w:rPr>
                 <w:b/>
                 <w:bCs/>
               </w:rPr>
-              <w:t xml:space="preserve">run parts from their phone</w:t>
-            </w:r>
-            <w:r>
-              <w:t xml:space="preserve">: the new </w:t>
+              <w:t xml:space="preserve">Staff Hub → Missed punch</w:t>
+            </w:r>
+            <w:r>
+              <w:t xml:space="preserve">. Admins approve or deny slips with time off (Staff Hub → </w:t>
             </w:r>
             <w:r>
               <w:rPr>
                 <w:b/>
                 <w:bCs/>
               </w:rPr>
-              <w:t xml:space="preserve">Parts desk</w:t>
-            </w:r>
-            <w:r>
-              <w:t xml:space="preserve"> in the Employee App orders, receives and mirror matches parts, moves them between shelves, and covers Returns &amp; Alerts and storage locations.</w:t>
+              <w:t xml:space="preserve">Approve requests</w:t>
+            </w:r>
+            <w:r>
+              <w:t xml:space="preserve">, or the </w:t>
+            </w:r>
+            <w:r>
+              <w:rPr>
+                <w:b/>
+                <w:bCs/>
+              </w:rPr>
+              <w:t xml:space="preserve">Time Off</w:t>
+            </w:r>
+            <w:r>
+              <w:t xml:space="preserve"> tab), and the employee and office are notified. The Employee App now </w:t>
+            </w:r>
+            <w:r>
+              <w:rPr>
+                <w:b/>
+                <w:bCs/>
+              </w:rPr>
+              <w:t xml:space="preserve">updates itself</w:t>
+            </w:r>
+            <w:r>
+              <w:t xml:space="preserve"> when a new version is put on the server.</w:t>
             </w:r>
           </w:p>
         </w:tc>
@@ -7842,7 +8079,7 @@
                 <w:b/>
                 <w:bCs/>
               </w:rPr>
-              <w:t xml:space="preserve">2.4</w:t>
+              <w:t xml:space="preserve">2.5</w:t>
             </w:r>
           </w:p>
         </w:tc>
@@ -7864,7 +8101,7 @@
           </w:tcPr>
           <w:p>
             <w:r>
-              <w:t xml:space="preserve">October 6, 2026</w:t>
+              <w:t xml:space="preserve">October 8, 2026</w:t>
             </w:r>
           </w:p>
         </w:tc>
@@ -7886,17 +8123,27 @@
           </w:tcPr>
           <w:p>
             <w:r>
-              <w:t xml:space="preserve">Admins can </w:t>
+              <w:t xml:space="preserve">Office staff and the parts department can </w:t>
             </w:r>
             <w:r>
               <w:rPr>
                 <w:b/>
                 <w:bCs/>
               </w:rPr>
-              <w:t xml:space="preserve">approve or deny time off in the Employee App</w:t>
-            </w:r>
-            <w:r>
-              <w:t xml:space="preserve"> (Staff Hub → Approve time off), and the office is emailed every decision. The TV and shop touch board show when they last updated and catch up by themselves if they fall behind.</w:t>
+              <w:t xml:space="preserve">run parts from their phone</w:t>
+            </w:r>
+            <w:r>
+              <w:t xml:space="preserve">: the new </w:t>
+            </w:r>
+            <w:r>
+              <w:rPr>
+                <w:b/>
+                <w:bCs/>
+              </w:rPr>
+              <w:t xml:space="preserve">Parts desk</w:t>
+            </w:r>
+            <w:r>
+              <w:t xml:space="preserve"> in the Employee App orders, receives and mirror matches parts, moves them between shelves, and covers Returns &amp; Alerts and storage locations.</w:t>
             </w:r>
           </w:p>
         </w:tc>
@@ -7927,7 +8174,7 @@
                 <w:b/>
                 <w:bCs/>
               </w:rPr>
-              <w:t xml:space="preserve">2.3</w:t>
+              <w:t xml:space="preserve">2.4</w:t>
             </w:r>
           </w:p>
         </w:tc>
@@ -7949,7 +8196,7 @@
           </w:tcPr>
           <w:p>
             <w:r>
-              <w:t xml:space="preserve">October 5, 2026</w:t>
+              <w:t xml:space="preserve">October 6, 2026</w:t>
             </w:r>
           </w:p>
         </w:tc>
@@ -7971,37 +8218,17 @@
           </w:tcPr>
           <w:p>
             <w:r>
-              <w:t xml:space="preserve">Estimates without an RO are now </w:t>
+              <w:t xml:space="preserve">Admins can </w:t>
             </w:r>
             <w:r>
               <w:rPr>
                 <w:b/>
                 <w:bCs/>
               </w:rPr>
-              <w:t xml:space="preserve">capture opportunities</w:t>
-            </w:r>
-            <w:r>
-              <w:t xml:space="preserve">: instead of cycle time emails, the office gets up to 3 reminders to call the customer. Log each call with </w:t>
-            </w:r>
-            <w:r>
-              <w:rPr>
-                <w:b/>
-                <w:bCs/>
-              </w:rPr>
-              <w:t xml:space="preserve">Log call</w:t>
-            </w:r>
-            <w:r>
-              <w:t xml:space="preserve"> under </w:t>
-            </w:r>
-            <w:r>
-              <w:rPr>
-                <w:b/>
-                <w:bCs/>
-              </w:rPr>
-              <w:t xml:space="preserve">Opportunities</w:t>
-            </w:r>
-            <w:r>
-              <w:t xml:space="preserve">.</w:t>
+              <w:t xml:space="preserve">approve or deny time off in the Employee App</w:t>
+            </w:r>
+            <w:r>
+              <w:t xml:space="preserve"> (Staff Hub → Approve time off), and the office is emailed every decision. The TV and shop touch board show when they last updated and catch up by themselves if they fall behind.</w:t>
             </w:r>
           </w:p>
         </w:tc>
@@ -8032,7 +8259,7 @@
                 <w:b/>
                 <w:bCs/>
               </w:rPr>
-              <w:t xml:space="preserve">2.2</w:t>
+              <w:t xml:space="preserve">2.3</w:t>
             </w:r>
           </w:p>
         </w:tc>
@@ -8054,7 +8281,7 @@
           </w:tcPr>
           <w:p>
             <w:r>
-              <w:t xml:space="preserve">September 30, 2026</w:t>
+              <w:t xml:space="preserve">October 5, 2026</w:t>
             </w:r>
           </w:p>
         </w:tc>
@@ -8076,17 +8303,37 @@
           </w:tcPr>
           <w:p>
             <w:r>
-              <w:t xml:space="preserve">On the shop touch board, technicians can </w:t>
+              <w:t xml:space="preserve">Estimates without an RO are now </w:t>
             </w:r>
             <w:r>
               <w:rPr>
                 <w:b/>
                 <w:bCs/>
               </w:rPr>
-              <w:t xml:space="preserve">drag</w:t>
-            </w:r>
-            <w:r>
-              <w:t xml:space="preserve"> a car to its next stage with a finger (tapping still works).</w:t>
+              <w:t xml:space="preserve">capture opportunities</w:t>
+            </w:r>
+            <w:r>
+              <w:t xml:space="preserve">: instead of cycle time emails, the office gets up to 3 reminders to call the customer. Log each call with </w:t>
+            </w:r>
+            <w:r>
+              <w:rPr>
+                <w:b/>
+                <w:bCs/>
+              </w:rPr>
+              <w:t xml:space="preserve">Log call</w:t>
+            </w:r>
+            <w:r>
+              <w:t xml:space="preserve"> under </w:t>
+            </w:r>
+            <w:r>
+              <w:rPr>
+                <w:b/>
+                <w:bCs/>
+              </w:rPr>
+              <w:t xml:space="preserve">Opportunities</w:t>
+            </w:r>
+            <w:r>
+              <w:t xml:space="preserve">.</w:t>
             </w:r>
           </w:p>
         </w:tc>
@@ -8117,7 +8364,7 @@
                 <w:b/>
                 <w:bCs/>
               </w:rPr>
-              <w:t xml:space="preserve">2.1</w:t>
+              <w:t xml:space="preserve">2.2</w:t>
             </w:r>
           </w:p>
         </w:tc>
@@ -8161,17 +8408,17 @@
           </w:tcPr>
           <w:p>
             <w:r>
-              <w:t xml:space="preserve">New </w:t>
+              <w:t xml:space="preserve">On the shop touch board, technicians can </w:t>
             </w:r>
             <w:r>
               <w:rPr>
                 <w:b/>
                 <w:bCs/>
               </w:rPr>
-              <w:t xml:space="preserve">shop touch board</w:t>
-            </w:r>
-            <w:r>
-              <w:t xml:space="preserve">: technicians move cars to their next stage by tapping the car, the stage and their name.</w:t>
+              <w:t xml:space="preserve">drag</w:t>
+            </w:r>
+            <w:r>
+              <w:t xml:space="preserve"> a car to its next stage with a finger (tapping still works).</w:t>
             </w:r>
           </w:p>
         </w:tc>
@@ -8202,7 +8449,7 @@
                 <w:b/>
                 <w:bCs/>
               </w:rPr>
-              <w:t xml:space="preserve">2.0</w:t>
+              <w:t xml:space="preserve">2.1</w:t>
             </w:r>
           </w:p>
         </w:tc>
@@ -8246,27 +8493,17 @@
           </w:tcPr>
           <w:p>
             <w:r>
-              <w:t xml:space="preserve">The Employee App can be switched to </w:t>
+              <w:t xml:space="preserve">New </w:t>
             </w:r>
             <w:r>
               <w:rPr>
                 <w:b/>
                 <w:bCs/>
               </w:rPr>
-              <w:t xml:space="preserve">Spanish</w:t>
-            </w:r>
-            <w:r>
-              <w:t xml:space="preserve"> with the </w:t>
-            </w:r>
-            <w:r>
-              <w:rPr>
-                <w:b/>
-                <w:bCs/>
-              </w:rPr>
-              <w:t xml:space="preserve">Español</w:t>
-            </w:r>
-            <w:r>
-              <w:t xml:space="preserve"> button. Reports and the office program stay in English.</w:t>
+              <w:t xml:space="preserve">shop touch board</w:t>
+            </w:r>
+            <w:r>
+              <w:t xml:space="preserve">: technicians move cars to their next stage by tapping the car, the stage and their name.</w:t>
             </w:r>
           </w:p>
         </w:tc>
@@ -8297,7 +8534,7 @@
                 <w:b/>
                 <w:bCs/>
               </w:rPr>
-              <w:t xml:space="preserve">1.9</w:t>
+              <w:t xml:space="preserve">2.0</w:t>
             </w:r>
           </w:p>
         </w:tc>
@@ -8319,7 +8556,7 @@
           </w:tcPr>
           <w:p>
             <w:r>
-              <w:t xml:space="preserve">September 28, 2026</w:t>
+              <w:t xml:space="preserve">September 30, 2026</w:t>
             </w:r>
           </w:p>
         </w:tc>
@@ -8341,17 +8578,27 @@
           </w:tcPr>
           <w:p>
             <w:r>
-              <w:t xml:space="preserve">New </w:t>
+              <w:t xml:space="preserve">The Employee App can be switched to </w:t>
             </w:r>
             <w:r>
               <w:rPr>
                 <w:b/>
                 <w:bCs/>
               </w:rPr>
-              <w:t xml:space="preserve">Find a vehicle</w:t>
-            </w:r>
-            <w:r>
-              <w:t xml:space="preserve"> search at the top of the office program. It finds any car, at any stage or finished, by RO, customer, vehicle, VIN, plate or claim number.</w:t>
+              <w:t xml:space="preserve">Spanish</w:t>
+            </w:r>
+            <w:r>
+              <w:t xml:space="preserve"> with the </w:t>
+            </w:r>
+            <w:r>
+              <w:rPr>
+                <w:b/>
+                <w:bCs/>
+              </w:rPr>
+              <w:t xml:space="preserve">Español</w:t>
+            </w:r>
+            <w:r>
+              <w:t xml:space="preserve"> button. Reports and the office program stay in English.</w:t>
             </w:r>
           </w:p>
         </w:tc>
@@ -8382,7 +8629,7 @@
                 <w:b/>
                 <w:bCs/>
               </w:rPr>
-              <w:t xml:space="preserve">1.8</w:t>
+              <w:t xml:space="preserve">1.9</w:t>
             </w:r>
           </w:p>
         </w:tc>
@@ -8433,10 +8680,10 @@
                 <w:b/>
                 <w:bCs/>
               </w:rPr>
-              <w:t xml:space="preserve">Completed Jobs</w:t>
-            </w:r>
-            <w:r>
-              <w:t xml:space="preserve"> tab with each finished job's full file (production timeline, parts, QC, photos, every change). Only an admin can delete a delivered job or its parts.</w:t>
+              <w:t xml:space="preserve">Find a vehicle</w:t>
+            </w:r>
+            <w:r>
+              <w:t xml:space="preserve"> search at the top of the office program. It finds any car, at any stage or finished, by RO, customer, vehicle, VIN, plate or claim number.</w:t>
             </w:r>
           </w:p>
         </w:tc>
@@ -8467,7 +8714,7 @@
                 <w:b/>
                 <w:bCs/>
               </w:rPr>
-              <w:t xml:space="preserve">1.7</w:t>
+              <w:t xml:space="preserve">1.8</w:t>
             </w:r>
           </w:p>
         </w:tc>
@@ -8511,17 +8758,17 @@
           </w:tcPr>
           <w:p>
             <w:r>
-              <w:t xml:space="preserve">The Employee App now shows </w:t>
+              <w:t xml:space="preserve">New </w:t>
             </w:r>
             <w:r>
               <w:rPr>
                 <w:b/>
                 <w:bCs/>
               </w:rPr>
-              <w:t xml:space="preserve">where each part is</w:t>
-            </w:r>
-            <w:r>
-              <w:t xml:space="preserve">: the car's parts cart, and the cart shelf or storage spot for every part.</w:t>
+              <w:t xml:space="preserve">Completed Jobs</w:t>
+            </w:r>
+            <w:r>
+              <w:t xml:space="preserve"> tab with each finished job's full file (production timeline, parts, QC, photos, every change). Only an admin can delete a delivered job or its parts.</w:t>
             </w:r>
           </w:p>
         </w:tc>
@@ -8552,7 +8799,7 @@
                 <w:b/>
                 <w:bCs/>
               </w:rPr>
-              <w:t xml:space="preserve">1.6</w:t>
+              <w:t xml:space="preserve">1.7</w:t>
             </w:r>
           </w:p>
         </w:tc>
@@ -8596,37 +8843,17 @@
           </w:tcPr>
           <w:p>
             <w:r>
-              <w:t xml:space="preserve">Whoever does </w:t>
+              <w:t xml:space="preserve">The Employee App now shows </w:t>
             </w:r>
             <w:r>
               <w:rPr>
                 <w:b/>
                 <w:bCs/>
               </w:rPr>
-              <w:t xml:space="preserve">Check-In</w:t>
-            </w:r>
-            <w:r>
-              <w:t xml:space="preserve"> automatically gets the </w:t>
-            </w:r>
-            <w:r>
-              <w:rPr>
-                <w:b/>
-                <w:bCs/>
-              </w:rPr>
-              <w:t xml:space="preserve">Final QC</w:t>
-            </w:r>
-            <w:r>
-              <w:t xml:space="preserve"> checklist too. New </w:t>
-            </w:r>
-            <w:r>
-              <w:rPr>
-                <w:b/>
-                <w:bCs/>
-              </w:rPr>
-              <w:t xml:space="preserve">QC report</w:t>
-            </w:r>
-            <w:r>
-              <w:t xml:space="preserve"> for each car: all five checklists with signatures on one printable page.</w:t>
+              <w:t xml:space="preserve">where each part is</w:t>
+            </w:r>
+            <w:r>
+              <w:t xml:space="preserve">: the car's parts cart, and the cart shelf or storage spot for every part.</w:t>
             </w:r>
           </w:p>
         </w:tc>
@@ -8657,7 +8884,7 @@
                 <w:b/>
                 <w:bCs/>
               </w:rPr>
-              <w:t xml:space="preserve">1.5</w:t>
+              <w:t xml:space="preserve">1.6</w:t>
             </w:r>
           </w:p>
         </w:tc>
@@ -8701,17 +8928,37 @@
           </w:tcPr>
           <w:p>
             <w:r>
-              <w:t xml:space="preserve">Body technicians automatically get the </w:t>
+              <w:t xml:space="preserve">Whoever does </w:t>
             </w:r>
             <w:r>
               <w:rPr>
                 <w:b/>
                 <w:bCs/>
               </w:rPr>
-              <w:t xml:space="preserve">Reassy</w:t>
-            </w:r>
-            <w:r>
-              <w:t xml:space="preserve"> checklist too.</w:t>
+              <w:t xml:space="preserve">Check-In</w:t>
+            </w:r>
+            <w:r>
+              <w:t xml:space="preserve"> automatically gets the </w:t>
+            </w:r>
+            <w:r>
+              <w:rPr>
+                <w:b/>
+                <w:bCs/>
+              </w:rPr>
+              <w:t xml:space="preserve">Final QC</w:t>
+            </w:r>
+            <w:r>
+              <w:t xml:space="preserve"> checklist too. New </w:t>
+            </w:r>
+            <w:r>
+              <w:rPr>
+                <w:b/>
+                <w:bCs/>
+              </w:rPr>
+              <w:t xml:space="preserve">QC report</w:t>
+            </w:r>
+            <w:r>
+              <w:t xml:space="preserve"> for each car: all five checklists with signatures on one printable page.</w:t>
             </w:r>
           </w:p>
         </w:tc>
@@ -8742,7 +8989,7 @@
                 <w:b/>
                 <w:bCs/>
               </w:rPr>
-              <w:t xml:space="preserve">1.4</w:t>
+              <w:t xml:space="preserve">1.5</w:t>
             </w:r>
           </w:p>
         </w:tc>
@@ -8786,17 +9033,17 @@
           </w:tcPr>
           <w:p>
             <w:r>
-              <w:t xml:space="preserve">Employees can be set to </w:t>
+              <w:t xml:space="preserve">Body technicians automatically get the </w:t>
             </w:r>
             <w:r>
               <w:rPr>
                 <w:b/>
                 <w:bCs/>
               </w:rPr>
-              <w:t xml:space="preserve">also do</w:t>
-            </w:r>
-            <w:r>
-              <w:t xml:space="preserve"> other checklists (for example a body tech who reassembles also gets the Reassy checklist).</w:t>
+              <w:t xml:space="preserve">Reassy</w:t>
+            </w:r>
+            <w:r>
+              <w:t xml:space="preserve"> checklist too.</w:t>
             </w:r>
           </w:p>
         </w:tc>
@@ -8827,7 +9074,7 @@
                 <w:b/>
                 <w:bCs/>
               </w:rPr>
-              <w:t xml:space="preserve">1.3</w:t>
+              <w:t xml:space="preserve">1.4</w:t>
             </w:r>
           </w:p>
         </w:tc>
@@ -8871,7 +9118,17 @@
           </w:tcPr>
           <w:p>
             <w:r>
-              <w:t xml:space="preserve">New accounts and admin password resets use a temporary password; you choose your own the first time you sign in.</w:t>
+              <w:t xml:space="preserve">Employees can be set to </w:t>
+            </w:r>
+            <w:r>
+              <w:rPr>
+                <w:b/>
+                <w:bCs/>
+              </w:rPr>
+              <w:t xml:space="preserve">also do</w:t>
+            </w:r>
+            <w:r>
+              <w:t xml:space="preserve"> other checklists (for example a body tech who reassembles also gets the Reassy checklist).</w:t>
             </w:r>
           </w:p>
         </w:tc>
@@ -8902,7 +9159,7 @@
                 <w:b/>
                 <w:bCs/>
               </w:rPr>
-              <w:t xml:space="preserve">1.2</w:t>
+              <w:t xml:space="preserve">1.3</w:t>
             </w:r>
           </w:p>
         </w:tc>
@@ -8946,17 +9203,7 @@
           </w:tcPr>
           <w:p>
             <w:r>
-              <w:t xml:space="preserve">Added the </w:t>
-            </w:r>
-            <w:r>
-              <w:rPr>
-                <w:b/>
-                <w:bCs/>
-              </w:rPr>
-              <w:t xml:space="preserve">Help</w:t>
-            </w:r>
-            <w:r>
-              <w:t xml:space="preserve"> tab in the office program and a search box in the manual.</w:t>
+              <w:t xml:space="preserve">New accounts and admin password resets use a temporary password; you choose your own the first time you sign in.</w:t>
             </w:r>
           </w:p>
         </w:tc>
@@ -8987,7 +9234,7 @@
                 <w:b/>
                 <w:bCs/>
               </w:rPr>
-              <w:t xml:space="preserve">1.1</w:t>
+              <w:t xml:space="preserve">1.2</w:t>
             </w:r>
           </w:p>
         </w:tc>
@@ -9031,17 +9278,17 @@
           </w:tcPr>
           <w:p>
             <w:r>
-              <w:t xml:space="preserve">Employee App address is now </w:t>
+              <w:t xml:space="preserve">Added the </w:t>
             </w:r>
             <w:r>
               <w:rPr>
                 <w:b/>
                 <w:bCs/>
               </w:rPr>
-              <w:t xml:space="preserve">https://conceptautobody.app</w:t>
-            </w:r>
-            <w:r>
-              <w:t xml:space="preserve"> and works on phones anywhere. Added how to put it on your phone's home screen.</w:t>
+              <w:t xml:space="preserve">Help</w:t>
+            </w:r>
+            <w:r>
+              <w:t xml:space="preserve"> tab in the office program and a search box in the manual.</w:t>
             </w:r>
           </w:p>
         </w:tc>
@@ -9072,7 +9319,7 @@
                 <w:b/>
                 <w:bCs/>
               </w:rPr>
-              <w:t xml:space="preserve">1.0</w:t>
+              <w:t xml:space="preserve">1.1</w:t>
             </w:r>
           </w:p>
         </w:tc>
@@ -9116,6 +9363,91 @@
           </w:tcPr>
           <w:p>
             <w:r>
+              <w:t xml:space="preserve">Employee App address is now </w:t>
+            </w:r>
+            <w:r>
+              <w:rPr>
+                <w:b/>
+                <w:bCs/>
+              </w:rPr>
+              <w:t xml:space="preserve">https://conceptautobody.app</w:t>
+            </w:r>
+            <w:r>
+              <w:t xml:space="preserve"> and works on phones anywhere. Added how to put it on your phone's home screen.</w:t>
+            </w:r>
+          </w:p>
+        </w:tc>
+      </w:tr>
+      <w:tr>
+        <w:trPr>
+          <w:cantSplit/>
+        </w:trPr>
+        <w:tc>
+          <w:tcPr>
+            <w:tcW w:type="dxa" w:w="3120"/>
+            <w:tcBorders>
+              <w:top w:val="single" w:color="C9CFD6" w:sz="4"/>
+              <w:left w:val="single" w:color="C9CFD6" w:sz="4"/>
+              <w:bottom w:val="single" w:color="C9CFD6" w:sz="4"/>
+              <w:right w:val="single" w:color="C9CFD6" w:sz="4"/>
+            </w:tcBorders>
+            <w:tcMar>
+              <w:top w:type="dxa" w:w="80"/>
+              <w:left w:type="dxa" w:w="120"/>
+              <w:bottom w:type="dxa" w:w="80"/>
+              <w:right w:type="dxa" w:w="120"/>
+            </w:tcMar>
+          </w:tcPr>
+          <w:p>
+            <w:r>
+              <w:rPr>
+                <w:b/>
+                <w:bCs/>
+              </w:rPr>
+              <w:t xml:space="preserve">1.0</w:t>
+            </w:r>
+          </w:p>
+        </w:tc>
+        <w:tc>
+          <w:tcPr>
+            <w:tcW w:type="dxa" w:w="3120"/>
+            <w:tcBorders>
+              <w:top w:val="single" w:color="C9CFD6" w:sz="4"/>
+              <w:left w:val="single" w:color="C9CFD6" w:sz="4"/>
+              <w:bottom w:val="single" w:color="C9CFD6" w:sz="4"/>
+              <w:right w:val="single" w:color="C9CFD6" w:sz="4"/>
+            </w:tcBorders>
+            <w:tcMar>
+              <w:top w:type="dxa" w:w="80"/>
+              <w:left w:type="dxa" w:w="120"/>
+              <w:bottom w:type="dxa" w:w="80"/>
+              <w:right w:type="dxa" w:w="120"/>
+            </w:tcMar>
+          </w:tcPr>
+          <w:p>
+            <w:r>
+              <w:t xml:space="preserve">September 28, 2026</w:t>
+            </w:r>
+          </w:p>
+        </w:tc>
+        <w:tc>
+          <w:tcPr>
+            <w:tcW w:type="dxa" w:w="3120"/>
+            <w:tcBorders>
+              <w:top w:val="single" w:color="C9CFD6" w:sz="4"/>
+              <w:left w:val="single" w:color="C9CFD6" w:sz="4"/>
+              <w:bottom w:val="single" w:color="C9CFD6" w:sz="4"/>
+              <w:right w:val="single" w:color="C9CFD6" w:sz="4"/>
+            </w:tcBorders>
+            <w:tcMar>
+              <w:top w:type="dxa" w:w="80"/>
+              <w:left w:type="dxa" w:w="120"/>
+              <w:bottom w:type="dxa" w:w="80"/>
+              <w:right w:type="dxa" w:w="120"/>
+            </w:tcMar>
+          </w:tcPr>
+          <w:p>
+            <w:r>
               <w:t xml:space="preserve">First edition.</w:t>
             </w:r>
           </w:p>
@@ -9189,7 +9521,7 @@
         <w:sz w:val="18"/>
         <w:szCs w:val="18"/>
       </w:rPr>
-      <w:t xml:space="preserve">Concept Autobody  ·  Version 2.7  ·  Page </w:t>
+      <w:t xml:space="preserve">Concept Autobody  ·  Version 2.8  ·  Page </w:t>
     </w:r>
     <w:r>
       <w:rPr>
@@ -9491,6 +9823,12 @@
     </w:lvlOverride>
   </w:num>
   <w:num w:numId="20">
+    <w:abstractNumId w:val="3"/>
+    <w:lvlOverride w:ilvl="0">
+      <w:startOverride w:val="1"/>
+    </w:lvlOverride>
+  </w:num>
+  <w:num w:numId="21">
     <w:abstractNumId w:val="3"/>
     <w:lvlOverride w:ilvl="0">
       <w:startOverride w:val="1"/>

</xml_diff>

<commit_message>
Grouped left menu and Customer Service tab; manual v2.9
The desktop left menu is now collapsible groups (Jobs, Boards & Calendar,
Customer Service, Parts, Quality & Shop, Money & Cycle Time, Staff, Admin &
Help, Other Screens). nav.js remembers open groups per computer, opens the
group of any page you're sent to, and hides groups with nothing visible for
the user's role. Dashboard and Notifications stay at the top.

New Customer Service -> Customer Status Page tab lists open ROs with their
link status and last customer update (GET /api/customer-portal), filtered by
Need an update / In the shop / All open ROs, with the status page panel
beside the list. The panel code now runs per box so it works here and in the
job editor; the side panel is built once so refreshes don't wipe a draft.

Co-Authored-By: Claude Opus 5.5 <noreply@anthropic.com>
</commit_message>
<xml_diff>
--- a/client/manual/ShopControl-User-Manual.docx
+++ b/client/manual/ShopControl-User-Manual.docx
@@ -92,7 +92,7 @@
           <w:sz w:val="22"/>
           <w:szCs w:val="22"/>
         </w:rPr>
-        <w:t xml:space="preserve">Version 2.8  ·  Updated October 8, 2026</w:t>
+        <w:t xml:space="preserve">Version 2.9  ·  Updated October 9, 2026</w:t>
       </w:r>
     </w:p>
     <w:p>
@@ -240,7 +240,7 @@
           <w:b/>
           <w:bCs/>
         </w:rPr>
-        <w:t xml:space="preserve">Employee app</w:t>
+        <w:t xml:space="preserve">Other Screens → Employee app</w:t>
       </w:r>
       <w:r>
         <w:t xml:space="preserve"> in the left menu.</w:t>
@@ -278,7 +278,7 @@
           <w:b/>
           <w:bCs/>
         </w:rPr>
-        <w:t xml:space="preserve">Help</w:t>
+        <w:t xml:space="preserve">Admin &amp; Help → Help</w:t>
       </w:r>
       <w:r>
         <w:t xml:space="preserve"> in the left menu to read this manual inside ShopControl. Use </w:t>
@@ -4380,7 +4380,7 @@
           <w:b/>
           <w:bCs/>
         </w:rPr>
-        <w:t xml:space="preserve">TV display</w:t>
+        <w:t xml:space="preserve">Other Screens → TV display</w:t>
       </w:r>
       <w:r>
         <w:t xml:space="preserve"> in the left menu.</w:t>
@@ -4724,7 +4724,7 @@
           <w:b/>
           <w:bCs/>
         </w:rPr>
-        <w:t xml:space="preserve">Shop touch board</w:t>
+        <w:t xml:space="preserve">Other Screens → Shop touch board</w:t>
       </w:r>
       <w:r>
         <w:t xml:space="preserve"> in the left menu. Moves you make there are recorded under the name you tap.</w:t>
@@ -5764,7 +5764,17 @@
         <w:t xml:space="preserve">Completed Jobs</w:t>
       </w:r>
       <w:r>
-        <w:t xml:space="preserve"> tab (left menu, under Delivery Board) lists every finished job with when it came in, when it was delivered, days in the shop, repair value, how many parts it had and how many QC checklists were done. Search by RO, customer, vehicle or insurance, or filter by delivered date.</w:t>
+        <w:t xml:space="preserve"> tab (left menu, under </w:t>
+      </w:r>
+      <w:r>
+        <w:rPr>
+          <w:b/>
+          <w:bCs/>
+        </w:rPr>
+        <w:t xml:space="preserve">Jobs</w:t>
+      </w:r>
+      <w:r>
+        <w:t xml:space="preserve">) lists every finished job with when it came in, when it was delivered, days in the shop, repair value, how many parts it had and how many QC checklists were done. Search by RO, customer, vehicle or insurance, or filter by delivered date.</w:t>
       </w:r>
     </w:p>
     <w:p>
@@ -6474,27 +6484,57 @@
         <w:spacing w:after="60"/>
       </w:pPr>
       <w:r>
-        <w:t xml:space="preserve">Open the job in </w:t>
-      </w:r>
-      <w:r>
-        <w:rPr>
-          <w:b/>
-          <w:bCs/>
-        </w:rPr>
-        <w:t xml:space="preserve">Shop Control</w:t>
-      </w:r>
-      <w:r>
-        <w:t xml:space="preserve"> (Edit). The </w:t>
-      </w:r>
-      <w:r>
-        <w:rPr>
-          <w:b/>
-          <w:bCs/>
-        </w:rPr>
-        <w:t xml:space="preserve">Customer status page</w:t>
-      </w:r>
-      <w:r>
-        <w:t xml:space="preserve"> panel is under the timestamps (office staff, estimators, managers and admins).</w:t>
+        <w:t xml:space="preserve">Click </w:t>
+      </w:r>
+      <w:r>
+        <w:rPr>
+          <w:b/>
+          <w:bCs/>
+        </w:rPr>
+        <w:t xml:space="preserve">Customer Service → Customer Status Page</w:t>
+      </w:r>
+      <w:r>
+        <w:t xml:space="preserve"> in the left menu (office staff, estimators, managers and admins). The red number shows how many cars in the shop need a customer update today. Use </w:t>
+      </w:r>
+      <w:r>
+        <w:rPr>
+          <w:b/>
+          <w:bCs/>
+        </w:rPr>
+        <w:t xml:space="preserve">Need an update</w:t>
+      </w:r>
+      <w:r>
+        <w:t xml:space="preserve">, </w:t>
+      </w:r>
+      <w:r>
+        <w:rPr>
+          <w:b/>
+          <w:bCs/>
+        </w:rPr>
+        <w:t xml:space="preserve">In the shop</w:t>
+      </w:r>
+      <w:r>
+        <w:t xml:space="preserve"> or </w:t>
+      </w:r>
+      <w:r>
+        <w:rPr>
+          <w:b/>
+          <w:bCs/>
+        </w:rPr>
+        <w:t xml:space="preserve">All open ROs</w:t>
+      </w:r>
+      <w:r>
+        <w:t xml:space="preserve"> and the search box to find the car, then click </w:t>
+      </w:r>
+      <w:r>
+        <w:rPr>
+          <w:b/>
+          <w:bCs/>
+        </w:rPr>
+        <w:t xml:space="preserve">Manage</w:t>
+      </w:r>
+      <w:r>
+        <w:t xml:space="preserve">. The same panel is also in the job editor (Daily GO List → Edit), under the timestamps.</w:t>
       </w:r>
     </w:p>
     <w:p>
@@ -7774,7 +7814,7 @@
                 <w:b/>
                 <w:bCs/>
               </w:rPr>
-              <w:t xml:space="preserve">2.8</w:t>
+              <w:t xml:space="preserve">2.9</w:t>
             </w:r>
           </w:p>
         </w:tc>
@@ -7796,7 +7836,7 @@
           </w:tcPr>
           <w:p>
             <w:r>
-              <w:t xml:space="preserve">October 8, 2026</w:t>
+              <w:t xml:space="preserve">October 9, 2026</w:t>
             </w:r>
           </w:p>
         </w:tc>
@@ -7818,27 +7858,17 @@
           </w:tcPr>
           <w:p>
             <w:r>
-              <w:t xml:space="preserve">New </w:t>
+              <w:t xml:space="preserve">The left menu is now grouped (Jobs, Boards &amp; Calendar, Customer Service, Parts, Quality &amp; Shop, Money &amp; Cycle Time, Staff, Admin &amp; Help, Other Screens). Click a group name to open or close it. New </w:t>
             </w:r>
             <w:r>
               <w:rPr>
                 <w:b/>
                 <w:bCs/>
               </w:rPr>
-              <w:t xml:space="preserve">customer status page</w:t>
-            </w:r>
-            <w:r>
-              <w:t xml:space="preserve"> at conceptautobody.app/update: customers see where their car is in the repair and the updates you post, from a private link or by looking up their RO number and last name. Set it up from the job editor (</w:t>
-            </w:r>
-            <w:r>
-              <w:rPr>
-                <w:b/>
-                <w:bCs/>
-              </w:rPr>
-              <w:t xml:space="preserve">Customer status page</w:t>
-            </w:r>
-            <w:r>
-              <w:t xml:space="preserve">) and Settings.</w:t>
+              <w:t xml:space="preserve">Customer Service → Customer Status Page</w:t>
+            </w:r>
+            <w:r>
+              <w:t xml:space="preserve"> tab lists every open RO with its customer link and last update, so you can share links and post updates in one place.</w:t>
             </w:r>
           </w:p>
         </w:tc>
@@ -7869,7 +7899,7 @@
                 <w:b/>
                 <w:bCs/>
               </w:rPr>
-              <w:t xml:space="preserve">2.7</w:t>
+              <w:t xml:space="preserve">2.8</w:t>
             </w:r>
           </w:p>
         </w:tc>
@@ -7913,27 +7943,27 @@
           </w:tcPr>
           <w:p>
             <w:r>
-              <w:t xml:space="preserve">The paper </w:t>
+              <w:t xml:space="preserve">New </w:t>
             </w:r>
             <w:r>
               <w:rPr>
                 <w:b/>
                 <w:bCs/>
               </w:rPr>
-              <w:t xml:space="preserve">payroll correction form</w:t>
-            </w:r>
-            <w:r>
-              <w:t xml:space="preserve"> is now in the Employee App: </w:t>
+              <w:t xml:space="preserve">customer status page</w:t>
+            </w:r>
+            <w:r>
+              <w:t xml:space="preserve"> at conceptautobody.app/update: customers see where their car is in the repair and the updates you post, from a private link or by looking up their RO number and last name. Set it up from the job editor (</w:t>
             </w:r>
             <w:r>
               <w:rPr>
                 <w:b/>
                 <w:bCs/>
               </w:rPr>
-              <w:t xml:space="preserve">Staff Hub → Payroll correction</w:t>
-            </w:r>
-            <w:r>
-              <w:t xml:space="preserve">. Admins approve or deny it with time off and missed punches, and the employee and office are notified.</w:t>
+              <w:t xml:space="preserve">Customer status page</w:t>
+            </w:r>
+            <w:r>
+              <w:t xml:space="preserve">) and Settings.</w:t>
             </w:r>
           </w:p>
         </w:tc>
@@ -7964,7 +7994,7 @@
                 <w:b/>
                 <w:bCs/>
               </w:rPr>
-              <w:t xml:space="preserve">2.6</w:t>
+              <w:t xml:space="preserve">2.7</w:t>
             </w:r>
           </w:p>
         </w:tc>
@@ -8008,47 +8038,27 @@
           </w:tcPr>
           <w:p>
             <w:r>
-              <w:t xml:space="preserve">The paper missed punch slip is now in the Employee App: </w:t>
+              <w:t xml:space="preserve">The paper </w:t>
             </w:r>
             <w:r>
               <w:rPr>
                 <w:b/>
                 <w:bCs/>
               </w:rPr>
-              <w:t xml:space="preserve">Staff Hub → Missed punch</w:t>
-            </w:r>
-            <w:r>
-              <w:t xml:space="preserve">. Admins approve or deny slips with time off (Staff Hub → </w:t>
+              <w:t xml:space="preserve">payroll correction form</w:t>
+            </w:r>
+            <w:r>
+              <w:t xml:space="preserve"> is now in the Employee App: </w:t>
             </w:r>
             <w:r>
               <w:rPr>
                 <w:b/>
                 <w:bCs/>
               </w:rPr>
-              <w:t xml:space="preserve">Approve requests</w:t>
-            </w:r>
-            <w:r>
-              <w:t xml:space="preserve">, or the </w:t>
-            </w:r>
-            <w:r>
-              <w:rPr>
-                <w:b/>
-                <w:bCs/>
-              </w:rPr>
-              <w:t xml:space="preserve">Time Off</w:t>
-            </w:r>
-            <w:r>
-              <w:t xml:space="preserve"> tab), and the employee and office are notified. The Employee App now </w:t>
-            </w:r>
-            <w:r>
-              <w:rPr>
-                <w:b/>
-                <w:bCs/>
-              </w:rPr>
-              <w:t xml:space="preserve">updates itself</w:t>
-            </w:r>
-            <w:r>
-              <w:t xml:space="preserve"> when a new version is put on the server.</w:t>
+              <w:t xml:space="preserve">Staff Hub → Payroll correction</w:t>
+            </w:r>
+            <w:r>
+              <w:t xml:space="preserve">. Admins approve or deny it with time off and missed punches, and the employee and office are notified.</w:t>
             </w:r>
           </w:p>
         </w:tc>
@@ -8079,7 +8089,7 @@
                 <w:b/>
                 <w:bCs/>
               </w:rPr>
-              <w:t xml:space="preserve">2.5</w:t>
+              <w:t xml:space="preserve">2.6</w:t>
             </w:r>
           </w:p>
         </w:tc>
@@ -8123,27 +8133,47 @@
           </w:tcPr>
           <w:p>
             <w:r>
-              <w:t xml:space="preserve">Office staff and the parts department can </w:t>
+              <w:t xml:space="preserve">The paper missed punch slip is now in the Employee App: </w:t>
             </w:r>
             <w:r>
               <w:rPr>
                 <w:b/>
                 <w:bCs/>
               </w:rPr>
-              <w:t xml:space="preserve">run parts from their phone</w:t>
-            </w:r>
-            <w:r>
-              <w:t xml:space="preserve">: the new </w:t>
+              <w:t xml:space="preserve">Staff Hub → Missed punch</w:t>
+            </w:r>
+            <w:r>
+              <w:t xml:space="preserve">. Admins approve or deny slips with time off (Staff Hub → </w:t>
             </w:r>
             <w:r>
               <w:rPr>
                 <w:b/>
                 <w:bCs/>
               </w:rPr>
-              <w:t xml:space="preserve">Parts desk</w:t>
-            </w:r>
-            <w:r>
-              <w:t xml:space="preserve"> in the Employee App orders, receives and mirror matches parts, moves them between shelves, and covers Returns &amp; Alerts and storage locations.</w:t>
+              <w:t xml:space="preserve">Approve requests</w:t>
+            </w:r>
+            <w:r>
+              <w:t xml:space="preserve">, or the </w:t>
+            </w:r>
+            <w:r>
+              <w:rPr>
+                <w:b/>
+                <w:bCs/>
+              </w:rPr>
+              <w:t xml:space="preserve">Time Off</w:t>
+            </w:r>
+            <w:r>
+              <w:t xml:space="preserve"> tab), and the employee and office are notified. The Employee App now </w:t>
+            </w:r>
+            <w:r>
+              <w:rPr>
+                <w:b/>
+                <w:bCs/>
+              </w:rPr>
+              <w:t xml:space="preserve">updates itself</w:t>
+            </w:r>
+            <w:r>
+              <w:t xml:space="preserve"> when a new version is put on the server.</w:t>
             </w:r>
           </w:p>
         </w:tc>
@@ -8174,7 +8204,7 @@
                 <w:b/>
                 <w:bCs/>
               </w:rPr>
-              <w:t xml:space="preserve">2.4</w:t>
+              <w:t xml:space="preserve">2.5</w:t>
             </w:r>
           </w:p>
         </w:tc>
@@ -8196,7 +8226,7 @@
           </w:tcPr>
           <w:p>
             <w:r>
-              <w:t xml:space="preserve">October 6, 2026</w:t>
+              <w:t xml:space="preserve">October 8, 2026</w:t>
             </w:r>
           </w:p>
         </w:tc>
@@ -8218,17 +8248,27 @@
           </w:tcPr>
           <w:p>
             <w:r>
-              <w:t xml:space="preserve">Admins can </w:t>
+              <w:t xml:space="preserve">Office staff and the parts department can </w:t>
             </w:r>
             <w:r>
               <w:rPr>
                 <w:b/>
                 <w:bCs/>
               </w:rPr>
-              <w:t xml:space="preserve">approve or deny time off in the Employee App</w:t>
-            </w:r>
-            <w:r>
-              <w:t xml:space="preserve"> (Staff Hub → Approve time off), and the office is emailed every decision. The TV and shop touch board show when they last updated and catch up by themselves if they fall behind.</w:t>
+              <w:t xml:space="preserve">run parts from their phone</w:t>
+            </w:r>
+            <w:r>
+              <w:t xml:space="preserve">: the new </w:t>
+            </w:r>
+            <w:r>
+              <w:rPr>
+                <w:b/>
+                <w:bCs/>
+              </w:rPr>
+              <w:t xml:space="preserve">Parts desk</w:t>
+            </w:r>
+            <w:r>
+              <w:t xml:space="preserve"> in the Employee App orders, receives and mirror matches parts, moves them between shelves, and covers Returns &amp; Alerts and storage locations.</w:t>
             </w:r>
           </w:p>
         </w:tc>
@@ -8259,7 +8299,7 @@
                 <w:b/>
                 <w:bCs/>
               </w:rPr>
-              <w:t xml:space="preserve">2.3</w:t>
+              <w:t xml:space="preserve">2.4</w:t>
             </w:r>
           </w:p>
         </w:tc>
@@ -8281,7 +8321,7 @@
           </w:tcPr>
           <w:p>
             <w:r>
-              <w:t xml:space="preserve">October 5, 2026</w:t>
+              <w:t xml:space="preserve">October 6, 2026</w:t>
             </w:r>
           </w:p>
         </w:tc>
@@ -8303,37 +8343,17 @@
           </w:tcPr>
           <w:p>
             <w:r>
-              <w:t xml:space="preserve">Estimates without an RO are now </w:t>
+              <w:t xml:space="preserve">Admins can </w:t>
             </w:r>
             <w:r>
               <w:rPr>
                 <w:b/>
                 <w:bCs/>
               </w:rPr>
-              <w:t xml:space="preserve">capture opportunities</w:t>
-            </w:r>
-            <w:r>
-              <w:t xml:space="preserve">: instead of cycle time emails, the office gets up to 3 reminders to call the customer. Log each call with </w:t>
-            </w:r>
-            <w:r>
-              <w:rPr>
-                <w:b/>
-                <w:bCs/>
-              </w:rPr>
-              <w:t xml:space="preserve">Log call</w:t>
-            </w:r>
-            <w:r>
-              <w:t xml:space="preserve"> under </w:t>
-            </w:r>
-            <w:r>
-              <w:rPr>
-                <w:b/>
-                <w:bCs/>
-              </w:rPr>
-              <w:t xml:space="preserve">Opportunities</w:t>
-            </w:r>
-            <w:r>
-              <w:t xml:space="preserve">.</w:t>
+              <w:t xml:space="preserve">approve or deny time off in the Employee App</w:t>
+            </w:r>
+            <w:r>
+              <w:t xml:space="preserve"> (Staff Hub → Approve time off), and the office is emailed every decision. The TV and shop touch board show when they last updated and catch up by themselves if they fall behind.</w:t>
             </w:r>
           </w:p>
         </w:tc>
@@ -8364,7 +8384,7 @@
                 <w:b/>
                 <w:bCs/>
               </w:rPr>
-              <w:t xml:space="preserve">2.2</w:t>
+              <w:t xml:space="preserve">2.3</w:t>
             </w:r>
           </w:p>
         </w:tc>
@@ -8386,7 +8406,7 @@
           </w:tcPr>
           <w:p>
             <w:r>
-              <w:t xml:space="preserve">September 30, 2026</w:t>
+              <w:t xml:space="preserve">October 5, 2026</w:t>
             </w:r>
           </w:p>
         </w:tc>
@@ -8408,17 +8428,37 @@
           </w:tcPr>
           <w:p>
             <w:r>
-              <w:t xml:space="preserve">On the shop touch board, technicians can </w:t>
+              <w:t xml:space="preserve">Estimates without an RO are now </w:t>
             </w:r>
             <w:r>
               <w:rPr>
                 <w:b/>
                 <w:bCs/>
               </w:rPr>
-              <w:t xml:space="preserve">drag</w:t>
-            </w:r>
-            <w:r>
-              <w:t xml:space="preserve"> a car to its next stage with a finger (tapping still works).</w:t>
+              <w:t xml:space="preserve">capture opportunities</w:t>
+            </w:r>
+            <w:r>
+              <w:t xml:space="preserve">: instead of cycle time emails, the office gets up to 3 reminders to call the customer. Log each call with </w:t>
+            </w:r>
+            <w:r>
+              <w:rPr>
+                <w:b/>
+                <w:bCs/>
+              </w:rPr>
+              <w:t xml:space="preserve">Log call</w:t>
+            </w:r>
+            <w:r>
+              <w:t xml:space="preserve"> under </w:t>
+            </w:r>
+            <w:r>
+              <w:rPr>
+                <w:b/>
+                <w:bCs/>
+              </w:rPr>
+              <w:t xml:space="preserve">Opportunities</w:t>
+            </w:r>
+            <w:r>
+              <w:t xml:space="preserve">.</w:t>
             </w:r>
           </w:p>
         </w:tc>
@@ -8449,7 +8489,7 @@
                 <w:b/>
                 <w:bCs/>
               </w:rPr>
-              <w:t xml:space="preserve">2.1</w:t>
+              <w:t xml:space="preserve">2.2</w:t>
             </w:r>
           </w:p>
         </w:tc>
@@ -8493,17 +8533,17 @@
           </w:tcPr>
           <w:p>
             <w:r>
-              <w:t xml:space="preserve">New </w:t>
+              <w:t xml:space="preserve">On the shop touch board, technicians can </w:t>
             </w:r>
             <w:r>
               <w:rPr>
                 <w:b/>
                 <w:bCs/>
               </w:rPr>
-              <w:t xml:space="preserve">shop touch board</w:t>
-            </w:r>
-            <w:r>
-              <w:t xml:space="preserve">: technicians move cars to their next stage by tapping the car, the stage and their name.</w:t>
+              <w:t xml:space="preserve">drag</w:t>
+            </w:r>
+            <w:r>
+              <w:t xml:space="preserve"> a car to its next stage with a finger (tapping still works).</w:t>
             </w:r>
           </w:p>
         </w:tc>
@@ -8534,7 +8574,7 @@
                 <w:b/>
                 <w:bCs/>
               </w:rPr>
-              <w:t xml:space="preserve">2.0</w:t>
+              <w:t xml:space="preserve">2.1</w:t>
             </w:r>
           </w:p>
         </w:tc>
@@ -8578,27 +8618,17 @@
           </w:tcPr>
           <w:p>
             <w:r>
-              <w:t xml:space="preserve">The Employee App can be switched to </w:t>
+              <w:t xml:space="preserve">New </w:t>
             </w:r>
             <w:r>
               <w:rPr>
                 <w:b/>
                 <w:bCs/>
               </w:rPr>
-              <w:t xml:space="preserve">Spanish</w:t>
-            </w:r>
-            <w:r>
-              <w:t xml:space="preserve"> with the </w:t>
-            </w:r>
-            <w:r>
-              <w:rPr>
-                <w:b/>
-                <w:bCs/>
-              </w:rPr>
-              <w:t xml:space="preserve">Español</w:t>
-            </w:r>
-            <w:r>
-              <w:t xml:space="preserve"> button. Reports and the office program stay in English.</w:t>
+              <w:t xml:space="preserve">shop touch board</w:t>
+            </w:r>
+            <w:r>
+              <w:t xml:space="preserve">: technicians move cars to their next stage by tapping the car, the stage and their name.</w:t>
             </w:r>
           </w:p>
         </w:tc>
@@ -8629,7 +8659,7 @@
                 <w:b/>
                 <w:bCs/>
               </w:rPr>
-              <w:t xml:space="preserve">1.9</w:t>
+              <w:t xml:space="preserve">2.0</w:t>
             </w:r>
           </w:p>
         </w:tc>
@@ -8651,7 +8681,7 @@
           </w:tcPr>
           <w:p>
             <w:r>
-              <w:t xml:space="preserve">September 28, 2026</w:t>
+              <w:t xml:space="preserve">September 30, 2026</w:t>
             </w:r>
           </w:p>
         </w:tc>
@@ -8673,17 +8703,27 @@
           </w:tcPr>
           <w:p>
             <w:r>
-              <w:t xml:space="preserve">New </w:t>
+              <w:t xml:space="preserve">The Employee App can be switched to </w:t>
             </w:r>
             <w:r>
               <w:rPr>
                 <w:b/>
                 <w:bCs/>
               </w:rPr>
-              <w:t xml:space="preserve">Find a vehicle</w:t>
-            </w:r>
-            <w:r>
-              <w:t xml:space="preserve"> search at the top of the office program. It finds any car, at any stage or finished, by RO, customer, vehicle, VIN, plate or claim number.</w:t>
+              <w:t xml:space="preserve">Spanish</w:t>
+            </w:r>
+            <w:r>
+              <w:t xml:space="preserve"> with the </w:t>
+            </w:r>
+            <w:r>
+              <w:rPr>
+                <w:b/>
+                <w:bCs/>
+              </w:rPr>
+              <w:t xml:space="preserve">Español</w:t>
+            </w:r>
+            <w:r>
+              <w:t xml:space="preserve"> button. Reports and the office program stay in English.</w:t>
             </w:r>
           </w:p>
         </w:tc>
@@ -8714,7 +8754,7 @@
                 <w:b/>
                 <w:bCs/>
               </w:rPr>
-              <w:t xml:space="preserve">1.8</w:t>
+              <w:t xml:space="preserve">1.9</w:t>
             </w:r>
           </w:p>
         </w:tc>
@@ -8765,10 +8805,10 @@
                 <w:b/>
                 <w:bCs/>
               </w:rPr>
-              <w:t xml:space="preserve">Completed Jobs</w:t>
-            </w:r>
-            <w:r>
-              <w:t xml:space="preserve"> tab with each finished job's full file (production timeline, parts, QC, photos, every change). Only an admin can delete a delivered job or its parts.</w:t>
+              <w:t xml:space="preserve">Find a vehicle</w:t>
+            </w:r>
+            <w:r>
+              <w:t xml:space="preserve"> search at the top of the office program. It finds any car, at any stage or finished, by RO, customer, vehicle, VIN, plate or claim number.</w:t>
             </w:r>
           </w:p>
         </w:tc>
@@ -8799,7 +8839,7 @@
                 <w:b/>
                 <w:bCs/>
               </w:rPr>
-              <w:t xml:space="preserve">1.7</w:t>
+              <w:t xml:space="preserve">1.8</w:t>
             </w:r>
           </w:p>
         </w:tc>
@@ -8843,17 +8883,17 @@
           </w:tcPr>
           <w:p>
             <w:r>
-              <w:t xml:space="preserve">The Employee App now shows </w:t>
+              <w:t xml:space="preserve">New </w:t>
             </w:r>
             <w:r>
               <w:rPr>
                 <w:b/>
                 <w:bCs/>
               </w:rPr>
-              <w:t xml:space="preserve">where each part is</w:t>
-            </w:r>
-            <w:r>
-              <w:t xml:space="preserve">: the car's parts cart, and the cart shelf or storage spot for every part.</w:t>
+              <w:t xml:space="preserve">Completed Jobs</w:t>
+            </w:r>
+            <w:r>
+              <w:t xml:space="preserve"> tab with each finished job's full file (production timeline, parts, QC, photos, every change). Only an admin can delete a delivered job or its parts.</w:t>
             </w:r>
           </w:p>
         </w:tc>
@@ -8884,7 +8924,7 @@
                 <w:b/>
                 <w:bCs/>
               </w:rPr>
-              <w:t xml:space="preserve">1.6</w:t>
+              <w:t xml:space="preserve">1.7</w:t>
             </w:r>
           </w:p>
         </w:tc>
@@ -8928,37 +8968,17 @@
           </w:tcPr>
           <w:p>
             <w:r>
-              <w:t xml:space="preserve">Whoever does </w:t>
+              <w:t xml:space="preserve">The Employee App now shows </w:t>
             </w:r>
             <w:r>
               <w:rPr>
                 <w:b/>
                 <w:bCs/>
               </w:rPr>
-              <w:t xml:space="preserve">Check-In</w:t>
-            </w:r>
-            <w:r>
-              <w:t xml:space="preserve"> automatically gets the </w:t>
-            </w:r>
-            <w:r>
-              <w:rPr>
-                <w:b/>
-                <w:bCs/>
-              </w:rPr>
-              <w:t xml:space="preserve">Final QC</w:t>
-            </w:r>
-            <w:r>
-              <w:t xml:space="preserve"> checklist too. New </w:t>
-            </w:r>
-            <w:r>
-              <w:rPr>
-                <w:b/>
-                <w:bCs/>
-              </w:rPr>
-              <w:t xml:space="preserve">QC report</w:t>
-            </w:r>
-            <w:r>
-              <w:t xml:space="preserve"> for each car: all five checklists with signatures on one printable page.</w:t>
+              <w:t xml:space="preserve">where each part is</w:t>
+            </w:r>
+            <w:r>
+              <w:t xml:space="preserve">: the car's parts cart, and the cart shelf or storage spot for every part.</w:t>
             </w:r>
           </w:p>
         </w:tc>
@@ -8989,7 +9009,7 @@
                 <w:b/>
                 <w:bCs/>
               </w:rPr>
-              <w:t xml:space="preserve">1.5</w:t>
+              <w:t xml:space="preserve">1.6</w:t>
             </w:r>
           </w:p>
         </w:tc>
@@ -9033,17 +9053,37 @@
           </w:tcPr>
           <w:p>
             <w:r>
-              <w:t xml:space="preserve">Body technicians automatically get the </w:t>
+              <w:t xml:space="preserve">Whoever does </w:t>
             </w:r>
             <w:r>
               <w:rPr>
                 <w:b/>
                 <w:bCs/>
               </w:rPr>
-              <w:t xml:space="preserve">Reassy</w:t>
-            </w:r>
-            <w:r>
-              <w:t xml:space="preserve"> checklist too.</w:t>
+              <w:t xml:space="preserve">Check-In</w:t>
+            </w:r>
+            <w:r>
+              <w:t xml:space="preserve"> automatically gets the </w:t>
+            </w:r>
+            <w:r>
+              <w:rPr>
+                <w:b/>
+                <w:bCs/>
+              </w:rPr>
+              <w:t xml:space="preserve">Final QC</w:t>
+            </w:r>
+            <w:r>
+              <w:t xml:space="preserve"> checklist too. New </w:t>
+            </w:r>
+            <w:r>
+              <w:rPr>
+                <w:b/>
+                <w:bCs/>
+              </w:rPr>
+              <w:t xml:space="preserve">QC report</w:t>
+            </w:r>
+            <w:r>
+              <w:t xml:space="preserve"> for each car: all five checklists with signatures on one printable page.</w:t>
             </w:r>
           </w:p>
         </w:tc>
@@ -9074,7 +9114,7 @@
                 <w:b/>
                 <w:bCs/>
               </w:rPr>
-              <w:t xml:space="preserve">1.4</w:t>
+              <w:t xml:space="preserve">1.5</w:t>
             </w:r>
           </w:p>
         </w:tc>
@@ -9118,17 +9158,17 @@
           </w:tcPr>
           <w:p>
             <w:r>
-              <w:t xml:space="preserve">Employees can be set to </w:t>
+              <w:t xml:space="preserve">Body technicians automatically get the </w:t>
             </w:r>
             <w:r>
               <w:rPr>
                 <w:b/>
                 <w:bCs/>
               </w:rPr>
-              <w:t xml:space="preserve">also do</w:t>
-            </w:r>
-            <w:r>
-              <w:t xml:space="preserve"> other checklists (for example a body tech who reassembles also gets the Reassy checklist).</w:t>
+              <w:t xml:space="preserve">Reassy</w:t>
+            </w:r>
+            <w:r>
+              <w:t xml:space="preserve"> checklist too.</w:t>
             </w:r>
           </w:p>
         </w:tc>
@@ -9159,7 +9199,7 @@
                 <w:b/>
                 <w:bCs/>
               </w:rPr>
-              <w:t xml:space="preserve">1.3</w:t>
+              <w:t xml:space="preserve">1.4</w:t>
             </w:r>
           </w:p>
         </w:tc>
@@ -9203,7 +9243,17 @@
           </w:tcPr>
           <w:p>
             <w:r>
-              <w:t xml:space="preserve">New accounts and admin password resets use a temporary password; you choose your own the first time you sign in.</w:t>
+              <w:t xml:space="preserve">Employees can be set to </w:t>
+            </w:r>
+            <w:r>
+              <w:rPr>
+                <w:b/>
+                <w:bCs/>
+              </w:rPr>
+              <w:t xml:space="preserve">also do</w:t>
+            </w:r>
+            <w:r>
+              <w:t xml:space="preserve"> other checklists (for example a body tech who reassembles also gets the Reassy checklist).</w:t>
             </w:r>
           </w:p>
         </w:tc>
@@ -9234,7 +9284,7 @@
                 <w:b/>
                 <w:bCs/>
               </w:rPr>
-              <w:t xml:space="preserve">1.2</w:t>
+              <w:t xml:space="preserve">1.3</w:t>
             </w:r>
           </w:p>
         </w:tc>
@@ -9278,17 +9328,7 @@
           </w:tcPr>
           <w:p>
             <w:r>
-              <w:t xml:space="preserve">Added the </w:t>
-            </w:r>
-            <w:r>
-              <w:rPr>
-                <w:b/>
-                <w:bCs/>
-              </w:rPr>
-              <w:t xml:space="preserve">Help</w:t>
-            </w:r>
-            <w:r>
-              <w:t xml:space="preserve"> tab in the office program and a search box in the manual.</w:t>
+              <w:t xml:space="preserve">New accounts and admin password resets use a temporary password; you choose your own the first time you sign in.</w:t>
             </w:r>
           </w:p>
         </w:tc>
@@ -9319,7 +9359,7 @@
                 <w:b/>
                 <w:bCs/>
               </w:rPr>
-              <w:t xml:space="preserve">1.1</w:t>
+              <w:t xml:space="preserve">1.2</w:t>
             </w:r>
           </w:p>
         </w:tc>
@@ -9363,17 +9403,17 @@
           </w:tcPr>
           <w:p>
             <w:r>
-              <w:t xml:space="preserve">Employee App address is now </w:t>
+              <w:t xml:space="preserve">Added the </w:t>
             </w:r>
             <w:r>
               <w:rPr>
                 <w:b/>
                 <w:bCs/>
               </w:rPr>
-              <w:t xml:space="preserve">https://conceptautobody.app</w:t>
-            </w:r>
-            <w:r>
-              <w:t xml:space="preserve"> and works on phones anywhere. Added how to put it on your phone's home screen.</w:t>
+              <w:t xml:space="preserve">Help</w:t>
+            </w:r>
+            <w:r>
+              <w:t xml:space="preserve"> tab in the office program and a search box in the manual.</w:t>
             </w:r>
           </w:p>
         </w:tc>
@@ -9404,7 +9444,7 @@
                 <w:b/>
                 <w:bCs/>
               </w:rPr>
-              <w:t xml:space="preserve">1.0</w:t>
+              <w:t xml:space="preserve">1.1</w:t>
             </w:r>
           </w:p>
         </w:tc>
@@ -9448,6 +9488,91 @@
           </w:tcPr>
           <w:p>
             <w:r>
+              <w:t xml:space="preserve">Employee App address is now </w:t>
+            </w:r>
+            <w:r>
+              <w:rPr>
+                <w:b/>
+                <w:bCs/>
+              </w:rPr>
+              <w:t xml:space="preserve">https://conceptautobody.app</w:t>
+            </w:r>
+            <w:r>
+              <w:t xml:space="preserve"> and works on phones anywhere. Added how to put it on your phone's home screen.</w:t>
+            </w:r>
+          </w:p>
+        </w:tc>
+      </w:tr>
+      <w:tr>
+        <w:trPr>
+          <w:cantSplit/>
+        </w:trPr>
+        <w:tc>
+          <w:tcPr>
+            <w:tcW w:type="dxa" w:w="3120"/>
+            <w:tcBorders>
+              <w:top w:val="single" w:color="C9CFD6" w:sz="4"/>
+              <w:left w:val="single" w:color="C9CFD6" w:sz="4"/>
+              <w:bottom w:val="single" w:color="C9CFD6" w:sz="4"/>
+              <w:right w:val="single" w:color="C9CFD6" w:sz="4"/>
+            </w:tcBorders>
+            <w:tcMar>
+              <w:top w:type="dxa" w:w="80"/>
+              <w:left w:type="dxa" w:w="120"/>
+              <w:bottom w:type="dxa" w:w="80"/>
+              <w:right w:type="dxa" w:w="120"/>
+            </w:tcMar>
+          </w:tcPr>
+          <w:p>
+            <w:r>
+              <w:rPr>
+                <w:b/>
+                <w:bCs/>
+              </w:rPr>
+              <w:t xml:space="preserve">1.0</w:t>
+            </w:r>
+          </w:p>
+        </w:tc>
+        <w:tc>
+          <w:tcPr>
+            <w:tcW w:type="dxa" w:w="3120"/>
+            <w:tcBorders>
+              <w:top w:val="single" w:color="C9CFD6" w:sz="4"/>
+              <w:left w:val="single" w:color="C9CFD6" w:sz="4"/>
+              <w:bottom w:val="single" w:color="C9CFD6" w:sz="4"/>
+              <w:right w:val="single" w:color="C9CFD6" w:sz="4"/>
+            </w:tcBorders>
+            <w:tcMar>
+              <w:top w:type="dxa" w:w="80"/>
+              <w:left w:type="dxa" w:w="120"/>
+              <w:bottom w:type="dxa" w:w="80"/>
+              <w:right w:type="dxa" w:w="120"/>
+            </w:tcMar>
+          </w:tcPr>
+          <w:p>
+            <w:r>
+              <w:t xml:space="preserve">September 28, 2026</w:t>
+            </w:r>
+          </w:p>
+        </w:tc>
+        <w:tc>
+          <w:tcPr>
+            <w:tcW w:type="dxa" w:w="3120"/>
+            <w:tcBorders>
+              <w:top w:val="single" w:color="C9CFD6" w:sz="4"/>
+              <w:left w:val="single" w:color="C9CFD6" w:sz="4"/>
+              <w:bottom w:val="single" w:color="C9CFD6" w:sz="4"/>
+              <w:right w:val="single" w:color="C9CFD6" w:sz="4"/>
+            </w:tcBorders>
+            <w:tcMar>
+              <w:top w:type="dxa" w:w="80"/>
+              <w:left w:type="dxa" w:w="120"/>
+              <w:bottom w:type="dxa" w:w="80"/>
+              <w:right w:type="dxa" w:w="120"/>
+            </w:tcMar>
+          </w:tcPr>
+          <w:p>
+            <w:r>
               <w:t xml:space="preserve">First edition.</w:t>
             </w:r>
           </w:p>
@@ -9521,7 +9646,7 @@
         <w:sz w:val="18"/>
         <w:szCs w:val="18"/>
       </w:rPr>
-      <w:t xml:space="preserve">Concept Autobody  ·  Version 2.8  ·  Page </w:t>
+      <w:t xml:space="preserve">Concept Autobody  ·  Version 2.9  ·  Page </w:t>
     </w:r>
     <w:r>
       <w:rPr>

</xml_diff>